<commit_message>
Lesson 26 Designing the /contact FrontEnd Page
</commit_message>
<xml_diff>
--- a/Notes2.docx
+++ b/Notes2.docx
@@ -1671,6 +1671,9 @@
         <w:jc w:val="center"/>
       </w:pPr>
       <w:r>
+        <w:rPr>
+          <w:noProof/>
+        </w:rPr>
         <w:drawing>
           <wp:inline distT="0" distB="0" distL="0" distR="0" wp14:anchorId="1D1939CD" wp14:editId="6BCB2DD6">
             <wp:extent cx="4639322" cy="2038635"/>
@@ -1718,6 +1721,9 @@
         <w:jc w:val="center"/>
       </w:pPr>
       <w:r>
+        <w:rPr>
+          <w:noProof/>
+        </w:rPr>
         <w:drawing>
           <wp:inline distT="0" distB="0" distL="0" distR="0" wp14:anchorId="26A7C02D" wp14:editId="0C84393F">
             <wp:extent cx="5391902" cy="2591162"/>
@@ -1801,6 +1807,207 @@
         <w:t>Writing in file system is not a good idea but for simplicity we are doing this.</w:t>
       </w:r>
     </w:p>
+    <w:p>
+      <w:pPr>
+        <w:jc w:val="center"/>
+      </w:pPr>
+      <w:r>
+        <w:drawing>
+          <wp:inline distT="0" distB="0" distL="0" distR="0" wp14:anchorId="1988FD76" wp14:editId="3B3EB82A">
+            <wp:extent cx="5731510" cy="455930"/>
+            <wp:effectExtent l="0" t="0" r="2540" b="1270"/>
+            <wp:docPr id="1422782006" name="Picture 1"/>
+            <wp:cNvGraphicFramePr>
+              <a:graphicFrameLocks xmlns:a="http://schemas.openxmlformats.org/drawingml/2006/main" noChangeAspect="1"/>
+            </wp:cNvGraphicFramePr>
+            <a:graphic xmlns:a="http://schemas.openxmlformats.org/drawingml/2006/main">
+              <a:graphicData uri="http://schemas.openxmlformats.org/drawingml/2006/picture">
+                <pic:pic xmlns:pic="http://schemas.openxmlformats.org/drawingml/2006/picture">
+                  <pic:nvPicPr>
+                    <pic:cNvPr id="1422782006" name=""/>
+                    <pic:cNvPicPr/>
+                  </pic:nvPicPr>
+                  <pic:blipFill>
+                    <a:blip r:embed="rId16"/>
+                    <a:stretch>
+                      <a:fillRect/>
+                    </a:stretch>
+                  </pic:blipFill>
+                  <pic:spPr>
+                    <a:xfrm>
+                      <a:off x="0" y="0"/>
+                      <a:ext cx="5731510" cy="455930"/>
+                    </a:xfrm>
+                    <a:prstGeom prst="rect">
+                      <a:avLst/>
+                    </a:prstGeom>
+                  </pic:spPr>
+                </pic:pic>
+              </a:graphicData>
+            </a:graphic>
+          </wp:inline>
+        </w:drawing>
+      </w:r>
+    </w:p>
+    <w:p>
+      <w:r>
+        <w:br w:type="page"/>
+      </w:r>
+      <w:r>
+        <w:lastRenderedPageBreak/>
+        <w:t xml:space="preserve">This error we may face if we </w:t>
+      </w:r>
+      <w:proofErr w:type="spellStart"/>
+      <w:r>
+        <w:t>son’t</w:t>
+      </w:r>
+      <w:proofErr w:type="spellEnd"/>
+      <w:r>
+        <w:t xml:space="preserve"> set the value of the input fields </w:t>
+      </w:r>
+    </w:p>
+    <w:p>
+      <w:r>
+        <w:t xml:space="preserve">In older version </w:t>
+      </w:r>
+      <w:r>
+        <w:t xml:space="preserve">we used to put the state value in between the </w:t>
+      </w:r>
+      <w:proofErr w:type="spellStart"/>
+      <w:r>
+        <w:t>textarea</w:t>
+      </w:r>
+      <w:proofErr w:type="spellEnd"/>
+      <w:r>
+        <w:t xml:space="preserve"> element</w:t>
+      </w:r>
+      <w:r>
+        <w:t>(who knows may be I am wrong here)</w:t>
+      </w:r>
+      <w:r>
+        <w:t xml:space="preserve"> </w:t>
+      </w:r>
+      <w:r>
+        <w:t xml:space="preserve">and on state update method we used </w:t>
+      </w:r>
+      <w:proofErr w:type="spellStart"/>
+      <w:r>
+        <w:t>e.target.innerText</w:t>
+      </w:r>
+      <w:proofErr w:type="spellEnd"/>
+    </w:p>
+    <w:p>
+      <w:r>
+        <w:t xml:space="preserve">But now in </w:t>
+      </w:r>
+      <w:proofErr w:type="spellStart"/>
+      <w:r>
+        <w:t>Textare</w:t>
+      </w:r>
+      <w:proofErr w:type="spellEnd"/>
+      <w:r>
+        <w:t xml:space="preserve"> we can use </w:t>
+      </w:r>
+      <w:proofErr w:type="spellStart"/>
+      <w:r>
+        <w:t>e.target,value</w:t>
+      </w:r>
+      <w:proofErr w:type="spellEnd"/>
+      <w:r>
+        <w:t xml:space="preserve"> as value attribute is used in the </w:t>
+      </w:r>
+      <w:proofErr w:type="spellStart"/>
+      <w:r>
+        <w:t>Textfi</w:t>
+      </w:r>
+      <w:r>
+        <w:t>eld</w:t>
+      </w:r>
+      <w:proofErr w:type="spellEnd"/>
+    </w:p>
+    <w:p>
+      <w:r>
+        <w:t xml:space="preserve">The API may not give </w:t>
+      </w:r>
+      <w:proofErr w:type="spellStart"/>
+      <w:r>
+        <w:t>json</w:t>
+      </w:r>
+      <w:proofErr w:type="spellEnd"/>
+      <w:r>
+        <w:t xml:space="preserve"> response but instead </w:t>
+      </w:r>
+      <w:proofErr w:type="spellStart"/>
+      <w:r>
+        <w:t>uit</w:t>
+      </w:r>
+      <w:proofErr w:type="spellEnd"/>
+      <w:r>
+        <w:t xml:space="preserve"> may text </w:t>
+      </w:r>
+      <w:proofErr w:type="spellStart"/>
+      <w:r>
+        <w:t>reponse</w:t>
+      </w:r>
+      <w:proofErr w:type="spellEnd"/>
+      <w:r>
+        <w:t xml:space="preserve"> who knows and we can parse it by text method in response we are fetching</w:t>
+      </w:r>
+      <w:r>
+        <w:t xml:space="preserve"> as shown below</w:t>
+      </w:r>
+    </w:p>
+    <w:p>
+      <w:pPr>
+        <w:jc w:val="center"/>
+      </w:pPr>
+      <w:r>
+        <w:drawing>
+          <wp:inline distT="0" distB="0" distL="0" distR="0" wp14:anchorId="67403C19" wp14:editId="264E6B84">
+            <wp:extent cx="3038899" cy="323895"/>
+            <wp:effectExtent l="0" t="0" r="9525" b="0"/>
+            <wp:docPr id="434519910" name="Picture 1"/>
+            <wp:cNvGraphicFramePr>
+              <a:graphicFrameLocks xmlns:a="http://schemas.openxmlformats.org/drawingml/2006/main" noChangeAspect="1"/>
+            </wp:cNvGraphicFramePr>
+            <a:graphic xmlns:a="http://schemas.openxmlformats.org/drawingml/2006/main">
+              <a:graphicData uri="http://schemas.openxmlformats.org/drawingml/2006/picture">
+                <pic:pic xmlns:pic="http://schemas.openxmlformats.org/drawingml/2006/picture">
+                  <pic:nvPicPr>
+                    <pic:cNvPr id="434519910" name=""/>
+                    <pic:cNvPicPr/>
+                  </pic:nvPicPr>
+                  <pic:blipFill>
+                    <a:blip r:embed="rId17"/>
+                    <a:stretch>
+                      <a:fillRect/>
+                    </a:stretch>
+                  </pic:blipFill>
+                  <pic:spPr>
+                    <a:xfrm>
+                      <a:off x="0" y="0"/>
+                      <a:ext cx="3038899" cy="323895"/>
+                    </a:xfrm>
+                    <a:prstGeom prst="rect">
+                      <a:avLst/>
+                    </a:prstGeom>
+                  </pic:spPr>
+                </pic:pic>
+              </a:graphicData>
+            </a:graphic>
+          </wp:inline>
+        </w:drawing>
+      </w:r>
+    </w:p>
+    <w:p>
+      <w:r>
+        <w:t xml:space="preserve">Our hunting coder design is not good </w:t>
+      </w:r>
+      <w:r>
+        <w:t xml:space="preserve">but the contact for is working </w:t>
+      </w:r>
+    </w:p>
+    <w:p/>
     <w:sectPr>
       <w:pgSz w:w="11906" w:h="16838"/>
       <w:pgMar w:top="1440" w:right="1440" w:bottom="1440" w:left="1440" w:header="708" w:footer="708" w:gutter="0"/>

</xml_diff>

<commit_message>
Lesson 27 Designing the About Page
</commit_message>
<xml_diff>
--- a/Notes2.docx
+++ b/Notes2.docx
@@ -59,10 +59,18 @@
     </w:p>
     <w:p>
       <w:r>
-        <w:t>In nay container</w:t>
-      </w:r>
-      <w:r>
-        <w:t>(or component)</w:t>
+        <w:t xml:space="preserve">In nay </w:t>
+      </w:r>
+      <w:proofErr w:type="gramStart"/>
+      <w:r>
+        <w:t>container</w:t>
+      </w:r>
+      <w:r>
+        <w:t>(</w:t>
+      </w:r>
+      <w:proofErr w:type="gramEnd"/>
+      <w:r>
+        <w:t>or component)</w:t>
       </w:r>
       <w:r>
         <w:t xml:space="preserve"> if you want to </w:t>
@@ -434,7 +442,15 @@
       </w:r>
       <w:proofErr w:type="spellEnd"/>
       <w:r>
-        <w:t xml:space="preserve"> should not have space in the content as it is considered a content other wise you will get this error</w:t>
+        <w:t xml:space="preserve"> should not have space in the content as it is considered a content </w:t>
+      </w:r>
+      <w:proofErr w:type="spellStart"/>
+      <w:r>
+        <w:t>other wise</w:t>
+      </w:r>
+      <w:proofErr w:type="spellEnd"/>
+      <w:r>
+        <w:t xml:space="preserve"> you will get this error</w:t>
       </w:r>
     </w:p>
     <w:p>
@@ -539,9 +555,14 @@
       </w:r>
     </w:p>
     <w:p>
+      <w:proofErr w:type="gramStart"/>
       <w:r>
         <w:lastRenderedPageBreak/>
-        <w:t>So we can so this thing Now we can see it is getting rendered as shown below</w:t>
+        <w:t>So</w:t>
+      </w:r>
+      <w:proofErr w:type="gramEnd"/>
+      <w:r>
+        <w:t xml:space="preserve"> we can so this thing Now we can see it is getting rendered as shown below</w:t>
       </w:r>
     </w:p>
     <w:p>
@@ -643,8 +664,13 @@
         <w:t xml:space="preserve"> s</w:t>
       </w:r>
       <w:r>
-        <w:t>ubmit the form</w:t>
-      </w:r>
+        <w:t xml:space="preserve">ubmit the </w:t>
+      </w:r>
+      <w:proofErr w:type="gramStart"/>
+      <w:r>
+        <w:t>form</w:t>
+      </w:r>
+      <w:proofErr w:type="gramEnd"/>
       <w:r>
         <w:t xml:space="preserve"> we will definitely have to make an API to co</w:t>
       </w:r>
@@ -710,8 +736,29 @@
       </w:r>
     </w:p>
     <w:p>
-      <w:r>
-        <w:t>So for now our post request handler look like below</w:t>
+      <w:proofErr w:type="gramStart"/>
+      <w:r>
+        <w:t>So</w:t>
+      </w:r>
+      <w:proofErr w:type="gramEnd"/>
+      <w:r>
+        <w:t xml:space="preserve"> for </w:t>
+      </w:r>
+      <w:proofErr w:type="gramStart"/>
+      <w:r>
+        <w:t>now</w:t>
+      </w:r>
+      <w:proofErr w:type="gramEnd"/>
+      <w:r>
+        <w:t xml:space="preserve"> our post request handler </w:t>
+      </w:r>
+      <w:proofErr w:type="gramStart"/>
+      <w:r>
+        <w:t>look</w:t>
+      </w:r>
+      <w:proofErr w:type="gramEnd"/>
+      <w:r>
+        <w:t xml:space="preserve"> like below</w:t>
       </w:r>
     </w:p>
     <w:p>
@@ -760,8 +807,13 @@
       </w:r>
     </w:p>
     <w:p>
-      <w:r>
-        <w:t>Ols version used to look like below</w:t>
+      <w:proofErr w:type="gramStart"/>
+      <w:r>
+        <w:t>Ols</w:t>
+      </w:r>
+      <w:proofErr w:type="gramEnd"/>
+      <w:r>
+        <w:t xml:space="preserve"> version used to look like below</w:t>
       </w:r>
     </w:p>
     <w:p>
@@ -869,10 +921,12 @@
         <w:t xml:space="preserve">, not plain JSON, so sending it directly with </w:t>
       </w:r>
       <w:proofErr w:type="spellStart"/>
+      <w:proofErr w:type="gramStart"/>
       <w:r>
         <w:t>res.json</w:t>
       </w:r>
       <w:proofErr w:type="spellEnd"/>
+      <w:proofErr w:type="gramEnd"/>
       <w:r>
         <w:t>(</w:t>
       </w:r>
@@ -930,9 +984,14 @@
     </w:p>
     <w:p>
       <w:r>
-        <w:t>export default function handler(</w:t>
-      </w:r>
-      <w:proofErr w:type="spellStart"/>
+        <w:t xml:space="preserve">export default function </w:t>
+      </w:r>
+      <w:proofErr w:type="gramStart"/>
+      <w:r>
+        <w:t>handler(</w:t>
+      </w:r>
+      <w:proofErr w:type="spellStart"/>
+      <w:proofErr w:type="gramEnd"/>
       <w:r>
         <w:t>req</w:t>
       </w:r>
@@ -1038,6 +1097,7 @@
         <w:t xml:space="preserve">Why </w:t>
       </w:r>
       <w:proofErr w:type="spellStart"/>
+      <w:proofErr w:type="gramStart"/>
       <w:r>
         <w:rPr>
           <w:b/>
@@ -1046,6 +1106,7 @@
         <w:t>res.json</w:t>
       </w:r>
       <w:proofErr w:type="spellEnd"/>
+      <w:proofErr w:type="gramEnd"/>
       <w:r>
         <w:rPr>
           <w:b/>
@@ -1077,18 +1138,25 @@
     </w:p>
     <w:p>
       <w:proofErr w:type="spellStart"/>
+      <w:proofErr w:type="gramStart"/>
       <w:r>
         <w:t>res.status</w:t>
       </w:r>
       <w:proofErr w:type="spellEnd"/>
-      <w:r>
-        <w:t>(200).</w:t>
+      <w:proofErr w:type="gramEnd"/>
+      <w:r>
+        <w:t>(200</w:t>
+      </w:r>
+      <w:proofErr w:type="gramStart"/>
+      <w:r>
+        <w:t>).</w:t>
       </w:r>
       <w:proofErr w:type="spellStart"/>
       <w:r>
         <w:t>json</w:t>
       </w:r>
       <w:proofErr w:type="spellEnd"/>
+      <w:proofErr w:type="gramEnd"/>
       <w:r>
         <w:t>(</w:t>
       </w:r>
@@ -1189,9 +1257,14 @@
     </w:p>
     <w:p>
       <w:r>
-        <w:t>export default function handler(</w:t>
-      </w:r>
-      <w:proofErr w:type="spellStart"/>
+        <w:t xml:space="preserve">export default function </w:t>
+      </w:r>
+      <w:proofErr w:type="gramStart"/>
+      <w:r>
+        <w:t>handler(</w:t>
+      </w:r>
+      <w:proofErr w:type="spellStart"/>
+      <w:proofErr w:type="gramEnd"/>
       <w:r>
         <w:t>req</w:t>
       </w:r>
@@ -1204,10 +1277,12 @@
         <w:t xml:space="preserve">  if (</w:t>
       </w:r>
       <w:proofErr w:type="spellStart"/>
+      <w:proofErr w:type="gramStart"/>
       <w:r>
         <w:t>req.method</w:t>
       </w:r>
       <w:proofErr w:type="spellEnd"/>
+      <w:proofErr w:type="gramEnd"/>
       <w:r>
         <w:t xml:space="preserve"> === "POST") {</w:t>
       </w:r>
@@ -1216,18 +1291,25 @@
         <w:t xml:space="preserve">    </w:t>
       </w:r>
       <w:proofErr w:type="spellStart"/>
+      <w:proofErr w:type="gramStart"/>
       <w:r>
         <w:t>res.status</w:t>
       </w:r>
       <w:proofErr w:type="spellEnd"/>
-      <w:r>
-        <w:t>(200).</w:t>
+      <w:proofErr w:type="gramEnd"/>
+      <w:r>
+        <w:t>(200</w:t>
+      </w:r>
+      <w:proofErr w:type="gramStart"/>
+      <w:r>
+        <w:t>).</w:t>
       </w:r>
       <w:proofErr w:type="spellStart"/>
       <w:r>
         <w:t>json</w:t>
       </w:r>
       <w:proofErr w:type="spellEnd"/>
+      <w:proofErr w:type="gramEnd"/>
       <w:r>
         <w:t>({</w:t>
       </w:r>
@@ -1236,10 +1318,12 @@
         <w:t xml:space="preserve">      method: </w:t>
       </w:r>
       <w:proofErr w:type="spellStart"/>
+      <w:proofErr w:type="gramStart"/>
       <w:r>
         <w:t>req.method</w:t>
       </w:r>
       <w:proofErr w:type="spellEnd"/>
+      <w:proofErr w:type="gramEnd"/>
       <w:r>
         <w:t>,</w:t>
       </w:r>
@@ -1248,10 +1332,12 @@
         <w:t xml:space="preserve">      body: </w:t>
       </w:r>
       <w:proofErr w:type="spellStart"/>
+      <w:proofErr w:type="gramStart"/>
       <w:r>
         <w:t>req.body</w:t>
       </w:r>
       <w:proofErr w:type="spellEnd"/>
+      <w:proofErr w:type="gramEnd"/>
       <w:r>
         <w:t>,</w:t>
       </w:r>
@@ -1260,10 +1346,12 @@
         <w:t xml:space="preserve">      query: </w:t>
       </w:r>
       <w:proofErr w:type="spellStart"/>
+      <w:proofErr w:type="gramStart"/>
       <w:r>
         <w:t>req.query</w:t>
       </w:r>
       <w:proofErr w:type="spellEnd"/>
+      <w:proofErr w:type="gramEnd"/>
       <w:r>
         <w:t>,</w:t>
       </w:r>
@@ -1273,8 +1361,12 @@
       </w:r>
       <w:r>
         <w:br/>
+      </w:r>
+      <w:proofErr w:type="gramStart"/>
+      <w:r>
         <w:t xml:space="preserve">  }</w:t>
       </w:r>
+      <w:proofErr w:type="gramEnd"/>
       <w:r>
         <w:br/>
         <w:t>}</w:t>
@@ -1430,10 +1522,12 @@
           </w:tcPr>
           <w:p>
             <w:proofErr w:type="spellStart"/>
+            <w:proofErr w:type="gramStart"/>
             <w:r>
               <w:t>req.body</w:t>
             </w:r>
             <w:proofErr w:type="spellEnd"/>
+            <w:proofErr w:type="gramEnd"/>
           </w:p>
         </w:tc>
         <w:tc>
@@ -1467,10 +1561,12 @@
           </w:tcPr>
           <w:p>
             <w:proofErr w:type="spellStart"/>
+            <w:proofErr w:type="gramStart"/>
             <w:r>
               <w:t>req.query</w:t>
             </w:r>
             <w:proofErr w:type="spellEnd"/>
+            <w:proofErr w:type="gramEnd"/>
           </w:p>
         </w:tc>
         <w:tc>
@@ -1504,10 +1600,12 @@
           </w:tcPr>
           <w:p>
             <w:proofErr w:type="spellStart"/>
+            <w:proofErr w:type="gramStart"/>
             <w:r>
               <w:t>req.method</w:t>
             </w:r>
             <w:proofErr w:type="spellEnd"/>
+            <w:proofErr w:type="gramEnd"/>
           </w:p>
         </w:tc>
         <w:tc>
@@ -1559,9 +1657,14 @@
     </w:p>
     <w:p>
       <w:r>
-        <w:t>export async function POST(</w:t>
-      </w:r>
-      <w:proofErr w:type="spellStart"/>
+        <w:t xml:space="preserve">export async function </w:t>
+      </w:r>
+      <w:proofErr w:type="gramStart"/>
+      <w:r>
+        <w:t>POST(</w:t>
+      </w:r>
+      <w:proofErr w:type="spellStart"/>
+      <w:proofErr w:type="gramEnd"/>
       <w:r>
         <w:t>req</w:t>
       </w:r>
@@ -1585,10 +1688,12 @@
         <w:t xml:space="preserve"> body = await </w:t>
       </w:r>
       <w:proofErr w:type="spellStart"/>
+      <w:proofErr w:type="gramStart"/>
       <w:r>
         <w:t>req.json</w:t>
       </w:r>
       <w:proofErr w:type="spellEnd"/>
+      <w:proofErr w:type="gramEnd"/>
       <w:r>
         <w:t>();</w:t>
       </w:r>
@@ -1650,10 +1755,12 @@
         <w:t xml:space="preserve">d specific fields like </w:t>
       </w:r>
       <w:proofErr w:type="spellStart"/>
+      <w:proofErr w:type="gramStart"/>
       <w:r>
         <w:t>req.body</w:t>
       </w:r>
       <w:proofErr w:type="spellEnd"/>
+      <w:proofErr w:type="gramEnd"/>
       <w:r>
         <w:t>.</w:t>
       </w:r>
@@ -1663,7 +1770,15 @@
         <w:t>In older version we used to get body like we did in n</w:t>
       </w:r>
       <w:r>
-        <w:t>ode js but in modern it look like below</w:t>
+        <w:t xml:space="preserve">ode js but in modern it </w:t>
+      </w:r>
+      <w:proofErr w:type="gramStart"/>
+      <w:r>
+        <w:t>look</w:t>
+      </w:r>
+      <w:proofErr w:type="gramEnd"/>
+      <w:r>
+        <w:t xml:space="preserve"> like below</w:t>
       </w:r>
     </w:p>
     <w:p>
@@ -1766,10 +1881,18 @@
         <w:t>The problem with the file making</w:t>
       </w:r>
       <w:r>
-        <w:t xml:space="preserve"> strategy </w:t>
-      </w:r>
-      <w:r>
-        <w:t xml:space="preserve"> is that </w:t>
+        <w:t xml:space="preserve"> </w:t>
+      </w:r>
+      <w:proofErr w:type="gramStart"/>
+      <w:r>
+        <w:t xml:space="preserve">strategy </w:t>
+      </w:r>
+      <w:r>
+        <w:t xml:space="preserve"> is</w:t>
+      </w:r>
+      <w:proofErr w:type="gramEnd"/>
+      <w:r>
+        <w:t xml:space="preserve"> that </w:t>
       </w:r>
       <w:r>
         <w:t xml:space="preserve">if suppose </w:t>
@@ -1812,6 +1935,9 @@
         <w:jc w:val="center"/>
       </w:pPr>
       <w:r>
+        <w:rPr>
+          <w:noProof/>
+        </w:rPr>
         <w:drawing>
           <wp:inline distT="0" distB="0" distL="0" distR="0" wp14:anchorId="1988FD76" wp14:editId="3B3EB82A">
             <wp:extent cx="5731510" cy="455930"/>
@@ -1879,20 +2005,41 @@
       </w:r>
       <w:proofErr w:type="spellEnd"/>
       <w:r>
-        <w:t xml:space="preserve"> element</w:t>
-      </w:r>
-      <w:r>
-        <w:t>(who knows may be I am wrong here)</w:t>
-      </w:r>
-      <w:r>
         <w:t xml:space="preserve"> </w:t>
       </w:r>
+      <w:proofErr w:type="gramStart"/>
+      <w:r>
+        <w:t>element</w:t>
+      </w:r>
+      <w:r>
+        <w:t>(</w:t>
+      </w:r>
+      <w:proofErr w:type="gramEnd"/>
+      <w:r>
+        <w:t xml:space="preserve">who knows </w:t>
+      </w:r>
+      <w:proofErr w:type="gramStart"/>
+      <w:r>
+        <w:t>may be</w:t>
+      </w:r>
+      <w:proofErr w:type="gramEnd"/>
+      <w:r>
+        <w:t xml:space="preserve"> I am wrong here)</w:t>
+      </w:r>
+      <w:r>
+        <w:t xml:space="preserve"> </w:t>
+      </w:r>
       <w:r>
         <w:t xml:space="preserve">and on state update method we used </w:t>
       </w:r>
       <w:proofErr w:type="spellStart"/>
-      <w:r>
-        <w:t>e.target.innerText</w:t>
+      <w:proofErr w:type="gramStart"/>
+      <w:r>
+        <w:t>e.target</w:t>
+      </w:r>
+      <w:proofErr w:type="gramEnd"/>
+      <w:r>
+        <w:t>.innerText</w:t>
       </w:r>
       <w:proofErr w:type="spellEnd"/>
     </w:p>
@@ -1909,8 +2056,13 @@
         <w:t xml:space="preserve"> we can use </w:t>
       </w:r>
       <w:proofErr w:type="spellStart"/>
-      <w:r>
-        <w:t>e.target,value</w:t>
+      <w:proofErr w:type="gramStart"/>
+      <w:r>
+        <w:t>e.target</w:t>
+      </w:r>
+      <w:proofErr w:type="gramEnd"/>
+      <w:r>
+        <w:t>,value</w:t>
       </w:r>
       <w:proofErr w:type="spellEnd"/>
       <w:r>
@@ -1962,6 +2114,9 @@
         <w:jc w:val="center"/>
       </w:pPr>
       <w:r>
+        <w:rPr>
+          <w:noProof/>
+        </w:rPr>
         <w:drawing>
           <wp:inline distT="0" distB="0" distL="0" distR="0" wp14:anchorId="67403C19" wp14:editId="264E6B84">
             <wp:extent cx="3038899" cy="323895"/>
@@ -2003,9 +2158,59 @@
       <w:r>
         <w:t xml:space="preserve">Our hunting coder design is not good </w:t>
       </w:r>
-      <w:r>
-        <w:t xml:space="preserve">but the contact for is working </w:t>
-      </w:r>
+    </w:p>
+    <w:p>
+      <w:r>
+        <w:t>Teacher will tell us ho</w:t>
+      </w:r>
+      <w:r>
+        <w:t>w</w:t>
+      </w:r>
+      <w:r>
+        <w:t xml:space="preserve"> different component should be kept separate</w:t>
+      </w:r>
+      <w:r>
+        <w:t>.</w:t>
+      </w:r>
+    </w:p>
+    <w:p>
+      <w:r>
+        <w:t xml:space="preserve">Shortcut for </w:t>
+      </w:r>
+      <w:proofErr w:type="spellStart"/>
+      <w:proofErr w:type="gramStart"/>
+      <w:r>
+        <w:t>margin:auto</w:t>
+      </w:r>
+      <w:proofErr w:type="spellEnd"/>
+      <w:proofErr w:type="gramEnd"/>
+      <w:r>
+        <w:t xml:space="preserve"> will be </w:t>
+      </w:r>
+      <w:proofErr w:type="gramStart"/>
+      <w:r>
+        <w:rPr>
+          <w:b/>
+          <w:bCs/>
+        </w:rPr>
+        <w:t>m:auto</w:t>
+      </w:r>
+      <w:proofErr w:type="gramEnd"/>
+      <w:r>
+        <w:rPr>
+          <w:b/>
+          <w:bCs/>
+        </w:rPr>
+        <w:t xml:space="preserve"> </w:t>
+      </w:r>
+      <w:r>
+        <w:t xml:space="preserve">in </w:t>
+      </w:r>
+      <w:proofErr w:type="spellStart"/>
+      <w:r>
+        <w:t>VSCode</w:t>
+      </w:r>
+      <w:proofErr w:type="spellEnd"/>
     </w:p>
     <w:p/>
     <w:sectPr>

</xml_diff>

<commit_message>
Lesson 28 Styling Fixes in our Hunting coder Blog
</commit_message>
<xml_diff>
--- a/Notes2.docx
+++ b/Notes2.docx
@@ -2211,6 +2211,28 @@
         <w:t>VSCode</w:t>
       </w:r>
       <w:proofErr w:type="spellEnd"/>
+    </w:p>
+    <w:p>
+      <w:r>
+        <w:t xml:space="preserve">In name of logic we forgot to style </w:t>
+      </w:r>
+      <w:proofErr w:type="spellStart"/>
+      <w:r>
+        <w:t>outpages</w:t>
+      </w:r>
+      <w:proofErr w:type="spellEnd"/>
+      <w:r>
+        <w:t xml:space="preserve"> are not responsive which teacher will talk about in upcoming lesson </w:t>
+      </w:r>
+      <w:r>
+        <w:t xml:space="preserve">we will see how to keep styling of </w:t>
+      </w:r>
+      <w:r>
+        <w:t xml:space="preserve">the </w:t>
+      </w:r>
+      <w:r>
+        <w:t>component different from one another.</w:t>
+      </w:r>
     </w:p>
     <w:p/>
     <w:sectPr>

</xml_diff>

<commit_message>
Lesson 29 Adding Infinite Scroll to Hunting Coder
</commit_message>
<xml_diff>
--- a/Notes2.docx
+++ b/Notes2.docx
@@ -2232,6 +2232,523 @@
       </w:r>
       <w:r>
         <w:t>component different from one another.</w:t>
+      </w:r>
+    </w:p>
+    <w:p>
+      <w:r>
+        <w:t xml:space="preserve">Infinite scrolling is a feature that you see in any blog that looks very professional </w:t>
+      </w:r>
+      <w:r>
+        <w:t xml:space="preserve">Previously pagination was used </w:t>
+      </w:r>
+      <w:r>
+        <w:t>you did see going from on</w:t>
+      </w:r>
+      <w:r>
+        <w:t>e</w:t>
+      </w:r>
+      <w:r>
+        <w:t xml:space="preserve"> page to another page</w:t>
+      </w:r>
+      <w:r>
+        <w:t xml:space="preserve"> like 1,2,3 number come at the bottom of the page</w:t>
+      </w:r>
+      <w:r>
+        <w:t>.</w:t>
+      </w:r>
+    </w:p>
+    <w:p>
+      <w:r>
+        <w:t xml:space="preserve">Suppose you have 50 blogs and you want to show 5 blogs on each </w:t>
+      </w:r>
+      <w:proofErr w:type="gramStart"/>
+      <w:r>
+        <w:t xml:space="preserve">pages </w:t>
+      </w:r>
+      <w:r>
+        <w:t xml:space="preserve"> so</w:t>
+      </w:r>
+      <w:proofErr w:type="gramEnd"/>
+      <w:r>
+        <w:t xml:space="preserve"> 10 pages </w:t>
+      </w:r>
+      <w:r>
+        <w:t>will</w:t>
+      </w:r>
+      <w:r>
+        <w:t xml:space="preserve"> </w:t>
+      </w:r>
+      <w:r>
+        <w:t xml:space="preserve">be </w:t>
+      </w:r>
+      <w:proofErr w:type="gramStart"/>
+      <w:r>
+        <w:t xml:space="preserve">formed </w:t>
+      </w:r>
+      <w:r>
+        <w:t>.</w:t>
+      </w:r>
+      <w:proofErr w:type="gramEnd"/>
+      <w:r>
+        <w:t xml:space="preserve"> In the similar way </w:t>
+      </w:r>
+      <w:r>
+        <w:t xml:space="preserve">pagination can be showed </w:t>
+      </w:r>
+      <w:r>
+        <w:t xml:space="preserve">by infinite scroll </w:t>
+      </w:r>
+      <w:r>
+        <w:t xml:space="preserve">like </w:t>
+      </w:r>
+      <w:proofErr w:type="spellStart"/>
+      <w:r>
+        <w:t>facebook</w:t>
+      </w:r>
+      <w:proofErr w:type="spellEnd"/>
+      <w:r>
+        <w:t xml:space="preserve"> news feed </w:t>
+      </w:r>
+      <w:r>
+        <w:t>you keep scrolling and new thing appears</w:t>
+      </w:r>
+      <w:r>
+        <w:t xml:space="preserve"> we will implement things</w:t>
+      </w:r>
+      <w:r>
+        <w:t xml:space="preserve"> in out blog</w:t>
+      </w:r>
+      <w:r>
+        <w:t>s</w:t>
+      </w:r>
+      <w:r>
+        <w:t xml:space="preserve"> page</w:t>
+      </w:r>
+      <w:r>
+        <w:t xml:space="preserve">. </w:t>
+      </w:r>
+    </w:p>
+    <w:p>
+      <w:r>
+        <w:t>If you want to make blog manually then you can use intersection</w:t>
+      </w:r>
+      <w:r>
+        <w:t xml:space="preserve"> observer</w:t>
+      </w:r>
+      <w:r>
+        <w:t xml:space="preserve"> api. </w:t>
+      </w:r>
+    </w:p>
+    <w:p>
+      <w:pPr>
+        <w:rPr>
+          <w:b/>
+          <w:bCs/>
+        </w:rPr>
+      </w:pPr>
+      <w:r>
+        <w:rPr>
+          <w:b/>
+          <w:bCs/>
+        </w:rPr>
+        <w:t>The Intersection Observer API is a web API that allows developers to asynchronously observe changes in the visibility of a target element relative to an ancestor element or the viewport. It is commonly used for features like lazy-loading images and implementing infinite scrolling on websites but we don’t do here just to save our time</w:t>
+      </w:r>
+      <w:r>
+        <w:rPr>
+          <w:b/>
+          <w:bCs/>
+        </w:rPr>
+        <w:t xml:space="preserve">. </w:t>
+      </w:r>
+      <w:r>
+        <w:rPr>
+          <w:b/>
+          <w:bCs/>
+        </w:rPr>
+        <w:t xml:space="preserve">And we will use the libraries </w:t>
+      </w:r>
+      <w:r>
+        <w:rPr>
+          <w:b/>
+          <w:bCs/>
+        </w:rPr>
+        <w:t xml:space="preserve">which id already made for us </w:t>
+      </w:r>
+    </w:p>
+    <w:p>
+      <w:r>
+        <w:t xml:space="preserve">Sometimes it happens </w:t>
+      </w:r>
+      <w:r>
+        <w:t xml:space="preserve">that we will not good components </w:t>
+      </w:r>
+      <w:r>
+        <w:t xml:space="preserve">means you won’t get good packages for doing any </w:t>
+      </w:r>
+      <w:proofErr w:type="gramStart"/>
+      <w:r>
+        <w:t>work(</w:t>
+      </w:r>
+      <w:proofErr w:type="gramEnd"/>
+      <w:r>
+        <w:t>who knows)</w:t>
+      </w:r>
+    </w:p>
+    <w:p>
+      <w:pPr>
+        <w:jc w:val="center"/>
+        <w:rPr>
+          <w:b/>
+          <w:bCs/>
+        </w:rPr>
+      </w:pPr>
+      <w:proofErr w:type="spellStart"/>
+      <w:r>
+        <w:rPr>
+          <w:b/>
+          <w:bCs/>
+        </w:rPr>
+        <w:t>npm</w:t>
+      </w:r>
+      <w:proofErr w:type="spellEnd"/>
+      <w:r>
+        <w:rPr>
+          <w:b/>
+          <w:bCs/>
+        </w:rPr>
+        <w:t xml:space="preserve"> install --save react-infinite-scroll-component</w:t>
+      </w:r>
+    </w:p>
+    <w:p>
+      <w:proofErr w:type="gramStart"/>
+      <w:r>
+        <w:t>So</w:t>
+      </w:r>
+      <w:proofErr w:type="gramEnd"/>
+      <w:r>
+        <w:t xml:space="preserve"> we run the above command I context of </w:t>
+      </w:r>
+      <w:r>
+        <w:t xml:space="preserve">yarn </w:t>
+      </w:r>
+      <w:r>
+        <w:t xml:space="preserve">by </w:t>
+      </w:r>
+      <w:proofErr w:type="gramStart"/>
+      <w:r>
+        <w:t>using  below</w:t>
+      </w:r>
+      <w:proofErr w:type="gramEnd"/>
+      <w:r>
+        <w:t xml:space="preserve"> command</w:t>
+      </w:r>
+    </w:p>
+    <w:p>
+      <w:pPr>
+        <w:jc w:val="center"/>
+        <w:rPr>
+          <w:b/>
+          <w:bCs/>
+        </w:rPr>
+      </w:pPr>
+      <w:r>
+        <w:rPr>
+          <w:b/>
+          <w:bCs/>
+        </w:rPr>
+        <w:t>yarn add</w:t>
+      </w:r>
+      <w:r>
+        <w:rPr>
+          <w:b/>
+          <w:bCs/>
+        </w:rPr>
+        <w:t xml:space="preserve"> react-infinite-scroll-component</w:t>
+      </w:r>
+    </w:p>
+    <w:p>
+      <w:r>
+        <w:t xml:space="preserve">Now we will import it </w:t>
+      </w:r>
+      <w:r>
+        <w:t>and use it and see what are the functions inside it</w:t>
+      </w:r>
+      <w:r>
+        <w:t xml:space="preserve">. </w:t>
+      </w:r>
+    </w:p>
+    <w:p>
+      <w:pPr>
+        <w:jc w:val="center"/>
+      </w:pPr>
+      <w:r>
+        <w:rPr>
+          <w:noProof/>
+        </w:rPr>
+        <w:lastRenderedPageBreak/>
+        <w:drawing>
+          <wp:inline distT="0" distB="0" distL="0" distR="0" wp14:anchorId="0BA8727E" wp14:editId="583D0698">
+            <wp:extent cx="4706007" cy="4544059"/>
+            <wp:effectExtent l="0" t="0" r="0" b="9525"/>
+            <wp:docPr id="1228374796" name="Picture 1"/>
+            <wp:cNvGraphicFramePr>
+              <a:graphicFrameLocks xmlns:a="http://schemas.openxmlformats.org/drawingml/2006/main" noChangeAspect="1"/>
+            </wp:cNvGraphicFramePr>
+            <a:graphic xmlns:a="http://schemas.openxmlformats.org/drawingml/2006/main">
+              <a:graphicData uri="http://schemas.openxmlformats.org/drawingml/2006/picture">
+                <pic:pic xmlns:pic="http://schemas.openxmlformats.org/drawingml/2006/picture">
+                  <pic:nvPicPr>
+                    <pic:cNvPr id="1228374796" name=""/>
+                    <pic:cNvPicPr/>
+                  </pic:nvPicPr>
+                  <pic:blipFill>
+                    <a:blip r:embed="rId18"/>
+                    <a:stretch>
+                      <a:fillRect/>
+                    </a:stretch>
+                  </pic:blipFill>
+                  <pic:spPr>
+                    <a:xfrm>
+                      <a:off x="0" y="0"/>
+                      <a:ext cx="4706007" cy="4544059"/>
+                    </a:xfrm>
+                    <a:prstGeom prst="rect">
+                      <a:avLst/>
+                    </a:prstGeom>
+                  </pic:spPr>
+                </pic:pic>
+              </a:graphicData>
+            </a:graphic>
+          </wp:inline>
+        </w:drawing>
+      </w:r>
+    </w:p>
+    <w:p>
+      <w:r>
+        <w:t xml:space="preserve">Data length </w:t>
+      </w:r>
+      <w:r>
+        <w:t xml:space="preserve">of the data that to be </w:t>
+      </w:r>
+      <w:proofErr w:type="gramStart"/>
+      <w:r>
+        <w:t>shown</w:t>
+      </w:r>
+      <w:r>
+        <w:t xml:space="preserve"> ,</w:t>
+      </w:r>
+      <w:proofErr w:type="gramEnd"/>
+      <w:r>
+        <w:t xml:space="preserve"> next is the </w:t>
+      </w:r>
+      <w:proofErr w:type="gramStart"/>
+      <w:r>
+        <w:t xml:space="preserve">function  </w:t>
+      </w:r>
+      <w:r>
+        <w:t>that</w:t>
+      </w:r>
+      <w:proofErr w:type="gramEnd"/>
+      <w:r>
+        <w:t xml:space="preserve"> will be called when we scroll and reach the bottom and more data is needed to be loaded.</w:t>
+      </w:r>
+    </w:p>
+    <w:p>
+      <w:r>
+        <w:t xml:space="preserve">The props below the </w:t>
+      </w:r>
+      <w:proofErr w:type="spellStart"/>
+      <w:r>
+        <w:t>endMessage</w:t>
+      </w:r>
+      <w:proofErr w:type="spellEnd"/>
+      <w:r>
+        <w:t xml:space="preserve"> </w:t>
+      </w:r>
+      <w:r>
+        <w:t>are used when you w</w:t>
+      </w:r>
+      <w:r>
+        <w:t>a</w:t>
+      </w:r>
+      <w:r>
+        <w:t>nt pull do</w:t>
+      </w:r>
+      <w:r>
+        <w:t>w</w:t>
+      </w:r>
+      <w:r>
+        <w:t xml:space="preserve">n </w:t>
+      </w:r>
+      <w:proofErr w:type="gramStart"/>
+      <w:r>
+        <w:t>function</w:t>
+      </w:r>
+      <w:r>
+        <w:t>al</w:t>
+      </w:r>
+      <w:r>
+        <w:t>ity(</w:t>
+      </w:r>
+      <w:proofErr w:type="gramEnd"/>
+      <w:r>
+        <w:t>who knows)</w:t>
+      </w:r>
+    </w:p>
+    <w:p>
+      <w:r>
+        <w:t xml:space="preserve">You can use </w:t>
+      </w:r>
+      <w:proofErr w:type="spellStart"/>
+      <w:r>
+        <w:t>InfiniteScroll</w:t>
+      </w:r>
+      <w:proofErr w:type="spellEnd"/>
+      <w:r>
+        <w:t xml:space="preserve"> only in client side so </w:t>
+      </w:r>
+      <w:r>
+        <w:t xml:space="preserve">we need to use it in client component so we will change the blogs from SSG to client component. </w:t>
+      </w:r>
+    </w:p>
+    <w:p>
+      <w:r>
+        <w:t>Wh</w:t>
+      </w:r>
+      <w:r>
+        <w:t>e</w:t>
+      </w:r>
+      <w:r>
+        <w:t xml:space="preserve">never </w:t>
+      </w:r>
+      <w:r>
+        <w:t xml:space="preserve">we use any library </w:t>
+      </w:r>
+      <w:proofErr w:type="spellStart"/>
+      <w:r>
+        <w:t>onw</w:t>
+      </w:r>
+      <w:proofErr w:type="spellEnd"/>
+      <w:r>
+        <w:t xml:space="preserve"> imp</w:t>
+      </w:r>
+      <w:r>
+        <w:t>o</w:t>
+      </w:r>
+      <w:r>
+        <w:t>rta</w:t>
+      </w:r>
+      <w:r>
+        <w:t>nt</w:t>
+      </w:r>
+      <w:r>
+        <w:t xml:space="preserve"> thing is that</w:t>
+      </w:r>
+      <w:r>
+        <w:t xml:space="preserve"> how to use it </w:t>
+      </w:r>
+      <w:r>
+        <w:t>how the library is def</w:t>
+      </w:r>
+      <w:r>
+        <w:t xml:space="preserve">ined </w:t>
+      </w:r>
+      <w:r>
+        <w:t xml:space="preserve">is it </w:t>
+      </w:r>
+      <w:proofErr w:type="spellStart"/>
+      <w:r>
+        <w:t>idefined</w:t>
+      </w:r>
+      <w:proofErr w:type="spellEnd"/>
+      <w:r>
+        <w:t xml:space="preserve"> like that you have t</w:t>
+      </w:r>
+      <w:r>
+        <w:t xml:space="preserve">o </w:t>
+      </w:r>
+      <w:r>
+        <w:t xml:space="preserve">use the map </w:t>
+      </w:r>
+      <w:r>
+        <w:t xml:space="preserve">it is defined like this </w:t>
+      </w:r>
+      <w:r>
+        <w:t xml:space="preserve">if we keep single </w:t>
+      </w:r>
+      <w:proofErr w:type="gramStart"/>
+      <w:r>
+        <w:t>item</w:t>
+      </w:r>
+      <w:proofErr w:type="gramEnd"/>
+      <w:r>
+        <w:t xml:space="preserve"> </w:t>
+      </w:r>
+      <w:r>
+        <w:t>we need to see al</w:t>
+      </w:r>
+      <w:r>
+        <w:t>l</w:t>
+      </w:r>
+      <w:r>
+        <w:t xml:space="preserve"> </w:t>
+      </w:r>
+      <w:proofErr w:type="gramStart"/>
+      <w:r>
+        <w:t>this thi</w:t>
+      </w:r>
+      <w:r>
+        <w:t>n</w:t>
+      </w:r>
+      <w:r>
+        <w:t>gs</w:t>
+      </w:r>
+      <w:proofErr w:type="gramEnd"/>
+      <w:r>
+        <w:t xml:space="preserve"> </w:t>
+      </w:r>
+    </w:p>
+    <w:p>
+      <w:pPr>
+        <w:rPr>
+          <w:b/>
+          <w:bCs/>
+        </w:rPr>
+      </w:pPr>
+      <w:proofErr w:type="gramStart"/>
+      <w:r>
+        <w:rPr>
+          <w:b/>
+          <w:bCs/>
+        </w:rPr>
+        <w:t>Note:-</w:t>
+      </w:r>
+      <w:proofErr w:type="gramEnd"/>
+    </w:p>
+    <w:p>
+      <w:pPr>
+        <w:pBdr>
+          <w:bottom w:val="single" w:sz="12" w:space="1" w:color="auto"/>
+        </w:pBdr>
+      </w:pPr>
+      <w:r>
+        <w:t xml:space="preserve">Sometime it happens </w:t>
+      </w:r>
+      <w:r>
+        <w:t xml:space="preserve">in react that one component is </w:t>
+      </w:r>
+      <w:proofErr w:type="gramStart"/>
+      <w:r>
+        <w:t>show  two</w:t>
+      </w:r>
+      <w:proofErr w:type="gramEnd"/>
+      <w:r>
+        <w:t xml:space="preserve"> times so reload to remove the bug</w:t>
+      </w:r>
+    </w:p>
+    <w:p>
+      <w:r>
+        <w:t xml:space="preserve">We will update blogs with more blogs </w:t>
       </w:r>
     </w:p>
     <w:p/>

</xml_diff>

<commit_message>
Lesson 30 Adding Responsive Design to Hunting Coder(real)
</commit_message>
<xml_diff>
--- a/Notes2.docx
+++ b/Notes2.docx
@@ -59,18 +59,10 @@
     </w:p>
     <w:p>
       <w:r>
-        <w:t xml:space="preserve">In nay </w:t>
-      </w:r>
-      <w:proofErr w:type="gramStart"/>
-      <w:r>
-        <w:t>container</w:t>
-      </w:r>
-      <w:r>
-        <w:t>(</w:t>
-      </w:r>
-      <w:proofErr w:type="gramEnd"/>
-      <w:r>
-        <w:t>or component)</w:t>
+        <w:t>In nay container</w:t>
+      </w:r>
+      <w:r>
+        <w:t>(or component)</w:t>
       </w:r>
       <w:r>
         <w:t xml:space="preserve"> if you want to </w:t>
@@ -555,14 +547,9 @@
       </w:r>
     </w:p>
     <w:p>
-      <w:proofErr w:type="gramStart"/>
       <w:r>
         <w:lastRenderedPageBreak/>
-        <w:t>So</w:t>
-      </w:r>
-      <w:proofErr w:type="gramEnd"/>
-      <w:r>
-        <w:t xml:space="preserve"> we can so this thing Now we can see it is getting rendered as shown below</w:t>
+        <w:t>So we can so this thing Now we can see it is getting rendered as shown below</w:t>
       </w:r>
     </w:p>
     <w:p>
@@ -664,13 +651,8 @@
         <w:t xml:space="preserve"> s</w:t>
       </w:r>
       <w:r>
-        <w:t xml:space="preserve">ubmit the </w:t>
-      </w:r>
-      <w:proofErr w:type="gramStart"/>
-      <w:r>
-        <w:t>form</w:t>
-      </w:r>
-      <w:proofErr w:type="gramEnd"/>
+        <w:t>ubmit the form</w:t>
+      </w:r>
       <w:r>
         <w:t xml:space="preserve"> we will definitely have to make an API to co</w:t>
       </w:r>
@@ -736,29 +718,8 @@
       </w:r>
     </w:p>
     <w:p>
-      <w:proofErr w:type="gramStart"/>
-      <w:r>
-        <w:t>So</w:t>
-      </w:r>
-      <w:proofErr w:type="gramEnd"/>
-      <w:r>
-        <w:t xml:space="preserve"> for </w:t>
-      </w:r>
-      <w:proofErr w:type="gramStart"/>
-      <w:r>
-        <w:t>now</w:t>
-      </w:r>
-      <w:proofErr w:type="gramEnd"/>
-      <w:r>
-        <w:t xml:space="preserve"> our post request handler </w:t>
-      </w:r>
-      <w:proofErr w:type="gramStart"/>
-      <w:r>
-        <w:t>look</w:t>
-      </w:r>
-      <w:proofErr w:type="gramEnd"/>
-      <w:r>
-        <w:t xml:space="preserve"> like below</w:t>
+      <w:r>
+        <w:t>So for now our post request handler look like below</w:t>
       </w:r>
     </w:p>
     <w:p>
@@ -807,13 +768,8 @@
       </w:r>
     </w:p>
     <w:p>
-      <w:proofErr w:type="gramStart"/>
-      <w:r>
-        <w:t>Ols</w:t>
-      </w:r>
-      <w:proofErr w:type="gramEnd"/>
-      <w:r>
-        <w:t xml:space="preserve"> version used to look like below</w:t>
+      <w:r>
+        <w:t>Ols version used to look like below</w:t>
       </w:r>
     </w:p>
     <w:p>
@@ -921,12 +877,10 @@
         <w:t xml:space="preserve">, not plain JSON, so sending it directly with </w:t>
       </w:r>
       <w:proofErr w:type="spellStart"/>
-      <w:proofErr w:type="gramStart"/>
       <w:r>
         <w:t>res.json</w:t>
       </w:r>
       <w:proofErr w:type="spellEnd"/>
-      <w:proofErr w:type="gramEnd"/>
       <w:r>
         <w:t>(</w:t>
       </w:r>
@@ -984,14 +938,9 @@
     </w:p>
     <w:p>
       <w:r>
-        <w:t xml:space="preserve">export default function </w:t>
-      </w:r>
-      <w:proofErr w:type="gramStart"/>
-      <w:r>
-        <w:t>handler(</w:t>
-      </w:r>
-      <w:proofErr w:type="spellStart"/>
-      <w:proofErr w:type="gramEnd"/>
+        <w:t>export default function handler(</w:t>
+      </w:r>
+      <w:proofErr w:type="spellStart"/>
       <w:r>
         <w:t>req</w:t>
       </w:r>
@@ -1097,7 +1046,6 @@
         <w:t xml:space="preserve">Why </w:t>
       </w:r>
       <w:proofErr w:type="spellStart"/>
-      <w:proofErr w:type="gramStart"/>
       <w:r>
         <w:rPr>
           <w:b/>
@@ -1106,7 +1054,6 @@
         <w:t>res.json</w:t>
       </w:r>
       <w:proofErr w:type="spellEnd"/>
-      <w:proofErr w:type="gramEnd"/>
       <w:r>
         <w:rPr>
           <w:b/>
@@ -1138,25 +1085,18 @@
     </w:p>
     <w:p>
       <w:proofErr w:type="spellStart"/>
-      <w:proofErr w:type="gramStart"/>
       <w:r>
         <w:t>res.status</w:t>
       </w:r>
       <w:proofErr w:type="spellEnd"/>
-      <w:proofErr w:type="gramEnd"/>
-      <w:r>
-        <w:t>(200</w:t>
-      </w:r>
-      <w:proofErr w:type="gramStart"/>
-      <w:r>
-        <w:t>).</w:t>
+      <w:r>
+        <w:t>(200).</w:t>
       </w:r>
       <w:proofErr w:type="spellStart"/>
       <w:r>
         <w:t>json</w:t>
       </w:r>
       <w:proofErr w:type="spellEnd"/>
-      <w:proofErr w:type="gramEnd"/>
       <w:r>
         <w:t>(</w:t>
       </w:r>
@@ -1257,14 +1197,9 @@
     </w:p>
     <w:p>
       <w:r>
-        <w:t xml:space="preserve">export default function </w:t>
-      </w:r>
-      <w:proofErr w:type="gramStart"/>
-      <w:r>
-        <w:t>handler(</w:t>
-      </w:r>
-      <w:proofErr w:type="spellStart"/>
-      <w:proofErr w:type="gramEnd"/>
+        <w:t>export default function handler(</w:t>
+      </w:r>
+      <w:proofErr w:type="spellStart"/>
       <w:r>
         <w:t>req</w:t>
       </w:r>
@@ -1277,12 +1212,10 @@
         <w:t xml:space="preserve">  if (</w:t>
       </w:r>
       <w:proofErr w:type="spellStart"/>
-      <w:proofErr w:type="gramStart"/>
       <w:r>
         <w:t>req.method</w:t>
       </w:r>
       <w:proofErr w:type="spellEnd"/>
-      <w:proofErr w:type="gramEnd"/>
       <w:r>
         <w:t xml:space="preserve"> === "POST") {</w:t>
       </w:r>
@@ -1291,25 +1224,18 @@
         <w:t xml:space="preserve">    </w:t>
       </w:r>
       <w:proofErr w:type="spellStart"/>
-      <w:proofErr w:type="gramStart"/>
       <w:r>
         <w:t>res.status</w:t>
       </w:r>
       <w:proofErr w:type="spellEnd"/>
-      <w:proofErr w:type="gramEnd"/>
-      <w:r>
-        <w:t>(200</w:t>
-      </w:r>
-      <w:proofErr w:type="gramStart"/>
-      <w:r>
-        <w:t>).</w:t>
+      <w:r>
+        <w:t>(200).</w:t>
       </w:r>
       <w:proofErr w:type="spellStart"/>
       <w:r>
         <w:t>json</w:t>
       </w:r>
       <w:proofErr w:type="spellEnd"/>
-      <w:proofErr w:type="gramEnd"/>
       <w:r>
         <w:t>({</w:t>
       </w:r>
@@ -1318,12 +1244,10 @@
         <w:t xml:space="preserve">      method: </w:t>
       </w:r>
       <w:proofErr w:type="spellStart"/>
-      <w:proofErr w:type="gramStart"/>
       <w:r>
         <w:t>req.method</w:t>
       </w:r>
       <w:proofErr w:type="spellEnd"/>
-      <w:proofErr w:type="gramEnd"/>
       <w:r>
         <w:t>,</w:t>
       </w:r>
@@ -1332,12 +1256,10 @@
         <w:t xml:space="preserve">      body: </w:t>
       </w:r>
       <w:proofErr w:type="spellStart"/>
-      <w:proofErr w:type="gramStart"/>
       <w:r>
         <w:t>req.body</w:t>
       </w:r>
       <w:proofErr w:type="spellEnd"/>
-      <w:proofErr w:type="gramEnd"/>
       <w:r>
         <w:t>,</w:t>
       </w:r>
@@ -1346,12 +1268,10 @@
         <w:t xml:space="preserve">      query: </w:t>
       </w:r>
       <w:proofErr w:type="spellStart"/>
-      <w:proofErr w:type="gramStart"/>
       <w:r>
         <w:t>req.query</w:t>
       </w:r>
       <w:proofErr w:type="spellEnd"/>
-      <w:proofErr w:type="gramEnd"/>
       <w:r>
         <w:t>,</w:t>
       </w:r>
@@ -1361,12 +1281,8 @@
       </w:r>
       <w:r>
         <w:br/>
-      </w:r>
-      <w:proofErr w:type="gramStart"/>
-      <w:r>
         <w:t xml:space="preserve">  }</w:t>
       </w:r>
-      <w:proofErr w:type="gramEnd"/>
       <w:r>
         <w:br/>
         <w:t>}</w:t>
@@ -1522,12 +1438,10 @@
           </w:tcPr>
           <w:p>
             <w:proofErr w:type="spellStart"/>
-            <w:proofErr w:type="gramStart"/>
             <w:r>
               <w:t>req.body</w:t>
             </w:r>
             <w:proofErr w:type="spellEnd"/>
-            <w:proofErr w:type="gramEnd"/>
           </w:p>
         </w:tc>
         <w:tc>
@@ -1561,12 +1475,10 @@
           </w:tcPr>
           <w:p>
             <w:proofErr w:type="spellStart"/>
-            <w:proofErr w:type="gramStart"/>
             <w:r>
               <w:t>req.query</w:t>
             </w:r>
             <w:proofErr w:type="spellEnd"/>
-            <w:proofErr w:type="gramEnd"/>
           </w:p>
         </w:tc>
         <w:tc>
@@ -1600,12 +1512,10 @@
           </w:tcPr>
           <w:p>
             <w:proofErr w:type="spellStart"/>
-            <w:proofErr w:type="gramStart"/>
             <w:r>
               <w:t>req.method</w:t>
             </w:r>
             <w:proofErr w:type="spellEnd"/>
-            <w:proofErr w:type="gramEnd"/>
           </w:p>
         </w:tc>
         <w:tc>
@@ -1657,14 +1567,9 @@
     </w:p>
     <w:p>
       <w:r>
-        <w:t xml:space="preserve">export async function </w:t>
-      </w:r>
-      <w:proofErr w:type="gramStart"/>
-      <w:r>
-        <w:t>POST(</w:t>
-      </w:r>
-      <w:proofErr w:type="spellStart"/>
-      <w:proofErr w:type="gramEnd"/>
+        <w:t>export async function POST(</w:t>
+      </w:r>
+      <w:proofErr w:type="spellStart"/>
       <w:r>
         <w:t>req</w:t>
       </w:r>
@@ -1688,12 +1593,10 @@
         <w:t xml:space="preserve"> body = await </w:t>
       </w:r>
       <w:proofErr w:type="spellStart"/>
-      <w:proofErr w:type="gramStart"/>
       <w:r>
         <w:t>req.json</w:t>
       </w:r>
       <w:proofErr w:type="spellEnd"/>
-      <w:proofErr w:type="gramEnd"/>
       <w:r>
         <w:t>();</w:t>
       </w:r>
@@ -1755,12 +1658,10 @@
         <w:t xml:space="preserve">d specific fields like </w:t>
       </w:r>
       <w:proofErr w:type="spellStart"/>
-      <w:proofErr w:type="gramStart"/>
       <w:r>
         <w:t>req.body</w:t>
       </w:r>
       <w:proofErr w:type="spellEnd"/>
-      <w:proofErr w:type="gramEnd"/>
       <w:r>
         <w:t>.</w:t>
       </w:r>
@@ -1770,15 +1671,7 @@
         <w:t>In older version we used to get body like we did in n</w:t>
       </w:r>
       <w:r>
-        <w:t xml:space="preserve">ode js but in modern it </w:t>
-      </w:r>
-      <w:proofErr w:type="gramStart"/>
-      <w:r>
-        <w:t>look</w:t>
-      </w:r>
-      <w:proofErr w:type="gramEnd"/>
-      <w:r>
-        <w:t xml:space="preserve"> like below</w:t>
+        <w:t>ode js but in modern it look like below</w:t>
       </w:r>
     </w:p>
     <w:p>
@@ -1881,18 +1774,10 @@
         <w:t>The problem with the file making</w:t>
       </w:r>
       <w:r>
-        <w:t xml:space="preserve"> </w:t>
-      </w:r>
-      <w:proofErr w:type="gramStart"/>
-      <w:r>
-        <w:t xml:space="preserve">strategy </w:t>
-      </w:r>
-      <w:r>
-        <w:t xml:space="preserve"> is</w:t>
-      </w:r>
-      <w:proofErr w:type="gramEnd"/>
-      <w:r>
-        <w:t xml:space="preserve"> that </w:t>
+        <w:t xml:space="preserve"> strategy </w:t>
+      </w:r>
+      <w:r>
+        <w:t xml:space="preserve"> is that </w:t>
       </w:r>
       <w:r>
         <w:t xml:space="preserve">if suppose </w:t>
@@ -2005,41 +1890,20 @@
       </w:r>
       <w:proofErr w:type="spellEnd"/>
       <w:r>
+        <w:t xml:space="preserve"> element</w:t>
+      </w:r>
+      <w:r>
+        <w:t>(who knows may be I am wrong here)</w:t>
+      </w:r>
+      <w:r>
         <w:t xml:space="preserve"> </w:t>
       </w:r>
-      <w:proofErr w:type="gramStart"/>
-      <w:r>
-        <w:t>element</w:t>
-      </w:r>
-      <w:r>
-        <w:t>(</w:t>
-      </w:r>
-      <w:proofErr w:type="gramEnd"/>
-      <w:r>
-        <w:t xml:space="preserve">who knows </w:t>
-      </w:r>
-      <w:proofErr w:type="gramStart"/>
-      <w:r>
-        <w:t>may be</w:t>
-      </w:r>
-      <w:proofErr w:type="gramEnd"/>
-      <w:r>
-        <w:t xml:space="preserve"> I am wrong here)</w:t>
-      </w:r>
-      <w:r>
-        <w:t xml:space="preserve"> </w:t>
-      </w:r>
       <w:r>
         <w:t xml:space="preserve">and on state update method we used </w:t>
       </w:r>
       <w:proofErr w:type="spellStart"/>
-      <w:proofErr w:type="gramStart"/>
-      <w:r>
-        <w:t>e.target</w:t>
-      </w:r>
-      <w:proofErr w:type="gramEnd"/>
-      <w:r>
-        <w:t>.innerText</w:t>
+      <w:r>
+        <w:t>e.target.innerText</w:t>
       </w:r>
       <w:proofErr w:type="spellEnd"/>
     </w:p>
@@ -2056,13 +1920,8 @@
         <w:t xml:space="preserve"> we can use </w:t>
       </w:r>
       <w:proofErr w:type="spellStart"/>
-      <w:proofErr w:type="gramStart"/>
-      <w:r>
-        <w:t>e.target</w:t>
-      </w:r>
-      <w:proofErr w:type="gramEnd"/>
-      <w:r>
-        <w:t>,value</w:t>
+      <w:r>
+        <w:t>e.target,value</w:t>
       </w:r>
       <w:proofErr w:type="spellEnd"/>
       <w:r>
@@ -2178,16 +2037,13 @@
         <w:t xml:space="preserve">Shortcut for </w:t>
       </w:r>
       <w:proofErr w:type="spellStart"/>
-      <w:proofErr w:type="gramStart"/>
       <w:r>
         <w:t>margin:auto</w:t>
       </w:r>
       <w:proofErr w:type="spellEnd"/>
-      <w:proofErr w:type="gramEnd"/>
       <w:r>
         <w:t xml:space="preserve"> will be </w:t>
       </w:r>
-      <w:proofErr w:type="gramStart"/>
       <w:r>
         <w:rPr>
           <w:b/>
@@ -2195,7 +2051,6 @@
         </w:rPr>
         <w:t>m:auto</w:t>
       </w:r>
-      <w:proofErr w:type="gramEnd"/>
       <w:r>
         <w:rPr>
           <w:b/>
@@ -2259,18 +2114,10 @@
     </w:p>
     <w:p>
       <w:r>
-        <w:t xml:space="preserve">Suppose you have 50 blogs and you want to show 5 blogs on each </w:t>
-      </w:r>
-      <w:proofErr w:type="gramStart"/>
-      <w:r>
-        <w:t xml:space="preserve">pages </w:t>
-      </w:r>
-      <w:r>
-        <w:t xml:space="preserve"> so</w:t>
-      </w:r>
-      <w:proofErr w:type="gramEnd"/>
-      <w:r>
-        <w:t xml:space="preserve"> 10 pages </w:t>
+        <w:t xml:space="preserve">Suppose you have 50 blogs and you want to show 5 blogs on each pages </w:t>
+      </w:r>
+      <w:r>
+        <w:t xml:space="preserve"> so 10 pages </w:t>
       </w:r>
       <w:r>
         <w:t>will</w:t>
@@ -2281,16 +2128,11 @@
       <w:r>
         <w:t xml:space="preserve">be </w:t>
       </w:r>
-      <w:proofErr w:type="gramStart"/>
       <w:r>
         <w:t xml:space="preserve">formed </w:t>
       </w:r>
       <w:r>
-        <w:t>.</w:t>
-      </w:r>
-      <w:proofErr w:type="gramEnd"/>
-      <w:r>
-        <w:t xml:space="preserve"> In the similar way </w:t>
+        <w:t xml:space="preserve">. In the similar way </w:t>
       </w:r>
       <w:r>
         <w:t xml:space="preserve">pagination can be showed </w:t>
@@ -2383,15 +2225,7 @@
         <w:t xml:space="preserve">that we will not good components </w:t>
       </w:r>
       <w:r>
-        <w:t xml:space="preserve">means you won’t get good packages for doing any </w:t>
-      </w:r>
-      <w:proofErr w:type="gramStart"/>
-      <w:r>
-        <w:t>work(</w:t>
-      </w:r>
-      <w:proofErr w:type="gramEnd"/>
-      <w:r>
-        <w:t>who knows)</w:t>
+        <w:t>means you won’t get good packages for doing any work(who knows)</w:t>
       </w:r>
     </w:p>
     <w:p>
@@ -2420,27 +2254,14 @@
       </w:r>
     </w:p>
     <w:p>
-      <w:proofErr w:type="gramStart"/>
-      <w:r>
-        <w:t>So</w:t>
-      </w:r>
-      <w:proofErr w:type="gramEnd"/>
-      <w:r>
-        <w:t xml:space="preserve"> we run the above command I context of </w:t>
+      <w:r>
+        <w:t xml:space="preserve">So we run the above command I context of </w:t>
       </w:r>
       <w:r>
         <w:t xml:space="preserve">yarn </w:t>
       </w:r>
       <w:r>
-        <w:t xml:space="preserve">by </w:t>
-      </w:r>
-      <w:proofErr w:type="gramStart"/>
-      <w:r>
-        <w:t>using  below</w:t>
-      </w:r>
-      <w:proofErr w:type="gramEnd"/>
-      <w:r>
-        <w:t xml:space="preserve"> command</w:t>
+        <w:t>by using  below command</w:t>
       </w:r>
     </w:p>
     <w:p>
@@ -2528,29 +2349,13 @@
         <w:t xml:space="preserve">Data length </w:t>
       </w:r>
       <w:r>
-        <w:t xml:space="preserve">of the data that to be </w:t>
-      </w:r>
-      <w:proofErr w:type="gramStart"/>
-      <w:r>
-        <w:t>shown</w:t>
-      </w:r>
-      <w:r>
-        <w:t xml:space="preserve"> ,</w:t>
-      </w:r>
-      <w:proofErr w:type="gramEnd"/>
-      <w:r>
-        <w:t xml:space="preserve"> next is the </w:t>
-      </w:r>
-      <w:proofErr w:type="gramStart"/>
-      <w:r>
-        <w:t xml:space="preserve">function  </w:t>
-      </w:r>
-      <w:r>
-        <w:t>that</w:t>
-      </w:r>
-      <w:proofErr w:type="gramEnd"/>
-      <w:r>
-        <w:t xml:space="preserve"> will be called when we scroll and reach the bottom and more data is needed to be loaded.</w:t>
+        <w:t>of the data that to be shown</w:t>
+      </w:r>
+      <w:r>
+        <w:t xml:space="preserve"> , next is the function  </w:t>
+      </w:r>
+      <w:r>
+        <w:t>that will be called when we scroll and reach the bottom and more data is needed to be loaded.</w:t>
       </w:r>
     </w:p>
     <w:p>
@@ -2578,21 +2383,13 @@
         <w:t>w</w:t>
       </w:r>
       <w:r>
-        <w:t xml:space="preserve">n </w:t>
-      </w:r>
-      <w:proofErr w:type="gramStart"/>
-      <w:r>
-        <w:t>function</w:t>
+        <w:t>n function</w:t>
       </w:r>
       <w:r>
         <w:t>al</w:t>
       </w:r>
       <w:r>
-        <w:t>ity(</w:t>
-      </w:r>
-      <w:proofErr w:type="gramEnd"/>
-      <w:r>
-        <w:t>who knows)</w:t>
+        <w:t>ity(who knows)</w:t>
       </w:r>
     </w:p>
     <w:p>
@@ -2674,15 +2471,7 @@
         <w:t xml:space="preserve">it is defined like this </w:t>
       </w:r>
       <w:r>
-        <w:t xml:space="preserve">if we keep single </w:t>
-      </w:r>
-      <w:proofErr w:type="gramStart"/>
-      <w:r>
-        <w:t>item</w:t>
-      </w:r>
-      <w:proofErr w:type="gramEnd"/>
-      <w:r>
-        <w:t xml:space="preserve"> </w:t>
+        <w:t xml:space="preserve">if we keep single item </w:t>
       </w:r>
       <w:r>
         <w:t>we need to see al</w:t>
@@ -2691,21 +2480,13 @@
         <w:t>l</w:t>
       </w:r>
       <w:r>
-        <w:t xml:space="preserve"> </w:t>
-      </w:r>
-      <w:proofErr w:type="gramStart"/>
-      <w:r>
-        <w:t>this thi</w:t>
+        <w:t xml:space="preserve"> this thi</w:t>
       </w:r>
       <w:r>
         <w:t>n</w:t>
       </w:r>
       <w:r>
-        <w:t>gs</w:t>
-      </w:r>
-      <w:proofErr w:type="gramEnd"/>
-      <w:r>
-        <w:t xml:space="preserve"> </w:t>
+        <w:t xml:space="preserve">gs </w:t>
       </w:r>
     </w:p>
     <w:p>
@@ -2715,7 +2496,6 @@
           <w:bCs/>
         </w:rPr>
       </w:pPr>
-      <w:proofErr w:type="gramStart"/>
       <w:r>
         <w:rPr>
           <w:b/>
@@ -2723,7 +2503,6 @@
         </w:rPr>
         <w:t>Note:-</w:t>
       </w:r>
-      <w:proofErr w:type="gramEnd"/>
     </w:p>
     <w:p>
       <w:pPr>
@@ -2735,15 +2514,7 @@
         <w:t xml:space="preserve">Sometime it happens </w:t>
       </w:r>
       <w:r>
-        <w:t xml:space="preserve">in react that one component is </w:t>
-      </w:r>
-      <w:proofErr w:type="gramStart"/>
-      <w:r>
-        <w:t>show  two</w:t>
-      </w:r>
-      <w:proofErr w:type="gramEnd"/>
-      <w:r>
-        <w:t xml:space="preserve"> times so reload to remove the bug</w:t>
+        <w:t>in react that one component is show  two times so reload to remove the bug</w:t>
       </w:r>
     </w:p>
     <w:p>
@@ -2751,7 +2522,127 @@
         <w:t xml:space="preserve">We will update blogs with more blogs </w:t>
       </w:r>
     </w:p>
-    <w:p/>
+    <w:p>
+      <w:r>
+        <w:t xml:space="preserve">Out blog is almost over </w:t>
+      </w:r>
+      <w:r>
+        <w:t xml:space="preserve">except for responsiveness </w:t>
+      </w:r>
+      <w:r>
+        <w:t xml:space="preserve">we will  make our blog responsive and will write media queries </w:t>
+      </w:r>
+      <w:r>
+        <w:t>how we can we run media que</w:t>
+      </w:r>
+      <w:r>
+        <w:t xml:space="preserve">ries in the css model </w:t>
+      </w:r>
+      <w:r>
+        <w:t xml:space="preserve">and we will give our website </w:t>
+      </w:r>
+      <w:r>
+        <w:t xml:space="preserve">a unique </w:t>
+      </w:r>
+      <w:r>
+        <w:t xml:space="preserve">look </w:t>
+      </w:r>
+    </w:p>
+    <w:p>
+      <w:r>
+        <w:t xml:space="preserve">Previously if you used to deliver </w:t>
+      </w:r>
+      <w:r>
+        <w:t xml:space="preserve">the website </w:t>
+      </w:r>
+      <w:r>
+        <w:t>and if you gave responsiveness</w:t>
+      </w:r>
+      <w:r>
+        <w:t xml:space="preserve"> it was an addon</w:t>
+      </w:r>
+      <w:r>
+        <w:t xml:space="preserve"> if you gave it then it was a </w:t>
+      </w:r>
+      <w:proofErr w:type="spellStart"/>
+      <w:r>
+        <w:t>favor</w:t>
+      </w:r>
+      <w:proofErr w:type="spellEnd"/>
+      <w:r>
+        <w:t xml:space="preserve"> </w:t>
+      </w:r>
+      <w:r>
+        <w:t xml:space="preserve">you can say bit in todays time </w:t>
+      </w:r>
+      <w:r>
+        <w:t xml:space="preserve">if you are delivering a website </w:t>
+      </w:r>
+      <w:r>
+        <w:t xml:space="preserve">then responsiveness is a must </w:t>
+      </w:r>
+    </w:p>
+    <w:p>
+      <w:pPr>
+        <w:jc w:val="center"/>
+      </w:pPr>
+      <w:r>
+        <w:lastRenderedPageBreak/>
+        <w:drawing>
+          <wp:inline distT="0" distB="0" distL="0" distR="0" wp14:anchorId="1A049BBB" wp14:editId="7691BD7B">
+            <wp:extent cx="5731510" cy="996315"/>
+            <wp:effectExtent l="0" t="0" r="2540" b="0"/>
+            <wp:docPr id="1769661507" name="Picture 1"/>
+            <wp:cNvGraphicFramePr>
+              <a:graphicFrameLocks xmlns:a="http://schemas.openxmlformats.org/drawingml/2006/main" noChangeAspect="1"/>
+            </wp:cNvGraphicFramePr>
+            <a:graphic xmlns:a="http://schemas.openxmlformats.org/drawingml/2006/main">
+              <a:graphicData uri="http://schemas.openxmlformats.org/drawingml/2006/picture">
+                <pic:pic xmlns:pic="http://schemas.openxmlformats.org/drawingml/2006/picture">
+                  <pic:nvPicPr>
+                    <pic:cNvPr id="1769661507" name=""/>
+                    <pic:cNvPicPr/>
+                  </pic:nvPicPr>
+                  <pic:blipFill>
+                    <a:blip r:embed="rId19"/>
+                    <a:stretch>
+                      <a:fillRect/>
+                    </a:stretch>
+                  </pic:blipFill>
+                  <pic:spPr>
+                    <a:xfrm>
+                      <a:off x="0" y="0"/>
+                      <a:ext cx="5731510" cy="996315"/>
+                    </a:xfrm>
+                    <a:prstGeom prst="rect">
+                      <a:avLst/>
+                    </a:prstGeom>
+                  </pic:spPr>
+                </pic:pic>
+              </a:graphicData>
+            </a:graphic>
+          </wp:inline>
+        </w:drawing>
+      </w:r>
+    </w:p>
+    <w:p>
+      <w:pPr>
+        <w:pBdr>
+          <w:bottom w:val="single" w:sz="12" w:space="1" w:color="auto"/>
+        </w:pBdr>
+      </w:pPr>
+      <w:r>
+        <w:t xml:space="preserve">I think this command remove the folder from being tracked. </w:t>
+      </w:r>
+      <w:r>
+        <w:t>(maybe for now until next commit)</w:t>
+      </w:r>
+    </w:p>
+    <w:p>
+      <w:r>
+        <w:t xml:space="preserve">We will deploy everything </w:t>
+      </w:r>
+    </w:p>
     <w:sectPr>
       <w:pgSz w:w="11906" w:h="16838"/>
       <w:pgMar w:top="1440" w:right="1440" w:bottom="1440" w:left="1440" w:header="708" w:footer="708" w:gutter="0"/>

</xml_diff>

<commit_message>
Lesson 31 Deploying Hunting Coder
</commit_message>
<xml_diff>
--- a/Notes2.docx
+++ b/Notes2.docx
@@ -2641,6 +2641,364 @@
     <w:p>
       <w:r>
         <w:t xml:space="preserve">We will deploy everything </w:t>
+      </w:r>
+    </w:p>
+    <w:p>
+      <w:r>
+        <w:t>We will ho</w:t>
+      </w:r>
+      <w:r>
+        <w:t>s</w:t>
+      </w:r>
+      <w:r>
+        <w:t>t</w:t>
+      </w:r>
+      <w:r>
+        <w:t>s the web</w:t>
+      </w:r>
+      <w:r>
+        <w:t>s</w:t>
+      </w:r>
+      <w:r>
+        <w:t xml:space="preserve">ite made in next js </w:t>
+      </w:r>
+      <w:r>
+        <w:t>we will see our hunting coder live</w:t>
+      </w:r>
+      <w:r>
+        <w:t xml:space="preserve"> for everyone </w:t>
+      </w:r>
+      <w:r>
+        <w:t xml:space="preserve">we will host it </w:t>
+      </w:r>
+      <w:r>
+        <w:t>so everyone can read ou</w:t>
+      </w:r>
+      <w:r>
+        <w:t>r</w:t>
+      </w:r>
+      <w:r>
+        <w:t xml:space="preserve"> blog </w:t>
+      </w:r>
+    </w:p>
+    <w:p>
+      <w:r>
+        <w:t>Tea</w:t>
+      </w:r>
+      <w:r>
+        <w:t>c</w:t>
+      </w:r>
+      <w:r>
+        <w:t xml:space="preserve">her will use digital Ocean </w:t>
+      </w:r>
+      <w:r>
+        <w:t xml:space="preserve">platform </w:t>
+      </w:r>
+      <w:r>
+        <w:t xml:space="preserve">you can use anything basic are same. If you want </w:t>
+      </w:r>
+      <w:r>
+        <w:t>to</w:t>
+      </w:r>
+      <w:r>
+        <w:t xml:space="preserve"> upload a stat</w:t>
+      </w:r>
+      <w:r>
+        <w:t>i</w:t>
+      </w:r>
+      <w:r>
+        <w:t>c</w:t>
+      </w:r>
+      <w:r>
+        <w:t xml:space="preserve"> site </w:t>
+      </w:r>
+    </w:p>
+    <w:p>
+      <w:r>
+        <w:drawing>
+          <wp:inline distT="0" distB="0" distL="0" distR="0" wp14:anchorId="796028B2" wp14:editId="79062BCC">
+            <wp:extent cx="619211" cy="342948"/>
+            <wp:effectExtent l="0" t="0" r="0" b="0"/>
+            <wp:docPr id="207229642" name="Picture 1"/>
+            <wp:cNvGraphicFramePr>
+              <a:graphicFrameLocks xmlns:a="http://schemas.openxmlformats.org/drawingml/2006/main" noChangeAspect="1"/>
+            </wp:cNvGraphicFramePr>
+            <a:graphic xmlns:a="http://schemas.openxmlformats.org/drawingml/2006/main">
+              <a:graphicData uri="http://schemas.openxmlformats.org/drawingml/2006/picture">
+                <pic:pic xmlns:pic="http://schemas.openxmlformats.org/drawingml/2006/picture">
+                  <pic:nvPicPr>
+                    <pic:cNvPr id="207229642" name=""/>
+                    <pic:cNvPicPr/>
+                  </pic:nvPicPr>
+                  <pic:blipFill>
+                    <a:blip r:embed="rId20"/>
+                    <a:stretch>
+                      <a:fillRect/>
+                    </a:stretch>
+                  </pic:blipFill>
+                  <pic:spPr>
+                    <a:xfrm>
+                      <a:off x="0" y="0"/>
+                      <a:ext cx="619211" cy="342948"/>
+                    </a:xfrm>
+                    <a:prstGeom prst="rect">
+                      <a:avLst/>
+                    </a:prstGeom>
+                  </pic:spPr>
+                </pic:pic>
+              </a:graphicData>
+            </a:graphic>
+          </wp:inline>
+        </w:drawing>
+      </w:r>
+    </w:p>
+    <w:p>
+      <w:r>
+        <w:t xml:space="preserve">In github commit history </w:t>
+      </w:r>
+      <w:r>
+        <w:t>click on above to access the code in that commit</w:t>
+      </w:r>
+    </w:p>
+    <w:p>
+      <w:r>
+        <w:t xml:space="preserve">IN digital Ocean we will make a VPS. </w:t>
+      </w:r>
+    </w:p>
+    <w:p>
+      <w:r>
+        <w:t xml:space="preserve">There is an app platform which I don’t know about </w:t>
+      </w:r>
+    </w:p>
+    <w:p>
+      <w:r>
+        <w:t xml:space="preserve">IN digital ocean we make new user(who knows) </w:t>
+      </w:r>
+    </w:p>
+    <w:p>
+      <w:r>
+        <w:t xml:space="preserve">In digital ocean we create an app. </w:t>
+      </w:r>
+    </w:p>
+    <w:p>
+      <w:r>
+        <w:t xml:space="preserve">Often </w:t>
+      </w:r>
+      <w:r>
+        <w:t xml:space="preserve">the hosting happens by taking </w:t>
+      </w:r>
+      <w:r>
+        <w:t xml:space="preserve">files form the github pages </w:t>
+      </w:r>
+    </w:p>
+    <w:p>
+      <w:r>
+        <w:t>In case your project is nested you can  configure the source directory and the whol</w:t>
+      </w:r>
+      <w:r>
+        <w:t>e</w:t>
+      </w:r>
+      <w:r>
+        <w:t xml:space="preserve"> bu</w:t>
+      </w:r>
+      <w:r>
+        <w:t>i</w:t>
+      </w:r>
+      <w:r>
+        <w:t xml:space="preserve">ld </w:t>
+      </w:r>
+      <w:r>
+        <w:t xml:space="preserve">process will be </w:t>
+      </w:r>
+      <w:r>
+        <w:t xml:space="preserve">build there </w:t>
+      </w:r>
+    </w:p>
+    <w:p>
+      <w:r>
+        <w:t>It will ask you to make database in there services.</w:t>
+      </w:r>
+      <w:r>
+        <w:t xml:space="preserve"> (who knows)</w:t>
+      </w:r>
+    </w:p>
+    <w:p>
+      <w:r>
+        <w:t>There is some concept of container which we may study about</w:t>
+      </w:r>
+      <w:r>
+        <w:t>.</w:t>
+      </w:r>
+    </w:p>
+    <w:p>
+      <w:r>
+        <w:t xml:space="preserve">It is very simple an it </w:t>
+      </w:r>
+      <w:proofErr w:type="spellStart"/>
+      <w:r>
+        <w:t>wil</w:t>
+      </w:r>
+      <w:proofErr w:type="spellEnd"/>
+      <w:r>
+        <w:t xml:space="preserve"> automatically detect your application </w:t>
+      </w:r>
+    </w:p>
+    <w:p>
+      <w:r>
+        <w:t xml:space="preserve">I think  if you build it an use it like a node ap </w:t>
+      </w:r>
+      <w:proofErr w:type="spellStart"/>
+      <w:r>
+        <w:t>hten</w:t>
+      </w:r>
+      <w:proofErr w:type="spellEnd"/>
+      <w:r>
+        <w:t xml:space="preserve"> it will be good(</w:t>
+      </w:r>
+      <w:proofErr w:type="spellStart"/>
+      <w:r>
+        <w:t>wjp</w:t>
+      </w:r>
+      <w:proofErr w:type="spellEnd"/>
+      <w:r>
+        <w:t xml:space="preserve"> knows)</w:t>
+      </w:r>
+    </w:p>
+    <w:p>
+      <w:pPr>
+        <w:rPr>
+          <w:b/>
+          <w:bCs/>
+          <w:color w:val="EE0000"/>
+        </w:rPr>
+      </w:pPr>
+      <w:r>
+        <w:rPr>
+          <w:b/>
+          <w:bCs/>
+          <w:color w:val="EE0000"/>
+        </w:rPr>
+        <w:t xml:space="preserve">‘ can create </w:t>
+      </w:r>
+      <w:r>
+        <w:rPr>
+          <w:b/>
+          <w:bCs/>
+          <w:color w:val="EE0000"/>
+        </w:rPr>
+        <w:t xml:space="preserve">error in </w:t>
+      </w:r>
+      <w:proofErr w:type="spellStart"/>
+      <w:r>
+        <w:rPr>
+          <w:b/>
+          <w:bCs/>
+          <w:color w:val="EE0000"/>
+        </w:rPr>
+        <w:t>js</w:t>
+      </w:r>
+      <w:r>
+        <w:rPr>
+          <w:b/>
+          <w:bCs/>
+          <w:color w:val="EE0000"/>
+        </w:rPr>
+        <w:t>x</w:t>
+      </w:r>
+      <w:proofErr w:type="spellEnd"/>
+      <w:r>
+        <w:rPr>
+          <w:b/>
+          <w:bCs/>
+          <w:color w:val="EE0000"/>
+        </w:rPr>
+        <w:t xml:space="preserve"> in </w:t>
+      </w:r>
+      <w:proofErr w:type="spellStart"/>
+      <w:r>
+        <w:rPr>
+          <w:b/>
+          <w:bCs/>
+          <w:color w:val="EE0000"/>
+        </w:rPr>
+        <w:t>Nextjs</w:t>
+      </w:r>
+      <w:proofErr w:type="spellEnd"/>
+      <w:r>
+        <w:rPr>
+          <w:b/>
+          <w:bCs/>
+          <w:color w:val="EE0000"/>
+        </w:rPr>
+        <w:t xml:space="preserve"> or maybe in React.</w:t>
+      </w:r>
+    </w:p>
+    <w:p>
+      <w:r>
+        <w:t xml:space="preserve">The routes for posting the form </w:t>
+      </w:r>
+      <w:r>
+        <w:t>may not be work and show errors as we are in docker (who knows)</w:t>
+      </w:r>
+    </w:p>
+    <w:p>
+      <w:r>
+        <w:t>It is good for small scale setup</w:t>
+      </w:r>
+    </w:p>
+    <w:p>
+      <w:r>
+        <w:t xml:space="preserve">Now as you commit then </w:t>
+      </w:r>
+      <w:r>
+        <w:t>Digital ocean will build it</w:t>
+      </w:r>
+      <w:r>
+        <w:t xml:space="preserve"> automatically for you.</w:t>
+      </w:r>
+    </w:p>
+    <w:p>
+      <w:r>
+        <w:t xml:space="preserve">At the </w:t>
+      </w:r>
+      <w:r>
+        <w:t>time</w:t>
+      </w:r>
+      <w:r>
+        <w:t xml:space="preserve"> Teacher lesson re</w:t>
+      </w:r>
+      <w:r>
+        <w:t>c</w:t>
+      </w:r>
+      <w:r>
+        <w:t>orde</w:t>
+      </w:r>
+      <w:r>
+        <w:t>d</w:t>
+      </w:r>
+      <w:r>
+        <w:t xml:space="preserve"> that is Digital Ocean give you 8GB Ram on built time and there is no other method to increase it.</w:t>
+      </w:r>
+      <w:r>
+        <w:t xml:space="preserve"> as an advanced user you may face such problems. </w:t>
+      </w:r>
+      <w:r>
+        <w:t xml:space="preserve">The big apps work fine </w:t>
+      </w:r>
+      <w:r>
+        <w:t xml:space="preserve">here (maybe </w:t>
+      </w:r>
+      <w:r>
+        <w:t>very large app don’t work properly</w:t>
+      </w:r>
+      <w:r>
+        <w:t>(who knows)</w:t>
+      </w:r>
+      <w:r>
+        <w:t>)</w:t>
+      </w:r>
+      <w:r>
+        <w:t xml:space="preserve"> </w:t>
       </w:r>
     </w:p>
     <w:sectPr>
@@ -3413,7 +3771,6 @@
   <w:style w:type="character" w:default="1" w:styleId="DefaultParagraphFont">
     <w:name w:val="Default Paragraph Font"/>
     <w:uiPriority w:val="1"/>
-    <w:semiHidden/>
     <w:unhideWhenUsed/>
   </w:style>
   <w:style w:type="table" w:default="1" w:styleId="TableNormal">

</xml_diff>

<commit_message>
Lesson 32 Adding huntingcoder.com Domain and Search Console
</commit_message>
<xml_diff>
--- a/Notes2.docx
+++ b/Notes2.docx
@@ -59,10 +59,18 @@
     </w:p>
     <w:p>
       <w:r>
-        <w:t>In nay container</w:t>
-      </w:r>
-      <w:r>
-        <w:t>(or component)</w:t>
+        <w:t xml:space="preserve">In nay </w:t>
+      </w:r>
+      <w:proofErr w:type="gramStart"/>
+      <w:r>
+        <w:t>container</w:t>
+      </w:r>
+      <w:r>
+        <w:t>(</w:t>
+      </w:r>
+      <w:proofErr w:type="gramEnd"/>
+      <w:r>
+        <w:t>or component)</w:t>
       </w:r>
       <w:r>
         <w:t xml:space="preserve"> if you want to </w:t>
@@ -547,9 +555,14 @@
       </w:r>
     </w:p>
     <w:p>
+      <w:proofErr w:type="gramStart"/>
       <w:r>
         <w:lastRenderedPageBreak/>
-        <w:t>So we can so this thing Now we can see it is getting rendered as shown below</w:t>
+        <w:t>So</w:t>
+      </w:r>
+      <w:proofErr w:type="gramEnd"/>
+      <w:r>
+        <w:t xml:space="preserve"> we can so this thing Now we can see it is getting rendered as shown below</w:t>
       </w:r>
     </w:p>
     <w:p>
@@ -651,8 +664,13 @@
         <w:t xml:space="preserve"> s</w:t>
       </w:r>
       <w:r>
-        <w:t>ubmit the form</w:t>
-      </w:r>
+        <w:t xml:space="preserve">ubmit the </w:t>
+      </w:r>
+      <w:proofErr w:type="gramStart"/>
+      <w:r>
+        <w:t>form</w:t>
+      </w:r>
+      <w:proofErr w:type="gramEnd"/>
       <w:r>
         <w:t xml:space="preserve"> we will definitely have to make an API to co</w:t>
       </w:r>
@@ -718,8 +736,29 @@
       </w:r>
     </w:p>
     <w:p>
-      <w:r>
-        <w:t>So for now our post request handler look like below</w:t>
+      <w:proofErr w:type="gramStart"/>
+      <w:r>
+        <w:t>So</w:t>
+      </w:r>
+      <w:proofErr w:type="gramEnd"/>
+      <w:r>
+        <w:t xml:space="preserve"> for </w:t>
+      </w:r>
+      <w:proofErr w:type="gramStart"/>
+      <w:r>
+        <w:t>now</w:t>
+      </w:r>
+      <w:proofErr w:type="gramEnd"/>
+      <w:r>
+        <w:t xml:space="preserve"> our post request handler </w:t>
+      </w:r>
+      <w:proofErr w:type="gramStart"/>
+      <w:r>
+        <w:t>look</w:t>
+      </w:r>
+      <w:proofErr w:type="gramEnd"/>
+      <w:r>
+        <w:t xml:space="preserve"> like below</w:t>
       </w:r>
     </w:p>
     <w:p>
@@ -768,8 +807,13 @@
       </w:r>
     </w:p>
     <w:p>
-      <w:r>
-        <w:t>Ols version used to look like below</w:t>
+      <w:proofErr w:type="gramStart"/>
+      <w:r>
+        <w:t>Ols</w:t>
+      </w:r>
+      <w:proofErr w:type="gramEnd"/>
+      <w:r>
+        <w:t xml:space="preserve"> version used to look like below</w:t>
       </w:r>
     </w:p>
     <w:p>
@@ -877,10 +921,12 @@
         <w:t xml:space="preserve">, not plain JSON, so sending it directly with </w:t>
       </w:r>
       <w:proofErr w:type="spellStart"/>
+      <w:proofErr w:type="gramStart"/>
       <w:r>
         <w:t>res.json</w:t>
       </w:r>
       <w:proofErr w:type="spellEnd"/>
+      <w:proofErr w:type="gramEnd"/>
       <w:r>
         <w:t>(</w:t>
       </w:r>
@@ -938,9 +984,14 @@
     </w:p>
     <w:p>
       <w:r>
-        <w:t>export default function handler(</w:t>
-      </w:r>
-      <w:proofErr w:type="spellStart"/>
+        <w:t xml:space="preserve">export default function </w:t>
+      </w:r>
+      <w:proofErr w:type="gramStart"/>
+      <w:r>
+        <w:t>handler(</w:t>
+      </w:r>
+      <w:proofErr w:type="spellStart"/>
+      <w:proofErr w:type="gramEnd"/>
       <w:r>
         <w:t>req</w:t>
       </w:r>
@@ -1046,6 +1097,7 @@
         <w:t xml:space="preserve">Why </w:t>
       </w:r>
       <w:proofErr w:type="spellStart"/>
+      <w:proofErr w:type="gramStart"/>
       <w:r>
         <w:rPr>
           <w:b/>
@@ -1054,6 +1106,7 @@
         <w:t>res.json</w:t>
       </w:r>
       <w:proofErr w:type="spellEnd"/>
+      <w:proofErr w:type="gramEnd"/>
       <w:r>
         <w:rPr>
           <w:b/>
@@ -1085,18 +1138,25 @@
     </w:p>
     <w:p>
       <w:proofErr w:type="spellStart"/>
+      <w:proofErr w:type="gramStart"/>
       <w:r>
         <w:t>res.status</w:t>
       </w:r>
       <w:proofErr w:type="spellEnd"/>
-      <w:r>
-        <w:t>(200).</w:t>
+      <w:proofErr w:type="gramEnd"/>
+      <w:r>
+        <w:t>(200</w:t>
+      </w:r>
+      <w:proofErr w:type="gramStart"/>
+      <w:r>
+        <w:t>).</w:t>
       </w:r>
       <w:proofErr w:type="spellStart"/>
       <w:r>
         <w:t>json</w:t>
       </w:r>
       <w:proofErr w:type="spellEnd"/>
+      <w:proofErr w:type="gramEnd"/>
       <w:r>
         <w:t>(</w:t>
       </w:r>
@@ -1197,9 +1257,14 @@
     </w:p>
     <w:p>
       <w:r>
-        <w:t>export default function handler(</w:t>
-      </w:r>
-      <w:proofErr w:type="spellStart"/>
+        <w:t xml:space="preserve">export default function </w:t>
+      </w:r>
+      <w:proofErr w:type="gramStart"/>
+      <w:r>
+        <w:t>handler(</w:t>
+      </w:r>
+      <w:proofErr w:type="spellStart"/>
+      <w:proofErr w:type="gramEnd"/>
       <w:r>
         <w:t>req</w:t>
       </w:r>
@@ -1212,10 +1277,12 @@
         <w:t xml:space="preserve">  if (</w:t>
       </w:r>
       <w:proofErr w:type="spellStart"/>
+      <w:proofErr w:type="gramStart"/>
       <w:r>
         <w:t>req.method</w:t>
       </w:r>
       <w:proofErr w:type="spellEnd"/>
+      <w:proofErr w:type="gramEnd"/>
       <w:r>
         <w:t xml:space="preserve"> === "POST") {</w:t>
       </w:r>
@@ -1224,18 +1291,25 @@
         <w:t xml:space="preserve">    </w:t>
       </w:r>
       <w:proofErr w:type="spellStart"/>
+      <w:proofErr w:type="gramStart"/>
       <w:r>
         <w:t>res.status</w:t>
       </w:r>
       <w:proofErr w:type="spellEnd"/>
-      <w:r>
-        <w:t>(200).</w:t>
+      <w:proofErr w:type="gramEnd"/>
+      <w:r>
+        <w:t>(200</w:t>
+      </w:r>
+      <w:proofErr w:type="gramStart"/>
+      <w:r>
+        <w:t>).</w:t>
       </w:r>
       <w:proofErr w:type="spellStart"/>
       <w:r>
         <w:t>json</w:t>
       </w:r>
       <w:proofErr w:type="spellEnd"/>
+      <w:proofErr w:type="gramEnd"/>
       <w:r>
         <w:t>({</w:t>
       </w:r>
@@ -1244,10 +1318,12 @@
         <w:t xml:space="preserve">      method: </w:t>
       </w:r>
       <w:proofErr w:type="spellStart"/>
+      <w:proofErr w:type="gramStart"/>
       <w:r>
         <w:t>req.method</w:t>
       </w:r>
       <w:proofErr w:type="spellEnd"/>
+      <w:proofErr w:type="gramEnd"/>
       <w:r>
         <w:t>,</w:t>
       </w:r>
@@ -1256,10 +1332,12 @@
         <w:t xml:space="preserve">      body: </w:t>
       </w:r>
       <w:proofErr w:type="spellStart"/>
+      <w:proofErr w:type="gramStart"/>
       <w:r>
         <w:t>req.body</w:t>
       </w:r>
       <w:proofErr w:type="spellEnd"/>
+      <w:proofErr w:type="gramEnd"/>
       <w:r>
         <w:t>,</w:t>
       </w:r>
@@ -1268,10 +1346,12 @@
         <w:t xml:space="preserve">      query: </w:t>
       </w:r>
       <w:proofErr w:type="spellStart"/>
+      <w:proofErr w:type="gramStart"/>
       <w:r>
         <w:t>req.query</w:t>
       </w:r>
       <w:proofErr w:type="spellEnd"/>
+      <w:proofErr w:type="gramEnd"/>
       <w:r>
         <w:t>,</w:t>
       </w:r>
@@ -1281,8 +1361,12 @@
       </w:r>
       <w:r>
         <w:br/>
+      </w:r>
+      <w:proofErr w:type="gramStart"/>
+      <w:r>
         <w:t xml:space="preserve">  }</w:t>
       </w:r>
+      <w:proofErr w:type="gramEnd"/>
       <w:r>
         <w:br/>
         <w:t>}</w:t>
@@ -1438,10 +1522,12 @@
           </w:tcPr>
           <w:p>
             <w:proofErr w:type="spellStart"/>
+            <w:proofErr w:type="gramStart"/>
             <w:r>
               <w:t>req.body</w:t>
             </w:r>
             <w:proofErr w:type="spellEnd"/>
+            <w:proofErr w:type="gramEnd"/>
           </w:p>
         </w:tc>
         <w:tc>
@@ -1475,10 +1561,12 @@
           </w:tcPr>
           <w:p>
             <w:proofErr w:type="spellStart"/>
+            <w:proofErr w:type="gramStart"/>
             <w:r>
               <w:t>req.query</w:t>
             </w:r>
             <w:proofErr w:type="spellEnd"/>
+            <w:proofErr w:type="gramEnd"/>
           </w:p>
         </w:tc>
         <w:tc>
@@ -1512,10 +1600,12 @@
           </w:tcPr>
           <w:p>
             <w:proofErr w:type="spellStart"/>
+            <w:proofErr w:type="gramStart"/>
             <w:r>
               <w:t>req.method</w:t>
             </w:r>
             <w:proofErr w:type="spellEnd"/>
+            <w:proofErr w:type="gramEnd"/>
           </w:p>
         </w:tc>
         <w:tc>
@@ -1567,9 +1657,14 @@
     </w:p>
     <w:p>
       <w:r>
-        <w:t>export async function POST(</w:t>
-      </w:r>
-      <w:proofErr w:type="spellStart"/>
+        <w:t xml:space="preserve">export async function </w:t>
+      </w:r>
+      <w:proofErr w:type="gramStart"/>
+      <w:r>
+        <w:t>POST(</w:t>
+      </w:r>
+      <w:proofErr w:type="spellStart"/>
+      <w:proofErr w:type="gramEnd"/>
       <w:r>
         <w:t>req</w:t>
       </w:r>
@@ -1593,10 +1688,12 @@
         <w:t xml:space="preserve"> body = await </w:t>
       </w:r>
       <w:proofErr w:type="spellStart"/>
+      <w:proofErr w:type="gramStart"/>
       <w:r>
         <w:t>req.json</w:t>
       </w:r>
       <w:proofErr w:type="spellEnd"/>
+      <w:proofErr w:type="gramEnd"/>
       <w:r>
         <w:t>();</w:t>
       </w:r>
@@ -1658,10 +1755,12 @@
         <w:t xml:space="preserve">d specific fields like </w:t>
       </w:r>
       <w:proofErr w:type="spellStart"/>
+      <w:proofErr w:type="gramStart"/>
       <w:r>
         <w:t>req.body</w:t>
       </w:r>
       <w:proofErr w:type="spellEnd"/>
+      <w:proofErr w:type="gramEnd"/>
       <w:r>
         <w:t>.</w:t>
       </w:r>
@@ -1671,7 +1770,15 @@
         <w:t>In older version we used to get body like we did in n</w:t>
       </w:r>
       <w:r>
-        <w:t>ode js but in modern it look like below</w:t>
+        <w:t xml:space="preserve">ode js but in modern it </w:t>
+      </w:r>
+      <w:proofErr w:type="gramStart"/>
+      <w:r>
+        <w:t>look</w:t>
+      </w:r>
+      <w:proofErr w:type="gramEnd"/>
+      <w:r>
+        <w:t xml:space="preserve"> like below</w:t>
       </w:r>
     </w:p>
     <w:p>
@@ -1774,10 +1881,18 @@
         <w:t>The problem with the file making</w:t>
       </w:r>
       <w:r>
-        <w:t xml:space="preserve"> strategy </w:t>
-      </w:r>
-      <w:r>
-        <w:t xml:space="preserve"> is that </w:t>
+        <w:t xml:space="preserve"> </w:t>
+      </w:r>
+      <w:proofErr w:type="gramStart"/>
+      <w:r>
+        <w:t xml:space="preserve">strategy </w:t>
+      </w:r>
+      <w:r>
+        <w:t xml:space="preserve"> is</w:t>
+      </w:r>
+      <w:proofErr w:type="gramEnd"/>
+      <w:r>
+        <w:t xml:space="preserve"> that </w:t>
       </w:r>
       <w:r>
         <w:t xml:space="preserve">if suppose </w:t>
@@ -1890,20 +2005,41 @@
       </w:r>
       <w:proofErr w:type="spellEnd"/>
       <w:r>
-        <w:t xml:space="preserve"> element</w:t>
-      </w:r>
-      <w:r>
-        <w:t>(who knows may be I am wrong here)</w:t>
-      </w:r>
-      <w:r>
         <w:t xml:space="preserve"> </w:t>
       </w:r>
+      <w:proofErr w:type="gramStart"/>
+      <w:r>
+        <w:t>element</w:t>
+      </w:r>
+      <w:r>
+        <w:t>(</w:t>
+      </w:r>
+      <w:proofErr w:type="gramEnd"/>
+      <w:r>
+        <w:t xml:space="preserve">who knows </w:t>
+      </w:r>
+      <w:proofErr w:type="gramStart"/>
+      <w:r>
+        <w:t>may be</w:t>
+      </w:r>
+      <w:proofErr w:type="gramEnd"/>
+      <w:r>
+        <w:t xml:space="preserve"> I am wrong here)</w:t>
+      </w:r>
+      <w:r>
+        <w:t xml:space="preserve"> </w:t>
+      </w:r>
       <w:r>
         <w:t xml:space="preserve">and on state update method we used </w:t>
       </w:r>
       <w:proofErr w:type="spellStart"/>
-      <w:r>
-        <w:t>e.target.innerText</w:t>
+      <w:proofErr w:type="gramStart"/>
+      <w:r>
+        <w:t>e.target</w:t>
+      </w:r>
+      <w:proofErr w:type="gramEnd"/>
+      <w:r>
+        <w:t>.innerText</w:t>
       </w:r>
       <w:proofErr w:type="spellEnd"/>
     </w:p>
@@ -1920,8 +2056,13 @@
         <w:t xml:space="preserve"> we can use </w:t>
       </w:r>
       <w:proofErr w:type="spellStart"/>
-      <w:r>
-        <w:t>e.target,value</w:t>
+      <w:proofErr w:type="gramStart"/>
+      <w:r>
+        <w:t>e.target</w:t>
+      </w:r>
+      <w:proofErr w:type="gramEnd"/>
+      <w:r>
+        <w:t>,value</w:t>
       </w:r>
       <w:proofErr w:type="spellEnd"/>
       <w:r>
@@ -2037,13 +2178,16 @@
         <w:t xml:space="preserve">Shortcut for </w:t>
       </w:r>
       <w:proofErr w:type="spellStart"/>
+      <w:proofErr w:type="gramStart"/>
       <w:r>
         <w:t>margin:auto</w:t>
       </w:r>
       <w:proofErr w:type="spellEnd"/>
+      <w:proofErr w:type="gramEnd"/>
       <w:r>
         <w:t xml:space="preserve"> will be </w:t>
       </w:r>
+      <w:proofErr w:type="gramStart"/>
       <w:r>
         <w:rPr>
           <w:b/>
@@ -2051,6 +2195,7 @@
         </w:rPr>
         <w:t>m:auto</w:t>
       </w:r>
+      <w:proofErr w:type="gramEnd"/>
       <w:r>
         <w:rPr>
           <w:b/>
@@ -2114,10 +2259,18 @@
     </w:p>
     <w:p>
       <w:r>
-        <w:t xml:space="preserve">Suppose you have 50 blogs and you want to show 5 blogs on each pages </w:t>
-      </w:r>
-      <w:r>
-        <w:t xml:space="preserve"> so 10 pages </w:t>
+        <w:t xml:space="preserve">Suppose you have 50 blogs and you want to show 5 blogs on each </w:t>
+      </w:r>
+      <w:proofErr w:type="gramStart"/>
+      <w:r>
+        <w:t xml:space="preserve">pages </w:t>
+      </w:r>
+      <w:r>
+        <w:t xml:space="preserve"> so</w:t>
+      </w:r>
+      <w:proofErr w:type="gramEnd"/>
+      <w:r>
+        <w:t xml:space="preserve"> 10 pages </w:t>
       </w:r>
       <w:r>
         <w:t>will</w:t>
@@ -2128,11 +2281,16 @@
       <w:r>
         <w:t xml:space="preserve">be </w:t>
       </w:r>
+      <w:proofErr w:type="gramStart"/>
       <w:r>
         <w:t xml:space="preserve">formed </w:t>
       </w:r>
       <w:r>
-        <w:t xml:space="preserve">. In the similar way </w:t>
+        <w:t>.</w:t>
+      </w:r>
+      <w:proofErr w:type="gramEnd"/>
+      <w:r>
+        <w:t xml:space="preserve"> In the similar way </w:t>
       </w:r>
       <w:r>
         <w:t xml:space="preserve">pagination can be showed </w:t>
@@ -2225,7 +2383,15 @@
         <w:t xml:space="preserve">that we will not good components </w:t>
       </w:r>
       <w:r>
-        <w:t>means you won’t get good packages for doing any work(who knows)</w:t>
+        <w:t xml:space="preserve">means you won’t get good packages for doing any </w:t>
+      </w:r>
+      <w:proofErr w:type="gramStart"/>
+      <w:r>
+        <w:t>work(</w:t>
+      </w:r>
+      <w:proofErr w:type="gramEnd"/>
+      <w:r>
+        <w:t>who knows)</w:t>
       </w:r>
     </w:p>
     <w:p>
@@ -2254,14 +2420,27 @@
       </w:r>
     </w:p>
     <w:p>
-      <w:r>
-        <w:t xml:space="preserve">So we run the above command I context of </w:t>
+      <w:proofErr w:type="gramStart"/>
+      <w:r>
+        <w:t>So</w:t>
+      </w:r>
+      <w:proofErr w:type="gramEnd"/>
+      <w:r>
+        <w:t xml:space="preserve"> we run the above command I context of </w:t>
       </w:r>
       <w:r>
         <w:t xml:space="preserve">yarn </w:t>
       </w:r>
       <w:r>
-        <w:t>by using  below command</w:t>
+        <w:t xml:space="preserve">by </w:t>
+      </w:r>
+      <w:proofErr w:type="gramStart"/>
+      <w:r>
+        <w:t>using  below</w:t>
+      </w:r>
+      <w:proofErr w:type="gramEnd"/>
+      <w:r>
+        <w:t xml:space="preserve"> command</w:t>
       </w:r>
     </w:p>
     <w:p>
@@ -2349,13 +2528,29 @@
         <w:t xml:space="preserve">Data length </w:t>
       </w:r>
       <w:r>
-        <w:t>of the data that to be shown</w:t>
-      </w:r>
-      <w:r>
-        <w:t xml:space="preserve"> , next is the function  </w:t>
-      </w:r>
-      <w:r>
-        <w:t>that will be called when we scroll and reach the bottom and more data is needed to be loaded.</w:t>
+        <w:t xml:space="preserve">of the data that to be </w:t>
+      </w:r>
+      <w:proofErr w:type="gramStart"/>
+      <w:r>
+        <w:t>shown</w:t>
+      </w:r>
+      <w:r>
+        <w:t xml:space="preserve"> ,</w:t>
+      </w:r>
+      <w:proofErr w:type="gramEnd"/>
+      <w:r>
+        <w:t xml:space="preserve"> next is the </w:t>
+      </w:r>
+      <w:proofErr w:type="gramStart"/>
+      <w:r>
+        <w:t xml:space="preserve">function  </w:t>
+      </w:r>
+      <w:r>
+        <w:t>that</w:t>
+      </w:r>
+      <w:proofErr w:type="gramEnd"/>
+      <w:r>
+        <w:t xml:space="preserve"> will be called when we scroll and reach the bottom and more data is needed to be loaded.</w:t>
       </w:r>
     </w:p>
     <w:p>
@@ -2383,13 +2578,21 @@
         <w:t>w</w:t>
       </w:r>
       <w:r>
-        <w:t>n function</w:t>
+        <w:t xml:space="preserve">n </w:t>
+      </w:r>
+      <w:proofErr w:type="gramStart"/>
+      <w:r>
+        <w:t>function</w:t>
       </w:r>
       <w:r>
         <w:t>al</w:t>
       </w:r>
       <w:r>
-        <w:t>ity(who knows)</w:t>
+        <w:t>ity(</w:t>
+      </w:r>
+      <w:proofErr w:type="gramEnd"/>
+      <w:r>
+        <w:t>who knows)</w:t>
       </w:r>
     </w:p>
     <w:p>
@@ -2471,7 +2674,15 @@
         <w:t xml:space="preserve">it is defined like this </w:t>
       </w:r>
       <w:r>
-        <w:t xml:space="preserve">if we keep single item </w:t>
+        <w:t xml:space="preserve">if we keep single </w:t>
+      </w:r>
+      <w:proofErr w:type="gramStart"/>
+      <w:r>
+        <w:t>item</w:t>
+      </w:r>
+      <w:proofErr w:type="gramEnd"/>
+      <w:r>
+        <w:t xml:space="preserve"> </w:t>
       </w:r>
       <w:r>
         <w:t>we need to see al</w:t>
@@ -2480,13 +2691,21 @@
         <w:t>l</w:t>
       </w:r>
       <w:r>
-        <w:t xml:space="preserve"> this thi</w:t>
+        <w:t xml:space="preserve"> </w:t>
+      </w:r>
+      <w:proofErr w:type="gramStart"/>
+      <w:r>
+        <w:t>this thi</w:t>
       </w:r>
       <w:r>
         <w:t>n</w:t>
       </w:r>
       <w:r>
-        <w:t xml:space="preserve">gs </w:t>
+        <w:t>gs</w:t>
+      </w:r>
+      <w:proofErr w:type="gramEnd"/>
+      <w:r>
+        <w:t xml:space="preserve"> </w:t>
       </w:r>
     </w:p>
     <w:p>
@@ -2496,6 +2715,7 @@
           <w:bCs/>
         </w:rPr>
       </w:pPr>
+      <w:proofErr w:type="gramStart"/>
       <w:r>
         <w:rPr>
           <w:b/>
@@ -2503,6 +2723,7 @@
         </w:rPr>
         <w:t>Note:-</w:t>
       </w:r>
+      <w:proofErr w:type="gramEnd"/>
     </w:p>
     <w:p>
       <w:pPr>
@@ -2514,7 +2735,15 @@
         <w:t xml:space="preserve">Sometime it happens </w:t>
       </w:r>
       <w:r>
-        <w:t>in react that one component is show  two times so reload to remove the bug</w:t>
+        <w:t xml:space="preserve">in react that one component is </w:t>
+      </w:r>
+      <w:proofErr w:type="gramStart"/>
+      <w:r>
+        <w:t>show  two</w:t>
+      </w:r>
+      <w:proofErr w:type="gramEnd"/>
+      <w:r>
+        <w:t xml:space="preserve"> times so reload to remove the bug</w:t>
       </w:r>
     </w:p>
     <w:p>
@@ -2530,7 +2759,15 @@
         <w:t xml:space="preserve">except for responsiveness </w:t>
       </w:r>
       <w:r>
-        <w:t xml:space="preserve">we will  make our blog responsive and will write media queries </w:t>
+        <w:t xml:space="preserve">we </w:t>
+      </w:r>
+      <w:proofErr w:type="gramStart"/>
+      <w:r>
+        <w:t>will  make</w:t>
+      </w:r>
+      <w:proofErr w:type="gramEnd"/>
+      <w:r>
+        <w:t xml:space="preserve"> our blog responsive and will write media queries </w:t>
       </w:r>
       <w:r>
         <w:t>how we can we run media que</w:t>
@@ -2556,8 +2793,13 @@
         <w:t xml:space="preserve">the website </w:t>
       </w:r>
       <w:r>
-        <w:t>and if you gave responsiveness</w:t>
-      </w:r>
+        <w:t xml:space="preserve">and if you gave </w:t>
+      </w:r>
+      <w:proofErr w:type="gramStart"/>
+      <w:r>
+        <w:t>responsiveness</w:t>
+      </w:r>
+      <w:proofErr w:type="gramEnd"/>
       <w:r>
         <w:t xml:space="preserve"> it was an addon</w:t>
       </w:r>
@@ -2573,7 +2815,15 @@
         <w:t xml:space="preserve"> </w:t>
       </w:r>
       <w:r>
-        <w:t xml:space="preserve">you can say bit in todays time </w:t>
+        <w:t xml:space="preserve">you can say bit in </w:t>
+      </w:r>
+      <w:proofErr w:type="gramStart"/>
+      <w:r>
+        <w:t>todays</w:t>
+      </w:r>
+      <w:proofErr w:type="gramEnd"/>
+      <w:r>
+        <w:t xml:space="preserve"> time </w:t>
       </w:r>
       <w:r>
         <w:t xml:space="preserve">if you are delivering a website </w:t>
@@ -2587,6 +2837,9 @@
         <w:jc w:val="center"/>
       </w:pPr>
       <w:r>
+        <w:rPr>
+          <w:noProof/>
+        </w:rPr>
         <w:lastRenderedPageBreak/>
         <w:drawing>
           <wp:inline distT="0" distB="0" distL="0" distR="0" wp14:anchorId="1A049BBB" wp14:editId="7691BD7B">
@@ -2645,7 +2898,11 @@
     </w:p>
     <w:p>
       <w:r>
-        <w:t>We will ho</w:t>
+        <w:t xml:space="preserve">We will </w:t>
+      </w:r>
+      <w:proofErr w:type="gramStart"/>
+      <w:r>
+        <w:t>ho</w:t>
       </w:r>
       <w:r>
         <w:t>s</w:t>
@@ -2654,11 +2911,15 @@
         <w:t>t</w:t>
       </w:r>
       <w:r>
-        <w:t>s the web</w:t>
-      </w:r>
-      <w:r>
         <w:t>s</w:t>
       </w:r>
+      <w:proofErr w:type="gramEnd"/>
+      <w:r>
+        <w:t xml:space="preserve"> the web</w:t>
+      </w:r>
+      <w:r>
+        <w:t>s</w:t>
+      </w:r>
       <w:r>
         <w:t xml:space="preserve">ite made in next js </w:t>
       </w:r>
@@ -2715,6 +2976,9 @@
     </w:p>
     <w:p>
       <w:r>
+        <w:rPr>
+          <w:noProof/>
+        </w:rPr>
         <w:drawing>
           <wp:inline distT="0" distB="0" distL="0" distR="0" wp14:anchorId="796028B2" wp14:editId="79062BCC">
             <wp:extent cx="619211" cy="342948"/>
@@ -2762,7 +3026,13 @@
     </w:p>
     <w:p>
       <w:r>
-        <w:t xml:space="preserve">IN digital Ocean we will make a VPS. </w:t>
+        <w:t>I</w:t>
+      </w:r>
+      <w:r>
+        <w:t>n</w:t>
+      </w:r>
+      <w:r>
+        <w:t xml:space="preserve"> digital Ocean we will make a VPS. </w:t>
       </w:r>
     </w:p>
     <w:p>
@@ -2772,7 +3042,15 @@
     </w:p>
     <w:p>
       <w:r>
-        <w:t xml:space="preserve">IN digital ocean we make new user(who knows) </w:t>
+        <w:t xml:space="preserve">IN digital ocean we make new </w:t>
+      </w:r>
+      <w:proofErr w:type="gramStart"/>
+      <w:r>
+        <w:t>user(</w:t>
+      </w:r>
+      <w:proofErr w:type="gramEnd"/>
+      <w:r>
+        <w:t xml:space="preserve">who knows) </w:t>
       </w:r>
     </w:p>
     <w:p>
@@ -2793,7 +3071,7 @@
     </w:p>
     <w:p>
       <w:r>
-        <w:t>In case your project is nested you can  configure the source directory and the whol</w:t>
+        <w:t>In case your project is nested you can configure the source directory and the whol</w:t>
       </w:r>
       <w:r>
         <w:t>e</w:t>
@@ -2810,13 +3088,26 @@
       <w:r>
         <w:t xml:space="preserve">process will be </w:t>
       </w:r>
-      <w:r>
-        <w:t xml:space="preserve">build there </w:t>
-      </w:r>
-    </w:p>
-    <w:p>
-      <w:r>
-        <w:t>It will ask you to make database in there services.</w:t>
+      <w:proofErr w:type="gramStart"/>
+      <w:r>
+        <w:t>build</w:t>
+      </w:r>
+      <w:proofErr w:type="gramEnd"/>
+      <w:r>
+        <w:t xml:space="preserve"> there </w:t>
+      </w:r>
+    </w:p>
+    <w:p>
+      <w:r>
+        <w:t xml:space="preserve">It will ask you to make database in </w:t>
+      </w:r>
+      <w:proofErr w:type="gramStart"/>
+      <w:r>
+        <w:t>there</w:t>
+      </w:r>
+      <w:proofErr w:type="gramEnd"/>
+      <w:r>
+        <w:t xml:space="preserve"> services.</w:t>
       </w:r>
       <w:r>
         <w:t xml:space="preserve"> (who knows)</w:t>
@@ -2832,7 +3123,15 @@
     </w:p>
     <w:p>
       <w:r>
-        <w:t xml:space="preserve">It is very simple an it </w:t>
+        <w:t xml:space="preserve">It is very simple </w:t>
+      </w:r>
+      <w:proofErr w:type="spellStart"/>
+      <w:r>
+        <w:t>an</w:t>
+      </w:r>
+      <w:proofErr w:type="spellEnd"/>
+      <w:r>
+        <w:t xml:space="preserve"> it </w:t>
       </w:r>
       <w:proofErr w:type="spellStart"/>
       <w:r>
@@ -2845,7 +3144,13 @@
     </w:p>
     <w:p>
       <w:r>
-        <w:t xml:space="preserve">I think  if you build it an use it like a node ap </w:t>
+        <w:t>I think if you build it an</w:t>
+      </w:r>
+      <w:r>
+        <w:t>d</w:t>
+      </w:r>
+      <w:r>
+        <w:t xml:space="preserve"> use it like a node ap </w:t>
       </w:r>
       <w:proofErr w:type="spellStart"/>
       <w:r>
@@ -2853,9 +3158,14 @@
       </w:r>
       <w:proofErr w:type="spellEnd"/>
       <w:r>
-        <w:t xml:space="preserve"> it will be good(</w:t>
-      </w:r>
-      <w:proofErr w:type="spellStart"/>
+        <w:t xml:space="preserve"> it will be </w:t>
+      </w:r>
+      <w:proofErr w:type="gramStart"/>
+      <w:r>
+        <w:t>good(</w:t>
+      </w:r>
+      <w:proofErr w:type="spellStart"/>
+      <w:proofErr w:type="gramEnd"/>
       <w:r>
         <w:t>wjp</w:t>
       </w:r>
@@ -2872,20 +3182,30 @@
           <w:color w:val="EE0000"/>
         </w:rPr>
       </w:pPr>
+      <w:proofErr w:type="gramStart"/>
       <w:r>
         <w:rPr>
           <w:b/>
           <w:bCs/>
           <w:color w:val="EE0000"/>
         </w:rPr>
-        <w:t xml:space="preserve">‘ can create </w:t>
-      </w:r>
+        <w:t>‘ can</w:t>
+      </w:r>
+      <w:proofErr w:type="gramEnd"/>
       <w:r>
         <w:rPr>
           <w:b/>
           <w:bCs/>
           <w:color w:val="EE0000"/>
         </w:rPr>
+        <w:t xml:space="preserve"> create </w:t>
+      </w:r>
+      <w:r>
+        <w:rPr>
+          <w:b/>
+          <w:bCs/>
+          <w:color w:val="EE0000"/>
+        </w:rPr>
         <w:t xml:space="preserve">error in </w:t>
       </w:r>
       <w:proofErr w:type="spellStart"/>
@@ -2930,7 +3250,33 @@
           <w:bCs/>
           <w:color w:val="EE0000"/>
         </w:rPr>
-        <w:t xml:space="preserve"> or maybe in React.</w:t>
+        <w:t xml:space="preserve"> or maybe in </w:t>
+      </w:r>
+      <w:proofErr w:type="gramStart"/>
+      <w:r>
+        <w:rPr>
+          <w:b/>
+          <w:bCs/>
+          <w:color w:val="EE0000"/>
+        </w:rPr>
+        <w:t>React.</w:t>
+      </w:r>
+      <w:r>
+        <w:rPr>
+          <w:b/>
+          <w:bCs/>
+          <w:color w:val="EE0000"/>
+        </w:rPr>
+        <w:t>(</w:t>
+      </w:r>
+      <w:proofErr w:type="gramEnd"/>
+      <w:r>
+        <w:rPr>
+          <w:b/>
+          <w:bCs/>
+          <w:color w:val="EE0000"/>
+        </w:rPr>
+        <w:t>maybe it is an outdated problem)</w:t>
       </w:r>
     </w:p>
     <w:p>
@@ -2945,16 +3291,75 @@
       <w:r>
         <w:t>It is good for small scale setup</w:t>
       </w:r>
+      <w:r>
+        <w:t xml:space="preserve"> Teacher wanted to show it </w:t>
+      </w:r>
+      <w:r>
+        <w:t xml:space="preserve">that </w:t>
+      </w:r>
+      <w:r>
+        <w:t xml:space="preserve">you can make it like that and if it </w:t>
+      </w:r>
+      <w:proofErr w:type="gramStart"/>
+      <w:r>
+        <w:t>become</w:t>
+      </w:r>
+      <w:proofErr w:type="gramEnd"/>
+      <w:r>
+        <w:t xml:space="preserve"> profitable then you can scale it (who knows) </w:t>
+      </w:r>
     </w:p>
     <w:p>
       <w:r>
         <w:t xml:space="preserve">Now as you commit then </w:t>
       </w:r>
-      <w:r>
-        <w:t>Digital ocean will build it</w:t>
-      </w:r>
-      <w:r>
-        <w:t xml:space="preserve"> automatically for you.</w:t>
+      <w:proofErr w:type="gramStart"/>
+      <w:r>
+        <w:t>Digital</w:t>
+      </w:r>
+      <w:r>
+        <w:t xml:space="preserve"> </w:t>
+      </w:r>
+      <w:r>
+        <w:t>ocean</w:t>
+      </w:r>
+      <w:proofErr w:type="gramEnd"/>
+      <w:r>
+        <w:t xml:space="preserve"> will build it</w:t>
+      </w:r>
+      <w:r>
+        <w:t xml:space="preserve"> automatically for </w:t>
+      </w:r>
+      <w:proofErr w:type="gramStart"/>
+      <w:r>
+        <w:t>you.</w:t>
+      </w:r>
+      <w:r>
+        <w:t>(</w:t>
+      </w:r>
+      <w:proofErr w:type="gramEnd"/>
+      <w:r>
+        <w:t>maybe if auto</w:t>
+      </w:r>
+      <w:r>
+        <w:t xml:space="preserve"> </w:t>
+      </w:r>
+      <w:r>
+        <w:t xml:space="preserve">deploy option was selected </w:t>
+      </w:r>
+      <w:r>
+        <w:t xml:space="preserve">in the </w:t>
+      </w:r>
+      <w:proofErr w:type="gramStart"/>
+      <w:r>
+        <w:t>setting(</w:t>
+      </w:r>
+      <w:proofErr w:type="gramEnd"/>
+      <w:r>
+        <w:t>who knows)</w:t>
+      </w:r>
+      <w:r>
+        <w:t>)</w:t>
       </w:r>
     </w:p>
     <w:p>
@@ -2989,10 +3394,18 @@
         <w:t xml:space="preserve">here (maybe </w:t>
       </w:r>
       <w:r>
-        <w:t>very large app don’t work properly</w:t>
-      </w:r>
-      <w:r>
-        <w:t>(who knows)</w:t>
+        <w:t xml:space="preserve">very large app don’t work </w:t>
+      </w:r>
+      <w:proofErr w:type="gramStart"/>
+      <w:r>
+        <w:t>properly</w:t>
+      </w:r>
+      <w:r>
+        <w:t>(</w:t>
+      </w:r>
+      <w:proofErr w:type="gramEnd"/>
+      <w:r>
+        <w:t>who knows)</w:t>
       </w:r>
       <w:r>
         <w:t>)</w:t>
@@ -3001,6 +3414,551 @@
         <w:t xml:space="preserve"> </w:t>
       </w:r>
     </w:p>
+    <w:p>
+      <w:r>
+        <w:lastRenderedPageBreak/>
+        <w:t xml:space="preserve">In digital ocean you cannot access files and folder directly </w:t>
+      </w:r>
+      <w:r>
+        <w:t xml:space="preserve">so we may not be able to submit </w:t>
+      </w:r>
+      <w:r>
+        <w:t>o</w:t>
+      </w:r>
+      <w:r>
+        <w:t>ur fo</w:t>
+      </w:r>
+      <w:r>
+        <w:t>r</w:t>
+      </w:r>
+      <w:r>
+        <w:t xml:space="preserve">m </w:t>
+      </w:r>
+      <w:r>
+        <w:t xml:space="preserve">because it is inside the docker </w:t>
+      </w:r>
+      <w:r>
+        <w:t xml:space="preserve">and there are many complications </w:t>
+      </w:r>
+    </w:p>
+    <w:p>
+      <w:r>
+        <w:t xml:space="preserve">Now we will see </w:t>
+      </w:r>
+      <w:r>
+        <w:t xml:space="preserve">how Google analytics and search </w:t>
+      </w:r>
+      <w:proofErr w:type="gramStart"/>
+      <w:r>
+        <w:t>console</w:t>
+      </w:r>
+      <w:r>
+        <w:t>(</w:t>
+      </w:r>
+      <w:proofErr w:type="gramEnd"/>
+      <w:r>
+        <w:t xml:space="preserve">who </w:t>
+      </w:r>
+      <w:proofErr w:type="spellStart"/>
+      <w:r>
+        <w:t>knowa</w:t>
+      </w:r>
+      <w:proofErr w:type="spellEnd"/>
+      <w:r>
+        <w:t>)</w:t>
+      </w:r>
+      <w:r>
+        <w:t xml:space="preserve"> </w:t>
+      </w:r>
+      <w:r>
+        <w:t xml:space="preserve">like very important services </w:t>
+      </w:r>
+      <w:r>
+        <w:t>added in our blog</w:t>
+      </w:r>
+      <w:r>
+        <w:t xml:space="preserve"> especially if next js is present </w:t>
+      </w:r>
+    </w:p>
+    <w:p>
+      <w:proofErr w:type="spellStart"/>
+      <w:r>
+        <w:t>Nextjs</w:t>
+      </w:r>
+      <w:proofErr w:type="spellEnd"/>
+      <w:r>
+        <w:t xml:space="preserve"> </w:t>
+      </w:r>
+      <w:r>
+        <w:t>d</w:t>
+      </w:r>
+      <w:r>
+        <w:t xml:space="preserve">on’t have index.html like we did see in React. </w:t>
+      </w:r>
+    </w:p>
+    <w:p>
+      <w:r>
+        <w:t xml:space="preserve">In </w:t>
+      </w:r>
+      <w:r>
+        <w:rPr>
+          <w:b/>
+          <w:bCs/>
+        </w:rPr>
+        <w:t>networking</w:t>
+      </w:r>
+      <w:r>
+        <w:t xml:space="preserve">, a </w:t>
+      </w:r>
+      <w:r>
+        <w:rPr>
+          <w:b/>
+          <w:bCs/>
+        </w:rPr>
+        <w:t>padlock</w:t>
+      </w:r>
+      <w:r>
+        <w:t xml:space="preserve"> refers to the </w:t>
+      </w:r>
+      <w:r>
+        <w:rPr>
+          <w:b/>
+          <w:bCs/>
+        </w:rPr>
+        <w:t>security lock icon shown in the browser address bar</w:t>
+      </w:r>
+      <w:r>
+        <w:t xml:space="preserve"> </w:t>
+      </w:r>
+      <w:r>
+        <w:rPr>
+          <w:rFonts w:ascii="Segoe UI Emoji" w:hAnsi="Segoe UI Emoji" w:cs="Segoe UI Emoji"/>
+        </w:rPr>
+        <w:t>🔒</w:t>
+      </w:r>
+      <w:r>
+        <w:t>.</w:t>
+      </w:r>
+    </w:p>
+    <w:p>
+      <w:pPr>
+        <w:rPr>
+          <w:b/>
+          <w:bCs/>
+        </w:rPr>
+      </w:pPr>
+      <w:r>
+        <w:rPr>
+          <w:b/>
+          <w:bCs/>
+        </w:rPr>
+        <w:t>Meaning</w:t>
+      </w:r>
+    </w:p>
+    <w:p>
+      <w:r>
+        <w:t xml:space="preserve">The padlock indicates that the connection between your </w:t>
+      </w:r>
+      <w:r>
+        <w:rPr>
+          <w:b/>
+          <w:bCs/>
+        </w:rPr>
+        <w:t>browser and the website is secure and encrypted</w:t>
+      </w:r>
+      <w:r>
+        <w:t>.</w:t>
+      </w:r>
+    </w:p>
+    <w:p>
+      <w:pPr>
+        <w:rPr>
+          <w:b/>
+          <w:bCs/>
+        </w:rPr>
+      </w:pPr>
+      <w:r>
+        <w:rPr>
+          <w:b/>
+          <w:bCs/>
+        </w:rPr>
+        <w:t>What it means technically</w:t>
+      </w:r>
+    </w:p>
+    <w:p>
+      <w:r>
+        <w:t xml:space="preserve">It means the website is using </w:t>
+      </w:r>
+      <w:r>
+        <w:rPr>
+          <w:b/>
+          <w:bCs/>
+        </w:rPr>
+        <w:t>HTTPS</w:t>
+      </w:r>
+      <w:r>
+        <w:t xml:space="preserve"> (HTTP Secure) with </w:t>
+      </w:r>
+      <w:r>
+        <w:rPr>
+          <w:b/>
+          <w:bCs/>
+        </w:rPr>
+        <w:t>SSL/TLS encryption</w:t>
+      </w:r>
+      <w:r>
+        <w:t>.</w:t>
+      </w:r>
+    </w:p>
+    <w:p>
+      <w:r>
+        <w:t xml:space="preserve">The digital ocean </w:t>
+      </w:r>
+      <w:r>
+        <w:t>automatically gives you a pad</w:t>
+      </w:r>
+      <w:r>
+        <w:t>lo</w:t>
+      </w:r>
+      <w:r>
+        <w:t xml:space="preserve">ck </w:t>
+      </w:r>
+      <w:r>
+        <w:t xml:space="preserve">which is also called </w:t>
+      </w:r>
+      <w:proofErr w:type="gramStart"/>
+      <w:r>
+        <w:t>S</w:t>
+      </w:r>
+      <w:r>
+        <w:t>S</w:t>
+      </w:r>
+      <w:r>
+        <w:t>LV(</w:t>
+      </w:r>
+      <w:proofErr w:type="gramEnd"/>
+      <w:r>
+        <w:t>who knows)</w:t>
+      </w:r>
+      <w:r>
+        <w:t xml:space="preserve"> and </w:t>
+      </w:r>
+      <w:r>
+        <w:t xml:space="preserve">this is a good feature of </w:t>
+      </w:r>
+      <w:r>
+        <w:t xml:space="preserve">the digital ocean. </w:t>
+      </w:r>
+      <w:r>
+        <w:t xml:space="preserve">You can see this I other service providers </w:t>
+      </w:r>
+      <w:r>
+        <w:t xml:space="preserve">Different types of services are provided by all hosting </w:t>
+      </w:r>
+      <w:r>
+        <w:t xml:space="preserve">providers </w:t>
+      </w:r>
+      <w:r>
+        <w:t xml:space="preserve">choose one hosting provider </w:t>
+      </w:r>
+      <w:r>
+        <w:t>and start your work</w:t>
+      </w:r>
+      <w:r>
+        <w:t xml:space="preserve"> according to what is your bu</w:t>
+      </w:r>
+      <w:r>
+        <w:t>d</w:t>
+      </w:r>
+      <w:r>
+        <w:t xml:space="preserve">get </w:t>
+      </w:r>
+      <w:r>
+        <w:t>and application comple</w:t>
+      </w:r>
+      <w:r>
+        <w:t>x</w:t>
+      </w:r>
+      <w:r>
+        <w:t xml:space="preserve">ity and severity </w:t>
+      </w:r>
+      <w:r>
+        <w:t xml:space="preserve">of the application. </w:t>
+      </w:r>
+      <w:proofErr w:type="gramStart"/>
+      <w:r>
+        <w:t>So</w:t>
+      </w:r>
+      <w:proofErr w:type="gramEnd"/>
+      <w:r>
+        <w:t xml:space="preserve"> if we want that the domain we have need to be pointe</w:t>
+      </w:r>
+      <w:r>
+        <w:t>d</w:t>
+      </w:r>
+      <w:r>
+        <w:t xml:space="preserve"> to the </w:t>
+      </w:r>
+      <w:r>
+        <w:t xml:space="preserve">server then we need to add domain to the </w:t>
+      </w:r>
+      <w:r>
+        <w:t xml:space="preserve">digital ocean. </w:t>
+      </w:r>
+    </w:p>
+    <w:p>
+      <w:r>
+        <w:t xml:space="preserve">When you add domain then </w:t>
+      </w:r>
+      <w:r>
+        <w:t>it will ask you should they manage it or w</w:t>
+      </w:r>
+      <w:r>
+        <w:t xml:space="preserve">e </w:t>
+      </w:r>
+      <w:r>
+        <w:t>should do it</w:t>
+      </w:r>
+    </w:p>
+    <w:p>
+      <w:r>
+        <w:t xml:space="preserve">Of you chose the former then you </w:t>
+      </w:r>
+      <w:proofErr w:type="gramStart"/>
+      <w:r>
+        <w:t xml:space="preserve">will  </w:t>
+      </w:r>
+      <w:r>
+        <w:t>see</w:t>
+      </w:r>
+      <w:proofErr w:type="gramEnd"/>
+      <w:r>
+        <w:t xml:space="preserve"> that from the dashboard </w:t>
+      </w:r>
+      <w:r>
+        <w:t xml:space="preserve">that how things are happening </w:t>
+      </w:r>
+      <w:r>
+        <w:t xml:space="preserve">and if you chose later </w:t>
+      </w:r>
+      <w:r>
+        <w:t xml:space="preserve">then you need to point it to a Digital </w:t>
+      </w:r>
+      <w:proofErr w:type="gramStart"/>
+      <w:r>
+        <w:t>ocean(</w:t>
+      </w:r>
+      <w:proofErr w:type="gramEnd"/>
+      <w:r>
+        <w:t>who knows)</w:t>
+      </w:r>
+      <w:r>
+        <w:t xml:space="preserve">. By former we bring the domain in the digital </w:t>
+      </w:r>
+      <w:proofErr w:type="gramStart"/>
+      <w:r>
+        <w:t>ocean(</w:t>
+      </w:r>
+      <w:proofErr w:type="gramEnd"/>
+      <w:r>
+        <w:t>who knows)</w:t>
+      </w:r>
+      <w:r>
+        <w:t xml:space="preserve">. </w:t>
+      </w:r>
+    </w:p>
+    <w:p>
+      <w:r>
+        <w:t xml:space="preserve">Now it follows the </w:t>
+      </w:r>
+      <w:r>
+        <w:t xml:space="preserve">domain </w:t>
+      </w:r>
+      <w:r>
+        <w:t>technique I already know</w:t>
+      </w:r>
+      <w:r>
+        <w:t>.</w:t>
+      </w:r>
+    </w:p>
+    <w:p>
+      <w:r>
+        <w:t xml:space="preserve">In former </w:t>
+      </w:r>
+      <w:r>
+        <w:t xml:space="preserve">we add the domain in digital ocean (who knows). </w:t>
+      </w:r>
+    </w:p>
+    <w:p>
+      <w:r>
+        <w:t xml:space="preserve">Now we want to see out </w:t>
+      </w:r>
+      <w:r>
+        <w:t>h</w:t>
+      </w:r>
+      <w:r>
+        <w:t>untingcoder</w:t>
+      </w:r>
+      <w:r>
+        <w:t xml:space="preserve">.com </w:t>
+      </w:r>
+      <w:r>
+        <w:t xml:space="preserve">on google search console </w:t>
+      </w:r>
+    </w:p>
+    <w:p>
+      <w:proofErr w:type="gramStart"/>
+      <w:r>
+        <w:t>So</w:t>
+      </w:r>
+      <w:proofErr w:type="gramEnd"/>
+      <w:r>
+        <w:t xml:space="preserve"> we went to Google search console</w:t>
+      </w:r>
+      <w:r>
+        <w:t xml:space="preserve"> so we add a property there </w:t>
+      </w:r>
+    </w:p>
+    <w:p>
+      <w:pPr>
+        <w:jc w:val="center"/>
+      </w:pPr>
+      <w:r>
+        <w:lastRenderedPageBreak/>
+        <w:drawing>
+          <wp:inline distT="0" distB="0" distL="0" distR="0" wp14:anchorId="3A8208C9" wp14:editId="1F6175C6">
+            <wp:extent cx="5731510" cy="4450080"/>
+            <wp:effectExtent l="0" t="0" r="2540" b="7620"/>
+            <wp:docPr id="1397350465" name="Picture 1"/>
+            <wp:cNvGraphicFramePr>
+              <a:graphicFrameLocks xmlns:a="http://schemas.openxmlformats.org/drawingml/2006/main" noChangeAspect="1"/>
+            </wp:cNvGraphicFramePr>
+            <a:graphic xmlns:a="http://schemas.openxmlformats.org/drawingml/2006/main">
+              <a:graphicData uri="http://schemas.openxmlformats.org/drawingml/2006/picture">
+                <pic:pic xmlns:pic="http://schemas.openxmlformats.org/drawingml/2006/picture">
+                  <pic:nvPicPr>
+                    <pic:cNvPr id="1397350465" name=""/>
+                    <pic:cNvPicPr/>
+                  </pic:nvPicPr>
+                  <pic:blipFill>
+                    <a:blip r:embed="rId21"/>
+                    <a:stretch>
+                      <a:fillRect/>
+                    </a:stretch>
+                  </pic:blipFill>
+                  <pic:spPr>
+                    <a:xfrm>
+                      <a:off x="0" y="0"/>
+                      <a:ext cx="5731510" cy="4450080"/>
+                    </a:xfrm>
+                    <a:prstGeom prst="rect">
+                      <a:avLst/>
+                    </a:prstGeom>
+                  </pic:spPr>
+                </pic:pic>
+              </a:graphicData>
+            </a:graphic>
+          </wp:inline>
+        </w:drawing>
+      </w:r>
+    </w:p>
+    <w:p>
+      <w:r>
+        <w:t xml:space="preserve">We get the option of adding property by </w:t>
+      </w:r>
+      <w:r>
+        <w:t>d</w:t>
+      </w:r>
+      <w:r>
+        <w:t>omain or url p</w:t>
+      </w:r>
+      <w:r>
+        <w:t xml:space="preserve">refix </w:t>
+      </w:r>
+      <w:r>
+        <w:t xml:space="preserve">when we enter </w:t>
+      </w:r>
+      <w:r>
+        <w:t>d</w:t>
+      </w:r>
+      <w:r>
+        <w:t xml:space="preserve">omain </w:t>
+      </w:r>
+      <w:r>
+        <w:t xml:space="preserve">ad then you need to verify it so it </w:t>
+      </w:r>
+      <w:proofErr w:type="gramStart"/>
+      <w:r>
+        <w:t>give</w:t>
+      </w:r>
+      <w:proofErr w:type="gramEnd"/>
+      <w:r>
+        <w:t xml:space="preserve"> us some text which we will paste in the </w:t>
+      </w:r>
+      <w:r>
+        <w:t xml:space="preserve">DNS records to give the proof for ownership of domain. </w:t>
+      </w:r>
+      <w:r>
+        <w:t>After this you can g</w:t>
+      </w:r>
+      <w:r>
+        <w:t xml:space="preserve">et to go </w:t>
+      </w:r>
+      <w:r>
+        <w:t xml:space="preserve">to properties </w:t>
+      </w:r>
+    </w:p>
+    <w:p>
+      <w:pPr>
+        <w:jc w:val="center"/>
+      </w:pPr>
+      <w:r>
+        <w:drawing>
+          <wp:inline distT="0" distB="0" distL="0" distR="0" wp14:anchorId="78608F09" wp14:editId="5CBFD49E">
+            <wp:extent cx="5731510" cy="2922905"/>
+            <wp:effectExtent l="0" t="0" r="2540" b="0"/>
+            <wp:docPr id="949899873" name="Picture 1"/>
+            <wp:cNvGraphicFramePr>
+              <a:graphicFrameLocks xmlns:a="http://schemas.openxmlformats.org/drawingml/2006/main" noChangeAspect="1"/>
+            </wp:cNvGraphicFramePr>
+            <a:graphic xmlns:a="http://schemas.openxmlformats.org/drawingml/2006/main">
+              <a:graphicData uri="http://schemas.openxmlformats.org/drawingml/2006/picture">
+                <pic:pic xmlns:pic="http://schemas.openxmlformats.org/drawingml/2006/picture">
+                  <pic:nvPicPr>
+                    <pic:cNvPr id="949899873" name=""/>
+                    <pic:cNvPicPr/>
+                  </pic:nvPicPr>
+                  <pic:blipFill>
+                    <a:blip r:embed="rId22"/>
+                    <a:stretch>
+                      <a:fillRect/>
+                    </a:stretch>
+                  </pic:blipFill>
+                  <pic:spPr>
+                    <a:xfrm>
+                      <a:off x="0" y="0"/>
+                      <a:ext cx="5731510" cy="2922905"/>
+                    </a:xfrm>
+                    <a:prstGeom prst="rect">
+                      <a:avLst/>
+                    </a:prstGeom>
+                  </pic:spPr>
+                </pic:pic>
+              </a:graphicData>
+            </a:graphic>
+          </wp:inline>
+        </w:drawing>
+      </w:r>
+    </w:p>
+    <w:p>
+      <w:r>
+        <w:t>Now you can see all th</w:t>
+      </w:r>
+      <w:r>
+        <w:t>e things of the domain over here.</w:t>
+      </w:r>
+    </w:p>
+    <w:p/>
     <w:sectPr>
       <w:pgSz w:w="11906" w:h="16838"/>
       <w:pgMar w:top="1440" w:right="1440" w:bottom="1440" w:left="1440" w:header="708" w:footer="708" w:gutter="0"/>

</xml_diff>

<commit_message>
Lesson 33  A Next.js powered E-Commerce Store | NextJs Tutorial for Beginners
</commit_message>
<xml_diff>
--- a/Notes2.docx
+++ b/Notes2.docx
@@ -59,18 +59,10 @@
     </w:p>
     <w:p>
       <w:r>
-        <w:t xml:space="preserve">In nay </w:t>
-      </w:r>
-      <w:proofErr w:type="gramStart"/>
-      <w:r>
-        <w:t>container</w:t>
-      </w:r>
-      <w:r>
-        <w:t>(</w:t>
-      </w:r>
-      <w:proofErr w:type="gramEnd"/>
-      <w:r>
-        <w:t>or component)</w:t>
+        <w:t>In nay container</w:t>
+      </w:r>
+      <w:r>
+        <w:t>(or component)</w:t>
       </w:r>
       <w:r>
         <w:t xml:space="preserve"> if you want to </w:t>
@@ -555,14 +547,9 @@
       </w:r>
     </w:p>
     <w:p>
-      <w:proofErr w:type="gramStart"/>
       <w:r>
         <w:lastRenderedPageBreak/>
-        <w:t>So</w:t>
-      </w:r>
-      <w:proofErr w:type="gramEnd"/>
-      <w:r>
-        <w:t xml:space="preserve"> we can so this thing Now we can see it is getting rendered as shown below</w:t>
+        <w:t>So we can so this thing Now we can see it is getting rendered as shown below</w:t>
       </w:r>
     </w:p>
     <w:p>
@@ -664,13 +651,8 @@
         <w:t xml:space="preserve"> s</w:t>
       </w:r>
       <w:r>
-        <w:t xml:space="preserve">ubmit the </w:t>
-      </w:r>
-      <w:proofErr w:type="gramStart"/>
-      <w:r>
-        <w:t>form</w:t>
-      </w:r>
-      <w:proofErr w:type="gramEnd"/>
+        <w:t>ubmit the form</w:t>
+      </w:r>
       <w:r>
         <w:t xml:space="preserve"> we will definitely have to make an API to co</w:t>
       </w:r>
@@ -736,29 +718,8 @@
       </w:r>
     </w:p>
     <w:p>
-      <w:proofErr w:type="gramStart"/>
-      <w:r>
-        <w:t>So</w:t>
-      </w:r>
-      <w:proofErr w:type="gramEnd"/>
-      <w:r>
-        <w:t xml:space="preserve"> for </w:t>
-      </w:r>
-      <w:proofErr w:type="gramStart"/>
-      <w:r>
-        <w:t>now</w:t>
-      </w:r>
-      <w:proofErr w:type="gramEnd"/>
-      <w:r>
-        <w:t xml:space="preserve"> our post request handler </w:t>
-      </w:r>
-      <w:proofErr w:type="gramStart"/>
-      <w:r>
-        <w:t>look</w:t>
-      </w:r>
-      <w:proofErr w:type="gramEnd"/>
-      <w:r>
-        <w:t xml:space="preserve"> like below</w:t>
+      <w:r>
+        <w:t>So for now our post request handler look like below</w:t>
       </w:r>
     </w:p>
     <w:p>
@@ -807,13 +768,8 @@
       </w:r>
     </w:p>
     <w:p>
-      <w:proofErr w:type="gramStart"/>
-      <w:r>
-        <w:t>Ols</w:t>
-      </w:r>
-      <w:proofErr w:type="gramEnd"/>
-      <w:r>
-        <w:t xml:space="preserve"> version used to look like below</w:t>
+      <w:r>
+        <w:t>Ols version used to look like below</w:t>
       </w:r>
     </w:p>
     <w:p>
@@ -921,12 +877,10 @@
         <w:t xml:space="preserve">, not plain JSON, so sending it directly with </w:t>
       </w:r>
       <w:proofErr w:type="spellStart"/>
-      <w:proofErr w:type="gramStart"/>
       <w:r>
         <w:t>res.json</w:t>
       </w:r>
       <w:proofErr w:type="spellEnd"/>
-      <w:proofErr w:type="gramEnd"/>
       <w:r>
         <w:t>(</w:t>
       </w:r>
@@ -984,14 +938,9 @@
     </w:p>
     <w:p>
       <w:r>
-        <w:t xml:space="preserve">export default function </w:t>
-      </w:r>
-      <w:proofErr w:type="gramStart"/>
-      <w:r>
-        <w:t>handler(</w:t>
-      </w:r>
-      <w:proofErr w:type="spellStart"/>
-      <w:proofErr w:type="gramEnd"/>
+        <w:t>export default function handler(</w:t>
+      </w:r>
+      <w:proofErr w:type="spellStart"/>
       <w:r>
         <w:t>req</w:t>
       </w:r>
@@ -1097,7 +1046,6 @@
         <w:t xml:space="preserve">Why </w:t>
       </w:r>
       <w:proofErr w:type="spellStart"/>
-      <w:proofErr w:type="gramStart"/>
       <w:r>
         <w:rPr>
           <w:b/>
@@ -1106,7 +1054,6 @@
         <w:t>res.json</w:t>
       </w:r>
       <w:proofErr w:type="spellEnd"/>
-      <w:proofErr w:type="gramEnd"/>
       <w:r>
         <w:rPr>
           <w:b/>
@@ -1138,25 +1085,18 @@
     </w:p>
     <w:p>
       <w:proofErr w:type="spellStart"/>
-      <w:proofErr w:type="gramStart"/>
       <w:r>
         <w:t>res.status</w:t>
       </w:r>
       <w:proofErr w:type="spellEnd"/>
-      <w:proofErr w:type="gramEnd"/>
-      <w:r>
-        <w:t>(200</w:t>
-      </w:r>
-      <w:proofErr w:type="gramStart"/>
-      <w:r>
-        <w:t>).</w:t>
+      <w:r>
+        <w:t>(200).</w:t>
       </w:r>
       <w:proofErr w:type="spellStart"/>
       <w:r>
         <w:t>json</w:t>
       </w:r>
       <w:proofErr w:type="spellEnd"/>
-      <w:proofErr w:type="gramEnd"/>
       <w:r>
         <w:t>(</w:t>
       </w:r>
@@ -1257,14 +1197,9 @@
     </w:p>
     <w:p>
       <w:r>
-        <w:t xml:space="preserve">export default function </w:t>
-      </w:r>
-      <w:proofErr w:type="gramStart"/>
-      <w:r>
-        <w:t>handler(</w:t>
-      </w:r>
-      <w:proofErr w:type="spellStart"/>
-      <w:proofErr w:type="gramEnd"/>
+        <w:t>export default function handler(</w:t>
+      </w:r>
+      <w:proofErr w:type="spellStart"/>
       <w:r>
         <w:t>req</w:t>
       </w:r>
@@ -1277,12 +1212,10 @@
         <w:t xml:space="preserve">  if (</w:t>
       </w:r>
       <w:proofErr w:type="spellStart"/>
-      <w:proofErr w:type="gramStart"/>
       <w:r>
         <w:t>req.method</w:t>
       </w:r>
       <w:proofErr w:type="spellEnd"/>
-      <w:proofErr w:type="gramEnd"/>
       <w:r>
         <w:t xml:space="preserve"> === "POST") {</w:t>
       </w:r>
@@ -1291,25 +1224,18 @@
         <w:t xml:space="preserve">    </w:t>
       </w:r>
       <w:proofErr w:type="spellStart"/>
-      <w:proofErr w:type="gramStart"/>
       <w:r>
         <w:t>res.status</w:t>
       </w:r>
       <w:proofErr w:type="spellEnd"/>
-      <w:proofErr w:type="gramEnd"/>
-      <w:r>
-        <w:t>(200</w:t>
-      </w:r>
-      <w:proofErr w:type="gramStart"/>
-      <w:r>
-        <w:t>).</w:t>
+      <w:r>
+        <w:t>(200).</w:t>
       </w:r>
       <w:proofErr w:type="spellStart"/>
       <w:r>
         <w:t>json</w:t>
       </w:r>
       <w:proofErr w:type="spellEnd"/>
-      <w:proofErr w:type="gramEnd"/>
       <w:r>
         <w:t>({</w:t>
       </w:r>
@@ -1318,12 +1244,10 @@
         <w:t xml:space="preserve">      method: </w:t>
       </w:r>
       <w:proofErr w:type="spellStart"/>
-      <w:proofErr w:type="gramStart"/>
       <w:r>
         <w:t>req.method</w:t>
       </w:r>
       <w:proofErr w:type="spellEnd"/>
-      <w:proofErr w:type="gramEnd"/>
       <w:r>
         <w:t>,</w:t>
       </w:r>
@@ -1332,12 +1256,10 @@
         <w:t xml:space="preserve">      body: </w:t>
       </w:r>
       <w:proofErr w:type="spellStart"/>
-      <w:proofErr w:type="gramStart"/>
       <w:r>
         <w:t>req.body</w:t>
       </w:r>
       <w:proofErr w:type="spellEnd"/>
-      <w:proofErr w:type="gramEnd"/>
       <w:r>
         <w:t>,</w:t>
       </w:r>
@@ -1346,12 +1268,10 @@
         <w:t xml:space="preserve">      query: </w:t>
       </w:r>
       <w:proofErr w:type="spellStart"/>
-      <w:proofErr w:type="gramStart"/>
       <w:r>
         <w:t>req.query</w:t>
       </w:r>
       <w:proofErr w:type="spellEnd"/>
-      <w:proofErr w:type="gramEnd"/>
       <w:r>
         <w:t>,</w:t>
       </w:r>
@@ -1361,12 +1281,8 @@
       </w:r>
       <w:r>
         <w:br/>
-      </w:r>
-      <w:proofErr w:type="gramStart"/>
-      <w:r>
         <w:t xml:space="preserve">  }</w:t>
       </w:r>
-      <w:proofErr w:type="gramEnd"/>
       <w:r>
         <w:br/>
         <w:t>}</w:t>
@@ -1522,12 +1438,10 @@
           </w:tcPr>
           <w:p>
             <w:proofErr w:type="spellStart"/>
-            <w:proofErr w:type="gramStart"/>
             <w:r>
               <w:t>req.body</w:t>
             </w:r>
             <w:proofErr w:type="spellEnd"/>
-            <w:proofErr w:type="gramEnd"/>
           </w:p>
         </w:tc>
         <w:tc>
@@ -1561,12 +1475,10 @@
           </w:tcPr>
           <w:p>
             <w:proofErr w:type="spellStart"/>
-            <w:proofErr w:type="gramStart"/>
             <w:r>
               <w:t>req.query</w:t>
             </w:r>
             <w:proofErr w:type="spellEnd"/>
-            <w:proofErr w:type="gramEnd"/>
           </w:p>
         </w:tc>
         <w:tc>
@@ -1600,12 +1512,10 @@
           </w:tcPr>
           <w:p>
             <w:proofErr w:type="spellStart"/>
-            <w:proofErr w:type="gramStart"/>
             <w:r>
               <w:t>req.method</w:t>
             </w:r>
             <w:proofErr w:type="spellEnd"/>
-            <w:proofErr w:type="gramEnd"/>
           </w:p>
         </w:tc>
         <w:tc>
@@ -1657,14 +1567,9 @@
     </w:p>
     <w:p>
       <w:r>
-        <w:t xml:space="preserve">export async function </w:t>
-      </w:r>
-      <w:proofErr w:type="gramStart"/>
-      <w:r>
-        <w:t>POST(</w:t>
-      </w:r>
-      <w:proofErr w:type="spellStart"/>
-      <w:proofErr w:type="gramEnd"/>
+        <w:t>export async function POST(</w:t>
+      </w:r>
+      <w:proofErr w:type="spellStart"/>
       <w:r>
         <w:t>req</w:t>
       </w:r>
@@ -1688,12 +1593,10 @@
         <w:t xml:space="preserve"> body = await </w:t>
       </w:r>
       <w:proofErr w:type="spellStart"/>
-      <w:proofErr w:type="gramStart"/>
       <w:r>
         <w:t>req.json</w:t>
       </w:r>
       <w:proofErr w:type="spellEnd"/>
-      <w:proofErr w:type="gramEnd"/>
       <w:r>
         <w:t>();</w:t>
       </w:r>
@@ -1755,12 +1658,10 @@
         <w:t xml:space="preserve">d specific fields like </w:t>
       </w:r>
       <w:proofErr w:type="spellStart"/>
-      <w:proofErr w:type="gramStart"/>
       <w:r>
         <w:t>req.body</w:t>
       </w:r>
       <w:proofErr w:type="spellEnd"/>
-      <w:proofErr w:type="gramEnd"/>
       <w:r>
         <w:t>.</w:t>
       </w:r>
@@ -1770,15 +1671,7 @@
         <w:t>In older version we used to get body like we did in n</w:t>
       </w:r>
       <w:r>
-        <w:t xml:space="preserve">ode js but in modern it </w:t>
-      </w:r>
-      <w:proofErr w:type="gramStart"/>
-      <w:r>
-        <w:t>look</w:t>
-      </w:r>
-      <w:proofErr w:type="gramEnd"/>
-      <w:r>
-        <w:t xml:space="preserve"> like below</w:t>
+        <w:t>ode js but in modern it look like below</w:t>
       </w:r>
     </w:p>
     <w:p>
@@ -1881,18 +1774,10 @@
         <w:t>The problem with the file making</w:t>
       </w:r>
       <w:r>
-        <w:t xml:space="preserve"> </w:t>
-      </w:r>
-      <w:proofErr w:type="gramStart"/>
-      <w:r>
-        <w:t xml:space="preserve">strategy </w:t>
-      </w:r>
-      <w:r>
-        <w:t xml:space="preserve"> is</w:t>
-      </w:r>
-      <w:proofErr w:type="gramEnd"/>
-      <w:r>
-        <w:t xml:space="preserve"> that </w:t>
+        <w:t xml:space="preserve"> strategy </w:t>
+      </w:r>
+      <w:r>
+        <w:t xml:space="preserve"> is that </w:t>
       </w:r>
       <w:r>
         <w:t xml:space="preserve">if suppose </w:t>
@@ -2005,41 +1890,20 @@
       </w:r>
       <w:proofErr w:type="spellEnd"/>
       <w:r>
+        <w:t xml:space="preserve"> element</w:t>
+      </w:r>
+      <w:r>
+        <w:t>(who knows may be I am wrong here)</w:t>
+      </w:r>
+      <w:r>
         <w:t xml:space="preserve"> </w:t>
       </w:r>
-      <w:proofErr w:type="gramStart"/>
-      <w:r>
-        <w:t>element</w:t>
-      </w:r>
-      <w:r>
-        <w:t>(</w:t>
-      </w:r>
-      <w:proofErr w:type="gramEnd"/>
-      <w:r>
-        <w:t xml:space="preserve">who knows </w:t>
-      </w:r>
-      <w:proofErr w:type="gramStart"/>
-      <w:r>
-        <w:t>may be</w:t>
-      </w:r>
-      <w:proofErr w:type="gramEnd"/>
-      <w:r>
-        <w:t xml:space="preserve"> I am wrong here)</w:t>
-      </w:r>
-      <w:r>
-        <w:t xml:space="preserve"> </w:t>
-      </w:r>
       <w:r>
         <w:t xml:space="preserve">and on state update method we used </w:t>
       </w:r>
       <w:proofErr w:type="spellStart"/>
-      <w:proofErr w:type="gramStart"/>
-      <w:r>
-        <w:t>e.target</w:t>
-      </w:r>
-      <w:proofErr w:type="gramEnd"/>
-      <w:r>
-        <w:t>.innerText</w:t>
+      <w:r>
+        <w:t>e.target.innerText</w:t>
       </w:r>
       <w:proofErr w:type="spellEnd"/>
     </w:p>
@@ -2056,13 +1920,8 @@
         <w:t xml:space="preserve"> we can use </w:t>
       </w:r>
       <w:proofErr w:type="spellStart"/>
-      <w:proofErr w:type="gramStart"/>
-      <w:r>
-        <w:t>e.target</w:t>
-      </w:r>
-      <w:proofErr w:type="gramEnd"/>
-      <w:r>
-        <w:t>,value</w:t>
+      <w:r>
+        <w:t>e.target,value</w:t>
       </w:r>
       <w:proofErr w:type="spellEnd"/>
       <w:r>
@@ -2178,16 +2037,13 @@
         <w:t xml:space="preserve">Shortcut for </w:t>
       </w:r>
       <w:proofErr w:type="spellStart"/>
-      <w:proofErr w:type="gramStart"/>
       <w:r>
         <w:t>margin:auto</w:t>
       </w:r>
       <w:proofErr w:type="spellEnd"/>
-      <w:proofErr w:type="gramEnd"/>
       <w:r>
         <w:t xml:space="preserve"> will be </w:t>
       </w:r>
-      <w:proofErr w:type="gramStart"/>
       <w:r>
         <w:rPr>
           <w:b/>
@@ -2195,7 +2051,6 @@
         </w:rPr>
         <w:t>m:auto</w:t>
       </w:r>
-      <w:proofErr w:type="gramEnd"/>
       <w:r>
         <w:rPr>
           <w:b/>
@@ -2259,18 +2114,10 @@
     </w:p>
     <w:p>
       <w:r>
-        <w:t xml:space="preserve">Suppose you have 50 blogs and you want to show 5 blogs on each </w:t>
-      </w:r>
-      <w:proofErr w:type="gramStart"/>
-      <w:r>
-        <w:t xml:space="preserve">pages </w:t>
-      </w:r>
-      <w:r>
-        <w:t xml:space="preserve"> so</w:t>
-      </w:r>
-      <w:proofErr w:type="gramEnd"/>
-      <w:r>
-        <w:t xml:space="preserve"> 10 pages </w:t>
+        <w:t xml:space="preserve">Suppose you have 50 blogs and you want to show 5 blogs on each pages </w:t>
+      </w:r>
+      <w:r>
+        <w:t xml:space="preserve"> so 10 pages </w:t>
       </w:r>
       <w:r>
         <w:t>will</w:t>
@@ -2281,16 +2128,11 @@
       <w:r>
         <w:t xml:space="preserve">be </w:t>
       </w:r>
-      <w:proofErr w:type="gramStart"/>
       <w:r>
         <w:t xml:space="preserve">formed </w:t>
       </w:r>
       <w:r>
-        <w:t>.</w:t>
-      </w:r>
-      <w:proofErr w:type="gramEnd"/>
-      <w:r>
-        <w:t xml:space="preserve"> In the similar way </w:t>
+        <w:t xml:space="preserve">. In the similar way </w:t>
       </w:r>
       <w:r>
         <w:t xml:space="preserve">pagination can be showed </w:t>
@@ -2383,15 +2225,7 @@
         <w:t xml:space="preserve">that we will not good components </w:t>
       </w:r>
       <w:r>
-        <w:t xml:space="preserve">means you won’t get good packages for doing any </w:t>
-      </w:r>
-      <w:proofErr w:type="gramStart"/>
-      <w:r>
-        <w:t>work(</w:t>
-      </w:r>
-      <w:proofErr w:type="gramEnd"/>
-      <w:r>
-        <w:t>who knows)</w:t>
+        <w:t>means you won’t get good packages for doing any work(who knows)</w:t>
       </w:r>
     </w:p>
     <w:p>
@@ -2420,27 +2254,14 @@
       </w:r>
     </w:p>
     <w:p>
-      <w:proofErr w:type="gramStart"/>
-      <w:r>
-        <w:t>So</w:t>
-      </w:r>
-      <w:proofErr w:type="gramEnd"/>
-      <w:r>
-        <w:t xml:space="preserve"> we run the above command I context of </w:t>
+      <w:r>
+        <w:t xml:space="preserve">So we run the above command I context of </w:t>
       </w:r>
       <w:r>
         <w:t xml:space="preserve">yarn </w:t>
       </w:r>
       <w:r>
-        <w:t xml:space="preserve">by </w:t>
-      </w:r>
-      <w:proofErr w:type="gramStart"/>
-      <w:r>
-        <w:t>using  below</w:t>
-      </w:r>
-      <w:proofErr w:type="gramEnd"/>
-      <w:r>
-        <w:t xml:space="preserve"> command</w:t>
+        <w:t>by using  below command</w:t>
       </w:r>
     </w:p>
     <w:p>
@@ -2528,29 +2349,13 @@
         <w:t xml:space="preserve">Data length </w:t>
       </w:r>
       <w:r>
-        <w:t xml:space="preserve">of the data that to be </w:t>
-      </w:r>
-      <w:proofErr w:type="gramStart"/>
-      <w:r>
-        <w:t>shown</w:t>
-      </w:r>
-      <w:r>
-        <w:t xml:space="preserve"> ,</w:t>
-      </w:r>
-      <w:proofErr w:type="gramEnd"/>
-      <w:r>
-        <w:t xml:space="preserve"> next is the </w:t>
-      </w:r>
-      <w:proofErr w:type="gramStart"/>
-      <w:r>
-        <w:t xml:space="preserve">function  </w:t>
-      </w:r>
-      <w:r>
-        <w:t>that</w:t>
-      </w:r>
-      <w:proofErr w:type="gramEnd"/>
-      <w:r>
-        <w:t xml:space="preserve"> will be called when we scroll and reach the bottom and more data is needed to be loaded.</w:t>
+        <w:t>of the data that to be shown</w:t>
+      </w:r>
+      <w:r>
+        <w:t xml:space="preserve"> , next is the function  </w:t>
+      </w:r>
+      <w:r>
+        <w:t>that will be called when we scroll and reach the bottom and more data is needed to be loaded.</w:t>
       </w:r>
     </w:p>
     <w:p>
@@ -2578,21 +2383,13 @@
         <w:t>w</w:t>
       </w:r>
       <w:r>
-        <w:t xml:space="preserve">n </w:t>
-      </w:r>
-      <w:proofErr w:type="gramStart"/>
-      <w:r>
-        <w:t>function</w:t>
+        <w:t>n function</w:t>
       </w:r>
       <w:r>
         <w:t>al</w:t>
       </w:r>
       <w:r>
-        <w:t>ity(</w:t>
-      </w:r>
-      <w:proofErr w:type="gramEnd"/>
-      <w:r>
-        <w:t>who knows)</w:t>
+        <w:t>ity(who knows)</w:t>
       </w:r>
     </w:p>
     <w:p>
@@ -2674,15 +2471,7 @@
         <w:t xml:space="preserve">it is defined like this </w:t>
       </w:r>
       <w:r>
-        <w:t xml:space="preserve">if we keep single </w:t>
-      </w:r>
-      <w:proofErr w:type="gramStart"/>
-      <w:r>
-        <w:t>item</w:t>
-      </w:r>
-      <w:proofErr w:type="gramEnd"/>
-      <w:r>
-        <w:t xml:space="preserve"> </w:t>
+        <w:t xml:space="preserve">if we keep single item </w:t>
       </w:r>
       <w:r>
         <w:t>we need to see al</w:t>
@@ -2691,21 +2480,13 @@
         <w:t>l</w:t>
       </w:r>
       <w:r>
-        <w:t xml:space="preserve"> </w:t>
-      </w:r>
-      <w:proofErr w:type="gramStart"/>
-      <w:r>
-        <w:t>this thi</w:t>
+        <w:t xml:space="preserve"> this thi</w:t>
       </w:r>
       <w:r>
         <w:t>n</w:t>
       </w:r>
       <w:r>
-        <w:t>gs</w:t>
-      </w:r>
-      <w:proofErr w:type="gramEnd"/>
-      <w:r>
-        <w:t xml:space="preserve"> </w:t>
+        <w:t xml:space="preserve">gs </w:t>
       </w:r>
     </w:p>
     <w:p>
@@ -2715,7 +2496,6 @@
           <w:bCs/>
         </w:rPr>
       </w:pPr>
-      <w:proofErr w:type="gramStart"/>
       <w:r>
         <w:rPr>
           <w:b/>
@@ -2723,7 +2503,6 @@
         </w:rPr>
         <w:t>Note:-</w:t>
       </w:r>
-      <w:proofErr w:type="gramEnd"/>
     </w:p>
     <w:p>
       <w:pPr>
@@ -2735,15 +2514,7 @@
         <w:t xml:space="preserve">Sometime it happens </w:t>
       </w:r>
       <w:r>
-        <w:t xml:space="preserve">in react that one component is </w:t>
-      </w:r>
-      <w:proofErr w:type="gramStart"/>
-      <w:r>
-        <w:t>show  two</w:t>
-      </w:r>
-      <w:proofErr w:type="gramEnd"/>
-      <w:r>
-        <w:t xml:space="preserve"> times so reload to remove the bug</w:t>
+        <w:t>in react that one component is show  two times so reload to remove the bug</w:t>
       </w:r>
     </w:p>
     <w:p>
@@ -2759,15 +2530,7 @@
         <w:t xml:space="preserve">except for responsiveness </w:t>
       </w:r>
       <w:r>
-        <w:t xml:space="preserve">we </w:t>
-      </w:r>
-      <w:proofErr w:type="gramStart"/>
-      <w:r>
-        <w:t>will  make</w:t>
-      </w:r>
-      <w:proofErr w:type="gramEnd"/>
-      <w:r>
-        <w:t xml:space="preserve"> our blog responsive and will write media queries </w:t>
+        <w:t xml:space="preserve">we will  make our blog responsive and will write media queries </w:t>
       </w:r>
       <w:r>
         <w:t>how we can we run media que</w:t>
@@ -2793,13 +2556,8 @@
         <w:t xml:space="preserve">the website </w:t>
       </w:r>
       <w:r>
-        <w:t xml:space="preserve">and if you gave </w:t>
-      </w:r>
-      <w:proofErr w:type="gramStart"/>
-      <w:r>
-        <w:t>responsiveness</w:t>
-      </w:r>
-      <w:proofErr w:type="gramEnd"/>
+        <w:t>and if you gave responsiveness</w:t>
+      </w:r>
       <w:r>
         <w:t xml:space="preserve"> it was an addon</w:t>
       </w:r>
@@ -2815,15 +2573,7 @@
         <w:t xml:space="preserve"> </w:t>
       </w:r>
       <w:r>
-        <w:t xml:space="preserve">you can say bit in </w:t>
-      </w:r>
-      <w:proofErr w:type="gramStart"/>
-      <w:r>
-        <w:t>todays</w:t>
-      </w:r>
-      <w:proofErr w:type="gramEnd"/>
-      <w:r>
-        <w:t xml:space="preserve"> time </w:t>
+        <w:t xml:space="preserve">you can say bit in todays time </w:t>
       </w:r>
       <w:r>
         <w:t xml:space="preserve">if you are delivering a website </w:t>
@@ -2898,11 +2648,7 @@
     </w:p>
     <w:p>
       <w:r>
-        <w:t xml:space="preserve">We will </w:t>
-      </w:r>
-      <w:proofErr w:type="gramStart"/>
-      <w:r>
-        <w:t>ho</w:t>
+        <w:t>We will ho</w:t>
       </w:r>
       <w:r>
         <w:t>s</w:t>
@@ -2911,11 +2657,7 @@
         <w:t>t</w:t>
       </w:r>
       <w:r>
-        <w:t>s</w:t>
-      </w:r>
-      <w:proofErr w:type="gramEnd"/>
-      <w:r>
-        <w:t xml:space="preserve"> the web</w:t>
+        <w:t>s the web</w:t>
       </w:r>
       <w:r>
         <w:t>s</w:t>
@@ -3042,15 +2784,7 @@
     </w:p>
     <w:p>
       <w:r>
-        <w:t xml:space="preserve">IN digital ocean we make new </w:t>
-      </w:r>
-      <w:proofErr w:type="gramStart"/>
-      <w:r>
-        <w:t>user(</w:t>
-      </w:r>
-      <w:proofErr w:type="gramEnd"/>
-      <w:r>
-        <w:t xml:space="preserve">who knows) </w:t>
+        <w:t xml:space="preserve">IN digital ocean we make new user(who knows) </w:t>
       </w:r>
     </w:p>
     <w:p>
@@ -3088,26 +2822,13 @@
       <w:r>
         <w:t xml:space="preserve">process will be </w:t>
       </w:r>
-      <w:proofErr w:type="gramStart"/>
-      <w:r>
-        <w:t>build</w:t>
-      </w:r>
-      <w:proofErr w:type="gramEnd"/>
-      <w:r>
-        <w:t xml:space="preserve"> there </w:t>
-      </w:r>
-    </w:p>
-    <w:p>
-      <w:r>
-        <w:t xml:space="preserve">It will ask you to make database in </w:t>
-      </w:r>
-      <w:proofErr w:type="gramStart"/>
-      <w:r>
-        <w:t>there</w:t>
-      </w:r>
-      <w:proofErr w:type="gramEnd"/>
-      <w:r>
-        <w:t xml:space="preserve"> services.</w:t>
+      <w:r>
+        <w:t xml:space="preserve">build there </w:t>
+      </w:r>
+    </w:p>
+    <w:p>
+      <w:r>
+        <w:t>It will ask you to make database in there services.</w:t>
       </w:r>
       <w:r>
         <w:t xml:space="preserve"> (who knows)</w:t>
@@ -3158,14 +2879,9 @@
       </w:r>
       <w:proofErr w:type="spellEnd"/>
       <w:r>
-        <w:t xml:space="preserve"> it will be </w:t>
-      </w:r>
-      <w:proofErr w:type="gramStart"/>
-      <w:r>
-        <w:t>good(</w:t>
-      </w:r>
-      <w:proofErr w:type="spellStart"/>
-      <w:proofErr w:type="gramEnd"/>
+        <w:t xml:space="preserve"> it will be good(</w:t>
+      </w:r>
+      <w:proofErr w:type="spellStart"/>
       <w:r>
         <w:t>wjp</w:t>
       </w:r>
@@ -3182,101 +2898,73 @@
           <w:color w:val="EE0000"/>
         </w:rPr>
       </w:pPr>
-      <w:proofErr w:type="gramStart"/>
       <w:r>
         <w:rPr>
           <w:b/>
           <w:bCs/>
           <w:color w:val="EE0000"/>
         </w:rPr>
-        <w:t>‘ can</w:t>
-      </w:r>
-      <w:proofErr w:type="gramEnd"/>
+        <w:t xml:space="preserve">‘ can create </w:t>
+      </w:r>
       <w:r>
         <w:rPr>
           <w:b/>
           <w:bCs/>
           <w:color w:val="EE0000"/>
         </w:rPr>
-        <w:t xml:space="preserve"> create </w:t>
-      </w:r>
+        <w:t xml:space="preserve">error in </w:t>
+      </w:r>
+      <w:proofErr w:type="spellStart"/>
       <w:r>
         <w:rPr>
           <w:b/>
           <w:bCs/>
           <w:color w:val="EE0000"/>
         </w:rPr>
-        <w:t xml:space="preserve">error in </w:t>
-      </w:r>
-      <w:proofErr w:type="spellStart"/>
+        <w:t>js</w:t>
+      </w:r>
       <w:r>
         <w:rPr>
           <w:b/>
           <w:bCs/>
           <w:color w:val="EE0000"/>
         </w:rPr>
-        <w:t>js</w:t>
-      </w:r>
+        <w:t>x</w:t>
+      </w:r>
+      <w:proofErr w:type="spellEnd"/>
       <w:r>
         <w:rPr>
           <w:b/>
           <w:bCs/>
           <w:color w:val="EE0000"/>
         </w:rPr>
-        <w:t>x</w:t>
-      </w:r>
-      <w:proofErr w:type="spellEnd"/>
+        <w:t xml:space="preserve"> in </w:t>
+      </w:r>
+      <w:proofErr w:type="spellStart"/>
       <w:r>
         <w:rPr>
           <w:b/>
           <w:bCs/>
           <w:color w:val="EE0000"/>
         </w:rPr>
-        <w:t xml:space="preserve"> in </w:t>
-      </w:r>
-      <w:proofErr w:type="spellStart"/>
+        <w:t>Nextjs</w:t>
+      </w:r>
+      <w:proofErr w:type="spellEnd"/>
       <w:r>
         <w:rPr>
           <w:b/>
           <w:bCs/>
           <w:color w:val="EE0000"/>
         </w:rPr>
-        <w:t>Nextjs</w:t>
-      </w:r>
-      <w:proofErr w:type="spellEnd"/>
+        <w:t xml:space="preserve"> or maybe in React.</w:t>
+      </w:r>
       <w:r>
         <w:rPr>
           <w:b/>
           <w:bCs/>
           <w:color w:val="EE0000"/>
         </w:rPr>
-        <w:t xml:space="preserve"> or maybe in </w:t>
-      </w:r>
-      <w:proofErr w:type="gramStart"/>
-      <w:r>
-        <w:rPr>
-          <w:b/>
-          <w:bCs/>
-          <w:color w:val="EE0000"/>
-        </w:rPr>
-        <w:t>React.</w:t>
-      </w:r>
-      <w:r>
-        <w:rPr>
-          <w:b/>
-          <w:bCs/>
-          <w:color w:val="EE0000"/>
-        </w:rPr>
-        <w:t>(</w:t>
-      </w:r>
-      <w:proofErr w:type="gramEnd"/>
-      <w:r>
-        <w:rPr>
-          <w:b/>
-          <w:bCs/>
-          <w:color w:val="EE0000"/>
-        </w:rPr>
-        <w:t>maybe it is an outdated problem)</w:t>
+        <w:t>(maybe it is an outdated problem)</w:t>
       </w:r>
     </w:p>
     <w:p>
@@ -3298,22 +2986,13 @@
         <w:t xml:space="preserve">that </w:t>
       </w:r>
       <w:r>
-        <w:t xml:space="preserve">you can make it like that and if it </w:t>
-      </w:r>
-      <w:proofErr w:type="gramStart"/>
-      <w:r>
-        <w:t>become</w:t>
-      </w:r>
-      <w:proofErr w:type="gramEnd"/>
-      <w:r>
-        <w:t xml:space="preserve"> profitable then you can scale it (who knows) </w:t>
+        <w:t xml:space="preserve">you can make it like that and if it become profitable then you can scale it (who knows) </w:t>
       </w:r>
     </w:p>
     <w:p>
       <w:r>
         <w:t xml:space="preserve">Now as you commit then </w:t>
       </w:r>
-      <w:proofErr w:type="gramStart"/>
       <w:r>
         <w:t>Digital</w:t>
       </w:r>
@@ -3321,25 +3000,13 @@
         <w:t xml:space="preserve"> </w:t>
       </w:r>
       <w:r>
-        <w:t>ocean</w:t>
-      </w:r>
-      <w:proofErr w:type="gramEnd"/>
-      <w:r>
-        <w:t xml:space="preserve"> will build it</w:t>
-      </w:r>
-      <w:r>
-        <w:t xml:space="preserve"> automatically for </w:t>
-      </w:r>
-      <w:proofErr w:type="gramStart"/>
-      <w:r>
-        <w:t>you.</w:t>
-      </w:r>
-      <w:r>
-        <w:t>(</w:t>
-      </w:r>
-      <w:proofErr w:type="gramEnd"/>
-      <w:r>
-        <w:t>maybe if auto</w:t>
+        <w:t>ocean will build it</w:t>
+      </w:r>
+      <w:r>
+        <w:t xml:space="preserve"> automatically for you.</w:t>
+      </w:r>
+      <w:r>
+        <w:t>(maybe if auto</w:t>
       </w:r>
       <w:r>
         <w:t xml:space="preserve"> </w:t>
@@ -3348,15 +3015,7 @@
         <w:t xml:space="preserve">deploy option was selected </w:t>
       </w:r>
       <w:r>
-        <w:t xml:space="preserve">in the </w:t>
-      </w:r>
-      <w:proofErr w:type="gramStart"/>
-      <w:r>
-        <w:t>setting(</w:t>
-      </w:r>
-      <w:proofErr w:type="gramEnd"/>
-      <w:r>
-        <w:t>who knows)</w:t>
+        <w:t>in the setting(who knows)</w:t>
       </w:r>
       <w:r>
         <w:t>)</w:t>
@@ -3394,18 +3053,10 @@
         <w:t xml:space="preserve">here (maybe </w:t>
       </w:r>
       <w:r>
-        <w:t xml:space="preserve">very large app don’t work </w:t>
-      </w:r>
-      <w:proofErr w:type="gramStart"/>
-      <w:r>
-        <w:t>properly</w:t>
-      </w:r>
-      <w:r>
-        <w:t>(</w:t>
-      </w:r>
-      <w:proofErr w:type="gramEnd"/>
-      <w:r>
-        <w:t>who knows)</w:t>
+        <w:t>very large app don’t work properly</w:t>
+      </w:r>
+      <w:r>
+        <w:t>(who knows)</w:t>
       </w:r>
       <w:r>
         <w:t>)</w:t>
@@ -3446,18 +3097,10 @@
         <w:t xml:space="preserve">Now we will see </w:t>
       </w:r>
       <w:r>
-        <w:t xml:space="preserve">how Google analytics and search </w:t>
-      </w:r>
-      <w:proofErr w:type="gramStart"/>
-      <w:r>
-        <w:t>console</w:t>
-      </w:r>
-      <w:r>
-        <w:t>(</w:t>
-      </w:r>
-      <w:proofErr w:type="gramEnd"/>
-      <w:r>
-        <w:t xml:space="preserve">who </w:t>
+        <w:t>how Google analytics and search console</w:t>
+      </w:r>
+      <w:r>
+        <w:t xml:space="preserve">(who </w:t>
       </w:r>
       <w:proofErr w:type="spellStart"/>
       <w:r>
@@ -3624,21 +3267,13 @@
         <w:t xml:space="preserve">ck </w:t>
       </w:r>
       <w:r>
-        <w:t xml:space="preserve">which is also called </w:t>
-      </w:r>
-      <w:proofErr w:type="gramStart"/>
+        <w:t>which is also called S</w:t>
+      </w:r>
       <w:r>
         <w:t>S</w:t>
       </w:r>
       <w:r>
-        <w:t>S</w:t>
-      </w:r>
-      <w:r>
-        <w:t>LV(</w:t>
-      </w:r>
-      <w:proofErr w:type="gramEnd"/>
-      <w:r>
-        <w:t>who knows)</w:t>
+        <w:t>LV(who knows)</w:t>
       </w:r>
       <w:r>
         <w:t xml:space="preserve"> and </w:t>
@@ -3685,13 +3320,8 @@
       <w:r>
         <w:t xml:space="preserve">of the application. </w:t>
       </w:r>
-      <w:proofErr w:type="gramStart"/>
-      <w:r>
-        <w:t>So</w:t>
-      </w:r>
-      <w:proofErr w:type="gramEnd"/>
-      <w:r>
-        <w:t xml:space="preserve"> if we want that the domain we have need to be pointe</w:t>
+      <w:r>
+        <w:t>So if we want that the domain we have need to be pointe</w:t>
       </w:r>
       <w:r>
         <w:t>d</w:t>
@@ -3722,18 +3352,10 @@
     </w:p>
     <w:p>
       <w:r>
-        <w:t xml:space="preserve">Of you chose the former then you </w:t>
-      </w:r>
-      <w:proofErr w:type="gramStart"/>
-      <w:r>
-        <w:t xml:space="preserve">will  </w:t>
-      </w:r>
-      <w:r>
-        <w:t>see</w:t>
-      </w:r>
-      <w:proofErr w:type="gramEnd"/>
-      <w:r>
-        <w:t xml:space="preserve"> that from the dashboard </w:t>
+        <w:t xml:space="preserve">Of you chose the former then you will  </w:t>
+      </w:r>
+      <w:r>
+        <w:t xml:space="preserve">see that from the dashboard </w:t>
       </w:r>
       <w:r>
         <w:t xml:space="preserve">that how things are happening </w:t>
@@ -3742,26 +3364,10 @@
         <w:t xml:space="preserve">and if you chose later </w:t>
       </w:r>
       <w:r>
-        <w:t xml:space="preserve">then you need to point it to a Digital </w:t>
-      </w:r>
-      <w:proofErr w:type="gramStart"/>
-      <w:r>
-        <w:t>ocean(</w:t>
-      </w:r>
-      <w:proofErr w:type="gramEnd"/>
-      <w:r>
-        <w:t>who knows)</w:t>
-      </w:r>
-      <w:r>
-        <w:t xml:space="preserve">. By former we bring the domain in the digital </w:t>
-      </w:r>
-      <w:proofErr w:type="gramStart"/>
-      <w:r>
-        <w:t>ocean(</w:t>
-      </w:r>
-      <w:proofErr w:type="gramEnd"/>
-      <w:r>
-        <w:t>who knows)</w:t>
+        <w:t>then you need to point it to a Digital ocean(who knows)</w:t>
+      </w:r>
+      <w:r>
+        <w:t>. By former we bring the domain in the digital ocean(who knows)</w:t>
       </w:r>
       <w:r>
         <w:t xml:space="preserve">. </w:t>
@@ -3807,13 +3413,8 @@
       </w:r>
     </w:p>
     <w:p>
-      <w:proofErr w:type="gramStart"/>
-      <w:r>
-        <w:t>So</w:t>
-      </w:r>
-      <w:proofErr w:type="gramEnd"/>
-      <w:r>
-        <w:t xml:space="preserve"> we went to Google search console</w:t>
+      <w:r>
+        <w:t>So we went to Google search console</w:t>
       </w:r>
       <w:r>
         <w:t xml:space="preserve"> so we add a property there </w:t>
@@ -3824,6 +3425,9 @@
         <w:jc w:val="center"/>
       </w:pPr>
       <w:r>
+        <w:rPr>
+          <w:noProof/>
+        </w:rPr>
         <w:lastRenderedPageBreak/>
         <w:drawing>
           <wp:inline distT="0" distB="0" distL="0" distR="0" wp14:anchorId="3A8208C9" wp14:editId="1F6175C6">
@@ -3885,15 +3489,7 @@
         <w:t xml:space="preserve">omain </w:t>
       </w:r>
       <w:r>
-        <w:t xml:space="preserve">ad then you need to verify it so it </w:t>
-      </w:r>
-      <w:proofErr w:type="gramStart"/>
-      <w:r>
-        <w:t>give</w:t>
-      </w:r>
-      <w:proofErr w:type="gramEnd"/>
-      <w:r>
-        <w:t xml:space="preserve"> us some text which we will paste in the </w:t>
+        <w:t xml:space="preserve">ad then you need to verify it so it give us some text which we will paste in the </w:t>
       </w:r>
       <w:r>
         <w:t xml:space="preserve">DNS records to give the proof for ownership of domain. </w:t>
@@ -3913,6 +3509,9 @@
         <w:jc w:val="center"/>
       </w:pPr>
       <w:r>
+        <w:rPr>
+          <w:noProof/>
+        </w:rPr>
         <w:drawing>
           <wp:inline distT="0" distB="0" distL="0" distR="0" wp14:anchorId="78608F09" wp14:editId="5CBFD49E">
             <wp:extent cx="5731510" cy="2922905"/>
@@ -3957,8 +3556,152 @@
       <w:r>
         <w:t>e things of the domain over here.</w:t>
       </w:r>
-    </w:p>
-    <w:p/>
+      <w:r>
+        <w:t xml:space="preserve"> I think it collect data how many times your link was clicked when shown by the browser.</w:t>
+      </w:r>
+    </w:p>
+    <w:p>
+      <w:r>
+        <w:lastRenderedPageBreak/>
+        <w:t xml:space="preserve">Now we will make an </w:t>
+      </w:r>
+      <w:proofErr w:type="spellStart"/>
+      <w:r>
+        <w:t>ecomerce</w:t>
+      </w:r>
+      <w:proofErr w:type="spellEnd"/>
+      <w:r>
+        <w:t xml:space="preserve"> store </w:t>
+      </w:r>
+      <w:r>
+        <w:t xml:space="preserve">and we will make pages like </w:t>
+      </w:r>
+      <w:r>
+        <w:t>Product page, Cart page and checkout page</w:t>
+      </w:r>
+      <w:r>
+        <w:t xml:space="preserve"> and how to integrate </w:t>
+      </w:r>
+      <w:r>
+        <w:t>payment gateway to the websi</w:t>
+      </w:r>
+      <w:r>
+        <w:t>t</w:t>
+      </w:r>
+      <w:r>
+        <w:t xml:space="preserve">e </w:t>
+      </w:r>
+      <w:r>
+        <w:t>.</w:t>
+      </w:r>
+      <w:r>
+        <w:t xml:space="preserve"> How orders will come </w:t>
+      </w:r>
+      <w:r>
+        <w:t xml:space="preserve">and how admin panel will be made </w:t>
+      </w:r>
+      <w:r>
+        <w:t>. F</w:t>
+      </w:r>
+      <w:r>
+        <w:t>r</w:t>
+      </w:r>
+      <w:r>
+        <w:t xml:space="preserve">om domain buying </w:t>
+      </w:r>
+      <w:r>
+        <w:t>to end to end</w:t>
+      </w:r>
+      <w:r>
+        <w:t xml:space="preserve"> integration </w:t>
+      </w:r>
+      <w:r>
+        <w:t xml:space="preserve">teacher will teach us </w:t>
+      </w:r>
+      <w:r>
+        <w:t xml:space="preserve">We name it </w:t>
+      </w:r>
+      <w:proofErr w:type="spellStart"/>
+      <w:r>
+        <w:t>codeswear</w:t>
+      </w:r>
+      <w:proofErr w:type="spellEnd"/>
+      <w:r>
+        <w:t xml:space="preserve"> it will be an ecommerce store where we will list our product </w:t>
+      </w:r>
+      <w:r>
+        <w:t xml:space="preserve">So we type the command </w:t>
+      </w:r>
+    </w:p>
+    <w:p>
+      <w:pPr>
+        <w:jc w:val="center"/>
+        <w:rPr>
+          <w:b/>
+          <w:bCs/>
+        </w:rPr>
+      </w:pPr>
+      <w:r>
+        <w:rPr>
+          <w:b/>
+          <w:bCs/>
+        </w:rPr>
+        <w:t>yarn create next-app</w:t>
+      </w:r>
+      <w:r>
+        <w:rPr>
+          <w:b/>
+          <w:bCs/>
+        </w:rPr>
+        <w:t xml:space="preserve"> &lt;</w:t>
+      </w:r>
+      <w:proofErr w:type="spellStart"/>
+      <w:r>
+        <w:rPr>
+          <w:b/>
+          <w:bCs/>
+        </w:rPr>
+        <w:t>appname</w:t>
+      </w:r>
+      <w:proofErr w:type="spellEnd"/>
+      <w:r>
+        <w:rPr>
+          <w:b/>
+          <w:bCs/>
+        </w:rPr>
+        <w:t>&gt;</w:t>
+      </w:r>
+    </w:p>
+    <w:p>
+      <w:r>
+        <w:t>Teacher will us through this project that how to handle cust</w:t>
+      </w:r>
+      <w:r>
+        <w:t>om</w:t>
+      </w:r>
+      <w:r>
+        <w:t>er if they come in the app</w:t>
+      </w:r>
+      <w:r>
+        <w:t xml:space="preserve"> and if your website is scaled then </w:t>
+      </w:r>
+      <w:r>
+        <w:t xml:space="preserve">how you need to deploy it </w:t>
+      </w:r>
+    </w:p>
+    <w:p>
+      <w:r>
+        <w:t xml:space="preserve">We win use global css for </w:t>
+      </w:r>
+      <w:proofErr w:type="spellStart"/>
+      <w:r>
+        <w:t>tailwinf</w:t>
+      </w:r>
+      <w:proofErr w:type="spellEnd"/>
+      <w:r>
+        <w:t xml:space="preserve"> css and we will see how to apply it </w:t>
+      </w:r>
+    </w:p>
     <w:sectPr>
       <w:pgSz w:w="11906" w:h="16838"/>
       <w:pgMar w:top="1440" w:right="1440" w:bottom="1440" w:left="1440" w:header="708" w:footer="708" w:gutter="0"/>
@@ -4729,6 +4472,7 @@
   <w:style w:type="character" w:default="1" w:styleId="DefaultParagraphFont">
     <w:name w:val="Default Paragraph Font"/>
     <w:uiPriority w:val="1"/>
+    <w:semiHidden/>
     <w:unhideWhenUsed/>
   </w:style>
   <w:style w:type="table" w:default="1" w:styleId="TableNormal">

</xml_diff>

<commit_message>
Codeswear.com - Project Setup using Tailwind CSS
</commit_message>
<xml_diff>
--- a/Notes2.docx
+++ b/Notes2.docx
@@ -59,10 +59,18 @@
     </w:p>
     <w:p>
       <w:r>
-        <w:t>In nay container</w:t>
-      </w:r>
-      <w:r>
-        <w:t>(or component)</w:t>
+        <w:t xml:space="preserve">In nay </w:t>
+      </w:r>
+      <w:proofErr w:type="gramStart"/>
+      <w:r>
+        <w:t>container</w:t>
+      </w:r>
+      <w:r>
+        <w:t>(</w:t>
+      </w:r>
+      <w:proofErr w:type="gramEnd"/>
+      <w:r>
+        <w:t>or component)</w:t>
       </w:r>
       <w:r>
         <w:t xml:space="preserve"> if you want to </w:t>
@@ -547,9 +555,14 @@
       </w:r>
     </w:p>
     <w:p>
+      <w:proofErr w:type="gramStart"/>
       <w:r>
         <w:lastRenderedPageBreak/>
-        <w:t>So we can so this thing Now we can see it is getting rendered as shown below</w:t>
+        <w:t>So</w:t>
+      </w:r>
+      <w:proofErr w:type="gramEnd"/>
+      <w:r>
+        <w:t xml:space="preserve"> we can so this thing Now we can see it is getting rendered as shown below</w:t>
       </w:r>
     </w:p>
     <w:p>
@@ -651,8 +664,13 @@
         <w:t xml:space="preserve"> s</w:t>
       </w:r>
       <w:r>
-        <w:t>ubmit the form</w:t>
-      </w:r>
+        <w:t xml:space="preserve">ubmit the </w:t>
+      </w:r>
+      <w:proofErr w:type="gramStart"/>
+      <w:r>
+        <w:t>form</w:t>
+      </w:r>
+      <w:proofErr w:type="gramEnd"/>
       <w:r>
         <w:t xml:space="preserve"> we will definitely have to make an API to co</w:t>
       </w:r>
@@ -718,8 +736,29 @@
       </w:r>
     </w:p>
     <w:p>
-      <w:r>
-        <w:t>So for now our post request handler look like below</w:t>
+      <w:proofErr w:type="gramStart"/>
+      <w:r>
+        <w:t>So</w:t>
+      </w:r>
+      <w:proofErr w:type="gramEnd"/>
+      <w:r>
+        <w:t xml:space="preserve"> for </w:t>
+      </w:r>
+      <w:proofErr w:type="gramStart"/>
+      <w:r>
+        <w:t>now</w:t>
+      </w:r>
+      <w:proofErr w:type="gramEnd"/>
+      <w:r>
+        <w:t xml:space="preserve"> our post request handler </w:t>
+      </w:r>
+      <w:proofErr w:type="gramStart"/>
+      <w:r>
+        <w:t>look</w:t>
+      </w:r>
+      <w:proofErr w:type="gramEnd"/>
+      <w:r>
+        <w:t xml:space="preserve"> like below</w:t>
       </w:r>
     </w:p>
     <w:p>
@@ -768,8 +807,13 @@
       </w:r>
     </w:p>
     <w:p>
-      <w:r>
-        <w:t>Ols version used to look like below</w:t>
+      <w:proofErr w:type="gramStart"/>
+      <w:r>
+        <w:t>Ols</w:t>
+      </w:r>
+      <w:proofErr w:type="gramEnd"/>
+      <w:r>
+        <w:t xml:space="preserve"> version used to look like below</w:t>
       </w:r>
     </w:p>
     <w:p>
@@ -877,10 +921,12 @@
         <w:t xml:space="preserve">, not plain JSON, so sending it directly with </w:t>
       </w:r>
       <w:proofErr w:type="spellStart"/>
+      <w:proofErr w:type="gramStart"/>
       <w:r>
         <w:t>res.json</w:t>
       </w:r>
       <w:proofErr w:type="spellEnd"/>
+      <w:proofErr w:type="gramEnd"/>
       <w:r>
         <w:t>(</w:t>
       </w:r>
@@ -938,9 +984,14 @@
     </w:p>
     <w:p>
       <w:r>
-        <w:t>export default function handler(</w:t>
-      </w:r>
-      <w:proofErr w:type="spellStart"/>
+        <w:t xml:space="preserve">export default function </w:t>
+      </w:r>
+      <w:proofErr w:type="gramStart"/>
+      <w:r>
+        <w:t>handler(</w:t>
+      </w:r>
+      <w:proofErr w:type="spellStart"/>
+      <w:proofErr w:type="gramEnd"/>
       <w:r>
         <w:t>req</w:t>
       </w:r>
@@ -1046,6 +1097,7 @@
         <w:t xml:space="preserve">Why </w:t>
       </w:r>
       <w:proofErr w:type="spellStart"/>
+      <w:proofErr w:type="gramStart"/>
       <w:r>
         <w:rPr>
           <w:b/>
@@ -1054,6 +1106,7 @@
         <w:t>res.json</w:t>
       </w:r>
       <w:proofErr w:type="spellEnd"/>
+      <w:proofErr w:type="gramEnd"/>
       <w:r>
         <w:rPr>
           <w:b/>
@@ -1085,18 +1138,25 @@
     </w:p>
     <w:p>
       <w:proofErr w:type="spellStart"/>
+      <w:proofErr w:type="gramStart"/>
       <w:r>
         <w:t>res.status</w:t>
       </w:r>
       <w:proofErr w:type="spellEnd"/>
-      <w:r>
-        <w:t>(200).</w:t>
+      <w:proofErr w:type="gramEnd"/>
+      <w:r>
+        <w:t>(200</w:t>
+      </w:r>
+      <w:proofErr w:type="gramStart"/>
+      <w:r>
+        <w:t>).</w:t>
       </w:r>
       <w:proofErr w:type="spellStart"/>
       <w:r>
         <w:t>json</w:t>
       </w:r>
       <w:proofErr w:type="spellEnd"/>
+      <w:proofErr w:type="gramEnd"/>
       <w:r>
         <w:t>(</w:t>
       </w:r>
@@ -1197,9 +1257,14 @@
     </w:p>
     <w:p>
       <w:r>
-        <w:t>export default function handler(</w:t>
-      </w:r>
-      <w:proofErr w:type="spellStart"/>
+        <w:t xml:space="preserve">export default function </w:t>
+      </w:r>
+      <w:proofErr w:type="gramStart"/>
+      <w:r>
+        <w:t>handler(</w:t>
+      </w:r>
+      <w:proofErr w:type="spellStart"/>
+      <w:proofErr w:type="gramEnd"/>
       <w:r>
         <w:t>req</w:t>
       </w:r>
@@ -1212,10 +1277,12 @@
         <w:t xml:space="preserve">  if (</w:t>
       </w:r>
       <w:proofErr w:type="spellStart"/>
+      <w:proofErr w:type="gramStart"/>
       <w:r>
         <w:t>req.method</w:t>
       </w:r>
       <w:proofErr w:type="spellEnd"/>
+      <w:proofErr w:type="gramEnd"/>
       <w:r>
         <w:t xml:space="preserve"> === "POST") {</w:t>
       </w:r>
@@ -1224,18 +1291,25 @@
         <w:t xml:space="preserve">    </w:t>
       </w:r>
       <w:proofErr w:type="spellStart"/>
+      <w:proofErr w:type="gramStart"/>
       <w:r>
         <w:t>res.status</w:t>
       </w:r>
       <w:proofErr w:type="spellEnd"/>
-      <w:r>
-        <w:t>(200).</w:t>
+      <w:proofErr w:type="gramEnd"/>
+      <w:r>
+        <w:t>(200</w:t>
+      </w:r>
+      <w:proofErr w:type="gramStart"/>
+      <w:r>
+        <w:t>).</w:t>
       </w:r>
       <w:proofErr w:type="spellStart"/>
       <w:r>
         <w:t>json</w:t>
       </w:r>
       <w:proofErr w:type="spellEnd"/>
+      <w:proofErr w:type="gramEnd"/>
       <w:r>
         <w:t>({</w:t>
       </w:r>
@@ -1244,10 +1318,12 @@
         <w:t xml:space="preserve">      method: </w:t>
       </w:r>
       <w:proofErr w:type="spellStart"/>
+      <w:proofErr w:type="gramStart"/>
       <w:r>
         <w:t>req.method</w:t>
       </w:r>
       <w:proofErr w:type="spellEnd"/>
+      <w:proofErr w:type="gramEnd"/>
       <w:r>
         <w:t>,</w:t>
       </w:r>
@@ -1256,10 +1332,12 @@
         <w:t xml:space="preserve">      body: </w:t>
       </w:r>
       <w:proofErr w:type="spellStart"/>
+      <w:proofErr w:type="gramStart"/>
       <w:r>
         <w:t>req.body</w:t>
       </w:r>
       <w:proofErr w:type="spellEnd"/>
+      <w:proofErr w:type="gramEnd"/>
       <w:r>
         <w:t>,</w:t>
       </w:r>
@@ -1268,10 +1346,12 @@
         <w:t xml:space="preserve">      query: </w:t>
       </w:r>
       <w:proofErr w:type="spellStart"/>
+      <w:proofErr w:type="gramStart"/>
       <w:r>
         <w:t>req.query</w:t>
       </w:r>
       <w:proofErr w:type="spellEnd"/>
+      <w:proofErr w:type="gramEnd"/>
       <w:r>
         <w:t>,</w:t>
       </w:r>
@@ -1281,8 +1361,12 @@
       </w:r>
       <w:r>
         <w:br/>
+      </w:r>
+      <w:proofErr w:type="gramStart"/>
+      <w:r>
         <w:t xml:space="preserve">  }</w:t>
       </w:r>
+      <w:proofErr w:type="gramEnd"/>
       <w:r>
         <w:br/>
         <w:t>}</w:t>
@@ -1438,10 +1522,12 @@
           </w:tcPr>
           <w:p>
             <w:proofErr w:type="spellStart"/>
+            <w:proofErr w:type="gramStart"/>
             <w:r>
               <w:t>req.body</w:t>
             </w:r>
             <w:proofErr w:type="spellEnd"/>
+            <w:proofErr w:type="gramEnd"/>
           </w:p>
         </w:tc>
         <w:tc>
@@ -1475,10 +1561,12 @@
           </w:tcPr>
           <w:p>
             <w:proofErr w:type="spellStart"/>
+            <w:proofErr w:type="gramStart"/>
             <w:r>
               <w:t>req.query</w:t>
             </w:r>
             <w:proofErr w:type="spellEnd"/>
+            <w:proofErr w:type="gramEnd"/>
           </w:p>
         </w:tc>
         <w:tc>
@@ -1512,10 +1600,12 @@
           </w:tcPr>
           <w:p>
             <w:proofErr w:type="spellStart"/>
+            <w:proofErr w:type="gramStart"/>
             <w:r>
               <w:t>req.method</w:t>
             </w:r>
             <w:proofErr w:type="spellEnd"/>
+            <w:proofErr w:type="gramEnd"/>
           </w:p>
         </w:tc>
         <w:tc>
@@ -1567,9 +1657,14 @@
     </w:p>
     <w:p>
       <w:r>
-        <w:t>export async function POST(</w:t>
-      </w:r>
-      <w:proofErr w:type="spellStart"/>
+        <w:t xml:space="preserve">export async function </w:t>
+      </w:r>
+      <w:proofErr w:type="gramStart"/>
+      <w:r>
+        <w:t>POST(</w:t>
+      </w:r>
+      <w:proofErr w:type="spellStart"/>
+      <w:proofErr w:type="gramEnd"/>
       <w:r>
         <w:t>req</w:t>
       </w:r>
@@ -1593,10 +1688,12 @@
         <w:t xml:space="preserve"> body = await </w:t>
       </w:r>
       <w:proofErr w:type="spellStart"/>
+      <w:proofErr w:type="gramStart"/>
       <w:r>
         <w:t>req.json</w:t>
       </w:r>
       <w:proofErr w:type="spellEnd"/>
+      <w:proofErr w:type="gramEnd"/>
       <w:r>
         <w:t>();</w:t>
       </w:r>
@@ -1658,10 +1755,12 @@
         <w:t xml:space="preserve">d specific fields like </w:t>
       </w:r>
       <w:proofErr w:type="spellStart"/>
+      <w:proofErr w:type="gramStart"/>
       <w:r>
         <w:t>req.body</w:t>
       </w:r>
       <w:proofErr w:type="spellEnd"/>
+      <w:proofErr w:type="gramEnd"/>
       <w:r>
         <w:t>.</w:t>
       </w:r>
@@ -1671,7 +1770,15 @@
         <w:t>In older version we used to get body like we did in n</w:t>
       </w:r>
       <w:r>
-        <w:t>ode js but in modern it look like below</w:t>
+        <w:t xml:space="preserve">ode js but in modern it </w:t>
+      </w:r>
+      <w:proofErr w:type="gramStart"/>
+      <w:r>
+        <w:t>look</w:t>
+      </w:r>
+      <w:proofErr w:type="gramEnd"/>
+      <w:r>
+        <w:t xml:space="preserve"> like below</w:t>
       </w:r>
     </w:p>
     <w:p>
@@ -1774,10 +1881,18 @@
         <w:t>The problem with the file making</w:t>
       </w:r>
       <w:r>
-        <w:t xml:space="preserve"> strategy </w:t>
-      </w:r>
-      <w:r>
-        <w:t xml:space="preserve"> is that </w:t>
+        <w:t xml:space="preserve"> </w:t>
+      </w:r>
+      <w:proofErr w:type="gramStart"/>
+      <w:r>
+        <w:t xml:space="preserve">strategy </w:t>
+      </w:r>
+      <w:r>
+        <w:t xml:space="preserve"> is</w:t>
+      </w:r>
+      <w:proofErr w:type="gramEnd"/>
+      <w:r>
+        <w:t xml:space="preserve"> that </w:t>
       </w:r>
       <w:r>
         <w:t xml:space="preserve">if suppose </w:t>
@@ -1890,20 +2005,41 @@
       </w:r>
       <w:proofErr w:type="spellEnd"/>
       <w:r>
-        <w:t xml:space="preserve"> element</w:t>
-      </w:r>
-      <w:r>
-        <w:t>(who knows may be I am wrong here)</w:t>
-      </w:r>
-      <w:r>
         <w:t xml:space="preserve"> </w:t>
       </w:r>
+      <w:proofErr w:type="gramStart"/>
+      <w:r>
+        <w:t>element</w:t>
+      </w:r>
+      <w:r>
+        <w:t>(</w:t>
+      </w:r>
+      <w:proofErr w:type="gramEnd"/>
+      <w:r>
+        <w:t xml:space="preserve">who knows </w:t>
+      </w:r>
+      <w:proofErr w:type="gramStart"/>
+      <w:r>
+        <w:t>may be</w:t>
+      </w:r>
+      <w:proofErr w:type="gramEnd"/>
+      <w:r>
+        <w:t xml:space="preserve"> I am wrong here)</w:t>
+      </w:r>
+      <w:r>
+        <w:t xml:space="preserve"> </w:t>
+      </w:r>
       <w:r>
         <w:t xml:space="preserve">and on state update method we used </w:t>
       </w:r>
       <w:proofErr w:type="spellStart"/>
-      <w:r>
-        <w:t>e.target.innerText</w:t>
+      <w:proofErr w:type="gramStart"/>
+      <w:r>
+        <w:t>e.target</w:t>
+      </w:r>
+      <w:proofErr w:type="gramEnd"/>
+      <w:r>
+        <w:t>.innerText</w:t>
       </w:r>
       <w:proofErr w:type="spellEnd"/>
     </w:p>
@@ -1920,8 +2056,13 @@
         <w:t xml:space="preserve"> we can use </w:t>
       </w:r>
       <w:proofErr w:type="spellStart"/>
-      <w:r>
-        <w:t>e.target,value</w:t>
+      <w:proofErr w:type="gramStart"/>
+      <w:r>
+        <w:t>e.target</w:t>
+      </w:r>
+      <w:proofErr w:type="gramEnd"/>
+      <w:r>
+        <w:t>,value</w:t>
       </w:r>
       <w:proofErr w:type="spellEnd"/>
       <w:r>
@@ -2037,13 +2178,16 @@
         <w:t xml:space="preserve">Shortcut for </w:t>
       </w:r>
       <w:proofErr w:type="spellStart"/>
+      <w:proofErr w:type="gramStart"/>
       <w:r>
         <w:t>margin:auto</w:t>
       </w:r>
       <w:proofErr w:type="spellEnd"/>
+      <w:proofErr w:type="gramEnd"/>
       <w:r>
         <w:t xml:space="preserve"> will be </w:t>
       </w:r>
+      <w:proofErr w:type="gramStart"/>
       <w:r>
         <w:rPr>
           <w:b/>
@@ -2051,6 +2195,7 @@
         </w:rPr>
         <w:t>m:auto</w:t>
       </w:r>
+      <w:proofErr w:type="gramEnd"/>
       <w:r>
         <w:rPr>
           <w:b/>
@@ -2114,10 +2259,18 @@
     </w:p>
     <w:p>
       <w:r>
-        <w:t xml:space="preserve">Suppose you have 50 blogs and you want to show 5 blogs on each pages </w:t>
-      </w:r>
-      <w:r>
-        <w:t xml:space="preserve"> so 10 pages </w:t>
+        <w:t xml:space="preserve">Suppose you have 50 blogs and you want to show 5 blogs on each </w:t>
+      </w:r>
+      <w:proofErr w:type="gramStart"/>
+      <w:r>
+        <w:t xml:space="preserve">pages </w:t>
+      </w:r>
+      <w:r>
+        <w:t xml:space="preserve"> so</w:t>
+      </w:r>
+      <w:proofErr w:type="gramEnd"/>
+      <w:r>
+        <w:t xml:space="preserve"> 10 pages </w:t>
       </w:r>
       <w:r>
         <w:t>will</w:t>
@@ -2128,11 +2281,16 @@
       <w:r>
         <w:t xml:space="preserve">be </w:t>
       </w:r>
+      <w:proofErr w:type="gramStart"/>
       <w:r>
         <w:t xml:space="preserve">formed </w:t>
       </w:r>
       <w:r>
-        <w:t xml:space="preserve">. In the similar way </w:t>
+        <w:t>.</w:t>
+      </w:r>
+      <w:proofErr w:type="gramEnd"/>
+      <w:r>
+        <w:t xml:space="preserve"> In the similar way </w:t>
       </w:r>
       <w:r>
         <w:t xml:space="preserve">pagination can be showed </w:t>
@@ -2225,7 +2383,15 @@
         <w:t xml:space="preserve">that we will not good components </w:t>
       </w:r>
       <w:r>
-        <w:t>means you won’t get good packages for doing any work(who knows)</w:t>
+        <w:t xml:space="preserve">means you won’t get good packages for doing any </w:t>
+      </w:r>
+      <w:proofErr w:type="gramStart"/>
+      <w:r>
+        <w:t>work(</w:t>
+      </w:r>
+      <w:proofErr w:type="gramEnd"/>
+      <w:r>
+        <w:t>who knows)</w:t>
       </w:r>
     </w:p>
     <w:p>
@@ -2254,14 +2420,27 @@
       </w:r>
     </w:p>
     <w:p>
-      <w:r>
-        <w:t xml:space="preserve">So we run the above command I context of </w:t>
+      <w:proofErr w:type="gramStart"/>
+      <w:r>
+        <w:t>So</w:t>
+      </w:r>
+      <w:proofErr w:type="gramEnd"/>
+      <w:r>
+        <w:t xml:space="preserve"> we run the above command I context of </w:t>
       </w:r>
       <w:r>
         <w:t xml:space="preserve">yarn </w:t>
       </w:r>
       <w:r>
-        <w:t>by using  below command</w:t>
+        <w:t xml:space="preserve">by </w:t>
+      </w:r>
+      <w:proofErr w:type="gramStart"/>
+      <w:r>
+        <w:t>using  below</w:t>
+      </w:r>
+      <w:proofErr w:type="gramEnd"/>
+      <w:r>
+        <w:t xml:space="preserve"> command</w:t>
       </w:r>
     </w:p>
     <w:p>
@@ -2349,13 +2528,29 @@
         <w:t xml:space="preserve">Data length </w:t>
       </w:r>
       <w:r>
-        <w:t>of the data that to be shown</w:t>
-      </w:r>
-      <w:r>
-        <w:t xml:space="preserve"> , next is the function  </w:t>
-      </w:r>
-      <w:r>
-        <w:t>that will be called when we scroll and reach the bottom and more data is needed to be loaded.</w:t>
+        <w:t xml:space="preserve">of the data that to be </w:t>
+      </w:r>
+      <w:proofErr w:type="gramStart"/>
+      <w:r>
+        <w:t>shown</w:t>
+      </w:r>
+      <w:r>
+        <w:t xml:space="preserve"> ,</w:t>
+      </w:r>
+      <w:proofErr w:type="gramEnd"/>
+      <w:r>
+        <w:t xml:space="preserve"> next is the </w:t>
+      </w:r>
+      <w:proofErr w:type="gramStart"/>
+      <w:r>
+        <w:t xml:space="preserve">function  </w:t>
+      </w:r>
+      <w:r>
+        <w:t>that</w:t>
+      </w:r>
+      <w:proofErr w:type="gramEnd"/>
+      <w:r>
+        <w:t xml:space="preserve"> will be called when we scroll and reach the bottom and more data is needed to be loaded.</w:t>
       </w:r>
     </w:p>
     <w:p>
@@ -2383,13 +2578,21 @@
         <w:t>w</w:t>
       </w:r>
       <w:r>
-        <w:t>n function</w:t>
+        <w:t xml:space="preserve">n </w:t>
+      </w:r>
+      <w:proofErr w:type="gramStart"/>
+      <w:r>
+        <w:t>function</w:t>
       </w:r>
       <w:r>
         <w:t>al</w:t>
       </w:r>
       <w:r>
-        <w:t>ity(who knows)</w:t>
+        <w:t>ity(</w:t>
+      </w:r>
+      <w:proofErr w:type="gramEnd"/>
+      <w:r>
+        <w:t>who knows)</w:t>
       </w:r>
     </w:p>
     <w:p>
@@ -2471,7 +2674,15 @@
         <w:t xml:space="preserve">it is defined like this </w:t>
       </w:r>
       <w:r>
-        <w:t xml:space="preserve">if we keep single item </w:t>
+        <w:t xml:space="preserve">if we keep single </w:t>
+      </w:r>
+      <w:proofErr w:type="gramStart"/>
+      <w:r>
+        <w:t>item</w:t>
+      </w:r>
+      <w:proofErr w:type="gramEnd"/>
+      <w:r>
+        <w:t xml:space="preserve"> </w:t>
       </w:r>
       <w:r>
         <w:t>we need to see al</w:t>
@@ -2480,13 +2691,21 @@
         <w:t>l</w:t>
       </w:r>
       <w:r>
-        <w:t xml:space="preserve"> this thi</w:t>
+        <w:t xml:space="preserve"> </w:t>
+      </w:r>
+      <w:proofErr w:type="gramStart"/>
+      <w:r>
+        <w:t>this thi</w:t>
       </w:r>
       <w:r>
         <w:t>n</w:t>
       </w:r>
       <w:r>
-        <w:t xml:space="preserve">gs </w:t>
+        <w:t>gs</w:t>
+      </w:r>
+      <w:proofErr w:type="gramEnd"/>
+      <w:r>
+        <w:t xml:space="preserve"> </w:t>
       </w:r>
     </w:p>
     <w:p>
@@ -2496,6 +2715,7 @@
           <w:bCs/>
         </w:rPr>
       </w:pPr>
+      <w:proofErr w:type="gramStart"/>
       <w:r>
         <w:rPr>
           <w:b/>
@@ -2503,6 +2723,7 @@
         </w:rPr>
         <w:t>Note:-</w:t>
       </w:r>
+      <w:proofErr w:type="gramEnd"/>
     </w:p>
     <w:p>
       <w:pPr>
@@ -2514,7 +2735,15 @@
         <w:t xml:space="preserve">Sometime it happens </w:t>
       </w:r>
       <w:r>
-        <w:t>in react that one component is show  two times so reload to remove the bug</w:t>
+        <w:t xml:space="preserve">in react that one component is </w:t>
+      </w:r>
+      <w:proofErr w:type="gramStart"/>
+      <w:r>
+        <w:t>show  two</w:t>
+      </w:r>
+      <w:proofErr w:type="gramEnd"/>
+      <w:r>
+        <w:t xml:space="preserve"> times so reload to remove the bug</w:t>
       </w:r>
     </w:p>
     <w:p>
@@ -2530,7 +2759,15 @@
         <w:t xml:space="preserve">except for responsiveness </w:t>
       </w:r>
       <w:r>
-        <w:t xml:space="preserve">we will  make our blog responsive and will write media queries </w:t>
+        <w:t xml:space="preserve">we </w:t>
+      </w:r>
+      <w:proofErr w:type="gramStart"/>
+      <w:r>
+        <w:t>will  make</w:t>
+      </w:r>
+      <w:proofErr w:type="gramEnd"/>
+      <w:r>
+        <w:t xml:space="preserve"> our blog responsive and will write media queries </w:t>
       </w:r>
       <w:r>
         <w:t>how we can we run media que</w:t>
@@ -2556,8 +2793,13 @@
         <w:t xml:space="preserve">the website </w:t>
       </w:r>
       <w:r>
-        <w:t>and if you gave responsiveness</w:t>
-      </w:r>
+        <w:t xml:space="preserve">and if you gave </w:t>
+      </w:r>
+      <w:proofErr w:type="gramStart"/>
+      <w:r>
+        <w:t>responsiveness</w:t>
+      </w:r>
+      <w:proofErr w:type="gramEnd"/>
       <w:r>
         <w:t xml:space="preserve"> it was an addon</w:t>
       </w:r>
@@ -2573,7 +2815,15 @@
         <w:t xml:space="preserve"> </w:t>
       </w:r>
       <w:r>
-        <w:t xml:space="preserve">you can say bit in todays time </w:t>
+        <w:t xml:space="preserve">you can say bit in </w:t>
+      </w:r>
+      <w:proofErr w:type="gramStart"/>
+      <w:r>
+        <w:t>todays</w:t>
+      </w:r>
+      <w:proofErr w:type="gramEnd"/>
+      <w:r>
+        <w:t xml:space="preserve"> time </w:t>
       </w:r>
       <w:r>
         <w:t xml:space="preserve">if you are delivering a website </w:t>
@@ -2648,7 +2898,11 @@
     </w:p>
     <w:p>
       <w:r>
-        <w:t>We will ho</w:t>
+        <w:t xml:space="preserve">We will </w:t>
+      </w:r>
+      <w:proofErr w:type="gramStart"/>
+      <w:r>
+        <w:t>ho</w:t>
       </w:r>
       <w:r>
         <w:t>s</w:t>
@@ -2657,7 +2911,11 @@
         <w:t>t</w:t>
       </w:r>
       <w:r>
-        <w:t>s the web</w:t>
+        <w:t>s</w:t>
+      </w:r>
+      <w:proofErr w:type="gramEnd"/>
+      <w:r>
+        <w:t xml:space="preserve"> the web</w:t>
       </w:r>
       <w:r>
         <w:t>s</w:t>
@@ -2784,7 +3042,15 @@
     </w:p>
     <w:p>
       <w:r>
-        <w:t xml:space="preserve">IN digital ocean we make new user(who knows) </w:t>
+        <w:t xml:space="preserve">IN digital ocean we make new </w:t>
+      </w:r>
+      <w:proofErr w:type="gramStart"/>
+      <w:r>
+        <w:t>user(</w:t>
+      </w:r>
+      <w:proofErr w:type="gramEnd"/>
+      <w:r>
+        <w:t xml:space="preserve">who knows) </w:t>
       </w:r>
     </w:p>
     <w:p>
@@ -2822,13 +3088,26 @@
       <w:r>
         <w:t xml:space="preserve">process will be </w:t>
       </w:r>
-      <w:r>
-        <w:t xml:space="preserve">build there </w:t>
-      </w:r>
-    </w:p>
-    <w:p>
-      <w:r>
-        <w:t>It will ask you to make database in there services.</w:t>
+      <w:proofErr w:type="gramStart"/>
+      <w:r>
+        <w:t>build</w:t>
+      </w:r>
+      <w:proofErr w:type="gramEnd"/>
+      <w:r>
+        <w:t xml:space="preserve"> there </w:t>
+      </w:r>
+    </w:p>
+    <w:p>
+      <w:r>
+        <w:t xml:space="preserve">It will ask you to make database in </w:t>
+      </w:r>
+      <w:proofErr w:type="gramStart"/>
+      <w:r>
+        <w:t>there</w:t>
+      </w:r>
+      <w:proofErr w:type="gramEnd"/>
+      <w:r>
+        <w:t xml:space="preserve"> services.</w:t>
       </w:r>
       <w:r>
         <w:t xml:space="preserve"> (who knows)</w:t>
@@ -2879,9 +3158,14 @@
       </w:r>
       <w:proofErr w:type="spellEnd"/>
       <w:r>
-        <w:t xml:space="preserve"> it will be good(</w:t>
-      </w:r>
-      <w:proofErr w:type="spellStart"/>
+        <w:t xml:space="preserve"> it will be </w:t>
+      </w:r>
+      <w:proofErr w:type="gramStart"/>
+      <w:r>
+        <w:t>good(</w:t>
+      </w:r>
+      <w:proofErr w:type="spellStart"/>
+      <w:proofErr w:type="gramEnd"/>
       <w:r>
         <w:t>wjp</w:t>
       </w:r>
@@ -2898,20 +3182,30 @@
           <w:color w:val="EE0000"/>
         </w:rPr>
       </w:pPr>
+      <w:proofErr w:type="gramStart"/>
       <w:r>
         <w:rPr>
           <w:b/>
           <w:bCs/>
           <w:color w:val="EE0000"/>
         </w:rPr>
-        <w:t xml:space="preserve">‘ can create </w:t>
-      </w:r>
+        <w:t>‘ can</w:t>
+      </w:r>
+      <w:proofErr w:type="gramEnd"/>
       <w:r>
         <w:rPr>
           <w:b/>
           <w:bCs/>
           <w:color w:val="EE0000"/>
         </w:rPr>
+        <w:t xml:space="preserve"> create </w:t>
+      </w:r>
+      <w:r>
+        <w:rPr>
+          <w:b/>
+          <w:bCs/>
+          <w:color w:val="EE0000"/>
+        </w:rPr>
         <w:t xml:space="preserve">error in </w:t>
       </w:r>
       <w:proofErr w:type="spellStart"/>
@@ -2956,15 +3250,33 @@
           <w:bCs/>
           <w:color w:val="EE0000"/>
         </w:rPr>
-        <w:t xml:space="preserve"> or maybe in React.</w:t>
-      </w:r>
+        <w:t xml:space="preserve"> or maybe in </w:t>
+      </w:r>
+      <w:proofErr w:type="gramStart"/>
       <w:r>
         <w:rPr>
           <w:b/>
           <w:bCs/>
           <w:color w:val="EE0000"/>
         </w:rPr>
-        <w:t>(maybe it is an outdated problem)</w:t>
+        <w:t>React.</w:t>
+      </w:r>
+      <w:r>
+        <w:rPr>
+          <w:b/>
+          <w:bCs/>
+          <w:color w:val="EE0000"/>
+        </w:rPr>
+        <w:t>(</w:t>
+      </w:r>
+      <w:proofErr w:type="gramEnd"/>
+      <w:r>
+        <w:rPr>
+          <w:b/>
+          <w:bCs/>
+          <w:color w:val="EE0000"/>
+        </w:rPr>
+        <w:t>maybe it is an outdated problem)</w:t>
       </w:r>
     </w:p>
     <w:p>
@@ -2986,13 +3298,22 @@
         <w:t xml:space="preserve">that </w:t>
       </w:r>
       <w:r>
-        <w:t xml:space="preserve">you can make it like that and if it become profitable then you can scale it (who knows) </w:t>
+        <w:t xml:space="preserve">you can make it like that and if it </w:t>
+      </w:r>
+      <w:proofErr w:type="gramStart"/>
+      <w:r>
+        <w:t>become</w:t>
+      </w:r>
+      <w:proofErr w:type="gramEnd"/>
+      <w:r>
+        <w:t xml:space="preserve"> profitable then you can scale it (who knows) </w:t>
       </w:r>
     </w:p>
     <w:p>
       <w:r>
         <w:t xml:space="preserve">Now as you commit then </w:t>
       </w:r>
+      <w:proofErr w:type="gramStart"/>
       <w:r>
         <w:t>Digital</w:t>
       </w:r>
@@ -3000,13 +3321,25 @@
         <w:t xml:space="preserve"> </w:t>
       </w:r>
       <w:r>
-        <w:t>ocean will build it</w:t>
-      </w:r>
-      <w:r>
-        <w:t xml:space="preserve"> automatically for you.</w:t>
-      </w:r>
-      <w:r>
-        <w:t>(maybe if auto</w:t>
+        <w:t>ocean</w:t>
+      </w:r>
+      <w:proofErr w:type="gramEnd"/>
+      <w:r>
+        <w:t xml:space="preserve"> will build it</w:t>
+      </w:r>
+      <w:r>
+        <w:t xml:space="preserve"> automatically for </w:t>
+      </w:r>
+      <w:proofErr w:type="gramStart"/>
+      <w:r>
+        <w:t>you.</w:t>
+      </w:r>
+      <w:r>
+        <w:t>(</w:t>
+      </w:r>
+      <w:proofErr w:type="gramEnd"/>
+      <w:r>
+        <w:t>maybe if auto</w:t>
       </w:r>
       <w:r>
         <w:t xml:space="preserve"> </w:t>
@@ -3015,7 +3348,15 @@
         <w:t xml:space="preserve">deploy option was selected </w:t>
       </w:r>
       <w:r>
-        <w:t>in the setting(who knows)</w:t>
+        <w:t xml:space="preserve">in the </w:t>
+      </w:r>
+      <w:proofErr w:type="gramStart"/>
+      <w:r>
+        <w:t>setting(</w:t>
+      </w:r>
+      <w:proofErr w:type="gramEnd"/>
+      <w:r>
+        <w:t>who knows)</w:t>
       </w:r>
       <w:r>
         <w:t>)</w:t>
@@ -3053,10 +3394,18 @@
         <w:t xml:space="preserve">here (maybe </w:t>
       </w:r>
       <w:r>
-        <w:t>very large app don’t work properly</w:t>
-      </w:r>
-      <w:r>
-        <w:t>(who knows)</w:t>
+        <w:t xml:space="preserve">very large app don’t work </w:t>
+      </w:r>
+      <w:proofErr w:type="gramStart"/>
+      <w:r>
+        <w:t>properly</w:t>
+      </w:r>
+      <w:r>
+        <w:t>(</w:t>
+      </w:r>
+      <w:proofErr w:type="gramEnd"/>
+      <w:r>
+        <w:t>who knows)</w:t>
       </w:r>
       <w:r>
         <w:t>)</w:t>
@@ -3097,10 +3446,18 @@
         <w:t xml:space="preserve">Now we will see </w:t>
       </w:r>
       <w:r>
-        <w:t>how Google analytics and search console</w:t>
-      </w:r>
-      <w:r>
-        <w:t xml:space="preserve">(who </w:t>
+        <w:t xml:space="preserve">how Google analytics and search </w:t>
+      </w:r>
+      <w:proofErr w:type="gramStart"/>
+      <w:r>
+        <w:t>console</w:t>
+      </w:r>
+      <w:r>
+        <w:t>(</w:t>
+      </w:r>
+      <w:proofErr w:type="gramEnd"/>
+      <w:r>
+        <w:t xml:space="preserve">who </w:t>
       </w:r>
       <w:proofErr w:type="spellStart"/>
       <w:r>
@@ -3267,13 +3624,21 @@
         <w:t xml:space="preserve">ck </w:t>
       </w:r>
       <w:r>
-        <w:t>which is also called S</w:t>
-      </w:r>
+        <w:t xml:space="preserve">which is also called </w:t>
+      </w:r>
+      <w:proofErr w:type="gramStart"/>
       <w:r>
         <w:t>S</w:t>
       </w:r>
       <w:r>
-        <w:t>LV(who knows)</w:t>
+        <w:t>S</w:t>
+      </w:r>
+      <w:r>
+        <w:t>LV(</w:t>
+      </w:r>
+      <w:proofErr w:type="gramEnd"/>
+      <w:r>
+        <w:t>who knows)</w:t>
       </w:r>
       <w:r>
         <w:t xml:space="preserve"> and </w:t>
@@ -3320,8 +3685,13 @@
       <w:r>
         <w:t xml:space="preserve">of the application. </w:t>
       </w:r>
-      <w:r>
-        <w:t>So if we want that the domain we have need to be pointe</w:t>
+      <w:proofErr w:type="gramStart"/>
+      <w:r>
+        <w:t>So</w:t>
+      </w:r>
+      <w:proofErr w:type="gramEnd"/>
+      <w:r>
+        <w:t xml:space="preserve"> if we want that the domain we have need to be pointe</w:t>
       </w:r>
       <w:r>
         <w:t>d</w:t>
@@ -3352,10 +3722,18 @@
     </w:p>
     <w:p>
       <w:r>
-        <w:t xml:space="preserve">Of you chose the former then you will  </w:t>
-      </w:r>
-      <w:r>
-        <w:t xml:space="preserve">see that from the dashboard </w:t>
+        <w:t xml:space="preserve">Of you chose the former then you </w:t>
+      </w:r>
+      <w:proofErr w:type="gramStart"/>
+      <w:r>
+        <w:t xml:space="preserve">will  </w:t>
+      </w:r>
+      <w:r>
+        <w:t>see</w:t>
+      </w:r>
+      <w:proofErr w:type="gramEnd"/>
+      <w:r>
+        <w:t xml:space="preserve"> that from the dashboard </w:t>
       </w:r>
       <w:r>
         <w:t xml:space="preserve">that how things are happening </w:t>
@@ -3364,10 +3742,26 @@
         <w:t xml:space="preserve">and if you chose later </w:t>
       </w:r>
       <w:r>
-        <w:t>then you need to point it to a Digital ocean(who knows)</w:t>
-      </w:r>
-      <w:r>
-        <w:t>. By former we bring the domain in the digital ocean(who knows)</w:t>
+        <w:t xml:space="preserve">then you need to point it to a Digital </w:t>
+      </w:r>
+      <w:proofErr w:type="gramStart"/>
+      <w:r>
+        <w:t>ocean(</w:t>
+      </w:r>
+      <w:proofErr w:type="gramEnd"/>
+      <w:r>
+        <w:t>who knows)</w:t>
+      </w:r>
+      <w:r>
+        <w:t xml:space="preserve">. By former we bring the domain in the digital </w:t>
+      </w:r>
+      <w:proofErr w:type="gramStart"/>
+      <w:r>
+        <w:t>ocean(</w:t>
+      </w:r>
+      <w:proofErr w:type="gramEnd"/>
+      <w:r>
+        <w:t>who knows)</w:t>
       </w:r>
       <w:r>
         <w:t xml:space="preserve">. </w:t>
@@ -3413,8 +3807,13 @@
       </w:r>
     </w:p>
     <w:p>
-      <w:r>
-        <w:t>So we went to Google search console</w:t>
+      <w:proofErr w:type="gramStart"/>
+      <w:r>
+        <w:t>So</w:t>
+      </w:r>
+      <w:proofErr w:type="gramEnd"/>
+      <w:r>
+        <w:t xml:space="preserve"> we went to Google search console</w:t>
       </w:r>
       <w:r>
         <w:t xml:space="preserve"> so we add a property there </w:t>
@@ -3489,7 +3888,15 @@
         <w:t xml:space="preserve">omain </w:t>
       </w:r>
       <w:r>
-        <w:t xml:space="preserve">ad then you need to verify it so it give us some text which we will paste in the </w:t>
+        <w:t xml:space="preserve">ad then you need to verify it so it </w:t>
+      </w:r>
+      <w:proofErr w:type="gramStart"/>
+      <w:r>
+        <w:t>give</w:t>
+      </w:r>
+      <w:proofErr w:type="gramEnd"/>
+      <w:r>
+        <w:t xml:space="preserve"> us some text which we will paste in the </w:t>
       </w:r>
       <w:r>
         <w:t xml:space="preserve">DNS records to give the proof for ownership of domain. </w:t>
@@ -3583,7 +3990,11 @@
         <w:t xml:space="preserve"> and how to integrate </w:t>
       </w:r>
       <w:r>
-        <w:t>payment gateway to the websi</w:t>
+        <w:t xml:space="preserve">payment gateway to the </w:t>
+      </w:r>
+      <w:proofErr w:type="gramStart"/>
+      <w:r>
+        <w:t>websi</w:t>
       </w:r>
       <w:r>
         <w:t>t</w:t>
@@ -3594,14 +4005,23 @@
       <w:r>
         <w:t>.</w:t>
       </w:r>
+      <w:proofErr w:type="gramEnd"/>
       <w:r>
         <w:t xml:space="preserve"> How orders will come </w:t>
       </w:r>
       <w:r>
-        <w:t xml:space="preserve">and how admin panel will be made </w:t>
-      </w:r>
-      <w:r>
-        <w:t>. F</w:t>
+        <w:t xml:space="preserve">and how admin panel will be </w:t>
+      </w:r>
+      <w:proofErr w:type="gramStart"/>
+      <w:r>
+        <w:t xml:space="preserve">made </w:t>
+      </w:r>
+      <w:r>
+        <w:t>.</w:t>
+      </w:r>
+      <w:proofErr w:type="gramEnd"/>
+      <w:r>
+        <w:t xml:space="preserve"> F</w:t>
       </w:r>
       <w:r>
         <w:t>r</w:t>
@@ -3691,15 +4111,346 @@
     </w:p>
     <w:p>
       <w:r>
-        <w:t xml:space="preserve">We win use global css for </w:t>
-      </w:r>
-      <w:proofErr w:type="spellStart"/>
-      <w:r>
-        <w:t>tailwinf</w:t>
-      </w:r>
-      <w:proofErr w:type="spellEnd"/>
+        <w:t>We wi</w:t>
+      </w:r>
+      <w:r>
+        <w:t>ll</w:t>
+      </w:r>
+      <w:r>
+        <w:t xml:space="preserve"> use global css for </w:t>
+      </w:r>
+      <w:r>
+        <w:t>tailwin</w:t>
+      </w:r>
+      <w:r>
+        <w:t>d</w:t>
+      </w:r>
       <w:r>
         <w:t xml:space="preserve"> css and we will see how to apply it </w:t>
+      </w:r>
+    </w:p>
+    <w:p>
+      <w:r>
+        <w:t xml:space="preserve">Now we will see how to setup </w:t>
+      </w:r>
+      <w:r>
+        <w:t xml:space="preserve">up tailwind with </w:t>
+      </w:r>
+      <w:proofErr w:type="spellStart"/>
+      <w:r>
+        <w:t>Ne</w:t>
+      </w:r>
+      <w:r>
+        <w:t>x</w:t>
+      </w:r>
+      <w:r>
+        <w:t>tjs</w:t>
+      </w:r>
+      <w:proofErr w:type="spellEnd"/>
+      <w:r>
+        <w:t>,</w:t>
+      </w:r>
+      <w:r>
+        <w:t xml:space="preserve"> what extension to us</w:t>
+      </w:r>
+      <w:r>
+        <w:t>e</w:t>
+      </w:r>
+      <w:r>
+        <w:t xml:space="preserve"> it </w:t>
+      </w:r>
+      <w:r>
+        <w:t xml:space="preserve">optimally </w:t>
+      </w:r>
+      <w:r>
+        <w:t xml:space="preserve">and will make a black slate of </w:t>
+      </w:r>
+      <w:proofErr w:type="spellStart"/>
+      <w:r>
+        <w:t>codeswear</w:t>
+      </w:r>
+      <w:proofErr w:type="spellEnd"/>
+      <w:r>
+        <w:t xml:space="preserve"> </w:t>
+      </w:r>
+      <w:r>
+        <w:t>(who knows)</w:t>
+      </w:r>
+    </w:p>
+    <w:p>
+      <w:pPr>
+        <w:rPr>
+          <w:b/>
+          <w:bCs/>
+        </w:rPr>
+      </w:pPr>
+      <w:r>
+        <w:rPr>
+          <w:b/>
+          <w:bCs/>
+        </w:rPr>
+        <w:t>A blank slate of a website means starting the website from scratch with no existing design, content, or structure.</w:t>
+      </w:r>
+    </w:p>
+    <w:p>
+      <w:r>
+        <w:t xml:space="preserve">We will search tailwind css with </w:t>
+      </w:r>
+      <w:proofErr w:type="spellStart"/>
+      <w:r>
+        <w:t>nextjs</w:t>
+      </w:r>
+      <w:proofErr w:type="spellEnd"/>
+      <w:r>
+        <w:t xml:space="preserve"> </w:t>
+      </w:r>
+      <w:r>
+        <w:t xml:space="preserve">so </w:t>
+      </w:r>
+      <w:r>
+        <w:t>b</w:t>
+      </w:r>
+      <w:r>
+        <w:t xml:space="preserve">y this we will go to official documentation </w:t>
+      </w:r>
+    </w:p>
+    <w:p>
+      <w:r>
+        <w:t>Now in out project folder type thi</w:t>
+      </w:r>
+      <w:r>
+        <w:t xml:space="preserve">s </w:t>
+      </w:r>
+      <w:proofErr w:type="spellStart"/>
+      <w:r>
+        <w:t>cammand</w:t>
+      </w:r>
+      <w:proofErr w:type="spellEnd"/>
+      <w:r>
+        <w:t xml:space="preserve"> </w:t>
+      </w:r>
+    </w:p>
+    <w:p>
+      <w:proofErr w:type="spellStart"/>
+      <w:r>
+        <w:t>npm</w:t>
+      </w:r>
+      <w:proofErr w:type="spellEnd"/>
+      <w:r>
+        <w:t xml:space="preserve"> install </w:t>
+      </w:r>
+      <w:proofErr w:type="spellStart"/>
+      <w:r>
+        <w:t>tailwindcss</w:t>
+      </w:r>
+      <w:proofErr w:type="spellEnd"/>
+      <w:r>
+        <w:t xml:space="preserve"> @tailwindcss/postcss </w:t>
+      </w:r>
+      <w:proofErr w:type="spellStart"/>
+      <w:r>
+        <w:t>postcss</w:t>
+      </w:r>
+      <w:proofErr w:type="spellEnd"/>
+      <w:r>
+        <w:t xml:space="preserve"> </w:t>
+      </w:r>
+    </w:p>
+    <w:p>
+      <w:r>
+        <w:t>or</w:t>
+      </w:r>
+    </w:p>
+    <w:p>
+      <w:r>
+        <w:t xml:space="preserve"> yarn add </w:t>
+      </w:r>
+      <w:proofErr w:type="spellStart"/>
+      <w:r>
+        <w:t>tailwindcss</w:t>
+      </w:r>
+      <w:proofErr w:type="spellEnd"/>
+      <w:r>
+        <w:t xml:space="preserve"> @tailwindcss/postcss </w:t>
+      </w:r>
+      <w:proofErr w:type="spellStart"/>
+      <w:r>
+        <w:t>postcss</w:t>
+      </w:r>
+      <w:proofErr w:type="spellEnd"/>
+      <w:r>
+        <w:t xml:space="preserve"> </w:t>
+      </w:r>
+    </w:p>
+    <w:p>
+      <w:r>
+        <w:t>Now the method tea</w:t>
+      </w:r>
+      <w:r>
+        <w:t>c</w:t>
+      </w:r>
+      <w:r>
+        <w:t>h</w:t>
+      </w:r>
+      <w:r>
+        <w:t>e</w:t>
+      </w:r>
+      <w:r>
+        <w:t xml:space="preserve">r is using is </w:t>
+      </w:r>
+      <w:proofErr w:type="spellStart"/>
+      <w:r>
+        <w:t>autdated</w:t>
+      </w:r>
+      <w:proofErr w:type="spellEnd"/>
+      <w:r>
+        <w:t xml:space="preserve"> so we will use moder</w:t>
+      </w:r>
+      <w:r>
+        <w:t>n</w:t>
+      </w:r>
+      <w:r>
+        <w:t xml:space="preserve"> method by following documentation </w:t>
+      </w:r>
+      <w:r>
+        <w:t xml:space="preserve"> </w:t>
+      </w:r>
+    </w:p>
+    <w:p>
+      <w:pPr>
+        <w:jc w:val="center"/>
+      </w:pPr>
+      <w:hyperlink r:id="rId23" w:history="1">
+        <w:r>
+          <w:rPr>
+            <w:rStyle w:val="Hyperlink"/>
+          </w:rPr>
+          <w:t>https://tailwindcss.com/docs/installation/framework-guides/nextjs</w:t>
+        </w:r>
+      </w:hyperlink>
+    </w:p>
+    <w:p>
+      <w:r>
+        <w:t xml:space="preserve">So now by installing the </w:t>
+      </w:r>
+      <w:r>
+        <w:t>tailwind most of the configuration happens by itself (maybe)</w:t>
+      </w:r>
+    </w:p>
+    <w:p>
+      <w:r>
+        <w:t xml:space="preserve">Like Bootstrap Tailwind also have </w:t>
+      </w:r>
+      <w:r>
+        <w:t xml:space="preserve">predefined </w:t>
+      </w:r>
+      <w:proofErr w:type="gramStart"/>
+      <w:r>
+        <w:t xml:space="preserve">class </w:t>
+      </w:r>
+      <w:r>
+        <w:t>.So</w:t>
+      </w:r>
+      <w:proofErr w:type="gramEnd"/>
+      <w:r>
+        <w:t xml:space="preserve"> we have tailwind css is installed </w:t>
+      </w:r>
+      <w:r>
+        <w:t>and we can use our utility class</w:t>
+      </w:r>
+      <w:r>
+        <w:t xml:space="preserve"> and can create our design </w:t>
+      </w:r>
+    </w:p>
+    <w:p>
+      <w:r>
+        <w:t>One side note is that</w:t>
+      </w:r>
+      <w:r>
+        <w:t xml:space="preserve"> Teacher is</w:t>
+      </w:r>
+      <w:r>
+        <w:t xml:space="preserve"> using tailwind extension</w:t>
+      </w:r>
+      <w:r>
+        <w:t>s as shown below</w:t>
+      </w:r>
+    </w:p>
+    <w:p>
+      <w:pPr>
+        <w:jc w:val="center"/>
+      </w:pPr>
+      <w:r>
+        <w:drawing>
+          <wp:inline distT="0" distB="0" distL="0" distR="0" wp14:anchorId="41EF9B39" wp14:editId="473A88B0">
+            <wp:extent cx="1664898" cy="2388767"/>
+            <wp:effectExtent l="0" t="0" r="0" b="0"/>
+            <wp:docPr id="242494848" name="Picture 1"/>
+            <wp:cNvGraphicFramePr>
+              <a:graphicFrameLocks xmlns:a="http://schemas.openxmlformats.org/drawingml/2006/main" noChangeAspect="1"/>
+            </wp:cNvGraphicFramePr>
+            <a:graphic xmlns:a="http://schemas.openxmlformats.org/drawingml/2006/main">
+              <a:graphicData uri="http://schemas.openxmlformats.org/drawingml/2006/picture">
+                <pic:pic xmlns:pic="http://schemas.openxmlformats.org/drawingml/2006/picture">
+                  <pic:nvPicPr>
+                    <pic:cNvPr id="242494848" name=""/>
+                    <pic:cNvPicPr/>
+                  </pic:nvPicPr>
+                  <pic:blipFill>
+                    <a:blip r:embed="rId24"/>
+                    <a:stretch>
+                      <a:fillRect/>
+                    </a:stretch>
+                  </pic:blipFill>
+                  <pic:spPr>
+                    <a:xfrm>
+                      <a:off x="0" y="0"/>
+                      <a:ext cx="1666215" cy="2390657"/>
+                    </a:xfrm>
+                    <a:prstGeom prst="rect">
+                      <a:avLst/>
+                    </a:prstGeom>
+                  </pic:spPr>
+                </pic:pic>
+              </a:graphicData>
+            </a:graphic>
+          </wp:inline>
+        </w:drawing>
+      </w:r>
+    </w:p>
+    <w:p>
+      <w:r>
+        <w:lastRenderedPageBreak/>
+        <w:t xml:space="preserve">The </w:t>
+      </w:r>
+      <w:r>
+        <w:t>Tailwind CSS intelligence</w:t>
+      </w:r>
+      <w:r>
+        <w:t xml:space="preserve"> </w:t>
+      </w:r>
+      <w:r>
+        <w:t>give us suggestion</w:t>
+      </w:r>
+      <w:r>
+        <w:t xml:space="preserve">. If you don’t get suggestion </w:t>
+      </w:r>
+      <w:r>
+        <w:t xml:space="preserve">then you can type </w:t>
+      </w:r>
+      <w:r>
+        <w:rPr>
+          <w:b/>
+          <w:bCs/>
+        </w:rPr>
+        <w:t>ctrl + space</w:t>
+      </w:r>
+      <w:r>
+        <w:rPr>
+          <w:b/>
+          <w:bCs/>
+        </w:rPr>
+        <w:t xml:space="preserve"> </w:t>
       </w:r>
     </w:p>
     <w:sectPr>
@@ -4472,7 +5223,6 @@
   <w:style w:type="character" w:default="1" w:styleId="DefaultParagraphFont">
     <w:name w:val="Default Paragraph Font"/>
     <w:uiPriority w:val="1"/>
-    <w:semiHidden/>
     <w:unhideWhenUsed/>
   </w:style>
   <w:style w:type="table" w:default="1" w:styleId="TableNormal">

</xml_diff>

<commit_message>
Creating Pages for Codeswear.com
</commit_message>
<xml_diff>
--- a/Notes2.docx
+++ b/Notes2.docx
@@ -4,13 +4,8 @@
   <w:body>
     <w:p>
       <w:r>
-        <w:t xml:space="preserve">In this lesson we will see a react feature that is </w:t>
-      </w:r>
-      <w:proofErr w:type="spellStart"/>
-      <w:r>
-        <w:t>dangerouslysetinnerHTML</w:t>
-      </w:r>
-      <w:proofErr w:type="spellEnd"/>
+        <w:t>In this lesson we will see a react feature that is dangerouslysetinnerHTML</w:t>
+      </w:r>
     </w:p>
     <w:p>
       <w:pPr>
@@ -59,18 +54,10 @@
     </w:p>
     <w:p>
       <w:r>
-        <w:t xml:space="preserve">In nay </w:t>
-      </w:r>
-      <w:proofErr w:type="gramStart"/>
-      <w:r>
-        <w:t>container</w:t>
-      </w:r>
-      <w:r>
-        <w:t>(</w:t>
-      </w:r>
-      <w:proofErr w:type="gramEnd"/>
-      <w:r>
-        <w:t>or component)</w:t>
+        <w:t>In nay container</w:t>
+      </w:r>
+      <w:r>
+        <w:t>(or component)</w:t>
       </w:r>
       <w:r>
         <w:t xml:space="preserve"> if you want to </w:t>
@@ -79,11 +66,7 @@
         <w:t>input HTML</w:t>
       </w:r>
       <w:r>
-        <w:t xml:space="preserve"> then you have to use </w:t>
-      </w:r>
-      <w:proofErr w:type="spellStart"/>
-      <w:r>
-        <w:t>dangerou</w:t>
+        <w:t xml:space="preserve"> then you have to use dangerou</w:t>
       </w:r>
       <w:r>
         <w:t>s</w:t>
@@ -94,7 +77,6 @@
       <w:r>
         <w:t>setInner</w:t>
       </w:r>
-      <w:proofErr w:type="spellEnd"/>
       <w:r>
         <w:t xml:space="preserve"> </w:t>
       </w:r>
@@ -120,55 +102,39 @@
         <w:t xml:space="preserve">We will see with the help of </w:t>
       </w:r>
       <w:r>
-        <w:t xml:space="preserve">dangerously </w:t>
-      </w:r>
-      <w:proofErr w:type="spellStart"/>
-      <w:r>
-        <w:t>innerhtml</w:t>
-      </w:r>
-      <w:proofErr w:type="spellEnd"/>
+        <w:t xml:space="preserve">dangerously innerhtml </w:t>
+      </w:r>
+      <w:r>
+        <w:t xml:space="preserve">we can put </w:t>
+      </w:r>
+      <w:r>
+        <w:t xml:space="preserve">html </w:t>
+      </w:r>
+      <w:r>
+        <w:t>conten</w:t>
+      </w:r>
+      <w:r>
+        <w:t>t in huntingcoder which has simple</w:t>
+      </w:r>
+      <w:r>
+        <w:t xml:space="preserve"> p and hea</w:t>
+      </w:r>
+      <w:r>
+        <w:t>ding plain text</w:t>
+      </w:r>
+      <w:r>
+        <w:t xml:space="preserve"> was there. </w:t>
+      </w:r>
+      <w:r>
+        <w:t xml:space="preserve">So that it looks beautiful </w:t>
+      </w:r>
+      <w:r>
+        <w:t>and the option</w:t>
+      </w:r>
       <w:r>
         <w:t xml:space="preserve"> </w:t>
       </w:r>
       <w:r>
-        <w:t xml:space="preserve">we can put </w:t>
-      </w:r>
-      <w:r>
-        <w:t xml:space="preserve">html </w:t>
-      </w:r>
-      <w:r>
-        <w:t>conten</w:t>
-      </w:r>
-      <w:r>
-        <w:t xml:space="preserve">t in </w:t>
-      </w:r>
-      <w:proofErr w:type="spellStart"/>
-      <w:r>
-        <w:t>huntingcoder</w:t>
-      </w:r>
-      <w:proofErr w:type="spellEnd"/>
-      <w:r>
-        <w:t xml:space="preserve"> which has simple</w:t>
-      </w:r>
-      <w:r>
-        <w:t xml:space="preserve"> p and hea</w:t>
-      </w:r>
-      <w:r>
-        <w:t>ding plain text</w:t>
-      </w:r>
-      <w:r>
-        <w:t xml:space="preserve"> was there. </w:t>
-      </w:r>
-      <w:r>
-        <w:t xml:space="preserve">So that it looks beautiful </w:t>
-      </w:r>
-      <w:r>
-        <w:t>and the option</w:t>
-      </w:r>
-      <w:r>
-        <w:t xml:space="preserve"> </w:t>
-      </w:r>
-      <w:r>
         <w:t xml:space="preserve">of formatting </w:t>
       </w:r>
       <w:r>
@@ -178,23 +144,7 @@
         <w:t xml:space="preserve">Out blog is HTML Now if you </w:t>
       </w:r>
       <w:r>
-        <w:t xml:space="preserve">put html </w:t>
-      </w:r>
-      <w:proofErr w:type="spellStart"/>
-      <w:r>
-        <w:t>uibside</w:t>
-      </w:r>
-      <w:proofErr w:type="spellEnd"/>
-      <w:r>
-        <w:t xml:space="preserve"> string in </w:t>
-      </w:r>
-      <w:proofErr w:type="spellStart"/>
-      <w:r>
-        <w:t>json</w:t>
-      </w:r>
-      <w:proofErr w:type="spellEnd"/>
-      <w:r>
-        <w:t xml:space="preserve"> file. </w:t>
+        <w:t xml:space="preserve">put html uibside string in json file. </w:t>
       </w:r>
       <w:r>
         <w:t xml:space="preserve">We want to write such that </w:t>
@@ -217,15 +167,7 @@
         </w:r>
       </w:hyperlink>
       <w:r>
-        <w:t xml:space="preserve"> and then copy the html content </w:t>
-      </w:r>
-      <w:proofErr w:type="spellStart"/>
-      <w:r>
-        <w:t>shownin</w:t>
-      </w:r>
-      <w:proofErr w:type="spellEnd"/>
-      <w:r>
-        <w:t xml:space="preserve"> in the first page </w:t>
+        <w:t xml:space="preserve"> and then copy the html content shownin in the first page </w:t>
       </w:r>
       <w:r>
         <w:t xml:space="preserve">and at first we paste it in the address bar so that </w:t>
@@ -243,26 +185,10 @@
         <w:t>e</w:t>
       </w:r>
       <w:r>
-        <w:t xml:space="preserve"> and then we search Json and aby any ransom site escape the </w:t>
-      </w:r>
-      <w:proofErr w:type="spellStart"/>
-      <w:r>
-        <w:t>jaon</w:t>
-      </w:r>
-      <w:proofErr w:type="spellEnd"/>
-      <w:r>
-        <w:t xml:space="preserve"> that is replace “ by /” and many more and then again remove the </w:t>
-      </w:r>
-      <w:r>
-        <w:t xml:space="preserve">new lines by </w:t>
-      </w:r>
-      <w:proofErr w:type="spellStart"/>
-      <w:r>
-        <w:t>pasing</w:t>
-      </w:r>
-      <w:proofErr w:type="spellEnd"/>
-      <w:r>
-        <w:t xml:space="preserve"> in the address bar.</w:t>
+        <w:t xml:space="preserve"> and then we search Json and aby any ransom site escape the jaon that is replace “ by /” and many more and then again remove the </w:t>
+      </w:r>
+      <w:r>
+        <w:t>new lines by pasing in the address bar.</w:t>
       </w:r>
     </w:p>
     <w:p>
@@ -333,15 +259,7 @@
         <w:t>It</w:t>
       </w:r>
       <w:r>
-        <w:t>(</w:t>
-      </w:r>
-      <w:proofErr w:type="spellStart"/>
-      <w:r>
-        <w:t>Nextjs</w:t>
-      </w:r>
-      <w:proofErr w:type="spellEnd"/>
-      <w:r>
-        <w:t xml:space="preserve"> or react)</w:t>
+        <w:t>(Nextjs or react)</w:t>
       </w:r>
       <w:r>
         <w:t xml:space="preserve"> wants to keep you sa</w:t>
@@ -358,27 +276,14 @@
       <w:r>
         <w:t xml:space="preserve"> you need to tell </w:t>
       </w:r>
-      <w:proofErr w:type="spellStart"/>
-      <w:r>
-        <w:t>Nextjs</w:t>
-      </w:r>
-      <w:proofErr w:type="spellEnd"/>
-      <w:r>
-        <w:t xml:space="preserve"> that you want to parse html </w:t>
+      <w:r>
+        <w:t xml:space="preserve">Nextjs that you want to parse html </w:t>
       </w:r>
       <w:r>
         <w:t>there is a tool or setting (who knows)</w:t>
       </w:r>
       <w:r>
-        <w:t xml:space="preserve"> and it is a part of react not a part of </w:t>
-      </w:r>
-      <w:proofErr w:type="spellStart"/>
-      <w:r>
-        <w:t>nextjs</w:t>
-      </w:r>
-      <w:proofErr w:type="spellEnd"/>
-      <w:r>
-        <w:t xml:space="preserve"> </w:t>
+        <w:t xml:space="preserve"> and it is a part of react not a part of nextjs </w:t>
       </w:r>
       <w:r>
         <w:t xml:space="preserve">as it is a feature of react </w:t>
@@ -434,23 +339,10 @@
     </w:p>
     <w:p>
       <w:r>
-        <w:t xml:space="preserve">The element where you used </w:t>
-      </w:r>
-      <w:proofErr w:type="spellStart"/>
-      <w:r>
-        <w:t>dangerouslyinnerHTML</w:t>
-      </w:r>
-      <w:proofErr w:type="spellEnd"/>
-      <w:r>
-        <w:t xml:space="preserve"> should not have space in the content as it is considered a content </w:t>
-      </w:r>
-      <w:proofErr w:type="spellStart"/>
-      <w:r>
-        <w:t>other wise</w:t>
-      </w:r>
-      <w:proofErr w:type="spellEnd"/>
-      <w:r>
-        <w:t xml:space="preserve"> you will get this error</w:t>
+        <w:t>The element where you used dangerouslyinnerHTML</w:t>
+      </w:r>
+      <w:r>
+        <w:t xml:space="preserve"> should not have space in the content as it is considered a content other wise you will get this error</w:t>
       </w:r>
     </w:p>
     <w:p>
@@ -498,15 +390,7 @@
     </w:p>
     <w:p>
       <w:r>
-        <w:t xml:space="preserve">Now our slug folder </w:t>
-      </w:r>
-      <w:proofErr w:type="spellStart"/>
-      <w:r>
-        <w:t>page.jsx</w:t>
-      </w:r>
-      <w:proofErr w:type="spellEnd"/>
-      <w:r>
-        <w:t xml:space="preserve"> look like below</w:t>
+        <w:t>Now our slug folder page.jsx look like below</w:t>
       </w:r>
     </w:p>
     <w:p>
@@ -555,14 +439,9 @@
       </w:r>
     </w:p>
     <w:p>
-      <w:proofErr w:type="gramStart"/>
       <w:r>
         <w:lastRenderedPageBreak/>
-        <w:t>So</w:t>
-      </w:r>
-      <w:proofErr w:type="gramEnd"/>
-      <w:r>
-        <w:t xml:space="preserve"> we can so this thing Now we can see it is getting rendered as shown below</w:t>
+        <w:t>So we can so this thing Now we can see it is getting rendered as shown below</w:t>
       </w:r>
     </w:p>
     <w:p>
@@ -664,13 +543,8 @@
         <w:t xml:space="preserve"> s</w:t>
       </w:r>
       <w:r>
-        <w:t xml:space="preserve">ubmit the </w:t>
-      </w:r>
-      <w:proofErr w:type="gramStart"/>
-      <w:r>
-        <w:t>form</w:t>
-      </w:r>
-      <w:proofErr w:type="gramEnd"/>
+        <w:t>ubmit the form</w:t>
+      </w:r>
       <w:r>
         <w:t xml:space="preserve"> we will definitely have to make an API to co</w:t>
       </w:r>
@@ -689,13 +563,8 @@
       <w:r>
         <w:t xml:space="preserve"> </w:t>
       </w:r>
-      <w:proofErr w:type="spellStart"/>
-      <w:r>
-        <w:t>api</w:t>
-      </w:r>
-      <w:proofErr w:type="spellEnd"/>
-      <w:r>
-        <w:t xml:space="preserve"> in this lesso</w:t>
+      <w:r>
+        <w:t>api in this lesso</w:t>
       </w:r>
       <w:r>
         <w:t>n. We will see make it using Next.js API route</w:t>
@@ -718,47 +587,13 @@
       <w:r>
         <w:t xml:space="preserve">it </w:t>
       </w:r>
-      <w:proofErr w:type="spellStart"/>
-      <w:r>
-        <w:t>Seom</w:t>
-      </w:r>
-      <w:proofErr w:type="spellEnd"/>
-      <w:r>
-        <w:t xml:space="preserve"> </w:t>
-      </w:r>
-      <w:proofErr w:type="spellStart"/>
-      <w:r>
-        <w:t>noownards</w:t>
-      </w:r>
-      <w:proofErr w:type="spellEnd"/>
-      <w:r>
-        <w:t xml:space="preserve"> I will not give too much explanation</w:t>
-      </w:r>
-    </w:p>
-    <w:p>
-      <w:proofErr w:type="gramStart"/>
-      <w:r>
-        <w:t>So</w:t>
-      </w:r>
-      <w:proofErr w:type="gramEnd"/>
-      <w:r>
-        <w:t xml:space="preserve"> for </w:t>
-      </w:r>
-      <w:proofErr w:type="gramStart"/>
-      <w:r>
-        <w:t>now</w:t>
-      </w:r>
-      <w:proofErr w:type="gramEnd"/>
-      <w:r>
-        <w:t xml:space="preserve"> our post request handler </w:t>
-      </w:r>
-      <w:proofErr w:type="gramStart"/>
-      <w:r>
-        <w:t>look</w:t>
-      </w:r>
-      <w:proofErr w:type="gramEnd"/>
-      <w:r>
-        <w:t xml:space="preserve"> like below</w:t>
+      <w:r>
+        <w:t>Seom noownards I will not give too much explanation</w:t>
+      </w:r>
+    </w:p>
+    <w:p>
+      <w:r>
+        <w:t>So for now our post request handler look like below</w:t>
       </w:r>
     </w:p>
     <w:p>
@@ -807,13 +642,8 @@
       </w:r>
     </w:p>
     <w:p>
-      <w:proofErr w:type="gramStart"/>
-      <w:r>
-        <w:t>Ols</w:t>
-      </w:r>
-      <w:proofErr w:type="gramEnd"/>
-      <w:r>
-        <w:t xml:space="preserve"> version used to look like below</w:t>
+      <w:r>
+        <w:t>Ols version used to look like below</w:t>
       </w:r>
     </w:p>
     <w:p>
@@ -887,28 +717,12 @@
     </w:p>
     <w:p>
       <w:r>
-        <w:t xml:space="preserve">In older version teacher try to send </w:t>
-      </w:r>
-      <w:proofErr w:type="spellStart"/>
-      <w:r>
-        <w:t>req</w:t>
-      </w:r>
-      <w:proofErr w:type="spellEnd"/>
-      <w:r>
-        <w:t xml:space="preserve"> but could not send because </w:t>
-      </w:r>
-    </w:p>
-    <w:p>
-      <w:r>
-        <w:t xml:space="preserve">You didn’t see useful data because </w:t>
-      </w:r>
-      <w:proofErr w:type="spellStart"/>
-      <w:r>
-        <w:t>req</w:t>
-      </w:r>
-      <w:proofErr w:type="spellEnd"/>
-      <w:r>
-        <w:t xml:space="preserve"> is a </w:t>
+        <w:t xml:space="preserve">In older version teacher try to send req but could not send because </w:t>
+      </w:r>
+    </w:p>
+    <w:p>
+      <w:r>
+        <w:t xml:space="preserve">You didn’t see useful data because req is a </w:t>
       </w:r>
       <w:r>
         <w:rPr>
@@ -918,25 +732,7 @@
         <w:t>complex object</w:t>
       </w:r>
       <w:r>
-        <w:t xml:space="preserve">, not plain JSON, so sending it directly with </w:t>
-      </w:r>
-      <w:proofErr w:type="spellStart"/>
-      <w:proofErr w:type="gramStart"/>
-      <w:r>
-        <w:t>res.json</w:t>
-      </w:r>
-      <w:proofErr w:type="spellEnd"/>
-      <w:proofErr w:type="gramEnd"/>
-      <w:r>
-        <w:t>(</w:t>
-      </w:r>
-      <w:proofErr w:type="spellStart"/>
-      <w:r>
-        <w:t>req</w:t>
-      </w:r>
-      <w:proofErr w:type="spellEnd"/>
-      <w:r>
-        <w:t>) doesn’t work as expected.</w:t>
+        <w:t>, not plain JSON, so sending it directly with res.json(req) doesn’t work as expected.</w:t>
       </w:r>
     </w:p>
     <w:p>
@@ -958,23 +754,7 @@
           <w:b/>
           <w:bCs/>
         </w:rPr>
-        <w:t xml:space="preserve">What </w:t>
-      </w:r>
-      <w:proofErr w:type="spellStart"/>
-      <w:r>
-        <w:rPr>
-          <w:b/>
-          <w:bCs/>
-        </w:rPr>
-        <w:t>req</w:t>
-      </w:r>
-      <w:proofErr w:type="spellEnd"/>
-      <w:r>
-        <w:rPr>
-          <w:b/>
-          <w:bCs/>
-        </w:rPr>
-        <w:t xml:space="preserve"> contains (old Next.js / Node.js)</w:t>
+        <w:t>What req contains (old Next.js / Node.js)</w:t>
       </w:r>
     </w:p>
     <w:p>
@@ -984,30 +764,12 @@
     </w:p>
     <w:p>
       <w:r>
-        <w:t xml:space="preserve">export default function </w:t>
-      </w:r>
-      <w:proofErr w:type="gramStart"/>
-      <w:r>
-        <w:t>handler(</w:t>
-      </w:r>
-      <w:proofErr w:type="spellStart"/>
-      <w:proofErr w:type="gramEnd"/>
-      <w:r>
-        <w:t>req</w:t>
-      </w:r>
-      <w:proofErr w:type="spellEnd"/>
-      <w:r>
-        <w:t>, res)</w:t>
-      </w:r>
-    </w:p>
-    <w:p>
-      <w:proofErr w:type="spellStart"/>
-      <w:r>
-        <w:t>req</w:t>
-      </w:r>
-      <w:proofErr w:type="spellEnd"/>
-      <w:r>
-        <w:t xml:space="preserve"> is a </w:t>
+        <w:t>export default function handler(req, res)</w:t>
+      </w:r>
+    </w:p>
+    <w:p>
+      <w:r>
+        <w:t xml:space="preserve">req is a </w:t>
       </w:r>
       <w:r>
         <w:rPr>
@@ -1094,41 +856,7 @@
           <w:b/>
           <w:bCs/>
         </w:rPr>
-        <w:t xml:space="preserve">Why </w:t>
-      </w:r>
-      <w:proofErr w:type="spellStart"/>
-      <w:proofErr w:type="gramStart"/>
-      <w:r>
-        <w:rPr>
-          <w:b/>
-          <w:bCs/>
-        </w:rPr>
-        <w:t>res.json</w:t>
-      </w:r>
-      <w:proofErr w:type="spellEnd"/>
-      <w:proofErr w:type="gramEnd"/>
-      <w:r>
-        <w:rPr>
-          <w:b/>
-          <w:bCs/>
-        </w:rPr>
-        <w:t>(</w:t>
-      </w:r>
-      <w:proofErr w:type="spellStart"/>
-      <w:r>
-        <w:rPr>
-          <w:b/>
-          <w:bCs/>
-        </w:rPr>
-        <w:t>req</w:t>
-      </w:r>
-      <w:proofErr w:type="spellEnd"/>
-      <w:r>
-        <w:rPr>
-          <w:b/>
-          <w:bCs/>
-        </w:rPr>
-        <w:t>) doesn’t show data</w:t>
+        <w:t>Why res.json(req) doesn’t show data</w:t>
       </w:r>
     </w:p>
     <w:p>
@@ -1137,36 +865,8 @@
       </w:r>
     </w:p>
     <w:p>
-      <w:proofErr w:type="spellStart"/>
-      <w:proofErr w:type="gramStart"/>
-      <w:r>
-        <w:t>res.status</w:t>
-      </w:r>
-      <w:proofErr w:type="spellEnd"/>
-      <w:proofErr w:type="gramEnd"/>
-      <w:r>
-        <w:t>(200</w:t>
-      </w:r>
-      <w:proofErr w:type="gramStart"/>
-      <w:r>
-        <w:t>).</w:t>
-      </w:r>
-      <w:proofErr w:type="spellStart"/>
-      <w:r>
-        <w:t>json</w:t>
-      </w:r>
-      <w:proofErr w:type="spellEnd"/>
-      <w:proofErr w:type="gramEnd"/>
-      <w:r>
-        <w:t>(</w:t>
-      </w:r>
-      <w:proofErr w:type="spellStart"/>
-      <w:r>
-        <w:t>req</w:t>
-      </w:r>
-      <w:proofErr w:type="spellEnd"/>
-      <w:r>
-        <w:t>)</w:t>
+      <w:r>
+        <w:t>res.status(200).json(req)</w:t>
       </w:r>
     </w:p>
     <w:p>
@@ -1175,13 +875,8 @@
       </w:r>
     </w:p>
     <w:p>
-      <w:proofErr w:type="spellStart"/>
-      <w:r>
-        <w:t>req</w:t>
-      </w:r>
-      <w:proofErr w:type="spellEnd"/>
-      <w:r>
-        <w:t xml:space="preserve"> is NOT a plain object</w:t>
+      <w:r>
+        <w:t>req is NOT a plain object</w:t>
       </w:r>
       <w:r>
         <w:br/>
@@ -1257,103 +952,27 @@
     </w:p>
     <w:p>
       <w:r>
-        <w:t xml:space="preserve">export default function </w:t>
-      </w:r>
-      <w:proofErr w:type="gramStart"/>
-      <w:r>
-        <w:t>handler(</w:t>
-      </w:r>
-      <w:proofErr w:type="spellStart"/>
-      <w:proofErr w:type="gramEnd"/>
-      <w:r>
-        <w:t>req</w:t>
-      </w:r>
-      <w:proofErr w:type="spellEnd"/>
-      <w:r>
-        <w:t>, res) {</w:t>
+        <w:t>export default function handler(req, res) {</w:t>
       </w:r>
       <w:r>
         <w:br/>
-        <w:t xml:space="preserve">  if (</w:t>
-      </w:r>
-      <w:proofErr w:type="spellStart"/>
-      <w:proofErr w:type="gramStart"/>
-      <w:r>
-        <w:t>req.method</w:t>
-      </w:r>
-      <w:proofErr w:type="spellEnd"/>
-      <w:proofErr w:type="gramEnd"/>
-      <w:r>
-        <w:t xml:space="preserve"> === "POST") {</w:t>
+        <w:t xml:space="preserve">  if (req.method === "POST") {</w:t>
       </w:r>
       <w:r>
         <w:br/>
-        <w:t xml:space="preserve">    </w:t>
-      </w:r>
-      <w:proofErr w:type="spellStart"/>
-      <w:proofErr w:type="gramStart"/>
-      <w:r>
-        <w:t>res.status</w:t>
-      </w:r>
-      <w:proofErr w:type="spellEnd"/>
-      <w:proofErr w:type="gramEnd"/>
-      <w:r>
-        <w:t>(200</w:t>
-      </w:r>
-      <w:proofErr w:type="gramStart"/>
-      <w:r>
-        <w:t>).</w:t>
-      </w:r>
-      <w:proofErr w:type="spellStart"/>
-      <w:r>
-        <w:t>json</w:t>
-      </w:r>
-      <w:proofErr w:type="spellEnd"/>
-      <w:proofErr w:type="gramEnd"/>
-      <w:r>
-        <w:t>({</w:t>
+        <w:t xml:space="preserve">    res.status(200).json({</w:t>
       </w:r>
       <w:r>
         <w:br/>
-        <w:t xml:space="preserve">      method: </w:t>
-      </w:r>
-      <w:proofErr w:type="spellStart"/>
-      <w:proofErr w:type="gramStart"/>
-      <w:r>
-        <w:t>req.method</w:t>
-      </w:r>
-      <w:proofErr w:type="spellEnd"/>
-      <w:proofErr w:type="gramEnd"/>
-      <w:r>
-        <w:t>,</w:t>
+        <w:t xml:space="preserve">      method: req.method,</w:t>
       </w:r>
       <w:r>
         <w:br/>
-        <w:t xml:space="preserve">      body: </w:t>
-      </w:r>
-      <w:proofErr w:type="spellStart"/>
-      <w:proofErr w:type="gramStart"/>
-      <w:r>
-        <w:t>req.body</w:t>
-      </w:r>
-      <w:proofErr w:type="spellEnd"/>
-      <w:proofErr w:type="gramEnd"/>
-      <w:r>
-        <w:t>,</w:t>
+        <w:t xml:space="preserve">      body: req.body,</w:t>
       </w:r>
       <w:r>
         <w:br/>
-        <w:t xml:space="preserve">      query: </w:t>
-      </w:r>
-      <w:proofErr w:type="spellStart"/>
-      <w:proofErr w:type="gramStart"/>
-      <w:r>
-        <w:t>req.query</w:t>
-      </w:r>
-      <w:proofErr w:type="spellEnd"/>
-      <w:proofErr w:type="gramEnd"/>
-      <w:r>
-        <w:t>,</w:t>
+        <w:t xml:space="preserve">      query: req.query,</w:t>
       </w:r>
       <w:r>
         <w:br/>
@@ -1361,12 +980,8 @@
       </w:r>
       <w:r>
         <w:br/>
-      </w:r>
-      <w:proofErr w:type="gramStart"/>
-      <w:r>
         <w:t xml:space="preserve">  }</w:t>
       </w:r>
-      <w:proofErr w:type="gramEnd"/>
       <w:r>
         <w:br/>
         <w:t>}</w:t>
@@ -1481,13 +1096,8 @@
             <w:hideMark/>
           </w:tcPr>
           <w:p>
-            <w:proofErr w:type="spellStart"/>
             <w:r>
-              <w:t>req</w:t>
-            </w:r>
-            <w:proofErr w:type="spellEnd"/>
-            <w:r>
-              <w:t xml:space="preserve"> (whole object)</w:t>
+              <w:t>req (whole object)</w:t>
             </w:r>
           </w:p>
         </w:tc>
@@ -1521,13 +1131,9 @@
             <w:hideMark/>
           </w:tcPr>
           <w:p>
-            <w:proofErr w:type="spellStart"/>
-            <w:proofErr w:type="gramStart"/>
             <w:r>
               <w:t>req.body</w:t>
             </w:r>
-            <w:proofErr w:type="spellEnd"/>
-            <w:proofErr w:type="gramEnd"/>
           </w:p>
         </w:tc>
         <w:tc>
@@ -1560,13 +1166,9 @@
             <w:hideMark/>
           </w:tcPr>
           <w:p>
-            <w:proofErr w:type="spellStart"/>
-            <w:proofErr w:type="gramStart"/>
             <w:r>
               <w:t>req.query</w:t>
             </w:r>
-            <w:proofErr w:type="spellEnd"/>
-            <w:proofErr w:type="gramEnd"/>
           </w:p>
         </w:tc>
         <w:tc>
@@ -1599,13 +1201,9 @@
             <w:hideMark/>
           </w:tcPr>
           <w:p>
-            <w:proofErr w:type="spellStart"/>
-            <w:proofErr w:type="gramStart"/>
             <w:r>
               <w:t>req.method</w:t>
             </w:r>
-            <w:proofErr w:type="spellEnd"/>
-            <w:proofErr w:type="gramEnd"/>
           </w:p>
         </w:tc>
         <w:tc>
@@ -1657,20 +1255,7 @@
     </w:p>
     <w:p>
       <w:r>
-        <w:t xml:space="preserve">export async function </w:t>
-      </w:r>
-      <w:proofErr w:type="gramStart"/>
-      <w:r>
-        <w:t>POST(</w:t>
-      </w:r>
-      <w:proofErr w:type="spellStart"/>
-      <w:proofErr w:type="gramEnd"/>
-      <w:r>
-        <w:t>req</w:t>
-      </w:r>
-      <w:proofErr w:type="spellEnd"/>
-      <w:r>
-        <w:t>)</w:t>
+        <w:t>export async function POST(req)</w:t>
       </w:r>
     </w:p>
     <w:p>
@@ -1679,23 +1264,8 @@
       </w:r>
     </w:p>
     <w:p>
-      <w:proofErr w:type="spellStart"/>
-      <w:r>
-        <w:t>const</w:t>
-      </w:r>
-      <w:proofErr w:type="spellEnd"/>
-      <w:r>
-        <w:t xml:space="preserve"> body = await </w:t>
-      </w:r>
-      <w:proofErr w:type="spellStart"/>
-      <w:proofErr w:type="gramStart"/>
-      <w:r>
-        <w:t>req.json</w:t>
-      </w:r>
-      <w:proofErr w:type="spellEnd"/>
-      <w:proofErr w:type="gramEnd"/>
-      <w:r>
-        <w:t>();</w:t>
+      <w:r>
+        <w:t>const body = await req.json();</w:t>
       </w:r>
     </w:p>
     <w:p>
@@ -1738,31 +1308,13 @@
       </w:pPr>
       <w:r>
         <w:lastRenderedPageBreak/>
-        <w:t xml:space="preserve">You didn’t see </w:t>
-      </w:r>
-      <w:proofErr w:type="spellStart"/>
-      <w:r>
-        <w:t>req</w:t>
-      </w:r>
-      <w:proofErr w:type="spellEnd"/>
-      <w:r>
-        <w:t xml:space="preserve"> in the response because it’s a complex object that cannot be directly converted to JSON—you need to se</w:t>
+        <w:t>You didn’t see req in the response because it’s a complex object that cannot be directly converted to JSON—you need to se</w:t>
       </w:r>
       <w:r>
         <w:t>n</w:t>
       </w:r>
       <w:r>
-        <w:t xml:space="preserve">d specific fields like </w:t>
-      </w:r>
-      <w:proofErr w:type="spellStart"/>
-      <w:proofErr w:type="gramStart"/>
-      <w:r>
-        <w:t>req.body</w:t>
-      </w:r>
-      <w:proofErr w:type="spellEnd"/>
-      <w:proofErr w:type="gramEnd"/>
-      <w:r>
-        <w:t>.</w:t>
+        <w:t>d specific fields like req.body.</w:t>
       </w:r>
     </w:p>
     <w:p>
@@ -1770,15 +1322,7 @@
         <w:t>In older version we used to get body like we did in n</w:t>
       </w:r>
       <w:r>
-        <w:t xml:space="preserve">ode js but in modern it </w:t>
-      </w:r>
-      <w:proofErr w:type="gramStart"/>
-      <w:r>
-        <w:t>look</w:t>
-      </w:r>
-      <w:proofErr w:type="gramEnd"/>
-      <w:r>
-        <w:t xml:space="preserve"> like below</w:t>
+        <w:t>ode js but in modern it look like below</w:t>
       </w:r>
     </w:p>
     <w:p>
@@ -1881,45 +1425,13 @@
         <w:t>The problem with the file making</w:t>
       </w:r>
       <w:r>
-        <w:t xml:space="preserve"> </w:t>
-      </w:r>
-      <w:proofErr w:type="gramStart"/>
-      <w:r>
-        <w:t xml:space="preserve">strategy </w:t>
-      </w:r>
-      <w:r>
-        <w:t xml:space="preserve"> is</w:t>
-      </w:r>
-      <w:proofErr w:type="gramEnd"/>
-      <w:r>
-        <w:t xml:space="preserve"> that </w:t>
-      </w:r>
-      <w:r>
-        <w:t xml:space="preserve">if suppose </w:t>
-      </w:r>
-      <w:proofErr w:type="spellStart"/>
-      <w:r>
-        <w:t>oint</w:t>
-      </w:r>
-      <w:proofErr w:type="spellEnd"/>
-      <w:r>
-        <w:t xml:space="preserve"> fail is failed to </w:t>
-      </w:r>
-      <w:proofErr w:type="spellStart"/>
-      <w:r>
-        <w:t>wiriteen</w:t>
-      </w:r>
-      <w:proofErr w:type="spellEnd"/>
-      <w:r>
-        <w:t xml:space="preserve"> an </w:t>
-      </w:r>
-      <w:proofErr w:type="spellStart"/>
-      <w:r>
-        <w:t>empyty</w:t>
-      </w:r>
-      <w:proofErr w:type="spellEnd"/>
-      <w:r>
-        <w:t xml:space="preserve"> fie is created </w:t>
+        <w:t xml:space="preserve"> strategy </w:t>
+      </w:r>
+      <w:r>
+        <w:t xml:space="preserve"> is that </w:t>
+      </w:r>
+      <w:r>
+        <w:t xml:space="preserve">if suppose oint fail is failed to wiriteen an empyty fie is created </w:t>
       </w:r>
       <w:r>
         <w:t>problem can happen (maybe if we associate a number to a user who tries to contact (who knows))</w:t>
@@ -1981,15 +1493,7 @@
       </w:r>
       <w:r>
         <w:lastRenderedPageBreak/>
-        <w:t xml:space="preserve">This error we may face if we </w:t>
-      </w:r>
-      <w:proofErr w:type="spellStart"/>
-      <w:r>
-        <w:t>son’t</w:t>
-      </w:r>
-      <w:proofErr w:type="spellEnd"/>
-      <w:r>
-        <w:t xml:space="preserve"> set the value of the input fields </w:t>
+        <w:t xml:space="preserve">This error we may face if we son’t set the value of the input fields </w:t>
       </w:r>
     </w:p>
     <w:p>
@@ -1997,113 +1501,29 @@
         <w:t xml:space="preserve">In older version </w:t>
       </w:r>
       <w:r>
-        <w:t xml:space="preserve">we used to put the state value in between the </w:t>
-      </w:r>
-      <w:proofErr w:type="spellStart"/>
-      <w:r>
-        <w:t>textarea</w:t>
-      </w:r>
-      <w:proofErr w:type="spellEnd"/>
+        <w:t>we used to put the state value in between the textarea element</w:t>
+      </w:r>
+      <w:r>
+        <w:t>(who knows may be I am wrong here)</w:t>
+      </w:r>
       <w:r>
         <w:t xml:space="preserve"> </w:t>
       </w:r>
-      <w:proofErr w:type="gramStart"/>
-      <w:r>
-        <w:t>element</w:t>
-      </w:r>
-      <w:r>
-        <w:t>(</w:t>
-      </w:r>
-      <w:proofErr w:type="gramEnd"/>
-      <w:r>
-        <w:t xml:space="preserve">who knows </w:t>
-      </w:r>
-      <w:proofErr w:type="gramStart"/>
-      <w:r>
-        <w:t>may be</w:t>
-      </w:r>
-      <w:proofErr w:type="gramEnd"/>
-      <w:r>
-        <w:t xml:space="preserve"> I am wrong here)</w:t>
-      </w:r>
-      <w:r>
-        <w:t xml:space="preserve"> </w:t>
-      </w:r>
-      <w:r>
-        <w:t xml:space="preserve">and on state update method we used </w:t>
-      </w:r>
-      <w:proofErr w:type="spellStart"/>
-      <w:proofErr w:type="gramStart"/>
-      <w:r>
-        <w:t>e.target</w:t>
-      </w:r>
-      <w:proofErr w:type="gramEnd"/>
-      <w:r>
-        <w:t>.innerText</w:t>
-      </w:r>
-      <w:proofErr w:type="spellEnd"/>
-    </w:p>
-    <w:p>
-      <w:r>
-        <w:t xml:space="preserve">But now in </w:t>
-      </w:r>
-      <w:proofErr w:type="spellStart"/>
-      <w:r>
-        <w:t>Textare</w:t>
-      </w:r>
-      <w:proofErr w:type="spellEnd"/>
-      <w:r>
-        <w:t xml:space="preserve"> we can use </w:t>
-      </w:r>
-      <w:proofErr w:type="spellStart"/>
-      <w:proofErr w:type="gramStart"/>
-      <w:r>
-        <w:t>e.target</w:t>
-      </w:r>
-      <w:proofErr w:type="gramEnd"/>
-      <w:r>
-        <w:t>,value</w:t>
-      </w:r>
-      <w:proofErr w:type="spellEnd"/>
-      <w:r>
-        <w:t xml:space="preserve"> as value attribute is used in the </w:t>
-      </w:r>
-      <w:proofErr w:type="spellStart"/>
-      <w:r>
-        <w:t>Textfi</w:t>
+      <w:r>
+        <w:t>and on state update method we used e.target.innerText</w:t>
+      </w:r>
+    </w:p>
+    <w:p>
+      <w:r>
+        <w:t>But now in Textare we can use e.target,value as value attribute is used in the Textfi</w:t>
       </w:r>
       <w:r>
         <w:t>eld</w:t>
       </w:r>
-      <w:proofErr w:type="spellEnd"/>
-    </w:p>
-    <w:p>
-      <w:r>
-        <w:t xml:space="preserve">The API may not give </w:t>
-      </w:r>
-      <w:proofErr w:type="spellStart"/>
-      <w:r>
-        <w:t>json</w:t>
-      </w:r>
-      <w:proofErr w:type="spellEnd"/>
-      <w:r>
-        <w:t xml:space="preserve"> response but instead </w:t>
-      </w:r>
-      <w:proofErr w:type="spellStart"/>
-      <w:r>
-        <w:t>uit</w:t>
-      </w:r>
-      <w:proofErr w:type="spellEnd"/>
-      <w:r>
-        <w:t xml:space="preserve"> may text </w:t>
-      </w:r>
-      <w:proofErr w:type="spellStart"/>
-      <w:r>
-        <w:t>reponse</w:t>
-      </w:r>
-      <w:proofErr w:type="spellEnd"/>
-      <w:r>
-        <w:t xml:space="preserve"> who knows and we can parse it by text method in response we are fetching</w:t>
+    </w:p>
+    <w:p>
+      <w:r>
+        <w:t>The API may not give json response but instead uit may text reponse who knows and we can parse it by text method in response we are fetching</w:t>
       </w:r>
       <w:r>
         <w:t xml:space="preserve"> as shown below</w:t>
@@ -2175,19 +1595,8 @@
     </w:p>
     <w:p>
       <w:r>
-        <w:t xml:space="preserve">Shortcut for </w:t>
-      </w:r>
-      <w:proofErr w:type="spellStart"/>
-      <w:proofErr w:type="gramStart"/>
-      <w:r>
-        <w:t>margin:auto</w:t>
-      </w:r>
-      <w:proofErr w:type="spellEnd"/>
-      <w:proofErr w:type="gramEnd"/>
-      <w:r>
-        <w:t xml:space="preserve"> will be </w:t>
-      </w:r>
-      <w:proofErr w:type="gramStart"/>
+        <w:t xml:space="preserve">Shortcut for margin:auto will be </w:t>
+      </w:r>
       <w:r>
         <w:rPr>
           <w:b/>
@@ -2195,7 +1604,6 @@
         </w:rPr>
         <w:t>m:auto</w:t>
       </w:r>
-      <w:proofErr w:type="gramEnd"/>
       <w:r>
         <w:rPr>
           <w:b/>
@@ -2204,25 +1612,12 @@
         <w:t xml:space="preserve"> </w:t>
       </w:r>
       <w:r>
-        <w:t xml:space="preserve">in </w:t>
-      </w:r>
-      <w:proofErr w:type="spellStart"/>
-      <w:r>
-        <w:t>VSCode</w:t>
-      </w:r>
-      <w:proofErr w:type="spellEnd"/>
-    </w:p>
-    <w:p>
-      <w:r>
-        <w:t xml:space="preserve">In name of logic we forgot to style </w:t>
-      </w:r>
-      <w:proofErr w:type="spellStart"/>
-      <w:r>
-        <w:t>outpages</w:t>
-      </w:r>
-      <w:proofErr w:type="spellEnd"/>
-      <w:r>
-        <w:t xml:space="preserve"> are not responsive which teacher will talk about in upcoming lesson </w:t>
+        <w:t>in VSCode</w:t>
+      </w:r>
+    </w:p>
+    <w:p>
+      <w:r>
+        <w:t xml:space="preserve">In name of logic we forgot to style outpages are not responsive which teacher will talk about in upcoming lesson </w:t>
       </w:r>
       <w:r>
         <w:t xml:space="preserve">we will see how to keep styling of </w:t>
@@ -2259,18 +1654,10 @@
     </w:p>
     <w:p>
       <w:r>
-        <w:t xml:space="preserve">Suppose you have 50 blogs and you want to show 5 blogs on each </w:t>
-      </w:r>
-      <w:proofErr w:type="gramStart"/>
-      <w:r>
-        <w:t xml:space="preserve">pages </w:t>
-      </w:r>
-      <w:r>
-        <w:t xml:space="preserve"> so</w:t>
-      </w:r>
-      <w:proofErr w:type="gramEnd"/>
-      <w:r>
-        <w:t xml:space="preserve"> 10 pages </w:t>
+        <w:t xml:space="preserve">Suppose you have 50 blogs and you want to show 5 blogs on each pages </w:t>
+      </w:r>
+      <w:r>
+        <w:t xml:space="preserve"> so 10 pages </w:t>
       </w:r>
       <w:r>
         <w:t>will</w:t>
@@ -2281,16 +1668,11 @@
       <w:r>
         <w:t xml:space="preserve">be </w:t>
       </w:r>
-      <w:proofErr w:type="gramStart"/>
       <w:r>
         <w:t xml:space="preserve">formed </w:t>
       </w:r>
       <w:r>
-        <w:t>.</w:t>
-      </w:r>
-      <w:proofErr w:type="gramEnd"/>
-      <w:r>
-        <w:t xml:space="preserve"> In the similar way </w:t>
+        <w:t xml:space="preserve">. In the similar way </w:t>
       </w:r>
       <w:r>
         <w:t xml:space="preserve">pagination can be showed </w:t>
@@ -2299,15 +1681,7 @@
         <w:t xml:space="preserve">by infinite scroll </w:t>
       </w:r>
       <w:r>
-        <w:t xml:space="preserve">like </w:t>
-      </w:r>
-      <w:proofErr w:type="spellStart"/>
-      <w:r>
-        <w:t>facebook</w:t>
-      </w:r>
-      <w:proofErr w:type="spellEnd"/>
-      <w:r>
-        <w:t xml:space="preserve"> news feed </w:t>
+        <w:t xml:space="preserve">like facebook news feed </w:t>
       </w:r>
       <w:r>
         <w:t>you keep scrolling and new thing appears</w:t>
@@ -2383,15 +1757,7 @@
         <w:t xml:space="preserve">that we will not good components </w:t>
       </w:r>
       <w:r>
-        <w:t xml:space="preserve">means you won’t get good packages for doing any </w:t>
-      </w:r>
-      <w:proofErr w:type="gramStart"/>
-      <w:r>
-        <w:t>work(</w:t>
-      </w:r>
-      <w:proofErr w:type="gramEnd"/>
-      <w:r>
-        <w:t>who knows)</w:t>
+        <w:t>means you won’t get good packages for doing any work(who knows)</w:t>
       </w:r>
     </w:p>
     <w:p>
@@ -2402,45 +1768,23 @@
           <w:bCs/>
         </w:rPr>
       </w:pPr>
-      <w:proofErr w:type="spellStart"/>
-      <w:r>
-        <w:rPr>
-          <w:b/>
-          <w:bCs/>
-        </w:rPr>
-        <w:t>npm</w:t>
-      </w:r>
-      <w:proofErr w:type="spellEnd"/>
-      <w:r>
-        <w:rPr>
-          <w:b/>
-          <w:bCs/>
-        </w:rPr>
-        <w:t xml:space="preserve"> install --save react-infinite-scroll-component</w:t>
-      </w:r>
-    </w:p>
-    <w:p>
-      <w:proofErr w:type="gramStart"/>
-      <w:r>
-        <w:t>So</w:t>
-      </w:r>
-      <w:proofErr w:type="gramEnd"/>
-      <w:r>
-        <w:t xml:space="preserve"> we run the above command I context of </w:t>
+      <w:r>
+        <w:rPr>
+          <w:b/>
+          <w:bCs/>
+        </w:rPr>
+        <w:t>npm install --save react-infinite-scroll-component</w:t>
+      </w:r>
+    </w:p>
+    <w:p>
+      <w:r>
+        <w:t xml:space="preserve">So we run the above command I context of </w:t>
       </w:r>
       <w:r>
         <w:t xml:space="preserve">yarn </w:t>
       </w:r>
       <w:r>
-        <w:t xml:space="preserve">by </w:t>
-      </w:r>
-      <w:proofErr w:type="gramStart"/>
-      <w:r>
-        <w:t>using  below</w:t>
-      </w:r>
-      <w:proofErr w:type="gramEnd"/>
-      <w:r>
-        <w:t xml:space="preserve"> command</w:t>
+        <w:t>by using  below command</w:t>
       </w:r>
     </w:p>
     <w:p>
@@ -2528,40 +1872,22 @@
         <w:t xml:space="preserve">Data length </w:t>
       </w:r>
       <w:r>
-        <w:t xml:space="preserve">of the data that to be </w:t>
-      </w:r>
-      <w:proofErr w:type="gramStart"/>
-      <w:r>
-        <w:t>shown</w:t>
-      </w:r>
-      <w:r>
-        <w:t xml:space="preserve"> ,</w:t>
-      </w:r>
-      <w:proofErr w:type="gramEnd"/>
-      <w:r>
-        <w:t xml:space="preserve"> next is the </w:t>
-      </w:r>
-      <w:proofErr w:type="gramStart"/>
-      <w:r>
-        <w:t xml:space="preserve">function  </w:t>
-      </w:r>
-      <w:r>
-        <w:t>that</w:t>
-      </w:r>
-      <w:proofErr w:type="gramEnd"/>
-      <w:r>
-        <w:t xml:space="preserve"> will be called when we scroll and reach the bottom and more data is needed to be loaded.</w:t>
+        <w:t>of the data that to be shown</w:t>
+      </w:r>
+      <w:r>
+        <w:t xml:space="preserve"> , next is the function  </w:t>
+      </w:r>
+      <w:r>
+        <w:t>that will be called when we scroll and reach the bottom and more data is needed to be loaded.</w:t>
       </w:r>
     </w:p>
     <w:p>
       <w:r>
         <w:t xml:space="preserve">The props below the </w:t>
       </w:r>
-      <w:proofErr w:type="spellStart"/>
       <w:r>
         <w:t>endMessage</w:t>
       </w:r>
-      <w:proofErr w:type="spellEnd"/>
       <w:r>
         <w:t xml:space="preserve"> </w:t>
       </w:r>
@@ -2578,34 +1904,18 @@
         <w:t>w</w:t>
       </w:r>
       <w:r>
-        <w:t xml:space="preserve">n </w:t>
-      </w:r>
-      <w:proofErr w:type="gramStart"/>
-      <w:r>
-        <w:t>function</w:t>
+        <w:t>n function</w:t>
       </w:r>
       <w:r>
         <w:t>al</w:t>
       </w:r>
       <w:r>
-        <w:t>ity(</w:t>
-      </w:r>
-      <w:proofErr w:type="gramEnd"/>
-      <w:r>
-        <w:t>who knows)</w:t>
-      </w:r>
-    </w:p>
-    <w:p>
-      <w:r>
-        <w:t xml:space="preserve">You can use </w:t>
-      </w:r>
-      <w:proofErr w:type="spellStart"/>
-      <w:r>
-        <w:t>InfiniteScroll</w:t>
-      </w:r>
-      <w:proofErr w:type="spellEnd"/>
-      <w:r>
-        <w:t xml:space="preserve"> only in client side so </w:t>
+        <w:t>ity(who knows)</w:t>
+      </w:r>
+    </w:p>
+    <w:p>
+      <w:r>
+        <w:t xml:space="preserve">You can use InfiniteScroll only in client side so </w:t>
       </w:r>
       <w:r>
         <w:t xml:space="preserve">we need to use it in client component so we will change the blogs from SSG to client component. </w:t>
@@ -2624,13 +1934,8 @@
       <w:r>
         <w:t xml:space="preserve">we use any library </w:t>
       </w:r>
-      <w:proofErr w:type="spellStart"/>
-      <w:r>
-        <w:t>onw</w:t>
-      </w:r>
-      <w:proofErr w:type="spellEnd"/>
-      <w:r>
-        <w:t xml:space="preserve"> imp</w:t>
+      <w:r>
+        <w:t>onw imp</w:t>
       </w:r>
       <w:r>
         <w:t>o</w:t>
@@ -2654,15 +1959,7 @@
         <w:t xml:space="preserve">ined </w:t>
       </w:r>
       <w:r>
-        <w:t xml:space="preserve">is it </w:t>
-      </w:r>
-      <w:proofErr w:type="spellStart"/>
-      <w:r>
-        <w:t>idefined</w:t>
-      </w:r>
-      <w:proofErr w:type="spellEnd"/>
-      <w:r>
-        <w:t xml:space="preserve"> like that you have t</w:t>
+        <w:t>is it idefined like that you have t</w:t>
       </w:r>
       <w:r>
         <w:t xml:space="preserve">o </w:t>
@@ -2674,15 +1971,7 @@
         <w:t xml:space="preserve">it is defined like this </w:t>
       </w:r>
       <w:r>
-        <w:t xml:space="preserve">if we keep single </w:t>
-      </w:r>
-      <w:proofErr w:type="gramStart"/>
-      <w:r>
-        <w:t>item</w:t>
-      </w:r>
-      <w:proofErr w:type="gramEnd"/>
-      <w:r>
-        <w:t xml:space="preserve"> </w:t>
+        <w:t xml:space="preserve">if we keep single item </w:t>
       </w:r>
       <w:r>
         <w:t>we need to see al</w:t>
@@ -2691,31 +1980,22 @@
         <w:t>l</w:t>
       </w:r>
       <w:r>
-        <w:t xml:space="preserve"> </w:t>
-      </w:r>
-      <w:proofErr w:type="gramStart"/>
-      <w:r>
-        <w:t>this thi</w:t>
+        <w:t xml:space="preserve"> this thi</w:t>
       </w:r>
       <w:r>
         <w:t>n</w:t>
       </w:r>
       <w:r>
-        <w:t>gs</w:t>
-      </w:r>
-      <w:proofErr w:type="gramEnd"/>
-      <w:r>
-        <w:t xml:space="preserve"> </w:t>
-      </w:r>
-    </w:p>
-    <w:p>
-      <w:pPr>
-        <w:rPr>
-          <w:b/>
-          <w:bCs/>
-        </w:rPr>
-      </w:pPr>
-      <w:proofErr w:type="gramStart"/>
+        <w:t xml:space="preserve">gs </w:t>
+      </w:r>
+    </w:p>
+    <w:p>
+      <w:pPr>
+        <w:rPr>
+          <w:b/>
+          <w:bCs/>
+        </w:rPr>
+      </w:pPr>
       <w:r>
         <w:rPr>
           <w:b/>
@@ -2723,7 +2003,6 @@
         </w:rPr>
         <w:t>Note:-</w:t>
       </w:r>
-      <w:proofErr w:type="gramEnd"/>
     </w:p>
     <w:p>
       <w:pPr>
@@ -2735,15 +2014,7 @@
         <w:t xml:space="preserve">Sometime it happens </w:t>
       </w:r>
       <w:r>
-        <w:t xml:space="preserve">in react that one component is </w:t>
-      </w:r>
-      <w:proofErr w:type="gramStart"/>
-      <w:r>
-        <w:t>show  two</w:t>
-      </w:r>
-      <w:proofErr w:type="gramEnd"/>
-      <w:r>
-        <w:t xml:space="preserve"> times so reload to remove the bug</w:t>
+        <w:t>in react that one component is show  two times so reload to remove the bug</w:t>
       </w:r>
     </w:p>
     <w:p>
@@ -2759,15 +2030,7 @@
         <w:t xml:space="preserve">except for responsiveness </w:t>
       </w:r>
       <w:r>
-        <w:t xml:space="preserve">we </w:t>
-      </w:r>
-      <w:proofErr w:type="gramStart"/>
-      <w:r>
-        <w:t>will  make</w:t>
-      </w:r>
-      <w:proofErr w:type="gramEnd"/>
-      <w:r>
-        <w:t xml:space="preserve"> our blog responsive and will write media queries </w:t>
+        <w:t xml:space="preserve">we will  make our blog responsive and will write media queries </w:t>
       </w:r>
       <w:r>
         <w:t>how we can we run media que</w:t>
@@ -2793,37 +2056,16 @@
         <w:t xml:space="preserve">the website </w:t>
       </w:r>
       <w:r>
-        <w:t xml:space="preserve">and if you gave </w:t>
-      </w:r>
-      <w:proofErr w:type="gramStart"/>
-      <w:r>
-        <w:t>responsiveness</w:t>
-      </w:r>
-      <w:proofErr w:type="gramEnd"/>
+        <w:t>and if you gave responsiveness</w:t>
+      </w:r>
       <w:r>
         <w:t xml:space="preserve"> it was an addon</w:t>
       </w:r>
       <w:r>
-        <w:t xml:space="preserve"> if you gave it then it was a </w:t>
-      </w:r>
-      <w:proofErr w:type="spellStart"/>
-      <w:r>
-        <w:t>favor</w:t>
-      </w:r>
-      <w:proofErr w:type="spellEnd"/>
-      <w:r>
-        <w:t xml:space="preserve"> </w:t>
-      </w:r>
-      <w:r>
-        <w:t xml:space="preserve">you can say bit in </w:t>
-      </w:r>
-      <w:proofErr w:type="gramStart"/>
-      <w:r>
-        <w:t>todays</w:t>
-      </w:r>
-      <w:proofErr w:type="gramEnd"/>
-      <w:r>
-        <w:t xml:space="preserve"> time </w:t>
+        <w:t xml:space="preserve"> if you gave it then it was a favor </w:t>
+      </w:r>
+      <w:r>
+        <w:t xml:space="preserve">you can say bit in todays time </w:t>
       </w:r>
       <w:r>
         <w:t xml:space="preserve">if you are delivering a website </w:t>
@@ -2898,11 +2140,7 @@
     </w:p>
     <w:p>
       <w:r>
-        <w:t xml:space="preserve">We will </w:t>
-      </w:r>
-      <w:proofErr w:type="gramStart"/>
-      <w:r>
-        <w:t>ho</w:t>
+        <w:t>We will ho</w:t>
       </w:r>
       <w:r>
         <w:t>s</w:t>
@@ -2911,11 +2149,7 @@
         <w:t>t</w:t>
       </w:r>
       <w:r>
-        <w:t>s</w:t>
-      </w:r>
-      <w:proofErr w:type="gramEnd"/>
-      <w:r>
-        <w:t xml:space="preserve"> the web</w:t>
+        <w:t>s the web</w:t>
       </w:r>
       <w:r>
         <w:t>s</w:t>
@@ -3042,15 +2276,7 @@
     </w:p>
     <w:p>
       <w:r>
-        <w:t xml:space="preserve">IN digital ocean we make new </w:t>
-      </w:r>
-      <w:proofErr w:type="gramStart"/>
-      <w:r>
-        <w:t>user(</w:t>
-      </w:r>
-      <w:proofErr w:type="gramEnd"/>
-      <w:r>
-        <w:t xml:space="preserve">who knows) </w:t>
+        <w:t xml:space="preserve">IN digital ocean we make new user(who knows) </w:t>
       </w:r>
     </w:p>
     <w:p>
@@ -3088,26 +2314,13 @@
       <w:r>
         <w:t xml:space="preserve">process will be </w:t>
       </w:r>
-      <w:proofErr w:type="gramStart"/>
-      <w:r>
-        <w:t>build</w:t>
-      </w:r>
-      <w:proofErr w:type="gramEnd"/>
-      <w:r>
-        <w:t xml:space="preserve"> there </w:t>
-      </w:r>
-    </w:p>
-    <w:p>
-      <w:r>
-        <w:t xml:space="preserve">It will ask you to make database in </w:t>
-      </w:r>
-      <w:proofErr w:type="gramStart"/>
-      <w:r>
-        <w:t>there</w:t>
-      </w:r>
-      <w:proofErr w:type="gramEnd"/>
-      <w:r>
-        <w:t xml:space="preserve"> services.</w:t>
+      <w:r>
+        <w:t xml:space="preserve">build there </w:t>
+      </w:r>
+    </w:p>
+    <w:p>
+      <w:r>
+        <w:t>It will ask you to make database in there services.</w:t>
       </w:r>
       <w:r>
         <w:t xml:space="preserve"> (who knows)</w:t>
@@ -3123,23 +2336,7 @@
     </w:p>
     <w:p>
       <w:r>
-        <w:t xml:space="preserve">It is very simple </w:t>
-      </w:r>
-      <w:proofErr w:type="spellStart"/>
-      <w:r>
-        <w:t>an</w:t>
-      </w:r>
-      <w:proofErr w:type="spellEnd"/>
-      <w:r>
-        <w:t xml:space="preserve"> it </w:t>
-      </w:r>
-      <w:proofErr w:type="spellStart"/>
-      <w:r>
-        <w:t>wil</w:t>
-      </w:r>
-      <w:proofErr w:type="spellEnd"/>
-      <w:r>
-        <w:t xml:space="preserve"> automatically detect your application </w:t>
+        <w:t xml:space="preserve">It is very simple an it wil automatically detect your application </w:t>
       </w:r>
     </w:p>
     <w:p>
@@ -3150,28 +2347,7 @@
         <w:t>d</w:t>
       </w:r>
       <w:r>
-        <w:t xml:space="preserve"> use it like a node ap </w:t>
-      </w:r>
-      <w:proofErr w:type="spellStart"/>
-      <w:r>
-        <w:t>hten</w:t>
-      </w:r>
-      <w:proofErr w:type="spellEnd"/>
-      <w:r>
-        <w:t xml:space="preserve"> it will be </w:t>
-      </w:r>
-      <w:proofErr w:type="gramStart"/>
-      <w:r>
-        <w:t>good(</w:t>
-      </w:r>
-      <w:proofErr w:type="spellStart"/>
-      <w:proofErr w:type="gramEnd"/>
-      <w:r>
-        <w:t>wjp</w:t>
-      </w:r>
-      <w:proofErr w:type="spellEnd"/>
-      <w:r>
-        <w:t xml:space="preserve"> knows)</w:t>
+        <w:t xml:space="preserve"> use it like a node ap hten it will be good(wjp knows)</w:t>
       </w:r>
     </w:p>
     <w:p>
@@ -3182,23 +2358,21 @@
           <w:color w:val="EE0000"/>
         </w:rPr>
       </w:pPr>
-      <w:proofErr w:type="gramStart"/>
       <w:r>
         <w:rPr>
           <w:b/>
           <w:bCs/>
           <w:color w:val="EE0000"/>
         </w:rPr>
-        <w:t>‘ can</w:t>
-      </w:r>
-      <w:proofErr w:type="gramEnd"/>
+        <w:t xml:space="preserve">‘ can create </w:t>
+      </w:r>
       <w:r>
         <w:rPr>
           <w:b/>
           <w:bCs/>
           <w:color w:val="EE0000"/>
         </w:rPr>
-        <w:t xml:space="preserve"> create </w:t>
+        <w:t>error in js</w:t>
       </w:r>
       <w:r>
         <w:rPr>
@@ -3206,77 +2380,15 @@
           <w:bCs/>
           <w:color w:val="EE0000"/>
         </w:rPr>
-        <w:t xml:space="preserve">error in </w:t>
-      </w:r>
-      <w:proofErr w:type="spellStart"/>
+        <w:t>x in Nextjs or maybe in React.</w:t>
+      </w:r>
       <w:r>
         <w:rPr>
           <w:b/>
           <w:bCs/>
           <w:color w:val="EE0000"/>
         </w:rPr>
-        <w:t>js</w:t>
-      </w:r>
-      <w:r>
-        <w:rPr>
-          <w:b/>
-          <w:bCs/>
-          <w:color w:val="EE0000"/>
-        </w:rPr>
-        <w:t>x</w:t>
-      </w:r>
-      <w:proofErr w:type="spellEnd"/>
-      <w:r>
-        <w:rPr>
-          <w:b/>
-          <w:bCs/>
-          <w:color w:val="EE0000"/>
-        </w:rPr>
-        <w:t xml:space="preserve"> in </w:t>
-      </w:r>
-      <w:proofErr w:type="spellStart"/>
-      <w:r>
-        <w:rPr>
-          <w:b/>
-          <w:bCs/>
-          <w:color w:val="EE0000"/>
-        </w:rPr>
-        <w:t>Nextjs</w:t>
-      </w:r>
-      <w:proofErr w:type="spellEnd"/>
-      <w:r>
-        <w:rPr>
-          <w:b/>
-          <w:bCs/>
-          <w:color w:val="EE0000"/>
-        </w:rPr>
-        <w:t xml:space="preserve"> or maybe in </w:t>
-      </w:r>
-      <w:proofErr w:type="gramStart"/>
-      <w:r>
-        <w:rPr>
-          <w:b/>
-          <w:bCs/>
-          <w:color w:val="EE0000"/>
-        </w:rPr>
-        <w:t>React.</w:t>
-      </w:r>
-      <w:r>
-        <w:rPr>
-          <w:b/>
-          <w:bCs/>
-          <w:color w:val="EE0000"/>
-        </w:rPr>
-        <w:t>(</w:t>
-      </w:r>
-      <w:proofErr w:type="gramEnd"/>
-      <w:r>
-        <w:rPr>
-          <w:b/>
-          <w:bCs/>
-          <w:color w:val="EE0000"/>
-        </w:rPr>
-        <w:t>maybe it is an outdated problem)</w:t>
+        <w:t>(maybe it is an outdated problem)</w:t>
       </w:r>
     </w:p>
     <w:p>
@@ -3298,22 +2410,13 @@
         <w:t xml:space="preserve">that </w:t>
       </w:r>
       <w:r>
-        <w:t xml:space="preserve">you can make it like that and if it </w:t>
-      </w:r>
-      <w:proofErr w:type="gramStart"/>
-      <w:r>
-        <w:t>become</w:t>
-      </w:r>
-      <w:proofErr w:type="gramEnd"/>
-      <w:r>
-        <w:t xml:space="preserve"> profitable then you can scale it (who knows) </w:t>
+        <w:t xml:space="preserve">you can make it like that and if it become profitable then you can scale it (who knows) </w:t>
       </w:r>
     </w:p>
     <w:p>
       <w:r>
         <w:t xml:space="preserve">Now as you commit then </w:t>
       </w:r>
-      <w:proofErr w:type="gramStart"/>
       <w:r>
         <w:t>Digital</w:t>
       </w:r>
@@ -3321,25 +2424,13 @@
         <w:t xml:space="preserve"> </w:t>
       </w:r>
       <w:r>
-        <w:t>ocean</w:t>
-      </w:r>
-      <w:proofErr w:type="gramEnd"/>
-      <w:r>
-        <w:t xml:space="preserve"> will build it</w:t>
-      </w:r>
-      <w:r>
-        <w:t xml:space="preserve"> automatically for </w:t>
-      </w:r>
-      <w:proofErr w:type="gramStart"/>
-      <w:r>
-        <w:t>you.</w:t>
-      </w:r>
-      <w:r>
-        <w:t>(</w:t>
-      </w:r>
-      <w:proofErr w:type="gramEnd"/>
-      <w:r>
-        <w:t>maybe if auto</w:t>
+        <w:t>ocean will build it</w:t>
+      </w:r>
+      <w:r>
+        <w:t xml:space="preserve"> automatically for you.</w:t>
+      </w:r>
+      <w:r>
+        <w:t>(maybe if auto</w:t>
       </w:r>
       <w:r>
         <w:t xml:space="preserve"> </w:t>
@@ -3348,15 +2439,7 @@
         <w:t xml:space="preserve">deploy option was selected </w:t>
       </w:r>
       <w:r>
-        <w:t xml:space="preserve">in the </w:t>
-      </w:r>
-      <w:proofErr w:type="gramStart"/>
-      <w:r>
-        <w:t>setting(</w:t>
-      </w:r>
-      <w:proofErr w:type="gramEnd"/>
-      <w:r>
-        <w:t>who knows)</w:t>
+        <w:t>in the setting(who knows)</w:t>
       </w:r>
       <w:r>
         <w:t>)</w:t>
@@ -3394,18 +2477,10 @@
         <w:t xml:space="preserve">here (maybe </w:t>
       </w:r>
       <w:r>
-        <w:t xml:space="preserve">very large app don’t work </w:t>
-      </w:r>
-      <w:proofErr w:type="gramStart"/>
-      <w:r>
-        <w:t>properly</w:t>
-      </w:r>
-      <w:r>
-        <w:t>(</w:t>
-      </w:r>
-      <w:proofErr w:type="gramEnd"/>
-      <w:r>
-        <w:t>who knows)</w:t>
+        <w:t>very large app don’t work properly</w:t>
+      </w:r>
+      <w:r>
+        <w:t>(who knows)</w:t>
       </w:r>
       <w:r>
         <w:t>)</w:t>
@@ -3446,26 +2521,10 @@
         <w:t xml:space="preserve">Now we will see </w:t>
       </w:r>
       <w:r>
-        <w:t xml:space="preserve">how Google analytics and search </w:t>
-      </w:r>
-      <w:proofErr w:type="gramStart"/>
-      <w:r>
-        <w:t>console</w:t>
-      </w:r>
-      <w:r>
-        <w:t>(</w:t>
-      </w:r>
-      <w:proofErr w:type="gramEnd"/>
-      <w:r>
-        <w:t xml:space="preserve">who </w:t>
-      </w:r>
-      <w:proofErr w:type="spellStart"/>
-      <w:r>
-        <w:t>knowa</w:t>
-      </w:r>
-      <w:proofErr w:type="spellEnd"/>
-      <w:r>
-        <w:t>)</w:t>
+        <w:t>how Google analytics and search console</w:t>
+      </w:r>
+      <w:r>
+        <w:t>(who knowa)</w:t>
       </w:r>
       <w:r>
         <w:t xml:space="preserve"> </w:t>
@@ -3481,307 +2540,265 @@
       </w:r>
     </w:p>
     <w:p>
-      <w:proofErr w:type="spellStart"/>
-      <w:r>
-        <w:t>Nextjs</w:t>
-      </w:r>
-      <w:proofErr w:type="spellEnd"/>
+      <w:r>
+        <w:t xml:space="preserve">Nextjs </w:t>
+      </w:r>
+      <w:r>
+        <w:t>d</w:t>
+      </w:r>
+      <w:r>
+        <w:t xml:space="preserve">on’t have index.html like we did see in React. </w:t>
+      </w:r>
+    </w:p>
+    <w:p>
+      <w:r>
+        <w:t xml:space="preserve">In </w:t>
+      </w:r>
+      <w:r>
+        <w:rPr>
+          <w:b/>
+          <w:bCs/>
+        </w:rPr>
+        <w:t>networking</w:t>
+      </w:r>
+      <w:r>
+        <w:t xml:space="preserve">, a </w:t>
+      </w:r>
+      <w:r>
+        <w:rPr>
+          <w:b/>
+          <w:bCs/>
+        </w:rPr>
+        <w:t>padlock</w:t>
+      </w:r>
+      <w:r>
+        <w:t xml:space="preserve"> refers to the </w:t>
+      </w:r>
+      <w:r>
+        <w:rPr>
+          <w:b/>
+          <w:bCs/>
+        </w:rPr>
+        <w:t>security lock icon shown in the browser address bar</w:t>
+      </w:r>
       <w:r>
         <w:t xml:space="preserve"> </w:t>
       </w:r>
       <w:r>
+        <w:rPr>
+          <w:rFonts w:ascii="Segoe UI Emoji" w:hAnsi="Segoe UI Emoji" w:cs="Segoe UI Emoji"/>
+        </w:rPr>
+        <w:t>🔒</w:t>
+      </w:r>
+      <w:r>
+        <w:t>.</w:t>
+      </w:r>
+    </w:p>
+    <w:p>
+      <w:pPr>
+        <w:rPr>
+          <w:b/>
+          <w:bCs/>
+        </w:rPr>
+      </w:pPr>
+      <w:r>
+        <w:rPr>
+          <w:b/>
+          <w:bCs/>
+        </w:rPr>
+        <w:t>Meaning</w:t>
+      </w:r>
+    </w:p>
+    <w:p>
+      <w:r>
+        <w:t xml:space="preserve">The padlock indicates that the connection between your </w:t>
+      </w:r>
+      <w:r>
+        <w:rPr>
+          <w:b/>
+          <w:bCs/>
+        </w:rPr>
+        <w:t>browser and the website is secure and encrypted</w:t>
+      </w:r>
+      <w:r>
+        <w:t>.</w:t>
+      </w:r>
+    </w:p>
+    <w:p>
+      <w:pPr>
+        <w:rPr>
+          <w:b/>
+          <w:bCs/>
+        </w:rPr>
+      </w:pPr>
+      <w:r>
+        <w:rPr>
+          <w:b/>
+          <w:bCs/>
+        </w:rPr>
+        <w:t>What it means technically</w:t>
+      </w:r>
+    </w:p>
+    <w:p>
+      <w:r>
+        <w:t xml:space="preserve">It means the website is using </w:t>
+      </w:r>
+      <w:r>
+        <w:rPr>
+          <w:b/>
+          <w:bCs/>
+        </w:rPr>
+        <w:t>HTTPS</w:t>
+      </w:r>
+      <w:r>
+        <w:t xml:space="preserve"> (HTTP Secure) with </w:t>
+      </w:r>
+      <w:r>
+        <w:rPr>
+          <w:b/>
+          <w:bCs/>
+        </w:rPr>
+        <w:t>SSL/TLS encryption</w:t>
+      </w:r>
+      <w:r>
+        <w:t>.</w:t>
+      </w:r>
+    </w:p>
+    <w:p>
+      <w:r>
+        <w:t xml:space="preserve">The digital ocean </w:t>
+      </w:r>
+      <w:r>
+        <w:t>automatically gives you a pad</w:t>
+      </w:r>
+      <w:r>
+        <w:t>lo</w:t>
+      </w:r>
+      <w:r>
+        <w:t xml:space="preserve">ck </w:t>
+      </w:r>
+      <w:r>
+        <w:t>which is also called S</w:t>
+      </w:r>
+      <w:r>
+        <w:t>S</w:t>
+      </w:r>
+      <w:r>
+        <w:t>LV(who knows)</w:t>
+      </w:r>
+      <w:r>
+        <w:t xml:space="preserve"> and </w:t>
+      </w:r>
+      <w:r>
+        <w:t xml:space="preserve">this is a good feature of </w:t>
+      </w:r>
+      <w:r>
+        <w:t xml:space="preserve">the digital ocean. </w:t>
+      </w:r>
+      <w:r>
+        <w:t xml:space="preserve">You can see this I other service providers </w:t>
+      </w:r>
+      <w:r>
+        <w:t xml:space="preserve">Different types of services are provided by all hosting </w:t>
+      </w:r>
+      <w:r>
+        <w:t xml:space="preserve">providers </w:t>
+      </w:r>
+      <w:r>
+        <w:t xml:space="preserve">choose one hosting provider </w:t>
+      </w:r>
+      <w:r>
+        <w:t>and start your work</w:t>
+      </w:r>
+      <w:r>
+        <w:t xml:space="preserve"> according to what is your bu</w:t>
+      </w:r>
+      <w:r>
         <w:t>d</w:t>
       </w:r>
       <w:r>
-        <w:t xml:space="preserve">on’t have index.html like we did see in React. </w:t>
-      </w:r>
-    </w:p>
-    <w:p>
-      <w:r>
-        <w:t xml:space="preserve">In </w:t>
-      </w:r>
-      <w:r>
-        <w:rPr>
-          <w:b/>
-          <w:bCs/>
-        </w:rPr>
-        <w:t>networking</w:t>
-      </w:r>
-      <w:r>
-        <w:t xml:space="preserve">, a </w:t>
-      </w:r>
-      <w:r>
-        <w:rPr>
-          <w:b/>
-          <w:bCs/>
-        </w:rPr>
-        <w:t>padlock</w:t>
-      </w:r>
-      <w:r>
-        <w:t xml:space="preserve"> refers to the </w:t>
-      </w:r>
-      <w:r>
-        <w:rPr>
-          <w:b/>
-          <w:bCs/>
-        </w:rPr>
-        <w:t>security lock icon shown in the browser address bar</w:t>
-      </w:r>
-      <w:r>
-        <w:t xml:space="preserve"> </w:t>
-      </w:r>
-      <w:r>
-        <w:rPr>
-          <w:rFonts w:ascii="Segoe UI Emoji" w:hAnsi="Segoe UI Emoji" w:cs="Segoe UI Emoji"/>
-        </w:rPr>
-        <w:t>🔒</w:t>
+        <w:t xml:space="preserve">get </w:t>
+      </w:r>
+      <w:r>
+        <w:t>and application comple</w:t>
+      </w:r>
+      <w:r>
+        <w:t>x</w:t>
+      </w:r>
+      <w:r>
+        <w:t xml:space="preserve">ity and severity </w:t>
+      </w:r>
+      <w:r>
+        <w:t xml:space="preserve">of the application. </w:t>
+      </w:r>
+      <w:r>
+        <w:t>So if we want that the domain we have need to be pointe</w:t>
+      </w:r>
+      <w:r>
+        <w:t>d</w:t>
+      </w:r>
+      <w:r>
+        <w:t xml:space="preserve"> to the </w:t>
+      </w:r>
+      <w:r>
+        <w:t xml:space="preserve">server then we need to add domain to the </w:t>
+      </w:r>
+      <w:r>
+        <w:t xml:space="preserve">digital ocean. </w:t>
+      </w:r>
+    </w:p>
+    <w:p>
+      <w:r>
+        <w:t xml:space="preserve">When you add domain then </w:t>
+      </w:r>
+      <w:r>
+        <w:t>it will ask you should they manage it or w</w:t>
+      </w:r>
+      <w:r>
+        <w:t xml:space="preserve">e </w:t>
+      </w:r>
+      <w:r>
+        <w:t>should do it</w:t>
+      </w:r>
+    </w:p>
+    <w:p>
+      <w:r>
+        <w:t xml:space="preserve">Of you chose the former then you will  </w:t>
+      </w:r>
+      <w:r>
+        <w:t xml:space="preserve">see that from the dashboard </w:t>
+      </w:r>
+      <w:r>
+        <w:t xml:space="preserve">that how things are happening </w:t>
+      </w:r>
+      <w:r>
+        <w:t xml:space="preserve">and if you chose later </w:t>
+      </w:r>
+      <w:r>
+        <w:t>then you need to point it to a Digital ocean(who knows)</w:t>
+      </w:r>
+      <w:r>
+        <w:t>. By former we bring the domain in the digital ocean(who knows)</w:t>
+      </w:r>
+      <w:r>
+        <w:t xml:space="preserve">. </w:t>
+      </w:r>
+    </w:p>
+    <w:p>
+      <w:r>
+        <w:t xml:space="preserve">Now it follows the </w:t>
+      </w:r>
+      <w:r>
+        <w:t xml:space="preserve">domain </w:t>
+      </w:r>
+      <w:r>
+        <w:t>technique I already know</w:t>
       </w:r>
       <w:r>
         <w:t>.</w:t>
       </w:r>
     </w:p>
     <w:p>
-      <w:pPr>
-        <w:rPr>
-          <w:b/>
-          <w:bCs/>
-        </w:rPr>
-      </w:pPr>
-      <w:r>
-        <w:rPr>
-          <w:b/>
-          <w:bCs/>
-        </w:rPr>
-        <w:t>Meaning</w:t>
-      </w:r>
-    </w:p>
-    <w:p>
-      <w:r>
-        <w:t xml:space="preserve">The padlock indicates that the connection between your </w:t>
-      </w:r>
-      <w:r>
-        <w:rPr>
-          <w:b/>
-          <w:bCs/>
-        </w:rPr>
-        <w:t>browser and the website is secure and encrypted</w:t>
-      </w:r>
-      <w:r>
-        <w:t>.</w:t>
-      </w:r>
-    </w:p>
-    <w:p>
-      <w:pPr>
-        <w:rPr>
-          <w:b/>
-          <w:bCs/>
-        </w:rPr>
-      </w:pPr>
-      <w:r>
-        <w:rPr>
-          <w:b/>
-          <w:bCs/>
-        </w:rPr>
-        <w:t>What it means technically</w:t>
-      </w:r>
-    </w:p>
-    <w:p>
-      <w:r>
-        <w:t xml:space="preserve">It means the website is using </w:t>
-      </w:r>
-      <w:r>
-        <w:rPr>
-          <w:b/>
-          <w:bCs/>
-        </w:rPr>
-        <w:t>HTTPS</w:t>
-      </w:r>
-      <w:r>
-        <w:t xml:space="preserve"> (HTTP Secure) with </w:t>
-      </w:r>
-      <w:r>
-        <w:rPr>
-          <w:b/>
-          <w:bCs/>
-        </w:rPr>
-        <w:t>SSL/TLS encryption</w:t>
-      </w:r>
-      <w:r>
-        <w:t>.</w:t>
-      </w:r>
-    </w:p>
-    <w:p>
-      <w:r>
-        <w:t xml:space="preserve">The digital ocean </w:t>
-      </w:r>
-      <w:r>
-        <w:t>automatically gives you a pad</w:t>
-      </w:r>
-      <w:r>
-        <w:t>lo</w:t>
-      </w:r>
-      <w:r>
-        <w:t xml:space="preserve">ck </w:t>
-      </w:r>
-      <w:r>
-        <w:t xml:space="preserve">which is also called </w:t>
-      </w:r>
-      <w:proofErr w:type="gramStart"/>
-      <w:r>
-        <w:t>S</w:t>
-      </w:r>
-      <w:r>
-        <w:t>S</w:t>
-      </w:r>
-      <w:r>
-        <w:t>LV(</w:t>
-      </w:r>
-      <w:proofErr w:type="gramEnd"/>
-      <w:r>
-        <w:t>who knows)</w:t>
-      </w:r>
-      <w:r>
-        <w:t xml:space="preserve"> and </w:t>
-      </w:r>
-      <w:r>
-        <w:t xml:space="preserve">this is a good feature of </w:t>
-      </w:r>
-      <w:r>
-        <w:t xml:space="preserve">the digital ocean. </w:t>
-      </w:r>
-      <w:r>
-        <w:t xml:space="preserve">You can see this I other service providers </w:t>
-      </w:r>
-      <w:r>
-        <w:t xml:space="preserve">Different types of services are provided by all hosting </w:t>
-      </w:r>
-      <w:r>
-        <w:t xml:space="preserve">providers </w:t>
-      </w:r>
-      <w:r>
-        <w:t xml:space="preserve">choose one hosting provider </w:t>
-      </w:r>
-      <w:r>
-        <w:t>and start your work</w:t>
-      </w:r>
-      <w:r>
-        <w:t xml:space="preserve"> according to what is your bu</w:t>
-      </w:r>
-      <w:r>
-        <w:t>d</w:t>
-      </w:r>
-      <w:r>
-        <w:t xml:space="preserve">get </w:t>
-      </w:r>
-      <w:r>
-        <w:t>and application comple</w:t>
-      </w:r>
-      <w:r>
-        <w:t>x</w:t>
-      </w:r>
-      <w:r>
-        <w:t xml:space="preserve">ity and severity </w:t>
-      </w:r>
-      <w:r>
-        <w:t xml:space="preserve">of the application. </w:t>
-      </w:r>
-      <w:proofErr w:type="gramStart"/>
-      <w:r>
-        <w:t>So</w:t>
-      </w:r>
-      <w:proofErr w:type="gramEnd"/>
-      <w:r>
-        <w:t xml:space="preserve"> if we want that the domain we have need to be pointe</w:t>
-      </w:r>
-      <w:r>
-        <w:t>d</w:t>
-      </w:r>
-      <w:r>
-        <w:t xml:space="preserve"> to the </w:t>
-      </w:r>
-      <w:r>
-        <w:t xml:space="preserve">server then we need to add domain to the </w:t>
-      </w:r>
-      <w:r>
-        <w:t xml:space="preserve">digital ocean. </w:t>
-      </w:r>
-    </w:p>
-    <w:p>
-      <w:r>
-        <w:t xml:space="preserve">When you add domain then </w:t>
-      </w:r>
-      <w:r>
-        <w:t>it will ask you should they manage it or w</w:t>
-      </w:r>
-      <w:r>
-        <w:t xml:space="preserve">e </w:t>
-      </w:r>
-      <w:r>
-        <w:t>should do it</w:t>
-      </w:r>
-    </w:p>
-    <w:p>
-      <w:r>
-        <w:t xml:space="preserve">Of you chose the former then you </w:t>
-      </w:r>
-      <w:proofErr w:type="gramStart"/>
-      <w:r>
-        <w:t xml:space="preserve">will  </w:t>
-      </w:r>
-      <w:r>
-        <w:t>see</w:t>
-      </w:r>
-      <w:proofErr w:type="gramEnd"/>
-      <w:r>
-        <w:t xml:space="preserve"> that from the dashboard </w:t>
-      </w:r>
-      <w:r>
-        <w:t xml:space="preserve">that how things are happening </w:t>
-      </w:r>
-      <w:r>
-        <w:t xml:space="preserve">and if you chose later </w:t>
-      </w:r>
-      <w:r>
-        <w:t xml:space="preserve">then you need to point it to a Digital </w:t>
-      </w:r>
-      <w:proofErr w:type="gramStart"/>
-      <w:r>
-        <w:t>ocean(</w:t>
-      </w:r>
-      <w:proofErr w:type="gramEnd"/>
-      <w:r>
-        <w:t>who knows)</w:t>
-      </w:r>
-      <w:r>
-        <w:t xml:space="preserve">. By former we bring the domain in the digital </w:t>
-      </w:r>
-      <w:proofErr w:type="gramStart"/>
-      <w:r>
-        <w:t>ocean(</w:t>
-      </w:r>
-      <w:proofErr w:type="gramEnd"/>
-      <w:r>
-        <w:t>who knows)</w:t>
-      </w:r>
-      <w:r>
-        <w:t xml:space="preserve">. </w:t>
-      </w:r>
-    </w:p>
-    <w:p>
-      <w:r>
-        <w:t xml:space="preserve">Now it follows the </w:t>
-      </w:r>
-      <w:r>
-        <w:t xml:space="preserve">domain </w:t>
-      </w:r>
-      <w:r>
-        <w:t>technique I already know</w:t>
-      </w:r>
-      <w:r>
-        <w:t>.</w:t>
-      </w:r>
-    </w:p>
-    <w:p>
       <w:r>
         <w:t xml:space="preserve">In former </w:t>
       </w:r>
@@ -3807,13 +2824,8 @@
       </w:r>
     </w:p>
     <w:p>
-      <w:proofErr w:type="gramStart"/>
-      <w:r>
-        <w:t>So</w:t>
-      </w:r>
-      <w:proofErr w:type="gramEnd"/>
-      <w:r>
-        <w:t xml:space="preserve"> we went to Google search console</w:t>
+      <w:r>
+        <w:t>So we went to Google search console</w:t>
       </w:r>
       <w:r>
         <w:t xml:space="preserve"> so we add a property there </w:t>
@@ -3888,15 +2900,7 @@
         <w:t xml:space="preserve">omain </w:t>
       </w:r>
       <w:r>
-        <w:t xml:space="preserve">ad then you need to verify it so it </w:t>
-      </w:r>
-      <w:proofErr w:type="gramStart"/>
-      <w:r>
-        <w:t>give</w:t>
-      </w:r>
-      <w:proofErr w:type="gramEnd"/>
-      <w:r>
-        <w:t xml:space="preserve"> us some text which we will paste in the </w:t>
+        <w:t xml:space="preserve">ad then you need to verify it so it give us some text which we will paste in the </w:t>
       </w:r>
       <w:r>
         <w:t xml:space="preserve">DNS records to give the proof for ownership of domain. </w:t>
@@ -3970,15 +2974,7 @@
     <w:p>
       <w:r>
         <w:lastRenderedPageBreak/>
-        <w:t xml:space="preserve">Now we will make an </w:t>
-      </w:r>
-      <w:proofErr w:type="spellStart"/>
-      <w:r>
-        <w:t>ecomerce</w:t>
-      </w:r>
-      <w:proofErr w:type="spellEnd"/>
-      <w:r>
-        <w:t xml:space="preserve"> store </w:t>
+        <w:t xml:space="preserve">Now we will make an ecomerce store </w:t>
       </w:r>
       <w:r>
         <w:t xml:space="preserve">and we will make pages like </w:t>
@@ -3990,11 +2986,7 @@
         <w:t xml:space="preserve"> and how to integrate </w:t>
       </w:r>
       <w:r>
-        <w:t xml:space="preserve">payment gateway to the </w:t>
-      </w:r>
-      <w:proofErr w:type="gramStart"/>
-      <w:r>
-        <w:t>websi</w:t>
+        <w:t>payment gateway to the websi</w:t>
       </w:r>
       <w:r>
         <w:t>t</w:t>
@@ -4005,23 +2997,14 @@
       <w:r>
         <w:t>.</w:t>
       </w:r>
-      <w:proofErr w:type="gramEnd"/>
       <w:r>
         <w:t xml:space="preserve"> How orders will come </w:t>
       </w:r>
       <w:r>
-        <w:t xml:space="preserve">and how admin panel will be </w:t>
-      </w:r>
-      <w:proofErr w:type="gramStart"/>
-      <w:r>
-        <w:t xml:space="preserve">made </w:t>
-      </w:r>
-      <w:r>
-        <w:t>.</w:t>
-      </w:r>
-      <w:proofErr w:type="gramEnd"/>
-      <w:r>
-        <w:t xml:space="preserve"> F</w:t>
+        <w:t xml:space="preserve">and how admin panel will be made </w:t>
+      </w:r>
+      <w:r>
+        <w:t>. F</w:t>
       </w:r>
       <w:r>
         <w:t>r</w:t>
@@ -4039,15 +3022,7 @@
         <w:t xml:space="preserve">teacher will teach us </w:t>
       </w:r>
       <w:r>
-        <w:t xml:space="preserve">We name it </w:t>
-      </w:r>
-      <w:proofErr w:type="spellStart"/>
-      <w:r>
-        <w:t>codeswear</w:t>
-      </w:r>
-      <w:proofErr w:type="spellEnd"/>
-      <w:r>
-        <w:t xml:space="preserve"> it will be an ecommerce store where we will list our product </w:t>
+        <w:t xml:space="preserve">We name it codeswear it will be an ecommerce store where we will list our product </w:t>
       </w:r>
       <w:r>
         <w:t xml:space="preserve">So we type the command </w:t>
@@ -4073,23 +3048,7 @@
           <w:b/>
           <w:bCs/>
         </w:rPr>
-        <w:t xml:space="preserve"> &lt;</w:t>
-      </w:r>
-      <w:proofErr w:type="spellStart"/>
-      <w:r>
-        <w:rPr>
-          <w:b/>
-          <w:bCs/>
-        </w:rPr>
-        <w:t>appname</w:t>
-      </w:r>
-      <w:proofErr w:type="spellEnd"/>
-      <w:r>
-        <w:rPr>
-          <w:b/>
-          <w:bCs/>
-        </w:rPr>
-        <w:t>&gt;</w:t>
+        <w:t xml:space="preserve"> &lt;appname&gt;</w:t>
       </w:r>
     </w:p>
     <w:p>
@@ -4134,11 +3093,7 @@
         <w:t xml:space="preserve">Now we will see how to setup </w:t>
       </w:r>
       <w:r>
-        <w:t xml:space="preserve">up tailwind with </w:t>
-      </w:r>
-      <w:proofErr w:type="spellStart"/>
-      <w:r>
-        <w:t>Ne</w:t>
+        <w:t>up tailwind with Ne</w:t>
       </w:r>
       <w:r>
         <w:t>x</w:t>
@@ -4146,7 +3101,6 @@
       <w:r>
         <w:t>tjs</w:t>
       </w:r>
-      <w:proofErr w:type="spellEnd"/>
       <w:r>
         <w:t>,</w:t>
       </w:r>
@@ -4163,126 +3117,80 @@
         <w:t xml:space="preserve">optimally </w:t>
       </w:r>
       <w:r>
-        <w:t xml:space="preserve">and will make a black slate of </w:t>
-      </w:r>
-      <w:proofErr w:type="spellStart"/>
-      <w:r>
-        <w:t>codeswear</w:t>
-      </w:r>
-      <w:proofErr w:type="spellEnd"/>
+        <w:t xml:space="preserve">and will make a black slate of codeswear </w:t>
+      </w:r>
+      <w:r>
+        <w:t>(who knows)</w:t>
+      </w:r>
+    </w:p>
+    <w:p>
+      <w:pPr>
+        <w:rPr>
+          <w:b/>
+          <w:bCs/>
+        </w:rPr>
+      </w:pPr>
+      <w:r>
+        <w:rPr>
+          <w:b/>
+          <w:bCs/>
+        </w:rPr>
+        <w:t>A blank slate of a website means starting the website from scratch with no existing design, content, or structure.</w:t>
+      </w:r>
+    </w:p>
+    <w:p>
+      <w:r>
+        <w:t>We will search tailwind css with nextjs</w:t>
+      </w:r>
       <w:r>
         <w:t xml:space="preserve"> </w:t>
       </w:r>
       <w:r>
-        <w:t>(who knows)</w:t>
-      </w:r>
-    </w:p>
-    <w:p>
-      <w:pPr>
-        <w:rPr>
-          <w:b/>
-          <w:bCs/>
-        </w:rPr>
-      </w:pPr>
-      <w:r>
-        <w:rPr>
-          <w:b/>
-          <w:bCs/>
-        </w:rPr>
-        <w:t>A blank slate of a website means starting the website from scratch with no existing design, content, or structure.</w:t>
-      </w:r>
-    </w:p>
-    <w:p>
-      <w:r>
-        <w:t xml:space="preserve">We will search tailwind css with </w:t>
-      </w:r>
-      <w:proofErr w:type="spellStart"/>
-      <w:r>
-        <w:t>nextjs</w:t>
-      </w:r>
-      <w:proofErr w:type="spellEnd"/>
+        <w:t xml:space="preserve">so </w:t>
+      </w:r>
+      <w:r>
+        <w:t>b</w:t>
+      </w:r>
+      <w:r>
+        <w:t xml:space="preserve">y this we will go to official documentation </w:t>
+      </w:r>
+    </w:p>
+    <w:p>
+      <w:r>
+        <w:t>Now in out project folder type thi</w:t>
+      </w:r>
+      <w:r>
+        <w:t xml:space="preserve">s </w:t>
+      </w:r>
+      <w:r>
+        <w:t xml:space="preserve">cammand </w:t>
+      </w:r>
+    </w:p>
+    <w:p>
+      <w:r>
+        <w:t>npm install tailwindcss @tailwindcss/postcss postcss</w:t>
+      </w:r>
       <w:r>
         <w:t xml:space="preserve"> </w:t>
       </w:r>
-      <w:r>
-        <w:t xml:space="preserve">so </w:t>
-      </w:r>
-      <w:r>
-        <w:t>b</w:t>
-      </w:r>
-      <w:r>
-        <w:t xml:space="preserve">y this we will go to official documentation </w:t>
-      </w:r>
-    </w:p>
-    <w:p>
-      <w:r>
-        <w:t>Now in out project folder type thi</w:t>
-      </w:r>
-      <w:r>
-        <w:t xml:space="preserve">s </w:t>
-      </w:r>
-      <w:proofErr w:type="spellStart"/>
-      <w:r>
-        <w:t>cammand</w:t>
-      </w:r>
-      <w:proofErr w:type="spellEnd"/>
+    </w:p>
+    <w:p>
+      <w:r>
+        <w:t>or</w:t>
+      </w:r>
+    </w:p>
+    <w:p>
+      <w:r>
+        <w:t xml:space="preserve"> yarn add </w:t>
+      </w:r>
+      <w:r>
+        <w:t>tailwindcss @tailwindcss/postcss postcss</w:t>
+      </w:r>
       <w:r>
         <w:t xml:space="preserve"> </w:t>
       </w:r>
     </w:p>
     <w:p>
-      <w:proofErr w:type="spellStart"/>
-      <w:r>
-        <w:t>npm</w:t>
-      </w:r>
-      <w:proofErr w:type="spellEnd"/>
-      <w:r>
-        <w:t xml:space="preserve"> install </w:t>
-      </w:r>
-      <w:proofErr w:type="spellStart"/>
-      <w:r>
-        <w:t>tailwindcss</w:t>
-      </w:r>
-      <w:proofErr w:type="spellEnd"/>
-      <w:r>
-        <w:t xml:space="preserve"> @tailwindcss/postcss </w:t>
-      </w:r>
-      <w:proofErr w:type="spellStart"/>
-      <w:r>
-        <w:t>postcss</w:t>
-      </w:r>
-      <w:proofErr w:type="spellEnd"/>
-      <w:r>
-        <w:t xml:space="preserve"> </w:t>
-      </w:r>
-    </w:p>
-    <w:p>
-      <w:r>
-        <w:t>or</w:t>
-      </w:r>
-    </w:p>
-    <w:p>
-      <w:r>
-        <w:t xml:space="preserve"> yarn add </w:t>
-      </w:r>
-      <w:proofErr w:type="spellStart"/>
-      <w:r>
-        <w:t>tailwindcss</w:t>
-      </w:r>
-      <w:proofErr w:type="spellEnd"/>
-      <w:r>
-        <w:t xml:space="preserve"> @tailwindcss/postcss </w:t>
-      </w:r>
-      <w:proofErr w:type="spellStart"/>
-      <w:r>
-        <w:t>postcss</w:t>
-      </w:r>
-      <w:proofErr w:type="spellEnd"/>
-      <w:r>
-        <w:t xml:space="preserve"> </w:t>
-      </w:r>
-    </w:p>
-    <w:p>
       <w:r>
         <w:t>Now the method tea</w:t>
       </w:r>
@@ -4296,15 +3204,7 @@
         <w:t>e</w:t>
       </w:r>
       <w:r>
-        <w:t xml:space="preserve">r is using is </w:t>
-      </w:r>
-      <w:proofErr w:type="spellStart"/>
-      <w:r>
-        <w:t>autdated</w:t>
-      </w:r>
-      <w:proofErr w:type="spellEnd"/>
-      <w:r>
-        <w:t xml:space="preserve"> so we will use moder</w:t>
+        <w:t>r is using is autdated so we will use moder</w:t>
       </w:r>
       <w:r>
         <w:t>n</w:t>
@@ -4342,18 +3242,10 @@
         <w:t xml:space="preserve">Like Bootstrap Tailwind also have </w:t>
       </w:r>
       <w:r>
-        <w:t xml:space="preserve">predefined </w:t>
-      </w:r>
-      <w:proofErr w:type="gramStart"/>
-      <w:r>
-        <w:t xml:space="preserve">class </w:t>
-      </w:r>
-      <w:r>
-        <w:t>.So</w:t>
-      </w:r>
-      <w:proofErr w:type="gramEnd"/>
-      <w:r>
-        <w:t xml:space="preserve"> we have tailwind css is installed </w:t>
+        <w:t xml:space="preserve">predefined class </w:t>
+      </w:r>
+      <w:r>
+        <w:t xml:space="preserve">.So we have tailwind css is installed </w:t>
       </w:r>
       <w:r>
         <w:t>and we can use our utility class</w:t>
@@ -4381,6 +3273,9 @@
         <w:jc w:val="center"/>
       </w:pPr>
       <w:r>
+        <w:rPr>
+          <w:noProof/>
+        </w:rPr>
         <w:drawing>
           <wp:inline distT="0" distB="0" distL="0" distR="0" wp14:anchorId="41EF9B39" wp14:editId="473A88B0">
             <wp:extent cx="1664898" cy="2388767"/>
@@ -4451,6 +3346,86 @@
           <w:bCs/>
         </w:rPr>
         <w:t xml:space="preserve"> </w:t>
+      </w:r>
+    </w:p>
+    <w:p>
+      <w:r>
+        <w:t xml:space="preserve">There are some pages which you will find in almost all Ecommerce website that is </w:t>
+      </w:r>
+      <w:r>
+        <w:t>Product page , Home page</w:t>
+      </w:r>
+      <w:r>
+        <w:t>, Checkout page</w:t>
+      </w:r>
+      <w:r>
+        <w:t>, page when you generate a</w:t>
+      </w:r>
+      <w:r>
+        <w:t>n</w:t>
+      </w:r>
+      <w:r>
+        <w:t xml:space="preserve"> order</w:t>
+      </w:r>
+      <w:r>
+        <w:t xml:space="preserve"> , login and signUp</w:t>
+      </w:r>
+      <w:r>
+        <w:t xml:space="preserve">. We will create their blank slate here </w:t>
+      </w:r>
+      <w:r>
+        <w:t xml:space="preserve">and then we will start </w:t>
+      </w:r>
+      <w:r>
+        <w:t>c</w:t>
+      </w:r>
+      <w:r>
+        <w:t xml:space="preserve">odeswear development </w:t>
+      </w:r>
+    </w:p>
+    <w:p>
+      <w:r>
+        <w:t xml:space="preserve">Whatever you </w:t>
+      </w:r>
+      <w:r>
+        <w:t xml:space="preserve">by [slug] is actually dynamic </w:t>
+      </w:r>
+      <w:r>
+        <w:t xml:space="preserve">page </w:t>
+      </w:r>
+      <w:r>
+        <w:t xml:space="preserve">routes </w:t>
+      </w:r>
+    </w:p>
+    <w:p>
+      <w:r>
+        <w:t>There are many thin</w:t>
+      </w:r>
+      <w:r>
+        <w:t>g</w:t>
+      </w:r>
+      <w:r>
+        <w:t xml:space="preserve">s which we think we need to o on the spot like </w:t>
+      </w:r>
+      <w:r>
+        <w:t xml:space="preserve">Forget Password </w:t>
+      </w:r>
+    </w:p>
+    <w:p>
+      <w:r>
+        <w:t>You can even launch this e</w:t>
+      </w:r>
+      <w:r>
+        <w:t>c</w:t>
+      </w:r>
+      <w:r>
+        <w:t>om</w:t>
+      </w:r>
+      <w:r>
+        <w:t>m</w:t>
+      </w:r>
+      <w:r>
+        <w:t xml:space="preserve">erce site </w:t>
       </w:r>
     </w:p>
     <w:sectPr>
@@ -5223,6 +4198,7 @@
   <w:style w:type="character" w:default="1" w:styleId="DefaultParagraphFont">
     <w:name w:val="Default Paragraph Font"/>
     <w:uiPriority w:val="1"/>
+    <w:semiHidden/>
     <w:unhideWhenUsed/>
   </w:style>
   <w:style w:type="table" w:default="1" w:styleId="TableNormal">

</xml_diff>

<commit_message>
Creating NavBar, Footer & HomePage for Codeswear.com
</commit_message>
<xml_diff>
--- a/Notes2.docx
+++ b/Notes2.docx
@@ -4,8 +4,13 @@
   <w:body>
     <w:p>
       <w:r>
-        <w:t>In this lesson we will see a react feature that is dangerouslysetinnerHTML</w:t>
-      </w:r>
+        <w:t xml:space="preserve">In this lesson we will see a react feature that is </w:t>
+      </w:r>
+      <w:proofErr w:type="spellStart"/>
+      <w:r>
+        <w:t>dangerouslysetinnerHTML</w:t>
+      </w:r>
+      <w:proofErr w:type="spellEnd"/>
     </w:p>
     <w:p>
       <w:pPr>
@@ -54,10 +59,18 @@
     </w:p>
     <w:p>
       <w:r>
-        <w:t>In nay container</w:t>
-      </w:r>
-      <w:r>
-        <w:t>(or component)</w:t>
+        <w:t xml:space="preserve">In nay </w:t>
+      </w:r>
+      <w:proofErr w:type="gramStart"/>
+      <w:r>
+        <w:t>container</w:t>
+      </w:r>
+      <w:r>
+        <w:t>(</w:t>
+      </w:r>
+      <w:proofErr w:type="gramEnd"/>
+      <w:r>
+        <w:t>or component)</w:t>
       </w:r>
       <w:r>
         <w:t xml:space="preserve"> if you want to </w:t>
@@ -66,7 +79,11 @@
         <w:t>input HTML</w:t>
       </w:r>
       <w:r>
-        <w:t xml:space="preserve"> then you have to use dangerou</w:t>
+        <w:t xml:space="preserve"> then you have to use </w:t>
+      </w:r>
+      <w:proofErr w:type="spellStart"/>
+      <w:r>
+        <w:t>dangerou</w:t>
       </w:r>
       <w:r>
         <w:t>s</w:t>
@@ -77,6 +94,7 @@
       <w:r>
         <w:t>setInner</w:t>
       </w:r>
+      <w:proofErr w:type="spellEnd"/>
       <w:r>
         <w:t xml:space="preserve"> </w:t>
       </w:r>
@@ -102,7 +120,15 @@
         <w:t xml:space="preserve">We will see with the help of </w:t>
       </w:r>
       <w:r>
-        <w:t xml:space="preserve">dangerously innerhtml </w:t>
+        <w:t xml:space="preserve">dangerously </w:t>
+      </w:r>
+      <w:proofErr w:type="spellStart"/>
+      <w:r>
+        <w:t>innerhtml</w:t>
+      </w:r>
+      <w:proofErr w:type="spellEnd"/>
+      <w:r>
+        <w:t xml:space="preserve"> </w:t>
       </w:r>
       <w:r>
         <w:t xml:space="preserve">we can put </w:t>
@@ -114,7 +140,15 @@
         <w:t>conten</w:t>
       </w:r>
       <w:r>
-        <w:t>t in huntingcoder which has simple</w:t>
+        <w:t xml:space="preserve">t in </w:t>
+      </w:r>
+      <w:proofErr w:type="spellStart"/>
+      <w:r>
+        <w:t>huntingcoder</w:t>
+      </w:r>
+      <w:proofErr w:type="spellEnd"/>
+      <w:r>
+        <w:t xml:space="preserve"> which has simple</w:t>
       </w:r>
       <w:r>
         <w:t xml:space="preserve"> p and hea</w:t>
@@ -144,7 +178,23 @@
         <w:t xml:space="preserve">Out blog is HTML Now if you </w:t>
       </w:r>
       <w:r>
-        <w:t xml:space="preserve">put html uibside string in json file. </w:t>
+        <w:t xml:space="preserve">put html </w:t>
+      </w:r>
+      <w:proofErr w:type="spellStart"/>
+      <w:r>
+        <w:t>uibside</w:t>
+      </w:r>
+      <w:proofErr w:type="spellEnd"/>
+      <w:r>
+        <w:t xml:space="preserve"> string in </w:t>
+      </w:r>
+      <w:proofErr w:type="spellStart"/>
+      <w:r>
+        <w:t>json</w:t>
+      </w:r>
+      <w:proofErr w:type="spellEnd"/>
+      <w:r>
+        <w:t xml:space="preserve"> file. </w:t>
       </w:r>
       <w:r>
         <w:t xml:space="preserve">We want to write such that </w:t>
@@ -167,7 +217,15 @@
         </w:r>
       </w:hyperlink>
       <w:r>
-        <w:t xml:space="preserve"> and then copy the html content shownin in the first page </w:t>
+        <w:t xml:space="preserve"> and then copy the html content </w:t>
+      </w:r>
+      <w:proofErr w:type="spellStart"/>
+      <w:r>
+        <w:t>shownin</w:t>
+      </w:r>
+      <w:proofErr w:type="spellEnd"/>
+      <w:r>
+        <w:t xml:space="preserve"> in the first page </w:t>
       </w:r>
       <w:r>
         <w:t xml:space="preserve">and at first we paste it in the address bar so that </w:t>
@@ -185,10 +243,26 @@
         <w:t>e</w:t>
       </w:r>
       <w:r>
-        <w:t xml:space="preserve"> and then we search Json and aby any ransom site escape the jaon that is replace “ by /” and many more and then again remove the </w:t>
-      </w:r>
-      <w:r>
-        <w:t>new lines by pasing in the address bar.</w:t>
+        <w:t xml:space="preserve"> and then we search Json and aby any ransom site escape the </w:t>
+      </w:r>
+      <w:proofErr w:type="spellStart"/>
+      <w:r>
+        <w:t>jaon</w:t>
+      </w:r>
+      <w:proofErr w:type="spellEnd"/>
+      <w:r>
+        <w:t xml:space="preserve"> that is replace “ by /” and many more and then again remove the </w:t>
+      </w:r>
+      <w:r>
+        <w:t xml:space="preserve">new lines by </w:t>
+      </w:r>
+      <w:proofErr w:type="spellStart"/>
+      <w:r>
+        <w:t>pasing</w:t>
+      </w:r>
+      <w:proofErr w:type="spellEnd"/>
+      <w:r>
+        <w:t xml:space="preserve"> in the address bar.</w:t>
       </w:r>
     </w:p>
     <w:p>
@@ -259,7 +333,15 @@
         <w:t>It</w:t>
       </w:r>
       <w:r>
-        <w:t>(Nextjs or react)</w:t>
+        <w:t>(</w:t>
+      </w:r>
+      <w:proofErr w:type="spellStart"/>
+      <w:r>
+        <w:t>Nextjs</w:t>
+      </w:r>
+      <w:proofErr w:type="spellEnd"/>
+      <w:r>
+        <w:t xml:space="preserve"> or react)</w:t>
       </w:r>
       <w:r>
         <w:t xml:space="preserve"> wants to keep you sa</w:t>
@@ -276,14 +358,27 @@
       <w:r>
         <w:t xml:space="preserve"> you need to tell </w:t>
       </w:r>
-      <w:r>
-        <w:t xml:space="preserve">Nextjs that you want to parse html </w:t>
+      <w:proofErr w:type="spellStart"/>
+      <w:r>
+        <w:t>Nextjs</w:t>
+      </w:r>
+      <w:proofErr w:type="spellEnd"/>
+      <w:r>
+        <w:t xml:space="preserve"> that you want to parse html </w:t>
       </w:r>
       <w:r>
         <w:t>there is a tool or setting (who knows)</w:t>
       </w:r>
       <w:r>
-        <w:t xml:space="preserve"> and it is a part of react not a part of nextjs </w:t>
+        <w:t xml:space="preserve"> and it is a part of react not a part of </w:t>
+      </w:r>
+      <w:proofErr w:type="spellStart"/>
+      <w:r>
+        <w:t>nextjs</w:t>
+      </w:r>
+      <w:proofErr w:type="spellEnd"/>
+      <w:r>
+        <w:t xml:space="preserve"> </w:t>
       </w:r>
       <w:r>
         <w:t xml:space="preserve">as it is a feature of react </w:t>
@@ -339,10 +434,23 @@
     </w:p>
     <w:p>
       <w:r>
-        <w:t>The element where you used dangerouslyinnerHTML</w:t>
-      </w:r>
-      <w:r>
-        <w:t xml:space="preserve"> should not have space in the content as it is considered a content other wise you will get this error</w:t>
+        <w:t xml:space="preserve">The element where you used </w:t>
+      </w:r>
+      <w:proofErr w:type="spellStart"/>
+      <w:r>
+        <w:t>dangerouslyinnerHTML</w:t>
+      </w:r>
+      <w:proofErr w:type="spellEnd"/>
+      <w:r>
+        <w:t xml:space="preserve"> should not have space in the content as it is considered a content </w:t>
+      </w:r>
+      <w:proofErr w:type="spellStart"/>
+      <w:r>
+        <w:t>other wise</w:t>
+      </w:r>
+      <w:proofErr w:type="spellEnd"/>
+      <w:r>
+        <w:t xml:space="preserve"> you will get this error</w:t>
       </w:r>
     </w:p>
     <w:p>
@@ -390,7 +498,15 @@
     </w:p>
     <w:p>
       <w:r>
-        <w:t>Now our slug folder page.jsx look like below</w:t>
+        <w:t xml:space="preserve">Now our slug folder </w:t>
+      </w:r>
+      <w:proofErr w:type="spellStart"/>
+      <w:r>
+        <w:t>page.jsx</w:t>
+      </w:r>
+      <w:proofErr w:type="spellEnd"/>
+      <w:r>
+        <w:t xml:space="preserve"> look like below</w:t>
       </w:r>
     </w:p>
     <w:p>
@@ -439,9 +555,14 @@
       </w:r>
     </w:p>
     <w:p>
+      <w:proofErr w:type="gramStart"/>
       <w:r>
         <w:lastRenderedPageBreak/>
-        <w:t>So we can so this thing Now we can see it is getting rendered as shown below</w:t>
+        <w:t>So</w:t>
+      </w:r>
+      <w:proofErr w:type="gramEnd"/>
+      <w:r>
+        <w:t xml:space="preserve"> we can so this thing Now we can see it is getting rendered as shown below</w:t>
       </w:r>
     </w:p>
     <w:p>
@@ -543,8 +664,13 @@
         <w:t xml:space="preserve"> s</w:t>
       </w:r>
       <w:r>
-        <w:t>ubmit the form</w:t>
-      </w:r>
+        <w:t xml:space="preserve">ubmit the </w:t>
+      </w:r>
+      <w:proofErr w:type="gramStart"/>
+      <w:r>
+        <w:t>form</w:t>
+      </w:r>
+      <w:proofErr w:type="gramEnd"/>
       <w:r>
         <w:t xml:space="preserve"> we will definitely have to make an API to co</w:t>
       </w:r>
@@ -563,8 +689,13 @@
       <w:r>
         <w:t xml:space="preserve"> </w:t>
       </w:r>
-      <w:r>
-        <w:t>api in this lesso</w:t>
+      <w:proofErr w:type="spellStart"/>
+      <w:r>
+        <w:t>api</w:t>
+      </w:r>
+      <w:proofErr w:type="spellEnd"/>
+      <w:r>
+        <w:t xml:space="preserve"> in this lesso</w:t>
       </w:r>
       <w:r>
         <w:t>n. We will see make it using Next.js API route</w:t>
@@ -587,13 +718,47 @@
       <w:r>
         <w:t xml:space="preserve">it </w:t>
       </w:r>
-      <w:r>
-        <w:t>Seom noownards I will not give too much explanation</w:t>
-      </w:r>
-    </w:p>
-    <w:p>
-      <w:r>
-        <w:t>So for now our post request handler look like below</w:t>
+      <w:proofErr w:type="spellStart"/>
+      <w:r>
+        <w:t>Seom</w:t>
+      </w:r>
+      <w:proofErr w:type="spellEnd"/>
+      <w:r>
+        <w:t xml:space="preserve"> </w:t>
+      </w:r>
+      <w:proofErr w:type="spellStart"/>
+      <w:r>
+        <w:t>noownards</w:t>
+      </w:r>
+      <w:proofErr w:type="spellEnd"/>
+      <w:r>
+        <w:t xml:space="preserve"> I will not give too much explanation</w:t>
+      </w:r>
+    </w:p>
+    <w:p>
+      <w:proofErr w:type="gramStart"/>
+      <w:r>
+        <w:t>So</w:t>
+      </w:r>
+      <w:proofErr w:type="gramEnd"/>
+      <w:r>
+        <w:t xml:space="preserve"> for </w:t>
+      </w:r>
+      <w:proofErr w:type="gramStart"/>
+      <w:r>
+        <w:t>now</w:t>
+      </w:r>
+      <w:proofErr w:type="gramEnd"/>
+      <w:r>
+        <w:t xml:space="preserve"> our post request handler </w:t>
+      </w:r>
+      <w:proofErr w:type="gramStart"/>
+      <w:r>
+        <w:t>look</w:t>
+      </w:r>
+      <w:proofErr w:type="gramEnd"/>
+      <w:r>
+        <w:t xml:space="preserve"> like below</w:t>
       </w:r>
     </w:p>
     <w:p>
@@ -642,8 +807,13 @@
       </w:r>
     </w:p>
     <w:p>
-      <w:r>
-        <w:t>Ols version used to look like below</w:t>
+      <w:proofErr w:type="gramStart"/>
+      <w:r>
+        <w:t>Ols</w:t>
+      </w:r>
+      <w:proofErr w:type="gramEnd"/>
+      <w:r>
+        <w:t xml:space="preserve"> version used to look like below</w:t>
       </w:r>
     </w:p>
     <w:p>
@@ -717,12 +887,28 @@
     </w:p>
     <w:p>
       <w:r>
-        <w:t xml:space="preserve">In older version teacher try to send req but could not send because </w:t>
-      </w:r>
-    </w:p>
-    <w:p>
-      <w:r>
-        <w:t xml:space="preserve">You didn’t see useful data because req is a </w:t>
+        <w:t xml:space="preserve">In older version teacher try to send </w:t>
+      </w:r>
+      <w:proofErr w:type="spellStart"/>
+      <w:r>
+        <w:t>req</w:t>
+      </w:r>
+      <w:proofErr w:type="spellEnd"/>
+      <w:r>
+        <w:t xml:space="preserve"> but could not send because </w:t>
+      </w:r>
+    </w:p>
+    <w:p>
+      <w:r>
+        <w:t xml:space="preserve">You didn’t see useful data because </w:t>
+      </w:r>
+      <w:proofErr w:type="spellStart"/>
+      <w:r>
+        <w:t>req</w:t>
+      </w:r>
+      <w:proofErr w:type="spellEnd"/>
+      <w:r>
+        <w:t xml:space="preserve"> is a </w:t>
       </w:r>
       <w:r>
         <w:rPr>
@@ -732,7 +918,25 @@
         <w:t>complex object</w:t>
       </w:r>
       <w:r>
-        <w:t>, not plain JSON, so sending it directly with res.json(req) doesn’t work as expected.</w:t>
+        <w:t xml:space="preserve">, not plain JSON, so sending it directly with </w:t>
+      </w:r>
+      <w:proofErr w:type="spellStart"/>
+      <w:proofErr w:type="gramStart"/>
+      <w:r>
+        <w:t>res.json</w:t>
+      </w:r>
+      <w:proofErr w:type="spellEnd"/>
+      <w:proofErr w:type="gramEnd"/>
+      <w:r>
+        <w:t>(</w:t>
+      </w:r>
+      <w:proofErr w:type="spellStart"/>
+      <w:r>
+        <w:t>req</w:t>
+      </w:r>
+      <w:proofErr w:type="spellEnd"/>
+      <w:r>
+        <w:t>) doesn’t work as expected.</w:t>
       </w:r>
     </w:p>
     <w:p>
@@ -754,7 +958,23 @@
           <w:b/>
           <w:bCs/>
         </w:rPr>
-        <w:t>What req contains (old Next.js / Node.js)</w:t>
+        <w:t xml:space="preserve">What </w:t>
+      </w:r>
+      <w:proofErr w:type="spellStart"/>
+      <w:r>
+        <w:rPr>
+          <w:b/>
+          <w:bCs/>
+        </w:rPr>
+        <w:t>req</w:t>
+      </w:r>
+      <w:proofErr w:type="spellEnd"/>
+      <w:r>
+        <w:rPr>
+          <w:b/>
+          <w:bCs/>
+        </w:rPr>
+        <w:t xml:space="preserve"> contains (old Next.js / Node.js)</w:t>
       </w:r>
     </w:p>
     <w:p>
@@ -764,12 +984,30 @@
     </w:p>
     <w:p>
       <w:r>
-        <w:t>export default function handler(req, res)</w:t>
-      </w:r>
-    </w:p>
-    <w:p>
-      <w:r>
-        <w:t xml:space="preserve">req is a </w:t>
+        <w:t xml:space="preserve">export default function </w:t>
+      </w:r>
+      <w:proofErr w:type="gramStart"/>
+      <w:r>
+        <w:t>handler(</w:t>
+      </w:r>
+      <w:proofErr w:type="spellStart"/>
+      <w:proofErr w:type="gramEnd"/>
+      <w:r>
+        <w:t>req</w:t>
+      </w:r>
+      <w:proofErr w:type="spellEnd"/>
+      <w:r>
+        <w:t>, res)</w:t>
+      </w:r>
+    </w:p>
+    <w:p>
+      <w:proofErr w:type="spellStart"/>
+      <w:r>
+        <w:t>req</w:t>
+      </w:r>
+      <w:proofErr w:type="spellEnd"/>
+      <w:r>
+        <w:t xml:space="preserve"> is a </w:t>
       </w:r>
       <w:r>
         <w:rPr>
@@ -856,7 +1094,41 @@
           <w:b/>
           <w:bCs/>
         </w:rPr>
-        <w:t>Why res.json(req) doesn’t show data</w:t>
+        <w:t xml:space="preserve">Why </w:t>
+      </w:r>
+      <w:proofErr w:type="spellStart"/>
+      <w:proofErr w:type="gramStart"/>
+      <w:r>
+        <w:rPr>
+          <w:b/>
+          <w:bCs/>
+        </w:rPr>
+        <w:t>res.json</w:t>
+      </w:r>
+      <w:proofErr w:type="spellEnd"/>
+      <w:proofErr w:type="gramEnd"/>
+      <w:r>
+        <w:rPr>
+          <w:b/>
+          <w:bCs/>
+        </w:rPr>
+        <w:t>(</w:t>
+      </w:r>
+      <w:proofErr w:type="spellStart"/>
+      <w:r>
+        <w:rPr>
+          <w:b/>
+          <w:bCs/>
+        </w:rPr>
+        <w:t>req</w:t>
+      </w:r>
+      <w:proofErr w:type="spellEnd"/>
+      <w:r>
+        <w:rPr>
+          <w:b/>
+          <w:bCs/>
+        </w:rPr>
+        <w:t>) doesn’t show data</w:t>
       </w:r>
     </w:p>
     <w:p>
@@ -865,8 +1137,36 @@
       </w:r>
     </w:p>
     <w:p>
-      <w:r>
-        <w:t>res.status(200).json(req)</w:t>
+      <w:proofErr w:type="spellStart"/>
+      <w:proofErr w:type="gramStart"/>
+      <w:r>
+        <w:t>res.status</w:t>
+      </w:r>
+      <w:proofErr w:type="spellEnd"/>
+      <w:proofErr w:type="gramEnd"/>
+      <w:r>
+        <w:t>(200</w:t>
+      </w:r>
+      <w:proofErr w:type="gramStart"/>
+      <w:r>
+        <w:t>).</w:t>
+      </w:r>
+      <w:proofErr w:type="spellStart"/>
+      <w:r>
+        <w:t>json</w:t>
+      </w:r>
+      <w:proofErr w:type="spellEnd"/>
+      <w:proofErr w:type="gramEnd"/>
+      <w:r>
+        <w:t>(</w:t>
+      </w:r>
+      <w:proofErr w:type="spellStart"/>
+      <w:r>
+        <w:t>req</w:t>
+      </w:r>
+      <w:proofErr w:type="spellEnd"/>
+      <w:r>
+        <w:t>)</w:t>
       </w:r>
     </w:p>
     <w:p>
@@ -875,8 +1175,13 @@
       </w:r>
     </w:p>
     <w:p>
-      <w:r>
-        <w:t>req is NOT a plain object</w:t>
+      <w:proofErr w:type="spellStart"/>
+      <w:r>
+        <w:t>req</w:t>
+      </w:r>
+      <w:proofErr w:type="spellEnd"/>
+      <w:r>
+        <w:t xml:space="preserve"> is NOT a plain object</w:t>
       </w:r>
       <w:r>
         <w:br/>
@@ -952,27 +1257,103 @@
     </w:p>
     <w:p>
       <w:r>
-        <w:t>export default function handler(req, res) {</w:t>
+        <w:t xml:space="preserve">export default function </w:t>
+      </w:r>
+      <w:proofErr w:type="gramStart"/>
+      <w:r>
+        <w:t>handler(</w:t>
+      </w:r>
+      <w:proofErr w:type="spellStart"/>
+      <w:proofErr w:type="gramEnd"/>
+      <w:r>
+        <w:t>req</w:t>
+      </w:r>
+      <w:proofErr w:type="spellEnd"/>
+      <w:r>
+        <w:t>, res) {</w:t>
       </w:r>
       <w:r>
         <w:br/>
-        <w:t xml:space="preserve">  if (req.method === "POST") {</w:t>
+        <w:t xml:space="preserve">  if (</w:t>
+      </w:r>
+      <w:proofErr w:type="spellStart"/>
+      <w:proofErr w:type="gramStart"/>
+      <w:r>
+        <w:t>req.method</w:t>
+      </w:r>
+      <w:proofErr w:type="spellEnd"/>
+      <w:proofErr w:type="gramEnd"/>
+      <w:r>
+        <w:t xml:space="preserve"> === "POST") {</w:t>
       </w:r>
       <w:r>
         <w:br/>
-        <w:t xml:space="preserve">    res.status(200).json({</w:t>
+        <w:t xml:space="preserve">    </w:t>
+      </w:r>
+      <w:proofErr w:type="spellStart"/>
+      <w:proofErr w:type="gramStart"/>
+      <w:r>
+        <w:t>res.status</w:t>
+      </w:r>
+      <w:proofErr w:type="spellEnd"/>
+      <w:proofErr w:type="gramEnd"/>
+      <w:r>
+        <w:t>(200</w:t>
+      </w:r>
+      <w:proofErr w:type="gramStart"/>
+      <w:r>
+        <w:t>).</w:t>
+      </w:r>
+      <w:proofErr w:type="spellStart"/>
+      <w:r>
+        <w:t>json</w:t>
+      </w:r>
+      <w:proofErr w:type="spellEnd"/>
+      <w:proofErr w:type="gramEnd"/>
+      <w:r>
+        <w:t>({</w:t>
       </w:r>
       <w:r>
         <w:br/>
-        <w:t xml:space="preserve">      method: req.method,</w:t>
+        <w:t xml:space="preserve">      method: </w:t>
+      </w:r>
+      <w:proofErr w:type="spellStart"/>
+      <w:proofErr w:type="gramStart"/>
+      <w:r>
+        <w:t>req.method</w:t>
+      </w:r>
+      <w:proofErr w:type="spellEnd"/>
+      <w:proofErr w:type="gramEnd"/>
+      <w:r>
+        <w:t>,</w:t>
       </w:r>
       <w:r>
         <w:br/>
-        <w:t xml:space="preserve">      body: req.body,</w:t>
+        <w:t xml:space="preserve">      body: </w:t>
+      </w:r>
+      <w:proofErr w:type="spellStart"/>
+      <w:proofErr w:type="gramStart"/>
+      <w:r>
+        <w:t>req.body</w:t>
+      </w:r>
+      <w:proofErr w:type="spellEnd"/>
+      <w:proofErr w:type="gramEnd"/>
+      <w:r>
+        <w:t>,</w:t>
       </w:r>
       <w:r>
         <w:br/>
-        <w:t xml:space="preserve">      query: req.query,</w:t>
+        <w:t xml:space="preserve">      query: </w:t>
+      </w:r>
+      <w:proofErr w:type="spellStart"/>
+      <w:proofErr w:type="gramStart"/>
+      <w:r>
+        <w:t>req.query</w:t>
+      </w:r>
+      <w:proofErr w:type="spellEnd"/>
+      <w:proofErr w:type="gramEnd"/>
+      <w:r>
+        <w:t>,</w:t>
       </w:r>
       <w:r>
         <w:br/>
@@ -980,8 +1361,12 @@
       </w:r>
       <w:r>
         <w:br/>
+      </w:r>
+      <w:proofErr w:type="gramStart"/>
+      <w:r>
         <w:t xml:space="preserve">  }</w:t>
       </w:r>
+      <w:proofErr w:type="gramEnd"/>
       <w:r>
         <w:br/>
         <w:t>}</w:t>
@@ -1096,8 +1481,13 @@
             <w:hideMark/>
           </w:tcPr>
           <w:p>
+            <w:proofErr w:type="spellStart"/>
             <w:r>
-              <w:t>req (whole object)</w:t>
+              <w:t>req</w:t>
+            </w:r>
+            <w:proofErr w:type="spellEnd"/>
+            <w:r>
+              <w:t xml:space="preserve"> (whole object)</w:t>
             </w:r>
           </w:p>
         </w:tc>
@@ -1131,9 +1521,13 @@
             <w:hideMark/>
           </w:tcPr>
           <w:p>
+            <w:proofErr w:type="spellStart"/>
+            <w:proofErr w:type="gramStart"/>
             <w:r>
               <w:t>req.body</w:t>
             </w:r>
+            <w:proofErr w:type="spellEnd"/>
+            <w:proofErr w:type="gramEnd"/>
           </w:p>
         </w:tc>
         <w:tc>
@@ -1166,9 +1560,13 @@
             <w:hideMark/>
           </w:tcPr>
           <w:p>
+            <w:proofErr w:type="spellStart"/>
+            <w:proofErr w:type="gramStart"/>
             <w:r>
               <w:t>req.query</w:t>
             </w:r>
+            <w:proofErr w:type="spellEnd"/>
+            <w:proofErr w:type="gramEnd"/>
           </w:p>
         </w:tc>
         <w:tc>
@@ -1201,9 +1599,13 @@
             <w:hideMark/>
           </w:tcPr>
           <w:p>
+            <w:proofErr w:type="spellStart"/>
+            <w:proofErr w:type="gramStart"/>
             <w:r>
               <w:t>req.method</w:t>
             </w:r>
+            <w:proofErr w:type="spellEnd"/>
+            <w:proofErr w:type="gramEnd"/>
           </w:p>
         </w:tc>
         <w:tc>
@@ -1255,7 +1657,20 @@
     </w:p>
     <w:p>
       <w:r>
-        <w:t>export async function POST(req)</w:t>
+        <w:t xml:space="preserve">export async function </w:t>
+      </w:r>
+      <w:proofErr w:type="gramStart"/>
+      <w:r>
+        <w:t>POST(</w:t>
+      </w:r>
+      <w:proofErr w:type="spellStart"/>
+      <w:proofErr w:type="gramEnd"/>
+      <w:r>
+        <w:t>req</w:t>
+      </w:r>
+      <w:proofErr w:type="spellEnd"/>
+      <w:r>
+        <w:t>)</w:t>
       </w:r>
     </w:p>
     <w:p>
@@ -1264,8 +1679,23 @@
       </w:r>
     </w:p>
     <w:p>
-      <w:r>
-        <w:t>const body = await req.json();</w:t>
+      <w:proofErr w:type="spellStart"/>
+      <w:r>
+        <w:t>const</w:t>
+      </w:r>
+      <w:proofErr w:type="spellEnd"/>
+      <w:r>
+        <w:t xml:space="preserve"> body = await </w:t>
+      </w:r>
+      <w:proofErr w:type="spellStart"/>
+      <w:proofErr w:type="gramStart"/>
+      <w:r>
+        <w:t>req.json</w:t>
+      </w:r>
+      <w:proofErr w:type="spellEnd"/>
+      <w:proofErr w:type="gramEnd"/>
+      <w:r>
+        <w:t>();</w:t>
       </w:r>
     </w:p>
     <w:p>
@@ -1308,13 +1738,31 @@
       </w:pPr>
       <w:r>
         <w:lastRenderedPageBreak/>
-        <w:t>You didn’t see req in the response because it’s a complex object that cannot be directly converted to JSON—you need to se</w:t>
+        <w:t xml:space="preserve">You didn’t see </w:t>
+      </w:r>
+      <w:proofErr w:type="spellStart"/>
+      <w:r>
+        <w:t>req</w:t>
+      </w:r>
+      <w:proofErr w:type="spellEnd"/>
+      <w:r>
+        <w:t xml:space="preserve"> in the response because it’s a complex object that cannot be directly converted to JSON—you need to se</w:t>
       </w:r>
       <w:r>
         <w:t>n</w:t>
       </w:r>
       <w:r>
-        <w:t>d specific fields like req.body.</w:t>
+        <w:t xml:space="preserve">d specific fields like </w:t>
+      </w:r>
+      <w:proofErr w:type="spellStart"/>
+      <w:proofErr w:type="gramStart"/>
+      <w:r>
+        <w:t>req.body</w:t>
+      </w:r>
+      <w:proofErr w:type="spellEnd"/>
+      <w:proofErr w:type="gramEnd"/>
+      <w:r>
+        <w:t>.</w:t>
       </w:r>
     </w:p>
     <w:p>
@@ -1322,7 +1770,15 @@
         <w:t>In older version we used to get body like we did in n</w:t>
       </w:r>
       <w:r>
-        <w:t>ode js but in modern it look like below</w:t>
+        <w:t xml:space="preserve">ode js but in modern it </w:t>
+      </w:r>
+      <w:proofErr w:type="gramStart"/>
+      <w:r>
+        <w:t>look</w:t>
+      </w:r>
+      <w:proofErr w:type="gramEnd"/>
+      <w:r>
+        <w:t xml:space="preserve"> like below</w:t>
       </w:r>
     </w:p>
     <w:p>
@@ -1425,13 +1881,45 @@
         <w:t>The problem with the file making</w:t>
       </w:r>
       <w:r>
-        <w:t xml:space="preserve"> strategy </w:t>
-      </w:r>
-      <w:r>
-        <w:t xml:space="preserve"> is that </w:t>
-      </w:r>
-      <w:r>
-        <w:t xml:space="preserve">if suppose oint fail is failed to wiriteen an empyty fie is created </w:t>
+        <w:t xml:space="preserve"> </w:t>
+      </w:r>
+      <w:proofErr w:type="gramStart"/>
+      <w:r>
+        <w:t xml:space="preserve">strategy </w:t>
+      </w:r>
+      <w:r>
+        <w:t xml:space="preserve"> is</w:t>
+      </w:r>
+      <w:proofErr w:type="gramEnd"/>
+      <w:r>
+        <w:t xml:space="preserve"> that </w:t>
+      </w:r>
+      <w:r>
+        <w:t xml:space="preserve">if suppose </w:t>
+      </w:r>
+      <w:proofErr w:type="spellStart"/>
+      <w:r>
+        <w:t>oint</w:t>
+      </w:r>
+      <w:proofErr w:type="spellEnd"/>
+      <w:r>
+        <w:t xml:space="preserve"> fail is failed to </w:t>
+      </w:r>
+      <w:proofErr w:type="spellStart"/>
+      <w:r>
+        <w:t>wiriteen</w:t>
+      </w:r>
+      <w:proofErr w:type="spellEnd"/>
+      <w:r>
+        <w:t xml:space="preserve"> an </w:t>
+      </w:r>
+      <w:proofErr w:type="spellStart"/>
+      <w:r>
+        <w:t>empyty</w:t>
+      </w:r>
+      <w:proofErr w:type="spellEnd"/>
+      <w:r>
+        <w:t xml:space="preserve"> fie is created </w:t>
       </w:r>
       <w:r>
         <w:t>problem can happen (maybe if we associate a number to a user who tries to contact (who knows))</w:t>
@@ -1493,7 +1981,15 @@
       </w:r>
       <w:r>
         <w:lastRenderedPageBreak/>
-        <w:t xml:space="preserve">This error we may face if we son’t set the value of the input fields </w:t>
+        <w:t xml:space="preserve">This error we may face if we </w:t>
+      </w:r>
+      <w:proofErr w:type="spellStart"/>
+      <w:r>
+        <w:t>son’t</w:t>
+      </w:r>
+      <w:proofErr w:type="spellEnd"/>
+      <w:r>
+        <w:t xml:space="preserve"> set the value of the input fields </w:t>
       </w:r>
     </w:p>
     <w:p>
@@ -1501,29 +1997,113 @@
         <w:t xml:space="preserve">In older version </w:t>
       </w:r>
       <w:r>
-        <w:t>we used to put the state value in between the textarea element</w:t>
-      </w:r>
-      <w:r>
-        <w:t>(who knows may be I am wrong here)</w:t>
-      </w:r>
+        <w:t xml:space="preserve">we used to put the state value in between the </w:t>
+      </w:r>
+      <w:proofErr w:type="spellStart"/>
+      <w:r>
+        <w:t>textarea</w:t>
+      </w:r>
+      <w:proofErr w:type="spellEnd"/>
       <w:r>
         <w:t xml:space="preserve"> </w:t>
       </w:r>
-      <w:r>
-        <w:t>and on state update method we used e.target.innerText</w:t>
-      </w:r>
-    </w:p>
-    <w:p>
-      <w:r>
-        <w:t>But now in Textare we can use e.target,value as value attribute is used in the Textfi</w:t>
+      <w:proofErr w:type="gramStart"/>
+      <w:r>
+        <w:t>element</w:t>
+      </w:r>
+      <w:r>
+        <w:t>(</w:t>
+      </w:r>
+      <w:proofErr w:type="gramEnd"/>
+      <w:r>
+        <w:t xml:space="preserve">who knows </w:t>
+      </w:r>
+      <w:proofErr w:type="gramStart"/>
+      <w:r>
+        <w:t>may be</w:t>
+      </w:r>
+      <w:proofErr w:type="gramEnd"/>
+      <w:r>
+        <w:t xml:space="preserve"> I am wrong here)</w:t>
+      </w:r>
+      <w:r>
+        <w:t xml:space="preserve"> </w:t>
+      </w:r>
+      <w:r>
+        <w:t xml:space="preserve">and on state update method we used </w:t>
+      </w:r>
+      <w:proofErr w:type="spellStart"/>
+      <w:proofErr w:type="gramStart"/>
+      <w:r>
+        <w:t>e.target</w:t>
+      </w:r>
+      <w:proofErr w:type="gramEnd"/>
+      <w:r>
+        <w:t>.innerText</w:t>
+      </w:r>
+      <w:proofErr w:type="spellEnd"/>
+    </w:p>
+    <w:p>
+      <w:r>
+        <w:t xml:space="preserve">But now in </w:t>
+      </w:r>
+      <w:proofErr w:type="spellStart"/>
+      <w:r>
+        <w:t>Textare</w:t>
+      </w:r>
+      <w:proofErr w:type="spellEnd"/>
+      <w:r>
+        <w:t xml:space="preserve"> we can use </w:t>
+      </w:r>
+      <w:proofErr w:type="spellStart"/>
+      <w:proofErr w:type="gramStart"/>
+      <w:r>
+        <w:t>e.target</w:t>
+      </w:r>
+      <w:proofErr w:type="gramEnd"/>
+      <w:r>
+        <w:t>,value</w:t>
+      </w:r>
+      <w:proofErr w:type="spellEnd"/>
+      <w:r>
+        <w:t xml:space="preserve"> as value attribute is used in the </w:t>
+      </w:r>
+      <w:proofErr w:type="spellStart"/>
+      <w:r>
+        <w:t>Textfi</w:t>
       </w:r>
       <w:r>
         <w:t>eld</w:t>
       </w:r>
-    </w:p>
-    <w:p>
-      <w:r>
-        <w:t>The API may not give json response but instead uit may text reponse who knows and we can parse it by text method in response we are fetching</w:t>
+      <w:proofErr w:type="spellEnd"/>
+    </w:p>
+    <w:p>
+      <w:r>
+        <w:t xml:space="preserve">The API may not give </w:t>
+      </w:r>
+      <w:proofErr w:type="spellStart"/>
+      <w:r>
+        <w:t>json</w:t>
+      </w:r>
+      <w:proofErr w:type="spellEnd"/>
+      <w:r>
+        <w:t xml:space="preserve"> response but instead </w:t>
+      </w:r>
+      <w:proofErr w:type="spellStart"/>
+      <w:r>
+        <w:t>uit</w:t>
+      </w:r>
+      <w:proofErr w:type="spellEnd"/>
+      <w:r>
+        <w:t xml:space="preserve"> may text </w:t>
+      </w:r>
+      <w:proofErr w:type="spellStart"/>
+      <w:r>
+        <w:t>reponse</w:t>
+      </w:r>
+      <w:proofErr w:type="spellEnd"/>
+      <w:r>
+        <w:t xml:space="preserve"> who knows and we can parse it by text method in response we are fetching</w:t>
       </w:r>
       <w:r>
         <w:t xml:space="preserve"> as shown below</w:t>
@@ -1595,8 +2175,19 @@
     </w:p>
     <w:p>
       <w:r>
-        <w:t xml:space="preserve">Shortcut for margin:auto will be </w:t>
-      </w:r>
+        <w:t xml:space="preserve">Shortcut for </w:t>
+      </w:r>
+      <w:proofErr w:type="spellStart"/>
+      <w:proofErr w:type="gramStart"/>
+      <w:r>
+        <w:t>margin:auto</w:t>
+      </w:r>
+      <w:proofErr w:type="spellEnd"/>
+      <w:proofErr w:type="gramEnd"/>
+      <w:r>
+        <w:t xml:space="preserve"> will be </w:t>
+      </w:r>
+      <w:proofErr w:type="gramStart"/>
       <w:r>
         <w:rPr>
           <w:b/>
@@ -1604,6 +2195,7 @@
         </w:rPr>
         <w:t>m:auto</w:t>
       </w:r>
+      <w:proofErr w:type="gramEnd"/>
       <w:r>
         <w:rPr>
           <w:b/>
@@ -1612,12 +2204,25 @@
         <w:t xml:space="preserve"> </w:t>
       </w:r>
       <w:r>
-        <w:t>in VSCode</w:t>
-      </w:r>
-    </w:p>
-    <w:p>
-      <w:r>
-        <w:t xml:space="preserve">In name of logic we forgot to style outpages are not responsive which teacher will talk about in upcoming lesson </w:t>
+        <w:t xml:space="preserve">in </w:t>
+      </w:r>
+      <w:proofErr w:type="spellStart"/>
+      <w:r>
+        <w:t>VSCode</w:t>
+      </w:r>
+      <w:proofErr w:type="spellEnd"/>
+    </w:p>
+    <w:p>
+      <w:r>
+        <w:t xml:space="preserve">In name of logic we forgot to style </w:t>
+      </w:r>
+      <w:proofErr w:type="spellStart"/>
+      <w:r>
+        <w:t>outpages</w:t>
+      </w:r>
+      <w:proofErr w:type="spellEnd"/>
+      <w:r>
+        <w:t xml:space="preserve"> are not responsive which teacher will talk about in upcoming lesson </w:t>
       </w:r>
       <w:r>
         <w:t xml:space="preserve">we will see how to keep styling of </w:t>
@@ -1654,10 +2259,18 @@
     </w:p>
     <w:p>
       <w:r>
-        <w:t xml:space="preserve">Suppose you have 50 blogs and you want to show 5 blogs on each pages </w:t>
-      </w:r>
-      <w:r>
-        <w:t xml:space="preserve"> so 10 pages </w:t>
+        <w:t xml:space="preserve">Suppose you have 50 blogs and you want to show 5 blogs on each </w:t>
+      </w:r>
+      <w:proofErr w:type="gramStart"/>
+      <w:r>
+        <w:t xml:space="preserve">pages </w:t>
+      </w:r>
+      <w:r>
+        <w:t xml:space="preserve"> so</w:t>
+      </w:r>
+      <w:proofErr w:type="gramEnd"/>
+      <w:r>
+        <w:t xml:space="preserve"> 10 pages </w:t>
       </w:r>
       <w:r>
         <w:t>will</w:t>
@@ -1668,11 +2281,16 @@
       <w:r>
         <w:t xml:space="preserve">be </w:t>
       </w:r>
+      <w:proofErr w:type="gramStart"/>
       <w:r>
         <w:t xml:space="preserve">formed </w:t>
       </w:r>
       <w:r>
-        <w:t xml:space="preserve">. In the similar way </w:t>
+        <w:t>.</w:t>
+      </w:r>
+      <w:proofErr w:type="gramEnd"/>
+      <w:r>
+        <w:t xml:space="preserve"> In the similar way </w:t>
       </w:r>
       <w:r>
         <w:t xml:space="preserve">pagination can be showed </w:t>
@@ -1681,7 +2299,15 @@
         <w:t xml:space="preserve">by infinite scroll </w:t>
       </w:r>
       <w:r>
-        <w:t xml:space="preserve">like facebook news feed </w:t>
+        <w:t xml:space="preserve">like </w:t>
+      </w:r>
+      <w:proofErr w:type="spellStart"/>
+      <w:r>
+        <w:t>facebook</w:t>
+      </w:r>
+      <w:proofErr w:type="spellEnd"/>
+      <w:r>
+        <w:t xml:space="preserve"> news feed </w:t>
       </w:r>
       <w:r>
         <w:t>you keep scrolling and new thing appears</w:t>
@@ -1710,7 +2336,15 @@
         <w:t xml:space="preserve"> observer</w:t>
       </w:r>
       <w:r>
-        <w:t xml:space="preserve"> api. </w:t>
+        <w:t xml:space="preserve"> </w:t>
+      </w:r>
+      <w:proofErr w:type="spellStart"/>
+      <w:r>
+        <w:t>api</w:t>
+      </w:r>
+      <w:proofErr w:type="spellEnd"/>
+      <w:r>
+        <w:t xml:space="preserve">. </w:t>
       </w:r>
     </w:p>
     <w:p>
@@ -1746,7 +2380,23 @@
           <w:b/>
           <w:bCs/>
         </w:rPr>
-        <w:t xml:space="preserve">which id already made for us </w:t>
+        <w:t xml:space="preserve">which </w:t>
+      </w:r>
+      <w:proofErr w:type="spellStart"/>
+      <w:r>
+        <w:rPr>
+          <w:b/>
+          <w:bCs/>
+        </w:rPr>
+        <w:t>id</w:t>
+      </w:r>
+      <w:proofErr w:type="spellEnd"/>
+      <w:r>
+        <w:rPr>
+          <w:b/>
+          <w:bCs/>
+        </w:rPr>
+        <w:t xml:space="preserve"> already made for us </w:t>
       </w:r>
     </w:p>
     <w:p>
@@ -1757,7 +2407,15 @@
         <w:t xml:space="preserve">that we will not good components </w:t>
       </w:r>
       <w:r>
-        <w:t>means you won’t get good packages for doing any work(who knows)</w:t>
+        <w:t xml:space="preserve">means you won’t get good packages for doing any </w:t>
+      </w:r>
+      <w:proofErr w:type="gramStart"/>
+      <w:r>
+        <w:t>work(</w:t>
+      </w:r>
+      <w:proofErr w:type="gramEnd"/>
+      <w:r>
+        <w:t>who knows)</w:t>
       </w:r>
     </w:p>
     <w:p>
@@ -1768,23 +2426,45 @@
           <w:bCs/>
         </w:rPr>
       </w:pPr>
-      <w:r>
-        <w:rPr>
-          <w:b/>
-          <w:bCs/>
-        </w:rPr>
-        <w:t>npm install --save react-infinite-scroll-component</w:t>
-      </w:r>
-    </w:p>
-    <w:p>
-      <w:r>
-        <w:t xml:space="preserve">So we run the above command I context of </w:t>
+      <w:proofErr w:type="spellStart"/>
+      <w:r>
+        <w:rPr>
+          <w:b/>
+          <w:bCs/>
+        </w:rPr>
+        <w:t>npm</w:t>
+      </w:r>
+      <w:proofErr w:type="spellEnd"/>
+      <w:r>
+        <w:rPr>
+          <w:b/>
+          <w:bCs/>
+        </w:rPr>
+        <w:t xml:space="preserve"> install --save react-infinite-scroll-component</w:t>
+      </w:r>
+    </w:p>
+    <w:p>
+      <w:proofErr w:type="gramStart"/>
+      <w:r>
+        <w:t>So</w:t>
+      </w:r>
+      <w:proofErr w:type="gramEnd"/>
+      <w:r>
+        <w:t xml:space="preserve"> we run the above command I context of </w:t>
       </w:r>
       <w:r>
         <w:t xml:space="preserve">yarn </w:t>
       </w:r>
       <w:r>
-        <w:t>by using  below command</w:t>
+        <w:t xml:space="preserve">by </w:t>
+      </w:r>
+      <w:proofErr w:type="gramStart"/>
+      <w:r>
+        <w:t>using  below</w:t>
+      </w:r>
+      <w:proofErr w:type="gramEnd"/>
+      <w:r>
+        <w:t xml:space="preserve"> command</w:t>
       </w:r>
     </w:p>
     <w:p>
@@ -1872,22 +2552,40 @@
         <w:t xml:space="preserve">Data length </w:t>
       </w:r>
       <w:r>
-        <w:t>of the data that to be shown</w:t>
-      </w:r>
-      <w:r>
-        <w:t xml:space="preserve"> , next is the function  </w:t>
-      </w:r>
-      <w:r>
-        <w:t>that will be called when we scroll and reach the bottom and more data is needed to be loaded.</w:t>
+        <w:t xml:space="preserve">of the data that to be </w:t>
+      </w:r>
+      <w:proofErr w:type="gramStart"/>
+      <w:r>
+        <w:t>shown</w:t>
+      </w:r>
+      <w:r>
+        <w:t xml:space="preserve"> ,</w:t>
+      </w:r>
+      <w:proofErr w:type="gramEnd"/>
+      <w:r>
+        <w:t xml:space="preserve"> next is the </w:t>
+      </w:r>
+      <w:proofErr w:type="gramStart"/>
+      <w:r>
+        <w:t xml:space="preserve">function  </w:t>
+      </w:r>
+      <w:r>
+        <w:t>that</w:t>
+      </w:r>
+      <w:proofErr w:type="gramEnd"/>
+      <w:r>
+        <w:t xml:space="preserve"> will be called when we scroll and reach the bottom and more data is needed to be loaded.</w:t>
       </w:r>
     </w:p>
     <w:p>
       <w:r>
         <w:t xml:space="preserve">The props below the </w:t>
       </w:r>
+      <w:proofErr w:type="spellStart"/>
       <w:r>
         <w:t>endMessage</w:t>
       </w:r>
+      <w:proofErr w:type="spellEnd"/>
       <w:r>
         <w:t xml:space="preserve"> </w:t>
       </w:r>
@@ -1904,18 +2602,34 @@
         <w:t>w</w:t>
       </w:r>
       <w:r>
-        <w:t>n function</w:t>
+        <w:t xml:space="preserve">n </w:t>
+      </w:r>
+      <w:proofErr w:type="gramStart"/>
+      <w:r>
+        <w:t>function</w:t>
       </w:r>
       <w:r>
         <w:t>al</w:t>
       </w:r>
       <w:r>
-        <w:t>ity(who knows)</w:t>
-      </w:r>
-    </w:p>
-    <w:p>
-      <w:r>
-        <w:t xml:space="preserve">You can use InfiniteScroll only in client side so </w:t>
+        <w:t>ity(</w:t>
+      </w:r>
+      <w:proofErr w:type="gramEnd"/>
+      <w:r>
+        <w:t>who knows)</w:t>
+      </w:r>
+    </w:p>
+    <w:p>
+      <w:r>
+        <w:t xml:space="preserve">You can use </w:t>
+      </w:r>
+      <w:proofErr w:type="spellStart"/>
+      <w:r>
+        <w:t>InfiniteScroll</w:t>
+      </w:r>
+      <w:proofErr w:type="spellEnd"/>
+      <w:r>
+        <w:t xml:space="preserve"> only in client side so </w:t>
       </w:r>
       <w:r>
         <w:t xml:space="preserve">we need to use it in client component so we will change the blogs from SSG to client component. </w:t>
@@ -1934,8 +2648,13 @@
       <w:r>
         <w:t xml:space="preserve">we use any library </w:t>
       </w:r>
-      <w:r>
-        <w:t>onw imp</w:t>
+      <w:proofErr w:type="spellStart"/>
+      <w:r>
+        <w:t>onw</w:t>
+      </w:r>
+      <w:proofErr w:type="spellEnd"/>
+      <w:r>
+        <w:t xml:space="preserve"> imp</w:t>
       </w:r>
       <w:r>
         <w:t>o</w:t>
@@ -1959,7 +2678,15 @@
         <w:t xml:space="preserve">ined </w:t>
       </w:r>
       <w:r>
-        <w:t>is it idefined like that you have t</w:t>
+        <w:t xml:space="preserve">is it </w:t>
+      </w:r>
+      <w:proofErr w:type="spellStart"/>
+      <w:r>
+        <w:t>idefined</w:t>
+      </w:r>
+      <w:proofErr w:type="spellEnd"/>
+      <w:r>
+        <w:t xml:space="preserve"> like that you have t</w:t>
       </w:r>
       <w:r>
         <w:t xml:space="preserve">o </w:t>
@@ -1971,7 +2698,15 @@
         <w:t xml:space="preserve">it is defined like this </w:t>
       </w:r>
       <w:r>
-        <w:t xml:space="preserve">if we keep single item </w:t>
+        <w:t xml:space="preserve">if we keep single </w:t>
+      </w:r>
+      <w:proofErr w:type="gramStart"/>
+      <w:r>
+        <w:t>item</w:t>
+      </w:r>
+      <w:proofErr w:type="gramEnd"/>
+      <w:r>
+        <w:t xml:space="preserve"> </w:t>
       </w:r>
       <w:r>
         <w:t>we need to see al</w:t>
@@ -1980,13 +2715,21 @@
         <w:t>l</w:t>
       </w:r>
       <w:r>
-        <w:t xml:space="preserve"> this thi</w:t>
+        <w:t xml:space="preserve"> </w:t>
+      </w:r>
+      <w:proofErr w:type="gramStart"/>
+      <w:r>
+        <w:t>this thi</w:t>
       </w:r>
       <w:r>
         <w:t>n</w:t>
       </w:r>
       <w:r>
-        <w:t xml:space="preserve">gs </w:t>
+        <w:t>gs</w:t>
+      </w:r>
+      <w:proofErr w:type="gramEnd"/>
+      <w:r>
+        <w:t xml:space="preserve"> </w:t>
       </w:r>
     </w:p>
     <w:p>
@@ -1996,6 +2739,7 @@
           <w:bCs/>
         </w:rPr>
       </w:pPr>
+      <w:proofErr w:type="gramStart"/>
       <w:r>
         <w:rPr>
           <w:b/>
@@ -2003,6 +2747,7 @@
         </w:rPr>
         <w:t>Note:-</w:t>
       </w:r>
+      <w:proofErr w:type="gramEnd"/>
     </w:p>
     <w:p>
       <w:pPr>
@@ -2014,7 +2759,15 @@
         <w:t xml:space="preserve">Sometime it happens </w:t>
       </w:r>
       <w:r>
-        <w:t>in react that one component is show  two times so reload to remove the bug</w:t>
+        <w:t xml:space="preserve">in react that one component is </w:t>
+      </w:r>
+      <w:proofErr w:type="gramStart"/>
+      <w:r>
+        <w:t>show  two</w:t>
+      </w:r>
+      <w:proofErr w:type="gramEnd"/>
+      <w:r>
+        <w:t xml:space="preserve"> times so reload to remove the bug</w:t>
       </w:r>
     </w:p>
     <w:p>
@@ -2030,7 +2783,15 @@
         <w:t xml:space="preserve">except for responsiveness </w:t>
       </w:r>
       <w:r>
-        <w:t xml:space="preserve">we will  make our blog responsive and will write media queries </w:t>
+        <w:t xml:space="preserve">we </w:t>
+      </w:r>
+      <w:proofErr w:type="gramStart"/>
+      <w:r>
+        <w:t>will  make</w:t>
+      </w:r>
+      <w:proofErr w:type="gramEnd"/>
+      <w:r>
+        <w:t xml:space="preserve"> our blog responsive and will write media queries </w:t>
       </w:r>
       <w:r>
         <w:t>how we can we run media que</w:t>
@@ -2056,16 +2817,39 @@
         <w:t xml:space="preserve">the website </w:t>
       </w:r>
       <w:r>
-        <w:t>and if you gave responsiveness</w:t>
-      </w:r>
+        <w:t xml:space="preserve">and if you gave </w:t>
+      </w:r>
+      <w:proofErr w:type="gramStart"/>
+      <w:r>
+        <w:t>responsiveness</w:t>
+      </w:r>
+      <w:proofErr w:type="gramEnd"/>
       <w:r>
         <w:t xml:space="preserve"> it was an addon</w:t>
       </w:r>
       <w:r>
-        <w:t xml:space="preserve"> if you gave it then it was a favor </w:t>
-      </w:r>
-      <w:r>
-        <w:t xml:space="preserve">you can say bit in todays time </w:t>
+        <w:t xml:space="preserve"> if you gave it then it was a </w:t>
+      </w:r>
+      <w:proofErr w:type="spellStart"/>
+      <w:r>
+        <w:t>favor</w:t>
+      </w:r>
+      <w:proofErr w:type="spellEnd"/>
+      <w:r>
+        <w:t xml:space="preserve"> </w:t>
+      </w:r>
+      <w:r>
+        <w:t xml:space="preserve">you can say bit in </w:t>
+      </w:r>
+      <w:proofErr w:type="spellStart"/>
+      <w:proofErr w:type="gramStart"/>
+      <w:r>
+        <w:t>todays</w:t>
+      </w:r>
+      <w:proofErr w:type="spellEnd"/>
+      <w:proofErr w:type="gramEnd"/>
+      <w:r>
+        <w:t xml:space="preserve"> time </w:t>
       </w:r>
       <w:r>
         <w:t xml:space="preserve">if you are delivering a website </w:t>
@@ -2140,7 +2924,11 @@
     </w:p>
     <w:p>
       <w:r>
-        <w:t>We will ho</w:t>
+        <w:t xml:space="preserve">We will </w:t>
+      </w:r>
+      <w:proofErr w:type="gramStart"/>
+      <w:r>
+        <w:t>ho</w:t>
       </w:r>
       <w:r>
         <w:t>s</w:t>
@@ -2149,7 +2937,11 @@
         <w:t>t</w:t>
       </w:r>
       <w:r>
-        <w:t>s the web</w:t>
+        <w:t>s</w:t>
+      </w:r>
+      <w:proofErr w:type="gramEnd"/>
+      <w:r>
+        <w:t xml:space="preserve"> the web</w:t>
       </w:r>
       <w:r>
         <w:t>s</w:t>
@@ -2276,7 +3068,15 @@
     </w:p>
     <w:p>
       <w:r>
-        <w:t xml:space="preserve">IN digital ocean we make new user(who knows) </w:t>
+        <w:t xml:space="preserve">IN digital ocean we make new </w:t>
+      </w:r>
+      <w:proofErr w:type="gramStart"/>
+      <w:r>
+        <w:t>user(</w:t>
+      </w:r>
+      <w:proofErr w:type="gramEnd"/>
+      <w:r>
+        <w:t xml:space="preserve">who knows) </w:t>
       </w:r>
     </w:p>
     <w:p>
@@ -2314,13 +3114,26 @@
       <w:r>
         <w:t xml:space="preserve">process will be </w:t>
       </w:r>
-      <w:r>
-        <w:t xml:space="preserve">build there </w:t>
-      </w:r>
-    </w:p>
-    <w:p>
-      <w:r>
-        <w:t>It will ask you to make database in there services.</w:t>
+      <w:proofErr w:type="gramStart"/>
+      <w:r>
+        <w:t>build</w:t>
+      </w:r>
+      <w:proofErr w:type="gramEnd"/>
+      <w:r>
+        <w:t xml:space="preserve"> there </w:t>
+      </w:r>
+    </w:p>
+    <w:p>
+      <w:r>
+        <w:t xml:space="preserve">It will ask you to make database in </w:t>
+      </w:r>
+      <w:proofErr w:type="gramStart"/>
+      <w:r>
+        <w:t>there</w:t>
+      </w:r>
+      <w:proofErr w:type="gramEnd"/>
+      <w:r>
+        <w:t xml:space="preserve"> services.</w:t>
       </w:r>
       <w:r>
         <w:t xml:space="preserve"> (who knows)</w:t>
@@ -2336,7 +3149,23 @@
     </w:p>
     <w:p>
       <w:r>
-        <w:t xml:space="preserve">It is very simple an it wil automatically detect your application </w:t>
+        <w:t xml:space="preserve">It is very simple </w:t>
+      </w:r>
+      <w:proofErr w:type="spellStart"/>
+      <w:r>
+        <w:t>an</w:t>
+      </w:r>
+      <w:proofErr w:type="spellEnd"/>
+      <w:r>
+        <w:t xml:space="preserve"> it </w:t>
+      </w:r>
+      <w:proofErr w:type="spellStart"/>
+      <w:r>
+        <w:t>wil</w:t>
+      </w:r>
+      <w:proofErr w:type="spellEnd"/>
+      <w:r>
+        <w:t xml:space="preserve"> automatically detect your application </w:t>
       </w:r>
     </w:p>
     <w:p>
@@ -2347,7 +3176,28 @@
         <w:t>d</w:t>
       </w:r>
       <w:r>
-        <w:t xml:space="preserve"> use it like a node ap hten it will be good(wjp knows)</w:t>
+        <w:t xml:space="preserve"> use it like a node ap </w:t>
+      </w:r>
+      <w:proofErr w:type="spellStart"/>
+      <w:r>
+        <w:t>hten</w:t>
+      </w:r>
+      <w:proofErr w:type="spellEnd"/>
+      <w:r>
+        <w:t xml:space="preserve"> it will be </w:t>
+      </w:r>
+      <w:proofErr w:type="gramStart"/>
+      <w:r>
+        <w:t>good(</w:t>
+      </w:r>
+      <w:proofErr w:type="spellStart"/>
+      <w:proofErr w:type="gramEnd"/>
+      <w:r>
+        <w:t>wjp</w:t>
+      </w:r>
+      <w:proofErr w:type="spellEnd"/>
+      <w:r>
+        <w:t xml:space="preserve"> knows)</w:t>
       </w:r>
     </w:p>
     <w:p>
@@ -2358,21 +3208,23 @@
           <w:color w:val="EE0000"/>
         </w:rPr>
       </w:pPr>
+      <w:proofErr w:type="gramStart"/>
       <w:r>
         <w:rPr>
           <w:b/>
           <w:bCs/>
           <w:color w:val="EE0000"/>
         </w:rPr>
-        <w:t xml:space="preserve">‘ can create </w:t>
-      </w:r>
+        <w:t>‘ can</w:t>
+      </w:r>
+      <w:proofErr w:type="gramEnd"/>
       <w:r>
         <w:rPr>
           <w:b/>
           <w:bCs/>
           <w:color w:val="EE0000"/>
         </w:rPr>
-        <w:t>error in js</w:t>
+        <w:t xml:space="preserve"> create </w:t>
       </w:r>
       <w:r>
         <w:rPr>
@@ -2380,15 +3232,77 @@
           <w:bCs/>
           <w:color w:val="EE0000"/>
         </w:rPr>
-        <w:t>x in Nextjs or maybe in React.</w:t>
-      </w:r>
+        <w:t xml:space="preserve">error in </w:t>
+      </w:r>
+      <w:proofErr w:type="spellStart"/>
       <w:r>
         <w:rPr>
           <w:b/>
           <w:bCs/>
           <w:color w:val="EE0000"/>
         </w:rPr>
-        <w:t>(maybe it is an outdated problem)</w:t>
+        <w:t>js</w:t>
+      </w:r>
+      <w:r>
+        <w:rPr>
+          <w:b/>
+          <w:bCs/>
+          <w:color w:val="EE0000"/>
+        </w:rPr>
+        <w:t>x</w:t>
+      </w:r>
+      <w:proofErr w:type="spellEnd"/>
+      <w:r>
+        <w:rPr>
+          <w:b/>
+          <w:bCs/>
+          <w:color w:val="EE0000"/>
+        </w:rPr>
+        <w:t xml:space="preserve"> in </w:t>
+      </w:r>
+      <w:proofErr w:type="spellStart"/>
+      <w:r>
+        <w:rPr>
+          <w:b/>
+          <w:bCs/>
+          <w:color w:val="EE0000"/>
+        </w:rPr>
+        <w:t>Nextjs</w:t>
+      </w:r>
+      <w:proofErr w:type="spellEnd"/>
+      <w:r>
+        <w:rPr>
+          <w:b/>
+          <w:bCs/>
+          <w:color w:val="EE0000"/>
+        </w:rPr>
+        <w:t xml:space="preserve"> or maybe in </w:t>
+      </w:r>
+      <w:proofErr w:type="gramStart"/>
+      <w:r>
+        <w:rPr>
+          <w:b/>
+          <w:bCs/>
+          <w:color w:val="EE0000"/>
+        </w:rPr>
+        <w:t>React.</w:t>
+      </w:r>
+      <w:r>
+        <w:rPr>
+          <w:b/>
+          <w:bCs/>
+          <w:color w:val="EE0000"/>
+        </w:rPr>
+        <w:t>(</w:t>
+      </w:r>
+      <w:proofErr w:type="gramEnd"/>
+      <w:r>
+        <w:rPr>
+          <w:b/>
+          <w:bCs/>
+          <w:color w:val="EE0000"/>
+        </w:rPr>
+        <w:t>maybe it is an outdated problem)</w:t>
       </w:r>
     </w:p>
     <w:p>
@@ -2410,13 +3324,24 @@
         <w:t xml:space="preserve">that </w:t>
       </w:r>
       <w:r>
-        <w:t xml:space="preserve">you can make it like that and if it become profitable then you can scale it (who knows) </w:t>
+        <w:t xml:space="preserve">you can make it like that and if it </w:t>
+      </w:r>
+      <w:proofErr w:type="spellStart"/>
+      <w:proofErr w:type="gramStart"/>
+      <w:r>
+        <w:t>become</w:t>
+      </w:r>
+      <w:proofErr w:type="spellEnd"/>
+      <w:proofErr w:type="gramEnd"/>
+      <w:r>
+        <w:t xml:space="preserve"> profitable then you can scale it (who knows) </w:t>
       </w:r>
     </w:p>
     <w:p>
       <w:r>
         <w:t xml:space="preserve">Now as you commit then </w:t>
       </w:r>
+      <w:proofErr w:type="gramStart"/>
       <w:r>
         <w:t>Digital</w:t>
       </w:r>
@@ -2424,13 +3349,25 @@
         <w:t xml:space="preserve"> </w:t>
       </w:r>
       <w:r>
-        <w:t>ocean will build it</w:t>
-      </w:r>
-      <w:r>
-        <w:t xml:space="preserve"> automatically for you.</w:t>
-      </w:r>
-      <w:r>
-        <w:t>(maybe if auto</w:t>
+        <w:t>ocean</w:t>
+      </w:r>
+      <w:proofErr w:type="gramEnd"/>
+      <w:r>
+        <w:t xml:space="preserve"> will build it</w:t>
+      </w:r>
+      <w:r>
+        <w:t xml:space="preserve"> automatically for </w:t>
+      </w:r>
+      <w:proofErr w:type="gramStart"/>
+      <w:r>
+        <w:t>you.</w:t>
+      </w:r>
+      <w:r>
+        <w:t>(</w:t>
+      </w:r>
+      <w:proofErr w:type="gramEnd"/>
+      <w:r>
+        <w:t>maybe if auto</w:t>
       </w:r>
       <w:r>
         <w:t xml:space="preserve"> </w:t>
@@ -2439,7 +3376,15 @@
         <w:t xml:space="preserve">deploy option was selected </w:t>
       </w:r>
       <w:r>
-        <w:t>in the setting(who knows)</w:t>
+        <w:t xml:space="preserve">in the </w:t>
+      </w:r>
+      <w:proofErr w:type="gramStart"/>
+      <w:r>
+        <w:t>setting(</w:t>
+      </w:r>
+      <w:proofErr w:type="gramEnd"/>
+      <w:r>
+        <w:t>who knows)</w:t>
       </w:r>
       <w:r>
         <w:t>)</w:t>
@@ -2477,10 +3422,18 @@
         <w:t xml:space="preserve">here (maybe </w:t>
       </w:r>
       <w:r>
-        <w:t>very large app don’t work properly</w:t>
-      </w:r>
-      <w:r>
-        <w:t>(who knows)</w:t>
+        <w:t xml:space="preserve">very large app don’t work </w:t>
+      </w:r>
+      <w:proofErr w:type="gramStart"/>
+      <w:r>
+        <w:t>properly</w:t>
+      </w:r>
+      <w:r>
+        <w:t>(</w:t>
+      </w:r>
+      <w:proofErr w:type="gramEnd"/>
+      <w:r>
+        <w:t>who knows)</w:t>
       </w:r>
       <w:r>
         <w:t>)</w:t>
@@ -2521,10 +3474,26 @@
         <w:t xml:space="preserve">Now we will see </w:t>
       </w:r>
       <w:r>
-        <w:t>how Google analytics and search console</w:t>
-      </w:r>
-      <w:r>
-        <w:t>(who knowa)</w:t>
+        <w:t xml:space="preserve">how Google analytics and search </w:t>
+      </w:r>
+      <w:proofErr w:type="gramStart"/>
+      <w:r>
+        <w:t>console</w:t>
+      </w:r>
+      <w:r>
+        <w:t>(</w:t>
+      </w:r>
+      <w:proofErr w:type="gramEnd"/>
+      <w:r>
+        <w:t xml:space="preserve">who </w:t>
+      </w:r>
+      <w:proofErr w:type="spellStart"/>
+      <w:r>
+        <w:t>knowa</w:t>
+      </w:r>
+      <w:proofErr w:type="spellEnd"/>
+      <w:r>
+        <w:t>)</w:t>
       </w:r>
       <w:r>
         <w:t xml:space="preserve"> </w:t>
@@ -2540,8 +3509,13 @@
       </w:r>
     </w:p>
     <w:p>
-      <w:r>
-        <w:t xml:space="preserve">Nextjs </w:t>
+      <w:proofErr w:type="spellStart"/>
+      <w:r>
+        <w:t>Nextjs</w:t>
+      </w:r>
+      <w:proofErr w:type="spellEnd"/>
+      <w:r>
+        <w:t xml:space="preserve"> </w:t>
       </w:r>
       <w:r>
         <w:t>d</w:t>
@@ -2678,13 +3652,21 @@
         <w:t xml:space="preserve">ck </w:t>
       </w:r>
       <w:r>
-        <w:t>which is also called S</w:t>
-      </w:r>
+        <w:t xml:space="preserve">which is also called </w:t>
+      </w:r>
+      <w:proofErr w:type="gramStart"/>
       <w:r>
         <w:t>S</w:t>
       </w:r>
       <w:r>
-        <w:t>LV(who knows)</w:t>
+        <w:t>S</w:t>
+      </w:r>
+      <w:r>
+        <w:t>LV(</w:t>
+      </w:r>
+      <w:proofErr w:type="gramEnd"/>
+      <w:r>
+        <w:t>who knows)</w:t>
       </w:r>
       <w:r>
         <w:t xml:space="preserve"> and </w:t>
@@ -2731,8 +3713,13 @@
       <w:r>
         <w:t xml:space="preserve">of the application. </w:t>
       </w:r>
-      <w:r>
-        <w:t>So if we want that the domain we have need to be pointe</w:t>
+      <w:proofErr w:type="gramStart"/>
+      <w:r>
+        <w:t>So</w:t>
+      </w:r>
+      <w:proofErr w:type="gramEnd"/>
+      <w:r>
+        <w:t xml:space="preserve"> if we want that the domain we have need to be pointe</w:t>
       </w:r>
       <w:r>
         <w:t>d</w:t>
@@ -2763,10 +3750,18 @@
     </w:p>
     <w:p>
       <w:r>
-        <w:t xml:space="preserve">Of you chose the former then you will  </w:t>
-      </w:r>
-      <w:r>
-        <w:t xml:space="preserve">see that from the dashboard </w:t>
+        <w:t xml:space="preserve">Of you chose the former then you </w:t>
+      </w:r>
+      <w:proofErr w:type="gramStart"/>
+      <w:r>
+        <w:t xml:space="preserve">will  </w:t>
+      </w:r>
+      <w:r>
+        <w:t>see</w:t>
+      </w:r>
+      <w:proofErr w:type="gramEnd"/>
+      <w:r>
+        <w:t xml:space="preserve"> that from the dashboard </w:t>
       </w:r>
       <w:r>
         <w:t xml:space="preserve">that how things are happening </w:t>
@@ -2775,10 +3770,26 @@
         <w:t xml:space="preserve">and if you chose later </w:t>
       </w:r>
       <w:r>
-        <w:t>then you need to point it to a Digital ocean(who knows)</w:t>
-      </w:r>
-      <w:r>
-        <w:t>. By former we bring the domain in the digital ocean(who knows)</w:t>
+        <w:t xml:space="preserve">then you need to point it to a Digital </w:t>
+      </w:r>
+      <w:proofErr w:type="gramStart"/>
+      <w:r>
+        <w:t>ocean(</w:t>
+      </w:r>
+      <w:proofErr w:type="gramEnd"/>
+      <w:r>
+        <w:t>who knows)</w:t>
+      </w:r>
+      <w:r>
+        <w:t xml:space="preserve">. By former we bring the domain in the digital </w:t>
+      </w:r>
+      <w:proofErr w:type="gramStart"/>
+      <w:r>
+        <w:t>ocean(</w:t>
+      </w:r>
+      <w:proofErr w:type="gramEnd"/>
+      <w:r>
+        <w:t>who knows)</w:t>
       </w:r>
       <w:r>
         <w:t xml:space="preserve">. </w:t>
@@ -2824,8 +3835,13 @@
       </w:r>
     </w:p>
     <w:p>
-      <w:r>
-        <w:t>So we went to Google search console</w:t>
+      <w:proofErr w:type="gramStart"/>
+      <w:r>
+        <w:t>So</w:t>
+      </w:r>
+      <w:proofErr w:type="gramEnd"/>
+      <w:r>
+        <w:t xml:space="preserve"> we went to Google search console</w:t>
       </w:r>
       <w:r>
         <w:t xml:space="preserve"> so we add a property there </w:t>
@@ -2900,7 +3916,15 @@
         <w:t xml:space="preserve">omain </w:t>
       </w:r>
       <w:r>
-        <w:t xml:space="preserve">ad then you need to verify it so it give us some text which we will paste in the </w:t>
+        <w:t xml:space="preserve">ad then you need to verify it so it </w:t>
+      </w:r>
+      <w:proofErr w:type="gramStart"/>
+      <w:r>
+        <w:t>give</w:t>
+      </w:r>
+      <w:proofErr w:type="gramEnd"/>
+      <w:r>
+        <w:t xml:space="preserve"> us some text which we will paste in the </w:t>
       </w:r>
       <w:r>
         <w:t xml:space="preserve">DNS records to give the proof for ownership of domain. </w:t>
@@ -2974,7 +3998,15 @@
     <w:p>
       <w:r>
         <w:lastRenderedPageBreak/>
-        <w:t xml:space="preserve">Now we will make an ecomerce store </w:t>
+        <w:t xml:space="preserve">Now we will make an </w:t>
+      </w:r>
+      <w:proofErr w:type="spellStart"/>
+      <w:r>
+        <w:t>ecomerce</w:t>
+      </w:r>
+      <w:proofErr w:type="spellEnd"/>
+      <w:r>
+        <w:t xml:space="preserve"> store </w:t>
       </w:r>
       <w:r>
         <w:t xml:space="preserve">and we will make pages like </w:t>
@@ -2986,7 +4018,11 @@
         <w:t xml:space="preserve"> and how to integrate </w:t>
       </w:r>
       <w:r>
-        <w:t>payment gateway to the websi</w:t>
+        <w:t xml:space="preserve">payment gateway to the </w:t>
+      </w:r>
+      <w:proofErr w:type="gramStart"/>
+      <w:r>
+        <w:t>websi</w:t>
       </w:r>
       <w:r>
         <w:t>t</w:t>
@@ -2997,14 +4033,23 @@
       <w:r>
         <w:t>.</w:t>
       </w:r>
+      <w:proofErr w:type="gramEnd"/>
       <w:r>
         <w:t xml:space="preserve"> How orders will come </w:t>
       </w:r>
       <w:r>
-        <w:t xml:space="preserve">and how admin panel will be made </w:t>
-      </w:r>
-      <w:r>
-        <w:t>. F</w:t>
+        <w:t xml:space="preserve">and how admin panel will be </w:t>
+      </w:r>
+      <w:proofErr w:type="gramStart"/>
+      <w:r>
+        <w:t xml:space="preserve">made </w:t>
+      </w:r>
+      <w:r>
+        <w:t>.</w:t>
+      </w:r>
+      <w:proofErr w:type="gramEnd"/>
+      <w:r>
+        <w:t xml:space="preserve"> F</w:t>
       </w:r>
       <w:r>
         <w:t>r</w:t>
@@ -3022,7 +4067,15 @@
         <w:t xml:space="preserve">teacher will teach us </w:t>
       </w:r>
       <w:r>
-        <w:t xml:space="preserve">We name it codeswear it will be an ecommerce store where we will list our product </w:t>
+        <w:t xml:space="preserve">We name it </w:t>
+      </w:r>
+      <w:proofErr w:type="spellStart"/>
+      <w:r>
+        <w:t>codeswear</w:t>
+      </w:r>
+      <w:proofErr w:type="spellEnd"/>
+      <w:r>
+        <w:t xml:space="preserve"> it will be an ecommerce store where we will list our product </w:t>
       </w:r>
       <w:r>
         <w:t xml:space="preserve">So we type the command </w:t>
@@ -3048,7 +4101,23 @@
           <w:b/>
           <w:bCs/>
         </w:rPr>
-        <w:t xml:space="preserve"> &lt;appname&gt;</w:t>
+        <w:t xml:space="preserve"> &lt;</w:t>
+      </w:r>
+      <w:proofErr w:type="spellStart"/>
+      <w:r>
+        <w:rPr>
+          <w:b/>
+          <w:bCs/>
+        </w:rPr>
+        <w:t>appname</w:t>
+      </w:r>
+      <w:proofErr w:type="spellEnd"/>
+      <w:r>
+        <w:rPr>
+          <w:b/>
+          <w:bCs/>
+        </w:rPr>
+        <w:t>&gt;</w:t>
       </w:r>
     </w:p>
     <w:p>
@@ -3093,7 +4162,11 @@
         <w:t xml:space="preserve">Now we will see how to setup </w:t>
       </w:r>
       <w:r>
-        <w:t>up tailwind with Ne</w:t>
+        <w:t xml:space="preserve">up tailwind with </w:t>
+      </w:r>
+      <w:proofErr w:type="spellStart"/>
+      <w:r>
+        <w:t>Ne</w:t>
       </w:r>
       <w:r>
         <w:t>x</w:t>
@@ -3101,6 +4174,7 @@
       <w:r>
         <w:t>tjs</w:t>
       </w:r>
+      <w:proofErr w:type="spellEnd"/>
       <w:r>
         <w:t>,</w:t>
       </w:r>
@@ -3117,7 +4191,15 @@
         <w:t xml:space="preserve">optimally </w:t>
       </w:r>
       <w:r>
-        <w:t xml:space="preserve">and will make a black slate of codeswear </w:t>
+        <w:t xml:space="preserve">and will make a black slate of </w:t>
+      </w:r>
+      <w:proofErr w:type="spellStart"/>
+      <w:r>
+        <w:t>codeswear</w:t>
+      </w:r>
+      <w:proofErr w:type="spellEnd"/>
+      <w:r>
+        <w:t xml:space="preserve"> </w:t>
       </w:r>
       <w:r>
         <w:t>(who knows)</w:t>
@@ -3140,8 +4222,13 @@
     </w:p>
     <w:p>
       <w:r>
-        <w:t>We will search tailwind css with nextjs</w:t>
-      </w:r>
+        <w:t xml:space="preserve">We will search tailwind css with </w:t>
+      </w:r>
+      <w:proofErr w:type="spellStart"/>
+      <w:r>
+        <w:t>nextjs</w:t>
+      </w:r>
+      <w:proofErr w:type="spellEnd"/>
       <w:r>
         <w:t xml:space="preserve"> </w:t>
       </w:r>
@@ -3162,19 +4249,42 @@
       <w:r>
         <w:t xml:space="preserve">s </w:t>
       </w:r>
-      <w:r>
-        <w:t xml:space="preserve">cammand </w:t>
-      </w:r>
-    </w:p>
-    <w:p>
-      <w:r>
-        <w:t>npm install tailwindcss @tailwindcss/postcss postcss</w:t>
-      </w:r>
+      <w:proofErr w:type="spellStart"/>
+      <w:r>
+        <w:t>cammand</w:t>
+      </w:r>
+      <w:proofErr w:type="spellEnd"/>
       <w:r>
         <w:t xml:space="preserve"> </w:t>
       </w:r>
     </w:p>
     <w:p>
+      <w:proofErr w:type="spellStart"/>
+      <w:r>
+        <w:t>npm</w:t>
+      </w:r>
+      <w:proofErr w:type="spellEnd"/>
+      <w:r>
+        <w:t xml:space="preserve"> install </w:t>
+      </w:r>
+      <w:proofErr w:type="spellStart"/>
+      <w:r>
+        <w:t>tailwindcss</w:t>
+      </w:r>
+      <w:proofErr w:type="spellEnd"/>
+      <w:r>
+        <w:t xml:space="preserve"> @tailwindcss/postcss </w:t>
+      </w:r>
+      <w:proofErr w:type="spellStart"/>
+      <w:r>
+        <w:t>postcss</w:t>
+      </w:r>
+      <w:proofErr w:type="spellEnd"/>
+      <w:r>
+        <w:t xml:space="preserve"> </w:t>
+      </w:r>
+    </w:p>
+    <w:p>
       <w:r>
         <w:t>or</w:t>
       </w:r>
@@ -3183,9 +4293,19 @@
       <w:r>
         <w:t xml:space="preserve"> yarn add </w:t>
       </w:r>
-      <w:r>
-        <w:t>tailwindcss @tailwindcss/postcss postcss</w:t>
-      </w:r>
+      <w:proofErr w:type="spellStart"/>
+      <w:r>
+        <w:t>tailwindcss</w:t>
+      </w:r>
+      <w:proofErr w:type="spellEnd"/>
+      <w:r>
+        <w:t xml:space="preserve"> @tailwindcss/postcss </w:t>
+      </w:r>
+      <w:proofErr w:type="spellStart"/>
+      <w:r>
+        <w:t>postcss</w:t>
+      </w:r>
+      <w:proofErr w:type="spellEnd"/>
       <w:r>
         <w:t xml:space="preserve"> </w:t>
       </w:r>
@@ -3204,7 +4324,15 @@
         <w:t>e</w:t>
       </w:r>
       <w:r>
-        <w:t>r is using is autdated so we will use moder</w:t>
+        <w:t xml:space="preserve">r is using is </w:t>
+      </w:r>
+      <w:proofErr w:type="spellStart"/>
+      <w:r>
+        <w:t>autdated</w:t>
+      </w:r>
+      <w:proofErr w:type="spellEnd"/>
+      <w:r>
+        <w:t xml:space="preserve"> so we will use moder</w:t>
       </w:r>
       <w:r>
         <w:t>n</w:t>
@@ -3242,10 +4370,18 @@
         <w:t xml:space="preserve">Like Bootstrap Tailwind also have </w:t>
       </w:r>
       <w:r>
-        <w:t xml:space="preserve">predefined class </w:t>
-      </w:r>
-      <w:r>
-        <w:t xml:space="preserve">.So we have tailwind css is installed </w:t>
+        <w:t xml:space="preserve">predefined </w:t>
+      </w:r>
+      <w:proofErr w:type="gramStart"/>
+      <w:r>
+        <w:t xml:space="preserve">class </w:t>
+      </w:r>
+      <w:r>
+        <w:t>.So</w:t>
+      </w:r>
+      <w:proofErr w:type="gramEnd"/>
+      <w:r>
+        <w:t xml:space="preserve"> we have tailwind css is installed </w:t>
       </w:r>
       <w:r>
         <w:t>and we can use our utility class</w:t>
@@ -3353,7 +4489,15 @@
         <w:t xml:space="preserve">There are some pages which you will find in almost all Ecommerce website that is </w:t>
       </w:r>
       <w:r>
-        <w:t>Product page , Home page</w:t>
+        <w:t xml:space="preserve">Product </w:t>
+      </w:r>
+      <w:proofErr w:type="gramStart"/>
+      <w:r>
+        <w:t>page ,</w:t>
+      </w:r>
+      <w:proofErr w:type="gramEnd"/>
+      <w:r>
+        <w:t xml:space="preserve"> Home page</w:t>
       </w:r>
       <w:r>
         <w:t>, Checkout page</w:t>
@@ -3365,22 +4509,40 @@
         <w:t>n</w:t>
       </w:r>
       <w:r>
-        <w:t xml:space="preserve"> order</w:t>
-      </w:r>
-      <w:r>
-        <w:t xml:space="preserve"> , login and signUp</w:t>
-      </w:r>
+        <w:t xml:space="preserve"> </w:t>
+      </w:r>
+      <w:proofErr w:type="gramStart"/>
+      <w:r>
+        <w:t>order</w:t>
+      </w:r>
+      <w:r>
+        <w:t xml:space="preserve"> ,</w:t>
+      </w:r>
+      <w:proofErr w:type="gramEnd"/>
+      <w:r>
+        <w:t xml:space="preserve"> login and </w:t>
+      </w:r>
+      <w:proofErr w:type="spellStart"/>
+      <w:r>
+        <w:t>signUp</w:t>
+      </w:r>
+      <w:proofErr w:type="spellEnd"/>
       <w:r>
         <w:t xml:space="preserve">. We will create their blank slate here </w:t>
       </w:r>
       <w:r>
         <w:t xml:space="preserve">and then we will start </w:t>
       </w:r>
+      <w:proofErr w:type="spellStart"/>
       <w:r>
         <w:t>c</w:t>
       </w:r>
       <w:r>
-        <w:t xml:space="preserve">odeswear development </w:t>
+        <w:t>odeswear</w:t>
+      </w:r>
+      <w:proofErr w:type="spellEnd"/>
+      <w:r>
+        <w:t xml:space="preserve"> development </w:t>
       </w:r>
     </w:p>
     <w:p>
@@ -3426,6 +4588,695 @@
       </w:r>
       <w:r>
         <w:t xml:space="preserve">erce site </w:t>
+      </w:r>
+    </w:p>
+    <w:p>
+      <w:r>
+        <w:t>Navbar and footer are important for our website and it will be present in all of the pages</w:t>
+      </w:r>
+    </w:p>
+    <w:p>
+      <w:r>
+        <w:t xml:space="preserve">We will use app for that </w:t>
+      </w:r>
+      <w:proofErr w:type="gramStart"/>
+      <w:r>
+        <w:t>purposes(</w:t>
+      </w:r>
+      <w:proofErr w:type="gramEnd"/>
+      <w:r>
+        <w:t xml:space="preserve">maybe </w:t>
+      </w:r>
+      <w:proofErr w:type="spellStart"/>
+      <w:r>
+        <w:t>ol</w:t>
+      </w:r>
+      <w:proofErr w:type="spellEnd"/>
+      <w:r>
+        <w:t xml:space="preserve"> version of </w:t>
+      </w:r>
+      <w:proofErr w:type="spellStart"/>
+      <w:r>
+        <w:t>layout.jsx</w:t>
+      </w:r>
+      <w:proofErr w:type="spellEnd"/>
+      <w:r>
+        <w:t>)</w:t>
+      </w:r>
+    </w:p>
+    <w:p>
+      <w:r>
+        <w:t xml:space="preserve">Now there is site that is </w:t>
+      </w:r>
+      <w:proofErr w:type="spellStart"/>
+      <w:r>
+        <w:t>Tailblocks</w:t>
+      </w:r>
+      <w:proofErr w:type="spellEnd"/>
+      <w:r>
+        <w:t xml:space="preserve"> that will give you </w:t>
+      </w:r>
+      <w:proofErr w:type="spellStart"/>
+      <w:r>
+        <w:t>tailblocks</w:t>
+      </w:r>
+      <w:proofErr w:type="spellEnd"/>
+      <w:r>
+        <w:t xml:space="preserve"> </w:t>
+      </w:r>
+      <w:r>
+        <w:t xml:space="preserve">snippet </w:t>
+      </w:r>
+      <w:r>
+        <w:t xml:space="preserve">here you get minimalistic </w:t>
+      </w:r>
+      <w:proofErr w:type="gramStart"/>
+      <w:r>
+        <w:t xml:space="preserve">design </w:t>
+      </w:r>
+      <w:r>
+        <w:t xml:space="preserve"> </w:t>
+      </w:r>
+      <w:r>
+        <w:t>Here</w:t>
+      </w:r>
+      <w:proofErr w:type="gramEnd"/>
+      <w:r>
+        <w:t xml:space="preserve"> you get </w:t>
+      </w:r>
+      <w:proofErr w:type="spellStart"/>
+      <w:r>
+        <w:t>Ecommerece</w:t>
+      </w:r>
+      <w:proofErr w:type="spellEnd"/>
+      <w:r>
+        <w:t xml:space="preserve"> design</w:t>
+      </w:r>
+    </w:p>
+    <w:p>
+      <w:r>
+        <w:t xml:space="preserve">Its link is like this </w:t>
+      </w:r>
+      <w:hyperlink r:id="rId25" w:history="1">
+        <w:r>
+          <w:rPr>
+            <w:rStyle w:val="Hyperlink"/>
+          </w:rPr>
+          <w:t>https://tailblocks.cc/</w:t>
+        </w:r>
+      </w:hyperlink>
+    </w:p>
+    <w:p>
+      <w:r>
+        <w:t xml:space="preserve">In </w:t>
+      </w:r>
+      <w:proofErr w:type="spellStart"/>
+      <w:r>
+        <w:t>tailwiond</w:t>
+      </w:r>
+      <w:proofErr w:type="spellEnd"/>
+      <w:r>
+        <w:t xml:space="preserve"> code you might need </w:t>
+      </w:r>
+      <w:proofErr w:type="spellStart"/>
+      <w:r>
+        <w:t>ot</w:t>
+      </w:r>
+      <w:proofErr w:type="spellEnd"/>
+      <w:r>
+        <w:t xml:space="preserve"> replace </w:t>
+      </w:r>
+    </w:p>
+    <w:p>
+      <w:r>
+        <w:rPr>
+          <w:i/>
+          <w:iCs/>
+        </w:rPr>
+        <w:t>stroke-</w:t>
+      </w:r>
+      <w:proofErr w:type="spellStart"/>
+      <w:r>
+        <w:rPr>
+          <w:i/>
+          <w:iCs/>
+        </w:rPr>
+        <w:t>linecap</w:t>
+      </w:r>
+      <w:proofErr w:type="spellEnd"/>
+      <w:r>
+        <w:rPr>
+          <w:i/>
+          <w:iCs/>
+        </w:rPr>
+        <w:t xml:space="preserve"> </w:t>
+      </w:r>
+      <w:r>
+        <w:t xml:space="preserve">by </w:t>
+      </w:r>
+      <w:proofErr w:type="spellStart"/>
+      <w:r>
+        <w:t>strokeLineCap</w:t>
+      </w:r>
+      <w:proofErr w:type="spellEnd"/>
+    </w:p>
+    <w:p>
+      <w:r>
+        <w:rPr>
+          <w:i/>
+          <w:iCs/>
+        </w:rPr>
+        <w:t>stroke-</w:t>
+      </w:r>
+      <w:proofErr w:type="spellStart"/>
+      <w:r>
+        <w:rPr>
+          <w:i/>
+          <w:iCs/>
+        </w:rPr>
+        <w:t>linejoin</w:t>
+      </w:r>
+      <w:proofErr w:type="spellEnd"/>
+      <w:r>
+        <w:rPr>
+          <w:i/>
+          <w:iCs/>
+        </w:rPr>
+        <w:t xml:space="preserve"> </w:t>
+      </w:r>
+      <w:r>
+        <w:t xml:space="preserve">by </w:t>
+      </w:r>
+      <w:proofErr w:type="spellStart"/>
+      <w:r>
+        <w:t>strokeLineJoin</w:t>
+      </w:r>
+      <w:proofErr w:type="spellEnd"/>
+    </w:p>
+    <w:p>
+      <w:r>
+        <w:t>stroke-width</w:t>
+      </w:r>
+      <w:r>
+        <w:t xml:space="preserve"> by </w:t>
+      </w:r>
+      <w:proofErr w:type="spellStart"/>
+      <w:r>
+        <w:t>StrokeWidth</w:t>
+      </w:r>
+      <w:proofErr w:type="spellEnd"/>
+    </w:p>
+    <w:p>
+      <w:r>
+        <w:t xml:space="preserve">Previously </w:t>
+      </w:r>
+      <w:r>
+        <w:t>we could use a</w:t>
+      </w:r>
+      <w:r>
+        <w:t>nchor</w:t>
+      </w:r>
+      <w:r>
+        <w:t xml:space="preserve"> tag inside the </w:t>
+      </w:r>
+      <w:r>
+        <w:t>Link component</w:t>
+      </w:r>
+      <w:r>
+        <w:t xml:space="preserve"> but not now but if you still want to use them then you need to add a Boolean attribute that is </w:t>
+      </w:r>
+      <w:proofErr w:type="spellStart"/>
+      <w:r>
+        <w:t>legacyBehaviour</w:t>
+      </w:r>
+      <w:proofErr w:type="spellEnd"/>
+    </w:p>
+    <w:p>
+      <w:pPr>
+        <w:rPr>
+          <w:b/>
+          <w:bCs/>
+        </w:rPr>
+      </w:pPr>
+      <w:r>
+        <w:rPr>
+          <w:b/>
+          <w:bCs/>
+        </w:rPr>
+        <w:t xml:space="preserve">Why not using / gives us error in </w:t>
+      </w:r>
+      <w:r>
+        <w:rPr>
+          <w:b/>
+          <w:bCs/>
+        </w:rPr>
+        <w:t xml:space="preserve">Image or maybe in </w:t>
+      </w:r>
+      <w:proofErr w:type="spellStart"/>
+      <w:r>
+        <w:rPr>
+          <w:b/>
+          <w:bCs/>
+        </w:rPr>
+        <w:t>Nextjs</w:t>
+      </w:r>
+      <w:proofErr w:type="spellEnd"/>
+      <w:r>
+        <w:rPr>
+          <w:b/>
+          <w:bCs/>
+        </w:rPr>
+        <w:t xml:space="preserve"> general</w:t>
+      </w:r>
+    </w:p>
+    <w:p>
+      <w:r>
+        <w:t xml:space="preserve">Coder, this happens because </w:t>
+      </w:r>
+      <w:r>
+        <w:rPr>
+          <w:b/>
+          <w:bCs/>
+        </w:rPr>
+        <w:t>Next.js (especially with next/image) requires absolute paths for static files</w:t>
+      </w:r>
+      <w:r>
+        <w:t>.</w:t>
+      </w:r>
+    </w:p>
+    <w:p>
+      <w:r>
+        <w:t>If you write:</w:t>
+      </w:r>
+    </w:p>
+    <w:p>
+      <w:r>
+        <w:t xml:space="preserve">&lt;Image </w:t>
+      </w:r>
+      <w:proofErr w:type="spellStart"/>
+      <w:r>
+        <w:t>src</w:t>
+      </w:r>
+      <w:proofErr w:type="spellEnd"/>
+      <w:r>
+        <w:t>="home.jpg" /&gt;</w:t>
+      </w:r>
+    </w:p>
+    <w:p>
+      <w:r>
+        <w:t xml:space="preserve">Next.js throws an error because it </w:t>
+      </w:r>
+      <w:r>
+        <w:rPr>
+          <w:b/>
+          <w:bCs/>
+        </w:rPr>
+        <w:t>cannot resolve a relative path for optimization</w:t>
+      </w:r>
+      <w:r>
+        <w:t>.</w:t>
+      </w:r>
+    </w:p>
+    <w:p>
+      <w:r>
+        <w:t>But when you write:</w:t>
+      </w:r>
+    </w:p>
+    <w:p>
+      <w:r>
+        <w:t xml:space="preserve">&lt;Image </w:t>
+      </w:r>
+      <w:proofErr w:type="spellStart"/>
+      <w:r>
+        <w:t>src</w:t>
+      </w:r>
+      <w:proofErr w:type="spellEnd"/>
+      <w:r>
+        <w:t>="/home.jpg" /&gt;</w:t>
+      </w:r>
+    </w:p>
+    <w:p>
+      <w:r>
+        <w:t xml:space="preserve">Next.js knows the file is in the </w:t>
+      </w:r>
+      <w:r>
+        <w:rPr>
+          <w:b/>
+          <w:bCs/>
+        </w:rPr>
+        <w:t>public folder</w:t>
+      </w:r>
+      <w:r>
+        <w:t xml:space="preserve"> and can process it.</w:t>
+      </w:r>
+    </w:p>
+    <w:p>
+      <w:r>
+        <w:rPr>
+          <w:b/>
+          <w:bCs/>
+        </w:rPr>
+        <w:t>Short answer:</w:t>
+      </w:r>
+      <w:r>
+        <w:br/>
+        <w:t xml:space="preserve">Next.js shows an error because </w:t>
+      </w:r>
+      <w:r>
+        <w:rPr>
+          <w:b/>
+          <w:bCs/>
+        </w:rPr>
+        <w:t>next/image only accepts absolute paths (/file.jpg) or external URLs, not relative paths like file.jpg.</w:t>
+      </w:r>
+    </w:p>
+    <w:p>
+      <w:pPr>
+        <w:rPr>
+          <w:b/>
+          <w:bCs/>
+        </w:rPr>
+      </w:pPr>
+      <w:r>
+        <w:rPr>
+          <w:b/>
+          <w:bCs/>
+        </w:rPr>
+        <w:t>Maybe we can use justify between to push the element i</w:t>
+      </w:r>
+      <w:r>
+        <w:rPr>
+          <w:b/>
+          <w:bCs/>
+        </w:rPr>
+        <w:t xml:space="preserve">nside a div with flex property </w:t>
+      </w:r>
+      <w:r>
+        <w:rPr>
+          <w:b/>
+          <w:bCs/>
+        </w:rPr>
+        <w:t>to the extreme end</w:t>
+      </w:r>
+      <w:r>
+        <w:rPr>
+          <w:b/>
+          <w:bCs/>
+        </w:rPr>
+        <w:t xml:space="preserve"> </w:t>
+      </w:r>
+      <w:proofErr w:type="gramStart"/>
+      <w:r>
+        <w:rPr>
+          <w:b/>
+          <w:bCs/>
+        </w:rPr>
+        <w:t>and(</w:t>
+      </w:r>
+      <w:proofErr w:type="gramEnd"/>
+      <w:r>
+        <w:rPr>
+          <w:b/>
+          <w:bCs/>
+        </w:rPr>
+        <w:t xml:space="preserve">we try there should be equivalent space between </w:t>
+      </w:r>
+      <w:proofErr w:type="gramStart"/>
+      <w:r>
+        <w:rPr>
+          <w:b/>
+          <w:bCs/>
+        </w:rPr>
+        <w:t>them)</w:t>
+      </w:r>
+      <w:r>
+        <w:rPr>
+          <w:b/>
+          <w:bCs/>
+        </w:rPr>
+        <w:t>(</w:t>
+      </w:r>
+      <w:proofErr w:type="gramEnd"/>
+      <w:r>
+        <w:rPr>
+          <w:b/>
+          <w:bCs/>
+        </w:rPr>
+        <w:t>who knows)</w:t>
+      </w:r>
+    </w:p>
+    <w:p>
+      <w:r>
+        <w:lastRenderedPageBreak/>
+        <w:t xml:space="preserve">We can add media </w:t>
+      </w:r>
+      <w:proofErr w:type="spellStart"/>
+      <w:r>
+        <w:t>quary</w:t>
+      </w:r>
+      <w:proofErr w:type="spellEnd"/>
+      <w:r>
+        <w:t xml:space="preserve"> in Tailwind by </w:t>
+      </w:r>
+      <w:proofErr w:type="spellStart"/>
+      <w:proofErr w:type="gramStart"/>
+      <w:r>
+        <w:rPr>
+          <w:b/>
+          <w:bCs/>
+        </w:rPr>
+        <w:t>md:</w:t>
+      </w:r>
+      <w:r>
+        <w:rPr>
+          <w:b/>
+          <w:bCs/>
+        </w:rPr>
+        <w:t>property</w:t>
+      </w:r>
+      <w:proofErr w:type="spellEnd"/>
+      <w:proofErr w:type="gramEnd"/>
+      <w:r>
+        <w:rPr>
+          <w:b/>
+          <w:bCs/>
+        </w:rPr>
+        <w:t xml:space="preserve"> name</w:t>
+      </w:r>
+      <w:r>
+        <w:rPr>
+          <w:b/>
+          <w:bCs/>
+        </w:rPr>
+        <w:t xml:space="preserve"> </w:t>
+      </w:r>
+      <w:r>
+        <w:t>s</w:t>
+      </w:r>
+      <w:r>
+        <w:t xml:space="preserve">uch </w:t>
+      </w:r>
+      <w:r>
+        <w:t>that when the screen is in medium size then this p</w:t>
+      </w:r>
+      <w:r>
+        <w:t>r</w:t>
+      </w:r>
+      <w:r>
+        <w:t>opert</w:t>
+      </w:r>
+      <w:r>
+        <w:t>y</w:t>
+      </w:r>
+      <w:r>
+        <w:t xml:space="preserve"> will be applied </w:t>
+      </w:r>
+    </w:p>
+    <w:p>
+      <w:r>
+        <w:t xml:space="preserve">You can get </w:t>
+      </w:r>
+      <w:r>
+        <w:t>pre</w:t>
+      </w:r>
+      <w:r>
+        <w:t xml:space="preserve">defined </w:t>
+      </w:r>
+      <w:r>
+        <w:t xml:space="preserve">icons from react </w:t>
+      </w:r>
+      <w:r>
+        <w:t xml:space="preserve">that is </w:t>
+      </w:r>
+      <w:r>
+        <w:t>from react-icons package</w:t>
+      </w:r>
+    </w:p>
+    <w:p>
+      <w:hyperlink r:id="rId26" w:history="1">
+        <w:r>
+          <w:rPr>
+            <w:rStyle w:val="Hyperlink"/>
+          </w:rPr>
+          <w:t>https://react-icons.github.io/react-icons/</w:t>
+        </w:r>
+      </w:hyperlink>
+    </w:p>
+    <w:p>
+      <w:r>
+        <w:t>You can follow above link and you can explore the icons presen</w:t>
+      </w:r>
+      <w:r>
+        <w:t>t</w:t>
+      </w:r>
+      <w:r>
+        <w:t xml:space="preserve"> </w:t>
+      </w:r>
+      <w:r>
+        <w:t>in</w:t>
+      </w:r>
+      <w:r>
+        <w:t xml:space="preserve"> react icons </w:t>
+      </w:r>
+      <w:r>
+        <w:t xml:space="preserve">package and it will tell you how to add it to </w:t>
+      </w:r>
+      <w:r>
+        <w:t xml:space="preserve">you site </w:t>
+      </w:r>
+    </w:p>
+    <w:p>
+      <w:r>
+        <w:t xml:space="preserve">Another tip is that </w:t>
+      </w:r>
+      <w:r>
+        <w:t>to import a</w:t>
+      </w:r>
+      <w:r>
+        <w:t>n</w:t>
+      </w:r>
+      <w:r>
+        <w:t xml:space="preserve"> icon we add the first two letters</w:t>
+      </w:r>
+      <w:r>
+        <w:t xml:space="preserve"> of the icon name</w:t>
+      </w:r>
+      <w:r>
+        <w:t xml:space="preserve"> in the slug</w:t>
+      </w:r>
+      <w:r>
+        <w:t xml:space="preserve"> while using import statement for</w:t>
+      </w:r>
+      <w:r>
+        <w:t xml:space="preserve"> example to i</w:t>
+      </w:r>
+      <w:r>
+        <w:t>m</w:t>
+      </w:r>
+      <w:r>
+        <w:t>port A</w:t>
+      </w:r>
+      <w:r>
+        <w:t xml:space="preserve">I </w:t>
+      </w:r>
+      <w:r>
+        <w:t xml:space="preserve">Outline Cart </w:t>
+      </w:r>
+      <w:r>
+        <w:t>we use slug ai as shown below</w:t>
+      </w:r>
+    </w:p>
+    <w:p>
+      <w:r>
+        <w:t xml:space="preserve">import </w:t>
+      </w:r>
+      <w:proofErr w:type="gramStart"/>
+      <w:r>
+        <w:t xml:space="preserve">{ </w:t>
+      </w:r>
+      <w:proofErr w:type="spellStart"/>
+      <w:r>
+        <w:t>AiOutlineShoppingCart</w:t>
+      </w:r>
+      <w:proofErr w:type="spellEnd"/>
+      <w:proofErr w:type="gramEnd"/>
+      <w:r>
+        <w:t xml:space="preserve"> } from "react-icons/ai";</w:t>
+      </w:r>
+    </w:p>
+    <w:p>
+      <w:r>
+        <w:t>By text-xl property we can increase or decrease a size</w:t>
+      </w:r>
+      <w:r>
+        <w:t xml:space="preserve"> in Tailwind</w:t>
+      </w:r>
+    </w:p>
+    <w:p>
+      <w:r>
+        <w:t xml:space="preserve">We </w:t>
+      </w:r>
+      <w:r>
+        <w:t>find below in the third section of cont</w:t>
+      </w:r>
+      <w:r>
+        <w:t>en</w:t>
+      </w:r>
+      <w:r>
+        <w:t>t</w:t>
+      </w:r>
+      <w:r>
+        <w:t xml:space="preserve"> group</w:t>
+      </w:r>
+      <w:r>
+        <w:t xml:space="preserve"> as shown below</w:t>
+      </w:r>
+    </w:p>
+    <w:p>
+      <w:pPr>
+        <w:jc w:val="center"/>
+      </w:pPr>
+      <w:r>
+        <w:drawing>
+          <wp:inline distT="0" distB="0" distL="0" distR="0" wp14:anchorId="5FD098AD" wp14:editId="409DF570">
+            <wp:extent cx="5731510" cy="2623185"/>
+            <wp:effectExtent l="0" t="0" r="2540" b="5715"/>
+            <wp:docPr id="440274459" name="Picture 1"/>
+            <wp:cNvGraphicFramePr>
+              <a:graphicFrameLocks xmlns:a="http://schemas.openxmlformats.org/drawingml/2006/main" noChangeAspect="1"/>
+            </wp:cNvGraphicFramePr>
+            <a:graphic xmlns:a="http://schemas.openxmlformats.org/drawingml/2006/main">
+              <a:graphicData uri="http://schemas.openxmlformats.org/drawingml/2006/picture">
+                <pic:pic xmlns:pic="http://schemas.openxmlformats.org/drawingml/2006/picture">
+                  <pic:nvPicPr>
+                    <pic:cNvPr id="440274459" name=""/>
+                    <pic:cNvPicPr/>
+                  </pic:nvPicPr>
+                  <pic:blipFill>
+                    <a:blip r:embed="rId27"/>
+                    <a:stretch>
+                      <a:fillRect/>
+                    </a:stretch>
+                  </pic:blipFill>
+                  <pic:spPr>
+                    <a:xfrm>
+                      <a:off x="0" y="0"/>
+                      <a:ext cx="5731510" cy="2623185"/>
+                    </a:xfrm>
+                    <a:prstGeom prst="rect">
+                      <a:avLst/>
+                    </a:prstGeom>
+                  </pic:spPr>
+                </pic:pic>
+              </a:graphicData>
+            </a:graphic>
+          </wp:inline>
+        </w:drawing>
+      </w:r>
+    </w:p>
+    <w:p>
+      <w:r>
+        <w:t xml:space="preserve">We go to its view code </w:t>
       </w:r>
     </w:p>
     <w:sectPr>
@@ -4198,7 +6049,6 @@
   <w:style w:type="character" w:default="1" w:styleId="DefaultParagraphFont">
     <w:name w:val="Default Paragraph Font"/>
     <w:uiPriority w:val="1"/>
-    <w:semiHidden/>
     <w:unhideWhenUsed/>
   </w:style>
   <w:style w:type="table" w:default="1" w:styleId="TableNormal">
@@ -4535,6 +6385,18 @@
       <w:shd w:val="clear" w:color="auto" w:fill="E1DFDD"/>
     </w:rPr>
   </w:style>
+  <w:style w:type="character" w:styleId="FollowedHyperlink">
+    <w:name w:val="FollowedHyperlink"/>
+    <w:basedOn w:val="DefaultParagraphFont"/>
+    <w:uiPriority w:val="99"/>
+    <w:semiHidden/>
+    <w:unhideWhenUsed/>
+    <w:rsid w:val="0001789A"/>
+    <w:rPr>
+      <w:color w:val="954F72" w:themeColor="followedHyperlink"/>
+      <w:u w:val="single"/>
+    </w:rPr>
+  </w:style>
 </w:styles>
 </file>
 

</xml_diff>

<commit_message>
Lesson 37 Designing the Tshirts Page for Codeswear.com
</commit_message>
<xml_diff>
--- a/Notes2.docx
+++ b/Notes2.docx
@@ -5237,6 +5237,9 @@
         <w:jc w:val="center"/>
       </w:pPr>
       <w:r>
+        <w:rPr>
+          <w:noProof/>
+        </w:rPr>
         <w:drawing>
           <wp:inline distT="0" distB="0" distL="0" distR="0" wp14:anchorId="5FD098AD" wp14:editId="409DF570">
             <wp:extent cx="5731510" cy="2623185"/>
@@ -5276,9 +5279,15 @@
     </w:p>
     <w:p>
       <w:r>
-        <w:t xml:space="preserve">We go to its view code </w:t>
-      </w:r>
-    </w:p>
+        <w:t>We go to its view code</w:t>
+      </w:r>
+    </w:p>
+    <w:p>
+      <w:r>
+        <w:t>Now we can see the cards in the ecommerce first tab</w:t>
+      </w:r>
+    </w:p>
+    <w:p/>
     <w:sectPr>
       <w:pgSz w:w="11906" w:h="16838"/>
       <w:pgMar w:top="1440" w:right="1440" w:bottom="1440" w:left="1440" w:header="708" w:footer="708" w:gutter="0"/>
@@ -6049,6 +6058,7 @@
   <w:style w:type="character" w:default="1" w:styleId="DefaultParagraphFont">
     <w:name w:val="Default Paragraph Font"/>
     <w:uiPriority w:val="1"/>
+    <w:semiHidden/>
     <w:unhideWhenUsed/>
   </w:style>
   <w:style w:type="table" w:default="1" w:styleId="TableNormal">

</xml_diff>

<commit_message>
Lesson 38 Designing Mugs, Sticker & Hoodies page for Codeswear.com
</commit_message>
<xml_diff>
--- a/Notes2.docx
+++ b/Notes2.docx
@@ -5285,6 +5285,75 @@
     <w:p>
       <w:r>
         <w:t>Now we can see the cards in the ecommerce first tab</w:t>
+      </w:r>
+    </w:p>
+    <w:p>
+      <w:r>
+        <w:t xml:space="preserve">We can do a permanent word wrap </w:t>
+      </w:r>
+      <w:r>
+        <w:t xml:space="preserve">in all files by going to </w:t>
+      </w:r>
+      <w:r>
+        <w:t xml:space="preserve">settings </w:t>
+      </w:r>
+      <w:r>
+        <w:t>and th</w:t>
+      </w:r>
+      <w:r>
+        <w:t xml:space="preserve">en </w:t>
+      </w:r>
+      <w:r>
+        <w:t xml:space="preserve">search word wrap and then </w:t>
+      </w:r>
+      <w:r>
+        <w:t xml:space="preserve">you can go to </w:t>
+      </w:r>
+      <w:r>
+        <w:t xml:space="preserve">marked below and make it on </w:t>
+      </w:r>
+    </w:p>
+    <w:p>
+      <w:pPr>
+        <w:jc w:val="center"/>
+      </w:pPr>
+      <w:r>
+        <w:lastRenderedPageBreak/>
+        <w:drawing>
+          <wp:inline distT="0" distB="0" distL="0" distR="0" wp14:anchorId="023E9868" wp14:editId="0BE5FCC6">
+            <wp:extent cx="4718649" cy="2642151"/>
+            <wp:effectExtent l="0" t="0" r="6350" b="6350"/>
+            <wp:docPr id="1582030828" name="Picture 1"/>
+            <wp:cNvGraphicFramePr>
+              <a:graphicFrameLocks xmlns:a="http://schemas.openxmlformats.org/drawingml/2006/main" noChangeAspect="1"/>
+            </wp:cNvGraphicFramePr>
+            <a:graphic xmlns:a="http://schemas.openxmlformats.org/drawingml/2006/main">
+              <a:graphicData uri="http://schemas.openxmlformats.org/drawingml/2006/picture">
+                <pic:pic xmlns:pic="http://schemas.openxmlformats.org/drawingml/2006/picture">
+                  <pic:nvPicPr>
+                    <pic:cNvPr id="1582030828" name=""/>
+                    <pic:cNvPicPr/>
+                  </pic:nvPicPr>
+                  <pic:blipFill>
+                    <a:blip r:embed="rId28"/>
+                    <a:stretch>
+                      <a:fillRect/>
+                    </a:stretch>
+                  </pic:blipFill>
+                  <pic:spPr>
+                    <a:xfrm>
+                      <a:off x="0" y="0"/>
+                      <a:ext cx="4721534" cy="2643766"/>
+                    </a:xfrm>
+                    <a:prstGeom prst="rect">
+                      <a:avLst/>
+                    </a:prstGeom>
+                  </pic:spPr>
+                </pic:pic>
+              </a:graphicData>
+            </a:graphic>
+          </wp:inline>
+        </w:drawing>
       </w:r>
     </w:p>
     <w:p/>

</xml_diff>

<commit_message>
Lesson 39 Designing the Cart Sidebar for Codeswear.com
</commit_message>
<xml_diff>
--- a/Notes2.docx
+++ b/Notes2.docx
@@ -5318,6 +5318,9 @@
         <w:jc w:val="center"/>
       </w:pPr>
       <w:r>
+        <w:rPr>
+          <w:noProof/>
+        </w:rPr>
         <w:lastRenderedPageBreak/>
         <w:drawing>
           <wp:inline distT="0" distB="0" distL="0" distR="0" wp14:anchorId="023E9868" wp14:editId="0BE5FCC6">
@@ -5354,6 +5357,104 @@
             </a:graphic>
           </wp:inline>
         </w:drawing>
+      </w:r>
+    </w:p>
+    <w:p>
+      <w:r>
+        <w:t xml:space="preserve">Teacher suggest us that </w:t>
+      </w:r>
+      <w:r>
+        <w:t xml:space="preserve">we make design of cart such that when we hover over the cart button then </w:t>
+      </w:r>
+      <w:r>
+        <w:t xml:space="preserve">we will be shown </w:t>
+      </w:r>
+      <w:r>
+        <w:t xml:space="preserve">cart items and checkout buttons it will increase the conversion </w:t>
+      </w:r>
+      <w:r>
+        <w:t xml:space="preserve">, design is good and </w:t>
+      </w:r>
+      <w:r>
+        <w:t>user experience is goo</w:t>
+      </w:r>
+      <w:r>
+        <w:t xml:space="preserve">d </w:t>
+      </w:r>
+      <w:r>
+        <w:t xml:space="preserve">how to make this card sidebar </w:t>
+      </w:r>
+      <w:r>
+        <w:t xml:space="preserve">by keeping it responsive </w:t>
+      </w:r>
+      <w:r>
+        <w:t xml:space="preserve">we are not going to keep making </w:t>
+      </w:r>
+      <w:r>
+        <w:t xml:space="preserve">it responsive by repeatedly changing design </w:t>
+      </w:r>
+      <w:r>
+        <w:t xml:space="preserve">because we are using </w:t>
+      </w:r>
+      <w:r>
+        <w:t>tailwind css</w:t>
+      </w:r>
+      <w:r>
+        <w:t xml:space="preserve">. </w:t>
+      </w:r>
+      <w:r>
+        <w:t xml:space="preserve">Since we are using </w:t>
+      </w:r>
+      <w:r>
+        <w:t>tailwind css we will</w:t>
+      </w:r>
+      <w:r>
+        <w:t xml:space="preserve"> keep mobile fir</w:t>
+      </w:r>
+      <w:r>
+        <w:t>s</w:t>
+      </w:r>
+      <w:r>
+        <w:t xml:space="preserve">t </w:t>
+      </w:r>
+      <w:r>
+        <w:t xml:space="preserve">as the screen increase </w:t>
+      </w:r>
+      <w:r>
+        <w:t>the sidebar of cart will aut</w:t>
+      </w:r>
+      <w:r>
+        <w:t>oma</w:t>
+      </w:r>
+      <w:r>
+        <w:t xml:space="preserve">tically adapt </w:t>
+      </w:r>
+    </w:p>
+    <w:p>
+      <w:r>
+        <w:t xml:space="preserve">By </w:t>
+      </w:r>
+      <w:proofErr w:type="spellStart"/>
+      <w:r>
+        <w:t>overflow-</w:t>
+      </w:r>
+      <w:proofErr w:type="gramStart"/>
+      <w:r>
+        <w:t>x:hidden</w:t>
+      </w:r>
+      <w:proofErr w:type="spellEnd"/>
+      <w:proofErr w:type="gramEnd"/>
+      <w:r>
+        <w:t xml:space="preserve"> you c</w:t>
+      </w:r>
+      <w:r>
+        <w:t xml:space="preserve">an make sure there is no horizontal </w:t>
+      </w:r>
+      <w:r>
+        <w:t>scrollbar</w:t>
+      </w:r>
+      <w:r>
+        <w:t xml:space="preserve"> maybe in body in case you add it to body. </w:t>
       </w:r>
     </w:p>
     <w:p/>

</xml_diff>

<commit_message>
Lesson 41 Adding Pincode Serviceability Check on Codeswear.com
</commit_message>
<xml_diff>
--- a/Notes2.docx
+++ b/Notes2.docx
@@ -59,18 +59,10 @@
     </w:p>
     <w:p>
       <w:r>
-        <w:t xml:space="preserve">In nay </w:t>
-      </w:r>
-      <w:proofErr w:type="gramStart"/>
-      <w:r>
-        <w:t>container</w:t>
-      </w:r>
-      <w:r>
-        <w:t>(</w:t>
-      </w:r>
-      <w:proofErr w:type="gramEnd"/>
-      <w:r>
-        <w:t>or component)</w:t>
+        <w:t>In nay container</w:t>
+      </w:r>
+      <w:r>
+        <w:t>(or component)</w:t>
       </w:r>
       <w:r>
         <w:t xml:space="preserve"> if you want to </w:t>
@@ -555,14 +547,9 @@
       </w:r>
     </w:p>
     <w:p>
-      <w:proofErr w:type="gramStart"/>
       <w:r>
         <w:lastRenderedPageBreak/>
-        <w:t>So</w:t>
-      </w:r>
-      <w:proofErr w:type="gramEnd"/>
-      <w:r>
-        <w:t xml:space="preserve"> we can so this thing Now we can see it is getting rendered as shown below</w:t>
+        <w:t>So we can so this thing Now we can see it is getting rendered as shown below</w:t>
       </w:r>
     </w:p>
     <w:p>
@@ -664,13 +651,8 @@
         <w:t xml:space="preserve"> s</w:t>
       </w:r>
       <w:r>
-        <w:t xml:space="preserve">ubmit the </w:t>
-      </w:r>
-      <w:proofErr w:type="gramStart"/>
-      <w:r>
-        <w:t>form</w:t>
-      </w:r>
-      <w:proofErr w:type="gramEnd"/>
+        <w:t>ubmit the form</w:t>
+      </w:r>
       <w:r>
         <w:t xml:space="preserve"> we will definitely have to make an API to co</w:t>
       </w:r>
@@ -736,29 +718,8 @@
       </w:r>
     </w:p>
     <w:p>
-      <w:proofErr w:type="gramStart"/>
-      <w:r>
-        <w:t>So</w:t>
-      </w:r>
-      <w:proofErr w:type="gramEnd"/>
-      <w:r>
-        <w:t xml:space="preserve"> for </w:t>
-      </w:r>
-      <w:proofErr w:type="gramStart"/>
-      <w:r>
-        <w:t>now</w:t>
-      </w:r>
-      <w:proofErr w:type="gramEnd"/>
-      <w:r>
-        <w:t xml:space="preserve"> our post request handler </w:t>
-      </w:r>
-      <w:proofErr w:type="gramStart"/>
-      <w:r>
-        <w:t>look</w:t>
-      </w:r>
-      <w:proofErr w:type="gramEnd"/>
-      <w:r>
-        <w:t xml:space="preserve"> like below</w:t>
+      <w:r>
+        <w:t>So for now our post request handler look like below</w:t>
       </w:r>
     </w:p>
     <w:p>
@@ -807,13 +768,8 @@
       </w:r>
     </w:p>
     <w:p>
-      <w:proofErr w:type="gramStart"/>
-      <w:r>
-        <w:t>Ols</w:t>
-      </w:r>
-      <w:proofErr w:type="gramEnd"/>
-      <w:r>
-        <w:t xml:space="preserve"> version used to look like below</w:t>
+      <w:r>
+        <w:t>Ols version used to look like below</w:t>
       </w:r>
     </w:p>
     <w:p>
@@ -921,12 +877,10 @@
         <w:t xml:space="preserve">, not plain JSON, so sending it directly with </w:t>
       </w:r>
       <w:proofErr w:type="spellStart"/>
-      <w:proofErr w:type="gramStart"/>
       <w:r>
         <w:t>res.json</w:t>
       </w:r>
       <w:proofErr w:type="spellEnd"/>
-      <w:proofErr w:type="gramEnd"/>
       <w:r>
         <w:t>(</w:t>
       </w:r>
@@ -984,14 +938,9 @@
     </w:p>
     <w:p>
       <w:r>
-        <w:t xml:space="preserve">export default function </w:t>
-      </w:r>
-      <w:proofErr w:type="gramStart"/>
-      <w:r>
-        <w:t>handler(</w:t>
-      </w:r>
-      <w:proofErr w:type="spellStart"/>
-      <w:proofErr w:type="gramEnd"/>
+        <w:t>export default function handler(</w:t>
+      </w:r>
+      <w:proofErr w:type="spellStart"/>
       <w:r>
         <w:t>req</w:t>
       </w:r>
@@ -1097,7 +1046,6 @@
         <w:t xml:space="preserve">Why </w:t>
       </w:r>
       <w:proofErr w:type="spellStart"/>
-      <w:proofErr w:type="gramStart"/>
       <w:r>
         <w:rPr>
           <w:b/>
@@ -1106,7 +1054,6 @@
         <w:t>res.json</w:t>
       </w:r>
       <w:proofErr w:type="spellEnd"/>
-      <w:proofErr w:type="gramEnd"/>
       <w:r>
         <w:rPr>
           <w:b/>
@@ -1138,25 +1085,18 @@
     </w:p>
     <w:p>
       <w:proofErr w:type="spellStart"/>
-      <w:proofErr w:type="gramStart"/>
       <w:r>
         <w:t>res.status</w:t>
       </w:r>
       <w:proofErr w:type="spellEnd"/>
-      <w:proofErr w:type="gramEnd"/>
-      <w:r>
-        <w:t>(200</w:t>
-      </w:r>
-      <w:proofErr w:type="gramStart"/>
-      <w:r>
-        <w:t>).</w:t>
+      <w:r>
+        <w:t>(200).</w:t>
       </w:r>
       <w:proofErr w:type="spellStart"/>
       <w:r>
         <w:t>json</w:t>
       </w:r>
       <w:proofErr w:type="spellEnd"/>
-      <w:proofErr w:type="gramEnd"/>
       <w:r>
         <w:t>(</w:t>
       </w:r>
@@ -1257,14 +1197,9 @@
     </w:p>
     <w:p>
       <w:r>
-        <w:t xml:space="preserve">export default function </w:t>
-      </w:r>
-      <w:proofErr w:type="gramStart"/>
-      <w:r>
-        <w:t>handler(</w:t>
-      </w:r>
-      <w:proofErr w:type="spellStart"/>
-      <w:proofErr w:type="gramEnd"/>
+        <w:t>export default function handler(</w:t>
+      </w:r>
+      <w:proofErr w:type="spellStart"/>
       <w:r>
         <w:t>req</w:t>
       </w:r>
@@ -1277,12 +1212,10 @@
         <w:t xml:space="preserve">  if (</w:t>
       </w:r>
       <w:proofErr w:type="spellStart"/>
-      <w:proofErr w:type="gramStart"/>
       <w:r>
         <w:t>req.method</w:t>
       </w:r>
       <w:proofErr w:type="spellEnd"/>
-      <w:proofErr w:type="gramEnd"/>
       <w:r>
         <w:t xml:space="preserve"> === "POST") {</w:t>
       </w:r>
@@ -1291,25 +1224,18 @@
         <w:t xml:space="preserve">    </w:t>
       </w:r>
       <w:proofErr w:type="spellStart"/>
-      <w:proofErr w:type="gramStart"/>
       <w:r>
         <w:t>res.status</w:t>
       </w:r>
       <w:proofErr w:type="spellEnd"/>
-      <w:proofErr w:type="gramEnd"/>
-      <w:r>
-        <w:t>(200</w:t>
-      </w:r>
-      <w:proofErr w:type="gramStart"/>
-      <w:r>
-        <w:t>).</w:t>
+      <w:r>
+        <w:t>(200).</w:t>
       </w:r>
       <w:proofErr w:type="spellStart"/>
       <w:r>
         <w:t>json</w:t>
       </w:r>
       <w:proofErr w:type="spellEnd"/>
-      <w:proofErr w:type="gramEnd"/>
       <w:r>
         <w:t>({</w:t>
       </w:r>
@@ -1318,12 +1244,10 @@
         <w:t xml:space="preserve">      method: </w:t>
       </w:r>
       <w:proofErr w:type="spellStart"/>
-      <w:proofErr w:type="gramStart"/>
       <w:r>
         <w:t>req.method</w:t>
       </w:r>
       <w:proofErr w:type="spellEnd"/>
-      <w:proofErr w:type="gramEnd"/>
       <w:r>
         <w:t>,</w:t>
       </w:r>
@@ -1332,12 +1256,10 @@
         <w:t xml:space="preserve">      body: </w:t>
       </w:r>
       <w:proofErr w:type="spellStart"/>
-      <w:proofErr w:type="gramStart"/>
       <w:r>
         <w:t>req.body</w:t>
       </w:r>
       <w:proofErr w:type="spellEnd"/>
-      <w:proofErr w:type="gramEnd"/>
       <w:r>
         <w:t>,</w:t>
       </w:r>
@@ -1346,12 +1268,10 @@
         <w:t xml:space="preserve">      query: </w:t>
       </w:r>
       <w:proofErr w:type="spellStart"/>
-      <w:proofErr w:type="gramStart"/>
       <w:r>
         <w:t>req.query</w:t>
       </w:r>
       <w:proofErr w:type="spellEnd"/>
-      <w:proofErr w:type="gramEnd"/>
       <w:r>
         <w:t>,</w:t>
       </w:r>
@@ -1361,12 +1281,8 @@
       </w:r>
       <w:r>
         <w:br/>
-      </w:r>
-      <w:proofErr w:type="gramStart"/>
-      <w:r>
         <w:t xml:space="preserve">  }</w:t>
       </w:r>
-      <w:proofErr w:type="gramEnd"/>
       <w:r>
         <w:br/>
         <w:t>}</w:t>
@@ -1522,12 +1438,10 @@
           </w:tcPr>
           <w:p>
             <w:proofErr w:type="spellStart"/>
-            <w:proofErr w:type="gramStart"/>
             <w:r>
               <w:t>req.body</w:t>
             </w:r>
             <w:proofErr w:type="spellEnd"/>
-            <w:proofErr w:type="gramEnd"/>
           </w:p>
         </w:tc>
         <w:tc>
@@ -1561,12 +1475,10 @@
           </w:tcPr>
           <w:p>
             <w:proofErr w:type="spellStart"/>
-            <w:proofErr w:type="gramStart"/>
             <w:r>
               <w:t>req.query</w:t>
             </w:r>
             <w:proofErr w:type="spellEnd"/>
-            <w:proofErr w:type="gramEnd"/>
           </w:p>
         </w:tc>
         <w:tc>
@@ -1600,12 +1512,10 @@
           </w:tcPr>
           <w:p>
             <w:proofErr w:type="spellStart"/>
-            <w:proofErr w:type="gramStart"/>
             <w:r>
               <w:t>req.method</w:t>
             </w:r>
             <w:proofErr w:type="spellEnd"/>
-            <w:proofErr w:type="gramEnd"/>
           </w:p>
         </w:tc>
         <w:tc>
@@ -1657,14 +1567,9 @@
     </w:p>
     <w:p>
       <w:r>
-        <w:t xml:space="preserve">export async function </w:t>
-      </w:r>
-      <w:proofErr w:type="gramStart"/>
-      <w:r>
-        <w:t>POST(</w:t>
-      </w:r>
-      <w:proofErr w:type="spellStart"/>
-      <w:proofErr w:type="gramEnd"/>
+        <w:t>export async function POST(</w:t>
+      </w:r>
+      <w:proofErr w:type="spellStart"/>
       <w:r>
         <w:t>req</w:t>
       </w:r>
@@ -1688,12 +1593,10 @@
         <w:t xml:space="preserve"> body = await </w:t>
       </w:r>
       <w:proofErr w:type="spellStart"/>
-      <w:proofErr w:type="gramStart"/>
       <w:r>
         <w:t>req.json</w:t>
       </w:r>
       <w:proofErr w:type="spellEnd"/>
-      <w:proofErr w:type="gramEnd"/>
       <w:r>
         <w:t>();</w:t>
       </w:r>
@@ -1755,12 +1658,10 @@
         <w:t xml:space="preserve">d specific fields like </w:t>
       </w:r>
       <w:proofErr w:type="spellStart"/>
-      <w:proofErr w:type="gramStart"/>
       <w:r>
         <w:t>req.body</w:t>
       </w:r>
       <w:proofErr w:type="spellEnd"/>
-      <w:proofErr w:type="gramEnd"/>
       <w:r>
         <w:t>.</w:t>
       </w:r>
@@ -1770,15 +1671,7 @@
         <w:t>In older version we used to get body like we did in n</w:t>
       </w:r>
       <w:r>
-        <w:t xml:space="preserve">ode js but in modern it </w:t>
-      </w:r>
-      <w:proofErr w:type="gramStart"/>
-      <w:r>
-        <w:t>look</w:t>
-      </w:r>
-      <w:proofErr w:type="gramEnd"/>
-      <w:r>
-        <w:t xml:space="preserve"> like below</w:t>
+        <w:t>ode js but in modern it look like below</w:t>
       </w:r>
     </w:p>
     <w:p>
@@ -1881,18 +1774,10 @@
         <w:t>The problem with the file making</w:t>
       </w:r>
       <w:r>
-        <w:t xml:space="preserve"> </w:t>
-      </w:r>
-      <w:proofErr w:type="gramStart"/>
-      <w:r>
-        <w:t xml:space="preserve">strategy </w:t>
-      </w:r>
-      <w:r>
-        <w:t xml:space="preserve"> is</w:t>
-      </w:r>
-      <w:proofErr w:type="gramEnd"/>
-      <w:r>
-        <w:t xml:space="preserve"> that </w:t>
+        <w:t xml:space="preserve"> strategy </w:t>
+      </w:r>
+      <w:r>
+        <w:t xml:space="preserve"> is that </w:t>
       </w:r>
       <w:r>
         <w:t xml:space="preserve">if suppose </w:t>
@@ -2005,41 +1890,20 @@
       </w:r>
       <w:proofErr w:type="spellEnd"/>
       <w:r>
+        <w:t xml:space="preserve"> element</w:t>
+      </w:r>
+      <w:r>
+        <w:t>(who knows may be I am wrong here)</w:t>
+      </w:r>
+      <w:r>
         <w:t xml:space="preserve"> </w:t>
       </w:r>
-      <w:proofErr w:type="gramStart"/>
-      <w:r>
-        <w:t>element</w:t>
-      </w:r>
-      <w:r>
-        <w:t>(</w:t>
-      </w:r>
-      <w:proofErr w:type="gramEnd"/>
-      <w:r>
-        <w:t xml:space="preserve">who knows </w:t>
-      </w:r>
-      <w:proofErr w:type="gramStart"/>
-      <w:r>
-        <w:t>may be</w:t>
-      </w:r>
-      <w:proofErr w:type="gramEnd"/>
-      <w:r>
-        <w:t xml:space="preserve"> I am wrong here)</w:t>
-      </w:r>
-      <w:r>
-        <w:t xml:space="preserve"> </w:t>
-      </w:r>
       <w:r>
         <w:t xml:space="preserve">and on state update method we used </w:t>
       </w:r>
       <w:proofErr w:type="spellStart"/>
-      <w:proofErr w:type="gramStart"/>
-      <w:r>
-        <w:t>e.target</w:t>
-      </w:r>
-      <w:proofErr w:type="gramEnd"/>
-      <w:r>
-        <w:t>.innerText</w:t>
+      <w:r>
+        <w:t>e.target.innerText</w:t>
       </w:r>
       <w:proofErr w:type="spellEnd"/>
     </w:p>
@@ -2056,13 +1920,8 @@
         <w:t xml:space="preserve"> we can use </w:t>
       </w:r>
       <w:proofErr w:type="spellStart"/>
-      <w:proofErr w:type="gramStart"/>
-      <w:r>
-        <w:t>e.target</w:t>
-      </w:r>
-      <w:proofErr w:type="gramEnd"/>
-      <w:r>
-        <w:t>,value</w:t>
+      <w:r>
+        <w:t>e.target,value</w:t>
       </w:r>
       <w:proofErr w:type="spellEnd"/>
       <w:r>
@@ -2178,16 +2037,13 @@
         <w:t xml:space="preserve">Shortcut for </w:t>
       </w:r>
       <w:proofErr w:type="spellStart"/>
-      <w:proofErr w:type="gramStart"/>
       <w:r>
         <w:t>margin:auto</w:t>
       </w:r>
       <w:proofErr w:type="spellEnd"/>
-      <w:proofErr w:type="gramEnd"/>
       <w:r>
         <w:t xml:space="preserve"> will be </w:t>
       </w:r>
-      <w:proofErr w:type="gramStart"/>
       <w:r>
         <w:rPr>
           <w:b/>
@@ -2195,7 +2051,6 @@
         </w:rPr>
         <w:t>m:auto</w:t>
       </w:r>
-      <w:proofErr w:type="gramEnd"/>
       <w:r>
         <w:rPr>
           <w:b/>
@@ -2259,18 +2114,10 @@
     </w:p>
     <w:p>
       <w:r>
-        <w:t xml:space="preserve">Suppose you have 50 blogs and you want to show 5 blogs on each </w:t>
-      </w:r>
-      <w:proofErr w:type="gramStart"/>
-      <w:r>
-        <w:t xml:space="preserve">pages </w:t>
-      </w:r>
-      <w:r>
-        <w:t xml:space="preserve"> so</w:t>
-      </w:r>
-      <w:proofErr w:type="gramEnd"/>
-      <w:r>
-        <w:t xml:space="preserve"> 10 pages </w:t>
+        <w:t xml:space="preserve">Suppose you have 50 blogs and you want to show 5 blogs on each pages </w:t>
+      </w:r>
+      <w:r>
+        <w:t xml:space="preserve"> so 10 pages </w:t>
       </w:r>
       <w:r>
         <w:t>will</w:t>
@@ -2281,16 +2128,11 @@
       <w:r>
         <w:t xml:space="preserve">be </w:t>
       </w:r>
-      <w:proofErr w:type="gramStart"/>
       <w:r>
         <w:t xml:space="preserve">formed </w:t>
       </w:r>
       <w:r>
-        <w:t>.</w:t>
-      </w:r>
-      <w:proofErr w:type="gramEnd"/>
-      <w:r>
-        <w:t xml:space="preserve"> In the similar way </w:t>
+        <w:t xml:space="preserve">. In the similar way </w:t>
       </w:r>
       <w:r>
         <w:t xml:space="preserve">pagination can be showed </w:t>
@@ -2407,15 +2249,7 @@
         <w:t xml:space="preserve">that we will not good components </w:t>
       </w:r>
       <w:r>
-        <w:t xml:space="preserve">means you won’t get good packages for doing any </w:t>
-      </w:r>
-      <w:proofErr w:type="gramStart"/>
-      <w:r>
-        <w:t>work(</w:t>
-      </w:r>
-      <w:proofErr w:type="gramEnd"/>
-      <w:r>
-        <w:t>who knows)</w:t>
+        <w:t>means you won’t get good packages for doing any work(who knows)</w:t>
       </w:r>
     </w:p>
     <w:p>
@@ -2444,27 +2278,14 @@
       </w:r>
     </w:p>
     <w:p>
-      <w:proofErr w:type="gramStart"/>
-      <w:r>
-        <w:t>So</w:t>
-      </w:r>
-      <w:proofErr w:type="gramEnd"/>
-      <w:r>
-        <w:t xml:space="preserve"> we run the above command I context of </w:t>
+      <w:r>
+        <w:t xml:space="preserve">So we run the above command I context of </w:t>
       </w:r>
       <w:r>
         <w:t xml:space="preserve">yarn </w:t>
       </w:r>
       <w:r>
-        <w:t xml:space="preserve">by </w:t>
-      </w:r>
-      <w:proofErr w:type="gramStart"/>
-      <w:r>
-        <w:t>using  below</w:t>
-      </w:r>
-      <w:proofErr w:type="gramEnd"/>
-      <w:r>
-        <w:t xml:space="preserve"> command</w:t>
+        <w:t>by using  below command</w:t>
       </w:r>
     </w:p>
     <w:p>
@@ -2552,29 +2373,13 @@
         <w:t xml:space="preserve">Data length </w:t>
       </w:r>
       <w:r>
-        <w:t xml:space="preserve">of the data that to be </w:t>
-      </w:r>
-      <w:proofErr w:type="gramStart"/>
-      <w:r>
-        <w:t>shown</w:t>
-      </w:r>
-      <w:r>
-        <w:t xml:space="preserve"> ,</w:t>
-      </w:r>
-      <w:proofErr w:type="gramEnd"/>
-      <w:r>
-        <w:t xml:space="preserve"> next is the </w:t>
-      </w:r>
-      <w:proofErr w:type="gramStart"/>
-      <w:r>
-        <w:t xml:space="preserve">function  </w:t>
-      </w:r>
-      <w:r>
-        <w:t>that</w:t>
-      </w:r>
-      <w:proofErr w:type="gramEnd"/>
-      <w:r>
-        <w:t xml:space="preserve"> will be called when we scroll and reach the bottom and more data is needed to be loaded.</w:t>
+        <w:t>of the data that to be shown</w:t>
+      </w:r>
+      <w:r>
+        <w:t xml:space="preserve"> , next is the function  </w:t>
+      </w:r>
+      <w:r>
+        <w:t>that will be called when we scroll and reach the bottom and more data is needed to be loaded.</w:t>
       </w:r>
     </w:p>
     <w:p>
@@ -2602,21 +2407,13 @@
         <w:t>w</w:t>
       </w:r>
       <w:r>
-        <w:t xml:space="preserve">n </w:t>
-      </w:r>
-      <w:proofErr w:type="gramStart"/>
-      <w:r>
-        <w:t>function</w:t>
+        <w:t>n function</w:t>
       </w:r>
       <w:r>
         <w:t>al</w:t>
       </w:r>
       <w:r>
-        <w:t>ity(</w:t>
-      </w:r>
-      <w:proofErr w:type="gramEnd"/>
-      <w:r>
-        <w:t>who knows)</w:t>
+        <w:t>ity(who knows)</w:t>
       </w:r>
     </w:p>
     <w:p>
@@ -2698,15 +2495,7 @@
         <w:t xml:space="preserve">it is defined like this </w:t>
       </w:r>
       <w:r>
-        <w:t xml:space="preserve">if we keep single </w:t>
-      </w:r>
-      <w:proofErr w:type="gramStart"/>
-      <w:r>
-        <w:t>item</w:t>
-      </w:r>
-      <w:proofErr w:type="gramEnd"/>
-      <w:r>
-        <w:t xml:space="preserve"> </w:t>
+        <w:t xml:space="preserve">if we keep single item </w:t>
       </w:r>
       <w:r>
         <w:t>we need to see al</w:t>
@@ -2715,21 +2504,13 @@
         <w:t>l</w:t>
       </w:r>
       <w:r>
-        <w:t xml:space="preserve"> </w:t>
-      </w:r>
-      <w:proofErr w:type="gramStart"/>
-      <w:r>
-        <w:t>this thi</w:t>
+        <w:t xml:space="preserve"> this thi</w:t>
       </w:r>
       <w:r>
         <w:t>n</w:t>
       </w:r>
       <w:r>
-        <w:t>gs</w:t>
-      </w:r>
-      <w:proofErr w:type="gramEnd"/>
-      <w:r>
-        <w:t xml:space="preserve"> </w:t>
+        <w:t xml:space="preserve">gs </w:t>
       </w:r>
     </w:p>
     <w:p>
@@ -2739,7 +2520,6 @@
           <w:bCs/>
         </w:rPr>
       </w:pPr>
-      <w:proofErr w:type="gramStart"/>
       <w:r>
         <w:rPr>
           <w:b/>
@@ -2747,7 +2527,6 @@
         </w:rPr>
         <w:t>Note:-</w:t>
       </w:r>
-      <w:proofErr w:type="gramEnd"/>
     </w:p>
     <w:p>
       <w:pPr>
@@ -2759,15 +2538,7 @@
         <w:t xml:space="preserve">Sometime it happens </w:t>
       </w:r>
       <w:r>
-        <w:t xml:space="preserve">in react that one component is </w:t>
-      </w:r>
-      <w:proofErr w:type="gramStart"/>
-      <w:r>
-        <w:t>show  two</w:t>
-      </w:r>
-      <w:proofErr w:type="gramEnd"/>
-      <w:r>
-        <w:t xml:space="preserve"> times so reload to remove the bug</w:t>
+        <w:t>in react that one component is show  two times so reload to remove the bug</w:t>
       </w:r>
     </w:p>
     <w:p>
@@ -2783,15 +2554,7 @@
         <w:t xml:space="preserve">except for responsiveness </w:t>
       </w:r>
       <w:r>
-        <w:t xml:space="preserve">we </w:t>
-      </w:r>
-      <w:proofErr w:type="gramStart"/>
-      <w:r>
-        <w:t>will  make</w:t>
-      </w:r>
-      <w:proofErr w:type="gramEnd"/>
-      <w:r>
-        <w:t xml:space="preserve"> our blog responsive and will write media queries </w:t>
+        <w:t xml:space="preserve">we will  make our blog responsive and will write media queries </w:t>
       </w:r>
       <w:r>
         <w:t>how we can we run media que</w:t>
@@ -2817,13 +2580,8 @@
         <w:t xml:space="preserve">the website </w:t>
       </w:r>
       <w:r>
-        <w:t xml:space="preserve">and if you gave </w:t>
-      </w:r>
-      <w:proofErr w:type="gramStart"/>
-      <w:r>
-        <w:t>responsiveness</w:t>
-      </w:r>
-      <w:proofErr w:type="gramEnd"/>
+        <w:t>and if you gave responsiveness</w:t>
+      </w:r>
       <w:r>
         <w:t xml:space="preserve"> it was an addon</w:t>
       </w:r>
@@ -2842,12 +2600,10 @@
         <w:t xml:space="preserve">you can say bit in </w:t>
       </w:r>
       <w:proofErr w:type="spellStart"/>
-      <w:proofErr w:type="gramStart"/>
       <w:r>
         <w:t>todays</w:t>
       </w:r>
       <w:proofErr w:type="spellEnd"/>
-      <w:proofErr w:type="gramEnd"/>
       <w:r>
         <w:t xml:space="preserve"> time </w:t>
       </w:r>
@@ -2924,11 +2680,7 @@
     </w:p>
     <w:p>
       <w:r>
-        <w:t xml:space="preserve">We will </w:t>
-      </w:r>
-      <w:proofErr w:type="gramStart"/>
-      <w:r>
-        <w:t>ho</w:t>
+        <w:t>We will ho</w:t>
       </w:r>
       <w:r>
         <w:t>s</w:t>
@@ -2937,11 +2689,7 @@
         <w:t>t</w:t>
       </w:r>
       <w:r>
-        <w:t>s</w:t>
-      </w:r>
-      <w:proofErr w:type="gramEnd"/>
-      <w:r>
-        <w:t xml:space="preserve"> the web</w:t>
+        <w:t>s the web</w:t>
       </w:r>
       <w:r>
         <w:t>s</w:t>
@@ -3068,15 +2816,7 @@
     </w:p>
     <w:p>
       <w:r>
-        <w:t xml:space="preserve">IN digital ocean we make new </w:t>
-      </w:r>
-      <w:proofErr w:type="gramStart"/>
-      <w:r>
-        <w:t>user(</w:t>
-      </w:r>
-      <w:proofErr w:type="gramEnd"/>
-      <w:r>
-        <w:t xml:space="preserve">who knows) </w:t>
+        <w:t xml:space="preserve">IN digital ocean we make new user(who knows) </w:t>
       </w:r>
     </w:p>
     <w:p>
@@ -3114,26 +2854,13 @@
       <w:r>
         <w:t xml:space="preserve">process will be </w:t>
       </w:r>
-      <w:proofErr w:type="gramStart"/>
-      <w:r>
-        <w:t>build</w:t>
-      </w:r>
-      <w:proofErr w:type="gramEnd"/>
-      <w:r>
-        <w:t xml:space="preserve"> there </w:t>
-      </w:r>
-    </w:p>
-    <w:p>
-      <w:r>
-        <w:t xml:space="preserve">It will ask you to make database in </w:t>
-      </w:r>
-      <w:proofErr w:type="gramStart"/>
-      <w:r>
-        <w:t>there</w:t>
-      </w:r>
-      <w:proofErr w:type="gramEnd"/>
-      <w:r>
-        <w:t xml:space="preserve"> services.</w:t>
+      <w:r>
+        <w:t xml:space="preserve">build there </w:t>
+      </w:r>
+    </w:p>
+    <w:p>
+      <w:r>
+        <w:t>It will ask you to make database in there services.</w:t>
       </w:r>
       <w:r>
         <w:t xml:space="preserve"> (who knows)</w:t>
@@ -3184,14 +2911,9 @@
       </w:r>
       <w:proofErr w:type="spellEnd"/>
       <w:r>
-        <w:t xml:space="preserve"> it will be </w:t>
-      </w:r>
-      <w:proofErr w:type="gramStart"/>
-      <w:r>
-        <w:t>good(</w:t>
-      </w:r>
-      <w:proofErr w:type="spellStart"/>
-      <w:proofErr w:type="gramEnd"/>
+        <w:t xml:space="preserve"> it will be good(</w:t>
+      </w:r>
+      <w:proofErr w:type="spellStart"/>
       <w:r>
         <w:t>wjp</w:t>
       </w:r>
@@ -3208,101 +2930,73 @@
           <w:color w:val="EE0000"/>
         </w:rPr>
       </w:pPr>
-      <w:proofErr w:type="gramStart"/>
       <w:r>
         <w:rPr>
           <w:b/>
           <w:bCs/>
           <w:color w:val="EE0000"/>
         </w:rPr>
-        <w:t>‘ can</w:t>
-      </w:r>
-      <w:proofErr w:type="gramEnd"/>
+        <w:t xml:space="preserve">‘ can create </w:t>
+      </w:r>
       <w:r>
         <w:rPr>
           <w:b/>
           <w:bCs/>
           <w:color w:val="EE0000"/>
         </w:rPr>
-        <w:t xml:space="preserve"> create </w:t>
-      </w:r>
+        <w:t xml:space="preserve">error in </w:t>
+      </w:r>
+      <w:proofErr w:type="spellStart"/>
       <w:r>
         <w:rPr>
           <w:b/>
           <w:bCs/>
           <w:color w:val="EE0000"/>
         </w:rPr>
-        <w:t xml:space="preserve">error in </w:t>
-      </w:r>
-      <w:proofErr w:type="spellStart"/>
+        <w:t>js</w:t>
+      </w:r>
       <w:r>
         <w:rPr>
           <w:b/>
           <w:bCs/>
           <w:color w:val="EE0000"/>
         </w:rPr>
-        <w:t>js</w:t>
-      </w:r>
+        <w:t>x</w:t>
+      </w:r>
+      <w:proofErr w:type="spellEnd"/>
       <w:r>
         <w:rPr>
           <w:b/>
           <w:bCs/>
           <w:color w:val="EE0000"/>
         </w:rPr>
-        <w:t>x</w:t>
-      </w:r>
-      <w:proofErr w:type="spellEnd"/>
+        <w:t xml:space="preserve"> in </w:t>
+      </w:r>
+      <w:proofErr w:type="spellStart"/>
       <w:r>
         <w:rPr>
           <w:b/>
           <w:bCs/>
           <w:color w:val="EE0000"/>
         </w:rPr>
-        <w:t xml:space="preserve"> in </w:t>
-      </w:r>
-      <w:proofErr w:type="spellStart"/>
+        <w:t>Nextjs</w:t>
+      </w:r>
+      <w:proofErr w:type="spellEnd"/>
       <w:r>
         <w:rPr>
           <w:b/>
           <w:bCs/>
           <w:color w:val="EE0000"/>
         </w:rPr>
-        <w:t>Nextjs</w:t>
-      </w:r>
-      <w:proofErr w:type="spellEnd"/>
+        <w:t xml:space="preserve"> or maybe in React.</w:t>
+      </w:r>
       <w:r>
         <w:rPr>
           <w:b/>
           <w:bCs/>
           <w:color w:val="EE0000"/>
         </w:rPr>
-        <w:t xml:space="preserve"> or maybe in </w:t>
-      </w:r>
-      <w:proofErr w:type="gramStart"/>
-      <w:r>
-        <w:rPr>
-          <w:b/>
-          <w:bCs/>
-          <w:color w:val="EE0000"/>
-        </w:rPr>
-        <w:t>React.</w:t>
-      </w:r>
-      <w:r>
-        <w:rPr>
-          <w:b/>
-          <w:bCs/>
-          <w:color w:val="EE0000"/>
-        </w:rPr>
-        <w:t>(</w:t>
-      </w:r>
-      <w:proofErr w:type="gramEnd"/>
-      <w:r>
-        <w:rPr>
-          <w:b/>
-          <w:bCs/>
-          <w:color w:val="EE0000"/>
-        </w:rPr>
-        <w:t>maybe it is an outdated problem)</w:t>
+        <w:t>(maybe it is an outdated problem)</w:t>
       </w:r>
     </w:p>
     <w:p>
@@ -3327,12 +3021,10 @@
         <w:t xml:space="preserve">you can make it like that and if it </w:t>
       </w:r>
       <w:proofErr w:type="spellStart"/>
-      <w:proofErr w:type="gramStart"/>
       <w:r>
         <w:t>become</w:t>
       </w:r>
       <w:proofErr w:type="spellEnd"/>
-      <w:proofErr w:type="gramEnd"/>
       <w:r>
         <w:t xml:space="preserve"> profitable then you can scale it (who knows) </w:t>
       </w:r>
@@ -3341,7 +3033,6 @@
       <w:r>
         <w:t xml:space="preserve">Now as you commit then </w:t>
       </w:r>
-      <w:proofErr w:type="gramStart"/>
       <w:r>
         <w:t>Digital</w:t>
       </w:r>
@@ -3349,25 +3040,13 @@
         <w:t xml:space="preserve"> </w:t>
       </w:r>
       <w:r>
-        <w:t>ocean</w:t>
-      </w:r>
-      <w:proofErr w:type="gramEnd"/>
-      <w:r>
-        <w:t xml:space="preserve"> will build it</w:t>
-      </w:r>
-      <w:r>
-        <w:t xml:space="preserve"> automatically for </w:t>
-      </w:r>
-      <w:proofErr w:type="gramStart"/>
-      <w:r>
-        <w:t>you.</w:t>
-      </w:r>
-      <w:r>
-        <w:t>(</w:t>
-      </w:r>
-      <w:proofErr w:type="gramEnd"/>
-      <w:r>
-        <w:t>maybe if auto</w:t>
+        <w:t>ocean will build it</w:t>
+      </w:r>
+      <w:r>
+        <w:t xml:space="preserve"> automatically for you.</w:t>
+      </w:r>
+      <w:r>
+        <w:t>(maybe if auto</w:t>
       </w:r>
       <w:r>
         <w:t xml:space="preserve"> </w:t>
@@ -3376,15 +3055,7 @@
         <w:t xml:space="preserve">deploy option was selected </w:t>
       </w:r>
       <w:r>
-        <w:t xml:space="preserve">in the </w:t>
-      </w:r>
-      <w:proofErr w:type="gramStart"/>
-      <w:r>
-        <w:t>setting(</w:t>
-      </w:r>
-      <w:proofErr w:type="gramEnd"/>
-      <w:r>
-        <w:t>who knows)</w:t>
+        <w:t>in the setting(who knows)</w:t>
       </w:r>
       <w:r>
         <w:t>)</w:t>
@@ -3422,18 +3093,10 @@
         <w:t xml:space="preserve">here (maybe </w:t>
       </w:r>
       <w:r>
-        <w:t xml:space="preserve">very large app don’t work </w:t>
-      </w:r>
-      <w:proofErr w:type="gramStart"/>
-      <w:r>
-        <w:t>properly</w:t>
-      </w:r>
-      <w:r>
-        <w:t>(</w:t>
-      </w:r>
-      <w:proofErr w:type="gramEnd"/>
-      <w:r>
-        <w:t>who knows)</w:t>
+        <w:t>very large app don’t work properly</w:t>
+      </w:r>
+      <w:r>
+        <w:t>(who knows)</w:t>
       </w:r>
       <w:r>
         <w:t>)</w:t>
@@ -3474,18 +3137,10 @@
         <w:t xml:space="preserve">Now we will see </w:t>
       </w:r>
       <w:r>
-        <w:t xml:space="preserve">how Google analytics and search </w:t>
-      </w:r>
-      <w:proofErr w:type="gramStart"/>
-      <w:r>
-        <w:t>console</w:t>
-      </w:r>
-      <w:r>
-        <w:t>(</w:t>
-      </w:r>
-      <w:proofErr w:type="gramEnd"/>
-      <w:r>
-        <w:t xml:space="preserve">who </w:t>
+        <w:t>how Google analytics and search console</w:t>
+      </w:r>
+      <w:r>
+        <w:t xml:space="preserve">(who </w:t>
       </w:r>
       <w:proofErr w:type="spellStart"/>
       <w:r>
@@ -3652,21 +3307,13 @@
         <w:t xml:space="preserve">ck </w:t>
       </w:r>
       <w:r>
-        <w:t xml:space="preserve">which is also called </w:t>
-      </w:r>
-      <w:proofErr w:type="gramStart"/>
+        <w:t>which is also called S</w:t>
+      </w:r>
       <w:r>
         <w:t>S</w:t>
       </w:r>
       <w:r>
-        <w:t>S</w:t>
-      </w:r>
-      <w:r>
-        <w:t>LV(</w:t>
-      </w:r>
-      <w:proofErr w:type="gramEnd"/>
-      <w:r>
-        <w:t>who knows)</w:t>
+        <w:t>LV(who knows)</w:t>
       </w:r>
       <w:r>
         <w:t xml:space="preserve"> and </w:t>
@@ -3713,13 +3360,8 @@
       <w:r>
         <w:t xml:space="preserve">of the application. </w:t>
       </w:r>
-      <w:proofErr w:type="gramStart"/>
-      <w:r>
-        <w:t>So</w:t>
-      </w:r>
-      <w:proofErr w:type="gramEnd"/>
-      <w:r>
-        <w:t xml:space="preserve"> if we want that the domain we have need to be pointe</w:t>
+      <w:r>
+        <w:t>So if we want that the domain we have need to be pointe</w:t>
       </w:r>
       <w:r>
         <w:t>d</w:t>
@@ -3750,18 +3392,10 @@
     </w:p>
     <w:p>
       <w:r>
-        <w:t xml:space="preserve">Of you chose the former then you </w:t>
-      </w:r>
-      <w:proofErr w:type="gramStart"/>
-      <w:r>
-        <w:t xml:space="preserve">will  </w:t>
-      </w:r>
-      <w:r>
-        <w:t>see</w:t>
-      </w:r>
-      <w:proofErr w:type="gramEnd"/>
-      <w:r>
-        <w:t xml:space="preserve"> that from the dashboard </w:t>
+        <w:t xml:space="preserve">Of you chose the former then you will  </w:t>
+      </w:r>
+      <w:r>
+        <w:t xml:space="preserve">see that from the dashboard </w:t>
       </w:r>
       <w:r>
         <w:t xml:space="preserve">that how things are happening </w:t>
@@ -3770,26 +3404,10 @@
         <w:t xml:space="preserve">and if you chose later </w:t>
       </w:r>
       <w:r>
-        <w:t xml:space="preserve">then you need to point it to a Digital </w:t>
-      </w:r>
-      <w:proofErr w:type="gramStart"/>
-      <w:r>
-        <w:t>ocean(</w:t>
-      </w:r>
-      <w:proofErr w:type="gramEnd"/>
-      <w:r>
-        <w:t>who knows)</w:t>
-      </w:r>
-      <w:r>
-        <w:t xml:space="preserve">. By former we bring the domain in the digital </w:t>
-      </w:r>
-      <w:proofErr w:type="gramStart"/>
-      <w:r>
-        <w:t>ocean(</w:t>
-      </w:r>
-      <w:proofErr w:type="gramEnd"/>
-      <w:r>
-        <w:t>who knows)</w:t>
+        <w:t>then you need to point it to a Digital ocean(who knows)</w:t>
+      </w:r>
+      <w:r>
+        <w:t>. By former we bring the domain in the digital ocean(who knows)</w:t>
       </w:r>
       <w:r>
         <w:t xml:space="preserve">. </w:t>
@@ -3835,13 +3453,8 @@
       </w:r>
     </w:p>
     <w:p>
-      <w:proofErr w:type="gramStart"/>
-      <w:r>
-        <w:t>So</w:t>
-      </w:r>
-      <w:proofErr w:type="gramEnd"/>
-      <w:r>
-        <w:t xml:space="preserve"> we went to Google search console</w:t>
+      <w:r>
+        <w:t>So we went to Google search console</w:t>
       </w:r>
       <w:r>
         <w:t xml:space="preserve"> so we add a property there </w:t>
@@ -3916,15 +3529,7 @@
         <w:t xml:space="preserve">omain </w:t>
       </w:r>
       <w:r>
-        <w:t xml:space="preserve">ad then you need to verify it so it </w:t>
-      </w:r>
-      <w:proofErr w:type="gramStart"/>
-      <w:r>
-        <w:t>give</w:t>
-      </w:r>
-      <w:proofErr w:type="gramEnd"/>
-      <w:r>
-        <w:t xml:space="preserve"> us some text which we will paste in the </w:t>
+        <w:t xml:space="preserve">ad then you need to verify it so it give us some text which we will paste in the </w:t>
       </w:r>
       <w:r>
         <w:t xml:space="preserve">DNS records to give the proof for ownership of domain. </w:t>
@@ -4018,11 +3623,7 @@
         <w:t xml:space="preserve"> and how to integrate </w:t>
       </w:r>
       <w:r>
-        <w:t xml:space="preserve">payment gateway to the </w:t>
-      </w:r>
-      <w:proofErr w:type="gramStart"/>
-      <w:r>
-        <w:t>websi</w:t>
+        <w:t>payment gateway to the websi</w:t>
       </w:r>
       <w:r>
         <w:t>t</w:t>
@@ -4033,23 +3634,14 @@
       <w:r>
         <w:t>.</w:t>
       </w:r>
-      <w:proofErr w:type="gramEnd"/>
       <w:r>
         <w:t xml:space="preserve"> How orders will come </w:t>
       </w:r>
       <w:r>
-        <w:t xml:space="preserve">and how admin panel will be </w:t>
-      </w:r>
-      <w:proofErr w:type="gramStart"/>
-      <w:r>
-        <w:t xml:space="preserve">made </w:t>
-      </w:r>
-      <w:r>
-        <w:t>.</w:t>
-      </w:r>
-      <w:proofErr w:type="gramEnd"/>
-      <w:r>
-        <w:t xml:space="preserve"> F</w:t>
+        <w:t xml:space="preserve">and how admin panel will be made </w:t>
+      </w:r>
+      <w:r>
+        <w:t>. F</w:t>
       </w:r>
       <w:r>
         <w:t>r</w:t>
@@ -4370,18 +3962,10 @@
         <w:t xml:space="preserve">Like Bootstrap Tailwind also have </w:t>
       </w:r>
       <w:r>
-        <w:t xml:space="preserve">predefined </w:t>
-      </w:r>
-      <w:proofErr w:type="gramStart"/>
-      <w:r>
-        <w:t xml:space="preserve">class </w:t>
-      </w:r>
-      <w:r>
-        <w:t>.So</w:t>
-      </w:r>
-      <w:proofErr w:type="gramEnd"/>
-      <w:r>
-        <w:t xml:space="preserve"> we have tailwind css is installed </w:t>
+        <w:t xml:space="preserve">predefined class </w:t>
+      </w:r>
+      <w:r>
+        <w:t xml:space="preserve">.So we have tailwind css is installed </w:t>
       </w:r>
       <w:r>
         <w:t>and we can use our utility class</w:t>
@@ -4489,15 +4073,7 @@
         <w:t xml:space="preserve">There are some pages which you will find in almost all Ecommerce website that is </w:t>
       </w:r>
       <w:r>
-        <w:t xml:space="preserve">Product </w:t>
-      </w:r>
-      <w:proofErr w:type="gramStart"/>
-      <w:r>
-        <w:t>page ,</w:t>
-      </w:r>
-      <w:proofErr w:type="gramEnd"/>
-      <w:r>
-        <w:t xml:space="preserve"> Home page</w:t>
+        <w:t>Product page , Home page</w:t>
       </w:r>
       <w:r>
         <w:t>, Checkout page</w:t>
@@ -4509,160 +4085,136 @@
         <w:t>n</w:t>
       </w:r>
       <w:r>
+        <w:t xml:space="preserve"> order</w:t>
+      </w:r>
+      <w:r>
+        <w:t xml:space="preserve"> , login and </w:t>
+      </w:r>
+      <w:proofErr w:type="spellStart"/>
+      <w:r>
+        <w:t>signUp</w:t>
+      </w:r>
+      <w:proofErr w:type="spellEnd"/>
+      <w:r>
+        <w:t xml:space="preserve">. We will create their blank slate here </w:t>
+      </w:r>
+      <w:r>
+        <w:t xml:space="preserve">and then we will start </w:t>
+      </w:r>
+      <w:proofErr w:type="spellStart"/>
+      <w:r>
+        <w:t>c</w:t>
+      </w:r>
+      <w:r>
+        <w:t>odeswear</w:t>
+      </w:r>
+      <w:proofErr w:type="spellEnd"/>
+      <w:r>
+        <w:t xml:space="preserve"> development </w:t>
+      </w:r>
+    </w:p>
+    <w:p>
+      <w:r>
+        <w:t xml:space="preserve">Whatever you </w:t>
+      </w:r>
+      <w:r>
+        <w:t xml:space="preserve">by [slug] is actually dynamic </w:t>
+      </w:r>
+      <w:r>
+        <w:t xml:space="preserve">page </w:t>
+      </w:r>
+      <w:r>
+        <w:t xml:space="preserve">routes </w:t>
+      </w:r>
+    </w:p>
+    <w:p>
+      <w:r>
+        <w:t>There are many thin</w:t>
+      </w:r>
+      <w:r>
+        <w:t>g</w:t>
+      </w:r>
+      <w:r>
+        <w:t xml:space="preserve">s which we think we need to o on the spot like </w:t>
+      </w:r>
+      <w:r>
+        <w:t xml:space="preserve">Forget Password </w:t>
+      </w:r>
+    </w:p>
+    <w:p>
+      <w:r>
+        <w:t>You can even launch this e</w:t>
+      </w:r>
+      <w:r>
+        <w:t>c</w:t>
+      </w:r>
+      <w:r>
+        <w:t>om</w:t>
+      </w:r>
+      <w:r>
+        <w:t>m</w:t>
+      </w:r>
+      <w:r>
+        <w:t xml:space="preserve">erce site </w:t>
+      </w:r>
+    </w:p>
+    <w:p>
+      <w:r>
+        <w:t>Navbar and footer are important for our website and it will be present in all of the pages</w:t>
+      </w:r>
+    </w:p>
+    <w:p>
+      <w:r>
+        <w:t xml:space="preserve">We will use app for that purposes(maybe </w:t>
+      </w:r>
+      <w:proofErr w:type="spellStart"/>
+      <w:r>
+        <w:t>ol</w:t>
+      </w:r>
+      <w:proofErr w:type="spellEnd"/>
+      <w:r>
+        <w:t xml:space="preserve"> version of </w:t>
+      </w:r>
+      <w:proofErr w:type="spellStart"/>
+      <w:r>
+        <w:t>layout.jsx</w:t>
+      </w:r>
+      <w:proofErr w:type="spellEnd"/>
+      <w:r>
+        <w:t>)</w:t>
+      </w:r>
+    </w:p>
+    <w:p>
+      <w:r>
+        <w:t xml:space="preserve">Now there is site that is </w:t>
+      </w:r>
+      <w:proofErr w:type="spellStart"/>
+      <w:r>
+        <w:t>Tailblocks</w:t>
+      </w:r>
+      <w:proofErr w:type="spellEnd"/>
+      <w:r>
+        <w:t xml:space="preserve"> that will give you </w:t>
+      </w:r>
+      <w:proofErr w:type="spellStart"/>
+      <w:r>
+        <w:t>tailblocks</w:t>
+      </w:r>
+      <w:proofErr w:type="spellEnd"/>
+      <w:r>
         <w:t xml:space="preserve"> </w:t>
       </w:r>
-      <w:proofErr w:type="gramStart"/>
-      <w:r>
-        <w:t>order</w:t>
-      </w:r>
-      <w:r>
-        <w:t xml:space="preserve"> ,</w:t>
-      </w:r>
-      <w:proofErr w:type="gramEnd"/>
-      <w:r>
-        <w:t xml:space="preserve"> login and </w:t>
-      </w:r>
-      <w:proofErr w:type="spellStart"/>
-      <w:r>
-        <w:t>signUp</w:t>
-      </w:r>
-      <w:proofErr w:type="spellEnd"/>
-      <w:r>
-        <w:t xml:space="preserve">. We will create their blank slate here </w:t>
-      </w:r>
-      <w:r>
-        <w:t xml:space="preserve">and then we will start </w:t>
-      </w:r>
-      <w:proofErr w:type="spellStart"/>
-      <w:r>
-        <w:t>c</w:t>
-      </w:r>
-      <w:r>
-        <w:t>odeswear</w:t>
-      </w:r>
-      <w:proofErr w:type="spellEnd"/>
-      <w:r>
-        <w:t xml:space="preserve"> development </w:t>
-      </w:r>
-    </w:p>
-    <w:p>
-      <w:r>
-        <w:t xml:space="preserve">Whatever you </w:t>
-      </w:r>
-      <w:r>
-        <w:t xml:space="preserve">by [slug] is actually dynamic </w:t>
-      </w:r>
-      <w:r>
-        <w:t xml:space="preserve">page </w:t>
-      </w:r>
-      <w:r>
-        <w:t xml:space="preserve">routes </w:t>
-      </w:r>
-    </w:p>
-    <w:p>
-      <w:r>
-        <w:t>There are many thin</w:t>
-      </w:r>
-      <w:r>
-        <w:t>g</w:t>
-      </w:r>
-      <w:r>
-        <w:t xml:space="preserve">s which we think we need to o on the spot like </w:t>
-      </w:r>
-      <w:r>
-        <w:t xml:space="preserve">Forget Password </w:t>
-      </w:r>
-    </w:p>
-    <w:p>
-      <w:r>
-        <w:t>You can even launch this e</w:t>
-      </w:r>
-      <w:r>
-        <w:t>c</w:t>
-      </w:r>
-      <w:r>
-        <w:t>om</w:t>
-      </w:r>
-      <w:r>
-        <w:t>m</w:t>
-      </w:r>
-      <w:r>
-        <w:t xml:space="preserve">erce site </w:t>
-      </w:r>
-    </w:p>
-    <w:p>
-      <w:r>
-        <w:t>Navbar and footer are important for our website and it will be present in all of the pages</w:t>
-      </w:r>
-    </w:p>
-    <w:p>
-      <w:r>
-        <w:t xml:space="preserve">We will use app for that </w:t>
-      </w:r>
-      <w:proofErr w:type="gramStart"/>
-      <w:r>
-        <w:t>purposes(</w:t>
-      </w:r>
-      <w:proofErr w:type="gramEnd"/>
-      <w:r>
-        <w:t xml:space="preserve">maybe </w:t>
-      </w:r>
-      <w:proofErr w:type="spellStart"/>
-      <w:r>
-        <w:t>ol</w:t>
-      </w:r>
-      <w:proofErr w:type="spellEnd"/>
-      <w:r>
-        <w:t xml:space="preserve"> version of </w:t>
-      </w:r>
-      <w:proofErr w:type="spellStart"/>
-      <w:r>
-        <w:t>layout.jsx</w:t>
-      </w:r>
-      <w:proofErr w:type="spellEnd"/>
-      <w:r>
-        <w:t>)</w:t>
-      </w:r>
-    </w:p>
-    <w:p>
-      <w:r>
-        <w:t xml:space="preserve">Now there is site that is </w:t>
-      </w:r>
-      <w:proofErr w:type="spellStart"/>
-      <w:r>
-        <w:t>Tailblocks</w:t>
-      </w:r>
-      <w:proofErr w:type="spellEnd"/>
-      <w:r>
-        <w:t xml:space="preserve"> that will give you </w:t>
-      </w:r>
-      <w:proofErr w:type="spellStart"/>
-      <w:r>
-        <w:t>tailblocks</w:t>
-      </w:r>
-      <w:proofErr w:type="spellEnd"/>
+      <w:r>
+        <w:t xml:space="preserve">snippet </w:t>
+      </w:r>
+      <w:r>
+        <w:t xml:space="preserve">here you get minimalistic design </w:t>
+      </w:r>
       <w:r>
         <w:t xml:space="preserve"> </w:t>
       </w:r>
       <w:r>
-        <w:t xml:space="preserve">snippet </w:t>
-      </w:r>
-      <w:r>
-        <w:t xml:space="preserve">here you get minimalistic </w:t>
-      </w:r>
-      <w:proofErr w:type="gramStart"/>
-      <w:r>
-        <w:t xml:space="preserve">design </w:t>
-      </w:r>
-      <w:r>
-        <w:t xml:space="preserve"> </w:t>
-      </w:r>
-      <w:r>
-        <w:t>Here</w:t>
-      </w:r>
-      <w:proofErr w:type="gramEnd"/>
-      <w:r>
-        <w:t xml:space="preserve"> you get </w:t>
+        <w:t xml:space="preserve">Here you get </w:t>
       </w:r>
       <w:proofErr w:type="spellStart"/>
       <w:r>
@@ -4983,46 +4535,14 @@
           <w:b/>
           <w:bCs/>
         </w:rPr>
-        <w:t xml:space="preserve"> </w:t>
-      </w:r>
-      <w:proofErr w:type="gramStart"/>
-      <w:r>
-        <w:rPr>
-          <w:b/>
-          <w:bCs/>
-        </w:rPr>
-        <w:t>and(</w:t>
-      </w:r>
-      <w:proofErr w:type="gramEnd"/>
-      <w:r>
-        <w:rPr>
-          <w:b/>
-          <w:bCs/>
-        </w:rPr>
-        <w:t xml:space="preserve">we try there should be equivalent space between </w:t>
-      </w:r>
-      <w:proofErr w:type="gramStart"/>
-      <w:r>
-        <w:rPr>
-          <w:b/>
-          <w:bCs/>
-        </w:rPr>
-        <w:t>them)</w:t>
-      </w:r>
-      <w:r>
-        <w:rPr>
-          <w:b/>
-          <w:bCs/>
-        </w:rPr>
-        <w:t>(</w:t>
-      </w:r>
-      <w:proofErr w:type="gramEnd"/>
-      <w:r>
-        <w:rPr>
-          <w:b/>
-          <w:bCs/>
-        </w:rPr>
-        <w:t>who knows)</w:t>
+        <w:t xml:space="preserve"> and(we try there should be equivalent space between them)</w:t>
+      </w:r>
+      <w:r>
+        <w:rPr>
+          <w:b/>
+          <w:bCs/>
+        </w:rPr>
+        <w:t>(who knows)</w:t>
       </w:r>
     </w:p>
     <w:p>
@@ -5039,7 +4559,6 @@
         <w:t xml:space="preserve"> in Tailwind by </w:t>
       </w:r>
       <w:proofErr w:type="spellStart"/>
-      <w:proofErr w:type="gramStart"/>
       <w:r>
         <w:rPr>
           <w:b/>
@@ -5055,7 +4574,6 @@
         <w:t>property</w:t>
       </w:r>
       <w:proofErr w:type="spellEnd"/>
-      <w:proofErr w:type="gramEnd"/>
       <w:r>
         <w:rPr>
           <w:b/>
@@ -5188,18 +4706,13 @@
     </w:p>
     <w:p>
       <w:r>
-        <w:t xml:space="preserve">import </w:t>
-      </w:r>
-      <w:proofErr w:type="gramStart"/>
-      <w:r>
-        <w:t xml:space="preserve">{ </w:t>
+        <w:t xml:space="preserve">import { </w:t>
       </w:r>
       <w:proofErr w:type="spellStart"/>
       <w:r>
         <w:t>AiOutlineShoppingCart</w:t>
       </w:r>
       <w:proofErr w:type="spellEnd"/>
-      <w:proofErr w:type="gramEnd"/>
       <w:r>
         <w:t xml:space="preserve"> } from "react-icons/ai";</w:t>
       </w:r>
@@ -5436,14 +4949,9 @@
       </w:r>
       <w:proofErr w:type="spellStart"/>
       <w:r>
-        <w:t>overflow-</w:t>
-      </w:r>
-      <w:proofErr w:type="gramStart"/>
-      <w:r>
-        <w:t>x:hidden</w:t>
-      </w:r>
-      <w:proofErr w:type="spellEnd"/>
-      <w:proofErr w:type="gramEnd"/>
+        <w:t>overflow-x:hidden</w:t>
+      </w:r>
+      <w:proofErr w:type="spellEnd"/>
       <w:r>
         <w:t xml:space="preserve"> you c</w:t>
       </w:r>
@@ -5457,7 +4965,93 @@
         <w:t xml:space="preserve"> maybe in body in case you add it to body. </w:t>
       </w:r>
     </w:p>
-    <w:p/>
+    <w:p>
+      <w:r>
+        <w:t>O</w:t>
+      </w:r>
+      <w:r>
+        <w:t>f</w:t>
+      </w:r>
+      <w:r>
+        <w:t>ten times we are a</w:t>
+      </w:r>
+      <w:r>
+        <w:t>s</w:t>
+      </w:r>
+      <w:r>
+        <w:t xml:space="preserve">ked is out </w:t>
+      </w:r>
+      <w:proofErr w:type="spellStart"/>
+      <w:r>
+        <w:t>pincode</w:t>
+      </w:r>
+      <w:proofErr w:type="spellEnd"/>
+      <w:r>
+        <w:t xml:space="preserve"> </w:t>
+      </w:r>
+      <w:proofErr w:type="spellStart"/>
+      <w:r>
+        <w:t>servicable</w:t>
+      </w:r>
+      <w:proofErr w:type="spellEnd"/>
+      <w:r>
+        <w:t xml:space="preserve"> o</w:t>
+      </w:r>
+      <w:r>
+        <w:t>r</w:t>
+      </w:r>
+      <w:r>
+        <w:t xml:space="preserve"> </w:t>
+      </w:r>
+      <w:proofErr w:type="spellStart"/>
+      <w:r>
+        <w:t>not</w:t>
+      </w:r>
+      <w:r>
+        <w:t>ig</w:t>
+      </w:r>
+      <w:proofErr w:type="spellEnd"/>
+      <w:r>
+        <w:t xml:space="preserve"> no then you cannot receiver the order.</w:t>
+      </w:r>
+    </w:p>
+    <w:p>
+      <w:r>
+        <w:t xml:space="preserve">We will </w:t>
+      </w:r>
+      <w:proofErr w:type="spellStart"/>
+      <w:r>
+        <w:t>maek</w:t>
+      </w:r>
+      <w:proofErr w:type="spellEnd"/>
+      <w:r>
+        <w:t xml:space="preserve"> a mock </w:t>
+      </w:r>
+      <w:proofErr w:type="spellStart"/>
+      <w:r>
+        <w:t>api</w:t>
+      </w:r>
+      <w:proofErr w:type="spellEnd"/>
+      <w:r>
+        <w:t xml:space="preserve"> that </w:t>
+      </w:r>
+      <w:proofErr w:type="spellStart"/>
+      <w:r>
+        <w:t>wil</w:t>
+      </w:r>
+      <w:proofErr w:type="spellEnd"/>
+      <w:r>
+        <w:t xml:space="preserve"> show all the </w:t>
+      </w:r>
+      <w:proofErr w:type="spellStart"/>
+      <w:r>
+        <w:t>apis</w:t>
+      </w:r>
+      <w:proofErr w:type="spellEnd"/>
+      <w:r>
+        <w:t xml:space="preserve"> that are serviceable </w:t>
+      </w:r>
+    </w:p>
     <w:sectPr>
       <w:pgSz w:w="11906" w:h="16838"/>
       <w:pgMar w:top="1440" w:right="1440" w:bottom="1440" w:left="1440" w:header="708" w:footer="708" w:gutter="0"/>

</xml_diff>

<commit_message>
Lesson 42 Creating Cart State for Codeswear.com
</commit_message>
<xml_diff>
--- a/Notes2.docx
+++ b/Notes2.docx
@@ -59,10 +59,18 @@
     </w:p>
     <w:p>
       <w:r>
-        <w:t>In nay container</w:t>
-      </w:r>
-      <w:r>
-        <w:t>(or component)</w:t>
+        <w:t xml:space="preserve">In nay </w:t>
+      </w:r>
+      <w:proofErr w:type="gramStart"/>
+      <w:r>
+        <w:t>container</w:t>
+      </w:r>
+      <w:r>
+        <w:t>(</w:t>
+      </w:r>
+      <w:proofErr w:type="gramEnd"/>
+      <w:r>
+        <w:t>or component)</w:t>
       </w:r>
       <w:r>
         <w:t xml:space="preserve"> if you want to </w:t>
@@ -547,9 +555,14 @@
       </w:r>
     </w:p>
     <w:p>
+      <w:proofErr w:type="gramStart"/>
       <w:r>
         <w:lastRenderedPageBreak/>
-        <w:t>So we can so this thing Now we can see it is getting rendered as shown below</w:t>
+        <w:t>So</w:t>
+      </w:r>
+      <w:proofErr w:type="gramEnd"/>
+      <w:r>
+        <w:t xml:space="preserve"> we can so this thing Now we can see it is getting rendered as shown below</w:t>
       </w:r>
     </w:p>
     <w:p>
@@ -651,8 +664,13 @@
         <w:t xml:space="preserve"> s</w:t>
       </w:r>
       <w:r>
-        <w:t>ubmit the form</w:t>
-      </w:r>
+        <w:t xml:space="preserve">ubmit the </w:t>
+      </w:r>
+      <w:proofErr w:type="gramStart"/>
+      <w:r>
+        <w:t>form</w:t>
+      </w:r>
+      <w:proofErr w:type="gramEnd"/>
       <w:r>
         <w:t xml:space="preserve"> we will definitely have to make an API to co</w:t>
       </w:r>
@@ -718,8 +736,29 @@
       </w:r>
     </w:p>
     <w:p>
-      <w:r>
-        <w:t>So for now our post request handler look like below</w:t>
+      <w:proofErr w:type="gramStart"/>
+      <w:r>
+        <w:t>So</w:t>
+      </w:r>
+      <w:proofErr w:type="gramEnd"/>
+      <w:r>
+        <w:t xml:space="preserve"> for </w:t>
+      </w:r>
+      <w:proofErr w:type="gramStart"/>
+      <w:r>
+        <w:t>now</w:t>
+      </w:r>
+      <w:proofErr w:type="gramEnd"/>
+      <w:r>
+        <w:t xml:space="preserve"> our post request handler </w:t>
+      </w:r>
+      <w:proofErr w:type="gramStart"/>
+      <w:r>
+        <w:t>look</w:t>
+      </w:r>
+      <w:proofErr w:type="gramEnd"/>
+      <w:r>
+        <w:t xml:space="preserve"> like below</w:t>
       </w:r>
     </w:p>
     <w:p>
@@ -768,8 +807,13 @@
       </w:r>
     </w:p>
     <w:p>
-      <w:r>
-        <w:t>Ols version used to look like below</w:t>
+      <w:proofErr w:type="gramStart"/>
+      <w:r>
+        <w:t>Ols</w:t>
+      </w:r>
+      <w:proofErr w:type="gramEnd"/>
+      <w:r>
+        <w:t xml:space="preserve"> version used to look like below</w:t>
       </w:r>
     </w:p>
     <w:p>
@@ -877,10 +921,12 @@
         <w:t xml:space="preserve">, not plain JSON, so sending it directly with </w:t>
       </w:r>
       <w:proofErr w:type="spellStart"/>
+      <w:proofErr w:type="gramStart"/>
       <w:r>
         <w:t>res.json</w:t>
       </w:r>
       <w:proofErr w:type="spellEnd"/>
+      <w:proofErr w:type="gramEnd"/>
       <w:r>
         <w:t>(</w:t>
       </w:r>
@@ -938,9 +984,14 @@
     </w:p>
     <w:p>
       <w:r>
-        <w:t>export default function handler(</w:t>
-      </w:r>
-      <w:proofErr w:type="spellStart"/>
+        <w:t xml:space="preserve">export default function </w:t>
+      </w:r>
+      <w:proofErr w:type="gramStart"/>
+      <w:r>
+        <w:t>handler(</w:t>
+      </w:r>
+      <w:proofErr w:type="spellStart"/>
+      <w:proofErr w:type="gramEnd"/>
       <w:r>
         <w:t>req</w:t>
       </w:r>
@@ -1046,6 +1097,7 @@
         <w:t xml:space="preserve">Why </w:t>
       </w:r>
       <w:proofErr w:type="spellStart"/>
+      <w:proofErr w:type="gramStart"/>
       <w:r>
         <w:rPr>
           <w:b/>
@@ -1054,6 +1106,7 @@
         <w:t>res.json</w:t>
       </w:r>
       <w:proofErr w:type="spellEnd"/>
+      <w:proofErr w:type="gramEnd"/>
       <w:r>
         <w:rPr>
           <w:b/>
@@ -1085,18 +1138,25 @@
     </w:p>
     <w:p>
       <w:proofErr w:type="spellStart"/>
+      <w:proofErr w:type="gramStart"/>
       <w:r>
         <w:t>res.status</w:t>
       </w:r>
       <w:proofErr w:type="spellEnd"/>
-      <w:r>
-        <w:t>(200).</w:t>
+      <w:proofErr w:type="gramEnd"/>
+      <w:r>
+        <w:t>(200</w:t>
+      </w:r>
+      <w:proofErr w:type="gramStart"/>
+      <w:r>
+        <w:t>).</w:t>
       </w:r>
       <w:proofErr w:type="spellStart"/>
       <w:r>
         <w:t>json</w:t>
       </w:r>
       <w:proofErr w:type="spellEnd"/>
+      <w:proofErr w:type="gramEnd"/>
       <w:r>
         <w:t>(</w:t>
       </w:r>
@@ -1197,9 +1257,14 @@
     </w:p>
     <w:p>
       <w:r>
-        <w:t>export default function handler(</w:t>
-      </w:r>
-      <w:proofErr w:type="spellStart"/>
+        <w:t xml:space="preserve">export default function </w:t>
+      </w:r>
+      <w:proofErr w:type="gramStart"/>
+      <w:r>
+        <w:t>handler(</w:t>
+      </w:r>
+      <w:proofErr w:type="spellStart"/>
+      <w:proofErr w:type="gramEnd"/>
       <w:r>
         <w:t>req</w:t>
       </w:r>
@@ -1212,10 +1277,12 @@
         <w:t xml:space="preserve">  if (</w:t>
       </w:r>
       <w:proofErr w:type="spellStart"/>
+      <w:proofErr w:type="gramStart"/>
       <w:r>
         <w:t>req.method</w:t>
       </w:r>
       <w:proofErr w:type="spellEnd"/>
+      <w:proofErr w:type="gramEnd"/>
       <w:r>
         <w:t xml:space="preserve"> === "POST") {</w:t>
       </w:r>
@@ -1224,18 +1291,25 @@
         <w:t xml:space="preserve">    </w:t>
       </w:r>
       <w:proofErr w:type="spellStart"/>
+      <w:proofErr w:type="gramStart"/>
       <w:r>
         <w:t>res.status</w:t>
       </w:r>
       <w:proofErr w:type="spellEnd"/>
-      <w:r>
-        <w:t>(200).</w:t>
+      <w:proofErr w:type="gramEnd"/>
+      <w:r>
+        <w:t>(200</w:t>
+      </w:r>
+      <w:proofErr w:type="gramStart"/>
+      <w:r>
+        <w:t>).</w:t>
       </w:r>
       <w:proofErr w:type="spellStart"/>
       <w:r>
         <w:t>json</w:t>
       </w:r>
       <w:proofErr w:type="spellEnd"/>
+      <w:proofErr w:type="gramEnd"/>
       <w:r>
         <w:t>({</w:t>
       </w:r>
@@ -1244,10 +1318,12 @@
         <w:t xml:space="preserve">      method: </w:t>
       </w:r>
       <w:proofErr w:type="spellStart"/>
+      <w:proofErr w:type="gramStart"/>
       <w:r>
         <w:t>req.method</w:t>
       </w:r>
       <w:proofErr w:type="spellEnd"/>
+      <w:proofErr w:type="gramEnd"/>
       <w:r>
         <w:t>,</w:t>
       </w:r>
@@ -1256,10 +1332,12 @@
         <w:t xml:space="preserve">      body: </w:t>
       </w:r>
       <w:proofErr w:type="spellStart"/>
+      <w:proofErr w:type="gramStart"/>
       <w:r>
         <w:t>req.body</w:t>
       </w:r>
       <w:proofErr w:type="spellEnd"/>
+      <w:proofErr w:type="gramEnd"/>
       <w:r>
         <w:t>,</w:t>
       </w:r>
@@ -1268,10 +1346,12 @@
         <w:t xml:space="preserve">      query: </w:t>
       </w:r>
       <w:proofErr w:type="spellStart"/>
+      <w:proofErr w:type="gramStart"/>
       <w:r>
         <w:t>req.query</w:t>
       </w:r>
       <w:proofErr w:type="spellEnd"/>
+      <w:proofErr w:type="gramEnd"/>
       <w:r>
         <w:t>,</w:t>
       </w:r>
@@ -1281,8 +1361,12 @@
       </w:r>
       <w:r>
         <w:br/>
+      </w:r>
+      <w:proofErr w:type="gramStart"/>
+      <w:r>
         <w:t xml:space="preserve">  }</w:t>
       </w:r>
+      <w:proofErr w:type="gramEnd"/>
       <w:r>
         <w:br/>
         <w:t>}</w:t>
@@ -1438,10 +1522,12 @@
           </w:tcPr>
           <w:p>
             <w:proofErr w:type="spellStart"/>
+            <w:proofErr w:type="gramStart"/>
             <w:r>
               <w:t>req.body</w:t>
             </w:r>
             <w:proofErr w:type="spellEnd"/>
+            <w:proofErr w:type="gramEnd"/>
           </w:p>
         </w:tc>
         <w:tc>
@@ -1475,10 +1561,12 @@
           </w:tcPr>
           <w:p>
             <w:proofErr w:type="spellStart"/>
+            <w:proofErr w:type="gramStart"/>
             <w:r>
               <w:t>req.query</w:t>
             </w:r>
             <w:proofErr w:type="spellEnd"/>
+            <w:proofErr w:type="gramEnd"/>
           </w:p>
         </w:tc>
         <w:tc>
@@ -1512,10 +1600,12 @@
           </w:tcPr>
           <w:p>
             <w:proofErr w:type="spellStart"/>
+            <w:proofErr w:type="gramStart"/>
             <w:r>
               <w:t>req.method</w:t>
             </w:r>
             <w:proofErr w:type="spellEnd"/>
+            <w:proofErr w:type="gramEnd"/>
           </w:p>
         </w:tc>
         <w:tc>
@@ -1567,9 +1657,14 @@
     </w:p>
     <w:p>
       <w:r>
-        <w:t>export async function POST(</w:t>
-      </w:r>
-      <w:proofErr w:type="spellStart"/>
+        <w:t xml:space="preserve">export async function </w:t>
+      </w:r>
+      <w:proofErr w:type="gramStart"/>
+      <w:r>
+        <w:t>POST(</w:t>
+      </w:r>
+      <w:proofErr w:type="spellStart"/>
+      <w:proofErr w:type="gramEnd"/>
       <w:r>
         <w:t>req</w:t>
       </w:r>
@@ -1593,10 +1688,12 @@
         <w:t xml:space="preserve"> body = await </w:t>
       </w:r>
       <w:proofErr w:type="spellStart"/>
+      <w:proofErr w:type="gramStart"/>
       <w:r>
         <w:t>req.json</w:t>
       </w:r>
       <w:proofErr w:type="spellEnd"/>
+      <w:proofErr w:type="gramEnd"/>
       <w:r>
         <w:t>();</w:t>
       </w:r>
@@ -1658,10 +1755,12 @@
         <w:t xml:space="preserve">d specific fields like </w:t>
       </w:r>
       <w:proofErr w:type="spellStart"/>
+      <w:proofErr w:type="gramStart"/>
       <w:r>
         <w:t>req.body</w:t>
       </w:r>
       <w:proofErr w:type="spellEnd"/>
+      <w:proofErr w:type="gramEnd"/>
       <w:r>
         <w:t>.</w:t>
       </w:r>
@@ -1671,7 +1770,15 @@
         <w:t>In older version we used to get body like we did in n</w:t>
       </w:r>
       <w:r>
-        <w:t>ode js but in modern it look like below</w:t>
+        <w:t xml:space="preserve">ode js but in modern it </w:t>
+      </w:r>
+      <w:proofErr w:type="gramStart"/>
+      <w:r>
+        <w:t>look</w:t>
+      </w:r>
+      <w:proofErr w:type="gramEnd"/>
+      <w:r>
+        <w:t xml:space="preserve"> like below</w:t>
       </w:r>
     </w:p>
     <w:p>
@@ -1774,10 +1881,18 @@
         <w:t>The problem with the file making</w:t>
       </w:r>
       <w:r>
-        <w:t xml:space="preserve"> strategy </w:t>
-      </w:r>
-      <w:r>
-        <w:t xml:space="preserve"> is that </w:t>
+        <w:t xml:space="preserve"> </w:t>
+      </w:r>
+      <w:proofErr w:type="gramStart"/>
+      <w:r>
+        <w:t xml:space="preserve">strategy </w:t>
+      </w:r>
+      <w:r>
+        <w:t xml:space="preserve"> is</w:t>
+      </w:r>
+      <w:proofErr w:type="gramEnd"/>
+      <w:r>
+        <w:t xml:space="preserve"> that </w:t>
       </w:r>
       <w:r>
         <w:t xml:space="preserve">if suppose </w:t>
@@ -1890,20 +2005,41 @@
       </w:r>
       <w:proofErr w:type="spellEnd"/>
       <w:r>
-        <w:t xml:space="preserve"> element</w:t>
-      </w:r>
-      <w:r>
-        <w:t>(who knows may be I am wrong here)</w:t>
-      </w:r>
-      <w:r>
         <w:t xml:space="preserve"> </w:t>
       </w:r>
+      <w:proofErr w:type="gramStart"/>
+      <w:r>
+        <w:t>element</w:t>
+      </w:r>
+      <w:r>
+        <w:t>(</w:t>
+      </w:r>
+      <w:proofErr w:type="gramEnd"/>
+      <w:r>
+        <w:t xml:space="preserve">who knows </w:t>
+      </w:r>
+      <w:proofErr w:type="gramStart"/>
+      <w:r>
+        <w:t>may be</w:t>
+      </w:r>
+      <w:proofErr w:type="gramEnd"/>
+      <w:r>
+        <w:t xml:space="preserve"> I am wrong here)</w:t>
+      </w:r>
+      <w:r>
+        <w:t xml:space="preserve"> </w:t>
+      </w:r>
       <w:r>
         <w:t xml:space="preserve">and on state update method we used </w:t>
       </w:r>
       <w:proofErr w:type="spellStart"/>
-      <w:r>
-        <w:t>e.target.innerText</w:t>
+      <w:proofErr w:type="gramStart"/>
+      <w:r>
+        <w:t>e.target</w:t>
+      </w:r>
+      <w:proofErr w:type="gramEnd"/>
+      <w:r>
+        <w:t>.innerText</w:t>
       </w:r>
       <w:proofErr w:type="spellEnd"/>
     </w:p>
@@ -1920,8 +2056,13 @@
         <w:t xml:space="preserve"> we can use </w:t>
       </w:r>
       <w:proofErr w:type="spellStart"/>
-      <w:r>
-        <w:t>e.target,value</w:t>
+      <w:proofErr w:type="gramStart"/>
+      <w:r>
+        <w:t>e.target</w:t>
+      </w:r>
+      <w:proofErr w:type="gramEnd"/>
+      <w:r>
+        <w:t>,value</w:t>
       </w:r>
       <w:proofErr w:type="spellEnd"/>
       <w:r>
@@ -2037,13 +2178,16 @@
         <w:t xml:space="preserve">Shortcut for </w:t>
       </w:r>
       <w:proofErr w:type="spellStart"/>
+      <w:proofErr w:type="gramStart"/>
       <w:r>
         <w:t>margin:auto</w:t>
       </w:r>
       <w:proofErr w:type="spellEnd"/>
+      <w:proofErr w:type="gramEnd"/>
       <w:r>
         <w:t xml:space="preserve"> will be </w:t>
       </w:r>
+      <w:proofErr w:type="gramStart"/>
       <w:r>
         <w:rPr>
           <w:b/>
@@ -2051,6 +2195,7 @@
         </w:rPr>
         <w:t>m:auto</w:t>
       </w:r>
+      <w:proofErr w:type="gramEnd"/>
       <w:r>
         <w:rPr>
           <w:b/>
@@ -2114,10 +2259,18 @@
     </w:p>
     <w:p>
       <w:r>
-        <w:t xml:space="preserve">Suppose you have 50 blogs and you want to show 5 blogs on each pages </w:t>
-      </w:r>
-      <w:r>
-        <w:t xml:space="preserve"> so 10 pages </w:t>
+        <w:t xml:space="preserve">Suppose you have 50 blogs and you want to show 5 blogs on each </w:t>
+      </w:r>
+      <w:proofErr w:type="gramStart"/>
+      <w:r>
+        <w:t xml:space="preserve">pages </w:t>
+      </w:r>
+      <w:r>
+        <w:t xml:space="preserve"> so</w:t>
+      </w:r>
+      <w:proofErr w:type="gramEnd"/>
+      <w:r>
+        <w:t xml:space="preserve"> 10 pages </w:t>
       </w:r>
       <w:r>
         <w:t>will</w:t>
@@ -2128,11 +2281,16 @@
       <w:r>
         <w:t xml:space="preserve">be </w:t>
       </w:r>
+      <w:proofErr w:type="gramStart"/>
       <w:r>
         <w:t xml:space="preserve">formed </w:t>
       </w:r>
       <w:r>
-        <w:t xml:space="preserve">. In the similar way </w:t>
+        <w:t>.</w:t>
+      </w:r>
+      <w:proofErr w:type="gramEnd"/>
+      <w:r>
+        <w:t xml:space="preserve"> In the similar way </w:t>
       </w:r>
       <w:r>
         <w:t xml:space="preserve">pagination can be showed </w:t>
@@ -2249,7 +2407,15 @@
         <w:t xml:space="preserve">that we will not good components </w:t>
       </w:r>
       <w:r>
-        <w:t>means you won’t get good packages for doing any work(who knows)</w:t>
+        <w:t xml:space="preserve">means you won’t get good packages for doing any </w:t>
+      </w:r>
+      <w:proofErr w:type="gramStart"/>
+      <w:r>
+        <w:t>work(</w:t>
+      </w:r>
+      <w:proofErr w:type="gramEnd"/>
+      <w:r>
+        <w:t>who knows)</w:t>
       </w:r>
     </w:p>
     <w:p>
@@ -2278,14 +2444,27 @@
       </w:r>
     </w:p>
     <w:p>
-      <w:r>
-        <w:t xml:space="preserve">So we run the above command I context of </w:t>
+      <w:proofErr w:type="gramStart"/>
+      <w:r>
+        <w:t>So</w:t>
+      </w:r>
+      <w:proofErr w:type="gramEnd"/>
+      <w:r>
+        <w:t xml:space="preserve"> we run the above command I context of </w:t>
       </w:r>
       <w:r>
         <w:t xml:space="preserve">yarn </w:t>
       </w:r>
       <w:r>
-        <w:t>by using  below command</w:t>
+        <w:t xml:space="preserve">by </w:t>
+      </w:r>
+      <w:proofErr w:type="gramStart"/>
+      <w:r>
+        <w:t>using  below</w:t>
+      </w:r>
+      <w:proofErr w:type="gramEnd"/>
+      <w:r>
+        <w:t xml:space="preserve"> command</w:t>
       </w:r>
     </w:p>
     <w:p>
@@ -2373,13 +2552,29 @@
         <w:t xml:space="preserve">Data length </w:t>
       </w:r>
       <w:r>
-        <w:t>of the data that to be shown</w:t>
-      </w:r>
-      <w:r>
-        <w:t xml:space="preserve"> , next is the function  </w:t>
-      </w:r>
-      <w:r>
-        <w:t>that will be called when we scroll and reach the bottom and more data is needed to be loaded.</w:t>
+        <w:t xml:space="preserve">of the data that to be </w:t>
+      </w:r>
+      <w:proofErr w:type="gramStart"/>
+      <w:r>
+        <w:t>shown</w:t>
+      </w:r>
+      <w:r>
+        <w:t xml:space="preserve"> ,</w:t>
+      </w:r>
+      <w:proofErr w:type="gramEnd"/>
+      <w:r>
+        <w:t xml:space="preserve"> next is the </w:t>
+      </w:r>
+      <w:proofErr w:type="gramStart"/>
+      <w:r>
+        <w:t xml:space="preserve">function  </w:t>
+      </w:r>
+      <w:r>
+        <w:t>that</w:t>
+      </w:r>
+      <w:proofErr w:type="gramEnd"/>
+      <w:r>
+        <w:t xml:space="preserve"> will be called when we scroll and reach the bottom and more data is needed to be loaded.</w:t>
       </w:r>
     </w:p>
     <w:p>
@@ -2407,13 +2602,21 @@
         <w:t>w</w:t>
       </w:r>
       <w:r>
-        <w:t>n function</w:t>
+        <w:t xml:space="preserve">n </w:t>
+      </w:r>
+      <w:proofErr w:type="gramStart"/>
+      <w:r>
+        <w:t>function</w:t>
       </w:r>
       <w:r>
         <w:t>al</w:t>
       </w:r>
       <w:r>
-        <w:t>ity(who knows)</w:t>
+        <w:t>ity(</w:t>
+      </w:r>
+      <w:proofErr w:type="gramEnd"/>
+      <w:r>
+        <w:t>who knows)</w:t>
       </w:r>
     </w:p>
     <w:p>
@@ -2495,7 +2698,15 @@
         <w:t xml:space="preserve">it is defined like this </w:t>
       </w:r>
       <w:r>
-        <w:t xml:space="preserve">if we keep single item </w:t>
+        <w:t xml:space="preserve">if we keep single </w:t>
+      </w:r>
+      <w:proofErr w:type="gramStart"/>
+      <w:r>
+        <w:t>item</w:t>
+      </w:r>
+      <w:proofErr w:type="gramEnd"/>
+      <w:r>
+        <w:t xml:space="preserve"> </w:t>
       </w:r>
       <w:r>
         <w:t>we need to see al</w:t>
@@ -2504,13 +2715,21 @@
         <w:t>l</w:t>
       </w:r>
       <w:r>
-        <w:t xml:space="preserve"> this thi</w:t>
+        <w:t xml:space="preserve"> </w:t>
+      </w:r>
+      <w:proofErr w:type="gramStart"/>
+      <w:r>
+        <w:t>this thi</w:t>
       </w:r>
       <w:r>
         <w:t>n</w:t>
       </w:r>
       <w:r>
-        <w:t xml:space="preserve">gs </w:t>
+        <w:t>gs</w:t>
+      </w:r>
+      <w:proofErr w:type="gramEnd"/>
+      <w:r>
+        <w:t xml:space="preserve"> </w:t>
       </w:r>
     </w:p>
     <w:p>
@@ -2520,6 +2739,7 @@
           <w:bCs/>
         </w:rPr>
       </w:pPr>
+      <w:proofErr w:type="gramStart"/>
       <w:r>
         <w:rPr>
           <w:b/>
@@ -2527,6 +2747,7 @@
         </w:rPr>
         <w:t>Note:-</w:t>
       </w:r>
+      <w:proofErr w:type="gramEnd"/>
     </w:p>
     <w:p>
       <w:pPr>
@@ -2538,7 +2759,15 @@
         <w:t xml:space="preserve">Sometime it happens </w:t>
       </w:r>
       <w:r>
-        <w:t>in react that one component is show  two times so reload to remove the bug</w:t>
+        <w:t xml:space="preserve">in react that one component is </w:t>
+      </w:r>
+      <w:proofErr w:type="gramStart"/>
+      <w:r>
+        <w:t>show  two</w:t>
+      </w:r>
+      <w:proofErr w:type="gramEnd"/>
+      <w:r>
+        <w:t xml:space="preserve"> times so reload to remove the bug</w:t>
       </w:r>
     </w:p>
     <w:p>
@@ -2554,7 +2783,15 @@
         <w:t xml:space="preserve">except for responsiveness </w:t>
       </w:r>
       <w:r>
-        <w:t xml:space="preserve">we will  make our blog responsive and will write media queries </w:t>
+        <w:t xml:space="preserve">we </w:t>
+      </w:r>
+      <w:proofErr w:type="gramStart"/>
+      <w:r>
+        <w:t>will  make</w:t>
+      </w:r>
+      <w:proofErr w:type="gramEnd"/>
+      <w:r>
+        <w:t xml:space="preserve"> our blog responsive and will write media queries </w:t>
       </w:r>
       <w:r>
         <w:t>how we can we run media que</w:t>
@@ -2580,8 +2817,13 @@
         <w:t xml:space="preserve">the website </w:t>
       </w:r>
       <w:r>
-        <w:t>and if you gave responsiveness</w:t>
-      </w:r>
+        <w:t xml:space="preserve">and if you gave </w:t>
+      </w:r>
+      <w:proofErr w:type="gramStart"/>
+      <w:r>
+        <w:t>responsiveness</w:t>
+      </w:r>
+      <w:proofErr w:type="gramEnd"/>
       <w:r>
         <w:t xml:space="preserve"> it was an addon</w:t>
       </w:r>
@@ -2600,10 +2842,12 @@
         <w:t xml:space="preserve">you can say bit in </w:t>
       </w:r>
       <w:proofErr w:type="spellStart"/>
+      <w:proofErr w:type="gramStart"/>
       <w:r>
         <w:t>todays</w:t>
       </w:r>
       <w:proofErr w:type="spellEnd"/>
+      <w:proofErr w:type="gramEnd"/>
       <w:r>
         <w:t xml:space="preserve"> time </w:t>
       </w:r>
@@ -2680,7 +2924,11 @@
     </w:p>
     <w:p>
       <w:r>
-        <w:t>We will ho</w:t>
+        <w:t xml:space="preserve">We will </w:t>
+      </w:r>
+      <w:proofErr w:type="gramStart"/>
+      <w:r>
+        <w:t>ho</w:t>
       </w:r>
       <w:r>
         <w:t>s</w:t>
@@ -2689,7 +2937,11 @@
         <w:t>t</w:t>
       </w:r>
       <w:r>
-        <w:t>s the web</w:t>
+        <w:t>s</w:t>
+      </w:r>
+      <w:proofErr w:type="gramEnd"/>
+      <w:r>
+        <w:t xml:space="preserve"> the web</w:t>
       </w:r>
       <w:r>
         <w:t>s</w:t>
@@ -2816,7 +3068,15 @@
     </w:p>
     <w:p>
       <w:r>
-        <w:t xml:space="preserve">IN digital ocean we make new user(who knows) </w:t>
+        <w:t xml:space="preserve">IN digital ocean we make new </w:t>
+      </w:r>
+      <w:proofErr w:type="gramStart"/>
+      <w:r>
+        <w:t>user(</w:t>
+      </w:r>
+      <w:proofErr w:type="gramEnd"/>
+      <w:r>
+        <w:t xml:space="preserve">who knows) </w:t>
       </w:r>
     </w:p>
     <w:p>
@@ -2854,13 +3114,26 @@
       <w:r>
         <w:t xml:space="preserve">process will be </w:t>
       </w:r>
-      <w:r>
-        <w:t xml:space="preserve">build there </w:t>
-      </w:r>
-    </w:p>
-    <w:p>
-      <w:r>
-        <w:t>It will ask you to make database in there services.</w:t>
+      <w:proofErr w:type="gramStart"/>
+      <w:r>
+        <w:t>build</w:t>
+      </w:r>
+      <w:proofErr w:type="gramEnd"/>
+      <w:r>
+        <w:t xml:space="preserve"> there </w:t>
+      </w:r>
+    </w:p>
+    <w:p>
+      <w:r>
+        <w:t xml:space="preserve">It will ask you to make database in </w:t>
+      </w:r>
+      <w:proofErr w:type="gramStart"/>
+      <w:r>
+        <w:t>there</w:t>
+      </w:r>
+      <w:proofErr w:type="gramEnd"/>
+      <w:r>
+        <w:t xml:space="preserve"> services.</w:t>
       </w:r>
       <w:r>
         <w:t xml:space="preserve"> (who knows)</w:t>
@@ -2911,9 +3184,14 @@
       </w:r>
       <w:proofErr w:type="spellEnd"/>
       <w:r>
-        <w:t xml:space="preserve"> it will be good(</w:t>
-      </w:r>
-      <w:proofErr w:type="spellStart"/>
+        <w:t xml:space="preserve"> it will be </w:t>
+      </w:r>
+      <w:proofErr w:type="gramStart"/>
+      <w:r>
+        <w:t>good(</w:t>
+      </w:r>
+      <w:proofErr w:type="spellStart"/>
+      <w:proofErr w:type="gramEnd"/>
       <w:r>
         <w:t>wjp</w:t>
       </w:r>
@@ -2930,20 +3208,30 @@
           <w:color w:val="EE0000"/>
         </w:rPr>
       </w:pPr>
+      <w:proofErr w:type="gramStart"/>
       <w:r>
         <w:rPr>
           <w:b/>
           <w:bCs/>
           <w:color w:val="EE0000"/>
         </w:rPr>
-        <w:t xml:space="preserve">‘ can create </w:t>
-      </w:r>
+        <w:t>‘ can</w:t>
+      </w:r>
+      <w:proofErr w:type="gramEnd"/>
       <w:r>
         <w:rPr>
           <w:b/>
           <w:bCs/>
           <w:color w:val="EE0000"/>
         </w:rPr>
+        <w:t xml:space="preserve"> create </w:t>
+      </w:r>
+      <w:r>
+        <w:rPr>
+          <w:b/>
+          <w:bCs/>
+          <w:color w:val="EE0000"/>
+        </w:rPr>
         <w:t xml:space="preserve">error in </w:t>
       </w:r>
       <w:proofErr w:type="spellStart"/>
@@ -2988,15 +3276,33 @@
           <w:bCs/>
           <w:color w:val="EE0000"/>
         </w:rPr>
-        <w:t xml:space="preserve"> or maybe in React.</w:t>
-      </w:r>
+        <w:t xml:space="preserve"> or maybe in </w:t>
+      </w:r>
+      <w:proofErr w:type="gramStart"/>
       <w:r>
         <w:rPr>
           <w:b/>
           <w:bCs/>
           <w:color w:val="EE0000"/>
         </w:rPr>
-        <w:t>(maybe it is an outdated problem)</w:t>
+        <w:t>React.</w:t>
+      </w:r>
+      <w:r>
+        <w:rPr>
+          <w:b/>
+          <w:bCs/>
+          <w:color w:val="EE0000"/>
+        </w:rPr>
+        <w:t>(</w:t>
+      </w:r>
+      <w:proofErr w:type="gramEnd"/>
+      <w:r>
+        <w:rPr>
+          <w:b/>
+          <w:bCs/>
+          <w:color w:val="EE0000"/>
+        </w:rPr>
+        <w:t>maybe it is an outdated problem)</w:t>
       </w:r>
     </w:p>
     <w:p>
@@ -3021,10 +3327,12 @@
         <w:t xml:space="preserve">you can make it like that and if it </w:t>
       </w:r>
       <w:proofErr w:type="spellStart"/>
+      <w:proofErr w:type="gramStart"/>
       <w:r>
         <w:t>become</w:t>
       </w:r>
       <w:proofErr w:type="spellEnd"/>
+      <w:proofErr w:type="gramEnd"/>
       <w:r>
         <w:t xml:space="preserve"> profitable then you can scale it (who knows) </w:t>
       </w:r>
@@ -3033,6 +3341,7 @@
       <w:r>
         <w:t xml:space="preserve">Now as you commit then </w:t>
       </w:r>
+      <w:proofErr w:type="gramStart"/>
       <w:r>
         <w:t>Digital</w:t>
       </w:r>
@@ -3040,13 +3349,25 @@
         <w:t xml:space="preserve"> </w:t>
       </w:r>
       <w:r>
-        <w:t>ocean will build it</w:t>
-      </w:r>
-      <w:r>
-        <w:t xml:space="preserve"> automatically for you.</w:t>
-      </w:r>
-      <w:r>
-        <w:t>(maybe if auto</w:t>
+        <w:t>ocean</w:t>
+      </w:r>
+      <w:proofErr w:type="gramEnd"/>
+      <w:r>
+        <w:t xml:space="preserve"> will build it</w:t>
+      </w:r>
+      <w:r>
+        <w:t xml:space="preserve"> automatically for </w:t>
+      </w:r>
+      <w:proofErr w:type="gramStart"/>
+      <w:r>
+        <w:t>you.</w:t>
+      </w:r>
+      <w:r>
+        <w:t>(</w:t>
+      </w:r>
+      <w:proofErr w:type="gramEnd"/>
+      <w:r>
+        <w:t>maybe if auto</w:t>
       </w:r>
       <w:r>
         <w:t xml:space="preserve"> </w:t>
@@ -3055,7 +3376,15 @@
         <w:t xml:space="preserve">deploy option was selected </w:t>
       </w:r>
       <w:r>
-        <w:t>in the setting(who knows)</w:t>
+        <w:t xml:space="preserve">in the </w:t>
+      </w:r>
+      <w:proofErr w:type="gramStart"/>
+      <w:r>
+        <w:t>setting(</w:t>
+      </w:r>
+      <w:proofErr w:type="gramEnd"/>
+      <w:r>
+        <w:t>who knows)</w:t>
       </w:r>
       <w:r>
         <w:t>)</w:t>
@@ -3093,10 +3422,18 @@
         <w:t xml:space="preserve">here (maybe </w:t>
       </w:r>
       <w:r>
-        <w:t>very large app don’t work properly</w:t>
-      </w:r>
-      <w:r>
-        <w:t>(who knows)</w:t>
+        <w:t xml:space="preserve">very large app don’t work </w:t>
+      </w:r>
+      <w:proofErr w:type="gramStart"/>
+      <w:r>
+        <w:t>properly</w:t>
+      </w:r>
+      <w:r>
+        <w:t>(</w:t>
+      </w:r>
+      <w:proofErr w:type="gramEnd"/>
+      <w:r>
+        <w:t>who knows)</w:t>
       </w:r>
       <w:r>
         <w:t>)</w:t>
@@ -3137,10 +3474,18 @@
         <w:t xml:space="preserve">Now we will see </w:t>
       </w:r>
       <w:r>
-        <w:t>how Google analytics and search console</w:t>
-      </w:r>
-      <w:r>
-        <w:t xml:space="preserve">(who </w:t>
+        <w:t xml:space="preserve">how Google analytics and search </w:t>
+      </w:r>
+      <w:proofErr w:type="gramStart"/>
+      <w:r>
+        <w:t>console</w:t>
+      </w:r>
+      <w:r>
+        <w:t>(</w:t>
+      </w:r>
+      <w:proofErr w:type="gramEnd"/>
+      <w:r>
+        <w:t xml:space="preserve">who </w:t>
       </w:r>
       <w:proofErr w:type="spellStart"/>
       <w:r>
@@ -3307,13 +3652,21 @@
         <w:t xml:space="preserve">ck </w:t>
       </w:r>
       <w:r>
-        <w:t>which is also called S</w:t>
-      </w:r>
+        <w:t xml:space="preserve">which is also called </w:t>
+      </w:r>
+      <w:proofErr w:type="gramStart"/>
       <w:r>
         <w:t>S</w:t>
       </w:r>
       <w:r>
-        <w:t>LV(who knows)</w:t>
+        <w:t>S</w:t>
+      </w:r>
+      <w:r>
+        <w:t>LV(</w:t>
+      </w:r>
+      <w:proofErr w:type="gramEnd"/>
+      <w:r>
+        <w:t>who knows)</w:t>
       </w:r>
       <w:r>
         <w:t xml:space="preserve"> and </w:t>
@@ -3360,8 +3713,13 @@
       <w:r>
         <w:t xml:space="preserve">of the application. </w:t>
       </w:r>
-      <w:r>
-        <w:t>So if we want that the domain we have need to be pointe</w:t>
+      <w:proofErr w:type="gramStart"/>
+      <w:r>
+        <w:t>So</w:t>
+      </w:r>
+      <w:proofErr w:type="gramEnd"/>
+      <w:r>
+        <w:t xml:space="preserve"> if we want that the domain we have need to be pointe</w:t>
       </w:r>
       <w:r>
         <w:t>d</w:t>
@@ -3392,10 +3750,18 @@
     </w:p>
     <w:p>
       <w:r>
-        <w:t xml:space="preserve">Of you chose the former then you will  </w:t>
-      </w:r>
-      <w:r>
-        <w:t xml:space="preserve">see that from the dashboard </w:t>
+        <w:t xml:space="preserve">Of you chose the former then you </w:t>
+      </w:r>
+      <w:proofErr w:type="gramStart"/>
+      <w:r>
+        <w:t xml:space="preserve">will  </w:t>
+      </w:r>
+      <w:r>
+        <w:t>see</w:t>
+      </w:r>
+      <w:proofErr w:type="gramEnd"/>
+      <w:r>
+        <w:t xml:space="preserve"> that from the dashboard </w:t>
       </w:r>
       <w:r>
         <w:t xml:space="preserve">that how things are happening </w:t>
@@ -3404,10 +3770,26 @@
         <w:t xml:space="preserve">and if you chose later </w:t>
       </w:r>
       <w:r>
-        <w:t>then you need to point it to a Digital ocean(who knows)</w:t>
-      </w:r>
-      <w:r>
-        <w:t>. By former we bring the domain in the digital ocean(who knows)</w:t>
+        <w:t xml:space="preserve">then you need to point it to a Digital </w:t>
+      </w:r>
+      <w:proofErr w:type="gramStart"/>
+      <w:r>
+        <w:t>ocean(</w:t>
+      </w:r>
+      <w:proofErr w:type="gramEnd"/>
+      <w:r>
+        <w:t>who knows)</w:t>
+      </w:r>
+      <w:r>
+        <w:t xml:space="preserve">. By former we bring the domain in the digital </w:t>
+      </w:r>
+      <w:proofErr w:type="gramStart"/>
+      <w:r>
+        <w:t>ocean(</w:t>
+      </w:r>
+      <w:proofErr w:type="gramEnd"/>
+      <w:r>
+        <w:t>who knows)</w:t>
       </w:r>
       <w:r>
         <w:t xml:space="preserve">. </w:t>
@@ -3453,8 +3835,13 @@
       </w:r>
     </w:p>
     <w:p>
-      <w:r>
-        <w:t>So we went to Google search console</w:t>
+      <w:proofErr w:type="gramStart"/>
+      <w:r>
+        <w:t>So</w:t>
+      </w:r>
+      <w:proofErr w:type="gramEnd"/>
+      <w:r>
+        <w:t xml:space="preserve"> we went to Google search console</w:t>
       </w:r>
       <w:r>
         <w:t xml:space="preserve"> so we add a property there </w:t>
@@ -3529,7 +3916,15 @@
         <w:t xml:space="preserve">omain </w:t>
       </w:r>
       <w:r>
-        <w:t xml:space="preserve">ad then you need to verify it so it give us some text which we will paste in the </w:t>
+        <w:t xml:space="preserve">ad then you need to verify it so it </w:t>
+      </w:r>
+      <w:proofErr w:type="gramStart"/>
+      <w:r>
+        <w:t>give</w:t>
+      </w:r>
+      <w:proofErr w:type="gramEnd"/>
+      <w:r>
+        <w:t xml:space="preserve"> us some text which we will paste in the </w:t>
       </w:r>
       <w:r>
         <w:t xml:space="preserve">DNS records to give the proof for ownership of domain. </w:t>
@@ -3623,7 +4018,11 @@
         <w:t xml:space="preserve"> and how to integrate </w:t>
       </w:r>
       <w:r>
-        <w:t>payment gateway to the websi</w:t>
+        <w:t xml:space="preserve">payment gateway to the </w:t>
+      </w:r>
+      <w:proofErr w:type="gramStart"/>
+      <w:r>
+        <w:t>websi</w:t>
       </w:r>
       <w:r>
         <w:t>t</w:t>
@@ -3634,14 +4033,23 @@
       <w:r>
         <w:t>.</w:t>
       </w:r>
+      <w:proofErr w:type="gramEnd"/>
       <w:r>
         <w:t xml:space="preserve"> How orders will come </w:t>
       </w:r>
       <w:r>
-        <w:t xml:space="preserve">and how admin panel will be made </w:t>
-      </w:r>
-      <w:r>
-        <w:t>. F</w:t>
+        <w:t xml:space="preserve">and how admin panel will be </w:t>
+      </w:r>
+      <w:proofErr w:type="gramStart"/>
+      <w:r>
+        <w:t xml:space="preserve">made </w:t>
+      </w:r>
+      <w:r>
+        <w:t>.</w:t>
+      </w:r>
+      <w:proofErr w:type="gramEnd"/>
+      <w:r>
+        <w:t xml:space="preserve"> F</w:t>
       </w:r>
       <w:r>
         <w:t>r</w:t>
@@ -3962,10 +4370,18 @@
         <w:t xml:space="preserve">Like Bootstrap Tailwind also have </w:t>
       </w:r>
       <w:r>
-        <w:t xml:space="preserve">predefined class </w:t>
-      </w:r>
-      <w:r>
-        <w:t xml:space="preserve">.So we have tailwind css is installed </w:t>
+        <w:t xml:space="preserve">predefined </w:t>
+      </w:r>
+      <w:proofErr w:type="gramStart"/>
+      <w:r>
+        <w:t xml:space="preserve">class </w:t>
+      </w:r>
+      <w:r>
+        <w:t>.So</w:t>
+      </w:r>
+      <w:proofErr w:type="gramEnd"/>
+      <w:r>
+        <w:t xml:space="preserve"> we have tailwind css is installed </w:t>
       </w:r>
       <w:r>
         <w:t>and we can use our utility class</w:t>
@@ -4073,7 +4489,15 @@
         <w:t xml:space="preserve">There are some pages which you will find in almost all Ecommerce website that is </w:t>
       </w:r>
       <w:r>
-        <w:t>Product page , Home page</w:t>
+        <w:t xml:space="preserve">Product </w:t>
+      </w:r>
+      <w:proofErr w:type="gramStart"/>
+      <w:r>
+        <w:t>page ,</w:t>
+      </w:r>
+      <w:proofErr w:type="gramEnd"/>
+      <w:r>
+        <w:t xml:space="preserve"> Home page</w:t>
       </w:r>
       <w:r>
         <w:t>, Checkout page</w:t>
@@ -4085,10 +4509,18 @@
         <w:t>n</w:t>
       </w:r>
       <w:r>
-        <w:t xml:space="preserve"> order</w:t>
-      </w:r>
-      <w:r>
-        <w:t xml:space="preserve"> , login and </w:t>
+        <w:t xml:space="preserve"> </w:t>
+      </w:r>
+      <w:proofErr w:type="gramStart"/>
+      <w:r>
+        <w:t>order</w:t>
+      </w:r>
+      <w:r>
+        <w:t xml:space="preserve"> ,</w:t>
+      </w:r>
+      <w:proofErr w:type="gramEnd"/>
+      <w:r>
+        <w:t xml:space="preserve"> login and </w:t>
       </w:r>
       <w:proofErr w:type="spellStart"/>
       <w:r>
@@ -4165,7 +4597,15 @@
     </w:p>
     <w:p>
       <w:r>
-        <w:t xml:space="preserve">We will use app for that purposes(maybe </w:t>
+        <w:t xml:space="preserve">We will use app for that </w:t>
+      </w:r>
+      <w:proofErr w:type="gramStart"/>
+      <w:r>
+        <w:t>purposes(</w:t>
+      </w:r>
+      <w:proofErr w:type="gramEnd"/>
+      <w:r>
+        <w:t xml:space="preserve">maybe </w:t>
       </w:r>
       <w:proofErr w:type="spellStart"/>
       <w:r>
@@ -4208,13 +4648,21 @@
         <w:t xml:space="preserve">snippet </w:t>
       </w:r>
       <w:r>
-        <w:t xml:space="preserve">here you get minimalistic design </w:t>
+        <w:t xml:space="preserve">here you get minimalistic </w:t>
+      </w:r>
+      <w:proofErr w:type="gramStart"/>
+      <w:r>
+        <w:t xml:space="preserve">design </w:t>
       </w:r>
       <w:r>
         <w:t xml:space="preserve"> </w:t>
       </w:r>
       <w:r>
-        <w:t xml:space="preserve">Here you get </w:t>
+        <w:t>Here</w:t>
+      </w:r>
+      <w:proofErr w:type="gramEnd"/>
+      <w:r>
+        <w:t xml:space="preserve"> you get </w:t>
       </w:r>
       <w:proofErr w:type="spellStart"/>
       <w:r>
@@ -4535,14 +4983,46 @@
           <w:b/>
           <w:bCs/>
         </w:rPr>
-        <w:t xml:space="preserve"> and(we try there should be equivalent space between them)</w:t>
-      </w:r>
-      <w:r>
-        <w:rPr>
-          <w:b/>
-          <w:bCs/>
-        </w:rPr>
-        <w:t>(who knows)</w:t>
+        <w:t xml:space="preserve"> </w:t>
+      </w:r>
+      <w:proofErr w:type="gramStart"/>
+      <w:r>
+        <w:rPr>
+          <w:b/>
+          <w:bCs/>
+        </w:rPr>
+        <w:t>and(</w:t>
+      </w:r>
+      <w:proofErr w:type="gramEnd"/>
+      <w:r>
+        <w:rPr>
+          <w:b/>
+          <w:bCs/>
+        </w:rPr>
+        <w:t xml:space="preserve">we try there should be equivalent space between </w:t>
+      </w:r>
+      <w:proofErr w:type="gramStart"/>
+      <w:r>
+        <w:rPr>
+          <w:b/>
+          <w:bCs/>
+        </w:rPr>
+        <w:t>them)</w:t>
+      </w:r>
+      <w:r>
+        <w:rPr>
+          <w:b/>
+          <w:bCs/>
+        </w:rPr>
+        <w:t>(</w:t>
+      </w:r>
+      <w:proofErr w:type="gramEnd"/>
+      <w:r>
+        <w:rPr>
+          <w:b/>
+          <w:bCs/>
+        </w:rPr>
+        <w:t>who knows)</w:t>
       </w:r>
     </w:p>
     <w:p>
@@ -4559,6 +5039,7 @@
         <w:t xml:space="preserve"> in Tailwind by </w:t>
       </w:r>
       <w:proofErr w:type="spellStart"/>
+      <w:proofErr w:type="gramStart"/>
       <w:r>
         <w:rPr>
           <w:b/>
@@ -4574,6 +5055,7 @@
         <w:t>property</w:t>
       </w:r>
       <w:proofErr w:type="spellEnd"/>
+      <w:proofErr w:type="gramEnd"/>
       <w:r>
         <w:rPr>
           <w:b/>
@@ -4706,13 +5188,18 @@
     </w:p>
     <w:p>
       <w:r>
-        <w:t xml:space="preserve">import { </w:t>
+        <w:t xml:space="preserve">import </w:t>
+      </w:r>
+      <w:proofErr w:type="gramStart"/>
+      <w:r>
+        <w:t xml:space="preserve">{ </w:t>
       </w:r>
       <w:proofErr w:type="spellStart"/>
       <w:r>
         <w:t>AiOutlineShoppingCart</w:t>
       </w:r>
       <w:proofErr w:type="spellEnd"/>
+      <w:proofErr w:type="gramEnd"/>
       <w:r>
         <w:t xml:space="preserve"> } from "react-icons/ai";</w:t>
       </w:r>
@@ -4949,9 +5436,14 @@
       </w:r>
       <w:proofErr w:type="spellStart"/>
       <w:r>
-        <w:t>overflow-x:hidden</w:t>
-      </w:r>
-      <w:proofErr w:type="spellEnd"/>
+        <w:t>overflow-</w:t>
+      </w:r>
+      <w:proofErr w:type="gramStart"/>
+      <w:r>
+        <w:t>x:hidden</w:t>
+      </w:r>
+      <w:proofErr w:type="spellEnd"/>
+      <w:proofErr w:type="gramEnd"/>
       <w:r>
         <w:t xml:space="preserve"> you c</w:t>
       </w:r>
@@ -5017,13 +5509,11 @@
     </w:p>
     <w:p>
       <w:r>
-        <w:t xml:space="preserve">We will </w:t>
-      </w:r>
-      <w:proofErr w:type="spellStart"/>
-      <w:r>
-        <w:t>maek</w:t>
-      </w:r>
-      <w:proofErr w:type="spellEnd"/>
+        <w:t>We will mak</w:t>
+      </w:r>
+      <w:r>
+        <w:t>e</w:t>
+      </w:r>
       <w:r>
         <w:t xml:space="preserve"> a mock </w:t>
       </w:r>
@@ -5033,13 +5523,11 @@
       </w:r>
       <w:proofErr w:type="spellEnd"/>
       <w:r>
-        <w:t xml:space="preserve"> that </w:t>
-      </w:r>
-      <w:proofErr w:type="spellStart"/>
-      <w:r>
-        <w:t>wil</w:t>
-      </w:r>
-      <w:proofErr w:type="spellEnd"/>
+        <w:t xml:space="preserve"> that wil</w:t>
+      </w:r>
+      <w:r>
+        <w:t>l</w:t>
+      </w:r>
       <w:r>
         <w:t xml:space="preserve"> show all the </w:t>
       </w:r>
@@ -5052,6 +5540,124 @@
         <w:t xml:space="preserve"> that are serviceable </w:t>
       </w:r>
     </w:p>
+    <w:p>
+      <w:r>
+        <w:t>We will stor</w:t>
+      </w:r>
+      <w:r>
+        <w:t>e</w:t>
+      </w:r>
+      <w:r>
+        <w:t xml:space="preserve"> the items in cart</w:t>
+      </w:r>
+      <w:r>
+        <w:t xml:space="preserve"> object</w:t>
+      </w:r>
+      <w:r>
+        <w:t xml:space="preserve"> as an object and its key will be</w:t>
+      </w:r>
+      <w:r>
+        <w:t xml:space="preserve"> </w:t>
+      </w:r>
+      <w:r>
+        <w:t>its id</w:t>
+      </w:r>
+      <w:r>
+        <w:t xml:space="preserve"> and the item will have properties </w:t>
+      </w:r>
+    </w:p>
+    <w:p>
+      <w:r>
+        <w:t>In react state are not updated immediately there is no such gu</w:t>
+      </w:r>
+      <w:r>
+        <w:t>a</w:t>
+      </w:r>
+      <w:r>
+        <w:t xml:space="preserve">rantee </w:t>
+      </w:r>
+      <w:r>
+        <w:t xml:space="preserve">it is just a request and js will update cart accordingly </w:t>
+      </w:r>
+      <w:r>
+        <w:t xml:space="preserve">and there is no guarantee </w:t>
+      </w:r>
+      <w:proofErr w:type="gramStart"/>
+      <w:r>
+        <w:t>when  it</w:t>
+      </w:r>
+      <w:proofErr w:type="gramEnd"/>
+      <w:r>
+        <w:t xml:space="preserve"> will be updated so believe it that </w:t>
+      </w:r>
+      <w:r>
+        <w:t>car</w:t>
+      </w:r>
+      <w:r>
+        <w:t>t</w:t>
+      </w:r>
+      <w:r>
+        <w:t xml:space="preserve"> is not updated but you believe it </w:t>
+      </w:r>
+      <w:r>
+        <w:t xml:space="preserve">will happen </w:t>
+      </w:r>
+      <w:r>
+        <w:t>do update method is</w:t>
+      </w:r>
+      <w:r>
+        <w:t xml:space="preserve"> request </w:t>
+      </w:r>
+      <w:proofErr w:type="gramStart"/>
+      <w:r>
+        <w:t>its</w:t>
+      </w:r>
+      <w:proofErr w:type="gramEnd"/>
+      <w:r>
+        <w:t xml:space="preserve"> not an order</w:t>
+      </w:r>
+      <w:r>
+        <w:t xml:space="preserve">. React </w:t>
+      </w:r>
+      <w:proofErr w:type="spellStart"/>
+      <w:r>
+        <w:t>fulfil</w:t>
+      </w:r>
+      <w:r>
+        <w:t>l</w:t>
+      </w:r>
+      <w:proofErr w:type="spellEnd"/>
+      <w:r>
+        <w:t xml:space="preserve"> this request </w:t>
+      </w:r>
+      <w:r>
+        <w:t xml:space="preserve">accordingly </w:t>
+      </w:r>
+      <w:r>
+        <w:t xml:space="preserve">and it will take time but it </w:t>
+      </w:r>
+      <w:proofErr w:type="gramStart"/>
+      <w:r>
+        <w:t>take</w:t>
+      </w:r>
+      <w:proofErr w:type="gramEnd"/>
+      <w:r>
+        <w:t xml:space="preserve"> time </w:t>
+      </w:r>
+      <w:r>
+        <w:t xml:space="preserve">by time we mean in millisecond </w:t>
+      </w:r>
+      <w:r>
+        <w:t>but it will not be that fast that immediately changes happen and next function can use th</w:t>
+      </w:r>
+      <w:r>
+        <w:t>e</w:t>
+      </w:r>
+      <w:r>
+        <w:t xml:space="preserve"> updated version </w:t>
+      </w:r>
+    </w:p>
+    <w:p/>
     <w:sectPr>
       <w:pgSz w:w="11906" w:h="16838"/>
       <w:pgMar w:top="1440" w:right="1440" w:bottom="1440" w:left="1440" w:header="708" w:footer="708" w:gutter="0"/>

</xml_diff>

<commit_message>
Lesson 43 Improving Sidebar & Checkout Page for Codeswear.com
</commit_message>
<xml_diff>
--- a/Notes2.docx
+++ b/Notes2.docx
@@ -5619,16 +5619,11 @@
       <w:r>
         <w:t xml:space="preserve">. React </w:t>
       </w:r>
-      <w:proofErr w:type="spellStart"/>
-      <w:r>
-        <w:t>fulfil</w:t>
-      </w:r>
-      <w:r>
-        <w:t>l</w:t>
-      </w:r>
-      <w:proofErr w:type="spellEnd"/>
-      <w:r>
-        <w:t xml:space="preserve"> this request </w:t>
+      <w:r>
+        <w:t xml:space="preserve">fulfil </w:t>
+      </w:r>
+      <w:r>
+        <w:t xml:space="preserve">this request </w:t>
       </w:r>
       <w:r>
         <w:t xml:space="preserve">accordingly </w:t>
@@ -5655,6 +5650,169 @@
       </w:r>
       <w:r>
         <w:t xml:space="preserve"> updated version </w:t>
+      </w:r>
+    </w:p>
+    <w:p>
+      <w:r>
+        <w:rPr>
+          <w:b/>
+          <w:bCs/>
+        </w:rPr>
+        <w:t xml:space="preserve">We can </w:t>
+      </w:r>
+      <w:r>
+        <w:rPr>
+          <w:b/>
+          <w:bCs/>
+        </w:rPr>
+        <w:t xml:space="preserve">place the button of checkout </w:t>
+      </w:r>
+      <w:r>
+        <w:rPr>
+          <w:b/>
+          <w:bCs/>
+        </w:rPr>
+        <w:t xml:space="preserve">inside link so that we can use it </w:t>
+      </w:r>
+      <w:r>
+        <w:rPr>
+          <w:b/>
+          <w:bCs/>
+        </w:rPr>
+        <w:t xml:space="preserve">as a link </w:t>
+      </w:r>
+      <w:r>
+        <w:rPr>
+          <w:b/>
+          <w:bCs/>
+        </w:rPr>
+        <w:br/>
+      </w:r>
+    </w:p>
+    <w:p>
+      <w:pPr>
+        <w:jc w:val="center"/>
+      </w:pPr>
+      <w:r>
+        <w:rPr>
+          <w:noProof/>
+        </w:rPr>
+        <w:lastRenderedPageBreak/>
+        <w:drawing>
+          <wp:inline distT="0" distB="0" distL="0" distR="0" wp14:anchorId="4EBAD725" wp14:editId="70DC94E2">
+            <wp:extent cx="3458058" cy="3000794"/>
+            <wp:effectExtent l="0" t="0" r="9525" b="9525"/>
+            <wp:docPr id="2048734358" name="Picture 1"/>
+            <wp:cNvGraphicFramePr>
+              <a:graphicFrameLocks xmlns:a="http://schemas.openxmlformats.org/drawingml/2006/main" noChangeAspect="1"/>
+            </wp:cNvGraphicFramePr>
+            <a:graphic xmlns:a="http://schemas.openxmlformats.org/drawingml/2006/main">
+              <a:graphicData uri="http://schemas.openxmlformats.org/drawingml/2006/picture">
+                <pic:pic xmlns:pic="http://schemas.openxmlformats.org/drawingml/2006/picture">
+                  <pic:nvPicPr>
+                    <pic:cNvPr id="2048734358" name=""/>
+                    <pic:cNvPicPr/>
+                  </pic:nvPicPr>
+                  <pic:blipFill>
+                    <a:blip r:embed="rId29"/>
+                    <a:stretch>
+                      <a:fillRect/>
+                    </a:stretch>
+                  </pic:blipFill>
+                  <pic:spPr>
+                    <a:xfrm>
+                      <a:off x="0" y="0"/>
+                      <a:ext cx="3458058" cy="3000794"/>
+                    </a:xfrm>
+                    <a:prstGeom prst="rect">
+                      <a:avLst/>
+                    </a:prstGeom>
+                  </pic:spPr>
+                </pic:pic>
+              </a:graphicData>
+            </a:graphic>
+          </wp:inline>
+        </w:drawing>
+      </w:r>
+    </w:p>
+    <w:p>
+      <w:r>
+        <w:t>B</w:t>
+      </w:r>
+      <w:r>
+        <w:t>y</w:t>
+      </w:r>
+      <w:r>
+        <w:t xml:space="preserve"> clicking on marked above you can </w:t>
+      </w:r>
+      <w:r>
+        <w:t>use the git to see all the</w:t>
+      </w:r>
+      <w:r>
+        <w:t xml:space="preserve"> code </w:t>
+      </w:r>
+      <w:r>
+        <w:t>after</w:t>
+      </w:r>
+      <w:r>
+        <w:t xml:space="preserve"> the </w:t>
+      </w:r>
+      <w:r>
+        <w:t xml:space="preserve">latest </w:t>
+      </w:r>
+      <w:r>
+        <w:t>c</w:t>
+      </w:r>
+      <w:r>
+        <w:t>ommit</w:t>
+      </w:r>
+      <w:r>
+        <w:t xml:space="preserve"> </w:t>
+      </w:r>
+      <w:r>
+        <w:t>as shown below</w:t>
+      </w:r>
+    </w:p>
+    <w:p>
+      <w:r>
+        <w:rPr>
+          <w:noProof/>
+        </w:rPr>
+        <w:drawing>
+          <wp:inline distT="0" distB="0" distL="0" distR="0" wp14:anchorId="3A73CE9E" wp14:editId="16A6C005">
+            <wp:extent cx="5731510" cy="2489200"/>
+            <wp:effectExtent l="0" t="0" r="2540" b="6350"/>
+            <wp:docPr id="2125240823" name="Picture 1"/>
+            <wp:cNvGraphicFramePr>
+              <a:graphicFrameLocks xmlns:a="http://schemas.openxmlformats.org/drawingml/2006/main" noChangeAspect="1"/>
+            </wp:cNvGraphicFramePr>
+            <a:graphic xmlns:a="http://schemas.openxmlformats.org/drawingml/2006/main">
+              <a:graphicData uri="http://schemas.openxmlformats.org/drawingml/2006/picture">
+                <pic:pic xmlns:pic="http://schemas.openxmlformats.org/drawingml/2006/picture">
+                  <pic:nvPicPr>
+                    <pic:cNvPr id="2125240823" name=""/>
+                    <pic:cNvPicPr/>
+                  </pic:nvPicPr>
+                  <pic:blipFill>
+                    <a:blip r:embed="rId30"/>
+                    <a:stretch>
+                      <a:fillRect/>
+                    </a:stretch>
+                  </pic:blipFill>
+                  <pic:spPr>
+                    <a:xfrm>
+                      <a:off x="0" y="0"/>
+                      <a:ext cx="5731510" cy="2489200"/>
+                    </a:xfrm>
+                    <a:prstGeom prst="rect">
+                      <a:avLst/>
+                    </a:prstGeom>
+                  </pic:spPr>
+                </pic:pic>
+              </a:graphicData>
+            </a:graphic>
+          </wp:inline>
+        </w:drawing>
       </w:r>
     </w:p>
     <w:p/>

</xml_diff>

<commit_message>
Lesson 44 Creating Orders Page for Codeswear.com
</commit_message>
<xml_diff>
--- a/Notes2.docx
+++ b/Notes2.docx
@@ -5813,6 +5813,92 @@
             </a:graphic>
           </wp:inline>
         </w:drawing>
+      </w:r>
+    </w:p>
+    <w:p>
+      <w:r>
+        <w:t>We will now make orders pag</w:t>
+      </w:r>
+      <w:r>
+        <w:t xml:space="preserve">e </w:t>
+      </w:r>
+      <w:r>
+        <w:t>where the user will be redirected when the order will be placed</w:t>
+      </w:r>
+      <w:r>
+        <w:t xml:space="preserve">. We will tell the </w:t>
+      </w:r>
+      <w:r>
+        <w:t xml:space="preserve">user how they can track their </w:t>
+      </w:r>
+      <w:r>
+        <w:t xml:space="preserve">order. </w:t>
+      </w:r>
+      <w:r>
+        <w:t>How his order item look (who knows)</w:t>
+      </w:r>
+      <w:r>
+        <w:t xml:space="preserve"> we can show it </w:t>
+      </w:r>
+      <w:r>
+        <w:t>al</w:t>
+      </w:r>
+      <w:r>
+        <w:t>l</w:t>
+      </w:r>
+      <w:r>
+        <w:t xml:space="preserve">. Herer we will confirm the order </w:t>
+      </w:r>
+      <w:r>
+        <w:t xml:space="preserve">and then we will tell user </w:t>
+      </w:r>
+      <w:r>
+        <w:t>your order is placed and then we will tell the user</w:t>
+      </w:r>
+      <w:r>
+        <w:t xml:space="preserve"> that what were the items in the cart </w:t>
+      </w:r>
+      <w:r>
+        <w:t xml:space="preserve">and how did we confirm </w:t>
+      </w:r>
+      <w:r>
+        <w:t xml:space="preserve">the order </w:t>
+      </w:r>
+      <w:proofErr w:type="gramStart"/>
+      <w:r>
+        <w:t>there</w:t>
+      </w:r>
+      <w:r>
+        <w:t>(</w:t>
+      </w:r>
+      <w:proofErr w:type="gramEnd"/>
+      <w:r>
+        <w:t>who knows)</w:t>
+      </w:r>
+      <w:r>
+        <w:t>.</w:t>
+      </w:r>
+    </w:p>
+    <w:p>
+      <w:pPr>
+        <w:rPr>
+          <w:b/>
+          <w:bCs/>
+        </w:rPr>
+      </w:pPr>
+      <w:proofErr w:type="gramStart"/>
+      <w:r>
+        <w:rPr>
+          <w:b/>
+          <w:bCs/>
+        </w:rPr>
+        <w:t>Note:-</w:t>
+      </w:r>
+      <w:proofErr w:type="gramEnd"/>
+    </w:p>
+    <w:p>
+      <w:r>
+        <w:t>JSX is js not html.</w:t>
       </w:r>
     </w:p>
     <w:p/>

</xml_diff>

<commit_message>
Lesson 45 Creating Login & Signup Page Design for Codeswear.com
</commit_message>
<xml_diff>
--- a/Notes2.docx
+++ b/Notes2.docx
@@ -5897,6 +5897,11 @@
       <w:proofErr w:type="gramEnd"/>
     </w:p>
     <w:p>
+      <w:pPr>
+        <w:pBdr>
+          <w:bottom w:val="single" w:sz="12" w:space="1" w:color="auto"/>
+        </w:pBdr>
+      </w:pPr>
       <w:r>
         <w:t>JSX is js not html.</w:t>
       </w:r>

</xml_diff>

<commit_message>
Lesson 46 Adding MongoDB Database to Codeswear.com
</commit_message>
<xml_diff>
--- a/Notes2.docx
+++ b/Notes2.docx
@@ -59,18 +59,10 @@
     </w:p>
     <w:p>
       <w:r>
-        <w:t xml:space="preserve">In nay </w:t>
-      </w:r>
-      <w:proofErr w:type="gramStart"/>
-      <w:r>
-        <w:t>container</w:t>
-      </w:r>
-      <w:r>
-        <w:t>(</w:t>
-      </w:r>
-      <w:proofErr w:type="gramEnd"/>
-      <w:r>
-        <w:t>or component)</w:t>
+        <w:t>In nay container</w:t>
+      </w:r>
+      <w:r>
+        <w:t>(or component)</w:t>
       </w:r>
       <w:r>
         <w:t xml:space="preserve"> if you want to </w:t>
@@ -555,14 +547,9 @@
       </w:r>
     </w:p>
     <w:p>
-      <w:proofErr w:type="gramStart"/>
       <w:r>
         <w:lastRenderedPageBreak/>
-        <w:t>So</w:t>
-      </w:r>
-      <w:proofErr w:type="gramEnd"/>
-      <w:r>
-        <w:t xml:space="preserve"> we can so this thing Now we can see it is getting rendered as shown below</w:t>
+        <w:t>So we can so this thing Now we can see it is getting rendered as shown below</w:t>
       </w:r>
     </w:p>
     <w:p>
@@ -664,13 +651,8 @@
         <w:t xml:space="preserve"> s</w:t>
       </w:r>
       <w:r>
-        <w:t xml:space="preserve">ubmit the </w:t>
-      </w:r>
-      <w:proofErr w:type="gramStart"/>
-      <w:r>
-        <w:t>form</w:t>
-      </w:r>
-      <w:proofErr w:type="gramEnd"/>
+        <w:t>ubmit the form</w:t>
+      </w:r>
       <w:r>
         <w:t xml:space="preserve"> we will definitely have to make an API to co</w:t>
       </w:r>
@@ -736,29 +718,8 @@
       </w:r>
     </w:p>
     <w:p>
-      <w:proofErr w:type="gramStart"/>
-      <w:r>
-        <w:t>So</w:t>
-      </w:r>
-      <w:proofErr w:type="gramEnd"/>
-      <w:r>
-        <w:t xml:space="preserve"> for </w:t>
-      </w:r>
-      <w:proofErr w:type="gramStart"/>
-      <w:r>
-        <w:t>now</w:t>
-      </w:r>
-      <w:proofErr w:type="gramEnd"/>
-      <w:r>
-        <w:t xml:space="preserve"> our post request handler </w:t>
-      </w:r>
-      <w:proofErr w:type="gramStart"/>
-      <w:r>
-        <w:t>look</w:t>
-      </w:r>
-      <w:proofErr w:type="gramEnd"/>
-      <w:r>
-        <w:t xml:space="preserve"> like below</w:t>
+      <w:r>
+        <w:t>So for now our post request handler look like below</w:t>
       </w:r>
     </w:p>
     <w:p>
@@ -807,13 +768,8 @@
       </w:r>
     </w:p>
     <w:p>
-      <w:proofErr w:type="gramStart"/>
-      <w:r>
-        <w:t>Ols</w:t>
-      </w:r>
-      <w:proofErr w:type="gramEnd"/>
-      <w:r>
-        <w:t xml:space="preserve"> version used to look like below</w:t>
+      <w:r>
+        <w:t>Ols version used to look like below</w:t>
       </w:r>
     </w:p>
     <w:p>
@@ -921,12 +877,10 @@
         <w:t xml:space="preserve">, not plain JSON, so sending it directly with </w:t>
       </w:r>
       <w:proofErr w:type="spellStart"/>
-      <w:proofErr w:type="gramStart"/>
       <w:r>
         <w:t>res.json</w:t>
       </w:r>
       <w:proofErr w:type="spellEnd"/>
-      <w:proofErr w:type="gramEnd"/>
       <w:r>
         <w:t>(</w:t>
       </w:r>
@@ -984,14 +938,9 @@
     </w:p>
     <w:p>
       <w:r>
-        <w:t xml:space="preserve">export default function </w:t>
-      </w:r>
-      <w:proofErr w:type="gramStart"/>
-      <w:r>
-        <w:t>handler(</w:t>
-      </w:r>
-      <w:proofErr w:type="spellStart"/>
-      <w:proofErr w:type="gramEnd"/>
+        <w:t>export default function handler(</w:t>
+      </w:r>
+      <w:proofErr w:type="spellStart"/>
       <w:r>
         <w:t>req</w:t>
       </w:r>
@@ -1097,7 +1046,6 @@
         <w:t xml:space="preserve">Why </w:t>
       </w:r>
       <w:proofErr w:type="spellStart"/>
-      <w:proofErr w:type="gramStart"/>
       <w:r>
         <w:rPr>
           <w:b/>
@@ -1106,7 +1054,6 @@
         <w:t>res.json</w:t>
       </w:r>
       <w:proofErr w:type="spellEnd"/>
-      <w:proofErr w:type="gramEnd"/>
       <w:r>
         <w:rPr>
           <w:b/>
@@ -1138,25 +1085,18 @@
     </w:p>
     <w:p>
       <w:proofErr w:type="spellStart"/>
-      <w:proofErr w:type="gramStart"/>
       <w:r>
         <w:t>res.status</w:t>
       </w:r>
       <w:proofErr w:type="spellEnd"/>
-      <w:proofErr w:type="gramEnd"/>
-      <w:r>
-        <w:t>(200</w:t>
-      </w:r>
-      <w:proofErr w:type="gramStart"/>
-      <w:r>
-        <w:t>).</w:t>
+      <w:r>
+        <w:t>(200).</w:t>
       </w:r>
       <w:proofErr w:type="spellStart"/>
       <w:r>
         <w:t>json</w:t>
       </w:r>
       <w:proofErr w:type="spellEnd"/>
-      <w:proofErr w:type="gramEnd"/>
       <w:r>
         <w:t>(</w:t>
       </w:r>
@@ -1257,14 +1197,9 @@
     </w:p>
     <w:p>
       <w:r>
-        <w:t xml:space="preserve">export default function </w:t>
-      </w:r>
-      <w:proofErr w:type="gramStart"/>
-      <w:r>
-        <w:t>handler(</w:t>
-      </w:r>
-      <w:proofErr w:type="spellStart"/>
-      <w:proofErr w:type="gramEnd"/>
+        <w:t>export default function handler(</w:t>
+      </w:r>
+      <w:proofErr w:type="spellStart"/>
       <w:r>
         <w:t>req</w:t>
       </w:r>
@@ -1277,12 +1212,10 @@
         <w:t xml:space="preserve">  if (</w:t>
       </w:r>
       <w:proofErr w:type="spellStart"/>
-      <w:proofErr w:type="gramStart"/>
       <w:r>
         <w:t>req.method</w:t>
       </w:r>
       <w:proofErr w:type="spellEnd"/>
-      <w:proofErr w:type="gramEnd"/>
       <w:r>
         <w:t xml:space="preserve"> === "POST") {</w:t>
       </w:r>
@@ -1291,25 +1224,18 @@
         <w:t xml:space="preserve">    </w:t>
       </w:r>
       <w:proofErr w:type="spellStart"/>
-      <w:proofErr w:type="gramStart"/>
       <w:r>
         <w:t>res.status</w:t>
       </w:r>
       <w:proofErr w:type="spellEnd"/>
-      <w:proofErr w:type="gramEnd"/>
-      <w:r>
-        <w:t>(200</w:t>
-      </w:r>
-      <w:proofErr w:type="gramStart"/>
-      <w:r>
-        <w:t>).</w:t>
+      <w:r>
+        <w:t>(200).</w:t>
       </w:r>
       <w:proofErr w:type="spellStart"/>
       <w:r>
         <w:t>json</w:t>
       </w:r>
       <w:proofErr w:type="spellEnd"/>
-      <w:proofErr w:type="gramEnd"/>
       <w:r>
         <w:t>({</w:t>
       </w:r>
@@ -1318,12 +1244,10 @@
         <w:t xml:space="preserve">      method: </w:t>
       </w:r>
       <w:proofErr w:type="spellStart"/>
-      <w:proofErr w:type="gramStart"/>
       <w:r>
         <w:t>req.method</w:t>
       </w:r>
       <w:proofErr w:type="spellEnd"/>
-      <w:proofErr w:type="gramEnd"/>
       <w:r>
         <w:t>,</w:t>
       </w:r>
@@ -1332,12 +1256,10 @@
         <w:t xml:space="preserve">      body: </w:t>
       </w:r>
       <w:proofErr w:type="spellStart"/>
-      <w:proofErr w:type="gramStart"/>
       <w:r>
         <w:t>req.body</w:t>
       </w:r>
       <w:proofErr w:type="spellEnd"/>
-      <w:proofErr w:type="gramEnd"/>
       <w:r>
         <w:t>,</w:t>
       </w:r>
@@ -1346,12 +1268,10 @@
         <w:t xml:space="preserve">      query: </w:t>
       </w:r>
       <w:proofErr w:type="spellStart"/>
-      <w:proofErr w:type="gramStart"/>
       <w:r>
         <w:t>req.query</w:t>
       </w:r>
       <w:proofErr w:type="spellEnd"/>
-      <w:proofErr w:type="gramEnd"/>
       <w:r>
         <w:t>,</w:t>
       </w:r>
@@ -1361,12 +1281,8 @@
       </w:r>
       <w:r>
         <w:br/>
-      </w:r>
-      <w:proofErr w:type="gramStart"/>
-      <w:r>
         <w:t xml:space="preserve">  }</w:t>
       </w:r>
-      <w:proofErr w:type="gramEnd"/>
       <w:r>
         <w:br/>
         <w:t>}</w:t>
@@ -1522,12 +1438,10 @@
           </w:tcPr>
           <w:p>
             <w:proofErr w:type="spellStart"/>
-            <w:proofErr w:type="gramStart"/>
             <w:r>
               <w:t>req.body</w:t>
             </w:r>
             <w:proofErr w:type="spellEnd"/>
-            <w:proofErr w:type="gramEnd"/>
           </w:p>
         </w:tc>
         <w:tc>
@@ -1561,12 +1475,10 @@
           </w:tcPr>
           <w:p>
             <w:proofErr w:type="spellStart"/>
-            <w:proofErr w:type="gramStart"/>
             <w:r>
               <w:t>req.query</w:t>
             </w:r>
             <w:proofErr w:type="spellEnd"/>
-            <w:proofErr w:type="gramEnd"/>
           </w:p>
         </w:tc>
         <w:tc>
@@ -1600,12 +1512,10 @@
           </w:tcPr>
           <w:p>
             <w:proofErr w:type="spellStart"/>
-            <w:proofErr w:type="gramStart"/>
             <w:r>
               <w:t>req.method</w:t>
             </w:r>
             <w:proofErr w:type="spellEnd"/>
-            <w:proofErr w:type="gramEnd"/>
           </w:p>
         </w:tc>
         <w:tc>
@@ -1657,14 +1567,9 @@
     </w:p>
     <w:p>
       <w:r>
-        <w:t xml:space="preserve">export async function </w:t>
-      </w:r>
-      <w:proofErr w:type="gramStart"/>
-      <w:r>
-        <w:t>POST(</w:t>
-      </w:r>
-      <w:proofErr w:type="spellStart"/>
-      <w:proofErr w:type="gramEnd"/>
+        <w:t>export async function POST(</w:t>
+      </w:r>
+      <w:proofErr w:type="spellStart"/>
       <w:r>
         <w:t>req</w:t>
       </w:r>
@@ -1688,12 +1593,10 @@
         <w:t xml:space="preserve"> body = await </w:t>
       </w:r>
       <w:proofErr w:type="spellStart"/>
-      <w:proofErr w:type="gramStart"/>
       <w:r>
         <w:t>req.json</w:t>
       </w:r>
       <w:proofErr w:type="spellEnd"/>
-      <w:proofErr w:type="gramEnd"/>
       <w:r>
         <w:t>();</w:t>
       </w:r>
@@ -1755,12 +1658,10 @@
         <w:t xml:space="preserve">d specific fields like </w:t>
       </w:r>
       <w:proofErr w:type="spellStart"/>
-      <w:proofErr w:type="gramStart"/>
       <w:r>
         <w:t>req.body</w:t>
       </w:r>
       <w:proofErr w:type="spellEnd"/>
-      <w:proofErr w:type="gramEnd"/>
       <w:r>
         <w:t>.</w:t>
       </w:r>
@@ -1770,15 +1671,7 @@
         <w:t>In older version we used to get body like we did in n</w:t>
       </w:r>
       <w:r>
-        <w:t xml:space="preserve">ode js but in modern it </w:t>
-      </w:r>
-      <w:proofErr w:type="gramStart"/>
-      <w:r>
-        <w:t>look</w:t>
-      </w:r>
-      <w:proofErr w:type="gramEnd"/>
-      <w:r>
-        <w:t xml:space="preserve"> like below</w:t>
+        <w:t>ode js but in modern it look like below</w:t>
       </w:r>
     </w:p>
     <w:p>
@@ -1881,18 +1774,10 @@
         <w:t>The problem with the file making</w:t>
       </w:r>
       <w:r>
-        <w:t xml:space="preserve"> </w:t>
-      </w:r>
-      <w:proofErr w:type="gramStart"/>
-      <w:r>
-        <w:t xml:space="preserve">strategy </w:t>
-      </w:r>
-      <w:r>
-        <w:t xml:space="preserve"> is</w:t>
-      </w:r>
-      <w:proofErr w:type="gramEnd"/>
-      <w:r>
-        <w:t xml:space="preserve"> that </w:t>
+        <w:t xml:space="preserve"> strategy </w:t>
+      </w:r>
+      <w:r>
+        <w:t xml:space="preserve"> is that </w:t>
       </w:r>
       <w:r>
         <w:t xml:space="preserve">if suppose </w:t>
@@ -2005,41 +1890,20 @@
       </w:r>
       <w:proofErr w:type="spellEnd"/>
       <w:r>
+        <w:t xml:space="preserve"> element</w:t>
+      </w:r>
+      <w:r>
+        <w:t>(who knows may be I am wrong here)</w:t>
+      </w:r>
+      <w:r>
         <w:t xml:space="preserve"> </w:t>
       </w:r>
-      <w:proofErr w:type="gramStart"/>
-      <w:r>
-        <w:t>element</w:t>
-      </w:r>
-      <w:r>
-        <w:t>(</w:t>
-      </w:r>
-      <w:proofErr w:type="gramEnd"/>
-      <w:r>
-        <w:t xml:space="preserve">who knows </w:t>
-      </w:r>
-      <w:proofErr w:type="gramStart"/>
-      <w:r>
-        <w:t>may be</w:t>
-      </w:r>
-      <w:proofErr w:type="gramEnd"/>
-      <w:r>
-        <w:t xml:space="preserve"> I am wrong here)</w:t>
-      </w:r>
-      <w:r>
-        <w:t xml:space="preserve"> </w:t>
-      </w:r>
       <w:r>
         <w:t xml:space="preserve">and on state update method we used </w:t>
       </w:r>
       <w:proofErr w:type="spellStart"/>
-      <w:proofErr w:type="gramStart"/>
-      <w:r>
-        <w:t>e.target</w:t>
-      </w:r>
-      <w:proofErr w:type="gramEnd"/>
-      <w:r>
-        <w:t>.innerText</w:t>
+      <w:r>
+        <w:t>e.target.innerText</w:t>
       </w:r>
       <w:proofErr w:type="spellEnd"/>
     </w:p>
@@ -2056,13 +1920,8 @@
         <w:t xml:space="preserve"> we can use </w:t>
       </w:r>
       <w:proofErr w:type="spellStart"/>
-      <w:proofErr w:type="gramStart"/>
-      <w:r>
-        <w:t>e.target</w:t>
-      </w:r>
-      <w:proofErr w:type="gramEnd"/>
-      <w:r>
-        <w:t>,value</w:t>
+      <w:r>
+        <w:t>e.target,value</w:t>
       </w:r>
       <w:proofErr w:type="spellEnd"/>
       <w:r>
@@ -2178,16 +2037,13 @@
         <w:t xml:space="preserve">Shortcut for </w:t>
       </w:r>
       <w:proofErr w:type="spellStart"/>
-      <w:proofErr w:type="gramStart"/>
       <w:r>
         <w:t>margin:auto</w:t>
       </w:r>
       <w:proofErr w:type="spellEnd"/>
-      <w:proofErr w:type="gramEnd"/>
       <w:r>
         <w:t xml:space="preserve"> will be </w:t>
       </w:r>
-      <w:proofErr w:type="gramStart"/>
       <w:r>
         <w:rPr>
           <w:b/>
@@ -2195,7 +2051,6 @@
         </w:rPr>
         <w:t>m:auto</w:t>
       </w:r>
-      <w:proofErr w:type="gramEnd"/>
       <w:r>
         <w:rPr>
           <w:b/>
@@ -2259,18 +2114,10 @@
     </w:p>
     <w:p>
       <w:r>
-        <w:t xml:space="preserve">Suppose you have 50 blogs and you want to show 5 blogs on each </w:t>
-      </w:r>
-      <w:proofErr w:type="gramStart"/>
-      <w:r>
-        <w:t xml:space="preserve">pages </w:t>
-      </w:r>
-      <w:r>
-        <w:t xml:space="preserve"> so</w:t>
-      </w:r>
-      <w:proofErr w:type="gramEnd"/>
-      <w:r>
-        <w:t xml:space="preserve"> 10 pages </w:t>
+        <w:t xml:space="preserve">Suppose you have 50 blogs and you want to show 5 blogs on each pages </w:t>
+      </w:r>
+      <w:r>
+        <w:t xml:space="preserve"> so 10 pages </w:t>
       </w:r>
       <w:r>
         <w:t>will</w:t>
@@ -2281,16 +2128,11 @@
       <w:r>
         <w:t xml:space="preserve">be </w:t>
       </w:r>
-      <w:proofErr w:type="gramStart"/>
       <w:r>
         <w:t xml:space="preserve">formed </w:t>
       </w:r>
       <w:r>
-        <w:t>.</w:t>
-      </w:r>
-      <w:proofErr w:type="gramEnd"/>
-      <w:r>
-        <w:t xml:space="preserve"> In the similar way </w:t>
+        <w:t xml:space="preserve">. In the similar way </w:t>
       </w:r>
       <w:r>
         <w:t xml:space="preserve">pagination can be showed </w:t>
@@ -2407,15 +2249,7 @@
         <w:t xml:space="preserve">that we will not good components </w:t>
       </w:r>
       <w:r>
-        <w:t xml:space="preserve">means you won’t get good packages for doing any </w:t>
-      </w:r>
-      <w:proofErr w:type="gramStart"/>
-      <w:r>
-        <w:t>work(</w:t>
-      </w:r>
-      <w:proofErr w:type="gramEnd"/>
-      <w:r>
-        <w:t>who knows)</w:t>
+        <w:t>means you won’t get good packages for doing any work(who knows)</w:t>
       </w:r>
     </w:p>
     <w:p>
@@ -2444,27 +2278,14 @@
       </w:r>
     </w:p>
     <w:p>
-      <w:proofErr w:type="gramStart"/>
-      <w:r>
-        <w:t>So</w:t>
-      </w:r>
-      <w:proofErr w:type="gramEnd"/>
-      <w:r>
-        <w:t xml:space="preserve"> we run the above command I context of </w:t>
+      <w:r>
+        <w:t xml:space="preserve">So we run the above command I context of </w:t>
       </w:r>
       <w:r>
         <w:t xml:space="preserve">yarn </w:t>
       </w:r>
       <w:r>
-        <w:t xml:space="preserve">by </w:t>
-      </w:r>
-      <w:proofErr w:type="gramStart"/>
-      <w:r>
-        <w:t>using  below</w:t>
-      </w:r>
-      <w:proofErr w:type="gramEnd"/>
-      <w:r>
-        <w:t xml:space="preserve"> command</w:t>
+        <w:t>by using  below command</w:t>
       </w:r>
     </w:p>
     <w:p>
@@ -2552,29 +2373,13 @@
         <w:t xml:space="preserve">Data length </w:t>
       </w:r>
       <w:r>
-        <w:t xml:space="preserve">of the data that to be </w:t>
-      </w:r>
-      <w:proofErr w:type="gramStart"/>
-      <w:r>
-        <w:t>shown</w:t>
-      </w:r>
-      <w:r>
-        <w:t xml:space="preserve"> ,</w:t>
-      </w:r>
-      <w:proofErr w:type="gramEnd"/>
-      <w:r>
-        <w:t xml:space="preserve"> next is the </w:t>
-      </w:r>
-      <w:proofErr w:type="gramStart"/>
-      <w:r>
-        <w:t xml:space="preserve">function  </w:t>
-      </w:r>
-      <w:r>
-        <w:t>that</w:t>
-      </w:r>
-      <w:proofErr w:type="gramEnd"/>
-      <w:r>
-        <w:t xml:space="preserve"> will be called when we scroll and reach the bottom and more data is needed to be loaded.</w:t>
+        <w:t>of the data that to be shown</w:t>
+      </w:r>
+      <w:r>
+        <w:t xml:space="preserve"> , next is the function  </w:t>
+      </w:r>
+      <w:r>
+        <w:t>that will be called when we scroll and reach the bottom and more data is needed to be loaded.</w:t>
       </w:r>
     </w:p>
     <w:p>
@@ -2602,21 +2407,13 @@
         <w:t>w</w:t>
       </w:r>
       <w:r>
-        <w:t xml:space="preserve">n </w:t>
-      </w:r>
-      <w:proofErr w:type="gramStart"/>
-      <w:r>
-        <w:t>function</w:t>
+        <w:t>n function</w:t>
       </w:r>
       <w:r>
         <w:t>al</w:t>
       </w:r>
       <w:r>
-        <w:t>ity(</w:t>
-      </w:r>
-      <w:proofErr w:type="gramEnd"/>
-      <w:r>
-        <w:t>who knows)</w:t>
+        <w:t>ity(who knows)</w:t>
       </w:r>
     </w:p>
     <w:p>
@@ -2698,15 +2495,7 @@
         <w:t xml:space="preserve">it is defined like this </w:t>
       </w:r>
       <w:r>
-        <w:t xml:space="preserve">if we keep single </w:t>
-      </w:r>
-      <w:proofErr w:type="gramStart"/>
-      <w:r>
-        <w:t>item</w:t>
-      </w:r>
-      <w:proofErr w:type="gramEnd"/>
-      <w:r>
-        <w:t xml:space="preserve"> </w:t>
+        <w:t xml:space="preserve">if we keep single item </w:t>
       </w:r>
       <w:r>
         <w:t>we need to see al</w:t>
@@ -2715,21 +2504,13 @@
         <w:t>l</w:t>
       </w:r>
       <w:r>
-        <w:t xml:space="preserve"> </w:t>
-      </w:r>
-      <w:proofErr w:type="gramStart"/>
-      <w:r>
-        <w:t>this thi</w:t>
+        <w:t xml:space="preserve"> this thi</w:t>
       </w:r>
       <w:r>
         <w:t>n</w:t>
       </w:r>
       <w:r>
-        <w:t>gs</w:t>
-      </w:r>
-      <w:proofErr w:type="gramEnd"/>
-      <w:r>
-        <w:t xml:space="preserve"> </w:t>
+        <w:t xml:space="preserve">gs </w:t>
       </w:r>
     </w:p>
     <w:p>
@@ -2739,7 +2520,6 @@
           <w:bCs/>
         </w:rPr>
       </w:pPr>
-      <w:proofErr w:type="gramStart"/>
       <w:r>
         <w:rPr>
           <w:b/>
@@ -2747,7 +2527,6 @@
         </w:rPr>
         <w:t>Note:-</w:t>
       </w:r>
-      <w:proofErr w:type="gramEnd"/>
     </w:p>
     <w:p>
       <w:pPr>
@@ -2759,15 +2538,7 @@
         <w:t xml:space="preserve">Sometime it happens </w:t>
       </w:r>
       <w:r>
-        <w:t xml:space="preserve">in react that one component is </w:t>
-      </w:r>
-      <w:proofErr w:type="gramStart"/>
-      <w:r>
-        <w:t>show  two</w:t>
-      </w:r>
-      <w:proofErr w:type="gramEnd"/>
-      <w:r>
-        <w:t xml:space="preserve"> times so reload to remove the bug</w:t>
+        <w:t>in react that one component is show  two times so reload to remove the bug</w:t>
       </w:r>
     </w:p>
     <w:p>
@@ -2783,15 +2554,7 @@
         <w:t xml:space="preserve">except for responsiveness </w:t>
       </w:r>
       <w:r>
-        <w:t xml:space="preserve">we </w:t>
-      </w:r>
-      <w:proofErr w:type="gramStart"/>
-      <w:r>
-        <w:t>will  make</w:t>
-      </w:r>
-      <w:proofErr w:type="gramEnd"/>
-      <w:r>
-        <w:t xml:space="preserve"> our blog responsive and will write media queries </w:t>
+        <w:t xml:space="preserve">we will  make our blog responsive and will write media queries </w:t>
       </w:r>
       <w:r>
         <w:t>how we can we run media que</w:t>
@@ -2817,13 +2580,8 @@
         <w:t xml:space="preserve">the website </w:t>
       </w:r>
       <w:r>
-        <w:t xml:space="preserve">and if you gave </w:t>
-      </w:r>
-      <w:proofErr w:type="gramStart"/>
-      <w:r>
-        <w:t>responsiveness</w:t>
-      </w:r>
-      <w:proofErr w:type="gramEnd"/>
+        <w:t>and if you gave responsiveness</w:t>
+      </w:r>
       <w:r>
         <w:t xml:space="preserve"> it was an addon</w:t>
       </w:r>
@@ -2842,12 +2600,10 @@
         <w:t xml:space="preserve">you can say bit in </w:t>
       </w:r>
       <w:proofErr w:type="spellStart"/>
-      <w:proofErr w:type="gramStart"/>
       <w:r>
         <w:t>todays</w:t>
       </w:r>
       <w:proofErr w:type="spellEnd"/>
-      <w:proofErr w:type="gramEnd"/>
       <w:r>
         <w:t xml:space="preserve"> time </w:t>
       </w:r>
@@ -2924,11 +2680,7 @@
     </w:p>
     <w:p>
       <w:r>
-        <w:t xml:space="preserve">We will </w:t>
-      </w:r>
-      <w:proofErr w:type="gramStart"/>
-      <w:r>
-        <w:t>ho</w:t>
+        <w:t>We will ho</w:t>
       </w:r>
       <w:r>
         <w:t>s</w:t>
@@ -2937,11 +2689,7 @@
         <w:t>t</w:t>
       </w:r>
       <w:r>
-        <w:t>s</w:t>
-      </w:r>
-      <w:proofErr w:type="gramEnd"/>
-      <w:r>
-        <w:t xml:space="preserve"> the web</w:t>
+        <w:t>s the web</w:t>
       </w:r>
       <w:r>
         <w:t>s</w:t>
@@ -3068,15 +2816,7 @@
     </w:p>
     <w:p>
       <w:r>
-        <w:t xml:space="preserve">IN digital ocean we make new </w:t>
-      </w:r>
-      <w:proofErr w:type="gramStart"/>
-      <w:r>
-        <w:t>user(</w:t>
-      </w:r>
-      <w:proofErr w:type="gramEnd"/>
-      <w:r>
-        <w:t xml:space="preserve">who knows) </w:t>
+        <w:t xml:space="preserve">IN digital ocean we make new user(who knows) </w:t>
       </w:r>
     </w:p>
     <w:p>
@@ -3114,26 +2854,13 @@
       <w:r>
         <w:t xml:space="preserve">process will be </w:t>
       </w:r>
-      <w:proofErr w:type="gramStart"/>
-      <w:r>
-        <w:t>build</w:t>
-      </w:r>
-      <w:proofErr w:type="gramEnd"/>
-      <w:r>
-        <w:t xml:space="preserve"> there </w:t>
-      </w:r>
-    </w:p>
-    <w:p>
-      <w:r>
-        <w:t xml:space="preserve">It will ask you to make database in </w:t>
-      </w:r>
-      <w:proofErr w:type="gramStart"/>
-      <w:r>
-        <w:t>there</w:t>
-      </w:r>
-      <w:proofErr w:type="gramEnd"/>
-      <w:r>
-        <w:t xml:space="preserve"> services.</w:t>
+      <w:r>
+        <w:t xml:space="preserve">build there </w:t>
+      </w:r>
+    </w:p>
+    <w:p>
+      <w:r>
+        <w:t>It will ask you to make database in there services.</w:t>
       </w:r>
       <w:r>
         <w:t xml:space="preserve"> (who knows)</w:t>
@@ -3184,14 +2911,9 @@
       </w:r>
       <w:proofErr w:type="spellEnd"/>
       <w:r>
-        <w:t xml:space="preserve"> it will be </w:t>
-      </w:r>
-      <w:proofErr w:type="gramStart"/>
-      <w:r>
-        <w:t>good(</w:t>
-      </w:r>
-      <w:proofErr w:type="spellStart"/>
-      <w:proofErr w:type="gramEnd"/>
+        <w:t xml:space="preserve"> it will be good(</w:t>
+      </w:r>
+      <w:proofErr w:type="spellStart"/>
       <w:r>
         <w:t>wjp</w:t>
       </w:r>
@@ -3208,101 +2930,73 @@
           <w:color w:val="EE0000"/>
         </w:rPr>
       </w:pPr>
-      <w:proofErr w:type="gramStart"/>
       <w:r>
         <w:rPr>
           <w:b/>
           <w:bCs/>
           <w:color w:val="EE0000"/>
         </w:rPr>
-        <w:t>‘ can</w:t>
-      </w:r>
-      <w:proofErr w:type="gramEnd"/>
+        <w:t xml:space="preserve">‘ can create </w:t>
+      </w:r>
       <w:r>
         <w:rPr>
           <w:b/>
           <w:bCs/>
           <w:color w:val="EE0000"/>
         </w:rPr>
-        <w:t xml:space="preserve"> create </w:t>
-      </w:r>
+        <w:t xml:space="preserve">error in </w:t>
+      </w:r>
+      <w:proofErr w:type="spellStart"/>
       <w:r>
         <w:rPr>
           <w:b/>
           <w:bCs/>
           <w:color w:val="EE0000"/>
         </w:rPr>
-        <w:t xml:space="preserve">error in </w:t>
-      </w:r>
-      <w:proofErr w:type="spellStart"/>
+        <w:t>js</w:t>
+      </w:r>
       <w:r>
         <w:rPr>
           <w:b/>
           <w:bCs/>
           <w:color w:val="EE0000"/>
         </w:rPr>
-        <w:t>js</w:t>
-      </w:r>
+        <w:t>x</w:t>
+      </w:r>
+      <w:proofErr w:type="spellEnd"/>
       <w:r>
         <w:rPr>
           <w:b/>
           <w:bCs/>
           <w:color w:val="EE0000"/>
         </w:rPr>
-        <w:t>x</w:t>
-      </w:r>
-      <w:proofErr w:type="spellEnd"/>
+        <w:t xml:space="preserve"> in </w:t>
+      </w:r>
+      <w:proofErr w:type="spellStart"/>
       <w:r>
         <w:rPr>
           <w:b/>
           <w:bCs/>
           <w:color w:val="EE0000"/>
         </w:rPr>
-        <w:t xml:space="preserve"> in </w:t>
-      </w:r>
-      <w:proofErr w:type="spellStart"/>
+        <w:t>Nextjs</w:t>
+      </w:r>
+      <w:proofErr w:type="spellEnd"/>
       <w:r>
         <w:rPr>
           <w:b/>
           <w:bCs/>
           <w:color w:val="EE0000"/>
         </w:rPr>
-        <w:t>Nextjs</w:t>
-      </w:r>
-      <w:proofErr w:type="spellEnd"/>
+        <w:t xml:space="preserve"> or maybe in React.</w:t>
+      </w:r>
       <w:r>
         <w:rPr>
           <w:b/>
           <w:bCs/>
           <w:color w:val="EE0000"/>
         </w:rPr>
-        <w:t xml:space="preserve"> or maybe in </w:t>
-      </w:r>
-      <w:proofErr w:type="gramStart"/>
-      <w:r>
-        <w:rPr>
-          <w:b/>
-          <w:bCs/>
-          <w:color w:val="EE0000"/>
-        </w:rPr>
-        <w:t>React.</w:t>
-      </w:r>
-      <w:r>
-        <w:rPr>
-          <w:b/>
-          <w:bCs/>
-          <w:color w:val="EE0000"/>
-        </w:rPr>
-        <w:t>(</w:t>
-      </w:r>
-      <w:proofErr w:type="gramEnd"/>
-      <w:r>
-        <w:rPr>
-          <w:b/>
-          <w:bCs/>
-          <w:color w:val="EE0000"/>
-        </w:rPr>
-        <w:t>maybe it is an outdated problem)</w:t>
+        <w:t>(maybe it is an outdated problem)</w:t>
       </w:r>
     </w:p>
     <w:p>
@@ -3327,12 +3021,10 @@
         <w:t xml:space="preserve">you can make it like that and if it </w:t>
       </w:r>
       <w:proofErr w:type="spellStart"/>
-      <w:proofErr w:type="gramStart"/>
       <w:r>
         <w:t>become</w:t>
       </w:r>
       <w:proofErr w:type="spellEnd"/>
-      <w:proofErr w:type="gramEnd"/>
       <w:r>
         <w:t xml:space="preserve"> profitable then you can scale it (who knows) </w:t>
       </w:r>
@@ -3341,7 +3033,6 @@
       <w:r>
         <w:t xml:space="preserve">Now as you commit then </w:t>
       </w:r>
-      <w:proofErr w:type="gramStart"/>
       <w:r>
         <w:t>Digital</w:t>
       </w:r>
@@ -3349,25 +3040,13 @@
         <w:t xml:space="preserve"> </w:t>
       </w:r>
       <w:r>
-        <w:t>ocean</w:t>
-      </w:r>
-      <w:proofErr w:type="gramEnd"/>
-      <w:r>
-        <w:t xml:space="preserve"> will build it</w:t>
-      </w:r>
-      <w:r>
-        <w:t xml:space="preserve"> automatically for </w:t>
-      </w:r>
-      <w:proofErr w:type="gramStart"/>
-      <w:r>
-        <w:t>you.</w:t>
-      </w:r>
-      <w:r>
-        <w:t>(</w:t>
-      </w:r>
-      <w:proofErr w:type="gramEnd"/>
-      <w:r>
-        <w:t>maybe if auto</w:t>
+        <w:t>ocean will build it</w:t>
+      </w:r>
+      <w:r>
+        <w:t xml:space="preserve"> automatically for you.</w:t>
+      </w:r>
+      <w:r>
+        <w:t>(maybe if auto</w:t>
       </w:r>
       <w:r>
         <w:t xml:space="preserve"> </w:t>
@@ -3376,15 +3055,7 @@
         <w:t xml:space="preserve">deploy option was selected </w:t>
       </w:r>
       <w:r>
-        <w:t xml:space="preserve">in the </w:t>
-      </w:r>
-      <w:proofErr w:type="gramStart"/>
-      <w:r>
-        <w:t>setting(</w:t>
-      </w:r>
-      <w:proofErr w:type="gramEnd"/>
-      <w:r>
-        <w:t>who knows)</w:t>
+        <w:t>in the setting(who knows)</w:t>
       </w:r>
       <w:r>
         <w:t>)</w:t>
@@ -3422,18 +3093,10 @@
         <w:t xml:space="preserve">here (maybe </w:t>
       </w:r>
       <w:r>
-        <w:t xml:space="preserve">very large app don’t work </w:t>
-      </w:r>
-      <w:proofErr w:type="gramStart"/>
-      <w:r>
-        <w:t>properly</w:t>
-      </w:r>
-      <w:r>
-        <w:t>(</w:t>
-      </w:r>
-      <w:proofErr w:type="gramEnd"/>
-      <w:r>
-        <w:t>who knows)</w:t>
+        <w:t>very large app don’t work properly</w:t>
+      </w:r>
+      <w:r>
+        <w:t>(who knows)</w:t>
       </w:r>
       <w:r>
         <w:t>)</w:t>
@@ -3474,18 +3137,10 @@
         <w:t xml:space="preserve">Now we will see </w:t>
       </w:r>
       <w:r>
-        <w:t xml:space="preserve">how Google analytics and search </w:t>
-      </w:r>
-      <w:proofErr w:type="gramStart"/>
-      <w:r>
-        <w:t>console</w:t>
-      </w:r>
-      <w:r>
-        <w:t>(</w:t>
-      </w:r>
-      <w:proofErr w:type="gramEnd"/>
-      <w:r>
-        <w:t xml:space="preserve">who </w:t>
+        <w:t>how Google analytics and search console</w:t>
+      </w:r>
+      <w:r>
+        <w:t xml:space="preserve">(who </w:t>
       </w:r>
       <w:proofErr w:type="spellStart"/>
       <w:r>
@@ -3652,21 +3307,13 @@
         <w:t xml:space="preserve">ck </w:t>
       </w:r>
       <w:r>
-        <w:t xml:space="preserve">which is also called </w:t>
-      </w:r>
-      <w:proofErr w:type="gramStart"/>
+        <w:t>which is also called S</w:t>
+      </w:r>
       <w:r>
         <w:t>S</w:t>
       </w:r>
       <w:r>
-        <w:t>S</w:t>
-      </w:r>
-      <w:r>
-        <w:t>LV(</w:t>
-      </w:r>
-      <w:proofErr w:type="gramEnd"/>
-      <w:r>
-        <w:t>who knows)</w:t>
+        <w:t>LV(who knows)</w:t>
       </w:r>
       <w:r>
         <w:t xml:space="preserve"> and </w:t>
@@ -3713,13 +3360,8 @@
       <w:r>
         <w:t xml:space="preserve">of the application. </w:t>
       </w:r>
-      <w:proofErr w:type="gramStart"/>
-      <w:r>
-        <w:t>So</w:t>
-      </w:r>
-      <w:proofErr w:type="gramEnd"/>
-      <w:r>
-        <w:t xml:space="preserve"> if we want that the domain we have need to be pointe</w:t>
+      <w:r>
+        <w:t>So if we want that the domain we have need to be pointe</w:t>
       </w:r>
       <w:r>
         <w:t>d</w:t>
@@ -3750,18 +3392,10 @@
     </w:p>
     <w:p>
       <w:r>
-        <w:t xml:space="preserve">Of you chose the former then you </w:t>
-      </w:r>
-      <w:proofErr w:type="gramStart"/>
-      <w:r>
-        <w:t xml:space="preserve">will  </w:t>
-      </w:r>
-      <w:r>
-        <w:t>see</w:t>
-      </w:r>
-      <w:proofErr w:type="gramEnd"/>
-      <w:r>
-        <w:t xml:space="preserve"> that from the dashboard </w:t>
+        <w:t xml:space="preserve">Of you chose the former then you will  </w:t>
+      </w:r>
+      <w:r>
+        <w:t xml:space="preserve">see that from the dashboard </w:t>
       </w:r>
       <w:r>
         <w:t xml:space="preserve">that how things are happening </w:t>
@@ -3770,26 +3404,10 @@
         <w:t xml:space="preserve">and if you chose later </w:t>
       </w:r>
       <w:r>
-        <w:t xml:space="preserve">then you need to point it to a Digital </w:t>
-      </w:r>
-      <w:proofErr w:type="gramStart"/>
-      <w:r>
-        <w:t>ocean(</w:t>
-      </w:r>
-      <w:proofErr w:type="gramEnd"/>
-      <w:r>
-        <w:t>who knows)</w:t>
-      </w:r>
-      <w:r>
-        <w:t xml:space="preserve">. By former we bring the domain in the digital </w:t>
-      </w:r>
-      <w:proofErr w:type="gramStart"/>
-      <w:r>
-        <w:t>ocean(</w:t>
-      </w:r>
-      <w:proofErr w:type="gramEnd"/>
-      <w:r>
-        <w:t>who knows)</w:t>
+        <w:t>then you need to point it to a Digital ocean(who knows)</w:t>
+      </w:r>
+      <w:r>
+        <w:t>. By former we bring the domain in the digital ocean(who knows)</w:t>
       </w:r>
       <w:r>
         <w:t xml:space="preserve">. </w:t>
@@ -3835,13 +3453,8 @@
       </w:r>
     </w:p>
     <w:p>
-      <w:proofErr w:type="gramStart"/>
-      <w:r>
-        <w:t>So</w:t>
-      </w:r>
-      <w:proofErr w:type="gramEnd"/>
-      <w:r>
-        <w:t xml:space="preserve"> we went to Google search console</w:t>
+      <w:r>
+        <w:t>So we went to Google search console</w:t>
       </w:r>
       <w:r>
         <w:t xml:space="preserve"> so we add a property there </w:t>
@@ -3916,15 +3529,7 @@
         <w:t xml:space="preserve">omain </w:t>
       </w:r>
       <w:r>
-        <w:t xml:space="preserve">ad then you need to verify it so it </w:t>
-      </w:r>
-      <w:proofErr w:type="gramStart"/>
-      <w:r>
-        <w:t>give</w:t>
-      </w:r>
-      <w:proofErr w:type="gramEnd"/>
-      <w:r>
-        <w:t xml:space="preserve"> us some text which we will paste in the </w:t>
+        <w:t xml:space="preserve">ad then you need to verify it so it give us some text which we will paste in the </w:t>
       </w:r>
       <w:r>
         <w:t xml:space="preserve">DNS records to give the proof for ownership of domain. </w:t>
@@ -4018,11 +3623,7 @@
         <w:t xml:space="preserve"> and how to integrate </w:t>
       </w:r>
       <w:r>
-        <w:t xml:space="preserve">payment gateway to the </w:t>
-      </w:r>
-      <w:proofErr w:type="gramStart"/>
-      <w:r>
-        <w:t>websi</w:t>
+        <w:t>payment gateway to the websi</w:t>
       </w:r>
       <w:r>
         <w:t>t</w:t>
@@ -4033,23 +3634,14 @@
       <w:r>
         <w:t>.</w:t>
       </w:r>
-      <w:proofErr w:type="gramEnd"/>
       <w:r>
         <w:t xml:space="preserve"> How orders will come </w:t>
       </w:r>
       <w:r>
-        <w:t xml:space="preserve">and how admin panel will be </w:t>
-      </w:r>
-      <w:proofErr w:type="gramStart"/>
-      <w:r>
-        <w:t xml:space="preserve">made </w:t>
-      </w:r>
-      <w:r>
-        <w:t>.</w:t>
-      </w:r>
-      <w:proofErr w:type="gramEnd"/>
-      <w:r>
-        <w:t xml:space="preserve"> F</w:t>
+        <w:t xml:space="preserve">and how admin panel will be made </w:t>
+      </w:r>
+      <w:r>
+        <w:t>. F</w:t>
       </w:r>
       <w:r>
         <w:t>r</w:t>
@@ -4370,18 +3962,10 @@
         <w:t xml:space="preserve">Like Bootstrap Tailwind also have </w:t>
       </w:r>
       <w:r>
-        <w:t xml:space="preserve">predefined </w:t>
-      </w:r>
-      <w:proofErr w:type="gramStart"/>
-      <w:r>
-        <w:t xml:space="preserve">class </w:t>
-      </w:r>
-      <w:r>
-        <w:t>.So</w:t>
-      </w:r>
-      <w:proofErr w:type="gramEnd"/>
-      <w:r>
-        <w:t xml:space="preserve"> we have tailwind css is installed </w:t>
+        <w:t xml:space="preserve">predefined class </w:t>
+      </w:r>
+      <w:r>
+        <w:t xml:space="preserve">.So we have tailwind css is installed </w:t>
       </w:r>
       <w:r>
         <w:t>and we can use our utility class</w:t>
@@ -4489,15 +4073,7 @@
         <w:t xml:space="preserve">There are some pages which you will find in almost all Ecommerce website that is </w:t>
       </w:r>
       <w:r>
-        <w:t xml:space="preserve">Product </w:t>
-      </w:r>
-      <w:proofErr w:type="gramStart"/>
-      <w:r>
-        <w:t>page ,</w:t>
-      </w:r>
-      <w:proofErr w:type="gramEnd"/>
-      <w:r>
-        <w:t xml:space="preserve"> Home page</w:t>
+        <w:t>Product page , Home page</w:t>
       </w:r>
       <w:r>
         <w:t>, Checkout page</w:t>
@@ -4509,160 +4085,136 @@
         <w:t>n</w:t>
       </w:r>
       <w:r>
+        <w:t xml:space="preserve"> order</w:t>
+      </w:r>
+      <w:r>
+        <w:t xml:space="preserve"> , login and </w:t>
+      </w:r>
+      <w:proofErr w:type="spellStart"/>
+      <w:r>
+        <w:t>signUp</w:t>
+      </w:r>
+      <w:proofErr w:type="spellEnd"/>
+      <w:r>
+        <w:t xml:space="preserve">. We will create their blank slate here </w:t>
+      </w:r>
+      <w:r>
+        <w:t xml:space="preserve">and then we will start </w:t>
+      </w:r>
+      <w:proofErr w:type="spellStart"/>
+      <w:r>
+        <w:t>c</w:t>
+      </w:r>
+      <w:r>
+        <w:t>odeswear</w:t>
+      </w:r>
+      <w:proofErr w:type="spellEnd"/>
+      <w:r>
+        <w:t xml:space="preserve"> development </w:t>
+      </w:r>
+    </w:p>
+    <w:p>
+      <w:r>
+        <w:t xml:space="preserve">Whatever you </w:t>
+      </w:r>
+      <w:r>
+        <w:t xml:space="preserve">by [slug] is actually dynamic </w:t>
+      </w:r>
+      <w:r>
+        <w:t xml:space="preserve">page </w:t>
+      </w:r>
+      <w:r>
+        <w:t xml:space="preserve">routes </w:t>
+      </w:r>
+    </w:p>
+    <w:p>
+      <w:r>
+        <w:t>There are many thin</w:t>
+      </w:r>
+      <w:r>
+        <w:t>g</w:t>
+      </w:r>
+      <w:r>
+        <w:t xml:space="preserve">s which we think we need to o on the spot like </w:t>
+      </w:r>
+      <w:r>
+        <w:t xml:space="preserve">Forget Password </w:t>
+      </w:r>
+    </w:p>
+    <w:p>
+      <w:r>
+        <w:t>You can even launch this e</w:t>
+      </w:r>
+      <w:r>
+        <w:t>c</w:t>
+      </w:r>
+      <w:r>
+        <w:t>om</w:t>
+      </w:r>
+      <w:r>
+        <w:t>m</w:t>
+      </w:r>
+      <w:r>
+        <w:t xml:space="preserve">erce site </w:t>
+      </w:r>
+    </w:p>
+    <w:p>
+      <w:r>
+        <w:t>Navbar and footer are important for our website and it will be present in all of the pages</w:t>
+      </w:r>
+    </w:p>
+    <w:p>
+      <w:r>
+        <w:t xml:space="preserve">We will use app for that purposes(maybe </w:t>
+      </w:r>
+      <w:proofErr w:type="spellStart"/>
+      <w:r>
+        <w:t>ol</w:t>
+      </w:r>
+      <w:proofErr w:type="spellEnd"/>
+      <w:r>
+        <w:t xml:space="preserve"> version of </w:t>
+      </w:r>
+      <w:proofErr w:type="spellStart"/>
+      <w:r>
+        <w:t>layout.jsx</w:t>
+      </w:r>
+      <w:proofErr w:type="spellEnd"/>
+      <w:r>
+        <w:t>)</w:t>
+      </w:r>
+    </w:p>
+    <w:p>
+      <w:r>
+        <w:t xml:space="preserve">Now there is site that is </w:t>
+      </w:r>
+      <w:proofErr w:type="spellStart"/>
+      <w:r>
+        <w:t>Tailblocks</w:t>
+      </w:r>
+      <w:proofErr w:type="spellEnd"/>
+      <w:r>
+        <w:t xml:space="preserve"> that will give you </w:t>
+      </w:r>
+      <w:proofErr w:type="spellStart"/>
+      <w:r>
+        <w:t>tailblocks</w:t>
+      </w:r>
+      <w:proofErr w:type="spellEnd"/>
+      <w:r>
         <w:t xml:space="preserve"> </w:t>
       </w:r>
-      <w:proofErr w:type="gramStart"/>
-      <w:r>
-        <w:t>order</w:t>
-      </w:r>
-      <w:r>
-        <w:t xml:space="preserve"> ,</w:t>
-      </w:r>
-      <w:proofErr w:type="gramEnd"/>
-      <w:r>
-        <w:t xml:space="preserve"> login and </w:t>
-      </w:r>
-      <w:proofErr w:type="spellStart"/>
-      <w:r>
-        <w:t>signUp</w:t>
-      </w:r>
-      <w:proofErr w:type="spellEnd"/>
-      <w:r>
-        <w:t xml:space="preserve">. We will create their blank slate here </w:t>
-      </w:r>
-      <w:r>
-        <w:t xml:space="preserve">and then we will start </w:t>
-      </w:r>
-      <w:proofErr w:type="spellStart"/>
-      <w:r>
-        <w:t>c</w:t>
-      </w:r>
-      <w:r>
-        <w:t>odeswear</w:t>
-      </w:r>
-      <w:proofErr w:type="spellEnd"/>
-      <w:r>
-        <w:t xml:space="preserve"> development </w:t>
-      </w:r>
-    </w:p>
-    <w:p>
-      <w:r>
-        <w:t xml:space="preserve">Whatever you </w:t>
-      </w:r>
-      <w:r>
-        <w:t xml:space="preserve">by [slug] is actually dynamic </w:t>
-      </w:r>
-      <w:r>
-        <w:t xml:space="preserve">page </w:t>
-      </w:r>
-      <w:r>
-        <w:t xml:space="preserve">routes </w:t>
-      </w:r>
-    </w:p>
-    <w:p>
-      <w:r>
-        <w:t>There are many thin</w:t>
-      </w:r>
-      <w:r>
-        <w:t>g</w:t>
-      </w:r>
-      <w:r>
-        <w:t xml:space="preserve">s which we think we need to o on the spot like </w:t>
-      </w:r>
-      <w:r>
-        <w:t xml:space="preserve">Forget Password </w:t>
-      </w:r>
-    </w:p>
-    <w:p>
-      <w:r>
-        <w:t>You can even launch this e</w:t>
-      </w:r>
-      <w:r>
-        <w:t>c</w:t>
-      </w:r>
-      <w:r>
-        <w:t>om</w:t>
-      </w:r>
-      <w:r>
-        <w:t>m</w:t>
-      </w:r>
-      <w:r>
-        <w:t xml:space="preserve">erce site </w:t>
-      </w:r>
-    </w:p>
-    <w:p>
-      <w:r>
-        <w:t>Navbar and footer are important for our website and it will be present in all of the pages</w:t>
-      </w:r>
-    </w:p>
-    <w:p>
-      <w:r>
-        <w:t xml:space="preserve">We will use app for that </w:t>
-      </w:r>
-      <w:proofErr w:type="gramStart"/>
-      <w:r>
-        <w:t>purposes(</w:t>
-      </w:r>
-      <w:proofErr w:type="gramEnd"/>
-      <w:r>
-        <w:t xml:space="preserve">maybe </w:t>
-      </w:r>
-      <w:proofErr w:type="spellStart"/>
-      <w:r>
-        <w:t>ol</w:t>
-      </w:r>
-      <w:proofErr w:type="spellEnd"/>
-      <w:r>
-        <w:t xml:space="preserve"> version of </w:t>
-      </w:r>
-      <w:proofErr w:type="spellStart"/>
-      <w:r>
-        <w:t>layout.jsx</w:t>
-      </w:r>
-      <w:proofErr w:type="spellEnd"/>
-      <w:r>
-        <w:t>)</w:t>
-      </w:r>
-    </w:p>
-    <w:p>
-      <w:r>
-        <w:t xml:space="preserve">Now there is site that is </w:t>
-      </w:r>
-      <w:proofErr w:type="spellStart"/>
-      <w:r>
-        <w:t>Tailblocks</w:t>
-      </w:r>
-      <w:proofErr w:type="spellEnd"/>
-      <w:r>
-        <w:t xml:space="preserve"> that will give you </w:t>
-      </w:r>
-      <w:proofErr w:type="spellStart"/>
-      <w:r>
-        <w:t>tailblocks</w:t>
-      </w:r>
-      <w:proofErr w:type="spellEnd"/>
+      <w:r>
+        <w:t xml:space="preserve">snippet </w:t>
+      </w:r>
+      <w:r>
+        <w:t xml:space="preserve">here you get minimalistic design </w:t>
+      </w:r>
       <w:r>
         <w:t xml:space="preserve"> </w:t>
       </w:r>
       <w:r>
-        <w:t xml:space="preserve">snippet </w:t>
-      </w:r>
-      <w:r>
-        <w:t xml:space="preserve">here you get minimalistic </w:t>
-      </w:r>
-      <w:proofErr w:type="gramStart"/>
-      <w:r>
-        <w:t xml:space="preserve">design </w:t>
-      </w:r>
-      <w:r>
-        <w:t xml:space="preserve"> </w:t>
-      </w:r>
-      <w:r>
-        <w:t>Here</w:t>
-      </w:r>
-      <w:proofErr w:type="gramEnd"/>
-      <w:r>
-        <w:t xml:space="preserve"> you get </w:t>
+        <w:t xml:space="preserve">Here you get </w:t>
       </w:r>
       <w:proofErr w:type="spellStart"/>
       <w:r>
@@ -4983,46 +4535,14 @@
           <w:b/>
           <w:bCs/>
         </w:rPr>
-        <w:t xml:space="preserve"> </w:t>
-      </w:r>
-      <w:proofErr w:type="gramStart"/>
-      <w:r>
-        <w:rPr>
-          <w:b/>
-          <w:bCs/>
-        </w:rPr>
-        <w:t>and(</w:t>
-      </w:r>
-      <w:proofErr w:type="gramEnd"/>
-      <w:r>
-        <w:rPr>
-          <w:b/>
-          <w:bCs/>
-        </w:rPr>
-        <w:t xml:space="preserve">we try there should be equivalent space between </w:t>
-      </w:r>
-      <w:proofErr w:type="gramStart"/>
-      <w:r>
-        <w:rPr>
-          <w:b/>
-          <w:bCs/>
-        </w:rPr>
-        <w:t>them)</w:t>
-      </w:r>
-      <w:r>
-        <w:rPr>
-          <w:b/>
-          <w:bCs/>
-        </w:rPr>
-        <w:t>(</w:t>
-      </w:r>
-      <w:proofErr w:type="gramEnd"/>
-      <w:r>
-        <w:rPr>
-          <w:b/>
-          <w:bCs/>
-        </w:rPr>
-        <w:t>who knows)</w:t>
+        <w:t xml:space="preserve"> and(we try there should be equivalent space between them)</w:t>
+      </w:r>
+      <w:r>
+        <w:rPr>
+          <w:b/>
+          <w:bCs/>
+        </w:rPr>
+        <w:t>(who knows)</w:t>
       </w:r>
     </w:p>
     <w:p>
@@ -5039,7 +4559,6 @@
         <w:t xml:space="preserve"> in Tailwind by </w:t>
       </w:r>
       <w:proofErr w:type="spellStart"/>
-      <w:proofErr w:type="gramStart"/>
       <w:r>
         <w:rPr>
           <w:b/>
@@ -5055,7 +4574,6 @@
         <w:t>property</w:t>
       </w:r>
       <w:proofErr w:type="spellEnd"/>
-      <w:proofErr w:type="gramEnd"/>
       <w:r>
         <w:rPr>
           <w:b/>
@@ -5188,18 +4706,13 @@
     </w:p>
     <w:p>
       <w:r>
-        <w:t xml:space="preserve">import </w:t>
-      </w:r>
-      <w:proofErr w:type="gramStart"/>
-      <w:r>
-        <w:t xml:space="preserve">{ </w:t>
+        <w:t xml:space="preserve">import { </w:t>
       </w:r>
       <w:proofErr w:type="spellStart"/>
       <w:r>
         <w:t>AiOutlineShoppingCart</w:t>
       </w:r>
       <w:proofErr w:type="spellEnd"/>
-      <w:proofErr w:type="gramEnd"/>
       <w:r>
         <w:t xml:space="preserve"> } from "react-icons/ai";</w:t>
       </w:r>
@@ -5436,14 +4949,9 @@
       </w:r>
       <w:proofErr w:type="spellStart"/>
       <w:r>
-        <w:t>overflow-</w:t>
-      </w:r>
-      <w:proofErr w:type="gramStart"/>
-      <w:r>
-        <w:t>x:hidden</w:t>
-      </w:r>
-      <w:proofErr w:type="spellEnd"/>
-      <w:proofErr w:type="gramEnd"/>
+        <w:t>overflow-x:hidden</w:t>
+      </w:r>
+      <w:proofErr w:type="spellEnd"/>
       <w:r>
         <w:t xml:space="preserve"> you c</w:t>
       </w:r>
@@ -5580,15 +5088,7 @@
         <w:t xml:space="preserve">it is just a request and js will update cart accordingly </w:t>
       </w:r>
       <w:r>
-        <w:t xml:space="preserve">and there is no guarantee </w:t>
-      </w:r>
-      <w:proofErr w:type="gramStart"/>
-      <w:r>
-        <w:t>when  it</w:t>
-      </w:r>
-      <w:proofErr w:type="gramEnd"/>
-      <w:r>
-        <w:t xml:space="preserve"> will be updated so believe it that </w:t>
+        <w:t xml:space="preserve">and there is no guarantee when  it will be updated so believe it that </w:t>
       </w:r>
       <w:r>
         <w:t>car</w:t>
@@ -5606,15 +5106,7 @@
         <w:t>do update method is</w:t>
       </w:r>
       <w:r>
-        <w:t xml:space="preserve"> request </w:t>
-      </w:r>
-      <w:proofErr w:type="gramStart"/>
-      <w:r>
-        <w:t>its</w:t>
-      </w:r>
-      <w:proofErr w:type="gramEnd"/>
-      <w:r>
-        <w:t xml:space="preserve"> not an order</w:t>
+        <w:t xml:space="preserve"> request its not an order</w:t>
       </w:r>
       <w:r>
         <w:t xml:space="preserve">. React </w:t>
@@ -5629,15 +5121,7 @@
         <w:t xml:space="preserve">accordingly </w:t>
       </w:r>
       <w:r>
-        <w:t xml:space="preserve">and it will take time but it </w:t>
-      </w:r>
-      <w:proofErr w:type="gramStart"/>
-      <w:r>
-        <w:t>take</w:t>
-      </w:r>
-      <w:proofErr w:type="gramEnd"/>
-      <w:r>
-        <w:t xml:space="preserve"> time </w:t>
+        <w:t xml:space="preserve">and it will take time but it take time </w:t>
       </w:r>
       <w:r>
         <w:t xml:space="preserve">by time we mean in millisecond </w:t>
@@ -5862,18 +5346,10 @@
         <w:t xml:space="preserve">and how did we confirm </w:t>
       </w:r>
       <w:r>
-        <w:t xml:space="preserve">the order </w:t>
-      </w:r>
-      <w:proofErr w:type="gramStart"/>
-      <w:r>
-        <w:t>there</w:t>
-      </w:r>
-      <w:r>
-        <w:t>(</w:t>
-      </w:r>
-      <w:proofErr w:type="gramEnd"/>
-      <w:r>
-        <w:t>who knows)</w:t>
+        <w:t>the order there</w:t>
+      </w:r>
+      <w:r>
+        <w:t>(who knows)</w:t>
       </w:r>
       <w:r>
         <w:t>.</w:t>
@@ -5886,7 +5362,6 @@
           <w:bCs/>
         </w:rPr>
       </w:pPr>
-      <w:proofErr w:type="gramStart"/>
       <w:r>
         <w:rPr>
           <w:b/>
@@ -5894,7 +5369,6 @@
         </w:rPr>
         <w:t>Note:-</w:t>
       </w:r>
-      <w:proofErr w:type="gramEnd"/>
     </w:p>
     <w:p>
       <w:pPr>
@@ -5906,7 +5380,575 @@
         <w:t>JSX is js not html.</w:t>
       </w:r>
     </w:p>
-    <w:p/>
+    <w:p>
+      <w:r>
+        <w:t xml:space="preserve">To </w:t>
+      </w:r>
+      <w:r>
+        <w:t xml:space="preserve">make </w:t>
+      </w:r>
+      <w:proofErr w:type="spellStart"/>
+      <w:r>
+        <w:t>codewear</w:t>
+      </w:r>
+      <w:proofErr w:type="spellEnd"/>
+      <w:r>
+        <w:t xml:space="preserve"> we are going to use Mongoose </w:t>
+      </w:r>
+      <w:r>
+        <w:t xml:space="preserve">is a connector to a </w:t>
+      </w:r>
+      <w:proofErr w:type="spellStart"/>
+      <w:r>
+        <w:t>Mongodb</w:t>
+      </w:r>
+      <w:proofErr w:type="spellEnd"/>
+      <w:r>
+        <w:t xml:space="preserve"> </w:t>
+      </w:r>
+      <w:r>
+        <w:t>(who knows )</w:t>
+      </w:r>
+      <w:r>
+        <w:t xml:space="preserve"> it will help js to connect to </w:t>
+      </w:r>
+      <w:proofErr w:type="spellStart"/>
+      <w:r>
+        <w:t>mongodb</w:t>
+      </w:r>
+      <w:proofErr w:type="spellEnd"/>
+      <w:r>
+        <w:t xml:space="preserve"> </w:t>
+      </w:r>
+      <w:r>
+        <w:t xml:space="preserve">and we can use its </w:t>
+      </w:r>
+      <w:r>
+        <w:t xml:space="preserve">built in functionality </w:t>
+      </w:r>
+      <w:r>
+        <w:t xml:space="preserve">you don’t have to read and write and update to the </w:t>
+      </w:r>
+      <w:proofErr w:type="spellStart"/>
+      <w:r>
+        <w:t>mongodb</w:t>
+      </w:r>
+      <w:proofErr w:type="spellEnd"/>
+      <w:r>
+        <w:t xml:space="preserve"> (like </w:t>
+      </w:r>
+      <w:r>
+        <w:t xml:space="preserve">maybe </w:t>
+      </w:r>
+      <w:r>
+        <w:t xml:space="preserve">the complex we do for it in </w:t>
+      </w:r>
+      <w:proofErr w:type="spellStart"/>
+      <w:r>
+        <w:t>mongodb</w:t>
+      </w:r>
+      <w:proofErr w:type="spellEnd"/>
+      <w:r>
+        <w:t>(who knows))</w:t>
+      </w:r>
+      <w:r>
+        <w:t xml:space="preserve">. </w:t>
+      </w:r>
+      <w:r>
+        <w:t xml:space="preserve">Mongoose will manage many things for us </w:t>
+      </w:r>
+      <w:r>
+        <w:t>for example creat</w:t>
+      </w:r>
+      <w:r>
+        <w:t xml:space="preserve">ing fields like </w:t>
+      </w:r>
+      <w:proofErr w:type="spellStart"/>
+      <w:r>
+        <w:t>createdAT</w:t>
+      </w:r>
+      <w:proofErr w:type="spellEnd"/>
+      <w:r>
+        <w:t xml:space="preserve"> and </w:t>
+      </w:r>
+      <w:proofErr w:type="spellStart"/>
+      <w:r>
+        <w:t>updatedAt</w:t>
+      </w:r>
+      <w:proofErr w:type="spellEnd"/>
+    </w:p>
+    <w:p>
+      <w:r>
+        <w:lastRenderedPageBreak/>
+        <w:t>If we make timestamp property (who knows)true</w:t>
+      </w:r>
+      <w:r>
+        <w:t xml:space="preserve"> it automatically create for us</w:t>
+      </w:r>
+      <w:r>
+        <w:t xml:space="preserve">, How these all things are done </w:t>
+      </w:r>
+      <w:r>
+        <w:t>what is the syntax.</w:t>
+      </w:r>
+      <w:r>
+        <w:t xml:space="preserve"> How does </w:t>
+      </w:r>
+      <w:r>
+        <w:t>it manage</w:t>
+      </w:r>
+    </w:p>
+    <w:p>
+      <w:r>
+        <w:t xml:space="preserve">Mongoose is a library </w:t>
+      </w:r>
+      <w:r>
+        <w:t>o</w:t>
+      </w:r>
+      <w:r>
+        <w:t>f j</w:t>
+      </w:r>
+      <w:r>
+        <w:t>s th</w:t>
+      </w:r>
+      <w:r>
+        <w:t>r</w:t>
+      </w:r>
+      <w:r>
+        <w:t xml:space="preserve">ough which we connect to </w:t>
+      </w:r>
+      <w:proofErr w:type="spellStart"/>
+      <w:r>
+        <w:t>mongo</w:t>
+      </w:r>
+      <w:r>
+        <w:t>db</w:t>
+      </w:r>
+      <w:proofErr w:type="spellEnd"/>
+      <w:r>
+        <w:t xml:space="preserve"> </w:t>
+      </w:r>
+    </w:p>
+    <w:p>
+      <w:r>
+        <w:t xml:space="preserve">I think we are going to directly contact to mongos by </w:t>
+      </w:r>
+      <w:proofErr w:type="spellStart"/>
+      <w:r>
+        <w:t>frontEnd</w:t>
+      </w:r>
+      <w:proofErr w:type="spellEnd"/>
+      <w:r>
+        <w:t xml:space="preserve"> </w:t>
+      </w:r>
+    </w:p>
+    <w:p>
+      <w:r>
+        <w:t xml:space="preserve">Ow we will install Mongoose </w:t>
+      </w:r>
+      <w:r>
+        <w:t xml:space="preserve">by </w:t>
+      </w:r>
+      <w:proofErr w:type="spellStart"/>
+      <w:r>
+        <w:t>npm</w:t>
+      </w:r>
+      <w:proofErr w:type="spellEnd"/>
+      <w:r>
+        <w:t xml:space="preserve"> </w:t>
+      </w:r>
+      <w:r>
+        <w:t>and we will make some modals</w:t>
+      </w:r>
+      <w:r>
+        <w:t>(maybe not)</w:t>
+      </w:r>
+      <w:r>
+        <w:t xml:space="preserve"> </w:t>
+      </w:r>
+      <w:r>
+        <w:t>through which you will store the data (who knows)</w:t>
+      </w:r>
+      <w:r>
+        <w:t xml:space="preserve"> but before that we need to install </w:t>
+      </w:r>
+      <w:proofErr w:type="spellStart"/>
+      <w:r>
+        <w:t>mongodb</w:t>
+      </w:r>
+      <w:proofErr w:type="spellEnd"/>
+      <w:r>
+        <w:t xml:space="preserve"> </w:t>
+      </w:r>
+    </w:p>
+    <w:p>
+      <w:r>
+        <w:t xml:space="preserve">Download and install community </w:t>
+      </w:r>
+      <w:r>
+        <w:t xml:space="preserve">server as enterprise level will be paid </w:t>
+      </w:r>
+      <w:r>
+        <w:t xml:space="preserve">once you install it </w:t>
+      </w:r>
+      <w:r>
+        <w:t>then your</w:t>
+      </w:r>
+      <w:r>
+        <w:t xml:space="preserve"> </w:t>
+      </w:r>
+      <w:proofErr w:type="spellStart"/>
+      <w:r>
+        <w:t>mon</w:t>
+      </w:r>
+      <w:r>
+        <w:t>g</w:t>
+      </w:r>
+      <w:r>
+        <w:t>d</w:t>
+      </w:r>
+      <w:r>
+        <w:t>b</w:t>
+      </w:r>
+      <w:proofErr w:type="spellEnd"/>
+      <w:r>
+        <w:t xml:space="preserve"> compass will be installed</w:t>
+      </w:r>
+      <w:r>
+        <w:t xml:space="preserve"> which  is a product of </w:t>
+      </w:r>
+      <w:proofErr w:type="spellStart"/>
+      <w:r>
+        <w:t>mongodb</w:t>
+      </w:r>
+      <w:proofErr w:type="spellEnd"/>
+      <w:r>
+        <w:t xml:space="preserve"> </w:t>
+      </w:r>
+    </w:p>
+    <w:p>
+      <w:r>
+        <w:t xml:space="preserve">Now in </w:t>
+      </w:r>
+      <w:proofErr w:type="spellStart"/>
+      <w:r>
+        <w:t>mongodb</w:t>
+      </w:r>
+      <w:proofErr w:type="spellEnd"/>
+      <w:r>
+        <w:t xml:space="preserve"> compass you click on connect to the </w:t>
+      </w:r>
+      <w:r>
+        <w:t xml:space="preserve">localhost </w:t>
+      </w:r>
+      <w:proofErr w:type="spellStart"/>
+      <w:r>
+        <w:t>ehere</w:t>
+      </w:r>
+      <w:proofErr w:type="spellEnd"/>
+      <w:r>
+        <w:t xml:space="preserve"> the server is running </w:t>
+      </w:r>
+    </w:p>
+    <w:p>
+      <w:r>
+        <w:t xml:space="preserve">We will make all the data base in </w:t>
+      </w:r>
+      <w:proofErr w:type="spellStart"/>
+      <w:r>
+        <w:t>mongo</w:t>
+      </w:r>
+      <w:r>
+        <w:t>db</w:t>
+      </w:r>
+      <w:proofErr w:type="spellEnd"/>
+      <w:r>
+        <w:t xml:space="preserve"> compass.</w:t>
+      </w:r>
+    </w:p>
+    <w:p>
+      <w:r>
+        <w:t xml:space="preserve">So first we will understand how table is made </w:t>
+      </w:r>
+      <w:r>
+        <w:t xml:space="preserve">in mongoose </w:t>
+      </w:r>
+      <w:r>
+        <w:t xml:space="preserve">what is mongoose </w:t>
+      </w:r>
+      <w:r>
+        <w:t>it is w</w:t>
+      </w:r>
+      <w:r>
+        <w:t>r</w:t>
+      </w:r>
+      <w:r>
+        <w:t>itten as shown below</w:t>
+      </w:r>
+    </w:p>
+    <w:p>
+      <w:pPr>
+        <w:jc w:val="center"/>
+      </w:pPr>
+      <w:r>
+        <w:drawing>
+          <wp:inline distT="0" distB="0" distL="0" distR="0" wp14:anchorId="786B64B0" wp14:editId="23B87E0C">
+            <wp:extent cx="5731510" cy="2917825"/>
+            <wp:effectExtent l="0" t="0" r="2540" b="0"/>
+            <wp:docPr id="1053880657" name="Picture 1"/>
+            <wp:cNvGraphicFramePr>
+              <a:graphicFrameLocks xmlns:a="http://schemas.openxmlformats.org/drawingml/2006/main" noChangeAspect="1"/>
+            </wp:cNvGraphicFramePr>
+            <a:graphic xmlns:a="http://schemas.openxmlformats.org/drawingml/2006/main">
+              <a:graphicData uri="http://schemas.openxmlformats.org/drawingml/2006/picture">
+                <pic:pic xmlns:pic="http://schemas.openxmlformats.org/drawingml/2006/picture">
+                  <pic:nvPicPr>
+                    <pic:cNvPr id="1053880657" name=""/>
+                    <pic:cNvPicPr/>
+                  </pic:nvPicPr>
+                  <pic:blipFill>
+                    <a:blip r:embed="rId31"/>
+                    <a:stretch>
+                      <a:fillRect/>
+                    </a:stretch>
+                  </pic:blipFill>
+                  <pic:spPr>
+                    <a:xfrm>
+                      <a:off x="0" y="0"/>
+                      <a:ext cx="5731510" cy="2917825"/>
+                    </a:xfrm>
+                    <a:prstGeom prst="rect">
+                      <a:avLst/>
+                    </a:prstGeom>
+                  </pic:spPr>
+                </pic:pic>
+              </a:graphicData>
+            </a:graphic>
+          </wp:inline>
+        </w:drawing>
+      </w:r>
+    </w:p>
+    <w:p>
+      <w:r>
+        <w:t xml:space="preserve">They made it so that you can design schema properly </w:t>
+      </w:r>
+    </w:p>
+    <w:p>
+      <w:r>
+        <w:t xml:space="preserve">So first install it </w:t>
+      </w:r>
+      <w:r>
+        <w:t>as shown below</w:t>
+      </w:r>
+    </w:p>
+    <w:p>
+      <w:pPr>
+        <w:jc w:val="center"/>
+      </w:pPr>
+      <w:r>
+        <w:drawing>
+          <wp:inline distT="0" distB="0" distL="0" distR="0" wp14:anchorId="73A62792" wp14:editId="2B62B359">
+            <wp:extent cx="5731510" cy="1364615"/>
+            <wp:effectExtent l="0" t="0" r="2540" b="6985"/>
+            <wp:docPr id="1876072446" name="Picture 1"/>
+            <wp:cNvGraphicFramePr>
+              <a:graphicFrameLocks xmlns:a="http://schemas.openxmlformats.org/drawingml/2006/main" noChangeAspect="1"/>
+            </wp:cNvGraphicFramePr>
+            <a:graphic xmlns:a="http://schemas.openxmlformats.org/drawingml/2006/main">
+              <a:graphicData uri="http://schemas.openxmlformats.org/drawingml/2006/picture">
+                <pic:pic xmlns:pic="http://schemas.openxmlformats.org/drawingml/2006/picture">
+                  <pic:nvPicPr>
+                    <pic:cNvPr id="1876072446" name=""/>
+                    <pic:cNvPicPr/>
+                  </pic:nvPicPr>
+                  <pic:blipFill>
+                    <a:blip r:embed="rId32"/>
+                    <a:stretch>
+                      <a:fillRect/>
+                    </a:stretch>
+                  </pic:blipFill>
+                  <pic:spPr>
+                    <a:xfrm>
+                      <a:off x="0" y="0"/>
+                      <a:ext cx="5731510" cy="1364615"/>
+                    </a:xfrm>
+                    <a:prstGeom prst="rect">
+                      <a:avLst/>
+                    </a:prstGeom>
+                  </pic:spPr>
+                </pic:pic>
+              </a:graphicData>
+            </a:graphic>
+          </wp:inline>
+        </w:drawing>
+      </w:r>
+    </w:p>
+    <w:p>
+      <w:r>
+        <w:t xml:space="preserve">And after this get connection to the </w:t>
+      </w:r>
+      <w:proofErr w:type="spellStart"/>
+      <w:r>
+        <w:t>mongo</w:t>
+      </w:r>
+      <w:r>
+        <w:t>db</w:t>
+      </w:r>
+      <w:proofErr w:type="spellEnd"/>
+      <w:r>
+        <w:t xml:space="preserve"> </w:t>
+      </w:r>
+      <w:r>
+        <w:t>and your wok will be sone now you can make schema</w:t>
+      </w:r>
+      <w:r>
+        <w:t xml:space="preserve">s </w:t>
+      </w:r>
+    </w:p>
+    <w:p>
+      <w:r>
+        <w:lastRenderedPageBreak/>
+        <w:t xml:space="preserve">Consider model a table </w:t>
+      </w:r>
+      <w:r>
+        <w:t xml:space="preserve">however </w:t>
+      </w:r>
+      <w:r>
+        <w:t xml:space="preserve">mongo don’t have </w:t>
+      </w:r>
+      <w:r>
+        <w:t xml:space="preserve">tables </w:t>
+      </w:r>
+      <w:r>
+        <w:t xml:space="preserve">mongoose has collection and </w:t>
+      </w:r>
+      <w:r>
+        <w:t xml:space="preserve">document </w:t>
+      </w:r>
+      <w:r>
+        <w:t>but the teacher tell that if you are from a Database backgroun</w:t>
+      </w:r>
+      <w:r>
+        <w:t xml:space="preserve">d </w:t>
+      </w:r>
+      <w:r>
+        <w:t>and you used a relational database management system</w:t>
+      </w:r>
+      <w:r>
+        <w:t>.</w:t>
+      </w:r>
+    </w:p>
+    <w:p>
+      <w:r>
+        <w:t xml:space="preserve">So we will make three modals that is </w:t>
+      </w:r>
+      <w:r>
+        <w:t>Order, Product and User.</w:t>
+      </w:r>
+    </w:p>
+    <w:p>
+      <w:r>
+        <w:t xml:space="preserve">Now we will define how to define mongo schema </w:t>
+      </w:r>
+      <w:r>
+        <w:t>(who knows)</w:t>
+      </w:r>
+    </w:p>
+    <w:p>
+      <w:r>
+        <w:t xml:space="preserve">Teacher says we will make a middleware for </w:t>
+      </w:r>
+      <w:r>
+        <w:t xml:space="preserve">connection </w:t>
+      </w:r>
+    </w:p>
+    <w:p>
+      <w:pPr>
+        <w:jc w:val="center"/>
+      </w:pPr>
+      <w:r>
+        <w:drawing>
+          <wp:inline distT="0" distB="0" distL="0" distR="0" wp14:anchorId="334928E1" wp14:editId="18B20E44">
+            <wp:extent cx="4801270" cy="6049219"/>
+            <wp:effectExtent l="0" t="0" r="0" b="8890"/>
+            <wp:docPr id="612272149" name="Picture 1"/>
+            <wp:cNvGraphicFramePr>
+              <a:graphicFrameLocks xmlns:a="http://schemas.openxmlformats.org/drawingml/2006/main" noChangeAspect="1"/>
+            </wp:cNvGraphicFramePr>
+            <a:graphic xmlns:a="http://schemas.openxmlformats.org/drawingml/2006/main">
+              <a:graphicData uri="http://schemas.openxmlformats.org/drawingml/2006/picture">
+                <pic:pic xmlns:pic="http://schemas.openxmlformats.org/drawingml/2006/picture">
+                  <pic:nvPicPr>
+                    <pic:cNvPr id="612272149" name=""/>
+                    <pic:cNvPicPr/>
+                  </pic:nvPicPr>
+                  <pic:blipFill>
+                    <a:blip r:embed="rId33"/>
+                    <a:stretch>
+                      <a:fillRect/>
+                    </a:stretch>
+                  </pic:blipFill>
+                  <pic:spPr>
+                    <a:xfrm>
+                      <a:off x="0" y="0"/>
+                      <a:ext cx="4801270" cy="6049219"/>
+                    </a:xfrm>
+                    <a:prstGeom prst="rect">
+                      <a:avLst/>
+                    </a:prstGeom>
+                  </pic:spPr>
+                </pic:pic>
+              </a:graphicData>
+            </a:graphic>
+          </wp:inline>
+        </w:drawing>
+      </w:r>
+    </w:p>
+    <w:p>
+      <w:r>
+        <w:t xml:space="preserve">So by the scheme (who knows maybe </w:t>
+      </w:r>
+      <w:r>
+        <w:t xml:space="preserve">by making schema object and passing it to the </w:t>
+      </w:r>
+      <w:r>
+        <w:t>)we created a model</w:t>
+      </w:r>
+      <w:r>
+        <w:t>.</w:t>
+      </w:r>
+    </w:p>
+    <w:p>
+      <w:r>
+        <w:t>For admin we will create separate UI(who knows</w:t>
+      </w:r>
+      <w:r>
+        <w:t xml:space="preserve"> how we will manage admin authentication</w:t>
+      </w:r>
+      <w:r>
+        <w:t>)</w:t>
+      </w:r>
+    </w:p>
+    <w:p>
+      <w:r>
+        <w:t xml:space="preserve">So we will create middleware </w:t>
+      </w:r>
+      <w:r>
+        <w:t xml:space="preserve">to connect to database and from there we will </w:t>
+      </w:r>
+      <w:r>
+        <w:t xml:space="preserve">use </w:t>
+      </w:r>
+      <w:r>
+        <w:t xml:space="preserve">these </w:t>
+      </w:r>
+      <w:r>
+        <w:t xml:space="preserve">models </w:t>
+      </w:r>
+      <w:r>
+        <w:t xml:space="preserve">in our API </w:t>
+      </w:r>
+    </w:p>
     <w:sectPr>
       <w:pgSz w:w="11906" w:h="16838"/>
       <w:pgMar w:top="1440" w:right="1440" w:bottom="1440" w:left="1440" w:header="708" w:footer="708" w:gutter="0"/>
@@ -6677,7 +6719,6 @@
   <w:style w:type="character" w:default="1" w:styleId="DefaultParagraphFont">
     <w:name w:val="Default Paragraph Font"/>
     <w:uiPriority w:val="1"/>
-    <w:semiHidden/>
     <w:unhideWhenUsed/>
   </w:style>
   <w:style w:type="table" w:default="1" w:styleId="TableNormal">

</xml_diff>

<commit_message>
Lesson 47 Creating APIs for Codeswear.com
</commit_message>
<xml_diff>
--- a/Notes2.docx
+++ b/Notes2.docx
@@ -59,10 +59,18 @@
     </w:p>
     <w:p>
       <w:r>
-        <w:t>In nay container</w:t>
-      </w:r>
-      <w:r>
-        <w:t>(or component)</w:t>
+        <w:t xml:space="preserve">In nay </w:t>
+      </w:r>
+      <w:proofErr w:type="gramStart"/>
+      <w:r>
+        <w:t>container</w:t>
+      </w:r>
+      <w:r>
+        <w:t>(</w:t>
+      </w:r>
+      <w:proofErr w:type="gramEnd"/>
+      <w:r>
+        <w:t>or component)</w:t>
       </w:r>
       <w:r>
         <w:t xml:space="preserve"> if you want to </w:t>
@@ -547,9 +555,14 @@
       </w:r>
     </w:p>
     <w:p>
+      <w:proofErr w:type="gramStart"/>
       <w:r>
         <w:lastRenderedPageBreak/>
-        <w:t>So we can so this thing Now we can see it is getting rendered as shown below</w:t>
+        <w:t>So</w:t>
+      </w:r>
+      <w:proofErr w:type="gramEnd"/>
+      <w:r>
+        <w:t xml:space="preserve"> we can so this thing Now we can see it is getting rendered as shown below</w:t>
       </w:r>
     </w:p>
     <w:p>
@@ -651,8 +664,13 @@
         <w:t xml:space="preserve"> s</w:t>
       </w:r>
       <w:r>
-        <w:t>ubmit the form</w:t>
-      </w:r>
+        <w:t xml:space="preserve">ubmit the </w:t>
+      </w:r>
+      <w:proofErr w:type="gramStart"/>
+      <w:r>
+        <w:t>form</w:t>
+      </w:r>
+      <w:proofErr w:type="gramEnd"/>
       <w:r>
         <w:t xml:space="preserve"> we will definitely have to make an API to co</w:t>
       </w:r>
@@ -718,8 +736,29 @@
       </w:r>
     </w:p>
     <w:p>
-      <w:r>
-        <w:t>So for now our post request handler look like below</w:t>
+      <w:proofErr w:type="gramStart"/>
+      <w:r>
+        <w:t>So</w:t>
+      </w:r>
+      <w:proofErr w:type="gramEnd"/>
+      <w:r>
+        <w:t xml:space="preserve"> for </w:t>
+      </w:r>
+      <w:proofErr w:type="gramStart"/>
+      <w:r>
+        <w:t>now</w:t>
+      </w:r>
+      <w:proofErr w:type="gramEnd"/>
+      <w:r>
+        <w:t xml:space="preserve"> our post request handler </w:t>
+      </w:r>
+      <w:proofErr w:type="gramStart"/>
+      <w:r>
+        <w:t>look</w:t>
+      </w:r>
+      <w:proofErr w:type="gramEnd"/>
+      <w:r>
+        <w:t xml:space="preserve"> like below</w:t>
       </w:r>
     </w:p>
     <w:p>
@@ -768,8 +807,13 @@
       </w:r>
     </w:p>
     <w:p>
-      <w:r>
-        <w:t>Ols version used to look like below</w:t>
+      <w:proofErr w:type="gramStart"/>
+      <w:r>
+        <w:t>Ols</w:t>
+      </w:r>
+      <w:proofErr w:type="gramEnd"/>
+      <w:r>
+        <w:t xml:space="preserve"> version used to look like below</w:t>
       </w:r>
     </w:p>
     <w:p>
@@ -877,10 +921,12 @@
         <w:t xml:space="preserve">, not plain JSON, so sending it directly with </w:t>
       </w:r>
       <w:proofErr w:type="spellStart"/>
+      <w:proofErr w:type="gramStart"/>
       <w:r>
         <w:t>res.json</w:t>
       </w:r>
       <w:proofErr w:type="spellEnd"/>
+      <w:proofErr w:type="gramEnd"/>
       <w:r>
         <w:t>(</w:t>
       </w:r>
@@ -938,9 +984,14 @@
     </w:p>
     <w:p>
       <w:r>
-        <w:t>export default function handler(</w:t>
-      </w:r>
-      <w:proofErr w:type="spellStart"/>
+        <w:t xml:space="preserve">export default function </w:t>
+      </w:r>
+      <w:proofErr w:type="gramStart"/>
+      <w:r>
+        <w:t>handler(</w:t>
+      </w:r>
+      <w:proofErr w:type="spellStart"/>
+      <w:proofErr w:type="gramEnd"/>
       <w:r>
         <w:t>req</w:t>
       </w:r>
@@ -1046,6 +1097,7 @@
         <w:t xml:space="preserve">Why </w:t>
       </w:r>
       <w:proofErr w:type="spellStart"/>
+      <w:proofErr w:type="gramStart"/>
       <w:r>
         <w:rPr>
           <w:b/>
@@ -1054,6 +1106,7 @@
         <w:t>res.json</w:t>
       </w:r>
       <w:proofErr w:type="spellEnd"/>
+      <w:proofErr w:type="gramEnd"/>
       <w:r>
         <w:rPr>
           <w:b/>
@@ -1085,18 +1138,25 @@
     </w:p>
     <w:p>
       <w:proofErr w:type="spellStart"/>
+      <w:proofErr w:type="gramStart"/>
       <w:r>
         <w:t>res.status</w:t>
       </w:r>
       <w:proofErr w:type="spellEnd"/>
-      <w:r>
-        <w:t>(200).</w:t>
+      <w:proofErr w:type="gramEnd"/>
+      <w:r>
+        <w:t>(200</w:t>
+      </w:r>
+      <w:proofErr w:type="gramStart"/>
+      <w:r>
+        <w:t>).</w:t>
       </w:r>
       <w:proofErr w:type="spellStart"/>
       <w:r>
         <w:t>json</w:t>
       </w:r>
       <w:proofErr w:type="spellEnd"/>
+      <w:proofErr w:type="gramEnd"/>
       <w:r>
         <w:t>(</w:t>
       </w:r>
@@ -1197,9 +1257,14 @@
     </w:p>
     <w:p>
       <w:r>
-        <w:t>export default function handler(</w:t>
-      </w:r>
-      <w:proofErr w:type="spellStart"/>
+        <w:t xml:space="preserve">export default function </w:t>
+      </w:r>
+      <w:proofErr w:type="gramStart"/>
+      <w:r>
+        <w:t>handler(</w:t>
+      </w:r>
+      <w:proofErr w:type="spellStart"/>
+      <w:proofErr w:type="gramEnd"/>
       <w:r>
         <w:t>req</w:t>
       </w:r>
@@ -1212,10 +1277,12 @@
         <w:t xml:space="preserve">  if (</w:t>
       </w:r>
       <w:proofErr w:type="spellStart"/>
+      <w:proofErr w:type="gramStart"/>
       <w:r>
         <w:t>req.method</w:t>
       </w:r>
       <w:proofErr w:type="spellEnd"/>
+      <w:proofErr w:type="gramEnd"/>
       <w:r>
         <w:t xml:space="preserve"> === "POST") {</w:t>
       </w:r>
@@ -1224,18 +1291,25 @@
         <w:t xml:space="preserve">    </w:t>
       </w:r>
       <w:proofErr w:type="spellStart"/>
+      <w:proofErr w:type="gramStart"/>
       <w:r>
         <w:t>res.status</w:t>
       </w:r>
       <w:proofErr w:type="spellEnd"/>
-      <w:r>
-        <w:t>(200).</w:t>
+      <w:proofErr w:type="gramEnd"/>
+      <w:r>
+        <w:t>(200</w:t>
+      </w:r>
+      <w:proofErr w:type="gramStart"/>
+      <w:r>
+        <w:t>).</w:t>
       </w:r>
       <w:proofErr w:type="spellStart"/>
       <w:r>
         <w:t>json</w:t>
       </w:r>
       <w:proofErr w:type="spellEnd"/>
+      <w:proofErr w:type="gramEnd"/>
       <w:r>
         <w:t>({</w:t>
       </w:r>
@@ -1244,10 +1318,12 @@
         <w:t xml:space="preserve">      method: </w:t>
       </w:r>
       <w:proofErr w:type="spellStart"/>
+      <w:proofErr w:type="gramStart"/>
       <w:r>
         <w:t>req.method</w:t>
       </w:r>
       <w:proofErr w:type="spellEnd"/>
+      <w:proofErr w:type="gramEnd"/>
       <w:r>
         <w:t>,</w:t>
       </w:r>
@@ -1256,10 +1332,12 @@
         <w:t xml:space="preserve">      body: </w:t>
       </w:r>
       <w:proofErr w:type="spellStart"/>
+      <w:proofErr w:type="gramStart"/>
       <w:r>
         <w:t>req.body</w:t>
       </w:r>
       <w:proofErr w:type="spellEnd"/>
+      <w:proofErr w:type="gramEnd"/>
       <w:r>
         <w:t>,</w:t>
       </w:r>
@@ -1268,10 +1346,12 @@
         <w:t xml:space="preserve">      query: </w:t>
       </w:r>
       <w:proofErr w:type="spellStart"/>
+      <w:proofErr w:type="gramStart"/>
       <w:r>
         <w:t>req.query</w:t>
       </w:r>
       <w:proofErr w:type="spellEnd"/>
+      <w:proofErr w:type="gramEnd"/>
       <w:r>
         <w:t>,</w:t>
       </w:r>
@@ -1281,8 +1361,12 @@
       </w:r>
       <w:r>
         <w:br/>
+      </w:r>
+      <w:proofErr w:type="gramStart"/>
+      <w:r>
         <w:t xml:space="preserve">  }</w:t>
       </w:r>
+      <w:proofErr w:type="gramEnd"/>
       <w:r>
         <w:br/>
         <w:t>}</w:t>
@@ -1438,10 +1522,12 @@
           </w:tcPr>
           <w:p>
             <w:proofErr w:type="spellStart"/>
+            <w:proofErr w:type="gramStart"/>
             <w:r>
               <w:t>req.body</w:t>
             </w:r>
             <w:proofErr w:type="spellEnd"/>
+            <w:proofErr w:type="gramEnd"/>
           </w:p>
         </w:tc>
         <w:tc>
@@ -1475,10 +1561,12 @@
           </w:tcPr>
           <w:p>
             <w:proofErr w:type="spellStart"/>
+            <w:proofErr w:type="gramStart"/>
             <w:r>
               <w:t>req.query</w:t>
             </w:r>
             <w:proofErr w:type="spellEnd"/>
+            <w:proofErr w:type="gramEnd"/>
           </w:p>
         </w:tc>
         <w:tc>
@@ -1512,10 +1600,12 @@
           </w:tcPr>
           <w:p>
             <w:proofErr w:type="spellStart"/>
+            <w:proofErr w:type="gramStart"/>
             <w:r>
               <w:t>req.method</w:t>
             </w:r>
             <w:proofErr w:type="spellEnd"/>
+            <w:proofErr w:type="gramEnd"/>
           </w:p>
         </w:tc>
         <w:tc>
@@ -1567,9 +1657,14 @@
     </w:p>
     <w:p>
       <w:r>
-        <w:t>export async function POST(</w:t>
-      </w:r>
-      <w:proofErr w:type="spellStart"/>
+        <w:t xml:space="preserve">export async function </w:t>
+      </w:r>
+      <w:proofErr w:type="gramStart"/>
+      <w:r>
+        <w:t>POST(</w:t>
+      </w:r>
+      <w:proofErr w:type="spellStart"/>
+      <w:proofErr w:type="gramEnd"/>
       <w:r>
         <w:t>req</w:t>
       </w:r>
@@ -1593,10 +1688,12 @@
         <w:t xml:space="preserve"> body = await </w:t>
       </w:r>
       <w:proofErr w:type="spellStart"/>
+      <w:proofErr w:type="gramStart"/>
       <w:r>
         <w:t>req.json</w:t>
       </w:r>
       <w:proofErr w:type="spellEnd"/>
+      <w:proofErr w:type="gramEnd"/>
       <w:r>
         <w:t>();</w:t>
       </w:r>
@@ -1658,10 +1755,12 @@
         <w:t xml:space="preserve">d specific fields like </w:t>
       </w:r>
       <w:proofErr w:type="spellStart"/>
+      <w:proofErr w:type="gramStart"/>
       <w:r>
         <w:t>req.body</w:t>
       </w:r>
       <w:proofErr w:type="spellEnd"/>
+      <w:proofErr w:type="gramEnd"/>
       <w:r>
         <w:t>.</w:t>
       </w:r>
@@ -1671,7 +1770,15 @@
         <w:t>In older version we used to get body like we did in n</w:t>
       </w:r>
       <w:r>
-        <w:t>ode js but in modern it look like below</w:t>
+        <w:t xml:space="preserve">ode js but in modern it </w:t>
+      </w:r>
+      <w:proofErr w:type="gramStart"/>
+      <w:r>
+        <w:t>look</w:t>
+      </w:r>
+      <w:proofErr w:type="gramEnd"/>
+      <w:r>
+        <w:t xml:space="preserve"> like below</w:t>
       </w:r>
     </w:p>
     <w:p>
@@ -1774,10 +1881,18 @@
         <w:t>The problem with the file making</w:t>
       </w:r>
       <w:r>
-        <w:t xml:space="preserve"> strategy </w:t>
-      </w:r>
-      <w:r>
-        <w:t xml:space="preserve"> is that </w:t>
+        <w:t xml:space="preserve"> </w:t>
+      </w:r>
+      <w:proofErr w:type="gramStart"/>
+      <w:r>
+        <w:t xml:space="preserve">strategy </w:t>
+      </w:r>
+      <w:r>
+        <w:t xml:space="preserve"> is</w:t>
+      </w:r>
+      <w:proofErr w:type="gramEnd"/>
+      <w:r>
+        <w:t xml:space="preserve"> that </w:t>
       </w:r>
       <w:r>
         <w:t xml:space="preserve">if suppose </w:t>
@@ -1890,20 +2005,41 @@
       </w:r>
       <w:proofErr w:type="spellEnd"/>
       <w:r>
-        <w:t xml:space="preserve"> element</w:t>
-      </w:r>
-      <w:r>
-        <w:t>(who knows may be I am wrong here)</w:t>
-      </w:r>
-      <w:r>
         <w:t xml:space="preserve"> </w:t>
       </w:r>
+      <w:proofErr w:type="gramStart"/>
+      <w:r>
+        <w:t>element</w:t>
+      </w:r>
+      <w:r>
+        <w:t>(</w:t>
+      </w:r>
+      <w:proofErr w:type="gramEnd"/>
+      <w:r>
+        <w:t xml:space="preserve">who knows </w:t>
+      </w:r>
+      <w:proofErr w:type="gramStart"/>
+      <w:r>
+        <w:t>may be</w:t>
+      </w:r>
+      <w:proofErr w:type="gramEnd"/>
+      <w:r>
+        <w:t xml:space="preserve"> I am wrong here)</w:t>
+      </w:r>
+      <w:r>
+        <w:t xml:space="preserve"> </w:t>
+      </w:r>
       <w:r>
         <w:t xml:space="preserve">and on state update method we used </w:t>
       </w:r>
       <w:proofErr w:type="spellStart"/>
-      <w:r>
-        <w:t>e.target.innerText</w:t>
+      <w:proofErr w:type="gramStart"/>
+      <w:r>
+        <w:t>e.target</w:t>
+      </w:r>
+      <w:proofErr w:type="gramEnd"/>
+      <w:r>
+        <w:t>.innerText</w:t>
       </w:r>
       <w:proofErr w:type="spellEnd"/>
     </w:p>
@@ -1920,8 +2056,13 @@
         <w:t xml:space="preserve"> we can use </w:t>
       </w:r>
       <w:proofErr w:type="spellStart"/>
-      <w:r>
-        <w:t>e.target,value</w:t>
+      <w:proofErr w:type="gramStart"/>
+      <w:r>
+        <w:t>e.target</w:t>
+      </w:r>
+      <w:proofErr w:type="gramEnd"/>
+      <w:r>
+        <w:t>,value</w:t>
       </w:r>
       <w:proofErr w:type="spellEnd"/>
       <w:r>
@@ -2037,13 +2178,16 @@
         <w:t xml:space="preserve">Shortcut for </w:t>
       </w:r>
       <w:proofErr w:type="spellStart"/>
+      <w:proofErr w:type="gramStart"/>
       <w:r>
         <w:t>margin:auto</w:t>
       </w:r>
       <w:proofErr w:type="spellEnd"/>
+      <w:proofErr w:type="gramEnd"/>
       <w:r>
         <w:t xml:space="preserve"> will be </w:t>
       </w:r>
+      <w:proofErr w:type="gramStart"/>
       <w:r>
         <w:rPr>
           <w:b/>
@@ -2051,6 +2195,7 @@
         </w:rPr>
         <w:t>m:auto</w:t>
       </w:r>
+      <w:proofErr w:type="gramEnd"/>
       <w:r>
         <w:rPr>
           <w:b/>
@@ -2114,10 +2259,18 @@
     </w:p>
     <w:p>
       <w:r>
-        <w:t xml:space="preserve">Suppose you have 50 blogs and you want to show 5 blogs on each pages </w:t>
-      </w:r>
-      <w:r>
-        <w:t xml:space="preserve"> so 10 pages </w:t>
+        <w:t xml:space="preserve">Suppose you have 50 blogs and you want to show 5 blogs on each </w:t>
+      </w:r>
+      <w:proofErr w:type="gramStart"/>
+      <w:r>
+        <w:t xml:space="preserve">pages </w:t>
+      </w:r>
+      <w:r>
+        <w:t xml:space="preserve"> so</w:t>
+      </w:r>
+      <w:proofErr w:type="gramEnd"/>
+      <w:r>
+        <w:t xml:space="preserve"> 10 pages </w:t>
       </w:r>
       <w:r>
         <w:t>will</w:t>
@@ -2128,11 +2281,16 @@
       <w:r>
         <w:t xml:space="preserve">be </w:t>
       </w:r>
+      <w:proofErr w:type="gramStart"/>
       <w:r>
         <w:t xml:space="preserve">formed </w:t>
       </w:r>
       <w:r>
-        <w:t xml:space="preserve">. In the similar way </w:t>
+        <w:t>.</w:t>
+      </w:r>
+      <w:proofErr w:type="gramEnd"/>
+      <w:r>
+        <w:t xml:space="preserve"> In the similar way </w:t>
       </w:r>
       <w:r>
         <w:t xml:space="preserve">pagination can be showed </w:t>
@@ -2249,7 +2407,15 @@
         <w:t xml:space="preserve">that we will not good components </w:t>
       </w:r>
       <w:r>
-        <w:t>means you won’t get good packages for doing any work(who knows)</w:t>
+        <w:t xml:space="preserve">means you won’t get good packages for doing any </w:t>
+      </w:r>
+      <w:proofErr w:type="gramStart"/>
+      <w:r>
+        <w:t>work(</w:t>
+      </w:r>
+      <w:proofErr w:type="gramEnd"/>
+      <w:r>
+        <w:t>who knows)</w:t>
       </w:r>
     </w:p>
     <w:p>
@@ -2278,14 +2444,27 @@
       </w:r>
     </w:p>
     <w:p>
-      <w:r>
-        <w:t xml:space="preserve">So we run the above command I context of </w:t>
+      <w:proofErr w:type="gramStart"/>
+      <w:r>
+        <w:t>So</w:t>
+      </w:r>
+      <w:proofErr w:type="gramEnd"/>
+      <w:r>
+        <w:t xml:space="preserve"> we run the above command I context of </w:t>
       </w:r>
       <w:r>
         <w:t xml:space="preserve">yarn </w:t>
       </w:r>
       <w:r>
-        <w:t>by using  below command</w:t>
+        <w:t xml:space="preserve">by </w:t>
+      </w:r>
+      <w:proofErr w:type="gramStart"/>
+      <w:r>
+        <w:t>using  below</w:t>
+      </w:r>
+      <w:proofErr w:type="gramEnd"/>
+      <w:r>
+        <w:t xml:space="preserve"> command</w:t>
       </w:r>
     </w:p>
     <w:p>
@@ -2373,13 +2552,29 @@
         <w:t xml:space="preserve">Data length </w:t>
       </w:r>
       <w:r>
-        <w:t>of the data that to be shown</w:t>
-      </w:r>
-      <w:r>
-        <w:t xml:space="preserve"> , next is the function  </w:t>
-      </w:r>
-      <w:r>
-        <w:t>that will be called when we scroll and reach the bottom and more data is needed to be loaded.</w:t>
+        <w:t xml:space="preserve">of the data that to be </w:t>
+      </w:r>
+      <w:proofErr w:type="gramStart"/>
+      <w:r>
+        <w:t>shown</w:t>
+      </w:r>
+      <w:r>
+        <w:t xml:space="preserve"> ,</w:t>
+      </w:r>
+      <w:proofErr w:type="gramEnd"/>
+      <w:r>
+        <w:t xml:space="preserve"> next is the </w:t>
+      </w:r>
+      <w:proofErr w:type="gramStart"/>
+      <w:r>
+        <w:t xml:space="preserve">function  </w:t>
+      </w:r>
+      <w:r>
+        <w:t>that</w:t>
+      </w:r>
+      <w:proofErr w:type="gramEnd"/>
+      <w:r>
+        <w:t xml:space="preserve"> will be called when we scroll and reach the bottom and more data is needed to be loaded.</w:t>
       </w:r>
     </w:p>
     <w:p>
@@ -2407,13 +2602,21 @@
         <w:t>w</w:t>
       </w:r>
       <w:r>
-        <w:t>n function</w:t>
+        <w:t xml:space="preserve">n </w:t>
+      </w:r>
+      <w:proofErr w:type="gramStart"/>
+      <w:r>
+        <w:t>function</w:t>
       </w:r>
       <w:r>
         <w:t>al</w:t>
       </w:r>
       <w:r>
-        <w:t>ity(who knows)</w:t>
+        <w:t>ity(</w:t>
+      </w:r>
+      <w:proofErr w:type="gramEnd"/>
+      <w:r>
+        <w:t>who knows)</w:t>
       </w:r>
     </w:p>
     <w:p>
@@ -2495,7 +2698,15 @@
         <w:t xml:space="preserve">it is defined like this </w:t>
       </w:r>
       <w:r>
-        <w:t xml:space="preserve">if we keep single item </w:t>
+        <w:t xml:space="preserve">if we keep single </w:t>
+      </w:r>
+      <w:proofErr w:type="gramStart"/>
+      <w:r>
+        <w:t>item</w:t>
+      </w:r>
+      <w:proofErr w:type="gramEnd"/>
+      <w:r>
+        <w:t xml:space="preserve"> </w:t>
       </w:r>
       <w:r>
         <w:t>we need to see al</w:t>
@@ -2504,13 +2715,21 @@
         <w:t>l</w:t>
       </w:r>
       <w:r>
-        <w:t xml:space="preserve"> this thi</w:t>
+        <w:t xml:space="preserve"> </w:t>
+      </w:r>
+      <w:proofErr w:type="gramStart"/>
+      <w:r>
+        <w:t>this thi</w:t>
       </w:r>
       <w:r>
         <w:t>n</w:t>
       </w:r>
       <w:r>
-        <w:t xml:space="preserve">gs </w:t>
+        <w:t>gs</w:t>
+      </w:r>
+      <w:proofErr w:type="gramEnd"/>
+      <w:r>
+        <w:t xml:space="preserve"> </w:t>
       </w:r>
     </w:p>
     <w:p>
@@ -2520,6 +2739,7 @@
           <w:bCs/>
         </w:rPr>
       </w:pPr>
+      <w:proofErr w:type="gramStart"/>
       <w:r>
         <w:rPr>
           <w:b/>
@@ -2527,6 +2747,7 @@
         </w:rPr>
         <w:t>Note:-</w:t>
       </w:r>
+      <w:proofErr w:type="gramEnd"/>
     </w:p>
     <w:p>
       <w:pPr>
@@ -2538,7 +2759,15 @@
         <w:t xml:space="preserve">Sometime it happens </w:t>
       </w:r>
       <w:r>
-        <w:t>in react that one component is show  two times so reload to remove the bug</w:t>
+        <w:t xml:space="preserve">in react that one component is </w:t>
+      </w:r>
+      <w:proofErr w:type="gramStart"/>
+      <w:r>
+        <w:t>show  two</w:t>
+      </w:r>
+      <w:proofErr w:type="gramEnd"/>
+      <w:r>
+        <w:t xml:space="preserve"> times so reload to remove the bug</w:t>
       </w:r>
     </w:p>
     <w:p>
@@ -2554,7 +2783,15 @@
         <w:t xml:space="preserve">except for responsiveness </w:t>
       </w:r>
       <w:r>
-        <w:t xml:space="preserve">we will  make our blog responsive and will write media queries </w:t>
+        <w:t xml:space="preserve">we </w:t>
+      </w:r>
+      <w:proofErr w:type="gramStart"/>
+      <w:r>
+        <w:t>will  make</w:t>
+      </w:r>
+      <w:proofErr w:type="gramEnd"/>
+      <w:r>
+        <w:t xml:space="preserve"> our blog responsive and will write media queries </w:t>
       </w:r>
       <w:r>
         <w:t>how we can we run media que</w:t>
@@ -2580,8 +2817,13 @@
         <w:t xml:space="preserve">the website </w:t>
       </w:r>
       <w:r>
-        <w:t>and if you gave responsiveness</w:t>
-      </w:r>
+        <w:t xml:space="preserve">and if you gave </w:t>
+      </w:r>
+      <w:proofErr w:type="gramStart"/>
+      <w:r>
+        <w:t>responsiveness</w:t>
+      </w:r>
+      <w:proofErr w:type="gramEnd"/>
       <w:r>
         <w:t xml:space="preserve"> it was an addon</w:t>
       </w:r>
@@ -2600,10 +2842,12 @@
         <w:t xml:space="preserve">you can say bit in </w:t>
       </w:r>
       <w:proofErr w:type="spellStart"/>
+      <w:proofErr w:type="gramStart"/>
       <w:r>
         <w:t>todays</w:t>
       </w:r>
       <w:proofErr w:type="spellEnd"/>
+      <w:proofErr w:type="gramEnd"/>
       <w:r>
         <w:t xml:space="preserve"> time </w:t>
       </w:r>
@@ -2680,7 +2924,11 @@
     </w:p>
     <w:p>
       <w:r>
-        <w:t>We will ho</w:t>
+        <w:t xml:space="preserve">We will </w:t>
+      </w:r>
+      <w:proofErr w:type="gramStart"/>
+      <w:r>
+        <w:t>ho</w:t>
       </w:r>
       <w:r>
         <w:t>s</w:t>
@@ -2689,7 +2937,11 @@
         <w:t>t</w:t>
       </w:r>
       <w:r>
-        <w:t>s the web</w:t>
+        <w:t>s</w:t>
+      </w:r>
+      <w:proofErr w:type="gramEnd"/>
+      <w:r>
+        <w:t xml:space="preserve"> the web</w:t>
       </w:r>
       <w:r>
         <w:t>s</w:t>
@@ -2816,7 +3068,15 @@
     </w:p>
     <w:p>
       <w:r>
-        <w:t xml:space="preserve">IN digital ocean we make new user(who knows) </w:t>
+        <w:t xml:space="preserve">IN digital ocean we make new </w:t>
+      </w:r>
+      <w:proofErr w:type="gramStart"/>
+      <w:r>
+        <w:t>user(</w:t>
+      </w:r>
+      <w:proofErr w:type="gramEnd"/>
+      <w:r>
+        <w:t xml:space="preserve">who knows) </w:t>
       </w:r>
     </w:p>
     <w:p>
@@ -2854,13 +3114,26 @@
       <w:r>
         <w:t xml:space="preserve">process will be </w:t>
       </w:r>
-      <w:r>
-        <w:t xml:space="preserve">build there </w:t>
-      </w:r>
-    </w:p>
-    <w:p>
-      <w:r>
-        <w:t>It will ask you to make database in there services.</w:t>
+      <w:proofErr w:type="gramStart"/>
+      <w:r>
+        <w:t>build</w:t>
+      </w:r>
+      <w:proofErr w:type="gramEnd"/>
+      <w:r>
+        <w:t xml:space="preserve"> there </w:t>
+      </w:r>
+    </w:p>
+    <w:p>
+      <w:r>
+        <w:t xml:space="preserve">It will ask you to make database in </w:t>
+      </w:r>
+      <w:proofErr w:type="gramStart"/>
+      <w:r>
+        <w:t>there</w:t>
+      </w:r>
+      <w:proofErr w:type="gramEnd"/>
+      <w:r>
+        <w:t xml:space="preserve"> services.</w:t>
       </w:r>
       <w:r>
         <w:t xml:space="preserve"> (who knows)</w:t>
@@ -2911,9 +3184,14 @@
       </w:r>
       <w:proofErr w:type="spellEnd"/>
       <w:r>
-        <w:t xml:space="preserve"> it will be good(</w:t>
-      </w:r>
-      <w:proofErr w:type="spellStart"/>
+        <w:t xml:space="preserve"> it will be </w:t>
+      </w:r>
+      <w:proofErr w:type="gramStart"/>
+      <w:r>
+        <w:t>good(</w:t>
+      </w:r>
+      <w:proofErr w:type="spellStart"/>
+      <w:proofErr w:type="gramEnd"/>
       <w:r>
         <w:t>wjp</w:t>
       </w:r>
@@ -2930,20 +3208,30 @@
           <w:color w:val="EE0000"/>
         </w:rPr>
       </w:pPr>
+      <w:proofErr w:type="gramStart"/>
       <w:r>
         <w:rPr>
           <w:b/>
           <w:bCs/>
           <w:color w:val="EE0000"/>
         </w:rPr>
-        <w:t xml:space="preserve">‘ can create </w:t>
-      </w:r>
+        <w:t>‘ can</w:t>
+      </w:r>
+      <w:proofErr w:type="gramEnd"/>
       <w:r>
         <w:rPr>
           <w:b/>
           <w:bCs/>
           <w:color w:val="EE0000"/>
         </w:rPr>
+        <w:t xml:space="preserve"> create </w:t>
+      </w:r>
+      <w:r>
+        <w:rPr>
+          <w:b/>
+          <w:bCs/>
+          <w:color w:val="EE0000"/>
+        </w:rPr>
         <w:t xml:space="preserve">error in </w:t>
       </w:r>
       <w:proofErr w:type="spellStart"/>
@@ -2988,15 +3276,33 @@
           <w:bCs/>
           <w:color w:val="EE0000"/>
         </w:rPr>
-        <w:t xml:space="preserve"> or maybe in React.</w:t>
-      </w:r>
+        <w:t xml:space="preserve"> or maybe in </w:t>
+      </w:r>
+      <w:proofErr w:type="gramStart"/>
       <w:r>
         <w:rPr>
           <w:b/>
           <w:bCs/>
           <w:color w:val="EE0000"/>
         </w:rPr>
-        <w:t>(maybe it is an outdated problem)</w:t>
+        <w:t>React.</w:t>
+      </w:r>
+      <w:r>
+        <w:rPr>
+          <w:b/>
+          <w:bCs/>
+          <w:color w:val="EE0000"/>
+        </w:rPr>
+        <w:t>(</w:t>
+      </w:r>
+      <w:proofErr w:type="gramEnd"/>
+      <w:r>
+        <w:rPr>
+          <w:b/>
+          <w:bCs/>
+          <w:color w:val="EE0000"/>
+        </w:rPr>
+        <w:t>maybe it is an outdated problem)</w:t>
       </w:r>
     </w:p>
     <w:p>
@@ -3021,10 +3327,12 @@
         <w:t xml:space="preserve">you can make it like that and if it </w:t>
       </w:r>
       <w:proofErr w:type="spellStart"/>
+      <w:proofErr w:type="gramStart"/>
       <w:r>
         <w:t>become</w:t>
       </w:r>
       <w:proofErr w:type="spellEnd"/>
+      <w:proofErr w:type="gramEnd"/>
       <w:r>
         <w:t xml:space="preserve"> profitable then you can scale it (who knows) </w:t>
       </w:r>
@@ -3033,6 +3341,7 @@
       <w:r>
         <w:t xml:space="preserve">Now as you commit then </w:t>
       </w:r>
+      <w:proofErr w:type="gramStart"/>
       <w:r>
         <w:t>Digital</w:t>
       </w:r>
@@ -3040,13 +3349,25 @@
         <w:t xml:space="preserve"> </w:t>
       </w:r>
       <w:r>
-        <w:t>ocean will build it</w:t>
-      </w:r>
-      <w:r>
-        <w:t xml:space="preserve"> automatically for you.</w:t>
-      </w:r>
-      <w:r>
-        <w:t>(maybe if auto</w:t>
+        <w:t>ocean</w:t>
+      </w:r>
+      <w:proofErr w:type="gramEnd"/>
+      <w:r>
+        <w:t xml:space="preserve"> will build it</w:t>
+      </w:r>
+      <w:r>
+        <w:t xml:space="preserve"> automatically for </w:t>
+      </w:r>
+      <w:proofErr w:type="gramStart"/>
+      <w:r>
+        <w:t>you.</w:t>
+      </w:r>
+      <w:r>
+        <w:t>(</w:t>
+      </w:r>
+      <w:proofErr w:type="gramEnd"/>
+      <w:r>
+        <w:t>maybe if auto</w:t>
       </w:r>
       <w:r>
         <w:t xml:space="preserve"> </w:t>
@@ -3055,7 +3376,15 @@
         <w:t xml:space="preserve">deploy option was selected </w:t>
       </w:r>
       <w:r>
-        <w:t>in the setting(who knows)</w:t>
+        <w:t xml:space="preserve">in the </w:t>
+      </w:r>
+      <w:proofErr w:type="gramStart"/>
+      <w:r>
+        <w:t>setting(</w:t>
+      </w:r>
+      <w:proofErr w:type="gramEnd"/>
+      <w:r>
+        <w:t>who knows)</w:t>
       </w:r>
       <w:r>
         <w:t>)</w:t>
@@ -3093,10 +3422,18 @@
         <w:t xml:space="preserve">here (maybe </w:t>
       </w:r>
       <w:r>
-        <w:t>very large app don’t work properly</w:t>
-      </w:r>
-      <w:r>
-        <w:t>(who knows)</w:t>
+        <w:t xml:space="preserve">very large app don’t work </w:t>
+      </w:r>
+      <w:proofErr w:type="gramStart"/>
+      <w:r>
+        <w:t>properly</w:t>
+      </w:r>
+      <w:r>
+        <w:t>(</w:t>
+      </w:r>
+      <w:proofErr w:type="gramEnd"/>
+      <w:r>
+        <w:t>who knows)</w:t>
       </w:r>
       <w:r>
         <w:t>)</w:t>
@@ -3137,10 +3474,18 @@
         <w:t xml:space="preserve">Now we will see </w:t>
       </w:r>
       <w:r>
-        <w:t>how Google analytics and search console</w:t>
-      </w:r>
-      <w:r>
-        <w:t xml:space="preserve">(who </w:t>
+        <w:t xml:space="preserve">how Google analytics and search </w:t>
+      </w:r>
+      <w:proofErr w:type="gramStart"/>
+      <w:r>
+        <w:t>console</w:t>
+      </w:r>
+      <w:r>
+        <w:t>(</w:t>
+      </w:r>
+      <w:proofErr w:type="gramEnd"/>
+      <w:r>
+        <w:t xml:space="preserve">who </w:t>
       </w:r>
       <w:proofErr w:type="spellStart"/>
       <w:r>
@@ -3307,13 +3652,21 @@
         <w:t xml:space="preserve">ck </w:t>
       </w:r>
       <w:r>
-        <w:t>which is also called S</w:t>
-      </w:r>
+        <w:t xml:space="preserve">which is also called </w:t>
+      </w:r>
+      <w:proofErr w:type="gramStart"/>
       <w:r>
         <w:t>S</w:t>
       </w:r>
       <w:r>
-        <w:t>LV(who knows)</w:t>
+        <w:t>S</w:t>
+      </w:r>
+      <w:r>
+        <w:t>LV(</w:t>
+      </w:r>
+      <w:proofErr w:type="gramEnd"/>
+      <w:r>
+        <w:t>who knows)</w:t>
       </w:r>
       <w:r>
         <w:t xml:space="preserve"> and </w:t>
@@ -3360,8 +3713,13 @@
       <w:r>
         <w:t xml:space="preserve">of the application. </w:t>
       </w:r>
-      <w:r>
-        <w:t>So if we want that the domain we have need to be pointe</w:t>
+      <w:proofErr w:type="gramStart"/>
+      <w:r>
+        <w:t>So</w:t>
+      </w:r>
+      <w:proofErr w:type="gramEnd"/>
+      <w:r>
+        <w:t xml:space="preserve"> if we want that the domain we have need to be pointe</w:t>
       </w:r>
       <w:r>
         <w:t>d</w:t>
@@ -3392,10 +3750,18 @@
     </w:p>
     <w:p>
       <w:r>
-        <w:t xml:space="preserve">Of you chose the former then you will  </w:t>
-      </w:r>
-      <w:r>
-        <w:t xml:space="preserve">see that from the dashboard </w:t>
+        <w:t xml:space="preserve">Of you chose the former then you </w:t>
+      </w:r>
+      <w:proofErr w:type="gramStart"/>
+      <w:r>
+        <w:t xml:space="preserve">will  </w:t>
+      </w:r>
+      <w:r>
+        <w:t>see</w:t>
+      </w:r>
+      <w:proofErr w:type="gramEnd"/>
+      <w:r>
+        <w:t xml:space="preserve"> that from the dashboard </w:t>
       </w:r>
       <w:r>
         <w:t xml:space="preserve">that how things are happening </w:t>
@@ -3404,10 +3770,26 @@
         <w:t xml:space="preserve">and if you chose later </w:t>
       </w:r>
       <w:r>
-        <w:t>then you need to point it to a Digital ocean(who knows)</w:t>
-      </w:r>
-      <w:r>
-        <w:t>. By former we bring the domain in the digital ocean(who knows)</w:t>
+        <w:t xml:space="preserve">then you need to point it to a Digital </w:t>
+      </w:r>
+      <w:proofErr w:type="gramStart"/>
+      <w:r>
+        <w:t>ocean(</w:t>
+      </w:r>
+      <w:proofErr w:type="gramEnd"/>
+      <w:r>
+        <w:t>who knows)</w:t>
+      </w:r>
+      <w:r>
+        <w:t xml:space="preserve">. By former we bring the domain in the digital </w:t>
+      </w:r>
+      <w:proofErr w:type="gramStart"/>
+      <w:r>
+        <w:t>ocean(</w:t>
+      </w:r>
+      <w:proofErr w:type="gramEnd"/>
+      <w:r>
+        <w:t>who knows)</w:t>
       </w:r>
       <w:r>
         <w:t xml:space="preserve">. </w:t>
@@ -3453,8 +3835,13 @@
       </w:r>
     </w:p>
     <w:p>
-      <w:r>
-        <w:t>So we went to Google search console</w:t>
+      <w:proofErr w:type="gramStart"/>
+      <w:r>
+        <w:t>So</w:t>
+      </w:r>
+      <w:proofErr w:type="gramEnd"/>
+      <w:r>
+        <w:t xml:space="preserve"> we went to Google search console</w:t>
       </w:r>
       <w:r>
         <w:t xml:space="preserve"> so we add a property there </w:t>
@@ -3529,7 +3916,15 @@
         <w:t xml:space="preserve">omain </w:t>
       </w:r>
       <w:r>
-        <w:t xml:space="preserve">ad then you need to verify it so it give us some text which we will paste in the </w:t>
+        <w:t xml:space="preserve">ad then you need to verify it so it </w:t>
+      </w:r>
+      <w:proofErr w:type="gramStart"/>
+      <w:r>
+        <w:t>give</w:t>
+      </w:r>
+      <w:proofErr w:type="gramEnd"/>
+      <w:r>
+        <w:t xml:space="preserve"> us some text which we will paste in the </w:t>
       </w:r>
       <w:r>
         <w:t xml:space="preserve">DNS records to give the proof for ownership of domain. </w:t>
@@ -3623,7 +4018,11 @@
         <w:t xml:space="preserve"> and how to integrate </w:t>
       </w:r>
       <w:r>
-        <w:t>payment gateway to the websi</w:t>
+        <w:t xml:space="preserve">payment gateway to the </w:t>
+      </w:r>
+      <w:proofErr w:type="gramStart"/>
+      <w:r>
+        <w:t>websi</w:t>
       </w:r>
       <w:r>
         <w:t>t</w:t>
@@ -3634,14 +4033,23 @@
       <w:r>
         <w:t>.</w:t>
       </w:r>
+      <w:proofErr w:type="gramEnd"/>
       <w:r>
         <w:t xml:space="preserve"> How orders will come </w:t>
       </w:r>
       <w:r>
-        <w:t xml:space="preserve">and how admin panel will be made </w:t>
-      </w:r>
-      <w:r>
-        <w:t>. F</w:t>
+        <w:t xml:space="preserve">and how admin panel will be </w:t>
+      </w:r>
+      <w:proofErr w:type="gramStart"/>
+      <w:r>
+        <w:t xml:space="preserve">made </w:t>
+      </w:r>
+      <w:r>
+        <w:t>.</w:t>
+      </w:r>
+      <w:proofErr w:type="gramEnd"/>
+      <w:r>
+        <w:t xml:space="preserve"> F</w:t>
       </w:r>
       <w:r>
         <w:t>r</w:t>
@@ -3962,10 +4370,18 @@
         <w:t xml:space="preserve">Like Bootstrap Tailwind also have </w:t>
       </w:r>
       <w:r>
-        <w:t xml:space="preserve">predefined class </w:t>
-      </w:r>
-      <w:r>
-        <w:t xml:space="preserve">.So we have tailwind css is installed </w:t>
+        <w:t xml:space="preserve">predefined </w:t>
+      </w:r>
+      <w:proofErr w:type="gramStart"/>
+      <w:r>
+        <w:t xml:space="preserve">class </w:t>
+      </w:r>
+      <w:r>
+        <w:t>.So</w:t>
+      </w:r>
+      <w:proofErr w:type="gramEnd"/>
+      <w:r>
+        <w:t xml:space="preserve"> we have tailwind css is installed </w:t>
       </w:r>
       <w:r>
         <w:t>and we can use our utility class</w:t>
@@ -4073,7 +4489,15 @@
         <w:t xml:space="preserve">There are some pages which you will find in almost all Ecommerce website that is </w:t>
       </w:r>
       <w:r>
-        <w:t>Product page , Home page</w:t>
+        <w:t xml:space="preserve">Product </w:t>
+      </w:r>
+      <w:proofErr w:type="gramStart"/>
+      <w:r>
+        <w:t>page ,</w:t>
+      </w:r>
+      <w:proofErr w:type="gramEnd"/>
+      <w:r>
+        <w:t xml:space="preserve"> Home page</w:t>
       </w:r>
       <w:r>
         <w:t>, Checkout page</w:t>
@@ -4085,10 +4509,18 @@
         <w:t>n</w:t>
       </w:r>
       <w:r>
-        <w:t xml:space="preserve"> order</w:t>
-      </w:r>
-      <w:r>
-        <w:t xml:space="preserve"> , login and </w:t>
+        <w:t xml:space="preserve"> </w:t>
+      </w:r>
+      <w:proofErr w:type="gramStart"/>
+      <w:r>
+        <w:t>order</w:t>
+      </w:r>
+      <w:r>
+        <w:t xml:space="preserve"> ,</w:t>
+      </w:r>
+      <w:proofErr w:type="gramEnd"/>
+      <w:r>
+        <w:t xml:space="preserve"> login and </w:t>
       </w:r>
       <w:proofErr w:type="spellStart"/>
       <w:r>
@@ -4165,7 +4597,15 @@
     </w:p>
     <w:p>
       <w:r>
-        <w:t xml:space="preserve">We will use app for that purposes(maybe </w:t>
+        <w:t xml:space="preserve">We will use app for that </w:t>
+      </w:r>
+      <w:proofErr w:type="gramStart"/>
+      <w:r>
+        <w:t>purposes(</w:t>
+      </w:r>
+      <w:proofErr w:type="gramEnd"/>
+      <w:r>
+        <w:t xml:space="preserve">maybe </w:t>
       </w:r>
       <w:proofErr w:type="spellStart"/>
       <w:r>
@@ -4208,13 +4648,21 @@
         <w:t xml:space="preserve">snippet </w:t>
       </w:r>
       <w:r>
-        <w:t xml:space="preserve">here you get minimalistic design </w:t>
+        <w:t xml:space="preserve">here you get minimalistic </w:t>
+      </w:r>
+      <w:proofErr w:type="gramStart"/>
+      <w:r>
+        <w:t xml:space="preserve">design </w:t>
       </w:r>
       <w:r>
         <w:t xml:space="preserve"> </w:t>
       </w:r>
       <w:r>
-        <w:t xml:space="preserve">Here you get </w:t>
+        <w:t>Here</w:t>
+      </w:r>
+      <w:proofErr w:type="gramEnd"/>
+      <w:r>
+        <w:t xml:space="preserve"> you get </w:t>
       </w:r>
       <w:proofErr w:type="spellStart"/>
       <w:r>
@@ -4535,14 +4983,46 @@
           <w:b/>
           <w:bCs/>
         </w:rPr>
-        <w:t xml:space="preserve"> and(we try there should be equivalent space between them)</w:t>
-      </w:r>
-      <w:r>
-        <w:rPr>
-          <w:b/>
-          <w:bCs/>
-        </w:rPr>
-        <w:t>(who knows)</w:t>
+        <w:t xml:space="preserve"> </w:t>
+      </w:r>
+      <w:proofErr w:type="gramStart"/>
+      <w:r>
+        <w:rPr>
+          <w:b/>
+          <w:bCs/>
+        </w:rPr>
+        <w:t>and(</w:t>
+      </w:r>
+      <w:proofErr w:type="gramEnd"/>
+      <w:r>
+        <w:rPr>
+          <w:b/>
+          <w:bCs/>
+        </w:rPr>
+        <w:t xml:space="preserve">we try there should be equivalent space between </w:t>
+      </w:r>
+      <w:proofErr w:type="gramStart"/>
+      <w:r>
+        <w:rPr>
+          <w:b/>
+          <w:bCs/>
+        </w:rPr>
+        <w:t>them)</w:t>
+      </w:r>
+      <w:r>
+        <w:rPr>
+          <w:b/>
+          <w:bCs/>
+        </w:rPr>
+        <w:t>(</w:t>
+      </w:r>
+      <w:proofErr w:type="gramEnd"/>
+      <w:r>
+        <w:rPr>
+          <w:b/>
+          <w:bCs/>
+        </w:rPr>
+        <w:t>who knows)</w:t>
       </w:r>
     </w:p>
     <w:p>
@@ -4559,6 +5039,7 @@
         <w:t xml:space="preserve"> in Tailwind by </w:t>
       </w:r>
       <w:proofErr w:type="spellStart"/>
+      <w:proofErr w:type="gramStart"/>
       <w:r>
         <w:rPr>
           <w:b/>
@@ -4574,6 +5055,7 @@
         <w:t>property</w:t>
       </w:r>
       <w:proofErr w:type="spellEnd"/>
+      <w:proofErr w:type="gramEnd"/>
       <w:r>
         <w:rPr>
           <w:b/>
@@ -4706,13 +5188,18 @@
     </w:p>
     <w:p>
       <w:r>
-        <w:t xml:space="preserve">import { </w:t>
+        <w:t xml:space="preserve">import </w:t>
+      </w:r>
+      <w:proofErr w:type="gramStart"/>
+      <w:r>
+        <w:t xml:space="preserve">{ </w:t>
       </w:r>
       <w:proofErr w:type="spellStart"/>
       <w:r>
         <w:t>AiOutlineShoppingCart</w:t>
       </w:r>
       <w:proofErr w:type="spellEnd"/>
+      <w:proofErr w:type="gramEnd"/>
       <w:r>
         <w:t xml:space="preserve"> } from "react-icons/ai";</w:t>
       </w:r>
@@ -4949,9 +5436,14 @@
       </w:r>
       <w:proofErr w:type="spellStart"/>
       <w:r>
-        <w:t>overflow-x:hidden</w:t>
-      </w:r>
-      <w:proofErr w:type="spellEnd"/>
+        <w:t>overflow-</w:t>
+      </w:r>
+      <w:proofErr w:type="gramStart"/>
+      <w:r>
+        <w:t>x:hidden</w:t>
+      </w:r>
+      <w:proofErr w:type="spellEnd"/>
+      <w:proofErr w:type="gramEnd"/>
       <w:r>
         <w:t xml:space="preserve"> you c</w:t>
       </w:r>
@@ -5088,7 +5580,15 @@
         <w:t xml:space="preserve">it is just a request and js will update cart accordingly </w:t>
       </w:r>
       <w:r>
-        <w:t xml:space="preserve">and there is no guarantee when  it will be updated so believe it that </w:t>
+        <w:t xml:space="preserve">and there is no guarantee </w:t>
+      </w:r>
+      <w:proofErr w:type="gramStart"/>
+      <w:r>
+        <w:t>when  it</w:t>
+      </w:r>
+      <w:proofErr w:type="gramEnd"/>
+      <w:r>
+        <w:t xml:space="preserve"> will be updated so believe it that </w:t>
       </w:r>
       <w:r>
         <w:t>car</w:t>
@@ -5106,7 +5606,15 @@
         <w:t>do update method is</w:t>
       </w:r>
       <w:r>
-        <w:t xml:space="preserve"> request its not an order</w:t>
+        <w:t xml:space="preserve"> request </w:t>
+      </w:r>
+      <w:proofErr w:type="gramStart"/>
+      <w:r>
+        <w:t>its</w:t>
+      </w:r>
+      <w:proofErr w:type="gramEnd"/>
+      <w:r>
+        <w:t xml:space="preserve"> not an order</w:t>
       </w:r>
       <w:r>
         <w:t xml:space="preserve">. React </w:t>
@@ -5121,7 +5629,15 @@
         <w:t xml:space="preserve">accordingly </w:t>
       </w:r>
       <w:r>
-        <w:t xml:space="preserve">and it will take time but it take time </w:t>
+        <w:t xml:space="preserve">and it will take time but it </w:t>
+      </w:r>
+      <w:proofErr w:type="gramStart"/>
+      <w:r>
+        <w:t>take</w:t>
+      </w:r>
+      <w:proofErr w:type="gramEnd"/>
+      <w:r>
+        <w:t xml:space="preserve"> time </w:t>
       </w:r>
       <w:r>
         <w:t xml:space="preserve">by time we mean in millisecond </w:t>
@@ -5346,10 +5862,18 @@
         <w:t xml:space="preserve">and how did we confirm </w:t>
       </w:r>
       <w:r>
-        <w:t>the order there</w:t>
-      </w:r>
-      <w:r>
-        <w:t>(who knows)</w:t>
+        <w:t xml:space="preserve">the order </w:t>
+      </w:r>
+      <w:proofErr w:type="gramStart"/>
+      <w:r>
+        <w:t>there</w:t>
+      </w:r>
+      <w:r>
+        <w:t>(</w:t>
+      </w:r>
+      <w:proofErr w:type="gramEnd"/>
+      <w:r>
+        <w:t>who knows)</w:t>
       </w:r>
       <w:r>
         <w:t>.</w:t>
@@ -5362,6 +5886,7 @@
           <w:bCs/>
         </w:rPr>
       </w:pPr>
+      <w:proofErr w:type="gramStart"/>
       <w:r>
         <w:rPr>
           <w:b/>
@@ -5369,6 +5894,7 @@
         </w:rPr>
         <w:t>Note:-</w:t>
       </w:r>
+      <w:proofErr w:type="gramEnd"/>
     </w:p>
     <w:p>
       <w:pPr>
@@ -5407,8 +5933,13 @@
         <w:t xml:space="preserve"> </w:t>
       </w:r>
       <w:r>
-        <w:t>(who knows )</w:t>
-      </w:r>
+        <w:t xml:space="preserve">(who </w:t>
+      </w:r>
+      <w:proofErr w:type="gramStart"/>
+      <w:r>
+        <w:t>knows )</w:t>
+      </w:r>
+      <w:proofErr w:type="gramEnd"/>
       <w:r>
         <w:t xml:space="preserve"> it will help js to connect to </w:t>
       </w:r>
@@ -5423,8 +5954,13 @@
       <w:r>
         <w:t xml:space="preserve">and we can use its </w:t>
       </w:r>
-      <w:r>
-        <w:t xml:space="preserve">built in functionality </w:t>
+      <w:proofErr w:type="gramStart"/>
+      <w:r>
+        <w:t>built in</w:t>
+      </w:r>
+      <w:proofErr w:type="gramEnd"/>
+      <w:r>
+        <w:t xml:space="preserve"> functionality </w:t>
       </w:r>
       <w:r>
         <w:t xml:space="preserve">you don’t have to read and write and update to the </w:t>
@@ -5444,12 +5980,17 @@
         <w:t xml:space="preserve">the complex we do for it in </w:t>
       </w:r>
       <w:proofErr w:type="spellStart"/>
+      <w:proofErr w:type="gramStart"/>
       <w:r>
         <w:t>mongodb</w:t>
       </w:r>
       <w:proofErr w:type="spellEnd"/>
       <w:r>
-        <w:t>(who knows))</w:t>
+        <w:t>(</w:t>
+      </w:r>
+      <w:proofErr w:type="gramEnd"/>
+      <w:r>
+        <w:t>who knows))</w:t>
       </w:r>
       <w:r>
         <w:t xml:space="preserve">. </w:t>
@@ -5480,13 +6021,34 @@
     <w:p>
       <w:r>
         <w:lastRenderedPageBreak/>
-        <w:t>If we make timestamp property (who knows)true</w:t>
-      </w:r>
-      <w:r>
-        <w:t xml:space="preserve"> it automatically create for us</w:t>
-      </w:r>
-      <w:r>
-        <w:t xml:space="preserve">, How these all things are done </w:t>
+        <w:t xml:space="preserve">If we make timestamp property (who </w:t>
+      </w:r>
+      <w:proofErr w:type="gramStart"/>
+      <w:r>
+        <w:t>knows)true</w:t>
+      </w:r>
+      <w:proofErr w:type="gramEnd"/>
+      <w:r>
+        <w:t xml:space="preserve"> it automatically </w:t>
+      </w:r>
+      <w:proofErr w:type="gramStart"/>
+      <w:r>
+        <w:t>create</w:t>
+      </w:r>
+      <w:proofErr w:type="gramEnd"/>
+      <w:r>
+        <w:t xml:space="preserve"> for us</w:t>
+      </w:r>
+      <w:r>
+        <w:t xml:space="preserve">, </w:t>
+      </w:r>
+      <w:proofErr w:type="gramStart"/>
+      <w:r>
+        <w:t>How</w:t>
+      </w:r>
+      <w:proofErr w:type="gramEnd"/>
+      <w:r>
+        <w:t xml:space="preserve"> these all things are done </w:t>
       </w:r>
       <w:r>
         <w:t>what is the syntax.</w:t>
@@ -5558,10 +6120,18 @@
         <w:t xml:space="preserve"> </w:t>
       </w:r>
       <w:r>
-        <w:t>and we will make some modals</w:t>
-      </w:r>
-      <w:r>
-        <w:t>(maybe not)</w:t>
+        <w:t xml:space="preserve">and we will make some </w:t>
+      </w:r>
+      <w:proofErr w:type="gramStart"/>
+      <w:r>
+        <w:t>modals</w:t>
+      </w:r>
+      <w:r>
+        <w:t>(</w:t>
+      </w:r>
+      <w:proofErr w:type="gramEnd"/>
+      <w:r>
+        <w:t>maybe not)</w:t>
       </w:r>
       <w:r>
         <w:t xml:space="preserve"> </w:t>
@@ -5615,7 +6185,15 @@
         <w:t xml:space="preserve"> compass will be installed</w:t>
       </w:r>
       <w:r>
-        <w:t xml:space="preserve"> which  is a product of </w:t>
+        <w:t xml:space="preserve"> </w:t>
+      </w:r>
+      <w:proofErr w:type="gramStart"/>
+      <w:r>
+        <w:t>which  is</w:t>
+      </w:r>
+      <w:proofErr w:type="gramEnd"/>
+      <w:r>
+        <w:t xml:space="preserve"> a product of </w:t>
       </w:r>
       <w:proofErr w:type="spellStart"/>
       <w:r>
@@ -5691,6 +6269,9 @@
         <w:jc w:val="center"/>
       </w:pPr>
       <w:r>
+        <w:rPr>
+          <w:noProof/>
+        </w:rPr>
         <w:drawing>
           <wp:inline distT="0" distB="0" distL="0" distR="0" wp14:anchorId="786B64B0" wp14:editId="23B87E0C">
             <wp:extent cx="5731510" cy="2917825"/>
@@ -5746,6 +6327,9 @@
         <w:jc w:val="center"/>
       </w:pPr>
       <w:r>
+        <w:rPr>
+          <w:noProof/>
+        </w:rPr>
         <w:drawing>
           <wp:inline distT="0" distB="0" distL="0" distR="0" wp14:anchorId="73A62792" wp14:editId="2B62B359">
             <wp:extent cx="5731510" cy="1364615"/>
@@ -5839,8 +6423,13 @@
       </w:r>
     </w:p>
     <w:p>
-      <w:r>
-        <w:t xml:space="preserve">So we will make three modals that is </w:t>
+      <w:proofErr w:type="gramStart"/>
+      <w:r>
+        <w:t>So</w:t>
+      </w:r>
+      <w:proofErr w:type="gramEnd"/>
+      <w:r>
+        <w:t xml:space="preserve"> we will make three modals that is </w:t>
       </w:r>
       <w:r>
         <w:t>Order, Product and User.</w:t>
@@ -5867,6 +6456,9 @@
         <w:jc w:val="center"/>
       </w:pPr>
       <w:r>
+        <w:rPr>
+          <w:noProof/>
+        </w:rPr>
         <w:drawing>
           <wp:inline distT="0" distB="0" distL="0" distR="0" wp14:anchorId="334928E1" wp14:editId="18B20E44">
             <wp:extent cx="4801270" cy="6049219"/>
@@ -5905,14 +6497,27 @@
       </w:r>
     </w:p>
     <w:p>
-      <w:r>
-        <w:t xml:space="preserve">So by the scheme (who knows maybe </w:t>
-      </w:r>
-      <w:r>
-        <w:t xml:space="preserve">by making schema object and passing it to the </w:t>
-      </w:r>
-      <w:r>
-        <w:t>)we created a model</w:t>
+      <w:proofErr w:type="gramStart"/>
+      <w:r>
+        <w:t>So</w:t>
+      </w:r>
+      <w:proofErr w:type="gramEnd"/>
+      <w:r>
+        <w:t xml:space="preserve"> by the scheme (who knows maybe </w:t>
+      </w:r>
+      <w:r>
+        <w:t xml:space="preserve">by making schema object and passing it to </w:t>
+      </w:r>
+      <w:proofErr w:type="gramStart"/>
+      <w:r>
+        <w:t xml:space="preserve">the </w:t>
+      </w:r>
+      <w:r>
+        <w:t>)we</w:t>
+      </w:r>
+      <w:proofErr w:type="gramEnd"/>
+      <w:r>
+        <w:t xml:space="preserve"> created a model</w:t>
       </w:r>
       <w:r>
         <w:t>.</w:t>
@@ -5920,7 +6525,15 @@
     </w:p>
     <w:p>
       <w:r>
-        <w:t>For admin we will create separate UI(who knows</w:t>
+        <w:t xml:space="preserve">For admin we will create separate </w:t>
+      </w:r>
+      <w:proofErr w:type="gramStart"/>
+      <w:r>
+        <w:t>UI(</w:t>
+      </w:r>
+      <w:proofErr w:type="gramEnd"/>
+      <w:r>
+        <w:t>who knows</w:t>
       </w:r>
       <w:r>
         <w:t xml:space="preserve"> how we will manage admin authentication</w:t>
@@ -5930,8 +6543,13 @@
       </w:r>
     </w:p>
     <w:p>
-      <w:r>
-        <w:t xml:space="preserve">So we will create middleware </w:t>
+      <w:proofErr w:type="gramStart"/>
+      <w:r>
+        <w:t>So</w:t>
+      </w:r>
+      <w:proofErr w:type="gramEnd"/>
+      <w:r>
+        <w:t xml:space="preserve"> we will create middleware </w:t>
       </w:r>
       <w:r>
         <w:t xml:space="preserve">to connect to database and from there we will </w:t>
@@ -5949,6 +6567,607 @@
         <w:t xml:space="preserve">in our API </w:t>
       </w:r>
     </w:p>
+    <w:p>
+      <w:r>
+        <w:lastRenderedPageBreak/>
+        <w:t>Now we will learn how to make</w:t>
+      </w:r>
+      <w:r>
+        <w:t xml:space="preserve"> three</w:t>
+      </w:r>
+      <w:r>
+        <w:t xml:space="preserve"> </w:t>
+      </w:r>
+      <w:r>
+        <w:t xml:space="preserve">APIs that is </w:t>
+      </w:r>
+      <w:proofErr w:type="spellStart"/>
+      <w:r>
+        <w:t>getProduct</w:t>
+      </w:r>
+      <w:proofErr w:type="spellEnd"/>
+      <w:r>
+        <w:t xml:space="preserve">, </w:t>
+      </w:r>
+      <w:proofErr w:type="spellStart"/>
+      <w:r>
+        <w:t>updateProduct</w:t>
+      </w:r>
+      <w:proofErr w:type="spellEnd"/>
+      <w:r>
+        <w:t xml:space="preserve"> and </w:t>
+      </w:r>
+      <w:proofErr w:type="spellStart"/>
+      <w:r>
+        <w:t>addProducts</w:t>
+      </w:r>
+      <w:proofErr w:type="spellEnd"/>
+      <w:r>
+        <w:t xml:space="preserve"> </w:t>
+      </w:r>
+      <w:r>
+        <w:t xml:space="preserve">now they do as the name suggests </w:t>
+      </w:r>
+      <w:r>
+        <w:t>and of</w:t>
+      </w:r>
+      <w:r>
+        <w:t xml:space="preserve">f </w:t>
+      </w:r>
+      <w:r>
+        <w:t>course update API will not be public otherwise anybody can use it</w:t>
+      </w:r>
+      <w:r>
+        <w:t xml:space="preserve"> and update our store </w:t>
+      </w:r>
+      <w:r>
+        <w:t xml:space="preserve">so we will make it and then decide who get what </w:t>
+      </w:r>
+      <w:proofErr w:type="gramStart"/>
+      <w:r>
+        <w:t>access(</w:t>
+      </w:r>
+      <w:proofErr w:type="gramEnd"/>
+      <w:r>
+        <w:t>maybe referring to user)</w:t>
+      </w:r>
+      <w:r>
+        <w:t xml:space="preserve">. </w:t>
+      </w:r>
+    </w:p>
+    <w:p>
+      <w:r>
+        <w:t xml:space="preserve">Now we are going to start middleware development which will facilitate the connection to </w:t>
+      </w:r>
+      <w:proofErr w:type="spellStart"/>
+      <w:r>
+        <w:t>mongodb</w:t>
+      </w:r>
+      <w:proofErr w:type="spellEnd"/>
+      <w:r>
+        <w:t xml:space="preserve"> </w:t>
+      </w:r>
+      <w:r>
+        <w:t>now it seems confusing at first</w:t>
+      </w:r>
+      <w:r>
+        <w:t xml:space="preserve">. </w:t>
+      </w:r>
+    </w:p>
+    <w:p>
+      <w:r>
+        <w:rPr>
+          <w:b/>
+          <w:bCs/>
+        </w:rPr>
+        <w:t>Facilitate</w:t>
+      </w:r>
+      <w:r>
+        <w:t xml:space="preserve"> means:</w:t>
+      </w:r>
+      <w:r>
+        <w:br/>
+      </w:r>
+      <w:r>
+        <w:rPr>
+          <w:rFonts w:ascii="Segoe UI Emoji" w:hAnsi="Segoe UI Emoji" w:cs="Segoe UI Emoji"/>
+        </w:rPr>
+        <w:t>👉</w:t>
+      </w:r>
+      <w:r>
+        <w:t xml:space="preserve"> </w:t>
+      </w:r>
+      <w:r>
+        <w:rPr>
+          <w:b/>
+          <w:bCs/>
+        </w:rPr>
+        <w:t>to make something easier, smoother, or more possible</w:t>
+      </w:r>
+    </w:p>
+    <w:p>
+      <w:r>
+        <w:t xml:space="preserve">It may be confusing but it is </w:t>
+      </w:r>
+      <w:proofErr w:type="gramStart"/>
+      <w:r>
+        <w:t>as  simple</w:t>
+      </w:r>
+      <w:proofErr w:type="gramEnd"/>
+      <w:r>
+        <w:t xml:space="preserve"> as creating </w:t>
+      </w:r>
+      <w:r>
+        <w:t xml:space="preserve">middleware folder </w:t>
+      </w:r>
+      <w:r>
+        <w:t xml:space="preserve">and inside that what we need to do </w:t>
+      </w:r>
+      <w:r>
+        <w:t xml:space="preserve">you need to export a function inside a file </w:t>
+      </w:r>
+      <w:r>
+        <w:t>that will do all the connection work</w:t>
+      </w:r>
+    </w:p>
+    <w:p>
+      <w:pPr>
+        <w:pStyle w:val="ListParagraph"/>
+        <w:numPr>
+          <w:ilvl w:val="0"/>
+          <w:numId w:val="2"/>
+        </w:numPr>
+      </w:pPr>
+      <w:r>
+        <w:t xml:space="preserve">We can </w:t>
+      </w:r>
+      <w:r>
+        <w:t>make</w:t>
+      </w:r>
+      <w:r>
+        <w:t xml:space="preserve"> environment variable by </w:t>
+      </w:r>
+      <w:proofErr w:type="gramStart"/>
+      <w:r>
+        <w:t xml:space="preserve">making </w:t>
+      </w:r>
+      <w:r>
+        <w:t>.</w:t>
+      </w:r>
+      <w:proofErr w:type="spellStart"/>
+      <w:r>
+        <w:t>env</w:t>
+      </w:r>
+      <w:proofErr w:type="gramEnd"/>
+      <w:r>
+        <w:t>.local</w:t>
+      </w:r>
+      <w:proofErr w:type="spellEnd"/>
+      <w:r>
+        <w:t xml:space="preserve"> </w:t>
+      </w:r>
+      <w:r>
+        <w:t xml:space="preserve">file </w:t>
+      </w:r>
+      <w:r>
+        <w:t>and make a variable here</w:t>
+      </w:r>
+      <w:r>
+        <w:t xml:space="preserve"> and you can get it in our maybe server </w:t>
+      </w:r>
+      <w:r>
+        <w:t xml:space="preserve">side by using </w:t>
+      </w:r>
+      <w:proofErr w:type="spellStart"/>
+      <w:r>
+        <w:t>process.env</w:t>
+      </w:r>
+      <w:proofErr w:type="spellEnd"/>
+    </w:p>
+    <w:p>
+      <w:pPr>
+        <w:pStyle w:val="ListParagraph"/>
+        <w:numPr>
+          <w:ilvl w:val="0"/>
+          <w:numId w:val="2"/>
+        </w:numPr>
+      </w:pPr>
+      <w:r>
+        <w:t xml:space="preserve">We need a connection string to connect to </w:t>
+      </w:r>
+      <w:proofErr w:type="spellStart"/>
+      <w:proofErr w:type="gramStart"/>
+      <w:r>
+        <w:t>mongodb</w:t>
+      </w:r>
+      <w:proofErr w:type="spellEnd"/>
+      <w:r>
+        <w:t xml:space="preserve"> </w:t>
+      </w:r>
+      <w:r>
+        <w:t xml:space="preserve"> and</w:t>
+      </w:r>
+      <w:proofErr w:type="gramEnd"/>
+      <w:r>
+        <w:t xml:space="preserve"> we can get for </w:t>
+      </w:r>
+      <w:proofErr w:type="spellStart"/>
+      <w:r>
+        <w:t>mongodb</w:t>
+      </w:r>
+      <w:proofErr w:type="spellEnd"/>
+      <w:r>
+        <w:t xml:space="preserve"> compass by opening </w:t>
+      </w:r>
+      <w:proofErr w:type="spellStart"/>
+      <w:r>
+        <w:t>mongodb</w:t>
+      </w:r>
+      <w:proofErr w:type="spellEnd"/>
+      <w:r>
+        <w:t xml:space="preserve"> compass and then click on three </w:t>
+      </w:r>
+      <w:proofErr w:type="gramStart"/>
+      <w:r>
+        <w:t>dot</w:t>
+      </w:r>
+      <w:proofErr w:type="gramEnd"/>
+      <w:r>
+        <w:t xml:space="preserve"> </w:t>
+      </w:r>
+      <w:r>
+        <w:t>as</w:t>
+      </w:r>
+      <w:r>
+        <w:t xml:space="preserve"> marked </w:t>
+      </w:r>
+      <w:proofErr w:type="gramStart"/>
+      <w:r>
+        <w:t>below</w:t>
+      </w:r>
+      <w:r>
+        <w:t>(</w:t>
+      </w:r>
+      <w:proofErr w:type="gramEnd"/>
+      <w:r>
+        <w:t xml:space="preserve">not </w:t>
+      </w:r>
+      <w:proofErr w:type="spellStart"/>
+      <w:r>
+        <w:t>visiblie</w:t>
+      </w:r>
+      <w:proofErr w:type="spellEnd"/>
+      <w:r>
+        <w:t xml:space="preserve"> because of not hover)</w:t>
+      </w:r>
+    </w:p>
+    <w:p>
+      <w:pPr>
+        <w:pStyle w:val="ListParagraph"/>
+      </w:pPr>
+      <w:r>
+        <w:rPr>
+          <w:noProof/>
+        </w:rPr>
+        <w:drawing>
+          <wp:inline distT="0" distB="0" distL="0" distR="0" wp14:anchorId="08BF8D9A" wp14:editId="4BA2DEC9">
+            <wp:extent cx="5731510" cy="3772535"/>
+            <wp:effectExtent l="0" t="0" r="2540" b="0"/>
+            <wp:docPr id="632887990" name="Picture 1"/>
+            <wp:cNvGraphicFramePr>
+              <a:graphicFrameLocks xmlns:a="http://schemas.openxmlformats.org/drawingml/2006/main" noChangeAspect="1"/>
+            </wp:cNvGraphicFramePr>
+            <a:graphic xmlns:a="http://schemas.openxmlformats.org/drawingml/2006/main">
+              <a:graphicData uri="http://schemas.openxmlformats.org/drawingml/2006/picture">
+                <pic:pic xmlns:pic="http://schemas.openxmlformats.org/drawingml/2006/picture">
+                  <pic:nvPicPr>
+                    <pic:cNvPr id="632887990" name=""/>
+                    <pic:cNvPicPr/>
+                  </pic:nvPicPr>
+                  <pic:blipFill>
+                    <a:blip r:embed="rId34"/>
+                    <a:stretch>
+                      <a:fillRect/>
+                    </a:stretch>
+                  </pic:blipFill>
+                  <pic:spPr>
+                    <a:xfrm>
+                      <a:off x="0" y="0"/>
+                      <a:ext cx="5731510" cy="3772535"/>
+                    </a:xfrm>
+                    <a:prstGeom prst="rect">
+                      <a:avLst/>
+                    </a:prstGeom>
+                  </pic:spPr>
+                </pic:pic>
+              </a:graphicData>
+            </a:graphic>
+          </wp:inline>
+        </w:drawing>
+      </w:r>
+    </w:p>
+    <w:p>
+      <w:pPr>
+        <w:pStyle w:val="ListParagraph"/>
+      </w:pPr>
+      <w:r>
+        <w:t xml:space="preserve">And then </w:t>
+      </w:r>
+      <w:r>
+        <w:t>go to Edit connection</w:t>
+      </w:r>
+      <w:r>
+        <w:t xml:space="preserve"> to get </w:t>
+      </w:r>
+      <w:r>
+        <w:t xml:space="preserve">the connection string and we will store it </w:t>
+      </w:r>
+      <w:proofErr w:type="gramStart"/>
+      <w:r>
+        <w:t>inside .</w:t>
+      </w:r>
+      <w:proofErr w:type="spellStart"/>
+      <w:r>
+        <w:t>env</w:t>
+      </w:r>
+      <w:proofErr w:type="gramEnd"/>
+      <w:r>
+        <w:t>.local</w:t>
+      </w:r>
+      <w:proofErr w:type="spellEnd"/>
+      <w:r>
+        <w:t xml:space="preserve"> file.</w:t>
+      </w:r>
+    </w:p>
+    <w:p>
+      <w:pPr>
+        <w:rPr>
+          <w:b/>
+          <w:bCs/>
+        </w:rPr>
+      </w:pPr>
+      <w:proofErr w:type="gramStart"/>
+      <w:r>
+        <w:rPr>
+          <w:b/>
+          <w:bCs/>
+        </w:rPr>
+        <w:t>Note:-</w:t>
+      </w:r>
+      <w:proofErr w:type="gramEnd"/>
+    </w:p>
+    <w:p>
+      <w:pPr>
+        <w:pBdr>
+          <w:bottom w:val="single" w:sz="12" w:space="1" w:color="auto"/>
+        </w:pBdr>
+      </w:pPr>
+      <w:r>
+        <w:t>I</w:t>
+      </w:r>
+      <w:r>
+        <w:t>n</w:t>
+      </w:r>
+      <w:r>
+        <w:t xml:space="preserve"> modern </w:t>
+      </w:r>
+      <w:proofErr w:type="spellStart"/>
+      <w:r>
+        <w:t>Nextjs</w:t>
+      </w:r>
+      <w:proofErr w:type="spellEnd"/>
+      <w:r>
+        <w:t xml:space="preserve"> middleware cannot be used for database connectivity but you can use it </w:t>
+      </w:r>
+      <w:r>
+        <w:t>for auth</w:t>
+      </w:r>
+      <w:r>
+        <w:t>e</w:t>
+      </w:r>
+      <w:r>
+        <w:t xml:space="preserve">ntication and now edge runtime is used for middleware so there is a different syntax </w:t>
+      </w:r>
+      <w:r>
+        <w:t>t</w:t>
+      </w:r>
+      <w:r>
+        <w:t>here</w:t>
+      </w:r>
+      <w:r>
+        <w:t xml:space="preserve"> and for database connectivity we can use </w:t>
+      </w:r>
+      <w:r>
+        <w:t xml:space="preserve">helper function </w:t>
+      </w:r>
+      <w:r>
+        <w:t xml:space="preserve">for the purpose database connectivity </w:t>
+      </w:r>
+    </w:p>
+    <w:p>
+      <w:r>
+        <w:t xml:space="preserve">We will use our helper function </w:t>
+      </w:r>
+      <w:r>
+        <w:t>in ou</w:t>
+      </w:r>
+      <w:r>
+        <w:t>r</w:t>
+      </w:r>
+      <w:r>
+        <w:t xml:space="preserve"> add Product </w:t>
+      </w:r>
+      <w:r>
+        <w:t xml:space="preserve">and </w:t>
+      </w:r>
+      <w:proofErr w:type="spellStart"/>
+      <w:r>
+        <w:t>GetProduct</w:t>
+      </w:r>
+      <w:proofErr w:type="spellEnd"/>
+      <w:r>
+        <w:t xml:space="preserve"> API</w:t>
+      </w:r>
+      <w:r>
+        <w:t>.</w:t>
+      </w:r>
+    </w:p>
+    <w:p>
+      <w:pPr>
+        <w:rPr>
+          <w:b/>
+          <w:bCs/>
+        </w:rPr>
+      </w:pPr>
+      <w:proofErr w:type="gramStart"/>
+      <w:r>
+        <w:rPr>
+          <w:b/>
+          <w:bCs/>
+        </w:rPr>
+        <w:lastRenderedPageBreak/>
+        <w:t>Note:-</w:t>
+      </w:r>
+      <w:proofErr w:type="gramEnd"/>
+    </w:p>
+    <w:p>
+      <w:r>
+        <w:t xml:space="preserve">We have observed </w:t>
+      </w:r>
+      <w:r>
+        <w:t xml:space="preserve">that </w:t>
+      </w:r>
+      <w:r>
+        <w:t xml:space="preserve">when there is not data in </w:t>
+      </w:r>
+      <w:proofErr w:type="spellStart"/>
+      <w:proofErr w:type="gramStart"/>
+      <w:r>
+        <w:t>mon</w:t>
+      </w:r>
+      <w:r>
+        <w:t>godb</w:t>
+      </w:r>
+      <w:proofErr w:type="spellEnd"/>
+      <w:r>
+        <w:t xml:space="preserve"> </w:t>
+      </w:r>
+      <w:r>
+        <w:t xml:space="preserve"> and</w:t>
+      </w:r>
+      <w:proofErr w:type="gramEnd"/>
+      <w:r>
+        <w:t xml:space="preserve"> we use find </w:t>
+      </w:r>
+      <w:proofErr w:type="spellStart"/>
+      <w:r>
+        <w:t>ot</w:t>
+      </w:r>
+      <w:proofErr w:type="spellEnd"/>
+      <w:r>
+        <w:t xml:space="preserve"> any operation on modal </w:t>
+      </w:r>
+      <w:r>
+        <w:t xml:space="preserve">or maybe importing modal then it </w:t>
+      </w:r>
+      <w:proofErr w:type="gramStart"/>
+      <w:r>
+        <w:t>try</w:t>
+      </w:r>
+      <w:proofErr w:type="gramEnd"/>
+      <w:r>
+        <w:t xml:space="preserve"> to form </w:t>
+      </w:r>
+      <w:r>
+        <w:t xml:space="preserve">data again on </w:t>
+      </w:r>
+      <w:proofErr w:type="gramStart"/>
+      <w:r>
+        <w:t>database</w:t>
+      </w:r>
+      <w:r>
+        <w:t>(</w:t>
+      </w:r>
+      <w:proofErr w:type="gramEnd"/>
+      <w:r>
+        <w:t>who knows)</w:t>
+      </w:r>
+      <w:r>
+        <w:t>.</w:t>
+      </w:r>
+      <w:r>
+        <w:t xml:space="preserve"> to fix that in model file write </w:t>
+      </w:r>
+      <w:proofErr w:type="spellStart"/>
+      <w:proofErr w:type="gramStart"/>
+      <w:r>
+        <w:t>mongoose.models</w:t>
+      </w:r>
+      <w:proofErr w:type="spellEnd"/>
+      <w:proofErr w:type="gramEnd"/>
+      <w:r>
+        <w:t xml:space="preserve"> = {}</w:t>
+      </w:r>
+      <w:r>
+        <w:t xml:space="preserve"> </w:t>
+      </w:r>
+      <w:r>
+        <w:t xml:space="preserve">in each model do make sure you </w:t>
+      </w:r>
+      <w:proofErr w:type="spellStart"/>
+      <w:r>
+        <w:t>doi</w:t>
+      </w:r>
+      <w:proofErr w:type="spellEnd"/>
+      <w:r>
+        <w:t xml:space="preserve"> this.</w:t>
+      </w:r>
+    </w:p>
+    <w:p>
+      <w:r>
+        <w:t xml:space="preserve">Always add the </w:t>
+      </w:r>
+      <w:r>
+        <w:t xml:space="preserve">database in connection string </w:t>
+      </w:r>
+      <w:r>
+        <w:t>of</w:t>
+      </w:r>
+      <w:r>
+        <w:t xml:space="preserve"> m</w:t>
+      </w:r>
+      <w:r>
+        <w:t>ongo</w:t>
+      </w:r>
+      <w:r>
+        <w:t xml:space="preserve"> D</w:t>
+      </w:r>
+      <w:r>
+        <w:t>b.</w:t>
+      </w:r>
+    </w:p>
+    <w:p>
+      <w:r>
+        <w:t xml:space="preserve">We will make now </w:t>
+      </w:r>
+      <w:proofErr w:type="spellStart"/>
+      <w:r>
+        <w:t>updateProfuct</w:t>
+      </w:r>
+      <w:proofErr w:type="spellEnd"/>
+      <w:r>
+        <w:t xml:space="preserve"> </w:t>
+      </w:r>
+      <w:proofErr w:type="spellStart"/>
+      <w:r>
+        <w:t>api</w:t>
+      </w:r>
+      <w:proofErr w:type="spellEnd"/>
+      <w:r>
+        <w:t>.</w:t>
+      </w:r>
+    </w:p>
+    <w:p/>
     <w:sectPr>
       <w:pgSz w:w="11906" w:h="16838"/>
       <w:pgMar w:top="1440" w:right="1440" w:bottom="1440" w:left="1440" w:header="708" w:footer="708" w:gutter="0"/>
@@ -6110,8 +7329,124 @@
       </w:rPr>
     </w:lvl>
   </w:abstractNum>
+  <w:abstractNum w:abstractNumId="1" w15:restartNumberingAfterBreak="0">
+    <w:nsid w:val="3D133EE6"/>
+    <w:multiLevelType w:val="hybridMultilevel"/>
+    <w:tmpl w:val="711CB0CE"/>
+    <w:lvl w:ilvl="0" w:tplc="40090001">
+      <w:start w:val="1"/>
+      <w:numFmt w:val="bullet"/>
+      <w:lvlText w:val=""/>
+      <w:lvlJc w:val="left"/>
+      <w:pPr>
+        <w:ind w:left="720" w:hanging="360"/>
+      </w:pPr>
+      <w:rPr>
+        <w:rFonts w:ascii="Symbol" w:hAnsi="Symbol" w:hint="default"/>
+      </w:rPr>
+    </w:lvl>
+    <w:lvl w:ilvl="1" w:tplc="40090003" w:tentative="1">
+      <w:start w:val="1"/>
+      <w:numFmt w:val="bullet"/>
+      <w:lvlText w:val="o"/>
+      <w:lvlJc w:val="left"/>
+      <w:pPr>
+        <w:ind w:left="1440" w:hanging="360"/>
+      </w:pPr>
+      <w:rPr>
+        <w:rFonts w:ascii="Courier New" w:hAnsi="Courier New" w:cs="Courier New" w:hint="default"/>
+      </w:rPr>
+    </w:lvl>
+    <w:lvl w:ilvl="2" w:tplc="40090005" w:tentative="1">
+      <w:start w:val="1"/>
+      <w:numFmt w:val="bullet"/>
+      <w:lvlText w:val=""/>
+      <w:lvlJc w:val="left"/>
+      <w:pPr>
+        <w:ind w:left="2160" w:hanging="360"/>
+      </w:pPr>
+      <w:rPr>
+        <w:rFonts w:ascii="Wingdings" w:hAnsi="Wingdings" w:hint="default"/>
+      </w:rPr>
+    </w:lvl>
+    <w:lvl w:ilvl="3" w:tplc="40090001" w:tentative="1">
+      <w:start w:val="1"/>
+      <w:numFmt w:val="bullet"/>
+      <w:lvlText w:val=""/>
+      <w:lvlJc w:val="left"/>
+      <w:pPr>
+        <w:ind w:left="2880" w:hanging="360"/>
+      </w:pPr>
+      <w:rPr>
+        <w:rFonts w:ascii="Symbol" w:hAnsi="Symbol" w:hint="default"/>
+      </w:rPr>
+    </w:lvl>
+    <w:lvl w:ilvl="4" w:tplc="40090003" w:tentative="1">
+      <w:start w:val="1"/>
+      <w:numFmt w:val="bullet"/>
+      <w:lvlText w:val="o"/>
+      <w:lvlJc w:val="left"/>
+      <w:pPr>
+        <w:ind w:left="3600" w:hanging="360"/>
+      </w:pPr>
+      <w:rPr>
+        <w:rFonts w:ascii="Courier New" w:hAnsi="Courier New" w:cs="Courier New" w:hint="default"/>
+      </w:rPr>
+    </w:lvl>
+    <w:lvl w:ilvl="5" w:tplc="40090005" w:tentative="1">
+      <w:start w:val="1"/>
+      <w:numFmt w:val="bullet"/>
+      <w:lvlText w:val=""/>
+      <w:lvlJc w:val="left"/>
+      <w:pPr>
+        <w:ind w:left="4320" w:hanging="360"/>
+      </w:pPr>
+      <w:rPr>
+        <w:rFonts w:ascii="Wingdings" w:hAnsi="Wingdings" w:hint="default"/>
+      </w:rPr>
+    </w:lvl>
+    <w:lvl w:ilvl="6" w:tplc="40090001" w:tentative="1">
+      <w:start w:val="1"/>
+      <w:numFmt w:val="bullet"/>
+      <w:lvlText w:val=""/>
+      <w:lvlJc w:val="left"/>
+      <w:pPr>
+        <w:ind w:left="5040" w:hanging="360"/>
+      </w:pPr>
+      <w:rPr>
+        <w:rFonts w:ascii="Symbol" w:hAnsi="Symbol" w:hint="default"/>
+      </w:rPr>
+    </w:lvl>
+    <w:lvl w:ilvl="7" w:tplc="40090003" w:tentative="1">
+      <w:start w:val="1"/>
+      <w:numFmt w:val="bullet"/>
+      <w:lvlText w:val="o"/>
+      <w:lvlJc w:val="left"/>
+      <w:pPr>
+        <w:ind w:left="5760" w:hanging="360"/>
+      </w:pPr>
+      <w:rPr>
+        <w:rFonts w:ascii="Courier New" w:hAnsi="Courier New" w:cs="Courier New" w:hint="default"/>
+      </w:rPr>
+    </w:lvl>
+    <w:lvl w:ilvl="8" w:tplc="40090005" w:tentative="1">
+      <w:start w:val="1"/>
+      <w:numFmt w:val="bullet"/>
+      <w:lvlText w:val=""/>
+      <w:lvlJc w:val="left"/>
+      <w:pPr>
+        <w:ind w:left="6480" w:hanging="360"/>
+      </w:pPr>
+      <w:rPr>
+        <w:rFonts w:ascii="Wingdings" w:hAnsi="Wingdings" w:hint="default"/>
+      </w:rPr>
+    </w:lvl>
+  </w:abstractNum>
   <w:num w:numId="1" w16cid:durableId="1371342816">
     <w:abstractNumId w:val="0"/>
+  </w:num>
+  <w:num w:numId="2" w16cid:durableId="1185511463">
+    <w:abstractNumId w:val="1"/>
   </w:num>
 </w:numbering>
 </file>
@@ -6719,6 +8054,7 @@
   <w:style w:type="character" w:default="1" w:styleId="DefaultParagraphFont">
     <w:name w:val="Default Paragraph Font"/>
     <w:uiPriority w:val="1"/>
+    <w:semiHidden/>
     <w:unhideWhenUsed/>
   </w:style>
   <w:style w:type="table" w:default="1" w:styleId="TableNormal">

</xml_diff>

<commit_message>
Lesson 48 Displaying Tshirts on Codeswear.com
</commit_message>
<xml_diff>
--- a/Notes2.docx
+++ b/Notes2.docx
@@ -7167,6 +7167,496 @@
         <w:t>.</w:t>
       </w:r>
     </w:p>
+    <w:p>
+      <w:pPr>
+        <w:pBdr>
+          <w:bottom w:val="single" w:sz="12" w:space="1" w:color="auto"/>
+        </w:pBdr>
+      </w:pPr>
+      <w:r>
+        <w:t xml:space="preserve"> </w:t>
+      </w:r>
+      <w:r>
+        <w:t xml:space="preserve">In older version the server side used to send HTML as well as data so that client side can </w:t>
+      </w:r>
+      <w:r>
+        <w:t xml:space="preserve">add handler to the  html but now the game is changed </w:t>
+      </w:r>
+      <w:r>
+        <w:t xml:space="preserve">sever side component do all the work of mapping and generating html but in older version when data was end to the browser we need to make </w:t>
+      </w:r>
+      <w:proofErr w:type="spellStart"/>
+      <w:r>
+        <w:t>oit</w:t>
+      </w:r>
+      <w:proofErr w:type="spellEnd"/>
+      <w:r>
+        <w:t xml:space="preserve"> </w:t>
+      </w:r>
+      <w:proofErr w:type="spellStart"/>
+      <w:r>
+        <w:t>pardable</w:t>
+      </w:r>
+      <w:proofErr w:type="spellEnd"/>
+      <w:r>
+        <w:t xml:space="preserve"> we did it by </w:t>
+      </w:r>
+      <w:proofErr w:type="spellStart"/>
+      <w:r>
+        <w:t>JSON.parse</w:t>
+      </w:r>
+      <w:proofErr w:type="spellEnd"/>
+      <w:r>
+        <w:t>(</w:t>
+      </w:r>
+      <w:proofErr w:type="spellStart"/>
+      <w:r>
+        <w:t>JSON.stringify</w:t>
+      </w:r>
+      <w:proofErr w:type="spellEnd"/>
+      <w:r>
+        <w:t>(</w:t>
+      </w:r>
+      <w:r>
+        <w:t>&lt;object&gt;</w:t>
+      </w:r>
+      <w:r>
+        <w:t>))</w:t>
+      </w:r>
+    </w:p>
+    <w:p>
+      <w:r>
+        <w:t>Lesson 48 error could not solve 7:40</w:t>
+      </w:r>
+      <w:r>
+        <w:t>(who knows)</w:t>
+      </w:r>
+    </w:p>
+    <w:p>
+      <w:r>
+        <w:t xml:space="preserve">what is </w:t>
+      </w:r>
+      <w:proofErr w:type="spellStart"/>
+      <w:r>
+        <w:t>passHref</w:t>
+      </w:r>
+      <w:proofErr w:type="spellEnd"/>
+      <w:r>
+        <w:t xml:space="preserve"> in simple words</w:t>
+      </w:r>
+    </w:p>
+    <w:p>
+      <w:pPr>
+        <w:rPr>
+          <w:b/>
+          <w:bCs/>
+        </w:rPr>
+      </w:pPr>
+      <w:r>
+        <w:rPr>
+          <w:rFonts w:ascii="Segoe UI Emoji" w:hAnsi="Segoe UI Emoji" w:cs="Segoe UI Emoji"/>
+          <w:b/>
+          <w:bCs/>
+        </w:rPr>
+        <w:t>🧠</w:t>
+      </w:r>
+      <w:r>
+        <w:rPr>
+          <w:b/>
+          <w:bCs/>
+        </w:rPr>
+        <w:t xml:space="preserve"> </w:t>
+      </w:r>
+      <w:proofErr w:type="spellStart"/>
+      <w:r>
+        <w:rPr>
+          <w:b/>
+          <w:bCs/>
+        </w:rPr>
+        <w:t>passHref</w:t>
+      </w:r>
+      <w:proofErr w:type="spellEnd"/>
+      <w:r>
+        <w:rPr>
+          <w:b/>
+          <w:bCs/>
+        </w:rPr>
+        <w:t xml:space="preserve"> (simple explanation)</w:t>
+      </w:r>
+    </w:p>
+    <w:p>
+      <w:proofErr w:type="spellStart"/>
+      <w:r>
+        <w:rPr>
+          <w:b/>
+          <w:bCs/>
+        </w:rPr>
+        <w:t>passHref</w:t>
+      </w:r>
+      <w:proofErr w:type="spellEnd"/>
+      <w:r>
+        <w:rPr>
+          <w:b/>
+          <w:bCs/>
+        </w:rPr>
+        <w:t xml:space="preserve"> tells &lt;Link&gt; to pass the </w:t>
+      </w:r>
+      <w:proofErr w:type="spellStart"/>
+      <w:r>
+        <w:rPr>
+          <w:b/>
+          <w:bCs/>
+        </w:rPr>
+        <w:t>href</w:t>
+      </w:r>
+      <w:proofErr w:type="spellEnd"/>
+      <w:r>
+        <w:rPr>
+          <w:b/>
+          <w:bCs/>
+        </w:rPr>
+        <w:t xml:space="preserve"> to its child element (like &lt;a&gt;)</w:t>
+      </w:r>
+    </w:p>
+    <w:p>
+      <w:r>
+        <w:pict w14:anchorId="6C426FFD">
+          <v:rect id="_x0000_i1031" style="width:0;height:1.5pt" o:hralign="center" o:hrstd="t" o:hr="t" fillcolor="#a0a0a0" stroked="f"/>
+        </w:pict>
+      </w:r>
+    </w:p>
+    <w:p>
+      <w:pPr>
+        <w:rPr>
+          <w:b/>
+          <w:bCs/>
+        </w:rPr>
+      </w:pPr>
+      <w:r>
+        <w:rPr>
+          <w:rFonts w:ascii="Segoe UI Emoji" w:hAnsi="Segoe UI Emoji" w:cs="Segoe UI Emoji"/>
+          <w:b/>
+          <w:bCs/>
+        </w:rPr>
+        <w:t>🔍</w:t>
+      </w:r>
+      <w:r>
+        <w:rPr>
+          <w:b/>
+          <w:bCs/>
+        </w:rPr>
+        <w:t xml:space="preserve"> Why it was needed</w:t>
+      </w:r>
+    </w:p>
+    <w:p>
+      <w:r>
+        <w:t xml:space="preserve">In </w:t>
+      </w:r>
+      <w:r>
+        <w:rPr>
+          <w:b/>
+          <w:bCs/>
+        </w:rPr>
+        <w:t>older Next.js</w:t>
+      </w:r>
+      <w:r>
+        <w:t>, this code:</w:t>
+      </w:r>
+    </w:p>
+    <w:p>
+      <w:r>
+        <w:t xml:space="preserve">&lt;Link </w:t>
+      </w:r>
+      <w:proofErr w:type="spellStart"/>
+      <w:r>
+        <w:t>href</w:t>
+      </w:r>
+      <w:proofErr w:type="spellEnd"/>
+      <w:r>
+        <w:t>="/login"&gt;</w:t>
+      </w:r>
+      <w:r>
+        <w:br/>
+        <w:t xml:space="preserve">  &lt;a&gt;Login&lt;/a&gt;</w:t>
+      </w:r>
+      <w:r>
+        <w:br/>
+        <w:t>&lt;/Link&gt;</w:t>
+      </w:r>
+    </w:p>
+    <w:p>
+      <w:r>
+        <w:rPr>
+          <w:rFonts w:ascii="Segoe UI Emoji" w:hAnsi="Segoe UI Emoji" w:cs="Segoe UI Emoji"/>
+        </w:rPr>
+        <w:t>👉</w:t>
+      </w:r>
+      <w:r>
+        <w:t xml:space="preserve"> sometimes the &lt;a&gt; did </w:t>
+      </w:r>
+      <w:r>
+        <w:rPr>
+          <w:b/>
+          <w:bCs/>
+        </w:rPr>
+        <w:t xml:space="preserve">not automatically get </w:t>
+      </w:r>
+      <w:proofErr w:type="spellStart"/>
+      <w:r>
+        <w:rPr>
+          <w:b/>
+          <w:bCs/>
+        </w:rPr>
+        <w:t>href</w:t>
+      </w:r>
+      <w:proofErr w:type="spellEnd"/>
+    </w:p>
+    <w:p>
+      <w:proofErr w:type="gramStart"/>
+      <w:r>
+        <w:t>So</w:t>
+      </w:r>
+      <w:proofErr w:type="gramEnd"/>
+      <w:r>
+        <w:t xml:space="preserve"> we used:</w:t>
+      </w:r>
+    </w:p>
+    <w:p>
+      <w:r>
+        <w:t xml:space="preserve">&lt;Link </w:t>
+      </w:r>
+      <w:proofErr w:type="spellStart"/>
+      <w:r>
+        <w:t>href</w:t>
+      </w:r>
+      <w:proofErr w:type="spellEnd"/>
+      <w:r>
+        <w:t xml:space="preserve">="/login" </w:t>
+      </w:r>
+      <w:proofErr w:type="spellStart"/>
+      <w:r>
+        <w:t>passHref</w:t>
+      </w:r>
+      <w:proofErr w:type="spellEnd"/>
+      <w:r>
+        <w:t>&gt;</w:t>
+      </w:r>
+      <w:r>
+        <w:br/>
+        <w:t xml:space="preserve">  &lt;a&gt;Login&lt;/a&gt;</w:t>
+      </w:r>
+      <w:r>
+        <w:br/>
+        <w:t>&lt;/Link&gt;</w:t>
+      </w:r>
+    </w:p>
+    <w:p>
+      <w:r>
+        <w:rPr>
+          <w:rFonts w:ascii="Segoe UI Symbol" w:hAnsi="Segoe UI Symbol" w:cs="Segoe UI Symbol"/>
+        </w:rPr>
+        <w:t>✔</w:t>
+      </w:r>
+      <w:r>
+        <w:t xml:space="preserve"> Now &lt;a&gt; properly gets:</w:t>
+      </w:r>
+    </w:p>
+    <w:p>
+      <w:r>
+        <w:t xml:space="preserve">&lt;a </w:t>
+      </w:r>
+      <w:proofErr w:type="spellStart"/>
+      <w:r>
+        <w:t>href</w:t>
+      </w:r>
+      <w:proofErr w:type="spellEnd"/>
+      <w:r>
+        <w:t>="/login"&gt;Login&lt;/a&gt;</w:t>
+      </w:r>
+    </w:p>
+    <w:p>
+      <w:r>
+        <w:pict w14:anchorId="4BCF40EF">
+          <v:rect id="_x0000_i1032" style="width:0;height:1.5pt" o:hralign="center" o:hrstd="t" o:hr="t" fillcolor="#a0a0a0" stroked="f"/>
+        </w:pict>
+      </w:r>
+    </w:p>
+    <w:p>
+      <w:pPr>
+        <w:rPr>
+          <w:b/>
+          <w:bCs/>
+        </w:rPr>
+      </w:pPr>
+      <w:r>
+        <w:rPr>
+          <w:rFonts w:ascii="Segoe UI Emoji" w:hAnsi="Segoe UI Emoji" w:cs="Segoe UI Emoji"/>
+          <w:b/>
+          <w:bCs/>
+        </w:rPr>
+        <w:t>🧠</w:t>
+      </w:r>
+      <w:r>
+        <w:rPr>
+          <w:b/>
+          <w:bCs/>
+        </w:rPr>
+        <w:t xml:space="preserve"> Super simple analogy</w:t>
+      </w:r>
+    </w:p>
+    <w:p>
+      <w:pPr>
+        <w:numPr>
+          <w:ilvl w:val="0"/>
+          <w:numId w:val="3"/>
+        </w:numPr>
+      </w:pPr>
+      <w:r>
+        <w:t xml:space="preserve">&lt;Link&gt; = messenger </w:t>
+      </w:r>
+    </w:p>
+    <w:p>
+      <w:pPr>
+        <w:numPr>
+          <w:ilvl w:val="0"/>
+          <w:numId w:val="3"/>
+        </w:numPr>
+      </w:pPr>
+      <w:r>
+        <w:t xml:space="preserve">&lt;a&gt; = receiver </w:t>
+      </w:r>
+    </w:p>
+    <w:p>
+      <w:pPr>
+        <w:numPr>
+          <w:ilvl w:val="0"/>
+          <w:numId w:val="3"/>
+        </w:numPr>
+      </w:pPr>
+      <w:proofErr w:type="spellStart"/>
+      <w:r>
+        <w:t>passHref</w:t>
+      </w:r>
+      <w:proofErr w:type="spellEnd"/>
+      <w:r>
+        <w:t xml:space="preserve"> = “give the link to the receiver” </w:t>
+      </w:r>
+    </w:p>
+    <w:p>
+      <w:r>
+        <w:pict w14:anchorId="68FAECC2">
+          <v:rect id="_x0000_i1033" style="width:0;height:1.5pt" o:hralign="center" o:hrstd="t" o:hr="t" fillcolor="#a0a0a0" stroked="f"/>
+        </w:pict>
+      </w:r>
+    </w:p>
+    <w:p>
+      <w:pPr>
+        <w:rPr>
+          <w:b/>
+          <w:bCs/>
+        </w:rPr>
+      </w:pPr>
+      <w:r>
+        <w:rPr>
+          <w:rFonts w:ascii="Segoe UI Emoji" w:hAnsi="Segoe UI Emoji" w:cs="Segoe UI Emoji"/>
+          <w:b/>
+          <w:bCs/>
+        </w:rPr>
+        <w:t>⚠️</w:t>
+      </w:r>
+      <w:r>
+        <w:rPr>
+          <w:b/>
+          <w:bCs/>
+        </w:rPr>
+        <w:t xml:space="preserve"> Modern Next.js</w:t>
+      </w:r>
+    </w:p>
+    <w:p>
+      <w:r>
+        <w:lastRenderedPageBreak/>
+        <w:t>In modern **Next.js:</w:t>
+      </w:r>
+    </w:p>
+    <w:p>
+      <w:r>
+        <w:rPr>
+          <w:rFonts w:ascii="Segoe UI Emoji" w:hAnsi="Segoe UI Emoji" w:cs="Segoe UI Emoji"/>
+        </w:rPr>
+        <w:t>👉</w:t>
+      </w:r>
+      <w:r>
+        <w:t xml:space="preserve"> You don’t need </w:t>
+      </w:r>
+      <w:proofErr w:type="spellStart"/>
+      <w:r>
+        <w:t>passHref</w:t>
+      </w:r>
+      <w:proofErr w:type="spellEnd"/>
+      <w:r>
+        <w:t xml:space="preserve"> anymore</w:t>
+      </w:r>
+      <w:r>
+        <w:br/>
+      </w:r>
+      <w:r>
+        <w:rPr>
+          <w:rFonts w:ascii="Segoe UI Emoji" w:hAnsi="Segoe UI Emoji" w:cs="Segoe UI Emoji"/>
+        </w:rPr>
+        <w:t>👉</w:t>
+      </w:r>
+      <w:r>
+        <w:t xml:space="preserve"> Because &lt;Link&gt; handles everything itself</w:t>
+      </w:r>
+    </w:p>
+    <w:p>
+      <w:r>
+        <w:pict w14:anchorId="7D59C9CE">
+          <v:rect id="_x0000_i1034" style="width:0;height:1.5pt" o:hralign="center" o:hrstd="t" o:hr="t" fillcolor="#a0a0a0" stroked="f"/>
+        </w:pict>
+      </w:r>
+    </w:p>
+    <w:p>
+      <w:pPr>
+        <w:rPr>
+          <w:b/>
+          <w:bCs/>
+        </w:rPr>
+      </w:pPr>
+      <w:r>
+        <w:rPr>
+          <w:rFonts w:ascii="Segoe UI Emoji" w:hAnsi="Segoe UI Emoji" w:cs="Segoe UI Emoji"/>
+          <w:b/>
+          <w:bCs/>
+        </w:rPr>
+        <w:t>🎯</w:t>
+      </w:r>
+      <w:r>
+        <w:rPr>
+          <w:b/>
+          <w:bCs/>
+        </w:rPr>
+        <w:t xml:space="preserve"> One-line answer</w:t>
+      </w:r>
+    </w:p>
+    <w:p>
+      <w:proofErr w:type="spellStart"/>
+      <w:r>
+        <w:t>passHref</w:t>
+      </w:r>
+      <w:proofErr w:type="spellEnd"/>
+      <w:r>
+        <w:t xml:space="preserve"> ensures the child element (like &lt;a&gt;) actually receives the link (</w:t>
+      </w:r>
+      <w:proofErr w:type="spellStart"/>
+      <w:r>
+        <w:t>href</w:t>
+      </w:r>
+      <w:proofErr w:type="spellEnd"/>
+      <w:r>
+        <w:t>).</w:t>
+      </w:r>
+    </w:p>
     <w:p/>
     <w:sectPr>
       <w:pgSz w:w="11906" w:h="16838"/>
@@ -7330,9 +7820,9 @@
     </w:lvl>
   </w:abstractNum>
   <w:abstractNum w:abstractNumId="1" w15:restartNumberingAfterBreak="0">
-    <w:nsid w:val="3D133EE6"/>
+    <w:nsid w:val="3A452315"/>
     <w:multiLevelType w:val="hybridMultilevel"/>
-    <w:tmpl w:val="711CB0CE"/>
+    <w:tmpl w:val="3B2A1252"/>
     <w:lvl w:ilvl="0" w:tplc="40090001">
       <w:start w:val="1"/>
       <w:numFmt w:val="bullet"/>
@@ -7442,10 +7932,278 @@
       </w:rPr>
     </w:lvl>
   </w:abstractNum>
+  <w:abstractNum w:abstractNumId="2" w15:restartNumberingAfterBreak="0">
+    <w:nsid w:val="3D133EE6"/>
+    <w:multiLevelType w:val="hybridMultilevel"/>
+    <w:tmpl w:val="711CB0CE"/>
+    <w:lvl w:ilvl="0" w:tplc="40090001">
+      <w:start w:val="1"/>
+      <w:numFmt w:val="bullet"/>
+      <w:lvlText w:val=""/>
+      <w:lvlJc w:val="left"/>
+      <w:pPr>
+        <w:ind w:left="720" w:hanging="360"/>
+      </w:pPr>
+      <w:rPr>
+        <w:rFonts w:ascii="Symbol" w:hAnsi="Symbol" w:hint="default"/>
+      </w:rPr>
+    </w:lvl>
+    <w:lvl w:ilvl="1" w:tplc="40090003" w:tentative="1">
+      <w:start w:val="1"/>
+      <w:numFmt w:val="bullet"/>
+      <w:lvlText w:val="o"/>
+      <w:lvlJc w:val="left"/>
+      <w:pPr>
+        <w:ind w:left="1440" w:hanging="360"/>
+      </w:pPr>
+      <w:rPr>
+        <w:rFonts w:ascii="Courier New" w:hAnsi="Courier New" w:cs="Courier New" w:hint="default"/>
+      </w:rPr>
+    </w:lvl>
+    <w:lvl w:ilvl="2" w:tplc="40090005" w:tentative="1">
+      <w:start w:val="1"/>
+      <w:numFmt w:val="bullet"/>
+      <w:lvlText w:val=""/>
+      <w:lvlJc w:val="left"/>
+      <w:pPr>
+        <w:ind w:left="2160" w:hanging="360"/>
+      </w:pPr>
+      <w:rPr>
+        <w:rFonts w:ascii="Wingdings" w:hAnsi="Wingdings" w:hint="default"/>
+      </w:rPr>
+    </w:lvl>
+    <w:lvl w:ilvl="3" w:tplc="40090001" w:tentative="1">
+      <w:start w:val="1"/>
+      <w:numFmt w:val="bullet"/>
+      <w:lvlText w:val=""/>
+      <w:lvlJc w:val="left"/>
+      <w:pPr>
+        <w:ind w:left="2880" w:hanging="360"/>
+      </w:pPr>
+      <w:rPr>
+        <w:rFonts w:ascii="Symbol" w:hAnsi="Symbol" w:hint="default"/>
+      </w:rPr>
+    </w:lvl>
+    <w:lvl w:ilvl="4" w:tplc="40090003" w:tentative="1">
+      <w:start w:val="1"/>
+      <w:numFmt w:val="bullet"/>
+      <w:lvlText w:val="o"/>
+      <w:lvlJc w:val="left"/>
+      <w:pPr>
+        <w:ind w:left="3600" w:hanging="360"/>
+      </w:pPr>
+      <w:rPr>
+        <w:rFonts w:ascii="Courier New" w:hAnsi="Courier New" w:cs="Courier New" w:hint="default"/>
+      </w:rPr>
+    </w:lvl>
+    <w:lvl w:ilvl="5" w:tplc="40090005" w:tentative="1">
+      <w:start w:val="1"/>
+      <w:numFmt w:val="bullet"/>
+      <w:lvlText w:val=""/>
+      <w:lvlJc w:val="left"/>
+      <w:pPr>
+        <w:ind w:left="4320" w:hanging="360"/>
+      </w:pPr>
+      <w:rPr>
+        <w:rFonts w:ascii="Wingdings" w:hAnsi="Wingdings" w:hint="default"/>
+      </w:rPr>
+    </w:lvl>
+    <w:lvl w:ilvl="6" w:tplc="40090001" w:tentative="1">
+      <w:start w:val="1"/>
+      <w:numFmt w:val="bullet"/>
+      <w:lvlText w:val=""/>
+      <w:lvlJc w:val="left"/>
+      <w:pPr>
+        <w:ind w:left="5040" w:hanging="360"/>
+      </w:pPr>
+      <w:rPr>
+        <w:rFonts w:ascii="Symbol" w:hAnsi="Symbol" w:hint="default"/>
+      </w:rPr>
+    </w:lvl>
+    <w:lvl w:ilvl="7" w:tplc="40090003" w:tentative="1">
+      <w:start w:val="1"/>
+      <w:numFmt w:val="bullet"/>
+      <w:lvlText w:val="o"/>
+      <w:lvlJc w:val="left"/>
+      <w:pPr>
+        <w:ind w:left="5760" w:hanging="360"/>
+      </w:pPr>
+      <w:rPr>
+        <w:rFonts w:ascii="Courier New" w:hAnsi="Courier New" w:cs="Courier New" w:hint="default"/>
+      </w:rPr>
+    </w:lvl>
+    <w:lvl w:ilvl="8" w:tplc="40090005" w:tentative="1">
+      <w:start w:val="1"/>
+      <w:numFmt w:val="bullet"/>
+      <w:lvlText w:val=""/>
+      <w:lvlJc w:val="left"/>
+      <w:pPr>
+        <w:ind w:left="6480" w:hanging="360"/>
+      </w:pPr>
+      <w:rPr>
+        <w:rFonts w:ascii="Wingdings" w:hAnsi="Wingdings" w:hint="default"/>
+      </w:rPr>
+    </w:lvl>
+  </w:abstractNum>
+  <w:abstractNum w:abstractNumId="3" w15:restartNumberingAfterBreak="0">
+    <w:nsid w:val="62E830E2"/>
+    <w:multiLevelType w:val="multilevel"/>
+    <w:tmpl w:val="11CAD314"/>
+    <w:lvl w:ilvl="0">
+      <w:start w:val="1"/>
+      <w:numFmt w:val="bullet"/>
+      <w:lvlText w:val=""/>
+      <w:lvlJc w:val="left"/>
+      <w:pPr>
+        <w:tabs>
+          <w:tab w:val="num" w:pos="720"/>
+        </w:tabs>
+        <w:ind w:left="720" w:hanging="360"/>
+      </w:pPr>
+      <w:rPr>
+        <w:rFonts w:ascii="Symbol" w:hAnsi="Symbol" w:hint="default"/>
+        <w:sz w:val="20"/>
+      </w:rPr>
+    </w:lvl>
+    <w:lvl w:ilvl="1" w:tentative="1">
+      <w:start w:val="1"/>
+      <w:numFmt w:val="bullet"/>
+      <w:lvlText w:val="o"/>
+      <w:lvlJc w:val="left"/>
+      <w:pPr>
+        <w:tabs>
+          <w:tab w:val="num" w:pos="1440"/>
+        </w:tabs>
+        <w:ind w:left="1440" w:hanging="360"/>
+      </w:pPr>
+      <w:rPr>
+        <w:rFonts w:ascii="Courier New" w:hAnsi="Courier New" w:hint="default"/>
+        <w:sz w:val="20"/>
+      </w:rPr>
+    </w:lvl>
+    <w:lvl w:ilvl="2" w:tentative="1">
+      <w:start w:val="1"/>
+      <w:numFmt w:val="bullet"/>
+      <w:lvlText w:val=""/>
+      <w:lvlJc w:val="left"/>
+      <w:pPr>
+        <w:tabs>
+          <w:tab w:val="num" w:pos="2160"/>
+        </w:tabs>
+        <w:ind w:left="2160" w:hanging="360"/>
+      </w:pPr>
+      <w:rPr>
+        <w:rFonts w:ascii="Wingdings" w:hAnsi="Wingdings" w:hint="default"/>
+        <w:sz w:val="20"/>
+      </w:rPr>
+    </w:lvl>
+    <w:lvl w:ilvl="3" w:tentative="1">
+      <w:start w:val="1"/>
+      <w:numFmt w:val="bullet"/>
+      <w:lvlText w:val=""/>
+      <w:lvlJc w:val="left"/>
+      <w:pPr>
+        <w:tabs>
+          <w:tab w:val="num" w:pos="2880"/>
+        </w:tabs>
+        <w:ind w:left="2880" w:hanging="360"/>
+      </w:pPr>
+      <w:rPr>
+        <w:rFonts w:ascii="Wingdings" w:hAnsi="Wingdings" w:hint="default"/>
+        <w:sz w:val="20"/>
+      </w:rPr>
+    </w:lvl>
+    <w:lvl w:ilvl="4" w:tentative="1">
+      <w:start w:val="1"/>
+      <w:numFmt w:val="bullet"/>
+      <w:lvlText w:val=""/>
+      <w:lvlJc w:val="left"/>
+      <w:pPr>
+        <w:tabs>
+          <w:tab w:val="num" w:pos="3600"/>
+        </w:tabs>
+        <w:ind w:left="3600" w:hanging="360"/>
+      </w:pPr>
+      <w:rPr>
+        <w:rFonts w:ascii="Wingdings" w:hAnsi="Wingdings" w:hint="default"/>
+        <w:sz w:val="20"/>
+      </w:rPr>
+    </w:lvl>
+    <w:lvl w:ilvl="5" w:tentative="1">
+      <w:start w:val="1"/>
+      <w:numFmt w:val="bullet"/>
+      <w:lvlText w:val=""/>
+      <w:lvlJc w:val="left"/>
+      <w:pPr>
+        <w:tabs>
+          <w:tab w:val="num" w:pos="4320"/>
+        </w:tabs>
+        <w:ind w:left="4320" w:hanging="360"/>
+      </w:pPr>
+      <w:rPr>
+        <w:rFonts w:ascii="Wingdings" w:hAnsi="Wingdings" w:hint="default"/>
+        <w:sz w:val="20"/>
+      </w:rPr>
+    </w:lvl>
+    <w:lvl w:ilvl="6" w:tentative="1">
+      <w:start w:val="1"/>
+      <w:numFmt w:val="bullet"/>
+      <w:lvlText w:val=""/>
+      <w:lvlJc w:val="left"/>
+      <w:pPr>
+        <w:tabs>
+          <w:tab w:val="num" w:pos="5040"/>
+        </w:tabs>
+        <w:ind w:left="5040" w:hanging="360"/>
+      </w:pPr>
+      <w:rPr>
+        <w:rFonts w:ascii="Wingdings" w:hAnsi="Wingdings" w:hint="default"/>
+        <w:sz w:val="20"/>
+      </w:rPr>
+    </w:lvl>
+    <w:lvl w:ilvl="7" w:tentative="1">
+      <w:start w:val="1"/>
+      <w:numFmt w:val="bullet"/>
+      <w:lvlText w:val=""/>
+      <w:lvlJc w:val="left"/>
+      <w:pPr>
+        <w:tabs>
+          <w:tab w:val="num" w:pos="5760"/>
+        </w:tabs>
+        <w:ind w:left="5760" w:hanging="360"/>
+      </w:pPr>
+      <w:rPr>
+        <w:rFonts w:ascii="Wingdings" w:hAnsi="Wingdings" w:hint="default"/>
+        <w:sz w:val="20"/>
+      </w:rPr>
+    </w:lvl>
+    <w:lvl w:ilvl="8" w:tentative="1">
+      <w:start w:val="1"/>
+      <w:numFmt w:val="bullet"/>
+      <w:lvlText w:val=""/>
+      <w:lvlJc w:val="left"/>
+      <w:pPr>
+        <w:tabs>
+          <w:tab w:val="num" w:pos="6480"/>
+        </w:tabs>
+        <w:ind w:left="6480" w:hanging="360"/>
+      </w:pPr>
+      <w:rPr>
+        <w:rFonts w:ascii="Wingdings" w:hAnsi="Wingdings" w:hint="default"/>
+        <w:sz w:val="20"/>
+      </w:rPr>
+    </w:lvl>
+  </w:abstractNum>
   <w:num w:numId="1" w16cid:durableId="1371342816">
     <w:abstractNumId w:val="0"/>
   </w:num>
   <w:num w:numId="2" w16cid:durableId="1185511463">
+    <w:abstractNumId w:val="2"/>
+  </w:num>
+  <w:num w:numId="3" w16cid:durableId="725378917">
+    <w:abstractNumId w:val="3"/>
+  </w:num>
+  <w:num w:numId="4" w16cid:durableId="1651210289">
     <w:abstractNumId w:val="1"/>
   </w:num>
 </w:numbering>

</xml_diff>

<commit_message>
Lesson 49 Displaying Tshirt Variants on product page
</commit_message>
<xml_diff>
--- a/Notes2.docx
+++ b/Notes2.docx
@@ -984,14 +984,9 @@
     </w:p>
     <w:p>
       <w:r>
-        <w:t xml:space="preserve">export default function </w:t>
-      </w:r>
-      <w:proofErr w:type="gramStart"/>
-      <w:r>
-        <w:t>handler(</w:t>
-      </w:r>
-      <w:proofErr w:type="spellStart"/>
-      <w:proofErr w:type="gramEnd"/>
+        <w:t>export default function handler(</w:t>
+      </w:r>
+      <w:proofErr w:type="spellStart"/>
       <w:r>
         <w:t>req</w:t>
       </w:r>
@@ -1097,7 +1092,6 @@
         <w:t xml:space="preserve">Why </w:t>
       </w:r>
       <w:proofErr w:type="spellStart"/>
-      <w:proofErr w:type="gramStart"/>
       <w:r>
         <w:rPr>
           <w:b/>
@@ -1106,7 +1100,6 @@
         <w:t>res.json</w:t>
       </w:r>
       <w:proofErr w:type="spellEnd"/>
-      <w:proofErr w:type="gramEnd"/>
       <w:r>
         <w:rPr>
           <w:b/>
@@ -1138,25 +1131,18 @@
     </w:p>
     <w:p>
       <w:proofErr w:type="spellStart"/>
-      <w:proofErr w:type="gramStart"/>
       <w:r>
         <w:t>res.status</w:t>
       </w:r>
       <w:proofErr w:type="spellEnd"/>
-      <w:proofErr w:type="gramEnd"/>
-      <w:r>
-        <w:t>(200</w:t>
-      </w:r>
-      <w:proofErr w:type="gramStart"/>
-      <w:r>
-        <w:t>).</w:t>
+      <w:r>
+        <w:t>(200).</w:t>
       </w:r>
       <w:proofErr w:type="spellStart"/>
       <w:r>
         <w:t>json</w:t>
       </w:r>
       <w:proofErr w:type="spellEnd"/>
-      <w:proofErr w:type="gramEnd"/>
       <w:r>
         <w:t>(</w:t>
       </w:r>
@@ -1257,14 +1243,9 @@
     </w:p>
     <w:p>
       <w:r>
-        <w:t xml:space="preserve">export default function </w:t>
-      </w:r>
-      <w:proofErr w:type="gramStart"/>
-      <w:r>
-        <w:t>handler(</w:t>
-      </w:r>
-      <w:proofErr w:type="spellStart"/>
-      <w:proofErr w:type="gramEnd"/>
+        <w:t>export default function handler(</w:t>
+      </w:r>
+      <w:proofErr w:type="spellStart"/>
       <w:r>
         <w:t>req</w:t>
       </w:r>
@@ -1277,12 +1258,10 @@
         <w:t xml:space="preserve">  if (</w:t>
       </w:r>
       <w:proofErr w:type="spellStart"/>
-      <w:proofErr w:type="gramStart"/>
       <w:r>
         <w:t>req.method</w:t>
       </w:r>
       <w:proofErr w:type="spellEnd"/>
-      <w:proofErr w:type="gramEnd"/>
       <w:r>
         <w:t xml:space="preserve"> === "POST") {</w:t>
       </w:r>
@@ -1291,25 +1270,18 @@
         <w:t xml:space="preserve">    </w:t>
       </w:r>
       <w:proofErr w:type="spellStart"/>
-      <w:proofErr w:type="gramStart"/>
       <w:r>
         <w:t>res.status</w:t>
       </w:r>
       <w:proofErr w:type="spellEnd"/>
-      <w:proofErr w:type="gramEnd"/>
-      <w:r>
-        <w:t>(200</w:t>
-      </w:r>
-      <w:proofErr w:type="gramStart"/>
-      <w:r>
-        <w:t>).</w:t>
+      <w:r>
+        <w:t>(200).</w:t>
       </w:r>
       <w:proofErr w:type="spellStart"/>
       <w:r>
         <w:t>json</w:t>
       </w:r>
       <w:proofErr w:type="spellEnd"/>
-      <w:proofErr w:type="gramEnd"/>
       <w:r>
         <w:t>({</w:t>
       </w:r>
@@ -1318,12 +1290,10 @@
         <w:t xml:space="preserve">      method: </w:t>
       </w:r>
       <w:proofErr w:type="spellStart"/>
-      <w:proofErr w:type="gramStart"/>
       <w:r>
         <w:t>req.method</w:t>
       </w:r>
       <w:proofErr w:type="spellEnd"/>
-      <w:proofErr w:type="gramEnd"/>
       <w:r>
         <w:t>,</w:t>
       </w:r>
@@ -1332,12 +1302,10 @@
         <w:t xml:space="preserve">      body: </w:t>
       </w:r>
       <w:proofErr w:type="spellStart"/>
-      <w:proofErr w:type="gramStart"/>
       <w:r>
         <w:t>req.body</w:t>
       </w:r>
       <w:proofErr w:type="spellEnd"/>
-      <w:proofErr w:type="gramEnd"/>
       <w:r>
         <w:t>,</w:t>
       </w:r>
@@ -1346,12 +1314,10 @@
         <w:t xml:space="preserve">      query: </w:t>
       </w:r>
       <w:proofErr w:type="spellStart"/>
-      <w:proofErr w:type="gramStart"/>
       <w:r>
         <w:t>req.query</w:t>
       </w:r>
       <w:proofErr w:type="spellEnd"/>
-      <w:proofErr w:type="gramEnd"/>
       <w:r>
         <w:t>,</w:t>
       </w:r>
@@ -1361,12 +1327,8 @@
       </w:r>
       <w:r>
         <w:br/>
-      </w:r>
-      <w:proofErr w:type="gramStart"/>
-      <w:r>
         <w:t xml:space="preserve">  }</w:t>
       </w:r>
-      <w:proofErr w:type="gramEnd"/>
       <w:r>
         <w:br/>
         <w:t>}</w:t>
@@ -1522,12 +1484,10 @@
           </w:tcPr>
           <w:p>
             <w:proofErr w:type="spellStart"/>
-            <w:proofErr w:type="gramStart"/>
             <w:r>
               <w:t>req.body</w:t>
             </w:r>
             <w:proofErr w:type="spellEnd"/>
-            <w:proofErr w:type="gramEnd"/>
           </w:p>
         </w:tc>
         <w:tc>
@@ -1561,12 +1521,10 @@
           </w:tcPr>
           <w:p>
             <w:proofErr w:type="spellStart"/>
-            <w:proofErr w:type="gramStart"/>
             <w:r>
               <w:t>req.query</w:t>
             </w:r>
             <w:proofErr w:type="spellEnd"/>
-            <w:proofErr w:type="gramEnd"/>
           </w:p>
         </w:tc>
         <w:tc>
@@ -1600,12 +1558,10 @@
           </w:tcPr>
           <w:p>
             <w:proofErr w:type="spellStart"/>
-            <w:proofErr w:type="gramStart"/>
             <w:r>
               <w:t>req.method</w:t>
             </w:r>
             <w:proofErr w:type="spellEnd"/>
-            <w:proofErr w:type="gramEnd"/>
           </w:p>
         </w:tc>
         <w:tc>
@@ -1657,14 +1613,9 @@
     </w:p>
     <w:p>
       <w:r>
-        <w:t xml:space="preserve">export async function </w:t>
-      </w:r>
-      <w:proofErr w:type="gramStart"/>
-      <w:r>
-        <w:t>POST(</w:t>
-      </w:r>
-      <w:proofErr w:type="spellStart"/>
-      <w:proofErr w:type="gramEnd"/>
+        <w:t>export async function POST(</w:t>
+      </w:r>
+      <w:proofErr w:type="spellStart"/>
       <w:r>
         <w:t>req</w:t>
       </w:r>
@@ -1688,12 +1639,10 @@
         <w:t xml:space="preserve"> body = await </w:t>
       </w:r>
       <w:proofErr w:type="spellStart"/>
-      <w:proofErr w:type="gramStart"/>
       <w:r>
         <w:t>req.json</w:t>
       </w:r>
       <w:proofErr w:type="spellEnd"/>
-      <w:proofErr w:type="gramEnd"/>
       <w:r>
         <w:t>();</w:t>
       </w:r>
@@ -1755,12 +1704,10 @@
         <w:t xml:space="preserve">d specific fields like </w:t>
       </w:r>
       <w:proofErr w:type="spellStart"/>
-      <w:proofErr w:type="gramStart"/>
       <w:r>
         <w:t>req.body</w:t>
       </w:r>
       <w:proofErr w:type="spellEnd"/>
-      <w:proofErr w:type="gramEnd"/>
       <w:r>
         <w:t>.</w:t>
       </w:r>
@@ -1770,15 +1717,7 @@
         <w:t>In older version we used to get body like we did in n</w:t>
       </w:r>
       <w:r>
-        <w:t xml:space="preserve">ode js but in modern it </w:t>
-      </w:r>
-      <w:proofErr w:type="gramStart"/>
-      <w:r>
-        <w:t>look</w:t>
-      </w:r>
-      <w:proofErr w:type="gramEnd"/>
-      <w:r>
-        <w:t xml:space="preserve"> like below</w:t>
+        <w:t>ode js but in modern it look like below</w:t>
       </w:r>
     </w:p>
     <w:p>
@@ -1881,18 +1820,10 @@
         <w:t>The problem with the file making</w:t>
       </w:r>
       <w:r>
-        <w:t xml:space="preserve"> </w:t>
-      </w:r>
-      <w:proofErr w:type="gramStart"/>
-      <w:r>
-        <w:t xml:space="preserve">strategy </w:t>
-      </w:r>
-      <w:r>
-        <w:t xml:space="preserve"> is</w:t>
-      </w:r>
-      <w:proofErr w:type="gramEnd"/>
-      <w:r>
-        <w:t xml:space="preserve"> that </w:t>
+        <w:t xml:space="preserve"> strategy </w:t>
+      </w:r>
+      <w:r>
+        <w:t xml:space="preserve"> is that </w:t>
       </w:r>
       <w:r>
         <w:t xml:space="preserve">if suppose </w:t>
@@ -2005,41 +1936,20 @@
       </w:r>
       <w:proofErr w:type="spellEnd"/>
       <w:r>
+        <w:t xml:space="preserve"> element</w:t>
+      </w:r>
+      <w:r>
+        <w:t>(who knows may be I am wrong here)</w:t>
+      </w:r>
+      <w:r>
         <w:t xml:space="preserve"> </w:t>
       </w:r>
-      <w:proofErr w:type="gramStart"/>
-      <w:r>
-        <w:t>element</w:t>
-      </w:r>
-      <w:r>
-        <w:t>(</w:t>
-      </w:r>
-      <w:proofErr w:type="gramEnd"/>
-      <w:r>
-        <w:t xml:space="preserve">who knows </w:t>
-      </w:r>
-      <w:proofErr w:type="gramStart"/>
-      <w:r>
-        <w:t>may be</w:t>
-      </w:r>
-      <w:proofErr w:type="gramEnd"/>
-      <w:r>
-        <w:t xml:space="preserve"> I am wrong here)</w:t>
-      </w:r>
-      <w:r>
-        <w:t xml:space="preserve"> </w:t>
-      </w:r>
       <w:r>
         <w:t xml:space="preserve">and on state update method we used </w:t>
       </w:r>
       <w:proofErr w:type="spellStart"/>
-      <w:proofErr w:type="gramStart"/>
-      <w:r>
-        <w:t>e.target</w:t>
-      </w:r>
-      <w:proofErr w:type="gramEnd"/>
-      <w:r>
-        <w:t>.innerText</w:t>
+      <w:r>
+        <w:t>e.target.innerText</w:t>
       </w:r>
       <w:proofErr w:type="spellEnd"/>
     </w:p>
@@ -2056,13 +1966,8 @@
         <w:t xml:space="preserve"> we can use </w:t>
       </w:r>
       <w:proofErr w:type="spellStart"/>
-      <w:proofErr w:type="gramStart"/>
-      <w:r>
-        <w:t>e.target</w:t>
-      </w:r>
-      <w:proofErr w:type="gramEnd"/>
-      <w:r>
-        <w:t>,value</w:t>
+      <w:r>
+        <w:t>e.target,value</w:t>
       </w:r>
       <w:proofErr w:type="spellEnd"/>
       <w:r>
@@ -2178,16 +2083,13 @@
         <w:t xml:space="preserve">Shortcut for </w:t>
       </w:r>
       <w:proofErr w:type="spellStart"/>
-      <w:proofErr w:type="gramStart"/>
       <w:r>
         <w:t>margin:auto</w:t>
       </w:r>
       <w:proofErr w:type="spellEnd"/>
-      <w:proofErr w:type="gramEnd"/>
       <w:r>
         <w:t xml:space="preserve"> will be </w:t>
       </w:r>
-      <w:proofErr w:type="gramStart"/>
       <w:r>
         <w:rPr>
           <w:b/>
@@ -2195,7 +2097,6 @@
         </w:rPr>
         <w:t>m:auto</w:t>
       </w:r>
-      <w:proofErr w:type="gramEnd"/>
       <w:r>
         <w:rPr>
           <w:b/>
@@ -2259,18 +2160,10 @@
     </w:p>
     <w:p>
       <w:r>
-        <w:t xml:space="preserve">Suppose you have 50 blogs and you want to show 5 blogs on each </w:t>
-      </w:r>
-      <w:proofErr w:type="gramStart"/>
-      <w:r>
-        <w:t xml:space="preserve">pages </w:t>
-      </w:r>
-      <w:r>
-        <w:t xml:space="preserve"> so</w:t>
-      </w:r>
-      <w:proofErr w:type="gramEnd"/>
-      <w:r>
-        <w:t xml:space="preserve"> 10 pages </w:t>
+        <w:t xml:space="preserve">Suppose you have 50 blogs and you want to show 5 blogs on each pages </w:t>
+      </w:r>
+      <w:r>
+        <w:t xml:space="preserve"> so 10 pages </w:t>
       </w:r>
       <w:r>
         <w:t>will</w:t>
@@ -2281,16 +2174,11 @@
       <w:r>
         <w:t xml:space="preserve">be </w:t>
       </w:r>
-      <w:proofErr w:type="gramStart"/>
       <w:r>
         <w:t xml:space="preserve">formed </w:t>
       </w:r>
       <w:r>
-        <w:t>.</w:t>
-      </w:r>
-      <w:proofErr w:type="gramEnd"/>
-      <w:r>
-        <w:t xml:space="preserve"> In the similar way </w:t>
+        <w:t xml:space="preserve">. In the similar way </w:t>
       </w:r>
       <w:r>
         <w:t xml:space="preserve">pagination can be showed </w:t>
@@ -2407,15 +2295,7 @@
         <w:t xml:space="preserve">that we will not good components </w:t>
       </w:r>
       <w:r>
-        <w:t xml:space="preserve">means you won’t get good packages for doing any </w:t>
-      </w:r>
-      <w:proofErr w:type="gramStart"/>
-      <w:r>
-        <w:t>work(</w:t>
-      </w:r>
-      <w:proofErr w:type="gramEnd"/>
-      <w:r>
-        <w:t>who knows)</w:t>
+        <w:t>means you won’t get good packages for doing any work(who knows)</w:t>
       </w:r>
     </w:p>
     <w:p>
@@ -2444,27 +2324,14 @@
       </w:r>
     </w:p>
     <w:p>
-      <w:proofErr w:type="gramStart"/>
-      <w:r>
-        <w:t>So</w:t>
-      </w:r>
-      <w:proofErr w:type="gramEnd"/>
-      <w:r>
-        <w:t xml:space="preserve"> we run the above command I context of </w:t>
+      <w:r>
+        <w:t xml:space="preserve">So we run the above command I context of </w:t>
       </w:r>
       <w:r>
         <w:t xml:space="preserve">yarn </w:t>
       </w:r>
       <w:r>
-        <w:t xml:space="preserve">by </w:t>
-      </w:r>
-      <w:proofErr w:type="gramStart"/>
-      <w:r>
-        <w:t>using  below</w:t>
-      </w:r>
-      <w:proofErr w:type="gramEnd"/>
-      <w:r>
-        <w:t xml:space="preserve"> command</w:t>
+        <w:t>by using  below command</w:t>
       </w:r>
     </w:p>
     <w:p>
@@ -2552,29 +2419,13 @@
         <w:t xml:space="preserve">Data length </w:t>
       </w:r>
       <w:r>
-        <w:t xml:space="preserve">of the data that to be </w:t>
-      </w:r>
-      <w:proofErr w:type="gramStart"/>
-      <w:r>
-        <w:t>shown</w:t>
-      </w:r>
-      <w:r>
-        <w:t xml:space="preserve"> ,</w:t>
-      </w:r>
-      <w:proofErr w:type="gramEnd"/>
-      <w:r>
-        <w:t xml:space="preserve"> next is the </w:t>
-      </w:r>
-      <w:proofErr w:type="gramStart"/>
-      <w:r>
-        <w:t xml:space="preserve">function  </w:t>
-      </w:r>
-      <w:r>
-        <w:t>that</w:t>
-      </w:r>
-      <w:proofErr w:type="gramEnd"/>
-      <w:r>
-        <w:t xml:space="preserve"> will be called when we scroll and reach the bottom and more data is needed to be loaded.</w:t>
+        <w:t>of the data that to be shown</w:t>
+      </w:r>
+      <w:r>
+        <w:t xml:space="preserve"> , next is the function  </w:t>
+      </w:r>
+      <w:r>
+        <w:t>that will be called when we scroll and reach the bottom and more data is needed to be loaded.</w:t>
       </w:r>
     </w:p>
     <w:p>
@@ -2602,21 +2453,13 @@
         <w:t>w</w:t>
       </w:r>
       <w:r>
-        <w:t xml:space="preserve">n </w:t>
-      </w:r>
-      <w:proofErr w:type="gramStart"/>
-      <w:r>
-        <w:t>function</w:t>
+        <w:t>n function</w:t>
       </w:r>
       <w:r>
         <w:t>al</w:t>
       </w:r>
       <w:r>
-        <w:t>ity(</w:t>
-      </w:r>
-      <w:proofErr w:type="gramEnd"/>
-      <w:r>
-        <w:t>who knows)</w:t>
+        <w:t>ity(who knows)</w:t>
       </w:r>
     </w:p>
     <w:p>
@@ -2698,15 +2541,7 @@
         <w:t xml:space="preserve">it is defined like this </w:t>
       </w:r>
       <w:r>
-        <w:t xml:space="preserve">if we keep single </w:t>
-      </w:r>
-      <w:proofErr w:type="gramStart"/>
-      <w:r>
-        <w:t>item</w:t>
-      </w:r>
-      <w:proofErr w:type="gramEnd"/>
-      <w:r>
-        <w:t xml:space="preserve"> </w:t>
+        <w:t xml:space="preserve">if we keep single item </w:t>
       </w:r>
       <w:r>
         <w:t>we need to see al</w:t>
@@ -2715,31 +2550,22 @@
         <w:t>l</w:t>
       </w:r>
       <w:r>
-        <w:t xml:space="preserve"> </w:t>
-      </w:r>
-      <w:proofErr w:type="gramStart"/>
-      <w:r>
-        <w:t>this thi</w:t>
+        <w:t xml:space="preserve"> this thi</w:t>
       </w:r>
       <w:r>
         <w:t>n</w:t>
       </w:r>
       <w:r>
-        <w:t>gs</w:t>
-      </w:r>
-      <w:proofErr w:type="gramEnd"/>
-      <w:r>
-        <w:t xml:space="preserve"> </w:t>
-      </w:r>
-    </w:p>
-    <w:p>
-      <w:pPr>
-        <w:rPr>
-          <w:b/>
-          <w:bCs/>
-        </w:rPr>
-      </w:pPr>
-      <w:proofErr w:type="gramStart"/>
+        <w:t xml:space="preserve">gs </w:t>
+      </w:r>
+    </w:p>
+    <w:p>
+      <w:pPr>
+        <w:rPr>
+          <w:b/>
+          <w:bCs/>
+        </w:rPr>
+      </w:pPr>
       <w:r>
         <w:rPr>
           <w:b/>
@@ -2747,7 +2573,6 @@
         </w:rPr>
         <w:t>Note:-</w:t>
       </w:r>
-      <w:proofErr w:type="gramEnd"/>
     </w:p>
     <w:p>
       <w:pPr>
@@ -2759,15 +2584,7 @@
         <w:t xml:space="preserve">Sometime it happens </w:t>
       </w:r>
       <w:r>
-        <w:t xml:space="preserve">in react that one component is </w:t>
-      </w:r>
-      <w:proofErr w:type="gramStart"/>
-      <w:r>
-        <w:t>show  two</w:t>
-      </w:r>
-      <w:proofErr w:type="gramEnd"/>
-      <w:r>
-        <w:t xml:space="preserve"> times so reload to remove the bug</w:t>
+        <w:t>in react that one component is show  two times so reload to remove the bug</w:t>
       </w:r>
     </w:p>
     <w:p>
@@ -2783,15 +2600,7 @@
         <w:t xml:space="preserve">except for responsiveness </w:t>
       </w:r>
       <w:r>
-        <w:t xml:space="preserve">we </w:t>
-      </w:r>
-      <w:proofErr w:type="gramStart"/>
-      <w:r>
-        <w:t>will  make</w:t>
-      </w:r>
-      <w:proofErr w:type="gramEnd"/>
-      <w:r>
-        <w:t xml:space="preserve"> our blog responsive and will write media queries </w:t>
+        <w:t xml:space="preserve">we will  make our blog responsive and will write media queries </w:t>
       </w:r>
       <w:r>
         <w:t>how we can we run media que</w:t>
@@ -2817,13 +2626,8 @@
         <w:t xml:space="preserve">the website </w:t>
       </w:r>
       <w:r>
-        <w:t xml:space="preserve">and if you gave </w:t>
-      </w:r>
-      <w:proofErr w:type="gramStart"/>
-      <w:r>
-        <w:t>responsiveness</w:t>
-      </w:r>
-      <w:proofErr w:type="gramEnd"/>
+        <w:t>and if you gave responsiveness</w:t>
+      </w:r>
       <w:r>
         <w:t xml:space="preserve"> it was an addon</w:t>
       </w:r>
@@ -2842,12 +2646,10 @@
         <w:t xml:space="preserve">you can say bit in </w:t>
       </w:r>
       <w:proofErr w:type="spellStart"/>
-      <w:proofErr w:type="gramStart"/>
       <w:r>
         <w:t>todays</w:t>
       </w:r>
       <w:proofErr w:type="spellEnd"/>
-      <w:proofErr w:type="gramEnd"/>
       <w:r>
         <w:t xml:space="preserve"> time </w:t>
       </w:r>
@@ -2924,11 +2726,7 @@
     </w:p>
     <w:p>
       <w:r>
-        <w:t xml:space="preserve">We will </w:t>
-      </w:r>
-      <w:proofErr w:type="gramStart"/>
-      <w:r>
-        <w:t>ho</w:t>
+        <w:t>We will ho</w:t>
       </w:r>
       <w:r>
         <w:t>s</w:t>
@@ -2937,11 +2735,7 @@
         <w:t>t</w:t>
       </w:r>
       <w:r>
-        <w:t>s</w:t>
-      </w:r>
-      <w:proofErr w:type="gramEnd"/>
-      <w:r>
-        <w:t xml:space="preserve"> the web</w:t>
+        <w:t>s the web</w:t>
       </w:r>
       <w:r>
         <w:t>s</w:t>
@@ -3068,15 +2862,7 @@
     </w:p>
     <w:p>
       <w:r>
-        <w:t xml:space="preserve">IN digital ocean we make new </w:t>
-      </w:r>
-      <w:proofErr w:type="gramStart"/>
-      <w:r>
-        <w:t>user(</w:t>
-      </w:r>
-      <w:proofErr w:type="gramEnd"/>
-      <w:r>
-        <w:t xml:space="preserve">who knows) </w:t>
+        <w:t xml:space="preserve">IN digital ocean we make new user(who knows) </w:t>
       </w:r>
     </w:p>
     <w:p>
@@ -3114,26 +2900,13 @@
       <w:r>
         <w:t xml:space="preserve">process will be </w:t>
       </w:r>
-      <w:proofErr w:type="gramStart"/>
-      <w:r>
-        <w:t>build</w:t>
-      </w:r>
-      <w:proofErr w:type="gramEnd"/>
-      <w:r>
-        <w:t xml:space="preserve"> there </w:t>
-      </w:r>
-    </w:p>
-    <w:p>
-      <w:r>
-        <w:t xml:space="preserve">It will ask you to make database in </w:t>
-      </w:r>
-      <w:proofErr w:type="gramStart"/>
-      <w:r>
-        <w:t>there</w:t>
-      </w:r>
-      <w:proofErr w:type="gramEnd"/>
-      <w:r>
-        <w:t xml:space="preserve"> services.</w:t>
+      <w:r>
+        <w:t xml:space="preserve">build there </w:t>
+      </w:r>
+    </w:p>
+    <w:p>
+      <w:r>
+        <w:t>It will ask you to make database in there services.</w:t>
       </w:r>
       <w:r>
         <w:t xml:space="preserve"> (who knows)</w:t>
@@ -3184,14 +2957,9 @@
       </w:r>
       <w:proofErr w:type="spellEnd"/>
       <w:r>
-        <w:t xml:space="preserve"> it will be </w:t>
-      </w:r>
-      <w:proofErr w:type="gramStart"/>
-      <w:r>
-        <w:t>good(</w:t>
-      </w:r>
-      <w:proofErr w:type="spellStart"/>
-      <w:proofErr w:type="gramEnd"/>
+        <w:t xml:space="preserve"> it will be good(</w:t>
+      </w:r>
+      <w:proofErr w:type="spellStart"/>
       <w:r>
         <w:t>wjp</w:t>
       </w:r>
@@ -3208,101 +2976,73 @@
           <w:color w:val="EE0000"/>
         </w:rPr>
       </w:pPr>
-      <w:proofErr w:type="gramStart"/>
       <w:r>
         <w:rPr>
           <w:b/>
           <w:bCs/>
           <w:color w:val="EE0000"/>
         </w:rPr>
-        <w:t>‘ can</w:t>
-      </w:r>
-      <w:proofErr w:type="gramEnd"/>
+        <w:t xml:space="preserve">‘ can create </w:t>
+      </w:r>
       <w:r>
         <w:rPr>
           <w:b/>
           <w:bCs/>
           <w:color w:val="EE0000"/>
         </w:rPr>
-        <w:t xml:space="preserve"> create </w:t>
-      </w:r>
+        <w:t xml:space="preserve">error in </w:t>
+      </w:r>
+      <w:proofErr w:type="spellStart"/>
       <w:r>
         <w:rPr>
           <w:b/>
           <w:bCs/>
           <w:color w:val="EE0000"/>
         </w:rPr>
-        <w:t xml:space="preserve">error in </w:t>
-      </w:r>
-      <w:proofErr w:type="spellStart"/>
+        <w:t>js</w:t>
+      </w:r>
       <w:r>
         <w:rPr>
           <w:b/>
           <w:bCs/>
           <w:color w:val="EE0000"/>
         </w:rPr>
-        <w:t>js</w:t>
-      </w:r>
+        <w:t>x</w:t>
+      </w:r>
+      <w:proofErr w:type="spellEnd"/>
       <w:r>
         <w:rPr>
           <w:b/>
           <w:bCs/>
           <w:color w:val="EE0000"/>
         </w:rPr>
-        <w:t>x</w:t>
-      </w:r>
-      <w:proofErr w:type="spellEnd"/>
+        <w:t xml:space="preserve"> in </w:t>
+      </w:r>
+      <w:proofErr w:type="spellStart"/>
       <w:r>
         <w:rPr>
           <w:b/>
           <w:bCs/>
           <w:color w:val="EE0000"/>
         </w:rPr>
-        <w:t xml:space="preserve"> in </w:t>
-      </w:r>
-      <w:proofErr w:type="spellStart"/>
+        <w:t>Nextjs</w:t>
+      </w:r>
+      <w:proofErr w:type="spellEnd"/>
       <w:r>
         <w:rPr>
           <w:b/>
           <w:bCs/>
           <w:color w:val="EE0000"/>
         </w:rPr>
-        <w:t>Nextjs</w:t>
-      </w:r>
-      <w:proofErr w:type="spellEnd"/>
+        <w:t xml:space="preserve"> or maybe in React.</w:t>
+      </w:r>
       <w:r>
         <w:rPr>
           <w:b/>
           <w:bCs/>
           <w:color w:val="EE0000"/>
         </w:rPr>
-        <w:t xml:space="preserve"> or maybe in </w:t>
-      </w:r>
-      <w:proofErr w:type="gramStart"/>
-      <w:r>
-        <w:rPr>
-          <w:b/>
-          <w:bCs/>
-          <w:color w:val="EE0000"/>
-        </w:rPr>
-        <w:t>React.</w:t>
-      </w:r>
-      <w:r>
-        <w:rPr>
-          <w:b/>
-          <w:bCs/>
-          <w:color w:val="EE0000"/>
-        </w:rPr>
-        <w:t>(</w:t>
-      </w:r>
-      <w:proofErr w:type="gramEnd"/>
-      <w:r>
-        <w:rPr>
-          <w:b/>
-          <w:bCs/>
-          <w:color w:val="EE0000"/>
-        </w:rPr>
-        <w:t>maybe it is an outdated problem)</w:t>
+        <w:t>(maybe it is an outdated problem)</w:t>
       </w:r>
     </w:p>
     <w:p>
@@ -3327,12 +3067,10 @@
         <w:t xml:space="preserve">you can make it like that and if it </w:t>
       </w:r>
       <w:proofErr w:type="spellStart"/>
-      <w:proofErr w:type="gramStart"/>
       <w:r>
         <w:t>become</w:t>
       </w:r>
       <w:proofErr w:type="spellEnd"/>
-      <w:proofErr w:type="gramEnd"/>
       <w:r>
         <w:t xml:space="preserve"> profitable then you can scale it (who knows) </w:t>
       </w:r>
@@ -3341,7 +3079,6 @@
       <w:r>
         <w:t xml:space="preserve">Now as you commit then </w:t>
       </w:r>
-      <w:proofErr w:type="gramStart"/>
       <w:r>
         <w:t>Digital</w:t>
       </w:r>
@@ -3349,25 +3086,13 @@
         <w:t xml:space="preserve"> </w:t>
       </w:r>
       <w:r>
-        <w:t>ocean</w:t>
-      </w:r>
-      <w:proofErr w:type="gramEnd"/>
-      <w:r>
-        <w:t xml:space="preserve"> will build it</w:t>
-      </w:r>
-      <w:r>
-        <w:t xml:space="preserve"> automatically for </w:t>
-      </w:r>
-      <w:proofErr w:type="gramStart"/>
-      <w:r>
-        <w:t>you.</w:t>
-      </w:r>
-      <w:r>
-        <w:t>(</w:t>
-      </w:r>
-      <w:proofErr w:type="gramEnd"/>
-      <w:r>
-        <w:t>maybe if auto</w:t>
+        <w:t>ocean will build it</w:t>
+      </w:r>
+      <w:r>
+        <w:t xml:space="preserve"> automatically for you.</w:t>
+      </w:r>
+      <w:r>
+        <w:t>(maybe if auto</w:t>
       </w:r>
       <w:r>
         <w:t xml:space="preserve"> </w:t>
@@ -3376,15 +3101,7 @@
         <w:t xml:space="preserve">deploy option was selected </w:t>
       </w:r>
       <w:r>
-        <w:t xml:space="preserve">in the </w:t>
-      </w:r>
-      <w:proofErr w:type="gramStart"/>
-      <w:r>
-        <w:t>setting(</w:t>
-      </w:r>
-      <w:proofErr w:type="gramEnd"/>
-      <w:r>
-        <w:t>who knows)</w:t>
+        <w:t>in the setting(who knows)</w:t>
       </w:r>
       <w:r>
         <w:t>)</w:t>
@@ -3422,18 +3139,10 @@
         <w:t xml:space="preserve">here (maybe </w:t>
       </w:r>
       <w:r>
-        <w:t xml:space="preserve">very large app don’t work </w:t>
-      </w:r>
-      <w:proofErr w:type="gramStart"/>
-      <w:r>
-        <w:t>properly</w:t>
-      </w:r>
-      <w:r>
-        <w:t>(</w:t>
-      </w:r>
-      <w:proofErr w:type="gramEnd"/>
-      <w:r>
-        <w:t>who knows)</w:t>
+        <w:t>very large app don’t work properly</w:t>
+      </w:r>
+      <w:r>
+        <w:t>(who knows)</w:t>
       </w:r>
       <w:r>
         <w:t>)</w:t>
@@ -3474,18 +3183,10 @@
         <w:t xml:space="preserve">Now we will see </w:t>
       </w:r>
       <w:r>
-        <w:t xml:space="preserve">how Google analytics and search </w:t>
-      </w:r>
-      <w:proofErr w:type="gramStart"/>
-      <w:r>
-        <w:t>console</w:t>
-      </w:r>
-      <w:r>
-        <w:t>(</w:t>
-      </w:r>
-      <w:proofErr w:type="gramEnd"/>
-      <w:r>
-        <w:t xml:space="preserve">who </w:t>
+        <w:t>how Google analytics and search console</w:t>
+      </w:r>
+      <w:r>
+        <w:t xml:space="preserve">(who </w:t>
       </w:r>
       <w:proofErr w:type="spellStart"/>
       <w:r>
@@ -3652,21 +3353,13 @@
         <w:t xml:space="preserve">ck </w:t>
       </w:r>
       <w:r>
-        <w:t xml:space="preserve">which is also called </w:t>
-      </w:r>
-      <w:proofErr w:type="gramStart"/>
+        <w:t>which is also called S</w:t>
+      </w:r>
       <w:r>
         <w:t>S</w:t>
       </w:r>
       <w:r>
-        <w:t>S</w:t>
-      </w:r>
-      <w:r>
-        <w:t>LV(</w:t>
-      </w:r>
-      <w:proofErr w:type="gramEnd"/>
-      <w:r>
-        <w:t>who knows)</w:t>
+        <w:t>LV(who knows)</w:t>
       </w:r>
       <w:r>
         <w:t xml:space="preserve"> and </w:t>
@@ -3713,13 +3406,8 @@
       <w:r>
         <w:t xml:space="preserve">of the application. </w:t>
       </w:r>
-      <w:proofErr w:type="gramStart"/>
-      <w:r>
-        <w:t>So</w:t>
-      </w:r>
-      <w:proofErr w:type="gramEnd"/>
-      <w:r>
-        <w:t xml:space="preserve"> if we want that the domain we have need to be pointe</w:t>
+      <w:r>
+        <w:t>So if we want that the domain we have need to be pointe</w:t>
       </w:r>
       <w:r>
         <w:t>d</w:t>
@@ -3750,18 +3438,10 @@
     </w:p>
     <w:p>
       <w:r>
-        <w:t xml:space="preserve">Of you chose the former then you </w:t>
-      </w:r>
-      <w:proofErr w:type="gramStart"/>
-      <w:r>
-        <w:t xml:space="preserve">will  </w:t>
-      </w:r>
-      <w:r>
-        <w:t>see</w:t>
-      </w:r>
-      <w:proofErr w:type="gramEnd"/>
-      <w:r>
-        <w:t xml:space="preserve"> that from the dashboard </w:t>
+        <w:t xml:space="preserve">Of you chose the former then you will  </w:t>
+      </w:r>
+      <w:r>
+        <w:t xml:space="preserve">see that from the dashboard </w:t>
       </w:r>
       <w:r>
         <w:t xml:space="preserve">that how things are happening </w:t>
@@ -3770,26 +3450,10 @@
         <w:t xml:space="preserve">and if you chose later </w:t>
       </w:r>
       <w:r>
-        <w:t xml:space="preserve">then you need to point it to a Digital </w:t>
-      </w:r>
-      <w:proofErr w:type="gramStart"/>
-      <w:r>
-        <w:t>ocean(</w:t>
-      </w:r>
-      <w:proofErr w:type="gramEnd"/>
-      <w:r>
-        <w:t>who knows)</w:t>
-      </w:r>
-      <w:r>
-        <w:t xml:space="preserve">. By former we bring the domain in the digital </w:t>
-      </w:r>
-      <w:proofErr w:type="gramStart"/>
-      <w:r>
-        <w:t>ocean(</w:t>
-      </w:r>
-      <w:proofErr w:type="gramEnd"/>
-      <w:r>
-        <w:t>who knows)</w:t>
+        <w:t>then you need to point it to a Digital ocean(who knows)</w:t>
+      </w:r>
+      <w:r>
+        <w:t>. By former we bring the domain in the digital ocean(who knows)</w:t>
       </w:r>
       <w:r>
         <w:t xml:space="preserve">. </w:t>
@@ -3835,13 +3499,8 @@
       </w:r>
     </w:p>
     <w:p>
-      <w:proofErr w:type="gramStart"/>
-      <w:r>
-        <w:t>So</w:t>
-      </w:r>
-      <w:proofErr w:type="gramEnd"/>
-      <w:r>
-        <w:t xml:space="preserve"> we went to Google search console</w:t>
+      <w:r>
+        <w:t>So we went to Google search console</w:t>
       </w:r>
       <w:r>
         <w:t xml:space="preserve"> so we add a property there </w:t>
@@ -3916,15 +3575,7 @@
         <w:t xml:space="preserve">omain </w:t>
       </w:r>
       <w:r>
-        <w:t xml:space="preserve">ad then you need to verify it so it </w:t>
-      </w:r>
-      <w:proofErr w:type="gramStart"/>
-      <w:r>
-        <w:t>give</w:t>
-      </w:r>
-      <w:proofErr w:type="gramEnd"/>
-      <w:r>
-        <w:t xml:space="preserve"> us some text which we will paste in the </w:t>
+        <w:t xml:space="preserve">ad then you need to verify it so it give us some text which we will paste in the </w:t>
       </w:r>
       <w:r>
         <w:t xml:space="preserve">DNS records to give the proof for ownership of domain. </w:t>
@@ -4018,11 +3669,7 @@
         <w:t xml:space="preserve"> and how to integrate </w:t>
       </w:r>
       <w:r>
-        <w:t xml:space="preserve">payment gateway to the </w:t>
-      </w:r>
-      <w:proofErr w:type="gramStart"/>
-      <w:r>
-        <w:t>websi</w:t>
+        <w:t>payment gateway to the websi</w:t>
       </w:r>
       <w:r>
         <w:t>t</w:t>
@@ -4033,23 +3680,14 @@
       <w:r>
         <w:t>.</w:t>
       </w:r>
-      <w:proofErr w:type="gramEnd"/>
       <w:r>
         <w:t xml:space="preserve"> How orders will come </w:t>
       </w:r>
       <w:r>
-        <w:t xml:space="preserve">and how admin panel will be </w:t>
-      </w:r>
-      <w:proofErr w:type="gramStart"/>
-      <w:r>
-        <w:t xml:space="preserve">made </w:t>
-      </w:r>
-      <w:r>
-        <w:t>.</w:t>
-      </w:r>
-      <w:proofErr w:type="gramEnd"/>
-      <w:r>
-        <w:t xml:space="preserve"> F</w:t>
+        <w:t xml:space="preserve">and how admin panel will be made </w:t>
+      </w:r>
+      <w:r>
+        <w:t>. F</w:t>
       </w:r>
       <w:r>
         <w:t>r</w:t>
@@ -4370,18 +4008,10 @@
         <w:t xml:space="preserve">Like Bootstrap Tailwind also have </w:t>
       </w:r>
       <w:r>
-        <w:t xml:space="preserve">predefined </w:t>
-      </w:r>
-      <w:proofErr w:type="gramStart"/>
-      <w:r>
-        <w:t xml:space="preserve">class </w:t>
-      </w:r>
-      <w:r>
-        <w:t>.So</w:t>
-      </w:r>
-      <w:proofErr w:type="gramEnd"/>
-      <w:r>
-        <w:t xml:space="preserve"> we have tailwind css is installed </w:t>
+        <w:t xml:space="preserve">predefined class </w:t>
+      </w:r>
+      <w:r>
+        <w:t xml:space="preserve">.So we have tailwind css is installed </w:t>
       </w:r>
       <w:r>
         <w:t>and we can use our utility class</w:t>
@@ -4489,15 +4119,7 @@
         <w:t xml:space="preserve">There are some pages which you will find in almost all Ecommerce website that is </w:t>
       </w:r>
       <w:r>
-        <w:t xml:space="preserve">Product </w:t>
-      </w:r>
-      <w:proofErr w:type="gramStart"/>
-      <w:r>
-        <w:t>page ,</w:t>
-      </w:r>
-      <w:proofErr w:type="gramEnd"/>
-      <w:r>
-        <w:t xml:space="preserve"> Home page</w:t>
+        <w:t>Product page , Home page</w:t>
       </w:r>
       <w:r>
         <w:t>, Checkout page</w:t>
@@ -4509,160 +4131,136 @@
         <w:t>n</w:t>
       </w:r>
       <w:r>
+        <w:t xml:space="preserve"> order</w:t>
+      </w:r>
+      <w:r>
+        <w:t xml:space="preserve"> , login and </w:t>
+      </w:r>
+      <w:proofErr w:type="spellStart"/>
+      <w:r>
+        <w:t>signUp</w:t>
+      </w:r>
+      <w:proofErr w:type="spellEnd"/>
+      <w:r>
+        <w:t xml:space="preserve">. We will create their blank slate here </w:t>
+      </w:r>
+      <w:r>
+        <w:t xml:space="preserve">and then we will start </w:t>
+      </w:r>
+      <w:proofErr w:type="spellStart"/>
+      <w:r>
+        <w:t>c</w:t>
+      </w:r>
+      <w:r>
+        <w:t>odeswear</w:t>
+      </w:r>
+      <w:proofErr w:type="spellEnd"/>
+      <w:r>
+        <w:t xml:space="preserve"> development </w:t>
+      </w:r>
+    </w:p>
+    <w:p>
+      <w:r>
+        <w:t xml:space="preserve">Whatever you </w:t>
+      </w:r>
+      <w:r>
+        <w:t xml:space="preserve">by [slug] is actually dynamic </w:t>
+      </w:r>
+      <w:r>
+        <w:t xml:space="preserve">page </w:t>
+      </w:r>
+      <w:r>
+        <w:t xml:space="preserve">routes </w:t>
+      </w:r>
+    </w:p>
+    <w:p>
+      <w:r>
+        <w:t>There are many thin</w:t>
+      </w:r>
+      <w:r>
+        <w:t>g</w:t>
+      </w:r>
+      <w:r>
+        <w:t xml:space="preserve">s which we think we need to o on the spot like </w:t>
+      </w:r>
+      <w:r>
+        <w:t xml:space="preserve">Forget Password </w:t>
+      </w:r>
+    </w:p>
+    <w:p>
+      <w:r>
+        <w:t>You can even launch this e</w:t>
+      </w:r>
+      <w:r>
+        <w:t>c</w:t>
+      </w:r>
+      <w:r>
+        <w:t>om</w:t>
+      </w:r>
+      <w:r>
+        <w:t>m</w:t>
+      </w:r>
+      <w:r>
+        <w:t xml:space="preserve">erce site </w:t>
+      </w:r>
+    </w:p>
+    <w:p>
+      <w:r>
+        <w:t>Navbar and footer are important for our website and it will be present in all of the pages</w:t>
+      </w:r>
+    </w:p>
+    <w:p>
+      <w:r>
+        <w:t xml:space="preserve">We will use app for that purposes(maybe </w:t>
+      </w:r>
+      <w:proofErr w:type="spellStart"/>
+      <w:r>
+        <w:t>ol</w:t>
+      </w:r>
+      <w:proofErr w:type="spellEnd"/>
+      <w:r>
+        <w:t xml:space="preserve"> version of </w:t>
+      </w:r>
+      <w:proofErr w:type="spellStart"/>
+      <w:r>
+        <w:t>layout.jsx</w:t>
+      </w:r>
+      <w:proofErr w:type="spellEnd"/>
+      <w:r>
+        <w:t>)</w:t>
+      </w:r>
+    </w:p>
+    <w:p>
+      <w:r>
+        <w:t xml:space="preserve">Now there is site that is </w:t>
+      </w:r>
+      <w:proofErr w:type="spellStart"/>
+      <w:r>
+        <w:t>Tailblocks</w:t>
+      </w:r>
+      <w:proofErr w:type="spellEnd"/>
+      <w:r>
+        <w:t xml:space="preserve"> that will give you </w:t>
+      </w:r>
+      <w:proofErr w:type="spellStart"/>
+      <w:r>
+        <w:t>tailblocks</w:t>
+      </w:r>
+      <w:proofErr w:type="spellEnd"/>
+      <w:r>
         <w:t xml:space="preserve"> </w:t>
       </w:r>
-      <w:proofErr w:type="gramStart"/>
-      <w:r>
-        <w:t>order</w:t>
-      </w:r>
-      <w:r>
-        <w:t xml:space="preserve"> ,</w:t>
-      </w:r>
-      <w:proofErr w:type="gramEnd"/>
-      <w:r>
-        <w:t xml:space="preserve"> login and </w:t>
-      </w:r>
-      <w:proofErr w:type="spellStart"/>
-      <w:r>
-        <w:t>signUp</w:t>
-      </w:r>
-      <w:proofErr w:type="spellEnd"/>
-      <w:r>
-        <w:t xml:space="preserve">. We will create their blank slate here </w:t>
-      </w:r>
-      <w:r>
-        <w:t xml:space="preserve">and then we will start </w:t>
-      </w:r>
-      <w:proofErr w:type="spellStart"/>
-      <w:r>
-        <w:t>c</w:t>
-      </w:r>
-      <w:r>
-        <w:t>odeswear</w:t>
-      </w:r>
-      <w:proofErr w:type="spellEnd"/>
-      <w:r>
-        <w:t xml:space="preserve"> development </w:t>
-      </w:r>
-    </w:p>
-    <w:p>
-      <w:r>
-        <w:t xml:space="preserve">Whatever you </w:t>
-      </w:r>
-      <w:r>
-        <w:t xml:space="preserve">by [slug] is actually dynamic </w:t>
-      </w:r>
-      <w:r>
-        <w:t xml:space="preserve">page </w:t>
-      </w:r>
-      <w:r>
-        <w:t xml:space="preserve">routes </w:t>
-      </w:r>
-    </w:p>
-    <w:p>
-      <w:r>
-        <w:t>There are many thin</w:t>
-      </w:r>
-      <w:r>
-        <w:t>g</w:t>
-      </w:r>
-      <w:r>
-        <w:t xml:space="preserve">s which we think we need to o on the spot like </w:t>
-      </w:r>
-      <w:r>
-        <w:t xml:space="preserve">Forget Password </w:t>
-      </w:r>
-    </w:p>
-    <w:p>
-      <w:r>
-        <w:t>You can even launch this e</w:t>
-      </w:r>
-      <w:r>
-        <w:t>c</w:t>
-      </w:r>
-      <w:r>
-        <w:t>om</w:t>
-      </w:r>
-      <w:r>
-        <w:t>m</w:t>
-      </w:r>
-      <w:r>
-        <w:t xml:space="preserve">erce site </w:t>
-      </w:r>
-    </w:p>
-    <w:p>
-      <w:r>
-        <w:t>Navbar and footer are important for our website and it will be present in all of the pages</w:t>
-      </w:r>
-    </w:p>
-    <w:p>
-      <w:r>
-        <w:t xml:space="preserve">We will use app for that </w:t>
-      </w:r>
-      <w:proofErr w:type="gramStart"/>
-      <w:r>
-        <w:t>purposes(</w:t>
-      </w:r>
-      <w:proofErr w:type="gramEnd"/>
-      <w:r>
-        <w:t xml:space="preserve">maybe </w:t>
-      </w:r>
-      <w:proofErr w:type="spellStart"/>
-      <w:r>
-        <w:t>ol</w:t>
-      </w:r>
-      <w:proofErr w:type="spellEnd"/>
-      <w:r>
-        <w:t xml:space="preserve"> version of </w:t>
-      </w:r>
-      <w:proofErr w:type="spellStart"/>
-      <w:r>
-        <w:t>layout.jsx</w:t>
-      </w:r>
-      <w:proofErr w:type="spellEnd"/>
-      <w:r>
-        <w:t>)</w:t>
-      </w:r>
-    </w:p>
-    <w:p>
-      <w:r>
-        <w:t xml:space="preserve">Now there is site that is </w:t>
-      </w:r>
-      <w:proofErr w:type="spellStart"/>
-      <w:r>
-        <w:t>Tailblocks</w:t>
-      </w:r>
-      <w:proofErr w:type="spellEnd"/>
-      <w:r>
-        <w:t xml:space="preserve"> that will give you </w:t>
-      </w:r>
-      <w:proofErr w:type="spellStart"/>
-      <w:r>
-        <w:t>tailblocks</w:t>
-      </w:r>
-      <w:proofErr w:type="spellEnd"/>
+      <w:r>
+        <w:t xml:space="preserve">snippet </w:t>
+      </w:r>
+      <w:r>
+        <w:t xml:space="preserve">here you get minimalistic design </w:t>
+      </w:r>
       <w:r>
         <w:t xml:space="preserve"> </w:t>
       </w:r>
       <w:r>
-        <w:t xml:space="preserve">snippet </w:t>
-      </w:r>
-      <w:r>
-        <w:t xml:space="preserve">here you get minimalistic </w:t>
-      </w:r>
-      <w:proofErr w:type="gramStart"/>
-      <w:r>
-        <w:t xml:space="preserve">design </w:t>
-      </w:r>
-      <w:r>
-        <w:t xml:space="preserve"> </w:t>
-      </w:r>
-      <w:r>
-        <w:t>Here</w:t>
-      </w:r>
-      <w:proofErr w:type="gramEnd"/>
-      <w:r>
-        <w:t xml:space="preserve"> you get </w:t>
+        <w:t xml:space="preserve">Here you get </w:t>
       </w:r>
       <w:proofErr w:type="spellStart"/>
       <w:r>
@@ -4983,46 +4581,14 @@
           <w:b/>
           <w:bCs/>
         </w:rPr>
-        <w:t xml:space="preserve"> </w:t>
-      </w:r>
-      <w:proofErr w:type="gramStart"/>
-      <w:r>
-        <w:rPr>
-          <w:b/>
-          <w:bCs/>
-        </w:rPr>
-        <w:t>and(</w:t>
-      </w:r>
-      <w:proofErr w:type="gramEnd"/>
-      <w:r>
-        <w:rPr>
-          <w:b/>
-          <w:bCs/>
-        </w:rPr>
-        <w:t xml:space="preserve">we try there should be equivalent space between </w:t>
-      </w:r>
-      <w:proofErr w:type="gramStart"/>
-      <w:r>
-        <w:rPr>
-          <w:b/>
-          <w:bCs/>
-        </w:rPr>
-        <w:t>them)</w:t>
-      </w:r>
-      <w:r>
-        <w:rPr>
-          <w:b/>
-          <w:bCs/>
-        </w:rPr>
-        <w:t>(</w:t>
-      </w:r>
-      <w:proofErr w:type="gramEnd"/>
-      <w:r>
-        <w:rPr>
-          <w:b/>
-          <w:bCs/>
-        </w:rPr>
-        <w:t>who knows)</w:t>
+        <w:t xml:space="preserve"> and(we try there should be equivalent space between them)</w:t>
+      </w:r>
+      <w:r>
+        <w:rPr>
+          <w:b/>
+          <w:bCs/>
+        </w:rPr>
+        <w:t>(who knows)</w:t>
       </w:r>
     </w:p>
     <w:p>
@@ -5039,7 +4605,6 @@
         <w:t xml:space="preserve"> in Tailwind by </w:t>
       </w:r>
       <w:proofErr w:type="spellStart"/>
-      <w:proofErr w:type="gramStart"/>
       <w:r>
         <w:rPr>
           <w:b/>
@@ -5055,7 +4620,6 @@
         <w:t>property</w:t>
       </w:r>
       <w:proofErr w:type="spellEnd"/>
-      <w:proofErr w:type="gramEnd"/>
       <w:r>
         <w:rPr>
           <w:b/>
@@ -5188,18 +4752,13 @@
     </w:p>
     <w:p>
       <w:r>
-        <w:t xml:space="preserve">import </w:t>
-      </w:r>
-      <w:proofErr w:type="gramStart"/>
-      <w:r>
-        <w:t xml:space="preserve">{ </w:t>
+        <w:t xml:space="preserve">import { </w:t>
       </w:r>
       <w:proofErr w:type="spellStart"/>
       <w:r>
         <w:t>AiOutlineShoppingCart</w:t>
       </w:r>
       <w:proofErr w:type="spellEnd"/>
-      <w:proofErr w:type="gramEnd"/>
       <w:r>
         <w:t xml:space="preserve"> } from "react-icons/ai";</w:t>
       </w:r>
@@ -5436,14 +4995,9 @@
       </w:r>
       <w:proofErr w:type="spellStart"/>
       <w:r>
-        <w:t>overflow-</w:t>
-      </w:r>
-      <w:proofErr w:type="gramStart"/>
-      <w:r>
-        <w:t>x:hidden</w:t>
-      </w:r>
-      <w:proofErr w:type="spellEnd"/>
-      <w:proofErr w:type="gramEnd"/>
+        <w:t>overflow-x:hidden</w:t>
+      </w:r>
+      <w:proofErr w:type="spellEnd"/>
       <w:r>
         <w:t xml:space="preserve"> you c</w:t>
       </w:r>
@@ -5580,15 +5134,7 @@
         <w:t xml:space="preserve">it is just a request and js will update cart accordingly </w:t>
       </w:r>
       <w:r>
-        <w:t xml:space="preserve">and there is no guarantee </w:t>
-      </w:r>
-      <w:proofErr w:type="gramStart"/>
-      <w:r>
-        <w:t>when  it</w:t>
-      </w:r>
-      <w:proofErr w:type="gramEnd"/>
-      <w:r>
-        <w:t xml:space="preserve"> will be updated so believe it that </w:t>
+        <w:t xml:space="preserve">and there is no guarantee when  it will be updated so believe it that </w:t>
       </w:r>
       <w:r>
         <w:t>car</w:t>
@@ -5606,15 +5152,7 @@
         <w:t>do update method is</w:t>
       </w:r>
       <w:r>
-        <w:t xml:space="preserve"> request </w:t>
-      </w:r>
-      <w:proofErr w:type="gramStart"/>
-      <w:r>
-        <w:t>its</w:t>
-      </w:r>
-      <w:proofErr w:type="gramEnd"/>
-      <w:r>
-        <w:t xml:space="preserve"> not an order</w:t>
+        <w:t xml:space="preserve"> request its not an order</w:t>
       </w:r>
       <w:r>
         <w:t xml:space="preserve">. React </w:t>
@@ -5629,15 +5167,7 @@
         <w:t xml:space="preserve">accordingly </w:t>
       </w:r>
       <w:r>
-        <w:t xml:space="preserve">and it will take time but it </w:t>
-      </w:r>
-      <w:proofErr w:type="gramStart"/>
-      <w:r>
-        <w:t>take</w:t>
-      </w:r>
-      <w:proofErr w:type="gramEnd"/>
-      <w:r>
-        <w:t xml:space="preserve"> time </w:t>
+        <w:t xml:space="preserve">and it will take time but it take time </w:t>
       </w:r>
       <w:r>
         <w:t xml:space="preserve">by time we mean in millisecond </w:t>
@@ -5862,18 +5392,10 @@
         <w:t xml:space="preserve">and how did we confirm </w:t>
       </w:r>
       <w:r>
-        <w:t xml:space="preserve">the order </w:t>
-      </w:r>
-      <w:proofErr w:type="gramStart"/>
-      <w:r>
-        <w:t>there</w:t>
-      </w:r>
-      <w:r>
-        <w:t>(</w:t>
-      </w:r>
-      <w:proofErr w:type="gramEnd"/>
-      <w:r>
-        <w:t>who knows)</w:t>
+        <w:t>the order there</w:t>
+      </w:r>
+      <w:r>
+        <w:t>(who knows)</w:t>
       </w:r>
       <w:r>
         <w:t>.</w:t>
@@ -5886,7 +5408,6 @@
           <w:bCs/>
         </w:rPr>
       </w:pPr>
-      <w:proofErr w:type="gramStart"/>
       <w:r>
         <w:rPr>
           <w:b/>
@@ -5894,7 +5415,6 @@
         </w:rPr>
         <w:t>Note:-</w:t>
       </w:r>
-      <w:proofErr w:type="gramEnd"/>
     </w:p>
     <w:p>
       <w:pPr>
@@ -5933,13 +5453,8 @@
         <w:t xml:space="preserve"> </w:t>
       </w:r>
       <w:r>
-        <w:t xml:space="preserve">(who </w:t>
-      </w:r>
-      <w:proofErr w:type="gramStart"/>
-      <w:r>
-        <w:t>knows )</w:t>
-      </w:r>
-      <w:proofErr w:type="gramEnd"/>
+        <w:t>(who knows )</w:t>
+      </w:r>
       <w:r>
         <w:t xml:space="preserve"> it will help js to connect to </w:t>
       </w:r>
@@ -5954,13 +5469,8 @@
       <w:r>
         <w:t xml:space="preserve">and we can use its </w:t>
       </w:r>
-      <w:proofErr w:type="gramStart"/>
-      <w:r>
-        <w:t>built in</w:t>
-      </w:r>
-      <w:proofErr w:type="gramEnd"/>
-      <w:r>
-        <w:t xml:space="preserve"> functionality </w:t>
+      <w:r>
+        <w:t xml:space="preserve">built in functionality </w:t>
       </w:r>
       <w:r>
         <w:t xml:space="preserve">you don’t have to read and write and update to the </w:t>
@@ -5980,17 +5490,12 @@
         <w:t xml:space="preserve">the complex we do for it in </w:t>
       </w:r>
       <w:proofErr w:type="spellStart"/>
-      <w:proofErr w:type="gramStart"/>
       <w:r>
         <w:t>mongodb</w:t>
       </w:r>
       <w:proofErr w:type="spellEnd"/>
       <w:r>
-        <w:t>(</w:t>
-      </w:r>
-      <w:proofErr w:type="gramEnd"/>
-      <w:r>
-        <w:t>who knows))</w:t>
+        <w:t>(who knows))</w:t>
       </w:r>
       <w:r>
         <w:t xml:space="preserve">. </w:t>
@@ -6021,34 +5526,13 @@
     <w:p>
       <w:r>
         <w:lastRenderedPageBreak/>
-        <w:t xml:space="preserve">If we make timestamp property (who </w:t>
-      </w:r>
-      <w:proofErr w:type="gramStart"/>
-      <w:r>
-        <w:t>knows)true</w:t>
-      </w:r>
-      <w:proofErr w:type="gramEnd"/>
-      <w:r>
-        <w:t xml:space="preserve"> it automatically </w:t>
-      </w:r>
-      <w:proofErr w:type="gramStart"/>
-      <w:r>
-        <w:t>create</w:t>
-      </w:r>
-      <w:proofErr w:type="gramEnd"/>
-      <w:r>
-        <w:t xml:space="preserve"> for us</w:t>
-      </w:r>
-      <w:r>
-        <w:t xml:space="preserve">, </w:t>
-      </w:r>
-      <w:proofErr w:type="gramStart"/>
-      <w:r>
-        <w:t>How</w:t>
-      </w:r>
-      <w:proofErr w:type="gramEnd"/>
-      <w:r>
-        <w:t xml:space="preserve"> these all things are done </w:t>
+        <w:t>If we make timestamp property (who knows)true</w:t>
+      </w:r>
+      <w:r>
+        <w:t xml:space="preserve"> it automatically create for us</w:t>
+      </w:r>
+      <w:r>
+        <w:t xml:space="preserve">, How these all things are done </w:t>
       </w:r>
       <w:r>
         <w:t>what is the syntax.</w:t>
@@ -6120,18 +5604,10 @@
         <w:t xml:space="preserve"> </w:t>
       </w:r>
       <w:r>
-        <w:t xml:space="preserve">and we will make some </w:t>
-      </w:r>
-      <w:proofErr w:type="gramStart"/>
-      <w:r>
-        <w:t>modals</w:t>
-      </w:r>
-      <w:r>
-        <w:t>(</w:t>
-      </w:r>
-      <w:proofErr w:type="gramEnd"/>
-      <w:r>
-        <w:t>maybe not)</w:t>
+        <w:t>and we will make some modals</w:t>
+      </w:r>
+      <w:r>
+        <w:t>(maybe not)</w:t>
       </w:r>
       <w:r>
         <w:t xml:space="preserve"> </w:t>
@@ -6185,15 +5661,7 @@
         <w:t xml:space="preserve"> compass will be installed</w:t>
       </w:r>
       <w:r>
-        <w:t xml:space="preserve"> </w:t>
-      </w:r>
-      <w:proofErr w:type="gramStart"/>
-      <w:r>
-        <w:t>which  is</w:t>
-      </w:r>
-      <w:proofErr w:type="gramEnd"/>
-      <w:r>
-        <w:t xml:space="preserve"> a product of </w:t>
+        <w:t xml:space="preserve"> which  is a product of </w:t>
       </w:r>
       <w:proofErr w:type="spellStart"/>
       <w:r>
@@ -6423,13 +5891,8 @@
       </w:r>
     </w:p>
     <w:p>
-      <w:proofErr w:type="gramStart"/>
-      <w:r>
-        <w:t>So</w:t>
-      </w:r>
-      <w:proofErr w:type="gramEnd"/>
-      <w:r>
-        <w:t xml:space="preserve"> we will make three modals that is </w:t>
+      <w:r>
+        <w:t xml:space="preserve">So we will make three modals that is </w:t>
       </w:r>
       <w:r>
         <w:t>Order, Product and User.</w:t>
@@ -6497,27 +5960,14 @@
       </w:r>
     </w:p>
     <w:p>
-      <w:proofErr w:type="gramStart"/>
-      <w:r>
-        <w:t>So</w:t>
-      </w:r>
-      <w:proofErr w:type="gramEnd"/>
-      <w:r>
-        <w:t xml:space="preserve"> by the scheme (who knows maybe </w:t>
-      </w:r>
-      <w:r>
-        <w:t xml:space="preserve">by making schema object and passing it to </w:t>
-      </w:r>
-      <w:proofErr w:type="gramStart"/>
-      <w:r>
-        <w:t xml:space="preserve">the </w:t>
-      </w:r>
-      <w:r>
-        <w:t>)we</w:t>
-      </w:r>
-      <w:proofErr w:type="gramEnd"/>
-      <w:r>
-        <w:t xml:space="preserve"> created a model</w:t>
+      <w:r>
+        <w:t xml:space="preserve">So by the scheme (who knows maybe </w:t>
+      </w:r>
+      <w:r>
+        <w:t xml:space="preserve">by making schema object and passing it to the </w:t>
+      </w:r>
+      <w:r>
+        <w:t>)we created a model</w:t>
       </w:r>
       <w:r>
         <w:t>.</w:t>
@@ -6525,15 +5975,7 @@
     </w:p>
     <w:p>
       <w:r>
-        <w:t xml:space="preserve">For admin we will create separate </w:t>
-      </w:r>
-      <w:proofErr w:type="gramStart"/>
-      <w:r>
-        <w:t>UI(</w:t>
-      </w:r>
-      <w:proofErr w:type="gramEnd"/>
-      <w:r>
-        <w:t>who knows</w:t>
+        <w:t>For admin we will create separate UI(who knows</w:t>
       </w:r>
       <w:r>
         <w:t xml:space="preserve"> how we will manage admin authentication</w:t>
@@ -6543,13 +5985,8 @@
       </w:r>
     </w:p>
     <w:p>
-      <w:proofErr w:type="gramStart"/>
-      <w:r>
-        <w:t>So</w:t>
-      </w:r>
-      <w:proofErr w:type="gramEnd"/>
-      <w:r>
-        <w:t xml:space="preserve"> we will create middleware </w:t>
+      <w:r>
+        <w:t xml:space="preserve">So we will create middleware </w:t>
       </w:r>
       <w:r>
         <w:t xml:space="preserve">to connect to database and from there we will </w:t>
@@ -6621,15 +6058,7 @@
         <w:t xml:space="preserve"> and update our store </w:t>
       </w:r>
       <w:r>
-        <w:t xml:space="preserve">so we will make it and then decide who get what </w:t>
-      </w:r>
-      <w:proofErr w:type="gramStart"/>
-      <w:r>
-        <w:t>access(</w:t>
-      </w:r>
-      <w:proofErr w:type="gramEnd"/>
-      <w:r>
-        <w:t>maybe referring to user)</w:t>
+        <w:t>so we will make it and then decide who get what access(maybe referring to user)</w:t>
       </w:r>
       <w:r>
         <w:t xml:space="preserve">. </w:t>
@@ -6687,15 +6116,7 @@
     </w:p>
     <w:p>
       <w:r>
-        <w:t xml:space="preserve">It may be confusing but it is </w:t>
-      </w:r>
-      <w:proofErr w:type="gramStart"/>
-      <w:r>
-        <w:t>as  simple</w:t>
-      </w:r>
-      <w:proofErr w:type="gramEnd"/>
-      <w:r>
-        <w:t xml:space="preserve"> as creating </w:t>
+        <w:t xml:space="preserve">It may be confusing but it is as  simple as creating </w:t>
       </w:r>
       <w:r>
         <w:t xml:space="preserve">middleware folder </w:t>
@@ -6725,22 +6146,14 @@
         <w:t>make</w:t>
       </w:r>
       <w:r>
-        <w:t xml:space="preserve"> environment variable by </w:t>
-      </w:r>
-      <w:proofErr w:type="gramStart"/>
-      <w:r>
-        <w:t xml:space="preserve">making </w:t>
+        <w:t xml:space="preserve"> environment variable by making </w:t>
       </w:r>
       <w:r>
         <w:t>.</w:t>
       </w:r>
       <w:proofErr w:type="spellStart"/>
       <w:r>
-        <w:t>env</w:t>
-      </w:r>
-      <w:proofErr w:type="gramEnd"/>
-      <w:r>
-        <w:t>.local</w:t>
+        <w:t>env.local</w:t>
       </w:r>
       <w:proofErr w:type="spellEnd"/>
       <w:r>
@@ -6776,7 +6189,6 @@
         <w:t xml:space="preserve">We need a connection string to connect to </w:t>
       </w:r>
       <w:proofErr w:type="spellStart"/>
-      <w:proofErr w:type="gramStart"/>
       <w:r>
         <w:t>mongodb</w:t>
       </w:r>
@@ -6785,11 +6197,7 @@
         <w:t xml:space="preserve"> </w:t>
       </w:r>
       <w:r>
-        <w:t xml:space="preserve"> and</w:t>
-      </w:r>
-      <w:proofErr w:type="gramEnd"/>
-      <w:r>
-        <w:t xml:space="preserve"> we can get for </w:t>
+        <w:t xml:space="preserve"> and we can get for </w:t>
       </w:r>
       <w:proofErr w:type="spellStart"/>
       <w:r>
@@ -6805,32 +6213,16 @@
       </w:r>
       <w:proofErr w:type="spellEnd"/>
       <w:r>
-        <w:t xml:space="preserve"> compass and then click on three </w:t>
-      </w:r>
-      <w:proofErr w:type="gramStart"/>
-      <w:r>
-        <w:t>dot</w:t>
-      </w:r>
-      <w:proofErr w:type="gramEnd"/>
-      <w:r>
-        <w:t xml:space="preserve"> </w:t>
+        <w:t xml:space="preserve"> compass and then click on three dot </w:t>
       </w:r>
       <w:r>
         <w:t>as</w:t>
       </w:r>
       <w:r>
-        <w:t xml:space="preserve"> marked </w:t>
-      </w:r>
-      <w:proofErr w:type="gramStart"/>
-      <w:r>
-        <w:t>below</w:t>
-      </w:r>
-      <w:r>
-        <w:t>(</w:t>
-      </w:r>
-      <w:proofErr w:type="gramEnd"/>
-      <w:r>
-        <w:t xml:space="preserve">not </w:t>
+        <w:t xml:space="preserve"> marked below</w:t>
+      </w:r>
+      <w:r>
+        <w:t xml:space="preserve">(not </w:t>
       </w:r>
       <w:proofErr w:type="spellStart"/>
       <w:r>
@@ -6900,19 +6292,11 @@
         <w:t xml:space="preserve"> to get </w:t>
       </w:r>
       <w:r>
-        <w:t xml:space="preserve">the connection string and we will store it </w:t>
-      </w:r>
-      <w:proofErr w:type="gramStart"/>
-      <w:r>
-        <w:t>inside .</w:t>
-      </w:r>
-      <w:proofErr w:type="spellStart"/>
-      <w:r>
-        <w:t>env</w:t>
-      </w:r>
-      <w:proofErr w:type="gramEnd"/>
-      <w:r>
-        <w:t>.local</w:t>
+        <w:t>the connection string and we will store it inside .</w:t>
+      </w:r>
+      <w:proofErr w:type="spellStart"/>
+      <w:r>
+        <w:t>env.local</w:t>
       </w:r>
       <w:proofErr w:type="spellEnd"/>
       <w:r>
@@ -6926,7 +6310,6 @@
           <w:bCs/>
         </w:rPr>
       </w:pPr>
-      <w:proofErr w:type="gramStart"/>
       <w:r>
         <w:rPr>
           <w:b/>
@@ -6934,7 +6317,6 @@
         </w:rPr>
         <w:t>Note:-</w:t>
       </w:r>
-      <w:proofErr w:type="gramEnd"/>
     </w:p>
     <w:p>
       <w:pPr>
@@ -7019,7 +6401,6 @@
           <w:bCs/>
         </w:rPr>
       </w:pPr>
-      <w:proofErr w:type="gramStart"/>
       <w:r>
         <w:rPr>
           <w:b/>
@@ -7028,7 +6409,6 @@
         <w:lastRenderedPageBreak/>
         <w:t>Note:-</w:t>
       </w:r>
-      <w:proofErr w:type="gramEnd"/>
     </w:p>
     <w:p>
       <w:r>
@@ -7041,7 +6421,6 @@
         <w:t xml:space="preserve">when there is not data in </w:t>
       </w:r>
       <w:proofErr w:type="spellStart"/>
-      <w:proofErr w:type="gramStart"/>
       <w:r>
         <w:t>mon</w:t>
       </w:r>
@@ -7053,11 +6432,7 @@
         <w:t xml:space="preserve"> </w:t>
       </w:r>
       <w:r>
-        <w:t xml:space="preserve"> and</w:t>
-      </w:r>
-      <w:proofErr w:type="gramEnd"/>
-      <w:r>
-        <w:t xml:space="preserve"> we use find </w:t>
+        <w:t xml:space="preserve"> and we use find </w:t>
       </w:r>
       <w:proofErr w:type="spellStart"/>
       <w:r>
@@ -7068,29 +6443,13 @@
         <w:t xml:space="preserve"> any operation on modal </w:t>
       </w:r>
       <w:r>
-        <w:t xml:space="preserve">or maybe importing modal then it </w:t>
-      </w:r>
-      <w:proofErr w:type="gramStart"/>
-      <w:r>
-        <w:t>try</w:t>
-      </w:r>
-      <w:proofErr w:type="gramEnd"/>
-      <w:r>
-        <w:t xml:space="preserve"> to form </w:t>
-      </w:r>
-      <w:r>
-        <w:t xml:space="preserve">data again on </w:t>
-      </w:r>
-      <w:proofErr w:type="gramStart"/>
-      <w:r>
-        <w:t>database</w:t>
-      </w:r>
-      <w:r>
-        <w:t>(</w:t>
-      </w:r>
-      <w:proofErr w:type="gramEnd"/>
-      <w:r>
-        <w:t>who knows)</w:t>
+        <w:t xml:space="preserve">or maybe importing modal then it try to form </w:t>
+      </w:r>
+      <w:r>
+        <w:t>data again on database</w:t>
+      </w:r>
+      <w:r>
+        <w:t>(who knows)</w:t>
       </w:r>
       <w:r>
         <w:t>.</w:t>
@@ -7099,12 +6458,10 @@
         <w:t xml:space="preserve"> to fix that in model file write </w:t>
       </w:r>
       <w:proofErr w:type="spellStart"/>
-      <w:proofErr w:type="gramStart"/>
       <w:r>
         <w:t>mongoose.models</w:t>
       </w:r>
       <w:proofErr w:type="spellEnd"/>
-      <w:proofErr w:type="gramEnd"/>
       <w:r>
         <w:t xml:space="preserve"> = {}</w:t>
       </w:r>
@@ -7412,13 +6769,8 @@
       <w:proofErr w:type="spellEnd"/>
     </w:p>
     <w:p>
-      <w:proofErr w:type="gramStart"/>
-      <w:r>
-        <w:t>So</w:t>
-      </w:r>
-      <w:proofErr w:type="gramEnd"/>
-      <w:r>
-        <w:t xml:space="preserve"> we used:</w:t>
+      <w:r>
+        <w:t>So we used:</w:t>
       </w:r>
     </w:p>
     <w:p>
@@ -7640,6 +6992,11 @@
       </w:r>
     </w:p>
     <w:p>
+      <w:pPr>
+        <w:pBdr>
+          <w:bottom w:val="single" w:sz="12" w:space="1" w:color="auto"/>
+        </w:pBdr>
+      </w:pPr>
       <w:proofErr w:type="spellStart"/>
       <w:r>
         <w:t>passHref</w:t>
@@ -7655,6 +7012,424 @@
       <w:proofErr w:type="spellEnd"/>
       <w:r>
         <w:t>).</w:t>
+      </w:r>
+    </w:p>
+    <w:p>
+      <w:r>
+        <w:t xml:space="preserve">When we change color in our product page then we want our </w:t>
+      </w:r>
+      <w:r>
+        <w:t>p</w:t>
+      </w:r>
+      <w:r>
+        <w:t>age to load as we don’t want the user to be con</w:t>
+      </w:r>
+      <w:r>
+        <w:t>f</w:t>
+      </w:r>
+      <w:r>
+        <w:t>used as</w:t>
+      </w:r>
+      <w:r>
+        <w:t xml:space="preserve"> in </w:t>
+      </w:r>
+      <w:r>
+        <w:t>one</w:t>
+      </w:r>
+      <w:r>
+        <w:t xml:space="preserve"> </w:t>
+      </w:r>
+      <w:r>
+        <w:t xml:space="preserve">page application is very fast </w:t>
+      </w:r>
+      <w:r>
+        <w:t xml:space="preserve">and strictly update everything </w:t>
+      </w:r>
+      <w:r>
+        <w:t xml:space="preserve">and </w:t>
+      </w:r>
+      <w:proofErr w:type="gramStart"/>
+      <w:r>
+        <w:t>If</w:t>
+      </w:r>
+      <w:proofErr w:type="gramEnd"/>
+      <w:r>
+        <w:t xml:space="preserve"> any person </w:t>
+      </w:r>
+      <w:proofErr w:type="gramStart"/>
+      <w:r>
+        <w:t>click</w:t>
+      </w:r>
+      <w:proofErr w:type="gramEnd"/>
+      <w:r>
+        <w:t xml:space="preserve"> on the color he </w:t>
+      </w:r>
+      <w:proofErr w:type="gramStart"/>
+      <w:r>
+        <w:t>don’t</w:t>
+      </w:r>
+      <w:proofErr w:type="gramEnd"/>
+      <w:r>
+        <w:t xml:space="preserve"> want and click on add to cart then he might buy wrong color product. </w:t>
+      </w:r>
+      <w:proofErr w:type="gramStart"/>
+      <w:r>
+        <w:t>So</w:t>
+      </w:r>
+      <w:proofErr w:type="gramEnd"/>
+      <w:r>
+        <w:t xml:space="preserve"> he should know he is in new page</w:t>
+      </w:r>
+      <w:r>
+        <w:t xml:space="preserve">. </w:t>
+      </w:r>
+    </w:p>
+    <w:p>
+      <w:r>
+        <w:t xml:space="preserve">There is </w:t>
+      </w:r>
+      <w:r>
+        <w:t>a configuration</w:t>
+      </w:r>
+      <w:r>
+        <w:t xml:space="preserve"> in debugging </w:t>
+      </w:r>
+      <w:r>
+        <w:t>that</w:t>
+      </w:r>
+      <w:r>
+        <w:t xml:space="preserve"> can help that is called preserve log it may be found in every browser </w:t>
+      </w:r>
+      <w:r>
+        <w:t xml:space="preserve">it </w:t>
+      </w:r>
+      <w:proofErr w:type="gramStart"/>
+      <w:r>
+        <w:t>preserve</w:t>
+      </w:r>
+      <w:proofErr w:type="gramEnd"/>
+      <w:r>
+        <w:t xml:space="preserve"> the log that was before reload So to do it go to marked below</w:t>
+      </w:r>
+    </w:p>
+    <w:p>
+      <w:pPr>
+        <w:jc w:val="center"/>
+        <w:rPr>
+          <w:b/>
+          <w:bCs/>
+        </w:rPr>
+      </w:pPr>
+      <w:r>
+        <w:rPr>
+          <w:b/>
+          <w:bCs/>
+        </w:rPr>
+        <w:drawing>
+          <wp:inline distT="0" distB="0" distL="0" distR="0" wp14:anchorId="1A0A36F9" wp14:editId="4D3B142B">
+            <wp:extent cx="5731510" cy="1156335"/>
+            <wp:effectExtent l="0" t="0" r="2540" b="5715"/>
+            <wp:docPr id="89345755" name="Picture 1"/>
+            <wp:cNvGraphicFramePr>
+              <a:graphicFrameLocks xmlns:a="http://schemas.openxmlformats.org/drawingml/2006/main" noChangeAspect="1"/>
+            </wp:cNvGraphicFramePr>
+            <a:graphic xmlns:a="http://schemas.openxmlformats.org/drawingml/2006/main">
+              <a:graphicData uri="http://schemas.openxmlformats.org/drawingml/2006/picture">
+                <pic:pic xmlns:pic="http://schemas.openxmlformats.org/drawingml/2006/picture">
+                  <pic:nvPicPr>
+                    <pic:cNvPr id="89345755" name=""/>
+                    <pic:cNvPicPr/>
+                  </pic:nvPicPr>
+                  <pic:blipFill>
+                    <a:blip r:embed="rId35"/>
+                    <a:stretch>
+                      <a:fillRect/>
+                    </a:stretch>
+                  </pic:blipFill>
+                  <pic:spPr>
+                    <a:xfrm>
+                      <a:off x="0" y="0"/>
+                      <a:ext cx="5731510" cy="1156335"/>
+                    </a:xfrm>
+                    <a:prstGeom prst="rect">
+                      <a:avLst/>
+                    </a:prstGeom>
+                  </pic:spPr>
+                </pic:pic>
+              </a:graphicData>
+            </a:graphic>
+          </wp:inline>
+        </w:drawing>
+      </w:r>
+    </w:p>
+    <w:p>
+      <w:pPr>
+        <w:rPr>
+          <w:b/>
+          <w:bCs/>
+        </w:rPr>
+      </w:pPr>
+      <w:r>
+        <w:rPr>
+          <w:b/>
+          <w:bCs/>
+        </w:rPr>
+        <w:drawing>
+          <wp:inline distT="0" distB="0" distL="0" distR="0" wp14:anchorId="7F43AB2C" wp14:editId="4F4DD218">
+            <wp:extent cx="5731510" cy="1263650"/>
+            <wp:effectExtent l="0" t="0" r="2540" b="0"/>
+            <wp:docPr id="1822315991" name="Picture 1"/>
+            <wp:cNvGraphicFramePr>
+              <a:graphicFrameLocks xmlns:a="http://schemas.openxmlformats.org/drawingml/2006/main" noChangeAspect="1"/>
+            </wp:cNvGraphicFramePr>
+            <a:graphic xmlns:a="http://schemas.openxmlformats.org/drawingml/2006/main">
+              <a:graphicData uri="http://schemas.openxmlformats.org/drawingml/2006/picture">
+                <pic:pic xmlns:pic="http://schemas.openxmlformats.org/drawingml/2006/picture">
+                  <pic:nvPicPr>
+                    <pic:cNvPr id="1822315991" name=""/>
+                    <pic:cNvPicPr/>
+                  </pic:nvPicPr>
+                  <pic:blipFill>
+                    <a:blip r:embed="rId36"/>
+                    <a:stretch>
+                      <a:fillRect/>
+                    </a:stretch>
+                  </pic:blipFill>
+                  <pic:spPr>
+                    <a:xfrm>
+                      <a:off x="0" y="0"/>
+                      <a:ext cx="5731510" cy="1263650"/>
+                    </a:xfrm>
+                    <a:prstGeom prst="rect">
+                      <a:avLst/>
+                    </a:prstGeom>
+                  </pic:spPr>
+                </pic:pic>
+              </a:graphicData>
+            </a:graphic>
+          </wp:inline>
+        </w:drawing>
+      </w:r>
+    </w:p>
+    <w:p>
+      <w:r>
+        <w:t xml:space="preserve">Now we go to </w:t>
+      </w:r>
+      <w:r>
+        <w:t xml:space="preserve">marked above </w:t>
+      </w:r>
+      <w:r>
+        <w:t xml:space="preserve">and then </w:t>
+      </w:r>
+      <w:r>
+        <w:t>check the preserve log.</w:t>
+      </w:r>
+    </w:p>
+    <w:p>
+      <w:pPr>
+        <w:rPr>
+          <w:b/>
+          <w:bCs/>
+          <w:color w:val="EE0000"/>
+        </w:rPr>
+      </w:pPr>
+      <w:r>
+        <w:rPr>
+          <w:b/>
+          <w:bCs/>
+          <w:color w:val="EE0000"/>
+        </w:rPr>
+        <w:t>In a select ele</w:t>
+      </w:r>
+      <w:r>
+        <w:rPr>
+          <w:b/>
+          <w:bCs/>
+          <w:color w:val="EE0000"/>
+        </w:rPr>
+        <w:t xml:space="preserve">ment </w:t>
+      </w:r>
+      <w:r>
+        <w:rPr>
+          <w:b/>
+          <w:bCs/>
+          <w:color w:val="EE0000"/>
+        </w:rPr>
+        <w:t>we have an attribu</w:t>
+      </w:r>
+      <w:r>
+        <w:rPr>
+          <w:b/>
+          <w:bCs/>
+          <w:color w:val="EE0000"/>
+        </w:rPr>
+        <w:t>te that is value that tells what is selected in the select list</w:t>
+      </w:r>
+      <w:r>
+        <w:rPr>
+          <w:b/>
+          <w:bCs/>
+          <w:color w:val="EE0000"/>
+        </w:rPr>
+        <w:t xml:space="preserve"> by default</w:t>
+      </w:r>
+      <w:r>
+        <w:rPr>
+          <w:b/>
+          <w:bCs/>
+          <w:color w:val="EE0000"/>
+        </w:rPr>
+        <w:t xml:space="preserve"> </w:t>
+      </w:r>
+      <w:r>
+        <w:rPr>
+          <w:b/>
+          <w:bCs/>
+          <w:color w:val="EE0000"/>
+        </w:rPr>
+        <w:t xml:space="preserve">as </w:t>
+      </w:r>
+      <w:r>
+        <w:rPr>
+          <w:b/>
+          <w:bCs/>
+          <w:color w:val="EE0000"/>
+        </w:rPr>
+        <w:t>select</w:t>
+      </w:r>
+      <w:r>
+        <w:rPr>
+          <w:b/>
+          <w:bCs/>
+          <w:color w:val="EE0000"/>
+        </w:rPr>
+        <w:t xml:space="preserve"> match </w:t>
+      </w:r>
+      <w:r>
+        <w:rPr>
+          <w:b/>
+          <w:bCs/>
+          <w:color w:val="EE0000"/>
+        </w:rPr>
+        <w:t>its</w:t>
+      </w:r>
+      <w:r>
+        <w:rPr>
+          <w:b/>
+          <w:bCs/>
+          <w:color w:val="EE0000"/>
+        </w:rPr>
+        <w:t xml:space="preserve"> value attribute value to the value of </w:t>
+      </w:r>
+      <w:r>
+        <w:rPr>
+          <w:b/>
+          <w:bCs/>
+          <w:color w:val="EE0000"/>
+        </w:rPr>
+        <w:t xml:space="preserve">option element </w:t>
+      </w:r>
+      <w:r>
+        <w:rPr>
+          <w:b/>
+          <w:bCs/>
+          <w:color w:val="EE0000"/>
+        </w:rPr>
+        <w:t>so we can use it instead of using select</w:t>
+      </w:r>
+      <w:r>
+        <w:rPr>
+          <w:b/>
+          <w:bCs/>
+          <w:color w:val="EE0000"/>
+        </w:rPr>
+        <w:t>ed</w:t>
+      </w:r>
+      <w:r>
+        <w:rPr>
+          <w:b/>
+          <w:bCs/>
+          <w:color w:val="EE0000"/>
+        </w:rPr>
+        <w:t xml:space="preserve"> </w:t>
+      </w:r>
+      <w:r>
+        <w:rPr>
+          <w:b/>
+          <w:bCs/>
+          <w:color w:val="EE0000"/>
+        </w:rPr>
+        <w:t xml:space="preserve">Boolean </w:t>
+      </w:r>
+      <w:r>
+        <w:rPr>
+          <w:b/>
+          <w:bCs/>
+          <w:color w:val="EE0000"/>
+        </w:rPr>
+        <w:t xml:space="preserve">attribute on a particular </w:t>
+      </w:r>
+      <w:r>
+        <w:rPr>
+          <w:b/>
+          <w:bCs/>
+          <w:color w:val="EE0000"/>
+        </w:rPr>
+        <w:t>option we want to show by default</w:t>
+      </w:r>
+      <w:r>
+        <w:rPr>
+          <w:b/>
+          <w:bCs/>
+        </w:rPr>
+        <w:t xml:space="preserve"> </w:t>
+      </w:r>
+      <w:r>
+        <w:rPr>
+          <w:b/>
+          <w:bCs/>
+          <w:color w:val="EE0000"/>
+        </w:rPr>
+        <w:t>shown below</w:t>
+      </w:r>
+    </w:p>
+    <w:p>
+      <w:r>
+        <w:drawing>
+          <wp:inline distT="0" distB="0" distL="0" distR="0" wp14:anchorId="37F787A8" wp14:editId="3402E84A">
+            <wp:extent cx="5731510" cy="1045210"/>
+            <wp:effectExtent l="0" t="0" r="2540" b="2540"/>
+            <wp:docPr id="1965773188" name="Picture 1"/>
+            <wp:cNvGraphicFramePr>
+              <a:graphicFrameLocks xmlns:a="http://schemas.openxmlformats.org/drawingml/2006/main" noChangeAspect="1"/>
+            </wp:cNvGraphicFramePr>
+            <a:graphic xmlns:a="http://schemas.openxmlformats.org/drawingml/2006/main">
+              <a:graphicData uri="http://schemas.openxmlformats.org/drawingml/2006/picture">
+                <pic:pic xmlns:pic="http://schemas.openxmlformats.org/drawingml/2006/picture">
+                  <pic:nvPicPr>
+                    <pic:cNvPr id="1965773188" name=""/>
+                    <pic:cNvPicPr/>
+                  </pic:nvPicPr>
+                  <pic:blipFill>
+                    <a:blip r:embed="rId37"/>
+                    <a:stretch>
+                      <a:fillRect/>
+                    </a:stretch>
+                  </pic:blipFill>
+                  <pic:spPr>
+                    <a:xfrm>
+                      <a:off x="0" y="0"/>
+                      <a:ext cx="5731510" cy="1045210"/>
+                    </a:xfrm>
+                    <a:prstGeom prst="rect">
+                      <a:avLst/>
+                    </a:prstGeom>
+                  </pic:spPr>
+                </pic:pic>
+              </a:graphicData>
+            </a:graphic>
+          </wp:inline>
+        </w:drawing>
       </w:r>
     </w:p>
     <w:p/>

</xml_diff>

<commit_message>
Lesson 50 Replacing Dummy Text on Codeswear.com
</commit_message>
<xml_diff>
--- a/Notes2.docx
+++ b/Notes2.docx
@@ -4,13 +4,8 @@
   <w:body>
     <w:p>
       <w:r>
-        <w:t xml:space="preserve">In this lesson we will see a react feature that is </w:t>
-      </w:r>
-      <w:proofErr w:type="spellStart"/>
-      <w:r>
-        <w:t>dangerouslysetinnerHTML</w:t>
-      </w:r>
-      <w:proofErr w:type="spellEnd"/>
+        <w:t>In this lesson we will see a react feature that is dangerouslysetinnerHTML</w:t>
+      </w:r>
     </w:p>
     <w:p>
       <w:pPr>
@@ -79,11 +74,7 @@
         <w:t>input HTML</w:t>
       </w:r>
       <w:r>
-        <w:t xml:space="preserve"> then you have to use </w:t>
-      </w:r>
-      <w:proofErr w:type="spellStart"/>
-      <w:r>
-        <w:t>dangerou</w:t>
+        <w:t xml:space="preserve"> then you have to use dangerou</w:t>
       </w:r>
       <w:r>
         <w:t>s</w:t>
@@ -94,7 +85,6 @@
       <w:r>
         <w:t>setInner</w:t>
       </w:r>
-      <w:proofErr w:type="spellEnd"/>
       <w:r>
         <w:t xml:space="preserve"> </w:t>
       </w:r>
@@ -120,55 +110,39 @@
         <w:t xml:space="preserve">We will see with the help of </w:t>
       </w:r>
       <w:r>
-        <w:t xml:space="preserve">dangerously </w:t>
-      </w:r>
-      <w:proofErr w:type="spellStart"/>
-      <w:r>
-        <w:t>innerhtml</w:t>
-      </w:r>
-      <w:proofErr w:type="spellEnd"/>
+        <w:t xml:space="preserve">dangerously innerhtml </w:t>
+      </w:r>
+      <w:r>
+        <w:t xml:space="preserve">we can put </w:t>
+      </w:r>
+      <w:r>
+        <w:t xml:space="preserve">html </w:t>
+      </w:r>
+      <w:r>
+        <w:t>conten</w:t>
+      </w:r>
+      <w:r>
+        <w:t>t in huntingcoder which has simple</w:t>
+      </w:r>
+      <w:r>
+        <w:t xml:space="preserve"> p and hea</w:t>
+      </w:r>
+      <w:r>
+        <w:t>ding plain text</w:t>
+      </w:r>
+      <w:r>
+        <w:t xml:space="preserve"> was there. </w:t>
+      </w:r>
+      <w:r>
+        <w:t xml:space="preserve">So that it looks beautiful </w:t>
+      </w:r>
+      <w:r>
+        <w:t>and the option</w:t>
+      </w:r>
       <w:r>
         <w:t xml:space="preserve"> </w:t>
       </w:r>
       <w:r>
-        <w:t xml:space="preserve">we can put </w:t>
-      </w:r>
-      <w:r>
-        <w:t xml:space="preserve">html </w:t>
-      </w:r>
-      <w:r>
-        <w:t>conten</w:t>
-      </w:r>
-      <w:r>
-        <w:t xml:space="preserve">t in </w:t>
-      </w:r>
-      <w:proofErr w:type="spellStart"/>
-      <w:r>
-        <w:t>huntingcoder</w:t>
-      </w:r>
-      <w:proofErr w:type="spellEnd"/>
-      <w:r>
-        <w:t xml:space="preserve"> which has simple</w:t>
-      </w:r>
-      <w:r>
-        <w:t xml:space="preserve"> p and hea</w:t>
-      </w:r>
-      <w:r>
-        <w:t>ding plain text</w:t>
-      </w:r>
-      <w:r>
-        <w:t xml:space="preserve"> was there. </w:t>
-      </w:r>
-      <w:r>
-        <w:t xml:space="preserve">So that it looks beautiful </w:t>
-      </w:r>
-      <w:r>
-        <w:t>and the option</w:t>
-      </w:r>
-      <w:r>
-        <w:t xml:space="preserve"> </w:t>
-      </w:r>
-      <w:r>
         <w:t xml:space="preserve">of formatting </w:t>
       </w:r>
       <w:r>
@@ -178,23 +152,7 @@
         <w:t xml:space="preserve">Out blog is HTML Now if you </w:t>
       </w:r>
       <w:r>
-        <w:t xml:space="preserve">put html </w:t>
-      </w:r>
-      <w:proofErr w:type="spellStart"/>
-      <w:r>
-        <w:t>uibside</w:t>
-      </w:r>
-      <w:proofErr w:type="spellEnd"/>
-      <w:r>
-        <w:t xml:space="preserve"> string in </w:t>
-      </w:r>
-      <w:proofErr w:type="spellStart"/>
-      <w:r>
-        <w:t>json</w:t>
-      </w:r>
-      <w:proofErr w:type="spellEnd"/>
-      <w:r>
-        <w:t xml:space="preserve"> file. </w:t>
+        <w:t xml:space="preserve">put html uibside string in json file. </w:t>
       </w:r>
       <w:r>
         <w:t xml:space="preserve">We want to write such that </w:t>
@@ -217,15 +175,7 @@
         </w:r>
       </w:hyperlink>
       <w:r>
-        <w:t xml:space="preserve"> and then copy the html content </w:t>
-      </w:r>
-      <w:proofErr w:type="spellStart"/>
-      <w:r>
-        <w:t>shownin</w:t>
-      </w:r>
-      <w:proofErr w:type="spellEnd"/>
-      <w:r>
-        <w:t xml:space="preserve"> in the first page </w:t>
+        <w:t xml:space="preserve"> and then copy the html content shownin in the first page </w:t>
       </w:r>
       <w:r>
         <w:t xml:space="preserve">and at first we paste it in the address bar so that </w:t>
@@ -243,26 +193,10 @@
         <w:t>e</w:t>
       </w:r>
       <w:r>
-        <w:t xml:space="preserve"> and then we search Json and aby any ransom site escape the </w:t>
-      </w:r>
-      <w:proofErr w:type="spellStart"/>
-      <w:r>
-        <w:t>jaon</w:t>
-      </w:r>
-      <w:proofErr w:type="spellEnd"/>
-      <w:r>
-        <w:t xml:space="preserve"> that is replace “ by /” and many more and then again remove the </w:t>
-      </w:r>
-      <w:r>
-        <w:t xml:space="preserve">new lines by </w:t>
-      </w:r>
-      <w:proofErr w:type="spellStart"/>
-      <w:r>
-        <w:t>pasing</w:t>
-      </w:r>
-      <w:proofErr w:type="spellEnd"/>
-      <w:r>
-        <w:t xml:space="preserve"> in the address bar.</w:t>
+        <w:t xml:space="preserve"> and then we search Json and aby any ransom site escape the jaon that is replace “ by /” and many more and then again remove the </w:t>
+      </w:r>
+      <w:r>
+        <w:t>new lines by pasing in the address bar.</w:t>
       </w:r>
     </w:p>
     <w:p>
@@ -333,15 +267,7 @@
         <w:t>It</w:t>
       </w:r>
       <w:r>
-        <w:t>(</w:t>
-      </w:r>
-      <w:proofErr w:type="spellStart"/>
-      <w:r>
-        <w:t>Nextjs</w:t>
-      </w:r>
-      <w:proofErr w:type="spellEnd"/>
-      <w:r>
-        <w:t xml:space="preserve"> or react)</w:t>
+        <w:t>(Nextjs or react)</w:t>
       </w:r>
       <w:r>
         <w:t xml:space="preserve"> wants to keep you sa</w:t>
@@ -358,27 +284,14 @@
       <w:r>
         <w:t xml:space="preserve"> you need to tell </w:t>
       </w:r>
-      <w:proofErr w:type="spellStart"/>
-      <w:r>
-        <w:t>Nextjs</w:t>
-      </w:r>
-      <w:proofErr w:type="spellEnd"/>
-      <w:r>
-        <w:t xml:space="preserve"> that you want to parse html </w:t>
+      <w:r>
+        <w:t xml:space="preserve">Nextjs that you want to parse html </w:t>
       </w:r>
       <w:r>
         <w:t>there is a tool or setting (who knows)</w:t>
       </w:r>
       <w:r>
-        <w:t xml:space="preserve"> and it is a part of react not a part of </w:t>
-      </w:r>
-      <w:proofErr w:type="spellStart"/>
-      <w:r>
-        <w:t>nextjs</w:t>
-      </w:r>
-      <w:proofErr w:type="spellEnd"/>
-      <w:r>
-        <w:t xml:space="preserve"> </w:t>
+        <w:t xml:space="preserve"> and it is a part of react not a part of nextjs </w:t>
       </w:r>
       <w:r>
         <w:t xml:space="preserve">as it is a feature of react </w:t>
@@ -434,23 +347,10 @@
     </w:p>
     <w:p>
       <w:r>
-        <w:t xml:space="preserve">The element where you used </w:t>
-      </w:r>
-      <w:proofErr w:type="spellStart"/>
-      <w:r>
-        <w:t>dangerouslyinnerHTML</w:t>
-      </w:r>
-      <w:proofErr w:type="spellEnd"/>
-      <w:r>
-        <w:t xml:space="preserve"> should not have space in the content as it is considered a content </w:t>
-      </w:r>
-      <w:proofErr w:type="spellStart"/>
-      <w:r>
-        <w:t>other wise</w:t>
-      </w:r>
-      <w:proofErr w:type="spellEnd"/>
-      <w:r>
-        <w:t xml:space="preserve"> you will get this error</w:t>
+        <w:t>The element where you used dangerouslyinnerHTML</w:t>
+      </w:r>
+      <w:r>
+        <w:t xml:space="preserve"> should not have space in the content as it is considered a content other wise you will get this error</w:t>
       </w:r>
     </w:p>
     <w:p>
@@ -498,15 +398,7 @@
     </w:p>
     <w:p>
       <w:r>
-        <w:t xml:space="preserve">Now our slug folder </w:t>
-      </w:r>
-      <w:proofErr w:type="spellStart"/>
-      <w:r>
-        <w:t>page.jsx</w:t>
-      </w:r>
-      <w:proofErr w:type="spellEnd"/>
-      <w:r>
-        <w:t xml:space="preserve"> look like below</w:t>
+        <w:t>Now our slug folder page.jsx look like below</w:t>
       </w:r>
     </w:p>
     <w:p>
@@ -689,13 +581,8 @@
       <w:r>
         <w:t xml:space="preserve"> </w:t>
       </w:r>
-      <w:proofErr w:type="spellStart"/>
-      <w:r>
-        <w:t>api</w:t>
-      </w:r>
-      <w:proofErr w:type="spellEnd"/>
-      <w:r>
-        <w:t xml:space="preserve"> in this lesso</w:t>
+      <w:r>
+        <w:t>api in this lesso</w:t>
       </w:r>
       <w:r>
         <w:t>n. We will see make it using Next.js API route</w:t>
@@ -718,21 +605,8 @@
       <w:r>
         <w:t xml:space="preserve">it </w:t>
       </w:r>
-      <w:proofErr w:type="spellStart"/>
-      <w:r>
-        <w:t>Seom</w:t>
-      </w:r>
-      <w:proofErr w:type="spellEnd"/>
-      <w:r>
-        <w:t xml:space="preserve"> </w:t>
-      </w:r>
-      <w:proofErr w:type="spellStart"/>
-      <w:r>
-        <w:t>noownards</w:t>
-      </w:r>
-      <w:proofErr w:type="spellEnd"/>
-      <w:r>
-        <w:t xml:space="preserve"> I will not give too much explanation</w:t>
+      <w:r>
+        <w:t>Seom noownards I will not give too much explanation</w:t>
       </w:r>
     </w:p>
     <w:p>
@@ -887,28 +761,12 @@
     </w:p>
     <w:p>
       <w:r>
-        <w:t xml:space="preserve">In older version teacher try to send </w:t>
-      </w:r>
-      <w:proofErr w:type="spellStart"/>
-      <w:r>
-        <w:t>req</w:t>
-      </w:r>
-      <w:proofErr w:type="spellEnd"/>
-      <w:r>
-        <w:t xml:space="preserve"> but could not send because </w:t>
-      </w:r>
-    </w:p>
-    <w:p>
-      <w:r>
-        <w:t xml:space="preserve">You didn’t see useful data because </w:t>
-      </w:r>
-      <w:proofErr w:type="spellStart"/>
-      <w:r>
-        <w:t>req</w:t>
-      </w:r>
-      <w:proofErr w:type="spellEnd"/>
-      <w:r>
-        <w:t xml:space="preserve"> is a </w:t>
+        <w:t xml:space="preserve">In older version teacher try to send req but could not send because </w:t>
+      </w:r>
+    </w:p>
+    <w:p>
+      <w:r>
+        <w:t xml:space="preserve">You didn’t see useful data because req is a </w:t>
       </w:r>
       <w:r>
         <w:rPr>
@@ -920,23 +778,13 @@
       <w:r>
         <w:t xml:space="preserve">, not plain JSON, so sending it directly with </w:t>
       </w:r>
-      <w:proofErr w:type="spellStart"/>
       <w:proofErr w:type="gramStart"/>
       <w:r>
         <w:t>res.json</w:t>
       </w:r>
-      <w:proofErr w:type="spellEnd"/>
       <w:proofErr w:type="gramEnd"/>
       <w:r>
-        <w:t>(</w:t>
-      </w:r>
-      <w:proofErr w:type="spellStart"/>
-      <w:r>
-        <w:t>req</w:t>
-      </w:r>
-      <w:proofErr w:type="spellEnd"/>
-      <w:r>
-        <w:t>) doesn’t work as expected.</w:t>
+        <w:t>(req) doesn’t work as expected.</w:t>
       </w:r>
     </w:p>
     <w:p>
@@ -958,23 +806,7 @@
           <w:b/>
           <w:bCs/>
         </w:rPr>
-        <w:t xml:space="preserve">What </w:t>
-      </w:r>
-      <w:proofErr w:type="spellStart"/>
-      <w:r>
-        <w:rPr>
-          <w:b/>
-          <w:bCs/>
-        </w:rPr>
-        <w:t>req</w:t>
-      </w:r>
-      <w:proofErr w:type="spellEnd"/>
-      <w:r>
-        <w:rPr>
-          <w:b/>
-          <w:bCs/>
-        </w:rPr>
-        <w:t xml:space="preserve"> contains (old Next.js / Node.js)</w:t>
+        <w:t>What req contains (old Next.js / Node.js)</w:t>
       </w:r>
     </w:p>
     <w:p>
@@ -984,25 +816,12 @@
     </w:p>
     <w:p>
       <w:r>
-        <w:t>export default function handler(</w:t>
-      </w:r>
-      <w:proofErr w:type="spellStart"/>
-      <w:r>
-        <w:t>req</w:t>
-      </w:r>
-      <w:proofErr w:type="spellEnd"/>
-      <w:r>
-        <w:t>, res)</w:t>
-      </w:r>
-    </w:p>
-    <w:p>
-      <w:proofErr w:type="spellStart"/>
-      <w:r>
-        <w:t>req</w:t>
-      </w:r>
-      <w:proofErr w:type="spellEnd"/>
-      <w:r>
-        <w:t xml:space="preserve"> is a </w:t>
+        <w:t>export default function handler(req, res)</w:t>
+      </w:r>
+    </w:p>
+    <w:p>
+      <w:r>
+        <w:t xml:space="preserve">req is a </w:t>
       </w:r>
       <w:r>
         <w:rPr>
@@ -1089,39 +908,7 @@
           <w:b/>
           <w:bCs/>
         </w:rPr>
-        <w:t xml:space="preserve">Why </w:t>
-      </w:r>
-      <w:proofErr w:type="spellStart"/>
-      <w:r>
-        <w:rPr>
-          <w:b/>
-          <w:bCs/>
-        </w:rPr>
-        <w:t>res.json</w:t>
-      </w:r>
-      <w:proofErr w:type="spellEnd"/>
-      <w:r>
-        <w:rPr>
-          <w:b/>
-          <w:bCs/>
-        </w:rPr>
-        <w:t>(</w:t>
-      </w:r>
-      <w:proofErr w:type="spellStart"/>
-      <w:r>
-        <w:rPr>
-          <w:b/>
-          <w:bCs/>
-        </w:rPr>
-        <w:t>req</w:t>
-      </w:r>
-      <w:proofErr w:type="spellEnd"/>
-      <w:r>
-        <w:rPr>
-          <w:b/>
-          <w:bCs/>
-        </w:rPr>
-        <w:t>) doesn’t show data</w:t>
+        <w:t>Why res.json(req) doesn’t show data</w:t>
       </w:r>
     </w:p>
     <w:p>
@@ -1130,29 +917,8 @@
       </w:r>
     </w:p>
     <w:p>
-      <w:proofErr w:type="spellStart"/>
-      <w:r>
-        <w:t>res.status</w:t>
-      </w:r>
-      <w:proofErr w:type="spellEnd"/>
-      <w:r>
-        <w:t>(200).</w:t>
-      </w:r>
-      <w:proofErr w:type="spellStart"/>
-      <w:r>
-        <w:t>json</w:t>
-      </w:r>
-      <w:proofErr w:type="spellEnd"/>
-      <w:r>
-        <w:t>(</w:t>
-      </w:r>
-      <w:proofErr w:type="spellStart"/>
-      <w:r>
-        <w:t>req</w:t>
-      </w:r>
-      <w:proofErr w:type="spellEnd"/>
-      <w:r>
-        <w:t>)</w:t>
+      <w:r>
+        <w:t>res.status(200).json(req)</w:t>
       </w:r>
     </w:p>
     <w:p>
@@ -1161,13 +927,8 @@
       </w:r>
     </w:p>
     <w:p>
-      <w:proofErr w:type="spellStart"/>
-      <w:r>
-        <w:t>req</w:t>
-      </w:r>
-      <w:proofErr w:type="spellEnd"/>
-      <w:r>
-        <w:t xml:space="preserve"> is NOT a plain object</w:t>
+      <w:r>
+        <w:t>req is NOT a plain object</w:t>
       </w:r>
       <w:r>
         <w:br/>
@@ -1243,83 +1004,27 @@
     </w:p>
     <w:p>
       <w:r>
-        <w:t>export default function handler(</w:t>
-      </w:r>
-      <w:proofErr w:type="spellStart"/>
-      <w:r>
-        <w:t>req</w:t>
-      </w:r>
-      <w:proofErr w:type="spellEnd"/>
-      <w:r>
-        <w:t>, res) {</w:t>
+        <w:t>export default function handler(req, res) {</w:t>
       </w:r>
       <w:r>
         <w:br/>
-        <w:t xml:space="preserve">  if (</w:t>
-      </w:r>
-      <w:proofErr w:type="spellStart"/>
-      <w:r>
-        <w:t>req.method</w:t>
-      </w:r>
-      <w:proofErr w:type="spellEnd"/>
-      <w:r>
-        <w:t xml:space="preserve"> === "POST") {</w:t>
+        <w:t xml:space="preserve">  if (req.method === "POST") {</w:t>
       </w:r>
       <w:r>
         <w:br/>
-        <w:t xml:space="preserve">    </w:t>
-      </w:r>
-      <w:proofErr w:type="spellStart"/>
-      <w:r>
-        <w:t>res.status</w:t>
-      </w:r>
-      <w:proofErr w:type="spellEnd"/>
-      <w:r>
-        <w:t>(200).</w:t>
-      </w:r>
-      <w:proofErr w:type="spellStart"/>
-      <w:r>
-        <w:t>json</w:t>
-      </w:r>
-      <w:proofErr w:type="spellEnd"/>
-      <w:r>
-        <w:t>({</w:t>
+        <w:t xml:space="preserve">    res.status(200).json({</w:t>
       </w:r>
       <w:r>
         <w:br/>
-        <w:t xml:space="preserve">      method: </w:t>
-      </w:r>
-      <w:proofErr w:type="spellStart"/>
-      <w:r>
-        <w:t>req.method</w:t>
-      </w:r>
-      <w:proofErr w:type="spellEnd"/>
-      <w:r>
-        <w:t>,</w:t>
+        <w:t xml:space="preserve">      method: req.method,</w:t>
       </w:r>
       <w:r>
         <w:br/>
-        <w:t xml:space="preserve">      body: </w:t>
-      </w:r>
-      <w:proofErr w:type="spellStart"/>
-      <w:r>
-        <w:t>req.body</w:t>
-      </w:r>
-      <w:proofErr w:type="spellEnd"/>
-      <w:r>
-        <w:t>,</w:t>
+        <w:t xml:space="preserve">      body: req.body,</w:t>
       </w:r>
       <w:r>
         <w:br/>
-        <w:t xml:space="preserve">      query: </w:t>
-      </w:r>
-      <w:proofErr w:type="spellStart"/>
-      <w:r>
-        <w:t>req.query</w:t>
-      </w:r>
-      <w:proofErr w:type="spellEnd"/>
-      <w:r>
-        <w:t>,</w:t>
+        <w:t xml:space="preserve">      query: req.query,</w:t>
       </w:r>
       <w:r>
         <w:br/>
@@ -1443,13 +1148,8 @@
             <w:hideMark/>
           </w:tcPr>
           <w:p>
-            <w:proofErr w:type="spellStart"/>
             <w:r>
-              <w:t>req</w:t>
-            </w:r>
-            <w:proofErr w:type="spellEnd"/>
-            <w:r>
-              <w:t xml:space="preserve"> (whole object)</w:t>
+              <w:t>req (whole object)</w:t>
             </w:r>
           </w:p>
         </w:tc>
@@ -1483,11 +1183,9 @@
             <w:hideMark/>
           </w:tcPr>
           <w:p>
-            <w:proofErr w:type="spellStart"/>
             <w:r>
               <w:t>req.body</w:t>
             </w:r>
-            <w:proofErr w:type="spellEnd"/>
           </w:p>
         </w:tc>
         <w:tc>
@@ -1520,11 +1218,9 @@
             <w:hideMark/>
           </w:tcPr>
           <w:p>
-            <w:proofErr w:type="spellStart"/>
             <w:r>
               <w:t>req.query</w:t>
             </w:r>
-            <w:proofErr w:type="spellEnd"/>
           </w:p>
         </w:tc>
         <w:tc>
@@ -1557,11 +1253,9 @@
             <w:hideMark/>
           </w:tcPr>
           <w:p>
-            <w:proofErr w:type="spellStart"/>
             <w:r>
               <w:t>req.method</w:t>
             </w:r>
-            <w:proofErr w:type="spellEnd"/>
           </w:p>
         </w:tc>
         <w:tc>
@@ -1613,15 +1307,7 @@
     </w:p>
     <w:p>
       <w:r>
-        <w:t>export async function POST(</w:t>
-      </w:r>
-      <w:proofErr w:type="spellStart"/>
-      <w:r>
-        <w:t>req</w:t>
-      </w:r>
-      <w:proofErr w:type="spellEnd"/>
-      <w:r>
-        <w:t>)</w:t>
+        <w:t>export async function POST(req)</w:t>
       </w:r>
     </w:p>
     <w:p>
@@ -1630,21 +1316,8 @@
       </w:r>
     </w:p>
     <w:p>
-      <w:proofErr w:type="spellStart"/>
-      <w:r>
-        <w:t>const</w:t>
-      </w:r>
-      <w:proofErr w:type="spellEnd"/>
-      <w:r>
-        <w:t xml:space="preserve"> body = await </w:t>
-      </w:r>
-      <w:proofErr w:type="spellStart"/>
-      <w:r>
-        <w:t>req.json</w:t>
-      </w:r>
-      <w:proofErr w:type="spellEnd"/>
-      <w:r>
-        <w:t>();</w:t>
+      <w:r>
+        <w:t>const body = await req.json();</w:t>
       </w:r>
     </w:p>
     <w:p>
@@ -1687,29 +1360,13 @@
       </w:pPr>
       <w:r>
         <w:lastRenderedPageBreak/>
-        <w:t xml:space="preserve">You didn’t see </w:t>
-      </w:r>
-      <w:proofErr w:type="spellStart"/>
-      <w:r>
-        <w:t>req</w:t>
-      </w:r>
-      <w:proofErr w:type="spellEnd"/>
-      <w:r>
-        <w:t xml:space="preserve"> in the response because it’s a complex object that cannot be directly converted to JSON—you need to se</w:t>
+        <w:t>You didn’t see req in the response because it’s a complex object that cannot be directly converted to JSON—you need to se</w:t>
       </w:r>
       <w:r>
         <w:t>n</w:t>
       </w:r>
       <w:r>
-        <w:t xml:space="preserve">d specific fields like </w:t>
-      </w:r>
-      <w:proofErr w:type="spellStart"/>
-      <w:r>
-        <w:t>req.body</w:t>
-      </w:r>
-      <w:proofErr w:type="spellEnd"/>
-      <w:r>
-        <w:t>.</w:t>
+        <w:t>d specific fields like req.body.</w:t>
       </w:r>
     </w:p>
     <w:p>
@@ -1826,31 +1483,7 @@
         <w:t xml:space="preserve"> is that </w:t>
       </w:r>
       <w:r>
-        <w:t xml:space="preserve">if suppose </w:t>
-      </w:r>
-      <w:proofErr w:type="spellStart"/>
-      <w:r>
-        <w:t>oint</w:t>
-      </w:r>
-      <w:proofErr w:type="spellEnd"/>
-      <w:r>
-        <w:t xml:space="preserve"> fail is failed to </w:t>
-      </w:r>
-      <w:proofErr w:type="spellStart"/>
-      <w:r>
-        <w:t>wiriteen</w:t>
-      </w:r>
-      <w:proofErr w:type="spellEnd"/>
-      <w:r>
-        <w:t xml:space="preserve"> an </w:t>
-      </w:r>
-      <w:proofErr w:type="spellStart"/>
-      <w:r>
-        <w:t>empyty</w:t>
-      </w:r>
-      <w:proofErr w:type="spellEnd"/>
-      <w:r>
-        <w:t xml:space="preserve"> fie is created </w:t>
+        <w:t xml:space="preserve">if suppose oint fail is failed to wiriteen an empyty fie is created </w:t>
       </w:r>
       <w:r>
         <w:t>problem can happen (maybe if we associate a number to a user who tries to contact (who knows))</w:t>
@@ -1912,15 +1545,7 @@
       </w:r>
       <w:r>
         <w:lastRenderedPageBreak/>
-        <w:t xml:space="preserve">This error we may face if we </w:t>
-      </w:r>
-      <w:proofErr w:type="spellStart"/>
-      <w:r>
-        <w:t>son’t</w:t>
-      </w:r>
-      <w:proofErr w:type="spellEnd"/>
-      <w:r>
-        <w:t xml:space="preserve"> set the value of the input fields </w:t>
+        <w:t xml:space="preserve">This error we may face if we son’t set the value of the input fields </w:t>
       </w:r>
     </w:p>
     <w:p>
@@ -1928,15 +1553,7 @@
         <w:t xml:space="preserve">In older version </w:t>
       </w:r>
       <w:r>
-        <w:t xml:space="preserve">we used to put the state value in between the </w:t>
-      </w:r>
-      <w:proofErr w:type="spellStart"/>
-      <w:r>
-        <w:t>textarea</w:t>
-      </w:r>
-      <w:proofErr w:type="spellEnd"/>
-      <w:r>
-        <w:t xml:space="preserve"> element</w:t>
+        <w:t>we used to put the state value in between the textarea element</w:t>
       </w:r>
       <w:r>
         <w:t>(who knows may be I am wrong here)</w:t>
@@ -1945,70 +1562,20 @@
         <w:t xml:space="preserve"> </w:t>
       </w:r>
       <w:r>
-        <w:t xml:space="preserve">and on state update method we used </w:t>
-      </w:r>
-      <w:proofErr w:type="spellStart"/>
-      <w:r>
-        <w:t>e.target.innerText</w:t>
-      </w:r>
-      <w:proofErr w:type="spellEnd"/>
-    </w:p>
-    <w:p>
-      <w:r>
-        <w:t xml:space="preserve">But now in </w:t>
-      </w:r>
-      <w:proofErr w:type="spellStart"/>
-      <w:r>
-        <w:t>Textare</w:t>
-      </w:r>
-      <w:proofErr w:type="spellEnd"/>
-      <w:r>
-        <w:t xml:space="preserve"> we can use </w:t>
-      </w:r>
-      <w:proofErr w:type="spellStart"/>
-      <w:r>
-        <w:t>e.target,value</w:t>
-      </w:r>
-      <w:proofErr w:type="spellEnd"/>
-      <w:r>
-        <w:t xml:space="preserve"> as value attribute is used in the </w:t>
-      </w:r>
-      <w:proofErr w:type="spellStart"/>
-      <w:r>
-        <w:t>Textfi</w:t>
+        <w:t>and on state update method we used e.target.innerText</w:t>
+      </w:r>
+    </w:p>
+    <w:p>
+      <w:r>
+        <w:t>But now in Textare we can use e.target,value as value attribute is used in the Textfi</w:t>
       </w:r>
       <w:r>
         <w:t>eld</w:t>
       </w:r>
-      <w:proofErr w:type="spellEnd"/>
-    </w:p>
-    <w:p>
-      <w:r>
-        <w:t xml:space="preserve">The API may not give </w:t>
-      </w:r>
-      <w:proofErr w:type="spellStart"/>
-      <w:r>
-        <w:t>json</w:t>
-      </w:r>
-      <w:proofErr w:type="spellEnd"/>
-      <w:r>
-        <w:t xml:space="preserve"> response but instead </w:t>
-      </w:r>
-      <w:proofErr w:type="spellStart"/>
-      <w:r>
-        <w:t>uit</w:t>
-      </w:r>
-      <w:proofErr w:type="spellEnd"/>
-      <w:r>
-        <w:t xml:space="preserve"> may text </w:t>
-      </w:r>
-      <w:proofErr w:type="spellStart"/>
-      <w:r>
-        <w:t>reponse</w:t>
-      </w:r>
-      <w:proofErr w:type="spellEnd"/>
-      <w:r>
-        <w:t xml:space="preserve"> who knows and we can parse it by text method in response we are fetching</w:t>
+    </w:p>
+    <w:p>
+      <w:r>
+        <w:t>The API may not give json response but instead uit may text reponse who knows and we can parse it by text method in response we are fetching</w:t>
       </w:r>
       <w:r>
         <w:t xml:space="preserve"> as shown below</w:t>
@@ -2080,15 +1647,7 @@
     </w:p>
     <w:p>
       <w:r>
-        <w:t xml:space="preserve">Shortcut for </w:t>
-      </w:r>
-      <w:proofErr w:type="spellStart"/>
-      <w:r>
-        <w:t>margin:auto</w:t>
-      </w:r>
-      <w:proofErr w:type="spellEnd"/>
-      <w:r>
-        <w:t xml:space="preserve"> will be </w:t>
+        <w:t xml:space="preserve">Shortcut for margin:auto will be </w:t>
       </w:r>
       <w:r>
         <w:rPr>
@@ -2105,25 +1664,12 @@
         <w:t xml:space="preserve"> </w:t>
       </w:r>
       <w:r>
-        <w:t xml:space="preserve">in </w:t>
-      </w:r>
-      <w:proofErr w:type="spellStart"/>
-      <w:r>
-        <w:t>VSCode</w:t>
-      </w:r>
-      <w:proofErr w:type="spellEnd"/>
-    </w:p>
-    <w:p>
-      <w:r>
-        <w:t xml:space="preserve">In name of logic we forgot to style </w:t>
-      </w:r>
-      <w:proofErr w:type="spellStart"/>
-      <w:r>
-        <w:t>outpages</w:t>
-      </w:r>
-      <w:proofErr w:type="spellEnd"/>
-      <w:r>
-        <w:t xml:space="preserve"> are not responsive which teacher will talk about in upcoming lesson </w:t>
+        <w:t>in VSCode</w:t>
+      </w:r>
+    </w:p>
+    <w:p>
+      <w:r>
+        <w:t xml:space="preserve">In name of logic we forgot to style outpages are not responsive which teacher will talk about in upcoming lesson </w:t>
       </w:r>
       <w:r>
         <w:t xml:space="preserve">we will see how to keep styling of </w:t>
@@ -2187,15 +1733,7 @@
         <w:t xml:space="preserve">by infinite scroll </w:t>
       </w:r>
       <w:r>
-        <w:t xml:space="preserve">like </w:t>
-      </w:r>
-      <w:proofErr w:type="spellStart"/>
-      <w:r>
-        <w:t>facebook</w:t>
-      </w:r>
-      <w:proofErr w:type="spellEnd"/>
-      <w:r>
-        <w:t xml:space="preserve"> news feed </w:t>
+        <w:t xml:space="preserve">like facebook news feed </w:t>
       </w:r>
       <w:r>
         <w:t>you keep scrolling and new thing appears</w:t>
@@ -2224,38 +1762,30 @@
         <w:t xml:space="preserve"> observer</w:t>
       </w:r>
       <w:r>
-        <w:t xml:space="preserve"> </w:t>
-      </w:r>
-      <w:proofErr w:type="spellStart"/>
-      <w:r>
-        <w:t>api</w:t>
-      </w:r>
-      <w:proofErr w:type="spellEnd"/>
-      <w:r>
+        <w:t xml:space="preserve"> api. </w:t>
+      </w:r>
+    </w:p>
+    <w:p>
+      <w:pPr>
+        <w:rPr>
+          <w:b/>
+          <w:bCs/>
+        </w:rPr>
+      </w:pPr>
+      <w:r>
+        <w:rPr>
+          <w:b/>
+          <w:bCs/>
+        </w:rPr>
+        <w:t>The Intersection Observer API is a web API that allows developers to asynchronously observe changes in the visibility of a target element relative to an ancestor element or the viewport. It is commonly used for features like lazy-loading images and implementing infinite scrolling on websites but we don’t do here just to save our time</w:t>
+      </w:r>
+      <w:r>
+        <w:rPr>
+          <w:b/>
+          <w:bCs/>
+        </w:rPr>
         <w:t xml:space="preserve">. </w:t>
       </w:r>
-    </w:p>
-    <w:p>
-      <w:pPr>
-        <w:rPr>
-          <w:b/>
-          <w:bCs/>
-        </w:rPr>
-      </w:pPr>
-      <w:r>
-        <w:rPr>
-          <w:b/>
-          <w:bCs/>
-        </w:rPr>
-        <w:t>The Intersection Observer API is a web API that allows developers to asynchronously observe changes in the visibility of a target element relative to an ancestor element or the viewport. It is commonly used for features like lazy-loading images and implementing infinite scrolling on websites but we don’t do here just to save our time</w:t>
-      </w:r>
-      <w:r>
-        <w:rPr>
-          <w:b/>
-          <w:bCs/>
-        </w:rPr>
-        <w:t xml:space="preserve">. </w:t>
-      </w:r>
       <w:r>
         <w:rPr>
           <w:b/>
@@ -2268,23 +1798,7 @@
           <w:b/>
           <w:bCs/>
         </w:rPr>
-        <w:t xml:space="preserve">which </w:t>
-      </w:r>
-      <w:proofErr w:type="spellStart"/>
-      <w:r>
-        <w:rPr>
-          <w:b/>
-          <w:bCs/>
-        </w:rPr>
-        <w:t>id</w:t>
-      </w:r>
-      <w:proofErr w:type="spellEnd"/>
-      <w:r>
-        <w:rPr>
-          <w:b/>
-          <w:bCs/>
-        </w:rPr>
-        <w:t xml:space="preserve"> already made for us </w:t>
+        <w:t xml:space="preserve">which id already made for us </w:t>
       </w:r>
     </w:p>
     <w:p>
@@ -2306,21 +1820,12 @@
           <w:bCs/>
         </w:rPr>
       </w:pPr>
-      <w:proofErr w:type="spellStart"/>
-      <w:r>
-        <w:rPr>
-          <w:b/>
-          <w:bCs/>
-        </w:rPr>
-        <w:t>npm</w:t>
-      </w:r>
-      <w:proofErr w:type="spellEnd"/>
-      <w:r>
-        <w:rPr>
-          <w:b/>
-          <w:bCs/>
-        </w:rPr>
-        <w:t xml:space="preserve"> install --save react-infinite-scroll-component</w:t>
+      <w:r>
+        <w:rPr>
+          <w:b/>
+          <w:bCs/>
+        </w:rPr>
+        <w:t>npm install --save react-infinite-scroll-component</w:t>
       </w:r>
     </w:p>
     <w:p>
@@ -2432,11 +1937,9 @@
       <w:r>
         <w:t xml:space="preserve">The props below the </w:t>
       </w:r>
-      <w:proofErr w:type="spellStart"/>
       <w:r>
         <w:t>endMessage</w:t>
       </w:r>
-      <w:proofErr w:type="spellEnd"/>
       <w:r>
         <w:t xml:space="preserve"> </w:t>
       </w:r>
@@ -2464,15 +1967,7 @@
     </w:p>
     <w:p>
       <w:r>
-        <w:t xml:space="preserve">You can use </w:t>
-      </w:r>
-      <w:proofErr w:type="spellStart"/>
-      <w:r>
-        <w:t>InfiniteScroll</w:t>
-      </w:r>
-      <w:proofErr w:type="spellEnd"/>
-      <w:r>
-        <w:t xml:space="preserve"> only in client side so </w:t>
+        <w:t xml:space="preserve">You can use InfiniteScroll only in client side so </w:t>
       </w:r>
       <w:r>
         <w:t xml:space="preserve">we need to use it in client component so we will change the blogs from SSG to client component. </w:t>
@@ -2491,13 +1986,8 @@
       <w:r>
         <w:t xml:space="preserve">we use any library </w:t>
       </w:r>
-      <w:proofErr w:type="spellStart"/>
-      <w:r>
-        <w:t>onw</w:t>
-      </w:r>
-      <w:proofErr w:type="spellEnd"/>
-      <w:r>
-        <w:t xml:space="preserve"> imp</w:t>
+      <w:r>
+        <w:t>onw imp</w:t>
       </w:r>
       <w:r>
         <w:t>o</w:t>
@@ -2521,15 +2011,7 @@
         <w:t xml:space="preserve">ined </w:t>
       </w:r>
       <w:r>
-        <w:t xml:space="preserve">is it </w:t>
-      </w:r>
-      <w:proofErr w:type="spellStart"/>
-      <w:r>
-        <w:t>idefined</w:t>
-      </w:r>
-      <w:proofErr w:type="spellEnd"/>
-      <w:r>
-        <w:t xml:space="preserve"> like that you have t</w:t>
+        <w:t>is it idefined like that you have t</w:t>
       </w:r>
       <w:r>
         <w:t xml:space="preserve">o </w:t>
@@ -2632,26 +2114,10 @@
         <w:t xml:space="preserve"> it was an addon</w:t>
       </w:r>
       <w:r>
-        <w:t xml:space="preserve"> if you gave it then it was a </w:t>
-      </w:r>
-      <w:proofErr w:type="spellStart"/>
-      <w:r>
-        <w:t>favor</w:t>
-      </w:r>
-      <w:proofErr w:type="spellEnd"/>
-      <w:r>
-        <w:t xml:space="preserve"> </w:t>
-      </w:r>
-      <w:r>
-        <w:t xml:space="preserve">you can say bit in </w:t>
-      </w:r>
-      <w:proofErr w:type="spellStart"/>
-      <w:r>
-        <w:t>todays</w:t>
-      </w:r>
-      <w:proofErr w:type="spellEnd"/>
-      <w:r>
-        <w:t xml:space="preserve"> time </w:t>
+        <w:t xml:space="preserve"> if you gave it then it was a favor </w:t>
+      </w:r>
+      <w:r>
+        <w:t xml:space="preserve">you can say bit in todays time </w:t>
       </w:r>
       <w:r>
         <w:t xml:space="preserve">if you are delivering a website </w:t>
@@ -2922,23 +2388,7 @@
     </w:p>
     <w:p>
       <w:r>
-        <w:t xml:space="preserve">It is very simple </w:t>
-      </w:r>
-      <w:proofErr w:type="spellStart"/>
-      <w:r>
-        <w:t>an</w:t>
-      </w:r>
-      <w:proofErr w:type="spellEnd"/>
-      <w:r>
-        <w:t xml:space="preserve"> it </w:t>
-      </w:r>
-      <w:proofErr w:type="spellStart"/>
-      <w:r>
-        <w:t>wil</w:t>
-      </w:r>
-      <w:proofErr w:type="spellEnd"/>
-      <w:r>
-        <w:t xml:space="preserve"> automatically detect your application </w:t>
+        <w:t xml:space="preserve">It is very simple an it wil automatically detect your application </w:t>
       </w:r>
     </w:p>
     <w:p>
@@ -2949,23 +2399,7 @@
         <w:t>d</w:t>
       </w:r>
       <w:r>
-        <w:t xml:space="preserve"> use it like a node ap </w:t>
-      </w:r>
-      <w:proofErr w:type="spellStart"/>
-      <w:r>
-        <w:t>hten</w:t>
-      </w:r>
-      <w:proofErr w:type="spellEnd"/>
-      <w:r>
-        <w:t xml:space="preserve"> it will be good(</w:t>
-      </w:r>
-      <w:proofErr w:type="spellStart"/>
-      <w:r>
-        <w:t>wjp</w:t>
-      </w:r>
-      <w:proofErr w:type="spellEnd"/>
-      <w:r>
-        <w:t xml:space="preserve"> knows)</w:t>
+        <w:t xml:space="preserve"> use it like a node ap hten it will be good(wjp knows)</w:t>
       </w:r>
     </w:p>
     <w:p>
@@ -2990,16 +2424,15 @@
           <w:bCs/>
           <w:color w:val="EE0000"/>
         </w:rPr>
-        <w:t xml:space="preserve">error in </w:t>
-      </w:r>
-      <w:proofErr w:type="spellStart"/>
+        <w:t>error in js</w:t>
+      </w:r>
       <w:r>
         <w:rPr>
           <w:b/>
           <w:bCs/>
           <w:color w:val="EE0000"/>
         </w:rPr>
-        <w:t>js</w:t>
+        <w:t>x in Nextjs or maybe in React.</w:t>
       </w:r>
       <w:r>
         <w:rPr>
@@ -3007,41 +2440,6 @@
           <w:bCs/>
           <w:color w:val="EE0000"/>
         </w:rPr>
-        <w:t>x</w:t>
-      </w:r>
-      <w:proofErr w:type="spellEnd"/>
-      <w:r>
-        <w:rPr>
-          <w:b/>
-          <w:bCs/>
-          <w:color w:val="EE0000"/>
-        </w:rPr>
-        <w:t xml:space="preserve"> in </w:t>
-      </w:r>
-      <w:proofErr w:type="spellStart"/>
-      <w:r>
-        <w:rPr>
-          <w:b/>
-          <w:bCs/>
-          <w:color w:val="EE0000"/>
-        </w:rPr>
-        <w:t>Nextjs</w:t>
-      </w:r>
-      <w:proofErr w:type="spellEnd"/>
-      <w:r>
-        <w:rPr>
-          <w:b/>
-          <w:bCs/>
-          <w:color w:val="EE0000"/>
-        </w:rPr>
-        <w:t xml:space="preserve"> or maybe in React.</w:t>
-      </w:r>
-      <w:r>
-        <w:rPr>
-          <w:b/>
-          <w:bCs/>
-          <w:color w:val="EE0000"/>
-        </w:rPr>
         <w:t>(maybe it is an outdated problem)</w:t>
       </w:r>
     </w:p>
@@ -3064,15 +2462,7 @@
         <w:t xml:space="preserve">that </w:t>
       </w:r>
       <w:r>
-        <w:t xml:space="preserve">you can make it like that and if it </w:t>
-      </w:r>
-      <w:proofErr w:type="spellStart"/>
-      <w:r>
-        <w:t>become</w:t>
-      </w:r>
-      <w:proofErr w:type="spellEnd"/>
-      <w:r>
-        <w:t xml:space="preserve"> profitable then you can scale it (who knows) </w:t>
+        <w:t xml:space="preserve">you can make it like that and if it become profitable then you can scale it (who knows) </w:t>
       </w:r>
     </w:p>
     <w:p>
@@ -3186,15 +2576,7 @@
         <w:t>how Google analytics and search console</w:t>
       </w:r>
       <w:r>
-        <w:t xml:space="preserve">(who </w:t>
-      </w:r>
-      <w:proofErr w:type="spellStart"/>
-      <w:r>
-        <w:t>knowa</w:t>
-      </w:r>
-      <w:proofErr w:type="spellEnd"/>
-      <w:r>
-        <w:t>)</w:t>
+        <w:t>(who knowa)</w:t>
       </w:r>
       <w:r>
         <w:t xml:space="preserve"> </w:t>
@@ -3210,13 +2592,8 @@
       </w:r>
     </w:p>
     <w:p>
-      <w:proofErr w:type="spellStart"/>
-      <w:r>
-        <w:t>Nextjs</w:t>
-      </w:r>
-      <w:proofErr w:type="spellEnd"/>
-      <w:r>
-        <w:t xml:space="preserve"> </w:t>
+      <w:r>
+        <w:t xml:space="preserve">Nextjs </w:t>
       </w:r>
       <w:r>
         <w:t>d</w:t>
@@ -3649,15 +3026,7 @@
     <w:p>
       <w:r>
         <w:lastRenderedPageBreak/>
-        <w:t xml:space="preserve">Now we will make an </w:t>
-      </w:r>
-      <w:proofErr w:type="spellStart"/>
-      <w:r>
-        <w:t>ecomerce</w:t>
-      </w:r>
-      <w:proofErr w:type="spellEnd"/>
-      <w:r>
-        <w:t xml:space="preserve"> store </w:t>
+        <w:t xml:space="preserve">Now we will make an ecomerce store </w:t>
       </w:r>
       <w:r>
         <w:t xml:space="preserve">and we will make pages like </w:t>
@@ -3705,15 +3074,7 @@
         <w:t xml:space="preserve">teacher will teach us </w:t>
       </w:r>
       <w:r>
-        <w:t xml:space="preserve">We name it </w:t>
-      </w:r>
-      <w:proofErr w:type="spellStart"/>
-      <w:r>
-        <w:t>codeswear</w:t>
-      </w:r>
-      <w:proofErr w:type="spellEnd"/>
-      <w:r>
-        <w:t xml:space="preserve"> it will be an ecommerce store where we will list our product </w:t>
+        <w:t xml:space="preserve">We name it codeswear it will be an ecommerce store where we will list our product </w:t>
       </w:r>
       <w:r>
         <w:t xml:space="preserve">So we type the command </w:t>
@@ -3739,23 +3100,7 @@
           <w:b/>
           <w:bCs/>
         </w:rPr>
-        <w:t xml:space="preserve"> &lt;</w:t>
-      </w:r>
-      <w:proofErr w:type="spellStart"/>
-      <w:r>
-        <w:rPr>
-          <w:b/>
-          <w:bCs/>
-        </w:rPr>
-        <w:t>appname</w:t>
-      </w:r>
-      <w:proofErr w:type="spellEnd"/>
-      <w:r>
-        <w:rPr>
-          <w:b/>
-          <w:bCs/>
-        </w:rPr>
-        <w:t>&gt;</w:t>
+        <w:t xml:space="preserve"> &lt;appname&gt;</w:t>
       </w:r>
     </w:p>
     <w:p>
@@ -3800,11 +3145,7 @@
         <w:t xml:space="preserve">Now we will see how to setup </w:t>
       </w:r>
       <w:r>
-        <w:t xml:space="preserve">up tailwind with </w:t>
-      </w:r>
-      <w:proofErr w:type="spellStart"/>
-      <w:r>
-        <w:t>Ne</w:t>
+        <w:t>up tailwind with Ne</w:t>
       </w:r>
       <w:r>
         <w:t>x</w:t>
@@ -3812,7 +3153,6 @@
       <w:r>
         <w:t>tjs</w:t>
       </w:r>
-      <w:proofErr w:type="spellEnd"/>
       <w:r>
         <w:t>,</w:t>
       </w:r>
@@ -3829,126 +3169,80 @@
         <w:t xml:space="preserve">optimally </w:t>
       </w:r>
       <w:r>
-        <w:t xml:space="preserve">and will make a black slate of </w:t>
-      </w:r>
-      <w:proofErr w:type="spellStart"/>
-      <w:r>
-        <w:t>codeswear</w:t>
-      </w:r>
-      <w:proofErr w:type="spellEnd"/>
+        <w:t xml:space="preserve">and will make a black slate of codeswear </w:t>
+      </w:r>
+      <w:r>
+        <w:t>(who knows)</w:t>
+      </w:r>
+    </w:p>
+    <w:p>
+      <w:pPr>
+        <w:rPr>
+          <w:b/>
+          <w:bCs/>
+        </w:rPr>
+      </w:pPr>
+      <w:r>
+        <w:rPr>
+          <w:b/>
+          <w:bCs/>
+        </w:rPr>
+        <w:t>A blank slate of a website means starting the website from scratch with no existing design, content, or structure.</w:t>
+      </w:r>
+    </w:p>
+    <w:p>
+      <w:r>
+        <w:t>We will search tailwind css with nextjs</w:t>
+      </w:r>
       <w:r>
         <w:t xml:space="preserve"> </w:t>
       </w:r>
       <w:r>
-        <w:t>(who knows)</w:t>
-      </w:r>
-    </w:p>
-    <w:p>
-      <w:pPr>
-        <w:rPr>
-          <w:b/>
-          <w:bCs/>
-        </w:rPr>
-      </w:pPr>
-      <w:r>
-        <w:rPr>
-          <w:b/>
-          <w:bCs/>
-        </w:rPr>
-        <w:t>A blank slate of a website means starting the website from scratch with no existing design, content, or structure.</w:t>
-      </w:r>
-    </w:p>
-    <w:p>
-      <w:r>
-        <w:t xml:space="preserve">We will search tailwind css with </w:t>
-      </w:r>
-      <w:proofErr w:type="spellStart"/>
-      <w:r>
-        <w:t>nextjs</w:t>
-      </w:r>
-      <w:proofErr w:type="spellEnd"/>
+        <w:t xml:space="preserve">so </w:t>
+      </w:r>
+      <w:r>
+        <w:t>b</w:t>
+      </w:r>
+      <w:r>
+        <w:t xml:space="preserve">y this we will go to official documentation </w:t>
+      </w:r>
+    </w:p>
+    <w:p>
+      <w:r>
+        <w:t>Now in out project folder type thi</w:t>
+      </w:r>
+      <w:r>
+        <w:t xml:space="preserve">s </w:t>
+      </w:r>
+      <w:r>
+        <w:t xml:space="preserve">cammand </w:t>
+      </w:r>
+    </w:p>
+    <w:p>
+      <w:r>
+        <w:t>npm install tailwindcss @tailwindcss/postcss postcss</w:t>
+      </w:r>
       <w:r>
         <w:t xml:space="preserve"> </w:t>
       </w:r>
-      <w:r>
-        <w:t xml:space="preserve">so </w:t>
-      </w:r>
-      <w:r>
-        <w:t>b</w:t>
-      </w:r>
-      <w:r>
-        <w:t xml:space="preserve">y this we will go to official documentation </w:t>
-      </w:r>
-    </w:p>
-    <w:p>
-      <w:r>
-        <w:t>Now in out project folder type thi</w:t>
-      </w:r>
-      <w:r>
-        <w:t xml:space="preserve">s </w:t>
-      </w:r>
-      <w:proofErr w:type="spellStart"/>
-      <w:r>
-        <w:t>cammand</w:t>
-      </w:r>
-      <w:proofErr w:type="spellEnd"/>
+    </w:p>
+    <w:p>
+      <w:r>
+        <w:t>or</w:t>
+      </w:r>
+    </w:p>
+    <w:p>
+      <w:r>
+        <w:t xml:space="preserve"> yarn add </w:t>
+      </w:r>
+      <w:r>
+        <w:t>tailwindcss @tailwindcss/postcss postcss</w:t>
+      </w:r>
       <w:r>
         <w:t xml:space="preserve"> </w:t>
       </w:r>
     </w:p>
     <w:p>
-      <w:proofErr w:type="spellStart"/>
-      <w:r>
-        <w:t>npm</w:t>
-      </w:r>
-      <w:proofErr w:type="spellEnd"/>
-      <w:r>
-        <w:t xml:space="preserve"> install </w:t>
-      </w:r>
-      <w:proofErr w:type="spellStart"/>
-      <w:r>
-        <w:t>tailwindcss</w:t>
-      </w:r>
-      <w:proofErr w:type="spellEnd"/>
-      <w:r>
-        <w:t xml:space="preserve"> @tailwindcss/postcss </w:t>
-      </w:r>
-      <w:proofErr w:type="spellStart"/>
-      <w:r>
-        <w:t>postcss</w:t>
-      </w:r>
-      <w:proofErr w:type="spellEnd"/>
-      <w:r>
-        <w:t xml:space="preserve"> </w:t>
-      </w:r>
-    </w:p>
-    <w:p>
-      <w:r>
-        <w:t>or</w:t>
-      </w:r>
-    </w:p>
-    <w:p>
-      <w:r>
-        <w:t xml:space="preserve"> yarn add </w:t>
-      </w:r>
-      <w:proofErr w:type="spellStart"/>
-      <w:r>
-        <w:t>tailwindcss</w:t>
-      </w:r>
-      <w:proofErr w:type="spellEnd"/>
-      <w:r>
-        <w:t xml:space="preserve"> @tailwindcss/postcss </w:t>
-      </w:r>
-      <w:proofErr w:type="spellStart"/>
-      <w:r>
-        <w:t>postcss</w:t>
-      </w:r>
-      <w:proofErr w:type="spellEnd"/>
-      <w:r>
-        <w:t xml:space="preserve"> </w:t>
-      </w:r>
-    </w:p>
-    <w:p>
       <w:r>
         <w:t>Now the method tea</w:t>
       </w:r>
@@ -3962,15 +3256,7 @@
         <w:t>e</w:t>
       </w:r>
       <w:r>
-        <w:t xml:space="preserve">r is using is </w:t>
-      </w:r>
-      <w:proofErr w:type="spellStart"/>
-      <w:r>
-        <w:t>autdated</w:t>
-      </w:r>
-      <w:proofErr w:type="spellEnd"/>
-      <w:r>
-        <w:t xml:space="preserve"> so we will use moder</w:t>
+        <w:t>r is using is autdated so we will use moder</w:t>
       </w:r>
       <w:r>
         <w:t>n</w:t>
@@ -4134,29 +3420,19 @@
         <w:t xml:space="preserve"> order</w:t>
       </w:r>
       <w:r>
-        <w:t xml:space="preserve"> , login and </w:t>
-      </w:r>
-      <w:proofErr w:type="spellStart"/>
-      <w:r>
-        <w:t>signUp</w:t>
-      </w:r>
-      <w:proofErr w:type="spellEnd"/>
+        <w:t xml:space="preserve"> , login and signUp</w:t>
+      </w:r>
       <w:r>
         <w:t xml:space="preserve">. We will create their blank slate here </w:t>
       </w:r>
       <w:r>
         <w:t xml:space="preserve">and then we will start </w:t>
       </w:r>
-      <w:proofErr w:type="spellStart"/>
       <w:r>
         <w:t>c</w:t>
       </w:r>
       <w:r>
-        <w:t>odeswear</w:t>
-      </w:r>
-      <w:proofErr w:type="spellEnd"/>
-      <w:r>
-        <w:t xml:space="preserve"> development </w:t>
+        <w:t xml:space="preserve">odeswear development </w:t>
       </w:r>
     </w:p>
     <w:p>
@@ -4211,64 +3487,27 @@
     </w:p>
     <w:p>
       <w:r>
-        <w:t xml:space="preserve">We will use app for that purposes(maybe </w:t>
-      </w:r>
-      <w:proofErr w:type="spellStart"/>
-      <w:r>
-        <w:t>ol</w:t>
-      </w:r>
-      <w:proofErr w:type="spellEnd"/>
-      <w:r>
-        <w:t xml:space="preserve"> version of </w:t>
-      </w:r>
-      <w:proofErr w:type="spellStart"/>
-      <w:r>
-        <w:t>layout.jsx</w:t>
-      </w:r>
-      <w:proofErr w:type="spellEnd"/>
-      <w:r>
-        <w:t>)</w:t>
-      </w:r>
-    </w:p>
-    <w:p>
-      <w:r>
-        <w:t xml:space="preserve">Now there is site that is </w:t>
-      </w:r>
-      <w:proofErr w:type="spellStart"/>
-      <w:r>
-        <w:t>Tailblocks</w:t>
-      </w:r>
-      <w:proofErr w:type="spellEnd"/>
-      <w:r>
-        <w:t xml:space="preserve"> that will give you </w:t>
-      </w:r>
-      <w:proofErr w:type="spellStart"/>
-      <w:r>
-        <w:t>tailblocks</w:t>
-      </w:r>
-      <w:proofErr w:type="spellEnd"/>
+        <w:t>We will use app for that purposes(maybe ol version of layout.jsx)</w:t>
+      </w:r>
+    </w:p>
+    <w:p>
+      <w:r>
+        <w:t xml:space="preserve">Now there is site that is Tailblocks that will give you </w:t>
+      </w:r>
+      <w:r>
+        <w:t xml:space="preserve">tailblocks </w:t>
+      </w:r>
+      <w:r>
+        <w:t xml:space="preserve">snippet </w:t>
+      </w:r>
+      <w:r>
+        <w:t xml:space="preserve">here you get minimalistic design </w:t>
+      </w:r>
       <w:r>
         <w:t xml:space="preserve"> </w:t>
       </w:r>
       <w:r>
-        <w:t xml:space="preserve">snippet </w:t>
-      </w:r>
-      <w:r>
-        <w:t xml:space="preserve">here you get minimalistic design </w:t>
-      </w:r>
-      <w:r>
-        <w:t xml:space="preserve"> </w:t>
-      </w:r>
-      <w:r>
-        <w:t xml:space="preserve">Here you get </w:t>
-      </w:r>
-      <w:proofErr w:type="spellStart"/>
-      <w:r>
-        <w:t>Ecommerece</w:t>
-      </w:r>
-      <w:proofErr w:type="spellEnd"/>
-      <w:r>
-        <w:t xml:space="preserve"> design</w:t>
+        <w:t>Here you get Ecommerece design</w:t>
       </w:r>
     </w:p>
     <w:p>
@@ -4286,23 +3525,7 @@
     </w:p>
     <w:p>
       <w:r>
-        <w:t xml:space="preserve">In </w:t>
-      </w:r>
-      <w:proofErr w:type="spellStart"/>
-      <w:r>
-        <w:t>tailwiond</w:t>
-      </w:r>
-      <w:proofErr w:type="spellEnd"/>
-      <w:r>
-        <w:t xml:space="preserve"> code you might need </w:t>
-      </w:r>
-      <w:proofErr w:type="spellStart"/>
-      <w:r>
-        <w:t>ot</w:t>
-      </w:r>
-      <w:proofErr w:type="spellEnd"/>
-      <w:r>
-        <w:t xml:space="preserve"> replace </w:t>
+        <w:t xml:space="preserve">In tailwiond code you might need ot replace </w:t>
       </w:r>
     </w:p>
     <w:p>
@@ -4311,78 +3534,45 @@
           <w:i/>
           <w:iCs/>
         </w:rPr>
-        <w:t>stroke-</w:t>
-      </w:r>
-      <w:proofErr w:type="spellStart"/>
+        <w:t>stroke-linecap</w:t>
+      </w:r>
       <w:r>
         <w:rPr>
           <w:i/>
           <w:iCs/>
         </w:rPr>
-        <w:t>linecap</w:t>
-      </w:r>
-      <w:proofErr w:type="spellEnd"/>
+        <w:t xml:space="preserve"> </w:t>
+      </w:r>
+      <w:r>
+        <w:t>by strokeLineCap</w:t>
+      </w:r>
+    </w:p>
+    <w:p>
       <w:r>
         <w:rPr>
           <w:i/>
           <w:iCs/>
         </w:rPr>
-        <w:t xml:space="preserve"> </w:t>
-      </w:r>
-      <w:r>
-        <w:t xml:space="preserve">by </w:t>
-      </w:r>
-      <w:proofErr w:type="spellStart"/>
-      <w:r>
-        <w:t>strokeLineCap</w:t>
-      </w:r>
-      <w:proofErr w:type="spellEnd"/>
-    </w:p>
-    <w:p>
+        <w:t>stroke-linejoin</w:t>
+      </w:r>
       <w:r>
         <w:rPr>
           <w:i/>
           <w:iCs/>
         </w:rPr>
-        <w:t>stroke-</w:t>
-      </w:r>
-      <w:proofErr w:type="spellStart"/>
-      <w:r>
-        <w:rPr>
-          <w:i/>
-          <w:iCs/>
-        </w:rPr>
-        <w:t>linejoin</w:t>
-      </w:r>
-      <w:proofErr w:type="spellEnd"/>
-      <w:r>
-        <w:rPr>
-          <w:i/>
-          <w:iCs/>
-        </w:rPr>
         <w:t xml:space="preserve"> </w:t>
       </w:r>
       <w:r>
-        <w:t xml:space="preserve">by </w:t>
-      </w:r>
-      <w:proofErr w:type="spellStart"/>
-      <w:r>
-        <w:t>strokeLineJoin</w:t>
-      </w:r>
-      <w:proofErr w:type="spellEnd"/>
+        <w:t>by strokeLineJoin</w:t>
+      </w:r>
     </w:p>
     <w:p>
       <w:r>
         <w:t>stroke-width</w:t>
       </w:r>
       <w:r>
-        <w:t xml:space="preserve"> by </w:t>
-      </w:r>
-      <w:proofErr w:type="spellStart"/>
-      <w:r>
-        <w:t>StrokeWidth</w:t>
-      </w:r>
-      <w:proofErr w:type="spellEnd"/>
+        <w:t xml:space="preserve"> by StrokeWidth</w:t>
+      </w:r>
     </w:p>
     <w:p>
       <w:r>
@@ -4403,11 +3593,9 @@
       <w:r>
         <w:t xml:space="preserve"> but not now but if you still want to use them then you need to add a Boolean attribute that is </w:t>
       </w:r>
-      <w:proofErr w:type="spellStart"/>
       <w:r>
         <w:t>legacyBehaviour</w:t>
       </w:r>
-      <w:proofErr w:type="spellEnd"/>
     </w:p>
     <w:p>
       <w:pPr>
@@ -4428,23 +3616,7 @@
           <w:b/>
           <w:bCs/>
         </w:rPr>
-        <w:t xml:space="preserve">Image or maybe in </w:t>
-      </w:r>
-      <w:proofErr w:type="spellStart"/>
-      <w:r>
-        <w:rPr>
-          <w:b/>
-          <w:bCs/>
-        </w:rPr>
-        <w:t>Nextjs</w:t>
-      </w:r>
-      <w:proofErr w:type="spellEnd"/>
-      <w:r>
-        <w:rPr>
-          <w:b/>
-          <w:bCs/>
-        </w:rPr>
-        <w:t xml:space="preserve"> general</w:t>
+        <w:t>Image or maybe in Nextjs general</w:t>
       </w:r>
     </w:p>
     <w:p>
@@ -4469,15 +3641,7 @@
     </w:p>
     <w:p>
       <w:r>
-        <w:t xml:space="preserve">&lt;Image </w:t>
-      </w:r>
-      <w:proofErr w:type="spellStart"/>
-      <w:r>
-        <w:t>src</w:t>
-      </w:r>
-      <w:proofErr w:type="spellEnd"/>
-      <w:r>
-        <w:t>="home.jpg" /&gt;</w:t>
+        <w:t>&lt;Image src="home.jpg" /&gt;</w:t>
       </w:r>
     </w:p>
     <w:p>
@@ -4502,15 +3666,7 @@
     </w:p>
     <w:p>
       <w:r>
-        <w:t xml:space="preserve">&lt;Image </w:t>
-      </w:r>
-      <w:proofErr w:type="spellStart"/>
-      <w:r>
-        <w:t>src</w:t>
-      </w:r>
-      <w:proofErr w:type="spellEnd"/>
-      <w:r>
-        <w:t>="/home.jpg" /&gt;</w:t>
+        <w:t>&lt;Image src="/home.jpg" /&gt;</w:t>
       </w:r>
     </w:p>
     <w:p>
@@ -4594,17 +3750,8 @@
     <w:p>
       <w:r>
         <w:lastRenderedPageBreak/>
-        <w:t xml:space="preserve">We can add media </w:t>
-      </w:r>
-      <w:proofErr w:type="spellStart"/>
-      <w:r>
-        <w:t>quary</w:t>
-      </w:r>
-      <w:proofErr w:type="spellEnd"/>
-      <w:r>
-        <w:t xml:space="preserve"> in Tailwind by </w:t>
-      </w:r>
-      <w:proofErr w:type="spellStart"/>
+        <w:t xml:space="preserve">We can add media quary in Tailwind by </w:t>
+      </w:r>
       <w:r>
         <w:rPr>
           <w:b/>
@@ -4617,15 +3764,7 @@
           <w:b/>
           <w:bCs/>
         </w:rPr>
-        <w:t>property</w:t>
-      </w:r>
-      <w:proofErr w:type="spellEnd"/>
-      <w:r>
-        <w:rPr>
-          <w:b/>
-          <w:bCs/>
-        </w:rPr>
-        <w:t xml:space="preserve"> name</w:t>
+        <w:t>property name</w:t>
       </w:r>
       <w:r>
         <w:rPr>
@@ -4752,15 +3891,7 @@
     </w:p>
     <w:p>
       <w:r>
-        <w:t xml:space="preserve">import { </w:t>
-      </w:r>
-      <w:proofErr w:type="spellStart"/>
-      <w:r>
-        <w:t>AiOutlineShoppingCart</w:t>
-      </w:r>
-      <w:proofErr w:type="spellEnd"/>
-      <w:r>
-        <w:t xml:space="preserve"> } from "react-icons/ai";</w:t>
+        <w:t>import { AiOutlineShoppingCart } from "react-icons/ai";</w:t>
       </w:r>
     </w:p>
     <w:p>
@@ -4991,15 +4122,7 @@
     </w:p>
     <w:p>
       <w:r>
-        <w:t xml:space="preserve">By </w:t>
-      </w:r>
-      <w:proofErr w:type="spellStart"/>
-      <w:r>
-        <w:t>overflow-x:hidden</w:t>
-      </w:r>
-      <w:proofErr w:type="spellEnd"/>
-      <w:r>
-        <w:t xml:space="preserve"> you c</w:t>
+        <w:t>By overflow-x:hidden you c</w:t>
       </w:r>
       <w:r>
         <w:t xml:space="preserve">an make sure there is no horizontal </w:t>
@@ -5025,40 +4148,16 @@
         <w:t>s</w:t>
       </w:r>
       <w:r>
-        <w:t xml:space="preserve">ked is out </w:t>
-      </w:r>
-      <w:proofErr w:type="spellStart"/>
-      <w:r>
-        <w:t>pincode</w:t>
-      </w:r>
-      <w:proofErr w:type="spellEnd"/>
-      <w:r>
-        <w:t xml:space="preserve"> </w:t>
-      </w:r>
-      <w:proofErr w:type="spellStart"/>
-      <w:r>
-        <w:t>servicable</w:t>
-      </w:r>
-      <w:proofErr w:type="spellEnd"/>
-      <w:r>
-        <w:t xml:space="preserve"> o</w:t>
+        <w:t>ked is out pincode servicable o</w:t>
       </w:r>
       <w:r>
         <w:t>r</w:t>
       </w:r>
       <w:r>
-        <w:t xml:space="preserve"> </w:t>
-      </w:r>
-      <w:proofErr w:type="spellStart"/>
-      <w:r>
-        <w:t>not</w:t>
-      </w:r>
-      <w:r>
-        <w:t>ig</w:t>
-      </w:r>
-      <w:proofErr w:type="spellEnd"/>
-      <w:r>
-        <w:t xml:space="preserve"> no then you cannot receiver the order.</w:t>
+        <w:t xml:space="preserve"> not</w:t>
+      </w:r>
+      <w:r>
+        <w:t>ig no then you cannot receiver the order.</w:t>
       </w:r>
     </w:p>
     <w:p>
@@ -5069,29 +4168,13 @@
         <w:t>e</w:t>
       </w:r>
       <w:r>
-        <w:t xml:space="preserve"> a mock </w:t>
-      </w:r>
-      <w:proofErr w:type="spellStart"/>
-      <w:r>
-        <w:t>api</w:t>
-      </w:r>
-      <w:proofErr w:type="spellEnd"/>
-      <w:r>
-        <w:t xml:space="preserve"> that wil</w:t>
+        <w:t xml:space="preserve"> a mock api that wil</w:t>
       </w:r>
       <w:r>
         <w:t>l</w:t>
       </w:r>
       <w:r>
-        <w:t xml:space="preserve"> show all the </w:t>
-      </w:r>
-      <w:proofErr w:type="spellStart"/>
-      <w:r>
-        <w:t>apis</w:t>
-      </w:r>
-      <w:proofErr w:type="spellEnd"/>
-      <w:r>
-        <w:t xml:space="preserve"> that are serviceable </w:t>
+        <w:t xml:space="preserve"> show all the apis that are serviceable </w:t>
       </w:r>
     </w:p>
     <w:p>
@@ -5431,24 +4514,11 @@
         <w:t xml:space="preserve">To </w:t>
       </w:r>
       <w:r>
-        <w:t xml:space="preserve">make </w:t>
-      </w:r>
-      <w:proofErr w:type="spellStart"/>
-      <w:r>
-        <w:t>codewear</w:t>
-      </w:r>
-      <w:proofErr w:type="spellEnd"/>
-      <w:r>
-        <w:t xml:space="preserve"> we are going to use Mongoose </w:t>
-      </w:r>
-      <w:r>
-        <w:t xml:space="preserve">is a connector to a </w:t>
-      </w:r>
-      <w:proofErr w:type="spellStart"/>
-      <w:r>
-        <w:t>Mongodb</w:t>
-      </w:r>
-      <w:proofErr w:type="spellEnd"/>
+        <w:t xml:space="preserve">make codewear we are going to use Mongoose </w:t>
+      </w:r>
+      <w:r>
+        <w:t>is a connector to a Mongodb</w:t>
+      </w:r>
       <w:r>
         <w:t xml:space="preserve"> </w:t>
       </w:r>
@@ -5456,15 +4526,7 @@
         <w:t>(who knows )</w:t>
       </w:r>
       <w:r>
-        <w:t xml:space="preserve"> it will help js to connect to </w:t>
-      </w:r>
-      <w:proofErr w:type="spellStart"/>
-      <w:r>
-        <w:t>mongodb</w:t>
-      </w:r>
-      <w:proofErr w:type="spellEnd"/>
-      <w:r>
-        <w:t xml:space="preserve"> </w:t>
+        <w:t xml:space="preserve"> it will help js to connect to mongodb </w:t>
       </w:r>
       <w:r>
         <w:t xml:space="preserve">and we can use its </w:t>
@@ -5473,29 +4535,13 @@
         <w:t xml:space="preserve">built in functionality </w:t>
       </w:r>
       <w:r>
-        <w:t xml:space="preserve">you don’t have to read and write and update to the </w:t>
-      </w:r>
-      <w:proofErr w:type="spellStart"/>
-      <w:r>
-        <w:t>mongodb</w:t>
-      </w:r>
-      <w:proofErr w:type="spellEnd"/>
-      <w:r>
-        <w:t xml:space="preserve"> (like </w:t>
+        <w:t xml:space="preserve">you don’t have to read and write and update to the mongodb (like </w:t>
       </w:r>
       <w:r>
         <w:t xml:space="preserve">maybe </w:t>
       </w:r>
       <w:r>
-        <w:t xml:space="preserve">the complex we do for it in </w:t>
-      </w:r>
-      <w:proofErr w:type="spellStart"/>
-      <w:r>
-        <w:t>mongodb</w:t>
-      </w:r>
-      <w:proofErr w:type="spellEnd"/>
-      <w:r>
-        <w:t>(who knows))</w:t>
+        <w:t>the complex we do for it in mongodb(who knows))</w:t>
       </w:r>
       <w:r>
         <w:t xml:space="preserve">. </w:t>
@@ -5509,19 +4555,9 @@
       <w:r>
         <w:t xml:space="preserve">ing fields like </w:t>
       </w:r>
-      <w:proofErr w:type="spellStart"/>
-      <w:r>
-        <w:t>createdAT</w:t>
-      </w:r>
-      <w:proofErr w:type="spellEnd"/>
-      <w:r>
-        <w:t xml:space="preserve"> and </w:t>
-      </w:r>
-      <w:proofErr w:type="spellStart"/>
-      <w:r>
-        <w:t>updatedAt</w:t>
-      </w:r>
-      <w:proofErr w:type="spellEnd"/>
+      <w:r>
+        <w:t>createdAT and updatedAt</w:t>
+      </w:r>
     </w:p>
     <w:p>
       <w:r>
@@ -5561,70 +4597,38 @@
         <w:t>r</w:t>
       </w:r>
       <w:r>
-        <w:t xml:space="preserve">ough which we connect to </w:t>
-      </w:r>
-      <w:proofErr w:type="spellStart"/>
-      <w:r>
-        <w:t>mongo</w:t>
-      </w:r>
-      <w:r>
-        <w:t>db</w:t>
-      </w:r>
-      <w:proofErr w:type="spellEnd"/>
+        <w:t>ough which we connect to mongo</w:t>
+      </w:r>
+      <w:r>
+        <w:t xml:space="preserve">db </w:t>
+      </w:r>
+    </w:p>
+    <w:p>
+      <w:r>
+        <w:t xml:space="preserve">I think we are going to directly contact to mongos by frontEnd </w:t>
+      </w:r>
+    </w:p>
+    <w:p>
+      <w:r>
+        <w:t xml:space="preserve">Ow we will install Mongoose </w:t>
+      </w:r>
+      <w:r>
+        <w:t xml:space="preserve">by npm </w:t>
+      </w:r>
+      <w:r>
+        <w:t>and we will make some modals</w:t>
+      </w:r>
+      <w:r>
+        <w:t>(maybe not)</w:t>
+      </w:r>
       <w:r>
         <w:t xml:space="preserve"> </w:t>
       </w:r>
-    </w:p>
-    <w:p>
-      <w:r>
-        <w:t xml:space="preserve">I think we are going to directly contact to mongos by </w:t>
-      </w:r>
-      <w:proofErr w:type="spellStart"/>
-      <w:r>
-        <w:t>frontEnd</w:t>
-      </w:r>
-      <w:proofErr w:type="spellEnd"/>
-      <w:r>
-        <w:t xml:space="preserve"> </w:t>
-      </w:r>
-    </w:p>
-    <w:p>
-      <w:r>
-        <w:t xml:space="preserve">Ow we will install Mongoose </w:t>
-      </w:r>
-      <w:r>
-        <w:t xml:space="preserve">by </w:t>
-      </w:r>
-      <w:proofErr w:type="spellStart"/>
-      <w:r>
-        <w:t>npm</w:t>
-      </w:r>
-      <w:proofErr w:type="spellEnd"/>
-      <w:r>
-        <w:t xml:space="preserve"> </w:t>
-      </w:r>
-      <w:r>
-        <w:t>and we will make some modals</w:t>
-      </w:r>
-      <w:r>
-        <w:t>(maybe not)</w:t>
-      </w:r>
-      <w:r>
-        <w:t xml:space="preserve"> </w:t>
-      </w:r>
       <w:r>
         <w:t>through which you will store the data (who knows)</w:t>
       </w:r>
       <w:r>
-        <w:t xml:space="preserve"> but before that we need to install </w:t>
-      </w:r>
-      <w:proofErr w:type="spellStart"/>
-      <w:r>
-        <w:t>mongodb</w:t>
-      </w:r>
-      <w:proofErr w:type="spellEnd"/>
-      <w:r>
-        <w:t xml:space="preserve"> </w:t>
+        <w:t xml:space="preserve"> but before that we need to install mongodb </w:t>
       </w:r>
     </w:p>
     <w:p>
@@ -5641,11 +4645,7 @@
         <w:t>then your</w:t>
       </w:r>
       <w:r>
-        <w:t xml:space="preserve"> </w:t>
-      </w:r>
-      <w:proofErr w:type="spellStart"/>
-      <w:r>
-        <w:t>mon</w:t>
+        <w:t xml:space="preserve"> mon</w:t>
       </w:r>
       <w:r>
         <w:t>g</w:t>
@@ -5654,62 +4654,29 @@
         <w:t>d</w:t>
       </w:r>
       <w:r>
-        <w:t>b</w:t>
-      </w:r>
-      <w:proofErr w:type="spellEnd"/>
-      <w:r>
-        <w:t xml:space="preserve"> compass will be installed</w:t>
-      </w:r>
-      <w:r>
-        <w:t xml:space="preserve"> which  is a product of </w:t>
-      </w:r>
-      <w:proofErr w:type="spellStart"/>
-      <w:r>
-        <w:t>mongodb</w:t>
-      </w:r>
-      <w:proofErr w:type="spellEnd"/>
-      <w:r>
-        <w:t xml:space="preserve"> </w:t>
-      </w:r>
-    </w:p>
-    <w:p>
-      <w:r>
-        <w:t xml:space="preserve">Now in </w:t>
-      </w:r>
-      <w:proofErr w:type="spellStart"/>
-      <w:r>
-        <w:t>mongodb</w:t>
-      </w:r>
-      <w:proofErr w:type="spellEnd"/>
-      <w:r>
-        <w:t xml:space="preserve"> compass you click on connect to the </w:t>
+        <w:t>b compass will be installed</w:t>
+      </w:r>
+      <w:r>
+        <w:t xml:space="preserve"> which  is a product of mongodb </w:t>
+      </w:r>
+    </w:p>
+    <w:p>
+      <w:r>
+        <w:t xml:space="preserve">Now in mongodb compass you click on connect to the </w:t>
       </w:r>
       <w:r>
         <w:t xml:space="preserve">localhost </w:t>
       </w:r>
-      <w:proofErr w:type="spellStart"/>
-      <w:r>
-        <w:t>ehere</w:t>
-      </w:r>
-      <w:proofErr w:type="spellEnd"/>
-      <w:r>
-        <w:t xml:space="preserve"> the server is running </w:t>
-      </w:r>
-    </w:p>
-    <w:p>
-      <w:r>
-        <w:t xml:space="preserve">We will make all the data base in </w:t>
-      </w:r>
-      <w:proofErr w:type="spellStart"/>
-      <w:r>
-        <w:t>mongo</w:t>
-      </w:r>
-      <w:r>
-        <w:t>db</w:t>
-      </w:r>
-      <w:proofErr w:type="spellEnd"/>
-      <w:r>
-        <w:t xml:space="preserve"> compass.</w:t>
+      <w:r>
+        <w:t xml:space="preserve">ehere the server is running </w:t>
+      </w:r>
+    </w:p>
+    <w:p>
+      <w:r>
+        <w:t>We will make all the data base in mongo</w:t>
+      </w:r>
+      <w:r>
+        <w:t>db compass.</w:t>
       </w:r>
     </w:p>
     <w:p>
@@ -5837,18 +4804,10 @@
     </w:p>
     <w:p>
       <w:r>
-        <w:t xml:space="preserve">And after this get connection to the </w:t>
-      </w:r>
-      <w:proofErr w:type="spellStart"/>
-      <w:r>
-        <w:t>mongo</w:t>
-      </w:r>
-      <w:r>
-        <w:t>db</w:t>
-      </w:r>
-      <w:proofErr w:type="spellEnd"/>
-      <w:r>
-        <w:t xml:space="preserve"> </w:t>
+        <w:t>And after this get connection to the mongo</w:t>
+      </w:r>
+      <w:r>
+        <w:t xml:space="preserve">db </w:t>
       </w:r>
       <w:r>
         <w:t>and your wok will be sone now you can make schema</w:t>
@@ -6018,29 +4977,14 @@
       <w:r>
         <w:t xml:space="preserve">APIs that is </w:t>
       </w:r>
-      <w:proofErr w:type="spellStart"/>
-      <w:r>
-        <w:t>getProduct</w:t>
-      </w:r>
-      <w:proofErr w:type="spellEnd"/>
-      <w:r>
-        <w:t xml:space="preserve">, </w:t>
-      </w:r>
-      <w:proofErr w:type="spellStart"/>
-      <w:r>
-        <w:t>updateProduct</w:t>
-      </w:r>
-      <w:proofErr w:type="spellEnd"/>
+      <w:r>
+        <w:t>getProduct, updateProduct</w:t>
+      </w:r>
       <w:r>
         <w:t xml:space="preserve"> and </w:t>
       </w:r>
-      <w:proofErr w:type="spellStart"/>
-      <w:r>
-        <w:t>addProducts</w:t>
-      </w:r>
-      <w:proofErr w:type="spellEnd"/>
-      <w:r>
-        <w:t xml:space="preserve"> </w:t>
+      <w:r>
+        <w:t xml:space="preserve">addProducts </w:t>
       </w:r>
       <w:r>
         <w:t xml:space="preserve">now they do as the name suggests </w:t>
@@ -6066,15 +5010,7 @@
     </w:p>
     <w:p>
       <w:r>
-        <w:t xml:space="preserve">Now we are going to start middleware development which will facilitate the connection to </w:t>
-      </w:r>
-      <w:proofErr w:type="spellStart"/>
-      <w:r>
-        <w:t>mongodb</w:t>
-      </w:r>
-      <w:proofErr w:type="spellEnd"/>
-      <w:r>
-        <w:t xml:space="preserve"> </w:t>
+        <w:t xml:space="preserve">Now we are going to start middleware development which will facilitate the connection to mongodb </w:t>
       </w:r>
       <w:r>
         <w:t>now it seems confusing at first</w:t>
@@ -6151,13 +5087,8 @@
       <w:r>
         <w:t>.</w:t>
       </w:r>
-      <w:proofErr w:type="spellStart"/>
-      <w:r>
-        <w:t>env.local</w:t>
-      </w:r>
-      <w:proofErr w:type="spellEnd"/>
-      <w:r>
-        <w:t xml:space="preserve"> </w:t>
+      <w:r>
+        <w:t xml:space="preserve">env.local </w:t>
       </w:r>
       <w:r>
         <w:t xml:space="preserve">file </w:t>
@@ -6169,13 +5100,8 @@
         <w:t xml:space="preserve"> and you can get it in our maybe server </w:t>
       </w:r>
       <w:r>
-        <w:t xml:space="preserve">side by using </w:t>
-      </w:r>
-      <w:proofErr w:type="spellStart"/>
-      <w:r>
-        <w:t>process.env</w:t>
-      </w:r>
-      <w:proofErr w:type="spellEnd"/>
+        <w:t>side by using process.env</w:t>
+      </w:r>
     </w:p>
     <w:p>
       <w:pPr>
@@ -6186,34 +5112,10 @@
         </w:numPr>
       </w:pPr>
       <w:r>
-        <w:t xml:space="preserve">We need a connection string to connect to </w:t>
-      </w:r>
-      <w:proofErr w:type="spellStart"/>
-      <w:r>
-        <w:t>mongodb</w:t>
-      </w:r>
-      <w:proofErr w:type="spellEnd"/>
-      <w:r>
-        <w:t xml:space="preserve"> </w:t>
-      </w:r>
-      <w:r>
-        <w:t xml:space="preserve"> and we can get for </w:t>
-      </w:r>
-      <w:proofErr w:type="spellStart"/>
-      <w:r>
-        <w:t>mongodb</w:t>
-      </w:r>
-      <w:proofErr w:type="spellEnd"/>
-      <w:r>
-        <w:t xml:space="preserve"> compass by opening </w:t>
-      </w:r>
-      <w:proofErr w:type="spellStart"/>
-      <w:r>
-        <w:t>mongodb</w:t>
-      </w:r>
-      <w:proofErr w:type="spellEnd"/>
-      <w:r>
-        <w:t xml:space="preserve"> compass and then click on three dot </w:t>
+        <w:t xml:space="preserve">We need a connection string to connect to mongodb </w:t>
+      </w:r>
+      <w:r>
+        <w:t xml:space="preserve"> and we can get for mongodb compass by opening mongodb compass and then click on three dot </w:t>
       </w:r>
       <w:r>
         <w:t>as</w:t>
@@ -6222,15 +5124,7 @@
         <w:t xml:space="preserve"> marked below</w:t>
       </w:r>
       <w:r>
-        <w:t xml:space="preserve">(not </w:t>
-      </w:r>
-      <w:proofErr w:type="spellStart"/>
-      <w:r>
-        <w:t>visiblie</w:t>
-      </w:r>
-      <w:proofErr w:type="spellEnd"/>
-      <w:r>
-        <w:t xml:space="preserve"> because of not hover)</w:t>
+        <w:t>(not visiblie because of not hover)</w:t>
       </w:r>
     </w:p>
     <w:p>
@@ -6292,15 +5186,7 @@
         <w:t xml:space="preserve"> to get </w:t>
       </w:r>
       <w:r>
-        <w:t>the connection string and we will store it inside .</w:t>
-      </w:r>
-      <w:proofErr w:type="spellStart"/>
-      <w:r>
-        <w:t>env.local</w:t>
-      </w:r>
-      <w:proofErr w:type="spellEnd"/>
-      <w:r>
-        <w:t xml:space="preserve"> file.</w:t>
+        <w:t>the connection string and we will store it inside .env.local file.</w:t>
       </w:r>
     </w:p>
     <w:p>
@@ -6331,15 +5217,7 @@
         <w:t>n</w:t>
       </w:r>
       <w:r>
-        <w:t xml:space="preserve"> modern </w:t>
-      </w:r>
-      <w:proofErr w:type="spellStart"/>
-      <w:r>
-        <w:t>Nextjs</w:t>
-      </w:r>
-      <w:proofErr w:type="spellEnd"/>
-      <w:r>
-        <w:t xml:space="preserve"> middleware cannot be used for database connectivity but you can use it </w:t>
+        <w:t xml:space="preserve"> modern Nextjs middleware cannot be used for database connectivity but you can use it </w:t>
       </w:r>
       <w:r>
         <w:t>for auth</w:t>
@@ -6380,15 +5258,7 @@
         <w:t xml:space="preserve"> add Product </w:t>
       </w:r>
       <w:r>
-        <w:t xml:space="preserve">and </w:t>
-      </w:r>
-      <w:proofErr w:type="spellStart"/>
-      <w:r>
-        <w:t>GetProduct</w:t>
-      </w:r>
-      <w:proofErr w:type="spellEnd"/>
-      <w:r>
-        <w:t xml:space="preserve"> API</w:t>
+        <w:t>and GetProduct API</w:t>
       </w:r>
       <w:r>
         <w:t>.</w:t>
@@ -6418,66 +5288,34 @@
         <w:t xml:space="preserve">that </w:t>
       </w:r>
       <w:r>
-        <w:t xml:space="preserve">when there is not data in </w:t>
-      </w:r>
-      <w:proofErr w:type="spellStart"/>
-      <w:r>
-        <w:t>mon</w:t>
-      </w:r>
-      <w:r>
-        <w:t>godb</w:t>
-      </w:r>
-      <w:proofErr w:type="spellEnd"/>
+        <w:t>when there is not data in mon</w:t>
+      </w:r>
+      <w:r>
+        <w:t xml:space="preserve">godb </w:t>
+      </w:r>
+      <w:r>
+        <w:t xml:space="preserve"> and we use find ot any operation on modal </w:t>
+      </w:r>
+      <w:r>
+        <w:t xml:space="preserve">or maybe importing modal then it try to form </w:t>
+      </w:r>
+      <w:r>
+        <w:t>data again on database</w:t>
+      </w:r>
+      <w:r>
+        <w:t>(who knows)</w:t>
+      </w:r>
+      <w:r>
+        <w:t>.</w:t>
+      </w:r>
+      <w:r>
+        <w:t xml:space="preserve"> to fix that in model file write mongoose.models = {}</w:t>
+      </w:r>
       <w:r>
         <w:t xml:space="preserve"> </w:t>
       </w:r>
       <w:r>
-        <w:t xml:space="preserve"> and we use find </w:t>
-      </w:r>
-      <w:proofErr w:type="spellStart"/>
-      <w:r>
-        <w:t>ot</w:t>
-      </w:r>
-      <w:proofErr w:type="spellEnd"/>
-      <w:r>
-        <w:t xml:space="preserve"> any operation on modal </w:t>
-      </w:r>
-      <w:r>
-        <w:t xml:space="preserve">or maybe importing modal then it try to form </w:t>
-      </w:r>
-      <w:r>
-        <w:t>data again on database</w:t>
-      </w:r>
-      <w:r>
-        <w:t>(who knows)</w:t>
-      </w:r>
-      <w:r>
-        <w:t>.</w:t>
-      </w:r>
-      <w:r>
-        <w:t xml:space="preserve"> to fix that in model file write </w:t>
-      </w:r>
-      <w:proofErr w:type="spellStart"/>
-      <w:r>
-        <w:t>mongoose.models</w:t>
-      </w:r>
-      <w:proofErr w:type="spellEnd"/>
-      <w:r>
-        <w:t xml:space="preserve"> = {}</w:t>
-      </w:r>
-      <w:r>
-        <w:t xml:space="preserve"> </w:t>
-      </w:r>
-      <w:r>
-        <w:t xml:space="preserve">in each model do make sure you </w:t>
-      </w:r>
-      <w:proofErr w:type="spellStart"/>
-      <w:r>
-        <w:t>doi</w:t>
-      </w:r>
-      <w:proofErr w:type="spellEnd"/>
-      <w:r>
-        <w:t xml:space="preserve"> this.</w:t>
+        <w:t>in each model do make sure you doi this.</w:t>
       </w:r>
     </w:p>
     <w:p>
@@ -6505,23 +5343,7 @@
     </w:p>
     <w:p>
       <w:r>
-        <w:t xml:space="preserve">We will make now </w:t>
-      </w:r>
-      <w:proofErr w:type="spellStart"/>
-      <w:r>
-        <w:t>updateProfuct</w:t>
-      </w:r>
-      <w:proofErr w:type="spellEnd"/>
-      <w:r>
-        <w:t xml:space="preserve"> </w:t>
-      </w:r>
-      <w:proofErr w:type="spellStart"/>
-      <w:r>
-        <w:t>api</w:t>
-      </w:r>
-      <w:proofErr w:type="spellEnd"/>
-      <w:r>
-        <w:t>.</w:t>
+        <w:t>We will make now updateProfuct api.</w:t>
       </w:r>
     </w:p>
     <w:p>
@@ -6540,39 +5362,7 @@
         <w:t xml:space="preserve">add handler to the  html but now the game is changed </w:t>
       </w:r>
       <w:r>
-        <w:t xml:space="preserve">sever side component do all the work of mapping and generating html but in older version when data was end to the browser we need to make </w:t>
-      </w:r>
-      <w:proofErr w:type="spellStart"/>
-      <w:r>
-        <w:t>oit</w:t>
-      </w:r>
-      <w:proofErr w:type="spellEnd"/>
-      <w:r>
-        <w:t xml:space="preserve"> </w:t>
-      </w:r>
-      <w:proofErr w:type="spellStart"/>
-      <w:r>
-        <w:t>pardable</w:t>
-      </w:r>
-      <w:proofErr w:type="spellEnd"/>
-      <w:r>
-        <w:t xml:space="preserve"> we did it by </w:t>
-      </w:r>
-      <w:proofErr w:type="spellStart"/>
-      <w:r>
-        <w:t>JSON.parse</w:t>
-      </w:r>
-      <w:proofErr w:type="spellEnd"/>
-      <w:r>
-        <w:t>(</w:t>
-      </w:r>
-      <w:proofErr w:type="spellStart"/>
-      <w:r>
-        <w:t>JSON.stringify</w:t>
-      </w:r>
-      <w:proofErr w:type="spellEnd"/>
-      <w:r>
-        <w:t>(</w:t>
+        <w:t>sever side component do all the work of mapping and generating html but in older version when data was end to the browser we need to make oit pardable we did it by JSON.parse(JSON.stringify(</w:t>
       </w:r>
       <w:r>
         <w:t>&lt;object&gt;</w:t>
@@ -6591,15 +5381,7 @@
     </w:p>
     <w:p>
       <w:r>
-        <w:t xml:space="preserve">what is </w:t>
-      </w:r>
-      <w:proofErr w:type="spellStart"/>
-      <w:r>
-        <w:t>passHref</w:t>
-      </w:r>
-      <w:proofErr w:type="spellEnd"/>
-      <w:r>
-        <w:t xml:space="preserve"> in simple words</w:t>
+        <w:t>what is passHref in simple words</w:t>
       </w:r>
     </w:p>
     <w:p>
@@ -6622,57 +5404,16 @@
           <w:b/>
           <w:bCs/>
         </w:rPr>
-        <w:t xml:space="preserve"> </w:t>
-      </w:r>
-      <w:proofErr w:type="spellStart"/>
-      <w:r>
-        <w:rPr>
-          <w:b/>
-          <w:bCs/>
-        </w:rPr>
-        <w:t>passHref</w:t>
-      </w:r>
-      <w:proofErr w:type="spellEnd"/>
-      <w:r>
-        <w:rPr>
-          <w:b/>
-          <w:bCs/>
-        </w:rPr>
-        <w:t xml:space="preserve"> (simple explanation)</w:t>
-      </w:r>
-    </w:p>
-    <w:p>
-      <w:proofErr w:type="spellStart"/>
-      <w:r>
-        <w:rPr>
-          <w:b/>
-          <w:bCs/>
-        </w:rPr>
-        <w:t>passHref</w:t>
-      </w:r>
-      <w:proofErr w:type="spellEnd"/>
-      <w:r>
-        <w:rPr>
-          <w:b/>
-          <w:bCs/>
-        </w:rPr>
-        <w:t xml:space="preserve"> tells &lt;Link&gt; to pass the </w:t>
-      </w:r>
-      <w:proofErr w:type="spellStart"/>
-      <w:r>
-        <w:rPr>
-          <w:b/>
-          <w:bCs/>
-        </w:rPr>
-        <w:t>href</w:t>
-      </w:r>
-      <w:proofErr w:type="spellEnd"/>
-      <w:r>
-        <w:rPr>
-          <w:b/>
-          <w:bCs/>
-        </w:rPr>
-        <w:t xml:space="preserve"> to its child element (like &lt;a&gt;)</w:t>
+        <w:t xml:space="preserve"> passHref (simple explanation)</w:t>
+      </w:r>
+    </w:p>
+    <w:p>
+      <w:r>
+        <w:rPr>
+          <w:b/>
+          <w:bCs/>
+        </w:rPr>
+        <w:t>passHref tells &lt;Link&gt; to pass the href to its child element (like &lt;a&gt;)</w:t>
       </w:r>
     </w:p>
     <w:p>
@@ -6722,15 +5463,7 @@
     </w:p>
     <w:p>
       <w:r>
-        <w:t xml:space="preserve">&lt;Link </w:t>
-      </w:r>
-      <w:proofErr w:type="spellStart"/>
-      <w:r>
-        <w:t>href</w:t>
-      </w:r>
-      <w:proofErr w:type="spellEnd"/>
-      <w:r>
-        <w:t>="/login"&gt;</w:t>
+        <w:t>&lt;Link href="/login"&gt;</w:t>
       </w:r>
       <w:r>
         <w:br/>
@@ -6756,17 +5489,8 @@
           <w:b/>
           <w:bCs/>
         </w:rPr>
-        <w:t xml:space="preserve">not automatically get </w:t>
-      </w:r>
-      <w:proofErr w:type="spellStart"/>
-      <w:r>
-        <w:rPr>
-          <w:b/>
-          <w:bCs/>
-        </w:rPr>
-        <w:t>href</w:t>
-      </w:r>
-      <w:proofErr w:type="spellEnd"/>
+        <w:t>not automatically get href</w:t>
+      </w:r>
     </w:p>
     <w:p>
       <w:r>
@@ -6775,23 +5499,7 @@
     </w:p>
     <w:p>
       <w:r>
-        <w:t xml:space="preserve">&lt;Link </w:t>
-      </w:r>
-      <w:proofErr w:type="spellStart"/>
-      <w:r>
-        <w:t>href</w:t>
-      </w:r>
-      <w:proofErr w:type="spellEnd"/>
-      <w:r>
-        <w:t xml:space="preserve">="/login" </w:t>
-      </w:r>
-      <w:proofErr w:type="spellStart"/>
-      <w:r>
-        <w:t>passHref</w:t>
-      </w:r>
-      <w:proofErr w:type="spellEnd"/>
-      <w:r>
-        <w:t>&gt;</w:t>
+        <w:t>&lt;Link href="/login" passHref&gt;</w:t>
       </w:r>
       <w:r>
         <w:br/>
@@ -6815,15 +5523,7 @@
     </w:p>
     <w:p>
       <w:r>
-        <w:t xml:space="preserve">&lt;a </w:t>
-      </w:r>
-      <w:proofErr w:type="spellStart"/>
-      <w:r>
-        <w:t>href</w:t>
-      </w:r>
-      <w:proofErr w:type="spellEnd"/>
-      <w:r>
-        <w:t>="/login"&gt;Login&lt;/a&gt;</w:t>
+        <w:t>&lt;a href="/login"&gt;Login&lt;/a&gt;</w:t>
       </w:r>
     </w:p>
     <w:p>
@@ -6885,13 +5585,8 @@
           <w:numId w:val="3"/>
         </w:numPr>
       </w:pPr>
-      <w:proofErr w:type="spellStart"/>
-      <w:r>
-        <w:t>passHref</w:t>
-      </w:r>
-      <w:proofErr w:type="spellEnd"/>
-      <w:r>
-        <w:t xml:space="preserve"> = “give the link to the receiver” </w:t>
+      <w:r>
+        <w:t xml:space="preserve">passHref = “give the link to the receiver” </w:t>
       </w:r>
     </w:p>
     <w:p>
@@ -6938,15 +5633,7 @@
         <w:t>👉</w:t>
       </w:r>
       <w:r>
-        <w:t xml:space="preserve"> You don’t need </w:t>
-      </w:r>
-      <w:proofErr w:type="spellStart"/>
-      <w:r>
-        <w:t>passHref</w:t>
-      </w:r>
-      <w:proofErr w:type="spellEnd"/>
-      <w:r>
-        <w:t xml:space="preserve"> anymore</w:t>
+        <w:t xml:space="preserve"> You don’t need passHref anymore</w:t>
       </w:r>
       <w:r>
         <w:br/>
@@ -6997,21 +5684,8 @@
           <w:bottom w:val="single" w:sz="12" w:space="1" w:color="auto"/>
         </w:pBdr>
       </w:pPr>
-      <w:proofErr w:type="spellStart"/>
-      <w:r>
-        <w:t>passHref</w:t>
-      </w:r>
-      <w:proofErr w:type="spellEnd"/>
-      <w:r>
-        <w:t xml:space="preserve"> ensures the child element (like &lt;a&gt;) actually receives the link (</w:t>
-      </w:r>
-      <w:proofErr w:type="spellStart"/>
-      <w:r>
-        <w:t>href</w:t>
-      </w:r>
-      <w:proofErr w:type="spellEnd"/>
-      <w:r>
-        <w:t>).</w:t>
+      <w:r>
+        <w:t>passHref ensures the child element (like &lt;a&gt;) actually receives the link (href).</w:t>
       </w:r>
     </w:p>
     <w:p>
@@ -7110,6 +5784,9 @@
       <w:proofErr w:type="gramEnd"/>
       <w:r>
         <w:t xml:space="preserve"> the log that was before reload So to do it go to marked below</w:t>
+      </w:r>
+      <w:r>
+        <w:t xml:space="preserve"> in console</w:t>
       </w:r>
     </w:p>
     <w:p>
@@ -7430,6 +6107,92 @@
             </a:graphic>
           </wp:inline>
         </w:drawing>
+      </w:r>
+    </w:p>
+    <w:p>
+      <w:pPr>
+        <w:rPr>
+          <w:b/>
+          <w:bCs/>
+        </w:rPr>
+      </w:pPr>
+      <w:proofErr w:type="gramStart"/>
+      <w:r>
+        <w:rPr>
+          <w:b/>
+          <w:bCs/>
+        </w:rPr>
+        <w:t>Discovery</w:t>
+      </w:r>
+      <w:r>
+        <w:rPr>
+          <w:b/>
+          <w:bCs/>
+        </w:rPr>
+        <w:t>:-</w:t>
+      </w:r>
+      <w:proofErr w:type="gramEnd"/>
+    </w:p>
+    <w:p>
+      <w:pPr>
+        <w:pBdr>
+          <w:bottom w:val="single" w:sz="12" w:space="1" w:color="auto"/>
+        </w:pBdr>
+      </w:pPr>
+      <w:r>
+        <w:t>We think that inside react element</w:t>
+      </w:r>
+      <w:r>
+        <w:t xml:space="preserve">s that space is also counted as an </w:t>
+      </w:r>
+      <w:proofErr w:type="gramStart"/>
+      <w:r>
+        <w:t>element.</w:t>
+      </w:r>
+      <w:r>
+        <w:t>(</w:t>
+      </w:r>
+      <w:proofErr w:type="gramEnd"/>
+      <w:r>
+        <w:t>maybe) for example you take &lt;p&gt;</w:t>
+      </w:r>
+      <w:r>
+        <w:rPr>
+          <w:u w:val="single"/>
+        </w:rPr>
+        <w:t xml:space="preserve"> </w:t>
+      </w:r>
+      <w:r>
+        <w:t>&lt;a&gt;demo&lt;/a&gt;&lt;/p&gt;</w:t>
+      </w:r>
+      <w:r>
+        <w:t xml:space="preserve">. This </w:t>
+      </w:r>
+      <w:r>
+        <w:rPr>
+          <w:u w:val="single"/>
+        </w:rPr>
+        <w:t xml:space="preserve"> </w:t>
+      </w:r>
+      <w:r>
+        <w:t xml:space="preserve"> be treated as an </w:t>
+      </w:r>
+      <w:proofErr w:type="gramStart"/>
+      <w:r>
+        <w:t>element</w:t>
+      </w:r>
+      <w:r>
+        <w:t>.</w:t>
+      </w:r>
+      <w:r>
+        <w:t>(</w:t>
+      </w:r>
+      <w:proofErr w:type="gramEnd"/>
+      <w:r>
+        <w:t>who knows</w:t>
+      </w:r>
+      <w:r>
+        <w:t>)</w:t>
       </w:r>
     </w:p>
     <w:p/>

</xml_diff>

<commit_message>
Lesson 51Making the 'Buy Now' button for Codeswear.com
</commit_message>
<xml_diff>
--- a/Notes2.docx
+++ b/Notes2.docx
@@ -4,8 +4,13 @@
   <w:body>
     <w:p>
       <w:r>
-        <w:t>In this lesson we will see a react feature that is dangerouslysetinnerHTML</w:t>
-      </w:r>
+        <w:t xml:space="preserve">In this lesson we will see a react feature that is </w:t>
+      </w:r>
+      <w:proofErr w:type="spellStart"/>
+      <w:r>
+        <w:t>dangerouslysetinnerHTML</w:t>
+      </w:r>
+      <w:proofErr w:type="spellEnd"/>
     </w:p>
     <w:p>
       <w:pPr>
@@ -74,7 +79,11 @@
         <w:t>input HTML</w:t>
       </w:r>
       <w:r>
-        <w:t xml:space="preserve"> then you have to use dangerou</w:t>
+        <w:t xml:space="preserve"> then you have to use </w:t>
+      </w:r>
+      <w:proofErr w:type="spellStart"/>
+      <w:r>
+        <w:t>dangerou</w:t>
       </w:r>
       <w:r>
         <w:t>s</w:t>
@@ -85,6 +94,7 @@
       <w:r>
         <w:t>setInner</w:t>
       </w:r>
+      <w:proofErr w:type="spellEnd"/>
       <w:r>
         <w:t xml:space="preserve"> </w:t>
       </w:r>
@@ -110,7 +120,15 @@
         <w:t xml:space="preserve">We will see with the help of </w:t>
       </w:r>
       <w:r>
-        <w:t xml:space="preserve">dangerously innerhtml </w:t>
+        <w:t xml:space="preserve">dangerously </w:t>
+      </w:r>
+      <w:proofErr w:type="spellStart"/>
+      <w:r>
+        <w:t>innerhtml</w:t>
+      </w:r>
+      <w:proofErr w:type="spellEnd"/>
+      <w:r>
+        <w:t xml:space="preserve"> </w:t>
       </w:r>
       <w:r>
         <w:t xml:space="preserve">we can put </w:t>
@@ -122,7 +140,15 @@
         <w:t>conten</w:t>
       </w:r>
       <w:r>
-        <w:t>t in huntingcoder which has simple</w:t>
+        <w:t xml:space="preserve">t in </w:t>
+      </w:r>
+      <w:proofErr w:type="spellStart"/>
+      <w:r>
+        <w:t>huntingcoder</w:t>
+      </w:r>
+      <w:proofErr w:type="spellEnd"/>
+      <w:r>
+        <w:t xml:space="preserve"> which has simple</w:t>
       </w:r>
       <w:r>
         <w:t xml:space="preserve"> p and hea</w:t>
@@ -152,7 +178,23 @@
         <w:t xml:space="preserve">Out blog is HTML Now if you </w:t>
       </w:r>
       <w:r>
-        <w:t xml:space="preserve">put html uibside string in json file. </w:t>
+        <w:t xml:space="preserve">put html </w:t>
+      </w:r>
+      <w:proofErr w:type="spellStart"/>
+      <w:r>
+        <w:t>uibside</w:t>
+      </w:r>
+      <w:proofErr w:type="spellEnd"/>
+      <w:r>
+        <w:t xml:space="preserve"> string in </w:t>
+      </w:r>
+      <w:proofErr w:type="spellStart"/>
+      <w:r>
+        <w:t>json</w:t>
+      </w:r>
+      <w:proofErr w:type="spellEnd"/>
+      <w:r>
+        <w:t xml:space="preserve"> file. </w:t>
       </w:r>
       <w:r>
         <w:t xml:space="preserve">We want to write such that </w:t>
@@ -175,7 +217,15 @@
         </w:r>
       </w:hyperlink>
       <w:r>
-        <w:t xml:space="preserve"> and then copy the html content shownin in the first page </w:t>
+        <w:t xml:space="preserve"> and then copy the html content </w:t>
+      </w:r>
+      <w:proofErr w:type="spellStart"/>
+      <w:r>
+        <w:t>shownin</w:t>
+      </w:r>
+      <w:proofErr w:type="spellEnd"/>
+      <w:r>
+        <w:t xml:space="preserve"> in the first page </w:t>
       </w:r>
       <w:r>
         <w:t xml:space="preserve">and at first we paste it in the address bar so that </w:t>
@@ -193,10 +243,26 @@
         <w:t>e</w:t>
       </w:r>
       <w:r>
-        <w:t xml:space="preserve"> and then we search Json and aby any ransom site escape the jaon that is replace “ by /” and many more and then again remove the </w:t>
-      </w:r>
-      <w:r>
-        <w:t>new lines by pasing in the address bar.</w:t>
+        <w:t xml:space="preserve"> and then we search Json and aby any ransom site escape the </w:t>
+      </w:r>
+      <w:proofErr w:type="spellStart"/>
+      <w:r>
+        <w:t>jaon</w:t>
+      </w:r>
+      <w:proofErr w:type="spellEnd"/>
+      <w:r>
+        <w:t xml:space="preserve"> that is replace “ by /” and many more and then again remove the </w:t>
+      </w:r>
+      <w:r>
+        <w:t xml:space="preserve">new lines by </w:t>
+      </w:r>
+      <w:proofErr w:type="spellStart"/>
+      <w:r>
+        <w:t>pasing</w:t>
+      </w:r>
+      <w:proofErr w:type="spellEnd"/>
+      <w:r>
+        <w:t xml:space="preserve"> in the address bar.</w:t>
       </w:r>
     </w:p>
     <w:p>
@@ -267,7 +333,15 @@
         <w:t>It</w:t>
       </w:r>
       <w:r>
-        <w:t>(Nextjs or react)</w:t>
+        <w:t>(</w:t>
+      </w:r>
+      <w:proofErr w:type="spellStart"/>
+      <w:r>
+        <w:t>Nextjs</w:t>
+      </w:r>
+      <w:proofErr w:type="spellEnd"/>
+      <w:r>
+        <w:t xml:space="preserve"> or react)</w:t>
       </w:r>
       <w:r>
         <w:t xml:space="preserve"> wants to keep you sa</w:t>
@@ -284,14 +358,27 @@
       <w:r>
         <w:t xml:space="preserve"> you need to tell </w:t>
       </w:r>
-      <w:r>
-        <w:t xml:space="preserve">Nextjs that you want to parse html </w:t>
+      <w:proofErr w:type="spellStart"/>
+      <w:r>
+        <w:t>Nextjs</w:t>
+      </w:r>
+      <w:proofErr w:type="spellEnd"/>
+      <w:r>
+        <w:t xml:space="preserve"> that you want to parse html </w:t>
       </w:r>
       <w:r>
         <w:t>there is a tool or setting (who knows)</w:t>
       </w:r>
       <w:r>
-        <w:t xml:space="preserve"> and it is a part of react not a part of nextjs </w:t>
+        <w:t xml:space="preserve"> and it is a part of react not a part of </w:t>
+      </w:r>
+      <w:proofErr w:type="spellStart"/>
+      <w:r>
+        <w:t>nextjs</w:t>
+      </w:r>
+      <w:proofErr w:type="spellEnd"/>
+      <w:r>
+        <w:t xml:space="preserve"> </w:t>
       </w:r>
       <w:r>
         <w:t xml:space="preserve">as it is a feature of react </w:t>
@@ -347,10 +434,23 @@
     </w:p>
     <w:p>
       <w:r>
-        <w:t>The element where you used dangerouslyinnerHTML</w:t>
-      </w:r>
-      <w:r>
-        <w:t xml:space="preserve"> should not have space in the content as it is considered a content other wise you will get this error</w:t>
+        <w:t xml:space="preserve">The element where you used </w:t>
+      </w:r>
+      <w:proofErr w:type="spellStart"/>
+      <w:r>
+        <w:t>dangerouslyinnerHTML</w:t>
+      </w:r>
+      <w:proofErr w:type="spellEnd"/>
+      <w:r>
+        <w:t xml:space="preserve"> should not have space in the content as it is considered a content </w:t>
+      </w:r>
+      <w:proofErr w:type="spellStart"/>
+      <w:r>
+        <w:t>other wise</w:t>
+      </w:r>
+      <w:proofErr w:type="spellEnd"/>
+      <w:r>
+        <w:t xml:space="preserve"> you will get this error</w:t>
       </w:r>
     </w:p>
     <w:p>
@@ -398,7 +498,15 @@
     </w:p>
     <w:p>
       <w:r>
-        <w:t>Now our slug folder page.jsx look like below</w:t>
+        <w:t xml:space="preserve">Now our slug folder </w:t>
+      </w:r>
+      <w:proofErr w:type="spellStart"/>
+      <w:r>
+        <w:t>page.jsx</w:t>
+      </w:r>
+      <w:proofErr w:type="spellEnd"/>
+      <w:r>
+        <w:t xml:space="preserve"> look like below</w:t>
       </w:r>
     </w:p>
     <w:p>
@@ -581,8 +689,13 @@
       <w:r>
         <w:t xml:space="preserve"> </w:t>
       </w:r>
-      <w:r>
-        <w:t>api in this lesso</w:t>
+      <w:proofErr w:type="spellStart"/>
+      <w:r>
+        <w:t>api</w:t>
+      </w:r>
+      <w:proofErr w:type="spellEnd"/>
+      <w:r>
+        <w:t xml:space="preserve"> in this lesso</w:t>
       </w:r>
       <w:r>
         <w:t>n. We will see make it using Next.js API route</w:t>
@@ -605,8 +718,21 @@
       <w:r>
         <w:t xml:space="preserve">it </w:t>
       </w:r>
-      <w:r>
-        <w:t>Seom noownards I will not give too much explanation</w:t>
+      <w:proofErr w:type="spellStart"/>
+      <w:r>
+        <w:t>Seom</w:t>
+      </w:r>
+      <w:proofErr w:type="spellEnd"/>
+      <w:r>
+        <w:t xml:space="preserve"> </w:t>
+      </w:r>
+      <w:proofErr w:type="spellStart"/>
+      <w:r>
+        <w:t>noownards</w:t>
+      </w:r>
+      <w:proofErr w:type="spellEnd"/>
+      <w:r>
+        <w:t xml:space="preserve"> I will not give too much explanation</w:t>
       </w:r>
     </w:p>
     <w:p>
@@ -761,12 +887,28 @@
     </w:p>
     <w:p>
       <w:r>
-        <w:t xml:space="preserve">In older version teacher try to send req but could not send because </w:t>
-      </w:r>
-    </w:p>
-    <w:p>
-      <w:r>
-        <w:t xml:space="preserve">You didn’t see useful data because req is a </w:t>
+        <w:t xml:space="preserve">In older version teacher try to send </w:t>
+      </w:r>
+      <w:proofErr w:type="spellStart"/>
+      <w:r>
+        <w:t>req</w:t>
+      </w:r>
+      <w:proofErr w:type="spellEnd"/>
+      <w:r>
+        <w:t xml:space="preserve"> but could not send because </w:t>
+      </w:r>
+    </w:p>
+    <w:p>
+      <w:r>
+        <w:t xml:space="preserve">You didn’t see useful data because </w:t>
+      </w:r>
+      <w:proofErr w:type="spellStart"/>
+      <w:r>
+        <w:t>req</w:t>
+      </w:r>
+      <w:proofErr w:type="spellEnd"/>
+      <w:r>
+        <w:t xml:space="preserve"> is a </w:t>
       </w:r>
       <w:r>
         <w:rPr>
@@ -778,13 +920,23 @@
       <w:r>
         <w:t xml:space="preserve">, not plain JSON, so sending it directly with </w:t>
       </w:r>
+      <w:proofErr w:type="spellStart"/>
       <w:proofErr w:type="gramStart"/>
       <w:r>
         <w:t>res.json</w:t>
       </w:r>
+      <w:proofErr w:type="spellEnd"/>
       <w:proofErr w:type="gramEnd"/>
       <w:r>
-        <w:t>(req) doesn’t work as expected.</w:t>
+        <w:t>(</w:t>
+      </w:r>
+      <w:proofErr w:type="spellStart"/>
+      <w:r>
+        <w:t>req</w:t>
+      </w:r>
+      <w:proofErr w:type="spellEnd"/>
+      <w:r>
+        <w:t>) doesn’t work as expected.</w:t>
       </w:r>
     </w:p>
     <w:p>
@@ -806,7 +958,23 @@
           <w:b/>
           <w:bCs/>
         </w:rPr>
-        <w:t>What req contains (old Next.js / Node.js)</w:t>
+        <w:t xml:space="preserve">What </w:t>
+      </w:r>
+      <w:proofErr w:type="spellStart"/>
+      <w:r>
+        <w:rPr>
+          <w:b/>
+          <w:bCs/>
+        </w:rPr>
+        <w:t>req</w:t>
+      </w:r>
+      <w:proofErr w:type="spellEnd"/>
+      <w:r>
+        <w:rPr>
+          <w:b/>
+          <w:bCs/>
+        </w:rPr>
+        <w:t xml:space="preserve"> contains (old Next.js / Node.js)</w:t>
       </w:r>
     </w:p>
     <w:p>
@@ -816,12 +984,25 @@
     </w:p>
     <w:p>
       <w:r>
-        <w:t>export default function handler(req, res)</w:t>
-      </w:r>
-    </w:p>
-    <w:p>
-      <w:r>
-        <w:t xml:space="preserve">req is a </w:t>
+        <w:t>export default function handler(</w:t>
+      </w:r>
+      <w:proofErr w:type="spellStart"/>
+      <w:r>
+        <w:t>req</w:t>
+      </w:r>
+      <w:proofErr w:type="spellEnd"/>
+      <w:r>
+        <w:t>, res)</w:t>
+      </w:r>
+    </w:p>
+    <w:p>
+      <w:proofErr w:type="spellStart"/>
+      <w:r>
+        <w:t>req</w:t>
+      </w:r>
+      <w:proofErr w:type="spellEnd"/>
+      <w:r>
+        <w:t xml:space="preserve"> is a </w:t>
       </w:r>
       <w:r>
         <w:rPr>
@@ -908,7 +1089,39 @@
           <w:b/>
           <w:bCs/>
         </w:rPr>
-        <w:t>Why res.json(req) doesn’t show data</w:t>
+        <w:t xml:space="preserve">Why </w:t>
+      </w:r>
+      <w:proofErr w:type="spellStart"/>
+      <w:r>
+        <w:rPr>
+          <w:b/>
+          <w:bCs/>
+        </w:rPr>
+        <w:t>res.json</w:t>
+      </w:r>
+      <w:proofErr w:type="spellEnd"/>
+      <w:r>
+        <w:rPr>
+          <w:b/>
+          <w:bCs/>
+        </w:rPr>
+        <w:t>(</w:t>
+      </w:r>
+      <w:proofErr w:type="spellStart"/>
+      <w:r>
+        <w:rPr>
+          <w:b/>
+          <w:bCs/>
+        </w:rPr>
+        <w:t>req</w:t>
+      </w:r>
+      <w:proofErr w:type="spellEnd"/>
+      <w:r>
+        <w:rPr>
+          <w:b/>
+          <w:bCs/>
+        </w:rPr>
+        <w:t>) doesn’t show data</w:t>
       </w:r>
     </w:p>
     <w:p>
@@ -917,8 +1130,29 @@
       </w:r>
     </w:p>
     <w:p>
-      <w:r>
-        <w:t>res.status(200).json(req)</w:t>
+      <w:proofErr w:type="spellStart"/>
+      <w:r>
+        <w:t>res.status</w:t>
+      </w:r>
+      <w:proofErr w:type="spellEnd"/>
+      <w:r>
+        <w:t>(200).</w:t>
+      </w:r>
+      <w:proofErr w:type="spellStart"/>
+      <w:r>
+        <w:t>json</w:t>
+      </w:r>
+      <w:proofErr w:type="spellEnd"/>
+      <w:r>
+        <w:t>(</w:t>
+      </w:r>
+      <w:proofErr w:type="spellStart"/>
+      <w:r>
+        <w:t>req</w:t>
+      </w:r>
+      <w:proofErr w:type="spellEnd"/>
+      <w:r>
+        <w:t>)</w:t>
       </w:r>
     </w:p>
     <w:p>
@@ -927,8 +1161,13 @@
       </w:r>
     </w:p>
     <w:p>
-      <w:r>
-        <w:t>req is NOT a plain object</w:t>
+      <w:proofErr w:type="spellStart"/>
+      <w:r>
+        <w:t>req</w:t>
+      </w:r>
+      <w:proofErr w:type="spellEnd"/>
+      <w:r>
+        <w:t xml:space="preserve"> is NOT a plain object</w:t>
       </w:r>
       <w:r>
         <w:br/>
@@ -1004,27 +1243,83 @@
     </w:p>
     <w:p>
       <w:r>
-        <w:t>export default function handler(req, res) {</w:t>
+        <w:t>export default function handler(</w:t>
+      </w:r>
+      <w:proofErr w:type="spellStart"/>
+      <w:r>
+        <w:t>req</w:t>
+      </w:r>
+      <w:proofErr w:type="spellEnd"/>
+      <w:r>
+        <w:t>, res) {</w:t>
       </w:r>
       <w:r>
         <w:br/>
-        <w:t xml:space="preserve">  if (req.method === "POST") {</w:t>
+        <w:t xml:space="preserve">  if (</w:t>
+      </w:r>
+      <w:proofErr w:type="spellStart"/>
+      <w:r>
+        <w:t>req.method</w:t>
+      </w:r>
+      <w:proofErr w:type="spellEnd"/>
+      <w:r>
+        <w:t xml:space="preserve"> === "POST") {</w:t>
       </w:r>
       <w:r>
         <w:br/>
-        <w:t xml:space="preserve">    res.status(200).json({</w:t>
+        <w:t xml:space="preserve">    </w:t>
+      </w:r>
+      <w:proofErr w:type="spellStart"/>
+      <w:r>
+        <w:t>res.status</w:t>
+      </w:r>
+      <w:proofErr w:type="spellEnd"/>
+      <w:r>
+        <w:t>(200).</w:t>
+      </w:r>
+      <w:proofErr w:type="spellStart"/>
+      <w:r>
+        <w:t>json</w:t>
+      </w:r>
+      <w:proofErr w:type="spellEnd"/>
+      <w:r>
+        <w:t>({</w:t>
       </w:r>
       <w:r>
         <w:br/>
-        <w:t xml:space="preserve">      method: req.method,</w:t>
+        <w:t xml:space="preserve">      method: </w:t>
+      </w:r>
+      <w:proofErr w:type="spellStart"/>
+      <w:r>
+        <w:t>req.method</w:t>
+      </w:r>
+      <w:proofErr w:type="spellEnd"/>
+      <w:r>
+        <w:t>,</w:t>
       </w:r>
       <w:r>
         <w:br/>
-        <w:t xml:space="preserve">      body: req.body,</w:t>
+        <w:t xml:space="preserve">      body: </w:t>
+      </w:r>
+      <w:proofErr w:type="spellStart"/>
+      <w:r>
+        <w:t>req.body</w:t>
+      </w:r>
+      <w:proofErr w:type="spellEnd"/>
+      <w:r>
+        <w:t>,</w:t>
       </w:r>
       <w:r>
         <w:br/>
-        <w:t xml:space="preserve">      query: req.query,</w:t>
+        <w:t xml:space="preserve">      query: </w:t>
+      </w:r>
+      <w:proofErr w:type="spellStart"/>
+      <w:r>
+        <w:t>req.query</w:t>
+      </w:r>
+      <w:proofErr w:type="spellEnd"/>
+      <w:r>
+        <w:t>,</w:t>
       </w:r>
       <w:r>
         <w:br/>
@@ -1148,8 +1443,13 @@
             <w:hideMark/>
           </w:tcPr>
           <w:p>
+            <w:proofErr w:type="spellStart"/>
             <w:r>
-              <w:t>req (whole object)</w:t>
+              <w:t>req</w:t>
+            </w:r>
+            <w:proofErr w:type="spellEnd"/>
+            <w:r>
+              <w:t xml:space="preserve"> (whole object)</w:t>
             </w:r>
           </w:p>
         </w:tc>
@@ -1183,9 +1483,11 @@
             <w:hideMark/>
           </w:tcPr>
           <w:p>
+            <w:proofErr w:type="spellStart"/>
             <w:r>
               <w:t>req.body</w:t>
             </w:r>
+            <w:proofErr w:type="spellEnd"/>
           </w:p>
         </w:tc>
         <w:tc>
@@ -1218,9 +1520,11 @@
             <w:hideMark/>
           </w:tcPr>
           <w:p>
+            <w:proofErr w:type="spellStart"/>
             <w:r>
               <w:t>req.query</w:t>
             </w:r>
+            <w:proofErr w:type="spellEnd"/>
           </w:p>
         </w:tc>
         <w:tc>
@@ -1253,9 +1557,11 @@
             <w:hideMark/>
           </w:tcPr>
           <w:p>
+            <w:proofErr w:type="spellStart"/>
             <w:r>
               <w:t>req.method</w:t>
             </w:r>
+            <w:proofErr w:type="spellEnd"/>
           </w:p>
         </w:tc>
         <w:tc>
@@ -1307,7 +1613,15 @@
     </w:p>
     <w:p>
       <w:r>
-        <w:t>export async function POST(req)</w:t>
+        <w:t>export async function POST(</w:t>
+      </w:r>
+      <w:proofErr w:type="spellStart"/>
+      <w:r>
+        <w:t>req</w:t>
+      </w:r>
+      <w:proofErr w:type="spellEnd"/>
+      <w:r>
+        <w:t>)</w:t>
       </w:r>
     </w:p>
     <w:p>
@@ -1316,8 +1630,21 @@
       </w:r>
     </w:p>
     <w:p>
-      <w:r>
-        <w:t>const body = await req.json();</w:t>
+      <w:proofErr w:type="spellStart"/>
+      <w:r>
+        <w:t>const</w:t>
+      </w:r>
+      <w:proofErr w:type="spellEnd"/>
+      <w:r>
+        <w:t xml:space="preserve"> body = await </w:t>
+      </w:r>
+      <w:proofErr w:type="spellStart"/>
+      <w:r>
+        <w:t>req.json</w:t>
+      </w:r>
+      <w:proofErr w:type="spellEnd"/>
+      <w:r>
+        <w:t>();</w:t>
       </w:r>
     </w:p>
     <w:p>
@@ -1360,13 +1687,29 @@
       </w:pPr>
       <w:r>
         <w:lastRenderedPageBreak/>
-        <w:t>You didn’t see req in the response because it’s a complex object that cannot be directly converted to JSON—you need to se</w:t>
+        <w:t xml:space="preserve">You didn’t see </w:t>
+      </w:r>
+      <w:proofErr w:type="spellStart"/>
+      <w:r>
+        <w:t>req</w:t>
+      </w:r>
+      <w:proofErr w:type="spellEnd"/>
+      <w:r>
+        <w:t xml:space="preserve"> in the response because it’s a complex object that cannot be directly converted to JSON—you need to se</w:t>
       </w:r>
       <w:r>
         <w:t>n</w:t>
       </w:r>
       <w:r>
-        <w:t>d specific fields like req.body.</w:t>
+        <w:t xml:space="preserve">d specific fields like </w:t>
+      </w:r>
+      <w:proofErr w:type="spellStart"/>
+      <w:r>
+        <w:t>req.body</w:t>
+      </w:r>
+      <w:proofErr w:type="spellEnd"/>
+      <w:r>
+        <w:t>.</w:t>
       </w:r>
     </w:p>
     <w:p>
@@ -1483,7 +1826,31 @@
         <w:t xml:space="preserve"> is that </w:t>
       </w:r>
       <w:r>
-        <w:t xml:space="preserve">if suppose oint fail is failed to wiriteen an empyty fie is created </w:t>
+        <w:t xml:space="preserve">if suppose </w:t>
+      </w:r>
+      <w:proofErr w:type="spellStart"/>
+      <w:r>
+        <w:t>oint</w:t>
+      </w:r>
+      <w:proofErr w:type="spellEnd"/>
+      <w:r>
+        <w:t xml:space="preserve"> fail is failed to </w:t>
+      </w:r>
+      <w:proofErr w:type="spellStart"/>
+      <w:r>
+        <w:t>wiriteen</w:t>
+      </w:r>
+      <w:proofErr w:type="spellEnd"/>
+      <w:r>
+        <w:t xml:space="preserve"> an </w:t>
+      </w:r>
+      <w:proofErr w:type="spellStart"/>
+      <w:r>
+        <w:t>empyty</w:t>
+      </w:r>
+      <w:proofErr w:type="spellEnd"/>
+      <w:r>
+        <w:t xml:space="preserve"> fie is created </w:t>
       </w:r>
       <w:r>
         <w:t>problem can happen (maybe if we associate a number to a user who tries to contact (who knows))</w:t>
@@ -1545,7 +1912,15 @@
       </w:r>
       <w:r>
         <w:lastRenderedPageBreak/>
-        <w:t xml:space="preserve">This error we may face if we son’t set the value of the input fields </w:t>
+        <w:t xml:space="preserve">This error we may face if we </w:t>
+      </w:r>
+      <w:proofErr w:type="spellStart"/>
+      <w:r>
+        <w:t>son’t</w:t>
+      </w:r>
+      <w:proofErr w:type="spellEnd"/>
+      <w:r>
+        <w:t xml:space="preserve"> set the value of the input fields </w:t>
       </w:r>
     </w:p>
     <w:p>
@@ -1553,7 +1928,15 @@
         <w:t xml:space="preserve">In older version </w:t>
       </w:r>
       <w:r>
-        <w:t>we used to put the state value in between the textarea element</w:t>
+        <w:t xml:space="preserve">we used to put the state value in between the </w:t>
+      </w:r>
+      <w:proofErr w:type="spellStart"/>
+      <w:r>
+        <w:t>textarea</w:t>
+      </w:r>
+      <w:proofErr w:type="spellEnd"/>
+      <w:r>
+        <w:t xml:space="preserve"> element</w:t>
       </w:r>
       <w:r>
         <w:t>(who knows may be I am wrong here)</w:t>
@@ -1562,20 +1945,70 @@
         <w:t xml:space="preserve"> </w:t>
       </w:r>
       <w:r>
-        <w:t>and on state update method we used e.target.innerText</w:t>
-      </w:r>
-    </w:p>
-    <w:p>
-      <w:r>
-        <w:t>But now in Textare we can use e.target,value as value attribute is used in the Textfi</w:t>
+        <w:t xml:space="preserve">and on state update method we used </w:t>
+      </w:r>
+      <w:proofErr w:type="spellStart"/>
+      <w:r>
+        <w:t>e.target.innerText</w:t>
+      </w:r>
+      <w:proofErr w:type="spellEnd"/>
+    </w:p>
+    <w:p>
+      <w:r>
+        <w:t xml:space="preserve">But now in </w:t>
+      </w:r>
+      <w:proofErr w:type="spellStart"/>
+      <w:r>
+        <w:t>Textare</w:t>
+      </w:r>
+      <w:proofErr w:type="spellEnd"/>
+      <w:r>
+        <w:t xml:space="preserve"> we can use </w:t>
+      </w:r>
+      <w:proofErr w:type="spellStart"/>
+      <w:r>
+        <w:t>e.target,value</w:t>
+      </w:r>
+      <w:proofErr w:type="spellEnd"/>
+      <w:r>
+        <w:t xml:space="preserve"> as value attribute is used in the </w:t>
+      </w:r>
+      <w:proofErr w:type="spellStart"/>
+      <w:r>
+        <w:t>Textfi</w:t>
       </w:r>
       <w:r>
         <w:t>eld</w:t>
       </w:r>
-    </w:p>
-    <w:p>
-      <w:r>
-        <w:t>The API may not give json response but instead uit may text reponse who knows and we can parse it by text method in response we are fetching</w:t>
+      <w:proofErr w:type="spellEnd"/>
+    </w:p>
+    <w:p>
+      <w:r>
+        <w:t xml:space="preserve">The API may not give </w:t>
+      </w:r>
+      <w:proofErr w:type="spellStart"/>
+      <w:r>
+        <w:t>json</w:t>
+      </w:r>
+      <w:proofErr w:type="spellEnd"/>
+      <w:r>
+        <w:t xml:space="preserve"> response but instead </w:t>
+      </w:r>
+      <w:proofErr w:type="spellStart"/>
+      <w:r>
+        <w:t>uit</w:t>
+      </w:r>
+      <w:proofErr w:type="spellEnd"/>
+      <w:r>
+        <w:t xml:space="preserve"> may text </w:t>
+      </w:r>
+      <w:proofErr w:type="spellStart"/>
+      <w:r>
+        <w:t>reponse</w:t>
+      </w:r>
+      <w:proofErr w:type="spellEnd"/>
+      <w:r>
+        <w:t xml:space="preserve"> who knows and we can parse it by text method in response we are fetching</w:t>
       </w:r>
       <w:r>
         <w:t xml:space="preserve"> as shown below</w:t>
@@ -1647,7 +2080,15 @@
     </w:p>
     <w:p>
       <w:r>
-        <w:t xml:space="preserve">Shortcut for margin:auto will be </w:t>
+        <w:t xml:space="preserve">Shortcut for </w:t>
+      </w:r>
+      <w:proofErr w:type="spellStart"/>
+      <w:r>
+        <w:t>margin:auto</w:t>
+      </w:r>
+      <w:proofErr w:type="spellEnd"/>
+      <w:r>
+        <w:t xml:space="preserve"> will be </w:t>
       </w:r>
       <w:r>
         <w:rPr>
@@ -1664,12 +2105,25 @@
         <w:t xml:space="preserve"> </w:t>
       </w:r>
       <w:r>
-        <w:t>in VSCode</w:t>
-      </w:r>
-    </w:p>
-    <w:p>
-      <w:r>
-        <w:t xml:space="preserve">In name of logic we forgot to style outpages are not responsive which teacher will talk about in upcoming lesson </w:t>
+        <w:t xml:space="preserve">in </w:t>
+      </w:r>
+      <w:proofErr w:type="spellStart"/>
+      <w:r>
+        <w:t>VSCode</w:t>
+      </w:r>
+      <w:proofErr w:type="spellEnd"/>
+    </w:p>
+    <w:p>
+      <w:r>
+        <w:t xml:space="preserve">In name of logic we forgot to style </w:t>
+      </w:r>
+      <w:proofErr w:type="spellStart"/>
+      <w:r>
+        <w:t>outpages</w:t>
+      </w:r>
+      <w:proofErr w:type="spellEnd"/>
+      <w:r>
+        <w:t xml:space="preserve"> are not responsive which teacher will talk about in upcoming lesson </w:t>
       </w:r>
       <w:r>
         <w:t xml:space="preserve">we will see how to keep styling of </w:t>
@@ -1733,7 +2187,15 @@
         <w:t xml:space="preserve">by infinite scroll </w:t>
       </w:r>
       <w:r>
-        <w:t xml:space="preserve">like facebook news feed </w:t>
+        <w:t xml:space="preserve">like </w:t>
+      </w:r>
+      <w:proofErr w:type="spellStart"/>
+      <w:r>
+        <w:t>facebook</w:t>
+      </w:r>
+      <w:proofErr w:type="spellEnd"/>
+      <w:r>
+        <w:t xml:space="preserve"> news feed </w:t>
       </w:r>
       <w:r>
         <w:t>you keep scrolling and new thing appears</w:t>
@@ -1762,7 +2224,15 @@
         <w:t xml:space="preserve"> observer</w:t>
       </w:r>
       <w:r>
-        <w:t xml:space="preserve"> api. </w:t>
+        <w:t xml:space="preserve"> </w:t>
+      </w:r>
+      <w:proofErr w:type="spellStart"/>
+      <w:r>
+        <w:t>api</w:t>
+      </w:r>
+      <w:proofErr w:type="spellEnd"/>
+      <w:r>
+        <w:t xml:space="preserve">. </w:t>
       </w:r>
     </w:p>
     <w:p>
@@ -1798,7 +2268,23 @@
           <w:b/>
           <w:bCs/>
         </w:rPr>
-        <w:t xml:space="preserve">which id already made for us </w:t>
+        <w:t xml:space="preserve">which </w:t>
+      </w:r>
+      <w:proofErr w:type="spellStart"/>
+      <w:r>
+        <w:rPr>
+          <w:b/>
+          <w:bCs/>
+        </w:rPr>
+        <w:t>id</w:t>
+      </w:r>
+      <w:proofErr w:type="spellEnd"/>
+      <w:r>
+        <w:rPr>
+          <w:b/>
+          <w:bCs/>
+        </w:rPr>
+        <w:t xml:space="preserve"> already made for us </w:t>
       </w:r>
     </w:p>
     <w:p>
@@ -1820,12 +2306,21 @@
           <w:bCs/>
         </w:rPr>
       </w:pPr>
-      <w:r>
-        <w:rPr>
-          <w:b/>
-          <w:bCs/>
-        </w:rPr>
-        <w:t>npm install --save react-infinite-scroll-component</w:t>
+      <w:proofErr w:type="spellStart"/>
+      <w:r>
+        <w:rPr>
+          <w:b/>
+          <w:bCs/>
+        </w:rPr>
+        <w:t>npm</w:t>
+      </w:r>
+      <w:proofErr w:type="spellEnd"/>
+      <w:r>
+        <w:rPr>
+          <w:b/>
+          <w:bCs/>
+        </w:rPr>
+        <w:t xml:space="preserve"> install --save react-infinite-scroll-component</w:t>
       </w:r>
     </w:p>
     <w:p>
@@ -1937,9 +2432,11 @@
       <w:r>
         <w:t xml:space="preserve">The props below the </w:t>
       </w:r>
+      <w:proofErr w:type="spellStart"/>
       <w:r>
         <w:t>endMessage</w:t>
       </w:r>
+      <w:proofErr w:type="spellEnd"/>
       <w:r>
         <w:t xml:space="preserve"> </w:t>
       </w:r>
@@ -1967,7 +2464,15 @@
     </w:p>
     <w:p>
       <w:r>
-        <w:t xml:space="preserve">You can use InfiniteScroll only in client side so </w:t>
+        <w:t xml:space="preserve">You can use </w:t>
+      </w:r>
+      <w:proofErr w:type="spellStart"/>
+      <w:r>
+        <w:t>InfiniteScroll</w:t>
+      </w:r>
+      <w:proofErr w:type="spellEnd"/>
+      <w:r>
+        <w:t xml:space="preserve"> only in client side so </w:t>
       </w:r>
       <w:r>
         <w:t xml:space="preserve">we need to use it in client component so we will change the blogs from SSG to client component. </w:t>
@@ -1986,8 +2491,13 @@
       <w:r>
         <w:t xml:space="preserve">we use any library </w:t>
       </w:r>
-      <w:r>
-        <w:t>onw imp</w:t>
+      <w:proofErr w:type="spellStart"/>
+      <w:r>
+        <w:t>onw</w:t>
+      </w:r>
+      <w:proofErr w:type="spellEnd"/>
+      <w:r>
+        <w:t xml:space="preserve"> imp</w:t>
       </w:r>
       <w:r>
         <w:t>o</w:t>
@@ -2011,7 +2521,15 @@
         <w:t xml:space="preserve">ined </w:t>
       </w:r>
       <w:r>
-        <w:t>is it idefined like that you have t</w:t>
+        <w:t xml:space="preserve">is it </w:t>
+      </w:r>
+      <w:proofErr w:type="spellStart"/>
+      <w:r>
+        <w:t>idefined</w:t>
+      </w:r>
+      <w:proofErr w:type="spellEnd"/>
+      <w:r>
+        <w:t xml:space="preserve"> like that you have t</w:t>
       </w:r>
       <w:r>
         <w:t xml:space="preserve">o </w:t>
@@ -2114,10 +2632,26 @@
         <w:t xml:space="preserve"> it was an addon</w:t>
       </w:r>
       <w:r>
-        <w:t xml:space="preserve"> if you gave it then it was a favor </w:t>
-      </w:r>
-      <w:r>
-        <w:t xml:space="preserve">you can say bit in todays time </w:t>
+        <w:t xml:space="preserve"> if you gave it then it was a </w:t>
+      </w:r>
+      <w:proofErr w:type="spellStart"/>
+      <w:r>
+        <w:t>favor</w:t>
+      </w:r>
+      <w:proofErr w:type="spellEnd"/>
+      <w:r>
+        <w:t xml:space="preserve"> </w:t>
+      </w:r>
+      <w:r>
+        <w:t xml:space="preserve">you can say bit in </w:t>
+      </w:r>
+      <w:proofErr w:type="spellStart"/>
+      <w:r>
+        <w:t>todays</w:t>
+      </w:r>
+      <w:proofErr w:type="spellEnd"/>
+      <w:r>
+        <w:t xml:space="preserve"> time </w:t>
       </w:r>
       <w:r>
         <w:t xml:space="preserve">if you are delivering a website </w:t>
@@ -2388,7 +2922,23 @@
     </w:p>
     <w:p>
       <w:r>
-        <w:t xml:space="preserve">It is very simple an it wil automatically detect your application </w:t>
+        <w:t xml:space="preserve">It is very simple </w:t>
+      </w:r>
+      <w:proofErr w:type="spellStart"/>
+      <w:r>
+        <w:t>an</w:t>
+      </w:r>
+      <w:proofErr w:type="spellEnd"/>
+      <w:r>
+        <w:t xml:space="preserve"> it </w:t>
+      </w:r>
+      <w:proofErr w:type="spellStart"/>
+      <w:r>
+        <w:t>wil</w:t>
+      </w:r>
+      <w:proofErr w:type="spellEnd"/>
+      <w:r>
+        <w:t xml:space="preserve"> automatically detect your application </w:t>
       </w:r>
     </w:p>
     <w:p>
@@ -2399,7 +2949,23 @@
         <w:t>d</w:t>
       </w:r>
       <w:r>
-        <w:t xml:space="preserve"> use it like a node ap hten it will be good(wjp knows)</w:t>
+        <w:t xml:space="preserve"> use it like a node ap </w:t>
+      </w:r>
+      <w:proofErr w:type="spellStart"/>
+      <w:r>
+        <w:t>hten</w:t>
+      </w:r>
+      <w:proofErr w:type="spellEnd"/>
+      <w:r>
+        <w:t xml:space="preserve"> it will be good(</w:t>
+      </w:r>
+      <w:proofErr w:type="spellStart"/>
+      <w:r>
+        <w:t>wjp</w:t>
+      </w:r>
+      <w:proofErr w:type="spellEnd"/>
+      <w:r>
+        <w:t xml:space="preserve"> knows)</w:t>
       </w:r>
     </w:p>
     <w:p>
@@ -2424,15 +2990,16 @@
           <w:bCs/>
           <w:color w:val="EE0000"/>
         </w:rPr>
-        <w:t>error in js</w:t>
-      </w:r>
+        <w:t xml:space="preserve">error in </w:t>
+      </w:r>
+      <w:proofErr w:type="spellStart"/>
       <w:r>
         <w:rPr>
           <w:b/>
           <w:bCs/>
           <w:color w:val="EE0000"/>
         </w:rPr>
-        <w:t>x in Nextjs or maybe in React.</w:t>
+        <w:t>js</w:t>
       </w:r>
       <w:r>
         <w:rPr>
@@ -2440,6 +3007,41 @@
           <w:bCs/>
           <w:color w:val="EE0000"/>
         </w:rPr>
+        <w:t>x</w:t>
+      </w:r>
+      <w:proofErr w:type="spellEnd"/>
+      <w:r>
+        <w:rPr>
+          <w:b/>
+          <w:bCs/>
+          <w:color w:val="EE0000"/>
+        </w:rPr>
+        <w:t xml:space="preserve"> in </w:t>
+      </w:r>
+      <w:proofErr w:type="spellStart"/>
+      <w:r>
+        <w:rPr>
+          <w:b/>
+          <w:bCs/>
+          <w:color w:val="EE0000"/>
+        </w:rPr>
+        <w:t>Nextjs</w:t>
+      </w:r>
+      <w:proofErr w:type="spellEnd"/>
+      <w:r>
+        <w:rPr>
+          <w:b/>
+          <w:bCs/>
+          <w:color w:val="EE0000"/>
+        </w:rPr>
+        <w:t xml:space="preserve"> or maybe in React.</w:t>
+      </w:r>
+      <w:r>
+        <w:rPr>
+          <w:b/>
+          <w:bCs/>
+          <w:color w:val="EE0000"/>
+        </w:rPr>
         <w:t>(maybe it is an outdated problem)</w:t>
       </w:r>
     </w:p>
@@ -2462,7 +3064,15 @@
         <w:t xml:space="preserve">that </w:t>
       </w:r>
       <w:r>
-        <w:t xml:space="preserve">you can make it like that and if it become profitable then you can scale it (who knows) </w:t>
+        <w:t xml:space="preserve">you can make it like that and if it </w:t>
+      </w:r>
+      <w:proofErr w:type="spellStart"/>
+      <w:r>
+        <w:t>become</w:t>
+      </w:r>
+      <w:proofErr w:type="spellEnd"/>
+      <w:r>
+        <w:t xml:space="preserve"> profitable then you can scale it (who knows) </w:t>
       </w:r>
     </w:p>
     <w:p>
@@ -2576,7 +3186,15 @@
         <w:t>how Google analytics and search console</w:t>
       </w:r>
       <w:r>
-        <w:t>(who knowa)</w:t>
+        <w:t xml:space="preserve">(who </w:t>
+      </w:r>
+      <w:proofErr w:type="spellStart"/>
+      <w:r>
+        <w:t>knowa</w:t>
+      </w:r>
+      <w:proofErr w:type="spellEnd"/>
+      <w:r>
+        <w:t>)</w:t>
       </w:r>
       <w:r>
         <w:t xml:space="preserve"> </w:t>
@@ -2592,8 +3210,13 @@
       </w:r>
     </w:p>
     <w:p>
-      <w:r>
-        <w:t xml:space="preserve">Nextjs </w:t>
+      <w:proofErr w:type="spellStart"/>
+      <w:r>
+        <w:t>Nextjs</w:t>
+      </w:r>
+      <w:proofErr w:type="spellEnd"/>
+      <w:r>
+        <w:t xml:space="preserve"> </w:t>
       </w:r>
       <w:r>
         <w:t>d</w:t>
@@ -3026,7 +3649,15 @@
     <w:p>
       <w:r>
         <w:lastRenderedPageBreak/>
-        <w:t xml:space="preserve">Now we will make an ecomerce store </w:t>
+        <w:t xml:space="preserve">Now we will make an </w:t>
+      </w:r>
+      <w:proofErr w:type="spellStart"/>
+      <w:r>
+        <w:t>ecomerce</w:t>
+      </w:r>
+      <w:proofErr w:type="spellEnd"/>
+      <w:r>
+        <w:t xml:space="preserve"> store </w:t>
       </w:r>
       <w:r>
         <w:t xml:space="preserve">and we will make pages like </w:t>
@@ -3074,7 +3705,15 @@
         <w:t xml:space="preserve">teacher will teach us </w:t>
       </w:r>
       <w:r>
-        <w:t xml:space="preserve">We name it codeswear it will be an ecommerce store where we will list our product </w:t>
+        <w:t xml:space="preserve">We name it </w:t>
+      </w:r>
+      <w:proofErr w:type="spellStart"/>
+      <w:r>
+        <w:t>codeswear</w:t>
+      </w:r>
+      <w:proofErr w:type="spellEnd"/>
+      <w:r>
+        <w:t xml:space="preserve"> it will be an ecommerce store where we will list our product </w:t>
       </w:r>
       <w:r>
         <w:t xml:space="preserve">So we type the command </w:t>
@@ -3100,7 +3739,23 @@
           <w:b/>
           <w:bCs/>
         </w:rPr>
-        <w:t xml:space="preserve"> &lt;appname&gt;</w:t>
+        <w:t xml:space="preserve"> &lt;</w:t>
+      </w:r>
+      <w:proofErr w:type="spellStart"/>
+      <w:r>
+        <w:rPr>
+          <w:b/>
+          <w:bCs/>
+        </w:rPr>
+        <w:t>appname</w:t>
+      </w:r>
+      <w:proofErr w:type="spellEnd"/>
+      <w:r>
+        <w:rPr>
+          <w:b/>
+          <w:bCs/>
+        </w:rPr>
+        <w:t>&gt;</w:t>
       </w:r>
     </w:p>
     <w:p>
@@ -3145,7 +3800,11 @@
         <w:t xml:space="preserve">Now we will see how to setup </w:t>
       </w:r>
       <w:r>
-        <w:t>up tailwind with Ne</w:t>
+        <w:t xml:space="preserve">up tailwind with </w:t>
+      </w:r>
+      <w:proofErr w:type="spellStart"/>
+      <w:r>
+        <w:t>Ne</w:t>
       </w:r>
       <w:r>
         <w:t>x</w:t>
@@ -3153,6 +3812,7 @@
       <w:r>
         <w:t>tjs</w:t>
       </w:r>
+      <w:proofErr w:type="spellEnd"/>
       <w:r>
         <w:t>,</w:t>
       </w:r>
@@ -3169,7 +3829,15 @@
         <w:t xml:space="preserve">optimally </w:t>
       </w:r>
       <w:r>
-        <w:t xml:space="preserve">and will make a black slate of codeswear </w:t>
+        <w:t xml:space="preserve">and will make a black slate of </w:t>
+      </w:r>
+      <w:proofErr w:type="spellStart"/>
+      <w:r>
+        <w:t>codeswear</w:t>
+      </w:r>
+      <w:proofErr w:type="spellEnd"/>
+      <w:r>
+        <w:t xml:space="preserve"> </w:t>
       </w:r>
       <w:r>
         <w:t>(who knows)</w:t>
@@ -3192,8 +3860,13 @@
     </w:p>
     <w:p>
       <w:r>
-        <w:t>We will search tailwind css with nextjs</w:t>
-      </w:r>
+        <w:t xml:space="preserve">We will search tailwind css with </w:t>
+      </w:r>
+      <w:proofErr w:type="spellStart"/>
+      <w:r>
+        <w:t>nextjs</w:t>
+      </w:r>
+      <w:proofErr w:type="spellEnd"/>
       <w:r>
         <w:t xml:space="preserve"> </w:t>
       </w:r>
@@ -3214,19 +3887,42 @@
       <w:r>
         <w:t xml:space="preserve">s </w:t>
       </w:r>
-      <w:r>
-        <w:t xml:space="preserve">cammand </w:t>
-      </w:r>
-    </w:p>
-    <w:p>
-      <w:r>
-        <w:t>npm install tailwindcss @tailwindcss/postcss postcss</w:t>
-      </w:r>
+      <w:proofErr w:type="spellStart"/>
+      <w:r>
+        <w:t>cammand</w:t>
+      </w:r>
+      <w:proofErr w:type="spellEnd"/>
       <w:r>
         <w:t xml:space="preserve"> </w:t>
       </w:r>
     </w:p>
     <w:p>
+      <w:proofErr w:type="spellStart"/>
+      <w:r>
+        <w:t>npm</w:t>
+      </w:r>
+      <w:proofErr w:type="spellEnd"/>
+      <w:r>
+        <w:t xml:space="preserve"> install </w:t>
+      </w:r>
+      <w:proofErr w:type="spellStart"/>
+      <w:r>
+        <w:t>tailwindcss</w:t>
+      </w:r>
+      <w:proofErr w:type="spellEnd"/>
+      <w:r>
+        <w:t xml:space="preserve"> @tailwindcss/postcss </w:t>
+      </w:r>
+      <w:proofErr w:type="spellStart"/>
+      <w:r>
+        <w:t>postcss</w:t>
+      </w:r>
+      <w:proofErr w:type="spellEnd"/>
+      <w:r>
+        <w:t xml:space="preserve"> </w:t>
+      </w:r>
+    </w:p>
+    <w:p>
       <w:r>
         <w:t>or</w:t>
       </w:r>
@@ -3235,9 +3931,19 @@
       <w:r>
         <w:t xml:space="preserve"> yarn add </w:t>
       </w:r>
-      <w:r>
-        <w:t>tailwindcss @tailwindcss/postcss postcss</w:t>
-      </w:r>
+      <w:proofErr w:type="spellStart"/>
+      <w:r>
+        <w:t>tailwindcss</w:t>
+      </w:r>
+      <w:proofErr w:type="spellEnd"/>
+      <w:r>
+        <w:t xml:space="preserve"> @tailwindcss/postcss </w:t>
+      </w:r>
+      <w:proofErr w:type="spellStart"/>
+      <w:r>
+        <w:t>postcss</w:t>
+      </w:r>
+      <w:proofErr w:type="spellEnd"/>
       <w:r>
         <w:t xml:space="preserve"> </w:t>
       </w:r>
@@ -3256,7 +3962,15 @@
         <w:t>e</w:t>
       </w:r>
       <w:r>
-        <w:t>r is using is autdated so we will use moder</w:t>
+        <w:t xml:space="preserve">r is using is </w:t>
+      </w:r>
+      <w:proofErr w:type="spellStart"/>
+      <w:r>
+        <w:t>autdated</w:t>
+      </w:r>
+      <w:proofErr w:type="spellEnd"/>
+      <w:r>
+        <w:t xml:space="preserve"> so we will use moder</w:t>
       </w:r>
       <w:r>
         <w:t>n</w:t>
@@ -3420,19 +4134,29 @@
         <w:t xml:space="preserve"> order</w:t>
       </w:r>
       <w:r>
-        <w:t xml:space="preserve"> , login and signUp</w:t>
-      </w:r>
+        <w:t xml:space="preserve"> , login and </w:t>
+      </w:r>
+      <w:proofErr w:type="spellStart"/>
+      <w:r>
+        <w:t>signUp</w:t>
+      </w:r>
+      <w:proofErr w:type="spellEnd"/>
       <w:r>
         <w:t xml:space="preserve">. We will create their blank slate here </w:t>
       </w:r>
       <w:r>
         <w:t xml:space="preserve">and then we will start </w:t>
       </w:r>
+      <w:proofErr w:type="spellStart"/>
       <w:r>
         <w:t>c</w:t>
       </w:r>
       <w:r>
-        <w:t xml:space="preserve">odeswear development </w:t>
+        <w:t>odeswear</w:t>
+      </w:r>
+      <w:proofErr w:type="spellEnd"/>
+      <w:r>
+        <w:t xml:space="preserve"> development </w:t>
       </w:r>
     </w:p>
     <w:p>
@@ -3487,15 +4211,44 @@
     </w:p>
     <w:p>
       <w:r>
-        <w:t>We will use app for that purposes(maybe ol version of layout.jsx)</w:t>
-      </w:r>
-    </w:p>
-    <w:p>
-      <w:r>
-        <w:t xml:space="preserve">Now there is site that is Tailblocks that will give you </w:t>
-      </w:r>
-      <w:r>
-        <w:t xml:space="preserve">tailblocks </w:t>
+        <w:t xml:space="preserve">We will use app for that purposes(maybe </w:t>
+      </w:r>
+      <w:proofErr w:type="spellStart"/>
+      <w:r>
+        <w:t>ol</w:t>
+      </w:r>
+      <w:proofErr w:type="spellEnd"/>
+      <w:r>
+        <w:t xml:space="preserve"> version of </w:t>
+      </w:r>
+      <w:proofErr w:type="spellStart"/>
+      <w:r>
+        <w:t>layout.jsx</w:t>
+      </w:r>
+      <w:proofErr w:type="spellEnd"/>
+      <w:r>
+        <w:t>)</w:t>
+      </w:r>
+    </w:p>
+    <w:p>
+      <w:r>
+        <w:t xml:space="preserve">Now there is site that is </w:t>
+      </w:r>
+      <w:proofErr w:type="spellStart"/>
+      <w:r>
+        <w:t>Tailblocks</w:t>
+      </w:r>
+      <w:proofErr w:type="spellEnd"/>
+      <w:r>
+        <w:t xml:space="preserve"> that will give you </w:t>
+      </w:r>
+      <w:proofErr w:type="spellStart"/>
+      <w:r>
+        <w:t>tailblocks</w:t>
+      </w:r>
+      <w:proofErr w:type="spellEnd"/>
+      <w:r>
+        <w:t xml:space="preserve"> </w:t>
       </w:r>
       <w:r>
         <w:t xml:space="preserve">snippet </w:t>
@@ -3507,7 +4260,15 @@
         <w:t xml:space="preserve"> </w:t>
       </w:r>
       <w:r>
-        <w:t>Here you get Ecommerece design</w:t>
+        <w:t xml:space="preserve">Here you get </w:t>
+      </w:r>
+      <w:proofErr w:type="spellStart"/>
+      <w:r>
+        <w:t>Ecommerece</w:t>
+      </w:r>
+      <w:proofErr w:type="spellEnd"/>
+      <w:r>
+        <w:t xml:space="preserve"> design</w:t>
       </w:r>
     </w:p>
     <w:p>
@@ -3525,7 +4286,23 @@
     </w:p>
     <w:p>
       <w:r>
-        <w:t xml:space="preserve">In tailwiond code you might need ot replace </w:t>
+        <w:t xml:space="preserve">In </w:t>
+      </w:r>
+      <w:proofErr w:type="spellStart"/>
+      <w:r>
+        <w:t>tailwiond</w:t>
+      </w:r>
+      <w:proofErr w:type="spellEnd"/>
+      <w:r>
+        <w:t xml:space="preserve"> code you might need </w:t>
+      </w:r>
+      <w:proofErr w:type="spellStart"/>
+      <w:r>
+        <w:t>ot</w:t>
+      </w:r>
+      <w:proofErr w:type="spellEnd"/>
+      <w:r>
+        <w:t xml:space="preserve"> replace </w:t>
       </w:r>
     </w:p>
     <w:p>
@@ -3534,45 +4311,78 @@
           <w:i/>
           <w:iCs/>
         </w:rPr>
-        <w:t>stroke-linecap</w:t>
-      </w:r>
+        <w:t>stroke-</w:t>
+      </w:r>
+      <w:proofErr w:type="spellStart"/>
       <w:r>
         <w:rPr>
           <w:i/>
           <w:iCs/>
         </w:rPr>
-        <w:t xml:space="preserve"> </w:t>
-      </w:r>
-      <w:r>
-        <w:t>by strokeLineCap</w:t>
-      </w:r>
-    </w:p>
-    <w:p>
+        <w:t>linecap</w:t>
+      </w:r>
+      <w:proofErr w:type="spellEnd"/>
       <w:r>
         <w:rPr>
           <w:i/>
           <w:iCs/>
         </w:rPr>
-        <w:t>stroke-linejoin</w:t>
-      </w:r>
+        <w:t xml:space="preserve"> </w:t>
+      </w:r>
+      <w:r>
+        <w:t xml:space="preserve">by </w:t>
+      </w:r>
+      <w:proofErr w:type="spellStart"/>
+      <w:r>
+        <w:t>strokeLineCap</w:t>
+      </w:r>
+      <w:proofErr w:type="spellEnd"/>
+    </w:p>
+    <w:p>
       <w:r>
         <w:rPr>
           <w:i/>
           <w:iCs/>
         </w:rPr>
+        <w:t>stroke-</w:t>
+      </w:r>
+      <w:proofErr w:type="spellStart"/>
+      <w:r>
+        <w:rPr>
+          <w:i/>
+          <w:iCs/>
+        </w:rPr>
+        <w:t>linejoin</w:t>
+      </w:r>
+      <w:proofErr w:type="spellEnd"/>
+      <w:r>
+        <w:rPr>
+          <w:i/>
+          <w:iCs/>
+        </w:rPr>
         <w:t xml:space="preserve"> </w:t>
       </w:r>
       <w:r>
-        <w:t>by strokeLineJoin</w:t>
-      </w:r>
+        <w:t xml:space="preserve">by </w:t>
+      </w:r>
+      <w:proofErr w:type="spellStart"/>
+      <w:r>
+        <w:t>strokeLineJoin</w:t>
+      </w:r>
+      <w:proofErr w:type="spellEnd"/>
     </w:p>
     <w:p>
       <w:r>
         <w:t>stroke-width</w:t>
       </w:r>
       <w:r>
-        <w:t xml:space="preserve"> by StrokeWidth</w:t>
-      </w:r>
+        <w:t xml:space="preserve"> by </w:t>
+      </w:r>
+      <w:proofErr w:type="spellStart"/>
+      <w:r>
+        <w:t>StrokeWidth</w:t>
+      </w:r>
+      <w:proofErr w:type="spellEnd"/>
     </w:p>
     <w:p>
       <w:r>
@@ -3593,9 +4403,11 @@
       <w:r>
         <w:t xml:space="preserve"> but not now but if you still want to use them then you need to add a Boolean attribute that is </w:t>
       </w:r>
+      <w:proofErr w:type="spellStart"/>
       <w:r>
         <w:t>legacyBehaviour</w:t>
       </w:r>
+      <w:proofErr w:type="spellEnd"/>
     </w:p>
     <w:p>
       <w:pPr>
@@ -3616,7 +4428,23 @@
           <w:b/>
           <w:bCs/>
         </w:rPr>
-        <w:t>Image or maybe in Nextjs general</w:t>
+        <w:t xml:space="preserve">Image or maybe in </w:t>
+      </w:r>
+      <w:proofErr w:type="spellStart"/>
+      <w:r>
+        <w:rPr>
+          <w:b/>
+          <w:bCs/>
+        </w:rPr>
+        <w:t>Nextjs</w:t>
+      </w:r>
+      <w:proofErr w:type="spellEnd"/>
+      <w:r>
+        <w:rPr>
+          <w:b/>
+          <w:bCs/>
+        </w:rPr>
+        <w:t xml:space="preserve"> general</w:t>
       </w:r>
     </w:p>
     <w:p>
@@ -3641,7 +4469,15 @@
     </w:p>
     <w:p>
       <w:r>
-        <w:t>&lt;Image src="home.jpg" /&gt;</w:t>
+        <w:t xml:space="preserve">&lt;Image </w:t>
+      </w:r>
+      <w:proofErr w:type="spellStart"/>
+      <w:r>
+        <w:t>src</w:t>
+      </w:r>
+      <w:proofErr w:type="spellEnd"/>
+      <w:r>
+        <w:t>="home.jpg" /&gt;</w:t>
       </w:r>
     </w:p>
     <w:p>
@@ -3666,7 +4502,15 @@
     </w:p>
     <w:p>
       <w:r>
-        <w:t>&lt;Image src="/home.jpg" /&gt;</w:t>
+        <w:t xml:space="preserve">&lt;Image </w:t>
+      </w:r>
+      <w:proofErr w:type="spellStart"/>
+      <w:r>
+        <w:t>src</w:t>
+      </w:r>
+      <w:proofErr w:type="spellEnd"/>
+      <w:r>
+        <w:t>="/home.jpg" /&gt;</w:t>
       </w:r>
     </w:p>
     <w:p>
@@ -3750,8 +4594,17 @@
     <w:p>
       <w:r>
         <w:lastRenderedPageBreak/>
-        <w:t xml:space="preserve">We can add media quary in Tailwind by </w:t>
-      </w:r>
+        <w:t xml:space="preserve">We can add media </w:t>
+      </w:r>
+      <w:proofErr w:type="spellStart"/>
+      <w:r>
+        <w:t>quary</w:t>
+      </w:r>
+      <w:proofErr w:type="spellEnd"/>
+      <w:r>
+        <w:t xml:space="preserve"> in Tailwind by </w:t>
+      </w:r>
+      <w:proofErr w:type="spellStart"/>
       <w:r>
         <w:rPr>
           <w:b/>
@@ -3764,7 +4617,15 @@
           <w:b/>
           <w:bCs/>
         </w:rPr>
-        <w:t>property name</w:t>
+        <w:t>property</w:t>
+      </w:r>
+      <w:proofErr w:type="spellEnd"/>
+      <w:r>
+        <w:rPr>
+          <w:b/>
+          <w:bCs/>
+        </w:rPr>
+        <w:t xml:space="preserve"> name</w:t>
       </w:r>
       <w:r>
         <w:rPr>
@@ -3891,7 +4752,15 @@
     </w:p>
     <w:p>
       <w:r>
-        <w:t>import { AiOutlineShoppingCart } from "react-icons/ai";</w:t>
+        <w:t xml:space="preserve">import { </w:t>
+      </w:r>
+      <w:proofErr w:type="spellStart"/>
+      <w:r>
+        <w:t>AiOutlineShoppingCart</w:t>
+      </w:r>
+      <w:proofErr w:type="spellEnd"/>
+      <w:r>
+        <w:t xml:space="preserve"> } from "react-icons/ai";</w:t>
       </w:r>
     </w:p>
     <w:p>
@@ -4122,7 +4991,15 @@
     </w:p>
     <w:p>
       <w:r>
-        <w:t>By overflow-x:hidden you c</w:t>
+        <w:t xml:space="preserve">By </w:t>
+      </w:r>
+      <w:proofErr w:type="spellStart"/>
+      <w:r>
+        <w:t>overflow-x:hidden</w:t>
+      </w:r>
+      <w:proofErr w:type="spellEnd"/>
+      <w:r>
+        <w:t xml:space="preserve"> you c</w:t>
       </w:r>
       <w:r>
         <w:t xml:space="preserve">an make sure there is no horizontal </w:t>
@@ -4148,16 +5025,40 @@
         <w:t>s</w:t>
       </w:r>
       <w:r>
-        <w:t>ked is out pincode servicable o</w:t>
+        <w:t xml:space="preserve">ked is out </w:t>
+      </w:r>
+      <w:proofErr w:type="spellStart"/>
+      <w:r>
+        <w:t>pincode</w:t>
+      </w:r>
+      <w:proofErr w:type="spellEnd"/>
+      <w:r>
+        <w:t xml:space="preserve"> </w:t>
+      </w:r>
+      <w:proofErr w:type="spellStart"/>
+      <w:r>
+        <w:t>servicable</w:t>
+      </w:r>
+      <w:proofErr w:type="spellEnd"/>
+      <w:r>
+        <w:t xml:space="preserve"> o</w:t>
       </w:r>
       <w:r>
         <w:t>r</w:t>
       </w:r>
       <w:r>
-        <w:t xml:space="preserve"> not</w:t>
-      </w:r>
-      <w:r>
-        <w:t>ig no then you cannot receiver the order.</w:t>
+        <w:t xml:space="preserve"> </w:t>
+      </w:r>
+      <w:proofErr w:type="spellStart"/>
+      <w:r>
+        <w:t>not</w:t>
+      </w:r>
+      <w:r>
+        <w:t>ig</w:t>
+      </w:r>
+      <w:proofErr w:type="spellEnd"/>
+      <w:r>
+        <w:t xml:space="preserve"> no then you cannot receiver the order.</w:t>
       </w:r>
     </w:p>
     <w:p>
@@ -4168,13 +5069,29 @@
         <w:t>e</w:t>
       </w:r>
       <w:r>
-        <w:t xml:space="preserve"> a mock api that wil</w:t>
+        <w:t xml:space="preserve"> a mock </w:t>
+      </w:r>
+      <w:proofErr w:type="spellStart"/>
+      <w:r>
+        <w:t>api</w:t>
+      </w:r>
+      <w:proofErr w:type="spellEnd"/>
+      <w:r>
+        <w:t xml:space="preserve"> that wil</w:t>
       </w:r>
       <w:r>
         <w:t>l</w:t>
       </w:r>
       <w:r>
-        <w:t xml:space="preserve"> show all the apis that are serviceable </w:t>
+        <w:t xml:space="preserve"> show all the </w:t>
+      </w:r>
+      <w:proofErr w:type="spellStart"/>
+      <w:r>
+        <w:t>apis</w:t>
+      </w:r>
+      <w:proofErr w:type="spellEnd"/>
+      <w:r>
+        <w:t xml:space="preserve"> that are serviceable </w:t>
       </w:r>
     </w:p>
     <w:p>
@@ -4514,11 +5431,24 @@
         <w:t xml:space="preserve">To </w:t>
       </w:r>
       <w:r>
-        <w:t xml:space="preserve">make codewear we are going to use Mongoose </w:t>
-      </w:r>
-      <w:r>
-        <w:t>is a connector to a Mongodb</w:t>
-      </w:r>
+        <w:t xml:space="preserve">make </w:t>
+      </w:r>
+      <w:proofErr w:type="spellStart"/>
+      <w:r>
+        <w:t>codewear</w:t>
+      </w:r>
+      <w:proofErr w:type="spellEnd"/>
+      <w:r>
+        <w:t xml:space="preserve"> we are going to use Mongoose </w:t>
+      </w:r>
+      <w:r>
+        <w:t xml:space="preserve">is a connector to a </w:t>
+      </w:r>
+      <w:proofErr w:type="spellStart"/>
+      <w:r>
+        <w:t>Mongodb</w:t>
+      </w:r>
+      <w:proofErr w:type="spellEnd"/>
       <w:r>
         <w:t xml:space="preserve"> </w:t>
       </w:r>
@@ -4526,7 +5456,15 @@
         <w:t>(who knows )</w:t>
       </w:r>
       <w:r>
-        <w:t xml:space="preserve"> it will help js to connect to mongodb </w:t>
+        <w:t xml:space="preserve"> it will help js to connect to </w:t>
+      </w:r>
+      <w:proofErr w:type="spellStart"/>
+      <w:r>
+        <w:t>mongodb</w:t>
+      </w:r>
+      <w:proofErr w:type="spellEnd"/>
+      <w:r>
+        <w:t xml:space="preserve"> </w:t>
       </w:r>
       <w:r>
         <w:t xml:space="preserve">and we can use its </w:t>
@@ -4535,13 +5473,29 @@
         <w:t xml:space="preserve">built in functionality </w:t>
       </w:r>
       <w:r>
-        <w:t xml:space="preserve">you don’t have to read and write and update to the mongodb (like </w:t>
+        <w:t xml:space="preserve">you don’t have to read and write and update to the </w:t>
+      </w:r>
+      <w:proofErr w:type="spellStart"/>
+      <w:r>
+        <w:t>mongodb</w:t>
+      </w:r>
+      <w:proofErr w:type="spellEnd"/>
+      <w:r>
+        <w:t xml:space="preserve"> (like </w:t>
       </w:r>
       <w:r>
         <w:t xml:space="preserve">maybe </w:t>
       </w:r>
       <w:r>
-        <w:t>the complex we do for it in mongodb(who knows))</w:t>
+        <w:t xml:space="preserve">the complex we do for it in </w:t>
+      </w:r>
+      <w:proofErr w:type="spellStart"/>
+      <w:r>
+        <w:t>mongodb</w:t>
+      </w:r>
+      <w:proofErr w:type="spellEnd"/>
+      <w:r>
+        <w:t>(who knows))</w:t>
       </w:r>
       <w:r>
         <w:t xml:space="preserve">. </w:t>
@@ -4555,9 +5509,19 @@
       <w:r>
         <w:t xml:space="preserve">ing fields like </w:t>
       </w:r>
-      <w:r>
-        <w:t>createdAT and updatedAt</w:t>
-      </w:r>
+      <w:proofErr w:type="spellStart"/>
+      <w:r>
+        <w:t>createdAT</w:t>
+      </w:r>
+      <w:proofErr w:type="spellEnd"/>
+      <w:r>
+        <w:t xml:space="preserve"> and </w:t>
+      </w:r>
+      <w:proofErr w:type="spellStart"/>
+      <w:r>
+        <w:t>updatedAt</w:t>
+      </w:r>
+      <w:proofErr w:type="spellEnd"/>
     </w:p>
     <w:p>
       <w:r>
@@ -4597,15 +5561,31 @@
         <w:t>r</w:t>
       </w:r>
       <w:r>
-        <w:t>ough which we connect to mongo</w:t>
-      </w:r>
-      <w:r>
-        <w:t xml:space="preserve">db </w:t>
-      </w:r>
-    </w:p>
-    <w:p>
-      <w:r>
-        <w:t xml:space="preserve">I think we are going to directly contact to mongos by frontEnd </w:t>
+        <w:t xml:space="preserve">ough which we connect to </w:t>
+      </w:r>
+      <w:proofErr w:type="spellStart"/>
+      <w:r>
+        <w:t>mongo</w:t>
+      </w:r>
+      <w:r>
+        <w:t>db</w:t>
+      </w:r>
+      <w:proofErr w:type="spellEnd"/>
+      <w:r>
+        <w:t xml:space="preserve"> </w:t>
+      </w:r>
+    </w:p>
+    <w:p>
+      <w:r>
+        <w:t xml:space="preserve">I think we are going to directly contact to mongos by </w:t>
+      </w:r>
+      <w:proofErr w:type="spellStart"/>
+      <w:r>
+        <w:t>frontEnd</w:t>
+      </w:r>
+      <w:proofErr w:type="spellEnd"/>
+      <w:r>
+        <w:t xml:space="preserve"> </w:t>
       </w:r>
     </w:p>
     <w:p>
@@ -4613,7 +5593,15 @@
         <w:t xml:space="preserve">Ow we will install Mongoose </w:t>
       </w:r>
       <w:r>
-        <w:t xml:space="preserve">by npm </w:t>
+        <w:t xml:space="preserve">by </w:t>
+      </w:r>
+      <w:proofErr w:type="spellStart"/>
+      <w:r>
+        <w:t>npm</w:t>
+      </w:r>
+      <w:proofErr w:type="spellEnd"/>
+      <w:r>
+        <w:t xml:space="preserve"> </w:t>
       </w:r>
       <w:r>
         <w:t>and we will make some modals</w:t>
@@ -4628,7 +5616,15 @@
         <w:t>through which you will store the data (who knows)</w:t>
       </w:r>
       <w:r>
-        <w:t xml:space="preserve"> but before that we need to install mongodb </w:t>
+        <w:t xml:space="preserve"> but before that we need to install </w:t>
+      </w:r>
+      <w:proofErr w:type="spellStart"/>
+      <w:r>
+        <w:t>mongodb</w:t>
+      </w:r>
+      <w:proofErr w:type="spellEnd"/>
+      <w:r>
+        <w:t xml:space="preserve"> </w:t>
       </w:r>
     </w:p>
     <w:p>
@@ -4645,7 +5641,11 @@
         <w:t>then your</w:t>
       </w:r>
       <w:r>
-        <w:t xml:space="preserve"> mon</w:t>
+        <w:t xml:space="preserve"> </w:t>
+      </w:r>
+      <w:proofErr w:type="spellStart"/>
+      <w:r>
+        <w:t>mon</w:t>
       </w:r>
       <w:r>
         <w:t>g</w:t>
@@ -4654,29 +5654,62 @@
         <w:t>d</w:t>
       </w:r>
       <w:r>
-        <w:t>b compass will be installed</w:t>
-      </w:r>
-      <w:r>
-        <w:t xml:space="preserve"> which  is a product of mongodb </w:t>
-      </w:r>
-    </w:p>
-    <w:p>
-      <w:r>
-        <w:t xml:space="preserve">Now in mongodb compass you click on connect to the </w:t>
+        <w:t>b</w:t>
+      </w:r>
+      <w:proofErr w:type="spellEnd"/>
+      <w:r>
+        <w:t xml:space="preserve"> compass will be installed</w:t>
+      </w:r>
+      <w:r>
+        <w:t xml:space="preserve"> which  is a product of </w:t>
+      </w:r>
+      <w:proofErr w:type="spellStart"/>
+      <w:r>
+        <w:t>mongodb</w:t>
+      </w:r>
+      <w:proofErr w:type="spellEnd"/>
+      <w:r>
+        <w:t xml:space="preserve"> </w:t>
+      </w:r>
+    </w:p>
+    <w:p>
+      <w:r>
+        <w:t xml:space="preserve">Now in </w:t>
+      </w:r>
+      <w:proofErr w:type="spellStart"/>
+      <w:r>
+        <w:t>mongodb</w:t>
+      </w:r>
+      <w:proofErr w:type="spellEnd"/>
+      <w:r>
+        <w:t xml:space="preserve"> compass you click on connect to the </w:t>
       </w:r>
       <w:r>
         <w:t xml:space="preserve">localhost </w:t>
       </w:r>
-      <w:r>
-        <w:t xml:space="preserve">ehere the server is running </w:t>
-      </w:r>
-    </w:p>
-    <w:p>
-      <w:r>
-        <w:t>We will make all the data base in mongo</w:t>
-      </w:r>
-      <w:r>
-        <w:t>db compass.</w:t>
+      <w:proofErr w:type="spellStart"/>
+      <w:r>
+        <w:t>ehere</w:t>
+      </w:r>
+      <w:proofErr w:type="spellEnd"/>
+      <w:r>
+        <w:t xml:space="preserve"> the server is running </w:t>
+      </w:r>
+    </w:p>
+    <w:p>
+      <w:r>
+        <w:t xml:space="preserve">We will make all the data base in </w:t>
+      </w:r>
+      <w:proofErr w:type="spellStart"/>
+      <w:r>
+        <w:t>mongo</w:t>
+      </w:r>
+      <w:r>
+        <w:t>db</w:t>
+      </w:r>
+      <w:proofErr w:type="spellEnd"/>
+      <w:r>
+        <w:t xml:space="preserve"> compass.</w:t>
       </w:r>
     </w:p>
     <w:p>
@@ -4804,10 +5837,18 @@
     </w:p>
     <w:p>
       <w:r>
-        <w:t>And after this get connection to the mongo</w:t>
-      </w:r>
-      <w:r>
-        <w:t xml:space="preserve">db </w:t>
+        <w:t xml:space="preserve">And after this get connection to the </w:t>
+      </w:r>
+      <w:proofErr w:type="spellStart"/>
+      <w:r>
+        <w:t>mongo</w:t>
+      </w:r>
+      <w:r>
+        <w:t>db</w:t>
+      </w:r>
+      <w:proofErr w:type="spellEnd"/>
+      <w:r>
+        <w:t xml:space="preserve"> </w:t>
       </w:r>
       <w:r>
         <w:t>and your wok will be sone now you can make schema</w:t>
@@ -4977,14 +6018,29 @@
       <w:r>
         <w:t xml:space="preserve">APIs that is </w:t>
       </w:r>
-      <w:r>
-        <w:t>getProduct, updateProduct</w:t>
-      </w:r>
+      <w:proofErr w:type="spellStart"/>
+      <w:r>
+        <w:t>getProduct</w:t>
+      </w:r>
+      <w:proofErr w:type="spellEnd"/>
+      <w:r>
+        <w:t xml:space="preserve">, </w:t>
+      </w:r>
+      <w:proofErr w:type="spellStart"/>
+      <w:r>
+        <w:t>updateProduct</w:t>
+      </w:r>
+      <w:proofErr w:type="spellEnd"/>
       <w:r>
         <w:t xml:space="preserve"> and </w:t>
       </w:r>
-      <w:r>
-        <w:t xml:space="preserve">addProducts </w:t>
+      <w:proofErr w:type="spellStart"/>
+      <w:r>
+        <w:t>addProducts</w:t>
+      </w:r>
+      <w:proofErr w:type="spellEnd"/>
+      <w:r>
+        <w:t xml:space="preserve"> </w:t>
       </w:r>
       <w:r>
         <w:t xml:space="preserve">now they do as the name suggests </w:t>
@@ -5010,7 +6066,15 @@
     </w:p>
     <w:p>
       <w:r>
-        <w:t xml:space="preserve">Now we are going to start middleware development which will facilitate the connection to mongodb </w:t>
+        <w:t xml:space="preserve">Now we are going to start middleware development which will facilitate the connection to </w:t>
+      </w:r>
+      <w:proofErr w:type="spellStart"/>
+      <w:r>
+        <w:t>mongodb</w:t>
+      </w:r>
+      <w:proofErr w:type="spellEnd"/>
+      <w:r>
+        <w:t xml:space="preserve"> </w:t>
       </w:r>
       <w:r>
         <w:t>now it seems confusing at first</w:t>
@@ -5087,8 +6151,13 @@
       <w:r>
         <w:t>.</w:t>
       </w:r>
-      <w:r>
-        <w:t xml:space="preserve">env.local </w:t>
+      <w:proofErr w:type="spellStart"/>
+      <w:r>
+        <w:t>env.local</w:t>
+      </w:r>
+      <w:proofErr w:type="spellEnd"/>
+      <w:r>
+        <w:t xml:space="preserve"> </w:t>
       </w:r>
       <w:r>
         <w:t xml:space="preserve">file </w:t>
@@ -5100,8 +6169,13 @@
         <w:t xml:space="preserve"> and you can get it in our maybe server </w:t>
       </w:r>
       <w:r>
-        <w:t>side by using process.env</w:t>
-      </w:r>
+        <w:t xml:space="preserve">side by using </w:t>
+      </w:r>
+      <w:proofErr w:type="spellStart"/>
+      <w:r>
+        <w:t>process.env</w:t>
+      </w:r>
+      <w:proofErr w:type="spellEnd"/>
     </w:p>
     <w:p>
       <w:pPr>
@@ -5112,10 +6186,34 @@
         </w:numPr>
       </w:pPr>
       <w:r>
-        <w:t xml:space="preserve">We need a connection string to connect to mongodb </w:t>
-      </w:r>
-      <w:r>
-        <w:t xml:space="preserve"> and we can get for mongodb compass by opening mongodb compass and then click on three dot </w:t>
+        <w:t xml:space="preserve">We need a connection string to connect to </w:t>
+      </w:r>
+      <w:proofErr w:type="spellStart"/>
+      <w:r>
+        <w:t>mongodb</w:t>
+      </w:r>
+      <w:proofErr w:type="spellEnd"/>
+      <w:r>
+        <w:t xml:space="preserve"> </w:t>
+      </w:r>
+      <w:r>
+        <w:t xml:space="preserve"> and we can get for </w:t>
+      </w:r>
+      <w:proofErr w:type="spellStart"/>
+      <w:r>
+        <w:t>mongodb</w:t>
+      </w:r>
+      <w:proofErr w:type="spellEnd"/>
+      <w:r>
+        <w:t xml:space="preserve"> compass by opening </w:t>
+      </w:r>
+      <w:proofErr w:type="spellStart"/>
+      <w:r>
+        <w:t>mongodb</w:t>
+      </w:r>
+      <w:proofErr w:type="spellEnd"/>
+      <w:r>
+        <w:t xml:space="preserve"> compass and then click on three dot </w:t>
       </w:r>
       <w:r>
         <w:t>as</w:t>
@@ -5124,7 +6222,15 @@
         <w:t xml:space="preserve"> marked below</w:t>
       </w:r>
       <w:r>
-        <w:t>(not visiblie because of not hover)</w:t>
+        <w:t xml:space="preserve">(not </w:t>
+      </w:r>
+      <w:proofErr w:type="spellStart"/>
+      <w:r>
+        <w:t>visiblie</w:t>
+      </w:r>
+      <w:proofErr w:type="spellEnd"/>
+      <w:r>
+        <w:t xml:space="preserve"> because of not hover)</w:t>
       </w:r>
     </w:p>
     <w:p>
@@ -5186,7 +6292,15 @@
         <w:t xml:space="preserve"> to get </w:t>
       </w:r>
       <w:r>
-        <w:t>the connection string and we will store it inside .env.local file.</w:t>
+        <w:t>the connection string and we will store it inside .</w:t>
+      </w:r>
+      <w:proofErr w:type="spellStart"/>
+      <w:r>
+        <w:t>env.local</w:t>
+      </w:r>
+      <w:proofErr w:type="spellEnd"/>
+      <w:r>
+        <w:t xml:space="preserve"> file.</w:t>
       </w:r>
     </w:p>
     <w:p>
@@ -5217,7 +6331,15 @@
         <w:t>n</w:t>
       </w:r>
       <w:r>
-        <w:t xml:space="preserve"> modern Nextjs middleware cannot be used for database connectivity but you can use it </w:t>
+        <w:t xml:space="preserve"> modern </w:t>
+      </w:r>
+      <w:proofErr w:type="spellStart"/>
+      <w:r>
+        <w:t>Nextjs</w:t>
+      </w:r>
+      <w:proofErr w:type="spellEnd"/>
+      <w:r>
+        <w:t xml:space="preserve"> middleware cannot be used for database connectivity but you can use it </w:t>
       </w:r>
       <w:r>
         <w:t>for auth</w:t>
@@ -5258,7 +6380,15 @@
         <w:t xml:space="preserve"> add Product </w:t>
       </w:r>
       <w:r>
-        <w:t>and GetProduct API</w:t>
+        <w:t xml:space="preserve">and </w:t>
+      </w:r>
+      <w:proofErr w:type="spellStart"/>
+      <w:r>
+        <w:t>GetProduct</w:t>
+      </w:r>
+      <w:proofErr w:type="spellEnd"/>
+      <w:r>
+        <w:t xml:space="preserve"> API</w:t>
       </w:r>
       <w:r>
         <w:t>.</w:t>
@@ -5288,13 +6418,29 @@
         <w:t xml:space="preserve">that </w:t>
       </w:r>
       <w:r>
-        <w:t>when there is not data in mon</w:t>
-      </w:r>
-      <w:r>
-        <w:t xml:space="preserve">godb </w:t>
-      </w:r>
-      <w:r>
-        <w:t xml:space="preserve"> and we use find ot any operation on modal </w:t>
+        <w:t xml:space="preserve">when there is not data in </w:t>
+      </w:r>
+      <w:proofErr w:type="spellStart"/>
+      <w:r>
+        <w:t>mon</w:t>
+      </w:r>
+      <w:r>
+        <w:t>godb</w:t>
+      </w:r>
+      <w:proofErr w:type="spellEnd"/>
+      <w:r>
+        <w:t xml:space="preserve"> </w:t>
+      </w:r>
+      <w:r>
+        <w:t xml:space="preserve"> and we use find </w:t>
+      </w:r>
+      <w:proofErr w:type="spellStart"/>
+      <w:r>
+        <w:t>ot</w:t>
+      </w:r>
+      <w:proofErr w:type="spellEnd"/>
+      <w:r>
+        <w:t xml:space="preserve"> any operation on modal </w:t>
       </w:r>
       <w:r>
         <w:t xml:space="preserve">or maybe importing modal then it try to form </w:t>
@@ -5309,13 +6455,29 @@
         <w:t>.</w:t>
       </w:r>
       <w:r>
-        <w:t xml:space="preserve"> to fix that in model file write mongoose.models = {}</w:t>
+        <w:t xml:space="preserve"> to fix that in model file write </w:t>
+      </w:r>
+      <w:proofErr w:type="spellStart"/>
+      <w:r>
+        <w:t>mongoose.models</w:t>
+      </w:r>
+      <w:proofErr w:type="spellEnd"/>
+      <w:r>
+        <w:t xml:space="preserve"> = {}</w:t>
       </w:r>
       <w:r>
         <w:t xml:space="preserve"> </w:t>
       </w:r>
       <w:r>
-        <w:t>in each model do make sure you doi this.</w:t>
+        <w:t xml:space="preserve">in each model do make sure you </w:t>
+      </w:r>
+      <w:proofErr w:type="spellStart"/>
+      <w:r>
+        <w:t>doi</w:t>
+      </w:r>
+      <w:proofErr w:type="spellEnd"/>
+      <w:r>
+        <w:t xml:space="preserve"> this.</w:t>
       </w:r>
     </w:p>
     <w:p>
@@ -5343,7 +6505,23 @@
     </w:p>
     <w:p>
       <w:r>
-        <w:t>We will make now updateProfuct api.</w:t>
+        <w:t xml:space="preserve">We will make now </w:t>
+      </w:r>
+      <w:proofErr w:type="spellStart"/>
+      <w:r>
+        <w:t>updateProfuct</w:t>
+      </w:r>
+      <w:proofErr w:type="spellEnd"/>
+      <w:r>
+        <w:t xml:space="preserve"> </w:t>
+      </w:r>
+      <w:proofErr w:type="spellStart"/>
+      <w:r>
+        <w:t>api</w:t>
+      </w:r>
+      <w:proofErr w:type="spellEnd"/>
+      <w:r>
+        <w:t>.</w:t>
       </w:r>
     </w:p>
     <w:p>
@@ -5362,7 +6540,39 @@
         <w:t xml:space="preserve">add handler to the  html but now the game is changed </w:t>
       </w:r>
       <w:r>
-        <w:t>sever side component do all the work of mapping and generating html but in older version when data was end to the browser we need to make oit pardable we did it by JSON.parse(JSON.stringify(</w:t>
+        <w:t xml:space="preserve">sever side component do all the work of mapping and generating html but in older version when data was end to the browser we need to make </w:t>
+      </w:r>
+      <w:proofErr w:type="spellStart"/>
+      <w:r>
+        <w:t>oit</w:t>
+      </w:r>
+      <w:proofErr w:type="spellEnd"/>
+      <w:r>
+        <w:t xml:space="preserve"> </w:t>
+      </w:r>
+      <w:proofErr w:type="spellStart"/>
+      <w:r>
+        <w:t>pardable</w:t>
+      </w:r>
+      <w:proofErr w:type="spellEnd"/>
+      <w:r>
+        <w:t xml:space="preserve"> we did it by </w:t>
+      </w:r>
+      <w:proofErr w:type="spellStart"/>
+      <w:r>
+        <w:t>JSON.parse</w:t>
+      </w:r>
+      <w:proofErr w:type="spellEnd"/>
+      <w:r>
+        <w:t>(</w:t>
+      </w:r>
+      <w:proofErr w:type="spellStart"/>
+      <w:r>
+        <w:t>JSON.stringify</w:t>
+      </w:r>
+      <w:proofErr w:type="spellEnd"/>
+      <w:r>
+        <w:t>(</w:t>
       </w:r>
       <w:r>
         <w:t>&lt;object&gt;</w:t>
@@ -5381,7 +6591,15 @@
     </w:p>
     <w:p>
       <w:r>
-        <w:t>what is passHref in simple words</w:t>
+        <w:t xml:space="preserve">what is </w:t>
+      </w:r>
+      <w:proofErr w:type="spellStart"/>
+      <w:r>
+        <w:t>passHref</w:t>
+      </w:r>
+      <w:proofErr w:type="spellEnd"/>
+      <w:r>
+        <w:t xml:space="preserve"> in simple words</w:t>
       </w:r>
     </w:p>
     <w:p>
@@ -5404,16 +6622,57 @@
           <w:b/>
           <w:bCs/>
         </w:rPr>
-        <w:t xml:space="preserve"> passHref (simple explanation)</w:t>
-      </w:r>
-    </w:p>
-    <w:p>
-      <w:r>
-        <w:rPr>
-          <w:b/>
-          <w:bCs/>
-        </w:rPr>
-        <w:t>passHref tells &lt;Link&gt; to pass the href to its child element (like &lt;a&gt;)</w:t>
+        <w:t xml:space="preserve"> </w:t>
+      </w:r>
+      <w:proofErr w:type="spellStart"/>
+      <w:r>
+        <w:rPr>
+          <w:b/>
+          <w:bCs/>
+        </w:rPr>
+        <w:t>passHref</w:t>
+      </w:r>
+      <w:proofErr w:type="spellEnd"/>
+      <w:r>
+        <w:rPr>
+          <w:b/>
+          <w:bCs/>
+        </w:rPr>
+        <w:t xml:space="preserve"> (simple explanation)</w:t>
+      </w:r>
+    </w:p>
+    <w:p>
+      <w:proofErr w:type="spellStart"/>
+      <w:r>
+        <w:rPr>
+          <w:b/>
+          <w:bCs/>
+        </w:rPr>
+        <w:t>passHref</w:t>
+      </w:r>
+      <w:proofErr w:type="spellEnd"/>
+      <w:r>
+        <w:rPr>
+          <w:b/>
+          <w:bCs/>
+        </w:rPr>
+        <w:t xml:space="preserve"> tells &lt;Link&gt; to pass the </w:t>
+      </w:r>
+      <w:proofErr w:type="spellStart"/>
+      <w:r>
+        <w:rPr>
+          <w:b/>
+          <w:bCs/>
+        </w:rPr>
+        <w:t>href</w:t>
+      </w:r>
+      <w:proofErr w:type="spellEnd"/>
+      <w:r>
+        <w:rPr>
+          <w:b/>
+          <w:bCs/>
+        </w:rPr>
+        <w:t xml:space="preserve"> to its child element (like &lt;a&gt;)</w:t>
       </w:r>
     </w:p>
     <w:p>
@@ -5463,7 +6722,15 @@
     </w:p>
     <w:p>
       <w:r>
-        <w:t>&lt;Link href="/login"&gt;</w:t>
+        <w:t xml:space="preserve">&lt;Link </w:t>
+      </w:r>
+      <w:proofErr w:type="spellStart"/>
+      <w:r>
+        <w:t>href</w:t>
+      </w:r>
+      <w:proofErr w:type="spellEnd"/>
+      <w:r>
+        <w:t>="/login"&gt;</w:t>
       </w:r>
       <w:r>
         <w:br/>
@@ -5489,8 +6756,17 @@
           <w:b/>
           <w:bCs/>
         </w:rPr>
-        <w:t>not automatically get href</w:t>
-      </w:r>
+        <w:t xml:space="preserve">not automatically get </w:t>
+      </w:r>
+      <w:proofErr w:type="spellStart"/>
+      <w:r>
+        <w:rPr>
+          <w:b/>
+          <w:bCs/>
+        </w:rPr>
+        <w:t>href</w:t>
+      </w:r>
+      <w:proofErr w:type="spellEnd"/>
     </w:p>
     <w:p>
       <w:r>
@@ -5499,7 +6775,23 @@
     </w:p>
     <w:p>
       <w:r>
-        <w:t>&lt;Link href="/login" passHref&gt;</w:t>
+        <w:t xml:space="preserve">&lt;Link </w:t>
+      </w:r>
+      <w:proofErr w:type="spellStart"/>
+      <w:r>
+        <w:t>href</w:t>
+      </w:r>
+      <w:proofErr w:type="spellEnd"/>
+      <w:r>
+        <w:t xml:space="preserve">="/login" </w:t>
+      </w:r>
+      <w:proofErr w:type="spellStart"/>
+      <w:r>
+        <w:t>passHref</w:t>
+      </w:r>
+      <w:proofErr w:type="spellEnd"/>
+      <w:r>
+        <w:t>&gt;</w:t>
       </w:r>
       <w:r>
         <w:br/>
@@ -5523,7 +6815,15 @@
     </w:p>
     <w:p>
       <w:r>
-        <w:t>&lt;a href="/login"&gt;Login&lt;/a&gt;</w:t>
+        <w:t xml:space="preserve">&lt;a </w:t>
+      </w:r>
+      <w:proofErr w:type="spellStart"/>
+      <w:r>
+        <w:t>href</w:t>
+      </w:r>
+      <w:proofErr w:type="spellEnd"/>
+      <w:r>
+        <w:t>="/login"&gt;Login&lt;/a&gt;</w:t>
       </w:r>
     </w:p>
     <w:p>
@@ -5585,8 +6885,13 @@
           <w:numId w:val="3"/>
         </w:numPr>
       </w:pPr>
-      <w:r>
-        <w:t xml:space="preserve">passHref = “give the link to the receiver” </w:t>
+      <w:proofErr w:type="spellStart"/>
+      <w:r>
+        <w:t>passHref</w:t>
+      </w:r>
+      <w:proofErr w:type="spellEnd"/>
+      <w:r>
+        <w:t xml:space="preserve"> = “give the link to the receiver” </w:t>
       </w:r>
     </w:p>
     <w:p>
@@ -5633,7 +6938,15 @@
         <w:t>👉</w:t>
       </w:r>
       <w:r>
-        <w:t xml:space="preserve"> You don’t need passHref anymore</w:t>
+        <w:t xml:space="preserve"> You don’t need </w:t>
+      </w:r>
+      <w:proofErr w:type="spellStart"/>
+      <w:r>
+        <w:t>passHref</w:t>
+      </w:r>
+      <w:proofErr w:type="spellEnd"/>
+      <w:r>
+        <w:t xml:space="preserve"> anymore</w:t>
       </w:r>
       <w:r>
         <w:br/>
@@ -5684,8 +6997,21 @@
           <w:bottom w:val="single" w:sz="12" w:space="1" w:color="auto"/>
         </w:pBdr>
       </w:pPr>
-      <w:r>
-        <w:t>passHref ensures the child element (like &lt;a&gt;) actually receives the link (href).</w:t>
+      <w:proofErr w:type="spellStart"/>
+      <w:r>
+        <w:t>passHref</w:t>
+      </w:r>
+      <w:proofErr w:type="spellEnd"/>
+      <w:r>
+        <w:t xml:space="preserve"> ensures the child element (like &lt;a&gt;) actually receives the link (</w:t>
+      </w:r>
+      <w:proofErr w:type="spellStart"/>
+      <w:r>
+        <w:t>href</w:t>
+      </w:r>
+      <w:proofErr w:type="spellEnd"/>
+      <w:r>
+        <w:t>).</w:t>
       </w:r>
     </w:p>
     <w:p>
@@ -6193,6 +7519,323 @@
       </w:r>
       <w:r>
         <w:t>)</w:t>
+      </w:r>
+    </w:p>
+    <w:p>
+      <w:r>
+        <w:lastRenderedPageBreak/>
+        <w:t xml:space="preserve">We usually add an item to cart and then </w:t>
+      </w:r>
+      <w:r>
+        <w:t xml:space="preserve">we checkout </w:t>
+      </w:r>
+      <w:r>
+        <w:t xml:space="preserve">but sometime we want that </w:t>
+      </w:r>
+      <w:r>
+        <w:t xml:space="preserve">we buy </w:t>
+      </w:r>
+      <w:proofErr w:type="spellStart"/>
+      <w:r>
+        <w:t>onr</w:t>
+      </w:r>
+      <w:proofErr w:type="spellEnd"/>
+      <w:r>
+        <w:t xml:space="preserve"> </w:t>
+      </w:r>
+      <w:proofErr w:type="spellStart"/>
+      <w:r>
+        <w:t>ptofict</w:t>
+      </w:r>
+      <w:proofErr w:type="spellEnd"/>
+      <w:r>
+        <w:t xml:space="preserve"> imme</w:t>
+      </w:r>
+      <w:r>
+        <w:t>d</w:t>
+      </w:r>
+      <w:r>
+        <w:t xml:space="preserve">iately </w:t>
+      </w:r>
+      <w:r>
+        <w:t xml:space="preserve">and for that you are given buy now button </w:t>
+      </w:r>
+      <w:r>
+        <w:t xml:space="preserve">.If you click on buy Now </w:t>
+      </w:r>
+      <w:r>
+        <w:t>then it will b</w:t>
+      </w:r>
+      <w:r>
+        <w:t>e</w:t>
+      </w:r>
+      <w:r>
+        <w:t xml:space="preserve"> in </w:t>
+      </w:r>
+      <w:r>
+        <w:rPr>
+          <w:b/>
+          <w:bCs/>
+          <w:color w:val="EE0000"/>
+        </w:rPr>
+        <w:t>your cart and you will be checkout (who knows</w:t>
+      </w:r>
+      <w:r>
+        <w:rPr>
+          <w:b/>
+          <w:bCs/>
+          <w:color w:val="EE0000"/>
+        </w:rPr>
+        <w:t>(maybe wrong)</w:t>
+      </w:r>
+      <w:r>
+        <w:rPr>
+          <w:b/>
+          <w:bCs/>
+          <w:color w:val="EE0000"/>
+        </w:rPr>
+        <w:t>)</w:t>
+      </w:r>
+      <w:r>
+        <w:t xml:space="preserve"> so that you can enter your details instantly </w:t>
+      </w:r>
+      <w:r>
+        <w:t xml:space="preserve">and checkout </w:t>
+      </w:r>
+      <w:r>
+        <w:t>Now what teacher is saying when someone click on</w:t>
+      </w:r>
+      <w:r>
+        <w:t xml:space="preserve"> </w:t>
+      </w:r>
+      <w:r>
+        <w:t>Buy</w:t>
+      </w:r>
+      <w:r>
+        <w:t xml:space="preserve"> </w:t>
+      </w:r>
+      <w:r>
+        <w:t xml:space="preserve">now then all cart will be cleared and </w:t>
+      </w:r>
+      <w:r>
+        <w:t>the item</w:t>
+      </w:r>
+      <w:r>
+        <w:t>s</w:t>
+      </w:r>
+      <w:r>
+        <w:t xml:space="preserve"> you carted will be removed from cart</w:t>
+      </w:r>
+      <w:r>
+        <w:t xml:space="preserve"> and only then ite</w:t>
+      </w:r>
+      <w:r>
+        <w:t>m</w:t>
+      </w:r>
+      <w:r>
+        <w:t xml:space="preserve"> you want to buy now</w:t>
+      </w:r>
+      <w:r>
+        <w:t xml:space="preserve"> will be shown in the cart and we will be checked out(who knows) </w:t>
+      </w:r>
+    </w:p>
+    <w:p>
+      <w:r>
+        <w:t xml:space="preserve">There is a method to move to a next page in </w:t>
+      </w:r>
+      <w:proofErr w:type="spellStart"/>
+      <w:r>
+        <w:t>nextjs</w:t>
+      </w:r>
+      <w:proofErr w:type="spellEnd"/>
+      <w:r>
+        <w:t xml:space="preserve"> like you did </w:t>
+      </w:r>
+      <w:r>
+        <w:t>in</w:t>
+      </w:r>
+      <w:r>
+        <w:t xml:space="preserve"> </w:t>
+      </w:r>
+      <w:r>
+        <w:t xml:space="preserve">react </w:t>
+      </w:r>
+      <w:r>
+        <w:t xml:space="preserve">by navigate you can do so in </w:t>
+      </w:r>
+      <w:proofErr w:type="spellStart"/>
+      <w:r>
+        <w:t>nextJs</w:t>
+      </w:r>
+      <w:proofErr w:type="spellEnd"/>
+      <w:r>
+        <w:t xml:space="preserve"> by router object that you can get by </w:t>
+      </w:r>
+      <w:proofErr w:type="spellStart"/>
+      <w:r>
+        <w:t>useRouter</w:t>
+      </w:r>
+      <w:proofErr w:type="spellEnd"/>
+      <w:r>
+        <w:t xml:space="preserve"> hooks </w:t>
+      </w:r>
+      <w:r>
+        <w:t xml:space="preserve">which you import from </w:t>
+      </w:r>
+      <w:r>
+        <w:t xml:space="preserve">“next/navigation” </w:t>
+      </w:r>
+      <w:r>
+        <w:t>and you navigate to another page that is by push method of router object</w:t>
+      </w:r>
+      <w:r>
+        <w:t xml:space="preserve"> and in push method we pass the relative path(maybe)</w:t>
+      </w:r>
+    </w:p>
+    <w:p>
+      <w:pPr>
+        <w:jc w:val="center"/>
+      </w:pPr>
+      <w:r>
+        <w:drawing>
+          <wp:inline distT="0" distB="0" distL="0" distR="0" wp14:anchorId="3CA19444" wp14:editId="1DC1B8AA">
+            <wp:extent cx="3591426" cy="181000"/>
+            <wp:effectExtent l="0" t="0" r="9525" b="9525"/>
+            <wp:docPr id="1647800291" name="Picture 1"/>
+            <wp:cNvGraphicFramePr>
+              <a:graphicFrameLocks xmlns:a="http://schemas.openxmlformats.org/drawingml/2006/main" noChangeAspect="1"/>
+            </wp:cNvGraphicFramePr>
+            <a:graphic xmlns:a="http://schemas.openxmlformats.org/drawingml/2006/main">
+              <a:graphicData uri="http://schemas.openxmlformats.org/drawingml/2006/picture">
+                <pic:pic xmlns:pic="http://schemas.openxmlformats.org/drawingml/2006/picture">
+                  <pic:nvPicPr>
+                    <pic:cNvPr id="1647800291" name=""/>
+                    <pic:cNvPicPr/>
+                  </pic:nvPicPr>
+                  <pic:blipFill>
+                    <a:blip r:embed="rId38"/>
+                    <a:stretch>
+                      <a:fillRect/>
+                    </a:stretch>
+                  </pic:blipFill>
+                  <pic:spPr>
+                    <a:xfrm>
+                      <a:off x="0" y="0"/>
+                      <a:ext cx="3591426" cy="181000"/>
+                    </a:xfrm>
+                    <a:prstGeom prst="rect">
+                      <a:avLst/>
+                    </a:prstGeom>
+                  </pic:spPr>
+                </pic:pic>
+              </a:graphicData>
+            </a:graphic>
+          </wp:inline>
+        </w:drawing>
+      </w:r>
+    </w:p>
+    <w:p>
+      <w:pPr>
+        <w:jc w:val="center"/>
+      </w:pPr>
+      <w:r>
+        <w:drawing>
+          <wp:inline distT="0" distB="0" distL="0" distR="0" wp14:anchorId="27CF6D17" wp14:editId="5B98E27F">
+            <wp:extent cx="2257740" cy="209579"/>
+            <wp:effectExtent l="0" t="0" r="9525" b="0"/>
+            <wp:docPr id="1451222808" name="Picture 1"/>
+            <wp:cNvGraphicFramePr>
+              <a:graphicFrameLocks xmlns:a="http://schemas.openxmlformats.org/drawingml/2006/main" noChangeAspect="1"/>
+            </wp:cNvGraphicFramePr>
+            <a:graphic xmlns:a="http://schemas.openxmlformats.org/drawingml/2006/main">
+              <a:graphicData uri="http://schemas.openxmlformats.org/drawingml/2006/picture">
+                <pic:pic xmlns:pic="http://schemas.openxmlformats.org/drawingml/2006/picture">
+                  <pic:nvPicPr>
+                    <pic:cNvPr id="1451222808" name=""/>
+                    <pic:cNvPicPr/>
+                  </pic:nvPicPr>
+                  <pic:blipFill>
+                    <a:blip r:embed="rId39"/>
+                    <a:stretch>
+                      <a:fillRect/>
+                    </a:stretch>
+                  </pic:blipFill>
+                  <pic:spPr>
+                    <a:xfrm>
+                      <a:off x="0" y="0"/>
+                      <a:ext cx="2257740" cy="209579"/>
+                    </a:xfrm>
+                    <a:prstGeom prst="rect">
+                      <a:avLst/>
+                    </a:prstGeom>
+                  </pic:spPr>
+                </pic:pic>
+              </a:graphicData>
+            </a:graphic>
+          </wp:inline>
+        </w:drawing>
+      </w:r>
+    </w:p>
+    <w:p>
+      <w:pPr>
+        <w:jc w:val="center"/>
+      </w:pPr>
+      <w:r>
+        <w:drawing>
+          <wp:inline distT="0" distB="0" distL="0" distR="0" wp14:anchorId="7553B8B5" wp14:editId="27E1E96C">
+            <wp:extent cx="2105319" cy="209579"/>
+            <wp:effectExtent l="0" t="0" r="9525" b="0"/>
+            <wp:docPr id="237841811" name="Picture 1"/>
+            <wp:cNvGraphicFramePr>
+              <a:graphicFrameLocks xmlns:a="http://schemas.openxmlformats.org/drawingml/2006/main" noChangeAspect="1"/>
+            </wp:cNvGraphicFramePr>
+            <a:graphic xmlns:a="http://schemas.openxmlformats.org/drawingml/2006/main">
+              <a:graphicData uri="http://schemas.openxmlformats.org/drawingml/2006/picture">
+                <pic:pic xmlns:pic="http://schemas.openxmlformats.org/drawingml/2006/picture">
+                  <pic:nvPicPr>
+                    <pic:cNvPr id="237841811" name=""/>
+                    <pic:cNvPicPr/>
+                  </pic:nvPicPr>
+                  <pic:blipFill>
+                    <a:blip r:embed="rId40"/>
+                    <a:stretch>
+                      <a:fillRect/>
+                    </a:stretch>
+                  </pic:blipFill>
+                  <pic:spPr>
+                    <a:xfrm>
+                      <a:off x="0" y="0"/>
+                      <a:ext cx="2105319" cy="209579"/>
+                    </a:xfrm>
+                    <a:prstGeom prst="rect">
+                      <a:avLst/>
+                    </a:prstGeom>
+                  </pic:spPr>
+                </pic:pic>
+              </a:graphicData>
+            </a:graphic>
+          </wp:inline>
+        </w:drawing>
+      </w:r>
+    </w:p>
+    <w:p>
+      <w:pPr>
+        <w:rPr>
+          <w:b/>
+          <w:bCs/>
+        </w:rPr>
+      </w:pPr>
+      <w:r>
+        <w:rPr>
+          <w:b/>
+          <w:bCs/>
+        </w:rPr>
+        <w:t> overflow-y-scroll</w:t>
+      </w:r>
+    </w:p>
+    <w:p>
+      <w:r>
+        <w:t>By this class we can add scroll to an element vertically.</w:t>
       </w:r>
     </w:p>
     <w:p/>
@@ -7350,7 +8993,6 @@
   <w:style w:type="character" w:default="1" w:styleId="DefaultParagraphFont">
     <w:name w:val="Default Paragraph Font"/>
     <w:uiPriority w:val="1"/>
-    <w:semiHidden/>
     <w:unhideWhenUsed/>
   </w:style>
   <w:style w:type="table" w:default="1" w:styleId="TableNormal">

</xml_diff>

<commit_message>
Lesson 52 Adding React Toastify to Codeswear.com
</commit_message>
<xml_diff>
--- a/Notes2.docx
+++ b/Notes2.docx
@@ -59,18 +59,10 @@
     </w:p>
     <w:p>
       <w:r>
-        <w:t xml:space="preserve">In nay </w:t>
-      </w:r>
-      <w:proofErr w:type="gramStart"/>
-      <w:r>
-        <w:t>container</w:t>
-      </w:r>
-      <w:r>
-        <w:t>(</w:t>
-      </w:r>
-      <w:proofErr w:type="gramEnd"/>
-      <w:r>
-        <w:t>or component)</w:t>
+        <w:t>In nay container</w:t>
+      </w:r>
+      <w:r>
+        <w:t>(or component)</w:t>
       </w:r>
       <w:r>
         <w:t xml:space="preserve"> if you want to </w:t>
@@ -555,14 +547,9 @@
       </w:r>
     </w:p>
     <w:p>
-      <w:proofErr w:type="gramStart"/>
       <w:r>
         <w:lastRenderedPageBreak/>
-        <w:t>So</w:t>
-      </w:r>
-      <w:proofErr w:type="gramEnd"/>
-      <w:r>
-        <w:t xml:space="preserve"> we can so this thing Now we can see it is getting rendered as shown below</w:t>
+        <w:t>So we can so this thing Now we can see it is getting rendered as shown below</w:t>
       </w:r>
     </w:p>
     <w:p>
@@ -664,13 +651,8 @@
         <w:t xml:space="preserve"> s</w:t>
       </w:r>
       <w:r>
-        <w:t xml:space="preserve">ubmit the </w:t>
-      </w:r>
-      <w:proofErr w:type="gramStart"/>
-      <w:r>
-        <w:t>form</w:t>
-      </w:r>
-      <w:proofErr w:type="gramEnd"/>
+        <w:t>ubmit the form</w:t>
+      </w:r>
       <w:r>
         <w:t xml:space="preserve"> we will definitely have to make an API to co</w:t>
       </w:r>
@@ -736,29 +718,8 @@
       </w:r>
     </w:p>
     <w:p>
-      <w:proofErr w:type="gramStart"/>
-      <w:r>
-        <w:t>So</w:t>
-      </w:r>
-      <w:proofErr w:type="gramEnd"/>
-      <w:r>
-        <w:t xml:space="preserve"> for </w:t>
-      </w:r>
-      <w:proofErr w:type="gramStart"/>
-      <w:r>
-        <w:t>now</w:t>
-      </w:r>
-      <w:proofErr w:type="gramEnd"/>
-      <w:r>
-        <w:t xml:space="preserve"> our post request handler </w:t>
-      </w:r>
-      <w:proofErr w:type="gramStart"/>
-      <w:r>
-        <w:t>look</w:t>
-      </w:r>
-      <w:proofErr w:type="gramEnd"/>
-      <w:r>
-        <w:t xml:space="preserve"> like below</w:t>
+      <w:r>
+        <w:t>So for now our post request handler look like below</w:t>
       </w:r>
     </w:p>
     <w:p>
@@ -807,13 +768,8 @@
       </w:r>
     </w:p>
     <w:p>
-      <w:proofErr w:type="gramStart"/>
-      <w:r>
-        <w:t>Ols</w:t>
-      </w:r>
-      <w:proofErr w:type="gramEnd"/>
-      <w:r>
-        <w:t xml:space="preserve"> version used to look like below</w:t>
+      <w:r>
+        <w:t>Ols version used to look like below</w:t>
       </w:r>
     </w:p>
     <w:p>
@@ -921,12 +877,10 @@
         <w:t xml:space="preserve">, not plain JSON, so sending it directly with </w:t>
       </w:r>
       <w:proofErr w:type="spellStart"/>
-      <w:proofErr w:type="gramStart"/>
       <w:r>
         <w:t>res.json</w:t>
       </w:r>
       <w:proofErr w:type="spellEnd"/>
-      <w:proofErr w:type="gramEnd"/>
       <w:r>
         <w:t>(</w:t>
       </w:r>
@@ -7046,39 +7000,10 @@
         <w:t xml:space="preserve">and strictly update everything </w:t>
       </w:r>
       <w:r>
-        <w:t xml:space="preserve">and </w:t>
-      </w:r>
-      <w:proofErr w:type="gramStart"/>
-      <w:r>
-        <w:t>If</w:t>
-      </w:r>
-      <w:proofErr w:type="gramEnd"/>
-      <w:r>
-        <w:t xml:space="preserve"> any person </w:t>
-      </w:r>
-      <w:proofErr w:type="gramStart"/>
-      <w:r>
-        <w:t>click</w:t>
-      </w:r>
-      <w:proofErr w:type="gramEnd"/>
-      <w:r>
-        <w:t xml:space="preserve"> on the color he </w:t>
-      </w:r>
-      <w:proofErr w:type="gramStart"/>
-      <w:r>
-        <w:t>don’t</w:t>
-      </w:r>
-      <w:proofErr w:type="gramEnd"/>
-      <w:r>
-        <w:t xml:space="preserve"> want and click on add to cart then he might buy wrong color product. </w:t>
-      </w:r>
-      <w:proofErr w:type="gramStart"/>
-      <w:r>
-        <w:t>So</w:t>
-      </w:r>
-      <w:proofErr w:type="gramEnd"/>
-      <w:r>
-        <w:t xml:space="preserve"> he should know he is in new page</w:t>
+        <w:t xml:space="preserve">and If any person click on the color he don’t want and click on add to cart then he might buy wrong color product. </w:t>
+      </w:r>
+      <w:r>
+        <w:t>So he should know he is in new page</w:t>
       </w:r>
       <w:r>
         <w:t xml:space="preserve">. </w:t>
@@ -7101,15 +7026,7 @@
         <w:t xml:space="preserve"> can help that is called preserve log it may be found in every browser </w:t>
       </w:r>
       <w:r>
-        <w:t xml:space="preserve">it </w:t>
-      </w:r>
-      <w:proofErr w:type="gramStart"/>
-      <w:r>
-        <w:t>preserve</w:t>
-      </w:r>
-      <w:proofErr w:type="gramEnd"/>
-      <w:r>
-        <w:t xml:space="preserve"> the log that was before reload So to do it go to marked below</w:t>
+        <w:t>it preserve the log that was before reload So to do it go to marked below</w:t>
       </w:r>
       <w:r>
         <w:t xml:space="preserve"> in console</w:t>
@@ -7127,6 +7044,7 @@
         <w:rPr>
           <w:b/>
           <w:bCs/>
+          <w:noProof/>
         </w:rPr>
         <w:drawing>
           <wp:inline distT="0" distB="0" distL="0" distR="0" wp14:anchorId="1A0A36F9" wp14:editId="4D3B142B">
@@ -7176,6 +7094,7 @@
         <w:rPr>
           <w:b/>
           <w:bCs/>
+          <w:noProof/>
         </w:rPr>
         <w:drawing>
           <wp:inline distT="0" distB="0" distL="0" distR="0" wp14:anchorId="7F43AB2C" wp14:editId="4F4DD218">
@@ -7398,6 +7317,9 @@
     </w:p>
     <w:p>
       <w:r>
+        <w:rPr>
+          <w:noProof/>
+        </w:rPr>
         <w:drawing>
           <wp:inline distT="0" distB="0" distL="0" distR="0" wp14:anchorId="37F787A8" wp14:editId="3402E84A">
             <wp:extent cx="5731510" cy="1045210"/>
@@ -7442,7 +7364,6 @@
           <w:bCs/>
         </w:rPr>
       </w:pPr>
-      <w:proofErr w:type="gramStart"/>
       <w:r>
         <w:rPr>
           <w:b/>
@@ -7457,7 +7378,6 @@
         </w:rPr>
         <w:t>:-</w:t>
       </w:r>
-      <w:proofErr w:type="gramEnd"/>
     </w:p>
     <w:p>
       <w:pPr>
@@ -7469,51 +7389,38 @@
         <w:t>We think that inside react element</w:t>
       </w:r>
       <w:r>
-        <w:t xml:space="preserve">s that space is also counted as an </w:t>
-      </w:r>
-      <w:proofErr w:type="gramStart"/>
-      <w:r>
-        <w:t>element.</w:t>
+        <w:t>s that space is also counted as an element.</w:t>
+      </w:r>
+      <w:r>
+        <w:t>(maybe) for example you take &lt;p&gt;</w:t>
+      </w:r>
+      <w:r>
+        <w:rPr>
+          <w:u w:val="single"/>
+        </w:rPr>
+        <w:t xml:space="preserve"> </w:t>
+      </w:r>
+      <w:r>
+        <w:t>&lt;a&gt;demo&lt;/a&gt;&lt;/p&gt;</w:t>
+      </w:r>
+      <w:r>
+        <w:t xml:space="preserve">. This </w:t>
+      </w:r>
+      <w:r>
+        <w:rPr>
+          <w:u w:val="single"/>
+        </w:rPr>
+        <w:t xml:space="preserve"> </w:t>
+      </w:r>
+      <w:r>
+        <w:t xml:space="preserve"> be treated as an element</w:t>
+      </w:r>
+      <w:r>
+        <w:t>.</w:t>
       </w:r>
       <w:r>
         <w:t>(</w:t>
       </w:r>
-      <w:proofErr w:type="gramEnd"/>
-      <w:r>
-        <w:t>maybe) for example you take &lt;p&gt;</w:t>
-      </w:r>
-      <w:r>
-        <w:rPr>
-          <w:u w:val="single"/>
-        </w:rPr>
-        <w:t xml:space="preserve"> </w:t>
-      </w:r>
-      <w:r>
-        <w:t>&lt;a&gt;demo&lt;/a&gt;&lt;/p&gt;</w:t>
-      </w:r>
-      <w:r>
-        <w:t xml:space="preserve">. This </w:t>
-      </w:r>
-      <w:r>
-        <w:rPr>
-          <w:u w:val="single"/>
-        </w:rPr>
-        <w:t xml:space="preserve"> </w:t>
-      </w:r>
-      <w:r>
-        <w:t xml:space="preserve"> be treated as an </w:t>
-      </w:r>
-      <w:proofErr w:type="gramStart"/>
-      <w:r>
-        <w:t>element</w:t>
-      </w:r>
-      <w:r>
-        <w:t>.</w:t>
-      </w:r>
-      <w:r>
-        <w:t>(</w:t>
-      </w:r>
-      <w:proofErr w:type="gramEnd"/>
       <w:r>
         <w:t>who knows</w:t>
       </w:r>
@@ -7697,6 +7604,9 @@
         <w:jc w:val="center"/>
       </w:pPr>
       <w:r>
+        <w:rPr>
+          <w:noProof/>
+        </w:rPr>
         <w:drawing>
           <wp:inline distT="0" distB="0" distL="0" distR="0" wp14:anchorId="3CA19444" wp14:editId="1DC1B8AA">
             <wp:extent cx="3591426" cy="181000"/>
@@ -7739,6 +7649,9 @@
         <w:jc w:val="center"/>
       </w:pPr>
       <w:r>
+        <w:rPr>
+          <w:noProof/>
+        </w:rPr>
         <w:drawing>
           <wp:inline distT="0" distB="0" distL="0" distR="0" wp14:anchorId="27CF6D17" wp14:editId="5B98E27F">
             <wp:extent cx="2257740" cy="209579"/>
@@ -7781,6 +7694,9 @@
         <w:jc w:val="center"/>
       </w:pPr>
       <w:r>
+        <w:rPr>
+          <w:noProof/>
+        </w:rPr>
         <w:drawing>
           <wp:inline distT="0" distB="0" distL="0" distR="0" wp14:anchorId="7553B8B5" wp14:editId="27E1E96C">
             <wp:extent cx="2105319" cy="209579"/>
@@ -7838,6 +7754,968 @@
         <w:t>By this class we can add scroll to an element vertically.</w:t>
       </w:r>
     </w:p>
+    <w:p>
+      <w:r>
+        <w:t>Many times</w:t>
+      </w:r>
+      <w:r>
+        <w:t xml:space="preserve"> in ecommerce </w:t>
+      </w:r>
+      <w:r>
+        <w:t xml:space="preserve"> we need to give alert to the </w:t>
+      </w:r>
+      <w:r>
+        <w:t>user</w:t>
+      </w:r>
+      <w:r>
+        <w:t xml:space="preserve"> that </w:t>
+      </w:r>
+      <w:r>
+        <w:t xml:space="preserve">their </w:t>
+      </w:r>
+      <w:proofErr w:type="spellStart"/>
+      <w:r>
+        <w:t>pi</w:t>
+      </w:r>
+      <w:r>
+        <w:t>n</w:t>
+      </w:r>
+      <w:r>
+        <w:t>code</w:t>
+      </w:r>
+      <w:proofErr w:type="spellEnd"/>
+      <w:r>
+        <w:t xml:space="preserve"> is not serviceable</w:t>
+      </w:r>
+    </w:p>
+    <w:p>
+      <w:pPr>
+        <w:jc w:val="center"/>
+      </w:pPr>
+      <w:r>
+        <w:drawing>
+          <wp:inline distT="0" distB="0" distL="0" distR="0" wp14:anchorId="6863909D" wp14:editId="730A6029">
+            <wp:extent cx="5731510" cy="3196590"/>
+            <wp:effectExtent l="0" t="0" r="2540" b="3810"/>
+            <wp:docPr id="2087382725" name="Picture 1"/>
+            <wp:cNvGraphicFramePr>
+              <a:graphicFrameLocks xmlns:a="http://schemas.openxmlformats.org/drawingml/2006/main" noChangeAspect="1"/>
+            </wp:cNvGraphicFramePr>
+            <a:graphic xmlns:a="http://schemas.openxmlformats.org/drawingml/2006/main">
+              <a:graphicData uri="http://schemas.openxmlformats.org/drawingml/2006/picture">
+                <pic:pic xmlns:pic="http://schemas.openxmlformats.org/drawingml/2006/picture">
+                  <pic:nvPicPr>
+                    <pic:cNvPr id="2087382725" name=""/>
+                    <pic:cNvPicPr/>
+                  </pic:nvPicPr>
+                  <pic:blipFill>
+                    <a:blip r:embed="rId41"/>
+                    <a:stretch>
+                      <a:fillRect/>
+                    </a:stretch>
+                  </pic:blipFill>
+                  <pic:spPr>
+                    <a:xfrm>
+                      <a:off x="0" y="0"/>
+                      <a:ext cx="5731510" cy="3196590"/>
+                    </a:xfrm>
+                    <a:prstGeom prst="rect">
+                      <a:avLst/>
+                    </a:prstGeom>
+                  </pic:spPr>
+                </pic:pic>
+              </a:graphicData>
+            </a:graphic>
+          </wp:inline>
+        </w:drawing>
+      </w:r>
+    </w:p>
+    <w:p>
+      <w:r>
+        <w:t xml:space="preserve"> </w:t>
+      </w:r>
+      <w:r>
+        <w:t xml:space="preserve">.We need to tell them </w:t>
+      </w:r>
+      <w:r>
+        <w:t xml:space="preserve">that </w:t>
+      </w:r>
+      <w:r>
+        <w:t xml:space="preserve">their login credentials are correct </w:t>
+      </w:r>
+    </w:p>
+    <w:p>
+      <w:pPr>
+        <w:jc w:val="center"/>
+      </w:pPr>
+      <w:r>
+        <w:lastRenderedPageBreak/>
+        <w:drawing>
+          <wp:inline distT="0" distB="0" distL="0" distR="0" wp14:anchorId="47C8CC6B" wp14:editId="7D570D3E">
+            <wp:extent cx="4686954" cy="3562847"/>
+            <wp:effectExtent l="0" t="0" r="0" b="0"/>
+            <wp:docPr id="98957518" name="Picture 1"/>
+            <wp:cNvGraphicFramePr>
+              <a:graphicFrameLocks xmlns:a="http://schemas.openxmlformats.org/drawingml/2006/main" noChangeAspect="1"/>
+            </wp:cNvGraphicFramePr>
+            <a:graphic xmlns:a="http://schemas.openxmlformats.org/drawingml/2006/main">
+              <a:graphicData uri="http://schemas.openxmlformats.org/drawingml/2006/picture">
+                <pic:pic xmlns:pic="http://schemas.openxmlformats.org/drawingml/2006/picture">
+                  <pic:nvPicPr>
+                    <pic:cNvPr id="98957518" name=""/>
+                    <pic:cNvPicPr/>
+                  </pic:nvPicPr>
+                  <pic:blipFill>
+                    <a:blip r:embed="rId42"/>
+                    <a:stretch>
+                      <a:fillRect/>
+                    </a:stretch>
+                  </pic:blipFill>
+                  <pic:spPr>
+                    <a:xfrm>
+                      <a:off x="0" y="0"/>
+                      <a:ext cx="4686954" cy="3562847"/>
+                    </a:xfrm>
+                    <a:prstGeom prst="rect">
+                      <a:avLst/>
+                    </a:prstGeom>
+                  </pic:spPr>
+                </pic:pic>
+              </a:graphicData>
+            </a:graphic>
+          </wp:inline>
+        </w:drawing>
+      </w:r>
+    </w:p>
+    <w:p>
+      <w:r>
+        <w:t xml:space="preserve">and their cart value is changed </w:t>
+      </w:r>
+      <w:r>
+        <w:t>because some prices of item is changed</w:t>
+      </w:r>
+    </w:p>
+    <w:p>
+      <w:r>
+        <w:t xml:space="preserve"> </w:t>
+      </w:r>
+      <w:r>
+        <w:t xml:space="preserve">To do all this we are going to use a library </w:t>
+      </w:r>
+      <w:r>
+        <w:t xml:space="preserve">called React </w:t>
+      </w:r>
+      <w:proofErr w:type="spellStart"/>
+      <w:r>
+        <w:t>Toastify</w:t>
+      </w:r>
+      <w:proofErr w:type="spellEnd"/>
+      <w:r>
+        <w:t xml:space="preserve"> </w:t>
+      </w:r>
+      <w:r>
+        <w:t>and if you use Rea</w:t>
+      </w:r>
+      <w:r>
+        <w:t>ct</w:t>
+      </w:r>
+      <w:r>
+        <w:t xml:space="preserve"> or </w:t>
+      </w:r>
+      <w:proofErr w:type="spellStart"/>
+      <w:r>
+        <w:t>Nextjs</w:t>
+      </w:r>
+      <w:proofErr w:type="spellEnd"/>
+      <w:r>
+        <w:t xml:space="preserve"> </w:t>
+      </w:r>
+    </w:p>
+    <w:p>
+      <w:pPr>
+        <w:jc w:val="center"/>
+      </w:pPr>
+      <w:r>
+        <w:drawing>
+          <wp:inline distT="0" distB="0" distL="0" distR="0" wp14:anchorId="659C6EA6" wp14:editId="4740E141">
+            <wp:extent cx="5731510" cy="3058795"/>
+            <wp:effectExtent l="0" t="0" r="2540" b="8255"/>
+            <wp:docPr id="811922537" name="Picture 1"/>
+            <wp:cNvGraphicFramePr>
+              <a:graphicFrameLocks xmlns:a="http://schemas.openxmlformats.org/drawingml/2006/main" noChangeAspect="1"/>
+            </wp:cNvGraphicFramePr>
+            <a:graphic xmlns:a="http://schemas.openxmlformats.org/drawingml/2006/main">
+              <a:graphicData uri="http://schemas.openxmlformats.org/drawingml/2006/picture">
+                <pic:pic xmlns:pic="http://schemas.openxmlformats.org/drawingml/2006/picture">
+                  <pic:nvPicPr>
+                    <pic:cNvPr id="811922537" name=""/>
+                    <pic:cNvPicPr/>
+                  </pic:nvPicPr>
+                  <pic:blipFill>
+                    <a:blip r:embed="rId43"/>
+                    <a:stretch>
+                      <a:fillRect/>
+                    </a:stretch>
+                  </pic:blipFill>
+                  <pic:spPr>
+                    <a:xfrm>
+                      <a:off x="0" y="0"/>
+                      <a:ext cx="5731510" cy="3058795"/>
+                    </a:xfrm>
+                    <a:prstGeom prst="rect">
+                      <a:avLst/>
+                    </a:prstGeom>
+                  </pic:spPr>
+                </pic:pic>
+              </a:graphicData>
+            </a:graphic>
+          </wp:inline>
+        </w:drawing>
+      </w:r>
+    </w:p>
+    <w:p>
+      <w:r>
+        <w:t xml:space="preserve">then this library </w:t>
+      </w:r>
+      <w:r>
+        <w:t>is very helpful</w:t>
+      </w:r>
+      <w:r>
+        <w:t xml:space="preserve"> as it is very simple setup </w:t>
+      </w:r>
+      <w:r>
+        <w:t>and you will feel fun</w:t>
+      </w:r>
+      <w:r>
+        <w:t xml:space="preserve"> </w:t>
+      </w:r>
+    </w:p>
+    <w:p>
+      <w:pPr>
+        <w:jc w:val="center"/>
+      </w:pPr>
+      <w:r>
+        <w:lastRenderedPageBreak/>
+        <w:drawing>
+          <wp:inline distT="0" distB="0" distL="0" distR="0" wp14:anchorId="1D1889CD" wp14:editId="516B3644">
+            <wp:extent cx="5468113" cy="3124636"/>
+            <wp:effectExtent l="0" t="0" r="0" b="0"/>
+            <wp:docPr id="740371677" name="Picture 1"/>
+            <wp:cNvGraphicFramePr>
+              <a:graphicFrameLocks xmlns:a="http://schemas.openxmlformats.org/drawingml/2006/main" noChangeAspect="1"/>
+            </wp:cNvGraphicFramePr>
+            <a:graphic xmlns:a="http://schemas.openxmlformats.org/drawingml/2006/main">
+              <a:graphicData uri="http://schemas.openxmlformats.org/drawingml/2006/picture">
+                <pic:pic xmlns:pic="http://schemas.openxmlformats.org/drawingml/2006/picture">
+                  <pic:nvPicPr>
+                    <pic:cNvPr id="740371677" name=""/>
+                    <pic:cNvPicPr/>
+                  </pic:nvPicPr>
+                  <pic:blipFill>
+                    <a:blip r:embed="rId44"/>
+                    <a:stretch>
+                      <a:fillRect/>
+                    </a:stretch>
+                  </pic:blipFill>
+                  <pic:spPr>
+                    <a:xfrm>
+                      <a:off x="0" y="0"/>
+                      <a:ext cx="5468113" cy="3124636"/>
+                    </a:xfrm>
+                    <a:prstGeom prst="rect">
+                      <a:avLst/>
+                    </a:prstGeom>
+                  </pic:spPr>
+                </pic:pic>
+              </a:graphicData>
+            </a:graphic>
+          </wp:inline>
+        </w:drawing>
+      </w:r>
+    </w:p>
+    <w:p>
+      <w:r>
+        <w:t xml:space="preserve">Because there are two lines of code </w:t>
+      </w:r>
+      <w:r>
+        <w:t xml:space="preserve">one you add container </w:t>
+      </w:r>
+      <w:r>
+        <w:t xml:space="preserve">and then invoke that container </w:t>
+      </w:r>
+      <w:r>
+        <w:t>and all the work this library handles it itself.</w:t>
+      </w:r>
+    </w:p>
+    <w:p>
+      <w:r>
+        <w:t xml:space="preserve">We will see React </w:t>
+      </w:r>
+      <w:proofErr w:type="spellStart"/>
+      <w:r>
+        <w:t>Toastify</w:t>
+      </w:r>
+      <w:proofErr w:type="spellEnd"/>
+      <w:r>
+        <w:t xml:space="preserve"> documentation </w:t>
+      </w:r>
+      <w:r>
+        <w:t xml:space="preserve">and use it. </w:t>
+      </w:r>
+      <w:r>
+        <w:t xml:space="preserve">and we will see a link </w:t>
+      </w:r>
+      <w:r>
+        <w:t xml:space="preserve">by going to which we can create our </w:t>
+      </w:r>
+      <w:r>
+        <w:t xml:space="preserve">own toast </w:t>
+      </w:r>
+    </w:p>
+    <w:p>
+      <w:r>
+        <w:t>To use it we need to import it as shown below</w:t>
+      </w:r>
+    </w:p>
+    <w:p>
+      <w:pPr>
+        <w:jc w:val="center"/>
+      </w:pPr>
+      <w:r>
+        <w:drawing>
+          <wp:inline distT="0" distB="0" distL="0" distR="0" wp14:anchorId="6E186B29" wp14:editId="39D3F423">
+            <wp:extent cx="3924848" cy="381053"/>
+            <wp:effectExtent l="0" t="0" r="0" b="0"/>
+            <wp:docPr id="142759843" name="Picture 1"/>
+            <wp:cNvGraphicFramePr>
+              <a:graphicFrameLocks xmlns:a="http://schemas.openxmlformats.org/drawingml/2006/main" noChangeAspect="1"/>
+            </wp:cNvGraphicFramePr>
+            <a:graphic xmlns:a="http://schemas.openxmlformats.org/drawingml/2006/main">
+              <a:graphicData uri="http://schemas.openxmlformats.org/drawingml/2006/picture">
+                <pic:pic xmlns:pic="http://schemas.openxmlformats.org/drawingml/2006/picture">
+                  <pic:nvPicPr>
+                    <pic:cNvPr id="142759843" name=""/>
+                    <pic:cNvPicPr/>
+                  </pic:nvPicPr>
+                  <pic:blipFill>
+                    <a:blip r:embed="rId45"/>
+                    <a:stretch>
+                      <a:fillRect/>
+                    </a:stretch>
+                  </pic:blipFill>
+                  <pic:spPr>
+                    <a:xfrm>
+                      <a:off x="0" y="0"/>
+                      <a:ext cx="3924848" cy="381053"/>
+                    </a:xfrm>
+                    <a:prstGeom prst="rect">
+                      <a:avLst/>
+                    </a:prstGeom>
+                  </pic:spPr>
+                </pic:pic>
+              </a:graphicData>
+            </a:graphic>
+          </wp:inline>
+        </w:drawing>
+      </w:r>
+    </w:p>
+    <w:p>
+      <w:r>
+        <w:t>And here toast it is a</w:t>
+      </w:r>
+      <w:r>
+        <w:t xml:space="preserve"> container invoker method </w:t>
+      </w:r>
+      <w:r>
+        <w:t xml:space="preserve">be calling it we invoke Toast component </w:t>
+      </w:r>
+    </w:p>
+    <w:p>
+      <w:r>
+        <w:t>We get error as shown below</w:t>
+      </w:r>
+    </w:p>
+    <w:p>
+      <w:pPr>
+        <w:jc w:val="center"/>
+      </w:pPr>
+      <w:r>
+        <w:rPr>
+          <w:noProof/>
+        </w:rPr>
+        <mc:AlternateContent>
+          <mc:Choice Requires="wps">
+            <w:drawing>
+              <wp:inline distT="0" distB="0" distL="0" distR="0" wp14:anchorId="42CB2320" wp14:editId="65EADC76">
+                <wp:extent cx="304800" cy="304800"/>
+                <wp:effectExtent l="0" t="0" r="0" b="0"/>
+                <wp:docPr id="1093774335" name="Rectangle 1" descr="We get this error because image also demands from server by url and server takes slug and did not find any product by this title as the img property that was used in the src was some random string we set for demo"/>
+                <wp:cNvGraphicFramePr>
+                  <a:graphicFrameLocks xmlns:a="http://schemas.openxmlformats.org/drawingml/2006/main" noChangeAspect="1"/>
+                </wp:cNvGraphicFramePr>
+                <a:graphic xmlns:a="http://schemas.openxmlformats.org/drawingml/2006/main">
+                  <a:graphicData uri="http://schemas.microsoft.com/office/word/2010/wordprocessingShape">
+                    <wps:wsp>
+                      <wps:cNvSpPr>
+                        <a:spLocks noChangeAspect="1" noChangeArrowheads="1"/>
+                      </wps:cNvSpPr>
+                      <wps:spPr bwMode="auto">
+                        <a:xfrm>
+                          <a:off x="0" y="0"/>
+                          <a:ext cx="304800" cy="304800"/>
+                        </a:xfrm>
+                        <a:prstGeom prst="rect">
+                          <a:avLst/>
+                        </a:prstGeom>
+                        <a:noFill/>
+                        <a:ln>
+                          <a:noFill/>
+                        </a:ln>
+                        <a:extLst>
+                          <a:ext uri="{909E8E84-426E-40DD-AFC4-6F175D3DCCD1}">
+                            <a14:hiddenFill xmlns:a14="http://schemas.microsoft.com/office/drawing/2010/main">
+                              <a:solidFill>
+                                <a:srgbClr val="FFFFFF"/>
+                              </a:solidFill>
+                            </a14:hiddenFill>
+                          </a:ext>
+                          <a:ext uri="{91240B29-F687-4F45-9708-019B960494DF}">
+                            <a14:hiddenLine xmlns:a14="http://schemas.microsoft.com/office/drawing/2010/main" w="9525">
+                              <a:solidFill>
+                                <a:srgbClr val="000000"/>
+                              </a:solidFill>
+                              <a:miter lim="800000"/>
+                              <a:headEnd/>
+                              <a:tailEnd/>
+                            </a14:hiddenLine>
+                          </a:ext>
+                        </a:extLst>
+                      </wps:spPr>
+                      <wps:bodyPr rot="0" vert="horz" wrap="square" lIns="91440" tIns="45720" rIns="91440" bIns="45720" anchor="t" anchorCtr="0" upright="1">
+                        <a:noAutofit/>
+                      </wps:bodyPr>
+                    </wps:wsp>
+                  </a:graphicData>
+                </a:graphic>
+              </wp:inline>
+            </w:drawing>
+          </mc:Choice>
+          <mc:Fallback>
+            <w:pict>
+              <v:rect w14:anchorId="6E1956BF" id="Rectangle 1" o:spid="_x0000_s1026" alt="We get this error because image also demands from server by url and server takes slug and did not find any product by this title as the img property that was used in the src was some random string we set for demo" style="width:24pt;height:24pt;visibility:visible;mso-wrap-style:square;mso-left-percent:-10001;mso-top-percent:-10001;mso-position-horizontal:absolute;mso-position-horizontal-relative:char;mso-position-vertical:absolute;mso-position-vertical-relative:line;mso-left-percent:-10001;mso-top-percent:-10001;v-text-anchor:top" o:gfxdata="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" filled="f" stroked="f">
+                <o:lock v:ext="edit" aspectratio="t"/>
+                <w10:anchorlock/>
+              </v:rect>
+            </w:pict>
+          </mc:Fallback>
+        </mc:AlternateContent>
+      </w:r>
+      <w:r>
+        <w:rPr>
+          <w:noProof/>
+        </w:rPr>
+        <mc:AlternateContent>
+          <mc:Choice Requires="wps">
+            <w:drawing>
+              <wp:inline distT="0" distB="0" distL="0" distR="0" wp14:anchorId="589B8128" wp14:editId="40626542">
+                <wp:extent cx="304800" cy="304800"/>
+                <wp:effectExtent l="0" t="0" r="0" b="0"/>
+                <wp:docPr id="2115521202" name="Rectangle 2" descr="We get this error because image also demands from server by url and server takes slug and did not find any product by this title as the img property that was used in the src was some random string we set for demo"/>
+                <wp:cNvGraphicFramePr>
+                  <a:graphicFrameLocks xmlns:a="http://schemas.openxmlformats.org/drawingml/2006/main" noChangeAspect="1"/>
+                </wp:cNvGraphicFramePr>
+                <a:graphic xmlns:a="http://schemas.openxmlformats.org/drawingml/2006/main">
+                  <a:graphicData uri="http://schemas.microsoft.com/office/word/2010/wordprocessingShape">
+                    <wps:wsp>
+                      <wps:cNvSpPr>
+                        <a:spLocks noChangeAspect="1" noChangeArrowheads="1"/>
+                      </wps:cNvSpPr>
+                      <wps:spPr bwMode="auto">
+                        <a:xfrm>
+                          <a:off x="0" y="0"/>
+                          <a:ext cx="304800" cy="304800"/>
+                        </a:xfrm>
+                        <a:prstGeom prst="rect">
+                          <a:avLst/>
+                        </a:prstGeom>
+                        <a:noFill/>
+                        <a:ln>
+                          <a:noFill/>
+                        </a:ln>
+                        <a:extLst>
+                          <a:ext uri="{909E8E84-426E-40DD-AFC4-6F175D3DCCD1}">
+                            <a14:hiddenFill xmlns:a14="http://schemas.microsoft.com/office/drawing/2010/main">
+                              <a:solidFill>
+                                <a:srgbClr val="FFFFFF"/>
+                              </a:solidFill>
+                            </a14:hiddenFill>
+                          </a:ext>
+                          <a:ext uri="{91240B29-F687-4F45-9708-019B960494DF}">
+                            <a14:hiddenLine xmlns:a14="http://schemas.microsoft.com/office/drawing/2010/main" w="9525">
+                              <a:solidFill>
+                                <a:srgbClr val="000000"/>
+                              </a:solidFill>
+                              <a:miter lim="800000"/>
+                              <a:headEnd/>
+                              <a:tailEnd/>
+                            </a14:hiddenLine>
+                          </a:ext>
+                        </a:extLst>
+                      </wps:spPr>
+                      <wps:bodyPr rot="0" vert="horz" wrap="square" lIns="91440" tIns="45720" rIns="91440" bIns="45720" anchor="t" anchorCtr="0" upright="1">
+                        <a:noAutofit/>
+                      </wps:bodyPr>
+                    </wps:wsp>
+                  </a:graphicData>
+                </a:graphic>
+              </wp:inline>
+            </w:drawing>
+          </mc:Choice>
+          <mc:Fallback>
+            <w:pict>
+              <v:rect w14:anchorId="276BDA58" id="Rectangle 2" o:spid="_x0000_s1026" alt="We get this error because image also demands from server by url and server takes slug and did not find any product by this title as the img property that was used in the src was some random string we set for demo" style="width:24pt;height:24pt;visibility:visible;mso-wrap-style:square;mso-left-percent:-10001;mso-top-percent:-10001;mso-position-horizontal:absolute;mso-position-horizontal-relative:char;mso-position-vertical:absolute;mso-position-vertical-relative:line;mso-left-percent:-10001;mso-top-percent:-10001;v-text-anchor:top" o:gfxdata="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" filled="f" stroked="f">
+                <o:lock v:ext="edit" aspectratio="t"/>
+                <w10:anchorlock/>
+              </v:rect>
+            </w:pict>
+          </mc:Fallback>
+        </mc:AlternateContent>
+      </w:r>
+      <w:r>
+        <w:rPr>
+          <w:noProof/>
+        </w:rPr>
+        <w:drawing>
+          <wp:inline distT="0" distB="0" distL="0" distR="0" wp14:anchorId="6B6DF7C8" wp14:editId="563D2266">
+            <wp:extent cx="5731510" cy="2579370"/>
+            <wp:effectExtent l="0" t="0" r="2540" b="0"/>
+            <wp:docPr id="1981589093" name="Picture 4"/>
+            <wp:cNvGraphicFramePr>
+              <a:graphicFrameLocks xmlns:a="http://schemas.openxmlformats.org/drawingml/2006/main" noChangeAspect="1"/>
+            </wp:cNvGraphicFramePr>
+            <a:graphic xmlns:a="http://schemas.openxmlformats.org/drawingml/2006/main">
+              <a:graphicData uri="http://schemas.openxmlformats.org/drawingml/2006/picture">
+                <pic:pic xmlns:pic="http://schemas.openxmlformats.org/drawingml/2006/picture">
+                  <pic:nvPicPr>
+                    <pic:cNvPr id="0" name="Picture 20"/>
+                    <pic:cNvPicPr>
+                      <a:picLocks noChangeAspect="1" noChangeArrowheads="1"/>
+                    </pic:cNvPicPr>
+                  </pic:nvPicPr>
+                  <pic:blipFill>
+                    <a:blip r:embed="rId46" cstate="print">
+                      <a:extLst>
+                        <a:ext uri="{28A0092B-C50C-407E-A947-70E740481C1C}">
+                          <a14:useLocalDpi xmlns:a14="http://schemas.microsoft.com/office/drawing/2010/main" val="0"/>
+                        </a:ext>
+                      </a:extLst>
+                    </a:blip>
+                    <a:srcRect/>
+                    <a:stretch>
+                      <a:fillRect/>
+                    </a:stretch>
+                  </pic:blipFill>
+                  <pic:spPr bwMode="auto">
+                    <a:xfrm>
+                      <a:off x="0" y="0"/>
+                      <a:ext cx="5731510" cy="2579370"/>
+                    </a:xfrm>
+                    <a:prstGeom prst="rect">
+                      <a:avLst/>
+                    </a:prstGeom>
+                    <a:noFill/>
+                    <a:ln>
+                      <a:noFill/>
+                    </a:ln>
+                  </pic:spPr>
+                </pic:pic>
+              </a:graphicData>
+            </a:graphic>
+          </wp:inline>
+        </w:drawing>
+      </w:r>
+    </w:p>
+    <w:p>
+      <w:r>
+        <w:lastRenderedPageBreak/>
+        <w:t xml:space="preserve">We get this error because image also demands from server by url and server takes slug and did not find any product by this title as the </w:t>
+      </w:r>
+      <w:proofErr w:type="spellStart"/>
+      <w:r>
+        <w:t>img</w:t>
+      </w:r>
+      <w:proofErr w:type="spellEnd"/>
+      <w:r>
+        <w:t xml:space="preserve"> property that was used in the </w:t>
+      </w:r>
+      <w:proofErr w:type="spellStart"/>
+      <w:r>
+        <w:t>src</w:t>
+      </w:r>
+      <w:proofErr w:type="spellEnd"/>
+      <w:r>
+        <w:t xml:space="preserve"> was some random string we set for demo</w:t>
+      </w:r>
+    </w:p>
+    <w:p>
+      <w:pPr>
+        <w:jc w:val="center"/>
+      </w:pPr>
+      <w:r>
+        <w:drawing>
+          <wp:inline distT="0" distB="0" distL="0" distR="0" wp14:anchorId="4A5B0994" wp14:editId="218B50CE">
+            <wp:extent cx="5468113" cy="3124636"/>
+            <wp:effectExtent l="0" t="0" r="0" b="0"/>
+            <wp:docPr id="566626530" name="Picture 1"/>
+            <wp:cNvGraphicFramePr>
+              <a:graphicFrameLocks xmlns:a="http://schemas.openxmlformats.org/drawingml/2006/main" noChangeAspect="1"/>
+            </wp:cNvGraphicFramePr>
+            <a:graphic xmlns:a="http://schemas.openxmlformats.org/drawingml/2006/main">
+              <a:graphicData uri="http://schemas.openxmlformats.org/drawingml/2006/picture">
+                <pic:pic xmlns:pic="http://schemas.openxmlformats.org/drawingml/2006/picture">
+                  <pic:nvPicPr>
+                    <pic:cNvPr id="566626530" name=""/>
+                    <pic:cNvPicPr/>
+                  </pic:nvPicPr>
+                  <pic:blipFill>
+                    <a:blip r:embed="rId47"/>
+                    <a:stretch>
+                      <a:fillRect/>
+                    </a:stretch>
+                  </pic:blipFill>
+                  <pic:spPr>
+                    <a:xfrm>
+                      <a:off x="0" y="0"/>
+                      <a:ext cx="5468113" cy="3124636"/>
+                    </a:xfrm>
+                    <a:prstGeom prst="rect">
+                      <a:avLst/>
+                    </a:prstGeom>
+                  </pic:spPr>
+                </pic:pic>
+              </a:graphicData>
+            </a:graphic>
+          </wp:inline>
+        </w:drawing>
+      </w:r>
+    </w:p>
+    <w:p>
+      <w:r>
+        <w:t xml:space="preserve">Now you can click </w:t>
+      </w:r>
+      <w:r>
+        <w:t>on demo in the documentation and you will reach below</w:t>
+      </w:r>
+    </w:p>
+    <w:p>
+      <w:pPr>
+        <w:jc w:val="center"/>
+      </w:pPr>
+      <w:r>
+        <w:drawing>
+          <wp:inline distT="0" distB="0" distL="0" distR="0" wp14:anchorId="656E8466" wp14:editId="0583BC03">
+            <wp:extent cx="5198396" cy="4600575"/>
+            <wp:effectExtent l="0" t="0" r="2540" b="0"/>
+            <wp:docPr id="1076367917" name="Picture 1"/>
+            <wp:cNvGraphicFramePr>
+              <a:graphicFrameLocks xmlns:a="http://schemas.openxmlformats.org/drawingml/2006/main" noChangeAspect="1"/>
+            </wp:cNvGraphicFramePr>
+            <a:graphic xmlns:a="http://schemas.openxmlformats.org/drawingml/2006/main">
+              <a:graphicData uri="http://schemas.openxmlformats.org/drawingml/2006/picture">
+                <pic:pic xmlns:pic="http://schemas.openxmlformats.org/drawingml/2006/picture">
+                  <pic:nvPicPr>
+                    <pic:cNvPr id="1076367917" name=""/>
+                    <pic:cNvPicPr/>
+                  </pic:nvPicPr>
+                  <pic:blipFill>
+                    <a:blip r:embed="rId48"/>
+                    <a:stretch>
+                      <a:fillRect/>
+                    </a:stretch>
+                  </pic:blipFill>
+                  <pic:spPr>
+                    <a:xfrm>
+                      <a:off x="0" y="0"/>
+                      <a:ext cx="5202662" cy="4604351"/>
+                    </a:xfrm>
+                    <a:prstGeom prst="rect">
+                      <a:avLst/>
+                    </a:prstGeom>
+                  </pic:spPr>
+                </pic:pic>
+              </a:graphicData>
+            </a:graphic>
+          </wp:inline>
+        </w:drawing>
+      </w:r>
+    </w:p>
+    <w:p>
+      <w:pPr>
+        <w:jc w:val="center"/>
+      </w:pPr>
+      <w:r>
+        <w:lastRenderedPageBreak/>
+        <w:drawing>
+          <wp:inline distT="0" distB="0" distL="0" distR="0" wp14:anchorId="0E3C4F60" wp14:editId="11770495">
+            <wp:extent cx="5731510" cy="1898015"/>
+            <wp:effectExtent l="0" t="0" r="2540" b="6985"/>
+            <wp:docPr id="919233548" name="Picture 1"/>
+            <wp:cNvGraphicFramePr>
+              <a:graphicFrameLocks xmlns:a="http://schemas.openxmlformats.org/drawingml/2006/main" noChangeAspect="1"/>
+            </wp:cNvGraphicFramePr>
+            <a:graphic xmlns:a="http://schemas.openxmlformats.org/drawingml/2006/main">
+              <a:graphicData uri="http://schemas.openxmlformats.org/drawingml/2006/picture">
+                <pic:pic xmlns:pic="http://schemas.openxmlformats.org/drawingml/2006/picture">
+                  <pic:nvPicPr>
+                    <pic:cNvPr id="919233548" name=""/>
+                    <pic:cNvPicPr/>
+                  </pic:nvPicPr>
+                  <pic:blipFill>
+                    <a:blip r:embed="rId49"/>
+                    <a:stretch>
+                      <a:fillRect/>
+                    </a:stretch>
+                  </pic:blipFill>
+                  <pic:spPr>
+                    <a:xfrm>
+                      <a:off x="0" y="0"/>
+                      <a:ext cx="5731510" cy="1898015"/>
+                    </a:xfrm>
+                    <a:prstGeom prst="rect">
+                      <a:avLst/>
+                    </a:prstGeom>
+                  </pic:spPr>
+                </pic:pic>
+              </a:graphicData>
+            </a:graphic>
+          </wp:inline>
+        </w:drawing>
+      </w:r>
+    </w:p>
+    <w:p>
+      <w:r>
+        <w:t xml:space="preserve">You can there is two things that is </w:t>
+      </w:r>
+      <w:proofErr w:type="spellStart"/>
+      <w:r>
+        <w:t>ToastContainer</w:t>
+      </w:r>
+      <w:proofErr w:type="spellEnd"/>
+      <w:r>
+        <w:t xml:space="preserve"> </w:t>
+      </w:r>
+      <w:r>
+        <w:t xml:space="preserve">which tells how our toast will be shown </w:t>
+      </w:r>
+      <w:r>
+        <w:t xml:space="preserve">, </w:t>
+      </w:r>
+      <w:proofErr w:type="spellStart"/>
+      <w:r>
+        <w:t>whjat</w:t>
+      </w:r>
+      <w:proofErr w:type="spellEnd"/>
+      <w:r>
+        <w:t xml:space="preserve"> will be the position and </w:t>
+      </w:r>
+      <w:r>
+        <w:t xml:space="preserve">after what duration the </w:t>
+      </w:r>
+      <w:r>
+        <w:t>toast should be closed</w:t>
+      </w:r>
+      <w:r>
+        <w:t xml:space="preserve"> and we have Toast </w:t>
+      </w:r>
+      <w:proofErr w:type="spellStart"/>
+      <w:r>
+        <w:t>Emmitor</w:t>
+      </w:r>
+      <w:proofErr w:type="spellEnd"/>
+      <w:r>
+        <w:t xml:space="preserve"> that invoke that component </w:t>
+      </w:r>
+      <w:r>
+        <w:t xml:space="preserve"> You can see </w:t>
+      </w:r>
+      <w:proofErr w:type="spellStart"/>
+      <w:r>
+        <w:t>oabove</w:t>
+      </w:r>
+      <w:proofErr w:type="spellEnd"/>
+      <w:r>
+        <w:t xml:space="preserve"> options of types and position is given . Choose your option and </w:t>
+      </w:r>
+      <w:r>
+        <w:t xml:space="preserve">then your code will reflect that. </w:t>
+      </w:r>
+      <w:r>
+        <w:t xml:space="preserve">To see the demo we click on Show toast </w:t>
+      </w:r>
+    </w:p>
+    <w:p>
+      <w:r>
+        <w:t>You can see the output in top tight as that position was chosen for it</w:t>
+      </w:r>
+    </w:p>
+    <w:p>
+      <w:pPr>
+        <w:jc w:val="center"/>
+      </w:pPr>
+      <w:r>
+        <w:drawing>
+          <wp:inline distT="0" distB="0" distL="0" distR="0" wp14:anchorId="3D18426F" wp14:editId="66B95E8F">
+            <wp:extent cx="3839111" cy="1952898"/>
+            <wp:effectExtent l="0" t="0" r="0" b="9525"/>
+            <wp:docPr id="2013083480" name="Picture 1"/>
+            <wp:cNvGraphicFramePr>
+              <a:graphicFrameLocks xmlns:a="http://schemas.openxmlformats.org/drawingml/2006/main" noChangeAspect="1"/>
+            </wp:cNvGraphicFramePr>
+            <a:graphic xmlns:a="http://schemas.openxmlformats.org/drawingml/2006/main">
+              <a:graphicData uri="http://schemas.openxmlformats.org/drawingml/2006/picture">
+                <pic:pic xmlns:pic="http://schemas.openxmlformats.org/drawingml/2006/picture">
+                  <pic:nvPicPr>
+                    <pic:cNvPr id="2013083480" name=""/>
+                    <pic:cNvPicPr/>
+                  </pic:nvPicPr>
+                  <pic:blipFill>
+                    <a:blip r:embed="rId50"/>
+                    <a:stretch>
+                      <a:fillRect/>
+                    </a:stretch>
+                  </pic:blipFill>
+                  <pic:spPr>
+                    <a:xfrm>
+                      <a:off x="0" y="0"/>
+                      <a:ext cx="3839111" cy="1952898"/>
+                    </a:xfrm>
+                    <a:prstGeom prst="rect">
+                      <a:avLst/>
+                    </a:prstGeom>
+                  </pic:spPr>
+                </pic:pic>
+              </a:graphicData>
+            </a:graphic>
+          </wp:inline>
+        </w:drawing>
+      </w:r>
+    </w:p>
+    <w:p>
+      <w:r>
+        <w:t>So we now copy and paste the code here to apply them.</w:t>
+      </w:r>
+      <w:r>
+        <w:t xml:space="preserve"> </w:t>
+      </w:r>
+      <w:r>
+        <w:t xml:space="preserve">There are other methods inside our toast that is success and error and many more to show different situation in the toast.(who knows) </w:t>
+      </w:r>
+    </w:p>
+    <w:p>
+      <w:r>
+        <w:t xml:space="preserve">You can see different combination </w:t>
+      </w:r>
+      <w:r>
+        <w:t xml:space="preserve">of </w:t>
+      </w:r>
+      <w:r>
+        <w:t>toast  in the demo of documentation</w:t>
+      </w:r>
+    </w:p>
+    <w:p>
+      <w:pPr>
+        <w:jc w:val="center"/>
+      </w:pPr>
+      <w:r>
+        <w:drawing>
+          <wp:inline distT="0" distB="0" distL="0" distR="0" wp14:anchorId="71F9ACF8" wp14:editId="53CD2B24">
+            <wp:extent cx="5731510" cy="1898015"/>
+            <wp:effectExtent l="0" t="0" r="2540" b="6985"/>
+            <wp:docPr id="1435562952" name="Picture 1"/>
+            <wp:cNvGraphicFramePr>
+              <a:graphicFrameLocks xmlns:a="http://schemas.openxmlformats.org/drawingml/2006/main" noChangeAspect="1"/>
+            </wp:cNvGraphicFramePr>
+            <a:graphic xmlns:a="http://schemas.openxmlformats.org/drawingml/2006/main">
+              <a:graphicData uri="http://schemas.openxmlformats.org/drawingml/2006/picture">
+                <pic:pic xmlns:pic="http://schemas.openxmlformats.org/drawingml/2006/picture">
+                  <pic:nvPicPr>
+                    <pic:cNvPr id="919233548" name=""/>
+                    <pic:cNvPicPr/>
+                  </pic:nvPicPr>
+                  <pic:blipFill>
+                    <a:blip r:embed="rId49"/>
+                    <a:stretch>
+                      <a:fillRect/>
+                    </a:stretch>
+                  </pic:blipFill>
+                  <pic:spPr>
+                    <a:xfrm>
+                      <a:off x="0" y="0"/>
+                      <a:ext cx="5731510" cy="1898015"/>
+                    </a:xfrm>
+                    <a:prstGeom prst="rect">
+                      <a:avLst/>
+                    </a:prstGeom>
+                  </pic:spPr>
+                </pic:pic>
+              </a:graphicData>
+            </a:graphic>
+          </wp:inline>
+        </w:drawing>
+      </w:r>
+    </w:p>
+    <w:p>
+      <w:r>
+        <w:t>By pr</w:t>
+      </w:r>
+      <w:r>
+        <w:t>o</w:t>
+      </w:r>
+      <w:r>
+        <w:t>mis</w:t>
+      </w:r>
+      <w:r>
+        <w:t>e</w:t>
+      </w:r>
+      <w:r>
+        <w:t xml:space="preserve"> it shows how it will look in promise who knows and in update we reset the ongoing popup </w:t>
+      </w:r>
+    </w:p>
+    <w:p>
+      <w:r>
+        <w:t>We can change its font</w:t>
+      </w:r>
+      <w:r>
+        <w:t xml:space="preserve">. In the upcoming lesson we will </w:t>
+      </w:r>
+      <w:r>
+        <w:t>connect</w:t>
+      </w:r>
+      <w:r>
+        <w:t xml:space="preserve"> the hoodies</w:t>
+      </w:r>
+      <w:r>
+        <w:t>,</w:t>
+      </w:r>
+      <w:r>
+        <w:t xml:space="preserve"> stickers a</w:t>
+      </w:r>
+      <w:r>
+        <w:t>nd cups</w:t>
+      </w:r>
+      <w:r>
+        <w:t xml:space="preserve"> </w:t>
+      </w:r>
+      <w:r>
+        <w:t>with data bases</w:t>
+      </w:r>
+      <w:r>
+        <w:t xml:space="preserve"> and fill content in it.</w:t>
+      </w:r>
+    </w:p>
+    <w:p/>
+    <w:p/>
+    <w:p/>
     <w:p/>
     <w:sectPr>
       <w:pgSz w:w="11906" w:h="16838"/>

</xml_diff>

<commit_message>
Lesson 54 Creating Signup Page for Codeswear.com
</commit_message>
<xml_diff>
--- a/Notes2.docx
+++ b/Notes2.docx
@@ -59,10 +59,18 @@
     </w:p>
     <w:p>
       <w:r>
-        <w:t>In nay container</w:t>
-      </w:r>
-      <w:r>
-        <w:t>(or component)</w:t>
+        <w:t xml:space="preserve">In nay </w:t>
+      </w:r>
+      <w:proofErr w:type="gramStart"/>
+      <w:r>
+        <w:t>container</w:t>
+      </w:r>
+      <w:r>
+        <w:t>(</w:t>
+      </w:r>
+      <w:proofErr w:type="gramEnd"/>
+      <w:r>
+        <w:t>or component)</w:t>
       </w:r>
       <w:r>
         <w:t xml:space="preserve"> if you want to </w:t>
@@ -547,9 +555,14 @@
       </w:r>
     </w:p>
     <w:p>
+      <w:proofErr w:type="gramStart"/>
       <w:r>
         <w:lastRenderedPageBreak/>
-        <w:t>So we can so this thing Now we can see it is getting rendered as shown below</w:t>
+        <w:t>So</w:t>
+      </w:r>
+      <w:proofErr w:type="gramEnd"/>
+      <w:r>
+        <w:t xml:space="preserve"> we can so this thing Now we can see it is getting rendered as shown below</w:t>
       </w:r>
     </w:p>
     <w:p>
@@ -651,8 +664,13 @@
         <w:t xml:space="preserve"> s</w:t>
       </w:r>
       <w:r>
-        <w:t>ubmit the form</w:t>
-      </w:r>
+        <w:t xml:space="preserve">ubmit the </w:t>
+      </w:r>
+      <w:proofErr w:type="gramStart"/>
+      <w:r>
+        <w:t>form</w:t>
+      </w:r>
+      <w:proofErr w:type="gramEnd"/>
       <w:r>
         <w:t xml:space="preserve"> we will definitely have to make an API to co</w:t>
       </w:r>
@@ -718,8 +736,29 @@
       </w:r>
     </w:p>
     <w:p>
-      <w:r>
-        <w:t>So for now our post request handler look like below</w:t>
+      <w:proofErr w:type="gramStart"/>
+      <w:r>
+        <w:t>So</w:t>
+      </w:r>
+      <w:proofErr w:type="gramEnd"/>
+      <w:r>
+        <w:t xml:space="preserve"> for </w:t>
+      </w:r>
+      <w:proofErr w:type="gramStart"/>
+      <w:r>
+        <w:t>now</w:t>
+      </w:r>
+      <w:proofErr w:type="gramEnd"/>
+      <w:r>
+        <w:t xml:space="preserve"> our post request handler </w:t>
+      </w:r>
+      <w:proofErr w:type="gramStart"/>
+      <w:r>
+        <w:t>look</w:t>
+      </w:r>
+      <w:proofErr w:type="gramEnd"/>
+      <w:r>
+        <w:t xml:space="preserve"> like below</w:t>
       </w:r>
     </w:p>
     <w:p>
@@ -768,8 +807,13 @@
       </w:r>
     </w:p>
     <w:p>
-      <w:r>
-        <w:t>Ols version used to look like below</w:t>
+      <w:proofErr w:type="gramStart"/>
+      <w:r>
+        <w:t>Ols</w:t>
+      </w:r>
+      <w:proofErr w:type="gramEnd"/>
+      <w:r>
+        <w:t xml:space="preserve"> version used to look like below</w:t>
       </w:r>
     </w:p>
     <w:p>
@@ -877,10 +921,12 @@
         <w:t xml:space="preserve">, not plain JSON, so sending it directly with </w:t>
       </w:r>
       <w:proofErr w:type="spellStart"/>
+      <w:proofErr w:type="gramStart"/>
       <w:r>
         <w:t>res.json</w:t>
       </w:r>
       <w:proofErr w:type="spellEnd"/>
+      <w:proofErr w:type="gramEnd"/>
       <w:r>
         <w:t>(</w:t>
       </w:r>
@@ -7000,10 +7046,39 @@
         <w:t xml:space="preserve">and strictly update everything </w:t>
       </w:r>
       <w:r>
-        <w:t xml:space="preserve">and If any person click on the color he don’t want and click on add to cart then he might buy wrong color product. </w:t>
-      </w:r>
-      <w:r>
-        <w:t>So he should know he is in new page</w:t>
+        <w:t xml:space="preserve">and </w:t>
+      </w:r>
+      <w:proofErr w:type="gramStart"/>
+      <w:r>
+        <w:t>If</w:t>
+      </w:r>
+      <w:proofErr w:type="gramEnd"/>
+      <w:r>
+        <w:t xml:space="preserve"> any person </w:t>
+      </w:r>
+      <w:proofErr w:type="gramStart"/>
+      <w:r>
+        <w:t>click</w:t>
+      </w:r>
+      <w:proofErr w:type="gramEnd"/>
+      <w:r>
+        <w:t xml:space="preserve"> on the color he </w:t>
+      </w:r>
+      <w:proofErr w:type="gramStart"/>
+      <w:r>
+        <w:t>don’t</w:t>
+      </w:r>
+      <w:proofErr w:type="gramEnd"/>
+      <w:r>
+        <w:t xml:space="preserve"> want and click on add to cart then he might buy wrong color product. </w:t>
+      </w:r>
+      <w:proofErr w:type="gramStart"/>
+      <w:r>
+        <w:t>So</w:t>
+      </w:r>
+      <w:proofErr w:type="gramEnd"/>
+      <w:r>
+        <w:t xml:space="preserve"> he should know he is in new page</w:t>
       </w:r>
       <w:r>
         <w:t xml:space="preserve">. </w:t>
@@ -7026,7 +7101,15 @@
         <w:t xml:space="preserve"> can help that is called preserve log it may be found in every browser </w:t>
       </w:r>
       <w:r>
-        <w:t>it preserve the log that was before reload So to do it go to marked below</w:t>
+        <w:t xml:space="preserve">it </w:t>
+      </w:r>
+      <w:proofErr w:type="gramStart"/>
+      <w:r>
+        <w:t>preserve</w:t>
+      </w:r>
+      <w:proofErr w:type="gramEnd"/>
+      <w:r>
+        <w:t xml:space="preserve"> the log that was before reload So to do it go to marked below</w:t>
       </w:r>
       <w:r>
         <w:t xml:space="preserve"> in console</w:t>
@@ -7364,6 +7447,7 @@
           <w:bCs/>
         </w:rPr>
       </w:pPr>
+      <w:proofErr w:type="gramStart"/>
       <w:r>
         <w:rPr>
           <w:b/>
@@ -7378,6 +7462,7 @@
         </w:rPr>
         <w:t>:-</w:t>
       </w:r>
+      <w:proofErr w:type="gramEnd"/>
     </w:p>
     <w:p>
       <w:pPr>
@@ -7389,10 +7474,18 @@
         <w:t>We think that inside react element</w:t>
       </w:r>
       <w:r>
-        <w:t>s that space is also counted as an element.</w:t>
-      </w:r>
-      <w:r>
-        <w:t>(maybe) for example you take &lt;p&gt;</w:t>
+        <w:t xml:space="preserve">s that space is also counted as an </w:t>
+      </w:r>
+      <w:proofErr w:type="gramStart"/>
+      <w:r>
+        <w:t>element.</w:t>
+      </w:r>
+      <w:r>
+        <w:t>(</w:t>
+      </w:r>
+      <w:proofErr w:type="gramEnd"/>
+      <w:r>
+        <w:t>maybe) for example you take &lt;p&gt;</w:t>
       </w:r>
       <w:r>
         <w:rPr>
@@ -7413,7 +7506,11 @@
         <w:t xml:space="preserve"> </w:t>
       </w:r>
       <w:r>
-        <w:t xml:space="preserve"> be treated as an element</w:t>
+        <w:t xml:space="preserve"> be treated as an </w:t>
+      </w:r>
+      <w:proofErr w:type="gramStart"/>
+      <w:r>
+        <w:t>element</w:t>
       </w:r>
       <w:r>
         <w:t>.</w:t>
@@ -7421,6 +7518,7 @@
       <w:r>
         <w:t>(</w:t>
       </w:r>
+      <w:proofErr w:type="gramEnd"/>
       <w:r>
         <w:t>who knows</w:t>
       </w:r>
@@ -7756,13 +7854,26 @@
     </w:p>
     <w:p>
       <w:r>
-        <w:t>Many times</w:t>
-      </w:r>
-      <w:r>
-        <w:t xml:space="preserve"> in ecommerce </w:t>
-      </w:r>
-      <w:r>
-        <w:t xml:space="preserve"> we need to give alert to the </w:t>
+        <w:t xml:space="preserve">Many </w:t>
+      </w:r>
+      <w:proofErr w:type="gramStart"/>
+      <w:r>
+        <w:t>times</w:t>
+      </w:r>
+      <w:proofErr w:type="gramEnd"/>
+      <w:r>
+        <w:t xml:space="preserve"> in </w:t>
+      </w:r>
+      <w:proofErr w:type="gramStart"/>
+      <w:r>
+        <w:t xml:space="preserve">ecommerce </w:t>
+      </w:r>
+      <w:r>
+        <w:t xml:space="preserve"> we</w:t>
+      </w:r>
+      <w:proofErr w:type="gramEnd"/>
+      <w:r>
+        <w:t xml:space="preserve"> need to give alert to the </w:t>
       </w:r>
       <w:r>
         <w:t>user</w:t>
@@ -7793,6 +7904,9 @@
         <w:jc w:val="center"/>
       </w:pPr>
       <w:r>
+        <w:rPr>
+          <w:noProof/>
+        </w:rPr>
         <w:drawing>
           <wp:inline distT="0" distB="0" distL="0" distR="0" wp14:anchorId="6863909D" wp14:editId="730A6029">
             <wp:extent cx="5731510" cy="3196590"/>
@@ -7834,8 +7948,13 @@
       <w:r>
         <w:t xml:space="preserve"> </w:t>
       </w:r>
-      <w:r>
-        <w:t xml:space="preserve">.We need to tell them </w:t>
+      <w:proofErr w:type="gramStart"/>
+      <w:r>
+        <w:t>.We</w:t>
+      </w:r>
+      <w:proofErr w:type="gramEnd"/>
+      <w:r>
+        <w:t xml:space="preserve"> need to tell them </w:t>
       </w:r>
       <w:r>
         <w:t xml:space="preserve">that </w:t>
@@ -7849,6 +7968,9 @@
         <w:jc w:val="center"/>
       </w:pPr>
       <w:r>
+        <w:rPr>
+          <w:noProof/>
+        </w:rPr>
         <w:lastRenderedPageBreak/>
         <w:drawing>
           <wp:inline distT="0" distB="0" distL="0" distR="0" wp14:anchorId="47C8CC6B" wp14:editId="7D570D3E">
@@ -7936,6 +8058,9 @@
         <w:jc w:val="center"/>
       </w:pPr>
       <w:r>
+        <w:rPr>
+          <w:noProof/>
+        </w:rPr>
         <w:drawing>
           <wp:inline distT="0" distB="0" distL="0" distR="0" wp14:anchorId="659C6EA6" wp14:editId="4740E141">
             <wp:extent cx="5731510" cy="3058795"/>
@@ -7995,6 +8120,9 @@
         <w:jc w:val="center"/>
       </w:pPr>
       <w:r>
+        <w:rPr>
+          <w:noProof/>
+        </w:rPr>
         <w:lastRenderedPageBreak/>
         <w:drawing>
           <wp:inline distT="0" distB="0" distL="0" distR="0" wp14:anchorId="1D1889CD" wp14:editId="516B3644">
@@ -8082,6 +8210,9 @@
         <w:jc w:val="center"/>
       </w:pPr>
       <w:r>
+        <w:rPr>
+          <w:noProof/>
+        </w:rPr>
         <w:drawing>
           <wp:inline distT="0" distB="0" distL="0" distR="0" wp14:anchorId="6E186B29" wp14:editId="39D3F423">
             <wp:extent cx="3924848" cy="381053"/>
@@ -8202,7 +8333,7 @@
           </mc:Choice>
           <mc:Fallback>
             <w:pict>
-              <v:rect w14:anchorId="6E1956BF" id="Rectangle 1" o:spid="_x0000_s1026" alt="We get this error because image also demands from server by url and server takes slug and did not find any product by this title as the img property that was used in the src was some random string we set for demo" style="width:24pt;height:24pt;visibility:visible;mso-wrap-style:square;mso-left-percent:-10001;mso-top-percent:-10001;mso-position-horizontal:absolute;mso-position-horizontal-relative:char;mso-position-vertical:absolute;mso-position-vertical-relative:line;mso-left-percent:-10001;mso-top-percent:-10001;v-text-anchor:top" o:gfxdata="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" filled="f" stroked="f">
+              <v:rect w14:anchorId="0AFB9096" id="Rectangle 1" o:spid="_x0000_s1026" alt="We get this error because image also demands from server by url and server takes slug and did not find any product by this title as the img property that was used in the src was some random string we set for demo" style="width:24pt;height:24pt;visibility:visible;mso-wrap-style:square;mso-left-percent:-10001;mso-top-percent:-10001;mso-position-horizontal:absolute;mso-position-horizontal-relative:char;mso-position-vertical:absolute;mso-position-vertical-relative:line;mso-left-percent:-10001;mso-top-percent:-10001;v-text-anchor:top" o:gfxdata="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" filled="f" stroked="f">
                 <o:lock v:ext="edit" aspectratio="t"/>
                 <w10:anchorlock/>
               </v:rect>
@@ -8273,7 +8404,7 @@
           </mc:Choice>
           <mc:Fallback>
             <w:pict>
-              <v:rect w14:anchorId="276BDA58" id="Rectangle 2" o:spid="_x0000_s1026" alt="We get this error because image also demands from server by url and server takes slug and did not find any product by this title as the img property that was used in the src was some random string we set for demo" style="width:24pt;height:24pt;visibility:visible;mso-wrap-style:square;mso-left-percent:-10001;mso-top-percent:-10001;mso-position-horizontal:absolute;mso-position-horizontal-relative:char;mso-position-vertical:absolute;mso-position-vertical-relative:line;mso-left-percent:-10001;mso-top-percent:-10001;v-text-anchor:top" o:gfxdata="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" filled="f" stroked="f">
+              <v:rect w14:anchorId="47D54B95" id="Rectangle 2" o:spid="_x0000_s1026" alt="We get this error because image also demands from server by url and server takes slug and did not find any product by this title as the img property that was used in the src was some random string we set for demo" style="width:24pt;height:24pt;visibility:visible;mso-wrap-style:square;mso-left-percent:-10001;mso-top-percent:-10001;mso-position-horizontal:absolute;mso-position-horizontal-relative:char;mso-position-vertical:absolute;mso-position-vertical-relative:line;mso-left-percent:-10001;mso-top-percent:-10001;v-text-anchor:top" o:gfxdata="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" filled="f" stroked="f">
                 <o:lock v:ext="edit" aspectratio="t"/>
                 <w10:anchorlock/>
               </v:rect>
@@ -8286,7 +8417,7 @@
           <w:noProof/>
         </w:rPr>
         <w:drawing>
-          <wp:inline distT="0" distB="0" distL="0" distR="0" wp14:anchorId="6B6DF7C8" wp14:editId="563D2266">
+          <wp:inline distT="0" distB="0" distL="0" distR="0" wp14:anchorId="6B6DF7C8" wp14:editId="669659CF">
             <wp:extent cx="5731510" cy="2579370"/>
             <wp:effectExtent l="0" t="0" r="2540" b="0"/>
             <wp:docPr id="1981589093" name="Picture 4"/>
@@ -8362,6 +8493,9 @@
         <w:jc w:val="center"/>
       </w:pPr>
       <w:r>
+        <w:rPr>
+          <w:noProof/>
+        </w:rPr>
         <w:drawing>
           <wp:inline distT="0" distB="0" distL="0" distR="0" wp14:anchorId="4A5B0994" wp14:editId="218B50CE">
             <wp:extent cx="5468113" cy="3124636"/>
@@ -8412,6 +8546,9 @@
         <w:jc w:val="center"/>
       </w:pPr>
       <w:r>
+        <w:rPr>
+          <w:noProof/>
+        </w:rPr>
         <w:drawing>
           <wp:inline distT="0" distB="0" distL="0" distR="0" wp14:anchorId="656E8466" wp14:editId="0583BC03">
             <wp:extent cx="5198396" cy="4600575"/>
@@ -8454,6 +8591,9 @@
         <w:jc w:val="center"/>
       </w:pPr>
       <w:r>
+        <w:rPr>
+          <w:noProof/>
+        </w:rPr>
         <w:lastRenderedPageBreak/>
         <w:drawing>
           <wp:inline distT="0" distB="0" distL="0" distR="0" wp14:anchorId="0E3C4F60" wp14:editId="11770495">
@@ -8505,10 +8645,18 @@
         <w:t xml:space="preserve"> </w:t>
       </w:r>
       <w:r>
-        <w:t xml:space="preserve">which tells how our toast will be shown </w:t>
-      </w:r>
-      <w:r>
-        <w:t xml:space="preserve">, </w:t>
+        <w:t xml:space="preserve">which tells how our toast will be </w:t>
+      </w:r>
+      <w:proofErr w:type="gramStart"/>
+      <w:r>
+        <w:t xml:space="preserve">shown </w:t>
+      </w:r>
+      <w:r>
+        <w:t>,</w:t>
+      </w:r>
+      <w:proofErr w:type="gramEnd"/>
+      <w:r>
+        <w:t xml:space="preserve"> </w:t>
       </w:r>
       <w:proofErr w:type="spellStart"/>
       <w:r>
@@ -8533,10 +8681,18 @@
       </w:r>
       <w:proofErr w:type="spellEnd"/>
       <w:r>
-        <w:t xml:space="preserve"> that invoke that component </w:t>
-      </w:r>
-      <w:r>
-        <w:t xml:space="preserve"> You can see </w:t>
+        <w:t xml:space="preserve"> that invoke that </w:t>
+      </w:r>
+      <w:proofErr w:type="gramStart"/>
+      <w:r>
+        <w:t xml:space="preserve">component </w:t>
+      </w:r>
+      <w:r>
+        <w:t xml:space="preserve"> You</w:t>
+      </w:r>
+      <w:proofErr w:type="gramEnd"/>
+      <w:r>
+        <w:t xml:space="preserve"> can see </w:t>
       </w:r>
       <w:proofErr w:type="spellStart"/>
       <w:r>
@@ -8544,13 +8700,29 @@
       </w:r>
       <w:proofErr w:type="spellEnd"/>
       <w:r>
-        <w:t xml:space="preserve"> options of types and position is given . Choose your option and </w:t>
+        <w:t xml:space="preserve"> options of types and position is </w:t>
+      </w:r>
+      <w:proofErr w:type="gramStart"/>
+      <w:r>
+        <w:t>given .</w:t>
+      </w:r>
+      <w:proofErr w:type="gramEnd"/>
+      <w:r>
+        <w:t xml:space="preserve"> Choose your option and </w:t>
       </w:r>
       <w:r>
         <w:t xml:space="preserve">then your code will reflect that. </w:t>
       </w:r>
       <w:r>
-        <w:t xml:space="preserve">To see the demo we click on Show toast </w:t>
+        <w:t xml:space="preserve">To see the </w:t>
+      </w:r>
+      <w:proofErr w:type="gramStart"/>
+      <w:r>
+        <w:t>demo</w:t>
+      </w:r>
+      <w:proofErr w:type="gramEnd"/>
+      <w:r>
+        <w:t xml:space="preserve"> we click on Show toast </w:t>
       </w:r>
     </w:p>
     <w:p>
@@ -8563,6 +8735,9 @@
         <w:jc w:val="center"/>
       </w:pPr>
       <w:r>
+        <w:rPr>
+          <w:noProof/>
+        </w:rPr>
         <w:drawing>
           <wp:inline distT="0" distB="0" distL="0" distR="0" wp14:anchorId="3D18426F" wp14:editId="66B95E8F">
             <wp:extent cx="3839111" cy="1952898"/>
@@ -8601,14 +8776,27 @@
       </w:r>
     </w:p>
     <w:p>
-      <w:r>
-        <w:t>So we now copy and paste the code here to apply them.</w:t>
+      <w:proofErr w:type="gramStart"/>
+      <w:r>
+        <w:t>So</w:t>
+      </w:r>
+      <w:proofErr w:type="gramEnd"/>
+      <w:r>
+        <w:t xml:space="preserve"> we now copy and paste the code here to apply them.</w:t>
       </w:r>
       <w:r>
         <w:t xml:space="preserve"> </w:t>
       </w:r>
       <w:r>
-        <w:t xml:space="preserve">There are other methods inside our toast that is success and error and many more to show different situation in the toast.(who knows) </w:t>
+        <w:t xml:space="preserve">There are other methods inside our toast that is success and error and many more to show different situation in the </w:t>
+      </w:r>
+      <w:proofErr w:type="gramStart"/>
+      <w:r>
+        <w:t>toast.(</w:t>
+      </w:r>
+      <w:proofErr w:type="gramEnd"/>
+      <w:r>
+        <w:t xml:space="preserve">who knows) </w:t>
       </w:r>
     </w:p>
     <w:p>
@@ -8618,8 +8806,13 @@
       <w:r>
         <w:t xml:space="preserve">of </w:t>
       </w:r>
-      <w:r>
-        <w:t>toast  in the demo of documentation</w:t>
+      <w:proofErr w:type="gramStart"/>
+      <w:r>
+        <w:t>toast  in</w:t>
+      </w:r>
+      <w:proofErr w:type="gramEnd"/>
+      <w:r>
+        <w:t xml:space="preserve"> the demo of documentation</w:t>
       </w:r>
     </w:p>
     <w:p>
@@ -8627,6 +8820,9 @@
         <w:jc w:val="center"/>
       </w:pPr>
       <w:r>
+        <w:rPr>
+          <w:noProof/>
+        </w:rPr>
         <w:drawing>
           <wp:inline distT="0" distB="0" distL="0" distR="0" wp14:anchorId="71F9ACF8" wp14:editId="53CD2B24">
             <wp:extent cx="5731510" cy="1898015"/>
@@ -8716,6 +8912,220 @@
     <w:p/>
     <w:p/>
     <w:p/>
+    <w:p>
+      <w:r>
+        <w:t>We think</w:t>
+      </w:r>
+      <w:r>
+        <w:t xml:space="preserve"> that</w:t>
+      </w:r>
+      <w:r>
+        <w:t xml:space="preserve"> whatever </w:t>
+      </w:r>
+      <w:r>
+        <w:t>files</w:t>
+      </w:r>
+      <w:r>
+        <w:t xml:space="preserve"> stored in </w:t>
+      </w:r>
+      <w:r>
+        <w:t xml:space="preserve">the </w:t>
+      </w:r>
+      <w:r>
+        <w:t xml:space="preserve">models is Schema actually </w:t>
+      </w:r>
+      <w:r>
+        <w:t>and we make models of hem when we import that schema in a file that mak</w:t>
+      </w:r>
+      <w:r>
+        <w:t>e</w:t>
+      </w:r>
+      <w:r>
+        <w:t xml:space="preserve">s the model that is Schema </w:t>
+      </w:r>
+      <w:proofErr w:type="gramStart"/>
+      <w:r>
+        <w:t>Object(</w:t>
+      </w:r>
+      <w:proofErr w:type="gramEnd"/>
+      <w:r>
+        <w:t xml:space="preserve">who knows) and sometimes we don’t need </w:t>
+      </w:r>
+      <w:r>
+        <w:t xml:space="preserve">object just Schema </w:t>
+      </w:r>
+      <w:r>
+        <w:t xml:space="preserve">class </w:t>
+      </w:r>
+      <w:r>
+        <w:t xml:space="preserve">and its static </w:t>
+      </w:r>
+      <w:proofErr w:type="gramStart"/>
+      <w:r>
+        <w:t>methods(</w:t>
+      </w:r>
+      <w:proofErr w:type="gramEnd"/>
+      <w:r>
+        <w:t>who knows)</w:t>
+      </w:r>
+      <w:r>
+        <w:t>.</w:t>
+      </w:r>
+      <w:r>
+        <w:t xml:space="preserve"> </w:t>
+      </w:r>
+    </w:p>
+    <w:p>
+      <w:pPr>
+        <w:rPr>
+          <w:b/>
+          <w:bCs/>
+        </w:rPr>
+      </w:pPr>
+      <w:r>
+        <w:rPr>
+          <w:b/>
+          <w:bCs/>
+        </w:rPr>
+        <w:t xml:space="preserve">It is recommended to </w:t>
+      </w:r>
+      <w:r>
+        <w:rPr>
+          <w:b/>
+          <w:bCs/>
+        </w:rPr>
+        <w:t xml:space="preserve">import css of </w:t>
+      </w:r>
+      <w:proofErr w:type="spellStart"/>
+      <w:r>
+        <w:rPr>
+          <w:b/>
+          <w:bCs/>
+        </w:rPr>
+        <w:t>toastify</w:t>
+      </w:r>
+      <w:proofErr w:type="spellEnd"/>
+      <w:r>
+        <w:rPr>
+          <w:b/>
+          <w:bCs/>
+        </w:rPr>
+        <w:t xml:space="preserve"> that come with it </w:t>
+      </w:r>
+      <w:r>
+        <w:rPr>
+          <w:b/>
+          <w:bCs/>
+        </w:rPr>
+        <w:t xml:space="preserve">as </w:t>
+      </w:r>
+      <w:r>
+        <w:rPr>
+          <w:b/>
+          <w:bCs/>
+        </w:rPr>
+        <w:t>the classes used by Toast might find by mistake definition in Tailwind css.</w:t>
+      </w:r>
+    </w:p>
+    <w:p>
+      <w:pPr>
+        <w:rPr>
+          <w:b/>
+          <w:bCs/>
+        </w:rPr>
+      </w:pPr>
+      <w:r>
+        <w:rPr>
+          <w:b/>
+          <w:bCs/>
+        </w:rPr>
+        <w:t>As Teacher did mis</w:t>
+      </w:r>
+      <w:r>
+        <w:rPr>
+          <w:b/>
+          <w:bCs/>
+        </w:rPr>
+        <w:t>t</w:t>
+      </w:r>
+      <w:r>
+        <w:rPr>
+          <w:b/>
+          <w:bCs/>
+        </w:rPr>
+        <w:t>a</w:t>
+      </w:r>
+      <w:r>
+        <w:rPr>
+          <w:b/>
+          <w:bCs/>
+        </w:rPr>
+        <w:t>k</w:t>
+      </w:r>
+      <w:r>
+        <w:rPr>
+          <w:b/>
+          <w:bCs/>
+        </w:rPr>
+        <w:t xml:space="preserve">e as he signed up them some </w:t>
+      </w:r>
+      <w:r>
+        <w:rPr>
+          <w:b/>
+          <w:bCs/>
+        </w:rPr>
+        <w:t>e</w:t>
+      </w:r>
+      <w:r>
+        <w:rPr>
+          <w:b/>
+          <w:bCs/>
+        </w:rPr>
+        <w:t>lement get bugger as shown below</w:t>
+      </w:r>
+    </w:p>
+    <w:p>
+      <w:pPr>
+        <w:jc w:val="center"/>
+      </w:pPr>
+      <w:r>
+        <w:drawing>
+          <wp:inline distT="0" distB="0" distL="0" distR="0" wp14:anchorId="7E206959" wp14:editId="686252B6">
+            <wp:extent cx="5731510" cy="2896870"/>
+            <wp:effectExtent l="0" t="0" r="2540" b="0"/>
+            <wp:docPr id="749928302" name="Picture 1"/>
+            <wp:cNvGraphicFramePr>
+              <a:graphicFrameLocks xmlns:a="http://schemas.openxmlformats.org/drawingml/2006/main" noChangeAspect="1"/>
+            </wp:cNvGraphicFramePr>
+            <a:graphic xmlns:a="http://schemas.openxmlformats.org/drawingml/2006/main">
+              <a:graphicData uri="http://schemas.openxmlformats.org/drawingml/2006/picture">
+                <pic:pic xmlns:pic="http://schemas.openxmlformats.org/drawingml/2006/picture">
+                  <pic:nvPicPr>
+                    <pic:cNvPr id="749928302" name=""/>
+                    <pic:cNvPicPr/>
+                  </pic:nvPicPr>
+                  <pic:blipFill>
+                    <a:blip r:embed="rId51"/>
+                    <a:stretch>
+                      <a:fillRect/>
+                    </a:stretch>
+                  </pic:blipFill>
+                  <pic:spPr>
+                    <a:xfrm>
+                      <a:off x="0" y="0"/>
+                      <a:ext cx="5731510" cy="2896870"/>
+                    </a:xfrm>
+                    <a:prstGeom prst="rect">
+                      <a:avLst/>
+                    </a:prstGeom>
+                  </pic:spPr>
+                </pic:pic>
+              </a:graphicData>
+            </a:graphic>
+          </wp:inline>
+        </w:drawing>
+      </w:r>
+    </w:p>
     <w:p/>
     <w:sectPr>
       <w:pgSz w:w="11906" w:h="16838"/>
@@ -9871,6 +10281,7 @@
   <w:style w:type="character" w:default="1" w:styleId="DefaultParagraphFont">
     <w:name w:val="Default Paragraph Font"/>
     <w:uiPriority w:val="1"/>
+    <w:semiHidden/>
     <w:unhideWhenUsed/>
   </w:style>
   <w:style w:type="table" w:default="1" w:styleId="TableNormal">

</xml_diff>

<commit_message>
Lesson 55 Creating Login Page for Codeswear.com
</commit_message>
<xml_diff>
--- a/Notes2.docx
+++ b/Notes2.docx
@@ -59,18 +59,10 @@
     </w:p>
     <w:p>
       <w:r>
-        <w:t xml:space="preserve">In nay </w:t>
-      </w:r>
-      <w:proofErr w:type="gramStart"/>
-      <w:r>
-        <w:t>container</w:t>
-      </w:r>
-      <w:r>
-        <w:t>(</w:t>
-      </w:r>
-      <w:proofErr w:type="gramEnd"/>
-      <w:r>
-        <w:t>or component)</w:t>
+        <w:t>In nay container</w:t>
+      </w:r>
+      <w:r>
+        <w:t>(or component)</w:t>
       </w:r>
       <w:r>
         <w:t xml:space="preserve"> if you want to </w:t>
@@ -555,14 +547,9 @@
       </w:r>
     </w:p>
     <w:p>
-      <w:proofErr w:type="gramStart"/>
       <w:r>
         <w:lastRenderedPageBreak/>
-        <w:t>So</w:t>
-      </w:r>
-      <w:proofErr w:type="gramEnd"/>
-      <w:r>
-        <w:t xml:space="preserve"> we can so this thing Now we can see it is getting rendered as shown below</w:t>
+        <w:t>So we can so this thing Now we can see it is getting rendered as shown below</w:t>
       </w:r>
     </w:p>
     <w:p>
@@ -664,13 +651,8 @@
         <w:t xml:space="preserve"> s</w:t>
       </w:r>
       <w:r>
-        <w:t xml:space="preserve">ubmit the </w:t>
-      </w:r>
-      <w:proofErr w:type="gramStart"/>
-      <w:r>
-        <w:t>form</w:t>
-      </w:r>
-      <w:proofErr w:type="gramEnd"/>
+        <w:t>ubmit the form</w:t>
+      </w:r>
       <w:r>
         <w:t xml:space="preserve"> we will definitely have to make an API to co</w:t>
       </w:r>
@@ -736,29 +718,8 @@
       </w:r>
     </w:p>
     <w:p>
-      <w:proofErr w:type="gramStart"/>
-      <w:r>
-        <w:t>So</w:t>
-      </w:r>
-      <w:proofErr w:type="gramEnd"/>
-      <w:r>
-        <w:t xml:space="preserve"> for </w:t>
-      </w:r>
-      <w:proofErr w:type="gramStart"/>
-      <w:r>
-        <w:t>now</w:t>
-      </w:r>
-      <w:proofErr w:type="gramEnd"/>
-      <w:r>
-        <w:t xml:space="preserve"> our post request handler </w:t>
-      </w:r>
-      <w:proofErr w:type="gramStart"/>
-      <w:r>
-        <w:t>look</w:t>
-      </w:r>
-      <w:proofErr w:type="gramEnd"/>
-      <w:r>
-        <w:t xml:space="preserve"> like below</w:t>
+      <w:r>
+        <w:t>So for now our post request handler look like below</w:t>
       </w:r>
     </w:p>
     <w:p>
@@ -807,13 +768,8 @@
       </w:r>
     </w:p>
     <w:p>
-      <w:proofErr w:type="gramStart"/>
-      <w:r>
-        <w:t>Ols</w:t>
-      </w:r>
-      <w:proofErr w:type="gramEnd"/>
-      <w:r>
-        <w:t xml:space="preserve"> version used to look like below</w:t>
+      <w:r>
+        <w:t>Ols version used to look like below</w:t>
       </w:r>
     </w:p>
     <w:p>
@@ -921,12 +877,10 @@
         <w:t xml:space="preserve">, not plain JSON, so sending it directly with </w:t>
       </w:r>
       <w:proofErr w:type="spellStart"/>
-      <w:proofErr w:type="gramStart"/>
       <w:r>
         <w:t>res.json</w:t>
       </w:r>
       <w:proofErr w:type="spellEnd"/>
-      <w:proofErr w:type="gramEnd"/>
       <w:r>
         <w:t>(</w:t>
       </w:r>
@@ -7046,39 +7000,10 @@
         <w:t xml:space="preserve">and strictly update everything </w:t>
       </w:r>
       <w:r>
-        <w:t xml:space="preserve">and </w:t>
-      </w:r>
-      <w:proofErr w:type="gramStart"/>
-      <w:r>
-        <w:t>If</w:t>
-      </w:r>
-      <w:proofErr w:type="gramEnd"/>
-      <w:r>
-        <w:t xml:space="preserve"> any person </w:t>
-      </w:r>
-      <w:proofErr w:type="gramStart"/>
-      <w:r>
-        <w:t>click</w:t>
-      </w:r>
-      <w:proofErr w:type="gramEnd"/>
-      <w:r>
-        <w:t xml:space="preserve"> on the color he </w:t>
-      </w:r>
-      <w:proofErr w:type="gramStart"/>
-      <w:r>
-        <w:t>don’t</w:t>
-      </w:r>
-      <w:proofErr w:type="gramEnd"/>
-      <w:r>
-        <w:t xml:space="preserve"> want and click on add to cart then he might buy wrong color product. </w:t>
-      </w:r>
-      <w:proofErr w:type="gramStart"/>
-      <w:r>
-        <w:t>So</w:t>
-      </w:r>
-      <w:proofErr w:type="gramEnd"/>
-      <w:r>
-        <w:t xml:space="preserve"> he should know he is in new page</w:t>
+        <w:t xml:space="preserve">and If any person click on the color he don’t want and click on add to cart then he might buy wrong color product. </w:t>
+      </w:r>
+      <w:r>
+        <w:t>So he should know he is in new page</w:t>
       </w:r>
       <w:r>
         <w:t xml:space="preserve">. </w:t>
@@ -7101,15 +7026,7 @@
         <w:t xml:space="preserve"> can help that is called preserve log it may be found in every browser </w:t>
       </w:r>
       <w:r>
-        <w:t xml:space="preserve">it </w:t>
-      </w:r>
-      <w:proofErr w:type="gramStart"/>
-      <w:r>
-        <w:t>preserve</w:t>
-      </w:r>
-      <w:proofErr w:type="gramEnd"/>
-      <w:r>
-        <w:t xml:space="preserve"> the log that was before reload So to do it go to marked below</w:t>
+        <w:t>it preserve the log that was before reload So to do it go to marked below</w:t>
       </w:r>
       <w:r>
         <w:t xml:space="preserve"> in console</w:t>
@@ -7447,7 +7364,6 @@
           <w:bCs/>
         </w:rPr>
       </w:pPr>
-      <w:proofErr w:type="gramStart"/>
       <w:r>
         <w:rPr>
           <w:b/>
@@ -7462,7 +7378,6 @@
         </w:rPr>
         <w:t>:-</w:t>
       </w:r>
-      <w:proofErr w:type="gramEnd"/>
     </w:p>
     <w:p>
       <w:pPr>
@@ -7474,51 +7389,38 @@
         <w:t>We think that inside react element</w:t>
       </w:r>
       <w:r>
-        <w:t xml:space="preserve">s that space is also counted as an </w:t>
-      </w:r>
-      <w:proofErr w:type="gramStart"/>
-      <w:r>
-        <w:t>element.</w:t>
+        <w:t>s that space is also counted as an element.</w:t>
+      </w:r>
+      <w:r>
+        <w:t>(maybe) for example you take &lt;p&gt;</w:t>
+      </w:r>
+      <w:r>
+        <w:rPr>
+          <w:u w:val="single"/>
+        </w:rPr>
+        <w:t xml:space="preserve"> </w:t>
+      </w:r>
+      <w:r>
+        <w:t>&lt;a&gt;demo&lt;/a&gt;&lt;/p&gt;</w:t>
+      </w:r>
+      <w:r>
+        <w:t xml:space="preserve">. This </w:t>
+      </w:r>
+      <w:r>
+        <w:rPr>
+          <w:u w:val="single"/>
+        </w:rPr>
+        <w:t xml:space="preserve"> </w:t>
+      </w:r>
+      <w:r>
+        <w:t xml:space="preserve"> be treated as an element</w:t>
+      </w:r>
+      <w:r>
+        <w:t>.</w:t>
       </w:r>
       <w:r>
         <w:t>(</w:t>
       </w:r>
-      <w:proofErr w:type="gramEnd"/>
-      <w:r>
-        <w:t>maybe) for example you take &lt;p&gt;</w:t>
-      </w:r>
-      <w:r>
-        <w:rPr>
-          <w:u w:val="single"/>
-        </w:rPr>
-        <w:t xml:space="preserve"> </w:t>
-      </w:r>
-      <w:r>
-        <w:t>&lt;a&gt;demo&lt;/a&gt;&lt;/p&gt;</w:t>
-      </w:r>
-      <w:r>
-        <w:t xml:space="preserve">. This </w:t>
-      </w:r>
-      <w:r>
-        <w:rPr>
-          <w:u w:val="single"/>
-        </w:rPr>
-        <w:t xml:space="preserve"> </w:t>
-      </w:r>
-      <w:r>
-        <w:t xml:space="preserve"> be treated as an </w:t>
-      </w:r>
-      <w:proofErr w:type="gramStart"/>
-      <w:r>
-        <w:t>element</w:t>
-      </w:r>
-      <w:r>
-        <w:t>.</w:t>
-      </w:r>
-      <w:r>
-        <w:t>(</w:t>
-      </w:r>
-      <w:proofErr w:type="gramEnd"/>
       <w:r>
         <w:t>who knows</w:t>
       </w:r>
@@ -7854,26 +7756,13 @@
     </w:p>
     <w:p>
       <w:r>
-        <w:t xml:space="preserve">Many </w:t>
-      </w:r>
-      <w:proofErr w:type="gramStart"/>
-      <w:r>
-        <w:t>times</w:t>
-      </w:r>
-      <w:proofErr w:type="gramEnd"/>
-      <w:r>
-        <w:t xml:space="preserve"> in </w:t>
-      </w:r>
-      <w:proofErr w:type="gramStart"/>
-      <w:r>
-        <w:t xml:space="preserve">ecommerce </w:t>
-      </w:r>
-      <w:r>
-        <w:t xml:space="preserve"> we</w:t>
-      </w:r>
-      <w:proofErr w:type="gramEnd"/>
-      <w:r>
-        <w:t xml:space="preserve"> need to give alert to the </w:t>
+        <w:t>Many times</w:t>
+      </w:r>
+      <w:r>
+        <w:t xml:space="preserve"> in ecommerce </w:t>
+      </w:r>
+      <w:r>
+        <w:t xml:space="preserve"> we need to give alert to the </w:t>
       </w:r>
       <w:r>
         <w:t>user</w:t>
@@ -7948,13 +7837,8 @@
       <w:r>
         <w:t xml:space="preserve"> </w:t>
       </w:r>
-      <w:proofErr w:type="gramStart"/>
-      <w:r>
-        <w:t>.We</w:t>
-      </w:r>
-      <w:proofErr w:type="gramEnd"/>
-      <w:r>
-        <w:t xml:space="preserve"> need to tell them </w:t>
+      <w:r>
+        <w:t xml:space="preserve">.We need to tell them </w:t>
       </w:r>
       <w:r>
         <w:t xml:space="preserve">that </w:t>
@@ -8645,18 +8529,10 @@
         <w:t xml:space="preserve"> </w:t>
       </w:r>
       <w:r>
-        <w:t xml:space="preserve">which tells how our toast will be </w:t>
-      </w:r>
-      <w:proofErr w:type="gramStart"/>
-      <w:r>
-        <w:t xml:space="preserve">shown </w:t>
-      </w:r>
-      <w:r>
-        <w:t>,</w:t>
-      </w:r>
-      <w:proofErr w:type="gramEnd"/>
-      <w:r>
-        <w:t xml:space="preserve"> </w:t>
+        <w:t xml:space="preserve">which tells how our toast will be shown </w:t>
+      </w:r>
+      <w:r>
+        <w:t xml:space="preserve">, </w:t>
       </w:r>
       <w:proofErr w:type="spellStart"/>
       <w:r>
@@ -8681,18 +8557,10 @@
       </w:r>
       <w:proofErr w:type="spellEnd"/>
       <w:r>
-        <w:t xml:space="preserve"> that invoke that </w:t>
-      </w:r>
-      <w:proofErr w:type="gramStart"/>
-      <w:r>
-        <w:t xml:space="preserve">component </w:t>
-      </w:r>
-      <w:r>
-        <w:t xml:space="preserve"> You</w:t>
-      </w:r>
-      <w:proofErr w:type="gramEnd"/>
-      <w:r>
-        <w:t xml:space="preserve"> can see </w:t>
+        <w:t xml:space="preserve"> that invoke that component </w:t>
+      </w:r>
+      <w:r>
+        <w:t xml:space="preserve"> You can see </w:t>
       </w:r>
       <w:proofErr w:type="spellStart"/>
       <w:r>
@@ -8700,29 +8568,13 @@
       </w:r>
       <w:proofErr w:type="spellEnd"/>
       <w:r>
-        <w:t xml:space="preserve"> options of types and position is </w:t>
-      </w:r>
-      <w:proofErr w:type="gramStart"/>
-      <w:r>
-        <w:t>given .</w:t>
-      </w:r>
-      <w:proofErr w:type="gramEnd"/>
-      <w:r>
-        <w:t xml:space="preserve"> Choose your option and </w:t>
+        <w:t xml:space="preserve"> options of types and position is given . Choose your option and </w:t>
       </w:r>
       <w:r>
         <w:t xml:space="preserve">then your code will reflect that. </w:t>
       </w:r>
       <w:r>
-        <w:t xml:space="preserve">To see the </w:t>
-      </w:r>
-      <w:proofErr w:type="gramStart"/>
-      <w:r>
-        <w:t>demo</w:t>
-      </w:r>
-      <w:proofErr w:type="gramEnd"/>
-      <w:r>
-        <w:t xml:space="preserve"> we click on Show toast </w:t>
+        <w:t xml:space="preserve">To see the demo we click on Show toast </w:t>
       </w:r>
     </w:p>
     <w:p>
@@ -8776,27 +8628,14 @@
       </w:r>
     </w:p>
     <w:p>
-      <w:proofErr w:type="gramStart"/>
-      <w:r>
-        <w:t>So</w:t>
-      </w:r>
-      <w:proofErr w:type="gramEnd"/>
-      <w:r>
-        <w:t xml:space="preserve"> we now copy and paste the code here to apply them.</w:t>
+      <w:r>
+        <w:t>So we now copy and paste the code here to apply them.</w:t>
       </w:r>
       <w:r>
         <w:t xml:space="preserve"> </w:t>
       </w:r>
       <w:r>
-        <w:t xml:space="preserve">There are other methods inside our toast that is success and error and many more to show different situation in the </w:t>
-      </w:r>
-      <w:proofErr w:type="gramStart"/>
-      <w:r>
-        <w:t>toast.(</w:t>
-      </w:r>
-      <w:proofErr w:type="gramEnd"/>
-      <w:r>
-        <w:t xml:space="preserve">who knows) </w:t>
+        <w:t xml:space="preserve">There are other methods inside our toast that is success and error and many more to show different situation in the toast.(who knows) </w:t>
       </w:r>
     </w:p>
     <w:p>
@@ -8806,13 +8645,8 @@
       <w:r>
         <w:t xml:space="preserve">of </w:t>
       </w:r>
-      <w:proofErr w:type="gramStart"/>
-      <w:r>
-        <w:t>toast  in</w:t>
-      </w:r>
-      <w:proofErr w:type="gramEnd"/>
-      <w:r>
-        <w:t xml:space="preserve"> the demo of documentation</w:t>
+      <w:r>
+        <w:t>toast  in the demo of documentation</w:t>
       </w:r>
     </w:p>
     <w:p>
@@ -8941,15 +8775,7 @@
         <w:t>e</w:t>
       </w:r>
       <w:r>
-        <w:t xml:space="preserve">s the model that is Schema </w:t>
-      </w:r>
-      <w:proofErr w:type="gramStart"/>
-      <w:r>
-        <w:t>Object(</w:t>
-      </w:r>
-      <w:proofErr w:type="gramEnd"/>
-      <w:r>
-        <w:t xml:space="preserve">who knows) and sometimes we don’t need </w:t>
+        <w:t xml:space="preserve">s the model that is Schema Object(who knows) and sometimes we don’t need </w:t>
       </w:r>
       <w:r>
         <w:t xml:space="preserve">object just Schema </w:t>
@@ -8958,15 +8784,7 @@
         <w:t xml:space="preserve">class </w:t>
       </w:r>
       <w:r>
-        <w:t xml:space="preserve">and its static </w:t>
-      </w:r>
-      <w:proofErr w:type="gramStart"/>
-      <w:r>
-        <w:t>methods(</w:t>
-      </w:r>
-      <w:proofErr w:type="gramEnd"/>
-      <w:r>
-        <w:t>who knows)</w:t>
+        <w:t>and its static methods(who knows)</w:t>
       </w:r>
       <w:r>
         <w:t>.</w:t>
@@ -9124,6 +8942,205 @@
             </a:graphic>
           </wp:inline>
         </w:drawing>
+      </w:r>
+    </w:p>
+    <w:p>
+      <w:r>
+        <w:t xml:space="preserve">In the </w:t>
+      </w:r>
+      <w:r>
+        <w:t xml:space="preserve">express you could have send </w:t>
+      </w:r>
+      <w:r>
+        <w:t>two responses on</w:t>
+      </w:r>
+      <w:r>
+        <w:t>e</w:t>
+      </w:r>
+      <w:r>
+        <w:t xml:space="preserve"> after the other but server will give erro</w:t>
+      </w:r>
+      <w:r>
+        <w:t>r</w:t>
+      </w:r>
+      <w:r>
+        <w:t xml:space="preserve"> in se</w:t>
+      </w:r>
+      <w:r>
+        <w:t>c</w:t>
+      </w:r>
+      <w:r>
+        <w:t xml:space="preserve">ond response as it will say header could not be sent when they </w:t>
+      </w:r>
+      <w:r>
+        <w:t>we</w:t>
+      </w:r>
+      <w:r>
+        <w:t>re already sen</w:t>
+      </w:r>
+      <w:r>
+        <w:t>t</w:t>
+      </w:r>
+      <w:r>
+        <w:t xml:space="preserve"> to the client early.(maybe header are sent </w:t>
+      </w:r>
+      <w:r>
+        <w:t>bef</w:t>
+      </w:r>
+      <w:r>
+        <w:t>o</w:t>
+      </w:r>
+      <w:r>
+        <w:t>re</w:t>
+      </w:r>
+      <w:r>
+        <w:t xml:space="preserve"> response</w:t>
+      </w:r>
+      <w:r>
+        <w:t>(maybe)</w:t>
+      </w:r>
+      <w:r>
+        <w:t xml:space="preserve"> </w:t>
+      </w:r>
+      <w:r>
+        <w:t>that was supposed to be only one</w:t>
+      </w:r>
+      <w:r>
+        <w:t>)</w:t>
+      </w:r>
+      <w:r>
+        <w:t xml:space="preserve"> but in Modern </w:t>
+      </w:r>
+      <w:proofErr w:type="spellStart"/>
+      <w:r>
+        <w:t>nextjs</w:t>
+      </w:r>
+      <w:proofErr w:type="spellEnd"/>
+      <w:r>
+        <w:t xml:space="preserve"> it does not happen as the responses are returned and the flow is stopped in the function.</w:t>
+      </w:r>
+      <w:r>
+        <w:t xml:space="preserve"> </w:t>
+      </w:r>
+    </w:p>
+    <w:p>
+      <w:pPr>
+        <w:rPr>
+          <w:b/>
+          <w:bCs/>
+        </w:rPr>
+      </w:pPr>
+      <w:r>
+        <w:rPr>
+          <w:b/>
+          <w:bCs/>
+        </w:rPr>
+        <w:t>I</w:t>
+      </w:r>
+      <w:r>
+        <w:rPr>
+          <w:b/>
+          <w:bCs/>
+        </w:rPr>
+        <w:t>n</w:t>
+      </w:r>
+      <w:r>
+        <w:rPr>
+          <w:b/>
+          <w:bCs/>
+        </w:rPr>
+        <w:t xml:space="preserve"> authentication </w:t>
+      </w:r>
+      <w:r>
+        <w:rPr>
+          <w:b/>
+          <w:bCs/>
+        </w:rPr>
+        <w:t xml:space="preserve">we encrypt password </w:t>
+      </w:r>
+      <w:r>
+        <w:rPr>
+          <w:b/>
+          <w:bCs/>
+        </w:rPr>
+        <w:t xml:space="preserve">and when we match our password after we get authenticated we get token for </w:t>
+      </w:r>
+      <w:r>
+        <w:rPr>
+          <w:b/>
+          <w:bCs/>
+        </w:rPr>
+        <w:t xml:space="preserve">personalization of services. </w:t>
+      </w:r>
+      <w:r>
+        <w:rPr>
+          <w:b/>
+          <w:bCs/>
+        </w:rPr>
+        <w:t xml:space="preserve">It is not easy to hack a database of plain password but if it get </w:t>
+      </w:r>
+      <w:r>
+        <w:rPr>
+          <w:b/>
+          <w:bCs/>
+        </w:rPr>
+        <w:t xml:space="preserve">hacked </w:t>
+      </w:r>
+      <w:r>
+        <w:rPr>
+          <w:b/>
+          <w:bCs/>
+        </w:rPr>
+        <w:t xml:space="preserve">then all the data will be </w:t>
+      </w:r>
+      <w:r>
+        <w:rPr>
+          <w:b/>
+          <w:bCs/>
+        </w:rPr>
+        <w:t xml:space="preserve">taken </w:t>
+      </w:r>
+      <w:r>
+        <w:rPr>
+          <w:b/>
+          <w:bCs/>
+        </w:rPr>
+        <w:t xml:space="preserve">from </w:t>
+      </w:r>
+      <w:r>
+        <w:rPr>
+          <w:b/>
+          <w:bCs/>
+        </w:rPr>
+        <w:t>database.</w:t>
+      </w:r>
+      <w:r>
+        <w:rPr>
+          <w:b/>
+          <w:bCs/>
+        </w:rPr>
+        <w:t xml:space="preserve"> Anybody can </w:t>
+      </w:r>
+      <w:r>
+        <w:rPr>
+          <w:b/>
+          <w:bCs/>
+        </w:rPr>
+        <w:t>access</w:t>
+      </w:r>
+      <w:r>
+        <w:rPr>
+          <w:b/>
+          <w:bCs/>
+        </w:rPr>
+        <w:t xml:space="preserve"> any account</w:t>
+      </w:r>
+      <w:r>
+        <w:rPr>
+          <w:b/>
+          <w:bCs/>
+        </w:rPr>
+        <w:t xml:space="preserve">. </w:t>
       </w:r>
     </w:p>
     <w:p/>

</xml_diff>

<commit_message>
Lesson 56 Adding Encryption to login and signup for Codeswear.com
</commit_message>
<xml_diff>
--- a/Notes2.docx
+++ b/Notes2.docx
@@ -4,13 +4,8 @@
   <w:body>
     <w:p>
       <w:r>
-        <w:t xml:space="preserve">In this lesson we will see a react feature that is </w:t>
-      </w:r>
-      <w:proofErr w:type="spellStart"/>
-      <w:r>
-        <w:t>dangerouslysetinnerHTML</w:t>
-      </w:r>
-      <w:proofErr w:type="spellEnd"/>
+        <w:t>In this lesson we will see a react feature that is dangerouslysetinnerHTML</w:t>
+      </w:r>
     </w:p>
     <w:p>
       <w:pPr>
@@ -71,11 +66,7 @@
         <w:t>input HTML</w:t>
       </w:r>
       <w:r>
-        <w:t xml:space="preserve"> then you have to use </w:t>
-      </w:r>
-      <w:proofErr w:type="spellStart"/>
-      <w:r>
-        <w:t>dangerou</w:t>
+        <w:t xml:space="preserve"> then you have to use dangerou</w:t>
       </w:r>
       <w:r>
         <w:t>s</w:t>
@@ -86,7 +77,6 @@
       <w:r>
         <w:t>setInner</w:t>
       </w:r>
-      <w:proofErr w:type="spellEnd"/>
       <w:r>
         <w:t xml:space="preserve"> </w:t>
       </w:r>
@@ -112,55 +102,39 @@
         <w:t xml:space="preserve">We will see with the help of </w:t>
       </w:r>
       <w:r>
-        <w:t xml:space="preserve">dangerously </w:t>
-      </w:r>
-      <w:proofErr w:type="spellStart"/>
-      <w:r>
-        <w:t>innerhtml</w:t>
-      </w:r>
-      <w:proofErr w:type="spellEnd"/>
+        <w:t xml:space="preserve">dangerously innerhtml </w:t>
+      </w:r>
+      <w:r>
+        <w:t xml:space="preserve">we can put </w:t>
+      </w:r>
+      <w:r>
+        <w:t xml:space="preserve">html </w:t>
+      </w:r>
+      <w:r>
+        <w:t>conten</w:t>
+      </w:r>
+      <w:r>
+        <w:t>t in huntingcoder which has simple</w:t>
+      </w:r>
+      <w:r>
+        <w:t xml:space="preserve"> p and hea</w:t>
+      </w:r>
+      <w:r>
+        <w:t>ding plain text</w:t>
+      </w:r>
+      <w:r>
+        <w:t xml:space="preserve"> was there. </w:t>
+      </w:r>
+      <w:r>
+        <w:t xml:space="preserve">So that it looks beautiful </w:t>
+      </w:r>
+      <w:r>
+        <w:t>and the option</w:t>
+      </w:r>
       <w:r>
         <w:t xml:space="preserve"> </w:t>
       </w:r>
       <w:r>
-        <w:t xml:space="preserve">we can put </w:t>
-      </w:r>
-      <w:r>
-        <w:t xml:space="preserve">html </w:t>
-      </w:r>
-      <w:r>
-        <w:t>conten</w:t>
-      </w:r>
-      <w:r>
-        <w:t xml:space="preserve">t in </w:t>
-      </w:r>
-      <w:proofErr w:type="spellStart"/>
-      <w:r>
-        <w:t>huntingcoder</w:t>
-      </w:r>
-      <w:proofErr w:type="spellEnd"/>
-      <w:r>
-        <w:t xml:space="preserve"> which has simple</w:t>
-      </w:r>
-      <w:r>
-        <w:t xml:space="preserve"> p and hea</w:t>
-      </w:r>
-      <w:r>
-        <w:t>ding plain text</w:t>
-      </w:r>
-      <w:r>
-        <w:t xml:space="preserve"> was there. </w:t>
-      </w:r>
-      <w:r>
-        <w:t xml:space="preserve">So that it looks beautiful </w:t>
-      </w:r>
-      <w:r>
-        <w:t>and the option</w:t>
-      </w:r>
-      <w:r>
-        <w:t xml:space="preserve"> </w:t>
-      </w:r>
-      <w:r>
         <w:t xml:space="preserve">of formatting </w:t>
       </w:r>
       <w:r>
@@ -170,23 +144,7 @@
         <w:t xml:space="preserve">Out blog is HTML Now if you </w:t>
       </w:r>
       <w:r>
-        <w:t xml:space="preserve">put html </w:t>
-      </w:r>
-      <w:proofErr w:type="spellStart"/>
-      <w:r>
-        <w:t>uibside</w:t>
-      </w:r>
-      <w:proofErr w:type="spellEnd"/>
-      <w:r>
-        <w:t xml:space="preserve"> string in </w:t>
-      </w:r>
-      <w:proofErr w:type="spellStart"/>
-      <w:r>
-        <w:t>json</w:t>
-      </w:r>
-      <w:proofErr w:type="spellEnd"/>
-      <w:r>
-        <w:t xml:space="preserve"> file. </w:t>
+        <w:t xml:space="preserve">put html uibside string in json file. </w:t>
       </w:r>
       <w:r>
         <w:t xml:space="preserve">We want to write such that </w:t>
@@ -209,15 +167,7 @@
         </w:r>
       </w:hyperlink>
       <w:r>
-        <w:t xml:space="preserve"> and then copy the html content </w:t>
-      </w:r>
-      <w:proofErr w:type="spellStart"/>
-      <w:r>
-        <w:t>shownin</w:t>
-      </w:r>
-      <w:proofErr w:type="spellEnd"/>
-      <w:r>
-        <w:t xml:space="preserve"> in the first page </w:t>
+        <w:t xml:space="preserve"> and then copy the html content shownin in the first page </w:t>
       </w:r>
       <w:r>
         <w:t xml:space="preserve">and at first we paste it in the address bar so that </w:t>
@@ -235,26 +185,10 @@
         <w:t>e</w:t>
       </w:r>
       <w:r>
-        <w:t xml:space="preserve"> and then we search Json and aby any ransom site escape the </w:t>
-      </w:r>
-      <w:proofErr w:type="spellStart"/>
-      <w:r>
-        <w:t>jaon</w:t>
-      </w:r>
-      <w:proofErr w:type="spellEnd"/>
-      <w:r>
-        <w:t xml:space="preserve"> that is replace “ by /” and many more and then again remove the </w:t>
-      </w:r>
-      <w:r>
-        <w:t xml:space="preserve">new lines by </w:t>
-      </w:r>
-      <w:proofErr w:type="spellStart"/>
-      <w:r>
-        <w:t>pasing</w:t>
-      </w:r>
-      <w:proofErr w:type="spellEnd"/>
-      <w:r>
-        <w:t xml:space="preserve"> in the address bar.</w:t>
+        <w:t xml:space="preserve"> and then we search Json and aby any ransom site escape the jaon that is replace “ by /” and many more and then again remove the </w:t>
+      </w:r>
+      <w:r>
+        <w:t>new lines by pasing in the address bar.</w:t>
       </w:r>
     </w:p>
     <w:p>
@@ -325,15 +259,7 @@
         <w:t>It</w:t>
       </w:r>
       <w:r>
-        <w:t>(</w:t>
-      </w:r>
-      <w:proofErr w:type="spellStart"/>
-      <w:r>
-        <w:t>Nextjs</w:t>
-      </w:r>
-      <w:proofErr w:type="spellEnd"/>
-      <w:r>
-        <w:t xml:space="preserve"> or react)</w:t>
+        <w:t>(Nextjs or react)</w:t>
       </w:r>
       <w:r>
         <w:t xml:space="preserve"> wants to keep you sa</w:t>
@@ -350,27 +276,14 @@
       <w:r>
         <w:t xml:space="preserve"> you need to tell </w:t>
       </w:r>
-      <w:proofErr w:type="spellStart"/>
-      <w:r>
-        <w:t>Nextjs</w:t>
-      </w:r>
-      <w:proofErr w:type="spellEnd"/>
-      <w:r>
-        <w:t xml:space="preserve"> that you want to parse html </w:t>
+      <w:r>
+        <w:t xml:space="preserve">Nextjs that you want to parse html </w:t>
       </w:r>
       <w:r>
         <w:t>there is a tool or setting (who knows)</w:t>
       </w:r>
       <w:r>
-        <w:t xml:space="preserve"> and it is a part of react not a part of </w:t>
-      </w:r>
-      <w:proofErr w:type="spellStart"/>
-      <w:r>
-        <w:t>nextjs</w:t>
-      </w:r>
-      <w:proofErr w:type="spellEnd"/>
-      <w:r>
-        <w:t xml:space="preserve"> </w:t>
+        <w:t xml:space="preserve"> and it is a part of react not a part of nextjs </w:t>
       </w:r>
       <w:r>
         <w:t xml:space="preserve">as it is a feature of react </w:t>
@@ -426,23 +339,10 @@
     </w:p>
     <w:p>
       <w:r>
-        <w:t xml:space="preserve">The element where you used </w:t>
-      </w:r>
-      <w:proofErr w:type="spellStart"/>
-      <w:r>
-        <w:t>dangerouslyinnerHTML</w:t>
-      </w:r>
-      <w:proofErr w:type="spellEnd"/>
-      <w:r>
-        <w:t xml:space="preserve"> should not have space in the content as it is considered a content </w:t>
-      </w:r>
-      <w:proofErr w:type="spellStart"/>
-      <w:r>
-        <w:t>other wise</w:t>
-      </w:r>
-      <w:proofErr w:type="spellEnd"/>
-      <w:r>
-        <w:t xml:space="preserve"> you will get this error</w:t>
+        <w:t>The element where you used dangerouslyinnerHTML</w:t>
+      </w:r>
+      <w:r>
+        <w:t xml:space="preserve"> should not have space in the content as it is considered a content other wise you will get this error</w:t>
       </w:r>
     </w:p>
     <w:p>
@@ -490,15 +390,7 @@
     </w:p>
     <w:p>
       <w:r>
-        <w:t xml:space="preserve">Now our slug folder </w:t>
-      </w:r>
-      <w:proofErr w:type="spellStart"/>
-      <w:r>
-        <w:t>page.jsx</w:t>
-      </w:r>
-      <w:proofErr w:type="spellEnd"/>
-      <w:r>
-        <w:t xml:space="preserve"> look like below</w:t>
+        <w:t>Now our slug folder page.jsx look like below</w:t>
       </w:r>
     </w:p>
     <w:p>
@@ -671,13 +563,8 @@
       <w:r>
         <w:t xml:space="preserve"> </w:t>
       </w:r>
-      <w:proofErr w:type="spellStart"/>
-      <w:r>
-        <w:t>api</w:t>
-      </w:r>
-      <w:proofErr w:type="spellEnd"/>
-      <w:r>
-        <w:t xml:space="preserve"> in this lesso</w:t>
+      <w:r>
+        <w:t>api in this lesso</w:t>
       </w:r>
       <w:r>
         <w:t>n. We will see make it using Next.js API route</w:t>
@@ -700,21 +587,8 @@
       <w:r>
         <w:t xml:space="preserve">it </w:t>
       </w:r>
-      <w:proofErr w:type="spellStart"/>
-      <w:r>
-        <w:t>Seom</w:t>
-      </w:r>
-      <w:proofErr w:type="spellEnd"/>
-      <w:r>
-        <w:t xml:space="preserve"> </w:t>
-      </w:r>
-      <w:proofErr w:type="spellStart"/>
-      <w:r>
-        <w:t>noownards</w:t>
-      </w:r>
-      <w:proofErr w:type="spellEnd"/>
-      <w:r>
-        <w:t xml:space="preserve"> I will not give too much explanation</w:t>
+      <w:r>
+        <w:t>Seom noownards I will not give too much explanation</w:t>
       </w:r>
     </w:p>
     <w:p>
@@ -843,28 +717,12 @@
     </w:p>
     <w:p>
       <w:r>
-        <w:t xml:space="preserve">In older version teacher try to send </w:t>
-      </w:r>
-      <w:proofErr w:type="spellStart"/>
-      <w:r>
-        <w:t>req</w:t>
-      </w:r>
-      <w:proofErr w:type="spellEnd"/>
-      <w:r>
-        <w:t xml:space="preserve"> but could not send because </w:t>
-      </w:r>
-    </w:p>
-    <w:p>
-      <w:r>
-        <w:t xml:space="preserve">You didn’t see useful data because </w:t>
-      </w:r>
-      <w:proofErr w:type="spellStart"/>
-      <w:r>
-        <w:t>req</w:t>
-      </w:r>
-      <w:proofErr w:type="spellEnd"/>
-      <w:r>
-        <w:t xml:space="preserve"> is a </w:t>
+        <w:t xml:space="preserve">In older version teacher try to send req but could not send because </w:t>
+      </w:r>
+    </w:p>
+    <w:p>
+      <w:r>
+        <w:t xml:space="preserve">You didn’t see useful data because req is a </w:t>
       </w:r>
       <w:r>
         <w:rPr>
@@ -874,23 +732,7 @@
         <w:t>complex object</w:t>
       </w:r>
       <w:r>
-        <w:t xml:space="preserve">, not plain JSON, so sending it directly with </w:t>
-      </w:r>
-      <w:proofErr w:type="spellStart"/>
-      <w:r>
-        <w:t>res.json</w:t>
-      </w:r>
-      <w:proofErr w:type="spellEnd"/>
-      <w:r>
-        <w:t>(</w:t>
-      </w:r>
-      <w:proofErr w:type="spellStart"/>
-      <w:r>
-        <w:t>req</w:t>
-      </w:r>
-      <w:proofErr w:type="spellEnd"/>
-      <w:r>
-        <w:t>) doesn’t work as expected.</w:t>
+        <w:t>, not plain JSON, so sending it directly with res.json(req) doesn’t work as expected.</w:t>
       </w:r>
     </w:p>
     <w:p>
@@ -912,23 +754,7 @@
           <w:b/>
           <w:bCs/>
         </w:rPr>
-        <w:t xml:space="preserve">What </w:t>
-      </w:r>
-      <w:proofErr w:type="spellStart"/>
-      <w:r>
-        <w:rPr>
-          <w:b/>
-          <w:bCs/>
-        </w:rPr>
-        <w:t>req</w:t>
-      </w:r>
-      <w:proofErr w:type="spellEnd"/>
-      <w:r>
-        <w:rPr>
-          <w:b/>
-          <w:bCs/>
-        </w:rPr>
-        <w:t xml:space="preserve"> contains (old Next.js / Node.js)</w:t>
+        <w:t>What req contains (old Next.js / Node.js)</w:t>
       </w:r>
     </w:p>
     <w:p>
@@ -938,25 +764,12 @@
     </w:p>
     <w:p>
       <w:r>
-        <w:t>export default function handler(</w:t>
-      </w:r>
-      <w:proofErr w:type="spellStart"/>
-      <w:r>
-        <w:t>req</w:t>
-      </w:r>
-      <w:proofErr w:type="spellEnd"/>
-      <w:r>
-        <w:t>, res)</w:t>
-      </w:r>
-    </w:p>
-    <w:p>
-      <w:proofErr w:type="spellStart"/>
-      <w:r>
-        <w:t>req</w:t>
-      </w:r>
-      <w:proofErr w:type="spellEnd"/>
-      <w:r>
-        <w:t xml:space="preserve"> is a </w:t>
+        <w:t>export default function handler(req, res)</w:t>
+      </w:r>
+    </w:p>
+    <w:p>
+      <w:r>
+        <w:t xml:space="preserve">req is a </w:t>
       </w:r>
       <w:r>
         <w:rPr>
@@ -1043,39 +856,7 @@
           <w:b/>
           <w:bCs/>
         </w:rPr>
-        <w:t xml:space="preserve">Why </w:t>
-      </w:r>
-      <w:proofErr w:type="spellStart"/>
-      <w:r>
-        <w:rPr>
-          <w:b/>
-          <w:bCs/>
-        </w:rPr>
-        <w:t>res.json</w:t>
-      </w:r>
-      <w:proofErr w:type="spellEnd"/>
-      <w:r>
-        <w:rPr>
-          <w:b/>
-          <w:bCs/>
-        </w:rPr>
-        <w:t>(</w:t>
-      </w:r>
-      <w:proofErr w:type="spellStart"/>
-      <w:r>
-        <w:rPr>
-          <w:b/>
-          <w:bCs/>
-        </w:rPr>
-        <w:t>req</w:t>
-      </w:r>
-      <w:proofErr w:type="spellEnd"/>
-      <w:r>
-        <w:rPr>
-          <w:b/>
-          <w:bCs/>
-        </w:rPr>
-        <w:t>) doesn’t show data</w:t>
+        <w:t>Why res.json(req) doesn’t show data</w:t>
       </w:r>
     </w:p>
     <w:p>
@@ -1084,29 +865,8 @@
       </w:r>
     </w:p>
     <w:p>
-      <w:proofErr w:type="spellStart"/>
-      <w:r>
-        <w:t>res.status</w:t>
-      </w:r>
-      <w:proofErr w:type="spellEnd"/>
-      <w:r>
-        <w:t>(200).</w:t>
-      </w:r>
-      <w:proofErr w:type="spellStart"/>
-      <w:r>
-        <w:t>json</w:t>
-      </w:r>
-      <w:proofErr w:type="spellEnd"/>
-      <w:r>
-        <w:t>(</w:t>
-      </w:r>
-      <w:proofErr w:type="spellStart"/>
-      <w:r>
-        <w:t>req</w:t>
-      </w:r>
-      <w:proofErr w:type="spellEnd"/>
-      <w:r>
-        <w:t>)</w:t>
+      <w:r>
+        <w:t>res.status(200).json(req)</w:t>
       </w:r>
     </w:p>
     <w:p>
@@ -1115,13 +875,8 @@
       </w:r>
     </w:p>
     <w:p>
-      <w:proofErr w:type="spellStart"/>
-      <w:r>
-        <w:t>req</w:t>
-      </w:r>
-      <w:proofErr w:type="spellEnd"/>
-      <w:r>
-        <w:t xml:space="preserve"> is NOT a plain object</w:t>
+      <w:r>
+        <w:t>req is NOT a plain object</w:t>
       </w:r>
       <w:r>
         <w:br/>
@@ -1197,83 +952,27 @@
     </w:p>
     <w:p>
       <w:r>
-        <w:t>export default function handler(</w:t>
-      </w:r>
-      <w:proofErr w:type="spellStart"/>
-      <w:r>
-        <w:t>req</w:t>
-      </w:r>
-      <w:proofErr w:type="spellEnd"/>
-      <w:r>
-        <w:t>, res) {</w:t>
+        <w:t>export default function handler(req, res) {</w:t>
       </w:r>
       <w:r>
         <w:br/>
-        <w:t xml:space="preserve">  if (</w:t>
-      </w:r>
-      <w:proofErr w:type="spellStart"/>
-      <w:r>
-        <w:t>req.method</w:t>
-      </w:r>
-      <w:proofErr w:type="spellEnd"/>
-      <w:r>
-        <w:t xml:space="preserve"> === "POST") {</w:t>
+        <w:t xml:space="preserve">  if (req.method === "POST") {</w:t>
       </w:r>
       <w:r>
         <w:br/>
-        <w:t xml:space="preserve">    </w:t>
-      </w:r>
-      <w:proofErr w:type="spellStart"/>
-      <w:r>
-        <w:t>res.status</w:t>
-      </w:r>
-      <w:proofErr w:type="spellEnd"/>
-      <w:r>
-        <w:t>(200).</w:t>
-      </w:r>
-      <w:proofErr w:type="spellStart"/>
-      <w:r>
-        <w:t>json</w:t>
-      </w:r>
-      <w:proofErr w:type="spellEnd"/>
-      <w:r>
-        <w:t>({</w:t>
+        <w:t xml:space="preserve">    res.status(200).json({</w:t>
       </w:r>
       <w:r>
         <w:br/>
-        <w:t xml:space="preserve">      method: </w:t>
-      </w:r>
-      <w:proofErr w:type="spellStart"/>
-      <w:r>
-        <w:t>req.method</w:t>
-      </w:r>
-      <w:proofErr w:type="spellEnd"/>
-      <w:r>
-        <w:t>,</w:t>
+        <w:t xml:space="preserve">      method: req.method,</w:t>
       </w:r>
       <w:r>
         <w:br/>
-        <w:t xml:space="preserve">      body: </w:t>
-      </w:r>
-      <w:proofErr w:type="spellStart"/>
-      <w:r>
-        <w:t>req.body</w:t>
-      </w:r>
-      <w:proofErr w:type="spellEnd"/>
-      <w:r>
-        <w:t>,</w:t>
+        <w:t xml:space="preserve">      body: req.body,</w:t>
       </w:r>
       <w:r>
         <w:br/>
-        <w:t xml:space="preserve">      query: </w:t>
-      </w:r>
-      <w:proofErr w:type="spellStart"/>
-      <w:r>
-        <w:t>req.query</w:t>
-      </w:r>
-      <w:proofErr w:type="spellEnd"/>
-      <w:r>
-        <w:t>,</w:t>
+        <w:t xml:space="preserve">      query: req.query,</w:t>
       </w:r>
       <w:r>
         <w:br/>
@@ -1397,13 +1096,8 @@
             <w:hideMark/>
           </w:tcPr>
           <w:p>
-            <w:proofErr w:type="spellStart"/>
             <w:r>
-              <w:t>req</w:t>
-            </w:r>
-            <w:proofErr w:type="spellEnd"/>
-            <w:r>
-              <w:t xml:space="preserve"> (whole object)</w:t>
+              <w:t>req (whole object)</w:t>
             </w:r>
           </w:p>
         </w:tc>
@@ -1437,11 +1131,9 @@
             <w:hideMark/>
           </w:tcPr>
           <w:p>
-            <w:proofErr w:type="spellStart"/>
             <w:r>
               <w:t>req.body</w:t>
             </w:r>
-            <w:proofErr w:type="spellEnd"/>
           </w:p>
         </w:tc>
         <w:tc>
@@ -1474,11 +1166,9 @@
             <w:hideMark/>
           </w:tcPr>
           <w:p>
-            <w:proofErr w:type="spellStart"/>
             <w:r>
               <w:t>req.query</w:t>
             </w:r>
-            <w:proofErr w:type="spellEnd"/>
           </w:p>
         </w:tc>
         <w:tc>
@@ -1511,11 +1201,9 @@
             <w:hideMark/>
           </w:tcPr>
           <w:p>
-            <w:proofErr w:type="spellStart"/>
             <w:r>
               <w:t>req.method</w:t>
             </w:r>
-            <w:proofErr w:type="spellEnd"/>
           </w:p>
         </w:tc>
         <w:tc>
@@ -1567,15 +1255,7 @@
     </w:p>
     <w:p>
       <w:r>
-        <w:t>export async function POST(</w:t>
-      </w:r>
-      <w:proofErr w:type="spellStart"/>
-      <w:r>
-        <w:t>req</w:t>
-      </w:r>
-      <w:proofErr w:type="spellEnd"/>
-      <w:r>
-        <w:t>)</w:t>
+        <w:t>export async function POST(req)</w:t>
       </w:r>
     </w:p>
     <w:p>
@@ -1584,21 +1264,8 @@
       </w:r>
     </w:p>
     <w:p>
-      <w:proofErr w:type="spellStart"/>
-      <w:r>
-        <w:t>const</w:t>
-      </w:r>
-      <w:proofErr w:type="spellEnd"/>
-      <w:r>
-        <w:t xml:space="preserve"> body = await </w:t>
-      </w:r>
-      <w:proofErr w:type="spellStart"/>
-      <w:r>
-        <w:t>req.json</w:t>
-      </w:r>
-      <w:proofErr w:type="spellEnd"/>
-      <w:r>
-        <w:t>();</w:t>
+      <w:r>
+        <w:t>const body = await req.json();</w:t>
       </w:r>
     </w:p>
     <w:p>
@@ -1641,29 +1308,13 @@
       </w:pPr>
       <w:r>
         <w:lastRenderedPageBreak/>
-        <w:t xml:space="preserve">You didn’t see </w:t>
-      </w:r>
-      <w:proofErr w:type="spellStart"/>
-      <w:r>
-        <w:t>req</w:t>
-      </w:r>
-      <w:proofErr w:type="spellEnd"/>
-      <w:r>
-        <w:t xml:space="preserve"> in the response because it’s a complex object that cannot be directly converted to JSON—you need to se</w:t>
+        <w:t>You didn’t see req in the response because it’s a complex object that cannot be directly converted to JSON—you need to se</w:t>
       </w:r>
       <w:r>
         <w:t>n</w:t>
       </w:r>
       <w:r>
-        <w:t xml:space="preserve">d specific fields like </w:t>
-      </w:r>
-      <w:proofErr w:type="spellStart"/>
-      <w:r>
-        <w:t>req.body</w:t>
-      </w:r>
-      <w:proofErr w:type="spellEnd"/>
-      <w:r>
-        <w:t>.</w:t>
+        <w:t>d specific fields like req.body.</w:t>
       </w:r>
     </w:p>
     <w:p>
@@ -1780,31 +1431,7 @@
         <w:t xml:space="preserve"> is that </w:t>
       </w:r>
       <w:r>
-        <w:t xml:space="preserve">if suppose </w:t>
-      </w:r>
-      <w:proofErr w:type="spellStart"/>
-      <w:r>
-        <w:t>oint</w:t>
-      </w:r>
-      <w:proofErr w:type="spellEnd"/>
-      <w:r>
-        <w:t xml:space="preserve"> fail is failed to </w:t>
-      </w:r>
-      <w:proofErr w:type="spellStart"/>
-      <w:r>
-        <w:t>wiriteen</w:t>
-      </w:r>
-      <w:proofErr w:type="spellEnd"/>
-      <w:r>
-        <w:t xml:space="preserve"> an </w:t>
-      </w:r>
-      <w:proofErr w:type="spellStart"/>
-      <w:r>
-        <w:t>empyty</w:t>
-      </w:r>
-      <w:proofErr w:type="spellEnd"/>
-      <w:r>
-        <w:t xml:space="preserve"> fie is created </w:t>
+        <w:t xml:space="preserve">if suppose oint fail is failed to wiriteen an empyty fie is created </w:t>
       </w:r>
       <w:r>
         <w:t>problem can happen (maybe if we associate a number to a user who tries to contact (who knows))</w:t>
@@ -1866,15 +1493,7 @@
       </w:r>
       <w:r>
         <w:lastRenderedPageBreak/>
-        <w:t xml:space="preserve">This error we may face if we </w:t>
-      </w:r>
-      <w:proofErr w:type="spellStart"/>
-      <w:r>
-        <w:t>son’t</w:t>
-      </w:r>
-      <w:proofErr w:type="spellEnd"/>
-      <w:r>
-        <w:t xml:space="preserve"> set the value of the input fields </w:t>
+        <w:t xml:space="preserve">This error we may face if we son’t set the value of the input fields </w:t>
       </w:r>
     </w:p>
     <w:p>
@@ -1882,15 +1501,7 @@
         <w:t xml:space="preserve">In older version </w:t>
       </w:r>
       <w:r>
-        <w:t xml:space="preserve">we used to put the state value in between the </w:t>
-      </w:r>
-      <w:proofErr w:type="spellStart"/>
-      <w:r>
-        <w:t>textarea</w:t>
-      </w:r>
-      <w:proofErr w:type="spellEnd"/>
-      <w:r>
-        <w:t xml:space="preserve"> element</w:t>
+        <w:t>we used to put the state value in between the textarea element</w:t>
       </w:r>
       <w:r>
         <w:t>(who knows may be I am wrong here)</w:t>
@@ -1899,70 +1510,20 @@
         <w:t xml:space="preserve"> </w:t>
       </w:r>
       <w:r>
-        <w:t xml:space="preserve">and on state update method we used </w:t>
-      </w:r>
-      <w:proofErr w:type="spellStart"/>
-      <w:r>
-        <w:t>e.target.innerText</w:t>
-      </w:r>
-      <w:proofErr w:type="spellEnd"/>
-    </w:p>
-    <w:p>
-      <w:r>
-        <w:t xml:space="preserve">But now in </w:t>
-      </w:r>
-      <w:proofErr w:type="spellStart"/>
-      <w:r>
-        <w:t>Textare</w:t>
-      </w:r>
-      <w:proofErr w:type="spellEnd"/>
-      <w:r>
-        <w:t xml:space="preserve"> we can use </w:t>
-      </w:r>
-      <w:proofErr w:type="spellStart"/>
-      <w:r>
-        <w:t>e.target,value</w:t>
-      </w:r>
-      <w:proofErr w:type="spellEnd"/>
-      <w:r>
-        <w:t xml:space="preserve"> as value attribute is used in the </w:t>
-      </w:r>
-      <w:proofErr w:type="spellStart"/>
-      <w:r>
-        <w:t>Textfi</w:t>
+        <w:t>and on state update method we used e.target.innerText</w:t>
+      </w:r>
+    </w:p>
+    <w:p>
+      <w:r>
+        <w:t>But now in Textare we can use e.target,value as value attribute is used in the Textfi</w:t>
       </w:r>
       <w:r>
         <w:t>eld</w:t>
       </w:r>
-      <w:proofErr w:type="spellEnd"/>
-    </w:p>
-    <w:p>
-      <w:r>
-        <w:t xml:space="preserve">The API may not give </w:t>
-      </w:r>
-      <w:proofErr w:type="spellStart"/>
-      <w:r>
-        <w:t>json</w:t>
-      </w:r>
-      <w:proofErr w:type="spellEnd"/>
-      <w:r>
-        <w:t xml:space="preserve"> response but instead </w:t>
-      </w:r>
-      <w:proofErr w:type="spellStart"/>
-      <w:r>
-        <w:t>uit</w:t>
-      </w:r>
-      <w:proofErr w:type="spellEnd"/>
-      <w:r>
-        <w:t xml:space="preserve"> may text </w:t>
-      </w:r>
-      <w:proofErr w:type="spellStart"/>
-      <w:r>
-        <w:t>reponse</w:t>
-      </w:r>
-      <w:proofErr w:type="spellEnd"/>
-      <w:r>
-        <w:t xml:space="preserve"> who knows and we can parse it by text method in response we are fetching</w:t>
+    </w:p>
+    <w:p>
+      <w:r>
+        <w:t>The API may not give json response but instead uit may text reponse who knows and we can parse it by text method in response we are fetching</w:t>
       </w:r>
       <w:r>
         <w:t xml:space="preserve"> as shown below</w:t>
@@ -2034,15 +1595,7 @@
     </w:p>
     <w:p>
       <w:r>
-        <w:t xml:space="preserve">Shortcut for </w:t>
-      </w:r>
-      <w:proofErr w:type="spellStart"/>
-      <w:r>
-        <w:t>margin:auto</w:t>
-      </w:r>
-      <w:proofErr w:type="spellEnd"/>
-      <w:r>
-        <w:t xml:space="preserve"> will be </w:t>
+        <w:t xml:space="preserve">Shortcut for margin:auto will be </w:t>
       </w:r>
       <w:r>
         <w:rPr>
@@ -2059,25 +1612,12 @@
         <w:t xml:space="preserve"> </w:t>
       </w:r>
       <w:r>
-        <w:t xml:space="preserve">in </w:t>
-      </w:r>
-      <w:proofErr w:type="spellStart"/>
-      <w:r>
-        <w:t>VSCode</w:t>
-      </w:r>
-      <w:proofErr w:type="spellEnd"/>
-    </w:p>
-    <w:p>
-      <w:r>
-        <w:t xml:space="preserve">In name of logic we forgot to style </w:t>
-      </w:r>
-      <w:proofErr w:type="spellStart"/>
-      <w:r>
-        <w:t>outpages</w:t>
-      </w:r>
-      <w:proofErr w:type="spellEnd"/>
-      <w:r>
-        <w:t xml:space="preserve"> are not responsive which teacher will talk about in upcoming lesson </w:t>
+        <w:t>in VSCode</w:t>
+      </w:r>
+    </w:p>
+    <w:p>
+      <w:r>
+        <w:t xml:space="preserve">In name of logic we forgot to style outpages are not responsive which teacher will talk about in upcoming lesson </w:t>
       </w:r>
       <w:r>
         <w:t xml:space="preserve">we will see how to keep styling of </w:t>
@@ -2141,15 +1681,7 @@
         <w:t xml:space="preserve">by infinite scroll </w:t>
       </w:r>
       <w:r>
-        <w:t xml:space="preserve">like </w:t>
-      </w:r>
-      <w:proofErr w:type="spellStart"/>
-      <w:r>
-        <w:t>facebook</w:t>
-      </w:r>
-      <w:proofErr w:type="spellEnd"/>
-      <w:r>
-        <w:t xml:space="preserve"> news feed </w:t>
+        <w:t xml:space="preserve">like facebook news feed </w:t>
       </w:r>
       <w:r>
         <w:t>you keep scrolling and new thing appears</w:t>
@@ -2178,38 +1710,30 @@
         <w:t xml:space="preserve"> observer</w:t>
       </w:r>
       <w:r>
-        <w:t xml:space="preserve"> </w:t>
-      </w:r>
-      <w:proofErr w:type="spellStart"/>
-      <w:r>
-        <w:t>api</w:t>
-      </w:r>
-      <w:proofErr w:type="spellEnd"/>
-      <w:r>
+        <w:t xml:space="preserve"> api. </w:t>
+      </w:r>
+    </w:p>
+    <w:p>
+      <w:pPr>
+        <w:rPr>
+          <w:b/>
+          <w:bCs/>
+        </w:rPr>
+      </w:pPr>
+      <w:r>
+        <w:rPr>
+          <w:b/>
+          <w:bCs/>
+        </w:rPr>
+        <w:t>The Intersection Observer API is a web API that allows developers to asynchronously observe changes in the visibility of a target element relative to an ancestor element or the viewport. It is commonly used for features like lazy-loading images and implementing infinite scrolling on websites but we don’t do here just to save our time</w:t>
+      </w:r>
+      <w:r>
+        <w:rPr>
+          <w:b/>
+          <w:bCs/>
+        </w:rPr>
         <w:t xml:space="preserve">. </w:t>
       </w:r>
-    </w:p>
-    <w:p>
-      <w:pPr>
-        <w:rPr>
-          <w:b/>
-          <w:bCs/>
-        </w:rPr>
-      </w:pPr>
-      <w:r>
-        <w:rPr>
-          <w:b/>
-          <w:bCs/>
-        </w:rPr>
-        <w:t>The Intersection Observer API is a web API that allows developers to asynchronously observe changes in the visibility of a target element relative to an ancestor element or the viewport. It is commonly used for features like lazy-loading images and implementing infinite scrolling on websites but we don’t do here just to save our time</w:t>
-      </w:r>
-      <w:r>
-        <w:rPr>
-          <w:b/>
-          <w:bCs/>
-        </w:rPr>
-        <w:t xml:space="preserve">. </w:t>
-      </w:r>
       <w:r>
         <w:rPr>
           <w:b/>
@@ -2222,23 +1746,7 @@
           <w:b/>
           <w:bCs/>
         </w:rPr>
-        <w:t xml:space="preserve">which </w:t>
-      </w:r>
-      <w:proofErr w:type="spellStart"/>
-      <w:r>
-        <w:rPr>
-          <w:b/>
-          <w:bCs/>
-        </w:rPr>
-        <w:t>id</w:t>
-      </w:r>
-      <w:proofErr w:type="spellEnd"/>
-      <w:r>
-        <w:rPr>
-          <w:b/>
-          <w:bCs/>
-        </w:rPr>
-        <w:t xml:space="preserve"> already made for us </w:t>
+        <w:t xml:space="preserve">which id already made for us </w:t>
       </w:r>
     </w:p>
     <w:p>
@@ -2260,21 +1768,12 @@
           <w:bCs/>
         </w:rPr>
       </w:pPr>
-      <w:proofErr w:type="spellStart"/>
-      <w:r>
-        <w:rPr>
-          <w:b/>
-          <w:bCs/>
-        </w:rPr>
-        <w:t>npm</w:t>
-      </w:r>
-      <w:proofErr w:type="spellEnd"/>
-      <w:r>
-        <w:rPr>
-          <w:b/>
-          <w:bCs/>
-        </w:rPr>
-        <w:t xml:space="preserve"> install --save react-infinite-scroll-component</w:t>
+      <w:r>
+        <w:rPr>
+          <w:b/>
+          <w:bCs/>
+        </w:rPr>
+        <w:t>npm install --save react-infinite-scroll-component</w:t>
       </w:r>
     </w:p>
     <w:p>
@@ -2386,11 +1885,9 @@
       <w:r>
         <w:t xml:space="preserve">The props below the </w:t>
       </w:r>
-      <w:proofErr w:type="spellStart"/>
       <w:r>
         <w:t>endMessage</w:t>
       </w:r>
-      <w:proofErr w:type="spellEnd"/>
       <w:r>
         <w:t xml:space="preserve"> </w:t>
       </w:r>
@@ -2418,15 +1915,7 @@
     </w:p>
     <w:p>
       <w:r>
-        <w:t xml:space="preserve">You can use </w:t>
-      </w:r>
-      <w:proofErr w:type="spellStart"/>
-      <w:r>
-        <w:t>InfiniteScroll</w:t>
-      </w:r>
-      <w:proofErr w:type="spellEnd"/>
-      <w:r>
-        <w:t xml:space="preserve"> only in client side so </w:t>
+        <w:t xml:space="preserve">You can use InfiniteScroll only in client side so </w:t>
       </w:r>
       <w:r>
         <w:t xml:space="preserve">we need to use it in client component so we will change the blogs from SSG to client component. </w:t>
@@ -2445,13 +1934,8 @@
       <w:r>
         <w:t xml:space="preserve">we use any library </w:t>
       </w:r>
-      <w:proofErr w:type="spellStart"/>
-      <w:r>
-        <w:t>onw</w:t>
-      </w:r>
-      <w:proofErr w:type="spellEnd"/>
-      <w:r>
-        <w:t xml:space="preserve"> imp</w:t>
+      <w:r>
+        <w:t>onw imp</w:t>
       </w:r>
       <w:r>
         <w:t>o</w:t>
@@ -2475,15 +1959,7 @@
         <w:t xml:space="preserve">ined </w:t>
       </w:r>
       <w:r>
-        <w:t xml:space="preserve">is it </w:t>
-      </w:r>
-      <w:proofErr w:type="spellStart"/>
-      <w:r>
-        <w:t>idefined</w:t>
-      </w:r>
-      <w:proofErr w:type="spellEnd"/>
-      <w:r>
-        <w:t xml:space="preserve"> like that you have t</w:t>
+        <w:t>is it idefined like that you have t</w:t>
       </w:r>
       <w:r>
         <w:t xml:space="preserve">o </w:t>
@@ -2586,26 +2062,10 @@
         <w:t xml:space="preserve"> it was an addon</w:t>
       </w:r>
       <w:r>
-        <w:t xml:space="preserve"> if you gave it then it was a </w:t>
-      </w:r>
-      <w:proofErr w:type="spellStart"/>
-      <w:r>
-        <w:t>favor</w:t>
-      </w:r>
-      <w:proofErr w:type="spellEnd"/>
-      <w:r>
-        <w:t xml:space="preserve"> </w:t>
-      </w:r>
-      <w:r>
-        <w:t xml:space="preserve">you can say bit in </w:t>
-      </w:r>
-      <w:proofErr w:type="spellStart"/>
-      <w:r>
-        <w:t>todays</w:t>
-      </w:r>
-      <w:proofErr w:type="spellEnd"/>
-      <w:r>
-        <w:t xml:space="preserve"> time </w:t>
+        <w:t xml:space="preserve"> if you gave it then it was a favor </w:t>
+      </w:r>
+      <w:r>
+        <w:t xml:space="preserve">you can say bit in todays time </w:t>
       </w:r>
       <w:r>
         <w:t xml:space="preserve">if you are delivering a website </w:t>
@@ -2876,23 +2336,7 @@
     </w:p>
     <w:p>
       <w:r>
-        <w:t xml:space="preserve">It is very simple </w:t>
-      </w:r>
-      <w:proofErr w:type="spellStart"/>
-      <w:r>
-        <w:t>an</w:t>
-      </w:r>
-      <w:proofErr w:type="spellEnd"/>
-      <w:r>
-        <w:t xml:space="preserve"> it </w:t>
-      </w:r>
-      <w:proofErr w:type="spellStart"/>
-      <w:r>
-        <w:t>wil</w:t>
-      </w:r>
-      <w:proofErr w:type="spellEnd"/>
-      <w:r>
-        <w:t xml:space="preserve"> automatically detect your application </w:t>
+        <w:t xml:space="preserve">It is very simple an it wil automatically detect your application </w:t>
       </w:r>
     </w:p>
     <w:p>
@@ -2903,23 +2347,7 @@
         <w:t>d</w:t>
       </w:r>
       <w:r>
-        <w:t xml:space="preserve"> use it like a node ap </w:t>
-      </w:r>
-      <w:proofErr w:type="spellStart"/>
-      <w:r>
-        <w:t>hten</w:t>
-      </w:r>
-      <w:proofErr w:type="spellEnd"/>
-      <w:r>
-        <w:t xml:space="preserve"> it will be good(</w:t>
-      </w:r>
-      <w:proofErr w:type="spellStart"/>
-      <w:r>
-        <w:t>wjp</w:t>
-      </w:r>
-      <w:proofErr w:type="spellEnd"/>
-      <w:r>
-        <w:t xml:space="preserve"> knows)</w:t>
+        <w:t xml:space="preserve"> use it like a node ap hten it will be good(wjp knows)</w:t>
       </w:r>
     </w:p>
     <w:p>
@@ -2944,16 +2372,15 @@
           <w:bCs/>
           <w:color w:val="EE0000"/>
         </w:rPr>
-        <w:t xml:space="preserve">error in </w:t>
-      </w:r>
-      <w:proofErr w:type="spellStart"/>
+        <w:t>error in js</w:t>
+      </w:r>
       <w:r>
         <w:rPr>
           <w:b/>
           <w:bCs/>
           <w:color w:val="EE0000"/>
         </w:rPr>
-        <w:t>js</w:t>
+        <w:t>x in Nextjs or maybe in React.</w:t>
       </w:r>
       <w:r>
         <w:rPr>
@@ -2961,41 +2388,6 @@
           <w:bCs/>
           <w:color w:val="EE0000"/>
         </w:rPr>
-        <w:t>x</w:t>
-      </w:r>
-      <w:proofErr w:type="spellEnd"/>
-      <w:r>
-        <w:rPr>
-          <w:b/>
-          <w:bCs/>
-          <w:color w:val="EE0000"/>
-        </w:rPr>
-        <w:t xml:space="preserve"> in </w:t>
-      </w:r>
-      <w:proofErr w:type="spellStart"/>
-      <w:r>
-        <w:rPr>
-          <w:b/>
-          <w:bCs/>
-          <w:color w:val="EE0000"/>
-        </w:rPr>
-        <w:t>Nextjs</w:t>
-      </w:r>
-      <w:proofErr w:type="spellEnd"/>
-      <w:r>
-        <w:rPr>
-          <w:b/>
-          <w:bCs/>
-          <w:color w:val="EE0000"/>
-        </w:rPr>
-        <w:t xml:space="preserve"> or maybe in React.</w:t>
-      </w:r>
-      <w:r>
-        <w:rPr>
-          <w:b/>
-          <w:bCs/>
-          <w:color w:val="EE0000"/>
-        </w:rPr>
         <w:t>(maybe it is an outdated problem)</w:t>
       </w:r>
     </w:p>
@@ -3018,15 +2410,7 @@
         <w:t xml:space="preserve">that </w:t>
       </w:r>
       <w:r>
-        <w:t xml:space="preserve">you can make it like that and if it </w:t>
-      </w:r>
-      <w:proofErr w:type="spellStart"/>
-      <w:r>
-        <w:t>become</w:t>
-      </w:r>
-      <w:proofErr w:type="spellEnd"/>
-      <w:r>
-        <w:t xml:space="preserve"> profitable then you can scale it (who knows) </w:t>
+        <w:t xml:space="preserve">you can make it like that and if it become profitable then you can scale it (who knows) </w:t>
       </w:r>
     </w:p>
     <w:p>
@@ -3140,15 +2524,7 @@
         <w:t>how Google analytics and search console</w:t>
       </w:r>
       <w:r>
-        <w:t xml:space="preserve">(who </w:t>
-      </w:r>
-      <w:proofErr w:type="spellStart"/>
-      <w:r>
-        <w:t>knowa</w:t>
-      </w:r>
-      <w:proofErr w:type="spellEnd"/>
-      <w:r>
-        <w:t>)</w:t>
+        <w:t>(who knowa)</w:t>
       </w:r>
       <w:r>
         <w:t xml:space="preserve"> </w:t>
@@ -3164,13 +2540,8 @@
       </w:r>
     </w:p>
     <w:p>
-      <w:proofErr w:type="spellStart"/>
-      <w:r>
-        <w:t>Nextjs</w:t>
-      </w:r>
-      <w:proofErr w:type="spellEnd"/>
-      <w:r>
-        <w:t xml:space="preserve"> </w:t>
+      <w:r>
+        <w:t xml:space="preserve">Nextjs </w:t>
       </w:r>
       <w:r>
         <w:t>d</w:t>
@@ -3603,15 +2974,7 @@
     <w:p>
       <w:r>
         <w:lastRenderedPageBreak/>
-        <w:t xml:space="preserve">Now we will make an </w:t>
-      </w:r>
-      <w:proofErr w:type="spellStart"/>
-      <w:r>
-        <w:t>ecomerce</w:t>
-      </w:r>
-      <w:proofErr w:type="spellEnd"/>
-      <w:r>
-        <w:t xml:space="preserve"> store </w:t>
+        <w:t xml:space="preserve">Now we will make an ecomerce store </w:t>
       </w:r>
       <w:r>
         <w:t xml:space="preserve">and we will make pages like </w:t>
@@ -3659,15 +3022,7 @@
         <w:t xml:space="preserve">teacher will teach us </w:t>
       </w:r>
       <w:r>
-        <w:t xml:space="preserve">We name it </w:t>
-      </w:r>
-      <w:proofErr w:type="spellStart"/>
-      <w:r>
-        <w:t>codeswear</w:t>
-      </w:r>
-      <w:proofErr w:type="spellEnd"/>
-      <w:r>
-        <w:t xml:space="preserve"> it will be an ecommerce store where we will list our product </w:t>
+        <w:t xml:space="preserve">We name it codeswear it will be an ecommerce store where we will list our product </w:t>
       </w:r>
       <w:r>
         <w:t xml:space="preserve">So we type the command </w:t>
@@ -3693,23 +3048,7 @@
           <w:b/>
           <w:bCs/>
         </w:rPr>
-        <w:t xml:space="preserve"> &lt;</w:t>
-      </w:r>
-      <w:proofErr w:type="spellStart"/>
-      <w:r>
-        <w:rPr>
-          <w:b/>
-          <w:bCs/>
-        </w:rPr>
-        <w:t>appname</w:t>
-      </w:r>
-      <w:proofErr w:type="spellEnd"/>
-      <w:r>
-        <w:rPr>
-          <w:b/>
-          <w:bCs/>
-        </w:rPr>
-        <w:t>&gt;</w:t>
+        <w:t xml:space="preserve"> &lt;appname&gt;</w:t>
       </w:r>
     </w:p>
     <w:p>
@@ -3754,11 +3093,7 @@
         <w:t xml:space="preserve">Now we will see how to setup </w:t>
       </w:r>
       <w:r>
-        <w:t xml:space="preserve">up tailwind with </w:t>
-      </w:r>
-      <w:proofErr w:type="spellStart"/>
-      <w:r>
-        <w:t>Ne</w:t>
+        <w:t>up tailwind with Ne</w:t>
       </w:r>
       <w:r>
         <w:t>x</w:t>
@@ -3766,7 +3101,6 @@
       <w:r>
         <w:t>tjs</w:t>
       </w:r>
-      <w:proofErr w:type="spellEnd"/>
       <w:r>
         <w:t>,</w:t>
       </w:r>
@@ -3783,126 +3117,80 @@
         <w:t xml:space="preserve">optimally </w:t>
       </w:r>
       <w:r>
-        <w:t xml:space="preserve">and will make a black slate of </w:t>
-      </w:r>
-      <w:proofErr w:type="spellStart"/>
-      <w:r>
-        <w:t>codeswear</w:t>
-      </w:r>
-      <w:proofErr w:type="spellEnd"/>
+        <w:t xml:space="preserve">and will make a black slate of codeswear </w:t>
+      </w:r>
+      <w:r>
+        <w:t>(who knows)</w:t>
+      </w:r>
+    </w:p>
+    <w:p>
+      <w:pPr>
+        <w:rPr>
+          <w:b/>
+          <w:bCs/>
+        </w:rPr>
+      </w:pPr>
+      <w:r>
+        <w:rPr>
+          <w:b/>
+          <w:bCs/>
+        </w:rPr>
+        <w:t>A blank slate of a website means starting the website from scratch with no existing design, content, or structure.</w:t>
+      </w:r>
+    </w:p>
+    <w:p>
+      <w:r>
+        <w:t>We will search tailwind css with nextjs</w:t>
+      </w:r>
       <w:r>
         <w:t xml:space="preserve"> </w:t>
       </w:r>
       <w:r>
-        <w:t>(who knows)</w:t>
-      </w:r>
-    </w:p>
-    <w:p>
-      <w:pPr>
-        <w:rPr>
-          <w:b/>
-          <w:bCs/>
-        </w:rPr>
-      </w:pPr>
-      <w:r>
-        <w:rPr>
-          <w:b/>
-          <w:bCs/>
-        </w:rPr>
-        <w:t>A blank slate of a website means starting the website from scratch with no existing design, content, or structure.</w:t>
-      </w:r>
-    </w:p>
-    <w:p>
-      <w:r>
-        <w:t xml:space="preserve">We will search tailwind css with </w:t>
-      </w:r>
-      <w:proofErr w:type="spellStart"/>
-      <w:r>
-        <w:t>nextjs</w:t>
-      </w:r>
-      <w:proofErr w:type="spellEnd"/>
+        <w:t xml:space="preserve">so </w:t>
+      </w:r>
+      <w:r>
+        <w:t>b</w:t>
+      </w:r>
+      <w:r>
+        <w:t xml:space="preserve">y this we will go to official documentation </w:t>
+      </w:r>
+    </w:p>
+    <w:p>
+      <w:r>
+        <w:t>Now in out project folder type thi</w:t>
+      </w:r>
+      <w:r>
+        <w:t xml:space="preserve">s </w:t>
+      </w:r>
+      <w:r>
+        <w:t xml:space="preserve">cammand </w:t>
+      </w:r>
+    </w:p>
+    <w:p>
+      <w:r>
+        <w:t>npm install tailwindcss @tailwindcss/postcss postcss</w:t>
+      </w:r>
       <w:r>
         <w:t xml:space="preserve"> </w:t>
       </w:r>
-      <w:r>
-        <w:t xml:space="preserve">so </w:t>
-      </w:r>
-      <w:r>
-        <w:t>b</w:t>
-      </w:r>
-      <w:r>
-        <w:t xml:space="preserve">y this we will go to official documentation </w:t>
-      </w:r>
-    </w:p>
-    <w:p>
-      <w:r>
-        <w:t>Now in out project folder type thi</w:t>
-      </w:r>
-      <w:r>
-        <w:t xml:space="preserve">s </w:t>
-      </w:r>
-      <w:proofErr w:type="spellStart"/>
-      <w:r>
-        <w:t>cammand</w:t>
-      </w:r>
-      <w:proofErr w:type="spellEnd"/>
+    </w:p>
+    <w:p>
+      <w:r>
+        <w:t>or</w:t>
+      </w:r>
+    </w:p>
+    <w:p>
+      <w:r>
+        <w:t xml:space="preserve"> yarn add </w:t>
+      </w:r>
+      <w:r>
+        <w:t>tailwindcss @tailwindcss/postcss postcss</w:t>
+      </w:r>
       <w:r>
         <w:t xml:space="preserve"> </w:t>
       </w:r>
     </w:p>
     <w:p>
-      <w:proofErr w:type="spellStart"/>
-      <w:r>
-        <w:t>npm</w:t>
-      </w:r>
-      <w:proofErr w:type="spellEnd"/>
-      <w:r>
-        <w:t xml:space="preserve"> install </w:t>
-      </w:r>
-      <w:proofErr w:type="spellStart"/>
-      <w:r>
-        <w:t>tailwindcss</w:t>
-      </w:r>
-      <w:proofErr w:type="spellEnd"/>
-      <w:r>
-        <w:t xml:space="preserve"> @tailwindcss/postcss </w:t>
-      </w:r>
-      <w:proofErr w:type="spellStart"/>
-      <w:r>
-        <w:t>postcss</w:t>
-      </w:r>
-      <w:proofErr w:type="spellEnd"/>
-      <w:r>
-        <w:t xml:space="preserve"> </w:t>
-      </w:r>
-    </w:p>
-    <w:p>
-      <w:r>
-        <w:t>or</w:t>
-      </w:r>
-    </w:p>
-    <w:p>
-      <w:r>
-        <w:t xml:space="preserve"> yarn add </w:t>
-      </w:r>
-      <w:proofErr w:type="spellStart"/>
-      <w:r>
-        <w:t>tailwindcss</w:t>
-      </w:r>
-      <w:proofErr w:type="spellEnd"/>
-      <w:r>
-        <w:t xml:space="preserve"> @tailwindcss/postcss </w:t>
-      </w:r>
-      <w:proofErr w:type="spellStart"/>
-      <w:r>
-        <w:t>postcss</w:t>
-      </w:r>
-      <w:proofErr w:type="spellEnd"/>
-      <w:r>
-        <w:t xml:space="preserve"> </w:t>
-      </w:r>
-    </w:p>
-    <w:p>
       <w:r>
         <w:t>Now the method tea</w:t>
       </w:r>
@@ -3916,15 +3204,7 @@
         <w:t>e</w:t>
       </w:r>
       <w:r>
-        <w:t xml:space="preserve">r is using is </w:t>
-      </w:r>
-      <w:proofErr w:type="spellStart"/>
-      <w:r>
-        <w:t>autdated</w:t>
-      </w:r>
-      <w:proofErr w:type="spellEnd"/>
-      <w:r>
-        <w:t xml:space="preserve"> so we will use moder</w:t>
+        <w:t>r is using is autdated so we will use moder</w:t>
       </w:r>
       <w:r>
         <w:t>n</w:t>
@@ -4088,29 +3368,19 @@
         <w:t xml:space="preserve"> order</w:t>
       </w:r>
       <w:r>
-        <w:t xml:space="preserve"> , login and </w:t>
-      </w:r>
-      <w:proofErr w:type="spellStart"/>
-      <w:r>
-        <w:t>signUp</w:t>
-      </w:r>
-      <w:proofErr w:type="spellEnd"/>
+        <w:t xml:space="preserve"> , login and signUp</w:t>
+      </w:r>
       <w:r>
         <w:t xml:space="preserve">. We will create their blank slate here </w:t>
       </w:r>
       <w:r>
         <w:t xml:space="preserve">and then we will start </w:t>
       </w:r>
-      <w:proofErr w:type="spellStart"/>
       <w:r>
         <w:t>c</w:t>
       </w:r>
       <w:r>
-        <w:t>odeswear</w:t>
-      </w:r>
-      <w:proofErr w:type="spellEnd"/>
-      <w:r>
-        <w:t xml:space="preserve"> development </w:t>
+        <w:t xml:space="preserve">odeswear development </w:t>
       </w:r>
     </w:p>
     <w:p>
@@ -4165,64 +3435,27 @@
     </w:p>
     <w:p>
       <w:r>
-        <w:t xml:space="preserve">We will use app for that purposes(maybe </w:t>
-      </w:r>
-      <w:proofErr w:type="spellStart"/>
-      <w:r>
-        <w:t>ol</w:t>
-      </w:r>
-      <w:proofErr w:type="spellEnd"/>
-      <w:r>
-        <w:t xml:space="preserve"> version of </w:t>
-      </w:r>
-      <w:proofErr w:type="spellStart"/>
-      <w:r>
-        <w:t>layout.jsx</w:t>
-      </w:r>
-      <w:proofErr w:type="spellEnd"/>
-      <w:r>
-        <w:t>)</w:t>
-      </w:r>
-    </w:p>
-    <w:p>
-      <w:r>
-        <w:t xml:space="preserve">Now there is site that is </w:t>
-      </w:r>
-      <w:proofErr w:type="spellStart"/>
-      <w:r>
-        <w:t>Tailblocks</w:t>
-      </w:r>
-      <w:proofErr w:type="spellEnd"/>
-      <w:r>
-        <w:t xml:space="preserve"> that will give you </w:t>
-      </w:r>
-      <w:proofErr w:type="spellStart"/>
-      <w:r>
-        <w:t>tailblocks</w:t>
-      </w:r>
-      <w:proofErr w:type="spellEnd"/>
+        <w:t>We will use app for that purposes(maybe ol version of layout.jsx)</w:t>
+      </w:r>
+    </w:p>
+    <w:p>
+      <w:r>
+        <w:t xml:space="preserve">Now there is site that is Tailblocks that will give you </w:t>
+      </w:r>
+      <w:r>
+        <w:t xml:space="preserve">tailblocks </w:t>
+      </w:r>
+      <w:r>
+        <w:t xml:space="preserve">snippet </w:t>
+      </w:r>
+      <w:r>
+        <w:t xml:space="preserve">here you get minimalistic design </w:t>
+      </w:r>
       <w:r>
         <w:t xml:space="preserve"> </w:t>
       </w:r>
       <w:r>
-        <w:t xml:space="preserve">snippet </w:t>
-      </w:r>
-      <w:r>
-        <w:t xml:space="preserve">here you get minimalistic design </w:t>
-      </w:r>
-      <w:r>
-        <w:t xml:space="preserve"> </w:t>
-      </w:r>
-      <w:r>
-        <w:t xml:space="preserve">Here you get </w:t>
-      </w:r>
-      <w:proofErr w:type="spellStart"/>
-      <w:r>
-        <w:t>Ecommerece</w:t>
-      </w:r>
-      <w:proofErr w:type="spellEnd"/>
-      <w:r>
-        <w:t xml:space="preserve"> design</w:t>
+        <w:t>Here you get Ecommerece design</w:t>
       </w:r>
     </w:p>
     <w:p>
@@ -4240,23 +3473,7 @@
     </w:p>
     <w:p>
       <w:r>
-        <w:t xml:space="preserve">In </w:t>
-      </w:r>
-      <w:proofErr w:type="spellStart"/>
-      <w:r>
-        <w:t>tailwiond</w:t>
-      </w:r>
-      <w:proofErr w:type="spellEnd"/>
-      <w:r>
-        <w:t xml:space="preserve"> code you might need </w:t>
-      </w:r>
-      <w:proofErr w:type="spellStart"/>
-      <w:r>
-        <w:t>ot</w:t>
-      </w:r>
-      <w:proofErr w:type="spellEnd"/>
-      <w:r>
-        <w:t xml:space="preserve"> replace </w:t>
+        <w:t xml:space="preserve">In tailwiond code you might need ot replace </w:t>
       </w:r>
     </w:p>
     <w:p>
@@ -4265,78 +3482,45 @@
           <w:i/>
           <w:iCs/>
         </w:rPr>
-        <w:t>stroke-</w:t>
-      </w:r>
-      <w:proofErr w:type="spellStart"/>
+        <w:t>stroke-linecap</w:t>
+      </w:r>
       <w:r>
         <w:rPr>
           <w:i/>
           <w:iCs/>
         </w:rPr>
-        <w:t>linecap</w:t>
-      </w:r>
-      <w:proofErr w:type="spellEnd"/>
+        <w:t xml:space="preserve"> </w:t>
+      </w:r>
+      <w:r>
+        <w:t>by strokeLineCap</w:t>
+      </w:r>
+    </w:p>
+    <w:p>
       <w:r>
         <w:rPr>
           <w:i/>
           <w:iCs/>
         </w:rPr>
-        <w:t xml:space="preserve"> </w:t>
-      </w:r>
-      <w:r>
-        <w:t xml:space="preserve">by </w:t>
-      </w:r>
-      <w:proofErr w:type="spellStart"/>
-      <w:r>
-        <w:t>strokeLineCap</w:t>
-      </w:r>
-      <w:proofErr w:type="spellEnd"/>
-    </w:p>
-    <w:p>
+        <w:t>stroke-linejoin</w:t>
+      </w:r>
       <w:r>
         <w:rPr>
           <w:i/>
           <w:iCs/>
         </w:rPr>
-        <w:t>stroke-</w:t>
-      </w:r>
-      <w:proofErr w:type="spellStart"/>
-      <w:r>
-        <w:rPr>
-          <w:i/>
-          <w:iCs/>
-        </w:rPr>
-        <w:t>linejoin</w:t>
-      </w:r>
-      <w:proofErr w:type="spellEnd"/>
-      <w:r>
-        <w:rPr>
-          <w:i/>
-          <w:iCs/>
-        </w:rPr>
         <w:t xml:space="preserve"> </w:t>
       </w:r>
       <w:r>
-        <w:t xml:space="preserve">by </w:t>
-      </w:r>
-      <w:proofErr w:type="spellStart"/>
-      <w:r>
-        <w:t>strokeLineJoin</w:t>
-      </w:r>
-      <w:proofErr w:type="spellEnd"/>
+        <w:t>by strokeLineJoin</w:t>
+      </w:r>
     </w:p>
     <w:p>
       <w:r>
         <w:t>stroke-width</w:t>
       </w:r>
       <w:r>
-        <w:t xml:space="preserve"> by </w:t>
-      </w:r>
-      <w:proofErr w:type="spellStart"/>
-      <w:r>
-        <w:t>StrokeWidth</w:t>
-      </w:r>
-      <w:proofErr w:type="spellEnd"/>
+        <w:t xml:space="preserve"> by StrokeWidth</w:t>
+      </w:r>
     </w:p>
     <w:p>
       <w:r>
@@ -4357,11 +3541,9 @@
       <w:r>
         <w:t xml:space="preserve"> but not now but if you still want to use them then you need to add a Boolean attribute that is </w:t>
       </w:r>
-      <w:proofErr w:type="spellStart"/>
       <w:r>
         <w:t>legacyBehaviour</w:t>
       </w:r>
-      <w:proofErr w:type="spellEnd"/>
     </w:p>
     <w:p>
       <w:pPr>
@@ -4382,23 +3564,7 @@
           <w:b/>
           <w:bCs/>
         </w:rPr>
-        <w:t xml:space="preserve">Image or maybe in </w:t>
-      </w:r>
-      <w:proofErr w:type="spellStart"/>
-      <w:r>
-        <w:rPr>
-          <w:b/>
-          <w:bCs/>
-        </w:rPr>
-        <w:t>Nextjs</w:t>
-      </w:r>
-      <w:proofErr w:type="spellEnd"/>
-      <w:r>
-        <w:rPr>
-          <w:b/>
-          <w:bCs/>
-        </w:rPr>
-        <w:t xml:space="preserve"> general</w:t>
+        <w:t>Image or maybe in Nextjs general</w:t>
       </w:r>
     </w:p>
     <w:p>
@@ -4423,15 +3589,7 @@
     </w:p>
     <w:p>
       <w:r>
-        <w:t xml:space="preserve">&lt;Image </w:t>
-      </w:r>
-      <w:proofErr w:type="spellStart"/>
-      <w:r>
-        <w:t>src</w:t>
-      </w:r>
-      <w:proofErr w:type="spellEnd"/>
-      <w:r>
-        <w:t>="home.jpg" /&gt;</w:t>
+        <w:t>&lt;Image src="home.jpg" /&gt;</w:t>
       </w:r>
     </w:p>
     <w:p>
@@ -4456,15 +3614,7 @@
     </w:p>
     <w:p>
       <w:r>
-        <w:t xml:space="preserve">&lt;Image </w:t>
-      </w:r>
-      <w:proofErr w:type="spellStart"/>
-      <w:r>
-        <w:t>src</w:t>
-      </w:r>
-      <w:proofErr w:type="spellEnd"/>
-      <w:r>
-        <w:t>="/home.jpg" /&gt;</w:t>
+        <w:t>&lt;Image src="/home.jpg" /&gt;</w:t>
       </w:r>
     </w:p>
     <w:p>
@@ -4548,17 +3698,8 @@
     <w:p>
       <w:r>
         <w:lastRenderedPageBreak/>
-        <w:t xml:space="preserve">We can add media </w:t>
-      </w:r>
-      <w:proofErr w:type="spellStart"/>
-      <w:r>
-        <w:t>quary</w:t>
-      </w:r>
-      <w:proofErr w:type="spellEnd"/>
-      <w:r>
-        <w:t xml:space="preserve"> in Tailwind by </w:t>
-      </w:r>
-      <w:proofErr w:type="spellStart"/>
+        <w:t xml:space="preserve">We can add media quary in Tailwind by </w:t>
+      </w:r>
       <w:r>
         <w:rPr>
           <w:b/>
@@ -4571,15 +3712,7 @@
           <w:b/>
           <w:bCs/>
         </w:rPr>
-        <w:t>property</w:t>
-      </w:r>
-      <w:proofErr w:type="spellEnd"/>
-      <w:r>
-        <w:rPr>
-          <w:b/>
-          <w:bCs/>
-        </w:rPr>
-        <w:t xml:space="preserve"> name</w:t>
+        <w:t>property name</w:t>
       </w:r>
       <w:r>
         <w:rPr>
@@ -4706,15 +3839,7 @@
     </w:p>
     <w:p>
       <w:r>
-        <w:t xml:space="preserve">import { </w:t>
-      </w:r>
-      <w:proofErr w:type="spellStart"/>
-      <w:r>
-        <w:t>AiOutlineShoppingCart</w:t>
-      </w:r>
-      <w:proofErr w:type="spellEnd"/>
-      <w:r>
-        <w:t xml:space="preserve"> } from "react-icons/ai";</w:t>
+        <w:t>import { AiOutlineShoppingCart } from "react-icons/ai";</w:t>
       </w:r>
     </w:p>
     <w:p>
@@ -4945,15 +4070,7 @@
     </w:p>
     <w:p>
       <w:r>
-        <w:t xml:space="preserve">By </w:t>
-      </w:r>
-      <w:proofErr w:type="spellStart"/>
-      <w:r>
-        <w:t>overflow-x:hidden</w:t>
-      </w:r>
-      <w:proofErr w:type="spellEnd"/>
-      <w:r>
-        <w:t xml:space="preserve"> you c</w:t>
+        <w:t>By overflow-x:hidden you c</w:t>
       </w:r>
       <w:r>
         <w:t xml:space="preserve">an make sure there is no horizontal </w:t>
@@ -4979,40 +4096,16 @@
         <w:t>s</w:t>
       </w:r>
       <w:r>
-        <w:t xml:space="preserve">ked is out </w:t>
-      </w:r>
-      <w:proofErr w:type="spellStart"/>
-      <w:r>
-        <w:t>pincode</w:t>
-      </w:r>
-      <w:proofErr w:type="spellEnd"/>
-      <w:r>
-        <w:t xml:space="preserve"> </w:t>
-      </w:r>
-      <w:proofErr w:type="spellStart"/>
-      <w:r>
-        <w:t>servicable</w:t>
-      </w:r>
-      <w:proofErr w:type="spellEnd"/>
-      <w:r>
-        <w:t xml:space="preserve"> o</w:t>
+        <w:t>ked is out pincode servicable o</w:t>
       </w:r>
       <w:r>
         <w:t>r</w:t>
       </w:r>
       <w:r>
-        <w:t xml:space="preserve"> </w:t>
-      </w:r>
-      <w:proofErr w:type="spellStart"/>
-      <w:r>
-        <w:t>not</w:t>
-      </w:r>
-      <w:r>
-        <w:t>ig</w:t>
-      </w:r>
-      <w:proofErr w:type="spellEnd"/>
-      <w:r>
-        <w:t xml:space="preserve"> no then you cannot receiver the order.</w:t>
+        <w:t xml:space="preserve"> not</w:t>
+      </w:r>
+      <w:r>
+        <w:t>ig no then you cannot receiver the order.</w:t>
       </w:r>
     </w:p>
     <w:p>
@@ -5023,29 +4116,13 @@
         <w:t>e</w:t>
       </w:r>
       <w:r>
-        <w:t xml:space="preserve"> a mock </w:t>
-      </w:r>
-      <w:proofErr w:type="spellStart"/>
-      <w:r>
-        <w:t>api</w:t>
-      </w:r>
-      <w:proofErr w:type="spellEnd"/>
-      <w:r>
-        <w:t xml:space="preserve"> that wil</w:t>
+        <w:t xml:space="preserve"> a mock api that wil</w:t>
       </w:r>
       <w:r>
         <w:t>l</w:t>
       </w:r>
       <w:r>
-        <w:t xml:space="preserve"> show all the </w:t>
-      </w:r>
-      <w:proofErr w:type="spellStart"/>
-      <w:r>
-        <w:t>apis</w:t>
-      </w:r>
-      <w:proofErr w:type="spellEnd"/>
-      <w:r>
-        <w:t xml:space="preserve"> that are serviceable </w:t>
+        <w:t xml:space="preserve"> show all the apis that are serviceable </w:t>
       </w:r>
     </w:p>
     <w:p>
@@ -5385,24 +4462,11 @@
         <w:t xml:space="preserve">To </w:t>
       </w:r>
       <w:r>
-        <w:t xml:space="preserve">make </w:t>
-      </w:r>
-      <w:proofErr w:type="spellStart"/>
-      <w:r>
-        <w:t>codewear</w:t>
-      </w:r>
-      <w:proofErr w:type="spellEnd"/>
-      <w:r>
-        <w:t xml:space="preserve"> we are going to use Mongoose </w:t>
-      </w:r>
-      <w:r>
-        <w:t xml:space="preserve">is a connector to a </w:t>
-      </w:r>
-      <w:proofErr w:type="spellStart"/>
-      <w:r>
-        <w:t>Mongodb</w:t>
-      </w:r>
-      <w:proofErr w:type="spellEnd"/>
+        <w:t xml:space="preserve">make codewear we are going to use Mongoose </w:t>
+      </w:r>
+      <w:r>
+        <w:t>is a connector to a Mongodb</w:t>
+      </w:r>
       <w:r>
         <w:t xml:space="preserve"> </w:t>
       </w:r>
@@ -5410,15 +4474,7 @@
         <w:t>(who knows )</w:t>
       </w:r>
       <w:r>
-        <w:t xml:space="preserve"> it will help js to connect to </w:t>
-      </w:r>
-      <w:proofErr w:type="spellStart"/>
-      <w:r>
-        <w:t>mongodb</w:t>
-      </w:r>
-      <w:proofErr w:type="spellEnd"/>
-      <w:r>
-        <w:t xml:space="preserve"> </w:t>
+        <w:t xml:space="preserve"> it will help js to connect to mongodb </w:t>
       </w:r>
       <w:r>
         <w:t xml:space="preserve">and we can use its </w:t>
@@ -5427,29 +4483,13 @@
         <w:t xml:space="preserve">built in functionality </w:t>
       </w:r>
       <w:r>
-        <w:t xml:space="preserve">you don’t have to read and write and update to the </w:t>
-      </w:r>
-      <w:proofErr w:type="spellStart"/>
-      <w:r>
-        <w:t>mongodb</w:t>
-      </w:r>
-      <w:proofErr w:type="spellEnd"/>
-      <w:r>
-        <w:t xml:space="preserve"> (like </w:t>
+        <w:t xml:space="preserve">you don’t have to read and write and update to the mongodb (like </w:t>
       </w:r>
       <w:r>
         <w:t xml:space="preserve">maybe </w:t>
       </w:r>
       <w:r>
-        <w:t xml:space="preserve">the complex we do for it in </w:t>
-      </w:r>
-      <w:proofErr w:type="spellStart"/>
-      <w:r>
-        <w:t>mongodb</w:t>
-      </w:r>
-      <w:proofErr w:type="spellEnd"/>
-      <w:r>
-        <w:t>(who knows))</w:t>
+        <w:t>the complex we do for it in mongodb(who knows))</w:t>
       </w:r>
       <w:r>
         <w:t xml:space="preserve">. </w:t>
@@ -5463,19 +4503,9 @@
       <w:r>
         <w:t xml:space="preserve">ing fields like </w:t>
       </w:r>
-      <w:proofErr w:type="spellStart"/>
-      <w:r>
-        <w:t>createdAT</w:t>
-      </w:r>
-      <w:proofErr w:type="spellEnd"/>
-      <w:r>
-        <w:t xml:space="preserve"> and </w:t>
-      </w:r>
-      <w:proofErr w:type="spellStart"/>
-      <w:r>
-        <w:t>updatedAt</w:t>
-      </w:r>
-      <w:proofErr w:type="spellEnd"/>
+      <w:r>
+        <w:t>createdAT and updatedAt</w:t>
+      </w:r>
     </w:p>
     <w:p>
       <w:r>
@@ -5515,70 +4545,38 @@
         <w:t>r</w:t>
       </w:r>
       <w:r>
-        <w:t xml:space="preserve">ough which we connect to </w:t>
-      </w:r>
-      <w:proofErr w:type="spellStart"/>
-      <w:r>
-        <w:t>mongo</w:t>
-      </w:r>
-      <w:r>
-        <w:t>db</w:t>
-      </w:r>
-      <w:proofErr w:type="spellEnd"/>
+        <w:t>ough which we connect to mongo</w:t>
+      </w:r>
+      <w:r>
+        <w:t xml:space="preserve">db </w:t>
+      </w:r>
+    </w:p>
+    <w:p>
+      <w:r>
+        <w:t xml:space="preserve">I think we are going to directly contact to mongos by frontEnd </w:t>
+      </w:r>
+    </w:p>
+    <w:p>
+      <w:r>
+        <w:t xml:space="preserve">Ow we will install Mongoose </w:t>
+      </w:r>
+      <w:r>
+        <w:t xml:space="preserve">by npm </w:t>
+      </w:r>
+      <w:r>
+        <w:t>and we will make some modals</w:t>
+      </w:r>
+      <w:r>
+        <w:t>(maybe not)</w:t>
+      </w:r>
       <w:r>
         <w:t xml:space="preserve"> </w:t>
       </w:r>
-    </w:p>
-    <w:p>
-      <w:r>
-        <w:t xml:space="preserve">I think we are going to directly contact to mongos by </w:t>
-      </w:r>
-      <w:proofErr w:type="spellStart"/>
-      <w:r>
-        <w:t>frontEnd</w:t>
-      </w:r>
-      <w:proofErr w:type="spellEnd"/>
-      <w:r>
-        <w:t xml:space="preserve"> </w:t>
-      </w:r>
-    </w:p>
-    <w:p>
-      <w:r>
-        <w:t xml:space="preserve">Ow we will install Mongoose </w:t>
-      </w:r>
-      <w:r>
-        <w:t xml:space="preserve">by </w:t>
-      </w:r>
-      <w:proofErr w:type="spellStart"/>
-      <w:r>
-        <w:t>npm</w:t>
-      </w:r>
-      <w:proofErr w:type="spellEnd"/>
-      <w:r>
-        <w:t xml:space="preserve"> </w:t>
-      </w:r>
-      <w:r>
-        <w:t>and we will make some modals</w:t>
-      </w:r>
-      <w:r>
-        <w:t>(maybe not)</w:t>
-      </w:r>
-      <w:r>
-        <w:t xml:space="preserve"> </w:t>
-      </w:r>
       <w:r>
         <w:t>through which you will store the data (who knows)</w:t>
       </w:r>
       <w:r>
-        <w:t xml:space="preserve"> but before that we need to install </w:t>
-      </w:r>
-      <w:proofErr w:type="spellStart"/>
-      <w:r>
-        <w:t>mongodb</w:t>
-      </w:r>
-      <w:proofErr w:type="spellEnd"/>
-      <w:r>
-        <w:t xml:space="preserve"> </w:t>
+        <w:t xml:space="preserve"> but before that we need to install mongodb </w:t>
       </w:r>
     </w:p>
     <w:p>
@@ -5595,11 +4593,7 @@
         <w:t>then your</w:t>
       </w:r>
       <w:r>
-        <w:t xml:space="preserve"> </w:t>
-      </w:r>
-      <w:proofErr w:type="spellStart"/>
-      <w:r>
-        <w:t>mon</w:t>
+        <w:t xml:space="preserve"> mon</w:t>
       </w:r>
       <w:r>
         <w:t>g</w:t>
@@ -5608,62 +4602,29 @@
         <w:t>d</w:t>
       </w:r>
       <w:r>
-        <w:t>b</w:t>
-      </w:r>
-      <w:proofErr w:type="spellEnd"/>
-      <w:r>
-        <w:t xml:space="preserve"> compass will be installed</w:t>
-      </w:r>
-      <w:r>
-        <w:t xml:space="preserve"> which  is a product of </w:t>
-      </w:r>
-      <w:proofErr w:type="spellStart"/>
-      <w:r>
-        <w:t>mongodb</w:t>
-      </w:r>
-      <w:proofErr w:type="spellEnd"/>
-      <w:r>
-        <w:t xml:space="preserve"> </w:t>
-      </w:r>
-    </w:p>
-    <w:p>
-      <w:r>
-        <w:t xml:space="preserve">Now in </w:t>
-      </w:r>
-      <w:proofErr w:type="spellStart"/>
-      <w:r>
-        <w:t>mongodb</w:t>
-      </w:r>
-      <w:proofErr w:type="spellEnd"/>
-      <w:r>
-        <w:t xml:space="preserve"> compass you click on connect to the </w:t>
+        <w:t>b compass will be installed</w:t>
+      </w:r>
+      <w:r>
+        <w:t xml:space="preserve"> which  is a product of mongodb </w:t>
+      </w:r>
+    </w:p>
+    <w:p>
+      <w:r>
+        <w:t xml:space="preserve">Now in mongodb compass you click on connect to the </w:t>
       </w:r>
       <w:r>
         <w:t xml:space="preserve">localhost </w:t>
       </w:r>
-      <w:proofErr w:type="spellStart"/>
-      <w:r>
-        <w:t>ehere</w:t>
-      </w:r>
-      <w:proofErr w:type="spellEnd"/>
-      <w:r>
-        <w:t xml:space="preserve"> the server is running </w:t>
-      </w:r>
-    </w:p>
-    <w:p>
-      <w:r>
-        <w:t xml:space="preserve">We will make all the data base in </w:t>
-      </w:r>
-      <w:proofErr w:type="spellStart"/>
-      <w:r>
-        <w:t>mongo</w:t>
-      </w:r>
-      <w:r>
-        <w:t>db</w:t>
-      </w:r>
-      <w:proofErr w:type="spellEnd"/>
-      <w:r>
-        <w:t xml:space="preserve"> compass.</w:t>
+      <w:r>
+        <w:t xml:space="preserve">ehere the server is running </w:t>
+      </w:r>
+    </w:p>
+    <w:p>
+      <w:r>
+        <w:t>We will make all the data base in mongo</w:t>
+      </w:r>
+      <w:r>
+        <w:t>db compass.</w:t>
       </w:r>
     </w:p>
     <w:p>
@@ -5791,18 +4752,10 @@
     </w:p>
     <w:p>
       <w:r>
-        <w:t xml:space="preserve">And after this get connection to the </w:t>
-      </w:r>
-      <w:proofErr w:type="spellStart"/>
-      <w:r>
-        <w:t>mongo</w:t>
-      </w:r>
-      <w:r>
-        <w:t>db</w:t>
-      </w:r>
-      <w:proofErr w:type="spellEnd"/>
-      <w:r>
-        <w:t xml:space="preserve"> </w:t>
+        <w:t>And after this get connection to the mongo</w:t>
+      </w:r>
+      <w:r>
+        <w:t xml:space="preserve">db </w:t>
       </w:r>
       <w:r>
         <w:t>and your wok will be sone now you can make schema</w:t>
@@ -5972,29 +4925,14 @@
       <w:r>
         <w:t xml:space="preserve">APIs that is </w:t>
       </w:r>
-      <w:proofErr w:type="spellStart"/>
-      <w:r>
-        <w:t>getProduct</w:t>
-      </w:r>
-      <w:proofErr w:type="spellEnd"/>
-      <w:r>
-        <w:t xml:space="preserve">, </w:t>
-      </w:r>
-      <w:proofErr w:type="spellStart"/>
-      <w:r>
-        <w:t>updateProduct</w:t>
-      </w:r>
-      <w:proofErr w:type="spellEnd"/>
+      <w:r>
+        <w:t>getProduct, updateProduct</w:t>
+      </w:r>
       <w:r>
         <w:t xml:space="preserve"> and </w:t>
       </w:r>
-      <w:proofErr w:type="spellStart"/>
-      <w:r>
-        <w:t>addProducts</w:t>
-      </w:r>
-      <w:proofErr w:type="spellEnd"/>
-      <w:r>
-        <w:t xml:space="preserve"> </w:t>
+      <w:r>
+        <w:t xml:space="preserve">addProducts </w:t>
       </w:r>
       <w:r>
         <w:t xml:space="preserve">now they do as the name suggests </w:t>
@@ -6020,15 +4958,7 @@
     </w:p>
     <w:p>
       <w:r>
-        <w:t xml:space="preserve">Now we are going to start middleware development which will facilitate the connection to </w:t>
-      </w:r>
-      <w:proofErr w:type="spellStart"/>
-      <w:r>
-        <w:t>mongodb</w:t>
-      </w:r>
-      <w:proofErr w:type="spellEnd"/>
-      <w:r>
-        <w:t xml:space="preserve"> </w:t>
+        <w:t xml:space="preserve">Now we are going to start middleware development which will facilitate the connection to mongodb </w:t>
       </w:r>
       <w:r>
         <w:t>now it seems confusing at first</w:t>
@@ -6105,13 +5035,8 @@
       <w:r>
         <w:t>.</w:t>
       </w:r>
-      <w:proofErr w:type="spellStart"/>
-      <w:r>
-        <w:t>env.local</w:t>
-      </w:r>
-      <w:proofErr w:type="spellEnd"/>
-      <w:r>
-        <w:t xml:space="preserve"> </w:t>
+      <w:r>
+        <w:t xml:space="preserve">env.local </w:t>
       </w:r>
       <w:r>
         <w:t xml:space="preserve">file </w:t>
@@ -6123,13 +5048,8 @@
         <w:t xml:space="preserve"> and you can get it in our maybe server </w:t>
       </w:r>
       <w:r>
-        <w:t xml:space="preserve">side by using </w:t>
-      </w:r>
-      <w:proofErr w:type="spellStart"/>
-      <w:r>
-        <w:t>process.env</w:t>
-      </w:r>
-      <w:proofErr w:type="spellEnd"/>
+        <w:t>side by using process.env</w:t>
+      </w:r>
     </w:p>
     <w:p>
       <w:pPr>
@@ -6140,34 +5060,10 @@
         </w:numPr>
       </w:pPr>
       <w:r>
-        <w:t xml:space="preserve">We need a connection string to connect to </w:t>
-      </w:r>
-      <w:proofErr w:type="spellStart"/>
-      <w:r>
-        <w:t>mongodb</w:t>
-      </w:r>
-      <w:proofErr w:type="spellEnd"/>
-      <w:r>
-        <w:t xml:space="preserve"> </w:t>
-      </w:r>
-      <w:r>
-        <w:t xml:space="preserve"> and we can get for </w:t>
-      </w:r>
-      <w:proofErr w:type="spellStart"/>
-      <w:r>
-        <w:t>mongodb</w:t>
-      </w:r>
-      <w:proofErr w:type="spellEnd"/>
-      <w:r>
-        <w:t xml:space="preserve"> compass by opening </w:t>
-      </w:r>
-      <w:proofErr w:type="spellStart"/>
-      <w:r>
-        <w:t>mongodb</w:t>
-      </w:r>
-      <w:proofErr w:type="spellEnd"/>
-      <w:r>
-        <w:t xml:space="preserve"> compass and then click on three dot </w:t>
+        <w:t xml:space="preserve">We need a connection string to connect to mongodb </w:t>
+      </w:r>
+      <w:r>
+        <w:t xml:space="preserve"> and we can get for mongodb compass by opening mongodb compass and then click on three dot </w:t>
       </w:r>
       <w:r>
         <w:t>as</w:t>
@@ -6176,15 +5072,7 @@
         <w:t xml:space="preserve"> marked below</w:t>
       </w:r>
       <w:r>
-        <w:t xml:space="preserve">(not </w:t>
-      </w:r>
-      <w:proofErr w:type="spellStart"/>
-      <w:r>
-        <w:t>visiblie</w:t>
-      </w:r>
-      <w:proofErr w:type="spellEnd"/>
-      <w:r>
-        <w:t xml:space="preserve"> because of not hover)</w:t>
+        <w:t>(not visiblie because of not hover)</w:t>
       </w:r>
     </w:p>
     <w:p>
@@ -6246,15 +5134,7 @@
         <w:t xml:space="preserve"> to get </w:t>
       </w:r>
       <w:r>
-        <w:t>the connection string and we will store it inside .</w:t>
-      </w:r>
-      <w:proofErr w:type="spellStart"/>
-      <w:r>
-        <w:t>env.local</w:t>
-      </w:r>
-      <w:proofErr w:type="spellEnd"/>
-      <w:r>
-        <w:t xml:space="preserve"> file.</w:t>
+        <w:t>the connection string and we will store it inside .env.local file.</w:t>
       </w:r>
     </w:p>
     <w:p>
@@ -6285,15 +5165,7 @@
         <w:t>n</w:t>
       </w:r>
       <w:r>
-        <w:t xml:space="preserve"> modern </w:t>
-      </w:r>
-      <w:proofErr w:type="spellStart"/>
-      <w:r>
-        <w:t>Nextjs</w:t>
-      </w:r>
-      <w:proofErr w:type="spellEnd"/>
-      <w:r>
-        <w:t xml:space="preserve"> middleware cannot be used for database connectivity but you can use it </w:t>
+        <w:t xml:space="preserve"> modern Nextjs middleware cannot be used for database connectivity but you can use it </w:t>
       </w:r>
       <w:r>
         <w:t>for auth</w:t>
@@ -6334,15 +5206,7 @@
         <w:t xml:space="preserve"> add Product </w:t>
       </w:r>
       <w:r>
-        <w:t xml:space="preserve">and </w:t>
-      </w:r>
-      <w:proofErr w:type="spellStart"/>
-      <w:r>
-        <w:t>GetProduct</w:t>
-      </w:r>
-      <w:proofErr w:type="spellEnd"/>
-      <w:r>
-        <w:t xml:space="preserve"> API</w:t>
+        <w:t>and GetProduct API</w:t>
       </w:r>
       <w:r>
         <w:t>.</w:t>
@@ -6372,66 +5236,34 @@
         <w:t xml:space="preserve">that </w:t>
       </w:r>
       <w:r>
-        <w:t xml:space="preserve">when there is not data in </w:t>
-      </w:r>
-      <w:proofErr w:type="spellStart"/>
-      <w:r>
-        <w:t>mon</w:t>
-      </w:r>
-      <w:r>
-        <w:t>godb</w:t>
-      </w:r>
-      <w:proofErr w:type="spellEnd"/>
+        <w:t>when there is not data in mon</w:t>
+      </w:r>
+      <w:r>
+        <w:t xml:space="preserve">godb </w:t>
+      </w:r>
+      <w:r>
+        <w:t xml:space="preserve"> and we use find ot any operation on modal </w:t>
+      </w:r>
+      <w:r>
+        <w:t xml:space="preserve">or maybe importing modal then it try to form </w:t>
+      </w:r>
+      <w:r>
+        <w:t>data again on database</w:t>
+      </w:r>
+      <w:r>
+        <w:t>(who knows)</w:t>
+      </w:r>
+      <w:r>
+        <w:t>.</w:t>
+      </w:r>
+      <w:r>
+        <w:t xml:space="preserve"> to fix that in model file write mongoose.models = {}</w:t>
+      </w:r>
       <w:r>
         <w:t xml:space="preserve"> </w:t>
       </w:r>
       <w:r>
-        <w:t xml:space="preserve"> and we use find </w:t>
-      </w:r>
-      <w:proofErr w:type="spellStart"/>
-      <w:r>
-        <w:t>ot</w:t>
-      </w:r>
-      <w:proofErr w:type="spellEnd"/>
-      <w:r>
-        <w:t xml:space="preserve"> any operation on modal </w:t>
-      </w:r>
-      <w:r>
-        <w:t xml:space="preserve">or maybe importing modal then it try to form </w:t>
-      </w:r>
-      <w:r>
-        <w:t>data again on database</w:t>
-      </w:r>
-      <w:r>
-        <w:t>(who knows)</w:t>
-      </w:r>
-      <w:r>
-        <w:t>.</w:t>
-      </w:r>
-      <w:r>
-        <w:t xml:space="preserve"> to fix that in model file write </w:t>
-      </w:r>
-      <w:proofErr w:type="spellStart"/>
-      <w:r>
-        <w:t>mongoose.models</w:t>
-      </w:r>
-      <w:proofErr w:type="spellEnd"/>
-      <w:r>
-        <w:t xml:space="preserve"> = {}</w:t>
-      </w:r>
-      <w:r>
-        <w:t xml:space="preserve"> </w:t>
-      </w:r>
-      <w:r>
-        <w:t xml:space="preserve">in each model do make sure you </w:t>
-      </w:r>
-      <w:proofErr w:type="spellStart"/>
-      <w:r>
-        <w:t>doi</w:t>
-      </w:r>
-      <w:proofErr w:type="spellEnd"/>
-      <w:r>
-        <w:t xml:space="preserve"> this.</w:t>
+        <w:t>in each model do make sure you doi this.</w:t>
       </w:r>
     </w:p>
     <w:p>
@@ -6459,23 +5291,7 @@
     </w:p>
     <w:p>
       <w:r>
-        <w:t xml:space="preserve">We will make now </w:t>
-      </w:r>
-      <w:proofErr w:type="spellStart"/>
-      <w:r>
-        <w:t>updateProfuct</w:t>
-      </w:r>
-      <w:proofErr w:type="spellEnd"/>
-      <w:r>
-        <w:t xml:space="preserve"> </w:t>
-      </w:r>
-      <w:proofErr w:type="spellStart"/>
-      <w:r>
-        <w:t>api</w:t>
-      </w:r>
-      <w:proofErr w:type="spellEnd"/>
-      <w:r>
-        <w:t>.</w:t>
+        <w:t>We will make now updateProfuct api.</w:t>
       </w:r>
     </w:p>
     <w:p>
@@ -6494,39 +5310,7 @@
         <w:t xml:space="preserve">add handler to the  html but now the game is changed </w:t>
       </w:r>
       <w:r>
-        <w:t xml:space="preserve">sever side component do all the work of mapping and generating html but in older version when data was end to the browser we need to make </w:t>
-      </w:r>
-      <w:proofErr w:type="spellStart"/>
-      <w:r>
-        <w:t>oit</w:t>
-      </w:r>
-      <w:proofErr w:type="spellEnd"/>
-      <w:r>
-        <w:t xml:space="preserve"> </w:t>
-      </w:r>
-      <w:proofErr w:type="spellStart"/>
-      <w:r>
-        <w:t>pardable</w:t>
-      </w:r>
-      <w:proofErr w:type="spellEnd"/>
-      <w:r>
-        <w:t xml:space="preserve"> we did it by </w:t>
-      </w:r>
-      <w:proofErr w:type="spellStart"/>
-      <w:r>
-        <w:t>JSON.parse</w:t>
-      </w:r>
-      <w:proofErr w:type="spellEnd"/>
-      <w:r>
-        <w:t>(</w:t>
-      </w:r>
-      <w:proofErr w:type="spellStart"/>
-      <w:r>
-        <w:t>JSON.stringify</w:t>
-      </w:r>
-      <w:proofErr w:type="spellEnd"/>
-      <w:r>
-        <w:t>(</w:t>
+        <w:t>sever side component do all the work of mapping and generating html but in older version when data was end to the browser we need to make oit pardable we did it by JSON.parse(JSON.stringify(</w:t>
       </w:r>
       <w:r>
         <w:t>&lt;object&gt;</w:t>
@@ -6545,15 +5329,7 @@
     </w:p>
     <w:p>
       <w:r>
-        <w:t xml:space="preserve">what is </w:t>
-      </w:r>
-      <w:proofErr w:type="spellStart"/>
-      <w:r>
-        <w:t>passHref</w:t>
-      </w:r>
-      <w:proofErr w:type="spellEnd"/>
-      <w:r>
-        <w:t xml:space="preserve"> in simple words</w:t>
+        <w:t>what is passHref in simple words</w:t>
       </w:r>
     </w:p>
     <w:p>
@@ -6576,57 +5352,16 @@
           <w:b/>
           <w:bCs/>
         </w:rPr>
-        <w:t xml:space="preserve"> </w:t>
-      </w:r>
-      <w:proofErr w:type="spellStart"/>
-      <w:r>
-        <w:rPr>
-          <w:b/>
-          <w:bCs/>
-        </w:rPr>
-        <w:t>passHref</w:t>
-      </w:r>
-      <w:proofErr w:type="spellEnd"/>
-      <w:r>
-        <w:rPr>
-          <w:b/>
-          <w:bCs/>
-        </w:rPr>
-        <w:t xml:space="preserve"> (simple explanation)</w:t>
-      </w:r>
-    </w:p>
-    <w:p>
-      <w:proofErr w:type="spellStart"/>
-      <w:r>
-        <w:rPr>
-          <w:b/>
-          <w:bCs/>
-        </w:rPr>
-        <w:t>passHref</w:t>
-      </w:r>
-      <w:proofErr w:type="spellEnd"/>
-      <w:r>
-        <w:rPr>
-          <w:b/>
-          <w:bCs/>
-        </w:rPr>
-        <w:t xml:space="preserve"> tells &lt;Link&gt; to pass the </w:t>
-      </w:r>
-      <w:proofErr w:type="spellStart"/>
-      <w:r>
-        <w:rPr>
-          <w:b/>
-          <w:bCs/>
-        </w:rPr>
-        <w:t>href</w:t>
-      </w:r>
-      <w:proofErr w:type="spellEnd"/>
-      <w:r>
-        <w:rPr>
-          <w:b/>
-          <w:bCs/>
-        </w:rPr>
-        <w:t xml:space="preserve"> to its child element (like &lt;a&gt;)</w:t>
+        <w:t xml:space="preserve"> passHref (simple explanation)</w:t>
+      </w:r>
+    </w:p>
+    <w:p>
+      <w:r>
+        <w:rPr>
+          <w:b/>
+          <w:bCs/>
+        </w:rPr>
+        <w:t>passHref tells &lt;Link&gt; to pass the href to its child element (like &lt;a&gt;)</w:t>
       </w:r>
     </w:p>
     <w:p>
@@ -6676,15 +5411,7 @@
     </w:p>
     <w:p>
       <w:r>
-        <w:t xml:space="preserve">&lt;Link </w:t>
-      </w:r>
-      <w:proofErr w:type="spellStart"/>
-      <w:r>
-        <w:t>href</w:t>
-      </w:r>
-      <w:proofErr w:type="spellEnd"/>
-      <w:r>
-        <w:t>="/login"&gt;</w:t>
+        <w:t>&lt;Link href="/login"&gt;</w:t>
       </w:r>
       <w:r>
         <w:br/>
@@ -6710,17 +5437,8 @@
           <w:b/>
           <w:bCs/>
         </w:rPr>
-        <w:t xml:space="preserve">not automatically get </w:t>
-      </w:r>
-      <w:proofErr w:type="spellStart"/>
-      <w:r>
-        <w:rPr>
-          <w:b/>
-          <w:bCs/>
-        </w:rPr>
-        <w:t>href</w:t>
-      </w:r>
-      <w:proofErr w:type="spellEnd"/>
+        <w:t>not automatically get href</w:t>
+      </w:r>
     </w:p>
     <w:p>
       <w:r>
@@ -6729,23 +5447,7 @@
     </w:p>
     <w:p>
       <w:r>
-        <w:t xml:space="preserve">&lt;Link </w:t>
-      </w:r>
-      <w:proofErr w:type="spellStart"/>
-      <w:r>
-        <w:t>href</w:t>
-      </w:r>
-      <w:proofErr w:type="spellEnd"/>
-      <w:r>
-        <w:t xml:space="preserve">="/login" </w:t>
-      </w:r>
-      <w:proofErr w:type="spellStart"/>
-      <w:r>
-        <w:t>passHref</w:t>
-      </w:r>
-      <w:proofErr w:type="spellEnd"/>
-      <w:r>
-        <w:t>&gt;</w:t>
+        <w:t>&lt;Link href="/login" passHref&gt;</w:t>
       </w:r>
       <w:r>
         <w:br/>
@@ -6769,15 +5471,7 @@
     </w:p>
     <w:p>
       <w:r>
-        <w:t xml:space="preserve">&lt;a </w:t>
-      </w:r>
-      <w:proofErr w:type="spellStart"/>
-      <w:r>
-        <w:t>href</w:t>
-      </w:r>
-      <w:proofErr w:type="spellEnd"/>
-      <w:r>
-        <w:t>="/login"&gt;Login&lt;/a&gt;</w:t>
+        <w:t>&lt;a href="/login"&gt;Login&lt;/a&gt;</w:t>
       </w:r>
     </w:p>
     <w:p>
@@ -6839,13 +5533,8 @@
           <w:numId w:val="3"/>
         </w:numPr>
       </w:pPr>
-      <w:proofErr w:type="spellStart"/>
-      <w:r>
-        <w:t>passHref</w:t>
-      </w:r>
-      <w:proofErr w:type="spellEnd"/>
-      <w:r>
-        <w:t xml:space="preserve"> = “give the link to the receiver” </w:t>
+      <w:r>
+        <w:t xml:space="preserve">passHref = “give the link to the receiver” </w:t>
       </w:r>
     </w:p>
     <w:p>
@@ -6892,15 +5581,7 @@
         <w:t>👉</w:t>
       </w:r>
       <w:r>
-        <w:t xml:space="preserve"> You don’t need </w:t>
-      </w:r>
-      <w:proofErr w:type="spellStart"/>
-      <w:r>
-        <w:t>passHref</w:t>
-      </w:r>
-      <w:proofErr w:type="spellEnd"/>
-      <w:r>
-        <w:t xml:space="preserve"> anymore</w:t>
+        <w:t xml:space="preserve"> You don’t need passHref anymore</w:t>
       </w:r>
       <w:r>
         <w:br/>
@@ -6951,21 +5632,8 @@
           <w:bottom w:val="single" w:sz="12" w:space="1" w:color="auto"/>
         </w:pBdr>
       </w:pPr>
-      <w:proofErr w:type="spellStart"/>
-      <w:r>
-        <w:t>passHref</w:t>
-      </w:r>
-      <w:proofErr w:type="spellEnd"/>
-      <w:r>
-        <w:t xml:space="preserve"> ensures the child element (like &lt;a&gt;) actually receives the link (</w:t>
-      </w:r>
-      <w:proofErr w:type="spellStart"/>
-      <w:r>
-        <w:t>href</w:t>
-      </w:r>
-      <w:proofErr w:type="spellEnd"/>
-      <w:r>
-        <w:t>).</w:t>
+      <w:r>
+        <w:t>passHref ensures the child element (like &lt;a&gt;) actually receives the link (href).</w:t>
       </w:r>
     </w:p>
     <w:p>
@@ -7440,149 +6108,112 @@
         <w:t xml:space="preserve">but sometime we want that </w:t>
       </w:r>
       <w:r>
-        <w:t xml:space="preserve">we buy </w:t>
-      </w:r>
-      <w:proofErr w:type="spellStart"/>
-      <w:r>
-        <w:t>onr</w:t>
-      </w:r>
-      <w:proofErr w:type="spellEnd"/>
+        <w:t>we buy onr ptofict imme</w:t>
+      </w:r>
+      <w:r>
+        <w:t>d</w:t>
+      </w:r>
+      <w:r>
+        <w:t xml:space="preserve">iately </w:t>
+      </w:r>
+      <w:r>
+        <w:t xml:space="preserve">and for that you are given buy now button </w:t>
+      </w:r>
+      <w:r>
+        <w:t xml:space="preserve">.If you click on buy Now </w:t>
+      </w:r>
+      <w:r>
+        <w:t>then it will b</w:t>
+      </w:r>
+      <w:r>
+        <w:t>e</w:t>
+      </w:r>
+      <w:r>
+        <w:t xml:space="preserve"> in </w:t>
+      </w:r>
+      <w:r>
+        <w:rPr>
+          <w:b/>
+          <w:bCs/>
+          <w:color w:val="EE0000"/>
+        </w:rPr>
+        <w:t>your cart and you will be checkout (who knows</w:t>
+      </w:r>
+      <w:r>
+        <w:rPr>
+          <w:b/>
+          <w:bCs/>
+          <w:color w:val="EE0000"/>
+        </w:rPr>
+        <w:t>(maybe wrong)</w:t>
+      </w:r>
+      <w:r>
+        <w:rPr>
+          <w:b/>
+          <w:bCs/>
+          <w:color w:val="EE0000"/>
+        </w:rPr>
+        <w:t>)</w:t>
+      </w:r>
+      <w:r>
+        <w:t xml:space="preserve"> so that you can enter your details instantly </w:t>
+      </w:r>
+      <w:r>
+        <w:t xml:space="preserve">and checkout </w:t>
+      </w:r>
+      <w:r>
+        <w:t>Now what teacher is saying when someone click on</w:t>
+      </w:r>
       <w:r>
         <w:t xml:space="preserve"> </w:t>
       </w:r>
-      <w:proofErr w:type="spellStart"/>
-      <w:r>
-        <w:t>ptofict</w:t>
-      </w:r>
-      <w:proofErr w:type="spellEnd"/>
-      <w:r>
-        <w:t xml:space="preserve"> imme</w:t>
-      </w:r>
-      <w:r>
-        <w:t>d</w:t>
-      </w:r>
-      <w:r>
-        <w:t xml:space="preserve">iately </w:t>
-      </w:r>
-      <w:r>
-        <w:t xml:space="preserve">and for that you are given buy now button </w:t>
-      </w:r>
-      <w:r>
-        <w:t xml:space="preserve">.If you click on buy Now </w:t>
-      </w:r>
-      <w:r>
-        <w:t>then it will b</w:t>
-      </w:r>
-      <w:r>
-        <w:t>e</w:t>
-      </w:r>
-      <w:r>
-        <w:t xml:space="preserve"> in </w:t>
-      </w:r>
-      <w:r>
-        <w:rPr>
-          <w:b/>
-          <w:bCs/>
-          <w:color w:val="EE0000"/>
-        </w:rPr>
-        <w:t>your cart and you will be checkout (who knows</w:t>
-      </w:r>
-      <w:r>
-        <w:rPr>
-          <w:b/>
-          <w:bCs/>
-          <w:color w:val="EE0000"/>
-        </w:rPr>
-        <w:t>(maybe wrong)</w:t>
-      </w:r>
-      <w:r>
-        <w:rPr>
-          <w:b/>
-          <w:bCs/>
-          <w:color w:val="EE0000"/>
-        </w:rPr>
-        <w:t>)</w:t>
-      </w:r>
-      <w:r>
-        <w:t xml:space="preserve"> so that you can enter your details instantly </w:t>
-      </w:r>
-      <w:r>
-        <w:t xml:space="preserve">and checkout </w:t>
-      </w:r>
-      <w:r>
-        <w:t>Now what teacher is saying when someone click on</w:t>
+      <w:r>
+        <w:t>Buy</w:t>
       </w:r>
       <w:r>
         <w:t xml:space="preserve"> </w:t>
       </w:r>
       <w:r>
-        <w:t>Buy</w:t>
+        <w:t xml:space="preserve">now then all cart will be cleared and </w:t>
+      </w:r>
+      <w:r>
+        <w:t>the item</w:t>
+      </w:r>
+      <w:r>
+        <w:t>s</w:t>
+      </w:r>
+      <w:r>
+        <w:t xml:space="preserve"> you carted will be removed from cart</w:t>
+      </w:r>
+      <w:r>
+        <w:t xml:space="preserve"> and only then ite</w:t>
+      </w:r>
+      <w:r>
+        <w:t>m</w:t>
+      </w:r>
+      <w:r>
+        <w:t xml:space="preserve"> you want to buy now</w:t>
+      </w:r>
+      <w:r>
+        <w:t xml:space="preserve"> will be shown in the cart and we will be checked out(who knows) </w:t>
+      </w:r>
+    </w:p>
+    <w:p>
+      <w:r>
+        <w:t xml:space="preserve">There is a method to move to a next page in nextjs like you did </w:t>
+      </w:r>
+      <w:r>
+        <w:t>in</w:t>
       </w:r>
       <w:r>
         <w:t xml:space="preserve"> </w:t>
       </w:r>
       <w:r>
-        <w:t xml:space="preserve">now then all cart will be cleared and </w:t>
-      </w:r>
-      <w:r>
-        <w:t>the item</w:t>
-      </w:r>
-      <w:r>
-        <w:t>s</w:t>
-      </w:r>
-      <w:r>
-        <w:t xml:space="preserve"> you carted will be removed from cart</w:t>
-      </w:r>
-      <w:r>
-        <w:t xml:space="preserve"> and only then ite</w:t>
-      </w:r>
-      <w:r>
-        <w:t>m</w:t>
-      </w:r>
-      <w:r>
-        <w:t xml:space="preserve"> you want to buy now</w:t>
-      </w:r>
-      <w:r>
-        <w:t xml:space="preserve"> will be shown in the cart and we will be checked out(who knows) </w:t>
-      </w:r>
-    </w:p>
-    <w:p>
-      <w:r>
-        <w:t xml:space="preserve">There is a method to move to a next page in </w:t>
-      </w:r>
-      <w:proofErr w:type="spellStart"/>
-      <w:r>
-        <w:t>nextjs</w:t>
-      </w:r>
-      <w:proofErr w:type="spellEnd"/>
-      <w:r>
-        <w:t xml:space="preserve"> like you did </w:t>
-      </w:r>
-      <w:r>
-        <w:t>in</w:t>
-      </w:r>
-      <w:r>
-        <w:t xml:space="preserve"> </w:t>
-      </w:r>
-      <w:r>
         <w:t xml:space="preserve">react </w:t>
       </w:r>
       <w:r>
-        <w:t xml:space="preserve">by navigate you can do so in </w:t>
-      </w:r>
-      <w:proofErr w:type="spellStart"/>
-      <w:r>
-        <w:t>nextJs</w:t>
-      </w:r>
-      <w:proofErr w:type="spellEnd"/>
-      <w:r>
-        <w:t xml:space="preserve"> by router object that you can get by </w:t>
-      </w:r>
-      <w:proofErr w:type="spellStart"/>
-      <w:r>
-        <w:t>useRouter</w:t>
-      </w:r>
-      <w:proofErr w:type="spellEnd"/>
+        <w:t>by navigate you can do so in nextJs by router object that you can get by useRouter</w:t>
+      </w:r>
       <w:r>
         <w:t xml:space="preserve"> hooks </w:t>
       </w:r>
@@ -7771,21 +6402,13 @@
         <w:t xml:space="preserve"> that </w:t>
       </w:r>
       <w:r>
-        <w:t xml:space="preserve">their </w:t>
-      </w:r>
-      <w:proofErr w:type="spellStart"/>
-      <w:r>
-        <w:t>pi</w:t>
+        <w:t>their pi</w:t>
       </w:r>
       <w:r>
         <w:t>n</w:t>
       </w:r>
       <w:r>
-        <w:t>code</w:t>
-      </w:r>
-      <w:proofErr w:type="spellEnd"/>
-      <w:r>
-        <w:t xml:space="preserve"> is not serviceable</w:t>
+        <w:t>code is not serviceable</w:t>
       </w:r>
     </w:p>
     <w:p>
@@ -7909,15 +6532,7 @@
         <w:t xml:space="preserve">To do all this we are going to use a library </w:t>
       </w:r>
       <w:r>
-        <w:t xml:space="preserve">called React </w:t>
-      </w:r>
-      <w:proofErr w:type="spellStart"/>
-      <w:r>
-        <w:t>Toastify</w:t>
-      </w:r>
-      <w:proofErr w:type="spellEnd"/>
-      <w:r>
-        <w:t xml:space="preserve"> </w:t>
+        <w:t xml:space="preserve">called React Toastify </w:t>
       </w:r>
       <w:r>
         <w:t>and if you use Rea</w:t>
@@ -7926,15 +6541,7 @@
         <w:t>ct</w:t>
       </w:r>
       <w:r>
-        <w:t xml:space="preserve"> or </w:t>
-      </w:r>
-      <w:proofErr w:type="spellStart"/>
-      <w:r>
-        <w:t>Nextjs</w:t>
-      </w:r>
-      <w:proofErr w:type="spellEnd"/>
-      <w:r>
-        <w:t xml:space="preserve"> </w:t>
+        <w:t xml:space="preserve"> or Nextjs </w:t>
       </w:r>
     </w:p>
     <w:p>
@@ -8061,15 +6668,7 @@
     </w:p>
     <w:p>
       <w:r>
-        <w:t xml:space="preserve">We will see React </w:t>
-      </w:r>
-      <w:proofErr w:type="spellStart"/>
-      <w:r>
-        <w:t>Toastify</w:t>
-      </w:r>
-      <w:proofErr w:type="spellEnd"/>
-      <w:r>
-        <w:t xml:space="preserve"> documentation </w:t>
+        <w:t xml:space="preserve">We will see React Toastify documentation </w:t>
       </w:r>
       <w:r>
         <w:t xml:space="preserve">and use it. </w:t>
@@ -8301,7 +6900,7 @@
           <w:noProof/>
         </w:rPr>
         <w:drawing>
-          <wp:inline distT="0" distB="0" distL="0" distR="0" wp14:anchorId="6B6DF7C8" wp14:editId="669659CF">
+          <wp:inline distT="0" distB="0" distL="0" distR="0" wp14:anchorId="6B6DF7C8" wp14:editId="4DA6E5BB">
             <wp:extent cx="5731510" cy="2579370"/>
             <wp:effectExtent l="0" t="0" r="2540" b="0"/>
             <wp:docPr id="1981589093" name="Picture 4"/>
@@ -8353,23 +6952,7 @@
     <w:p>
       <w:r>
         <w:lastRenderedPageBreak/>
-        <w:t xml:space="preserve">We get this error because image also demands from server by url and server takes slug and did not find any product by this title as the </w:t>
-      </w:r>
-      <w:proofErr w:type="spellStart"/>
-      <w:r>
-        <w:t>img</w:t>
-      </w:r>
-      <w:proofErr w:type="spellEnd"/>
-      <w:r>
-        <w:t xml:space="preserve"> property that was used in the </w:t>
-      </w:r>
-      <w:proofErr w:type="spellStart"/>
-      <w:r>
-        <w:t>src</w:t>
-      </w:r>
-      <w:proofErr w:type="spellEnd"/>
-      <w:r>
-        <w:t xml:space="preserve"> was some random string we set for demo</w:t>
+        <w:t>We get this error because image also demands from server by url and server takes slug and did not find any product by this title as the img property that was used in the src was some random string we set for demo</w:t>
       </w:r>
     </w:p>
     <w:p>
@@ -8518,29 +7101,13 @@
     </w:p>
     <w:p>
       <w:r>
-        <w:t xml:space="preserve">You can there is two things that is </w:t>
-      </w:r>
-      <w:proofErr w:type="spellStart"/>
-      <w:r>
-        <w:t>ToastContainer</w:t>
-      </w:r>
-      <w:proofErr w:type="spellEnd"/>
-      <w:r>
-        <w:t xml:space="preserve"> </w:t>
+        <w:t xml:space="preserve">You can there is two things that is ToastContainer </w:t>
       </w:r>
       <w:r>
         <w:t xml:space="preserve">which tells how our toast will be shown </w:t>
       </w:r>
       <w:r>
-        <w:t xml:space="preserve">, </w:t>
-      </w:r>
-      <w:proofErr w:type="spellStart"/>
-      <w:r>
-        <w:t>whjat</w:t>
-      </w:r>
-      <w:proofErr w:type="spellEnd"/>
-      <w:r>
-        <w:t xml:space="preserve"> will be the position and </w:t>
+        <w:t xml:space="preserve">, whjat will be the position and </w:t>
       </w:r>
       <w:r>
         <w:t xml:space="preserve">after what duration the </w:t>
@@ -8549,26 +7116,10 @@
         <w:t>toast should be closed</w:t>
       </w:r>
       <w:r>
-        <w:t xml:space="preserve"> and we have Toast </w:t>
-      </w:r>
-      <w:proofErr w:type="spellStart"/>
-      <w:r>
-        <w:t>Emmitor</w:t>
-      </w:r>
-      <w:proofErr w:type="spellEnd"/>
-      <w:r>
-        <w:t xml:space="preserve"> that invoke that component </w:t>
-      </w:r>
-      <w:r>
-        <w:t xml:space="preserve"> You can see </w:t>
-      </w:r>
-      <w:proofErr w:type="spellStart"/>
-      <w:r>
-        <w:t>oabove</w:t>
-      </w:r>
-      <w:proofErr w:type="spellEnd"/>
-      <w:r>
-        <w:t xml:space="preserve"> options of types and position is given . Choose your option and </w:t>
+        <w:t xml:space="preserve"> and we have Toast Emmitor that invoke that component </w:t>
+      </w:r>
+      <w:r>
+        <w:t xml:space="preserve"> You can see oabove options of types and position is given . Choose your option and </w:t>
       </w:r>
       <w:r>
         <w:t xml:space="preserve">then your code will reflect that. </w:t>
@@ -8814,21 +7365,12 @@
         </w:rPr>
         <w:t xml:space="preserve">import css of </w:t>
       </w:r>
-      <w:proofErr w:type="spellStart"/>
-      <w:r>
-        <w:rPr>
-          <w:b/>
-          <w:bCs/>
-        </w:rPr>
-        <w:t>toastify</w:t>
-      </w:r>
-      <w:proofErr w:type="spellEnd"/>
-      <w:r>
-        <w:rPr>
-          <w:b/>
-          <w:bCs/>
-        </w:rPr>
-        <w:t xml:space="preserve"> that come with it </w:t>
+      <w:r>
+        <w:rPr>
+          <w:b/>
+          <w:bCs/>
+        </w:rPr>
+        <w:t xml:space="preserve">toastify that come with it </w:t>
       </w:r>
       <w:r>
         <w:rPr>
@@ -8907,6 +7449,9 @@
         <w:jc w:val="center"/>
       </w:pPr>
       <w:r>
+        <w:rPr>
+          <w:noProof/>
+        </w:rPr>
         <w:drawing>
           <wp:inline distT="0" distB="0" distL="0" distR="0" wp14:anchorId="7E206959" wp14:editId="686252B6">
             <wp:extent cx="5731510" cy="2896870"/>
@@ -9009,15 +7554,7 @@
         <w:t>)</w:t>
       </w:r>
       <w:r>
-        <w:t xml:space="preserve"> but in Modern </w:t>
-      </w:r>
-      <w:proofErr w:type="spellStart"/>
-      <w:r>
-        <w:t>nextjs</w:t>
-      </w:r>
-      <w:proofErr w:type="spellEnd"/>
-      <w:r>
-        <w:t xml:space="preserve"> it does not happen as the responses are returned and the flow is stopped in the function.</w:t>
+        <w:t xml:space="preserve"> but in Modern nextjs it does not happen as the responses are returned and the flow is stopped in the function.</w:t>
       </w:r>
       <w:r>
         <w:t xml:space="preserve"> </w:t>
@@ -9141,6 +7678,274 @@
           <w:bCs/>
         </w:rPr>
         <w:t xml:space="preserve">. </w:t>
+      </w:r>
+    </w:p>
+    <w:p>
+      <w:r>
+        <w:t>User experience is bad if you</w:t>
+      </w:r>
+      <w:r>
+        <w:t>r</w:t>
+      </w:r>
+      <w:r>
+        <w:t xml:space="preserve"> site is not smooth </w:t>
+      </w:r>
+      <w:r>
+        <w:t xml:space="preserve">and </w:t>
+      </w:r>
+      <w:r>
+        <w:t>secure.</w:t>
+      </w:r>
+    </w:p>
+    <w:p>
+      <w:r>
+        <w:t xml:space="preserve">Now there is a dependency that we need that is </w:t>
+      </w:r>
+      <w:r>
+        <w:rPr>
+          <w:b/>
+          <w:bCs/>
+        </w:rPr>
+        <w:t>crypto</w:t>
+      </w:r>
+      <w:r>
+        <w:rPr>
+          <w:b/>
+          <w:bCs/>
+        </w:rPr>
+        <w:t>-</w:t>
+      </w:r>
+      <w:r>
+        <w:rPr>
+          <w:b/>
+          <w:bCs/>
+        </w:rPr>
+        <w:t>js</w:t>
+      </w:r>
+      <w:r>
+        <w:t xml:space="preserve"> for encryption.</w:t>
+      </w:r>
+    </w:p>
+    <w:p>
+      <w:r>
+        <w:t xml:space="preserve">When we encrypt </w:t>
+      </w:r>
+      <w:r>
+        <w:t>a password with a secret key</w:t>
+      </w:r>
+      <w:r>
+        <w:t xml:space="preserve"> and one benefit we get by this </w:t>
+      </w:r>
+      <w:r>
+        <w:t xml:space="preserve">is that </w:t>
+      </w:r>
+    </w:p>
+    <w:p>
+      <w:pPr>
+        <w:jc w:val="center"/>
+      </w:pPr>
+      <w:r>
+        <w:drawing>
+          <wp:inline distT="0" distB="0" distL="0" distR="0" wp14:anchorId="424B89E4" wp14:editId="66F5B669">
+            <wp:extent cx="4744112" cy="400106"/>
+            <wp:effectExtent l="0" t="0" r="0" b="0"/>
+            <wp:docPr id="212108795" name="Picture 1"/>
+            <wp:cNvGraphicFramePr>
+              <a:graphicFrameLocks xmlns:a="http://schemas.openxmlformats.org/drawingml/2006/main" noChangeAspect="1"/>
+            </wp:cNvGraphicFramePr>
+            <a:graphic xmlns:a="http://schemas.openxmlformats.org/drawingml/2006/main">
+              <a:graphicData uri="http://schemas.openxmlformats.org/drawingml/2006/picture">
+                <pic:pic xmlns:pic="http://schemas.openxmlformats.org/drawingml/2006/picture">
+                  <pic:nvPicPr>
+                    <pic:cNvPr id="212108795" name=""/>
+                    <pic:cNvPicPr/>
+                  </pic:nvPicPr>
+                  <pic:blipFill>
+                    <a:blip r:embed="rId52"/>
+                    <a:stretch>
+                      <a:fillRect/>
+                    </a:stretch>
+                  </pic:blipFill>
+                  <pic:spPr>
+                    <a:xfrm>
+                      <a:off x="0" y="0"/>
+                      <a:ext cx="4744112" cy="400106"/>
+                    </a:xfrm>
+                    <a:prstGeom prst="rect">
+                      <a:avLst/>
+                    </a:prstGeom>
+                  </pic:spPr>
+                </pic:pic>
+              </a:graphicData>
+            </a:graphic>
+          </wp:inline>
+        </w:drawing>
+      </w:r>
+    </w:p>
+    <w:p>
+      <w:r>
+        <w:t xml:space="preserve">You can see above we encrypted </w:t>
+      </w:r>
+      <w:r>
+        <w:t>the password with a secret keys</w:t>
+      </w:r>
+      <w:r>
+        <w:t xml:space="preserve"> which is a secret string actually </w:t>
+      </w:r>
+    </w:p>
+    <w:p>
+      <w:r>
+        <w:lastRenderedPageBreak/>
+        <w:t xml:space="preserve">We encrypted password because </w:t>
+      </w:r>
+      <w:r>
+        <w:t xml:space="preserve">we don’t want that even if our database got hacked </w:t>
+      </w:r>
+      <w:r>
+        <w:t>then still someone cannot access any account</w:t>
+      </w:r>
+      <w:r>
+        <w:t>.</w:t>
+      </w:r>
+      <w:r>
+        <w:t xml:space="preserve"> When we encrypt our password </w:t>
+      </w:r>
+      <w:r>
+        <w:t xml:space="preserve">then we encrypt it with a secret which we don’t tell anybody </w:t>
+      </w:r>
+      <w:r>
+        <w:t xml:space="preserve">obviously it will not be that simple it will be a very complex string </w:t>
+      </w:r>
+      <w:r>
+        <w:t xml:space="preserve">the benefit of that is that you can build the encrypted password from simple string </w:t>
+      </w:r>
+      <w:r>
+        <w:t>but cannot vice versa</w:t>
+      </w:r>
+      <w:r>
+        <w:t xml:space="preserve"> or we can say it is almost impossible to do so we basically need very high GPUs which many hackers cannot afford</w:t>
+      </w:r>
+      <w:r>
+        <w:t xml:space="preserve">. </w:t>
+      </w:r>
+      <w:r>
+        <w:t xml:space="preserve">These are special type of function that’s why they are used </w:t>
+      </w:r>
+    </w:p>
+    <w:p>
+      <w:pPr>
+        <w:rPr>
+          <w:b/>
+          <w:bCs/>
+        </w:rPr>
+      </w:pPr>
+      <w:r>
+        <w:rPr>
+          <w:b/>
+          <w:bCs/>
+        </w:rPr>
+        <w:t>Note:-</w:t>
+      </w:r>
+    </w:p>
+    <w:p>
+      <w:pPr>
+        <w:pBdr>
+          <w:bottom w:val="single" w:sz="12" w:space="1" w:color="auto"/>
+        </w:pBdr>
+      </w:pPr>
+      <w:r>
+        <w:t xml:space="preserve">Every time </w:t>
+      </w:r>
+      <w:r>
+        <w:t xml:space="preserve">we generate </w:t>
+      </w:r>
+      <w:r>
+        <w:t xml:space="preserve">an encrypted from of a </w:t>
+      </w:r>
+      <w:r>
+        <w:t xml:space="preserve">same </w:t>
+      </w:r>
+      <w:r>
+        <w:t>string</w:t>
+      </w:r>
+      <w:r>
+        <w:t xml:space="preserve"> </w:t>
+      </w:r>
+      <w:r>
+        <w:t>and even with sa</w:t>
+      </w:r>
+      <w:r>
+        <w:t>m</w:t>
+      </w:r>
+      <w:r>
+        <w:t xml:space="preserve">e secret key we get different </w:t>
+      </w:r>
+      <w:r>
+        <w:t xml:space="preserve">results because of salt </w:t>
+      </w:r>
+      <w:r>
+        <w:t>and we think it is a string that influences the formation of encrypted strin</w:t>
+      </w:r>
+      <w:r>
+        <w:t xml:space="preserve">g </w:t>
+      </w:r>
+      <w:r>
+        <w:t xml:space="preserve">and its string is decided by the algorithm </w:t>
+      </w:r>
+      <w:r>
+        <w:t>and while decrypting (how can it be possible) this string(or salt) may be decoded from the string.</w:t>
+      </w:r>
+      <w:r>
+        <w:t xml:space="preserve"> Evert algorithm has its own working</w:t>
+      </w:r>
+    </w:p>
+    <w:p>
+      <w:r>
+        <w:t xml:space="preserve">IN the working of AES we don’t need to match encrypted string </w:t>
+      </w:r>
+      <w:r>
+        <w:t xml:space="preserve">we need to match decrypted string. </w:t>
+      </w:r>
+    </w:p>
+    <w:p>
+      <w:r>
+        <w:t xml:space="preserve">There are lots of algorithm available </w:t>
+      </w:r>
+      <w:r>
+        <w:t xml:space="preserve">here </w:t>
+      </w:r>
+      <w:r>
+        <w:t>in crypto js</w:t>
+      </w:r>
+      <w:r>
+        <w:t>. You don’t have to know all</w:t>
+      </w:r>
+      <w:r>
+        <w:t xml:space="preserve"> algorithm</w:t>
+      </w:r>
+      <w:r>
+        <w:t>.</w:t>
+      </w:r>
+      <w:r>
+        <w:t xml:space="preserve"> </w:t>
+      </w:r>
+      <w:r>
+        <w:t>Y</w:t>
+      </w:r>
+      <w:r>
+        <w:t xml:space="preserve">ou </w:t>
+      </w:r>
+      <w:r>
+        <w:t>just</w:t>
+      </w:r>
+      <w:r>
+        <w:t xml:space="preserve"> need to </w:t>
+      </w:r>
+      <w:r>
+        <w:t xml:space="preserve">know how to deal with a particular </w:t>
+      </w:r>
+      <w:r>
+        <w:t>algorithm.</w:t>
       </w:r>
     </w:p>
     <w:p/>
@@ -10298,7 +9103,6 @@
   <w:style w:type="character" w:default="1" w:styleId="DefaultParagraphFont">
     <w:name w:val="Default Paragraph Font"/>
     <w:uiPriority w:val="1"/>
-    <w:semiHidden/>
     <w:unhideWhenUsed/>
   </w:style>
   <w:style w:type="table" w:default="1" w:styleId="TableNormal">

</xml_diff>

<commit_message>
Lesson 57 Introduction to JWT
</commit_message>
<xml_diff>
--- a/Notes2.docx
+++ b/Notes2.docx
@@ -4,8 +4,13 @@
   <w:body>
     <w:p>
       <w:r>
-        <w:t>In this lesson we will see a react feature that is dangerouslysetinnerHTML</w:t>
-      </w:r>
+        <w:t xml:space="preserve">In this lesson we will see a react feature that is </w:t>
+      </w:r>
+      <w:proofErr w:type="spellStart"/>
+      <w:r>
+        <w:t>dangerouslysetinnerHTML</w:t>
+      </w:r>
+      <w:proofErr w:type="spellEnd"/>
     </w:p>
     <w:p>
       <w:pPr>
@@ -66,7 +71,11 @@
         <w:t>input HTML</w:t>
       </w:r>
       <w:r>
-        <w:t xml:space="preserve"> then you have to use dangerou</w:t>
+        <w:t xml:space="preserve"> then you have to use </w:t>
+      </w:r>
+      <w:proofErr w:type="spellStart"/>
+      <w:r>
+        <w:t>dangerou</w:t>
       </w:r>
       <w:r>
         <w:t>s</w:t>
@@ -77,6 +86,7 @@
       <w:r>
         <w:t>setInner</w:t>
       </w:r>
+      <w:proofErr w:type="spellEnd"/>
       <w:r>
         <w:t xml:space="preserve"> </w:t>
       </w:r>
@@ -102,7 +112,15 @@
         <w:t xml:space="preserve">We will see with the help of </w:t>
       </w:r>
       <w:r>
-        <w:t xml:space="preserve">dangerously innerhtml </w:t>
+        <w:t xml:space="preserve">dangerously </w:t>
+      </w:r>
+      <w:proofErr w:type="spellStart"/>
+      <w:r>
+        <w:t>innerhtml</w:t>
+      </w:r>
+      <w:proofErr w:type="spellEnd"/>
+      <w:r>
+        <w:t xml:space="preserve"> </w:t>
       </w:r>
       <w:r>
         <w:t xml:space="preserve">we can put </w:t>
@@ -114,7 +132,15 @@
         <w:t>conten</w:t>
       </w:r>
       <w:r>
-        <w:t>t in huntingcoder which has simple</w:t>
+        <w:t xml:space="preserve">t in </w:t>
+      </w:r>
+      <w:proofErr w:type="spellStart"/>
+      <w:r>
+        <w:t>huntingcoder</w:t>
+      </w:r>
+      <w:proofErr w:type="spellEnd"/>
+      <w:r>
+        <w:t xml:space="preserve"> which has simple</w:t>
       </w:r>
       <w:r>
         <w:t xml:space="preserve"> p and hea</w:t>
@@ -144,7 +170,23 @@
         <w:t xml:space="preserve">Out blog is HTML Now if you </w:t>
       </w:r>
       <w:r>
-        <w:t xml:space="preserve">put html uibside string in json file. </w:t>
+        <w:t xml:space="preserve">put html </w:t>
+      </w:r>
+      <w:proofErr w:type="spellStart"/>
+      <w:r>
+        <w:t>uibside</w:t>
+      </w:r>
+      <w:proofErr w:type="spellEnd"/>
+      <w:r>
+        <w:t xml:space="preserve"> string in </w:t>
+      </w:r>
+      <w:proofErr w:type="spellStart"/>
+      <w:r>
+        <w:t>json</w:t>
+      </w:r>
+      <w:proofErr w:type="spellEnd"/>
+      <w:r>
+        <w:t xml:space="preserve"> file. </w:t>
       </w:r>
       <w:r>
         <w:t xml:space="preserve">We want to write such that </w:t>
@@ -167,7 +209,15 @@
         </w:r>
       </w:hyperlink>
       <w:r>
-        <w:t xml:space="preserve"> and then copy the html content shownin in the first page </w:t>
+        <w:t xml:space="preserve"> and then copy the html content </w:t>
+      </w:r>
+      <w:proofErr w:type="spellStart"/>
+      <w:r>
+        <w:t>shownin</w:t>
+      </w:r>
+      <w:proofErr w:type="spellEnd"/>
+      <w:r>
+        <w:t xml:space="preserve"> in the first page </w:t>
       </w:r>
       <w:r>
         <w:t xml:space="preserve">and at first we paste it in the address bar so that </w:t>
@@ -185,10 +235,26 @@
         <w:t>e</w:t>
       </w:r>
       <w:r>
-        <w:t xml:space="preserve"> and then we search Json and aby any ransom site escape the jaon that is replace “ by /” and many more and then again remove the </w:t>
-      </w:r>
-      <w:r>
-        <w:t>new lines by pasing in the address bar.</w:t>
+        <w:t xml:space="preserve"> and then we search Json and aby any ransom site escape the </w:t>
+      </w:r>
+      <w:proofErr w:type="spellStart"/>
+      <w:r>
+        <w:t>jaon</w:t>
+      </w:r>
+      <w:proofErr w:type="spellEnd"/>
+      <w:r>
+        <w:t xml:space="preserve"> that is replace “ by /” and many more and then again remove the </w:t>
+      </w:r>
+      <w:r>
+        <w:t xml:space="preserve">new lines by </w:t>
+      </w:r>
+      <w:proofErr w:type="spellStart"/>
+      <w:r>
+        <w:t>pasing</w:t>
+      </w:r>
+      <w:proofErr w:type="spellEnd"/>
+      <w:r>
+        <w:t xml:space="preserve"> in the address bar.</w:t>
       </w:r>
     </w:p>
     <w:p>
@@ -259,7 +325,15 @@
         <w:t>It</w:t>
       </w:r>
       <w:r>
-        <w:t>(Nextjs or react)</w:t>
+        <w:t>(</w:t>
+      </w:r>
+      <w:proofErr w:type="spellStart"/>
+      <w:r>
+        <w:t>Nextjs</w:t>
+      </w:r>
+      <w:proofErr w:type="spellEnd"/>
+      <w:r>
+        <w:t xml:space="preserve"> or react)</w:t>
       </w:r>
       <w:r>
         <w:t xml:space="preserve"> wants to keep you sa</w:t>
@@ -276,14 +350,27 @@
       <w:r>
         <w:t xml:space="preserve"> you need to tell </w:t>
       </w:r>
-      <w:r>
-        <w:t xml:space="preserve">Nextjs that you want to parse html </w:t>
+      <w:proofErr w:type="spellStart"/>
+      <w:r>
+        <w:t>Nextjs</w:t>
+      </w:r>
+      <w:proofErr w:type="spellEnd"/>
+      <w:r>
+        <w:t xml:space="preserve"> that you want to parse html </w:t>
       </w:r>
       <w:r>
         <w:t>there is a tool or setting (who knows)</w:t>
       </w:r>
       <w:r>
-        <w:t xml:space="preserve"> and it is a part of react not a part of nextjs </w:t>
+        <w:t xml:space="preserve"> and it is a part of react not a part of </w:t>
+      </w:r>
+      <w:proofErr w:type="spellStart"/>
+      <w:r>
+        <w:t>nextjs</w:t>
+      </w:r>
+      <w:proofErr w:type="spellEnd"/>
+      <w:r>
+        <w:t xml:space="preserve"> </w:t>
       </w:r>
       <w:r>
         <w:t xml:space="preserve">as it is a feature of react </w:t>
@@ -339,10 +426,23 @@
     </w:p>
     <w:p>
       <w:r>
-        <w:t>The element where you used dangerouslyinnerHTML</w:t>
-      </w:r>
-      <w:r>
-        <w:t xml:space="preserve"> should not have space in the content as it is considered a content other wise you will get this error</w:t>
+        <w:t xml:space="preserve">The element where you used </w:t>
+      </w:r>
+      <w:proofErr w:type="spellStart"/>
+      <w:r>
+        <w:t>dangerouslyinnerHTML</w:t>
+      </w:r>
+      <w:proofErr w:type="spellEnd"/>
+      <w:r>
+        <w:t xml:space="preserve"> should not have space in the content as it is considered a content </w:t>
+      </w:r>
+      <w:proofErr w:type="spellStart"/>
+      <w:r>
+        <w:t>other wise</w:t>
+      </w:r>
+      <w:proofErr w:type="spellEnd"/>
+      <w:r>
+        <w:t xml:space="preserve"> you will get this error</w:t>
       </w:r>
     </w:p>
     <w:p>
@@ -390,7 +490,15 @@
     </w:p>
     <w:p>
       <w:r>
-        <w:t>Now our slug folder page.jsx look like below</w:t>
+        <w:t xml:space="preserve">Now our slug folder </w:t>
+      </w:r>
+      <w:proofErr w:type="spellStart"/>
+      <w:r>
+        <w:t>page.jsx</w:t>
+      </w:r>
+      <w:proofErr w:type="spellEnd"/>
+      <w:r>
+        <w:t xml:space="preserve"> look like below</w:t>
       </w:r>
     </w:p>
     <w:p>
@@ -563,8 +671,13 @@
       <w:r>
         <w:t xml:space="preserve"> </w:t>
       </w:r>
-      <w:r>
-        <w:t>api in this lesso</w:t>
+      <w:proofErr w:type="spellStart"/>
+      <w:r>
+        <w:t>api</w:t>
+      </w:r>
+      <w:proofErr w:type="spellEnd"/>
+      <w:r>
+        <w:t xml:space="preserve"> in this lesso</w:t>
       </w:r>
       <w:r>
         <w:t>n. We will see make it using Next.js API route</w:t>
@@ -587,8 +700,21 @@
       <w:r>
         <w:t xml:space="preserve">it </w:t>
       </w:r>
-      <w:r>
-        <w:t>Seom noownards I will not give too much explanation</w:t>
+      <w:proofErr w:type="spellStart"/>
+      <w:r>
+        <w:t>Seom</w:t>
+      </w:r>
+      <w:proofErr w:type="spellEnd"/>
+      <w:r>
+        <w:t xml:space="preserve"> </w:t>
+      </w:r>
+      <w:proofErr w:type="spellStart"/>
+      <w:r>
+        <w:t>noownards</w:t>
+      </w:r>
+      <w:proofErr w:type="spellEnd"/>
+      <w:r>
+        <w:t xml:space="preserve"> I will not give too much explanation</w:t>
       </w:r>
     </w:p>
     <w:p>
@@ -717,12 +843,28 @@
     </w:p>
     <w:p>
       <w:r>
-        <w:t xml:space="preserve">In older version teacher try to send req but could not send because </w:t>
-      </w:r>
-    </w:p>
-    <w:p>
-      <w:r>
-        <w:t xml:space="preserve">You didn’t see useful data because req is a </w:t>
+        <w:t xml:space="preserve">In older version teacher try to send </w:t>
+      </w:r>
+      <w:proofErr w:type="spellStart"/>
+      <w:r>
+        <w:t>req</w:t>
+      </w:r>
+      <w:proofErr w:type="spellEnd"/>
+      <w:r>
+        <w:t xml:space="preserve"> but could not send because </w:t>
+      </w:r>
+    </w:p>
+    <w:p>
+      <w:r>
+        <w:t xml:space="preserve">You didn’t see useful data because </w:t>
+      </w:r>
+      <w:proofErr w:type="spellStart"/>
+      <w:r>
+        <w:t>req</w:t>
+      </w:r>
+      <w:proofErr w:type="spellEnd"/>
+      <w:r>
+        <w:t xml:space="preserve"> is a </w:t>
       </w:r>
       <w:r>
         <w:rPr>
@@ -732,7 +874,23 @@
         <w:t>complex object</w:t>
       </w:r>
       <w:r>
-        <w:t>, not plain JSON, so sending it directly with res.json(req) doesn’t work as expected.</w:t>
+        <w:t xml:space="preserve">, not plain JSON, so sending it directly with </w:t>
+      </w:r>
+      <w:proofErr w:type="spellStart"/>
+      <w:r>
+        <w:t>res.json</w:t>
+      </w:r>
+      <w:proofErr w:type="spellEnd"/>
+      <w:r>
+        <w:t>(</w:t>
+      </w:r>
+      <w:proofErr w:type="spellStart"/>
+      <w:r>
+        <w:t>req</w:t>
+      </w:r>
+      <w:proofErr w:type="spellEnd"/>
+      <w:r>
+        <w:t>) doesn’t work as expected.</w:t>
       </w:r>
     </w:p>
     <w:p>
@@ -754,7 +912,23 @@
           <w:b/>
           <w:bCs/>
         </w:rPr>
-        <w:t>What req contains (old Next.js / Node.js)</w:t>
+        <w:t xml:space="preserve">What </w:t>
+      </w:r>
+      <w:proofErr w:type="spellStart"/>
+      <w:r>
+        <w:rPr>
+          <w:b/>
+          <w:bCs/>
+        </w:rPr>
+        <w:t>req</w:t>
+      </w:r>
+      <w:proofErr w:type="spellEnd"/>
+      <w:r>
+        <w:rPr>
+          <w:b/>
+          <w:bCs/>
+        </w:rPr>
+        <w:t xml:space="preserve"> contains (old Next.js / Node.js)</w:t>
       </w:r>
     </w:p>
     <w:p>
@@ -764,12 +938,25 @@
     </w:p>
     <w:p>
       <w:r>
-        <w:t>export default function handler(req, res)</w:t>
-      </w:r>
-    </w:p>
-    <w:p>
-      <w:r>
-        <w:t xml:space="preserve">req is a </w:t>
+        <w:t>export default function handler(</w:t>
+      </w:r>
+      <w:proofErr w:type="spellStart"/>
+      <w:r>
+        <w:t>req</w:t>
+      </w:r>
+      <w:proofErr w:type="spellEnd"/>
+      <w:r>
+        <w:t>, res)</w:t>
+      </w:r>
+    </w:p>
+    <w:p>
+      <w:proofErr w:type="spellStart"/>
+      <w:r>
+        <w:t>req</w:t>
+      </w:r>
+      <w:proofErr w:type="spellEnd"/>
+      <w:r>
+        <w:t xml:space="preserve"> is a </w:t>
       </w:r>
       <w:r>
         <w:rPr>
@@ -856,7 +1043,39 @@
           <w:b/>
           <w:bCs/>
         </w:rPr>
-        <w:t>Why res.json(req) doesn’t show data</w:t>
+        <w:t xml:space="preserve">Why </w:t>
+      </w:r>
+      <w:proofErr w:type="spellStart"/>
+      <w:r>
+        <w:rPr>
+          <w:b/>
+          <w:bCs/>
+        </w:rPr>
+        <w:t>res.json</w:t>
+      </w:r>
+      <w:proofErr w:type="spellEnd"/>
+      <w:r>
+        <w:rPr>
+          <w:b/>
+          <w:bCs/>
+        </w:rPr>
+        <w:t>(</w:t>
+      </w:r>
+      <w:proofErr w:type="spellStart"/>
+      <w:r>
+        <w:rPr>
+          <w:b/>
+          <w:bCs/>
+        </w:rPr>
+        <w:t>req</w:t>
+      </w:r>
+      <w:proofErr w:type="spellEnd"/>
+      <w:r>
+        <w:rPr>
+          <w:b/>
+          <w:bCs/>
+        </w:rPr>
+        <w:t>) doesn’t show data</w:t>
       </w:r>
     </w:p>
     <w:p>
@@ -865,8 +1084,29 @@
       </w:r>
     </w:p>
     <w:p>
-      <w:r>
-        <w:t>res.status(200).json(req)</w:t>
+      <w:proofErr w:type="spellStart"/>
+      <w:r>
+        <w:t>res.status</w:t>
+      </w:r>
+      <w:proofErr w:type="spellEnd"/>
+      <w:r>
+        <w:t>(200).</w:t>
+      </w:r>
+      <w:proofErr w:type="spellStart"/>
+      <w:r>
+        <w:t>json</w:t>
+      </w:r>
+      <w:proofErr w:type="spellEnd"/>
+      <w:r>
+        <w:t>(</w:t>
+      </w:r>
+      <w:proofErr w:type="spellStart"/>
+      <w:r>
+        <w:t>req</w:t>
+      </w:r>
+      <w:proofErr w:type="spellEnd"/>
+      <w:r>
+        <w:t>)</w:t>
       </w:r>
     </w:p>
     <w:p>
@@ -875,8 +1115,13 @@
       </w:r>
     </w:p>
     <w:p>
-      <w:r>
-        <w:t>req is NOT a plain object</w:t>
+      <w:proofErr w:type="spellStart"/>
+      <w:r>
+        <w:t>req</w:t>
+      </w:r>
+      <w:proofErr w:type="spellEnd"/>
+      <w:r>
+        <w:t xml:space="preserve"> is NOT a plain object</w:t>
       </w:r>
       <w:r>
         <w:br/>
@@ -952,27 +1197,83 @@
     </w:p>
     <w:p>
       <w:r>
-        <w:t>export default function handler(req, res) {</w:t>
+        <w:t>export default function handler(</w:t>
+      </w:r>
+      <w:proofErr w:type="spellStart"/>
+      <w:r>
+        <w:t>req</w:t>
+      </w:r>
+      <w:proofErr w:type="spellEnd"/>
+      <w:r>
+        <w:t>, res) {</w:t>
       </w:r>
       <w:r>
         <w:br/>
-        <w:t xml:space="preserve">  if (req.method === "POST") {</w:t>
+        <w:t xml:space="preserve">  if (</w:t>
+      </w:r>
+      <w:proofErr w:type="spellStart"/>
+      <w:r>
+        <w:t>req.method</w:t>
+      </w:r>
+      <w:proofErr w:type="spellEnd"/>
+      <w:r>
+        <w:t xml:space="preserve"> === "POST") {</w:t>
       </w:r>
       <w:r>
         <w:br/>
-        <w:t xml:space="preserve">    res.status(200).json({</w:t>
+        <w:t xml:space="preserve">    </w:t>
+      </w:r>
+      <w:proofErr w:type="spellStart"/>
+      <w:r>
+        <w:t>res.status</w:t>
+      </w:r>
+      <w:proofErr w:type="spellEnd"/>
+      <w:r>
+        <w:t>(200).</w:t>
+      </w:r>
+      <w:proofErr w:type="spellStart"/>
+      <w:r>
+        <w:t>json</w:t>
+      </w:r>
+      <w:proofErr w:type="spellEnd"/>
+      <w:r>
+        <w:t>({</w:t>
       </w:r>
       <w:r>
         <w:br/>
-        <w:t xml:space="preserve">      method: req.method,</w:t>
+        <w:t xml:space="preserve">      method: </w:t>
+      </w:r>
+      <w:proofErr w:type="spellStart"/>
+      <w:r>
+        <w:t>req.method</w:t>
+      </w:r>
+      <w:proofErr w:type="spellEnd"/>
+      <w:r>
+        <w:t>,</w:t>
       </w:r>
       <w:r>
         <w:br/>
-        <w:t xml:space="preserve">      body: req.body,</w:t>
+        <w:t xml:space="preserve">      body: </w:t>
+      </w:r>
+      <w:proofErr w:type="spellStart"/>
+      <w:r>
+        <w:t>req.body</w:t>
+      </w:r>
+      <w:proofErr w:type="spellEnd"/>
+      <w:r>
+        <w:t>,</w:t>
       </w:r>
       <w:r>
         <w:br/>
-        <w:t xml:space="preserve">      query: req.query,</w:t>
+        <w:t xml:space="preserve">      query: </w:t>
+      </w:r>
+      <w:proofErr w:type="spellStart"/>
+      <w:r>
+        <w:t>req.query</w:t>
+      </w:r>
+      <w:proofErr w:type="spellEnd"/>
+      <w:r>
+        <w:t>,</w:t>
       </w:r>
       <w:r>
         <w:br/>
@@ -1096,8 +1397,13 @@
             <w:hideMark/>
           </w:tcPr>
           <w:p>
+            <w:proofErr w:type="spellStart"/>
             <w:r>
-              <w:t>req (whole object)</w:t>
+              <w:t>req</w:t>
+            </w:r>
+            <w:proofErr w:type="spellEnd"/>
+            <w:r>
+              <w:t xml:space="preserve"> (whole object)</w:t>
             </w:r>
           </w:p>
         </w:tc>
@@ -1131,9 +1437,11 @@
             <w:hideMark/>
           </w:tcPr>
           <w:p>
+            <w:proofErr w:type="spellStart"/>
             <w:r>
               <w:t>req.body</w:t>
             </w:r>
+            <w:proofErr w:type="spellEnd"/>
           </w:p>
         </w:tc>
         <w:tc>
@@ -1166,9 +1474,11 @@
             <w:hideMark/>
           </w:tcPr>
           <w:p>
+            <w:proofErr w:type="spellStart"/>
             <w:r>
               <w:t>req.query</w:t>
             </w:r>
+            <w:proofErr w:type="spellEnd"/>
           </w:p>
         </w:tc>
         <w:tc>
@@ -1201,9 +1511,11 @@
             <w:hideMark/>
           </w:tcPr>
           <w:p>
+            <w:proofErr w:type="spellStart"/>
             <w:r>
               <w:t>req.method</w:t>
             </w:r>
+            <w:proofErr w:type="spellEnd"/>
           </w:p>
         </w:tc>
         <w:tc>
@@ -1255,7 +1567,15 @@
     </w:p>
     <w:p>
       <w:r>
-        <w:t>export async function POST(req)</w:t>
+        <w:t>export async function POST(</w:t>
+      </w:r>
+      <w:proofErr w:type="spellStart"/>
+      <w:r>
+        <w:t>req</w:t>
+      </w:r>
+      <w:proofErr w:type="spellEnd"/>
+      <w:r>
+        <w:t>)</w:t>
       </w:r>
     </w:p>
     <w:p>
@@ -1264,8 +1584,21 @@
       </w:r>
     </w:p>
     <w:p>
-      <w:r>
-        <w:t>const body = await req.json();</w:t>
+      <w:proofErr w:type="spellStart"/>
+      <w:r>
+        <w:t>const</w:t>
+      </w:r>
+      <w:proofErr w:type="spellEnd"/>
+      <w:r>
+        <w:t xml:space="preserve"> body = await </w:t>
+      </w:r>
+      <w:proofErr w:type="spellStart"/>
+      <w:r>
+        <w:t>req.json</w:t>
+      </w:r>
+      <w:proofErr w:type="spellEnd"/>
+      <w:r>
+        <w:t>();</w:t>
       </w:r>
     </w:p>
     <w:p>
@@ -1308,13 +1641,29 @@
       </w:pPr>
       <w:r>
         <w:lastRenderedPageBreak/>
-        <w:t>You didn’t see req in the response because it’s a complex object that cannot be directly converted to JSON—you need to se</w:t>
+        <w:t xml:space="preserve">You didn’t see </w:t>
+      </w:r>
+      <w:proofErr w:type="spellStart"/>
+      <w:r>
+        <w:t>req</w:t>
+      </w:r>
+      <w:proofErr w:type="spellEnd"/>
+      <w:r>
+        <w:t xml:space="preserve"> in the response because it’s a complex object that cannot be directly converted to JSON—you need to se</w:t>
       </w:r>
       <w:r>
         <w:t>n</w:t>
       </w:r>
       <w:r>
-        <w:t>d specific fields like req.body.</w:t>
+        <w:t xml:space="preserve">d specific fields like </w:t>
+      </w:r>
+      <w:proofErr w:type="spellStart"/>
+      <w:r>
+        <w:t>req.body</w:t>
+      </w:r>
+      <w:proofErr w:type="spellEnd"/>
+      <w:r>
+        <w:t>.</w:t>
       </w:r>
     </w:p>
     <w:p>
@@ -1431,7 +1780,31 @@
         <w:t xml:space="preserve"> is that </w:t>
       </w:r>
       <w:r>
-        <w:t xml:space="preserve">if suppose oint fail is failed to wiriteen an empyty fie is created </w:t>
+        <w:t xml:space="preserve">if suppose </w:t>
+      </w:r>
+      <w:proofErr w:type="spellStart"/>
+      <w:r>
+        <w:t>oint</w:t>
+      </w:r>
+      <w:proofErr w:type="spellEnd"/>
+      <w:r>
+        <w:t xml:space="preserve"> fail is failed to </w:t>
+      </w:r>
+      <w:proofErr w:type="spellStart"/>
+      <w:r>
+        <w:t>wiriteen</w:t>
+      </w:r>
+      <w:proofErr w:type="spellEnd"/>
+      <w:r>
+        <w:t xml:space="preserve"> an </w:t>
+      </w:r>
+      <w:proofErr w:type="spellStart"/>
+      <w:r>
+        <w:t>empyty</w:t>
+      </w:r>
+      <w:proofErr w:type="spellEnd"/>
+      <w:r>
+        <w:t xml:space="preserve"> fie is created </w:t>
       </w:r>
       <w:r>
         <w:t>problem can happen (maybe if we associate a number to a user who tries to contact (who knows))</w:t>
@@ -1493,7 +1866,15 @@
       </w:r>
       <w:r>
         <w:lastRenderedPageBreak/>
-        <w:t xml:space="preserve">This error we may face if we son’t set the value of the input fields </w:t>
+        <w:t xml:space="preserve">This error we may face if we </w:t>
+      </w:r>
+      <w:proofErr w:type="spellStart"/>
+      <w:r>
+        <w:t>son’t</w:t>
+      </w:r>
+      <w:proofErr w:type="spellEnd"/>
+      <w:r>
+        <w:t xml:space="preserve"> set the value of the input fields </w:t>
       </w:r>
     </w:p>
     <w:p>
@@ -1501,7 +1882,15 @@
         <w:t xml:space="preserve">In older version </w:t>
       </w:r>
       <w:r>
-        <w:t>we used to put the state value in between the textarea element</w:t>
+        <w:t xml:space="preserve">we used to put the state value in between the </w:t>
+      </w:r>
+      <w:proofErr w:type="spellStart"/>
+      <w:r>
+        <w:t>textarea</w:t>
+      </w:r>
+      <w:proofErr w:type="spellEnd"/>
+      <w:r>
+        <w:t xml:space="preserve"> element</w:t>
       </w:r>
       <w:r>
         <w:t>(who knows may be I am wrong here)</w:t>
@@ -1510,20 +1899,70 @@
         <w:t xml:space="preserve"> </w:t>
       </w:r>
       <w:r>
-        <w:t>and on state update method we used e.target.innerText</w:t>
-      </w:r>
-    </w:p>
-    <w:p>
-      <w:r>
-        <w:t>But now in Textare we can use e.target,value as value attribute is used in the Textfi</w:t>
+        <w:t xml:space="preserve">and on state update method we used </w:t>
+      </w:r>
+      <w:proofErr w:type="spellStart"/>
+      <w:r>
+        <w:t>e.target.innerText</w:t>
+      </w:r>
+      <w:proofErr w:type="spellEnd"/>
+    </w:p>
+    <w:p>
+      <w:r>
+        <w:t xml:space="preserve">But now in </w:t>
+      </w:r>
+      <w:proofErr w:type="spellStart"/>
+      <w:r>
+        <w:t>Textare</w:t>
+      </w:r>
+      <w:proofErr w:type="spellEnd"/>
+      <w:r>
+        <w:t xml:space="preserve"> we can use </w:t>
+      </w:r>
+      <w:proofErr w:type="spellStart"/>
+      <w:r>
+        <w:t>e.target,value</w:t>
+      </w:r>
+      <w:proofErr w:type="spellEnd"/>
+      <w:r>
+        <w:t xml:space="preserve"> as value attribute is used in the </w:t>
+      </w:r>
+      <w:proofErr w:type="spellStart"/>
+      <w:r>
+        <w:t>Textfi</w:t>
       </w:r>
       <w:r>
         <w:t>eld</w:t>
       </w:r>
-    </w:p>
-    <w:p>
-      <w:r>
-        <w:t>The API may not give json response but instead uit may text reponse who knows and we can parse it by text method in response we are fetching</w:t>
+      <w:proofErr w:type="spellEnd"/>
+    </w:p>
+    <w:p>
+      <w:r>
+        <w:t xml:space="preserve">The API may not give </w:t>
+      </w:r>
+      <w:proofErr w:type="spellStart"/>
+      <w:r>
+        <w:t>json</w:t>
+      </w:r>
+      <w:proofErr w:type="spellEnd"/>
+      <w:r>
+        <w:t xml:space="preserve"> response but instead </w:t>
+      </w:r>
+      <w:proofErr w:type="spellStart"/>
+      <w:r>
+        <w:t>uit</w:t>
+      </w:r>
+      <w:proofErr w:type="spellEnd"/>
+      <w:r>
+        <w:t xml:space="preserve"> may text </w:t>
+      </w:r>
+      <w:proofErr w:type="spellStart"/>
+      <w:r>
+        <w:t>reponse</w:t>
+      </w:r>
+      <w:proofErr w:type="spellEnd"/>
+      <w:r>
+        <w:t xml:space="preserve"> who knows and we can parse it by text method in response we are fetching</w:t>
       </w:r>
       <w:r>
         <w:t xml:space="preserve"> as shown below</w:t>
@@ -1595,7 +2034,15 @@
     </w:p>
     <w:p>
       <w:r>
-        <w:t xml:space="preserve">Shortcut for margin:auto will be </w:t>
+        <w:t xml:space="preserve">Shortcut for </w:t>
+      </w:r>
+      <w:proofErr w:type="spellStart"/>
+      <w:r>
+        <w:t>margin:auto</w:t>
+      </w:r>
+      <w:proofErr w:type="spellEnd"/>
+      <w:r>
+        <w:t xml:space="preserve"> will be </w:t>
       </w:r>
       <w:r>
         <w:rPr>
@@ -1612,12 +2059,25 @@
         <w:t xml:space="preserve"> </w:t>
       </w:r>
       <w:r>
-        <w:t>in VSCode</w:t>
-      </w:r>
-    </w:p>
-    <w:p>
-      <w:r>
-        <w:t xml:space="preserve">In name of logic we forgot to style outpages are not responsive which teacher will talk about in upcoming lesson </w:t>
+        <w:t xml:space="preserve">in </w:t>
+      </w:r>
+      <w:proofErr w:type="spellStart"/>
+      <w:r>
+        <w:t>VSCode</w:t>
+      </w:r>
+      <w:proofErr w:type="spellEnd"/>
+    </w:p>
+    <w:p>
+      <w:r>
+        <w:t xml:space="preserve">In name of logic we forgot to style </w:t>
+      </w:r>
+      <w:proofErr w:type="spellStart"/>
+      <w:r>
+        <w:t>outpages</w:t>
+      </w:r>
+      <w:proofErr w:type="spellEnd"/>
+      <w:r>
+        <w:t xml:space="preserve"> are not responsive which teacher will talk about in upcoming lesson </w:t>
       </w:r>
       <w:r>
         <w:t xml:space="preserve">we will see how to keep styling of </w:t>
@@ -1681,7 +2141,15 @@
         <w:t xml:space="preserve">by infinite scroll </w:t>
       </w:r>
       <w:r>
-        <w:t xml:space="preserve">like facebook news feed </w:t>
+        <w:t xml:space="preserve">like </w:t>
+      </w:r>
+      <w:proofErr w:type="spellStart"/>
+      <w:r>
+        <w:t>facebook</w:t>
+      </w:r>
+      <w:proofErr w:type="spellEnd"/>
+      <w:r>
+        <w:t xml:space="preserve"> news feed </w:t>
       </w:r>
       <w:r>
         <w:t>you keep scrolling and new thing appears</w:t>
@@ -1710,7 +2178,15 @@
         <w:t xml:space="preserve"> observer</w:t>
       </w:r>
       <w:r>
-        <w:t xml:space="preserve"> api. </w:t>
+        <w:t xml:space="preserve"> </w:t>
+      </w:r>
+      <w:proofErr w:type="spellStart"/>
+      <w:r>
+        <w:t>api</w:t>
+      </w:r>
+      <w:proofErr w:type="spellEnd"/>
+      <w:r>
+        <w:t xml:space="preserve">. </w:t>
       </w:r>
     </w:p>
     <w:p>
@@ -1746,7 +2222,23 @@
           <w:b/>
           <w:bCs/>
         </w:rPr>
-        <w:t xml:space="preserve">which id already made for us </w:t>
+        <w:t xml:space="preserve">which </w:t>
+      </w:r>
+      <w:proofErr w:type="spellStart"/>
+      <w:r>
+        <w:rPr>
+          <w:b/>
+          <w:bCs/>
+        </w:rPr>
+        <w:t>id</w:t>
+      </w:r>
+      <w:proofErr w:type="spellEnd"/>
+      <w:r>
+        <w:rPr>
+          <w:b/>
+          <w:bCs/>
+        </w:rPr>
+        <w:t xml:space="preserve"> already made for us </w:t>
       </w:r>
     </w:p>
     <w:p>
@@ -1768,12 +2260,21 @@
           <w:bCs/>
         </w:rPr>
       </w:pPr>
-      <w:r>
-        <w:rPr>
-          <w:b/>
-          <w:bCs/>
-        </w:rPr>
-        <w:t>npm install --save react-infinite-scroll-component</w:t>
+      <w:proofErr w:type="spellStart"/>
+      <w:r>
+        <w:rPr>
+          <w:b/>
+          <w:bCs/>
+        </w:rPr>
+        <w:t>npm</w:t>
+      </w:r>
+      <w:proofErr w:type="spellEnd"/>
+      <w:r>
+        <w:rPr>
+          <w:b/>
+          <w:bCs/>
+        </w:rPr>
+        <w:t xml:space="preserve"> install --save react-infinite-scroll-component</w:t>
       </w:r>
     </w:p>
     <w:p>
@@ -1885,9 +2386,11 @@
       <w:r>
         <w:t xml:space="preserve">The props below the </w:t>
       </w:r>
+      <w:proofErr w:type="spellStart"/>
       <w:r>
         <w:t>endMessage</w:t>
       </w:r>
+      <w:proofErr w:type="spellEnd"/>
       <w:r>
         <w:t xml:space="preserve"> </w:t>
       </w:r>
@@ -1915,7 +2418,15 @@
     </w:p>
     <w:p>
       <w:r>
-        <w:t xml:space="preserve">You can use InfiniteScroll only in client side so </w:t>
+        <w:t xml:space="preserve">You can use </w:t>
+      </w:r>
+      <w:proofErr w:type="spellStart"/>
+      <w:r>
+        <w:t>InfiniteScroll</w:t>
+      </w:r>
+      <w:proofErr w:type="spellEnd"/>
+      <w:r>
+        <w:t xml:space="preserve"> only in client side so </w:t>
       </w:r>
       <w:r>
         <w:t xml:space="preserve">we need to use it in client component so we will change the blogs from SSG to client component. </w:t>
@@ -1934,8 +2445,13 @@
       <w:r>
         <w:t xml:space="preserve">we use any library </w:t>
       </w:r>
-      <w:r>
-        <w:t>onw imp</w:t>
+      <w:proofErr w:type="spellStart"/>
+      <w:r>
+        <w:t>onw</w:t>
+      </w:r>
+      <w:proofErr w:type="spellEnd"/>
+      <w:r>
+        <w:t xml:space="preserve"> imp</w:t>
       </w:r>
       <w:r>
         <w:t>o</w:t>
@@ -1959,7 +2475,15 @@
         <w:t xml:space="preserve">ined </w:t>
       </w:r>
       <w:r>
-        <w:t>is it idefined like that you have t</w:t>
+        <w:t xml:space="preserve">is it </w:t>
+      </w:r>
+      <w:proofErr w:type="spellStart"/>
+      <w:r>
+        <w:t>idefined</w:t>
+      </w:r>
+      <w:proofErr w:type="spellEnd"/>
+      <w:r>
+        <w:t xml:space="preserve"> like that you have t</w:t>
       </w:r>
       <w:r>
         <w:t xml:space="preserve">o </w:t>
@@ -2062,10 +2586,26 @@
         <w:t xml:space="preserve"> it was an addon</w:t>
       </w:r>
       <w:r>
-        <w:t xml:space="preserve"> if you gave it then it was a favor </w:t>
-      </w:r>
-      <w:r>
-        <w:t xml:space="preserve">you can say bit in todays time </w:t>
+        <w:t xml:space="preserve"> if you gave it then it was a </w:t>
+      </w:r>
+      <w:proofErr w:type="spellStart"/>
+      <w:r>
+        <w:t>favor</w:t>
+      </w:r>
+      <w:proofErr w:type="spellEnd"/>
+      <w:r>
+        <w:t xml:space="preserve"> </w:t>
+      </w:r>
+      <w:r>
+        <w:t xml:space="preserve">you can say bit in </w:t>
+      </w:r>
+      <w:proofErr w:type="spellStart"/>
+      <w:r>
+        <w:t>todays</w:t>
+      </w:r>
+      <w:proofErr w:type="spellEnd"/>
+      <w:r>
+        <w:t xml:space="preserve"> time </w:t>
       </w:r>
       <w:r>
         <w:t xml:space="preserve">if you are delivering a website </w:t>
@@ -2336,7 +2876,23 @@
     </w:p>
     <w:p>
       <w:r>
-        <w:t xml:space="preserve">It is very simple an it wil automatically detect your application </w:t>
+        <w:t xml:space="preserve">It is very simple </w:t>
+      </w:r>
+      <w:proofErr w:type="spellStart"/>
+      <w:r>
+        <w:t>an</w:t>
+      </w:r>
+      <w:proofErr w:type="spellEnd"/>
+      <w:r>
+        <w:t xml:space="preserve"> it </w:t>
+      </w:r>
+      <w:proofErr w:type="spellStart"/>
+      <w:r>
+        <w:t>wil</w:t>
+      </w:r>
+      <w:proofErr w:type="spellEnd"/>
+      <w:r>
+        <w:t xml:space="preserve"> automatically detect your application </w:t>
       </w:r>
     </w:p>
     <w:p>
@@ -2347,7 +2903,23 @@
         <w:t>d</w:t>
       </w:r>
       <w:r>
-        <w:t xml:space="preserve"> use it like a node ap hten it will be good(wjp knows)</w:t>
+        <w:t xml:space="preserve"> use it like a node ap </w:t>
+      </w:r>
+      <w:proofErr w:type="spellStart"/>
+      <w:r>
+        <w:t>hten</w:t>
+      </w:r>
+      <w:proofErr w:type="spellEnd"/>
+      <w:r>
+        <w:t xml:space="preserve"> it will be good(</w:t>
+      </w:r>
+      <w:proofErr w:type="spellStart"/>
+      <w:r>
+        <w:t>wjp</w:t>
+      </w:r>
+      <w:proofErr w:type="spellEnd"/>
+      <w:r>
+        <w:t xml:space="preserve"> knows)</w:t>
       </w:r>
     </w:p>
     <w:p>
@@ -2372,15 +2944,16 @@
           <w:bCs/>
           <w:color w:val="EE0000"/>
         </w:rPr>
-        <w:t>error in js</w:t>
-      </w:r>
+        <w:t xml:space="preserve">error in </w:t>
+      </w:r>
+      <w:proofErr w:type="spellStart"/>
       <w:r>
         <w:rPr>
           <w:b/>
           <w:bCs/>
           <w:color w:val="EE0000"/>
         </w:rPr>
-        <w:t>x in Nextjs or maybe in React.</w:t>
+        <w:t>js</w:t>
       </w:r>
       <w:r>
         <w:rPr>
@@ -2388,6 +2961,41 @@
           <w:bCs/>
           <w:color w:val="EE0000"/>
         </w:rPr>
+        <w:t>x</w:t>
+      </w:r>
+      <w:proofErr w:type="spellEnd"/>
+      <w:r>
+        <w:rPr>
+          <w:b/>
+          <w:bCs/>
+          <w:color w:val="EE0000"/>
+        </w:rPr>
+        <w:t xml:space="preserve"> in </w:t>
+      </w:r>
+      <w:proofErr w:type="spellStart"/>
+      <w:r>
+        <w:rPr>
+          <w:b/>
+          <w:bCs/>
+          <w:color w:val="EE0000"/>
+        </w:rPr>
+        <w:t>Nextjs</w:t>
+      </w:r>
+      <w:proofErr w:type="spellEnd"/>
+      <w:r>
+        <w:rPr>
+          <w:b/>
+          <w:bCs/>
+          <w:color w:val="EE0000"/>
+        </w:rPr>
+        <w:t xml:space="preserve"> or maybe in React.</w:t>
+      </w:r>
+      <w:r>
+        <w:rPr>
+          <w:b/>
+          <w:bCs/>
+          <w:color w:val="EE0000"/>
+        </w:rPr>
         <w:t>(maybe it is an outdated problem)</w:t>
       </w:r>
     </w:p>
@@ -2410,7 +3018,15 @@
         <w:t xml:space="preserve">that </w:t>
       </w:r>
       <w:r>
-        <w:t xml:space="preserve">you can make it like that and if it become profitable then you can scale it (who knows) </w:t>
+        <w:t xml:space="preserve">you can make it like that and if it </w:t>
+      </w:r>
+      <w:proofErr w:type="spellStart"/>
+      <w:r>
+        <w:t>become</w:t>
+      </w:r>
+      <w:proofErr w:type="spellEnd"/>
+      <w:r>
+        <w:t xml:space="preserve"> profitable then you can scale it (who knows) </w:t>
       </w:r>
     </w:p>
     <w:p>
@@ -2524,7 +3140,15 @@
         <w:t>how Google analytics and search console</w:t>
       </w:r>
       <w:r>
-        <w:t>(who knowa)</w:t>
+        <w:t xml:space="preserve">(who </w:t>
+      </w:r>
+      <w:proofErr w:type="spellStart"/>
+      <w:r>
+        <w:t>knowa</w:t>
+      </w:r>
+      <w:proofErr w:type="spellEnd"/>
+      <w:r>
+        <w:t>)</w:t>
       </w:r>
       <w:r>
         <w:t xml:space="preserve"> </w:t>
@@ -2540,8 +3164,13 @@
       </w:r>
     </w:p>
     <w:p>
-      <w:r>
-        <w:t xml:space="preserve">Nextjs </w:t>
+      <w:proofErr w:type="spellStart"/>
+      <w:r>
+        <w:t>Nextjs</w:t>
+      </w:r>
+      <w:proofErr w:type="spellEnd"/>
+      <w:r>
+        <w:t xml:space="preserve"> </w:t>
       </w:r>
       <w:r>
         <w:t>d</w:t>
@@ -2974,7 +3603,15 @@
     <w:p>
       <w:r>
         <w:lastRenderedPageBreak/>
-        <w:t xml:space="preserve">Now we will make an ecomerce store </w:t>
+        <w:t xml:space="preserve">Now we will make an </w:t>
+      </w:r>
+      <w:proofErr w:type="spellStart"/>
+      <w:r>
+        <w:t>ecomerce</w:t>
+      </w:r>
+      <w:proofErr w:type="spellEnd"/>
+      <w:r>
+        <w:t xml:space="preserve"> store </w:t>
       </w:r>
       <w:r>
         <w:t xml:space="preserve">and we will make pages like </w:t>
@@ -3022,7 +3659,15 @@
         <w:t xml:space="preserve">teacher will teach us </w:t>
       </w:r>
       <w:r>
-        <w:t xml:space="preserve">We name it codeswear it will be an ecommerce store where we will list our product </w:t>
+        <w:t xml:space="preserve">We name it </w:t>
+      </w:r>
+      <w:proofErr w:type="spellStart"/>
+      <w:r>
+        <w:t>codeswear</w:t>
+      </w:r>
+      <w:proofErr w:type="spellEnd"/>
+      <w:r>
+        <w:t xml:space="preserve"> it will be an ecommerce store where we will list our product </w:t>
       </w:r>
       <w:r>
         <w:t xml:space="preserve">So we type the command </w:t>
@@ -3048,7 +3693,23 @@
           <w:b/>
           <w:bCs/>
         </w:rPr>
-        <w:t xml:space="preserve"> &lt;appname&gt;</w:t>
+        <w:t xml:space="preserve"> &lt;</w:t>
+      </w:r>
+      <w:proofErr w:type="spellStart"/>
+      <w:r>
+        <w:rPr>
+          <w:b/>
+          <w:bCs/>
+        </w:rPr>
+        <w:t>appname</w:t>
+      </w:r>
+      <w:proofErr w:type="spellEnd"/>
+      <w:r>
+        <w:rPr>
+          <w:b/>
+          <w:bCs/>
+        </w:rPr>
+        <w:t>&gt;</w:t>
       </w:r>
     </w:p>
     <w:p>
@@ -3093,7 +3754,11 @@
         <w:t xml:space="preserve">Now we will see how to setup </w:t>
       </w:r>
       <w:r>
-        <w:t>up tailwind with Ne</w:t>
+        <w:t xml:space="preserve">up tailwind with </w:t>
+      </w:r>
+      <w:proofErr w:type="spellStart"/>
+      <w:r>
+        <w:t>Ne</w:t>
       </w:r>
       <w:r>
         <w:t>x</w:t>
@@ -3101,6 +3766,7 @@
       <w:r>
         <w:t>tjs</w:t>
       </w:r>
+      <w:proofErr w:type="spellEnd"/>
       <w:r>
         <w:t>,</w:t>
       </w:r>
@@ -3117,7 +3783,15 @@
         <w:t xml:space="preserve">optimally </w:t>
       </w:r>
       <w:r>
-        <w:t xml:space="preserve">and will make a black slate of codeswear </w:t>
+        <w:t xml:space="preserve">and will make a black slate of </w:t>
+      </w:r>
+      <w:proofErr w:type="spellStart"/>
+      <w:r>
+        <w:t>codeswear</w:t>
+      </w:r>
+      <w:proofErr w:type="spellEnd"/>
+      <w:r>
+        <w:t xml:space="preserve"> </w:t>
       </w:r>
       <w:r>
         <w:t>(who knows)</w:t>
@@ -3140,8 +3814,13 @@
     </w:p>
     <w:p>
       <w:r>
-        <w:t>We will search tailwind css with nextjs</w:t>
-      </w:r>
+        <w:t xml:space="preserve">We will search tailwind css with </w:t>
+      </w:r>
+      <w:proofErr w:type="spellStart"/>
+      <w:r>
+        <w:t>nextjs</w:t>
+      </w:r>
+      <w:proofErr w:type="spellEnd"/>
       <w:r>
         <w:t xml:space="preserve"> </w:t>
       </w:r>
@@ -3162,19 +3841,42 @@
       <w:r>
         <w:t xml:space="preserve">s </w:t>
       </w:r>
-      <w:r>
-        <w:t xml:space="preserve">cammand </w:t>
-      </w:r>
-    </w:p>
-    <w:p>
-      <w:r>
-        <w:t>npm install tailwindcss @tailwindcss/postcss postcss</w:t>
-      </w:r>
+      <w:proofErr w:type="spellStart"/>
+      <w:r>
+        <w:t>cammand</w:t>
+      </w:r>
+      <w:proofErr w:type="spellEnd"/>
       <w:r>
         <w:t xml:space="preserve"> </w:t>
       </w:r>
     </w:p>
     <w:p>
+      <w:proofErr w:type="spellStart"/>
+      <w:r>
+        <w:t>npm</w:t>
+      </w:r>
+      <w:proofErr w:type="spellEnd"/>
+      <w:r>
+        <w:t xml:space="preserve"> install </w:t>
+      </w:r>
+      <w:proofErr w:type="spellStart"/>
+      <w:r>
+        <w:t>tailwindcss</w:t>
+      </w:r>
+      <w:proofErr w:type="spellEnd"/>
+      <w:r>
+        <w:t xml:space="preserve"> @tailwindcss/postcss </w:t>
+      </w:r>
+      <w:proofErr w:type="spellStart"/>
+      <w:r>
+        <w:t>postcss</w:t>
+      </w:r>
+      <w:proofErr w:type="spellEnd"/>
+      <w:r>
+        <w:t xml:space="preserve"> </w:t>
+      </w:r>
+    </w:p>
+    <w:p>
       <w:r>
         <w:t>or</w:t>
       </w:r>
@@ -3183,9 +3885,19 @@
       <w:r>
         <w:t xml:space="preserve"> yarn add </w:t>
       </w:r>
-      <w:r>
-        <w:t>tailwindcss @tailwindcss/postcss postcss</w:t>
-      </w:r>
+      <w:proofErr w:type="spellStart"/>
+      <w:r>
+        <w:t>tailwindcss</w:t>
+      </w:r>
+      <w:proofErr w:type="spellEnd"/>
+      <w:r>
+        <w:t xml:space="preserve"> @tailwindcss/postcss </w:t>
+      </w:r>
+      <w:proofErr w:type="spellStart"/>
+      <w:r>
+        <w:t>postcss</w:t>
+      </w:r>
+      <w:proofErr w:type="spellEnd"/>
       <w:r>
         <w:t xml:space="preserve"> </w:t>
       </w:r>
@@ -3204,7 +3916,15 @@
         <w:t>e</w:t>
       </w:r>
       <w:r>
-        <w:t>r is using is autdated so we will use moder</w:t>
+        <w:t xml:space="preserve">r is using is </w:t>
+      </w:r>
+      <w:proofErr w:type="spellStart"/>
+      <w:r>
+        <w:t>autdated</w:t>
+      </w:r>
+      <w:proofErr w:type="spellEnd"/>
+      <w:r>
+        <w:t xml:space="preserve"> so we will use moder</w:t>
       </w:r>
       <w:r>
         <w:t>n</w:t>
@@ -3368,19 +4088,29 @@
         <w:t xml:space="preserve"> order</w:t>
       </w:r>
       <w:r>
-        <w:t xml:space="preserve"> , login and signUp</w:t>
-      </w:r>
+        <w:t xml:space="preserve"> , login and </w:t>
+      </w:r>
+      <w:proofErr w:type="spellStart"/>
+      <w:r>
+        <w:t>signUp</w:t>
+      </w:r>
+      <w:proofErr w:type="spellEnd"/>
       <w:r>
         <w:t xml:space="preserve">. We will create their blank slate here </w:t>
       </w:r>
       <w:r>
         <w:t xml:space="preserve">and then we will start </w:t>
       </w:r>
+      <w:proofErr w:type="spellStart"/>
       <w:r>
         <w:t>c</w:t>
       </w:r>
       <w:r>
-        <w:t xml:space="preserve">odeswear development </w:t>
+        <w:t>odeswear</w:t>
+      </w:r>
+      <w:proofErr w:type="spellEnd"/>
+      <w:r>
+        <w:t xml:space="preserve"> development </w:t>
       </w:r>
     </w:p>
     <w:p>
@@ -3435,15 +4165,44 @@
     </w:p>
     <w:p>
       <w:r>
-        <w:t>We will use app for that purposes(maybe ol version of layout.jsx)</w:t>
-      </w:r>
-    </w:p>
-    <w:p>
-      <w:r>
-        <w:t xml:space="preserve">Now there is site that is Tailblocks that will give you </w:t>
-      </w:r>
-      <w:r>
-        <w:t xml:space="preserve">tailblocks </w:t>
+        <w:t xml:space="preserve">We will use app for that purposes(maybe </w:t>
+      </w:r>
+      <w:proofErr w:type="spellStart"/>
+      <w:r>
+        <w:t>ol</w:t>
+      </w:r>
+      <w:proofErr w:type="spellEnd"/>
+      <w:r>
+        <w:t xml:space="preserve"> version of </w:t>
+      </w:r>
+      <w:proofErr w:type="spellStart"/>
+      <w:r>
+        <w:t>layout.jsx</w:t>
+      </w:r>
+      <w:proofErr w:type="spellEnd"/>
+      <w:r>
+        <w:t>)</w:t>
+      </w:r>
+    </w:p>
+    <w:p>
+      <w:r>
+        <w:t xml:space="preserve">Now there is site that is </w:t>
+      </w:r>
+      <w:proofErr w:type="spellStart"/>
+      <w:r>
+        <w:t>Tailblocks</w:t>
+      </w:r>
+      <w:proofErr w:type="spellEnd"/>
+      <w:r>
+        <w:t xml:space="preserve"> that will give you </w:t>
+      </w:r>
+      <w:proofErr w:type="spellStart"/>
+      <w:r>
+        <w:t>tailblocks</w:t>
+      </w:r>
+      <w:proofErr w:type="spellEnd"/>
+      <w:r>
+        <w:t xml:space="preserve"> </w:t>
       </w:r>
       <w:r>
         <w:t xml:space="preserve">snippet </w:t>
@@ -3455,7 +4214,15 @@
         <w:t xml:space="preserve"> </w:t>
       </w:r>
       <w:r>
-        <w:t>Here you get Ecommerece design</w:t>
+        <w:t xml:space="preserve">Here you get </w:t>
+      </w:r>
+      <w:proofErr w:type="spellStart"/>
+      <w:r>
+        <w:t>Ecommerece</w:t>
+      </w:r>
+      <w:proofErr w:type="spellEnd"/>
+      <w:r>
+        <w:t xml:space="preserve"> design</w:t>
       </w:r>
     </w:p>
     <w:p>
@@ -3473,7 +4240,23 @@
     </w:p>
     <w:p>
       <w:r>
-        <w:t xml:space="preserve">In tailwiond code you might need ot replace </w:t>
+        <w:t xml:space="preserve">In </w:t>
+      </w:r>
+      <w:proofErr w:type="spellStart"/>
+      <w:r>
+        <w:t>tailwiond</w:t>
+      </w:r>
+      <w:proofErr w:type="spellEnd"/>
+      <w:r>
+        <w:t xml:space="preserve"> code you might need </w:t>
+      </w:r>
+      <w:proofErr w:type="spellStart"/>
+      <w:r>
+        <w:t>ot</w:t>
+      </w:r>
+      <w:proofErr w:type="spellEnd"/>
+      <w:r>
+        <w:t xml:space="preserve"> replace </w:t>
       </w:r>
     </w:p>
     <w:p>
@@ -3482,45 +4265,78 @@
           <w:i/>
           <w:iCs/>
         </w:rPr>
-        <w:t>stroke-linecap</w:t>
-      </w:r>
+        <w:t>stroke-</w:t>
+      </w:r>
+      <w:proofErr w:type="spellStart"/>
       <w:r>
         <w:rPr>
           <w:i/>
           <w:iCs/>
         </w:rPr>
-        <w:t xml:space="preserve"> </w:t>
-      </w:r>
-      <w:r>
-        <w:t>by strokeLineCap</w:t>
-      </w:r>
-    </w:p>
-    <w:p>
+        <w:t>linecap</w:t>
+      </w:r>
+      <w:proofErr w:type="spellEnd"/>
       <w:r>
         <w:rPr>
           <w:i/>
           <w:iCs/>
         </w:rPr>
-        <w:t>stroke-linejoin</w:t>
-      </w:r>
+        <w:t xml:space="preserve"> </w:t>
+      </w:r>
+      <w:r>
+        <w:t xml:space="preserve">by </w:t>
+      </w:r>
+      <w:proofErr w:type="spellStart"/>
+      <w:r>
+        <w:t>strokeLineCap</w:t>
+      </w:r>
+      <w:proofErr w:type="spellEnd"/>
+    </w:p>
+    <w:p>
       <w:r>
         <w:rPr>
           <w:i/>
           <w:iCs/>
         </w:rPr>
+        <w:t>stroke-</w:t>
+      </w:r>
+      <w:proofErr w:type="spellStart"/>
+      <w:r>
+        <w:rPr>
+          <w:i/>
+          <w:iCs/>
+        </w:rPr>
+        <w:t>linejoin</w:t>
+      </w:r>
+      <w:proofErr w:type="spellEnd"/>
+      <w:r>
+        <w:rPr>
+          <w:i/>
+          <w:iCs/>
+        </w:rPr>
         <w:t xml:space="preserve"> </w:t>
       </w:r>
       <w:r>
-        <w:t>by strokeLineJoin</w:t>
-      </w:r>
+        <w:t xml:space="preserve">by </w:t>
+      </w:r>
+      <w:proofErr w:type="spellStart"/>
+      <w:r>
+        <w:t>strokeLineJoin</w:t>
+      </w:r>
+      <w:proofErr w:type="spellEnd"/>
     </w:p>
     <w:p>
       <w:r>
         <w:t>stroke-width</w:t>
       </w:r>
       <w:r>
-        <w:t xml:space="preserve"> by StrokeWidth</w:t>
-      </w:r>
+        <w:t xml:space="preserve"> by </w:t>
+      </w:r>
+      <w:proofErr w:type="spellStart"/>
+      <w:r>
+        <w:t>StrokeWidth</w:t>
+      </w:r>
+      <w:proofErr w:type="spellEnd"/>
     </w:p>
     <w:p>
       <w:r>
@@ -3541,9 +4357,11 @@
       <w:r>
         <w:t xml:space="preserve"> but not now but if you still want to use them then you need to add a Boolean attribute that is </w:t>
       </w:r>
+      <w:proofErr w:type="spellStart"/>
       <w:r>
         <w:t>legacyBehaviour</w:t>
       </w:r>
+      <w:proofErr w:type="spellEnd"/>
     </w:p>
     <w:p>
       <w:pPr>
@@ -3564,7 +4382,23 @@
           <w:b/>
           <w:bCs/>
         </w:rPr>
-        <w:t>Image or maybe in Nextjs general</w:t>
+        <w:t xml:space="preserve">Image or maybe in </w:t>
+      </w:r>
+      <w:proofErr w:type="spellStart"/>
+      <w:r>
+        <w:rPr>
+          <w:b/>
+          <w:bCs/>
+        </w:rPr>
+        <w:t>Nextjs</w:t>
+      </w:r>
+      <w:proofErr w:type="spellEnd"/>
+      <w:r>
+        <w:rPr>
+          <w:b/>
+          <w:bCs/>
+        </w:rPr>
+        <w:t xml:space="preserve"> general</w:t>
       </w:r>
     </w:p>
     <w:p>
@@ -3589,7 +4423,15 @@
     </w:p>
     <w:p>
       <w:r>
-        <w:t>&lt;Image src="home.jpg" /&gt;</w:t>
+        <w:t xml:space="preserve">&lt;Image </w:t>
+      </w:r>
+      <w:proofErr w:type="spellStart"/>
+      <w:r>
+        <w:t>src</w:t>
+      </w:r>
+      <w:proofErr w:type="spellEnd"/>
+      <w:r>
+        <w:t>="home.jpg" /&gt;</w:t>
       </w:r>
     </w:p>
     <w:p>
@@ -3614,7 +4456,15 @@
     </w:p>
     <w:p>
       <w:r>
-        <w:t>&lt;Image src="/home.jpg" /&gt;</w:t>
+        <w:t xml:space="preserve">&lt;Image </w:t>
+      </w:r>
+      <w:proofErr w:type="spellStart"/>
+      <w:r>
+        <w:t>src</w:t>
+      </w:r>
+      <w:proofErr w:type="spellEnd"/>
+      <w:r>
+        <w:t>="/home.jpg" /&gt;</w:t>
       </w:r>
     </w:p>
     <w:p>
@@ -3698,8 +4548,17 @@
     <w:p>
       <w:r>
         <w:lastRenderedPageBreak/>
-        <w:t xml:space="preserve">We can add media quary in Tailwind by </w:t>
-      </w:r>
+        <w:t xml:space="preserve">We can add media </w:t>
+      </w:r>
+      <w:proofErr w:type="spellStart"/>
+      <w:r>
+        <w:t>quary</w:t>
+      </w:r>
+      <w:proofErr w:type="spellEnd"/>
+      <w:r>
+        <w:t xml:space="preserve"> in Tailwind by </w:t>
+      </w:r>
+      <w:proofErr w:type="spellStart"/>
       <w:r>
         <w:rPr>
           <w:b/>
@@ -3712,7 +4571,15 @@
           <w:b/>
           <w:bCs/>
         </w:rPr>
-        <w:t>property name</w:t>
+        <w:t>property</w:t>
+      </w:r>
+      <w:proofErr w:type="spellEnd"/>
+      <w:r>
+        <w:rPr>
+          <w:b/>
+          <w:bCs/>
+        </w:rPr>
+        <w:t xml:space="preserve"> name</w:t>
       </w:r>
       <w:r>
         <w:rPr>
@@ -3839,7 +4706,15 @@
     </w:p>
     <w:p>
       <w:r>
-        <w:t>import { AiOutlineShoppingCart } from "react-icons/ai";</w:t>
+        <w:t xml:space="preserve">import { </w:t>
+      </w:r>
+      <w:proofErr w:type="spellStart"/>
+      <w:r>
+        <w:t>AiOutlineShoppingCart</w:t>
+      </w:r>
+      <w:proofErr w:type="spellEnd"/>
+      <w:r>
+        <w:t xml:space="preserve"> } from "react-icons/ai";</w:t>
       </w:r>
     </w:p>
     <w:p>
@@ -4070,7 +4945,15 @@
     </w:p>
     <w:p>
       <w:r>
-        <w:t>By overflow-x:hidden you c</w:t>
+        <w:t xml:space="preserve">By </w:t>
+      </w:r>
+      <w:proofErr w:type="spellStart"/>
+      <w:r>
+        <w:t>overflow-x:hidden</w:t>
+      </w:r>
+      <w:proofErr w:type="spellEnd"/>
+      <w:r>
+        <w:t xml:space="preserve"> you c</w:t>
       </w:r>
       <w:r>
         <w:t xml:space="preserve">an make sure there is no horizontal </w:t>
@@ -4096,16 +4979,40 @@
         <w:t>s</w:t>
       </w:r>
       <w:r>
-        <w:t>ked is out pincode servicable o</w:t>
+        <w:t xml:space="preserve">ked is out </w:t>
+      </w:r>
+      <w:proofErr w:type="spellStart"/>
+      <w:r>
+        <w:t>pincode</w:t>
+      </w:r>
+      <w:proofErr w:type="spellEnd"/>
+      <w:r>
+        <w:t xml:space="preserve"> </w:t>
+      </w:r>
+      <w:proofErr w:type="spellStart"/>
+      <w:r>
+        <w:t>servicable</w:t>
+      </w:r>
+      <w:proofErr w:type="spellEnd"/>
+      <w:r>
+        <w:t xml:space="preserve"> o</w:t>
       </w:r>
       <w:r>
         <w:t>r</w:t>
       </w:r>
       <w:r>
-        <w:t xml:space="preserve"> not</w:t>
-      </w:r>
-      <w:r>
-        <w:t>ig no then you cannot receiver the order.</w:t>
+        <w:t xml:space="preserve"> </w:t>
+      </w:r>
+      <w:proofErr w:type="spellStart"/>
+      <w:r>
+        <w:t>not</w:t>
+      </w:r>
+      <w:r>
+        <w:t>ig</w:t>
+      </w:r>
+      <w:proofErr w:type="spellEnd"/>
+      <w:r>
+        <w:t xml:space="preserve"> no then you cannot receiver the order.</w:t>
       </w:r>
     </w:p>
     <w:p>
@@ -4116,13 +5023,29 @@
         <w:t>e</w:t>
       </w:r>
       <w:r>
-        <w:t xml:space="preserve"> a mock api that wil</w:t>
+        <w:t xml:space="preserve"> a mock </w:t>
+      </w:r>
+      <w:proofErr w:type="spellStart"/>
+      <w:r>
+        <w:t>api</w:t>
+      </w:r>
+      <w:proofErr w:type="spellEnd"/>
+      <w:r>
+        <w:t xml:space="preserve"> that wil</w:t>
       </w:r>
       <w:r>
         <w:t>l</w:t>
       </w:r>
       <w:r>
-        <w:t xml:space="preserve"> show all the apis that are serviceable </w:t>
+        <w:t xml:space="preserve"> show all the </w:t>
+      </w:r>
+      <w:proofErr w:type="spellStart"/>
+      <w:r>
+        <w:t>apis</w:t>
+      </w:r>
+      <w:proofErr w:type="spellEnd"/>
+      <w:r>
+        <w:t xml:space="preserve"> that are serviceable </w:t>
       </w:r>
     </w:p>
     <w:p>
@@ -4183,7 +5106,15 @@
         <w:t>do update method is</w:t>
       </w:r>
       <w:r>
-        <w:t xml:space="preserve"> request its not an order</w:t>
+        <w:t xml:space="preserve"> request </w:t>
+      </w:r>
+      <w:proofErr w:type="spellStart"/>
+      <w:r>
+        <w:t>its</w:t>
+      </w:r>
+      <w:proofErr w:type="spellEnd"/>
+      <w:r>
+        <w:t xml:space="preserve"> not an order</w:t>
       </w:r>
       <w:r>
         <w:t xml:space="preserve">. React </w:t>
@@ -4462,11 +5393,24 @@
         <w:t xml:space="preserve">To </w:t>
       </w:r>
       <w:r>
-        <w:t xml:space="preserve">make codewear we are going to use Mongoose </w:t>
-      </w:r>
-      <w:r>
-        <w:t>is a connector to a Mongodb</w:t>
-      </w:r>
+        <w:t xml:space="preserve">make </w:t>
+      </w:r>
+      <w:proofErr w:type="spellStart"/>
+      <w:r>
+        <w:t>codewear</w:t>
+      </w:r>
+      <w:proofErr w:type="spellEnd"/>
+      <w:r>
+        <w:t xml:space="preserve"> we are going to use Mongoose </w:t>
+      </w:r>
+      <w:r>
+        <w:t xml:space="preserve">is a connector to a </w:t>
+      </w:r>
+      <w:proofErr w:type="spellStart"/>
+      <w:r>
+        <w:t>Mongodb</w:t>
+      </w:r>
+      <w:proofErr w:type="spellEnd"/>
       <w:r>
         <w:t xml:space="preserve"> </w:t>
       </w:r>
@@ -4474,7 +5418,15 @@
         <w:t>(who knows )</w:t>
       </w:r>
       <w:r>
-        <w:t xml:space="preserve"> it will help js to connect to mongodb </w:t>
+        <w:t xml:space="preserve"> it will help js to connect to </w:t>
+      </w:r>
+      <w:proofErr w:type="spellStart"/>
+      <w:r>
+        <w:t>mongodb</w:t>
+      </w:r>
+      <w:proofErr w:type="spellEnd"/>
+      <w:r>
+        <w:t xml:space="preserve"> </w:t>
       </w:r>
       <w:r>
         <w:t xml:space="preserve">and we can use its </w:t>
@@ -4483,13 +5435,29 @@
         <w:t xml:space="preserve">built in functionality </w:t>
       </w:r>
       <w:r>
-        <w:t xml:space="preserve">you don’t have to read and write and update to the mongodb (like </w:t>
+        <w:t xml:space="preserve">you don’t have to read and write and update to the </w:t>
+      </w:r>
+      <w:proofErr w:type="spellStart"/>
+      <w:r>
+        <w:t>mongodb</w:t>
+      </w:r>
+      <w:proofErr w:type="spellEnd"/>
+      <w:r>
+        <w:t xml:space="preserve"> (like </w:t>
       </w:r>
       <w:r>
         <w:t xml:space="preserve">maybe </w:t>
       </w:r>
       <w:r>
-        <w:t>the complex we do for it in mongodb(who knows))</w:t>
+        <w:t xml:space="preserve">the complex we do for it in </w:t>
+      </w:r>
+      <w:proofErr w:type="spellStart"/>
+      <w:r>
+        <w:t>mongodb</w:t>
+      </w:r>
+      <w:proofErr w:type="spellEnd"/>
+      <w:r>
+        <w:t>(who knows))</w:t>
       </w:r>
       <w:r>
         <w:t xml:space="preserve">. </w:t>
@@ -4503,9 +5471,19 @@
       <w:r>
         <w:t xml:space="preserve">ing fields like </w:t>
       </w:r>
-      <w:r>
-        <w:t>createdAT and updatedAt</w:t>
-      </w:r>
+      <w:proofErr w:type="spellStart"/>
+      <w:r>
+        <w:t>createdAT</w:t>
+      </w:r>
+      <w:proofErr w:type="spellEnd"/>
+      <w:r>
+        <w:t xml:space="preserve"> and </w:t>
+      </w:r>
+      <w:proofErr w:type="spellStart"/>
+      <w:r>
+        <w:t>updatedAt</w:t>
+      </w:r>
+      <w:proofErr w:type="spellEnd"/>
     </w:p>
     <w:p>
       <w:r>
@@ -4545,15 +5523,31 @@
         <w:t>r</w:t>
       </w:r>
       <w:r>
-        <w:t>ough which we connect to mongo</w:t>
-      </w:r>
-      <w:r>
-        <w:t xml:space="preserve">db </w:t>
-      </w:r>
-    </w:p>
-    <w:p>
-      <w:r>
-        <w:t xml:space="preserve">I think we are going to directly contact to mongos by frontEnd </w:t>
+        <w:t xml:space="preserve">ough which we connect to </w:t>
+      </w:r>
+      <w:proofErr w:type="spellStart"/>
+      <w:r>
+        <w:t>mongo</w:t>
+      </w:r>
+      <w:r>
+        <w:t>db</w:t>
+      </w:r>
+      <w:proofErr w:type="spellEnd"/>
+      <w:r>
+        <w:t xml:space="preserve"> </w:t>
+      </w:r>
+    </w:p>
+    <w:p>
+      <w:r>
+        <w:t xml:space="preserve">I think we are going to directly contact to mongos by </w:t>
+      </w:r>
+      <w:proofErr w:type="spellStart"/>
+      <w:r>
+        <w:t>frontEnd</w:t>
+      </w:r>
+      <w:proofErr w:type="spellEnd"/>
+      <w:r>
+        <w:t xml:space="preserve"> </w:t>
       </w:r>
     </w:p>
     <w:p>
@@ -4561,7 +5555,15 @@
         <w:t xml:space="preserve">Ow we will install Mongoose </w:t>
       </w:r>
       <w:r>
-        <w:t xml:space="preserve">by npm </w:t>
+        <w:t xml:space="preserve">by </w:t>
+      </w:r>
+      <w:proofErr w:type="spellStart"/>
+      <w:r>
+        <w:t>npm</w:t>
+      </w:r>
+      <w:proofErr w:type="spellEnd"/>
+      <w:r>
+        <w:t xml:space="preserve"> </w:t>
       </w:r>
       <w:r>
         <w:t>and we will make some modals</w:t>
@@ -4576,7 +5578,15 @@
         <w:t>through which you will store the data (who knows)</w:t>
       </w:r>
       <w:r>
-        <w:t xml:space="preserve"> but before that we need to install mongodb </w:t>
+        <w:t xml:space="preserve"> but before that we need to install </w:t>
+      </w:r>
+      <w:proofErr w:type="spellStart"/>
+      <w:r>
+        <w:t>mongodb</w:t>
+      </w:r>
+      <w:proofErr w:type="spellEnd"/>
+      <w:r>
+        <w:t xml:space="preserve"> </w:t>
       </w:r>
     </w:p>
     <w:p>
@@ -4593,7 +5603,11 @@
         <w:t>then your</w:t>
       </w:r>
       <w:r>
-        <w:t xml:space="preserve"> mon</w:t>
+        <w:t xml:space="preserve"> </w:t>
+      </w:r>
+      <w:proofErr w:type="spellStart"/>
+      <w:r>
+        <w:t>mon</w:t>
       </w:r>
       <w:r>
         <w:t>g</w:t>
@@ -4602,29 +5616,62 @@
         <w:t>d</w:t>
       </w:r>
       <w:r>
-        <w:t>b compass will be installed</w:t>
-      </w:r>
-      <w:r>
-        <w:t xml:space="preserve"> which  is a product of mongodb </w:t>
-      </w:r>
-    </w:p>
-    <w:p>
-      <w:r>
-        <w:t xml:space="preserve">Now in mongodb compass you click on connect to the </w:t>
+        <w:t>b</w:t>
+      </w:r>
+      <w:proofErr w:type="spellEnd"/>
+      <w:r>
+        <w:t xml:space="preserve"> compass will be installed</w:t>
+      </w:r>
+      <w:r>
+        <w:t xml:space="preserve"> which  is a product of </w:t>
+      </w:r>
+      <w:proofErr w:type="spellStart"/>
+      <w:r>
+        <w:t>mongodb</w:t>
+      </w:r>
+      <w:proofErr w:type="spellEnd"/>
+      <w:r>
+        <w:t xml:space="preserve"> </w:t>
+      </w:r>
+    </w:p>
+    <w:p>
+      <w:r>
+        <w:t xml:space="preserve">Now in </w:t>
+      </w:r>
+      <w:proofErr w:type="spellStart"/>
+      <w:r>
+        <w:t>mongodb</w:t>
+      </w:r>
+      <w:proofErr w:type="spellEnd"/>
+      <w:r>
+        <w:t xml:space="preserve"> compass you click on connect to the </w:t>
       </w:r>
       <w:r>
         <w:t xml:space="preserve">localhost </w:t>
       </w:r>
-      <w:r>
-        <w:t xml:space="preserve">ehere the server is running </w:t>
-      </w:r>
-    </w:p>
-    <w:p>
-      <w:r>
-        <w:t>We will make all the data base in mongo</w:t>
-      </w:r>
-      <w:r>
-        <w:t>db compass.</w:t>
+      <w:proofErr w:type="spellStart"/>
+      <w:r>
+        <w:t>ehere</w:t>
+      </w:r>
+      <w:proofErr w:type="spellEnd"/>
+      <w:r>
+        <w:t xml:space="preserve"> the server is running </w:t>
+      </w:r>
+    </w:p>
+    <w:p>
+      <w:r>
+        <w:t xml:space="preserve">We will make all the data base in </w:t>
+      </w:r>
+      <w:proofErr w:type="spellStart"/>
+      <w:r>
+        <w:t>mongo</w:t>
+      </w:r>
+      <w:r>
+        <w:t>db</w:t>
+      </w:r>
+      <w:proofErr w:type="spellEnd"/>
+      <w:r>
+        <w:t xml:space="preserve"> compass.</w:t>
       </w:r>
     </w:p>
     <w:p>
@@ -4752,10 +5799,18 @@
     </w:p>
     <w:p>
       <w:r>
-        <w:t>And after this get connection to the mongo</w:t>
-      </w:r>
-      <w:r>
-        <w:t xml:space="preserve">db </w:t>
+        <w:t xml:space="preserve">And after this get connection to the </w:t>
+      </w:r>
+      <w:proofErr w:type="spellStart"/>
+      <w:r>
+        <w:t>mongo</w:t>
+      </w:r>
+      <w:r>
+        <w:t>db</w:t>
+      </w:r>
+      <w:proofErr w:type="spellEnd"/>
+      <w:r>
+        <w:t xml:space="preserve"> </w:t>
       </w:r>
       <w:r>
         <w:t>and your wok will be sone now you can make schema</w:t>
@@ -4799,7 +5854,15 @@
     </w:p>
     <w:p>
       <w:r>
-        <w:t xml:space="preserve">So we will make three modals that is </w:t>
+        <w:t xml:space="preserve">So we will make three </w:t>
+      </w:r>
+      <w:proofErr w:type="spellStart"/>
+      <w:r>
+        <w:t>modals</w:t>
+      </w:r>
+      <w:proofErr w:type="spellEnd"/>
+      <w:r>
+        <w:t xml:space="preserve"> that is </w:t>
       </w:r>
       <w:r>
         <w:t>Order, Product and User.</w:t>
@@ -4925,14 +5988,29 @@
       <w:r>
         <w:t xml:space="preserve">APIs that is </w:t>
       </w:r>
-      <w:r>
-        <w:t>getProduct, updateProduct</w:t>
-      </w:r>
+      <w:proofErr w:type="spellStart"/>
+      <w:r>
+        <w:t>getProduct</w:t>
+      </w:r>
+      <w:proofErr w:type="spellEnd"/>
+      <w:r>
+        <w:t xml:space="preserve">, </w:t>
+      </w:r>
+      <w:proofErr w:type="spellStart"/>
+      <w:r>
+        <w:t>updateProduct</w:t>
+      </w:r>
+      <w:proofErr w:type="spellEnd"/>
       <w:r>
         <w:t xml:space="preserve"> and </w:t>
       </w:r>
-      <w:r>
-        <w:t xml:space="preserve">addProducts </w:t>
+      <w:proofErr w:type="spellStart"/>
+      <w:r>
+        <w:t>addProducts</w:t>
+      </w:r>
+      <w:proofErr w:type="spellEnd"/>
+      <w:r>
+        <w:t xml:space="preserve"> </w:t>
       </w:r>
       <w:r>
         <w:t xml:space="preserve">now they do as the name suggests </w:t>
@@ -4958,7 +6036,15 @@
     </w:p>
     <w:p>
       <w:r>
-        <w:t xml:space="preserve">Now we are going to start middleware development which will facilitate the connection to mongodb </w:t>
+        <w:t xml:space="preserve">Now we are going to start middleware development which will facilitate the connection to </w:t>
+      </w:r>
+      <w:proofErr w:type="spellStart"/>
+      <w:r>
+        <w:t>mongodb</w:t>
+      </w:r>
+      <w:proofErr w:type="spellEnd"/>
+      <w:r>
+        <w:t xml:space="preserve"> </w:t>
       </w:r>
       <w:r>
         <w:t>now it seems confusing at first</w:t>
@@ -5035,8 +6121,13 @@
       <w:r>
         <w:t>.</w:t>
       </w:r>
-      <w:r>
-        <w:t xml:space="preserve">env.local </w:t>
+      <w:proofErr w:type="spellStart"/>
+      <w:r>
+        <w:t>env.local</w:t>
+      </w:r>
+      <w:proofErr w:type="spellEnd"/>
+      <w:r>
+        <w:t xml:space="preserve"> </w:t>
       </w:r>
       <w:r>
         <w:t xml:space="preserve">file </w:t>
@@ -5048,8 +6139,13 @@
         <w:t xml:space="preserve"> and you can get it in our maybe server </w:t>
       </w:r>
       <w:r>
-        <w:t>side by using process.env</w:t>
-      </w:r>
+        <w:t xml:space="preserve">side by using </w:t>
+      </w:r>
+      <w:proofErr w:type="spellStart"/>
+      <w:r>
+        <w:t>process.env</w:t>
+      </w:r>
+      <w:proofErr w:type="spellEnd"/>
     </w:p>
     <w:p>
       <w:pPr>
@@ -5060,10 +6156,34 @@
         </w:numPr>
       </w:pPr>
       <w:r>
-        <w:t xml:space="preserve">We need a connection string to connect to mongodb </w:t>
-      </w:r>
-      <w:r>
-        <w:t xml:space="preserve"> and we can get for mongodb compass by opening mongodb compass and then click on three dot </w:t>
+        <w:t xml:space="preserve">We need a connection string to connect to </w:t>
+      </w:r>
+      <w:proofErr w:type="spellStart"/>
+      <w:r>
+        <w:t>mongodb</w:t>
+      </w:r>
+      <w:proofErr w:type="spellEnd"/>
+      <w:r>
+        <w:t xml:space="preserve"> </w:t>
+      </w:r>
+      <w:r>
+        <w:t xml:space="preserve"> and we can get for </w:t>
+      </w:r>
+      <w:proofErr w:type="spellStart"/>
+      <w:r>
+        <w:t>mongodb</w:t>
+      </w:r>
+      <w:proofErr w:type="spellEnd"/>
+      <w:r>
+        <w:t xml:space="preserve"> compass by opening </w:t>
+      </w:r>
+      <w:proofErr w:type="spellStart"/>
+      <w:r>
+        <w:t>mongodb</w:t>
+      </w:r>
+      <w:proofErr w:type="spellEnd"/>
+      <w:r>
+        <w:t xml:space="preserve"> compass and then click on three dot </w:t>
       </w:r>
       <w:r>
         <w:t>as</w:t>
@@ -5072,7 +6192,15 @@
         <w:t xml:space="preserve"> marked below</w:t>
       </w:r>
       <w:r>
-        <w:t>(not visiblie because of not hover)</w:t>
+        <w:t xml:space="preserve">(not </w:t>
+      </w:r>
+      <w:proofErr w:type="spellStart"/>
+      <w:r>
+        <w:t>visiblie</w:t>
+      </w:r>
+      <w:proofErr w:type="spellEnd"/>
+      <w:r>
+        <w:t xml:space="preserve"> because of not hover)</w:t>
       </w:r>
     </w:p>
     <w:p>
@@ -5134,7 +6262,15 @@
         <w:t xml:space="preserve"> to get </w:t>
       </w:r>
       <w:r>
-        <w:t>the connection string and we will store it inside .env.local file.</w:t>
+        <w:t>the connection string and we will store it inside .</w:t>
+      </w:r>
+      <w:proofErr w:type="spellStart"/>
+      <w:r>
+        <w:t>env.local</w:t>
+      </w:r>
+      <w:proofErr w:type="spellEnd"/>
+      <w:r>
+        <w:t xml:space="preserve"> file.</w:t>
       </w:r>
     </w:p>
     <w:p>
@@ -5165,7 +6301,15 @@
         <w:t>n</w:t>
       </w:r>
       <w:r>
-        <w:t xml:space="preserve"> modern Nextjs middleware cannot be used for database connectivity but you can use it </w:t>
+        <w:t xml:space="preserve"> modern </w:t>
+      </w:r>
+      <w:proofErr w:type="spellStart"/>
+      <w:r>
+        <w:t>Nextjs</w:t>
+      </w:r>
+      <w:proofErr w:type="spellEnd"/>
+      <w:r>
+        <w:t xml:space="preserve"> middleware cannot be used for database connectivity but you can use it </w:t>
       </w:r>
       <w:r>
         <w:t>for auth</w:t>
@@ -5206,7 +6350,15 @@
         <w:t xml:space="preserve"> add Product </w:t>
       </w:r>
       <w:r>
-        <w:t>and GetProduct API</w:t>
+        <w:t xml:space="preserve">and </w:t>
+      </w:r>
+      <w:proofErr w:type="spellStart"/>
+      <w:r>
+        <w:t>GetProduct</w:t>
+      </w:r>
+      <w:proofErr w:type="spellEnd"/>
+      <w:r>
+        <w:t xml:space="preserve"> API</w:t>
       </w:r>
       <w:r>
         <w:t>.</w:t>
@@ -5236,13 +6388,29 @@
         <w:t xml:space="preserve">that </w:t>
       </w:r>
       <w:r>
-        <w:t>when there is not data in mon</w:t>
-      </w:r>
-      <w:r>
-        <w:t xml:space="preserve">godb </w:t>
-      </w:r>
-      <w:r>
-        <w:t xml:space="preserve"> and we use find ot any operation on modal </w:t>
+        <w:t xml:space="preserve">when there is not data in </w:t>
+      </w:r>
+      <w:proofErr w:type="spellStart"/>
+      <w:r>
+        <w:t>mon</w:t>
+      </w:r>
+      <w:r>
+        <w:t>godb</w:t>
+      </w:r>
+      <w:proofErr w:type="spellEnd"/>
+      <w:r>
+        <w:t xml:space="preserve"> </w:t>
+      </w:r>
+      <w:r>
+        <w:t xml:space="preserve"> and we use find </w:t>
+      </w:r>
+      <w:proofErr w:type="spellStart"/>
+      <w:r>
+        <w:t>ot</w:t>
+      </w:r>
+      <w:proofErr w:type="spellEnd"/>
+      <w:r>
+        <w:t xml:space="preserve"> any operation on modal </w:t>
       </w:r>
       <w:r>
         <w:t xml:space="preserve">or maybe importing modal then it try to form </w:t>
@@ -5257,13 +6425,29 @@
         <w:t>.</w:t>
       </w:r>
       <w:r>
-        <w:t xml:space="preserve"> to fix that in model file write mongoose.models = {}</w:t>
+        <w:t xml:space="preserve"> to fix that in model file write </w:t>
+      </w:r>
+      <w:proofErr w:type="spellStart"/>
+      <w:r>
+        <w:t>mongoose.models</w:t>
+      </w:r>
+      <w:proofErr w:type="spellEnd"/>
+      <w:r>
+        <w:t xml:space="preserve"> = {}</w:t>
       </w:r>
       <w:r>
         <w:t xml:space="preserve"> </w:t>
       </w:r>
       <w:r>
-        <w:t>in each model do make sure you doi this.</w:t>
+        <w:t xml:space="preserve">in each model do make sure you </w:t>
+      </w:r>
+      <w:proofErr w:type="spellStart"/>
+      <w:r>
+        <w:t>doi</w:t>
+      </w:r>
+      <w:proofErr w:type="spellEnd"/>
+      <w:r>
+        <w:t xml:space="preserve"> this.</w:t>
       </w:r>
     </w:p>
     <w:p>
@@ -5291,7 +6475,23 @@
     </w:p>
     <w:p>
       <w:r>
-        <w:t>We will make now updateProfuct api.</w:t>
+        <w:t xml:space="preserve">We will make now </w:t>
+      </w:r>
+      <w:proofErr w:type="spellStart"/>
+      <w:r>
+        <w:t>updateProfuct</w:t>
+      </w:r>
+      <w:proofErr w:type="spellEnd"/>
+      <w:r>
+        <w:t xml:space="preserve"> </w:t>
+      </w:r>
+      <w:proofErr w:type="spellStart"/>
+      <w:r>
+        <w:t>api</w:t>
+      </w:r>
+      <w:proofErr w:type="spellEnd"/>
+      <w:r>
+        <w:t>.</w:t>
       </w:r>
     </w:p>
     <w:p>
@@ -5310,7 +6510,39 @@
         <w:t xml:space="preserve">add handler to the  html but now the game is changed </w:t>
       </w:r>
       <w:r>
-        <w:t>sever side component do all the work of mapping and generating html but in older version when data was end to the browser we need to make oit pardable we did it by JSON.parse(JSON.stringify(</w:t>
+        <w:t xml:space="preserve">sever side component do all the work of mapping and generating html but in older version when data was end to the browser we need to make </w:t>
+      </w:r>
+      <w:proofErr w:type="spellStart"/>
+      <w:r>
+        <w:t>oit</w:t>
+      </w:r>
+      <w:proofErr w:type="spellEnd"/>
+      <w:r>
+        <w:t xml:space="preserve"> </w:t>
+      </w:r>
+      <w:proofErr w:type="spellStart"/>
+      <w:r>
+        <w:t>pardable</w:t>
+      </w:r>
+      <w:proofErr w:type="spellEnd"/>
+      <w:r>
+        <w:t xml:space="preserve"> we did it by </w:t>
+      </w:r>
+      <w:proofErr w:type="spellStart"/>
+      <w:r>
+        <w:t>JSON.parse</w:t>
+      </w:r>
+      <w:proofErr w:type="spellEnd"/>
+      <w:r>
+        <w:t>(</w:t>
+      </w:r>
+      <w:proofErr w:type="spellStart"/>
+      <w:r>
+        <w:t>JSON.stringify</w:t>
+      </w:r>
+      <w:proofErr w:type="spellEnd"/>
+      <w:r>
+        <w:t>(</w:t>
       </w:r>
       <w:r>
         <w:t>&lt;object&gt;</w:t>
@@ -5329,7 +6561,15 @@
     </w:p>
     <w:p>
       <w:r>
-        <w:t>what is passHref in simple words</w:t>
+        <w:t xml:space="preserve">what is </w:t>
+      </w:r>
+      <w:proofErr w:type="spellStart"/>
+      <w:r>
+        <w:t>passHref</w:t>
+      </w:r>
+      <w:proofErr w:type="spellEnd"/>
+      <w:r>
+        <w:t xml:space="preserve"> in simple words</w:t>
       </w:r>
     </w:p>
     <w:p>
@@ -5352,16 +6592,57 @@
           <w:b/>
           <w:bCs/>
         </w:rPr>
-        <w:t xml:space="preserve"> passHref (simple explanation)</w:t>
-      </w:r>
-    </w:p>
-    <w:p>
-      <w:r>
-        <w:rPr>
-          <w:b/>
-          <w:bCs/>
-        </w:rPr>
-        <w:t>passHref tells &lt;Link&gt; to pass the href to its child element (like &lt;a&gt;)</w:t>
+        <w:t xml:space="preserve"> </w:t>
+      </w:r>
+      <w:proofErr w:type="spellStart"/>
+      <w:r>
+        <w:rPr>
+          <w:b/>
+          <w:bCs/>
+        </w:rPr>
+        <w:t>passHref</w:t>
+      </w:r>
+      <w:proofErr w:type="spellEnd"/>
+      <w:r>
+        <w:rPr>
+          <w:b/>
+          <w:bCs/>
+        </w:rPr>
+        <w:t xml:space="preserve"> (simple explanation)</w:t>
+      </w:r>
+    </w:p>
+    <w:p>
+      <w:proofErr w:type="spellStart"/>
+      <w:r>
+        <w:rPr>
+          <w:b/>
+          <w:bCs/>
+        </w:rPr>
+        <w:t>passHref</w:t>
+      </w:r>
+      <w:proofErr w:type="spellEnd"/>
+      <w:r>
+        <w:rPr>
+          <w:b/>
+          <w:bCs/>
+        </w:rPr>
+        <w:t xml:space="preserve"> tells &lt;Link&gt; to pass the </w:t>
+      </w:r>
+      <w:proofErr w:type="spellStart"/>
+      <w:r>
+        <w:rPr>
+          <w:b/>
+          <w:bCs/>
+        </w:rPr>
+        <w:t>href</w:t>
+      </w:r>
+      <w:proofErr w:type="spellEnd"/>
+      <w:r>
+        <w:rPr>
+          <w:b/>
+          <w:bCs/>
+        </w:rPr>
+        <w:t xml:space="preserve"> to its child element (like &lt;a&gt;)</w:t>
       </w:r>
     </w:p>
     <w:p>
@@ -5411,7 +6692,15 @@
     </w:p>
     <w:p>
       <w:r>
-        <w:t>&lt;Link href="/login"&gt;</w:t>
+        <w:t xml:space="preserve">&lt;Link </w:t>
+      </w:r>
+      <w:proofErr w:type="spellStart"/>
+      <w:r>
+        <w:t>href</w:t>
+      </w:r>
+      <w:proofErr w:type="spellEnd"/>
+      <w:r>
+        <w:t>="/login"&gt;</w:t>
       </w:r>
       <w:r>
         <w:br/>
@@ -5437,8 +6726,17 @@
           <w:b/>
           <w:bCs/>
         </w:rPr>
-        <w:t>not automatically get href</w:t>
-      </w:r>
+        <w:t xml:space="preserve">not automatically get </w:t>
+      </w:r>
+      <w:proofErr w:type="spellStart"/>
+      <w:r>
+        <w:rPr>
+          <w:b/>
+          <w:bCs/>
+        </w:rPr>
+        <w:t>href</w:t>
+      </w:r>
+      <w:proofErr w:type="spellEnd"/>
     </w:p>
     <w:p>
       <w:r>
@@ -5447,7 +6745,23 @@
     </w:p>
     <w:p>
       <w:r>
-        <w:t>&lt;Link href="/login" passHref&gt;</w:t>
+        <w:t xml:space="preserve">&lt;Link </w:t>
+      </w:r>
+      <w:proofErr w:type="spellStart"/>
+      <w:r>
+        <w:t>href</w:t>
+      </w:r>
+      <w:proofErr w:type="spellEnd"/>
+      <w:r>
+        <w:t xml:space="preserve">="/login" </w:t>
+      </w:r>
+      <w:proofErr w:type="spellStart"/>
+      <w:r>
+        <w:t>passHref</w:t>
+      </w:r>
+      <w:proofErr w:type="spellEnd"/>
+      <w:r>
+        <w:t>&gt;</w:t>
       </w:r>
       <w:r>
         <w:br/>
@@ -5471,7 +6785,15 @@
     </w:p>
     <w:p>
       <w:r>
-        <w:t>&lt;a href="/login"&gt;Login&lt;/a&gt;</w:t>
+        <w:t xml:space="preserve">&lt;a </w:t>
+      </w:r>
+      <w:proofErr w:type="spellStart"/>
+      <w:r>
+        <w:t>href</w:t>
+      </w:r>
+      <w:proofErr w:type="spellEnd"/>
+      <w:r>
+        <w:t>="/login"&gt;Login&lt;/a&gt;</w:t>
       </w:r>
     </w:p>
     <w:p>
@@ -5533,8 +6855,13 @@
           <w:numId w:val="3"/>
         </w:numPr>
       </w:pPr>
-      <w:r>
-        <w:t xml:space="preserve">passHref = “give the link to the receiver” </w:t>
+      <w:proofErr w:type="spellStart"/>
+      <w:r>
+        <w:t>passHref</w:t>
+      </w:r>
+      <w:proofErr w:type="spellEnd"/>
+      <w:r>
+        <w:t xml:space="preserve"> = “give the link to the receiver” </w:t>
       </w:r>
     </w:p>
     <w:p>
@@ -5581,7 +6908,15 @@
         <w:t>👉</w:t>
       </w:r>
       <w:r>
-        <w:t xml:space="preserve"> You don’t need passHref anymore</w:t>
+        <w:t xml:space="preserve"> You don’t need </w:t>
+      </w:r>
+      <w:proofErr w:type="spellStart"/>
+      <w:r>
+        <w:t>passHref</w:t>
+      </w:r>
+      <w:proofErr w:type="spellEnd"/>
+      <w:r>
+        <w:t xml:space="preserve"> anymore</w:t>
       </w:r>
       <w:r>
         <w:br/>
@@ -5632,8 +6967,21 @@
           <w:bottom w:val="single" w:sz="12" w:space="1" w:color="auto"/>
         </w:pBdr>
       </w:pPr>
-      <w:r>
-        <w:t>passHref ensures the child element (like &lt;a&gt;) actually receives the link (href).</w:t>
+      <w:proofErr w:type="spellStart"/>
+      <w:r>
+        <w:t>passHref</w:t>
+      </w:r>
+      <w:proofErr w:type="spellEnd"/>
+      <w:r>
+        <w:t xml:space="preserve"> ensures the child element (like &lt;a&gt;) actually receives the link (</w:t>
+      </w:r>
+      <w:proofErr w:type="spellStart"/>
+      <w:r>
+        <w:t>href</w:t>
+      </w:r>
+      <w:proofErr w:type="spellEnd"/>
+      <w:r>
+        <w:t>).</w:t>
       </w:r>
     </w:p>
     <w:p>
@@ -6108,7 +7456,23 @@
         <w:t xml:space="preserve">but sometime we want that </w:t>
       </w:r>
       <w:r>
-        <w:t>we buy onr ptofict imme</w:t>
+        <w:t xml:space="preserve">we buy </w:t>
+      </w:r>
+      <w:proofErr w:type="spellStart"/>
+      <w:r>
+        <w:t>onr</w:t>
+      </w:r>
+      <w:proofErr w:type="spellEnd"/>
+      <w:r>
+        <w:t xml:space="preserve"> </w:t>
+      </w:r>
+      <w:proofErr w:type="spellStart"/>
+      <w:r>
+        <w:t>ptofict</w:t>
+      </w:r>
+      <w:proofErr w:type="spellEnd"/>
+      <w:r>
+        <w:t xml:space="preserve"> imme</w:t>
       </w:r>
       <w:r>
         <w:t>d</w:t>
@@ -6200,7 +7564,15 @@
     </w:p>
     <w:p>
       <w:r>
-        <w:t xml:space="preserve">There is a method to move to a next page in nextjs like you did </w:t>
+        <w:t xml:space="preserve">There is a method to move to a next page in </w:t>
+      </w:r>
+      <w:proofErr w:type="spellStart"/>
+      <w:r>
+        <w:t>nextjs</w:t>
+      </w:r>
+      <w:proofErr w:type="spellEnd"/>
+      <w:r>
+        <w:t xml:space="preserve"> like you did </w:t>
       </w:r>
       <w:r>
         <w:t>in</w:t>
@@ -6212,8 +7584,21 @@
         <w:t xml:space="preserve">react </w:t>
       </w:r>
       <w:r>
-        <w:t>by navigate you can do so in nextJs by router object that you can get by useRouter</w:t>
-      </w:r>
+        <w:t xml:space="preserve">by navigate you can do so in </w:t>
+      </w:r>
+      <w:proofErr w:type="spellStart"/>
+      <w:r>
+        <w:t>nextJs</w:t>
+      </w:r>
+      <w:proofErr w:type="spellEnd"/>
+      <w:r>
+        <w:t xml:space="preserve"> by router object that you can get by </w:t>
+      </w:r>
+      <w:proofErr w:type="spellStart"/>
+      <w:r>
+        <w:t>useRouter</w:t>
+      </w:r>
+      <w:proofErr w:type="spellEnd"/>
       <w:r>
         <w:t xml:space="preserve"> hooks </w:t>
       </w:r>
@@ -6402,13 +7787,21 @@
         <w:t xml:space="preserve"> that </w:t>
       </w:r>
       <w:r>
-        <w:t>their pi</w:t>
+        <w:t xml:space="preserve">their </w:t>
+      </w:r>
+      <w:proofErr w:type="spellStart"/>
+      <w:r>
+        <w:t>pi</w:t>
       </w:r>
       <w:r>
         <w:t>n</w:t>
       </w:r>
       <w:r>
-        <w:t>code is not serviceable</w:t>
+        <w:t>code</w:t>
+      </w:r>
+      <w:proofErr w:type="spellEnd"/>
+      <w:r>
+        <w:t xml:space="preserve"> is not serviceable</w:t>
       </w:r>
     </w:p>
     <w:p>
@@ -6532,7 +7925,15 @@
         <w:t xml:space="preserve">To do all this we are going to use a library </w:t>
       </w:r>
       <w:r>
-        <w:t xml:space="preserve">called React Toastify </w:t>
+        <w:t xml:space="preserve">called React </w:t>
+      </w:r>
+      <w:proofErr w:type="spellStart"/>
+      <w:r>
+        <w:t>Toastify</w:t>
+      </w:r>
+      <w:proofErr w:type="spellEnd"/>
+      <w:r>
+        <w:t xml:space="preserve"> </w:t>
       </w:r>
       <w:r>
         <w:t>and if you use Rea</w:t>
@@ -6541,7 +7942,15 @@
         <w:t>ct</w:t>
       </w:r>
       <w:r>
-        <w:t xml:space="preserve"> or Nextjs </w:t>
+        <w:t xml:space="preserve"> or </w:t>
+      </w:r>
+      <w:proofErr w:type="spellStart"/>
+      <w:r>
+        <w:t>Nextjs</w:t>
+      </w:r>
+      <w:proofErr w:type="spellEnd"/>
+      <w:r>
+        <w:t xml:space="preserve"> </w:t>
       </w:r>
     </w:p>
     <w:p>
@@ -6668,7 +8077,15 @@
     </w:p>
     <w:p>
       <w:r>
-        <w:t xml:space="preserve">We will see React Toastify documentation </w:t>
+        <w:t xml:space="preserve">We will see React </w:t>
+      </w:r>
+      <w:proofErr w:type="spellStart"/>
+      <w:r>
+        <w:t>Toastify</w:t>
+      </w:r>
+      <w:proofErr w:type="spellEnd"/>
+      <w:r>
+        <w:t xml:space="preserve"> documentation </w:t>
       </w:r>
       <w:r>
         <w:t xml:space="preserve">and use it. </w:t>
@@ -6900,7 +8317,7 @@
           <w:noProof/>
         </w:rPr>
         <w:drawing>
-          <wp:inline distT="0" distB="0" distL="0" distR="0" wp14:anchorId="6B6DF7C8" wp14:editId="4DA6E5BB">
+          <wp:inline distT="0" distB="0" distL="0" distR="0" wp14:anchorId="6B6DF7C8" wp14:editId="59B799C6">
             <wp:extent cx="5731510" cy="2579370"/>
             <wp:effectExtent l="0" t="0" r="2540" b="0"/>
             <wp:docPr id="1981589093" name="Picture 4"/>
@@ -6952,7 +8369,23 @@
     <w:p>
       <w:r>
         <w:lastRenderedPageBreak/>
-        <w:t>We get this error because image also demands from server by url and server takes slug and did not find any product by this title as the img property that was used in the src was some random string we set for demo</w:t>
+        <w:t xml:space="preserve">We get this error because image also demands from server by url and server takes slug and did not find any product by this title as the </w:t>
+      </w:r>
+      <w:proofErr w:type="spellStart"/>
+      <w:r>
+        <w:t>img</w:t>
+      </w:r>
+      <w:proofErr w:type="spellEnd"/>
+      <w:r>
+        <w:t xml:space="preserve"> property that was used in the </w:t>
+      </w:r>
+      <w:proofErr w:type="spellStart"/>
+      <w:r>
+        <w:t>src</w:t>
+      </w:r>
+      <w:proofErr w:type="spellEnd"/>
+      <w:r>
+        <w:t xml:space="preserve"> was some random string we set for demo</w:t>
       </w:r>
     </w:p>
     <w:p>
@@ -7101,13 +8534,29 @@
     </w:p>
     <w:p>
       <w:r>
-        <w:t xml:space="preserve">You can there is two things that is ToastContainer </w:t>
+        <w:t xml:space="preserve">You can there is two things that is </w:t>
+      </w:r>
+      <w:proofErr w:type="spellStart"/>
+      <w:r>
+        <w:t>ToastContainer</w:t>
+      </w:r>
+      <w:proofErr w:type="spellEnd"/>
+      <w:r>
+        <w:t xml:space="preserve"> </w:t>
       </w:r>
       <w:r>
         <w:t xml:space="preserve">which tells how our toast will be shown </w:t>
       </w:r>
       <w:r>
-        <w:t xml:space="preserve">, whjat will be the position and </w:t>
+        <w:t xml:space="preserve">, </w:t>
+      </w:r>
+      <w:proofErr w:type="spellStart"/>
+      <w:r>
+        <w:t>whjat</w:t>
+      </w:r>
+      <w:proofErr w:type="spellEnd"/>
+      <w:r>
+        <w:t xml:space="preserve"> will be the position and </w:t>
       </w:r>
       <w:r>
         <w:t xml:space="preserve">after what duration the </w:t>
@@ -7116,10 +8565,26 @@
         <w:t>toast should be closed</w:t>
       </w:r>
       <w:r>
-        <w:t xml:space="preserve"> and we have Toast Emmitor that invoke that component </w:t>
-      </w:r>
-      <w:r>
-        <w:t xml:space="preserve"> You can see oabove options of types and position is given . Choose your option and </w:t>
+        <w:t xml:space="preserve"> and we have Toast </w:t>
+      </w:r>
+      <w:proofErr w:type="spellStart"/>
+      <w:r>
+        <w:t>Emmitor</w:t>
+      </w:r>
+      <w:proofErr w:type="spellEnd"/>
+      <w:r>
+        <w:t xml:space="preserve"> that invoke that component </w:t>
+      </w:r>
+      <w:r>
+        <w:t xml:space="preserve"> You can see </w:t>
+      </w:r>
+      <w:proofErr w:type="spellStart"/>
+      <w:r>
+        <w:t>oabove</w:t>
+      </w:r>
+      <w:proofErr w:type="spellEnd"/>
+      <w:r>
+        <w:t xml:space="preserve"> options of types and position is given . Choose your option and </w:t>
       </w:r>
       <w:r>
         <w:t xml:space="preserve">then your code will reflect that. </w:t>
@@ -7365,12 +8830,21 @@
         </w:rPr>
         <w:t xml:space="preserve">import css of </w:t>
       </w:r>
-      <w:r>
-        <w:rPr>
-          <w:b/>
-          <w:bCs/>
-        </w:rPr>
-        <w:t xml:space="preserve">toastify that come with it </w:t>
+      <w:proofErr w:type="spellStart"/>
+      <w:r>
+        <w:rPr>
+          <w:b/>
+          <w:bCs/>
+        </w:rPr>
+        <w:t>toastify</w:t>
+      </w:r>
+      <w:proofErr w:type="spellEnd"/>
+      <w:r>
+        <w:rPr>
+          <w:b/>
+          <w:bCs/>
+        </w:rPr>
+        <w:t xml:space="preserve"> that come with it </w:t>
       </w:r>
       <w:r>
         <w:rPr>
@@ -7554,7 +9028,15 @@
         <w:t>)</w:t>
       </w:r>
       <w:r>
-        <w:t xml:space="preserve"> but in Modern nextjs it does not happen as the responses are returned and the flow is stopped in the function.</w:t>
+        <w:t xml:space="preserve"> but in Modern </w:t>
+      </w:r>
+      <w:proofErr w:type="spellStart"/>
+      <w:r>
+        <w:t>nextjs</w:t>
+      </w:r>
+      <w:proofErr w:type="spellEnd"/>
+      <w:r>
+        <w:t xml:space="preserve"> it does not happen as the responses are returned and the flow is stopped in the function.</w:t>
       </w:r>
       <w:r>
         <w:t xml:space="preserve"> </w:t>
@@ -7745,6 +9227,9 @@
         <w:jc w:val="center"/>
       </w:pPr>
       <w:r>
+        <w:rPr>
+          <w:noProof/>
+        </w:rPr>
         <w:drawing>
           <wp:inline distT="0" distB="0" distL="0" distR="0" wp14:anchorId="424B89E4" wp14:editId="66F5B669">
             <wp:extent cx="4744112" cy="400106"/>
@@ -7948,7 +9433,767 @@
         <w:t>algorithm.</w:t>
       </w:r>
     </w:p>
-    <w:p/>
+    <w:p>
+      <w:r>
+        <w:t xml:space="preserve">In this lesson we will learn about </w:t>
+      </w:r>
+      <w:r>
+        <w:t>what is JWT</w:t>
+      </w:r>
+      <w:r>
+        <w:t xml:space="preserve">. What are the benefits </w:t>
+      </w:r>
+      <w:r>
+        <w:t>of using JWT Token</w:t>
+      </w:r>
+      <w:r>
+        <w:t xml:space="preserve">. What are the three parts </w:t>
+      </w:r>
+      <w:r>
+        <w:t>of Json and how data is taken f</w:t>
+      </w:r>
+      <w:r>
+        <w:t xml:space="preserve">rom it </w:t>
+      </w:r>
+      <w:r>
+        <w:t xml:space="preserve">and it s tampering does not become possible what we do for it </w:t>
+      </w:r>
+    </w:p>
+    <w:p>
+      <w:pPr>
+        <w:jc w:val="center"/>
+      </w:pPr>
+      <w:r>
+        <w:drawing>
+          <wp:inline distT="0" distB="0" distL="0" distR="0" wp14:anchorId="0D17D480" wp14:editId="70A42FA5">
+            <wp:extent cx="5731510" cy="3161665"/>
+            <wp:effectExtent l="0" t="0" r="2540" b="635"/>
+            <wp:docPr id="1506231899" name="Picture 1"/>
+            <wp:cNvGraphicFramePr>
+              <a:graphicFrameLocks xmlns:a="http://schemas.openxmlformats.org/drawingml/2006/main" noChangeAspect="1"/>
+            </wp:cNvGraphicFramePr>
+            <a:graphic xmlns:a="http://schemas.openxmlformats.org/drawingml/2006/main">
+              <a:graphicData uri="http://schemas.openxmlformats.org/drawingml/2006/picture">
+                <pic:pic xmlns:pic="http://schemas.openxmlformats.org/drawingml/2006/picture">
+                  <pic:nvPicPr>
+                    <pic:cNvPr id="1506231899" name=""/>
+                    <pic:cNvPicPr/>
+                  </pic:nvPicPr>
+                  <pic:blipFill>
+                    <a:blip r:embed="rId53"/>
+                    <a:stretch>
+                      <a:fillRect/>
+                    </a:stretch>
+                  </pic:blipFill>
+                  <pic:spPr>
+                    <a:xfrm>
+                      <a:off x="0" y="0"/>
+                      <a:ext cx="5731510" cy="3161665"/>
+                    </a:xfrm>
+                    <a:prstGeom prst="rect">
+                      <a:avLst/>
+                    </a:prstGeom>
+                  </pic:spPr>
+                </pic:pic>
+              </a:graphicData>
+            </a:graphic>
+          </wp:inline>
+        </w:drawing>
+      </w:r>
+    </w:p>
+    <w:p>
+      <w:r>
+        <w:t xml:space="preserve">Now </w:t>
+      </w:r>
+      <w:proofErr w:type="spellStart"/>
+      <w:r>
+        <w:t>ig</w:t>
+      </w:r>
+      <w:proofErr w:type="spellEnd"/>
+      <w:r>
+        <w:t xml:space="preserve"> we go to JWT </w:t>
+      </w:r>
+      <w:r>
+        <w:t>website you see below</w:t>
+      </w:r>
+    </w:p>
+    <w:p>
+      <w:pPr>
+        <w:jc w:val="center"/>
+      </w:pPr>
+      <w:r>
+        <w:lastRenderedPageBreak/>
+        <w:drawing>
+          <wp:inline distT="0" distB="0" distL="0" distR="0" wp14:anchorId="0189C75D" wp14:editId="447BD2B1">
+            <wp:extent cx="5731510" cy="4507865"/>
+            <wp:effectExtent l="0" t="0" r="2540" b="6985"/>
+            <wp:docPr id="1902712357" name="Picture 1"/>
+            <wp:cNvGraphicFramePr>
+              <a:graphicFrameLocks xmlns:a="http://schemas.openxmlformats.org/drawingml/2006/main" noChangeAspect="1"/>
+            </wp:cNvGraphicFramePr>
+            <a:graphic xmlns:a="http://schemas.openxmlformats.org/drawingml/2006/main">
+              <a:graphicData uri="http://schemas.openxmlformats.org/drawingml/2006/picture">
+                <pic:pic xmlns:pic="http://schemas.openxmlformats.org/drawingml/2006/picture">
+                  <pic:nvPicPr>
+                    <pic:cNvPr id="1902712357" name=""/>
+                    <pic:cNvPicPr/>
+                  </pic:nvPicPr>
+                  <pic:blipFill>
+                    <a:blip r:embed="rId54"/>
+                    <a:stretch>
+                      <a:fillRect/>
+                    </a:stretch>
+                  </pic:blipFill>
+                  <pic:spPr>
+                    <a:xfrm>
+                      <a:off x="0" y="0"/>
+                      <a:ext cx="5731510" cy="4507865"/>
+                    </a:xfrm>
+                    <a:prstGeom prst="rect">
+                      <a:avLst/>
+                    </a:prstGeom>
+                  </pic:spPr>
+                </pic:pic>
+              </a:graphicData>
+            </a:graphic>
+          </wp:inline>
+        </w:drawing>
+      </w:r>
+    </w:p>
+    <w:p>
+      <w:r>
+        <w:t xml:space="preserve">We are talking about token on the left </w:t>
+      </w:r>
+      <w:r>
+        <w:t xml:space="preserve">The </w:t>
+      </w:r>
+      <w:r>
+        <w:t xml:space="preserve">traditional approach of login </w:t>
+      </w:r>
+      <w:r>
+        <w:t xml:space="preserve">is that you will </w:t>
+      </w:r>
+      <w:proofErr w:type="spellStart"/>
+      <w:r>
+        <w:t>authrnticate</w:t>
+      </w:r>
+      <w:proofErr w:type="spellEnd"/>
+      <w:r>
+        <w:t xml:space="preserve"> user id and password </w:t>
+      </w:r>
+      <w:r>
+        <w:t xml:space="preserve">and then in server your </w:t>
+      </w:r>
+      <w:r>
+        <w:t xml:space="preserve">session info </w:t>
+      </w:r>
+      <w:r>
+        <w:t xml:space="preserve">will be saved </w:t>
+      </w:r>
+      <w:r>
+        <w:t xml:space="preserve">and the </w:t>
+      </w:r>
+      <w:proofErr w:type="spellStart"/>
+      <w:r>
+        <w:t>seesion</w:t>
+      </w:r>
+      <w:proofErr w:type="spellEnd"/>
+      <w:r>
+        <w:t xml:space="preserve"> in server is alive </w:t>
+      </w:r>
+      <w:proofErr w:type="spellStart"/>
+      <w:r>
+        <w:t>iuntil</w:t>
+      </w:r>
+      <w:proofErr w:type="spellEnd"/>
+      <w:r>
+        <w:t xml:space="preserve"> then you will be logged in. If your session is ended by </w:t>
+      </w:r>
+      <w:r>
+        <w:t>server then you will be logg</w:t>
+      </w:r>
+      <w:r>
+        <w:t>ed out</w:t>
+      </w:r>
+      <w:r>
+        <w:t xml:space="preserve">. </w:t>
+      </w:r>
+    </w:p>
+    <w:p>
+      <w:pPr>
+        <w:jc w:val="center"/>
+      </w:pPr>
+      <w:r>
+        <w:drawing>
+          <wp:inline distT="0" distB="0" distL="0" distR="0" wp14:anchorId="320027C7" wp14:editId="7CF231AB">
+            <wp:extent cx="2752725" cy="2581623"/>
+            <wp:effectExtent l="0" t="0" r="0" b="9525"/>
+            <wp:docPr id="1617322659" name="Picture 1"/>
+            <wp:cNvGraphicFramePr>
+              <a:graphicFrameLocks xmlns:a="http://schemas.openxmlformats.org/drawingml/2006/main" noChangeAspect="1"/>
+            </wp:cNvGraphicFramePr>
+            <a:graphic xmlns:a="http://schemas.openxmlformats.org/drawingml/2006/main">
+              <a:graphicData uri="http://schemas.openxmlformats.org/drawingml/2006/picture">
+                <pic:pic xmlns:pic="http://schemas.openxmlformats.org/drawingml/2006/picture">
+                  <pic:nvPicPr>
+                    <pic:cNvPr id="1617322659" name=""/>
+                    <pic:cNvPicPr/>
+                  </pic:nvPicPr>
+                  <pic:blipFill>
+                    <a:blip r:embed="rId55"/>
+                    <a:stretch>
+                      <a:fillRect/>
+                    </a:stretch>
+                  </pic:blipFill>
+                  <pic:spPr>
+                    <a:xfrm>
+                      <a:off x="0" y="0"/>
+                      <a:ext cx="2756704" cy="2585355"/>
+                    </a:xfrm>
+                    <a:prstGeom prst="rect">
+                      <a:avLst/>
+                    </a:prstGeom>
+                  </pic:spPr>
+                </pic:pic>
+              </a:graphicData>
+            </a:graphic>
+          </wp:inline>
+        </w:drawing>
+      </w:r>
+    </w:p>
+    <w:p>
+      <w:r>
+        <w:t xml:space="preserve">What happens in </w:t>
+      </w:r>
+      <w:proofErr w:type="spellStart"/>
+      <w:r>
+        <w:t>jwt</w:t>
+      </w:r>
+      <w:proofErr w:type="spellEnd"/>
+      <w:r>
+        <w:t xml:space="preserve"> is that it is divided into three parts first i</w:t>
+      </w:r>
+      <w:r>
+        <w:t>s</w:t>
+      </w:r>
+      <w:r>
+        <w:t xml:space="preserve"> header </w:t>
+      </w:r>
+      <w:r>
+        <w:t>, second part is Payload data</w:t>
+      </w:r>
+      <w:r>
+        <w:t>(which is our data )</w:t>
+      </w:r>
+      <w:r>
+        <w:t xml:space="preserve"> and another is signature</w:t>
+      </w:r>
+      <w:r>
+        <w:t xml:space="preserve">. </w:t>
+      </w:r>
+      <w:r>
+        <w:t xml:space="preserve">Why JWT makes sense teacher tell it. </w:t>
+      </w:r>
+      <w:r>
+        <w:t>See header it is the algorithm</w:t>
+      </w:r>
+      <w:r>
+        <w:t xml:space="preserve"> it means for the security this algorithm is used.</w:t>
+      </w:r>
+      <w:r>
+        <w:t xml:space="preserve"> </w:t>
+      </w:r>
+      <w:r>
+        <w:t>By al</w:t>
+      </w:r>
+      <w:r>
+        <w:t>g</w:t>
+      </w:r>
+      <w:r>
+        <w:t xml:space="preserve">orithm we mean for its security </w:t>
+      </w:r>
+      <w:r>
+        <w:t xml:space="preserve">and to make JWT token </w:t>
+      </w:r>
+      <w:r>
+        <w:t>what al</w:t>
+      </w:r>
+      <w:r>
+        <w:t>g</w:t>
+      </w:r>
+      <w:r>
+        <w:t>orithm is used (maybe for encryption)</w:t>
+      </w:r>
+      <w:r>
+        <w:t xml:space="preserve"> </w:t>
+      </w:r>
+      <w:r>
+        <w:t xml:space="preserve"> and then next part is data </w:t>
+      </w:r>
+      <w:r>
+        <w:lastRenderedPageBreak/>
+        <w:t xml:space="preserve">that is payload is the actual data </w:t>
+      </w:r>
+      <w:r>
+        <w:t xml:space="preserve">sent </w:t>
+      </w:r>
+      <w:r>
+        <w:t xml:space="preserve">and the third part is </w:t>
+      </w:r>
+      <w:r>
+        <w:t xml:space="preserve">signature </w:t>
+      </w:r>
+      <w:r>
+        <w:t xml:space="preserve">Now we saw that in </w:t>
+      </w:r>
+      <w:r>
+        <w:t xml:space="preserve">JWT encoder of website </w:t>
+      </w:r>
+      <w:r>
+        <w:t>we see when we b</w:t>
+      </w:r>
+      <w:r>
+        <w:t>r</w:t>
+      </w:r>
+      <w:r>
+        <w:t>ing changes in the s</w:t>
+      </w:r>
+      <w:r>
+        <w:t>ecret</w:t>
+      </w:r>
+      <w:r>
+        <w:t xml:space="preserve"> key then </w:t>
+      </w:r>
+      <w:r>
+        <w:t>third part is modified</w:t>
+      </w:r>
+      <w:r>
+        <w:t>. This secret is only known by the server</w:t>
+      </w:r>
+      <w:r>
+        <w:t xml:space="preserve">. We can take JWT token </w:t>
+      </w:r>
+      <w:r>
+        <w:t xml:space="preserve">and can check that is the payload data </w:t>
+      </w:r>
+      <w:r>
+        <w:t xml:space="preserve">is actually tampered </w:t>
+      </w:r>
+      <w:r>
+        <w:t>or not</w:t>
+      </w:r>
+      <w:r>
+        <w:t xml:space="preserve">. </w:t>
+      </w:r>
+      <w:r>
+        <w:t>By tamper we mean has the cl</w:t>
+      </w:r>
+      <w:r>
+        <w:t>i</w:t>
+      </w:r>
+      <w:r>
+        <w:t xml:space="preserve">ent change the payload data </w:t>
+      </w:r>
+      <w:r>
+        <w:t xml:space="preserve">the client could not change it because we have signed it </w:t>
+      </w:r>
+      <w:r>
+        <w:t>with ou</w:t>
+      </w:r>
+      <w:r>
+        <w:t xml:space="preserve">r </w:t>
+      </w:r>
+      <w:r>
+        <w:t>secret</w:t>
+      </w:r>
+      <w:r>
+        <w:t xml:space="preserve"> key.</w:t>
+      </w:r>
+      <w:r>
+        <w:t xml:space="preserve"> </w:t>
+      </w:r>
+      <w:r>
+        <w:t xml:space="preserve">By using this secret we can </w:t>
+      </w:r>
+      <w:r>
+        <w:t xml:space="preserve">know is this </w:t>
+      </w:r>
+      <w:proofErr w:type="spellStart"/>
+      <w:r>
+        <w:t>JWt</w:t>
+      </w:r>
+      <w:proofErr w:type="spellEnd"/>
+      <w:r>
+        <w:t xml:space="preserve"> tampered.</w:t>
+      </w:r>
+      <w:r>
+        <w:t xml:space="preserve"> </w:t>
+      </w:r>
+      <w:r>
+        <w:t xml:space="preserve">And by this secret we can sign a given data </w:t>
+      </w:r>
+      <w:r>
+        <w:t xml:space="preserve">so that whoever we give this data to </w:t>
+      </w:r>
+      <w:r>
+        <w:t xml:space="preserve">he will not be able to change this </w:t>
+      </w:r>
+      <w:proofErr w:type="spellStart"/>
+      <w:r>
+        <w:t>jwt</w:t>
+      </w:r>
+      <w:proofErr w:type="spellEnd"/>
+      <w:r>
+        <w:t xml:space="preserve"> </w:t>
+      </w:r>
+      <w:proofErr w:type="spellStart"/>
+      <w:r>
+        <w:t>wihtou</w:t>
+      </w:r>
+      <w:proofErr w:type="spellEnd"/>
+      <w:r>
+        <w:t xml:space="preserve"> knowing this secret </w:t>
+      </w:r>
+    </w:p>
+    <w:p>
+      <w:r>
+        <w:t xml:space="preserve">So we add it </w:t>
+      </w:r>
+      <w:proofErr w:type="spellStart"/>
+      <w:r>
+        <w:t>jsonwebtokens</w:t>
+      </w:r>
+      <w:proofErr w:type="spellEnd"/>
+      <w:r>
+        <w:t xml:space="preserve"> </w:t>
+      </w:r>
+      <w:r>
+        <w:t xml:space="preserve">by yarn </w:t>
+      </w:r>
+    </w:p>
+    <w:p>
+      <w:r>
+        <w:t xml:space="preserve">So what we did we import </w:t>
+      </w:r>
+      <w:proofErr w:type="spellStart"/>
+      <w:r>
+        <w:t>jsonwebtokens</w:t>
+      </w:r>
+      <w:proofErr w:type="spellEnd"/>
+    </w:p>
+    <w:p>
+      <w:pPr>
+        <w:jc w:val="center"/>
+      </w:pPr>
+      <w:r>
+        <w:drawing>
+          <wp:inline distT="0" distB="0" distL="0" distR="0" wp14:anchorId="554B6B32" wp14:editId="495C3E92">
+            <wp:extent cx="2629267" cy="190527"/>
+            <wp:effectExtent l="0" t="0" r="0" b="0"/>
+            <wp:docPr id="1478653076" name="Picture 1"/>
+            <wp:cNvGraphicFramePr>
+              <a:graphicFrameLocks xmlns:a="http://schemas.openxmlformats.org/drawingml/2006/main" noChangeAspect="1"/>
+            </wp:cNvGraphicFramePr>
+            <a:graphic xmlns:a="http://schemas.openxmlformats.org/drawingml/2006/main">
+              <a:graphicData uri="http://schemas.openxmlformats.org/drawingml/2006/picture">
+                <pic:pic xmlns:pic="http://schemas.openxmlformats.org/drawingml/2006/picture">
+                  <pic:nvPicPr>
+                    <pic:cNvPr id="1478653076" name=""/>
+                    <pic:cNvPicPr/>
+                  </pic:nvPicPr>
+                  <pic:blipFill>
+                    <a:blip r:embed="rId56"/>
+                    <a:stretch>
+                      <a:fillRect/>
+                    </a:stretch>
+                  </pic:blipFill>
+                  <pic:spPr>
+                    <a:xfrm>
+                      <a:off x="0" y="0"/>
+                      <a:ext cx="2629267" cy="190527"/>
+                    </a:xfrm>
+                    <a:prstGeom prst="rect">
+                      <a:avLst/>
+                    </a:prstGeom>
+                  </pic:spPr>
+                </pic:pic>
+              </a:graphicData>
+            </a:graphic>
+          </wp:inline>
+        </w:drawing>
+      </w:r>
+    </w:p>
+    <w:p>
+      <w:r>
+        <w:t xml:space="preserve">And </w:t>
+      </w:r>
+      <w:r>
+        <w:t>then we do something like below</w:t>
+      </w:r>
+    </w:p>
+    <w:p>
+      <w:pPr>
+        <w:jc w:val="center"/>
+      </w:pPr>
+      <w:r>
+        <w:drawing>
+          <wp:inline distT="0" distB="0" distL="0" distR="0" wp14:anchorId="3EE2A3F2" wp14:editId="17B85A60">
+            <wp:extent cx="2924583" cy="1514686"/>
+            <wp:effectExtent l="0" t="0" r="9525" b="9525"/>
+            <wp:docPr id="52116952" name="Picture 1"/>
+            <wp:cNvGraphicFramePr>
+              <a:graphicFrameLocks xmlns:a="http://schemas.openxmlformats.org/drawingml/2006/main" noChangeAspect="1"/>
+            </wp:cNvGraphicFramePr>
+            <a:graphic xmlns:a="http://schemas.openxmlformats.org/drawingml/2006/main">
+              <a:graphicData uri="http://schemas.openxmlformats.org/drawingml/2006/picture">
+                <pic:pic xmlns:pic="http://schemas.openxmlformats.org/drawingml/2006/picture">
+                  <pic:nvPicPr>
+                    <pic:cNvPr id="52116952" name=""/>
+                    <pic:cNvPicPr/>
+                  </pic:nvPicPr>
+                  <pic:blipFill>
+                    <a:blip r:embed="rId57"/>
+                    <a:stretch>
+                      <a:fillRect/>
+                    </a:stretch>
+                  </pic:blipFill>
+                  <pic:spPr>
+                    <a:xfrm>
+                      <a:off x="0" y="0"/>
+                      <a:ext cx="2924583" cy="1514686"/>
+                    </a:xfrm>
+                    <a:prstGeom prst="rect">
+                      <a:avLst/>
+                    </a:prstGeom>
+                  </pic:spPr>
+                </pic:pic>
+              </a:graphicData>
+            </a:graphic>
+          </wp:inline>
+        </w:drawing>
+      </w:r>
+    </w:p>
+    <w:p>
+      <w:r>
+        <w:t xml:space="preserve">And </w:t>
+      </w:r>
+      <w:proofErr w:type="spellStart"/>
+      <w:r>
+        <w:t>whne</w:t>
+      </w:r>
+      <w:proofErr w:type="spellEnd"/>
+      <w:r>
+        <w:t xml:space="preserve"> we get tokens and we paster in token decoder we get below</w:t>
+      </w:r>
+    </w:p>
+    <w:p>
+      <w:pPr>
+        <w:jc w:val="center"/>
+      </w:pPr>
+      <w:r>
+        <w:drawing>
+          <wp:inline distT="0" distB="0" distL="0" distR="0" wp14:anchorId="0621F136" wp14:editId="35FDB5AC">
+            <wp:extent cx="5731510" cy="2714625"/>
+            <wp:effectExtent l="0" t="0" r="2540" b="9525"/>
+            <wp:docPr id="2141355917" name="Picture 1"/>
+            <wp:cNvGraphicFramePr>
+              <a:graphicFrameLocks xmlns:a="http://schemas.openxmlformats.org/drawingml/2006/main" noChangeAspect="1"/>
+            </wp:cNvGraphicFramePr>
+            <a:graphic xmlns:a="http://schemas.openxmlformats.org/drawingml/2006/main">
+              <a:graphicData uri="http://schemas.openxmlformats.org/drawingml/2006/picture">
+                <pic:pic xmlns:pic="http://schemas.openxmlformats.org/drawingml/2006/picture">
+                  <pic:nvPicPr>
+                    <pic:cNvPr id="2141355917" name=""/>
+                    <pic:cNvPicPr/>
+                  </pic:nvPicPr>
+                  <pic:blipFill>
+                    <a:blip r:embed="rId58"/>
+                    <a:stretch>
+                      <a:fillRect/>
+                    </a:stretch>
+                  </pic:blipFill>
+                  <pic:spPr>
+                    <a:xfrm>
+                      <a:off x="0" y="0"/>
+                      <a:ext cx="5731510" cy="2714625"/>
+                    </a:xfrm>
+                    <a:prstGeom prst="rect">
+                      <a:avLst/>
+                    </a:prstGeom>
+                  </pic:spPr>
+                </pic:pic>
+              </a:graphicData>
+            </a:graphic>
+          </wp:inline>
+        </w:drawing>
+      </w:r>
+    </w:p>
+    <w:p>
+      <w:r>
+        <w:t xml:space="preserve">You can see one more attribute is added </w:t>
+      </w:r>
+      <w:r>
+        <w:t>that is Iat it tells when this token was issued.</w:t>
+      </w:r>
+      <w:r>
+        <w:t xml:space="preserve">  So you can see above that this</w:t>
+      </w:r>
+      <w:r>
+        <w:t xml:space="preserve"> </w:t>
+      </w:r>
+      <w:r>
+        <w:t>is the data JWT is taking</w:t>
+      </w:r>
+      <w:r>
+        <w:t xml:space="preserve">. There is another parameter </w:t>
+      </w:r>
+      <w:r>
+        <w:t xml:space="preserve">that we pass to the sign </w:t>
+      </w:r>
+      <w:r>
+        <w:t xml:space="preserve">method </w:t>
+      </w:r>
+      <w:r>
+        <w:t xml:space="preserve">that is </w:t>
+      </w:r>
+      <w:r>
+        <w:t>an object</w:t>
+      </w:r>
+      <w:r>
+        <w:t xml:space="preserve"> </w:t>
+      </w:r>
+      <w:r>
+        <w:t>literal having p</w:t>
+      </w:r>
+      <w:r>
+        <w:t>r</w:t>
+      </w:r>
+      <w:r>
+        <w:t>operti</w:t>
+      </w:r>
+      <w:r>
+        <w:t>e</w:t>
+      </w:r>
+      <w:r>
+        <w:t xml:space="preserve">s like </w:t>
+      </w:r>
+      <w:proofErr w:type="spellStart"/>
+      <w:r>
+        <w:t>expiresIn</w:t>
+      </w:r>
+      <w:proofErr w:type="spellEnd"/>
+      <w:r>
+        <w:t xml:space="preserve"> that tells when that </w:t>
+      </w:r>
+      <w:r>
+        <w:t>token will be expired</w:t>
+      </w:r>
+      <w:r>
+        <w:t>(</w:t>
+      </w:r>
+      <w:r>
+        <w:t xml:space="preserve"> who knows</w:t>
+      </w:r>
+      <w:r>
+        <w:t>)</w:t>
+      </w:r>
+      <w:r>
+        <w:t>.</w:t>
+      </w:r>
+    </w:p>
+    <w:p>
+      <w:pPr>
+        <w:jc w:val="center"/>
+      </w:pPr>
+      <w:r>
+        <w:lastRenderedPageBreak/>
+        <w:drawing>
+          <wp:inline distT="0" distB="0" distL="0" distR="0" wp14:anchorId="0759759D" wp14:editId="0E01C70E">
+            <wp:extent cx="5401429" cy="2524477"/>
+            <wp:effectExtent l="0" t="0" r="8890" b="9525"/>
+            <wp:docPr id="1846008642" name="Picture 1"/>
+            <wp:cNvGraphicFramePr>
+              <a:graphicFrameLocks xmlns:a="http://schemas.openxmlformats.org/drawingml/2006/main" noChangeAspect="1"/>
+            </wp:cNvGraphicFramePr>
+            <a:graphic xmlns:a="http://schemas.openxmlformats.org/drawingml/2006/main">
+              <a:graphicData uri="http://schemas.openxmlformats.org/drawingml/2006/picture">
+                <pic:pic xmlns:pic="http://schemas.openxmlformats.org/drawingml/2006/picture">
+                  <pic:nvPicPr>
+                    <pic:cNvPr id="1846008642" name=""/>
+                    <pic:cNvPicPr/>
+                  </pic:nvPicPr>
+                  <pic:blipFill>
+                    <a:blip r:embed="rId59"/>
+                    <a:stretch>
+                      <a:fillRect/>
+                    </a:stretch>
+                  </pic:blipFill>
+                  <pic:spPr>
+                    <a:xfrm>
+                      <a:off x="0" y="0"/>
+                      <a:ext cx="5401429" cy="2524477"/>
+                    </a:xfrm>
+                    <a:prstGeom prst="rect">
+                      <a:avLst/>
+                    </a:prstGeom>
+                  </pic:spPr>
+                </pic:pic>
+              </a:graphicData>
+            </a:graphic>
+          </wp:inline>
+        </w:drawing>
+      </w:r>
+    </w:p>
+    <w:p>
+      <w:r>
+        <w:t>So now our code look like above.</w:t>
+      </w:r>
+    </w:p>
+    <w:p>
+      <w:r>
+        <w:t>We can even</w:t>
+      </w:r>
+      <w:r>
+        <w:t xml:space="preserve"> do </w:t>
+      </w:r>
+      <w:r>
+        <w:t xml:space="preserve">it </w:t>
+      </w:r>
+      <w:r>
+        <w:t xml:space="preserve">for </w:t>
+      </w:r>
+      <w:r>
+        <w:t xml:space="preserve">one day </w:t>
+      </w:r>
+      <w:r>
+        <w:t xml:space="preserve">by using “1d” as a value of </w:t>
+      </w:r>
+      <w:proofErr w:type="spellStart"/>
+      <w:r>
+        <w:t>expires</w:t>
+      </w:r>
+      <w:r>
+        <w:t>In</w:t>
+      </w:r>
+      <w:proofErr w:type="spellEnd"/>
+      <w:r>
+        <w:t xml:space="preserve"> </w:t>
+      </w:r>
+    </w:p>
+    <w:p>
+      <w:r>
+        <w:t>We are doin</w:t>
+      </w:r>
+      <w:r>
+        <w:t>g</w:t>
+      </w:r>
+      <w:r>
+        <w:t xml:space="preserve"> it so that </w:t>
+      </w:r>
+      <w:r>
+        <w:t xml:space="preserve">it get logout after some time. </w:t>
+      </w:r>
+    </w:p>
     <w:sectPr>
       <w:pgSz w:w="11906" w:h="16838"/>
       <w:pgMar w:top="1440" w:right="1440" w:bottom="1440" w:left="1440" w:header="708" w:footer="708" w:gutter="0"/>
@@ -9103,6 +11348,7 @@
   <w:style w:type="character" w:default="1" w:styleId="DefaultParagraphFont">
     <w:name w:val="Default Paragraph Font"/>
     <w:uiPriority w:val="1"/>
+    <w:semiHidden/>
     <w:unhideWhenUsed/>
   </w:style>
   <w:style w:type="table" w:default="1" w:styleId="TableNormal">

</xml_diff>

<commit_message>
Lesson 58 Adding Login and Logout buttons to Codeswear.com
</commit_message>
<xml_diff>
--- a/Notes2.docx
+++ b/Notes2.docx
@@ -59,10 +59,18 @@
     </w:p>
     <w:p>
       <w:r>
-        <w:t>In nay container</w:t>
-      </w:r>
-      <w:r>
-        <w:t>(or component)</w:t>
+        <w:t xml:space="preserve">In nay </w:t>
+      </w:r>
+      <w:proofErr w:type="gramStart"/>
+      <w:r>
+        <w:t>container</w:t>
+      </w:r>
+      <w:r>
+        <w:t>(</w:t>
+      </w:r>
+      <w:proofErr w:type="gramEnd"/>
+      <w:r>
+        <w:t>or component)</w:t>
       </w:r>
       <w:r>
         <w:t xml:space="preserve"> if you want to </w:t>
@@ -547,9 +555,14 @@
       </w:r>
     </w:p>
     <w:p>
+      <w:proofErr w:type="gramStart"/>
       <w:r>
         <w:lastRenderedPageBreak/>
-        <w:t>So we can so this thing Now we can see it is getting rendered as shown below</w:t>
+        <w:t>So</w:t>
+      </w:r>
+      <w:proofErr w:type="gramEnd"/>
+      <w:r>
+        <w:t xml:space="preserve"> we can so this thing Now we can see it is getting rendered as shown below</w:t>
       </w:r>
     </w:p>
     <w:p>
@@ -651,8 +664,13 @@
         <w:t xml:space="preserve"> s</w:t>
       </w:r>
       <w:r>
-        <w:t>ubmit the form</w:t>
-      </w:r>
+        <w:t xml:space="preserve">ubmit the </w:t>
+      </w:r>
+      <w:proofErr w:type="gramStart"/>
+      <w:r>
+        <w:t>form</w:t>
+      </w:r>
+      <w:proofErr w:type="gramEnd"/>
       <w:r>
         <w:t xml:space="preserve"> we will definitely have to make an API to co</w:t>
       </w:r>
@@ -718,8 +736,29 @@
       </w:r>
     </w:p>
     <w:p>
-      <w:r>
-        <w:t>So for now our post request handler look like below</w:t>
+      <w:proofErr w:type="gramStart"/>
+      <w:r>
+        <w:t>So</w:t>
+      </w:r>
+      <w:proofErr w:type="gramEnd"/>
+      <w:r>
+        <w:t xml:space="preserve"> for </w:t>
+      </w:r>
+      <w:proofErr w:type="gramStart"/>
+      <w:r>
+        <w:t>now</w:t>
+      </w:r>
+      <w:proofErr w:type="gramEnd"/>
+      <w:r>
+        <w:t xml:space="preserve"> our post request handler </w:t>
+      </w:r>
+      <w:proofErr w:type="gramStart"/>
+      <w:r>
+        <w:t>look</w:t>
+      </w:r>
+      <w:proofErr w:type="gramEnd"/>
+      <w:r>
+        <w:t xml:space="preserve"> like below</w:t>
       </w:r>
     </w:p>
     <w:p>
@@ -768,8 +807,13 @@
       </w:r>
     </w:p>
     <w:p>
-      <w:r>
-        <w:t>Ols version used to look like below</w:t>
+      <w:proofErr w:type="gramStart"/>
+      <w:r>
+        <w:t>Ols</w:t>
+      </w:r>
+      <w:proofErr w:type="gramEnd"/>
+      <w:r>
+        <w:t xml:space="preserve"> version used to look like below</w:t>
       </w:r>
     </w:p>
     <w:p>
@@ -877,10 +921,12 @@
         <w:t xml:space="preserve">, not plain JSON, so sending it directly with </w:t>
       </w:r>
       <w:proofErr w:type="spellStart"/>
+      <w:proofErr w:type="gramStart"/>
       <w:r>
         <w:t>res.json</w:t>
       </w:r>
       <w:proofErr w:type="spellEnd"/>
+      <w:proofErr w:type="gramEnd"/>
       <w:r>
         <w:t>(</w:t>
       </w:r>
@@ -938,9 +984,14 @@
     </w:p>
     <w:p>
       <w:r>
-        <w:t>export default function handler(</w:t>
-      </w:r>
-      <w:proofErr w:type="spellStart"/>
+        <w:t xml:space="preserve">export default function </w:t>
+      </w:r>
+      <w:proofErr w:type="gramStart"/>
+      <w:r>
+        <w:t>handler(</w:t>
+      </w:r>
+      <w:proofErr w:type="spellStart"/>
+      <w:proofErr w:type="gramEnd"/>
       <w:r>
         <w:t>req</w:t>
       </w:r>
@@ -1046,6 +1097,7 @@
         <w:t xml:space="preserve">Why </w:t>
       </w:r>
       <w:proofErr w:type="spellStart"/>
+      <w:proofErr w:type="gramStart"/>
       <w:r>
         <w:rPr>
           <w:b/>
@@ -1054,6 +1106,7 @@
         <w:t>res.json</w:t>
       </w:r>
       <w:proofErr w:type="spellEnd"/>
+      <w:proofErr w:type="gramEnd"/>
       <w:r>
         <w:rPr>
           <w:b/>
@@ -1085,18 +1138,25 @@
     </w:p>
     <w:p>
       <w:proofErr w:type="spellStart"/>
+      <w:proofErr w:type="gramStart"/>
       <w:r>
         <w:t>res.status</w:t>
       </w:r>
       <w:proofErr w:type="spellEnd"/>
-      <w:r>
-        <w:t>(200).</w:t>
+      <w:proofErr w:type="gramEnd"/>
+      <w:r>
+        <w:t>(200</w:t>
+      </w:r>
+      <w:proofErr w:type="gramStart"/>
+      <w:r>
+        <w:t>).</w:t>
       </w:r>
       <w:proofErr w:type="spellStart"/>
       <w:r>
         <w:t>json</w:t>
       </w:r>
       <w:proofErr w:type="spellEnd"/>
+      <w:proofErr w:type="gramEnd"/>
       <w:r>
         <w:t>(</w:t>
       </w:r>
@@ -1197,9 +1257,14 @@
     </w:p>
     <w:p>
       <w:r>
-        <w:t>export default function handler(</w:t>
-      </w:r>
-      <w:proofErr w:type="spellStart"/>
+        <w:t xml:space="preserve">export default function </w:t>
+      </w:r>
+      <w:proofErr w:type="gramStart"/>
+      <w:r>
+        <w:t>handler(</w:t>
+      </w:r>
+      <w:proofErr w:type="spellStart"/>
+      <w:proofErr w:type="gramEnd"/>
       <w:r>
         <w:t>req</w:t>
       </w:r>
@@ -1212,10 +1277,12 @@
         <w:t xml:space="preserve">  if (</w:t>
       </w:r>
       <w:proofErr w:type="spellStart"/>
+      <w:proofErr w:type="gramStart"/>
       <w:r>
         <w:t>req.method</w:t>
       </w:r>
       <w:proofErr w:type="spellEnd"/>
+      <w:proofErr w:type="gramEnd"/>
       <w:r>
         <w:t xml:space="preserve"> === "POST") {</w:t>
       </w:r>
@@ -1224,18 +1291,25 @@
         <w:t xml:space="preserve">    </w:t>
       </w:r>
       <w:proofErr w:type="spellStart"/>
+      <w:proofErr w:type="gramStart"/>
       <w:r>
         <w:t>res.status</w:t>
       </w:r>
       <w:proofErr w:type="spellEnd"/>
-      <w:r>
-        <w:t>(200).</w:t>
+      <w:proofErr w:type="gramEnd"/>
+      <w:r>
+        <w:t>(200</w:t>
+      </w:r>
+      <w:proofErr w:type="gramStart"/>
+      <w:r>
+        <w:t>).</w:t>
       </w:r>
       <w:proofErr w:type="spellStart"/>
       <w:r>
         <w:t>json</w:t>
       </w:r>
       <w:proofErr w:type="spellEnd"/>
+      <w:proofErr w:type="gramEnd"/>
       <w:r>
         <w:t>({</w:t>
       </w:r>
@@ -1244,10 +1318,12 @@
         <w:t xml:space="preserve">      method: </w:t>
       </w:r>
       <w:proofErr w:type="spellStart"/>
+      <w:proofErr w:type="gramStart"/>
       <w:r>
         <w:t>req.method</w:t>
       </w:r>
       <w:proofErr w:type="spellEnd"/>
+      <w:proofErr w:type="gramEnd"/>
       <w:r>
         <w:t>,</w:t>
       </w:r>
@@ -1256,10 +1332,12 @@
         <w:t xml:space="preserve">      body: </w:t>
       </w:r>
       <w:proofErr w:type="spellStart"/>
+      <w:proofErr w:type="gramStart"/>
       <w:r>
         <w:t>req.body</w:t>
       </w:r>
       <w:proofErr w:type="spellEnd"/>
+      <w:proofErr w:type="gramEnd"/>
       <w:r>
         <w:t>,</w:t>
       </w:r>
@@ -1268,10 +1346,12 @@
         <w:t xml:space="preserve">      query: </w:t>
       </w:r>
       <w:proofErr w:type="spellStart"/>
+      <w:proofErr w:type="gramStart"/>
       <w:r>
         <w:t>req.query</w:t>
       </w:r>
       <w:proofErr w:type="spellEnd"/>
+      <w:proofErr w:type="gramEnd"/>
       <w:r>
         <w:t>,</w:t>
       </w:r>
@@ -1281,8 +1361,12 @@
       </w:r>
       <w:r>
         <w:br/>
+      </w:r>
+      <w:proofErr w:type="gramStart"/>
+      <w:r>
         <w:t xml:space="preserve">  }</w:t>
       </w:r>
+      <w:proofErr w:type="gramEnd"/>
       <w:r>
         <w:br/>
         <w:t>}</w:t>
@@ -1438,10 +1522,12 @@
           </w:tcPr>
           <w:p>
             <w:proofErr w:type="spellStart"/>
+            <w:proofErr w:type="gramStart"/>
             <w:r>
               <w:t>req.body</w:t>
             </w:r>
             <w:proofErr w:type="spellEnd"/>
+            <w:proofErr w:type="gramEnd"/>
           </w:p>
         </w:tc>
         <w:tc>
@@ -1475,10 +1561,12 @@
           </w:tcPr>
           <w:p>
             <w:proofErr w:type="spellStart"/>
+            <w:proofErr w:type="gramStart"/>
             <w:r>
               <w:t>req.query</w:t>
             </w:r>
             <w:proofErr w:type="spellEnd"/>
+            <w:proofErr w:type="gramEnd"/>
           </w:p>
         </w:tc>
         <w:tc>
@@ -1512,10 +1600,12 @@
           </w:tcPr>
           <w:p>
             <w:proofErr w:type="spellStart"/>
+            <w:proofErr w:type="gramStart"/>
             <w:r>
               <w:t>req.method</w:t>
             </w:r>
             <w:proofErr w:type="spellEnd"/>
+            <w:proofErr w:type="gramEnd"/>
           </w:p>
         </w:tc>
         <w:tc>
@@ -1567,9 +1657,14 @@
     </w:p>
     <w:p>
       <w:r>
-        <w:t>export async function POST(</w:t>
-      </w:r>
-      <w:proofErr w:type="spellStart"/>
+        <w:t xml:space="preserve">export async function </w:t>
+      </w:r>
+      <w:proofErr w:type="gramStart"/>
+      <w:r>
+        <w:t>POST(</w:t>
+      </w:r>
+      <w:proofErr w:type="spellStart"/>
+      <w:proofErr w:type="gramEnd"/>
       <w:r>
         <w:t>req</w:t>
       </w:r>
@@ -1593,10 +1688,12 @@
         <w:t xml:space="preserve"> body = await </w:t>
       </w:r>
       <w:proofErr w:type="spellStart"/>
+      <w:proofErr w:type="gramStart"/>
       <w:r>
         <w:t>req.json</w:t>
       </w:r>
       <w:proofErr w:type="spellEnd"/>
+      <w:proofErr w:type="gramEnd"/>
       <w:r>
         <w:t>();</w:t>
       </w:r>
@@ -1658,10 +1755,12 @@
         <w:t xml:space="preserve">d specific fields like </w:t>
       </w:r>
       <w:proofErr w:type="spellStart"/>
+      <w:proofErr w:type="gramStart"/>
       <w:r>
         <w:t>req.body</w:t>
       </w:r>
       <w:proofErr w:type="spellEnd"/>
+      <w:proofErr w:type="gramEnd"/>
       <w:r>
         <w:t>.</w:t>
       </w:r>
@@ -1671,7 +1770,15 @@
         <w:t>In older version we used to get body like we did in n</w:t>
       </w:r>
       <w:r>
-        <w:t>ode js but in modern it look like below</w:t>
+        <w:t xml:space="preserve">ode js but in modern it </w:t>
+      </w:r>
+      <w:proofErr w:type="gramStart"/>
+      <w:r>
+        <w:t>look</w:t>
+      </w:r>
+      <w:proofErr w:type="gramEnd"/>
+      <w:r>
+        <w:t xml:space="preserve"> like below</w:t>
       </w:r>
     </w:p>
     <w:p>
@@ -1774,10 +1881,18 @@
         <w:t>The problem with the file making</w:t>
       </w:r>
       <w:r>
-        <w:t xml:space="preserve"> strategy </w:t>
-      </w:r>
-      <w:r>
-        <w:t xml:space="preserve"> is that </w:t>
+        <w:t xml:space="preserve"> </w:t>
+      </w:r>
+      <w:proofErr w:type="gramStart"/>
+      <w:r>
+        <w:t xml:space="preserve">strategy </w:t>
+      </w:r>
+      <w:r>
+        <w:t xml:space="preserve"> is</w:t>
+      </w:r>
+      <w:proofErr w:type="gramEnd"/>
+      <w:r>
+        <w:t xml:space="preserve"> that </w:t>
       </w:r>
       <w:r>
         <w:t xml:space="preserve">if suppose </w:t>
@@ -1890,20 +2005,41 @@
       </w:r>
       <w:proofErr w:type="spellEnd"/>
       <w:r>
-        <w:t xml:space="preserve"> element</w:t>
-      </w:r>
-      <w:r>
-        <w:t>(who knows may be I am wrong here)</w:t>
-      </w:r>
-      <w:r>
         <w:t xml:space="preserve"> </w:t>
       </w:r>
+      <w:proofErr w:type="gramStart"/>
+      <w:r>
+        <w:t>element</w:t>
+      </w:r>
+      <w:r>
+        <w:t>(</w:t>
+      </w:r>
+      <w:proofErr w:type="gramEnd"/>
+      <w:r>
+        <w:t xml:space="preserve">who knows </w:t>
+      </w:r>
+      <w:proofErr w:type="gramStart"/>
+      <w:r>
+        <w:t>may be</w:t>
+      </w:r>
+      <w:proofErr w:type="gramEnd"/>
+      <w:r>
+        <w:t xml:space="preserve"> I am wrong here)</w:t>
+      </w:r>
+      <w:r>
+        <w:t xml:space="preserve"> </w:t>
+      </w:r>
       <w:r>
         <w:t xml:space="preserve">and on state update method we used </w:t>
       </w:r>
       <w:proofErr w:type="spellStart"/>
-      <w:r>
-        <w:t>e.target.innerText</w:t>
+      <w:proofErr w:type="gramStart"/>
+      <w:r>
+        <w:t>e.target</w:t>
+      </w:r>
+      <w:proofErr w:type="gramEnd"/>
+      <w:r>
+        <w:t>.innerText</w:t>
       </w:r>
       <w:proofErr w:type="spellEnd"/>
     </w:p>
@@ -1920,8 +2056,13 @@
         <w:t xml:space="preserve"> we can use </w:t>
       </w:r>
       <w:proofErr w:type="spellStart"/>
-      <w:r>
-        <w:t>e.target,value</w:t>
+      <w:proofErr w:type="gramStart"/>
+      <w:r>
+        <w:t>e.target</w:t>
+      </w:r>
+      <w:proofErr w:type="gramEnd"/>
+      <w:r>
+        <w:t>,value</w:t>
       </w:r>
       <w:proofErr w:type="spellEnd"/>
       <w:r>
@@ -2037,13 +2178,16 @@
         <w:t xml:space="preserve">Shortcut for </w:t>
       </w:r>
       <w:proofErr w:type="spellStart"/>
+      <w:proofErr w:type="gramStart"/>
       <w:r>
         <w:t>margin:auto</w:t>
       </w:r>
       <w:proofErr w:type="spellEnd"/>
+      <w:proofErr w:type="gramEnd"/>
       <w:r>
         <w:t xml:space="preserve"> will be </w:t>
       </w:r>
+      <w:proofErr w:type="gramStart"/>
       <w:r>
         <w:rPr>
           <w:b/>
@@ -2051,6 +2195,7 @@
         </w:rPr>
         <w:t>m:auto</w:t>
       </w:r>
+      <w:proofErr w:type="gramEnd"/>
       <w:r>
         <w:rPr>
           <w:b/>
@@ -2114,10 +2259,18 @@
     </w:p>
     <w:p>
       <w:r>
-        <w:t xml:space="preserve">Suppose you have 50 blogs and you want to show 5 blogs on each pages </w:t>
-      </w:r>
-      <w:r>
-        <w:t xml:space="preserve"> so 10 pages </w:t>
+        <w:t xml:space="preserve">Suppose you have 50 blogs and you want to show 5 blogs on each </w:t>
+      </w:r>
+      <w:proofErr w:type="gramStart"/>
+      <w:r>
+        <w:t xml:space="preserve">pages </w:t>
+      </w:r>
+      <w:r>
+        <w:t xml:space="preserve"> so</w:t>
+      </w:r>
+      <w:proofErr w:type="gramEnd"/>
+      <w:r>
+        <w:t xml:space="preserve"> 10 pages </w:t>
       </w:r>
       <w:r>
         <w:t>will</w:t>
@@ -2128,11 +2281,16 @@
       <w:r>
         <w:t xml:space="preserve">be </w:t>
       </w:r>
+      <w:proofErr w:type="gramStart"/>
       <w:r>
         <w:t xml:space="preserve">formed </w:t>
       </w:r>
       <w:r>
-        <w:t xml:space="preserve">. In the similar way </w:t>
+        <w:t>.</w:t>
+      </w:r>
+      <w:proofErr w:type="gramEnd"/>
+      <w:r>
+        <w:t xml:space="preserve"> In the similar way </w:t>
       </w:r>
       <w:r>
         <w:t xml:space="preserve">pagination can be showed </w:t>
@@ -2249,7 +2407,15 @@
         <w:t xml:space="preserve">that we will not good components </w:t>
       </w:r>
       <w:r>
-        <w:t>means you won’t get good packages for doing any work(who knows)</w:t>
+        <w:t xml:space="preserve">means you won’t get good packages for doing any </w:t>
+      </w:r>
+      <w:proofErr w:type="gramStart"/>
+      <w:r>
+        <w:t>work(</w:t>
+      </w:r>
+      <w:proofErr w:type="gramEnd"/>
+      <w:r>
+        <w:t>who knows)</w:t>
       </w:r>
     </w:p>
     <w:p>
@@ -2278,14 +2444,27 @@
       </w:r>
     </w:p>
     <w:p>
-      <w:r>
-        <w:t xml:space="preserve">So we run the above command I context of </w:t>
+      <w:proofErr w:type="gramStart"/>
+      <w:r>
+        <w:t>So</w:t>
+      </w:r>
+      <w:proofErr w:type="gramEnd"/>
+      <w:r>
+        <w:t xml:space="preserve"> we run the above command I context of </w:t>
       </w:r>
       <w:r>
         <w:t xml:space="preserve">yarn </w:t>
       </w:r>
       <w:r>
-        <w:t>by using  below command</w:t>
+        <w:t xml:space="preserve">by </w:t>
+      </w:r>
+      <w:proofErr w:type="gramStart"/>
+      <w:r>
+        <w:t>using  below</w:t>
+      </w:r>
+      <w:proofErr w:type="gramEnd"/>
+      <w:r>
+        <w:t xml:space="preserve"> command</w:t>
       </w:r>
     </w:p>
     <w:p>
@@ -2373,13 +2552,29 @@
         <w:t xml:space="preserve">Data length </w:t>
       </w:r>
       <w:r>
-        <w:t>of the data that to be shown</w:t>
-      </w:r>
-      <w:r>
-        <w:t xml:space="preserve"> , next is the function  </w:t>
-      </w:r>
-      <w:r>
-        <w:t>that will be called when we scroll and reach the bottom and more data is needed to be loaded.</w:t>
+        <w:t xml:space="preserve">of the data that to be </w:t>
+      </w:r>
+      <w:proofErr w:type="gramStart"/>
+      <w:r>
+        <w:t>shown</w:t>
+      </w:r>
+      <w:r>
+        <w:t xml:space="preserve"> ,</w:t>
+      </w:r>
+      <w:proofErr w:type="gramEnd"/>
+      <w:r>
+        <w:t xml:space="preserve"> next is the </w:t>
+      </w:r>
+      <w:proofErr w:type="gramStart"/>
+      <w:r>
+        <w:t xml:space="preserve">function  </w:t>
+      </w:r>
+      <w:r>
+        <w:t>that</w:t>
+      </w:r>
+      <w:proofErr w:type="gramEnd"/>
+      <w:r>
+        <w:t xml:space="preserve"> will be called when we scroll and reach the bottom and more data is needed to be loaded.</w:t>
       </w:r>
     </w:p>
     <w:p>
@@ -2407,13 +2602,21 @@
         <w:t>w</w:t>
       </w:r>
       <w:r>
-        <w:t>n function</w:t>
+        <w:t xml:space="preserve">n </w:t>
+      </w:r>
+      <w:proofErr w:type="gramStart"/>
+      <w:r>
+        <w:t>function</w:t>
       </w:r>
       <w:r>
         <w:t>al</w:t>
       </w:r>
       <w:r>
-        <w:t>ity(who knows)</w:t>
+        <w:t>ity(</w:t>
+      </w:r>
+      <w:proofErr w:type="gramEnd"/>
+      <w:r>
+        <w:t>who knows)</w:t>
       </w:r>
     </w:p>
     <w:p>
@@ -2495,7 +2698,15 @@
         <w:t xml:space="preserve">it is defined like this </w:t>
       </w:r>
       <w:r>
-        <w:t xml:space="preserve">if we keep single item </w:t>
+        <w:t xml:space="preserve">if we keep single </w:t>
+      </w:r>
+      <w:proofErr w:type="gramStart"/>
+      <w:r>
+        <w:t>item</w:t>
+      </w:r>
+      <w:proofErr w:type="gramEnd"/>
+      <w:r>
+        <w:t xml:space="preserve"> </w:t>
       </w:r>
       <w:r>
         <w:t>we need to see al</w:t>
@@ -2504,22 +2715,31 @@
         <w:t>l</w:t>
       </w:r>
       <w:r>
-        <w:t xml:space="preserve"> this thi</w:t>
+        <w:t xml:space="preserve"> </w:t>
+      </w:r>
+      <w:proofErr w:type="gramStart"/>
+      <w:r>
+        <w:t>this thi</w:t>
       </w:r>
       <w:r>
         <w:t>n</w:t>
       </w:r>
       <w:r>
-        <w:t xml:space="preserve">gs </w:t>
-      </w:r>
-    </w:p>
-    <w:p>
-      <w:pPr>
-        <w:rPr>
-          <w:b/>
-          <w:bCs/>
-        </w:rPr>
-      </w:pPr>
+        <w:t>gs</w:t>
+      </w:r>
+      <w:proofErr w:type="gramEnd"/>
+      <w:r>
+        <w:t xml:space="preserve"> </w:t>
+      </w:r>
+    </w:p>
+    <w:p>
+      <w:pPr>
+        <w:rPr>
+          <w:b/>
+          <w:bCs/>
+        </w:rPr>
+      </w:pPr>
+      <w:proofErr w:type="gramStart"/>
       <w:r>
         <w:rPr>
           <w:b/>
@@ -2527,6 +2747,7 @@
         </w:rPr>
         <w:t>Note:-</w:t>
       </w:r>
+      <w:proofErr w:type="gramEnd"/>
     </w:p>
     <w:p>
       <w:pPr>
@@ -2538,7 +2759,15 @@
         <w:t xml:space="preserve">Sometime it happens </w:t>
       </w:r>
       <w:r>
-        <w:t>in react that one component is show  two times so reload to remove the bug</w:t>
+        <w:t xml:space="preserve">in react that one component is </w:t>
+      </w:r>
+      <w:proofErr w:type="gramStart"/>
+      <w:r>
+        <w:t>show  two</w:t>
+      </w:r>
+      <w:proofErr w:type="gramEnd"/>
+      <w:r>
+        <w:t xml:space="preserve"> times so reload to remove the bug</w:t>
       </w:r>
     </w:p>
     <w:p>
@@ -2554,7 +2783,15 @@
         <w:t xml:space="preserve">except for responsiveness </w:t>
       </w:r>
       <w:r>
-        <w:t xml:space="preserve">we will  make our blog responsive and will write media queries </w:t>
+        <w:t xml:space="preserve">we </w:t>
+      </w:r>
+      <w:proofErr w:type="gramStart"/>
+      <w:r>
+        <w:t>will  make</w:t>
+      </w:r>
+      <w:proofErr w:type="gramEnd"/>
+      <w:r>
+        <w:t xml:space="preserve"> our blog responsive and will write media queries </w:t>
       </w:r>
       <w:r>
         <w:t>how we can we run media que</w:t>
@@ -2580,8 +2817,13 @@
         <w:t xml:space="preserve">the website </w:t>
       </w:r>
       <w:r>
-        <w:t>and if you gave responsiveness</w:t>
-      </w:r>
+        <w:t xml:space="preserve">and if you gave </w:t>
+      </w:r>
+      <w:proofErr w:type="gramStart"/>
+      <w:r>
+        <w:t>responsiveness</w:t>
+      </w:r>
+      <w:proofErr w:type="gramEnd"/>
       <w:r>
         <w:t xml:space="preserve"> it was an addon</w:t>
       </w:r>
@@ -2600,10 +2842,12 @@
         <w:t xml:space="preserve">you can say bit in </w:t>
       </w:r>
       <w:proofErr w:type="spellStart"/>
+      <w:proofErr w:type="gramStart"/>
       <w:r>
         <w:t>todays</w:t>
       </w:r>
       <w:proofErr w:type="spellEnd"/>
+      <w:proofErr w:type="gramEnd"/>
       <w:r>
         <w:t xml:space="preserve"> time </w:t>
       </w:r>
@@ -2680,7 +2924,11 @@
     </w:p>
     <w:p>
       <w:r>
-        <w:t>We will ho</w:t>
+        <w:t xml:space="preserve">We will </w:t>
+      </w:r>
+      <w:proofErr w:type="gramStart"/>
+      <w:r>
+        <w:t>ho</w:t>
       </w:r>
       <w:r>
         <w:t>s</w:t>
@@ -2689,7 +2937,11 @@
         <w:t>t</w:t>
       </w:r>
       <w:r>
-        <w:t>s the web</w:t>
+        <w:t>s</w:t>
+      </w:r>
+      <w:proofErr w:type="gramEnd"/>
+      <w:r>
+        <w:t xml:space="preserve"> the web</w:t>
       </w:r>
       <w:r>
         <w:t>s</w:t>
@@ -2816,7 +3068,15 @@
     </w:p>
     <w:p>
       <w:r>
-        <w:t xml:space="preserve">IN digital ocean we make new user(who knows) </w:t>
+        <w:t xml:space="preserve">IN digital ocean we make new </w:t>
+      </w:r>
+      <w:proofErr w:type="gramStart"/>
+      <w:r>
+        <w:t>user(</w:t>
+      </w:r>
+      <w:proofErr w:type="gramEnd"/>
+      <w:r>
+        <w:t xml:space="preserve">who knows) </w:t>
       </w:r>
     </w:p>
     <w:p>
@@ -2854,13 +3114,26 @@
       <w:r>
         <w:t xml:space="preserve">process will be </w:t>
       </w:r>
-      <w:r>
-        <w:t xml:space="preserve">build there </w:t>
-      </w:r>
-    </w:p>
-    <w:p>
-      <w:r>
-        <w:t>It will ask you to make database in there services.</w:t>
+      <w:proofErr w:type="gramStart"/>
+      <w:r>
+        <w:t>build</w:t>
+      </w:r>
+      <w:proofErr w:type="gramEnd"/>
+      <w:r>
+        <w:t xml:space="preserve"> there </w:t>
+      </w:r>
+    </w:p>
+    <w:p>
+      <w:r>
+        <w:t xml:space="preserve">It will ask you to make database in </w:t>
+      </w:r>
+      <w:proofErr w:type="gramStart"/>
+      <w:r>
+        <w:t>there</w:t>
+      </w:r>
+      <w:proofErr w:type="gramEnd"/>
+      <w:r>
+        <w:t xml:space="preserve"> services.</w:t>
       </w:r>
       <w:r>
         <w:t xml:space="preserve"> (who knows)</w:t>
@@ -2911,9 +3184,14 @@
       </w:r>
       <w:proofErr w:type="spellEnd"/>
       <w:r>
-        <w:t xml:space="preserve"> it will be good(</w:t>
-      </w:r>
-      <w:proofErr w:type="spellStart"/>
+        <w:t xml:space="preserve"> it will be </w:t>
+      </w:r>
+      <w:proofErr w:type="gramStart"/>
+      <w:r>
+        <w:t>good(</w:t>
+      </w:r>
+      <w:proofErr w:type="spellStart"/>
+      <w:proofErr w:type="gramEnd"/>
       <w:r>
         <w:t>wjp</w:t>
       </w:r>
@@ -2930,20 +3208,30 @@
           <w:color w:val="EE0000"/>
         </w:rPr>
       </w:pPr>
+      <w:proofErr w:type="gramStart"/>
       <w:r>
         <w:rPr>
           <w:b/>
           <w:bCs/>
           <w:color w:val="EE0000"/>
         </w:rPr>
-        <w:t xml:space="preserve">‘ can create </w:t>
-      </w:r>
+        <w:t>‘ can</w:t>
+      </w:r>
+      <w:proofErr w:type="gramEnd"/>
       <w:r>
         <w:rPr>
           <w:b/>
           <w:bCs/>
           <w:color w:val="EE0000"/>
         </w:rPr>
+        <w:t xml:space="preserve"> create </w:t>
+      </w:r>
+      <w:r>
+        <w:rPr>
+          <w:b/>
+          <w:bCs/>
+          <w:color w:val="EE0000"/>
+        </w:rPr>
         <w:t xml:space="preserve">error in </w:t>
       </w:r>
       <w:proofErr w:type="spellStart"/>
@@ -2988,15 +3276,33 @@
           <w:bCs/>
           <w:color w:val="EE0000"/>
         </w:rPr>
-        <w:t xml:space="preserve"> or maybe in React.</w:t>
-      </w:r>
+        <w:t xml:space="preserve"> or maybe in </w:t>
+      </w:r>
+      <w:proofErr w:type="gramStart"/>
       <w:r>
         <w:rPr>
           <w:b/>
           <w:bCs/>
           <w:color w:val="EE0000"/>
         </w:rPr>
-        <w:t>(maybe it is an outdated problem)</w:t>
+        <w:t>React.</w:t>
+      </w:r>
+      <w:r>
+        <w:rPr>
+          <w:b/>
+          <w:bCs/>
+          <w:color w:val="EE0000"/>
+        </w:rPr>
+        <w:t>(</w:t>
+      </w:r>
+      <w:proofErr w:type="gramEnd"/>
+      <w:r>
+        <w:rPr>
+          <w:b/>
+          <w:bCs/>
+          <w:color w:val="EE0000"/>
+        </w:rPr>
+        <w:t>maybe it is an outdated problem)</w:t>
       </w:r>
     </w:p>
     <w:p>
@@ -3021,10 +3327,12 @@
         <w:t xml:space="preserve">you can make it like that and if it </w:t>
       </w:r>
       <w:proofErr w:type="spellStart"/>
+      <w:proofErr w:type="gramStart"/>
       <w:r>
         <w:t>become</w:t>
       </w:r>
       <w:proofErr w:type="spellEnd"/>
+      <w:proofErr w:type="gramEnd"/>
       <w:r>
         <w:t xml:space="preserve"> profitable then you can scale it (who knows) </w:t>
       </w:r>
@@ -3033,6 +3341,7 @@
       <w:r>
         <w:t xml:space="preserve">Now as you commit then </w:t>
       </w:r>
+      <w:proofErr w:type="gramStart"/>
       <w:r>
         <w:t>Digital</w:t>
       </w:r>
@@ -3040,13 +3349,25 @@
         <w:t xml:space="preserve"> </w:t>
       </w:r>
       <w:r>
-        <w:t>ocean will build it</w:t>
-      </w:r>
-      <w:r>
-        <w:t xml:space="preserve"> automatically for you.</w:t>
-      </w:r>
-      <w:r>
-        <w:t>(maybe if auto</w:t>
+        <w:t>ocean</w:t>
+      </w:r>
+      <w:proofErr w:type="gramEnd"/>
+      <w:r>
+        <w:t xml:space="preserve"> will build it</w:t>
+      </w:r>
+      <w:r>
+        <w:t xml:space="preserve"> automatically for </w:t>
+      </w:r>
+      <w:proofErr w:type="gramStart"/>
+      <w:r>
+        <w:t>you.</w:t>
+      </w:r>
+      <w:r>
+        <w:t>(</w:t>
+      </w:r>
+      <w:proofErr w:type="gramEnd"/>
+      <w:r>
+        <w:t>maybe if auto</w:t>
       </w:r>
       <w:r>
         <w:t xml:space="preserve"> </w:t>
@@ -3055,7 +3376,15 @@
         <w:t xml:space="preserve">deploy option was selected </w:t>
       </w:r>
       <w:r>
-        <w:t>in the setting(who knows)</w:t>
+        <w:t xml:space="preserve">in the </w:t>
+      </w:r>
+      <w:proofErr w:type="gramStart"/>
+      <w:r>
+        <w:t>setting(</w:t>
+      </w:r>
+      <w:proofErr w:type="gramEnd"/>
+      <w:r>
+        <w:t>who knows)</w:t>
       </w:r>
       <w:r>
         <w:t>)</w:t>
@@ -3093,10 +3422,18 @@
         <w:t xml:space="preserve">here (maybe </w:t>
       </w:r>
       <w:r>
-        <w:t>very large app don’t work properly</w:t>
-      </w:r>
-      <w:r>
-        <w:t>(who knows)</w:t>
+        <w:t xml:space="preserve">very large app don’t work </w:t>
+      </w:r>
+      <w:proofErr w:type="gramStart"/>
+      <w:r>
+        <w:t>properly</w:t>
+      </w:r>
+      <w:r>
+        <w:t>(</w:t>
+      </w:r>
+      <w:proofErr w:type="gramEnd"/>
+      <w:r>
+        <w:t>who knows)</w:t>
       </w:r>
       <w:r>
         <w:t>)</w:t>
@@ -3137,10 +3474,18 @@
         <w:t xml:space="preserve">Now we will see </w:t>
       </w:r>
       <w:r>
-        <w:t>how Google analytics and search console</w:t>
-      </w:r>
-      <w:r>
-        <w:t xml:space="preserve">(who </w:t>
+        <w:t xml:space="preserve">how Google analytics and search </w:t>
+      </w:r>
+      <w:proofErr w:type="gramStart"/>
+      <w:r>
+        <w:t>console</w:t>
+      </w:r>
+      <w:r>
+        <w:t>(</w:t>
+      </w:r>
+      <w:proofErr w:type="gramEnd"/>
+      <w:r>
+        <w:t xml:space="preserve">who </w:t>
       </w:r>
       <w:proofErr w:type="spellStart"/>
       <w:r>
@@ -3307,13 +3652,21 @@
         <w:t xml:space="preserve">ck </w:t>
       </w:r>
       <w:r>
-        <w:t>which is also called S</w:t>
-      </w:r>
+        <w:t xml:space="preserve">which is also called </w:t>
+      </w:r>
+      <w:proofErr w:type="gramStart"/>
       <w:r>
         <w:t>S</w:t>
       </w:r>
       <w:r>
-        <w:t>LV(who knows)</w:t>
+        <w:t>S</w:t>
+      </w:r>
+      <w:r>
+        <w:t>LV(</w:t>
+      </w:r>
+      <w:proofErr w:type="gramEnd"/>
+      <w:r>
+        <w:t>who knows)</w:t>
       </w:r>
       <w:r>
         <w:t xml:space="preserve"> and </w:t>
@@ -3360,8 +3713,13 @@
       <w:r>
         <w:t xml:space="preserve">of the application. </w:t>
       </w:r>
-      <w:r>
-        <w:t>So if we want that the domain we have need to be pointe</w:t>
+      <w:proofErr w:type="gramStart"/>
+      <w:r>
+        <w:t>So</w:t>
+      </w:r>
+      <w:proofErr w:type="gramEnd"/>
+      <w:r>
+        <w:t xml:space="preserve"> if we want that the domain we have need to be pointe</w:t>
       </w:r>
       <w:r>
         <w:t>d</w:t>
@@ -3392,10 +3750,18 @@
     </w:p>
     <w:p>
       <w:r>
-        <w:t xml:space="preserve">Of you chose the former then you will  </w:t>
-      </w:r>
-      <w:r>
-        <w:t xml:space="preserve">see that from the dashboard </w:t>
+        <w:t xml:space="preserve">Of you chose the former then you </w:t>
+      </w:r>
+      <w:proofErr w:type="gramStart"/>
+      <w:r>
+        <w:t xml:space="preserve">will  </w:t>
+      </w:r>
+      <w:r>
+        <w:t>see</w:t>
+      </w:r>
+      <w:proofErr w:type="gramEnd"/>
+      <w:r>
+        <w:t xml:space="preserve"> that from the dashboard </w:t>
       </w:r>
       <w:r>
         <w:t xml:space="preserve">that how things are happening </w:t>
@@ -3404,10 +3770,26 @@
         <w:t xml:space="preserve">and if you chose later </w:t>
       </w:r>
       <w:r>
-        <w:t>then you need to point it to a Digital ocean(who knows)</w:t>
-      </w:r>
-      <w:r>
-        <w:t>. By former we bring the domain in the digital ocean(who knows)</w:t>
+        <w:t xml:space="preserve">then you need to point it to a Digital </w:t>
+      </w:r>
+      <w:proofErr w:type="gramStart"/>
+      <w:r>
+        <w:t>ocean(</w:t>
+      </w:r>
+      <w:proofErr w:type="gramEnd"/>
+      <w:r>
+        <w:t>who knows)</w:t>
+      </w:r>
+      <w:r>
+        <w:t xml:space="preserve">. By former we bring the domain in the digital </w:t>
+      </w:r>
+      <w:proofErr w:type="gramStart"/>
+      <w:r>
+        <w:t>ocean(</w:t>
+      </w:r>
+      <w:proofErr w:type="gramEnd"/>
+      <w:r>
+        <w:t>who knows)</w:t>
       </w:r>
       <w:r>
         <w:t xml:space="preserve">. </w:t>
@@ -3453,8 +3835,13 @@
       </w:r>
     </w:p>
     <w:p>
-      <w:r>
-        <w:t>So we went to Google search console</w:t>
+      <w:proofErr w:type="gramStart"/>
+      <w:r>
+        <w:t>So</w:t>
+      </w:r>
+      <w:proofErr w:type="gramEnd"/>
+      <w:r>
+        <w:t xml:space="preserve"> we went to Google search console</w:t>
       </w:r>
       <w:r>
         <w:t xml:space="preserve"> so we add a property there </w:t>
@@ -3529,7 +3916,15 @@
         <w:t xml:space="preserve">omain </w:t>
       </w:r>
       <w:r>
-        <w:t xml:space="preserve">ad then you need to verify it so it give us some text which we will paste in the </w:t>
+        <w:t xml:space="preserve">ad then you need to verify it so it </w:t>
+      </w:r>
+      <w:proofErr w:type="gramStart"/>
+      <w:r>
+        <w:t>give</w:t>
+      </w:r>
+      <w:proofErr w:type="gramEnd"/>
+      <w:r>
+        <w:t xml:space="preserve"> us some text which we will paste in the </w:t>
       </w:r>
       <w:r>
         <w:t xml:space="preserve">DNS records to give the proof for ownership of domain. </w:t>
@@ -3623,7 +4018,11 @@
         <w:t xml:space="preserve"> and how to integrate </w:t>
       </w:r>
       <w:r>
-        <w:t>payment gateway to the websi</w:t>
+        <w:t xml:space="preserve">payment gateway to the </w:t>
+      </w:r>
+      <w:proofErr w:type="gramStart"/>
+      <w:r>
+        <w:t>websi</w:t>
       </w:r>
       <w:r>
         <w:t>t</w:t>
@@ -3634,14 +4033,23 @@
       <w:r>
         <w:t>.</w:t>
       </w:r>
+      <w:proofErr w:type="gramEnd"/>
       <w:r>
         <w:t xml:space="preserve"> How orders will come </w:t>
       </w:r>
       <w:r>
-        <w:t xml:space="preserve">and how admin panel will be made </w:t>
-      </w:r>
-      <w:r>
-        <w:t>. F</w:t>
+        <w:t xml:space="preserve">and how admin panel will be </w:t>
+      </w:r>
+      <w:proofErr w:type="gramStart"/>
+      <w:r>
+        <w:t xml:space="preserve">made </w:t>
+      </w:r>
+      <w:r>
+        <w:t>.</w:t>
+      </w:r>
+      <w:proofErr w:type="gramEnd"/>
+      <w:r>
+        <w:t xml:space="preserve"> F</w:t>
       </w:r>
       <w:r>
         <w:t>r</w:t>
@@ -3962,10 +4370,18 @@
         <w:t xml:space="preserve">Like Bootstrap Tailwind also have </w:t>
       </w:r>
       <w:r>
-        <w:t xml:space="preserve">predefined class </w:t>
-      </w:r>
-      <w:r>
-        <w:t xml:space="preserve">.So we have tailwind css is installed </w:t>
+        <w:t xml:space="preserve">predefined </w:t>
+      </w:r>
+      <w:proofErr w:type="gramStart"/>
+      <w:r>
+        <w:t xml:space="preserve">class </w:t>
+      </w:r>
+      <w:r>
+        <w:t>.So</w:t>
+      </w:r>
+      <w:proofErr w:type="gramEnd"/>
+      <w:r>
+        <w:t xml:space="preserve"> we have tailwind css is installed </w:t>
       </w:r>
       <w:r>
         <w:t>and we can use our utility class</w:t>
@@ -4073,7 +4489,15 @@
         <w:t xml:space="preserve">There are some pages which you will find in almost all Ecommerce website that is </w:t>
       </w:r>
       <w:r>
-        <w:t>Product page , Home page</w:t>
+        <w:t xml:space="preserve">Product </w:t>
+      </w:r>
+      <w:proofErr w:type="gramStart"/>
+      <w:r>
+        <w:t>page ,</w:t>
+      </w:r>
+      <w:proofErr w:type="gramEnd"/>
+      <w:r>
+        <w:t xml:space="preserve"> Home page</w:t>
       </w:r>
       <w:r>
         <w:t>, Checkout page</w:t>
@@ -4085,10 +4509,18 @@
         <w:t>n</w:t>
       </w:r>
       <w:r>
-        <w:t xml:space="preserve"> order</w:t>
-      </w:r>
-      <w:r>
-        <w:t xml:space="preserve"> , login and </w:t>
+        <w:t xml:space="preserve"> </w:t>
+      </w:r>
+      <w:proofErr w:type="gramStart"/>
+      <w:r>
+        <w:t>order</w:t>
+      </w:r>
+      <w:r>
+        <w:t xml:space="preserve"> ,</w:t>
+      </w:r>
+      <w:proofErr w:type="gramEnd"/>
+      <w:r>
+        <w:t xml:space="preserve"> login and </w:t>
       </w:r>
       <w:proofErr w:type="spellStart"/>
       <w:r>
@@ -4165,7 +4597,15 @@
     </w:p>
     <w:p>
       <w:r>
-        <w:t xml:space="preserve">We will use app for that purposes(maybe </w:t>
+        <w:t xml:space="preserve">We will use app for that </w:t>
+      </w:r>
+      <w:proofErr w:type="gramStart"/>
+      <w:r>
+        <w:t>purposes(</w:t>
+      </w:r>
+      <w:proofErr w:type="gramEnd"/>
+      <w:r>
+        <w:t xml:space="preserve">maybe </w:t>
       </w:r>
       <w:proofErr w:type="spellStart"/>
       <w:r>
@@ -4208,13 +4648,21 @@
         <w:t xml:space="preserve">snippet </w:t>
       </w:r>
       <w:r>
-        <w:t xml:space="preserve">here you get minimalistic design </w:t>
+        <w:t xml:space="preserve">here you get minimalistic </w:t>
+      </w:r>
+      <w:proofErr w:type="gramStart"/>
+      <w:r>
+        <w:t xml:space="preserve">design </w:t>
       </w:r>
       <w:r>
         <w:t xml:space="preserve"> </w:t>
       </w:r>
       <w:r>
-        <w:t xml:space="preserve">Here you get </w:t>
+        <w:t>Here</w:t>
+      </w:r>
+      <w:proofErr w:type="gramEnd"/>
+      <w:r>
+        <w:t xml:space="preserve"> you get </w:t>
       </w:r>
       <w:proofErr w:type="spellStart"/>
       <w:r>
@@ -4535,14 +4983,46 @@
           <w:b/>
           <w:bCs/>
         </w:rPr>
-        <w:t xml:space="preserve"> and(we try there should be equivalent space between them)</w:t>
-      </w:r>
-      <w:r>
-        <w:rPr>
-          <w:b/>
-          <w:bCs/>
-        </w:rPr>
-        <w:t>(who knows)</w:t>
+        <w:t xml:space="preserve"> </w:t>
+      </w:r>
+      <w:proofErr w:type="gramStart"/>
+      <w:r>
+        <w:rPr>
+          <w:b/>
+          <w:bCs/>
+        </w:rPr>
+        <w:t>and(</w:t>
+      </w:r>
+      <w:proofErr w:type="gramEnd"/>
+      <w:r>
+        <w:rPr>
+          <w:b/>
+          <w:bCs/>
+        </w:rPr>
+        <w:t xml:space="preserve">we try there should be equivalent space between </w:t>
+      </w:r>
+      <w:proofErr w:type="gramStart"/>
+      <w:r>
+        <w:rPr>
+          <w:b/>
+          <w:bCs/>
+        </w:rPr>
+        <w:t>them)</w:t>
+      </w:r>
+      <w:r>
+        <w:rPr>
+          <w:b/>
+          <w:bCs/>
+        </w:rPr>
+        <w:t>(</w:t>
+      </w:r>
+      <w:proofErr w:type="gramEnd"/>
+      <w:r>
+        <w:rPr>
+          <w:b/>
+          <w:bCs/>
+        </w:rPr>
+        <w:t>who knows)</w:t>
       </w:r>
     </w:p>
     <w:p>
@@ -4559,6 +5039,7 @@
         <w:t xml:space="preserve"> in Tailwind by </w:t>
       </w:r>
       <w:proofErr w:type="spellStart"/>
+      <w:proofErr w:type="gramStart"/>
       <w:r>
         <w:rPr>
           <w:b/>
@@ -4574,6 +5055,7 @@
         <w:t>property</w:t>
       </w:r>
       <w:proofErr w:type="spellEnd"/>
+      <w:proofErr w:type="gramEnd"/>
       <w:r>
         <w:rPr>
           <w:b/>
@@ -4706,13 +5188,18 @@
     </w:p>
     <w:p>
       <w:r>
-        <w:t xml:space="preserve">import { </w:t>
+        <w:t xml:space="preserve">import </w:t>
+      </w:r>
+      <w:proofErr w:type="gramStart"/>
+      <w:r>
+        <w:t xml:space="preserve">{ </w:t>
       </w:r>
       <w:proofErr w:type="spellStart"/>
       <w:r>
         <w:t>AiOutlineShoppingCart</w:t>
       </w:r>
       <w:proofErr w:type="spellEnd"/>
+      <w:proofErr w:type="gramEnd"/>
       <w:r>
         <w:t xml:space="preserve"> } from "react-icons/ai";</w:t>
       </w:r>
@@ -4949,9 +5436,14 @@
       </w:r>
       <w:proofErr w:type="spellStart"/>
       <w:r>
-        <w:t>overflow-x:hidden</w:t>
-      </w:r>
-      <w:proofErr w:type="spellEnd"/>
+        <w:t>overflow-</w:t>
+      </w:r>
+      <w:proofErr w:type="gramStart"/>
+      <w:r>
+        <w:t>x:hidden</w:t>
+      </w:r>
+      <w:proofErr w:type="spellEnd"/>
+      <w:proofErr w:type="gramEnd"/>
       <w:r>
         <w:t xml:space="preserve"> you c</w:t>
       </w:r>
@@ -5088,7 +5580,15 @@
         <w:t xml:space="preserve">it is just a request and js will update cart accordingly </w:t>
       </w:r>
       <w:r>
-        <w:t xml:space="preserve">and there is no guarantee when  it will be updated so believe it that </w:t>
+        <w:t xml:space="preserve">and there is no guarantee </w:t>
+      </w:r>
+      <w:proofErr w:type="gramStart"/>
+      <w:r>
+        <w:t>when  it</w:t>
+      </w:r>
+      <w:proofErr w:type="gramEnd"/>
+      <w:r>
+        <w:t xml:space="preserve"> will be updated so believe it that </w:t>
       </w:r>
       <w:r>
         <w:t>car</w:t>
@@ -5109,10 +5609,12 @@
         <w:t xml:space="preserve"> request </w:t>
       </w:r>
       <w:proofErr w:type="spellStart"/>
+      <w:proofErr w:type="gramStart"/>
       <w:r>
         <w:t>its</w:t>
       </w:r>
       <w:proofErr w:type="spellEnd"/>
+      <w:proofErr w:type="gramEnd"/>
       <w:r>
         <w:t xml:space="preserve"> not an order</w:t>
       </w:r>
@@ -5129,7 +5631,15 @@
         <w:t xml:space="preserve">accordingly </w:t>
       </w:r>
       <w:r>
-        <w:t xml:space="preserve">and it will take time but it take time </w:t>
+        <w:t xml:space="preserve">and it will take time but it </w:t>
+      </w:r>
+      <w:proofErr w:type="gramStart"/>
+      <w:r>
+        <w:t>take</w:t>
+      </w:r>
+      <w:proofErr w:type="gramEnd"/>
+      <w:r>
+        <w:t xml:space="preserve"> time </w:t>
       </w:r>
       <w:r>
         <w:t xml:space="preserve">by time we mean in millisecond </w:t>
@@ -5354,10 +5864,18 @@
         <w:t xml:space="preserve">and how did we confirm </w:t>
       </w:r>
       <w:r>
-        <w:t>the order there</w:t>
-      </w:r>
-      <w:r>
-        <w:t>(who knows)</w:t>
+        <w:t xml:space="preserve">the order </w:t>
+      </w:r>
+      <w:proofErr w:type="gramStart"/>
+      <w:r>
+        <w:t>there</w:t>
+      </w:r>
+      <w:r>
+        <w:t>(</w:t>
+      </w:r>
+      <w:proofErr w:type="gramEnd"/>
+      <w:r>
+        <w:t>who knows)</w:t>
       </w:r>
       <w:r>
         <w:t>.</w:t>
@@ -5370,6 +5888,7 @@
           <w:bCs/>
         </w:rPr>
       </w:pPr>
+      <w:proofErr w:type="gramStart"/>
       <w:r>
         <w:rPr>
           <w:b/>
@@ -5377,6 +5896,7 @@
         </w:rPr>
         <w:t>Note:-</w:t>
       </w:r>
+      <w:proofErr w:type="gramEnd"/>
     </w:p>
     <w:p>
       <w:pPr>
@@ -5415,8 +5935,13 @@
         <w:t xml:space="preserve"> </w:t>
       </w:r>
       <w:r>
-        <w:t>(who knows )</w:t>
-      </w:r>
+        <w:t xml:space="preserve">(who </w:t>
+      </w:r>
+      <w:proofErr w:type="gramStart"/>
+      <w:r>
+        <w:t>knows )</w:t>
+      </w:r>
+      <w:proofErr w:type="gramEnd"/>
       <w:r>
         <w:t xml:space="preserve"> it will help js to connect to </w:t>
       </w:r>
@@ -5431,8 +5956,13 @@
       <w:r>
         <w:t xml:space="preserve">and we can use its </w:t>
       </w:r>
-      <w:r>
-        <w:t xml:space="preserve">built in functionality </w:t>
+      <w:proofErr w:type="gramStart"/>
+      <w:r>
+        <w:t>built in</w:t>
+      </w:r>
+      <w:proofErr w:type="gramEnd"/>
+      <w:r>
+        <w:t xml:space="preserve"> functionality </w:t>
       </w:r>
       <w:r>
         <w:t xml:space="preserve">you don’t have to read and write and update to the </w:t>
@@ -5452,12 +5982,17 @@
         <w:t xml:space="preserve">the complex we do for it in </w:t>
       </w:r>
       <w:proofErr w:type="spellStart"/>
+      <w:proofErr w:type="gramStart"/>
       <w:r>
         <w:t>mongodb</w:t>
       </w:r>
       <w:proofErr w:type="spellEnd"/>
       <w:r>
-        <w:t>(who knows))</w:t>
+        <w:t>(</w:t>
+      </w:r>
+      <w:proofErr w:type="gramEnd"/>
+      <w:r>
+        <w:t>who knows))</w:t>
       </w:r>
       <w:r>
         <w:t xml:space="preserve">. </w:t>
@@ -5488,13 +6023,34 @@
     <w:p>
       <w:r>
         <w:lastRenderedPageBreak/>
-        <w:t>If we make timestamp property (who knows)true</w:t>
-      </w:r>
-      <w:r>
-        <w:t xml:space="preserve"> it automatically create for us</w:t>
-      </w:r>
-      <w:r>
-        <w:t xml:space="preserve">, How these all things are done </w:t>
+        <w:t xml:space="preserve">If we make timestamp property (who </w:t>
+      </w:r>
+      <w:proofErr w:type="gramStart"/>
+      <w:r>
+        <w:t>knows)true</w:t>
+      </w:r>
+      <w:proofErr w:type="gramEnd"/>
+      <w:r>
+        <w:t xml:space="preserve"> it automatically </w:t>
+      </w:r>
+      <w:proofErr w:type="gramStart"/>
+      <w:r>
+        <w:t>create</w:t>
+      </w:r>
+      <w:proofErr w:type="gramEnd"/>
+      <w:r>
+        <w:t xml:space="preserve"> for us</w:t>
+      </w:r>
+      <w:r>
+        <w:t xml:space="preserve">, </w:t>
+      </w:r>
+      <w:proofErr w:type="gramStart"/>
+      <w:r>
+        <w:t>How</w:t>
+      </w:r>
+      <w:proofErr w:type="gramEnd"/>
+      <w:r>
+        <w:t xml:space="preserve"> these all things are done </w:t>
       </w:r>
       <w:r>
         <w:t>what is the syntax.</w:t>
@@ -5566,10 +6122,18 @@
         <w:t xml:space="preserve"> </w:t>
       </w:r>
       <w:r>
-        <w:t>and we will make some modals</w:t>
-      </w:r>
-      <w:r>
-        <w:t>(maybe not)</w:t>
+        <w:t xml:space="preserve">and we will make some </w:t>
+      </w:r>
+      <w:proofErr w:type="gramStart"/>
+      <w:r>
+        <w:t>modals</w:t>
+      </w:r>
+      <w:r>
+        <w:t>(</w:t>
+      </w:r>
+      <w:proofErr w:type="gramEnd"/>
+      <w:r>
+        <w:t>maybe not)</w:t>
       </w:r>
       <w:r>
         <w:t xml:space="preserve"> </w:t>
@@ -5623,7 +6187,15 @@
         <w:t xml:space="preserve"> compass will be installed</w:t>
       </w:r>
       <w:r>
-        <w:t xml:space="preserve"> which  is a product of </w:t>
+        <w:t xml:space="preserve"> </w:t>
+      </w:r>
+      <w:proofErr w:type="gramStart"/>
+      <w:r>
+        <w:t>which  is</w:t>
+      </w:r>
+      <w:proofErr w:type="gramEnd"/>
+      <w:r>
+        <w:t xml:space="preserve"> a product of </w:t>
       </w:r>
       <w:proofErr w:type="spellStart"/>
       <w:r>
@@ -5853,8 +6425,13 @@
       </w:r>
     </w:p>
     <w:p>
-      <w:r>
-        <w:t xml:space="preserve">So we will make three </w:t>
+      <w:proofErr w:type="gramStart"/>
+      <w:r>
+        <w:t>So</w:t>
+      </w:r>
+      <w:proofErr w:type="gramEnd"/>
+      <w:r>
+        <w:t xml:space="preserve"> we will make three </w:t>
       </w:r>
       <w:proofErr w:type="spellStart"/>
       <w:r>
@@ -5930,14 +6507,27 @@
       </w:r>
     </w:p>
     <w:p>
-      <w:r>
-        <w:t xml:space="preserve">So by the scheme (who knows maybe </w:t>
-      </w:r>
-      <w:r>
-        <w:t xml:space="preserve">by making schema object and passing it to the </w:t>
-      </w:r>
-      <w:r>
-        <w:t>)we created a model</w:t>
+      <w:proofErr w:type="gramStart"/>
+      <w:r>
+        <w:t>So</w:t>
+      </w:r>
+      <w:proofErr w:type="gramEnd"/>
+      <w:r>
+        <w:t xml:space="preserve"> by the scheme (who knows maybe </w:t>
+      </w:r>
+      <w:r>
+        <w:t xml:space="preserve">by making schema object and passing it to </w:t>
+      </w:r>
+      <w:proofErr w:type="gramStart"/>
+      <w:r>
+        <w:t xml:space="preserve">the </w:t>
+      </w:r>
+      <w:r>
+        <w:t>)we</w:t>
+      </w:r>
+      <w:proofErr w:type="gramEnd"/>
+      <w:r>
+        <w:t xml:space="preserve"> created a model</w:t>
       </w:r>
       <w:r>
         <w:t>.</w:t>
@@ -5945,7 +6535,15 @@
     </w:p>
     <w:p>
       <w:r>
-        <w:t>For admin we will create separate UI(who knows</w:t>
+        <w:t xml:space="preserve">For admin we will create separate </w:t>
+      </w:r>
+      <w:proofErr w:type="gramStart"/>
+      <w:r>
+        <w:t>UI(</w:t>
+      </w:r>
+      <w:proofErr w:type="gramEnd"/>
+      <w:r>
+        <w:t>who knows</w:t>
       </w:r>
       <w:r>
         <w:t xml:space="preserve"> how we will manage admin authentication</w:t>
@@ -5955,8 +6553,13 @@
       </w:r>
     </w:p>
     <w:p>
-      <w:r>
-        <w:t xml:space="preserve">So we will create middleware </w:t>
+      <w:proofErr w:type="gramStart"/>
+      <w:r>
+        <w:t>So</w:t>
+      </w:r>
+      <w:proofErr w:type="gramEnd"/>
+      <w:r>
+        <w:t xml:space="preserve"> we will create middleware </w:t>
       </w:r>
       <w:r>
         <w:t xml:space="preserve">to connect to database and from there we will </w:t>
@@ -6028,7 +6631,15 @@
         <w:t xml:space="preserve"> and update our store </w:t>
       </w:r>
       <w:r>
-        <w:t>so we will make it and then decide who get what access(maybe referring to user)</w:t>
+        <w:t xml:space="preserve">so we will make it and then decide who get what </w:t>
+      </w:r>
+      <w:proofErr w:type="gramStart"/>
+      <w:r>
+        <w:t>access(</w:t>
+      </w:r>
+      <w:proofErr w:type="gramEnd"/>
+      <w:r>
+        <w:t>maybe referring to user)</w:t>
       </w:r>
       <w:r>
         <w:t xml:space="preserve">. </w:t>
@@ -6086,7 +6697,15 @@
     </w:p>
     <w:p>
       <w:r>
-        <w:t xml:space="preserve">It may be confusing but it is as  simple as creating </w:t>
+        <w:t xml:space="preserve">It may be confusing but it is </w:t>
+      </w:r>
+      <w:proofErr w:type="gramStart"/>
+      <w:r>
+        <w:t>as  simple</w:t>
+      </w:r>
+      <w:proofErr w:type="gramEnd"/>
+      <w:r>
+        <w:t xml:space="preserve"> as creating </w:t>
       </w:r>
       <w:r>
         <w:t xml:space="preserve">middleware folder </w:t>
@@ -6116,14 +6735,22 @@
         <w:t>make</w:t>
       </w:r>
       <w:r>
-        <w:t xml:space="preserve"> environment variable by making </w:t>
+        <w:t xml:space="preserve"> environment variable by </w:t>
+      </w:r>
+      <w:proofErr w:type="gramStart"/>
+      <w:r>
+        <w:t xml:space="preserve">making </w:t>
       </w:r>
       <w:r>
         <w:t>.</w:t>
       </w:r>
       <w:proofErr w:type="spellStart"/>
       <w:r>
-        <w:t>env.local</w:t>
+        <w:t>env</w:t>
+      </w:r>
+      <w:proofErr w:type="gramEnd"/>
+      <w:r>
+        <w:t>.local</w:t>
       </w:r>
       <w:proofErr w:type="spellEnd"/>
       <w:r>
@@ -6159,6 +6786,7 @@
         <w:t xml:space="preserve">We need a connection string to connect to </w:t>
       </w:r>
       <w:proofErr w:type="spellStart"/>
+      <w:proofErr w:type="gramStart"/>
       <w:r>
         <w:t>mongodb</w:t>
       </w:r>
@@ -6167,7 +6795,11 @@
         <w:t xml:space="preserve"> </w:t>
       </w:r>
       <w:r>
-        <w:t xml:space="preserve"> and we can get for </w:t>
+        <w:t xml:space="preserve"> and</w:t>
+      </w:r>
+      <w:proofErr w:type="gramEnd"/>
+      <w:r>
+        <w:t xml:space="preserve"> we can get for </w:t>
       </w:r>
       <w:proofErr w:type="spellStart"/>
       <w:r>
@@ -6183,16 +6815,32 @@
       </w:r>
       <w:proofErr w:type="spellEnd"/>
       <w:r>
-        <w:t xml:space="preserve"> compass and then click on three dot </w:t>
+        <w:t xml:space="preserve"> compass and then click on three </w:t>
+      </w:r>
+      <w:proofErr w:type="gramStart"/>
+      <w:r>
+        <w:t>dot</w:t>
+      </w:r>
+      <w:proofErr w:type="gramEnd"/>
+      <w:r>
+        <w:t xml:space="preserve"> </w:t>
       </w:r>
       <w:r>
         <w:t>as</w:t>
       </w:r>
       <w:r>
-        <w:t xml:space="preserve"> marked below</w:t>
-      </w:r>
-      <w:r>
-        <w:t xml:space="preserve">(not </w:t>
+        <w:t xml:space="preserve"> marked </w:t>
+      </w:r>
+      <w:proofErr w:type="gramStart"/>
+      <w:r>
+        <w:t>below</w:t>
+      </w:r>
+      <w:r>
+        <w:t>(</w:t>
+      </w:r>
+      <w:proofErr w:type="gramEnd"/>
+      <w:r>
+        <w:t xml:space="preserve">not </w:t>
       </w:r>
       <w:proofErr w:type="spellStart"/>
       <w:r>
@@ -6262,11 +6910,19 @@
         <w:t xml:space="preserve"> to get </w:t>
       </w:r>
       <w:r>
-        <w:t>the connection string and we will store it inside .</w:t>
-      </w:r>
-      <w:proofErr w:type="spellStart"/>
-      <w:r>
-        <w:t>env.local</w:t>
+        <w:t xml:space="preserve">the connection string and we will store it </w:t>
+      </w:r>
+      <w:proofErr w:type="gramStart"/>
+      <w:r>
+        <w:t>inside .</w:t>
+      </w:r>
+      <w:proofErr w:type="spellStart"/>
+      <w:r>
+        <w:t>env</w:t>
+      </w:r>
+      <w:proofErr w:type="gramEnd"/>
+      <w:r>
+        <w:t>.local</w:t>
       </w:r>
       <w:proofErr w:type="spellEnd"/>
       <w:r>
@@ -6280,6 +6936,7 @@
           <w:bCs/>
         </w:rPr>
       </w:pPr>
+      <w:proofErr w:type="gramStart"/>
       <w:r>
         <w:rPr>
           <w:b/>
@@ -6287,6 +6944,7 @@
         </w:rPr>
         <w:t>Note:-</w:t>
       </w:r>
+      <w:proofErr w:type="gramEnd"/>
     </w:p>
     <w:p>
       <w:pPr>
@@ -6371,6 +7029,7 @@
           <w:bCs/>
         </w:rPr>
       </w:pPr>
+      <w:proofErr w:type="gramStart"/>
       <w:r>
         <w:rPr>
           <w:b/>
@@ -6379,6 +7038,7 @@
         <w:lastRenderedPageBreak/>
         <w:t>Note:-</w:t>
       </w:r>
+      <w:proofErr w:type="gramEnd"/>
     </w:p>
     <w:p>
       <w:r>
@@ -6391,6 +7051,7 @@
         <w:t xml:space="preserve">when there is not data in </w:t>
       </w:r>
       <w:proofErr w:type="spellStart"/>
+      <w:proofErr w:type="gramStart"/>
       <w:r>
         <w:t>mon</w:t>
       </w:r>
@@ -6402,7 +7063,11 @@
         <w:t xml:space="preserve"> </w:t>
       </w:r>
       <w:r>
-        <w:t xml:space="preserve"> and we use find </w:t>
+        <w:t xml:space="preserve"> and</w:t>
+      </w:r>
+      <w:proofErr w:type="gramEnd"/>
+      <w:r>
+        <w:t xml:space="preserve"> we use find </w:t>
       </w:r>
       <w:proofErr w:type="spellStart"/>
       <w:r>
@@ -6413,13 +7078,29 @@
         <w:t xml:space="preserve"> any operation on modal </w:t>
       </w:r>
       <w:r>
-        <w:t xml:space="preserve">or maybe importing modal then it try to form </w:t>
-      </w:r>
-      <w:r>
-        <w:t>data again on database</w:t>
-      </w:r>
-      <w:r>
-        <w:t>(who knows)</w:t>
+        <w:t xml:space="preserve">or maybe importing modal then it </w:t>
+      </w:r>
+      <w:proofErr w:type="gramStart"/>
+      <w:r>
+        <w:t>try</w:t>
+      </w:r>
+      <w:proofErr w:type="gramEnd"/>
+      <w:r>
+        <w:t xml:space="preserve"> to form </w:t>
+      </w:r>
+      <w:r>
+        <w:t xml:space="preserve">data again on </w:t>
+      </w:r>
+      <w:proofErr w:type="gramStart"/>
+      <w:r>
+        <w:t>database</w:t>
+      </w:r>
+      <w:r>
+        <w:t>(</w:t>
+      </w:r>
+      <w:proofErr w:type="gramEnd"/>
+      <w:r>
+        <w:t>who knows)</w:t>
       </w:r>
       <w:r>
         <w:t>.</w:t>
@@ -6428,10 +7109,12 @@
         <w:t xml:space="preserve"> to fix that in model file write </w:t>
       </w:r>
       <w:proofErr w:type="spellStart"/>
+      <w:proofErr w:type="gramStart"/>
       <w:r>
         <w:t>mongoose.models</w:t>
       </w:r>
       <w:proofErr w:type="spellEnd"/>
+      <w:proofErr w:type="gramEnd"/>
       <w:r>
         <w:t xml:space="preserve"> = {}</w:t>
       </w:r>
@@ -6739,8 +7422,13 @@
       <w:proofErr w:type="spellEnd"/>
     </w:p>
     <w:p>
-      <w:r>
-        <w:t>So we used:</w:t>
+      <w:proofErr w:type="gramStart"/>
+      <w:r>
+        <w:t>So</w:t>
+      </w:r>
+      <w:proofErr w:type="gramEnd"/>
+      <w:r>
+        <w:t xml:space="preserve"> we used:</w:t>
       </w:r>
     </w:p>
     <w:p>
@@ -7016,10 +7704,39 @@
         <w:t xml:space="preserve">and strictly update everything </w:t>
       </w:r>
       <w:r>
-        <w:t xml:space="preserve">and If any person click on the color he don’t want and click on add to cart then he might buy wrong color product. </w:t>
-      </w:r>
-      <w:r>
-        <w:t>So he should know he is in new page</w:t>
+        <w:t xml:space="preserve">and </w:t>
+      </w:r>
+      <w:proofErr w:type="gramStart"/>
+      <w:r>
+        <w:t>If</w:t>
+      </w:r>
+      <w:proofErr w:type="gramEnd"/>
+      <w:r>
+        <w:t xml:space="preserve"> any person </w:t>
+      </w:r>
+      <w:proofErr w:type="gramStart"/>
+      <w:r>
+        <w:t>click</w:t>
+      </w:r>
+      <w:proofErr w:type="gramEnd"/>
+      <w:r>
+        <w:t xml:space="preserve"> on the color he </w:t>
+      </w:r>
+      <w:proofErr w:type="gramStart"/>
+      <w:r>
+        <w:t>don’t</w:t>
+      </w:r>
+      <w:proofErr w:type="gramEnd"/>
+      <w:r>
+        <w:t xml:space="preserve"> want and click on add to cart then he might buy wrong color product. </w:t>
+      </w:r>
+      <w:proofErr w:type="gramStart"/>
+      <w:r>
+        <w:t>So</w:t>
+      </w:r>
+      <w:proofErr w:type="gramEnd"/>
+      <w:r>
+        <w:t xml:space="preserve"> he should know he is in new page</w:t>
       </w:r>
       <w:r>
         <w:t xml:space="preserve">. </w:t>
@@ -7042,7 +7759,15 @@
         <w:t xml:space="preserve"> can help that is called preserve log it may be found in every browser </w:t>
       </w:r>
       <w:r>
-        <w:t>it preserve the log that was before reload So to do it go to marked below</w:t>
+        <w:t xml:space="preserve">it </w:t>
+      </w:r>
+      <w:proofErr w:type="gramStart"/>
+      <w:r>
+        <w:t>preserve</w:t>
+      </w:r>
+      <w:proofErr w:type="gramEnd"/>
+      <w:r>
+        <w:t xml:space="preserve"> the log that was before reload So to do it go to marked below</w:t>
       </w:r>
       <w:r>
         <w:t xml:space="preserve"> in console</w:t>
@@ -7380,6 +8105,7 @@
           <w:bCs/>
         </w:rPr>
       </w:pPr>
+      <w:proofErr w:type="gramStart"/>
       <w:r>
         <w:rPr>
           <w:b/>
@@ -7394,6 +8120,7 @@
         </w:rPr>
         <w:t>:-</w:t>
       </w:r>
+      <w:proofErr w:type="gramEnd"/>
     </w:p>
     <w:p>
       <w:pPr>
@@ -7405,10 +8132,18 @@
         <w:t>We think that inside react element</w:t>
       </w:r>
       <w:r>
-        <w:t>s that space is also counted as an element.</w:t>
-      </w:r>
-      <w:r>
-        <w:t>(maybe) for example you take &lt;p&gt;</w:t>
+        <w:t xml:space="preserve">s that space is also counted as an </w:t>
+      </w:r>
+      <w:proofErr w:type="gramStart"/>
+      <w:r>
+        <w:t>element.</w:t>
+      </w:r>
+      <w:r>
+        <w:t>(</w:t>
+      </w:r>
+      <w:proofErr w:type="gramEnd"/>
+      <w:r>
+        <w:t>maybe) for example you take &lt;p&gt;</w:t>
       </w:r>
       <w:r>
         <w:rPr>
@@ -7429,7 +8164,11 @@
         <w:t xml:space="preserve"> </w:t>
       </w:r>
       <w:r>
-        <w:t xml:space="preserve"> be treated as an element</w:t>
+        <w:t xml:space="preserve"> be treated as an </w:t>
+      </w:r>
+      <w:proofErr w:type="gramStart"/>
+      <w:r>
+        <w:t>element</w:t>
       </w:r>
       <w:r>
         <w:t>.</w:t>
@@ -7437,6 +8176,7 @@
       <w:r>
         <w:t>(</w:t>
       </w:r>
+      <w:proofErr w:type="gramEnd"/>
       <w:r>
         <w:t>who knows</w:t>
       </w:r>
@@ -7772,13 +8512,26 @@
     </w:p>
     <w:p>
       <w:r>
-        <w:t>Many times</w:t>
-      </w:r>
-      <w:r>
-        <w:t xml:space="preserve"> in ecommerce </w:t>
-      </w:r>
-      <w:r>
-        <w:t xml:space="preserve"> we need to give alert to the </w:t>
+        <w:t xml:space="preserve">Many </w:t>
+      </w:r>
+      <w:proofErr w:type="gramStart"/>
+      <w:r>
+        <w:t>times</w:t>
+      </w:r>
+      <w:proofErr w:type="gramEnd"/>
+      <w:r>
+        <w:t xml:space="preserve"> in </w:t>
+      </w:r>
+      <w:proofErr w:type="gramStart"/>
+      <w:r>
+        <w:t xml:space="preserve">ecommerce </w:t>
+      </w:r>
+      <w:r>
+        <w:t xml:space="preserve"> we</w:t>
+      </w:r>
+      <w:proofErr w:type="gramEnd"/>
+      <w:r>
+        <w:t xml:space="preserve"> need to give alert to the </w:t>
       </w:r>
       <w:r>
         <w:t>user</w:t>
@@ -7853,8 +8606,13 @@
       <w:r>
         <w:t xml:space="preserve"> </w:t>
       </w:r>
-      <w:r>
-        <w:t xml:space="preserve">.We need to tell them </w:t>
+      <w:proofErr w:type="gramStart"/>
+      <w:r>
+        <w:t>.We</w:t>
+      </w:r>
+      <w:proofErr w:type="gramEnd"/>
+      <w:r>
+        <w:t xml:space="preserve"> need to tell them </w:t>
       </w:r>
       <w:r>
         <w:t xml:space="preserve">that </w:t>
@@ -8317,7 +9075,7 @@
           <w:noProof/>
         </w:rPr>
         <w:drawing>
-          <wp:inline distT="0" distB="0" distL="0" distR="0" wp14:anchorId="6B6DF7C8" wp14:editId="59B799C6">
+          <wp:inline distT="0" distB="0" distL="0" distR="0" wp14:anchorId="6B6DF7C8" wp14:editId="07CF2CD4">
             <wp:extent cx="5731510" cy="2579370"/>
             <wp:effectExtent l="0" t="0" r="2540" b="0"/>
             <wp:docPr id="1981589093" name="Picture 4"/>
@@ -8545,10 +9303,18 @@
         <w:t xml:space="preserve"> </w:t>
       </w:r>
       <w:r>
-        <w:t xml:space="preserve">which tells how our toast will be shown </w:t>
-      </w:r>
-      <w:r>
-        <w:t xml:space="preserve">, </w:t>
+        <w:t xml:space="preserve">which tells how our toast will be </w:t>
+      </w:r>
+      <w:proofErr w:type="gramStart"/>
+      <w:r>
+        <w:t xml:space="preserve">shown </w:t>
+      </w:r>
+      <w:r>
+        <w:t>,</w:t>
+      </w:r>
+      <w:proofErr w:type="gramEnd"/>
+      <w:r>
+        <w:t xml:space="preserve"> </w:t>
       </w:r>
       <w:proofErr w:type="spellStart"/>
       <w:r>
@@ -8573,10 +9339,18 @@
       </w:r>
       <w:proofErr w:type="spellEnd"/>
       <w:r>
-        <w:t xml:space="preserve"> that invoke that component </w:t>
-      </w:r>
-      <w:r>
-        <w:t xml:space="preserve"> You can see </w:t>
+        <w:t xml:space="preserve"> that invoke that </w:t>
+      </w:r>
+      <w:proofErr w:type="gramStart"/>
+      <w:r>
+        <w:t xml:space="preserve">component </w:t>
+      </w:r>
+      <w:r>
+        <w:t xml:space="preserve"> You</w:t>
+      </w:r>
+      <w:proofErr w:type="gramEnd"/>
+      <w:r>
+        <w:t xml:space="preserve"> can see </w:t>
       </w:r>
       <w:proofErr w:type="spellStart"/>
       <w:r>
@@ -8584,13 +9358,29 @@
       </w:r>
       <w:proofErr w:type="spellEnd"/>
       <w:r>
-        <w:t xml:space="preserve"> options of types and position is given . Choose your option and </w:t>
+        <w:t xml:space="preserve"> options of types and position is </w:t>
+      </w:r>
+      <w:proofErr w:type="gramStart"/>
+      <w:r>
+        <w:t>given .</w:t>
+      </w:r>
+      <w:proofErr w:type="gramEnd"/>
+      <w:r>
+        <w:t xml:space="preserve"> Choose your option and </w:t>
       </w:r>
       <w:r>
         <w:t xml:space="preserve">then your code will reflect that. </w:t>
       </w:r>
       <w:r>
-        <w:t xml:space="preserve">To see the demo we click on Show toast </w:t>
+        <w:t xml:space="preserve">To see the </w:t>
+      </w:r>
+      <w:proofErr w:type="gramStart"/>
+      <w:r>
+        <w:t>demo</w:t>
+      </w:r>
+      <w:proofErr w:type="gramEnd"/>
+      <w:r>
+        <w:t xml:space="preserve"> we click on Show toast </w:t>
       </w:r>
     </w:p>
     <w:p>
@@ -8644,14 +9434,27 @@
       </w:r>
     </w:p>
     <w:p>
-      <w:r>
-        <w:t>So we now copy and paste the code here to apply them.</w:t>
+      <w:proofErr w:type="gramStart"/>
+      <w:r>
+        <w:t>So</w:t>
+      </w:r>
+      <w:proofErr w:type="gramEnd"/>
+      <w:r>
+        <w:t xml:space="preserve"> we now copy and paste the code here to apply them.</w:t>
       </w:r>
       <w:r>
         <w:t xml:space="preserve"> </w:t>
       </w:r>
       <w:r>
-        <w:t xml:space="preserve">There are other methods inside our toast that is success and error and many more to show different situation in the toast.(who knows) </w:t>
+        <w:t xml:space="preserve">There are other methods inside our toast that is success and error and many more to show different situation in the </w:t>
+      </w:r>
+      <w:proofErr w:type="gramStart"/>
+      <w:r>
+        <w:t>toast.(</w:t>
+      </w:r>
+      <w:proofErr w:type="gramEnd"/>
+      <w:r>
+        <w:t xml:space="preserve">who knows) </w:t>
       </w:r>
     </w:p>
     <w:p>
@@ -8661,8 +9464,13 @@
       <w:r>
         <w:t xml:space="preserve">of </w:t>
       </w:r>
-      <w:r>
-        <w:t>toast  in the demo of documentation</w:t>
+      <w:proofErr w:type="gramStart"/>
+      <w:r>
+        <w:t>toast  in</w:t>
+      </w:r>
+      <w:proofErr w:type="gramEnd"/>
+      <w:r>
+        <w:t xml:space="preserve"> the demo of documentation</w:t>
       </w:r>
     </w:p>
     <w:p>
@@ -8791,7 +9599,15 @@
         <w:t>e</w:t>
       </w:r>
       <w:r>
-        <w:t xml:space="preserve">s the model that is Schema Object(who knows) and sometimes we don’t need </w:t>
+        <w:t xml:space="preserve">s the model that is Schema </w:t>
+      </w:r>
+      <w:proofErr w:type="gramStart"/>
+      <w:r>
+        <w:t>Object(</w:t>
+      </w:r>
+      <w:proofErr w:type="gramEnd"/>
+      <w:r>
+        <w:t xml:space="preserve">who knows) and sometimes we don’t need </w:t>
       </w:r>
       <w:r>
         <w:t xml:space="preserve">object just Schema </w:t>
@@ -8800,7 +9616,15 @@
         <w:t xml:space="preserve">class </w:t>
       </w:r>
       <w:r>
-        <w:t>and its static methods(who knows)</w:t>
+        <w:t xml:space="preserve">and its static </w:t>
+      </w:r>
+      <w:proofErr w:type="gramStart"/>
+      <w:r>
+        <w:t>methods(</w:t>
+      </w:r>
+      <w:proofErr w:type="gramEnd"/>
+      <w:r>
+        <w:t>who knows)</w:t>
       </w:r>
       <w:r>
         <w:t>.</w:t>
@@ -9082,7 +9906,23 @@
           <w:b/>
           <w:bCs/>
         </w:rPr>
-        <w:t xml:space="preserve">and when we match our password after we get authenticated we get token for </w:t>
+        <w:t xml:space="preserve">and when we match our password after we get </w:t>
+      </w:r>
+      <w:proofErr w:type="gramStart"/>
+      <w:r>
+        <w:rPr>
+          <w:b/>
+          <w:bCs/>
+        </w:rPr>
+        <w:t>authenticated</w:t>
+      </w:r>
+      <w:proofErr w:type="gramEnd"/>
+      <w:r>
+        <w:rPr>
+          <w:b/>
+          <w:bCs/>
+        </w:rPr>
+        <w:t xml:space="preserve"> we get token for </w:t>
       </w:r>
       <w:r>
         <w:rPr>
@@ -9096,7 +9936,23 @@
           <w:b/>
           <w:bCs/>
         </w:rPr>
-        <w:t xml:space="preserve">It is not easy to hack a database of plain password but if it get </w:t>
+        <w:t xml:space="preserve">It is not easy to hack a database of plain password but if it </w:t>
+      </w:r>
+      <w:proofErr w:type="gramStart"/>
+      <w:r>
+        <w:rPr>
+          <w:b/>
+          <w:bCs/>
+        </w:rPr>
+        <w:t>get</w:t>
+      </w:r>
+      <w:proofErr w:type="gramEnd"/>
+      <w:r>
+        <w:rPr>
+          <w:b/>
+          <w:bCs/>
+        </w:rPr>
+        <w:t xml:space="preserve"> </w:t>
       </w:r>
       <w:r>
         <w:rPr>
@@ -9272,8 +10128,13 @@
         <w:t xml:space="preserve">You can see above we encrypted </w:t>
       </w:r>
       <w:r>
-        <w:t>the password with a secret keys</w:t>
-      </w:r>
+        <w:t xml:space="preserve">the password with a </w:t>
+      </w:r>
+      <w:proofErr w:type="gramStart"/>
+      <w:r>
+        <w:t>secret keys</w:t>
+      </w:r>
+      <w:proofErr w:type="gramEnd"/>
       <w:r>
         <w:t xml:space="preserve"> which is a secret string actually </w:t>
       </w:r>
@@ -9324,6 +10185,7 @@
           <w:bCs/>
         </w:rPr>
       </w:pPr>
+      <w:proofErr w:type="gramStart"/>
       <w:r>
         <w:rPr>
           <w:b/>
@@ -9331,6 +10193,7 @@
         </w:rPr>
         <w:t>Note:-</w:t>
       </w:r>
+      <w:proofErr w:type="gramEnd"/>
     </w:p>
     <w:p>
       <w:pPr>
@@ -9363,7 +10226,15 @@
         <w:t>m</w:t>
       </w:r>
       <w:r>
-        <w:t xml:space="preserve">e secret key we get different </w:t>
+        <w:t xml:space="preserve">e secret </w:t>
+      </w:r>
+      <w:proofErr w:type="gramStart"/>
+      <w:r>
+        <w:t>key</w:t>
+      </w:r>
+      <w:proofErr w:type="gramEnd"/>
+      <w:r>
+        <w:t xml:space="preserve"> we get different </w:t>
       </w:r>
       <w:r>
         <w:t xml:space="preserve">results because of salt </w:t>
@@ -9378,7 +10249,15 @@
         <w:t xml:space="preserve">and its string is decided by the algorithm </w:t>
       </w:r>
       <w:r>
-        <w:t>and while decrypting (how can it be possible) this string(or salt) may be decoded from the string.</w:t>
+        <w:t xml:space="preserve">and while decrypting (how can it be possible) this </w:t>
+      </w:r>
+      <w:proofErr w:type="gramStart"/>
+      <w:r>
+        <w:t>string(</w:t>
+      </w:r>
+      <w:proofErr w:type="gramEnd"/>
+      <w:r>
+        <w:t>or salt) may be decoded from the string.</w:t>
       </w:r>
       <w:r>
         <w:t xml:space="preserve"> Evert algorithm has its own working</w:t>
@@ -9386,7 +10265,15 @@
     </w:p>
     <w:p>
       <w:r>
-        <w:t xml:space="preserve">IN the working of AES we don’t need to match encrypted string </w:t>
+        <w:t xml:space="preserve">IN the working of </w:t>
+      </w:r>
+      <w:proofErr w:type="gramStart"/>
+      <w:r>
+        <w:t>AES</w:t>
+      </w:r>
+      <w:proofErr w:type="gramEnd"/>
+      <w:r>
+        <w:t xml:space="preserve"> we don’t need to match encrypted string </w:t>
       </w:r>
       <w:r>
         <w:t xml:space="preserve">we need to match decrypted string. </w:t>
@@ -9456,7 +10343,15 @@
         <w:t xml:space="preserve">rom it </w:t>
       </w:r>
       <w:r>
-        <w:t xml:space="preserve">and it s tampering does not become possible what we do for it </w:t>
+        <w:t xml:space="preserve">and </w:t>
+      </w:r>
+      <w:proofErr w:type="gramStart"/>
+      <w:r>
+        <w:t>it</w:t>
+      </w:r>
+      <w:proofErr w:type="gramEnd"/>
+      <w:r>
+        <w:t xml:space="preserve"> s tampering does not become possible what we do for it </w:t>
       </w:r>
     </w:p>
     <w:p>
@@ -9464,6 +10359,9 @@
         <w:jc w:val="center"/>
       </w:pPr>
       <w:r>
+        <w:rPr>
+          <w:noProof/>
+        </w:rPr>
         <w:drawing>
           <wp:inline distT="0" distB="0" distL="0" distR="0" wp14:anchorId="0D17D480" wp14:editId="70A42FA5">
             <wp:extent cx="5731510" cy="3161665"/>
@@ -9522,6 +10420,9 @@
         <w:jc w:val="center"/>
       </w:pPr>
       <w:r>
+        <w:rPr>
+          <w:noProof/>
+        </w:rPr>
         <w:lastRenderedPageBreak/>
         <w:drawing>
           <wp:inline distT="0" distB="0" distL="0" distR="0" wp14:anchorId="0189C75D" wp14:editId="447BD2B1">
@@ -9564,8 +10465,13 @@
       <w:r>
         <w:t xml:space="preserve">We are talking about token on the left </w:t>
       </w:r>
-      <w:r>
-        <w:t xml:space="preserve">The </w:t>
+      <w:proofErr w:type="gramStart"/>
+      <w:r>
+        <w:t>The</w:t>
+      </w:r>
+      <w:proofErr w:type="gramEnd"/>
+      <w:r>
+        <w:t xml:space="preserve"> </w:t>
       </w:r>
       <w:r>
         <w:t xml:space="preserve">traditional approach of login </w:t>
@@ -9624,6 +10530,9 @@
         <w:jc w:val="center"/>
       </w:pPr>
       <w:r>
+        <w:rPr>
+          <w:noProof/>
+        </w:rPr>
         <w:drawing>
           <wp:inline distT="0" distB="0" distL="0" distR="0" wp14:anchorId="320027C7" wp14:editId="7CF231AB">
             <wp:extent cx="2752725" cy="2581623"/>
@@ -9671,20 +10580,32 @@
       </w:r>
       <w:proofErr w:type="spellEnd"/>
       <w:r>
-        <w:t xml:space="preserve"> is that it is divided into three parts first i</w:t>
-      </w:r>
-      <w:r>
-        <w:t>s</w:t>
-      </w:r>
-      <w:r>
-        <w:t xml:space="preserve"> header </w:t>
-      </w:r>
-      <w:r>
-        <w:t>, second part is Payload data</w:t>
-      </w:r>
-      <w:r>
-        <w:t>(which is our data )</w:t>
-      </w:r>
+        <w:t xml:space="preserve"> is that it is divided into three parts first is </w:t>
+      </w:r>
+      <w:proofErr w:type="gramStart"/>
+      <w:r>
+        <w:t>header ,</w:t>
+      </w:r>
+      <w:proofErr w:type="gramEnd"/>
+      <w:r>
+        <w:t xml:space="preserve"> second part is Payload </w:t>
+      </w:r>
+      <w:proofErr w:type="gramStart"/>
+      <w:r>
+        <w:t>data</w:t>
+      </w:r>
+      <w:r>
+        <w:t>(</w:t>
+      </w:r>
+      <w:proofErr w:type="gramEnd"/>
+      <w:r>
+        <w:t xml:space="preserve">which is our </w:t>
+      </w:r>
+      <w:proofErr w:type="gramStart"/>
+      <w:r>
+        <w:t>data )</w:t>
+      </w:r>
+      <w:proofErr w:type="gramEnd"/>
       <w:r>
         <w:t xml:space="preserve"> and another is signature</w:t>
       </w:r>
@@ -9722,13 +10643,21 @@
         <w:t>g</w:t>
       </w:r>
       <w:r>
-        <w:t>orithm is used (maybe for encryption)</w:t>
+        <w:t xml:space="preserve">orithm is used (maybe for </w:t>
+      </w:r>
+      <w:proofErr w:type="gramStart"/>
+      <w:r>
+        <w:t>encryption)</w:t>
       </w:r>
       <w:r>
         <w:t xml:space="preserve"> </w:t>
       </w:r>
       <w:r>
-        <w:t xml:space="preserve"> and then next part is data </w:t>
+        <w:t xml:space="preserve"> and</w:t>
+      </w:r>
+      <w:proofErr w:type="gramEnd"/>
+      <w:r>
+        <w:t xml:space="preserve"> then next part is data </w:t>
       </w:r>
       <w:r>
         <w:lastRenderedPageBreak/>
@@ -9813,7 +10742,15 @@
         <w:t xml:space="preserve"> </w:t>
       </w:r>
       <w:r>
-        <w:t xml:space="preserve">By using this secret we can </w:t>
+        <w:t xml:space="preserve">By using this </w:t>
+      </w:r>
+      <w:proofErr w:type="gramStart"/>
+      <w:r>
+        <w:t>secret</w:t>
+      </w:r>
+      <w:proofErr w:type="gramEnd"/>
+      <w:r>
+        <w:t xml:space="preserve"> we can </w:t>
       </w:r>
       <w:r>
         <w:t xml:space="preserve">know is this </w:t>
@@ -9856,8 +10793,13 @@
       </w:r>
     </w:p>
     <w:p>
-      <w:r>
-        <w:t xml:space="preserve">So we add it </w:t>
+      <w:proofErr w:type="gramStart"/>
+      <w:r>
+        <w:t>So</w:t>
+      </w:r>
+      <w:proofErr w:type="gramEnd"/>
+      <w:r>
+        <w:t xml:space="preserve"> we add it </w:t>
       </w:r>
       <w:proofErr w:type="spellStart"/>
       <w:r>
@@ -9872,8 +10814,13 @@
       </w:r>
     </w:p>
     <w:p>
-      <w:r>
-        <w:t xml:space="preserve">So what we did we import </w:t>
+      <w:proofErr w:type="gramStart"/>
+      <w:r>
+        <w:t>So</w:t>
+      </w:r>
+      <w:proofErr w:type="gramEnd"/>
+      <w:r>
+        <w:t xml:space="preserve"> what we did we import </w:t>
       </w:r>
       <w:proofErr w:type="spellStart"/>
       <w:r>
@@ -9886,6 +10833,9 @@
         <w:jc w:val="center"/>
       </w:pPr>
       <w:r>
+        <w:rPr>
+          <w:noProof/>
+        </w:rPr>
         <w:drawing>
           <wp:inline distT="0" distB="0" distL="0" distR="0" wp14:anchorId="554B6B32" wp14:editId="495C3E92">
             <wp:extent cx="2629267" cy="190527"/>
@@ -9936,6 +10886,9 @@
         <w:jc w:val="center"/>
       </w:pPr>
       <w:r>
+        <w:rPr>
+          <w:noProof/>
+        </w:rPr>
         <w:drawing>
           <wp:inline distT="0" distB="0" distL="0" distR="0" wp14:anchorId="3EE2A3F2" wp14:editId="17B85A60">
             <wp:extent cx="2924583" cy="1514686"/>
@@ -9991,6 +10944,9 @@
         <w:jc w:val="center"/>
       </w:pPr>
       <w:r>
+        <w:rPr>
+          <w:noProof/>
+        </w:rPr>
         <w:drawing>
           <wp:inline distT="0" distB="0" distL="0" distR="0" wp14:anchorId="0621F136" wp14:editId="35FDB5AC">
             <wp:extent cx="5731510" cy="2714625"/>
@@ -10036,7 +10992,15 @@
         <w:t>that is Iat it tells when this token was issued.</w:t>
       </w:r>
       <w:r>
-        <w:t xml:space="preserve">  So you can see above that this</w:t>
+        <w:t xml:space="preserve">  </w:t>
+      </w:r>
+      <w:proofErr w:type="gramStart"/>
+      <w:r>
+        <w:t>So</w:t>
+      </w:r>
+      <w:proofErr w:type="gramEnd"/>
+      <w:r>
+        <w:t xml:space="preserve"> you can see above that this</w:t>
       </w:r>
       <w:r>
         <w:t xml:space="preserve"> </w:t>
@@ -10086,13 +11050,21 @@
         <w:t xml:space="preserve"> that tells when that </w:t>
       </w:r>
       <w:r>
-        <w:t>token will be expired</w:t>
+        <w:t xml:space="preserve">token will be </w:t>
+      </w:r>
+      <w:proofErr w:type="gramStart"/>
+      <w:r>
+        <w:t>expired</w:t>
       </w:r>
       <w:r>
         <w:t>(</w:t>
       </w:r>
       <w:r>
-        <w:t xml:space="preserve"> who knows</w:t>
+        <w:t xml:space="preserve"> who</w:t>
+      </w:r>
+      <w:proofErr w:type="gramEnd"/>
+      <w:r>
+        <w:t xml:space="preserve"> knows</w:t>
       </w:r>
       <w:r>
         <w:t>)</w:t>
@@ -10106,6 +11078,9 @@
         <w:jc w:val="center"/>
       </w:pPr>
       <w:r>
+        <w:rPr>
+          <w:noProof/>
+        </w:rPr>
         <w:lastRenderedPageBreak/>
         <w:drawing>
           <wp:inline distT="0" distB="0" distL="0" distR="0" wp14:anchorId="0759759D" wp14:editId="0E01C70E">
@@ -10146,7 +11121,15 @@
     </w:p>
     <w:p>
       <w:r>
-        <w:t>So now our code look like above.</w:t>
+        <w:t xml:space="preserve">So now our code </w:t>
+      </w:r>
+      <w:proofErr w:type="gramStart"/>
+      <w:r>
+        <w:t>look</w:t>
+      </w:r>
+      <w:proofErr w:type="gramEnd"/>
+      <w:r>
+        <w:t xml:space="preserve"> like above.</w:t>
       </w:r>
     </w:p>
     <w:p>
@@ -10166,19 +11149,14 @@
         <w:t xml:space="preserve">one day </w:t>
       </w:r>
       <w:r>
-        <w:t xml:space="preserve">by using “1d” as a value of </w:t>
-      </w:r>
-      <w:proofErr w:type="spellStart"/>
-      <w:r>
-        <w:t>expires</w:t>
-      </w:r>
-      <w:r>
-        <w:t>In</w:t>
-      </w:r>
-      <w:proofErr w:type="spellEnd"/>
+        <w:t>by using “1d” as a value of expires</w:t>
+      </w:r>
       <w:r>
         <w:t xml:space="preserve"> </w:t>
       </w:r>
+      <w:r>
+        <w:t xml:space="preserve">In </w:t>
+      </w:r>
     </w:p>
     <w:p>
       <w:r>
@@ -10191,9 +11169,1540 @@
         <w:t xml:space="preserve"> it so that </w:t>
       </w:r>
       <w:r>
-        <w:t xml:space="preserve">it get logout after some time. </w:t>
-      </w:r>
-    </w:p>
+        <w:t xml:space="preserve">it </w:t>
+      </w:r>
+      <w:proofErr w:type="gramStart"/>
+      <w:r>
+        <w:t>get</w:t>
+      </w:r>
+      <w:proofErr w:type="gramEnd"/>
+      <w:r>
+        <w:t xml:space="preserve"> logout after some time. </w:t>
+      </w:r>
+    </w:p>
+    <w:p>
+      <w:r>
+        <w:t xml:space="preserve">There was a predefined </w:t>
+      </w:r>
+      <w:r>
+        <w:t xml:space="preserve">file called _document.js which was used </w:t>
+      </w:r>
+      <w:r>
+        <w:t xml:space="preserve">as a wrapper to the application </w:t>
+      </w:r>
+      <w:r>
+        <w:t>that is basically B</w:t>
+      </w:r>
+      <w:r>
+        <w:t>o</w:t>
+      </w:r>
+      <w:r>
+        <w:t xml:space="preserve">ilerplate surrounding the </w:t>
+      </w:r>
+      <w:r>
+        <w:t>app</w:t>
+      </w:r>
+      <w:r>
+        <w:t xml:space="preserve"> </w:t>
+      </w:r>
+      <w:proofErr w:type="gramStart"/>
+      <w:r>
+        <w:t>content</w:t>
+      </w:r>
+      <w:r>
+        <w:t>(</w:t>
+      </w:r>
+      <w:proofErr w:type="gramEnd"/>
+      <w:r>
+        <w:t>or pages)</w:t>
+      </w:r>
+      <w:r>
+        <w:t xml:space="preserve"> and Boiler plate often contains </w:t>
+      </w:r>
+      <w:proofErr w:type="gramStart"/>
+      <w:r>
+        <w:t>H</w:t>
+      </w:r>
+      <w:r>
+        <w:t>t</w:t>
+      </w:r>
+      <w:r>
+        <w:t>ml ,Head</w:t>
+      </w:r>
+      <w:proofErr w:type="gramEnd"/>
+      <w:r>
+        <w:t xml:space="preserve"> and Body </w:t>
+      </w:r>
+      <w:r>
+        <w:t xml:space="preserve">It </w:t>
+      </w:r>
+      <w:r>
+        <w:t xml:space="preserve">was </w:t>
+      </w:r>
+      <w:r>
+        <w:t xml:space="preserve">used to work like a </w:t>
+      </w:r>
+      <w:r>
+        <w:t xml:space="preserve">HTML </w:t>
+      </w:r>
+      <w:r>
+        <w:t xml:space="preserve">wrapper around </w:t>
+      </w:r>
+      <w:r>
+        <w:t>the page</w:t>
+      </w:r>
+      <w:r>
+        <w:t xml:space="preserve"> </w:t>
+      </w:r>
+      <w:r>
+        <w:t>It was like below</w:t>
+      </w:r>
+    </w:p>
+    <w:p>
+      <w:pPr>
+        <w:jc w:val="center"/>
+      </w:pPr>
+      <w:r>
+        <w:rPr>
+          <w:noProof/>
+        </w:rPr>
+        <w:drawing>
+          <wp:inline distT="0" distB="0" distL="0" distR="0" wp14:anchorId="2997BF11" wp14:editId="3D89C26C">
+            <wp:extent cx="5287113" cy="2648320"/>
+            <wp:effectExtent l="0" t="0" r="0" b="0"/>
+            <wp:docPr id="240064779" name="Picture 1"/>
+            <wp:cNvGraphicFramePr>
+              <a:graphicFrameLocks xmlns:a="http://schemas.openxmlformats.org/drawingml/2006/main" noChangeAspect="1"/>
+            </wp:cNvGraphicFramePr>
+            <a:graphic xmlns:a="http://schemas.openxmlformats.org/drawingml/2006/main">
+              <a:graphicData uri="http://schemas.openxmlformats.org/drawingml/2006/picture">
+                <pic:pic xmlns:pic="http://schemas.openxmlformats.org/drawingml/2006/picture">
+                  <pic:nvPicPr>
+                    <pic:cNvPr id="240064779" name=""/>
+                    <pic:cNvPicPr/>
+                  </pic:nvPicPr>
+                  <pic:blipFill>
+                    <a:blip r:embed="rId60"/>
+                    <a:stretch>
+                      <a:fillRect/>
+                    </a:stretch>
+                  </pic:blipFill>
+                  <pic:spPr>
+                    <a:xfrm>
+                      <a:off x="0" y="0"/>
+                      <a:ext cx="5287113" cy="2648320"/>
+                    </a:xfrm>
+                    <a:prstGeom prst="rect">
+                      <a:avLst/>
+                    </a:prstGeom>
+                  </pic:spPr>
+                </pic:pic>
+              </a:graphicData>
+            </a:graphic>
+          </wp:inline>
+        </w:drawing>
+      </w:r>
+    </w:p>
+    <w:p>
+      <w:pPr>
+        <w:jc w:val="center"/>
+      </w:pPr>
+      <w:r>
+        <w:rPr>
+          <w:noProof/>
+        </w:rPr>
+        <w:lastRenderedPageBreak/>
+        <w:drawing>
+          <wp:inline distT="0" distB="0" distL="0" distR="0" wp14:anchorId="1E65A1F1" wp14:editId="3C026302">
+            <wp:extent cx="5630061" cy="3038899"/>
+            <wp:effectExtent l="0" t="0" r="8890" b="9525"/>
+            <wp:docPr id="389942934" name="Picture 1"/>
+            <wp:cNvGraphicFramePr>
+              <a:graphicFrameLocks xmlns:a="http://schemas.openxmlformats.org/drawingml/2006/main" noChangeAspect="1"/>
+            </wp:cNvGraphicFramePr>
+            <a:graphic xmlns:a="http://schemas.openxmlformats.org/drawingml/2006/main">
+              <a:graphicData uri="http://schemas.openxmlformats.org/drawingml/2006/picture">
+                <pic:pic xmlns:pic="http://schemas.openxmlformats.org/drawingml/2006/picture">
+                  <pic:nvPicPr>
+                    <pic:cNvPr id="389942934" name=""/>
+                    <pic:cNvPicPr/>
+                  </pic:nvPicPr>
+                  <pic:blipFill>
+                    <a:blip r:embed="rId61"/>
+                    <a:stretch>
+                      <a:fillRect/>
+                    </a:stretch>
+                  </pic:blipFill>
+                  <pic:spPr>
+                    <a:xfrm>
+                      <a:off x="0" y="0"/>
+                      <a:ext cx="5630061" cy="3038899"/>
+                    </a:xfrm>
+                    <a:prstGeom prst="rect">
+                      <a:avLst/>
+                    </a:prstGeom>
+                  </pic:spPr>
+                </pic:pic>
+              </a:graphicData>
+            </a:graphic>
+          </wp:inline>
+        </w:drawing>
+      </w:r>
+    </w:p>
+    <w:p>
+      <w:r>
+        <w:t xml:space="preserve">But now it is not used instead our </w:t>
+      </w:r>
+      <w:proofErr w:type="spellStart"/>
+      <w:r>
+        <w:t>layout.tsx</w:t>
+      </w:r>
+      <w:proofErr w:type="spellEnd"/>
+      <w:r>
+        <w:t xml:space="preserve"> is used. </w:t>
+      </w:r>
+      <w:r>
+        <w:t>With _d</w:t>
+      </w:r>
+      <w:r>
+        <w:t>o</w:t>
+      </w:r>
+      <w:r>
+        <w:t>cument.j</w:t>
+      </w:r>
+      <w:r>
+        <w:t>s</w:t>
+      </w:r>
+      <w:r>
+        <w:t xml:space="preserve"> we can make a skeleton of custom </w:t>
+      </w:r>
+      <w:r>
+        <w:t xml:space="preserve">document </w:t>
+      </w:r>
+      <w:r>
+        <w:t>(maybe pages (who knows))</w:t>
+      </w:r>
+    </w:p>
+    <w:p>
+      <w:r>
+        <w:t xml:space="preserve">The _documents.js </w:t>
+      </w:r>
+      <w:r>
+        <w:t>was</w:t>
+      </w:r>
+      <w:r>
+        <w:t xml:space="preserve"> used </w:t>
+      </w:r>
+      <w:r>
+        <w:t xml:space="preserve">inside pages router </w:t>
+      </w:r>
+      <w:r>
+        <w:t xml:space="preserve">but </w:t>
+      </w:r>
+      <w:proofErr w:type="spellStart"/>
+      <w:r>
+        <w:t>layout.tsx</w:t>
+      </w:r>
+      <w:proofErr w:type="spellEnd"/>
+      <w:r>
+        <w:t xml:space="preserve"> was inside a</w:t>
+      </w:r>
+      <w:r>
+        <w:t>p</w:t>
+      </w:r>
+      <w:r>
+        <w:t>p</w:t>
+      </w:r>
+      <w:r>
+        <w:t xml:space="preserve"> router</w:t>
+      </w:r>
+      <w:r>
+        <w:t>.</w:t>
+      </w:r>
+      <w:r>
+        <w:t xml:space="preserve"> </w:t>
+      </w:r>
+    </w:p>
+    <w:p>
+      <w:pPr>
+        <w:rPr>
+          <w:b/>
+          <w:bCs/>
+        </w:rPr>
+      </w:pPr>
+      <w:r>
+        <w:rPr>
+          <w:b/>
+          <w:bCs/>
+        </w:rPr>
+        <w:t xml:space="preserve">You can use </w:t>
+      </w:r>
+      <w:proofErr w:type="spellStart"/>
+      <w:proofErr w:type="gramStart"/>
+      <w:r>
+        <w:rPr>
+          <w:b/>
+          <w:bCs/>
+        </w:rPr>
+        <w:t>router.query</w:t>
+      </w:r>
+      <w:proofErr w:type="spellEnd"/>
+      <w:proofErr w:type="gramEnd"/>
+      <w:r>
+        <w:rPr>
+          <w:b/>
+          <w:bCs/>
+        </w:rPr>
+        <w:t xml:space="preserve"> inside the array </w:t>
+      </w:r>
+      <w:r>
+        <w:rPr>
+          <w:b/>
+          <w:bCs/>
+        </w:rPr>
+        <w:t xml:space="preserve">of the useEffect </w:t>
+      </w:r>
+      <w:r>
+        <w:rPr>
+          <w:b/>
+          <w:bCs/>
+        </w:rPr>
+        <w:t xml:space="preserve">that you want to run as it track the </w:t>
+      </w:r>
+      <w:proofErr w:type="gramStart"/>
+      <w:r>
+        <w:rPr>
+          <w:b/>
+          <w:bCs/>
+        </w:rPr>
+        <w:t>url .</w:t>
+      </w:r>
+      <w:proofErr w:type="gramEnd"/>
+      <w:r>
+        <w:rPr>
+          <w:b/>
+          <w:bCs/>
+        </w:rPr>
+        <w:t xml:space="preserve"> </w:t>
+      </w:r>
+      <w:proofErr w:type="gramStart"/>
+      <w:r>
+        <w:rPr>
+          <w:b/>
+          <w:bCs/>
+        </w:rPr>
+        <w:t>so</w:t>
+      </w:r>
+      <w:proofErr w:type="gramEnd"/>
+      <w:r>
+        <w:rPr>
+          <w:b/>
+          <w:bCs/>
+        </w:rPr>
+        <w:t xml:space="preserve"> as url changes our useEffect runs.</w:t>
+      </w:r>
+    </w:p>
+    <w:p>
+      <w:r>
+        <w:t xml:space="preserve">Now in modern </w:t>
+      </w:r>
+      <w:proofErr w:type="spellStart"/>
+      <w:r>
+        <w:t>Nextjs</w:t>
+      </w:r>
+      <w:proofErr w:type="spellEnd"/>
+      <w:r>
+        <w:t xml:space="preserve"> router don’t have a query parameter </w:t>
+      </w:r>
+      <w:r>
+        <w:t xml:space="preserve">you have </w:t>
+      </w:r>
+      <w:proofErr w:type="spellStart"/>
+      <w:r>
+        <w:t>usePathName</w:t>
+      </w:r>
+      <w:proofErr w:type="spellEnd"/>
+      <w:r>
+        <w:t xml:space="preserve"> </w:t>
+      </w:r>
+      <w:r>
+        <w:t>hooks and you can use it to</w:t>
+      </w:r>
+      <w:r>
+        <w:t xml:space="preserve"> </w:t>
+      </w:r>
+      <w:r>
+        <w:t xml:space="preserve">access pathname and can pass it to useEffect </w:t>
+      </w:r>
+      <w:r>
+        <w:t xml:space="preserve">so that it can track </w:t>
+      </w:r>
+    </w:p>
+    <w:p>
+      <w:r>
+        <w:t xml:space="preserve">The issue is not with Tailwind or rendering—it's with how you're </w:t>
+      </w:r>
+      <w:r>
+        <w:rPr>
+          <w:b/>
+          <w:bCs/>
+        </w:rPr>
+        <w:t>tracking route changes in Next.js App Router</w:t>
+      </w:r>
+      <w:r>
+        <w:t>.</w:t>
+      </w:r>
+    </w:p>
+    <w:p>
+      <w:r>
+        <w:t>You're using:</w:t>
+      </w:r>
+    </w:p>
+    <w:p>
+      <w:proofErr w:type="gramStart"/>
+      <w:r>
+        <w:t>useEffect(</w:t>
+      </w:r>
+      <w:proofErr w:type="gramEnd"/>
+      <w:r>
+        <w:t>() =&gt; {</w:t>
+      </w:r>
+    </w:p>
+    <w:p>
+      <w:r>
+        <w:t xml:space="preserve">  ...</w:t>
+      </w:r>
+    </w:p>
+    <w:p>
+      <w:r>
+        <w:t>}, [</w:t>
+      </w:r>
+      <w:proofErr w:type="spellStart"/>
+      <w:proofErr w:type="gramStart"/>
+      <w:r>
+        <w:t>router.query</w:t>
+      </w:r>
+      <w:proofErr w:type="spellEnd"/>
+      <w:proofErr w:type="gramEnd"/>
+      <w:r>
+        <w:t>]);</w:t>
+      </w:r>
+    </w:p>
+    <w:p>
+      <w:r>
+        <w:rPr>
+          <w:rFonts w:ascii="Segoe UI Emoji" w:hAnsi="Segoe UI Emoji" w:cs="Segoe UI Emoji"/>
+        </w:rPr>
+        <w:t>👉</w:t>
+      </w:r>
+      <w:r>
+        <w:t xml:space="preserve"> This </w:t>
+      </w:r>
+      <w:r>
+        <w:rPr>
+          <w:b/>
+          <w:bCs/>
+        </w:rPr>
+        <w:t>does not work</w:t>
+      </w:r>
+      <w:r>
+        <w:t xml:space="preserve"> in modern Next.js (App Router).</w:t>
+      </w:r>
+    </w:p>
+    <w:p>
+      <w:r>
+        <w:pict w14:anchorId="5FA560E4">
+          <v:rect id="_x0000_i1089" style="width:0;height:1.5pt" o:hralign="center" o:hrstd="t" o:hr="t" fillcolor="#a0a0a0" stroked="f"/>
+        </w:pict>
+      </w:r>
+    </w:p>
+    <w:p>
+      <w:pPr>
+        <w:rPr>
+          <w:b/>
+          <w:bCs/>
+        </w:rPr>
+      </w:pPr>
+      <w:r>
+        <w:rPr>
+          <w:rFonts w:ascii="Segoe UI Emoji" w:hAnsi="Segoe UI Emoji" w:cs="Segoe UI Emoji"/>
+          <w:b/>
+          <w:bCs/>
+        </w:rPr>
+        <w:t>❌</w:t>
+      </w:r>
+      <w:r>
+        <w:rPr>
+          <w:b/>
+          <w:bCs/>
+        </w:rPr>
+        <w:t xml:space="preserve"> Problem</w:t>
+      </w:r>
+    </w:p>
+    <w:p>
+      <w:r>
+        <w:t>In next/navigation:</w:t>
+      </w:r>
+    </w:p>
+    <w:p>
+      <w:proofErr w:type="spellStart"/>
+      <w:r>
+        <w:t>const</w:t>
+      </w:r>
+      <w:proofErr w:type="spellEnd"/>
+      <w:r>
+        <w:t xml:space="preserve"> router = </w:t>
+      </w:r>
+      <w:proofErr w:type="spellStart"/>
+      <w:proofErr w:type="gramStart"/>
+      <w:r>
+        <w:t>useRouter</w:t>
+      </w:r>
+      <w:proofErr w:type="spellEnd"/>
+      <w:r>
+        <w:t>(</w:t>
+      </w:r>
+      <w:proofErr w:type="gramEnd"/>
+      <w:r>
+        <w:t>)</w:t>
+      </w:r>
+    </w:p>
+    <w:p>
+      <w:r>
+        <w:rPr>
+          <w:rFonts w:ascii="Segoe UI Emoji" w:hAnsi="Segoe UI Emoji" w:cs="Segoe UI Emoji"/>
+        </w:rPr>
+        <w:t>👉</w:t>
+      </w:r>
+      <w:r>
+        <w:t xml:space="preserve"> router </w:t>
+      </w:r>
+      <w:r>
+        <w:rPr>
+          <w:b/>
+          <w:bCs/>
+        </w:rPr>
+        <w:t>does NOT have query anymore</w:t>
+      </w:r>
+    </w:p>
+    <w:p>
+      <w:r>
+        <w:t>So:</w:t>
+      </w:r>
+    </w:p>
+    <w:p>
+      <w:proofErr w:type="spellStart"/>
+      <w:proofErr w:type="gramStart"/>
+      <w:r>
+        <w:t>router.query</w:t>
+      </w:r>
+      <w:proofErr w:type="spellEnd"/>
+      <w:proofErr w:type="gramEnd"/>
+      <w:r>
+        <w:t xml:space="preserve"> // </w:t>
+      </w:r>
+      <w:r>
+        <w:rPr>
+          <w:rFonts w:ascii="Segoe UI Emoji" w:hAnsi="Segoe UI Emoji" w:cs="Segoe UI Emoji"/>
+        </w:rPr>
+        <w:t>❌</w:t>
+      </w:r>
+      <w:r>
+        <w:t xml:space="preserve"> undefined</w:t>
+      </w:r>
+    </w:p>
+    <w:p>
+      <w:r>
+        <w:rPr>
+          <w:rFonts w:ascii="Segoe UI Emoji" w:hAnsi="Segoe UI Emoji" w:cs="Segoe UI Emoji"/>
+        </w:rPr>
+        <w:lastRenderedPageBreak/>
+        <w:t>👉</w:t>
+      </w:r>
+      <w:r>
+        <w:t xml:space="preserve"> Your useEffect dependency never changes → effect doesn’t rerun</w:t>
+      </w:r>
+    </w:p>
+    <w:p>
+      <w:r>
+        <w:pict w14:anchorId="668305DC">
+          <v:rect id="_x0000_i1090" style="width:0;height:1.5pt" o:hralign="center" o:hrstd="t" o:hr="t" fillcolor="#a0a0a0" stroked="f"/>
+        </w:pict>
+      </w:r>
+    </w:p>
+    <w:p>
+      <w:pPr>
+        <w:rPr>
+          <w:b/>
+          <w:bCs/>
+        </w:rPr>
+      </w:pPr>
+      <w:r>
+        <w:rPr>
+          <w:rFonts w:ascii="Segoe UI Emoji" w:hAnsi="Segoe UI Emoji" w:cs="Segoe UI Emoji"/>
+          <w:b/>
+          <w:bCs/>
+        </w:rPr>
+        <w:t>✅</w:t>
+      </w:r>
+      <w:r>
+        <w:rPr>
+          <w:b/>
+          <w:bCs/>
+        </w:rPr>
+        <w:t xml:space="preserve"> Correct way (App Router)</w:t>
+      </w:r>
+    </w:p>
+    <w:p>
+      <w:r>
+        <w:t>Use:</w:t>
+      </w:r>
+    </w:p>
+    <w:p>
+      <w:r>
+        <w:t xml:space="preserve">import </w:t>
+      </w:r>
+      <w:proofErr w:type="gramStart"/>
+      <w:r>
+        <w:t xml:space="preserve">{ </w:t>
+      </w:r>
+      <w:proofErr w:type="spellStart"/>
+      <w:r>
+        <w:t>usePathname</w:t>
+      </w:r>
+      <w:proofErr w:type="spellEnd"/>
+      <w:proofErr w:type="gramEnd"/>
+      <w:r>
+        <w:t xml:space="preserve">, </w:t>
+      </w:r>
+      <w:proofErr w:type="spellStart"/>
+      <w:proofErr w:type="gramStart"/>
+      <w:r>
+        <w:t>useSearchParams</w:t>
+      </w:r>
+      <w:proofErr w:type="spellEnd"/>
+      <w:r>
+        <w:t xml:space="preserve"> }</w:t>
+      </w:r>
+      <w:proofErr w:type="gramEnd"/>
+      <w:r>
+        <w:t xml:space="preserve"> from "next/navigation";</w:t>
+      </w:r>
+    </w:p>
+    <w:p>
+      <w:r>
+        <w:pict w14:anchorId="4B84AC80">
+          <v:rect id="_x0000_i1091" style="width:0;height:1.5pt" o:hralign="center" o:hrstd="t" o:hr="t" fillcolor="#a0a0a0" stroked="f"/>
+        </w:pict>
+      </w:r>
+    </w:p>
+    <w:p>
+      <w:pPr>
+        <w:rPr>
+          <w:b/>
+          <w:bCs/>
+        </w:rPr>
+      </w:pPr>
+      <w:r>
+        <w:rPr>
+          <w:rFonts w:ascii="Segoe UI Emoji" w:hAnsi="Segoe UI Emoji" w:cs="Segoe UI Emoji"/>
+          <w:b/>
+          <w:bCs/>
+        </w:rPr>
+        <w:t>🔧</w:t>
+      </w:r>
+      <w:r>
+        <w:rPr>
+          <w:b/>
+          <w:bCs/>
+        </w:rPr>
+        <w:t xml:space="preserve"> Fix your code</w:t>
+      </w:r>
+    </w:p>
+    <w:p>
+      <w:pPr>
+        <w:rPr>
+          <w:b/>
+          <w:bCs/>
+        </w:rPr>
+      </w:pPr>
+      <w:r>
+        <w:rPr>
+          <w:b/>
+          <w:bCs/>
+        </w:rPr>
+        <w:t>Option 1: Detect route change</w:t>
+      </w:r>
+    </w:p>
+    <w:p>
+      <w:r>
+        <w:t xml:space="preserve">import </w:t>
+      </w:r>
+      <w:proofErr w:type="gramStart"/>
+      <w:r>
+        <w:t xml:space="preserve">{ </w:t>
+      </w:r>
+      <w:proofErr w:type="spellStart"/>
+      <w:r>
+        <w:t>usePathname</w:t>
+      </w:r>
+      <w:proofErr w:type="spellEnd"/>
+      <w:proofErr w:type="gramEnd"/>
+      <w:r>
+        <w:t xml:space="preserve"> } from "next/navigation";</w:t>
+      </w:r>
+    </w:p>
+    <w:p/>
+    <w:p>
+      <w:proofErr w:type="spellStart"/>
+      <w:r>
+        <w:t>const</w:t>
+      </w:r>
+      <w:proofErr w:type="spellEnd"/>
+      <w:r>
+        <w:t xml:space="preserve"> pathname = </w:t>
+      </w:r>
+      <w:proofErr w:type="spellStart"/>
+      <w:proofErr w:type="gramStart"/>
+      <w:r>
+        <w:t>usePathname</w:t>
+      </w:r>
+      <w:proofErr w:type="spellEnd"/>
+      <w:r>
+        <w:t>(</w:t>
+      </w:r>
+      <w:proofErr w:type="gramEnd"/>
+      <w:r>
+        <w:t>);</w:t>
+      </w:r>
+    </w:p>
+    <w:p/>
+    <w:p>
+      <w:proofErr w:type="gramStart"/>
+      <w:r>
+        <w:t>useEffect(</w:t>
+      </w:r>
+      <w:proofErr w:type="gramEnd"/>
+      <w:r>
+        <w:t>() =&gt; {</w:t>
+      </w:r>
+    </w:p>
+    <w:p>
+      <w:r>
+        <w:t xml:space="preserve">  </w:t>
+      </w:r>
+      <w:proofErr w:type="spellStart"/>
+      <w:r>
+        <w:t>const</w:t>
+      </w:r>
+      <w:proofErr w:type="spellEnd"/>
+      <w:r>
+        <w:t xml:space="preserve"> token = </w:t>
+      </w:r>
+      <w:proofErr w:type="spellStart"/>
+      <w:r>
+        <w:t>localStorage.getItem</w:t>
+      </w:r>
+      <w:proofErr w:type="spellEnd"/>
+      <w:r>
+        <w:t>("token");</w:t>
+      </w:r>
+    </w:p>
+    <w:p/>
+    <w:p>
+      <w:r>
+        <w:t xml:space="preserve">  if (token) {</w:t>
+      </w:r>
+    </w:p>
+    <w:p>
+      <w:r>
+        <w:t xml:space="preserve">    </w:t>
+      </w:r>
+      <w:proofErr w:type="spellStart"/>
+      <w:proofErr w:type="gramStart"/>
+      <w:r>
+        <w:t>setUser</w:t>
+      </w:r>
+      <w:proofErr w:type="spellEnd"/>
+      <w:r>
+        <w:t>({ value</w:t>
+      </w:r>
+      <w:proofErr w:type="gramEnd"/>
+      <w:r>
+        <w:t xml:space="preserve">: </w:t>
+      </w:r>
+      <w:proofErr w:type="gramStart"/>
+      <w:r>
+        <w:t>token }</w:t>
+      </w:r>
+      <w:proofErr w:type="gramEnd"/>
+      <w:r>
+        <w:t>);</w:t>
+      </w:r>
+    </w:p>
+    <w:p>
+      <w:r>
+        <w:t xml:space="preserve">    </w:t>
+      </w:r>
+      <w:proofErr w:type="spellStart"/>
+      <w:proofErr w:type="gramStart"/>
+      <w:r>
+        <w:t>setKey</w:t>
+      </w:r>
+      <w:proofErr w:type="spellEnd"/>
+      <w:r>
+        <w:t>(</w:t>
+      </w:r>
+      <w:proofErr w:type="spellStart"/>
+      <w:proofErr w:type="gramEnd"/>
+      <w:r>
+        <w:t>Math.random</w:t>
+      </w:r>
+      <w:proofErr w:type="spellEnd"/>
+      <w:r>
+        <w:t>());</w:t>
+      </w:r>
+    </w:p>
+    <w:p>
+      <w:r>
+        <w:t xml:space="preserve">  }</w:t>
+      </w:r>
+    </w:p>
+    <w:p>
+      <w:r>
+        <w:t>}, [pathname]);</w:t>
+      </w:r>
+    </w:p>
+    <w:p>
+      <w:r>
+        <w:pict w14:anchorId="3BDA93B3">
+          <v:rect id="_x0000_i1092" style="width:0;height:1.5pt" o:hralign="center" o:hrstd="t" o:hr="t" fillcolor="#a0a0a0" stroked="f"/>
+        </w:pict>
+      </w:r>
+    </w:p>
+    <w:p>
+      <w:pPr>
+        <w:rPr>
+          <w:b/>
+          <w:bCs/>
+        </w:rPr>
+      </w:pPr>
+      <w:r>
+        <w:rPr>
+          <w:b/>
+          <w:bCs/>
+        </w:rPr>
+        <w:t>Option 2: Detect query params change</w:t>
+      </w:r>
+    </w:p>
+    <w:p>
+      <w:r>
+        <w:t xml:space="preserve">import </w:t>
+      </w:r>
+      <w:proofErr w:type="gramStart"/>
+      <w:r>
+        <w:t xml:space="preserve">{ </w:t>
+      </w:r>
+      <w:proofErr w:type="spellStart"/>
+      <w:r>
+        <w:t>useSearchParams</w:t>
+      </w:r>
+      <w:proofErr w:type="spellEnd"/>
+      <w:proofErr w:type="gramEnd"/>
+      <w:r>
+        <w:t xml:space="preserve"> } from "next/navigation";</w:t>
+      </w:r>
+    </w:p>
+    <w:p/>
+    <w:p>
+      <w:proofErr w:type="spellStart"/>
+      <w:r>
+        <w:t>const</w:t>
+      </w:r>
+      <w:proofErr w:type="spellEnd"/>
+      <w:r>
+        <w:t xml:space="preserve"> </w:t>
+      </w:r>
+      <w:proofErr w:type="spellStart"/>
+      <w:r>
+        <w:t>searchParams</w:t>
+      </w:r>
+      <w:proofErr w:type="spellEnd"/>
+      <w:r>
+        <w:t xml:space="preserve"> = </w:t>
+      </w:r>
+      <w:proofErr w:type="spellStart"/>
+      <w:proofErr w:type="gramStart"/>
+      <w:r>
+        <w:t>useSearchParams</w:t>
+      </w:r>
+      <w:proofErr w:type="spellEnd"/>
+      <w:r>
+        <w:t>(</w:t>
+      </w:r>
+      <w:proofErr w:type="gramEnd"/>
+      <w:r>
+        <w:t>);</w:t>
+      </w:r>
+    </w:p>
+    <w:p/>
+    <w:p>
+      <w:proofErr w:type="gramStart"/>
+      <w:r>
+        <w:t>useEffect(</w:t>
+      </w:r>
+      <w:proofErr w:type="gramEnd"/>
+      <w:r>
+        <w:t>() =&gt; {</w:t>
+      </w:r>
+    </w:p>
+    <w:p>
+      <w:r>
+        <w:t xml:space="preserve">  </w:t>
+      </w:r>
+      <w:proofErr w:type="spellStart"/>
+      <w:r>
+        <w:t>const</w:t>
+      </w:r>
+      <w:proofErr w:type="spellEnd"/>
+      <w:r>
+        <w:t xml:space="preserve"> token = </w:t>
+      </w:r>
+      <w:proofErr w:type="spellStart"/>
+      <w:r>
+        <w:t>localStorage.getItem</w:t>
+      </w:r>
+      <w:proofErr w:type="spellEnd"/>
+      <w:r>
+        <w:t>("token");</w:t>
+      </w:r>
+    </w:p>
+    <w:p/>
+    <w:p>
+      <w:r>
+        <w:t xml:space="preserve">  if (token) {</w:t>
+      </w:r>
+    </w:p>
+    <w:p>
+      <w:r>
+        <w:t xml:space="preserve">    </w:t>
+      </w:r>
+      <w:proofErr w:type="spellStart"/>
+      <w:proofErr w:type="gramStart"/>
+      <w:r>
+        <w:t>setUser</w:t>
+      </w:r>
+      <w:proofErr w:type="spellEnd"/>
+      <w:r>
+        <w:t>({ value</w:t>
+      </w:r>
+      <w:proofErr w:type="gramEnd"/>
+      <w:r>
+        <w:t xml:space="preserve">: </w:t>
+      </w:r>
+      <w:proofErr w:type="gramStart"/>
+      <w:r>
+        <w:t>token }</w:t>
+      </w:r>
+      <w:proofErr w:type="gramEnd"/>
+      <w:r>
+        <w:t>);</w:t>
+      </w:r>
+    </w:p>
+    <w:p>
+      <w:r>
+        <w:lastRenderedPageBreak/>
+        <w:t xml:space="preserve">    </w:t>
+      </w:r>
+      <w:proofErr w:type="spellStart"/>
+      <w:proofErr w:type="gramStart"/>
+      <w:r>
+        <w:t>setKey</w:t>
+      </w:r>
+      <w:proofErr w:type="spellEnd"/>
+      <w:r>
+        <w:t>(</w:t>
+      </w:r>
+      <w:proofErr w:type="spellStart"/>
+      <w:proofErr w:type="gramEnd"/>
+      <w:r>
+        <w:t>Math.random</w:t>
+      </w:r>
+      <w:proofErr w:type="spellEnd"/>
+      <w:r>
+        <w:t>());</w:t>
+      </w:r>
+    </w:p>
+    <w:p>
+      <w:r>
+        <w:t xml:space="preserve">  }</w:t>
+      </w:r>
+    </w:p>
+    <w:p>
+      <w:r>
+        <w:t>}, [</w:t>
+      </w:r>
+      <w:proofErr w:type="spellStart"/>
+      <w:r>
+        <w:t>searchParams</w:t>
+      </w:r>
+      <w:proofErr w:type="spellEnd"/>
+      <w:r>
+        <w:t>]);</w:t>
+      </w:r>
+    </w:p>
+    <w:p>
+      <w:r>
+        <w:pict w14:anchorId="4B6114C4">
+          <v:rect id="_x0000_i1093" style="width:0;height:1.5pt" o:hralign="center" o:hrstd="t" o:hr="t" fillcolor="#a0a0a0" stroked="f"/>
+        </w:pict>
+      </w:r>
+    </w:p>
+    <w:p>
+      <w:pPr>
+        <w:rPr>
+          <w:b/>
+          <w:bCs/>
+        </w:rPr>
+      </w:pPr>
+      <w:r>
+        <w:rPr>
+          <w:rFonts w:ascii="Segoe UI Emoji" w:hAnsi="Segoe UI Emoji" w:cs="Segoe UI Emoji"/>
+          <w:b/>
+          <w:bCs/>
+        </w:rPr>
+        <w:t>🧠</w:t>
+      </w:r>
+      <w:r>
+        <w:rPr>
+          <w:b/>
+          <w:bCs/>
+        </w:rPr>
+        <w:t xml:space="preserve"> Why your current code fails</w:t>
+      </w:r>
+    </w:p>
+    <w:p>
+      <w:pPr>
+        <w:numPr>
+          <w:ilvl w:val="0"/>
+          <w:numId w:val="5"/>
+        </w:numPr>
+      </w:pPr>
+      <w:proofErr w:type="spellStart"/>
+      <w:proofErr w:type="gramStart"/>
+      <w:r>
+        <w:t>router.query</w:t>
+      </w:r>
+      <w:proofErr w:type="spellEnd"/>
+      <w:proofErr w:type="gramEnd"/>
+      <w:r>
+        <w:t xml:space="preserve"> → only exists in </w:t>
+      </w:r>
+      <w:r>
+        <w:rPr>
+          <w:b/>
+          <w:bCs/>
+        </w:rPr>
+        <w:t>Pages Router (next/router)</w:t>
+      </w:r>
+    </w:p>
+    <w:p>
+      <w:pPr>
+        <w:numPr>
+          <w:ilvl w:val="0"/>
+          <w:numId w:val="5"/>
+        </w:numPr>
+      </w:pPr>
+      <w:r>
+        <w:t xml:space="preserve">You are using </w:t>
+      </w:r>
+      <w:r>
+        <w:rPr>
+          <w:b/>
+          <w:bCs/>
+        </w:rPr>
+        <w:t>App Router (next/navigation)</w:t>
+      </w:r>
+    </w:p>
+    <w:p>
+      <w:pPr>
+        <w:numPr>
+          <w:ilvl w:val="0"/>
+          <w:numId w:val="5"/>
+        </w:numPr>
+      </w:pPr>
+      <w:proofErr w:type="gramStart"/>
+      <w:r>
+        <w:t>So</w:t>
+      </w:r>
+      <w:proofErr w:type="gramEnd"/>
+      <w:r>
+        <w:t xml:space="preserve"> dependency never updates → no re-render</w:t>
+      </w:r>
+    </w:p>
+    <w:p>
+      <w:r>
+        <w:pict w14:anchorId="66667BC4">
+          <v:rect id="_x0000_i1094" style="width:0;height:1.5pt" o:hralign="center" o:hrstd="t" o:hr="t" fillcolor="#a0a0a0" stroked="f"/>
+        </w:pict>
+      </w:r>
+    </w:p>
+    <w:p>
+      <w:pPr>
+        <w:rPr>
+          <w:b/>
+          <w:bCs/>
+        </w:rPr>
+      </w:pPr>
+      <w:r>
+        <w:rPr>
+          <w:rFonts w:ascii="Segoe UI Emoji" w:hAnsi="Segoe UI Emoji" w:cs="Segoe UI Emoji"/>
+          <w:b/>
+          <w:bCs/>
+        </w:rPr>
+        <w:t>⚠️</w:t>
+      </w:r>
+      <w:r>
+        <w:rPr>
+          <w:b/>
+          <w:bCs/>
+        </w:rPr>
+        <w:t xml:space="preserve"> Bonus issue (important)</w:t>
+      </w:r>
+    </w:p>
+    <w:p>
+      <w:r>
+        <w:t>You don’t need this:</w:t>
+      </w:r>
+    </w:p>
+    <w:p>
+      <w:proofErr w:type="spellStart"/>
+      <w:proofErr w:type="gramStart"/>
+      <w:r>
+        <w:t>setKey</w:t>
+      </w:r>
+      <w:proofErr w:type="spellEnd"/>
+      <w:r>
+        <w:t>(</w:t>
+      </w:r>
+      <w:proofErr w:type="spellStart"/>
+      <w:proofErr w:type="gramEnd"/>
+      <w:r>
+        <w:t>Math.random</w:t>
+      </w:r>
+      <w:proofErr w:type="spellEnd"/>
+      <w:r>
+        <w:t>())</w:t>
+      </w:r>
+    </w:p>
+    <w:p>
+      <w:r>
+        <w:rPr>
+          <w:rFonts w:ascii="Segoe UI Emoji" w:hAnsi="Segoe UI Emoji" w:cs="Segoe UI Emoji"/>
+        </w:rPr>
+        <w:t>👉</w:t>
+      </w:r>
+      <w:r>
+        <w:t xml:space="preserve"> This forces remount of Navbar (bad practice)</w:t>
+      </w:r>
+    </w:p>
+    <w:p>
+      <w:proofErr w:type="gramStart"/>
+      <w:r>
+        <w:t>Instead</w:t>
+      </w:r>
+      <w:proofErr w:type="gramEnd"/>
+      <w:r>
+        <w:t xml:space="preserve"> just:</w:t>
+      </w:r>
+    </w:p>
+    <w:p>
+      <w:r>
+        <w:t>&lt;Navbar user={user} /&gt;</w:t>
+      </w:r>
+    </w:p>
+    <w:p>
+      <w:r>
+        <w:t>React will re-render automatically when state changes.</w:t>
+      </w:r>
+    </w:p>
+    <w:p>
+      <w:r>
+        <w:pict w14:anchorId="04A702DF">
+          <v:rect id="_x0000_i1095" style="width:0;height:1.5pt" o:hralign="center" o:hrstd="t" o:hr="t" fillcolor="#a0a0a0" stroked="f"/>
+        </w:pict>
+      </w:r>
+    </w:p>
+    <w:p>
+      <w:pPr>
+        <w:rPr>
+          <w:b/>
+          <w:bCs/>
+        </w:rPr>
+      </w:pPr>
+      <w:r>
+        <w:rPr>
+          <w:rFonts w:ascii="Segoe UI Emoji" w:hAnsi="Segoe UI Emoji" w:cs="Segoe UI Emoji"/>
+          <w:b/>
+          <w:bCs/>
+        </w:rPr>
+        <w:t>✅</w:t>
+      </w:r>
+      <w:r>
+        <w:rPr>
+          <w:b/>
+          <w:bCs/>
+        </w:rPr>
+        <w:t xml:space="preserve"> Clean version</w:t>
+      </w:r>
+    </w:p>
+    <w:p>
+      <w:r>
+        <w:t>"</w:t>
+      </w:r>
+      <w:proofErr w:type="gramStart"/>
+      <w:r>
+        <w:t>use</w:t>
+      </w:r>
+      <w:proofErr w:type="gramEnd"/>
+      <w:r>
+        <w:t xml:space="preserve"> client"</w:t>
+      </w:r>
+    </w:p>
+    <w:p>
+      <w:r>
+        <w:t xml:space="preserve">import React, </w:t>
+      </w:r>
+      <w:proofErr w:type="gramStart"/>
+      <w:r>
+        <w:t>{ useEffect</w:t>
+      </w:r>
+      <w:proofErr w:type="gramEnd"/>
+      <w:r>
+        <w:t xml:space="preserve">, </w:t>
+      </w:r>
+      <w:proofErr w:type="spellStart"/>
+      <w:proofErr w:type="gramStart"/>
+      <w:r>
+        <w:t>useState</w:t>
+      </w:r>
+      <w:proofErr w:type="spellEnd"/>
+      <w:r>
+        <w:t xml:space="preserve"> }</w:t>
+      </w:r>
+      <w:proofErr w:type="gramEnd"/>
+      <w:r>
+        <w:t xml:space="preserve"> from "react";</w:t>
+      </w:r>
+    </w:p>
+    <w:p>
+      <w:r>
+        <w:t xml:space="preserve">import Navbar from </w:t>
+      </w:r>
+      <w:proofErr w:type="gramStart"/>
+      <w:r>
+        <w:t>"./</w:t>
+      </w:r>
+      <w:proofErr w:type="gramEnd"/>
+      <w:r>
+        <w:t>Navbar";</w:t>
+      </w:r>
+    </w:p>
+    <w:p>
+      <w:r>
+        <w:t xml:space="preserve">import </w:t>
+      </w:r>
+      <w:proofErr w:type="gramStart"/>
+      <w:r>
+        <w:t xml:space="preserve">{ </w:t>
+      </w:r>
+      <w:proofErr w:type="spellStart"/>
+      <w:r>
+        <w:t>usePathname</w:t>
+      </w:r>
+      <w:proofErr w:type="spellEnd"/>
+      <w:proofErr w:type="gramEnd"/>
+      <w:r>
+        <w:t xml:space="preserve"> } from "next/navigation";</w:t>
+      </w:r>
+    </w:p>
+    <w:p/>
+    <w:p>
+      <w:r>
+        <w:t xml:space="preserve">function </w:t>
+      </w:r>
+      <w:proofErr w:type="spellStart"/>
+      <w:proofErr w:type="gramStart"/>
+      <w:r>
+        <w:t>SuperNavBar</w:t>
+      </w:r>
+      <w:proofErr w:type="spellEnd"/>
+      <w:r>
+        <w:t>(</w:t>
+      </w:r>
+      <w:proofErr w:type="gramEnd"/>
+      <w:r>
+        <w:t>) {</w:t>
+      </w:r>
+    </w:p>
+    <w:p>
+      <w:r>
+        <w:t xml:space="preserve">  </w:t>
+      </w:r>
+      <w:proofErr w:type="spellStart"/>
+      <w:r>
+        <w:t>const</w:t>
+      </w:r>
+      <w:proofErr w:type="spellEnd"/>
+      <w:r>
+        <w:t xml:space="preserve"> pathname = </w:t>
+      </w:r>
+      <w:proofErr w:type="spellStart"/>
+      <w:proofErr w:type="gramStart"/>
+      <w:r>
+        <w:t>usePathname</w:t>
+      </w:r>
+      <w:proofErr w:type="spellEnd"/>
+      <w:r>
+        <w:t>(</w:t>
+      </w:r>
+      <w:proofErr w:type="gramEnd"/>
+      <w:r>
+        <w:t>);</w:t>
+      </w:r>
+    </w:p>
+    <w:p>
+      <w:r>
+        <w:t xml:space="preserve">  </w:t>
+      </w:r>
+      <w:proofErr w:type="spellStart"/>
+      <w:r>
+        <w:t>const</w:t>
+      </w:r>
+      <w:proofErr w:type="spellEnd"/>
+      <w:r>
+        <w:t xml:space="preserve"> [user, </w:t>
+      </w:r>
+      <w:proofErr w:type="spellStart"/>
+      <w:r>
+        <w:t>setUser</w:t>
+      </w:r>
+      <w:proofErr w:type="spellEnd"/>
+      <w:r>
+        <w:t xml:space="preserve">] = </w:t>
+      </w:r>
+      <w:proofErr w:type="spellStart"/>
+      <w:proofErr w:type="gramStart"/>
+      <w:r>
+        <w:t>useState</w:t>
+      </w:r>
+      <w:proofErr w:type="spellEnd"/>
+      <w:r>
+        <w:t>({ value</w:t>
+      </w:r>
+      <w:proofErr w:type="gramEnd"/>
+      <w:r>
+        <w:t xml:space="preserve">: </w:t>
+      </w:r>
+      <w:proofErr w:type="gramStart"/>
+      <w:r>
+        <w:t>null }</w:t>
+      </w:r>
+      <w:proofErr w:type="gramEnd"/>
+      <w:r>
+        <w:t>);</w:t>
+      </w:r>
+    </w:p>
+    <w:p/>
+    <w:p>
+      <w:r>
+        <w:t xml:space="preserve">  </w:t>
+      </w:r>
+      <w:proofErr w:type="gramStart"/>
+      <w:r>
+        <w:t>useEffect(</w:t>
+      </w:r>
+      <w:proofErr w:type="gramEnd"/>
+      <w:r>
+        <w:t>() =&gt; {</w:t>
+      </w:r>
+    </w:p>
+    <w:p>
+      <w:r>
+        <w:t xml:space="preserve">    </w:t>
+      </w:r>
+      <w:proofErr w:type="spellStart"/>
+      <w:r>
+        <w:t>const</w:t>
+      </w:r>
+      <w:proofErr w:type="spellEnd"/>
+      <w:r>
+        <w:t xml:space="preserve"> token = </w:t>
+      </w:r>
+      <w:proofErr w:type="spellStart"/>
+      <w:r>
+        <w:t>localStorage.getItem</w:t>
+      </w:r>
+      <w:proofErr w:type="spellEnd"/>
+      <w:r>
+        <w:t>("token");</w:t>
+      </w:r>
+    </w:p>
+    <w:p/>
+    <w:p>
+      <w:r>
+        <w:t xml:space="preserve">    if (token) {</w:t>
+      </w:r>
+    </w:p>
+    <w:p>
+      <w:r>
+        <w:lastRenderedPageBreak/>
+        <w:t xml:space="preserve">      </w:t>
+      </w:r>
+      <w:proofErr w:type="spellStart"/>
+      <w:proofErr w:type="gramStart"/>
+      <w:r>
+        <w:t>setUser</w:t>
+      </w:r>
+      <w:proofErr w:type="spellEnd"/>
+      <w:r>
+        <w:t>({ value</w:t>
+      </w:r>
+      <w:proofErr w:type="gramEnd"/>
+      <w:r>
+        <w:t xml:space="preserve">: </w:t>
+      </w:r>
+      <w:proofErr w:type="gramStart"/>
+      <w:r>
+        <w:t>token }</w:t>
+      </w:r>
+      <w:proofErr w:type="gramEnd"/>
+      <w:r>
+        <w:t>);</w:t>
+      </w:r>
+    </w:p>
+    <w:p>
+      <w:r>
+        <w:t xml:space="preserve">    }</w:t>
+      </w:r>
+    </w:p>
+    <w:p>
+      <w:r>
+        <w:t xml:space="preserve">  }, [pathname]);</w:t>
+      </w:r>
+    </w:p>
+    <w:p/>
+    <w:p>
+      <w:r>
+        <w:t xml:space="preserve">  return &lt;Navbar user={user} /&gt;;</w:t>
+      </w:r>
+    </w:p>
+    <w:p>
+      <w:r>
+        <w:t>}</w:t>
+      </w:r>
+    </w:p>
+    <w:p/>
+    <w:p>
+      <w:r>
+        <w:t xml:space="preserve">export default </w:t>
+      </w:r>
+      <w:proofErr w:type="spellStart"/>
+      <w:r>
+        <w:t>SuperNavBar</w:t>
+      </w:r>
+      <w:proofErr w:type="spellEnd"/>
+      <w:r>
+        <w:t>;</w:t>
+      </w:r>
+    </w:p>
+    <w:p>
+      <w:r>
+        <w:pict w14:anchorId="1625D15F">
+          <v:rect id="_x0000_i1096" style="width:0;height:1.5pt" o:hralign="center" o:hrstd="t" o:hr="t" fillcolor="#a0a0a0" stroked="f"/>
+        </w:pict>
+      </w:r>
+    </w:p>
+    <w:p>
+      <w:pPr>
+        <w:rPr>
+          <w:b/>
+          <w:bCs/>
+        </w:rPr>
+      </w:pPr>
+      <w:r>
+        <w:rPr>
+          <w:rFonts w:ascii="Segoe UI Emoji" w:hAnsi="Segoe UI Emoji" w:cs="Segoe UI Emoji"/>
+          <w:b/>
+          <w:bCs/>
+        </w:rPr>
+        <w:t>🎯</w:t>
+      </w:r>
+      <w:r>
+        <w:rPr>
+          <w:b/>
+          <w:bCs/>
+        </w:rPr>
+        <w:t xml:space="preserve"> Key takeaway</w:t>
+      </w:r>
+    </w:p>
+    <w:p>
+      <w:proofErr w:type="spellStart"/>
+      <w:proofErr w:type="gramStart"/>
+      <w:r>
+        <w:t>router.query</w:t>
+      </w:r>
+      <w:proofErr w:type="spellEnd"/>
+      <w:proofErr w:type="gramEnd"/>
+      <w:r>
+        <w:t xml:space="preserve"> </w:t>
+      </w:r>
+      <w:r>
+        <w:rPr>
+          <w:rFonts w:ascii="Segoe UI Emoji" w:hAnsi="Segoe UI Emoji" w:cs="Segoe UI Emoji"/>
+        </w:rPr>
+        <w:t>❌</w:t>
+      </w:r>
+      <w:r>
+        <w:t xml:space="preserve"> (old Next.js)</w:t>
+      </w:r>
+      <w:r>
+        <w:br/>
+      </w:r>
+      <w:proofErr w:type="spellStart"/>
+      <w:r>
+        <w:t>usePathname</w:t>
+      </w:r>
+      <w:proofErr w:type="spellEnd"/>
+      <w:r>
+        <w:t xml:space="preserve"> / </w:t>
+      </w:r>
+      <w:proofErr w:type="spellStart"/>
+      <w:r>
+        <w:t>useSearchParams</w:t>
+      </w:r>
+      <w:proofErr w:type="spellEnd"/>
+      <w:r>
+        <w:t xml:space="preserve"> </w:t>
+      </w:r>
+      <w:r>
+        <w:rPr>
+          <w:rFonts w:ascii="Segoe UI Emoji" w:hAnsi="Segoe UI Emoji" w:cs="Segoe UI Emoji"/>
+        </w:rPr>
+        <w:t>✅</w:t>
+      </w:r>
+      <w:r>
+        <w:t xml:space="preserve"> (modern Next.js)</w:t>
+      </w:r>
+    </w:p>
+    <w:p>
+      <w:r>
+        <w:pict w14:anchorId="43DDF15E">
+          <v:rect id="_x0000_i1097" style="width:0;height:1.5pt" o:hralign="center" o:hrstd="t" o:hr="t" fillcolor="#a0a0a0" stroked="f"/>
+        </w:pict>
+      </w:r>
+    </w:p>
+    <w:p/>
     <w:sectPr>
       <w:pgSz w:w="11906" w:h="16838"/>
       <w:pgMar w:top="1440" w:right="1440" w:bottom="1440" w:left="1440" w:header="708" w:footer="708" w:gutter="0"/>
@@ -10582,6 +13091,155 @@
     </w:lvl>
   </w:abstractNum>
   <w:abstractNum w:abstractNumId="3" w15:restartNumberingAfterBreak="0">
+    <w:nsid w:val="428C2D54"/>
+    <w:multiLevelType w:val="multilevel"/>
+    <w:tmpl w:val="48A2CA0C"/>
+    <w:lvl w:ilvl="0">
+      <w:start w:val="1"/>
+      <w:numFmt w:val="bullet"/>
+      <w:lvlText w:val=""/>
+      <w:lvlJc w:val="left"/>
+      <w:pPr>
+        <w:tabs>
+          <w:tab w:val="num" w:pos="720"/>
+        </w:tabs>
+        <w:ind w:left="720" w:hanging="360"/>
+      </w:pPr>
+      <w:rPr>
+        <w:rFonts w:ascii="Symbol" w:hAnsi="Symbol" w:hint="default"/>
+        <w:sz w:val="20"/>
+      </w:rPr>
+    </w:lvl>
+    <w:lvl w:ilvl="1" w:tentative="1">
+      <w:start w:val="1"/>
+      <w:numFmt w:val="bullet"/>
+      <w:lvlText w:val="o"/>
+      <w:lvlJc w:val="left"/>
+      <w:pPr>
+        <w:tabs>
+          <w:tab w:val="num" w:pos="1440"/>
+        </w:tabs>
+        <w:ind w:left="1440" w:hanging="360"/>
+      </w:pPr>
+      <w:rPr>
+        <w:rFonts w:ascii="Courier New" w:hAnsi="Courier New" w:hint="default"/>
+        <w:sz w:val="20"/>
+      </w:rPr>
+    </w:lvl>
+    <w:lvl w:ilvl="2" w:tentative="1">
+      <w:start w:val="1"/>
+      <w:numFmt w:val="bullet"/>
+      <w:lvlText w:val=""/>
+      <w:lvlJc w:val="left"/>
+      <w:pPr>
+        <w:tabs>
+          <w:tab w:val="num" w:pos="2160"/>
+        </w:tabs>
+        <w:ind w:left="2160" w:hanging="360"/>
+      </w:pPr>
+      <w:rPr>
+        <w:rFonts w:ascii="Wingdings" w:hAnsi="Wingdings" w:hint="default"/>
+        <w:sz w:val="20"/>
+      </w:rPr>
+    </w:lvl>
+    <w:lvl w:ilvl="3" w:tentative="1">
+      <w:start w:val="1"/>
+      <w:numFmt w:val="bullet"/>
+      <w:lvlText w:val=""/>
+      <w:lvlJc w:val="left"/>
+      <w:pPr>
+        <w:tabs>
+          <w:tab w:val="num" w:pos="2880"/>
+        </w:tabs>
+        <w:ind w:left="2880" w:hanging="360"/>
+      </w:pPr>
+      <w:rPr>
+        <w:rFonts w:ascii="Wingdings" w:hAnsi="Wingdings" w:hint="default"/>
+        <w:sz w:val="20"/>
+      </w:rPr>
+    </w:lvl>
+    <w:lvl w:ilvl="4" w:tentative="1">
+      <w:start w:val="1"/>
+      <w:numFmt w:val="bullet"/>
+      <w:lvlText w:val=""/>
+      <w:lvlJc w:val="left"/>
+      <w:pPr>
+        <w:tabs>
+          <w:tab w:val="num" w:pos="3600"/>
+        </w:tabs>
+        <w:ind w:left="3600" w:hanging="360"/>
+      </w:pPr>
+      <w:rPr>
+        <w:rFonts w:ascii="Wingdings" w:hAnsi="Wingdings" w:hint="default"/>
+        <w:sz w:val="20"/>
+      </w:rPr>
+    </w:lvl>
+    <w:lvl w:ilvl="5" w:tentative="1">
+      <w:start w:val="1"/>
+      <w:numFmt w:val="bullet"/>
+      <w:lvlText w:val=""/>
+      <w:lvlJc w:val="left"/>
+      <w:pPr>
+        <w:tabs>
+          <w:tab w:val="num" w:pos="4320"/>
+        </w:tabs>
+        <w:ind w:left="4320" w:hanging="360"/>
+      </w:pPr>
+      <w:rPr>
+        <w:rFonts w:ascii="Wingdings" w:hAnsi="Wingdings" w:hint="default"/>
+        <w:sz w:val="20"/>
+      </w:rPr>
+    </w:lvl>
+    <w:lvl w:ilvl="6" w:tentative="1">
+      <w:start w:val="1"/>
+      <w:numFmt w:val="bullet"/>
+      <w:lvlText w:val=""/>
+      <w:lvlJc w:val="left"/>
+      <w:pPr>
+        <w:tabs>
+          <w:tab w:val="num" w:pos="5040"/>
+        </w:tabs>
+        <w:ind w:left="5040" w:hanging="360"/>
+      </w:pPr>
+      <w:rPr>
+        <w:rFonts w:ascii="Wingdings" w:hAnsi="Wingdings" w:hint="default"/>
+        <w:sz w:val="20"/>
+      </w:rPr>
+    </w:lvl>
+    <w:lvl w:ilvl="7" w:tentative="1">
+      <w:start w:val="1"/>
+      <w:numFmt w:val="bullet"/>
+      <w:lvlText w:val=""/>
+      <w:lvlJc w:val="left"/>
+      <w:pPr>
+        <w:tabs>
+          <w:tab w:val="num" w:pos="5760"/>
+        </w:tabs>
+        <w:ind w:left="5760" w:hanging="360"/>
+      </w:pPr>
+      <w:rPr>
+        <w:rFonts w:ascii="Wingdings" w:hAnsi="Wingdings" w:hint="default"/>
+        <w:sz w:val="20"/>
+      </w:rPr>
+    </w:lvl>
+    <w:lvl w:ilvl="8" w:tentative="1">
+      <w:start w:val="1"/>
+      <w:numFmt w:val="bullet"/>
+      <w:lvlText w:val=""/>
+      <w:lvlJc w:val="left"/>
+      <w:pPr>
+        <w:tabs>
+          <w:tab w:val="num" w:pos="6480"/>
+        </w:tabs>
+        <w:ind w:left="6480" w:hanging="360"/>
+      </w:pPr>
+      <w:rPr>
+        <w:rFonts w:ascii="Wingdings" w:hAnsi="Wingdings" w:hint="default"/>
+        <w:sz w:val="20"/>
+      </w:rPr>
+    </w:lvl>
+  </w:abstractNum>
+  <w:abstractNum w:abstractNumId="4" w15:restartNumberingAfterBreak="0">
     <w:nsid w:val="62E830E2"/>
     <w:multiLevelType w:val="multilevel"/>
     <w:tmpl w:val="11CAD314"/>
@@ -10737,10 +13395,13 @@
     <w:abstractNumId w:val="2"/>
   </w:num>
   <w:num w:numId="3" w16cid:durableId="725378917">
-    <w:abstractNumId w:val="3"/>
+    <w:abstractNumId w:val="4"/>
   </w:num>
   <w:num w:numId="4" w16cid:durableId="1651210289">
     <w:abstractNumId w:val="1"/>
+  </w:num>
+  <w:num w:numId="5" w16cid:durableId="1577781315">
+    <w:abstractNumId w:val="3"/>
   </w:num>
 </w:numbering>
 </file>
@@ -11348,7 +14009,6 @@
   <w:style w:type="character" w:default="1" w:styleId="DefaultParagraphFont">
     <w:name w:val="Default Paragraph Font"/>
     <w:uiPriority w:val="1"/>
-    <w:semiHidden/>
     <w:unhideWhenUsed/>
   </w:style>
   <w:style w:type="table" w:default="1" w:styleId="TableNormal">

</xml_diff>

<commit_message>
Lesson 59 Adding React top loading bar to Codeswear.com
</commit_message>
<xml_diff>
--- a/Notes2.docx
+++ b/Notes2.docx
@@ -12700,6 +12700,528 @@
         <w:pict w14:anchorId="43DDF15E">
           <v:rect id="_x0000_i1097" style="width:0;height:1.5pt" o:hralign="center" o:hrstd="t" o:hr="t" fillcolor="#a0a0a0" stroked="f"/>
         </w:pict>
+      </w:r>
+    </w:p>
+    <w:p>
+      <w:r>
+        <w:t xml:space="preserve">If you have </w:t>
+      </w:r>
+      <w:r>
+        <w:t xml:space="preserve">visited any </w:t>
+      </w:r>
+      <w:r>
+        <w:t>s</w:t>
+      </w:r>
+      <w:r>
+        <w:t>ingl</w:t>
+      </w:r>
+      <w:r>
+        <w:t>e</w:t>
+      </w:r>
+      <w:r>
+        <w:t xml:space="preserve"> page application </w:t>
+      </w:r>
+      <w:r>
+        <w:t xml:space="preserve">then you must have seen if there is a </w:t>
+      </w:r>
+      <w:r>
+        <w:t xml:space="preserve">navigation </w:t>
+      </w:r>
+      <w:r>
+        <w:t>in a page and we are taken from one page to another then there is a very thin loa</w:t>
+      </w:r>
+      <w:r>
+        <w:t>d</w:t>
+      </w:r>
+      <w:r>
+        <w:t xml:space="preserve">ing </w:t>
+      </w:r>
+      <w:r>
+        <w:t xml:space="preserve">bar </w:t>
+      </w:r>
+      <w:r>
+        <w:t xml:space="preserve">that goes on until </w:t>
+      </w:r>
+      <w:r>
+        <w:t xml:space="preserve">that page loading happens </w:t>
+      </w:r>
+      <w:r>
+        <w:t xml:space="preserve">Such things you might have seen in </w:t>
+      </w:r>
+      <w:proofErr w:type="spellStart"/>
+      <w:r>
+        <w:t>Youtube</w:t>
+      </w:r>
+      <w:proofErr w:type="spellEnd"/>
+      <w:r>
+        <w:t xml:space="preserve">. Teacher will tell how this thing is done. He will tell us that how </w:t>
+      </w:r>
+      <w:r>
+        <w:t xml:space="preserve">we are going to add top loafing bar in our site </w:t>
+      </w:r>
+    </w:p>
+    <w:p>
+      <w:r>
+        <w:t xml:space="preserve">If you see such thing in a site and it is </w:t>
+      </w:r>
+      <w:proofErr w:type="gramStart"/>
+      <w:r>
+        <w:t>react</w:t>
+      </w:r>
+      <w:proofErr w:type="gramEnd"/>
+      <w:r>
+        <w:t xml:space="preserve"> website</w:t>
+      </w:r>
+      <w:r>
+        <w:t xml:space="preserve"> then most probably </w:t>
+      </w:r>
+      <w:r>
+        <w:t xml:space="preserve">that </w:t>
+      </w:r>
+      <w:r>
+        <w:t xml:space="preserve">Top bar is made by </w:t>
+      </w:r>
+      <w:r>
+        <w:t>react-top-loading-bar</w:t>
+      </w:r>
+    </w:p>
+    <w:p>
+      <w:pPr>
+        <w:jc w:val="center"/>
+      </w:pPr>
+      <w:r>
+        <w:drawing>
+          <wp:inline distT="0" distB="0" distL="0" distR="0" wp14:anchorId="1EA20CFA" wp14:editId="3D3FC938">
+            <wp:extent cx="2143125" cy="2916702"/>
+            <wp:effectExtent l="0" t="0" r="0" b="0"/>
+            <wp:docPr id="1432824359" name="Picture 1"/>
+            <wp:cNvGraphicFramePr>
+              <a:graphicFrameLocks xmlns:a="http://schemas.openxmlformats.org/drawingml/2006/main" noChangeAspect="1"/>
+            </wp:cNvGraphicFramePr>
+            <a:graphic xmlns:a="http://schemas.openxmlformats.org/drawingml/2006/main">
+              <a:graphicData uri="http://schemas.openxmlformats.org/drawingml/2006/picture">
+                <pic:pic xmlns:pic="http://schemas.openxmlformats.org/drawingml/2006/picture">
+                  <pic:nvPicPr>
+                    <pic:cNvPr id="1432824359" name=""/>
+                    <pic:cNvPicPr/>
+                  </pic:nvPicPr>
+                  <pic:blipFill>
+                    <a:blip r:embed="rId62"/>
+                    <a:stretch>
+                      <a:fillRect/>
+                    </a:stretch>
+                  </pic:blipFill>
+                  <pic:spPr>
+                    <a:xfrm>
+                      <a:off x="0" y="0"/>
+                      <a:ext cx="2145702" cy="2920209"/>
+                    </a:xfrm>
+                    <a:prstGeom prst="rect">
+                      <a:avLst/>
+                    </a:prstGeom>
+                  </pic:spPr>
+                </pic:pic>
+              </a:graphicData>
+            </a:graphic>
+          </wp:inline>
+        </w:drawing>
+      </w:r>
+    </w:p>
+    <w:p>
+      <w:proofErr w:type="gramStart"/>
+      <w:r>
+        <w:t>However</w:t>
+      </w:r>
+      <w:proofErr w:type="gramEnd"/>
+      <w:r>
+        <w:t xml:space="preserve"> there are other ways </w:t>
+      </w:r>
+      <w:r>
+        <w:t>to do it</w:t>
+      </w:r>
+      <w:r>
+        <w:t xml:space="preserve">. </w:t>
+      </w:r>
+      <w:r>
+        <w:t xml:space="preserve">but we are going to see React top loafing bar. </w:t>
+      </w:r>
+      <w:r>
+        <w:t>We install it by</w:t>
+      </w:r>
+    </w:p>
+    <w:p>
+      <w:pPr>
+        <w:jc w:val="center"/>
+        <w:rPr>
+          <w:b/>
+          <w:bCs/>
+        </w:rPr>
+      </w:pPr>
+      <w:r>
+        <w:rPr>
+          <w:b/>
+          <w:bCs/>
+        </w:rPr>
+        <w:t>yarn add react-top-loading-bar</w:t>
+      </w:r>
+    </w:p>
+    <w:p>
+      <w:r>
+        <w:t xml:space="preserve">Now we see </w:t>
+      </w:r>
+      <w:r>
+        <w:t xml:space="preserve">next/router documentation </w:t>
+      </w:r>
+    </w:p>
+    <w:p>
+      <w:pPr>
+        <w:rPr>
+          <w:b/>
+          <w:bCs/>
+          <w:color w:val="EE0000"/>
+        </w:rPr>
+      </w:pPr>
+      <w:r>
+        <w:rPr>
+          <w:b/>
+          <w:bCs/>
+          <w:color w:val="EE0000"/>
+        </w:rPr>
+        <w:lastRenderedPageBreak/>
+        <w:t>A</w:t>
+      </w:r>
+      <w:r>
+        <w:rPr>
+          <w:b/>
+          <w:bCs/>
+          <w:color w:val="EE0000"/>
+        </w:rPr>
+        <w:t>s</w:t>
+      </w:r>
+      <w:r>
+        <w:rPr>
+          <w:b/>
+          <w:bCs/>
+          <w:color w:val="EE0000"/>
+        </w:rPr>
+        <w:t xml:space="preserve"> our navigation will be complete </w:t>
+      </w:r>
+      <w:r>
+        <w:rPr>
+          <w:b/>
+          <w:bCs/>
+          <w:color w:val="EE0000"/>
+        </w:rPr>
+        <w:t xml:space="preserve">in older </w:t>
+      </w:r>
+      <w:proofErr w:type="spellStart"/>
+      <w:r>
+        <w:rPr>
+          <w:b/>
+          <w:bCs/>
+          <w:color w:val="EE0000"/>
+        </w:rPr>
+        <w:t>Nextjs</w:t>
+      </w:r>
+      <w:proofErr w:type="spellEnd"/>
+      <w:r>
+        <w:rPr>
+          <w:b/>
+          <w:bCs/>
+          <w:color w:val="EE0000"/>
+        </w:rPr>
+        <w:t xml:space="preserve"> we use to </w:t>
+      </w:r>
+      <w:proofErr w:type="spellStart"/>
+      <w:r>
+        <w:rPr>
+          <w:b/>
+          <w:bCs/>
+          <w:color w:val="EE0000"/>
+        </w:rPr>
+        <w:t>listenof</w:t>
+      </w:r>
+      <w:proofErr w:type="spellEnd"/>
+      <w:r>
+        <w:rPr>
+          <w:b/>
+          <w:bCs/>
+          <w:color w:val="EE0000"/>
+        </w:rPr>
+        <w:t xml:space="preserve"> an event by </w:t>
+      </w:r>
+      <w:proofErr w:type="spellStart"/>
+      <w:proofErr w:type="gramStart"/>
+      <w:r>
+        <w:rPr>
+          <w:b/>
+          <w:bCs/>
+          <w:color w:val="EE0000"/>
+        </w:rPr>
+        <w:t>router.events</w:t>
+      </w:r>
+      <w:proofErr w:type="gramEnd"/>
+      <w:r>
+        <w:rPr>
+          <w:b/>
+          <w:bCs/>
+          <w:color w:val="EE0000"/>
+        </w:rPr>
+        <w:t>.</w:t>
+      </w:r>
+      <w:proofErr w:type="gramStart"/>
+      <w:r>
+        <w:rPr>
+          <w:b/>
+          <w:bCs/>
+          <w:color w:val="EE0000"/>
+        </w:rPr>
+        <w:t>on</w:t>
+      </w:r>
+      <w:proofErr w:type="spellEnd"/>
+      <w:r>
+        <w:rPr>
+          <w:b/>
+          <w:bCs/>
+          <w:color w:val="EE0000"/>
+        </w:rPr>
+        <w:t>(</w:t>
+      </w:r>
+      <w:proofErr w:type="gramEnd"/>
+      <w:r>
+        <w:rPr>
+          <w:b/>
+          <w:bCs/>
+          <w:color w:val="EE0000"/>
+        </w:rPr>
+        <w:t>“event name</w:t>
+      </w:r>
+      <w:proofErr w:type="gramStart"/>
+      <w:r>
+        <w:rPr>
+          <w:b/>
+          <w:bCs/>
+          <w:color w:val="EE0000"/>
+        </w:rPr>
+        <w:t>”,&lt;</w:t>
+      </w:r>
+      <w:proofErr w:type="gramEnd"/>
+      <w:r>
+        <w:rPr>
+          <w:b/>
+          <w:bCs/>
+          <w:color w:val="EE0000"/>
+        </w:rPr>
+        <w:t>event handler callback&gt;)</w:t>
+      </w:r>
+      <w:r>
+        <w:rPr>
+          <w:b/>
+          <w:bCs/>
+          <w:color w:val="EE0000"/>
+        </w:rPr>
+        <w:t xml:space="preserve"> we used to listen for the event</w:t>
+      </w:r>
+      <w:r>
+        <w:rPr>
+          <w:b/>
+          <w:bCs/>
+          <w:color w:val="EE0000"/>
+        </w:rPr>
+        <w:t xml:space="preserve"> </w:t>
+      </w:r>
+      <w:proofErr w:type="spellStart"/>
+      <w:r>
+        <w:rPr>
+          <w:b/>
+          <w:bCs/>
+          <w:color w:val="EE0000"/>
+        </w:rPr>
+        <w:t>routerChangeComplete</w:t>
+      </w:r>
+      <w:proofErr w:type="spellEnd"/>
+      <w:r>
+        <w:rPr>
+          <w:b/>
+          <w:bCs/>
+          <w:color w:val="EE0000"/>
+        </w:rPr>
+        <w:t xml:space="preserve"> </w:t>
+      </w:r>
+    </w:p>
+    <w:p>
+      <w:pPr>
+        <w:rPr>
+          <w:b/>
+          <w:bCs/>
+          <w:color w:val="EE0000"/>
+        </w:rPr>
+      </w:pPr>
+      <w:r>
+        <w:rPr>
+          <w:b/>
+          <w:bCs/>
+          <w:color w:val="EE0000"/>
+        </w:rPr>
+        <w:t xml:space="preserve">But now in modern we can use it in the useEffect normally and set pathname as a trigger for </w:t>
+      </w:r>
+      <w:r>
+        <w:rPr>
+          <w:b/>
+          <w:bCs/>
+          <w:color w:val="EE0000"/>
+        </w:rPr>
+        <w:t xml:space="preserve">the useEffect in our top component </w:t>
+      </w:r>
+    </w:p>
+    <w:p>
+      <w:r>
+        <w:t>We obser</w:t>
+      </w:r>
+      <w:r>
+        <w:t xml:space="preserve">ved that when the loader reaches </w:t>
+      </w:r>
+      <w:r>
+        <w:t xml:space="preserve">100 </w:t>
+      </w:r>
+      <w:proofErr w:type="spellStart"/>
+      <w:r>
+        <w:t>percnt</w:t>
+      </w:r>
+      <w:proofErr w:type="spellEnd"/>
+      <w:r>
+        <w:t xml:space="preserve"> it </w:t>
+      </w:r>
+      <w:proofErr w:type="spellStart"/>
+      <w:r>
+        <w:t>fases</w:t>
+      </w:r>
+      <w:proofErr w:type="spellEnd"/>
+      <w:r>
+        <w:t xml:space="preserve"> out but it </w:t>
+      </w:r>
+      <w:proofErr w:type="spellStart"/>
+      <w:r>
+        <w:t>gase</w:t>
+      </w:r>
+      <w:proofErr w:type="spellEnd"/>
+      <w:r>
+        <w:t xml:space="preserve"> out after slightly long delay we can control it by </w:t>
+      </w:r>
+      <w:proofErr w:type="spellStart"/>
+      <w:r>
+        <w:t>waitingTime</w:t>
+      </w:r>
+      <w:proofErr w:type="spellEnd"/>
+      <w:r>
+        <w:t xml:space="preserve"> attribute. </w:t>
+      </w:r>
+    </w:p>
+    <w:p>
+      <w:pPr>
+        <w:rPr>
+          <w:b/>
+          <w:bCs/>
+        </w:rPr>
+      </w:pPr>
+      <w:r>
+        <w:rPr>
+          <w:b/>
+          <w:bCs/>
+        </w:rPr>
+        <w:t xml:space="preserve">There was also </w:t>
+      </w:r>
+      <w:proofErr w:type="gramStart"/>
+      <w:r>
+        <w:rPr>
+          <w:b/>
+          <w:bCs/>
+        </w:rPr>
+        <w:t>an  event</w:t>
+      </w:r>
+      <w:proofErr w:type="gramEnd"/>
+      <w:r>
+        <w:rPr>
+          <w:b/>
+          <w:bCs/>
+        </w:rPr>
+        <w:t xml:space="preserve"> </w:t>
+      </w:r>
+      <w:r>
+        <w:rPr>
+          <w:b/>
+          <w:bCs/>
+        </w:rPr>
+        <w:t xml:space="preserve">that was called </w:t>
+      </w:r>
+      <w:proofErr w:type="spellStart"/>
+      <w:r>
+        <w:rPr>
+          <w:b/>
+          <w:bCs/>
+        </w:rPr>
+        <w:t>routerchangeStart</w:t>
+      </w:r>
+      <w:proofErr w:type="spellEnd"/>
+      <w:r>
+        <w:rPr>
+          <w:b/>
+          <w:bCs/>
+        </w:rPr>
+        <w:t xml:space="preserve"> which was called when the router start routing </w:t>
+      </w:r>
+      <w:r>
+        <w:rPr>
+          <w:b/>
+          <w:bCs/>
+        </w:rPr>
+        <w:t xml:space="preserve">but now no such thing </w:t>
+      </w:r>
+      <w:proofErr w:type="gramStart"/>
+      <w:r>
+        <w:rPr>
+          <w:b/>
+          <w:bCs/>
+        </w:rPr>
+        <w:t>exist</w:t>
+      </w:r>
+      <w:proofErr w:type="gramEnd"/>
+      <w:r>
+        <w:rPr>
+          <w:b/>
+          <w:bCs/>
+        </w:rPr>
+        <w:t xml:space="preserve"> so we need to do a</w:t>
+      </w:r>
+      <w:r>
+        <w:rPr>
+          <w:b/>
+          <w:bCs/>
+        </w:rPr>
+        <w:t>p</w:t>
+      </w:r>
+      <w:r>
+        <w:rPr>
+          <w:b/>
+          <w:bCs/>
+        </w:rPr>
+        <w:t xml:space="preserve">ply it in </w:t>
+      </w:r>
+      <w:proofErr w:type="spellStart"/>
+      <w:r>
+        <w:rPr>
+          <w:b/>
+          <w:bCs/>
+        </w:rPr>
+        <w:t>onClick</w:t>
+      </w:r>
+      <w:proofErr w:type="spellEnd"/>
+      <w:r>
+        <w:rPr>
+          <w:b/>
+          <w:bCs/>
+        </w:rPr>
+        <w:t xml:space="preserve"> on Link </w:t>
       </w:r>
     </w:p>
     <w:p/>

</xml_diff>

<commit_message>
Lesson 60 Creating Orders Page for Codeswear.com
</commit_message>
<xml_diff>
--- a/Notes2.docx
+++ b/Notes2.docx
@@ -59,18 +59,10 @@
     </w:p>
     <w:p>
       <w:r>
-        <w:t xml:space="preserve">In nay </w:t>
-      </w:r>
-      <w:proofErr w:type="gramStart"/>
-      <w:r>
-        <w:t>container</w:t>
-      </w:r>
-      <w:r>
-        <w:t>(</w:t>
-      </w:r>
-      <w:proofErr w:type="gramEnd"/>
-      <w:r>
-        <w:t>or component)</w:t>
+        <w:t>In nay container</w:t>
+      </w:r>
+      <w:r>
+        <w:t>(or component)</w:t>
       </w:r>
       <w:r>
         <w:t xml:space="preserve"> if you want to </w:t>
@@ -555,14 +547,9 @@
       </w:r>
     </w:p>
     <w:p>
-      <w:proofErr w:type="gramStart"/>
       <w:r>
         <w:lastRenderedPageBreak/>
-        <w:t>So</w:t>
-      </w:r>
-      <w:proofErr w:type="gramEnd"/>
-      <w:r>
-        <w:t xml:space="preserve"> we can so this thing Now we can see it is getting rendered as shown below</w:t>
+        <w:t>So we can so this thing Now we can see it is getting rendered as shown below</w:t>
       </w:r>
     </w:p>
     <w:p>
@@ -664,13 +651,8 @@
         <w:t xml:space="preserve"> s</w:t>
       </w:r>
       <w:r>
-        <w:t xml:space="preserve">ubmit the </w:t>
-      </w:r>
-      <w:proofErr w:type="gramStart"/>
-      <w:r>
-        <w:t>form</w:t>
-      </w:r>
-      <w:proofErr w:type="gramEnd"/>
+        <w:t>ubmit the form</w:t>
+      </w:r>
       <w:r>
         <w:t xml:space="preserve"> we will definitely have to make an API to co</w:t>
       </w:r>
@@ -736,29 +718,8 @@
       </w:r>
     </w:p>
     <w:p>
-      <w:proofErr w:type="gramStart"/>
-      <w:r>
-        <w:t>So</w:t>
-      </w:r>
-      <w:proofErr w:type="gramEnd"/>
-      <w:r>
-        <w:t xml:space="preserve"> for </w:t>
-      </w:r>
-      <w:proofErr w:type="gramStart"/>
-      <w:r>
-        <w:t>now</w:t>
-      </w:r>
-      <w:proofErr w:type="gramEnd"/>
-      <w:r>
-        <w:t xml:space="preserve"> our post request handler </w:t>
-      </w:r>
-      <w:proofErr w:type="gramStart"/>
-      <w:r>
-        <w:t>look</w:t>
-      </w:r>
-      <w:proofErr w:type="gramEnd"/>
-      <w:r>
-        <w:t xml:space="preserve"> like below</w:t>
+      <w:r>
+        <w:t>So for now our post request handler look like below</w:t>
       </w:r>
     </w:p>
     <w:p>
@@ -807,13 +768,8 @@
       </w:r>
     </w:p>
     <w:p>
-      <w:proofErr w:type="gramStart"/>
-      <w:r>
-        <w:t>Ols</w:t>
-      </w:r>
-      <w:proofErr w:type="gramEnd"/>
-      <w:r>
-        <w:t xml:space="preserve"> version used to look like below</w:t>
+      <w:r>
+        <w:t>Ols version used to look like below</w:t>
       </w:r>
     </w:p>
     <w:p>
@@ -921,12 +877,10 @@
         <w:t xml:space="preserve">, not plain JSON, so sending it directly with </w:t>
       </w:r>
       <w:proofErr w:type="spellStart"/>
-      <w:proofErr w:type="gramStart"/>
       <w:r>
         <w:t>res.json</w:t>
       </w:r>
       <w:proofErr w:type="spellEnd"/>
-      <w:proofErr w:type="gramEnd"/>
       <w:r>
         <w:t>(</w:t>
       </w:r>
@@ -984,14 +938,9 @@
     </w:p>
     <w:p>
       <w:r>
-        <w:t xml:space="preserve">export default function </w:t>
-      </w:r>
-      <w:proofErr w:type="gramStart"/>
-      <w:r>
-        <w:t>handler(</w:t>
-      </w:r>
-      <w:proofErr w:type="spellStart"/>
-      <w:proofErr w:type="gramEnd"/>
+        <w:t>export default function handler(</w:t>
+      </w:r>
+      <w:proofErr w:type="spellStart"/>
       <w:r>
         <w:t>req</w:t>
       </w:r>
@@ -1097,7 +1046,6 @@
         <w:t xml:space="preserve">Why </w:t>
       </w:r>
       <w:proofErr w:type="spellStart"/>
-      <w:proofErr w:type="gramStart"/>
       <w:r>
         <w:rPr>
           <w:b/>
@@ -1106,7 +1054,6 @@
         <w:t>res.json</w:t>
       </w:r>
       <w:proofErr w:type="spellEnd"/>
-      <w:proofErr w:type="gramEnd"/>
       <w:r>
         <w:rPr>
           <w:b/>
@@ -1138,25 +1085,18 @@
     </w:p>
     <w:p>
       <w:proofErr w:type="spellStart"/>
-      <w:proofErr w:type="gramStart"/>
       <w:r>
         <w:t>res.status</w:t>
       </w:r>
       <w:proofErr w:type="spellEnd"/>
-      <w:proofErr w:type="gramEnd"/>
-      <w:r>
-        <w:t>(200</w:t>
-      </w:r>
-      <w:proofErr w:type="gramStart"/>
-      <w:r>
-        <w:t>).</w:t>
+      <w:r>
+        <w:t>(200).</w:t>
       </w:r>
       <w:proofErr w:type="spellStart"/>
       <w:r>
         <w:t>json</w:t>
       </w:r>
       <w:proofErr w:type="spellEnd"/>
-      <w:proofErr w:type="gramEnd"/>
       <w:r>
         <w:t>(</w:t>
       </w:r>
@@ -1257,14 +1197,9 @@
     </w:p>
     <w:p>
       <w:r>
-        <w:t xml:space="preserve">export default function </w:t>
-      </w:r>
-      <w:proofErr w:type="gramStart"/>
-      <w:r>
-        <w:t>handler(</w:t>
-      </w:r>
-      <w:proofErr w:type="spellStart"/>
-      <w:proofErr w:type="gramEnd"/>
+        <w:t>export default function handler(</w:t>
+      </w:r>
+      <w:proofErr w:type="spellStart"/>
       <w:r>
         <w:t>req</w:t>
       </w:r>
@@ -1277,12 +1212,10 @@
         <w:t xml:space="preserve">  if (</w:t>
       </w:r>
       <w:proofErr w:type="spellStart"/>
-      <w:proofErr w:type="gramStart"/>
       <w:r>
         <w:t>req.method</w:t>
       </w:r>
       <w:proofErr w:type="spellEnd"/>
-      <w:proofErr w:type="gramEnd"/>
       <w:r>
         <w:t xml:space="preserve"> === "POST") {</w:t>
       </w:r>
@@ -1291,25 +1224,18 @@
         <w:t xml:space="preserve">    </w:t>
       </w:r>
       <w:proofErr w:type="spellStart"/>
-      <w:proofErr w:type="gramStart"/>
       <w:r>
         <w:t>res.status</w:t>
       </w:r>
       <w:proofErr w:type="spellEnd"/>
-      <w:proofErr w:type="gramEnd"/>
-      <w:r>
-        <w:t>(200</w:t>
-      </w:r>
-      <w:proofErr w:type="gramStart"/>
-      <w:r>
-        <w:t>).</w:t>
+      <w:r>
+        <w:t>(200).</w:t>
       </w:r>
       <w:proofErr w:type="spellStart"/>
       <w:r>
         <w:t>json</w:t>
       </w:r>
       <w:proofErr w:type="spellEnd"/>
-      <w:proofErr w:type="gramEnd"/>
       <w:r>
         <w:t>({</w:t>
       </w:r>
@@ -1318,12 +1244,10 @@
         <w:t xml:space="preserve">      method: </w:t>
       </w:r>
       <w:proofErr w:type="spellStart"/>
-      <w:proofErr w:type="gramStart"/>
       <w:r>
         <w:t>req.method</w:t>
       </w:r>
       <w:proofErr w:type="spellEnd"/>
-      <w:proofErr w:type="gramEnd"/>
       <w:r>
         <w:t>,</w:t>
       </w:r>
@@ -1332,12 +1256,10 @@
         <w:t xml:space="preserve">      body: </w:t>
       </w:r>
       <w:proofErr w:type="spellStart"/>
-      <w:proofErr w:type="gramStart"/>
       <w:r>
         <w:t>req.body</w:t>
       </w:r>
       <w:proofErr w:type="spellEnd"/>
-      <w:proofErr w:type="gramEnd"/>
       <w:r>
         <w:t>,</w:t>
       </w:r>
@@ -1346,12 +1268,10 @@
         <w:t xml:space="preserve">      query: </w:t>
       </w:r>
       <w:proofErr w:type="spellStart"/>
-      <w:proofErr w:type="gramStart"/>
       <w:r>
         <w:t>req.query</w:t>
       </w:r>
       <w:proofErr w:type="spellEnd"/>
-      <w:proofErr w:type="gramEnd"/>
       <w:r>
         <w:t>,</w:t>
       </w:r>
@@ -1361,12 +1281,8 @@
       </w:r>
       <w:r>
         <w:br/>
-      </w:r>
-      <w:proofErr w:type="gramStart"/>
-      <w:r>
         <w:t xml:space="preserve">  }</w:t>
       </w:r>
-      <w:proofErr w:type="gramEnd"/>
       <w:r>
         <w:br/>
         <w:t>}</w:t>
@@ -1522,12 +1438,10 @@
           </w:tcPr>
           <w:p>
             <w:proofErr w:type="spellStart"/>
-            <w:proofErr w:type="gramStart"/>
             <w:r>
               <w:t>req.body</w:t>
             </w:r>
             <w:proofErr w:type="spellEnd"/>
-            <w:proofErr w:type="gramEnd"/>
           </w:p>
         </w:tc>
         <w:tc>
@@ -1561,12 +1475,10 @@
           </w:tcPr>
           <w:p>
             <w:proofErr w:type="spellStart"/>
-            <w:proofErr w:type="gramStart"/>
             <w:r>
               <w:t>req.query</w:t>
             </w:r>
             <w:proofErr w:type="spellEnd"/>
-            <w:proofErr w:type="gramEnd"/>
           </w:p>
         </w:tc>
         <w:tc>
@@ -1600,12 +1512,10 @@
           </w:tcPr>
           <w:p>
             <w:proofErr w:type="spellStart"/>
-            <w:proofErr w:type="gramStart"/>
             <w:r>
               <w:t>req.method</w:t>
             </w:r>
             <w:proofErr w:type="spellEnd"/>
-            <w:proofErr w:type="gramEnd"/>
           </w:p>
         </w:tc>
         <w:tc>
@@ -1657,14 +1567,9 @@
     </w:p>
     <w:p>
       <w:r>
-        <w:t xml:space="preserve">export async function </w:t>
-      </w:r>
-      <w:proofErr w:type="gramStart"/>
-      <w:r>
-        <w:t>POST(</w:t>
-      </w:r>
-      <w:proofErr w:type="spellStart"/>
-      <w:proofErr w:type="gramEnd"/>
+        <w:t>export async function POST(</w:t>
+      </w:r>
+      <w:proofErr w:type="spellStart"/>
       <w:r>
         <w:t>req</w:t>
       </w:r>
@@ -1688,12 +1593,10 @@
         <w:t xml:space="preserve"> body = await </w:t>
       </w:r>
       <w:proofErr w:type="spellStart"/>
-      <w:proofErr w:type="gramStart"/>
       <w:r>
         <w:t>req.json</w:t>
       </w:r>
       <w:proofErr w:type="spellEnd"/>
-      <w:proofErr w:type="gramEnd"/>
       <w:r>
         <w:t>();</w:t>
       </w:r>
@@ -1755,12 +1658,10 @@
         <w:t xml:space="preserve">d specific fields like </w:t>
       </w:r>
       <w:proofErr w:type="spellStart"/>
-      <w:proofErr w:type="gramStart"/>
       <w:r>
         <w:t>req.body</w:t>
       </w:r>
       <w:proofErr w:type="spellEnd"/>
-      <w:proofErr w:type="gramEnd"/>
       <w:r>
         <w:t>.</w:t>
       </w:r>
@@ -1770,15 +1671,7 @@
         <w:t>In older version we used to get body like we did in n</w:t>
       </w:r>
       <w:r>
-        <w:t xml:space="preserve">ode js but in modern it </w:t>
-      </w:r>
-      <w:proofErr w:type="gramStart"/>
-      <w:r>
-        <w:t>look</w:t>
-      </w:r>
-      <w:proofErr w:type="gramEnd"/>
-      <w:r>
-        <w:t xml:space="preserve"> like below</w:t>
+        <w:t>ode js but in modern it look like below</w:t>
       </w:r>
     </w:p>
     <w:p>
@@ -1881,18 +1774,10 @@
         <w:t>The problem with the file making</w:t>
       </w:r>
       <w:r>
-        <w:t xml:space="preserve"> </w:t>
-      </w:r>
-      <w:proofErr w:type="gramStart"/>
-      <w:r>
-        <w:t xml:space="preserve">strategy </w:t>
-      </w:r>
-      <w:r>
-        <w:t xml:space="preserve"> is</w:t>
-      </w:r>
-      <w:proofErr w:type="gramEnd"/>
-      <w:r>
-        <w:t xml:space="preserve"> that </w:t>
+        <w:t xml:space="preserve"> strategy </w:t>
+      </w:r>
+      <w:r>
+        <w:t xml:space="preserve"> is that </w:t>
       </w:r>
       <w:r>
         <w:t xml:space="preserve">if suppose </w:t>
@@ -2005,41 +1890,20 @@
       </w:r>
       <w:proofErr w:type="spellEnd"/>
       <w:r>
+        <w:t xml:space="preserve"> element</w:t>
+      </w:r>
+      <w:r>
+        <w:t>(who knows may be I am wrong here)</w:t>
+      </w:r>
+      <w:r>
         <w:t xml:space="preserve"> </w:t>
       </w:r>
-      <w:proofErr w:type="gramStart"/>
-      <w:r>
-        <w:t>element</w:t>
-      </w:r>
-      <w:r>
-        <w:t>(</w:t>
-      </w:r>
-      <w:proofErr w:type="gramEnd"/>
-      <w:r>
-        <w:t xml:space="preserve">who knows </w:t>
-      </w:r>
-      <w:proofErr w:type="gramStart"/>
-      <w:r>
-        <w:t>may be</w:t>
-      </w:r>
-      <w:proofErr w:type="gramEnd"/>
-      <w:r>
-        <w:t xml:space="preserve"> I am wrong here)</w:t>
-      </w:r>
-      <w:r>
-        <w:t xml:space="preserve"> </w:t>
-      </w:r>
       <w:r>
         <w:t xml:space="preserve">and on state update method we used </w:t>
       </w:r>
       <w:proofErr w:type="spellStart"/>
-      <w:proofErr w:type="gramStart"/>
-      <w:r>
-        <w:t>e.target</w:t>
-      </w:r>
-      <w:proofErr w:type="gramEnd"/>
-      <w:r>
-        <w:t>.innerText</w:t>
+      <w:r>
+        <w:t>e.target.innerText</w:t>
       </w:r>
       <w:proofErr w:type="spellEnd"/>
     </w:p>
@@ -2056,13 +1920,8 @@
         <w:t xml:space="preserve"> we can use </w:t>
       </w:r>
       <w:proofErr w:type="spellStart"/>
-      <w:proofErr w:type="gramStart"/>
-      <w:r>
-        <w:t>e.target</w:t>
-      </w:r>
-      <w:proofErr w:type="gramEnd"/>
-      <w:r>
-        <w:t>,value</w:t>
+      <w:r>
+        <w:t>e.target,value</w:t>
       </w:r>
       <w:proofErr w:type="spellEnd"/>
       <w:r>
@@ -2178,16 +2037,13 @@
         <w:t xml:space="preserve">Shortcut for </w:t>
       </w:r>
       <w:proofErr w:type="spellStart"/>
-      <w:proofErr w:type="gramStart"/>
       <w:r>
         <w:t>margin:auto</w:t>
       </w:r>
       <w:proofErr w:type="spellEnd"/>
-      <w:proofErr w:type="gramEnd"/>
       <w:r>
         <w:t xml:space="preserve"> will be </w:t>
       </w:r>
-      <w:proofErr w:type="gramStart"/>
       <w:r>
         <w:rPr>
           <w:b/>
@@ -2195,7 +2051,6 @@
         </w:rPr>
         <w:t>m:auto</w:t>
       </w:r>
-      <w:proofErr w:type="gramEnd"/>
       <w:r>
         <w:rPr>
           <w:b/>
@@ -2259,18 +2114,10 @@
     </w:p>
     <w:p>
       <w:r>
-        <w:t xml:space="preserve">Suppose you have 50 blogs and you want to show 5 blogs on each </w:t>
-      </w:r>
-      <w:proofErr w:type="gramStart"/>
-      <w:r>
-        <w:t xml:space="preserve">pages </w:t>
-      </w:r>
-      <w:r>
-        <w:t xml:space="preserve"> so</w:t>
-      </w:r>
-      <w:proofErr w:type="gramEnd"/>
-      <w:r>
-        <w:t xml:space="preserve"> 10 pages </w:t>
+        <w:t xml:space="preserve">Suppose you have 50 blogs and you want to show 5 blogs on each pages </w:t>
+      </w:r>
+      <w:r>
+        <w:t xml:space="preserve"> so 10 pages </w:t>
       </w:r>
       <w:r>
         <w:t>will</w:t>
@@ -2281,16 +2128,11 @@
       <w:r>
         <w:t xml:space="preserve">be </w:t>
       </w:r>
-      <w:proofErr w:type="gramStart"/>
       <w:r>
         <w:t xml:space="preserve">formed </w:t>
       </w:r>
       <w:r>
-        <w:t>.</w:t>
-      </w:r>
-      <w:proofErr w:type="gramEnd"/>
-      <w:r>
-        <w:t xml:space="preserve"> In the similar way </w:t>
+        <w:t xml:space="preserve">. In the similar way </w:t>
       </w:r>
       <w:r>
         <w:t xml:space="preserve">pagination can be showed </w:t>
@@ -2407,15 +2249,7 @@
         <w:t xml:space="preserve">that we will not good components </w:t>
       </w:r>
       <w:r>
-        <w:t xml:space="preserve">means you won’t get good packages for doing any </w:t>
-      </w:r>
-      <w:proofErr w:type="gramStart"/>
-      <w:r>
-        <w:t>work(</w:t>
-      </w:r>
-      <w:proofErr w:type="gramEnd"/>
-      <w:r>
-        <w:t>who knows)</w:t>
+        <w:t>means you won’t get good packages for doing any work(who knows)</w:t>
       </w:r>
     </w:p>
     <w:p>
@@ -2444,27 +2278,14 @@
       </w:r>
     </w:p>
     <w:p>
-      <w:proofErr w:type="gramStart"/>
-      <w:r>
-        <w:t>So</w:t>
-      </w:r>
-      <w:proofErr w:type="gramEnd"/>
-      <w:r>
-        <w:t xml:space="preserve"> we run the above command I context of </w:t>
+      <w:r>
+        <w:t xml:space="preserve">So we run the above command I context of </w:t>
       </w:r>
       <w:r>
         <w:t xml:space="preserve">yarn </w:t>
       </w:r>
       <w:r>
-        <w:t xml:space="preserve">by </w:t>
-      </w:r>
-      <w:proofErr w:type="gramStart"/>
-      <w:r>
-        <w:t>using  below</w:t>
-      </w:r>
-      <w:proofErr w:type="gramEnd"/>
-      <w:r>
-        <w:t xml:space="preserve"> command</w:t>
+        <w:t>by using  below command</w:t>
       </w:r>
     </w:p>
     <w:p>
@@ -2552,29 +2373,13 @@
         <w:t xml:space="preserve">Data length </w:t>
       </w:r>
       <w:r>
-        <w:t xml:space="preserve">of the data that to be </w:t>
-      </w:r>
-      <w:proofErr w:type="gramStart"/>
-      <w:r>
-        <w:t>shown</w:t>
-      </w:r>
-      <w:r>
-        <w:t xml:space="preserve"> ,</w:t>
-      </w:r>
-      <w:proofErr w:type="gramEnd"/>
-      <w:r>
-        <w:t xml:space="preserve"> next is the </w:t>
-      </w:r>
-      <w:proofErr w:type="gramStart"/>
-      <w:r>
-        <w:t xml:space="preserve">function  </w:t>
-      </w:r>
-      <w:r>
-        <w:t>that</w:t>
-      </w:r>
-      <w:proofErr w:type="gramEnd"/>
-      <w:r>
-        <w:t xml:space="preserve"> will be called when we scroll and reach the bottom and more data is needed to be loaded.</w:t>
+        <w:t>of the data that to be shown</w:t>
+      </w:r>
+      <w:r>
+        <w:t xml:space="preserve"> , next is the function  </w:t>
+      </w:r>
+      <w:r>
+        <w:t>that will be called when we scroll and reach the bottom and more data is needed to be loaded.</w:t>
       </w:r>
     </w:p>
     <w:p>
@@ -2602,21 +2407,13 @@
         <w:t>w</w:t>
       </w:r>
       <w:r>
-        <w:t xml:space="preserve">n </w:t>
-      </w:r>
-      <w:proofErr w:type="gramStart"/>
-      <w:r>
-        <w:t>function</w:t>
+        <w:t>n function</w:t>
       </w:r>
       <w:r>
         <w:t>al</w:t>
       </w:r>
       <w:r>
-        <w:t>ity(</w:t>
-      </w:r>
-      <w:proofErr w:type="gramEnd"/>
-      <w:r>
-        <w:t>who knows)</w:t>
+        <w:t>ity(who knows)</w:t>
       </w:r>
     </w:p>
     <w:p>
@@ -2698,15 +2495,7 @@
         <w:t xml:space="preserve">it is defined like this </w:t>
       </w:r>
       <w:r>
-        <w:t xml:space="preserve">if we keep single </w:t>
-      </w:r>
-      <w:proofErr w:type="gramStart"/>
-      <w:r>
-        <w:t>item</w:t>
-      </w:r>
-      <w:proofErr w:type="gramEnd"/>
-      <w:r>
-        <w:t xml:space="preserve"> </w:t>
+        <w:t xml:space="preserve">if we keep single item </w:t>
       </w:r>
       <w:r>
         <w:t>we need to see al</w:t>
@@ -2715,31 +2504,22 @@
         <w:t>l</w:t>
       </w:r>
       <w:r>
-        <w:t xml:space="preserve"> </w:t>
-      </w:r>
-      <w:proofErr w:type="gramStart"/>
-      <w:r>
-        <w:t>this thi</w:t>
+        <w:t xml:space="preserve"> this thi</w:t>
       </w:r>
       <w:r>
         <w:t>n</w:t>
       </w:r>
       <w:r>
-        <w:t>gs</w:t>
-      </w:r>
-      <w:proofErr w:type="gramEnd"/>
-      <w:r>
-        <w:t xml:space="preserve"> </w:t>
-      </w:r>
-    </w:p>
-    <w:p>
-      <w:pPr>
-        <w:rPr>
-          <w:b/>
-          <w:bCs/>
-        </w:rPr>
-      </w:pPr>
-      <w:proofErr w:type="gramStart"/>
+        <w:t xml:space="preserve">gs </w:t>
+      </w:r>
+    </w:p>
+    <w:p>
+      <w:pPr>
+        <w:rPr>
+          <w:b/>
+          <w:bCs/>
+        </w:rPr>
+      </w:pPr>
       <w:r>
         <w:rPr>
           <w:b/>
@@ -2747,7 +2527,6 @@
         </w:rPr>
         <w:t>Note:-</w:t>
       </w:r>
-      <w:proofErr w:type="gramEnd"/>
     </w:p>
     <w:p>
       <w:pPr>
@@ -2759,15 +2538,7 @@
         <w:t xml:space="preserve">Sometime it happens </w:t>
       </w:r>
       <w:r>
-        <w:t xml:space="preserve">in react that one component is </w:t>
-      </w:r>
-      <w:proofErr w:type="gramStart"/>
-      <w:r>
-        <w:t>show  two</w:t>
-      </w:r>
-      <w:proofErr w:type="gramEnd"/>
-      <w:r>
-        <w:t xml:space="preserve"> times so reload to remove the bug</w:t>
+        <w:t>in react that one component is show  two times so reload to remove the bug</w:t>
       </w:r>
     </w:p>
     <w:p>
@@ -2783,15 +2554,7 @@
         <w:t xml:space="preserve">except for responsiveness </w:t>
       </w:r>
       <w:r>
-        <w:t xml:space="preserve">we </w:t>
-      </w:r>
-      <w:proofErr w:type="gramStart"/>
-      <w:r>
-        <w:t>will  make</w:t>
-      </w:r>
-      <w:proofErr w:type="gramEnd"/>
-      <w:r>
-        <w:t xml:space="preserve"> our blog responsive and will write media queries </w:t>
+        <w:t xml:space="preserve">we will  make our blog responsive and will write media queries </w:t>
       </w:r>
       <w:r>
         <w:t>how we can we run media que</w:t>
@@ -2817,13 +2580,8 @@
         <w:t xml:space="preserve">the website </w:t>
       </w:r>
       <w:r>
-        <w:t xml:space="preserve">and if you gave </w:t>
-      </w:r>
-      <w:proofErr w:type="gramStart"/>
-      <w:r>
-        <w:t>responsiveness</w:t>
-      </w:r>
-      <w:proofErr w:type="gramEnd"/>
+        <w:t>and if you gave responsiveness</w:t>
+      </w:r>
       <w:r>
         <w:t xml:space="preserve"> it was an addon</w:t>
       </w:r>
@@ -2842,12 +2600,10 @@
         <w:t xml:space="preserve">you can say bit in </w:t>
       </w:r>
       <w:proofErr w:type="spellStart"/>
-      <w:proofErr w:type="gramStart"/>
       <w:r>
         <w:t>todays</w:t>
       </w:r>
       <w:proofErr w:type="spellEnd"/>
-      <w:proofErr w:type="gramEnd"/>
       <w:r>
         <w:t xml:space="preserve"> time </w:t>
       </w:r>
@@ -2924,11 +2680,7 @@
     </w:p>
     <w:p>
       <w:r>
-        <w:t xml:space="preserve">We will </w:t>
-      </w:r>
-      <w:proofErr w:type="gramStart"/>
-      <w:r>
-        <w:t>ho</w:t>
+        <w:t>We will ho</w:t>
       </w:r>
       <w:r>
         <w:t>s</w:t>
@@ -2937,11 +2689,7 @@
         <w:t>t</w:t>
       </w:r>
       <w:r>
-        <w:t>s</w:t>
-      </w:r>
-      <w:proofErr w:type="gramEnd"/>
-      <w:r>
-        <w:t xml:space="preserve"> the web</w:t>
+        <w:t>s the web</w:t>
       </w:r>
       <w:r>
         <w:t>s</w:t>
@@ -3068,15 +2816,7 @@
     </w:p>
     <w:p>
       <w:r>
-        <w:t xml:space="preserve">IN digital ocean we make new </w:t>
-      </w:r>
-      <w:proofErr w:type="gramStart"/>
-      <w:r>
-        <w:t>user(</w:t>
-      </w:r>
-      <w:proofErr w:type="gramEnd"/>
-      <w:r>
-        <w:t xml:space="preserve">who knows) </w:t>
+        <w:t xml:space="preserve">IN digital ocean we make new user(who knows) </w:t>
       </w:r>
     </w:p>
     <w:p>
@@ -3114,26 +2854,13 @@
       <w:r>
         <w:t xml:space="preserve">process will be </w:t>
       </w:r>
-      <w:proofErr w:type="gramStart"/>
-      <w:r>
-        <w:t>build</w:t>
-      </w:r>
-      <w:proofErr w:type="gramEnd"/>
-      <w:r>
-        <w:t xml:space="preserve"> there </w:t>
-      </w:r>
-    </w:p>
-    <w:p>
-      <w:r>
-        <w:t xml:space="preserve">It will ask you to make database in </w:t>
-      </w:r>
-      <w:proofErr w:type="gramStart"/>
-      <w:r>
-        <w:t>there</w:t>
-      </w:r>
-      <w:proofErr w:type="gramEnd"/>
-      <w:r>
-        <w:t xml:space="preserve"> services.</w:t>
+      <w:r>
+        <w:t xml:space="preserve">build there </w:t>
+      </w:r>
+    </w:p>
+    <w:p>
+      <w:r>
+        <w:t>It will ask you to make database in there services.</w:t>
       </w:r>
       <w:r>
         <w:t xml:space="preserve"> (who knows)</w:t>
@@ -3184,14 +2911,9 @@
       </w:r>
       <w:proofErr w:type="spellEnd"/>
       <w:r>
-        <w:t xml:space="preserve"> it will be </w:t>
-      </w:r>
-      <w:proofErr w:type="gramStart"/>
-      <w:r>
-        <w:t>good(</w:t>
-      </w:r>
-      <w:proofErr w:type="spellStart"/>
-      <w:proofErr w:type="gramEnd"/>
+        <w:t xml:space="preserve"> it will be good(</w:t>
+      </w:r>
+      <w:proofErr w:type="spellStart"/>
       <w:r>
         <w:t>wjp</w:t>
       </w:r>
@@ -3208,101 +2930,73 @@
           <w:color w:val="EE0000"/>
         </w:rPr>
       </w:pPr>
-      <w:proofErr w:type="gramStart"/>
       <w:r>
         <w:rPr>
           <w:b/>
           <w:bCs/>
           <w:color w:val="EE0000"/>
         </w:rPr>
-        <w:t>‘ can</w:t>
-      </w:r>
-      <w:proofErr w:type="gramEnd"/>
+        <w:t xml:space="preserve">‘ can create </w:t>
+      </w:r>
       <w:r>
         <w:rPr>
           <w:b/>
           <w:bCs/>
           <w:color w:val="EE0000"/>
         </w:rPr>
-        <w:t xml:space="preserve"> create </w:t>
-      </w:r>
+        <w:t xml:space="preserve">error in </w:t>
+      </w:r>
+      <w:proofErr w:type="spellStart"/>
       <w:r>
         <w:rPr>
           <w:b/>
           <w:bCs/>
           <w:color w:val="EE0000"/>
         </w:rPr>
-        <w:t xml:space="preserve">error in </w:t>
-      </w:r>
-      <w:proofErr w:type="spellStart"/>
+        <w:t>js</w:t>
+      </w:r>
       <w:r>
         <w:rPr>
           <w:b/>
           <w:bCs/>
           <w:color w:val="EE0000"/>
         </w:rPr>
-        <w:t>js</w:t>
-      </w:r>
+        <w:t>x</w:t>
+      </w:r>
+      <w:proofErr w:type="spellEnd"/>
       <w:r>
         <w:rPr>
           <w:b/>
           <w:bCs/>
           <w:color w:val="EE0000"/>
         </w:rPr>
-        <w:t>x</w:t>
-      </w:r>
-      <w:proofErr w:type="spellEnd"/>
+        <w:t xml:space="preserve"> in </w:t>
+      </w:r>
+      <w:proofErr w:type="spellStart"/>
       <w:r>
         <w:rPr>
           <w:b/>
           <w:bCs/>
           <w:color w:val="EE0000"/>
         </w:rPr>
-        <w:t xml:space="preserve"> in </w:t>
-      </w:r>
-      <w:proofErr w:type="spellStart"/>
+        <w:t>Nextjs</w:t>
+      </w:r>
+      <w:proofErr w:type="spellEnd"/>
       <w:r>
         <w:rPr>
           <w:b/>
           <w:bCs/>
           <w:color w:val="EE0000"/>
         </w:rPr>
-        <w:t>Nextjs</w:t>
-      </w:r>
-      <w:proofErr w:type="spellEnd"/>
+        <w:t xml:space="preserve"> or maybe in React.</w:t>
+      </w:r>
       <w:r>
         <w:rPr>
           <w:b/>
           <w:bCs/>
           <w:color w:val="EE0000"/>
         </w:rPr>
-        <w:t xml:space="preserve"> or maybe in </w:t>
-      </w:r>
-      <w:proofErr w:type="gramStart"/>
-      <w:r>
-        <w:rPr>
-          <w:b/>
-          <w:bCs/>
-          <w:color w:val="EE0000"/>
-        </w:rPr>
-        <w:t>React.</w:t>
-      </w:r>
-      <w:r>
-        <w:rPr>
-          <w:b/>
-          <w:bCs/>
-          <w:color w:val="EE0000"/>
-        </w:rPr>
-        <w:t>(</w:t>
-      </w:r>
-      <w:proofErr w:type="gramEnd"/>
-      <w:r>
-        <w:rPr>
-          <w:b/>
-          <w:bCs/>
-          <w:color w:val="EE0000"/>
-        </w:rPr>
-        <w:t>maybe it is an outdated problem)</w:t>
+        <w:t>(maybe it is an outdated problem)</w:t>
       </w:r>
     </w:p>
     <w:p>
@@ -3327,12 +3021,10 @@
         <w:t xml:space="preserve">you can make it like that and if it </w:t>
       </w:r>
       <w:proofErr w:type="spellStart"/>
-      <w:proofErr w:type="gramStart"/>
       <w:r>
         <w:t>become</w:t>
       </w:r>
       <w:proofErr w:type="spellEnd"/>
-      <w:proofErr w:type="gramEnd"/>
       <w:r>
         <w:t xml:space="preserve"> profitable then you can scale it (who knows) </w:t>
       </w:r>
@@ -3341,7 +3033,6 @@
       <w:r>
         <w:t xml:space="preserve">Now as you commit then </w:t>
       </w:r>
-      <w:proofErr w:type="gramStart"/>
       <w:r>
         <w:t>Digital</w:t>
       </w:r>
@@ -3349,25 +3040,13 @@
         <w:t xml:space="preserve"> </w:t>
       </w:r>
       <w:r>
-        <w:t>ocean</w:t>
-      </w:r>
-      <w:proofErr w:type="gramEnd"/>
-      <w:r>
-        <w:t xml:space="preserve"> will build it</w:t>
-      </w:r>
-      <w:r>
-        <w:t xml:space="preserve"> automatically for </w:t>
-      </w:r>
-      <w:proofErr w:type="gramStart"/>
-      <w:r>
-        <w:t>you.</w:t>
-      </w:r>
-      <w:r>
-        <w:t>(</w:t>
-      </w:r>
-      <w:proofErr w:type="gramEnd"/>
-      <w:r>
-        <w:t>maybe if auto</w:t>
+        <w:t>ocean will build it</w:t>
+      </w:r>
+      <w:r>
+        <w:t xml:space="preserve"> automatically for you.</w:t>
+      </w:r>
+      <w:r>
+        <w:t>(maybe if auto</w:t>
       </w:r>
       <w:r>
         <w:t xml:space="preserve"> </w:t>
@@ -3376,15 +3055,7 @@
         <w:t xml:space="preserve">deploy option was selected </w:t>
       </w:r>
       <w:r>
-        <w:t xml:space="preserve">in the </w:t>
-      </w:r>
-      <w:proofErr w:type="gramStart"/>
-      <w:r>
-        <w:t>setting(</w:t>
-      </w:r>
-      <w:proofErr w:type="gramEnd"/>
-      <w:r>
-        <w:t>who knows)</w:t>
+        <w:t>in the setting(who knows)</w:t>
       </w:r>
       <w:r>
         <w:t>)</w:t>
@@ -3422,18 +3093,10 @@
         <w:t xml:space="preserve">here (maybe </w:t>
       </w:r>
       <w:r>
-        <w:t xml:space="preserve">very large app don’t work </w:t>
-      </w:r>
-      <w:proofErr w:type="gramStart"/>
-      <w:r>
-        <w:t>properly</w:t>
-      </w:r>
-      <w:r>
-        <w:t>(</w:t>
-      </w:r>
-      <w:proofErr w:type="gramEnd"/>
-      <w:r>
-        <w:t>who knows)</w:t>
+        <w:t>very large app don’t work properly</w:t>
+      </w:r>
+      <w:r>
+        <w:t>(who knows)</w:t>
       </w:r>
       <w:r>
         <w:t>)</w:t>
@@ -3474,18 +3137,10 @@
         <w:t xml:space="preserve">Now we will see </w:t>
       </w:r>
       <w:r>
-        <w:t xml:space="preserve">how Google analytics and search </w:t>
-      </w:r>
-      <w:proofErr w:type="gramStart"/>
-      <w:r>
-        <w:t>console</w:t>
-      </w:r>
-      <w:r>
-        <w:t>(</w:t>
-      </w:r>
-      <w:proofErr w:type="gramEnd"/>
-      <w:r>
-        <w:t xml:space="preserve">who </w:t>
+        <w:t>how Google analytics and search console</w:t>
+      </w:r>
+      <w:r>
+        <w:t xml:space="preserve">(who </w:t>
       </w:r>
       <w:proofErr w:type="spellStart"/>
       <w:r>
@@ -3652,21 +3307,13 @@
         <w:t xml:space="preserve">ck </w:t>
       </w:r>
       <w:r>
-        <w:t xml:space="preserve">which is also called </w:t>
-      </w:r>
-      <w:proofErr w:type="gramStart"/>
+        <w:t>which is also called S</w:t>
+      </w:r>
       <w:r>
         <w:t>S</w:t>
       </w:r>
       <w:r>
-        <w:t>S</w:t>
-      </w:r>
-      <w:r>
-        <w:t>LV(</w:t>
-      </w:r>
-      <w:proofErr w:type="gramEnd"/>
-      <w:r>
-        <w:t>who knows)</w:t>
+        <w:t>LV(who knows)</w:t>
       </w:r>
       <w:r>
         <w:t xml:space="preserve"> and </w:t>
@@ -3713,13 +3360,8 @@
       <w:r>
         <w:t xml:space="preserve">of the application. </w:t>
       </w:r>
-      <w:proofErr w:type="gramStart"/>
-      <w:r>
-        <w:t>So</w:t>
-      </w:r>
-      <w:proofErr w:type="gramEnd"/>
-      <w:r>
-        <w:t xml:space="preserve"> if we want that the domain we have need to be pointe</w:t>
+      <w:r>
+        <w:t>So if we want that the domain we have need to be pointe</w:t>
       </w:r>
       <w:r>
         <w:t>d</w:t>
@@ -3750,18 +3392,10 @@
     </w:p>
     <w:p>
       <w:r>
-        <w:t xml:space="preserve">Of you chose the former then you </w:t>
-      </w:r>
-      <w:proofErr w:type="gramStart"/>
-      <w:r>
-        <w:t xml:space="preserve">will  </w:t>
-      </w:r>
-      <w:r>
-        <w:t>see</w:t>
-      </w:r>
-      <w:proofErr w:type="gramEnd"/>
-      <w:r>
-        <w:t xml:space="preserve"> that from the dashboard </w:t>
+        <w:t xml:space="preserve">Of you chose the former then you will  </w:t>
+      </w:r>
+      <w:r>
+        <w:t xml:space="preserve">see that from the dashboard </w:t>
       </w:r>
       <w:r>
         <w:t xml:space="preserve">that how things are happening </w:t>
@@ -3770,26 +3404,10 @@
         <w:t xml:space="preserve">and if you chose later </w:t>
       </w:r>
       <w:r>
-        <w:t xml:space="preserve">then you need to point it to a Digital </w:t>
-      </w:r>
-      <w:proofErr w:type="gramStart"/>
-      <w:r>
-        <w:t>ocean(</w:t>
-      </w:r>
-      <w:proofErr w:type="gramEnd"/>
-      <w:r>
-        <w:t>who knows)</w:t>
-      </w:r>
-      <w:r>
-        <w:t xml:space="preserve">. By former we bring the domain in the digital </w:t>
-      </w:r>
-      <w:proofErr w:type="gramStart"/>
-      <w:r>
-        <w:t>ocean(</w:t>
-      </w:r>
-      <w:proofErr w:type="gramEnd"/>
-      <w:r>
-        <w:t>who knows)</w:t>
+        <w:t>then you need to point it to a Digital ocean(who knows)</w:t>
+      </w:r>
+      <w:r>
+        <w:t>. By former we bring the domain in the digital ocean(who knows)</w:t>
       </w:r>
       <w:r>
         <w:t xml:space="preserve">. </w:t>
@@ -3835,13 +3453,8 @@
       </w:r>
     </w:p>
     <w:p>
-      <w:proofErr w:type="gramStart"/>
-      <w:r>
-        <w:t>So</w:t>
-      </w:r>
-      <w:proofErr w:type="gramEnd"/>
-      <w:r>
-        <w:t xml:space="preserve"> we went to Google search console</w:t>
+      <w:r>
+        <w:t>So we went to Google search console</w:t>
       </w:r>
       <w:r>
         <w:t xml:space="preserve"> so we add a property there </w:t>
@@ -3916,15 +3529,7 @@
         <w:t xml:space="preserve">omain </w:t>
       </w:r>
       <w:r>
-        <w:t xml:space="preserve">ad then you need to verify it so it </w:t>
-      </w:r>
-      <w:proofErr w:type="gramStart"/>
-      <w:r>
-        <w:t>give</w:t>
-      </w:r>
-      <w:proofErr w:type="gramEnd"/>
-      <w:r>
-        <w:t xml:space="preserve"> us some text which we will paste in the </w:t>
+        <w:t xml:space="preserve">ad then you need to verify it so it give us some text which we will paste in the </w:t>
       </w:r>
       <w:r>
         <w:t xml:space="preserve">DNS records to give the proof for ownership of domain. </w:t>
@@ -4018,11 +3623,7 @@
         <w:t xml:space="preserve"> and how to integrate </w:t>
       </w:r>
       <w:r>
-        <w:t xml:space="preserve">payment gateway to the </w:t>
-      </w:r>
-      <w:proofErr w:type="gramStart"/>
-      <w:r>
-        <w:t>websi</w:t>
+        <w:t>payment gateway to the websi</w:t>
       </w:r>
       <w:r>
         <w:t>t</w:t>
@@ -4033,23 +3634,14 @@
       <w:r>
         <w:t>.</w:t>
       </w:r>
-      <w:proofErr w:type="gramEnd"/>
       <w:r>
         <w:t xml:space="preserve"> How orders will come </w:t>
       </w:r>
       <w:r>
-        <w:t xml:space="preserve">and how admin panel will be </w:t>
-      </w:r>
-      <w:proofErr w:type="gramStart"/>
-      <w:r>
-        <w:t xml:space="preserve">made </w:t>
-      </w:r>
-      <w:r>
-        <w:t>.</w:t>
-      </w:r>
-      <w:proofErr w:type="gramEnd"/>
-      <w:r>
-        <w:t xml:space="preserve"> F</w:t>
+        <w:t xml:space="preserve">and how admin panel will be made </w:t>
+      </w:r>
+      <w:r>
+        <w:t>. F</w:t>
       </w:r>
       <w:r>
         <w:t>r</w:t>
@@ -4370,18 +3962,10 @@
         <w:t xml:space="preserve">Like Bootstrap Tailwind also have </w:t>
       </w:r>
       <w:r>
-        <w:t xml:space="preserve">predefined </w:t>
-      </w:r>
-      <w:proofErr w:type="gramStart"/>
-      <w:r>
-        <w:t xml:space="preserve">class </w:t>
-      </w:r>
-      <w:r>
-        <w:t>.So</w:t>
-      </w:r>
-      <w:proofErr w:type="gramEnd"/>
-      <w:r>
-        <w:t xml:space="preserve"> we have tailwind css is installed </w:t>
+        <w:t xml:space="preserve">predefined class </w:t>
+      </w:r>
+      <w:r>
+        <w:t xml:space="preserve">.So we have tailwind css is installed </w:t>
       </w:r>
       <w:r>
         <w:t>and we can use our utility class</w:t>
@@ -4489,15 +4073,7 @@
         <w:t xml:space="preserve">There are some pages which you will find in almost all Ecommerce website that is </w:t>
       </w:r>
       <w:r>
-        <w:t xml:space="preserve">Product </w:t>
-      </w:r>
-      <w:proofErr w:type="gramStart"/>
-      <w:r>
-        <w:t>page ,</w:t>
-      </w:r>
-      <w:proofErr w:type="gramEnd"/>
-      <w:r>
-        <w:t xml:space="preserve"> Home page</w:t>
+        <w:t>Product page , Home page</w:t>
       </w:r>
       <w:r>
         <w:t>, Checkout page</w:t>
@@ -4509,160 +4085,136 @@
         <w:t>n</w:t>
       </w:r>
       <w:r>
+        <w:t xml:space="preserve"> order</w:t>
+      </w:r>
+      <w:r>
+        <w:t xml:space="preserve"> , login and </w:t>
+      </w:r>
+      <w:proofErr w:type="spellStart"/>
+      <w:r>
+        <w:t>signUp</w:t>
+      </w:r>
+      <w:proofErr w:type="spellEnd"/>
+      <w:r>
+        <w:t xml:space="preserve">. We will create their blank slate here </w:t>
+      </w:r>
+      <w:r>
+        <w:t xml:space="preserve">and then we will start </w:t>
+      </w:r>
+      <w:proofErr w:type="spellStart"/>
+      <w:r>
+        <w:t>c</w:t>
+      </w:r>
+      <w:r>
+        <w:t>odeswear</w:t>
+      </w:r>
+      <w:proofErr w:type="spellEnd"/>
+      <w:r>
+        <w:t xml:space="preserve"> development </w:t>
+      </w:r>
+    </w:p>
+    <w:p>
+      <w:r>
+        <w:t xml:space="preserve">Whatever you </w:t>
+      </w:r>
+      <w:r>
+        <w:t xml:space="preserve">by [slug] is actually dynamic </w:t>
+      </w:r>
+      <w:r>
+        <w:t xml:space="preserve">page </w:t>
+      </w:r>
+      <w:r>
+        <w:t xml:space="preserve">routes </w:t>
+      </w:r>
+    </w:p>
+    <w:p>
+      <w:r>
+        <w:t>There are many thin</w:t>
+      </w:r>
+      <w:r>
+        <w:t>g</w:t>
+      </w:r>
+      <w:r>
+        <w:t xml:space="preserve">s which we think we need to o on the spot like </w:t>
+      </w:r>
+      <w:r>
+        <w:t xml:space="preserve">Forget Password </w:t>
+      </w:r>
+    </w:p>
+    <w:p>
+      <w:r>
+        <w:t>You can even launch this e</w:t>
+      </w:r>
+      <w:r>
+        <w:t>c</w:t>
+      </w:r>
+      <w:r>
+        <w:t>om</w:t>
+      </w:r>
+      <w:r>
+        <w:t>m</w:t>
+      </w:r>
+      <w:r>
+        <w:t xml:space="preserve">erce site </w:t>
+      </w:r>
+    </w:p>
+    <w:p>
+      <w:r>
+        <w:t>Navbar and footer are important for our website and it will be present in all of the pages</w:t>
+      </w:r>
+    </w:p>
+    <w:p>
+      <w:r>
+        <w:t xml:space="preserve">We will use app for that purposes(maybe </w:t>
+      </w:r>
+      <w:proofErr w:type="spellStart"/>
+      <w:r>
+        <w:t>ol</w:t>
+      </w:r>
+      <w:proofErr w:type="spellEnd"/>
+      <w:r>
+        <w:t xml:space="preserve"> version of </w:t>
+      </w:r>
+      <w:proofErr w:type="spellStart"/>
+      <w:r>
+        <w:t>layout.jsx</w:t>
+      </w:r>
+      <w:proofErr w:type="spellEnd"/>
+      <w:r>
+        <w:t>)</w:t>
+      </w:r>
+    </w:p>
+    <w:p>
+      <w:r>
+        <w:t xml:space="preserve">Now there is site that is </w:t>
+      </w:r>
+      <w:proofErr w:type="spellStart"/>
+      <w:r>
+        <w:t>Tailblocks</w:t>
+      </w:r>
+      <w:proofErr w:type="spellEnd"/>
+      <w:r>
+        <w:t xml:space="preserve"> that will give you </w:t>
+      </w:r>
+      <w:proofErr w:type="spellStart"/>
+      <w:r>
+        <w:t>tailblocks</w:t>
+      </w:r>
+      <w:proofErr w:type="spellEnd"/>
+      <w:r>
         <w:t xml:space="preserve"> </w:t>
       </w:r>
-      <w:proofErr w:type="gramStart"/>
-      <w:r>
-        <w:t>order</w:t>
-      </w:r>
-      <w:r>
-        <w:t xml:space="preserve"> ,</w:t>
-      </w:r>
-      <w:proofErr w:type="gramEnd"/>
-      <w:r>
-        <w:t xml:space="preserve"> login and </w:t>
-      </w:r>
-      <w:proofErr w:type="spellStart"/>
-      <w:r>
-        <w:t>signUp</w:t>
-      </w:r>
-      <w:proofErr w:type="spellEnd"/>
-      <w:r>
-        <w:t xml:space="preserve">. We will create their blank slate here </w:t>
-      </w:r>
-      <w:r>
-        <w:t xml:space="preserve">and then we will start </w:t>
-      </w:r>
-      <w:proofErr w:type="spellStart"/>
-      <w:r>
-        <w:t>c</w:t>
-      </w:r>
-      <w:r>
-        <w:t>odeswear</w:t>
-      </w:r>
-      <w:proofErr w:type="spellEnd"/>
-      <w:r>
-        <w:t xml:space="preserve"> development </w:t>
-      </w:r>
-    </w:p>
-    <w:p>
-      <w:r>
-        <w:t xml:space="preserve">Whatever you </w:t>
-      </w:r>
-      <w:r>
-        <w:t xml:space="preserve">by [slug] is actually dynamic </w:t>
-      </w:r>
-      <w:r>
-        <w:t xml:space="preserve">page </w:t>
-      </w:r>
-      <w:r>
-        <w:t xml:space="preserve">routes </w:t>
-      </w:r>
-    </w:p>
-    <w:p>
-      <w:r>
-        <w:t>There are many thin</w:t>
-      </w:r>
-      <w:r>
-        <w:t>g</w:t>
-      </w:r>
-      <w:r>
-        <w:t xml:space="preserve">s which we think we need to o on the spot like </w:t>
-      </w:r>
-      <w:r>
-        <w:t xml:space="preserve">Forget Password </w:t>
-      </w:r>
-    </w:p>
-    <w:p>
-      <w:r>
-        <w:t>You can even launch this e</w:t>
-      </w:r>
-      <w:r>
-        <w:t>c</w:t>
-      </w:r>
-      <w:r>
-        <w:t>om</w:t>
-      </w:r>
-      <w:r>
-        <w:t>m</w:t>
-      </w:r>
-      <w:r>
-        <w:t xml:space="preserve">erce site </w:t>
-      </w:r>
-    </w:p>
-    <w:p>
-      <w:r>
-        <w:t>Navbar and footer are important for our website and it will be present in all of the pages</w:t>
-      </w:r>
-    </w:p>
-    <w:p>
-      <w:r>
-        <w:t xml:space="preserve">We will use app for that </w:t>
-      </w:r>
-      <w:proofErr w:type="gramStart"/>
-      <w:r>
-        <w:t>purposes(</w:t>
-      </w:r>
-      <w:proofErr w:type="gramEnd"/>
-      <w:r>
-        <w:t xml:space="preserve">maybe </w:t>
-      </w:r>
-      <w:proofErr w:type="spellStart"/>
-      <w:r>
-        <w:t>ol</w:t>
-      </w:r>
-      <w:proofErr w:type="spellEnd"/>
-      <w:r>
-        <w:t xml:space="preserve"> version of </w:t>
-      </w:r>
-      <w:proofErr w:type="spellStart"/>
-      <w:r>
-        <w:t>layout.jsx</w:t>
-      </w:r>
-      <w:proofErr w:type="spellEnd"/>
-      <w:r>
-        <w:t>)</w:t>
-      </w:r>
-    </w:p>
-    <w:p>
-      <w:r>
-        <w:t xml:space="preserve">Now there is site that is </w:t>
-      </w:r>
-      <w:proofErr w:type="spellStart"/>
-      <w:r>
-        <w:t>Tailblocks</w:t>
-      </w:r>
-      <w:proofErr w:type="spellEnd"/>
-      <w:r>
-        <w:t xml:space="preserve"> that will give you </w:t>
-      </w:r>
-      <w:proofErr w:type="spellStart"/>
-      <w:r>
-        <w:t>tailblocks</w:t>
-      </w:r>
-      <w:proofErr w:type="spellEnd"/>
+      <w:r>
+        <w:t xml:space="preserve">snippet </w:t>
+      </w:r>
+      <w:r>
+        <w:t xml:space="preserve">here you get minimalistic design </w:t>
+      </w:r>
       <w:r>
         <w:t xml:space="preserve"> </w:t>
       </w:r>
       <w:r>
-        <w:t xml:space="preserve">snippet </w:t>
-      </w:r>
-      <w:r>
-        <w:t xml:space="preserve">here you get minimalistic </w:t>
-      </w:r>
-      <w:proofErr w:type="gramStart"/>
-      <w:r>
-        <w:t xml:space="preserve">design </w:t>
-      </w:r>
-      <w:r>
-        <w:t xml:space="preserve"> </w:t>
-      </w:r>
-      <w:r>
-        <w:t>Here</w:t>
-      </w:r>
-      <w:proofErr w:type="gramEnd"/>
-      <w:r>
-        <w:t xml:space="preserve"> you get </w:t>
+        <w:t xml:space="preserve">Here you get </w:t>
       </w:r>
       <w:proofErr w:type="spellStart"/>
       <w:r>
@@ -4983,46 +4535,14 @@
           <w:b/>
           <w:bCs/>
         </w:rPr>
-        <w:t xml:space="preserve"> </w:t>
-      </w:r>
-      <w:proofErr w:type="gramStart"/>
-      <w:r>
-        <w:rPr>
-          <w:b/>
-          <w:bCs/>
-        </w:rPr>
-        <w:t>and(</w:t>
-      </w:r>
-      <w:proofErr w:type="gramEnd"/>
-      <w:r>
-        <w:rPr>
-          <w:b/>
-          <w:bCs/>
-        </w:rPr>
-        <w:t xml:space="preserve">we try there should be equivalent space between </w:t>
-      </w:r>
-      <w:proofErr w:type="gramStart"/>
-      <w:r>
-        <w:rPr>
-          <w:b/>
-          <w:bCs/>
-        </w:rPr>
-        <w:t>them)</w:t>
-      </w:r>
-      <w:r>
-        <w:rPr>
-          <w:b/>
-          <w:bCs/>
-        </w:rPr>
-        <w:t>(</w:t>
-      </w:r>
-      <w:proofErr w:type="gramEnd"/>
-      <w:r>
-        <w:rPr>
-          <w:b/>
-          <w:bCs/>
-        </w:rPr>
-        <w:t>who knows)</w:t>
+        <w:t xml:space="preserve"> and(we try there should be equivalent space between them)</w:t>
+      </w:r>
+      <w:r>
+        <w:rPr>
+          <w:b/>
+          <w:bCs/>
+        </w:rPr>
+        <w:t>(who knows)</w:t>
       </w:r>
     </w:p>
     <w:p>
@@ -5039,7 +4559,6 @@
         <w:t xml:space="preserve"> in Tailwind by </w:t>
       </w:r>
       <w:proofErr w:type="spellStart"/>
-      <w:proofErr w:type="gramStart"/>
       <w:r>
         <w:rPr>
           <w:b/>
@@ -5055,7 +4574,6 @@
         <w:t>property</w:t>
       </w:r>
       <w:proofErr w:type="spellEnd"/>
-      <w:proofErr w:type="gramEnd"/>
       <w:r>
         <w:rPr>
           <w:b/>
@@ -5188,18 +4706,13 @@
     </w:p>
     <w:p>
       <w:r>
-        <w:t xml:space="preserve">import </w:t>
-      </w:r>
-      <w:proofErr w:type="gramStart"/>
-      <w:r>
-        <w:t xml:space="preserve">{ </w:t>
+        <w:t xml:space="preserve">import { </w:t>
       </w:r>
       <w:proofErr w:type="spellStart"/>
       <w:r>
         <w:t>AiOutlineShoppingCart</w:t>
       </w:r>
       <w:proofErr w:type="spellEnd"/>
-      <w:proofErr w:type="gramEnd"/>
       <w:r>
         <w:t xml:space="preserve"> } from "react-icons/ai";</w:t>
       </w:r>
@@ -5436,14 +4949,9 @@
       </w:r>
       <w:proofErr w:type="spellStart"/>
       <w:r>
-        <w:t>overflow-</w:t>
-      </w:r>
-      <w:proofErr w:type="gramStart"/>
-      <w:r>
-        <w:t>x:hidden</w:t>
-      </w:r>
-      <w:proofErr w:type="spellEnd"/>
-      <w:proofErr w:type="gramEnd"/>
+        <w:t>overflow-x:hidden</w:t>
+      </w:r>
+      <w:proofErr w:type="spellEnd"/>
       <w:r>
         <w:t xml:space="preserve"> you c</w:t>
       </w:r>
@@ -5580,15 +5088,7 @@
         <w:t xml:space="preserve">it is just a request and js will update cart accordingly </w:t>
       </w:r>
       <w:r>
-        <w:t xml:space="preserve">and there is no guarantee </w:t>
-      </w:r>
-      <w:proofErr w:type="gramStart"/>
-      <w:r>
-        <w:t>when  it</w:t>
-      </w:r>
-      <w:proofErr w:type="gramEnd"/>
-      <w:r>
-        <w:t xml:space="preserve"> will be updated so believe it that </w:t>
+        <w:t xml:space="preserve">and there is no guarantee when  it will be updated so believe it that </w:t>
       </w:r>
       <w:r>
         <w:t>car</w:t>
@@ -5609,12 +5109,10 @@
         <w:t xml:space="preserve"> request </w:t>
       </w:r>
       <w:proofErr w:type="spellStart"/>
-      <w:proofErr w:type="gramStart"/>
       <w:r>
         <w:t>its</w:t>
       </w:r>
       <w:proofErr w:type="spellEnd"/>
-      <w:proofErr w:type="gramEnd"/>
       <w:r>
         <w:t xml:space="preserve"> not an order</w:t>
       </w:r>
@@ -5631,15 +5129,7 @@
         <w:t xml:space="preserve">accordingly </w:t>
       </w:r>
       <w:r>
-        <w:t xml:space="preserve">and it will take time but it </w:t>
-      </w:r>
-      <w:proofErr w:type="gramStart"/>
-      <w:r>
-        <w:t>take</w:t>
-      </w:r>
-      <w:proofErr w:type="gramEnd"/>
-      <w:r>
-        <w:t xml:space="preserve"> time </w:t>
+        <w:t xml:space="preserve">and it will take time but it take time </w:t>
       </w:r>
       <w:r>
         <w:t xml:space="preserve">by time we mean in millisecond </w:t>
@@ -5864,18 +5354,10 @@
         <w:t xml:space="preserve">and how did we confirm </w:t>
       </w:r>
       <w:r>
-        <w:t xml:space="preserve">the order </w:t>
-      </w:r>
-      <w:proofErr w:type="gramStart"/>
-      <w:r>
-        <w:t>there</w:t>
-      </w:r>
-      <w:r>
-        <w:t>(</w:t>
-      </w:r>
-      <w:proofErr w:type="gramEnd"/>
-      <w:r>
-        <w:t>who knows)</w:t>
+        <w:t>the order there</w:t>
+      </w:r>
+      <w:r>
+        <w:t>(who knows)</w:t>
       </w:r>
       <w:r>
         <w:t>.</w:t>
@@ -5888,7 +5370,6 @@
           <w:bCs/>
         </w:rPr>
       </w:pPr>
-      <w:proofErr w:type="gramStart"/>
       <w:r>
         <w:rPr>
           <w:b/>
@@ -5896,7 +5377,6 @@
         </w:rPr>
         <w:t>Note:-</w:t>
       </w:r>
-      <w:proofErr w:type="gramEnd"/>
     </w:p>
     <w:p>
       <w:pPr>
@@ -5935,13 +5415,8 @@
         <w:t xml:space="preserve"> </w:t>
       </w:r>
       <w:r>
-        <w:t xml:space="preserve">(who </w:t>
-      </w:r>
-      <w:proofErr w:type="gramStart"/>
-      <w:r>
-        <w:t>knows )</w:t>
-      </w:r>
-      <w:proofErr w:type="gramEnd"/>
+        <w:t>(who knows )</w:t>
+      </w:r>
       <w:r>
         <w:t xml:space="preserve"> it will help js to connect to </w:t>
       </w:r>
@@ -5956,13 +5431,8 @@
       <w:r>
         <w:t xml:space="preserve">and we can use its </w:t>
       </w:r>
-      <w:proofErr w:type="gramStart"/>
-      <w:r>
-        <w:t>built in</w:t>
-      </w:r>
-      <w:proofErr w:type="gramEnd"/>
-      <w:r>
-        <w:t xml:space="preserve"> functionality </w:t>
+      <w:r>
+        <w:t xml:space="preserve">built in functionality </w:t>
       </w:r>
       <w:r>
         <w:t xml:space="preserve">you don’t have to read and write and update to the </w:t>
@@ -5982,17 +5452,12 @@
         <w:t xml:space="preserve">the complex we do for it in </w:t>
       </w:r>
       <w:proofErr w:type="spellStart"/>
-      <w:proofErr w:type="gramStart"/>
       <w:r>
         <w:t>mongodb</w:t>
       </w:r>
       <w:proofErr w:type="spellEnd"/>
       <w:r>
-        <w:t>(</w:t>
-      </w:r>
-      <w:proofErr w:type="gramEnd"/>
-      <w:r>
-        <w:t>who knows))</w:t>
+        <w:t>(who knows))</w:t>
       </w:r>
       <w:r>
         <w:t xml:space="preserve">. </w:t>
@@ -6023,34 +5488,13 @@
     <w:p>
       <w:r>
         <w:lastRenderedPageBreak/>
-        <w:t xml:space="preserve">If we make timestamp property (who </w:t>
-      </w:r>
-      <w:proofErr w:type="gramStart"/>
-      <w:r>
-        <w:t>knows)true</w:t>
-      </w:r>
-      <w:proofErr w:type="gramEnd"/>
-      <w:r>
-        <w:t xml:space="preserve"> it automatically </w:t>
-      </w:r>
-      <w:proofErr w:type="gramStart"/>
-      <w:r>
-        <w:t>create</w:t>
-      </w:r>
-      <w:proofErr w:type="gramEnd"/>
-      <w:r>
-        <w:t xml:space="preserve"> for us</w:t>
-      </w:r>
-      <w:r>
-        <w:t xml:space="preserve">, </w:t>
-      </w:r>
-      <w:proofErr w:type="gramStart"/>
-      <w:r>
-        <w:t>How</w:t>
-      </w:r>
-      <w:proofErr w:type="gramEnd"/>
-      <w:r>
-        <w:t xml:space="preserve"> these all things are done </w:t>
+        <w:t>If we make timestamp property (who knows)true</w:t>
+      </w:r>
+      <w:r>
+        <w:t xml:space="preserve"> it automatically create for us</w:t>
+      </w:r>
+      <w:r>
+        <w:t xml:space="preserve">, How these all things are done </w:t>
       </w:r>
       <w:r>
         <w:t>what is the syntax.</w:t>
@@ -6122,18 +5566,10 @@
         <w:t xml:space="preserve"> </w:t>
       </w:r>
       <w:r>
-        <w:t xml:space="preserve">and we will make some </w:t>
-      </w:r>
-      <w:proofErr w:type="gramStart"/>
-      <w:r>
-        <w:t>modals</w:t>
-      </w:r>
-      <w:r>
-        <w:t>(</w:t>
-      </w:r>
-      <w:proofErr w:type="gramEnd"/>
-      <w:r>
-        <w:t>maybe not)</w:t>
+        <w:t>and we will make some modals</w:t>
+      </w:r>
+      <w:r>
+        <w:t>(maybe not)</w:t>
       </w:r>
       <w:r>
         <w:t xml:space="preserve"> </w:t>
@@ -6187,15 +5623,7 @@
         <w:t xml:space="preserve"> compass will be installed</w:t>
       </w:r>
       <w:r>
-        <w:t xml:space="preserve"> </w:t>
-      </w:r>
-      <w:proofErr w:type="gramStart"/>
-      <w:r>
-        <w:t>which  is</w:t>
-      </w:r>
-      <w:proofErr w:type="gramEnd"/>
-      <w:r>
-        <w:t xml:space="preserve"> a product of </w:t>
+        <w:t xml:space="preserve"> which  is a product of </w:t>
       </w:r>
       <w:proofErr w:type="spellStart"/>
       <w:r>
@@ -6425,13 +5853,8 @@
       </w:r>
     </w:p>
     <w:p>
-      <w:proofErr w:type="gramStart"/>
-      <w:r>
-        <w:t>So</w:t>
-      </w:r>
-      <w:proofErr w:type="gramEnd"/>
-      <w:r>
-        <w:t xml:space="preserve"> we will make three </w:t>
+      <w:r>
+        <w:t xml:space="preserve">So we will make three </w:t>
       </w:r>
       <w:proofErr w:type="spellStart"/>
       <w:r>
@@ -6507,27 +5930,14 @@
       </w:r>
     </w:p>
     <w:p>
-      <w:proofErr w:type="gramStart"/>
-      <w:r>
-        <w:t>So</w:t>
-      </w:r>
-      <w:proofErr w:type="gramEnd"/>
-      <w:r>
-        <w:t xml:space="preserve"> by the scheme (who knows maybe </w:t>
-      </w:r>
-      <w:r>
-        <w:t xml:space="preserve">by making schema object and passing it to </w:t>
-      </w:r>
-      <w:proofErr w:type="gramStart"/>
-      <w:r>
-        <w:t xml:space="preserve">the </w:t>
-      </w:r>
-      <w:r>
-        <w:t>)we</w:t>
-      </w:r>
-      <w:proofErr w:type="gramEnd"/>
-      <w:r>
-        <w:t xml:space="preserve"> created a model</w:t>
+      <w:r>
+        <w:t xml:space="preserve">So by the scheme (who knows maybe </w:t>
+      </w:r>
+      <w:r>
+        <w:t xml:space="preserve">by making schema object and passing it to the </w:t>
+      </w:r>
+      <w:r>
+        <w:t>)we created a model</w:t>
       </w:r>
       <w:r>
         <w:t>.</w:t>
@@ -6535,15 +5945,7 @@
     </w:p>
     <w:p>
       <w:r>
-        <w:t xml:space="preserve">For admin we will create separate </w:t>
-      </w:r>
-      <w:proofErr w:type="gramStart"/>
-      <w:r>
-        <w:t>UI(</w:t>
-      </w:r>
-      <w:proofErr w:type="gramEnd"/>
-      <w:r>
-        <w:t>who knows</w:t>
+        <w:t>For admin we will create separate UI(who knows</w:t>
       </w:r>
       <w:r>
         <w:t xml:space="preserve"> how we will manage admin authentication</w:t>
@@ -6553,13 +5955,8 @@
       </w:r>
     </w:p>
     <w:p>
-      <w:proofErr w:type="gramStart"/>
-      <w:r>
-        <w:t>So</w:t>
-      </w:r>
-      <w:proofErr w:type="gramEnd"/>
-      <w:r>
-        <w:t xml:space="preserve"> we will create middleware </w:t>
+      <w:r>
+        <w:t xml:space="preserve">So we will create middleware </w:t>
       </w:r>
       <w:r>
         <w:t xml:space="preserve">to connect to database and from there we will </w:t>
@@ -6631,15 +6028,7 @@
         <w:t xml:space="preserve"> and update our store </w:t>
       </w:r>
       <w:r>
-        <w:t xml:space="preserve">so we will make it and then decide who get what </w:t>
-      </w:r>
-      <w:proofErr w:type="gramStart"/>
-      <w:r>
-        <w:t>access(</w:t>
-      </w:r>
-      <w:proofErr w:type="gramEnd"/>
-      <w:r>
-        <w:t>maybe referring to user)</w:t>
+        <w:t>so we will make it and then decide who get what access(maybe referring to user)</w:t>
       </w:r>
       <w:r>
         <w:t xml:space="preserve">. </w:t>
@@ -6697,15 +6086,7 @@
     </w:p>
     <w:p>
       <w:r>
-        <w:t xml:space="preserve">It may be confusing but it is </w:t>
-      </w:r>
-      <w:proofErr w:type="gramStart"/>
-      <w:r>
-        <w:t>as  simple</w:t>
-      </w:r>
-      <w:proofErr w:type="gramEnd"/>
-      <w:r>
-        <w:t xml:space="preserve"> as creating </w:t>
+        <w:t xml:space="preserve">It may be confusing but it is as  simple as creating </w:t>
       </w:r>
       <w:r>
         <w:t xml:space="preserve">middleware folder </w:t>
@@ -6735,22 +6116,14 @@
         <w:t>make</w:t>
       </w:r>
       <w:r>
-        <w:t xml:space="preserve"> environment variable by </w:t>
-      </w:r>
-      <w:proofErr w:type="gramStart"/>
-      <w:r>
-        <w:t xml:space="preserve">making </w:t>
+        <w:t xml:space="preserve"> environment variable by making </w:t>
       </w:r>
       <w:r>
         <w:t>.</w:t>
       </w:r>
       <w:proofErr w:type="spellStart"/>
       <w:r>
-        <w:t>env</w:t>
-      </w:r>
-      <w:proofErr w:type="gramEnd"/>
-      <w:r>
-        <w:t>.local</w:t>
+        <w:t>env.local</w:t>
       </w:r>
       <w:proofErr w:type="spellEnd"/>
       <w:r>
@@ -6786,7 +6159,6 @@
         <w:t xml:space="preserve">We need a connection string to connect to </w:t>
       </w:r>
       <w:proofErr w:type="spellStart"/>
-      <w:proofErr w:type="gramStart"/>
       <w:r>
         <w:t>mongodb</w:t>
       </w:r>
@@ -6795,11 +6167,7 @@
         <w:t xml:space="preserve"> </w:t>
       </w:r>
       <w:r>
-        <w:t xml:space="preserve"> and</w:t>
-      </w:r>
-      <w:proofErr w:type="gramEnd"/>
-      <w:r>
-        <w:t xml:space="preserve"> we can get for </w:t>
+        <w:t xml:space="preserve"> and we can get for </w:t>
       </w:r>
       <w:proofErr w:type="spellStart"/>
       <w:r>
@@ -6815,32 +6183,16 @@
       </w:r>
       <w:proofErr w:type="spellEnd"/>
       <w:r>
-        <w:t xml:space="preserve"> compass and then click on three </w:t>
-      </w:r>
-      <w:proofErr w:type="gramStart"/>
-      <w:r>
-        <w:t>dot</w:t>
-      </w:r>
-      <w:proofErr w:type="gramEnd"/>
-      <w:r>
-        <w:t xml:space="preserve"> </w:t>
+        <w:t xml:space="preserve"> compass and then click on three dot </w:t>
       </w:r>
       <w:r>
         <w:t>as</w:t>
       </w:r>
       <w:r>
-        <w:t xml:space="preserve"> marked </w:t>
-      </w:r>
-      <w:proofErr w:type="gramStart"/>
-      <w:r>
-        <w:t>below</w:t>
-      </w:r>
-      <w:r>
-        <w:t>(</w:t>
-      </w:r>
-      <w:proofErr w:type="gramEnd"/>
-      <w:r>
-        <w:t xml:space="preserve">not </w:t>
+        <w:t xml:space="preserve"> marked below</w:t>
+      </w:r>
+      <w:r>
+        <w:t xml:space="preserve">(not </w:t>
       </w:r>
       <w:proofErr w:type="spellStart"/>
       <w:r>
@@ -6910,19 +6262,11 @@
         <w:t xml:space="preserve"> to get </w:t>
       </w:r>
       <w:r>
-        <w:t xml:space="preserve">the connection string and we will store it </w:t>
-      </w:r>
-      <w:proofErr w:type="gramStart"/>
-      <w:r>
-        <w:t>inside .</w:t>
-      </w:r>
-      <w:proofErr w:type="spellStart"/>
-      <w:r>
-        <w:t>env</w:t>
-      </w:r>
-      <w:proofErr w:type="gramEnd"/>
-      <w:r>
-        <w:t>.local</w:t>
+        <w:t>the connection string and we will store it inside .</w:t>
+      </w:r>
+      <w:proofErr w:type="spellStart"/>
+      <w:r>
+        <w:t>env.local</w:t>
       </w:r>
       <w:proofErr w:type="spellEnd"/>
       <w:r>
@@ -6936,7 +6280,6 @@
           <w:bCs/>
         </w:rPr>
       </w:pPr>
-      <w:proofErr w:type="gramStart"/>
       <w:r>
         <w:rPr>
           <w:b/>
@@ -6944,7 +6287,6 @@
         </w:rPr>
         <w:t>Note:-</w:t>
       </w:r>
-      <w:proofErr w:type="gramEnd"/>
     </w:p>
     <w:p>
       <w:pPr>
@@ -7029,7 +6371,6 @@
           <w:bCs/>
         </w:rPr>
       </w:pPr>
-      <w:proofErr w:type="gramStart"/>
       <w:r>
         <w:rPr>
           <w:b/>
@@ -7038,7 +6379,6 @@
         <w:lastRenderedPageBreak/>
         <w:t>Note:-</w:t>
       </w:r>
-      <w:proofErr w:type="gramEnd"/>
     </w:p>
     <w:p>
       <w:r>
@@ -7051,7 +6391,6 @@
         <w:t xml:space="preserve">when there is not data in </w:t>
       </w:r>
       <w:proofErr w:type="spellStart"/>
-      <w:proofErr w:type="gramStart"/>
       <w:r>
         <w:t>mon</w:t>
       </w:r>
@@ -7063,11 +6402,7 @@
         <w:t xml:space="preserve"> </w:t>
       </w:r>
       <w:r>
-        <w:t xml:space="preserve"> and</w:t>
-      </w:r>
-      <w:proofErr w:type="gramEnd"/>
-      <w:r>
-        <w:t xml:space="preserve"> we use find </w:t>
+        <w:t xml:space="preserve"> and we use find </w:t>
       </w:r>
       <w:proofErr w:type="spellStart"/>
       <w:r>
@@ -7078,29 +6413,13 @@
         <w:t xml:space="preserve"> any operation on modal </w:t>
       </w:r>
       <w:r>
-        <w:t xml:space="preserve">or maybe importing modal then it </w:t>
-      </w:r>
-      <w:proofErr w:type="gramStart"/>
-      <w:r>
-        <w:t>try</w:t>
-      </w:r>
-      <w:proofErr w:type="gramEnd"/>
-      <w:r>
-        <w:t xml:space="preserve"> to form </w:t>
-      </w:r>
-      <w:r>
-        <w:t xml:space="preserve">data again on </w:t>
-      </w:r>
-      <w:proofErr w:type="gramStart"/>
-      <w:r>
-        <w:t>database</w:t>
-      </w:r>
-      <w:r>
-        <w:t>(</w:t>
-      </w:r>
-      <w:proofErr w:type="gramEnd"/>
-      <w:r>
-        <w:t>who knows)</w:t>
+        <w:t xml:space="preserve">or maybe importing modal then it try to form </w:t>
+      </w:r>
+      <w:r>
+        <w:t>data again on database</w:t>
+      </w:r>
+      <w:r>
+        <w:t>(who knows)</w:t>
       </w:r>
       <w:r>
         <w:t>.</w:t>
@@ -7109,12 +6428,10 @@
         <w:t xml:space="preserve"> to fix that in model file write </w:t>
       </w:r>
       <w:proofErr w:type="spellStart"/>
-      <w:proofErr w:type="gramStart"/>
       <w:r>
         <w:t>mongoose.models</w:t>
       </w:r>
       <w:proofErr w:type="spellEnd"/>
-      <w:proofErr w:type="gramEnd"/>
       <w:r>
         <w:t xml:space="preserve"> = {}</w:t>
       </w:r>
@@ -7422,13 +6739,8 @@
       <w:proofErr w:type="spellEnd"/>
     </w:p>
     <w:p>
-      <w:proofErr w:type="gramStart"/>
-      <w:r>
-        <w:t>So</w:t>
-      </w:r>
-      <w:proofErr w:type="gramEnd"/>
-      <w:r>
-        <w:t xml:space="preserve"> we used:</w:t>
+      <w:r>
+        <w:t>So we used:</w:t>
       </w:r>
     </w:p>
     <w:p>
@@ -7704,39 +7016,10 @@
         <w:t xml:space="preserve">and strictly update everything </w:t>
       </w:r>
       <w:r>
-        <w:t xml:space="preserve">and </w:t>
-      </w:r>
-      <w:proofErr w:type="gramStart"/>
-      <w:r>
-        <w:t>If</w:t>
-      </w:r>
-      <w:proofErr w:type="gramEnd"/>
-      <w:r>
-        <w:t xml:space="preserve"> any person </w:t>
-      </w:r>
-      <w:proofErr w:type="gramStart"/>
-      <w:r>
-        <w:t>click</w:t>
-      </w:r>
-      <w:proofErr w:type="gramEnd"/>
-      <w:r>
-        <w:t xml:space="preserve"> on the color he </w:t>
-      </w:r>
-      <w:proofErr w:type="gramStart"/>
-      <w:r>
-        <w:t>don’t</w:t>
-      </w:r>
-      <w:proofErr w:type="gramEnd"/>
-      <w:r>
-        <w:t xml:space="preserve"> want and click on add to cart then he might buy wrong color product. </w:t>
-      </w:r>
-      <w:proofErr w:type="gramStart"/>
-      <w:r>
-        <w:t>So</w:t>
-      </w:r>
-      <w:proofErr w:type="gramEnd"/>
-      <w:r>
-        <w:t xml:space="preserve"> he should know he is in new page</w:t>
+        <w:t xml:space="preserve">and If any person click on the color he don’t want and click on add to cart then he might buy wrong color product. </w:t>
+      </w:r>
+      <w:r>
+        <w:t>So he should know he is in new page</w:t>
       </w:r>
       <w:r>
         <w:t xml:space="preserve">. </w:t>
@@ -7759,15 +7042,7 @@
         <w:t xml:space="preserve"> can help that is called preserve log it may be found in every browser </w:t>
       </w:r>
       <w:r>
-        <w:t xml:space="preserve">it </w:t>
-      </w:r>
-      <w:proofErr w:type="gramStart"/>
-      <w:r>
-        <w:t>preserve</w:t>
-      </w:r>
-      <w:proofErr w:type="gramEnd"/>
-      <w:r>
-        <w:t xml:space="preserve"> the log that was before reload So to do it go to marked below</w:t>
+        <w:t>it preserve the log that was before reload So to do it go to marked below</w:t>
       </w:r>
       <w:r>
         <w:t xml:space="preserve"> in console</w:t>
@@ -8105,7 +7380,6 @@
           <w:bCs/>
         </w:rPr>
       </w:pPr>
-      <w:proofErr w:type="gramStart"/>
       <w:r>
         <w:rPr>
           <w:b/>
@@ -8120,7 +7394,6 @@
         </w:rPr>
         <w:t>:-</w:t>
       </w:r>
-      <w:proofErr w:type="gramEnd"/>
     </w:p>
     <w:p>
       <w:pPr>
@@ -8132,51 +7405,38 @@
         <w:t>We think that inside react element</w:t>
       </w:r>
       <w:r>
-        <w:t xml:space="preserve">s that space is also counted as an </w:t>
-      </w:r>
-      <w:proofErr w:type="gramStart"/>
-      <w:r>
-        <w:t>element.</w:t>
+        <w:t>s that space is also counted as an element.</w:t>
+      </w:r>
+      <w:r>
+        <w:t>(maybe) for example you take &lt;p&gt;</w:t>
+      </w:r>
+      <w:r>
+        <w:rPr>
+          <w:u w:val="single"/>
+        </w:rPr>
+        <w:t xml:space="preserve"> </w:t>
+      </w:r>
+      <w:r>
+        <w:t>&lt;a&gt;demo&lt;/a&gt;&lt;/p&gt;</w:t>
+      </w:r>
+      <w:r>
+        <w:t xml:space="preserve">. This </w:t>
+      </w:r>
+      <w:r>
+        <w:rPr>
+          <w:u w:val="single"/>
+        </w:rPr>
+        <w:t xml:space="preserve"> </w:t>
+      </w:r>
+      <w:r>
+        <w:t xml:space="preserve"> be treated as an element</w:t>
+      </w:r>
+      <w:r>
+        <w:t>.</w:t>
       </w:r>
       <w:r>
         <w:t>(</w:t>
       </w:r>
-      <w:proofErr w:type="gramEnd"/>
-      <w:r>
-        <w:t>maybe) for example you take &lt;p&gt;</w:t>
-      </w:r>
-      <w:r>
-        <w:rPr>
-          <w:u w:val="single"/>
-        </w:rPr>
-        <w:t xml:space="preserve"> </w:t>
-      </w:r>
-      <w:r>
-        <w:t>&lt;a&gt;demo&lt;/a&gt;&lt;/p&gt;</w:t>
-      </w:r>
-      <w:r>
-        <w:t xml:space="preserve">. This </w:t>
-      </w:r>
-      <w:r>
-        <w:rPr>
-          <w:u w:val="single"/>
-        </w:rPr>
-        <w:t xml:space="preserve"> </w:t>
-      </w:r>
-      <w:r>
-        <w:t xml:space="preserve"> be treated as an </w:t>
-      </w:r>
-      <w:proofErr w:type="gramStart"/>
-      <w:r>
-        <w:t>element</w:t>
-      </w:r>
-      <w:r>
-        <w:t>.</w:t>
-      </w:r>
-      <w:r>
-        <w:t>(</w:t>
-      </w:r>
-      <w:proofErr w:type="gramEnd"/>
       <w:r>
         <w:t>who knows</w:t>
       </w:r>
@@ -8512,26 +7772,13 @@
     </w:p>
     <w:p>
       <w:r>
-        <w:t xml:space="preserve">Many </w:t>
-      </w:r>
-      <w:proofErr w:type="gramStart"/>
-      <w:r>
-        <w:t>times</w:t>
-      </w:r>
-      <w:proofErr w:type="gramEnd"/>
-      <w:r>
-        <w:t xml:space="preserve"> in </w:t>
-      </w:r>
-      <w:proofErr w:type="gramStart"/>
-      <w:r>
-        <w:t xml:space="preserve">ecommerce </w:t>
-      </w:r>
-      <w:r>
-        <w:t xml:space="preserve"> we</w:t>
-      </w:r>
-      <w:proofErr w:type="gramEnd"/>
-      <w:r>
-        <w:t xml:space="preserve"> need to give alert to the </w:t>
+        <w:t>Many times</w:t>
+      </w:r>
+      <w:r>
+        <w:t xml:space="preserve"> in ecommerce </w:t>
+      </w:r>
+      <w:r>
+        <w:t xml:space="preserve"> we need to give alert to the </w:t>
       </w:r>
       <w:r>
         <w:t>user</w:t>
@@ -8606,13 +7853,8 @@
       <w:r>
         <w:t xml:space="preserve"> </w:t>
       </w:r>
-      <w:proofErr w:type="gramStart"/>
-      <w:r>
-        <w:t>.We</w:t>
-      </w:r>
-      <w:proofErr w:type="gramEnd"/>
-      <w:r>
-        <w:t xml:space="preserve"> need to tell them </w:t>
+      <w:r>
+        <w:t xml:space="preserve">.We need to tell them </w:t>
       </w:r>
       <w:r>
         <w:t xml:space="preserve">that </w:t>
@@ -9303,18 +8545,10 @@
         <w:t xml:space="preserve"> </w:t>
       </w:r>
       <w:r>
-        <w:t xml:space="preserve">which tells how our toast will be </w:t>
-      </w:r>
-      <w:proofErr w:type="gramStart"/>
-      <w:r>
-        <w:t xml:space="preserve">shown </w:t>
-      </w:r>
-      <w:r>
-        <w:t>,</w:t>
-      </w:r>
-      <w:proofErr w:type="gramEnd"/>
-      <w:r>
-        <w:t xml:space="preserve"> </w:t>
+        <w:t xml:space="preserve">which tells how our toast will be shown </w:t>
+      </w:r>
+      <w:r>
+        <w:t xml:space="preserve">, </w:t>
       </w:r>
       <w:proofErr w:type="spellStart"/>
       <w:r>
@@ -9339,18 +8573,10 @@
       </w:r>
       <w:proofErr w:type="spellEnd"/>
       <w:r>
-        <w:t xml:space="preserve"> that invoke that </w:t>
-      </w:r>
-      <w:proofErr w:type="gramStart"/>
-      <w:r>
-        <w:t xml:space="preserve">component </w:t>
-      </w:r>
-      <w:r>
-        <w:t xml:space="preserve"> You</w:t>
-      </w:r>
-      <w:proofErr w:type="gramEnd"/>
-      <w:r>
-        <w:t xml:space="preserve"> can see </w:t>
+        <w:t xml:space="preserve"> that invoke that component </w:t>
+      </w:r>
+      <w:r>
+        <w:t xml:space="preserve"> You can see </w:t>
       </w:r>
       <w:proofErr w:type="spellStart"/>
       <w:r>
@@ -9358,29 +8584,13 @@
       </w:r>
       <w:proofErr w:type="spellEnd"/>
       <w:r>
-        <w:t xml:space="preserve"> options of types and position is </w:t>
-      </w:r>
-      <w:proofErr w:type="gramStart"/>
-      <w:r>
-        <w:t>given .</w:t>
-      </w:r>
-      <w:proofErr w:type="gramEnd"/>
-      <w:r>
-        <w:t xml:space="preserve"> Choose your option and </w:t>
+        <w:t xml:space="preserve"> options of types and position is given . Choose your option and </w:t>
       </w:r>
       <w:r>
         <w:t xml:space="preserve">then your code will reflect that. </w:t>
       </w:r>
       <w:r>
-        <w:t xml:space="preserve">To see the </w:t>
-      </w:r>
-      <w:proofErr w:type="gramStart"/>
-      <w:r>
-        <w:t>demo</w:t>
-      </w:r>
-      <w:proofErr w:type="gramEnd"/>
-      <w:r>
-        <w:t xml:space="preserve"> we click on Show toast </w:t>
+        <w:t xml:space="preserve">To see the demo we click on Show toast </w:t>
       </w:r>
     </w:p>
     <w:p>
@@ -9434,27 +8644,14 @@
       </w:r>
     </w:p>
     <w:p>
-      <w:proofErr w:type="gramStart"/>
-      <w:r>
-        <w:t>So</w:t>
-      </w:r>
-      <w:proofErr w:type="gramEnd"/>
-      <w:r>
-        <w:t xml:space="preserve"> we now copy and paste the code here to apply them.</w:t>
+      <w:r>
+        <w:t>So we now copy and paste the code here to apply them.</w:t>
       </w:r>
       <w:r>
         <w:t xml:space="preserve"> </w:t>
       </w:r>
       <w:r>
-        <w:t xml:space="preserve">There are other methods inside our toast that is success and error and many more to show different situation in the </w:t>
-      </w:r>
-      <w:proofErr w:type="gramStart"/>
-      <w:r>
-        <w:t>toast.(</w:t>
-      </w:r>
-      <w:proofErr w:type="gramEnd"/>
-      <w:r>
-        <w:t xml:space="preserve">who knows) </w:t>
+        <w:t xml:space="preserve">There are other methods inside our toast that is success and error and many more to show different situation in the toast.(who knows) </w:t>
       </w:r>
     </w:p>
     <w:p>
@@ -9464,13 +8661,8 @@
       <w:r>
         <w:t xml:space="preserve">of </w:t>
       </w:r>
-      <w:proofErr w:type="gramStart"/>
-      <w:r>
-        <w:t>toast  in</w:t>
-      </w:r>
-      <w:proofErr w:type="gramEnd"/>
-      <w:r>
-        <w:t xml:space="preserve"> the demo of documentation</w:t>
+      <w:r>
+        <w:t>toast  in the demo of documentation</w:t>
       </w:r>
     </w:p>
     <w:p>
@@ -9599,15 +8791,7 @@
         <w:t>e</w:t>
       </w:r>
       <w:r>
-        <w:t xml:space="preserve">s the model that is Schema </w:t>
-      </w:r>
-      <w:proofErr w:type="gramStart"/>
-      <w:r>
-        <w:t>Object(</w:t>
-      </w:r>
-      <w:proofErr w:type="gramEnd"/>
-      <w:r>
-        <w:t xml:space="preserve">who knows) and sometimes we don’t need </w:t>
+        <w:t xml:space="preserve">s the model that is Schema Object(who knows) and sometimes we don’t need </w:t>
       </w:r>
       <w:r>
         <w:t xml:space="preserve">object just Schema </w:t>
@@ -9616,15 +8800,7 @@
         <w:t xml:space="preserve">class </w:t>
       </w:r>
       <w:r>
-        <w:t xml:space="preserve">and its static </w:t>
-      </w:r>
-      <w:proofErr w:type="gramStart"/>
-      <w:r>
-        <w:t>methods(</w:t>
-      </w:r>
-      <w:proofErr w:type="gramEnd"/>
-      <w:r>
-        <w:t>who knows)</w:t>
+        <w:t>and its static methods(who knows)</w:t>
       </w:r>
       <w:r>
         <w:t>.</w:t>
@@ -9906,23 +9082,7 @@
           <w:b/>
           <w:bCs/>
         </w:rPr>
-        <w:t xml:space="preserve">and when we match our password after we get </w:t>
-      </w:r>
-      <w:proofErr w:type="gramStart"/>
-      <w:r>
-        <w:rPr>
-          <w:b/>
-          <w:bCs/>
-        </w:rPr>
-        <w:t>authenticated</w:t>
-      </w:r>
-      <w:proofErr w:type="gramEnd"/>
-      <w:r>
-        <w:rPr>
-          <w:b/>
-          <w:bCs/>
-        </w:rPr>
-        <w:t xml:space="preserve"> we get token for </w:t>
+        <w:t xml:space="preserve">and when we match our password after we get authenticated we get token for </w:t>
       </w:r>
       <w:r>
         <w:rPr>
@@ -9936,23 +9096,7 @@
           <w:b/>
           <w:bCs/>
         </w:rPr>
-        <w:t xml:space="preserve">It is not easy to hack a database of plain password but if it </w:t>
-      </w:r>
-      <w:proofErr w:type="gramStart"/>
-      <w:r>
-        <w:rPr>
-          <w:b/>
-          <w:bCs/>
-        </w:rPr>
-        <w:t>get</w:t>
-      </w:r>
-      <w:proofErr w:type="gramEnd"/>
-      <w:r>
-        <w:rPr>
-          <w:b/>
-          <w:bCs/>
-        </w:rPr>
-        <w:t xml:space="preserve"> </w:t>
+        <w:t xml:space="preserve">It is not easy to hack a database of plain password but if it get </w:t>
       </w:r>
       <w:r>
         <w:rPr>
@@ -10128,13 +9272,8 @@
         <w:t xml:space="preserve">You can see above we encrypted </w:t>
       </w:r>
       <w:r>
-        <w:t xml:space="preserve">the password with a </w:t>
-      </w:r>
-      <w:proofErr w:type="gramStart"/>
-      <w:r>
-        <w:t>secret keys</w:t>
-      </w:r>
-      <w:proofErr w:type="gramEnd"/>
+        <w:t>the password with a secret keys</w:t>
+      </w:r>
       <w:r>
         <w:t xml:space="preserve"> which is a secret string actually </w:t>
       </w:r>
@@ -10185,7 +9324,6 @@
           <w:bCs/>
         </w:rPr>
       </w:pPr>
-      <w:proofErr w:type="gramStart"/>
       <w:r>
         <w:rPr>
           <w:b/>
@@ -10193,7 +9331,6 @@
         </w:rPr>
         <w:t>Note:-</w:t>
       </w:r>
-      <w:proofErr w:type="gramEnd"/>
     </w:p>
     <w:p>
       <w:pPr>
@@ -10226,15 +9363,7 @@
         <w:t>m</w:t>
       </w:r>
       <w:r>
-        <w:t xml:space="preserve">e secret </w:t>
-      </w:r>
-      <w:proofErr w:type="gramStart"/>
-      <w:r>
-        <w:t>key</w:t>
-      </w:r>
-      <w:proofErr w:type="gramEnd"/>
-      <w:r>
-        <w:t xml:space="preserve"> we get different </w:t>
+        <w:t xml:space="preserve">e secret key we get different </w:t>
       </w:r>
       <w:r>
         <w:t xml:space="preserve">results because of salt </w:t>
@@ -10249,15 +9378,7 @@
         <w:t xml:space="preserve">and its string is decided by the algorithm </w:t>
       </w:r>
       <w:r>
-        <w:t xml:space="preserve">and while decrypting (how can it be possible) this </w:t>
-      </w:r>
-      <w:proofErr w:type="gramStart"/>
-      <w:r>
-        <w:t>string(</w:t>
-      </w:r>
-      <w:proofErr w:type="gramEnd"/>
-      <w:r>
-        <w:t>or salt) may be decoded from the string.</w:t>
+        <w:t>and while decrypting (how can it be possible) this string(or salt) may be decoded from the string.</w:t>
       </w:r>
       <w:r>
         <w:t xml:space="preserve"> Evert algorithm has its own working</w:t>
@@ -10265,15 +9386,7 @@
     </w:p>
     <w:p>
       <w:r>
-        <w:t xml:space="preserve">IN the working of </w:t>
-      </w:r>
-      <w:proofErr w:type="gramStart"/>
-      <w:r>
-        <w:t>AES</w:t>
-      </w:r>
-      <w:proofErr w:type="gramEnd"/>
-      <w:r>
-        <w:t xml:space="preserve"> we don’t need to match encrypted string </w:t>
+        <w:t xml:space="preserve">IN the working of AES we don’t need to match encrypted string </w:t>
       </w:r>
       <w:r>
         <w:t xml:space="preserve">we need to match decrypted string. </w:t>
@@ -10343,15 +9456,7 @@
         <w:t xml:space="preserve">rom it </w:t>
       </w:r>
       <w:r>
-        <w:t xml:space="preserve">and </w:t>
-      </w:r>
-      <w:proofErr w:type="gramStart"/>
-      <w:r>
-        <w:t>it</w:t>
-      </w:r>
-      <w:proofErr w:type="gramEnd"/>
-      <w:r>
-        <w:t xml:space="preserve"> s tampering does not become possible what we do for it </w:t>
+        <w:t xml:space="preserve">and it s tampering does not become possible what we do for it </w:t>
       </w:r>
     </w:p>
     <w:p>
@@ -10465,13 +9570,8 @@
       <w:r>
         <w:t xml:space="preserve">We are talking about token on the left </w:t>
       </w:r>
-      <w:proofErr w:type="gramStart"/>
-      <w:r>
-        <w:t>The</w:t>
-      </w:r>
-      <w:proofErr w:type="gramEnd"/>
-      <w:r>
-        <w:t xml:space="preserve"> </w:t>
+      <w:r>
+        <w:t xml:space="preserve">The </w:t>
       </w:r>
       <w:r>
         <w:t xml:space="preserve">traditional approach of login </w:t>
@@ -10580,32 +9680,11 @@
       </w:r>
       <w:proofErr w:type="spellEnd"/>
       <w:r>
-        <w:t xml:space="preserve"> is that it is divided into three parts first is </w:t>
-      </w:r>
-      <w:proofErr w:type="gramStart"/>
-      <w:r>
-        <w:t>header ,</w:t>
-      </w:r>
-      <w:proofErr w:type="gramEnd"/>
-      <w:r>
-        <w:t xml:space="preserve"> second part is Payload </w:t>
-      </w:r>
-      <w:proofErr w:type="gramStart"/>
-      <w:r>
-        <w:t>data</w:t>
-      </w:r>
-      <w:r>
-        <w:t>(</w:t>
-      </w:r>
-      <w:proofErr w:type="gramEnd"/>
-      <w:r>
-        <w:t xml:space="preserve">which is our </w:t>
-      </w:r>
-      <w:proofErr w:type="gramStart"/>
-      <w:r>
-        <w:t>data )</w:t>
-      </w:r>
-      <w:proofErr w:type="gramEnd"/>
+        <w:t xml:space="preserve"> is that it is divided into three parts first is header , second part is Payload data</w:t>
+      </w:r>
+      <w:r>
+        <w:t>(which is our data )</w:t>
+      </w:r>
       <w:r>
         <w:t xml:space="preserve"> and another is signature</w:t>
       </w:r>
@@ -10643,21 +9722,13 @@
         <w:t>g</w:t>
       </w:r>
       <w:r>
-        <w:t xml:space="preserve">orithm is used (maybe for </w:t>
-      </w:r>
-      <w:proofErr w:type="gramStart"/>
-      <w:r>
-        <w:t>encryption)</w:t>
+        <w:t>orithm is used (maybe for encryption)</w:t>
       </w:r>
       <w:r>
         <w:t xml:space="preserve"> </w:t>
       </w:r>
       <w:r>
-        <w:t xml:space="preserve"> and</w:t>
-      </w:r>
-      <w:proofErr w:type="gramEnd"/>
-      <w:r>
-        <w:t xml:space="preserve"> then next part is data </w:t>
+        <w:t xml:space="preserve"> and then next part is data </w:t>
       </w:r>
       <w:r>
         <w:lastRenderedPageBreak/>
@@ -10742,15 +9813,7 @@
         <w:t xml:space="preserve"> </w:t>
       </w:r>
       <w:r>
-        <w:t xml:space="preserve">By using this </w:t>
-      </w:r>
-      <w:proofErr w:type="gramStart"/>
-      <w:r>
-        <w:t>secret</w:t>
-      </w:r>
-      <w:proofErr w:type="gramEnd"/>
-      <w:r>
-        <w:t xml:space="preserve"> we can </w:t>
+        <w:t xml:space="preserve">By using this secret we can </w:t>
       </w:r>
       <w:r>
         <w:t xml:space="preserve">know is this </w:t>
@@ -10793,13 +9856,8 @@
       </w:r>
     </w:p>
     <w:p>
-      <w:proofErr w:type="gramStart"/>
-      <w:r>
-        <w:t>So</w:t>
-      </w:r>
-      <w:proofErr w:type="gramEnd"/>
-      <w:r>
-        <w:t xml:space="preserve"> we add it </w:t>
+      <w:r>
+        <w:t xml:space="preserve">So we add it </w:t>
       </w:r>
       <w:proofErr w:type="spellStart"/>
       <w:r>
@@ -10814,13 +9872,8 @@
       </w:r>
     </w:p>
     <w:p>
-      <w:proofErr w:type="gramStart"/>
-      <w:r>
-        <w:t>So</w:t>
-      </w:r>
-      <w:proofErr w:type="gramEnd"/>
-      <w:r>
-        <w:t xml:space="preserve"> what we did we import </w:t>
+      <w:r>
+        <w:t xml:space="preserve">So what we did we import </w:t>
       </w:r>
       <w:proofErr w:type="spellStart"/>
       <w:r>
@@ -10992,15 +10045,7 @@
         <w:t>that is Iat it tells when this token was issued.</w:t>
       </w:r>
       <w:r>
-        <w:t xml:space="preserve">  </w:t>
-      </w:r>
-      <w:proofErr w:type="gramStart"/>
-      <w:r>
-        <w:t>So</w:t>
-      </w:r>
-      <w:proofErr w:type="gramEnd"/>
-      <w:r>
-        <w:t xml:space="preserve"> you can see above that this</w:t>
+        <w:t xml:space="preserve">  So you can see above that this</w:t>
       </w:r>
       <w:r>
         <w:t xml:space="preserve"> </w:t>
@@ -11050,21 +10095,13 @@
         <w:t xml:space="preserve"> that tells when that </w:t>
       </w:r>
       <w:r>
-        <w:t xml:space="preserve">token will be </w:t>
-      </w:r>
-      <w:proofErr w:type="gramStart"/>
-      <w:r>
-        <w:t>expired</w:t>
+        <w:t>token will be expired</w:t>
       </w:r>
       <w:r>
         <w:t>(</w:t>
       </w:r>
       <w:r>
-        <w:t xml:space="preserve"> who</w:t>
-      </w:r>
-      <w:proofErr w:type="gramEnd"/>
-      <w:r>
-        <w:t xml:space="preserve"> knows</w:t>
+        <w:t xml:space="preserve"> who knows</w:t>
       </w:r>
       <w:r>
         <w:t>)</w:t>
@@ -11121,15 +10158,7 @@
     </w:p>
     <w:p>
       <w:r>
-        <w:t xml:space="preserve">So now our code </w:t>
-      </w:r>
-      <w:proofErr w:type="gramStart"/>
-      <w:r>
-        <w:t>look</w:t>
-      </w:r>
-      <w:proofErr w:type="gramEnd"/>
-      <w:r>
-        <w:t xml:space="preserve"> like above.</w:t>
+        <w:t>So now our code look like above.</w:t>
       </w:r>
     </w:p>
     <w:p>
@@ -11169,15 +10198,7 @@
         <w:t xml:space="preserve"> it so that </w:t>
       </w:r>
       <w:r>
-        <w:t xml:space="preserve">it </w:t>
-      </w:r>
-      <w:proofErr w:type="gramStart"/>
-      <w:r>
-        <w:t>get</w:t>
-      </w:r>
-      <w:proofErr w:type="gramEnd"/>
-      <w:r>
-        <w:t xml:space="preserve"> logout after some time. </w:t>
+        <w:t xml:space="preserve">it get logout after some time. </w:t>
       </w:r>
     </w:p>
     <w:p>
@@ -11203,23 +10224,14 @@
         <w:t>app</w:t>
       </w:r>
       <w:r>
-        <w:t xml:space="preserve"> </w:t>
-      </w:r>
-      <w:proofErr w:type="gramStart"/>
-      <w:r>
-        <w:t>content</w:t>
-      </w:r>
-      <w:r>
-        <w:t>(</w:t>
-      </w:r>
-      <w:proofErr w:type="gramEnd"/>
-      <w:r>
-        <w:t>or pages)</w:t>
+        <w:t xml:space="preserve"> content</w:t>
+      </w:r>
+      <w:r>
+        <w:t>(or pages)</w:t>
       </w:r>
       <w:r>
         <w:t xml:space="preserve"> and Boiler plate often contains </w:t>
       </w:r>
-      <w:proofErr w:type="gramStart"/>
       <w:r>
         <w:t>H</w:t>
       </w:r>
@@ -11227,11 +10239,7 @@
         <w:t>t</w:t>
       </w:r>
       <w:r>
-        <w:t>ml ,Head</w:t>
-      </w:r>
-      <w:proofErr w:type="gramEnd"/>
-      <w:r>
-        <w:t xml:space="preserve"> and Body </w:t>
+        <w:t xml:space="preserve">ml ,Head and Body </w:t>
       </w:r>
       <w:r>
         <w:t xml:space="preserve">It </w:t>
@@ -11438,7 +10446,6 @@
         <w:t xml:space="preserve">You can use </w:t>
       </w:r>
       <w:proofErr w:type="spellStart"/>
-      <w:proofErr w:type="gramStart"/>
       <w:r>
         <w:rPr>
           <w:b/>
@@ -11447,7 +10454,6 @@
         <w:t>router.query</w:t>
       </w:r>
       <w:proofErr w:type="spellEnd"/>
-      <w:proofErr w:type="gramEnd"/>
       <w:r>
         <w:rPr>
           <w:b/>
@@ -11467,71 +10473,39 @@
           <w:b/>
           <w:bCs/>
         </w:rPr>
-        <w:t xml:space="preserve">that you want to run as it track the </w:t>
-      </w:r>
-      <w:proofErr w:type="gramStart"/>
-      <w:r>
-        <w:rPr>
-          <w:b/>
-          <w:bCs/>
-        </w:rPr>
-        <w:t>url .</w:t>
-      </w:r>
-      <w:proofErr w:type="gramEnd"/>
-      <w:r>
-        <w:rPr>
-          <w:b/>
-          <w:bCs/>
-        </w:rPr>
+        <w:t>that you want to run as it track the url . so as url changes our useEffect runs.</w:t>
+      </w:r>
+    </w:p>
+    <w:p>
+      <w:r>
+        <w:t xml:space="preserve">Now in modern </w:t>
+      </w:r>
+      <w:proofErr w:type="spellStart"/>
+      <w:r>
+        <w:t>Nextjs</w:t>
+      </w:r>
+      <w:proofErr w:type="spellEnd"/>
+      <w:r>
+        <w:t xml:space="preserve"> router don’t have a query parameter </w:t>
+      </w:r>
+      <w:r>
+        <w:t xml:space="preserve">you have </w:t>
+      </w:r>
+      <w:proofErr w:type="spellStart"/>
+      <w:r>
+        <w:t>usePathName</w:t>
+      </w:r>
+      <w:proofErr w:type="spellEnd"/>
+      <w:r>
         <w:t xml:space="preserve"> </w:t>
       </w:r>
-      <w:proofErr w:type="gramStart"/>
-      <w:r>
-        <w:rPr>
-          <w:b/>
-          <w:bCs/>
-        </w:rPr>
-        <w:t>so</w:t>
-      </w:r>
-      <w:proofErr w:type="gramEnd"/>
-      <w:r>
-        <w:rPr>
-          <w:b/>
-          <w:bCs/>
-        </w:rPr>
-        <w:t xml:space="preserve"> as url changes our useEffect runs.</w:t>
-      </w:r>
-    </w:p>
-    <w:p>
-      <w:r>
-        <w:t xml:space="preserve">Now in modern </w:t>
-      </w:r>
-      <w:proofErr w:type="spellStart"/>
-      <w:r>
-        <w:t>Nextjs</w:t>
-      </w:r>
-      <w:proofErr w:type="spellEnd"/>
-      <w:r>
-        <w:t xml:space="preserve"> router don’t have a query parameter </w:t>
-      </w:r>
-      <w:r>
-        <w:t xml:space="preserve">you have </w:t>
-      </w:r>
-      <w:proofErr w:type="spellStart"/>
-      <w:r>
-        <w:t>usePathName</w:t>
-      </w:r>
-      <w:proofErr w:type="spellEnd"/>
+      <w:r>
+        <w:t>hooks and you can use it to</w:t>
+      </w:r>
       <w:r>
         <w:t xml:space="preserve"> </w:t>
       </w:r>
       <w:r>
-        <w:t>hooks and you can use it to</w:t>
-      </w:r>
-      <w:r>
-        <w:t xml:space="preserve"> </w:t>
-      </w:r>
-      <w:r>
         <w:t xml:space="preserve">access pathname and can pass it to useEffect </w:t>
       </w:r>
       <w:r>
@@ -11559,13 +10533,8 @@
       </w:r>
     </w:p>
     <w:p>
-      <w:proofErr w:type="gramStart"/>
-      <w:r>
-        <w:t>useEffect(</w:t>
-      </w:r>
-      <w:proofErr w:type="gramEnd"/>
-      <w:r>
-        <w:t>() =&gt; {</w:t>
+      <w:r>
+        <w:t>useEffect(() =&gt; {</w:t>
       </w:r>
     </w:p>
     <w:p>
@@ -11578,12 +10547,10 @@
         <w:t>}, [</w:t>
       </w:r>
       <w:proofErr w:type="spellStart"/>
-      <w:proofErr w:type="gramStart"/>
       <w:r>
         <w:t>router.query</w:t>
       </w:r>
       <w:proofErr w:type="spellEnd"/>
-      <w:proofErr w:type="gramEnd"/>
       <w:r>
         <w:t>]);</w:t>
       </w:r>
@@ -11654,17 +10621,12 @@
         <w:t xml:space="preserve"> router = </w:t>
       </w:r>
       <w:proofErr w:type="spellStart"/>
-      <w:proofErr w:type="gramStart"/>
       <w:r>
         <w:t>useRouter</w:t>
       </w:r>
       <w:proofErr w:type="spellEnd"/>
       <w:r>
-        <w:t>(</w:t>
-      </w:r>
-      <w:proofErr w:type="gramEnd"/>
-      <w:r>
-        <w:t>)</w:t>
+        <w:t>()</w:t>
       </w:r>
     </w:p>
     <w:p>
@@ -11692,12 +10654,10 @@
     </w:p>
     <w:p>
       <w:proofErr w:type="spellStart"/>
-      <w:proofErr w:type="gramStart"/>
       <w:r>
         <w:t>router.query</w:t>
       </w:r>
       <w:proofErr w:type="spellEnd"/>
-      <w:proofErr w:type="gramEnd"/>
       <w:r>
         <w:t xml:space="preserve"> // </w:t>
       </w:r>
@@ -11760,33 +10720,23 @@
     </w:p>
     <w:p>
       <w:r>
-        <w:t xml:space="preserve">import </w:t>
-      </w:r>
-      <w:proofErr w:type="gramStart"/>
-      <w:r>
-        <w:t xml:space="preserve">{ </w:t>
+        <w:t xml:space="preserve">import { </w:t>
       </w:r>
       <w:proofErr w:type="spellStart"/>
       <w:r>
         <w:t>usePathname</w:t>
       </w:r>
       <w:proofErr w:type="spellEnd"/>
-      <w:proofErr w:type="gramEnd"/>
       <w:r>
         <w:t xml:space="preserve">, </w:t>
       </w:r>
       <w:proofErr w:type="spellStart"/>
-      <w:proofErr w:type="gramStart"/>
       <w:r>
         <w:t>useSearchParams</w:t>
       </w:r>
       <w:proofErr w:type="spellEnd"/>
       <w:r>
-        <w:t xml:space="preserve"> }</w:t>
-      </w:r>
-      <w:proofErr w:type="gramEnd"/>
-      <w:r>
-        <w:t xml:space="preserve"> from "next/navigation";</w:t>
+        <w:t xml:space="preserve"> } from "next/navigation";</w:t>
       </w:r>
     </w:p>
     <w:p>
@@ -11836,18 +10786,13 @@
     </w:p>
     <w:p>
       <w:r>
-        <w:t xml:space="preserve">import </w:t>
-      </w:r>
-      <w:proofErr w:type="gramStart"/>
-      <w:r>
-        <w:t xml:space="preserve">{ </w:t>
+        <w:t xml:space="preserve">import { </w:t>
       </w:r>
       <w:proofErr w:type="spellStart"/>
       <w:r>
         <w:t>usePathname</w:t>
       </w:r>
       <w:proofErr w:type="spellEnd"/>
-      <w:proofErr w:type="gramEnd"/>
       <w:r>
         <w:t xml:space="preserve"> } from "next/navigation";</w:t>
       </w:r>
@@ -11863,98 +10808,73 @@
         <w:t xml:space="preserve"> pathname = </w:t>
       </w:r>
       <w:proofErr w:type="spellStart"/>
-      <w:proofErr w:type="gramStart"/>
       <w:r>
         <w:t>usePathname</w:t>
       </w:r>
       <w:proofErr w:type="spellEnd"/>
       <w:r>
+        <w:t>();</w:t>
+      </w:r>
+    </w:p>
+    <w:p/>
+    <w:p>
+      <w:r>
+        <w:t>useEffect(() =&gt; {</w:t>
+      </w:r>
+    </w:p>
+    <w:p>
+      <w:r>
+        <w:t xml:space="preserve">  </w:t>
+      </w:r>
+      <w:proofErr w:type="spellStart"/>
+      <w:r>
+        <w:t>const</w:t>
+      </w:r>
+      <w:proofErr w:type="spellEnd"/>
+      <w:r>
+        <w:t xml:space="preserve"> token = </w:t>
+      </w:r>
+      <w:proofErr w:type="spellStart"/>
+      <w:r>
+        <w:t>localStorage.getItem</w:t>
+      </w:r>
+      <w:proofErr w:type="spellEnd"/>
+      <w:r>
+        <w:t>("token");</w:t>
+      </w:r>
+    </w:p>
+    <w:p/>
+    <w:p>
+      <w:r>
+        <w:t xml:space="preserve">  if (token) {</w:t>
+      </w:r>
+    </w:p>
+    <w:p>
+      <w:r>
+        <w:t xml:space="preserve">    </w:t>
+      </w:r>
+      <w:proofErr w:type="spellStart"/>
+      <w:r>
+        <w:t>setUser</w:t>
+      </w:r>
+      <w:proofErr w:type="spellEnd"/>
+      <w:r>
+        <w:t>({ value: token });</w:t>
+      </w:r>
+    </w:p>
+    <w:p>
+      <w:r>
+        <w:t xml:space="preserve">    </w:t>
+      </w:r>
+      <w:proofErr w:type="spellStart"/>
+      <w:r>
+        <w:t>setKey</w:t>
+      </w:r>
+      <w:proofErr w:type="spellEnd"/>
+      <w:r>
         <w:t>(</w:t>
       </w:r>
-      <w:proofErr w:type="gramEnd"/>
-      <w:r>
-        <w:t>);</w:t>
-      </w:r>
-    </w:p>
-    <w:p/>
-    <w:p>
-      <w:proofErr w:type="gramStart"/>
-      <w:r>
-        <w:t>useEffect(</w:t>
-      </w:r>
-      <w:proofErr w:type="gramEnd"/>
-      <w:r>
-        <w:t>() =&gt; {</w:t>
-      </w:r>
-    </w:p>
-    <w:p>
-      <w:r>
-        <w:t xml:space="preserve">  </w:t>
-      </w:r>
-      <w:proofErr w:type="spellStart"/>
-      <w:r>
-        <w:t>const</w:t>
-      </w:r>
-      <w:proofErr w:type="spellEnd"/>
-      <w:r>
-        <w:t xml:space="preserve"> token = </w:t>
-      </w:r>
-      <w:proofErr w:type="spellStart"/>
-      <w:r>
-        <w:t>localStorage.getItem</w:t>
-      </w:r>
-      <w:proofErr w:type="spellEnd"/>
-      <w:r>
-        <w:t>("token");</w:t>
-      </w:r>
-    </w:p>
-    <w:p/>
-    <w:p>
-      <w:r>
-        <w:t xml:space="preserve">  if (token) {</w:t>
-      </w:r>
-    </w:p>
-    <w:p>
-      <w:r>
-        <w:t xml:space="preserve">    </w:t>
-      </w:r>
-      <w:proofErr w:type="spellStart"/>
-      <w:proofErr w:type="gramStart"/>
-      <w:r>
-        <w:t>setUser</w:t>
-      </w:r>
-      <w:proofErr w:type="spellEnd"/>
-      <w:r>
-        <w:t>({ value</w:t>
-      </w:r>
-      <w:proofErr w:type="gramEnd"/>
-      <w:r>
-        <w:t xml:space="preserve">: </w:t>
-      </w:r>
-      <w:proofErr w:type="gramStart"/>
-      <w:r>
-        <w:t>token }</w:t>
-      </w:r>
-      <w:proofErr w:type="gramEnd"/>
-      <w:r>
-        <w:t>);</w:t>
-      </w:r>
-    </w:p>
-    <w:p>
-      <w:r>
-        <w:t xml:space="preserve">    </w:t>
-      </w:r>
-      <w:proofErr w:type="spellStart"/>
-      <w:proofErr w:type="gramStart"/>
-      <w:r>
-        <w:t>setKey</w:t>
-      </w:r>
-      <w:proofErr w:type="spellEnd"/>
-      <w:r>
-        <w:t>(</w:t>
-      </w:r>
-      <w:proofErr w:type="spellStart"/>
-      <w:proofErr w:type="gramEnd"/>
+      <w:proofErr w:type="spellStart"/>
       <w:r>
         <w:t>Math.random</w:t>
       </w:r>
@@ -11997,18 +10917,13 @@
     </w:p>
     <w:p>
       <w:r>
-        <w:t xml:space="preserve">import </w:t>
-      </w:r>
-      <w:proofErr w:type="gramStart"/>
-      <w:r>
-        <w:t xml:space="preserve">{ </w:t>
+        <w:t xml:space="preserve">import { </w:t>
       </w:r>
       <w:proofErr w:type="spellStart"/>
       <w:r>
         <w:t>useSearchParams</w:t>
       </w:r>
       <w:proofErr w:type="spellEnd"/>
-      <w:proofErr w:type="gramEnd"/>
       <w:r>
         <w:t xml:space="preserve"> } from "next/navigation";</w:t>
       </w:r>
@@ -12032,28 +10947,18 @@
         <w:t xml:space="preserve"> = </w:t>
       </w:r>
       <w:proofErr w:type="spellStart"/>
-      <w:proofErr w:type="gramStart"/>
       <w:r>
         <w:t>useSearchParams</w:t>
       </w:r>
       <w:proofErr w:type="spellEnd"/>
       <w:r>
-        <w:t>(</w:t>
-      </w:r>
-      <w:proofErr w:type="gramEnd"/>
-      <w:r>
-        <w:t>);</w:t>
+        <w:t>();</w:t>
       </w:r>
     </w:p>
     <w:p/>
     <w:p>
-      <w:proofErr w:type="gramStart"/>
-      <w:r>
-        <w:t>useEffect(</w:t>
-      </w:r>
-      <w:proofErr w:type="gramEnd"/>
-      <w:r>
-        <w:t>() =&gt; {</w:t>
+      <w:r>
+        <w:t>useEffect(() =&gt; {</w:t>
       </w:r>
     </w:p>
     <w:p>
@@ -12088,25 +10993,12 @@
         <w:t xml:space="preserve">    </w:t>
       </w:r>
       <w:proofErr w:type="spellStart"/>
-      <w:proofErr w:type="gramStart"/>
       <w:r>
         <w:t>setUser</w:t>
       </w:r>
       <w:proofErr w:type="spellEnd"/>
       <w:r>
-        <w:t>({ value</w:t>
-      </w:r>
-      <w:proofErr w:type="gramEnd"/>
-      <w:r>
-        <w:t xml:space="preserve">: </w:t>
-      </w:r>
-      <w:proofErr w:type="gramStart"/>
-      <w:r>
-        <w:t>token }</w:t>
-      </w:r>
-      <w:proofErr w:type="gramEnd"/>
-      <w:r>
-        <w:t>);</w:t>
+        <w:t>({ value: token });</w:t>
       </w:r>
     </w:p>
     <w:p>
@@ -12115,7 +11007,6 @@
         <w:t xml:space="preserve">    </w:t>
       </w:r>
       <w:proofErr w:type="spellStart"/>
-      <w:proofErr w:type="gramStart"/>
       <w:r>
         <w:t>setKey</w:t>
       </w:r>
@@ -12124,7 +11015,6 @@
         <w:t>(</w:t>
       </w:r>
       <w:proofErr w:type="spellStart"/>
-      <w:proofErr w:type="gramEnd"/>
       <w:r>
         <w:t>Math.random</w:t>
       </w:r>
@@ -12189,12 +11079,10 @@
         </w:numPr>
       </w:pPr>
       <w:proofErr w:type="spellStart"/>
-      <w:proofErr w:type="gramStart"/>
       <w:r>
         <w:t>router.query</w:t>
       </w:r>
       <w:proofErr w:type="spellEnd"/>
-      <w:proofErr w:type="gramEnd"/>
       <w:r>
         <w:t xml:space="preserve"> → only exists in </w:t>
       </w:r>
@@ -12231,13 +11119,8 @@
           <w:numId w:val="5"/>
         </w:numPr>
       </w:pPr>
-      <w:proofErr w:type="gramStart"/>
-      <w:r>
-        <w:t>So</w:t>
-      </w:r>
-      <w:proofErr w:type="gramEnd"/>
-      <w:r>
-        <w:t xml:space="preserve"> dependency never updates → no re-render</w:t>
+      <w:r>
+        <w:t>So dependency never updates → no re-render</w:t>
       </w:r>
     </w:p>
     <w:p>
@@ -12277,7 +11160,6 @@
     </w:p>
     <w:p>
       <w:proofErr w:type="spellStart"/>
-      <w:proofErr w:type="gramStart"/>
       <w:r>
         <w:t>setKey</w:t>
       </w:r>
@@ -12286,7 +11168,6 @@
         <w:t>(</w:t>
       </w:r>
       <w:proofErr w:type="spellStart"/>
-      <w:proofErr w:type="gramEnd"/>
       <w:r>
         <w:t>Math.random</w:t>
       </w:r>
@@ -12307,13 +11188,8 @@
       </w:r>
     </w:p>
     <w:p>
-      <w:proofErr w:type="gramStart"/>
-      <w:r>
-        <w:t>Instead</w:t>
-      </w:r>
-      <w:proofErr w:type="gramEnd"/>
-      <w:r>
-        <w:t xml:space="preserve"> just:</w:t>
+      <w:r>
+        <w:t>Instead just:</w:t>
       </w:r>
     </w:p>
     <w:p>
@@ -12358,70 +11234,36 @@
     </w:p>
     <w:p>
       <w:r>
-        <w:t>"</w:t>
-      </w:r>
-      <w:proofErr w:type="gramStart"/>
-      <w:r>
-        <w:t>use</w:t>
-      </w:r>
-      <w:proofErr w:type="gramEnd"/>
-      <w:r>
-        <w:t xml:space="preserve"> client"</w:t>
-      </w:r>
-    </w:p>
-    <w:p>
-      <w:r>
-        <w:t xml:space="preserve">import React, </w:t>
-      </w:r>
-      <w:proofErr w:type="gramStart"/>
-      <w:r>
-        <w:t>{ useEffect</w:t>
-      </w:r>
-      <w:proofErr w:type="gramEnd"/>
-      <w:r>
-        <w:t xml:space="preserve">, </w:t>
-      </w:r>
-      <w:proofErr w:type="spellStart"/>
-      <w:proofErr w:type="gramStart"/>
+        <w:t>"use client"</w:t>
+      </w:r>
+    </w:p>
+    <w:p>
+      <w:r>
+        <w:t xml:space="preserve">import React, { useEffect, </w:t>
+      </w:r>
+      <w:proofErr w:type="spellStart"/>
       <w:r>
         <w:t>useState</w:t>
       </w:r>
       <w:proofErr w:type="spellEnd"/>
       <w:r>
-        <w:t xml:space="preserve"> }</w:t>
-      </w:r>
-      <w:proofErr w:type="gramEnd"/>
-      <w:r>
-        <w:t xml:space="preserve"> from "react";</w:t>
-      </w:r>
-    </w:p>
-    <w:p>
-      <w:r>
-        <w:t xml:space="preserve">import Navbar from </w:t>
-      </w:r>
-      <w:proofErr w:type="gramStart"/>
-      <w:r>
-        <w:t>"./</w:t>
-      </w:r>
-      <w:proofErr w:type="gramEnd"/>
-      <w:r>
-        <w:t>Navbar";</w:t>
-      </w:r>
-    </w:p>
-    <w:p>
-      <w:r>
-        <w:t xml:space="preserve">import </w:t>
-      </w:r>
-      <w:proofErr w:type="gramStart"/>
-      <w:r>
-        <w:t xml:space="preserve">{ </w:t>
+        <w:t xml:space="preserve"> } from "react";</w:t>
+      </w:r>
+    </w:p>
+    <w:p>
+      <w:r>
+        <w:t>import Navbar from "./Navbar";</w:t>
+      </w:r>
+    </w:p>
+    <w:p>
+      <w:r>
+        <w:t xml:space="preserve">import { </w:t>
       </w:r>
       <w:proofErr w:type="spellStart"/>
       <w:r>
         <w:t>usePathname</w:t>
       </w:r>
       <w:proofErr w:type="spellEnd"/>
-      <w:proofErr w:type="gramEnd"/>
       <w:r>
         <w:t xml:space="preserve"> } from "next/navigation";</w:t>
       </w:r>
@@ -12432,17 +11274,12 @@
         <w:t xml:space="preserve">function </w:t>
       </w:r>
       <w:proofErr w:type="spellStart"/>
-      <w:proofErr w:type="gramStart"/>
       <w:r>
         <w:t>SuperNavBar</w:t>
       </w:r>
       <w:proofErr w:type="spellEnd"/>
       <w:r>
-        <w:t>(</w:t>
-      </w:r>
-      <w:proofErr w:type="gramEnd"/>
-      <w:r>
-        <w:t>) {</w:t>
+        <w:t>() {</w:t>
       </w:r>
     </w:p>
     <w:p>
@@ -12458,17 +11295,12 @@
         <w:t xml:space="preserve"> pathname = </w:t>
       </w:r>
       <w:proofErr w:type="spellStart"/>
-      <w:proofErr w:type="gramStart"/>
       <w:r>
         <w:t>usePathname</w:t>
       </w:r>
       <w:proofErr w:type="spellEnd"/>
       <w:r>
-        <w:t>(</w:t>
-      </w:r>
-      <w:proofErr w:type="gramEnd"/>
-      <w:r>
-        <w:t>);</w:t>
+        <w:t>();</w:t>
       </w:r>
     </w:p>
     <w:p>
@@ -12492,39 +11324,18 @@
         <w:t xml:space="preserve">] = </w:t>
       </w:r>
       <w:proofErr w:type="spellStart"/>
-      <w:proofErr w:type="gramStart"/>
       <w:r>
         <w:t>useState</w:t>
       </w:r>
       <w:proofErr w:type="spellEnd"/>
       <w:r>
-        <w:t>({ value</w:t>
-      </w:r>
-      <w:proofErr w:type="gramEnd"/>
-      <w:r>
-        <w:t xml:space="preserve">: </w:t>
-      </w:r>
-      <w:proofErr w:type="gramStart"/>
-      <w:r>
-        <w:t>null }</w:t>
-      </w:r>
-      <w:proofErr w:type="gramEnd"/>
-      <w:r>
-        <w:t>);</w:t>
+        <w:t>({ value: null });</w:t>
       </w:r>
     </w:p>
     <w:p/>
     <w:p>
       <w:r>
-        <w:t xml:space="preserve">  </w:t>
-      </w:r>
-      <w:proofErr w:type="gramStart"/>
-      <w:r>
-        <w:t>useEffect(</w:t>
-      </w:r>
-      <w:proofErr w:type="gramEnd"/>
-      <w:r>
-        <w:t>() =&gt; {</w:t>
+        <w:t xml:space="preserve">  useEffect(() =&gt; {</w:t>
       </w:r>
     </w:p>
     <w:p>
@@ -12560,25 +11371,12 @@
         <w:t xml:space="preserve">      </w:t>
       </w:r>
       <w:proofErr w:type="spellStart"/>
-      <w:proofErr w:type="gramStart"/>
       <w:r>
         <w:t>setUser</w:t>
       </w:r>
       <w:proofErr w:type="spellEnd"/>
       <w:r>
-        <w:t>({ value</w:t>
-      </w:r>
-      <w:proofErr w:type="gramEnd"/>
-      <w:r>
-        <w:t xml:space="preserve">: </w:t>
-      </w:r>
-      <w:proofErr w:type="gramStart"/>
-      <w:r>
-        <w:t>token }</w:t>
-      </w:r>
-      <w:proofErr w:type="gramEnd"/>
-      <w:r>
-        <w:t>);</w:t>
+        <w:t>({ value: token });</w:t>
       </w:r>
     </w:p>
     <w:p>
@@ -12648,12 +11446,10 @@
     </w:p>
     <w:p>
       <w:proofErr w:type="spellStart"/>
-      <w:proofErr w:type="gramStart"/>
       <w:r>
         <w:t>router.query</w:t>
       </w:r>
       <w:proofErr w:type="spellEnd"/>
-      <w:proofErr w:type="gramEnd"/>
       <w:r>
         <w:t xml:space="preserve"> </w:t>
       </w:r>
@@ -12762,13 +11558,8 @@
     </w:p>
     <w:p>
       <w:r>
-        <w:t xml:space="preserve">If you see such thing in a site and it is </w:t>
-      </w:r>
-      <w:proofErr w:type="gramStart"/>
-      <w:r>
-        <w:t>react</w:t>
-      </w:r>
-      <w:proofErr w:type="gramEnd"/>
+        <w:t>If you see such thing in a site and it is react</w:t>
+      </w:r>
       <w:r>
         <w:t xml:space="preserve"> website</w:t>
       </w:r>
@@ -12828,13 +11619,8 @@
       </w:r>
     </w:p>
     <w:p>
-      <w:proofErr w:type="gramStart"/>
-      <w:r>
-        <w:t>However</w:t>
-      </w:r>
-      <w:proofErr w:type="gramEnd"/>
-      <w:r>
-        <w:t xml:space="preserve"> there are other ways </w:t>
+      <w:r>
+        <w:t xml:space="preserve">However there are other ways </w:t>
       </w:r>
       <w:r>
         <w:t>to do it</w:t>
@@ -12951,280 +11737,488 @@
         <w:t xml:space="preserve"> an event by </w:t>
       </w:r>
       <w:proofErr w:type="spellStart"/>
-      <w:proofErr w:type="gramStart"/>
       <w:r>
         <w:rPr>
           <w:b/>
           <w:bCs/>
           <w:color w:val="EE0000"/>
         </w:rPr>
-        <w:t>router.events</w:t>
-      </w:r>
-      <w:proofErr w:type="gramEnd"/>
+        <w:t>router.events.on</w:t>
+      </w:r>
+      <w:proofErr w:type="spellEnd"/>
       <w:r>
         <w:rPr>
           <w:b/>
           <w:bCs/>
           <w:color w:val="EE0000"/>
         </w:rPr>
+        <w:t>(“event name”,&lt;event handler callback&gt;)</w:t>
+      </w:r>
+      <w:r>
+        <w:rPr>
+          <w:b/>
+          <w:bCs/>
+          <w:color w:val="EE0000"/>
+        </w:rPr>
+        <w:t xml:space="preserve"> we used to listen for the event</w:t>
+      </w:r>
+      <w:r>
+        <w:rPr>
+          <w:b/>
+          <w:bCs/>
+          <w:color w:val="EE0000"/>
+        </w:rPr>
+        <w:t xml:space="preserve"> </w:t>
+      </w:r>
+      <w:proofErr w:type="spellStart"/>
+      <w:r>
+        <w:rPr>
+          <w:b/>
+          <w:bCs/>
+          <w:color w:val="EE0000"/>
+        </w:rPr>
+        <w:t>routerChangeComplete</w:t>
+      </w:r>
+      <w:proofErr w:type="spellEnd"/>
+      <w:r>
+        <w:rPr>
+          <w:b/>
+          <w:bCs/>
+          <w:color w:val="EE0000"/>
+        </w:rPr>
+        <w:t xml:space="preserve"> </w:t>
+      </w:r>
+    </w:p>
+    <w:p>
+      <w:pPr>
+        <w:rPr>
+          <w:b/>
+          <w:bCs/>
+          <w:color w:val="EE0000"/>
+        </w:rPr>
+      </w:pPr>
+      <w:r>
+        <w:rPr>
+          <w:b/>
+          <w:bCs/>
+          <w:color w:val="EE0000"/>
+        </w:rPr>
+        <w:t xml:space="preserve">But now in modern we can use it in the useEffect normally and set pathname as a trigger for </w:t>
+      </w:r>
+      <w:r>
+        <w:rPr>
+          <w:b/>
+          <w:bCs/>
+          <w:color w:val="EE0000"/>
+        </w:rPr>
+        <w:t xml:space="preserve">the useEffect in our top component </w:t>
+      </w:r>
+    </w:p>
+    <w:p>
+      <w:r>
+        <w:t>We obser</w:t>
+      </w:r>
+      <w:r>
+        <w:t xml:space="preserve">ved that when the loader reaches </w:t>
+      </w:r>
+      <w:r>
+        <w:t xml:space="preserve">100 </w:t>
+      </w:r>
+      <w:proofErr w:type="spellStart"/>
+      <w:r>
+        <w:t>percnt</w:t>
+      </w:r>
+      <w:proofErr w:type="spellEnd"/>
+      <w:r>
+        <w:t xml:space="preserve"> it </w:t>
+      </w:r>
+      <w:proofErr w:type="spellStart"/>
+      <w:r>
+        <w:t>fases</w:t>
+      </w:r>
+      <w:proofErr w:type="spellEnd"/>
+      <w:r>
+        <w:t xml:space="preserve"> out but it </w:t>
+      </w:r>
+      <w:proofErr w:type="spellStart"/>
+      <w:r>
+        <w:t>gase</w:t>
+      </w:r>
+      <w:proofErr w:type="spellEnd"/>
+      <w:r>
+        <w:t xml:space="preserve"> out after slightly long delay we can control it by </w:t>
+      </w:r>
+      <w:proofErr w:type="spellStart"/>
+      <w:r>
+        <w:t>waitingTime</w:t>
+      </w:r>
+      <w:proofErr w:type="spellEnd"/>
+      <w:r>
+        <w:t xml:space="preserve"> attribute. </w:t>
+      </w:r>
+    </w:p>
+    <w:p>
+      <w:pPr>
+        <w:rPr>
+          <w:b/>
+          <w:bCs/>
+        </w:rPr>
+      </w:pPr>
+      <w:r>
+        <w:rPr>
+          <w:b/>
+          <w:bCs/>
+        </w:rPr>
+        <w:t xml:space="preserve">There was also an  event </w:t>
+      </w:r>
+      <w:r>
+        <w:rPr>
+          <w:b/>
+          <w:bCs/>
+        </w:rPr>
+        <w:t xml:space="preserve">that was called </w:t>
+      </w:r>
+      <w:proofErr w:type="spellStart"/>
+      <w:r>
+        <w:rPr>
+          <w:b/>
+          <w:bCs/>
+        </w:rPr>
+        <w:t>routerchangeStart</w:t>
+      </w:r>
+      <w:proofErr w:type="spellEnd"/>
+      <w:r>
+        <w:rPr>
+          <w:b/>
+          <w:bCs/>
+        </w:rPr>
+        <w:t xml:space="preserve"> which was called when the router start routing </w:t>
+      </w:r>
+      <w:r>
+        <w:rPr>
+          <w:b/>
+          <w:bCs/>
+        </w:rPr>
+        <w:t>but now no such thing exist so we need to do a</w:t>
+      </w:r>
+      <w:r>
+        <w:rPr>
+          <w:b/>
+          <w:bCs/>
+        </w:rPr>
+        <w:t>p</w:t>
+      </w:r>
+      <w:r>
+        <w:rPr>
+          <w:b/>
+          <w:bCs/>
+        </w:rPr>
+        <w:t xml:space="preserve">ply it in </w:t>
+      </w:r>
+      <w:proofErr w:type="spellStart"/>
+      <w:r>
+        <w:rPr>
+          <w:b/>
+          <w:bCs/>
+        </w:rPr>
+        <w:t>onClick</w:t>
+      </w:r>
+      <w:proofErr w:type="spellEnd"/>
+      <w:r>
+        <w:rPr>
+          <w:b/>
+          <w:bCs/>
+        </w:rPr>
+        <w:t xml:space="preserve"> on Link </w:t>
+      </w:r>
+    </w:p>
+    <w:p>
+      <w:r>
+        <w:t xml:space="preserve">Now there is another site that is </w:t>
+      </w:r>
+      <w:proofErr w:type="spellStart"/>
+      <w:r>
+        <w:t>tw</w:t>
+      </w:r>
+      <w:proofErr w:type="spellEnd"/>
+      <w:r>
+        <w:t xml:space="preserve">-elements that we used for tables </w:t>
+      </w:r>
+      <w:r>
+        <w:t xml:space="preserve">and the keyword is like </w:t>
+      </w:r>
+    </w:p>
+    <w:p>
+      <w:pPr>
+        <w:rPr>
+          <w:b/>
+          <w:bCs/>
+        </w:rPr>
+      </w:pPr>
+      <w:r>
+        <w:rPr>
+          <w:b/>
+          <w:bCs/>
+        </w:rPr>
+        <w:t>tailwind css table component</w:t>
+      </w:r>
+    </w:p>
+    <w:p>
+      <w:pPr>
+        <w:jc w:val="center"/>
+      </w:pPr>
+      <w:r>
+        <w:drawing>
+          <wp:inline distT="0" distB="0" distL="0" distR="0" wp14:anchorId="037A21E4" wp14:editId="237314CE">
+            <wp:extent cx="5731510" cy="5040630"/>
+            <wp:effectExtent l="0" t="0" r="2540" b="7620"/>
+            <wp:docPr id="305372328" name="Picture 1"/>
+            <wp:cNvGraphicFramePr>
+              <a:graphicFrameLocks xmlns:a="http://schemas.openxmlformats.org/drawingml/2006/main" noChangeAspect="1"/>
+            </wp:cNvGraphicFramePr>
+            <a:graphic xmlns:a="http://schemas.openxmlformats.org/drawingml/2006/main">
+              <a:graphicData uri="http://schemas.openxmlformats.org/drawingml/2006/picture">
+                <pic:pic xmlns:pic="http://schemas.openxmlformats.org/drawingml/2006/picture">
+                  <pic:nvPicPr>
+                    <pic:cNvPr id="305372328" name=""/>
+                    <pic:cNvPicPr/>
+                  </pic:nvPicPr>
+                  <pic:blipFill>
+                    <a:blip r:embed="rId63"/>
+                    <a:stretch>
+                      <a:fillRect/>
+                    </a:stretch>
+                  </pic:blipFill>
+                  <pic:spPr>
+                    <a:xfrm>
+                      <a:off x="0" y="0"/>
+                      <a:ext cx="5731510" cy="5040630"/>
+                    </a:xfrm>
+                    <a:prstGeom prst="rect">
+                      <a:avLst/>
+                    </a:prstGeom>
+                  </pic:spPr>
+                </pic:pic>
+              </a:graphicData>
+            </a:graphic>
+          </wp:inline>
+        </w:drawing>
+      </w:r>
+    </w:p>
+    <w:p>
+      <w:hyperlink r:id="rId64" w:history="1">
+        <w:r>
+          <w:rPr>
+            <w:rStyle w:val="Hyperlink"/>
+          </w:rPr>
+          <w:t>https://tw-elements.com/docs/standard/data/tables/</w:t>
+        </w:r>
+      </w:hyperlink>
+      <w:r>
+        <w:t xml:space="preserve"> </w:t>
+      </w:r>
+      <w:r>
+        <w:t>This is the url of the above site.</w:t>
+      </w:r>
+    </w:p>
+    <w:p>
+      <w:r>
+        <w:t xml:space="preserve">When we reach the site by the above keyword highlighted keyword then </w:t>
+      </w:r>
+      <w:r>
+        <w:t>we see above and we copy</w:t>
+      </w:r>
+      <w:r>
+        <w:t xml:space="preserve"> </w:t>
+      </w:r>
+      <w:r>
+        <w:t>the code.</w:t>
+      </w:r>
+    </w:p>
+    <w:p>
+      <w:r>
+        <w:t>We also use the url below</w:t>
+      </w:r>
+    </w:p>
+    <w:p>
+      <w:hyperlink r:id="rId65" w:history="1">
+        <w:r>
+          <w:rPr>
+            <w:rStyle w:val="Hyperlink"/>
+          </w:rPr>
+          <w:t>https://tailwindcss.com/docs/table-layout</w:t>
+        </w:r>
+      </w:hyperlink>
+    </w:p>
+    <w:p>
+      <w:r>
+        <w:t>To clear console click on the marked below</w:t>
+      </w:r>
+    </w:p>
+    <w:p>
+      <w:pPr>
+        <w:jc w:val="center"/>
+      </w:pPr>
+      <w:r>
+        <w:drawing>
+          <wp:inline distT="0" distB="0" distL="0" distR="0" wp14:anchorId="1929315E" wp14:editId="22DE16A2">
+            <wp:extent cx="5731510" cy="1262380"/>
+            <wp:effectExtent l="0" t="0" r="2540" b="0"/>
+            <wp:docPr id="1863902105" name="Picture 1"/>
+            <wp:cNvGraphicFramePr>
+              <a:graphicFrameLocks xmlns:a="http://schemas.openxmlformats.org/drawingml/2006/main" noChangeAspect="1"/>
+            </wp:cNvGraphicFramePr>
+            <a:graphic xmlns:a="http://schemas.openxmlformats.org/drawingml/2006/main">
+              <a:graphicData uri="http://schemas.openxmlformats.org/drawingml/2006/picture">
+                <pic:pic xmlns:pic="http://schemas.openxmlformats.org/drawingml/2006/picture">
+                  <pic:nvPicPr>
+                    <pic:cNvPr id="1863902105" name=""/>
+                    <pic:cNvPicPr/>
+                  </pic:nvPicPr>
+                  <pic:blipFill>
+                    <a:blip r:embed="rId66"/>
+                    <a:stretch>
+                      <a:fillRect/>
+                    </a:stretch>
+                  </pic:blipFill>
+                  <pic:spPr>
+                    <a:xfrm>
+                      <a:off x="0" y="0"/>
+                      <a:ext cx="5731510" cy="1262380"/>
+                    </a:xfrm>
+                    <a:prstGeom prst="rect">
+                      <a:avLst/>
+                    </a:prstGeom>
+                  </pic:spPr>
+                </pic:pic>
+              </a:graphicData>
+            </a:graphic>
+          </wp:inline>
+        </w:drawing>
+      </w:r>
+    </w:p>
+    <w:p>
+      <w:r>
+        <w:t xml:space="preserve">Teacher indirectly says that </w:t>
+      </w:r>
+      <w:r>
+        <w:t xml:space="preserve">in blogs when you logout </w:t>
+      </w:r>
+      <w:r>
+        <w:t>then you stays in the same page after reload but you are not logged in.</w:t>
+      </w:r>
+    </w:p>
+    <w:p>
+      <w:pPr>
+        <w:rPr>
+          <w:b/>
+          <w:bCs/>
+          <w:color w:val="EE0000"/>
+        </w:rPr>
+      </w:pPr>
+      <w:r>
+        <w:rPr>
+          <w:b/>
+          <w:bCs/>
+          <w:color w:val="EE0000"/>
+        </w:rPr>
+        <w:t>Teacher says In orders page there is a tracking link associated with a product to track the product.(who knows)</w:t>
+      </w:r>
+    </w:p>
+    <w:p>
+      <w:r>
+        <w:t>Teacher would want that</w:t>
+      </w:r>
+      <w:r>
+        <w:t xml:space="preserve"> user </w:t>
+      </w:r>
+      <w:r>
+        <w:t>pay</w:t>
+      </w:r>
+      <w:r>
+        <w:t xml:space="preserve"> payment through payment gateway </w:t>
+      </w:r>
+      <w:r>
+        <w:t xml:space="preserve">and we add order </w:t>
+      </w:r>
+      <w:r>
+        <w:t xml:space="preserve"> user and then </w:t>
+      </w:r>
+      <w:r>
+        <w:t>redirect him to order page</w:t>
+      </w:r>
+      <w:r>
+        <w:t xml:space="preserve"> that we made.</w:t>
+      </w:r>
+    </w:p>
+    <w:p>
+      <w:pPr>
+        <w:jc w:val="center"/>
+      </w:pPr>
+      <w:r>
+        <w:drawing>
+          <wp:inline distT="0" distB="0" distL="0" distR="0" wp14:anchorId="4DEEAF9E" wp14:editId="5481759D">
+            <wp:extent cx="5731510" cy="2832735"/>
+            <wp:effectExtent l="0" t="0" r="2540" b="5715"/>
+            <wp:docPr id="695978645" name="Picture 1"/>
+            <wp:cNvGraphicFramePr>
+              <a:graphicFrameLocks xmlns:a="http://schemas.openxmlformats.org/drawingml/2006/main" noChangeAspect="1"/>
+            </wp:cNvGraphicFramePr>
+            <a:graphic xmlns:a="http://schemas.openxmlformats.org/drawingml/2006/main">
+              <a:graphicData uri="http://schemas.openxmlformats.org/drawingml/2006/picture">
+                <pic:pic xmlns:pic="http://schemas.openxmlformats.org/drawingml/2006/picture">
+                  <pic:nvPicPr>
+                    <pic:cNvPr id="695978645" name=""/>
+                    <pic:cNvPicPr/>
+                  </pic:nvPicPr>
+                  <pic:blipFill>
+                    <a:blip r:embed="rId67"/>
+                    <a:stretch>
+                      <a:fillRect/>
+                    </a:stretch>
+                  </pic:blipFill>
+                  <pic:spPr>
+                    <a:xfrm>
+                      <a:off x="0" y="0"/>
+                      <a:ext cx="5731510" cy="2832735"/>
+                    </a:xfrm>
+                    <a:prstGeom prst="rect">
+                      <a:avLst/>
+                    </a:prstGeom>
+                  </pic:spPr>
+                </pic:pic>
+              </a:graphicData>
+            </a:graphic>
+          </wp:inline>
+        </w:drawing>
+      </w:r>
+    </w:p>
+    <w:p>
+      <w:r>
+        <w:t xml:space="preserve">That this is your Order id </w:t>
+      </w:r>
+      <w:r>
+        <w:t xml:space="preserve">and this is your Subtotal </w:t>
+      </w:r>
+      <w:r>
+        <w:t>and these are your items and this is your tracking li</w:t>
+      </w:r>
+      <w:r>
+        <w:t>nk(who knows</w:t>
+      </w:r>
+      <w:r>
+        <w:t xml:space="preserve"> maybe link to track the order</w:t>
+      </w:r>
+      <w:r>
+        <w:t>)</w:t>
+      </w:r>
+      <w:r>
         <w:t>.</w:t>
       </w:r>
-      <w:proofErr w:type="gramStart"/>
-      <w:r>
-        <w:rPr>
-          <w:b/>
-          <w:bCs/>
-          <w:color w:val="EE0000"/>
-        </w:rPr>
-        <w:t>on</w:t>
-      </w:r>
-      <w:proofErr w:type="spellEnd"/>
-      <w:r>
-        <w:rPr>
-          <w:b/>
-          <w:bCs/>
-          <w:color w:val="EE0000"/>
-        </w:rPr>
-        <w:t>(</w:t>
-      </w:r>
-      <w:proofErr w:type="gramEnd"/>
-      <w:r>
-        <w:rPr>
-          <w:b/>
-          <w:bCs/>
-          <w:color w:val="EE0000"/>
-        </w:rPr>
-        <w:t>“event name</w:t>
-      </w:r>
-      <w:proofErr w:type="gramStart"/>
-      <w:r>
-        <w:rPr>
-          <w:b/>
-          <w:bCs/>
-          <w:color w:val="EE0000"/>
-        </w:rPr>
-        <w:t>”,&lt;</w:t>
-      </w:r>
-      <w:proofErr w:type="gramEnd"/>
-      <w:r>
-        <w:rPr>
-          <w:b/>
-          <w:bCs/>
-          <w:color w:val="EE0000"/>
-        </w:rPr>
-        <w:t>event handler callback&gt;)</w:t>
-      </w:r>
-      <w:r>
-        <w:rPr>
-          <w:b/>
-          <w:bCs/>
-          <w:color w:val="EE0000"/>
-        </w:rPr>
-        <w:t xml:space="preserve"> we used to listen for the event</w:t>
-      </w:r>
-      <w:r>
-        <w:rPr>
-          <w:b/>
-          <w:bCs/>
-          <w:color w:val="EE0000"/>
-        </w:rPr>
+      <w:r>
         <w:t xml:space="preserve"> </w:t>
       </w:r>
-      <w:proofErr w:type="spellStart"/>
-      <w:r>
-        <w:rPr>
-          <w:b/>
-          <w:bCs/>
-          <w:color w:val="EE0000"/>
-        </w:rPr>
-        <w:t>routerChangeComplete</w:t>
-      </w:r>
-      <w:proofErr w:type="spellEnd"/>
-      <w:r>
-        <w:rPr>
-          <w:b/>
-          <w:bCs/>
-          <w:color w:val="EE0000"/>
-        </w:rPr>
-        <w:t xml:space="preserve"> </w:t>
-      </w:r>
-    </w:p>
-    <w:p>
-      <w:pPr>
-        <w:rPr>
-          <w:b/>
-          <w:bCs/>
-          <w:color w:val="EE0000"/>
-        </w:rPr>
-      </w:pPr>
-      <w:r>
-        <w:rPr>
-          <w:b/>
-          <w:bCs/>
-          <w:color w:val="EE0000"/>
-        </w:rPr>
-        <w:t xml:space="preserve">But now in modern we can use it in the useEffect normally and set pathname as a trigger for </w:t>
-      </w:r>
-      <w:r>
-        <w:rPr>
-          <w:b/>
-          <w:bCs/>
-          <w:color w:val="EE0000"/>
-        </w:rPr>
-        <w:t xml:space="preserve">the useEffect in our top component </w:t>
-      </w:r>
-    </w:p>
-    <w:p>
-      <w:r>
-        <w:t>We obser</w:t>
-      </w:r>
-      <w:r>
-        <w:t xml:space="preserve">ved that when the loader reaches </w:t>
-      </w:r>
-      <w:r>
-        <w:t xml:space="preserve">100 </w:t>
-      </w:r>
-      <w:proofErr w:type="spellStart"/>
-      <w:r>
-        <w:t>percnt</w:t>
-      </w:r>
-      <w:proofErr w:type="spellEnd"/>
-      <w:r>
-        <w:t xml:space="preserve"> it </w:t>
-      </w:r>
-      <w:proofErr w:type="spellStart"/>
-      <w:r>
-        <w:t>fases</w:t>
-      </w:r>
-      <w:proofErr w:type="spellEnd"/>
-      <w:r>
-        <w:t xml:space="preserve"> out but it </w:t>
-      </w:r>
-      <w:proofErr w:type="spellStart"/>
-      <w:r>
-        <w:t>gase</w:t>
-      </w:r>
-      <w:proofErr w:type="spellEnd"/>
-      <w:r>
-        <w:t xml:space="preserve"> out after slightly long delay we can control it by </w:t>
-      </w:r>
-      <w:proofErr w:type="spellStart"/>
-      <w:r>
-        <w:t>waitingTime</w:t>
-      </w:r>
-      <w:proofErr w:type="spellEnd"/>
-      <w:r>
-        <w:t xml:space="preserve"> attribute. </w:t>
-      </w:r>
-    </w:p>
-    <w:p>
-      <w:pPr>
-        <w:rPr>
-          <w:b/>
-          <w:bCs/>
-        </w:rPr>
-      </w:pPr>
-      <w:r>
-        <w:rPr>
-          <w:b/>
-          <w:bCs/>
-        </w:rPr>
-        <w:t xml:space="preserve">There was also </w:t>
-      </w:r>
-      <w:proofErr w:type="gramStart"/>
-      <w:r>
-        <w:rPr>
-          <w:b/>
-          <w:bCs/>
-        </w:rPr>
-        <w:t>an  event</w:t>
-      </w:r>
-      <w:proofErr w:type="gramEnd"/>
-      <w:r>
-        <w:rPr>
-          <w:b/>
-          <w:bCs/>
-        </w:rPr>
-        <w:t xml:space="preserve"> </w:t>
-      </w:r>
-      <w:r>
-        <w:rPr>
-          <w:b/>
-          <w:bCs/>
-        </w:rPr>
-        <w:t xml:space="preserve">that was called </w:t>
-      </w:r>
-      <w:proofErr w:type="spellStart"/>
-      <w:r>
-        <w:rPr>
-          <w:b/>
-          <w:bCs/>
-        </w:rPr>
-        <w:t>routerchangeStart</w:t>
-      </w:r>
-      <w:proofErr w:type="spellEnd"/>
-      <w:r>
-        <w:rPr>
-          <w:b/>
-          <w:bCs/>
-        </w:rPr>
-        <w:t xml:space="preserve"> which was called when the router start routing </w:t>
-      </w:r>
-      <w:r>
-        <w:rPr>
-          <w:b/>
-          <w:bCs/>
-        </w:rPr>
-        <w:t xml:space="preserve">but now no such thing </w:t>
-      </w:r>
-      <w:proofErr w:type="gramStart"/>
-      <w:r>
-        <w:rPr>
-          <w:b/>
-          <w:bCs/>
-        </w:rPr>
-        <w:t>exist</w:t>
-      </w:r>
-      <w:proofErr w:type="gramEnd"/>
-      <w:r>
-        <w:rPr>
-          <w:b/>
-          <w:bCs/>
-        </w:rPr>
-        <w:t xml:space="preserve"> so we need to do a</w:t>
-      </w:r>
-      <w:r>
-        <w:rPr>
-          <w:b/>
-          <w:bCs/>
-        </w:rPr>
-        <w:t>p</w:t>
-      </w:r>
-      <w:r>
-        <w:rPr>
-          <w:b/>
-          <w:bCs/>
-        </w:rPr>
-        <w:t xml:space="preserve">ply it in </w:t>
-      </w:r>
-      <w:proofErr w:type="spellStart"/>
-      <w:r>
-        <w:rPr>
-          <w:b/>
-          <w:bCs/>
-        </w:rPr>
-        <w:t>onClick</w:t>
-      </w:r>
-      <w:proofErr w:type="spellEnd"/>
-      <w:r>
-        <w:rPr>
-          <w:b/>
-          <w:bCs/>
-        </w:rPr>
-        <w:t xml:space="preserve"> on Link </w:t>
-      </w:r>
-    </w:p>
-    <w:p/>
+    </w:p>
     <w:sectPr>
       <w:pgSz w:w="11906" w:h="16838"/>
       <w:pgMar w:top="1440" w:right="1440" w:bottom="1440" w:left="1440" w:header="708" w:footer="708" w:gutter="0"/>

</xml_diff>

<commit_message>
Lesson 61 Adding Environment Variables to Codeswear.com
</commit_message>
<xml_diff>
--- a/Notes2.docx
+++ b/Notes2.docx
@@ -59,10 +59,18 @@
     </w:p>
     <w:p>
       <w:r>
-        <w:t>In nay container</w:t>
-      </w:r>
-      <w:r>
-        <w:t>(or component)</w:t>
+        <w:t xml:space="preserve">In nay </w:t>
+      </w:r>
+      <w:proofErr w:type="gramStart"/>
+      <w:r>
+        <w:t>container</w:t>
+      </w:r>
+      <w:r>
+        <w:t>(</w:t>
+      </w:r>
+      <w:proofErr w:type="gramEnd"/>
+      <w:r>
+        <w:t>or component)</w:t>
       </w:r>
       <w:r>
         <w:t xml:space="preserve"> if you want to </w:t>
@@ -547,9 +555,14 @@
       </w:r>
     </w:p>
     <w:p>
+      <w:proofErr w:type="gramStart"/>
       <w:r>
         <w:lastRenderedPageBreak/>
-        <w:t>So we can so this thing Now we can see it is getting rendered as shown below</w:t>
+        <w:t>So</w:t>
+      </w:r>
+      <w:proofErr w:type="gramEnd"/>
+      <w:r>
+        <w:t xml:space="preserve"> we can so this thing Now we can see it is getting rendered as shown below</w:t>
       </w:r>
     </w:p>
     <w:p>
@@ -651,8 +664,13 @@
         <w:t xml:space="preserve"> s</w:t>
       </w:r>
       <w:r>
-        <w:t>ubmit the form</w:t>
-      </w:r>
+        <w:t xml:space="preserve">ubmit the </w:t>
+      </w:r>
+      <w:proofErr w:type="gramStart"/>
+      <w:r>
+        <w:t>form</w:t>
+      </w:r>
+      <w:proofErr w:type="gramEnd"/>
       <w:r>
         <w:t xml:space="preserve"> we will definitely have to make an API to co</w:t>
       </w:r>
@@ -718,8 +736,29 @@
       </w:r>
     </w:p>
     <w:p>
-      <w:r>
-        <w:t>So for now our post request handler look like below</w:t>
+      <w:proofErr w:type="gramStart"/>
+      <w:r>
+        <w:t>So</w:t>
+      </w:r>
+      <w:proofErr w:type="gramEnd"/>
+      <w:r>
+        <w:t xml:space="preserve"> for </w:t>
+      </w:r>
+      <w:proofErr w:type="gramStart"/>
+      <w:r>
+        <w:t>now</w:t>
+      </w:r>
+      <w:proofErr w:type="gramEnd"/>
+      <w:r>
+        <w:t xml:space="preserve"> our post request handler </w:t>
+      </w:r>
+      <w:proofErr w:type="gramStart"/>
+      <w:r>
+        <w:t>look</w:t>
+      </w:r>
+      <w:proofErr w:type="gramEnd"/>
+      <w:r>
+        <w:t xml:space="preserve"> like below</w:t>
       </w:r>
     </w:p>
     <w:p>
@@ -768,8 +807,13 @@
       </w:r>
     </w:p>
     <w:p>
-      <w:r>
-        <w:t>Ols version used to look like below</w:t>
+      <w:proofErr w:type="gramStart"/>
+      <w:r>
+        <w:t>Ols</w:t>
+      </w:r>
+      <w:proofErr w:type="gramEnd"/>
+      <w:r>
+        <w:t xml:space="preserve"> version used to look like below</w:t>
       </w:r>
     </w:p>
     <w:p>
@@ -877,10 +921,12 @@
         <w:t xml:space="preserve">, not plain JSON, so sending it directly with </w:t>
       </w:r>
       <w:proofErr w:type="spellStart"/>
+      <w:proofErr w:type="gramStart"/>
       <w:r>
         <w:t>res.json</w:t>
       </w:r>
       <w:proofErr w:type="spellEnd"/>
+      <w:proofErr w:type="gramEnd"/>
       <w:r>
         <w:t>(</w:t>
       </w:r>
@@ -938,9 +984,14 @@
     </w:p>
     <w:p>
       <w:r>
-        <w:t>export default function handler(</w:t>
-      </w:r>
-      <w:proofErr w:type="spellStart"/>
+        <w:t xml:space="preserve">export default function </w:t>
+      </w:r>
+      <w:proofErr w:type="gramStart"/>
+      <w:r>
+        <w:t>handler(</w:t>
+      </w:r>
+      <w:proofErr w:type="spellStart"/>
+      <w:proofErr w:type="gramEnd"/>
       <w:r>
         <w:t>req</w:t>
       </w:r>
@@ -1046,6 +1097,7 @@
         <w:t xml:space="preserve">Why </w:t>
       </w:r>
       <w:proofErr w:type="spellStart"/>
+      <w:proofErr w:type="gramStart"/>
       <w:r>
         <w:rPr>
           <w:b/>
@@ -1054,6 +1106,7 @@
         <w:t>res.json</w:t>
       </w:r>
       <w:proofErr w:type="spellEnd"/>
+      <w:proofErr w:type="gramEnd"/>
       <w:r>
         <w:rPr>
           <w:b/>
@@ -1085,18 +1138,25 @@
     </w:p>
     <w:p>
       <w:proofErr w:type="spellStart"/>
+      <w:proofErr w:type="gramStart"/>
       <w:r>
         <w:t>res.status</w:t>
       </w:r>
       <w:proofErr w:type="spellEnd"/>
-      <w:r>
-        <w:t>(200).</w:t>
+      <w:proofErr w:type="gramEnd"/>
+      <w:r>
+        <w:t>(200</w:t>
+      </w:r>
+      <w:proofErr w:type="gramStart"/>
+      <w:r>
+        <w:t>).</w:t>
       </w:r>
       <w:proofErr w:type="spellStart"/>
       <w:r>
         <w:t>json</w:t>
       </w:r>
       <w:proofErr w:type="spellEnd"/>
+      <w:proofErr w:type="gramEnd"/>
       <w:r>
         <w:t>(</w:t>
       </w:r>
@@ -1197,9 +1257,14 @@
     </w:p>
     <w:p>
       <w:r>
-        <w:t>export default function handler(</w:t>
-      </w:r>
-      <w:proofErr w:type="spellStart"/>
+        <w:t xml:space="preserve">export default function </w:t>
+      </w:r>
+      <w:proofErr w:type="gramStart"/>
+      <w:r>
+        <w:t>handler(</w:t>
+      </w:r>
+      <w:proofErr w:type="spellStart"/>
+      <w:proofErr w:type="gramEnd"/>
       <w:r>
         <w:t>req</w:t>
       </w:r>
@@ -1212,10 +1277,12 @@
         <w:t xml:space="preserve">  if (</w:t>
       </w:r>
       <w:proofErr w:type="spellStart"/>
+      <w:proofErr w:type="gramStart"/>
       <w:r>
         <w:t>req.method</w:t>
       </w:r>
       <w:proofErr w:type="spellEnd"/>
+      <w:proofErr w:type="gramEnd"/>
       <w:r>
         <w:t xml:space="preserve"> === "POST") {</w:t>
       </w:r>
@@ -1224,18 +1291,25 @@
         <w:t xml:space="preserve">    </w:t>
       </w:r>
       <w:proofErr w:type="spellStart"/>
+      <w:proofErr w:type="gramStart"/>
       <w:r>
         <w:t>res.status</w:t>
       </w:r>
       <w:proofErr w:type="spellEnd"/>
-      <w:r>
-        <w:t>(200).</w:t>
+      <w:proofErr w:type="gramEnd"/>
+      <w:r>
+        <w:t>(200</w:t>
+      </w:r>
+      <w:proofErr w:type="gramStart"/>
+      <w:r>
+        <w:t>).</w:t>
       </w:r>
       <w:proofErr w:type="spellStart"/>
       <w:r>
         <w:t>json</w:t>
       </w:r>
       <w:proofErr w:type="spellEnd"/>
+      <w:proofErr w:type="gramEnd"/>
       <w:r>
         <w:t>({</w:t>
       </w:r>
@@ -1244,10 +1318,12 @@
         <w:t xml:space="preserve">      method: </w:t>
       </w:r>
       <w:proofErr w:type="spellStart"/>
+      <w:proofErr w:type="gramStart"/>
       <w:r>
         <w:t>req.method</w:t>
       </w:r>
       <w:proofErr w:type="spellEnd"/>
+      <w:proofErr w:type="gramEnd"/>
       <w:r>
         <w:t>,</w:t>
       </w:r>
@@ -1256,10 +1332,12 @@
         <w:t xml:space="preserve">      body: </w:t>
       </w:r>
       <w:proofErr w:type="spellStart"/>
+      <w:proofErr w:type="gramStart"/>
       <w:r>
         <w:t>req.body</w:t>
       </w:r>
       <w:proofErr w:type="spellEnd"/>
+      <w:proofErr w:type="gramEnd"/>
       <w:r>
         <w:t>,</w:t>
       </w:r>
@@ -1268,10 +1346,12 @@
         <w:t xml:space="preserve">      query: </w:t>
       </w:r>
       <w:proofErr w:type="spellStart"/>
+      <w:proofErr w:type="gramStart"/>
       <w:r>
         <w:t>req.query</w:t>
       </w:r>
       <w:proofErr w:type="spellEnd"/>
+      <w:proofErr w:type="gramEnd"/>
       <w:r>
         <w:t>,</w:t>
       </w:r>
@@ -1281,8 +1361,12 @@
       </w:r>
       <w:r>
         <w:br/>
+      </w:r>
+      <w:proofErr w:type="gramStart"/>
+      <w:r>
         <w:t xml:space="preserve">  }</w:t>
       </w:r>
+      <w:proofErr w:type="gramEnd"/>
       <w:r>
         <w:br/>
         <w:t>}</w:t>
@@ -1438,10 +1522,12 @@
           </w:tcPr>
           <w:p>
             <w:proofErr w:type="spellStart"/>
+            <w:proofErr w:type="gramStart"/>
             <w:r>
               <w:t>req.body</w:t>
             </w:r>
             <w:proofErr w:type="spellEnd"/>
+            <w:proofErr w:type="gramEnd"/>
           </w:p>
         </w:tc>
         <w:tc>
@@ -1475,10 +1561,12 @@
           </w:tcPr>
           <w:p>
             <w:proofErr w:type="spellStart"/>
+            <w:proofErr w:type="gramStart"/>
             <w:r>
               <w:t>req.query</w:t>
             </w:r>
             <w:proofErr w:type="spellEnd"/>
+            <w:proofErr w:type="gramEnd"/>
           </w:p>
         </w:tc>
         <w:tc>
@@ -1512,10 +1600,12 @@
           </w:tcPr>
           <w:p>
             <w:proofErr w:type="spellStart"/>
+            <w:proofErr w:type="gramStart"/>
             <w:r>
               <w:t>req.method</w:t>
             </w:r>
             <w:proofErr w:type="spellEnd"/>
+            <w:proofErr w:type="gramEnd"/>
           </w:p>
         </w:tc>
         <w:tc>
@@ -1567,9 +1657,14 @@
     </w:p>
     <w:p>
       <w:r>
-        <w:t>export async function POST(</w:t>
-      </w:r>
-      <w:proofErr w:type="spellStart"/>
+        <w:t xml:space="preserve">export async function </w:t>
+      </w:r>
+      <w:proofErr w:type="gramStart"/>
+      <w:r>
+        <w:t>POST(</w:t>
+      </w:r>
+      <w:proofErr w:type="spellStart"/>
+      <w:proofErr w:type="gramEnd"/>
       <w:r>
         <w:t>req</w:t>
       </w:r>
@@ -1593,10 +1688,12 @@
         <w:t xml:space="preserve"> body = await </w:t>
       </w:r>
       <w:proofErr w:type="spellStart"/>
+      <w:proofErr w:type="gramStart"/>
       <w:r>
         <w:t>req.json</w:t>
       </w:r>
       <w:proofErr w:type="spellEnd"/>
+      <w:proofErr w:type="gramEnd"/>
       <w:r>
         <w:t>();</w:t>
       </w:r>
@@ -1658,10 +1755,12 @@
         <w:t xml:space="preserve">d specific fields like </w:t>
       </w:r>
       <w:proofErr w:type="spellStart"/>
+      <w:proofErr w:type="gramStart"/>
       <w:r>
         <w:t>req.body</w:t>
       </w:r>
       <w:proofErr w:type="spellEnd"/>
+      <w:proofErr w:type="gramEnd"/>
       <w:r>
         <w:t>.</w:t>
       </w:r>
@@ -1671,7 +1770,15 @@
         <w:t>In older version we used to get body like we did in n</w:t>
       </w:r>
       <w:r>
-        <w:t>ode js but in modern it look like below</w:t>
+        <w:t xml:space="preserve">ode js but in modern it </w:t>
+      </w:r>
+      <w:proofErr w:type="gramStart"/>
+      <w:r>
+        <w:t>look</w:t>
+      </w:r>
+      <w:proofErr w:type="gramEnd"/>
+      <w:r>
+        <w:t xml:space="preserve"> like below</w:t>
       </w:r>
     </w:p>
     <w:p>
@@ -1774,10 +1881,18 @@
         <w:t>The problem with the file making</w:t>
       </w:r>
       <w:r>
-        <w:t xml:space="preserve"> strategy </w:t>
-      </w:r>
-      <w:r>
-        <w:t xml:space="preserve"> is that </w:t>
+        <w:t xml:space="preserve"> </w:t>
+      </w:r>
+      <w:proofErr w:type="gramStart"/>
+      <w:r>
+        <w:t xml:space="preserve">strategy </w:t>
+      </w:r>
+      <w:r>
+        <w:t xml:space="preserve"> is</w:t>
+      </w:r>
+      <w:proofErr w:type="gramEnd"/>
+      <w:r>
+        <w:t xml:space="preserve"> that </w:t>
       </w:r>
       <w:r>
         <w:t xml:space="preserve">if suppose </w:t>
@@ -1890,20 +2005,41 @@
       </w:r>
       <w:proofErr w:type="spellEnd"/>
       <w:r>
-        <w:t xml:space="preserve"> element</w:t>
-      </w:r>
-      <w:r>
-        <w:t>(who knows may be I am wrong here)</w:t>
-      </w:r>
-      <w:r>
         <w:t xml:space="preserve"> </w:t>
       </w:r>
+      <w:proofErr w:type="gramStart"/>
+      <w:r>
+        <w:t>element</w:t>
+      </w:r>
+      <w:r>
+        <w:t>(</w:t>
+      </w:r>
+      <w:proofErr w:type="gramEnd"/>
+      <w:r>
+        <w:t xml:space="preserve">who knows </w:t>
+      </w:r>
+      <w:proofErr w:type="gramStart"/>
+      <w:r>
+        <w:t>may be</w:t>
+      </w:r>
+      <w:proofErr w:type="gramEnd"/>
+      <w:r>
+        <w:t xml:space="preserve"> I am wrong here)</w:t>
+      </w:r>
+      <w:r>
+        <w:t xml:space="preserve"> </w:t>
+      </w:r>
       <w:r>
         <w:t xml:space="preserve">and on state update method we used </w:t>
       </w:r>
       <w:proofErr w:type="spellStart"/>
-      <w:r>
-        <w:t>e.target.innerText</w:t>
+      <w:proofErr w:type="gramStart"/>
+      <w:r>
+        <w:t>e.target</w:t>
+      </w:r>
+      <w:proofErr w:type="gramEnd"/>
+      <w:r>
+        <w:t>.innerText</w:t>
       </w:r>
       <w:proofErr w:type="spellEnd"/>
     </w:p>
@@ -1920,8 +2056,13 @@
         <w:t xml:space="preserve"> we can use </w:t>
       </w:r>
       <w:proofErr w:type="spellStart"/>
-      <w:r>
-        <w:t>e.target,value</w:t>
+      <w:proofErr w:type="gramStart"/>
+      <w:r>
+        <w:t>e.target</w:t>
+      </w:r>
+      <w:proofErr w:type="gramEnd"/>
+      <w:r>
+        <w:t>,value</w:t>
       </w:r>
       <w:proofErr w:type="spellEnd"/>
       <w:r>
@@ -2037,13 +2178,16 @@
         <w:t xml:space="preserve">Shortcut for </w:t>
       </w:r>
       <w:proofErr w:type="spellStart"/>
+      <w:proofErr w:type="gramStart"/>
       <w:r>
         <w:t>margin:auto</w:t>
       </w:r>
       <w:proofErr w:type="spellEnd"/>
+      <w:proofErr w:type="gramEnd"/>
       <w:r>
         <w:t xml:space="preserve"> will be </w:t>
       </w:r>
+      <w:proofErr w:type="gramStart"/>
       <w:r>
         <w:rPr>
           <w:b/>
@@ -2051,6 +2195,7 @@
         </w:rPr>
         <w:t>m:auto</w:t>
       </w:r>
+      <w:proofErr w:type="gramEnd"/>
       <w:r>
         <w:rPr>
           <w:b/>
@@ -2114,10 +2259,18 @@
     </w:p>
     <w:p>
       <w:r>
-        <w:t xml:space="preserve">Suppose you have 50 blogs and you want to show 5 blogs on each pages </w:t>
-      </w:r>
-      <w:r>
-        <w:t xml:space="preserve"> so 10 pages </w:t>
+        <w:t xml:space="preserve">Suppose you have 50 blogs and you want to show 5 blogs on each </w:t>
+      </w:r>
+      <w:proofErr w:type="gramStart"/>
+      <w:r>
+        <w:t xml:space="preserve">pages </w:t>
+      </w:r>
+      <w:r>
+        <w:t xml:space="preserve"> so</w:t>
+      </w:r>
+      <w:proofErr w:type="gramEnd"/>
+      <w:r>
+        <w:t xml:space="preserve"> 10 pages </w:t>
       </w:r>
       <w:r>
         <w:t>will</w:t>
@@ -2128,11 +2281,16 @@
       <w:r>
         <w:t xml:space="preserve">be </w:t>
       </w:r>
+      <w:proofErr w:type="gramStart"/>
       <w:r>
         <w:t xml:space="preserve">formed </w:t>
       </w:r>
       <w:r>
-        <w:t xml:space="preserve">. In the similar way </w:t>
+        <w:t>.</w:t>
+      </w:r>
+      <w:proofErr w:type="gramEnd"/>
+      <w:r>
+        <w:t xml:space="preserve"> In the similar way </w:t>
       </w:r>
       <w:r>
         <w:t xml:space="preserve">pagination can be showed </w:t>
@@ -2249,7 +2407,15 @@
         <w:t xml:space="preserve">that we will not good components </w:t>
       </w:r>
       <w:r>
-        <w:t>means you won’t get good packages for doing any work(who knows)</w:t>
+        <w:t xml:space="preserve">means you won’t get good packages for doing any </w:t>
+      </w:r>
+      <w:proofErr w:type="gramStart"/>
+      <w:r>
+        <w:t>work(</w:t>
+      </w:r>
+      <w:proofErr w:type="gramEnd"/>
+      <w:r>
+        <w:t>who knows)</w:t>
       </w:r>
     </w:p>
     <w:p>
@@ -2278,14 +2444,27 @@
       </w:r>
     </w:p>
     <w:p>
-      <w:r>
-        <w:t xml:space="preserve">So we run the above command I context of </w:t>
+      <w:proofErr w:type="gramStart"/>
+      <w:r>
+        <w:t>So</w:t>
+      </w:r>
+      <w:proofErr w:type="gramEnd"/>
+      <w:r>
+        <w:t xml:space="preserve"> we run the above command I context of </w:t>
       </w:r>
       <w:r>
         <w:t xml:space="preserve">yarn </w:t>
       </w:r>
       <w:r>
-        <w:t>by using  below command</w:t>
+        <w:t xml:space="preserve">by </w:t>
+      </w:r>
+      <w:proofErr w:type="gramStart"/>
+      <w:r>
+        <w:t>using  below</w:t>
+      </w:r>
+      <w:proofErr w:type="gramEnd"/>
+      <w:r>
+        <w:t xml:space="preserve"> command</w:t>
       </w:r>
     </w:p>
     <w:p>
@@ -2373,13 +2552,29 @@
         <w:t xml:space="preserve">Data length </w:t>
       </w:r>
       <w:r>
-        <w:t>of the data that to be shown</w:t>
-      </w:r>
-      <w:r>
-        <w:t xml:space="preserve"> , next is the function  </w:t>
-      </w:r>
-      <w:r>
-        <w:t>that will be called when we scroll and reach the bottom and more data is needed to be loaded.</w:t>
+        <w:t xml:space="preserve">of the data that to be </w:t>
+      </w:r>
+      <w:proofErr w:type="gramStart"/>
+      <w:r>
+        <w:t>shown</w:t>
+      </w:r>
+      <w:r>
+        <w:t xml:space="preserve"> ,</w:t>
+      </w:r>
+      <w:proofErr w:type="gramEnd"/>
+      <w:r>
+        <w:t xml:space="preserve"> next is the </w:t>
+      </w:r>
+      <w:proofErr w:type="gramStart"/>
+      <w:r>
+        <w:t xml:space="preserve">function  </w:t>
+      </w:r>
+      <w:r>
+        <w:t>that</w:t>
+      </w:r>
+      <w:proofErr w:type="gramEnd"/>
+      <w:r>
+        <w:t xml:space="preserve"> will be called when we scroll and reach the bottom and more data is needed to be loaded.</w:t>
       </w:r>
     </w:p>
     <w:p>
@@ -2407,13 +2602,21 @@
         <w:t>w</w:t>
       </w:r>
       <w:r>
-        <w:t>n function</w:t>
+        <w:t xml:space="preserve">n </w:t>
+      </w:r>
+      <w:proofErr w:type="gramStart"/>
+      <w:r>
+        <w:t>function</w:t>
       </w:r>
       <w:r>
         <w:t>al</w:t>
       </w:r>
       <w:r>
-        <w:t>ity(who knows)</w:t>
+        <w:t>ity(</w:t>
+      </w:r>
+      <w:proofErr w:type="gramEnd"/>
+      <w:r>
+        <w:t>who knows)</w:t>
       </w:r>
     </w:p>
     <w:p>
@@ -2495,7 +2698,15 @@
         <w:t xml:space="preserve">it is defined like this </w:t>
       </w:r>
       <w:r>
-        <w:t xml:space="preserve">if we keep single item </w:t>
+        <w:t xml:space="preserve">if we keep single </w:t>
+      </w:r>
+      <w:proofErr w:type="gramStart"/>
+      <w:r>
+        <w:t>item</w:t>
+      </w:r>
+      <w:proofErr w:type="gramEnd"/>
+      <w:r>
+        <w:t xml:space="preserve"> </w:t>
       </w:r>
       <w:r>
         <w:t>we need to see al</w:t>
@@ -2504,22 +2715,31 @@
         <w:t>l</w:t>
       </w:r>
       <w:r>
-        <w:t xml:space="preserve"> this thi</w:t>
+        <w:t xml:space="preserve"> </w:t>
+      </w:r>
+      <w:proofErr w:type="gramStart"/>
+      <w:r>
+        <w:t>this thi</w:t>
       </w:r>
       <w:r>
         <w:t>n</w:t>
       </w:r>
       <w:r>
-        <w:t xml:space="preserve">gs </w:t>
-      </w:r>
-    </w:p>
-    <w:p>
-      <w:pPr>
-        <w:rPr>
-          <w:b/>
-          <w:bCs/>
-        </w:rPr>
-      </w:pPr>
+        <w:t>gs</w:t>
+      </w:r>
+      <w:proofErr w:type="gramEnd"/>
+      <w:r>
+        <w:t xml:space="preserve"> </w:t>
+      </w:r>
+    </w:p>
+    <w:p>
+      <w:pPr>
+        <w:rPr>
+          <w:b/>
+          <w:bCs/>
+        </w:rPr>
+      </w:pPr>
+      <w:proofErr w:type="gramStart"/>
       <w:r>
         <w:rPr>
           <w:b/>
@@ -2527,6 +2747,7 @@
         </w:rPr>
         <w:t>Note:-</w:t>
       </w:r>
+      <w:proofErr w:type="gramEnd"/>
     </w:p>
     <w:p>
       <w:pPr>
@@ -2538,7 +2759,15 @@
         <w:t xml:space="preserve">Sometime it happens </w:t>
       </w:r>
       <w:r>
-        <w:t>in react that one component is show  two times so reload to remove the bug</w:t>
+        <w:t xml:space="preserve">in react that one component is </w:t>
+      </w:r>
+      <w:proofErr w:type="gramStart"/>
+      <w:r>
+        <w:t>show  two</w:t>
+      </w:r>
+      <w:proofErr w:type="gramEnd"/>
+      <w:r>
+        <w:t xml:space="preserve"> times so reload to remove the bug</w:t>
       </w:r>
     </w:p>
     <w:p>
@@ -2554,7 +2783,15 @@
         <w:t xml:space="preserve">except for responsiveness </w:t>
       </w:r>
       <w:r>
-        <w:t xml:space="preserve">we will  make our blog responsive and will write media queries </w:t>
+        <w:t xml:space="preserve">we </w:t>
+      </w:r>
+      <w:proofErr w:type="gramStart"/>
+      <w:r>
+        <w:t>will  make</w:t>
+      </w:r>
+      <w:proofErr w:type="gramEnd"/>
+      <w:r>
+        <w:t xml:space="preserve"> our blog responsive and will write media queries </w:t>
       </w:r>
       <w:r>
         <w:t>how we can we run media que</w:t>
@@ -2580,8 +2817,13 @@
         <w:t xml:space="preserve">the website </w:t>
       </w:r>
       <w:r>
-        <w:t>and if you gave responsiveness</w:t>
-      </w:r>
+        <w:t xml:space="preserve">and if you gave </w:t>
+      </w:r>
+      <w:proofErr w:type="gramStart"/>
+      <w:r>
+        <w:t>responsiveness</w:t>
+      </w:r>
+      <w:proofErr w:type="gramEnd"/>
       <w:r>
         <w:t xml:space="preserve"> it was an addon</w:t>
       </w:r>
@@ -2600,10 +2842,12 @@
         <w:t xml:space="preserve">you can say bit in </w:t>
       </w:r>
       <w:proofErr w:type="spellStart"/>
+      <w:proofErr w:type="gramStart"/>
       <w:r>
         <w:t>todays</w:t>
       </w:r>
       <w:proofErr w:type="spellEnd"/>
+      <w:proofErr w:type="gramEnd"/>
       <w:r>
         <w:t xml:space="preserve"> time </w:t>
       </w:r>
@@ -2680,7 +2924,11 @@
     </w:p>
     <w:p>
       <w:r>
-        <w:t>We will ho</w:t>
+        <w:t xml:space="preserve">We will </w:t>
+      </w:r>
+      <w:proofErr w:type="gramStart"/>
+      <w:r>
+        <w:t>ho</w:t>
       </w:r>
       <w:r>
         <w:t>s</w:t>
@@ -2689,7 +2937,11 @@
         <w:t>t</w:t>
       </w:r>
       <w:r>
-        <w:t>s the web</w:t>
+        <w:t>s</w:t>
+      </w:r>
+      <w:proofErr w:type="gramEnd"/>
+      <w:r>
+        <w:t xml:space="preserve"> the web</w:t>
       </w:r>
       <w:r>
         <w:t>s</w:t>
@@ -2816,7 +3068,15 @@
     </w:p>
     <w:p>
       <w:r>
-        <w:t xml:space="preserve">IN digital ocean we make new user(who knows) </w:t>
+        <w:t xml:space="preserve">IN digital ocean we make new </w:t>
+      </w:r>
+      <w:proofErr w:type="gramStart"/>
+      <w:r>
+        <w:t>user(</w:t>
+      </w:r>
+      <w:proofErr w:type="gramEnd"/>
+      <w:r>
+        <w:t xml:space="preserve">who knows) </w:t>
       </w:r>
     </w:p>
     <w:p>
@@ -2854,13 +3114,26 @@
       <w:r>
         <w:t xml:space="preserve">process will be </w:t>
       </w:r>
-      <w:r>
-        <w:t xml:space="preserve">build there </w:t>
-      </w:r>
-    </w:p>
-    <w:p>
-      <w:r>
-        <w:t>It will ask you to make database in there services.</w:t>
+      <w:proofErr w:type="gramStart"/>
+      <w:r>
+        <w:t>build</w:t>
+      </w:r>
+      <w:proofErr w:type="gramEnd"/>
+      <w:r>
+        <w:t xml:space="preserve"> there </w:t>
+      </w:r>
+    </w:p>
+    <w:p>
+      <w:r>
+        <w:t xml:space="preserve">It will ask you to make database in </w:t>
+      </w:r>
+      <w:proofErr w:type="gramStart"/>
+      <w:r>
+        <w:t>there</w:t>
+      </w:r>
+      <w:proofErr w:type="gramEnd"/>
+      <w:r>
+        <w:t xml:space="preserve"> services.</w:t>
       </w:r>
       <w:r>
         <w:t xml:space="preserve"> (who knows)</w:t>
@@ -2911,9 +3184,14 @@
       </w:r>
       <w:proofErr w:type="spellEnd"/>
       <w:r>
-        <w:t xml:space="preserve"> it will be good(</w:t>
-      </w:r>
-      <w:proofErr w:type="spellStart"/>
+        <w:t xml:space="preserve"> it will be </w:t>
+      </w:r>
+      <w:proofErr w:type="gramStart"/>
+      <w:r>
+        <w:t>good(</w:t>
+      </w:r>
+      <w:proofErr w:type="spellStart"/>
+      <w:proofErr w:type="gramEnd"/>
       <w:r>
         <w:t>wjp</w:t>
       </w:r>
@@ -2930,20 +3208,30 @@
           <w:color w:val="EE0000"/>
         </w:rPr>
       </w:pPr>
+      <w:proofErr w:type="gramStart"/>
       <w:r>
         <w:rPr>
           <w:b/>
           <w:bCs/>
           <w:color w:val="EE0000"/>
         </w:rPr>
-        <w:t xml:space="preserve">‘ can create </w:t>
-      </w:r>
+        <w:t>‘ can</w:t>
+      </w:r>
+      <w:proofErr w:type="gramEnd"/>
       <w:r>
         <w:rPr>
           <w:b/>
           <w:bCs/>
           <w:color w:val="EE0000"/>
         </w:rPr>
+        <w:t xml:space="preserve"> create </w:t>
+      </w:r>
+      <w:r>
+        <w:rPr>
+          <w:b/>
+          <w:bCs/>
+          <w:color w:val="EE0000"/>
+        </w:rPr>
         <w:t xml:space="preserve">error in </w:t>
       </w:r>
       <w:proofErr w:type="spellStart"/>
@@ -2988,15 +3276,33 @@
           <w:bCs/>
           <w:color w:val="EE0000"/>
         </w:rPr>
-        <w:t xml:space="preserve"> or maybe in React.</w:t>
-      </w:r>
+        <w:t xml:space="preserve"> or maybe in </w:t>
+      </w:r>
+      <w:proofErr w:type="gramStart"/>
       <w:r>
         <w:rPr>
           <w:b/>
           <w:bCs/>
           <w:color w:val="EE0000"/>
         </w:rPr>
-        <w:t>(maybe it is an outdated problem)</w:t>
+        <w:t>React.</w:t>
+      </w:r>
+      <w:r>
+        <w:rPr>
+          <w:b/>
+          <w:bCs/>
+          <w:color w:val="EE0000"/>
+        </w:rPr>
+        <w:t>(</w:t>
+      </w:r>
+      <w:proofErr w:type="gramEnd"/>
+      <w:r>
+        <w:rPr>
+          <w:b/>
+          <w:bCs/>
+          <w:color w:val="EE0000"/>
+        </w:rPr>
+        <w:t>maybe it is an outdated problem)</w:t>
       </w:r>
     </w:p>
     <w:p>
@@ -3021,10 +3327,12 @@
         <w:t xml:space="preserve">you can make it like that and if it </w:t>
       </w:r>
       <w:proofErr w:type="spellStart"/>
+      <w:proofErr w:type="gramStart"/>
       <w:r>
         <w:t>become</w:t>
       </w:r>
       <w:proofErr w:type="spellEnd"/>
+      <w:proofErr w:type="gramEnd"/>
       <w:r>
         <w:t xml:space="preserve"> profitable then you can scale it (who knows) </w:t>
       </w:r>
@@ -3033,6 +3341,7 @@
       <w:r>
         <w:t xml:space="preserve">Now as you commit then </w:t>
       </w:r>
+      <w:proofErr w:type="gramStart"/>
       <w:r>
         <w:t>Digital</w:t>
       </w:r>
@@ -3040,13 +3349,25 @@
         <w:t xml:space="preserve"> </w:t>
       </w:r>
       <w:r>
-        <w:t>ocean will build it</w:t>
-      </w:r>
-      <w:r>
-        <w:t xml:space="preserve"> automatically for you.</w:t>
-      </w:r>
-      <w:r>
-        <w:t>(maybe if auto</w:t>
+        <w:t>ocean</w:t>
+      </w:r>
+      <w:proofErr w:type="gramEnd"/>
+      <w:r>
+        <w:t xml:space="preserve"> will build it</w:t>
+      </w:r>
+      <w:r>
+        <w:t xml:space="preserve"> automatically for </w:t>
+      </w:r>
+      <w:proofErr w:type="gramStart"/>
+      <w:r>
+        <w:t>you.</w:t>
+      </w:r>
+      <w:r>
+        <w:t>(</w:t>
+      </w:r>
+      <w:proofErr w:type="gramEnd"/>
+      <w:r>
+        <w:t>maybe if auto</w:t>
       </w:r>
       <w:r>
         <w:t xml:space="preserve"> </w:t>
@@ -3055,7 +3376,15 @@
         <w:t xml:space="preserve">deploy option was selected </w:t>
       </w:r>
       <w:r>
-        <w:t>in the setting(who knows)</w:t>
+        <w:t xml:space="preserve">in the </w:t>
+      </w:r>
+      <w:proofErr w:type="gramStart"/>
+      <w:r>
+        <w:t>setting(</w:t>
+      </w:r>
+      <w:proofErr w:type="gramEnd"/>
+      <w:r>
+        <w:t>who knows)</w:t>
       </w:r>
       <w:r>
         <w:t>)</w:t>
@@ -3093,10 +3422,18 @@
         <w:t xml:space="preserve">here (maybe </w:t>
       </w:r>
       <w:r>
-        <w:t>very large app don’t work properly</w:t>
-      </w:r>
-      <w:r>
-        <w:t>(who knows)</w:t>
+        <w:t xml:space="preserve">very large app don’t work </w:t>
+      </w:r>
+      <w:proofErr w:type="gramStart"/>
+      <w:r>
+        <w:t>properly</w:t>
+      </w:r>
+      <w:r>
+        <w:t>(</w:t>
+      </w:r>
+      <w:proofErr w:type="gramEnd"/>
+      <w:r>
+        <w:t>who knows)</w:t>
       </w:r>
       <w:r>
         <w:t>)</w:t>
@@ -3137,10 +3474,18 @@
         <w:t xml:space="preserve">Now we will see </w:t>
       </w:r>
       <w:r>
-        <w:t>how Google analytics and search console</w:t>
-      </w:r>
-      <w:r>
-        <w:t xml:space="preserve">(who </w:t>
+        <w:t xml:space="preserve">how Google analytics and search </w:t>
+      </w:r>
+      <w:proofErr w:type="gramStart"/>
+      <w:r>
+        <w:t>console</w:t>
+      </w:r>
+      <w:r>
+        <w:t>(</w:t>
+      </w:r>
+      <w:proofErr w:type="gramEnd"/>
+      <w:r>
+        <w:t xml:space="preserve">who </w:t>
       </w:r>
       <w:proofErr w:type="spellStart"/>
       <w:r>
@@ -3307,13 +3652,21 @@
         <w:t xml:space="preserve">ck </w:t>
       </w:r>
       <w:r>
-        <w:t>which is also called S</w:t>
-      </w:r>
+        <w:t xml:space="preserve">which is also called </w:t>
+      </w:r>
+      <w:proofErr w:type="gramStart"/>
       <w:r>
         <w:t>S</w:t>
       </w:r>
       <w:r>
-        <w:t>LV(who knows)</w:t>
+        <w:t>S</w:t>
+      </w:r>
+      <w:r>
+        <w:t>LV(</w:t>
+      </w:r>
+      <w:proofErr w:type="gramEnd"/>
+      <w:r>
+        <w:t>who knows)</w:t>
       </w:r>
       <w:r>
         <w:t xml:space="preserve"> and </w:t>
@@ -3360,8 +3713,13 @@
       <w:r>
         <w:t xml:space="preserve">of the application. </w:t>
       </w:r>
-      <w:r>
-        <w:t>So if we want that the domain we have need to be pointe</w:t>
+      <w:proofErr w:type="gramStart"/>
+      <w:r>
+        <w:t>So</w:t>
+      </w:r>
+      <w:proofErr w:type="gramEnd"/>
+      <w:r>
+        <w:t xml:space="preserve"> if we want that the domain we have need to be pointe</w:t>
       </w:r>
       <w:r>
         <w:t>d</w:t>
@@ -3392,10 +3750,18 @@
     </w:p>
     <w:p>
       <w:r>
-        <w:t xml:space="preserve">Of you chose the former then you will  </w:t>
-      </w:r>
-      <w:r>
-        <w:t xml:space="preserve">see that from the dashboard </w:t>
+        <w:t xml:space="preserve">Of you chose the former then you </w:t>
+      </w:r>
+      <w:proofErr w:type="gramStart"/>
+      <w:r>
+        <w:t xml:space="preserve">will  </w:t>
+      </w:r>
+      <w:r>
+        <w:t>see</w:t>
+      </w:r>
+      <w:proofErr w:type="gramEnd"/>
+      <w:r>
+        <w:t xml:space="preserve"> that from the dashboard </w:t>
       </w:r>
       <w:r>
         <w:t xml:space="preserve">that how things are happening </w:t>
@@ -3404,10 +3770,26 @@
         <w:t xml:space="preserve">and if you chose later </w:t>
       </w:r>
       <w:r>
-        <w:t>then you need to point it to a Digital ocean(who knows)</w:t>
-      </w:r>
-      <w:r>
-        <w:t>. By former we bring the domain in the digital ocean(who knows)</w:t>
+        <w:t xml:space="preserve">then you need to point it to a Digital </w:t>
+      </w:r>
+      <w:proofErr w:type="gramStart"/>
+      <w:r>
+        <w:t>ocean(</w:t>
+      </w:r>
+      <w:proofErr w:type="gramEnd"/>
+      <w:r>
+        <w:t>who knows)</w:t>
+      </w:r>
+      <w:r>
+        <w:t xml:space="preserve">. By former we bring the domain in the digital </w:t>
+      </w:r>
+      <w:proofErr w:type="gramStart"/>
+      <w:r>
+        <w:t>ocean(</w:t>
+      </w:r>
+      <w:proofErr w:type="gramEnd"/>
+      <w:r>
+        <w:t>who knows)</w:t>
       </w:r>
       <w:r>
         <w:t xml:space="preserve">. </w:t>
@@ -3453,8 +3835,13 @@
       </w:r>
     </w:p>
     <w:p>
-      <w:r>
-        <w:t>So we went to Google search console</w:t>
+      <w:proofErr w:type="gramStart"/>
+      <w:r>
+        <w:t>So</w:t>
+      </w:r>
+      <w:proofErr w:type="gramEnd"/>
+      <w:r>
+        <w:t xml:space="preserve"> we went to Google search console</w:t>
       </w:r>
       <w:r>
         <w:t xml:space="preserve"> so we add a property there </w:t>
@@ -3529,7 +3916,15 @@
         <w:t xml:space="preserve">omain </w:t>
       </w:r>
       <w:r>
-        <w:t xml:space="preserve">ad then you need to verify it so it give us some text which we will paste in the </w:t>
+        <w:t xml:space="preserve">ad then you need to verify it so it </w:t>
+      </w:r>
+      <w:proofErr w:type="gramStart"/>
+      <w:r>
+        <w:t>give</w:t>
+      </w:r>
+      <w:proofErr w:type="gramEnd"/>
+      <w:r>
+        <w:t xml:space="preserve"> us some text which we will paste in the </w:t>
       </w:r>
       <w:r>
         <w:t xml:space="preserve">DNS records to give the proof for ownership of domain. </w:t>
@@ -3623,7 +4018,11 @@
         <w:t xml:space="preserve"> and how to integrate </w:t>
       </w:r>
       <w:r>
-        <w:t>payment gateway to the websi</w:t>
+        <w:t xml:space="preserve">payment gateway to the </w:t>
+      </w:r>
+      <w:proofErr w:type="gramStart"/>
+      <w:r>
+        <w:t>websi</w:t>
       </w:r>
       <w:r>
         <w:t>t</w:t>
@@ -3634,14 +4033,23 @@
       <w:r>
         <w:t>.</w:t>
       </w:r>
+      <w:proofErr w:type="gramEnd"/>
       <w:r>
         <w:t xml:space="preserve"> How orders will come </w:t>
       </w:r>
       <w:r>
-        <w:t xml:space="preserve">and how admin panel will be made </w:t>
-      </w:r>
-      <w:r>
-        <w:t>. F</w:t>
+        <w:t xml:space="preserve">and how admin panel will be </w:t>
+      </w:r>
+      <w:proofErr w:type="gramStart"/>
+      <w:r>
+        <w:t xml:space="preserve">made </w:t>
+      </w:r>
+      <w:r>
+        <w:t>.</w:t>
+      </w:r>
+      <w:proofErr w:type="gramEnd"/>
+      <w:r>
+        <w:t xml:space="preserve"> F</w:t>
       </w:r>
       <w:r>
         <w:t>r</w:t>
@@ -3962,10 +4370,18 @@
         <w:t xml:space="preserve">Like Bootstrap Tailwind also have </w:t>
       </w:r>
       <w:r>
-        <w:t xml:space="preserve">predefined class </w:t>
-      </w:r>
-      <w:r>
-        <w:t xml:space="preserve">.So we have tailwind css is installed </w:t>
+        <w:t xml:space="preserve">predefined </w:t>
+      </w:r>
+      <w:proofErr w:type="gramStart"/>
+      <w:r>
+        <w:t xml:space="preserve">class </w:t>
+      </w:r>
+      <w:r>
+        <w:t>.So</w:t>
+      </w:r>
+      <w:proofErr w:type="gramEnd"/>
+      <w:r>
+        <w:t xml:space="preserve"> we have tailwind css is installed </w:t>
       </w:r>
       <w:r>
         <w:t>and we can use our utility class</w:t>
@@ -4073,7 +4489,15 @@
         <w:t xml:space="preserve">There are some pages which you will find in almost all Ecommerce website that is </w:t>
       </w:r>
       <w:r>
-        <w:t>Product page , Home page</w:t>
+        <w:t xml:space="preserve">Product </w:t>
+      </w:r>
+      <w:proofErr w:type="gramStart"/>
+      <w:r>
+        <w:t>page ,</w:t>
+      </w:r>
+      <w:proofErr w:type="gramEnd"/>
+      <w:r>
+        <w:t xml:space="preserve"> Home page</w:t>
       </w:r>
       <w:r>
         <w:t>, Checkout page</w:t>
@@ -4085,10 +4509,18 @@
         <w:t>n</w:t>
       </w:r>
       <w:r>
-        <w:t xml:space="preserve"> order</w:t>
-      </w:r>
-      <w:r>
-        <w:t xml:space="preserve"> , login and </w:t>
+        <w:t xml:space="preserve"> </w:t>
+      </w:r>
+      <w:proofErr w:type="gramStart"/>
+      <w:r>
+        <w:t>order</w:t>
+      </w:r>
+      <w:r>
+        <w:t xml:space="preserve"> ,</w:t>
+      </w:r>
+      <w:proofErr w:type="gramEnd"/>
+      <w:r>
+        <w:t xml:space="preserve"> login and </w:t>
       </w:r>
       <w:proofErr w:type="spellStart"/>
       <w:r>
@@ -4165,7 +4597,15 @@
     </w:p>
     <w:p>
       <w:r>
-        <w:t xml:space="preserve">We will use app for that purposes(maybe </w:t>
+        <w:t xml:space="preserve">We will use app for that </w:t>
+      </w:r>
+      <w:proofErr w:type="gramStart"/>
+      <w:r>
+        <w:t>purposes(</w:t>
+      </w:r>
+      <w:proofErr w:type="gramEnd"/>
+      <w:r>
+        <w:t xml:space="preserve">maybe </w:t>
       </w:r>
       <w:proofErr w:type="spellStart"/>
       <w:r>
@@ -4208,13 +4648,21 @@
         <w:t xml:space="preserve">snippet </w:t>
       </w:r>
       <w:r>
-        <w:t xml:space="preserve">here you get minimalistic design </w:t>
+        <w:t xml:space="preserve">here you get minimalistic </w:t>
+      </w:r>
+      <w:proofErr w:type="gramStart"/>
+      <w:r>
+        <w:t xml:space="preserve">design </w:t>
       </w:r>
       <w:r>
         <w:t xml:space="preserve"> </w:t>
       </w:r>
       <w:r>
-        <w:t xml:space="preserve">Here you get </w:t>
+        <w:t>Here</w:t>
+      </w:r>
+      <w:proofErr w:type="gramEnd"/>
+      <w:r>
+        <w:t xml:space="preserve"> you get </w:t>
       </w:r>
       <w:proofErr w:type="spellStart"/>
       <w:r>
@@ -4535,14 +4983,46 @@
           <w:b/>
           <w:bCs/>
         </w:rPr>
-        <w:t xml:space="preserve"> and(we try there should be equivalent space between them)</w:t>
-      </w:r>
-      <w:r>
-        <w:rPr>
-          <w:b/>
-          <w:bCs/>
-        </w:rPr>
-        <w:t>(who knows)</w:t>
+        <w:t xml:space="preserve"> </w:t>
+      </w:r>
+      <w:proofErr w:type="gramStart"/>
+      <w:r>
+        <w:rPr>
+          <w:b/>
+          <w:bCs/>
+        </w:rPr>
+        <w:t>and(</w:t>
+      </w:r>
+      <w:proofErr w:type="gramEnd"/>
+      <w:r>
+        <w:rPr>
+          <w:b/>
+          <w:bCs/>
+        </w:rPr>
+        <w:t xml:space="preserve">we try there should be equivalent space between </w:t>
+      </w:r>
+      <w:proofErr w:type="gramStart"/>
+      <w:r>
+        <w:rPr>
+          <w:b/>
+          <w:bCs/>
+        </w:rPr>
+        <w:t>them)</w:t>
+      </w:r>
+      <w:r>
+        <w:rPr>
+          <w:b/>
+          <w:bCs/>
+        </w:rPr>
+        <w:t>(</w:t>
+      </w:r>
+      <w:proofErr w:type="gramEnd"/>
+      <w:r>
+        <w:rPr>
+          <w:b/>
+          <w:bCs/>
+        </w:rPr>
+        <w:t>who knows)</w:t>
       </w:r>
     </w:p>
     <w:p>
@@ -4559,6 +5039,7 @@
         <w:t xml:space="preserve"> in Tailwind by </w:t>
       </w:r>
       <w:proofErr w:type="spellStart"/>
+      <w:proofErr w:type="gramStart"/>
       <w:r>
         <w:rPr>
           <w:b/>
@@ -4574,6 +5055,7 @@
         <w:t>property</w:t>
       </w:r>
       <w:proofErr w:type="spellEnd"/>
+      <w:proofErr w:type="gramEnd"/>
       <w:r>
         <w:rPr>
           <w:b/>
@@ -4706,13 +5188,18 @@
     </w:p>
     <w:p>
       <w:r>
-        <w:t xml:space="preserve">import { </w:t>
+        <w:t xml:space="preserve">import </w:t>
+      </w:r>
+      <w:proofErr w:type="gramStart"/>
+      <w:r>
+        <w:t xml:space="preserve">{ </w:t>
       </w:r>
       <w:proofErr w:type="spellStart"/>
       <w:r>
         <w:t>AiOutlineShoppingCart</w:t>
       </w:r>
       <w:proofErr w:type="spellEnd"/>
+      <w:proofErr w:type="gramEnd"/>
       <w:r>
         <w:t xml:space="preserve"> } from "react-icons/ai";</w:t>
       </w:r>
@@ -4949,9 +5436,14 @@
       </w:r>
       <w:proofErr w:type="spellStart"/>
       <w:r>
-        <w:t>overflow-x:hidden</w:t>
-      </w:r>
-      <w:proofErr w:type="spellEnd"/>
+        <w:t>overflow-</w:t>
+      </w:r>
+      <w:proofErr w:type="gramStart"/>
+      <w:r>
+        <w:t>x:hidden</w:t>
+      </w:r>
+      <w:proofErr w:type="spellEnd"/>
+      <w:proofErr w:type="gramEnd"/>
       <w:r>
         <w:t xml:space="preserve"> you c</w:t>
       </w:r>
@@ -5088,7 +5580,15 @@
         <w:t xml:space="preserve">it is just a request and js will update cart accordingly </w:t>
       </w:r>
       <w:r>
-        <w:t xml:space="preserve">and there is no guarantee when  it will be updated so believe it that </w:t>
+        <w:t xml:space="preserve">and there is no guarantee </w:t>
+      </w:r>
+      <w:proofErr w:type="gramStart"/>
+      <w:r>
+        <w:t>when  it</w:t>
+      </w:r>
+      <w:proofErr w:type="gramEnd"/>
+      <w:r>
+        <w:t xml:space="preserve"> will be updated so believe it that </w:t>
       </w:r>
       <w:r>
         <w:t>car</w:t>
@@ -5109,10 +5609,12 @@
         <w:t xml:space="preserve"> request </w:t>
       </w:r>
       <w:proofErr w:type="spellStart"/>
+      <w:proofErr w:type="gramStart"/>
       <w:r>
         <w:t>its</w:t>
       </w:r>
       <w:proofErr w:type="spellEnd"/>
+      <w:proofErr w:type="gramEnd"/>
       <w:r>
         <w:t xml:space="preserve"> not an order</w:t>
       </w:r>
@@ -5129,7 +5631,15 @@
         <w:t xml:space="preserve">accordingly </w:t>
       </w:r>
       <w:r>
-        <w:t xml:space="preserve">and it will take time but it take time </w:t>
+        <w:t xml:space="preserve">and it will take time but it </w:t>
+      </w:r>
+      <w:proofErr w:type="gramStart"/>
+      <w:r>
+        <w:t>take</w:t>
+      </w:r>
+      <w:proofErr w:type="gramEnd"/>
+      <w:r>
+        <w:t xml:space="preserve"> time </w:t>
       </w:r>
       <w:r>
         <w:t xml:space="preserve">by time we mean in millisecond </w:t>
@@ -5354,10 +5864,18 @@
         <w:t xml:space="preserve">and how did we confirm </w:t>
       </w:r>
       <w:r>
-        <w:t>the order there</w:t>
-      </w:r>
-      <w:r>
-        <w:t>(who knows)</w:t>
+        <w:t xml:space="preserve">the order </w:t>
+      </w:r>
+      <w:proofErr w:type="gramStart"/>
+      <w:r>
+        <w:t>there</w:t>
+      </w:r>
+      <w:r>
+        <w:t>(</w:t>
+      </w:r>
+      <w:proofErr w:type="gramEnd"/>
+      <w:r>
+        <w:t>who knows)</w:t>
       </w:r>
       <w:r>
         <w:t>.</w:t>
@@ -5370,6 +5888,7 @@
           <w:bCs/>
         </w:rPr>
       </w:pPr>
+      <w:proofErr w:type="gramStart"/>
       <w:r>
         <w:rPr>
           <w:b/>
@@ -5377,6 +5896,7 @@
         </w:rPr>
         <w:t>Note:-</w:t>
       </w:r>
+      <w:proofErr w:type="gramEnd"/>
     </w:p>
     <w:p>
       <w:pPr>
@@ -5415,8 +5935,13 @@
         <w:t xml:space="preserve"> </w:t>
       </w:r>
       <w:r>
-        <w:t>(who knows )</w:t>
-      </w:r>
+        <w:t xml:space="preserve">(who </w:t>
+      </w:r>
+      <w:proofErr w:type="gramStart"/>
+      <w:r>
+        <w:t>knows )</w:t>
+      </w:r>
+      <w:proofErr w:type="gramEnd"/>
       <w:r>
         <w:t xml:space="preserve"> it will help js to connect to </w:t>
       </w:r>
@@ -5431,8 +5956,13 @@
       <w:r>
         <w:t xml:space="preserve">and we can use its </w:t>
       </w:r>
-      <w:r>
-        <w:t xml:space="preserve">built in functionality </w:t>
+      <w:proofErr w:type="gramStart"/>
+      <w:r>
+        <w:t>built in</w:t>
+      </w:r>
+      <w:proofErr w:type="gramEnd"/>
+      <w:r>
+        <w:t xml:space="preserve"> functionality </w:t>
       </w:r>
       <w:r>
         <w:t xml:space="preserve">you don’t have to read and write and update to the </w:t>
@@ -5452,12 +5982,17 @@
         <w:t xml:space="preserve">the complex we do for it in </w:t>
       </w:r>
       <w:proofErr w:type="spellStart"/>
+      <w:proofErr w:type="gramStart"/>
       <w:r>
         <w:t>mongodb</w:t>
       </w:r>
       <w:proofErr w:type="spellEnd"/>
       <w:r>
-        <w:t>(who knows))</w:t>
+        <w:t>(</w:t>
+      </w:r>
+      <w:proofErr w:type="gramEnd"/>
+      <w:r>
+        <w:t>who knows))</w:t>
       </w:r>
       <w:r>
         <w:t xml:space="preserve">. </w:t>
@@ -5488,13 +6023,34 @@
     <w:p>
       <w:r>
         <w:lastRenderedPageBreak/>
-        <w:t>If we make timestamp property (who knows)true</w:t>
-      </w:r>
-      <w:r>
-        <w:t xml:space="preserve"> it automatically create for us</w:t>
-      </w:r>
-      <w:r>
-        <w:t xml:space="preserve">, How these all things are done </w:t>
+        <w:t xml:space="preserve">If we make timestamp property (who </w:t>
+      </w:r>
+      <w:proofErr w:type="gramStart"/>
+      <w:r>
+        <w:t>knows)true</w:t>
+      </w:r>
+      <w:proofErr w:type="gramEnd"/>
+      <w:r>
+        <w:t xml:space="preserve"> it automatically </w:t>
+      </w:r>
+      <w:proofErr w:type="gramStart"/>
+      <w:r>
+        <w:t>create</w:t>
+      </w:r>
+      <w:proofErr w:type="gramEnd"/>
+      <w:r>
+        <w:t xml:space="preserve"> for us</w:t>
+      </w:r>
+      <w:r>
+        <w:t xml:space="preserve">, </w:t>
+      </w:r>
+      <w:proofErr w:type="gramStart"/>
+      <w:r>
+        <w:t>How</w:t>
+      </w:r>
+      <w:proofErr w:type="gramEnd"/>
+      <w:r>
+        <w:t xml:space="preserve"> these all things are done </w:t>
       </w:r>
       <w:r>
         <w:t>what is the syntax.</w:t>
@@ -5566,10 +6122,18 @@
         <w:t xml:space="preserve"> </w:t>
       </w:r>
       <w:r>
-        <w:t>and we will make some modals</w:t>
-      </w:r>
-      <w:r>
-        <w:t>(maybe not)</w:t>
+        <w:t xml:space="preserve">and we will make some </w:t>
+      </w:r>
+      <w:proofErr w:type="gramStart"/>
+      <w:r>
+        <w:t>modals</w:t>
+      </w:r>
+      <w:r>
+        <w:t>(</w:t>
+      </w:r>
+      <w:proofErr w:type="gramEnd"/>
+      <w:r>
+        <w:t>maybe not)</w:t>
       </w:r>
       <w:r>
         <w:t xml:space="preserve"> </w:t>
@@ -5623,7 +6187,15 @@
         <w:t xml:space="preserve"> compass will be installed</w:t>
       </w:r>
       <w:r>
-        <w:t xml:space="preserve"> which  is a product of </w:t>
+        <w:t xml:space="preserve"> </w:t>
+      </w:r>
+      <w:proofErr w:type="gramStart"/>
+      <w:r>
+        <w:t>which  is</w:t>
+      </w:r>
+      <w:proofErr w:type="gramEnd"/>
+      <w:r>
+        <w:t xml:space="preserve"> a product of </w:t>
       </w:r>
       <w:proofErr w:type="spellStart"/>
       <w:r>
@@ -5853,8 +6425,13 @@
       </w:r>
     </w:p>
     <w:p>
-      <w:r>
-        <w:t xml:space="preserve">So we will make three </w:t>
+      <w:proofErr w:type="gramStart"/>
+      <w:r>
+        <w:t>So</w:t>
+      </w:r>
+      <w:proofErr w:type="gramEnd"/>
+      <w:r>
+        <w:t xml:space="preserve"> we will make three </w:t>
       </w:r>
       <w:proofErr w:type="spellStart"/>
       <w:r>
@@ -5930,14 +6507,27 @@
       </w:r>
     </w:p>
     <w:p>
-      <w:r>
-        <w:t xml:space="preserve">So by the scheme (who knows maybe </w:t>
-      </w:r>
-      <w:r>
-        <w:t xml:space="preserve">by making schema object and passing it to the </w:t>
-      </w:r>
-      <w:r>
-        <w:t>)we created a model</w:t>
+      <w:proofErr w:type="gramStart"/>
+      <w:r>
+        <w:t>So</w:t>
+      </w:r>
+      <w:proofErr w:type="gramEnd"/>
+      <w:r>
+        <w:t xml:space="preserve"> by the scheme (who knows maybe </w:t>
+      </w:r>
+      <w:r>
+        <w:t xml:space="preserve">by making schema object and passing it to </w:t>
+      </w:r>
+      <w:proofErr w:type="gramStart"/>
+      <w:r>
+        <w:t xml:space="preserve">the </w:t>
+      </w:r>
+      <w:r>
+        <w:t>)we</w:t>
+      </w:r>
+      <w:proofErr w:type="gramEnd"/>
+      <w:r>
+        <w:t xml:space="preserve"> created a model</w:t>
       </w:r>
       <w:r>
         <w:t>.</w:t>
@@ -5945,7 +6535,15 @@
     </w:p>
     <w:p>
       <w:r>
-        <w:t>For admin we will create separate UI(who knows</w:t>
+        <w:t xml:space="preserve">For admin we will create separate </w:t>
+      </w:r>
+      <w:proofErr w:type="gramStart"/>
+      <w:r>
+        <w:t>UI(</w:t>
+      </w:r>
+      <w:proofErr w:type="gramEnd"/>
+      <w:r>
+        <w:t>who knows</w:t>
       </w:r>
       <w:r>
         <w:t xml:space="preserve"> how we will manage admin authentication</w:t>
@@ -5955,8 +6553,13 @@
       </w:r>
     </w:p>
     <w:p>
-      <w:r>
-        <w:t xml:space="preserve">So we will create middleware </w:t>
+      <w:proofErr w:type="gramStart"/>
+      <w:r>
+        <w:t>So</w:t>
+      </w:r>
+      <w:proofErr w:type="gramEnd"/>
+      <w:r>
+        <w:t xml:space="preserve"> we will create middleware </w:t>
       </w:r>
       <w:r>
         <w:t xml:space="preserve">to connect to database and from there we will </w:t>
@@ -6028,7 +6631,15 @@
         <w:t xml:space="preserve"> and update our store </w:t>
       </w:r>
       <w:r>
-        <w:t>so we will make it and then decide who get what access(maybe referring to user)</w:t>
+        <w:t xml:space="preserve">so we will make it and then decide who get what </w:t>
+      </w:r>
+      <w:proofErr w:type="gramStart"/>
+      <w:r>
+        <w:t>access(</w:t>
+      </w:r>
+      <w:proofErr w:type="gramEnd"/>
+      <w:r>
+        <w:t>maybe referring to user)</w:t>
       </w:r>
       <w:r>
         <w:t xml:space="preserve">. </w:t>
@@ -6086,7 +6697,15 @@
     </w:p>
     <w:p>
       <w:r>
-        <w:t xml:space="preserve">It may be confusing but it is as  simple as creating </w:t>
+        <w:t xml:space="preserve">It may be confusing but it is </w:t>
+      </w:r>
+      <w:proofErr w:type="gramStart"/>
+      <w:r>
+        <w:t>as  simple</w:t>
+      </w:r>
+      <w:proofErr w:type="gramEnd"/>
+      <w:r>
+        <w:t xml:space="preserve"> as creating </w:t>
       </w:r>
       <w:r>
         <w:t xml:space="preserve">middleware folder </w:t>
@@ -6116,14 +6735,22 @@
         <w:t>make</w:t>
       </w:r>
       <w:r>
-        <w:t xml:space="preserve"> environment variable by making </w:t>
+        <w:t xml:space="preserve"> environment variable by </w:t>
+      </w:r>
+      <w:proofErr w:type="gramStart"/>
+      <w:r>
+        <w:t xml:space="preserve">making </w:t>
       </w:r>
       <w:r>
         <w:t>.</w:t>
       </w:r>
       <w:proofErr w:type="spellStart"/>
       <w:r>
-        <w:t>env.local</w:t>
+        <w:t>env</w:t>
+      </w:r>
+      <w:proofErr w:type="gramEnd"/>
+      <w:r>
+        <w:t>.local</w:t>
       </w:r>
       <w:proofErr w:type="spellEnd"/>
       <w:r>
@@ -6159,6 +6786,7 @@
         <w:t xml:space="preserve">We need a connection string to connect to </w:t>
       </w:r>
       <w:proofErr w:type="spellStart"/>
+      <w:proofErr w:type="gramStart"/>
       <w:r>
         <w:t>mongodb</w:t>
       </w:r>
@@ -6167,7 +6795,11 @@
         <w:t xml:space="preserve"> </w:t>
       </w:r>
       <w:r>
-        <w:t xml:space="preserve"> and we can get for </w:t>
+        <w:t xml:space="preserve"> and</w:t>
+      </w:r>
+      <w:proofErr w:type="gramEnd"/>
+      <w:r>
+        <w:t xml:space="preserve"> we can get for </w:t>
       </w:r>
       <w:proofErr w:type="spellStart"/>
       <w:r>
@@ -6183,16 +6815,32 @@
       </w:r>
       <w:proofErr w:type="spellEnd"/>
       <w:r>
-        <w:t xml:space="preserve"> compass and then click on three dot </w:t>
+        <w:t xml:space="preserve"> compass and then click on three </w:t>
+      </w:r>
+      <w:proofErr w:type="gramStart"/>
+      <w:r>
+        <w:t>dot</w:t>
+      </w:r>
+      <w:proofErr w:type="gramEnd"/>
+      <w:r>
+        <w:t xml:space="preserve"> </w:t>
       </w:r>
       <w:r>
         <w:t>as</w:t>
       </w:r>
       <w:r>
-        <w:t xml:space="preserve"> marked below</w:t>
-      </w:r>
-      <w:r>
-        <w:t xml:space="preserve">(not </w:t>
+        <w:t xml:space="preserve"> marked </w:t>
+      </w:r>
+      <w:proofErr w:type="gramStart"/>
+      <w:r>
+        <w:t>below</w:t>
+      </w:r>
+      <w:r>
+        <w:t>(</w:t>
+      </w:r>
+      <w:proofErr w:type="gramEnd"/>
+      <w:r>
+        <w:t xml:space="preserve">not </w:t>
       </w:r>
       <w:proofErr w:type="spellStart"/>
       <w:r>
@@ -6262,11 +6910,19 @@
         <w:t xml:space="preserve"> to get </w:t>
       </w:r>
       <w:r>
-        <w:t>the connection string and we will store it inside .</w:t>
-      </w:r>
-      <w:proofErr w:type="spellStart"/>
-      <w:r>
-        <w:t>env.local</w:t>
+        <w:t xml:space="preserve">the connection string and we will store it </w:t>
+      </w:r>
+      <w:proofErr w:type="gramStart"/>
+      <w:r>
+        <w:t>inside .</w:t>
+      </w:r>
+      <w:proofErr w:type="spellStart"/>
+      <w:r>
+        <w:t>env</w:t>
+      </w:r>
+      <w:proofErr w:type="gramEnd"/>
+      <w:r>
+        <w:t>.local</w:t>
       </w:r>
       <w:proofErr w:type="spellEnd"/>
       <w:r>
@@ -6280,6 +6936,7 @@
           <w:bCs/>
         </w:rPr>
       </w:pPr>
+      <w:proofErr w:type="gramStart"/>
       <w:r>
         <w:rPr>
           <w:b/>
@@ -6287,6 +6944,7 @@
         </w:rPr>
         <w:t>Note:-</w:t>
       </w:r>
+      <w:proofErr w:type="gramEnd"/>
     </w:p>
     <w:p>
       <w:pPr>
@@ -6371,6 +7029,7 @@
           <w:bCs/>
         </w:rPr>
       </w:pPr>
+      <w:proofErr w:type="gramStart"/>
       <w:r>
         <w:rPr>
           <w:b/>
@@ -6379,6 +7038,7 @@
         <w:lastRenderedPageBreak/>
         <w:t>Note:-</w:t>
       </w:r>
+      <w:proofErr w:type="gramEnd"/>
     </w:p>
     <w:p>
       <w:r>
@@ -6391,6 +7051,7 @@
         <w:t xml:space="preserve">when there is not data in </w:t>
       </w:r>
       <w:proofErr w:type="spellStart"/>
+      <w:proofErr w:type="gramStart"/>
       <w:r>
         <w:t>mon</w:t>
       </w:r>
@@ -6402,7 +7063,11 @@
         <w:t xml:space="preserve"> </w:t>
       </w:r>
       <w:r>
-        <w:t xml:space="preserve"> and we use find </w:t>
+        <w:t xml:space="preserve"> and</w:t>
+      </w:r>
+      <w:proofErr w:type="gramEnd"/>
+      <w:r>
+        <w:t xml:space="preserve"> we use find </w:t>
       </w:r>
       <w:proofErr w:type="spellStart"/>
       <w:r>
@@ -6413,13 +7078,29 @@
         <w:t xml:space="preserve"> any operation on modal </w:t>
       </w:r>
       <w:r>
-        <w:t xml:space="preserve">or maybe importing modal then it try to form </w:t>
-      </w:r>
-      <w:r>
-        <w:t>data again on database</w:t>
-      </w:r>
-      <w:r>
-        <w:t>(who knows)</w:t>
+        <w:t xml:space="preserve">or maybe importing modal then it </w:t>
+      </w:r>
+      <w:proofErr w:type="gramStart"/>
+      <w:r>
+        <w:t>try</w:t>
+      </w:r>
+      <w:proofErr w:type="gramEnd"/>
+      <w:r>
+        <w:t xml:space="preserve"> to form </w:t>
+      </w:r>
+      <w:r>
+        <w:t xml:space="preserve">data again on </w:t>
+      </w:r>
+      <w:proofErr w:type="gramStart"/>
+      <w:r>
+        <w:t>database</w:t>
+      </w:r>
+      <w:r>
+        <w:t>(</w:t>
+      </w:r>
+      <w:proofErr w:type="gramEnd"/>
+      <w:r>
+        <w:t>who knows)</w:t>
       </w:r>
       <w:r>
         <w:t>.</w:t>
@@ -6428,10 +7109,12 @@
         <w:t xml:space="preserve"> to fix that in model file write </w:t>
       </w:r>
       <w:proofErr w:type="spellStart"/>
+      <w:proofErr w:type="gramStart"/>
       <w:r>
         <w:t>mongoose.models</w:t>
       </w:r>
       <w:proofErr w:type="spellEnd"/>
+      <w:proofErr w:type="gramEnd"/>
       <w:r>
         <w:t xml:space="preserve"> = {}</w:t>
       </w:r>
@@ -6739,8 +7422,13 @@
       <w:proofErr w:type="spellEnd"/>
     </w:p>
     <w:p>
-      <w:r>
-        <w:t>So we used:</w:t>
+      <w:proofErr w:type="gramStart"/>
+      <w:r>
+        <w:t>So</w:t>
+      </w:r>
+      <w:proofErr w:type="gramEnd"/>
+      <w:r>
+        <w:t xml:space="preserve"> we used:</w:t>
       </w:r>
     </w:p>
     <w:p>
@@ -7016,10 +7704,39 @@
         <w:t xml:space="preserve">and strictly update everything </w:t>
       </w:r>
       <w:r>
-        <w:t xml:space="preserve">and If any person click on the color he don’t want and click on add to cart then he might buy wrong color product. </w:t>
-      </w:r>
-      <w:r>
-        <w:t>So he should know he is in new page</w:t>
+        <w:t xml:space="preserve">and </w:t>
+      </w:r>
+      <w:proofErr w:type="gramStart"/>
+      <w:r>
+        <w:t>If</w:t>
+      </w:r>
+      <w:proofErr w:type="gramEnd"/>
+      <w:r>
+        <w:t xml:space="preserve"> any person </w:t>
+      </w:r>
+      <w:proofErr w:type="gramStart"/>
+      <w:r>
+        <w:t>click</w:t>
+      </w:r>
+      <w:proofErr w:type="gramEnd"/>
+      <w:r>
+        <w:t xml:space="preserve"> on the color he </w:t>
+      </w:r>
+      <w:proofErr w:type="gramStart"/>
+      <w:r>
+        <w:t>don’t</w:t>
+      </w:r>
+      <w:proofErr w:type="gramEnd"/>
+      <w:r>
+        <w:t xml:space="preserve"> want and click on add to cart then he might buy wrong color product. </w:t>
+      </w:r>
+      <w:proofErr w:type="gramStart"/>
+      <w:r>
+        <w:t>So</w:t>
+      </w:r>
+      <w:proofErr w:type="gramEnd"/>
+      <w:r>
+        <w:t xml:space="preserve"> he should know he is in new page</w:t>
       </w:r>
       <w:r>
         <w:t xml:space="preserve">. </w:t>
@@ -7042,7 +7759,15 @@
         <w:t xml:space="preserve"> can help that is called preserve log it may be found in every browser </w:t>
       </w:r>
       <w:r>
-        <w:t>it preserve the log that was before reload So to do it go to marked below</w:t>
+        <w:t xml:space="preserve">it </w:t>
+      </w:r>
+      <w:proofErr w:type="gramStart"/>
+      <w:r>
+        <w:t>preserve</w:t>
+      </w:r>
+      <w:proofErr w:type="gramEnd"/>
+      <w:r>
+        <w:t xml:space="preserve"> the log that was before reload So to do it go to marked below</w:t>
       </w:r>
       <w:r>
         <w:t xml:space="preserve"> in console</w:t>
@@ -7380,6 +8105,7 @@
           <w:bCs/>
         </w:rPr>
       </w:pPr>
+      <w:proofErr w:type="gramStart"/>
       <w:r>
         <w:rPr>
           <w:b/>
@@ -7394,6 +8120,7 @@
         </w:rPr>
         <w:t>:-</w:t>
       </w:r>
+      <w:proofErr w:type="gramEnd"/>
     </w:p>
     <w:p>
       <w:pPr>
@@ -7405,10 +8132,18 @@
         <w:t>We think that inside react element</w:t>
       </w:r>
       <w:r>
-        <w:t>s that space is also counted as an element.</w:t>
-      </w:r>
-      <w:r>
-        <w:t>(maybe) for example you take &lt;p&gt;</w:t>
+        <w:t xml:space="preserve">s that space is also counted as an </w:t>
+      </w:r>
+      <w:proofErr w:type="gramStart"/>
+      <w:r>
+        <w:t>element.</w:t>
+      </w:r>
+      <w:r>
+        <w:t>(</w:t>
+      </w:r>
+      <w:proofErr w:type="gramEnd"/>
+      <w:r>
+        <w:t>maybe) for example you take &lt;p&gt;</w:t>
       </w:r>
       <w:r>
         <w:rPr>
@@ -7429,7 +8164,11 @@
         <w:t xml:space="preserve"> </w:t>
       </w:r>
       <w:r>
-        <w:t xml:space="preserve"> be treated as an element</w:t>
+        <w:t xml:space="preserve"> be treated as an </w:t>
+      </w:r>
+      <w:proofErr w:type="gramStart"/>
+      <w:r>
+        <w:t>element</w:t>
       </w:r>
       <w:r>
         <w:t>.</w:t>
@@ -7437,6 +8176,7 @@
       <w:r>
         <w:t>(</w:t>
       </w:r>
+      <w:proofErr w:type="gramEnd"/>
       <w:r>
         <w:t>who knows</w:t>
       </w:r>
@@ -7772,13 +8512,26 @@
     </w:p>
     <w:p>
       <w:r>
-        <w:t>Many times</w:t>
-      </w:r>
-      <w:r>
-        <w:t xml:space="preserve"> in ecommerce </w:t>
-      </w:r>
-      <w:r>
-        <w:t xml:space="preserve"> we need to give alert to the </w:t>
+        <w:t xml:space="preserve">Many </w:t>
+      </w:r>
+      <w:proofErr w:type="gramStart"/>
+      <w:r>
+        <w:t>times</w:t>
+      </w:r>
+      <w:proofErr w:type="gramEnd"/>
+      <w:r>
+        <w:t xml:space="preserve"> in </w:t>
+      </w:r>
+      <w:proofErr w:type="gramStart"/>
+      <w:r>
+        <w:t xml:space="preserve">ecommerce </w:t>
+      </w:r>
+      <w:r>
+        <w:t xml:space="preserve"> we</w:t>
+      </w:r>
+      <w:proofErr w:type="gramEnd"/>
+      <w:r>
+        <w:t xml:space="preserve"> need to give alert to the </w:t>
       </w:r>
       <w:r>
         <w:t>user</w:t>
@@ -7853,8 +8606,13 @@
       <w:r>
         <w:t xml:space="preserve"> </w:t>
       </w:r>
-      <w:r>
-        <w:t xml:space="preserve">.We need to tell them </w:t>
+      <w:proofErr w:type="gramStart"/>
+      <w:r>
+        <w:t>.We</w:t>
+      </w:r>
+      <w:proofErr w:type="gramEnd"/>
+      <w:r>
+        <w:t xml:space="preserve"> need to tell them </w:t>
       </w:r>
       <w:r>
         <w:t xml:space="preserve">that </w:t>
@@ -8545,10 +9303,18 @@
         <w:t xml:space="preserve"> </w:t>
       </w:r>
       <w:r>
-        <w:t xml:space="preserve">which tells how our toast will be shown </w:t>
-      </w:r>
-      <w:r>
-        <w:t xml:space="preserve">, </w:t>
+        <w:t xml:space="preserve">which tells how our toast will be </w:t>
+      </w:r>
+      <w:proofErr w:type="gramStart"/>
+      <w:r>
+        <w:t xml:space="preserve">shown </w:t>
+      </w:r>
+      <w:r>
+        <w:t>,</w:t>
+      </w:r>
+      <w:proofErr w:type="gramEnd"/>
+      <w:r>
+        <w:t xml:space="preserve"> </w:t>
       </w:r>
       <w:proofErr w:type="spellStart"/>
       <w:r>
@@ -8573,10 +9339,18 @@
       </w:r>
       <w:proofErr w:type="spellEnd"/>
       <w:r>
-        <w:t xml:space="preserve"> that invoke that component </w:t>
-      </w:r>
-      <w:r>
-        <w:t xml:space="preserve"> You can see </w:t>
+        <w:t xml:space="preserve"> that invoke that </w:t>
+      </w:r>
+      <w:proofErr w:type="gramStart"/>
+      <w:r>
+        <w:t xml:space="preserve">component </w:t>
+      </w:r>
+      <w:r>
+        <w:t xml:space="preserve"> You</w:t>
+      </w:r>
+      <w:proofErr w:type="gramEnd"/>
+      <w:r>
+        <w:t xml:space="preserve"> can see </w:t>
       </w:r>
       <w:proofErr w:type="spellStart"/>
       <w:r>
@@ -8584,13 +9358,29 @@
       </w:r>
       <w:proofErr w:type="spellEnd"/>
       <w:r>
-        <w:t xml:space="preserve"> options of types and position is given . Choose your option and </w:t>
+        <w:t xml:space="preserve"> options of types and position is </w:t>
+      </w:r>
+      <w:proofErr w:type="gramStart"/>
+      <w:r>
+        <w:t>given .</w:t>
+      </w:r>
+      <w:proofErr w:type="gramEnd"/>
+      <w:r>
+        <w:t xml:space="preserve"> Choose your option and </w:t>
       </w:r>
       <w:r>
         <w:t xml:space="preserve">then your code will reflect that. </w:t>
       </w:r>
       <w:r>
-        <w:t xml:space="preserve">To see the demo we click on Show toast </w:t>
+        <w:t xml:space="preserve">To see the </w:t>
+      </w:r>
+      <w:proofErr w:type="gramStart"/>
+      <w:r>
+        <w:t>demo</w:t>
+      </w:r>
+      <w:proofErr w:type="gramEnd"/>
+      <w:r>
+        <w:t xml:space="preserve"> we click on Show toast </w:t>
       </w:r>
     </w:p>
     <w:p>
@@ -8644,14 +9434,27 @@
       </w:r>
     </w:p>
     <w:p>
-      <w:r>
-        <w:t>So we now copy and paste the code here to apply them.</w:t>
+      <w:proofErr w:type="gramStart"/>
+      <w:r>
+        <w:t>So</w:t>
+      </w:r>
+      <w:proofErr w:type="gramEnd"/>
+      <w:r>
+        <w:t xml:space="preserve"> we now copy and paste the code here to apply them.</w:t>
       </w:r>
       <w:r>
         <w:t xml:space="preserve"> </w:t>
       </w:r>
       <w:r>
-        <w:t xml:space="preserve">There are other methods inside our toast that is success and error and many more to show different situation in the toast.(who knows) </w:t>
+        <w:t xml:space="preserve">There are other methods inside our toast that is success and error and many more to show different situation in the </w:t>
+      </w:r>
+      <w:proofErr w:type="gramStart"/>
+      <w:r>
+        <w:t>toast.(</w:t>
+      </w:r>
+      <w:proofErr w:type="gramEnd"/>
+      <w:r>
+        <w:t xml:space="preserve">who knows) </w:t>
       </w:r>
     </w:p>
     <w:p>
@@ -8661,8 +9464,13 @@
       <w:r>
         <w:t xml:space="preserve">of </w:t>
       </w:r>
-      <w:r>
-        <w:t>toast  in the demo of documentation</w:t>
+      <w:proofErr w:type="gramStart"/>
+      <w:r>
+        <w:t>toast  in</w:t>
+      </w:r>
+      <w:proofErr w:type="gramEnd"/>
+      <w:r>
+        <w:t xml:space="preserve"> the demo of documentation</w:t>
       </w:r>
     </w:p>
     <w:p>
@@ -8791,7 +9599,15 @@
         <w:t>e</w:t>
       </w:r>
       <w:r>
-        <w:t xml:space="preserve">s the model that is Schema Object(who knows) and sometimes we don’t need </w:t>
+        <w:t xml:space="preserve">s the model that is Schema </w:t>
+      </w:r>
+      <w:proofErr w:type="gramStart"/>
+      <w:r>
+        <w:t>Object(</w:t>
+      </w:r>
+      <w:proofErr w:type="gramEnd"/>
+      <w:r>
+        <w:t xml:space="preserve">who knows) and sometimes we don’t need </w:t>
       </w:r>
       <w:r>
         <w:t xml:space="preserve">object just Schema </w:t>
@@ -8800,7 +9616,15 @@
         <w:t xml:space="preserve">class </w:t>
       </w:r>
       <w:r>
-        <w:t>and its static methods(who knows)</w:t>
+        <w:t xml:space="preserve">and its static </w:t>
+      </w:r>
+      <w:proofErr w:type="gramStart"/>
+      <w:r>
+        <w:t>methods(</w:t>
+      </w:r>
+      <w:proofErr w:type="gramEnd"/>
+      <w:r>
+        <w:t>who knows)</w:t>
       </w:r>
       <w:r>
         <w:t>.</w:t>
@@ -9082,7 +9906,23 @@
           <w:b/>
           <w:bCs/>
         </w:rPr>
-        <w:t xml:space="preserve">and when we match our password after we get authenticated we get token for </w:t>
+        <w:t xml:space="preserve">and when we match our password after we get </w:t>
+      </w:r>
+      <w:proofErr w:type="gramStart"/>
+      <w:r>
+        <w:rPr>
+          <w:b/>
+          <w:bCs/>
+        </w:rPr>
+        <w:t>authenticated</w:t>
+      </w:r>
+      <w:proofErr w:type="gramEnd"/>
+      <w:r>
+        <w:rPr>
+          <w:b/>
+          <w:bCs/>
+        </w:rPr>
+        <w:t xml:space="preserve"> we get token for </w:t>
       </w:r>
       <w:r>
         <w:rPr>
@@ -9096,7 +9936,23 @@
           <w:b/>
           <w:bCs/>
         </w:rPr>
-        <w:t xml:space="preserve">It is not easy to hack a database of plain password but if it get </w:t>
+        <w:t xml:space="preserve">It is not easy to hack a database of plain password but if it </w:t>
+      </w:r>
+      <w:proofErr w:type="gramStart"/>
+      <w:r>
+        <w:rPr>
+          <w:b/>
+          <w:bCs/>
+        </w:rPr>
+        <w:t>get</w:t>
+      </w:r>
+      <w:proofErr w:type="gramEnd"/>
+      <w:r>
+        <w:rPr>
+          <w:b/>
+          <w:bCs/>
+        </w:rPr>
+        <w:t xml:space="preserve"> </w:t>
       </w:r>
       <w:r>
         <w:rPr>
@@ -9272,8 +10128,13 @@
         <w:t xml:space="preserve">You can see above we encrypted </w:t>
       </w:r>
       <w:r>
-        <w:t>the password with a secret keys</w:t>
-      </w:r>
+        <w:t xml:space="preserve">the password with a </w:t>
+      </w:r>
+      <w:proofErr w:type="gramStart"/>
+      <w:r>
+        <w:t>secret keys</w:t>
+      </w:r>
+      <w:proofErr w:type="gramEnd"/>
       <w:r>
         <w:t xml:space="preserve"> which is a secret string actually </w:t>
       </w:r>
@@ -9324,6 +10185,7 @@
           <w:bCs/>
         </w:rPr>
       </w:pPr>
+      <w:proofErr w:type="gramStart"/>
       <w:r>
         <w:rPr>
           <w:b/>
@@ -9331,6 +10193,7 @@
         </w:rPr>
         <w:t>Note:-</w:t>
       </w:r>
+      <w:proofErr w:type="gramEnd"/>
     </w:p>
     <w:p>
       <w:pPr>
@@ -9363,7 +10226,15 @@
         <w:t>m</w:t>
       </w:r>
       <w:r>
-        <w:t xml:space="preserve">e secret key we get different </w:t>
+        <w:t xml:space="preserve">e secret </w:t>
+      </w:r>
+      <w:proofErr w:type="gramStart"/>
+      <w:r>
+        <w:t>key</w:t>
+      </w:r>
+      <w:proofErr w:type="gramEnd"/>
+      <w:r>
+        <w:t xml:space="preserve"> we get different </w:t>
       </w:r>
       <w:r>
         <w:t xml:space="preserve">results because of salt </w:t>
@@ -9378,7 +10249,15 @@
         <w:t xml:space="preserve">and its string is decided by the algorithm </w:t>
       </w:r>
       <w:r>
-        <w:t>and while decrypting (how can it be possible) this string(or salt) may be decoded from the string.</w:t>
+        <w:t xml:space="preserve">and while decrypting (how can it be possible) this </w:t>
+      </w:r>
+      <w:proofErr w:type="gramStart"/>
+      <w:r>
+        <w:t>string(</w:t>
+      </w:r>
+      <w:proofErr w:type="gramEnd"/>
+      <w:r>
+        <w:t>or salt) may be decoded from the string.</w:t>
       </w:r>
       <w:r>
         <w:t xml:space="preserve"> Evert algorithm has its own working</w:t>
@@ -9386,7 +10265,15 @@
     </w:p>
     <w:p>
       <w:r>
-        <w:t xml:space="preserve">IN the working of AES we don’t need to match encrypted string </w:t>
+        <w:t xml:space="preserve">IN the working of </w:t>
+      </w:r>
+      <w:proofErr w:type="gramStart"/>
+      <w:r>
+        <w:t>AES</w:t>
+      </w:r>
+      <w:proofErr w:type="gramEnd"/>
+      <w:r>
+        <w:t xml:space="preserve"> we don’t need to match encrypted string </w:t>
       </w:r>
       <w:r>
         <w:t xml:space="preserve">we need to match decrypted string. </w:t>
@@ -9456,7 +10343,15 @@
         <w:t xml:space="preserve">rom it </w:t>
       </w:r>
       <w:r>
-        <w:t xml:space="preserve">and it s tampering does not become possible what we do for it </w:t>
+        <w:t xml:space="preserve">and </w:t>
+      </w:r>
+      <w:proofErr w:type="gramStart"/>
+      <w:r>
+        <w:t>it</w:t>
+      </w:r>
+      <w:proofErr w:type="gramEnd"/>
+      <w:r>
+        <w:t xml:space="preserve"> s tampering does not become possible what we do for it </w:t>
       </w:r>
     </w:p>
     <w:p>
@@ -9570,8 +10465,13 @@
       <w:r>
         <w:t xml:space="preserve">We are talking about token on the left </w:t>
       </w:r>
-      <w:r>
-        <w:t xml:space="preserve">The </w:t>
+      <w:proofErr w:type="gramStart"/>
+      <w:r>
+        <w:t>The</w:t>
+      </w:r>
+      <w:proofErr w:type="gramEnd"/>
+      <w:r>
+        <w:t xml:space="preserve"> </w:t>
       </w:r>
       <w:r>
         <w:t xml:space="preserve">traditional approach of login </w:t>
@@ -9680,11 +10580,32 @@
       </w:r>
       <w:proofErr w:type="spellEnd"/>
       <w:r>
-        <w:t xml:space="preserve"> is that it is divided into three parts first is header , second part is Payload data</w:t>
-      </w:r>
-      <w:r>
-        <w:t>(which is our data )</w:t>
-      </w:r>
+        <w:t xml:space="preserve"> is that it is divided into three parts first is </w:t>
+      </w:r>
+      <w:proofErr w:type="gramStart"/>
+      <w:r>
+        <w:t>header ,</w:t>
+      </w:r>
+      <w:proofErr w:type="gramEnd"/>
+      <w:r>
+        <w:t xml:space="preserve"> second part is Payload </w:t>
+      </w:r>
+      <w:proofErr w:type="gramStart"/>
+      <w:r>
+        <w:t>data</w:t>
+      </w:r>
+      <w:r>
+        <w:t>(</w:t>
+      </w:r>
+      <w:proofErr w:type="gramEnd"/>
+      <w:r>
+        <w:t xml:space="preserve">which is our </w:t>
+      </w:r>
+      <w:proofErr w:type="gramStart"/>
+      <w:r>
+        <w:t>data )</w:t>
+      </w:r>
+      <w:proofErr w:type="gramEnd"/>
       <w:r>
         <w:t xml:space="preserve"> and another is signature</w:t>
       </w:r>
@@ -9722,13 +10643,21 @@
         <w:t>g</w:t>
       </w:r>
       <w:r>
-        <w:t>orithm is used (maybe for encryption)</w:t>
+        <w:t xml:space="preserve">orithm is used (maybe for </w:t>
+      </w:r>
+      <w:proofErr w:type="gramStart"/>
+      <w:r>
+        <w:t>encryption)</w:t>
       </w:r>
       <w:r>
         <w:t xml:space="preserve"> </w:t>
       </w:r>
       <w:r>
-        <w:t xml:space="preserve"> and then next part is data </w:t>
+        <w:t xml:space="preserve"> and</w:t>
+      </w:r>
+      <w:proofErr w:type="gramEnd"/>
+      <w:r>
+        <w:t xml:space="preserve"> then next part is data </w:t>
       </w:r>
       <w:r>
         <w:lastRenderedPageBreak/>
@@ -9813,7 +10742,15 @@
         <w:t xml:space="preserve"> </w:t>
       </w:r>
       <w:r>
-        <w:t xml:space="preserve">By using this secret we can </w:t>
+        <w:t xml:space="preserve">By using this </w:t>
+      </w:r>
+      <w:proofErr w:type="gramStart"/>
+      <w:r>
+        <w:t>secret</w:t>
+      </w:r>
+      <w:proofErr w:type="gramEnd"/>
+      <w:r>
+        <w:t xml:space="preserve"> we can </w:t>
       </w:r>
       <w:r>
         <w:t xml:space="preserve">know is this </w:t>
@@ -9856,8 +10793,13 @@
       </w:r>
     </w:p>
     <w:p>
-      <w:r>
-        <w:t xml:space="preserve">So we add it </w:t>
+      <w:proofErr w:type="gramStart"/>
+      <w:r>
+        <w:t>So</w:t>
+      </w:r>
+      <w:proofErr w:type="gramEnd"/>
+      <w:r>
+        <w:t xml:space="preserve"> we add it </w:t>
       </w:r>
       <w:proofErr w:type="spellStart"/>
       <w:r>
@@ -9872,8 +10814,13 @@
       </w:r>
     </w:p>
     <w:p>
-      <w:r>
-        <w:t xml:space="preserve">So what we did we import </w:t>
+      <w:proofErr w:type="gramStart"/>
+      <w:r>
+        <w:t>So</w:t>
+      </w:r>
+      <w:proofErr w:type="gramEnd"/>
+      <w:r>
+        <w:t xml:space="preserve"> what we did we import </w:t>
       </w:r>
       <w:proofErr w:type="spellStart"/>
       <w:r>
@@ -10045,7 +10992,15 @@
         <w:t>that is Iat it tells when this token was issued.</w:t>
       </w:r>
       <w:r>
-        <w:t xml:space="preserve">  So you can see above that this</w:t>
+        <w:t xml:space="preserve">  </w:t>
+      </w:r>
+      <w:proofErr w:type="gramStart"/>
+      <w:r>
+        <w:t>So</w:t>
+      </w:r>
+      <w:proofErr w:type="gramEnd"/>
+      <w:r>
+        <w:t xml:space="preserve"> you can see above that this</w:t>
       </w:r>
       <w:r>
         <w:t xml:space="preserve"> </w:t>
@@ -10095,13 +11050,21 @@
         <w:t xml:space="preserve"> that tells when that </w:t>
       </w:r>
       <w:r>
-        <w:t>token will be expired</w:t>
+        <w:t xml:space="preserve">token will be </w:t>
+      </w:r>
+      <w:proofErr w:type="gramStart"/>
+      <w:r>
+        <w:t>expired</w:t>
       </w:r>
       <w:r>
         <w:t>(</w:t>
       </w:r>
       <w:r>
-        <w:t xml:space="preserve"> who knows</w:t>
+        <w:t xml:space="preserve"> who</w:t>
+      </w:r>
+      <w:proofErr w:type="gramEnd"/>
+      <w:r>
+        <w:t xml:space="preserve"> knows</w:t>
       </w:r>
       <w:r>
         <w:t>)</w:t>
@@ -10158,7 +11121,15 @@
     </w:p>
     <w:p>
       <w:r>
-        <w:t>So now our code look like above.</w:t>
+        <w:t xml:space="preserve">So now our code </w:t>
+      </w:r>
+      <w:proofErr w:type="gramStart"/>
+      <w:r>
+        <w:t>look</w:t>
+      </w:r>
+      <w:proofErr w:type="gramEnd"/>
+      <w:r>
+        <w:t xml:space="preserve"> like above.</w:t>
       </w:r>
     </w:p>
     <w:p>
@@ -10198,7 +11169,15 @@
         <w:t xml:space="preserve"> it so that </w:t>
       </w:r>
       <w:r>
-        <w:t xml:space="preserve">it get logout after some time. </w:t>
+        <w:t xml:space="preserve">it </w:t>
+      </w:r>
+      <w:proofErr w:type="gramStart"/>
+      <w:r>
+        <w:t>get</w:t>
+      </w:r>
+      <w:proofErr w:type="gramEnd"/>
+      <w:r>
+        <w:t xml:space="preserve"> logout after some time. </w:t>
       </w:r>
     </w:p>
     <w:p>
@@ -10224,14 +11203,23 @@
         <w:t>app</w:t>
       </w:r>
       <w:r>
-        <w:t xml:space="preserve"> content</w:t>
-      </w:r>
-      <w:r>
-        <w:t>(or pages)</w:t>
+        <w:t xml:space="preserve"> </w:t>
+      </w:r>
+      <w:proofErr w:type="gramStart"/>
+      <w:r>
+        <w:t>content</w:t>
+      </w:r>
+      <w:r>
+        <w:t>(</w:t>
+      </w:r>
+      <w:proofErr w:type="gramEnd"/>
+      <w:r>
+        <w:t>or pages)</w:t>
       </w:r>
       <w:r>
         <w:t xml:space="preserve"> and Boiler plate often contains </w:t>
       </w:r>
+      <w:proofErr w:type="gramStart"/>
       <w:r>
         <w:t>H</w:t>
       </w:r>
@@ -10239,7 +11227,11 @@
         <w:t>t</w:t>
       </w:r>
       <w:r>
-        <w:t xml:space="preserve">ml ,Head and Body </w:t>
+        <w:t>ml ,Head</w:t>
+      </w:r>
+      <w:proofErr w:type="gramEnd"/>
+      <w:r>
+        <w:t xml:space="preserve"> and Body </w:t>
       </w:r>
       <w:r>
         <w:t xml:space="preserve">It </w:t>
@@ -10446,6 +11438,7 @@
         <w:t xml:space="preserve">You can use </w:t>
       </w:r>
       <w:proofErr w:type="spellStart"/>
+      <w:proofErr w:type="gramStart"/>
       <w:r>
         <w:rPr>
           <w:b/>
@@ -10454,6 +11447,7 @@
         <w:t>router.query</w:t>
       </w:r>
       <w:proofErr w:type="spellEnd"/>
+      <w:proofErr w:type="gramEnd"/>
       <w:r>
         <w:rPr>
           <w:b/>
@@ -10473,7 +11467,39 @@
           <w:b/>
           <w:bCs/>
         </w:rPr>
-        <w:t>that you want to run as it track the url . so as url changes our useEffect runs.</w:t>
+        <w:t xml:space="preserve">that you want to run as it track the </w:t>
+      </w:r>
+      <w:proofErr w:type="gramStart"/>
+      <w:r>
+        <w:rPr>
+          <w:b/>
+          <w:bCs/>
+        </w:rPr>
+        <w:t>url .</w:t>
+      </w:r>
+      <w:proofErr w:type="gramEnd"/>
+      <w:r>
+        <w:rPr>
+          <w:b/>
+          <w:bCs/>
+        </w:rPr>
+        <w:t xml:space="preserve"> </w:t>
+      </w:r>
+      <w:proofErr w:type="gramStart"/>
+      <w:r>
+        <w:rPr>
+          <w:b/>
+          <w:bCs/>
+        </w:rPr>
+        <w:t>so</w:t>
+      </w:r>
+      <w:proofErr w:type="gramEnd"/>
+      <w:r>
+        <w:rPr>
+          <w:b/>
+          <w:bCs/>
+        </w:rPr>
+        <w:t xml:space="preserve"> as url changes our useEffect runs.</w:t>
       </w:r>
     </w:p>
     <w:p>
@@ -10533,8 +11559,13 @@
       </w:r>
     </w:p>
     <w:p>
-      <w:r>
-        <w:t>useEffect(() =&gt; {</w:t>
+      <w:proofErr w:type="gramStart"/>
+      <w:r>
+        <w:t>useEffect(</w:t>
+      </w:r>
+      <w:proofErr w:type="gramEnd"/>
+      <w:r>
+        <w:t>() =&gt; {</w:t>
       </w:r>
     </w:p>
     <w:p>
@@ -10547,10 +11578,12 @@
         <w:t>}, [</w:t>
       </w:r>
       <w:proofErr w:type="spellStart"/>
+      <w:proofErr w:type="gramStart"/>
       <w:r>
         <w:t>router.query</w:t>
       </w:r>
       <w:proofErr w:type="spellEnd"/>
+      <w:proofErr w:type="gramEnd"/>
       <w:r>
         <w:t>]);</w:t>
       </w:r>
@@ -10621,12 +11654,17 @@
         <w:t xml:space="preserve"> router = </w:t>
       </w:r>
       <w:proofErr w:type="spellStart"/>
+      <w:proofErr w:type="gramStart"/>
       <w:r>
         <w:t>useRouter</w:t>
       </w:r>
       <w:proofErr w:type="spellEnd"/>
       <w:r>
-        <w:t>()</w:t>
+        <w:t>(</w:t>
+      </w:r>
+      <w:proofErr w:type="gramEnd"/>
+      <w:r>
+        <w:t>)</w:t>
       </w:r>
     </w:p>
     <w:p>
@@ -10654,10 +11692,12 @@
     </w:p>
     <w:p>
       <w:proofErr w:type="spellStart"/>
+      <w:proofErr w:type="gramStart"/>
       <w:r>
         <w:t>router.query</w:t>
       </w:r>
       <w:proofErr w:type="spellEnd"/>
+      <w:proofErr w:type="gramEnd"/>
       <w:r>
         <w:t xml:space="preserve"> // </w:t>
       </w:r>
@@ -10720,23 +11760,33 @@
     </w:p>
     <w:p>
       <w:r>
-        <w:t xml:space="preserve">import { </w:t>
+        <w:t xml:space="preserve">import </w:t>
+      </w:r>
+      <w:proofErr w:type="gramStart"/>
+      <w:r>
+        <w:t xml:space="preserve">{ </w:t>
       </w:r>
       <w:proofErr w:type="spellStart"/>
       <w:r>
         <w:t>usePathname</w:t>
       </w:r>
       <w:proofErr w:type="spellEnd"/>
+      <w:proofErr w:type="gramEnd"/>
       <w:r>
         <w:t xml:space="preserve">, </w:t>
       </w:r>
       <w:proofErr w:type="spellStart"/>
+      <w:proofErr w:type="gramStart"/>
       <w:r>
         <w:t>useSearchParams</w:t>
       </w:r>
       <w:proofErr w:type="spellEnd"/>
       <w:r>
-        <w:t xml:space="preserve"> } from "next/navigation";</w:t>
+        <w:t xml:space="preserve"> }</w:t>
+      </w:r>
+      <w:proofErr w:type="gramEnd"/>
+      <w:r>
+        <w:t xml:space="preserve"> from "next/navigation";</w:t>
       </w:r>
     </w:p>
     <w:p>
@@ -10786,13 +11836,18 @@
     </w:p>
     <w:p>
       <w:r>
-        <w:t xml:space="preserve">import { </w:t>
+        <w:t xml:space="preserve">import </w:t>
+      </w:r>
+      <w:proofErr w:type="gramStart"/>
+      <w:r>
+        <w:t xml:space="preserve">{ </w:t>
       </w:r>
       <w:proofErr w:type="spellStart"/>
       <w:r>
         <w:t>usePathname</w:t>
       </w:r>
       <w:proofErr w:type="spellEnd"/>
+      <w:proofErr w:type="gramEnd"/>
       <w:r>
         <w:t xml:space="preserve"> } from "next/navigation";</w:t>
       </w:r>
@@ -10808,18 +11863,28 @@
         <w:t xml:space="preserve"> pathname = </w:t>
       </w:r>
       <w:proofErr w:type="spellStart"/>
+      <w:proofErr w:type="gramStart"/>
       <w:r>
         <w:t>usePathname</w:t>
       </w:r>
       <w:proofErr w:type="spellEnd"/>
       <w:r>
-        <w:t>();</w:t>
+        <w:t>(</w:t>
+      </w:r>
+      <w:proofErr w:type="gramEnd"/>
+      <w:r>
+        <w:t>);</w:t>
       </w:r>
     </w:p>
     <w:p/>
     <w:p>
-      <w:r>
-        <w:t>useEffect(() =&gt; {</w:t>
+      <w:proofErr w:type="gramStart"/>
+      <w:r>
+        <w:t>useEffect(</w:t>
+      </w:r>
+      <w:proofErr w:type="gramEnd"/>
+      <w:r>
+        <w:t>() =&gt; {</w:t>
       </w:r>
     </w:p>
     <w:p>
@@ -10854,12 +11919,25 @@
         <w:t xml:space="preserve">    </w:t>
       </w:r>
       <w:proofErr w:type="spellStart"/>
+      <w:proofErr w:type="gramStart"/>
       <w:r>
         <w:t>setUser</w:t>
       </w:r>
       <w:proofErr w:type="spellEnd"/>
       <w:r>
-        <w:t>({ value: token });</w:t>
+        <w:t>({ value</w:t>
+      </w:r>
+      <w:proofErr w:type="gramEnd"/>
+      <w:r>
+        <w:t xml:space="preserve">: </w:t>
+      </w:r>
+      <w:proofErr w:type="gramStart"/>
+      <w:r>
+        <w:t>token }</w:t>
+      </w:r>
+      <w:proofErr w:type="gramEnd"/>
+      <w:r>
+        <w:t>);</w:t>
       </w:r>
     </w:p>
     <w:p>
@@ -10867,6 +11945,7 @@
         <w:t xml:space="preserve">    </w:t>
       </w:r>
       <w:proofErr w:type="spellStart"/>
+      <w:proofErr w:type="gramStart"/>
       <w:r>
         <w:t>setKey</w:t>
       </w:r>
@@ -10875,6 +11954,7 @@
         <w:t>(</w:t>
       </w:r>
       <w:proofErr w:type="spellStart"/>
+      <w:proofErr w:type="gramEnd"/>
       <w:r>
         <w:t>Math.random</w:t>
       </w:r>
@@ -10917,13 +11997,18 @@
     </w:p>
     <w:p>
       <w:r>
-        <w:t xml:space="preserve">import { </w:t>
+        <w:t xml:space="preserve">import </w:t>
+      </w:r>
+      <w:proofErr w:type="gramStart"/>
+      <w:r>
+        <w:t xml:space="preserve">{ </w:t>
       </w:r>
       <w:proofErr w:type="spellStart"/>
       <w:r>
         <w:t>useSearchParams</w:t>
       </w:r>
       <w:proofErr w:type="spellEnd"/>
+      <w:proofErr w:type="gramEnd"/>
       <w:r>
         <w:t xml:space="preserve"> } from "next/navigation";</w:t>
       </w:r>
@@ -10947,18 +12032,28 @@
         <w:t xml:space="preserve"> = </w:t>
       </w:r>
       <w:proofErr w:type="spellStart"/>
+      <w:proofErr w:type="gramStart"/>
       <w:r>
         <w:t>useSearchParams</w:t>
       </w:r>
       <w:proofErr w:type="spellEnd"/>
       <w:r>
-        <w:t>();</w:t>
+        <w:t>(</w:t>
+      </w:r>
+      <w:proofErr w:type="gramEnd"/>
+      <w:r>
+        <w:t>);</w:t>
       </w:r>
     </w:p>
     <w:p/>
     <w:p>
-      <w:r>
-        <w:t>useEffect(() =&gt; {</w:t>
+      <w:proofErr w:type="gramStart"/>
+      <w:r>
+        <w:t>useEffect(</w:t>
+      </w:r>
+      <w:proofErr w:type="gramEnd"/>
+      <w:r>
+        <w:t>() =&gt; {</w:t>
       </w:r>
     </w:p>
     <w:p>
@@ -10993,12 +12088,25 @@
         <w:t xml:space="preserve">    </w:t>
       </w:r>
       <w:proofErr w:type="spellStart"/>
+      <w:proofErr w:type="gramStart"/>
       <w:r>
         <w:t>setUser</w:t>
       </w:r>
       <w:proofErr w:type="spellEnd"/>
       <w:r>
-        <w:t>({ value: token });</w:t>
+        <w:t>({ value</w:t>
+      </w:r>
+      <w:proofErr w:type="gramEnd"/>
+      <w:r>
+        <w:t xml:space="preserve">: </w:t>
+      </w:r>
+      <w:proofErr w:type="gramStart"/>
+      <w:r>
+        <w:t>token }</w:t>
+      </w:r>
+      <w:proofErr w:type="gramEnd"/>
+      <w:r>
+        <w:t>);</w:t>
       </w:r>
     </w:p>
     <w:p>
@@ -11007,6 +12115,7 @@
         <w:t xml:space="preserve">    </w:t>
       </w:r>
       <w:proofErr w:type="spellStart"/>
+      <w:proofErr w:type="gramStart"/>
       <w:r>
         <w:t>setKey</w:t>
       </w:r>
@@ -11015,6 +12124,7 @@
         <w:t>(</w:t>
       </w:r>
       <w:proofErr w:type="spellStart"/>
+      <w:proofErr w:type="gramEnd"/>
       <w:r>
         <w:t>Math.random</w:t>
       </w:r>
@@ -11079,10 +12189,12 @@
         </w:numPr>
       </w:pPr>
       <w:proofErr w:type="spellStart"/>
+      <w:proofErr w:type="gramStart"/>
       <w:r>
         <w:t>router.query</w:t>
       </w:r>
       <w:proofErr w:type="spellEnd"/>
+      <w:proofErr w:type="gramEnd"/>
       <w:r>
         <w:t xml:space="preserve"> → only exists in </w:t>
       </w:r>
@@ -11119,8 +12231,13 @@
           <w:numId w:val="5"/>
         </w:numPr>
       </w:pPr>
-      <w:r>
-        <w:t>So dependency never updates → no re-render</w:t>
+      <w:proofErr w:type="gramStart"/>
+      <w:r>
+        <w:t>So</w:t>
+      </w:r>
+      <w:proofErr w:type="gramEnd"/>
+      <w:r>
+        <w:t xml:space="preserve"> dependency never updates → no re-render</w:t>
       </w:r>
     </w:p>
     <w:p>
@@ -11160,6 +12277,7 @@
     </w:p>
     <w:p>
       <w:proofErr w:type="spellStart"/>
+      <w:proofErr w:type="gramStart"/>
       <w:r>
         <w:t>setKey</w:t>
       </w:r>
@@ -11168,6 +12286,7 @@
         <w:t>(</w:t>
       </w:r>
       <w:proofErr w:type="spellStart"/>
+      <w:proofErr w:type="gramEnd"/>
       <w:r>
         <w:t>Math.random</w:t>
       </w:r>
@@ -11188,8 +12307,13 @@
       </w:r>
     </w:p>
     <w:p>
-      <w:r>
-        <w:t>Instead just:</w:t>
+      <w:proofErr w:type="gramStart"/>
+      <w:r>
+        <w:t>Instead</w:t>
+      </w:r>
+      <w:proofErr w:type="gramEnd"/>
+      <w:r>
+        <w:t xml:space="preserve"> just:</w:t>
       </w:r>
     </w:p>
     <w:p>
@@ -11234,36 +12358,70 @@
     </w:p>
     <w:p>
       <w:r>
-        <w:t>"use client"</w:t>
-      </w:r>
-    </w:p>
-    <w:p>
-      <w:r>
-        <w:t xml:space="preserve">import React, { useEffect, </w:t>
-      </w:r>
-      <w:proofErr w:type="spellStart"/>
+        <w:t>"</w:t>
+      </w:r>
+      <w:proofErr w:type="gramStart"/>
+      <w:r>
+        <w:t>use</w:t>
+      </w:r>
+      <w:proofErr w:type="gramEnd"/>
+      <w:r>
+        <w:t xml:space="preserve"> client"</w:t>
+      </w:r>
+    </w:p>
+    <w:p>
+      <w:r>
+        <w:t xml:space="preserve">import React, </w:t>
+      </w:r>
+      <w:proofErr w:type="gramStart"/>
+      <w:r>
+        <w:t>{ useEffect</w:t>
+      </w:r>
+      <w:proofErr w:type="gramEnd"/>
+      <w:r>
+        <w:t xml:space="preserve">, </w:t>
+      </w:r>
+      <w:proofErr w:type="spellStart"/>
+      <w:proofErr w:type="gramStart"/>
       <w:r>
         <w:t>useState</w:t>
       </w:r>
       <w:proofErr w:type="spellEnd"/>
       <w:r>
-        <w:t xml:space="preserve"> } from "react";</w:t>
-      </w:r>
-    </w:p>
-    <w:p>
-      <w:r>
-        <w:t>import Navbar from "./Navbar";</w:t>
-      </w:r>
-    </w:p>
-    <w:p>
-      <w:r>
-        <w:t xml:space="preserve">import { </w:t>
+        <w:t xml:space="preserve"> }</w:t>
+      </w:r>
+      <w:proofErr w:type="gramEnd"/>
+      <w:r>
+        <w:t xml:space="preserve"> from "react";</w:t>
+      </w:r>
+    </w:p>
+    <w:p>
+      <w:r>
+        <w:t xml:space="preserve">import Navbar from </w:t>
+      </w:r>
+      <w:proofErr w:type="gramStart"/>
+      <w:r>
+        <w:t>"./</w:t>
+      </w:r>
+      <w:proofErr w:type="gramEnd"/>
+      <w:r>
+        <w:t>Navbar";</w:t>
+      </w:r>
+    </w:p>
+    <w:p>
+      <w:r>
+        <w:t xml:space="preserve">import </w:t>
+      </w:r>
+      <w:proofErr w:type="gramStart"/>
+      <w:r>
+        <w:t xml:space="preserve">{ </w:t>
       </w:r>
       <w:proofErr w:type="spellStart"/>
       <w:r>
         <w:t>usePathname</w:t>
       </w:r>
       <w:proofErr w:type="spellEnd"/>
+      <w:proofErr w:type="gramEnd"/>
       <w:r>
         <w:t xml:space="preserve"> } from "next/navigation";</w:t>
       </w:r>
@@ -11274,12 +12432,17 @@
         <w:t xml:space="preserve">function </w:t>
       </w:r>
       <w:proofErr w:type="spellStart"/>
+      <w:proofErr w:type="gramStart"/>
       <w:r>
         <w:t>SuperNavBar</w:t>
       </w:r>
       <w:proofErr w:type="spellEnd"/>
       <w:r>
-        <w:t>() {</w:t>
+        <w:t>(</w:t>
+      </w:r>
+      <w:proofErr w:type="gramEnd"/>
+      <w:r>
+        <w:t>) {</w:t>
       </w:r>
     </w:p>
     <w:p>
@@ -11295,12 +12458,17 @@
         <w:t xml:space="preserve"> pathname = </w:t>
       </w:r>
       <w:proofErr w:type="spellStart"/>
+      <w:proofErr w:type="gramStart"/>
       <w:r>
         <w:t>usePathname</w:t>
       </w:r>
       <w:proofErr w:type="spellEnd"/>
       <w:r>
-        <w:t>();</w:t>
+        <w:t>(</w:t>
+      </w:r>
+      <w:proofErr w:type="gramEnd"/>
+      <w:r>
+        <w:t>);</w:t>
       </w:r>
     </w:p>
     <w:p>
@@ -11324,18 +12492,39 @@
         <w:t xml:space="preserve">] = </w:t>
       </w:r>
       <w:proofErr w:type="spellStart"/>
+      <w:proofErr w:type="gramStart"/>
       <w:r>
         <w:t>useState</w:t>
       </w:r>
       <w:proofErr w:type="spellEnd"/>
       <w:r>
-        <w:t>({ value: null });</w:t>
+        <w:t>({ value</w:t>
+      </w:r>
+      <w:proofErr w:type="gramEnd"/>
+      <w:r>
+        <w:t xml:space="preserve">: </w:t>
+      </w:r>
+      <w:proofErr w:type="gramStart"/>
+      <w:r>
+        <w:t>null }</w:t>
+      </w:r>
+      <w:proofErr w:type="gramEnd"/>
+      <w:r>
+        <w:t>);</w:t>
       </w:r>
     </w:p>
     <w:p/>
     <w:p>
       <w:r>
-        <w:t xml:space="preserve">  useEffect(() =&gt; {</w:t>
+        <w:t xml:space="preserve">  </w:t>
+      </w:r>
+      <w:proofErr w:type="gramStart"/>
+      <w:r>
+        <w:t>useEffect(</w:t>
+      </w:r>
+      <w:proofErr w:type="gramEnd"/>
+      <w:r>
+        <w:t>() =&gt; {</w:t>
       </w:r>
     </w:p>
     <w:p>
@@ -11371,12 +12560,25 @@
         <w:t xml:space="preserve">      </w:t>
       </w:r>
       <w:proofErr w:type="spellStart"/>
+      <w:proofErr w:type="gramStart"/>
       <w:r>
         <w:t>setUser</w:t>
       </w:r>
       <w:proofErr w:type="spellEnd"/>
       <w:r>
-        <w:t>({ value: token });</w:t>
+        <w:t>({ value</w:t>
+      </w:r>
+      <w:proofErr w:type="gramEnd"/>
+      <w:r>
+        <w:t xml:space="preserve">: </w:t>
+      </w:r>
+      <w:proofErr w:type="gramStart"/>
+      <w:r>
+        <w:t>token }</w:t>
+      </w:r>
+      <w:proofErr w:type="gramEnd"/>
+      <w:r>
+        <w:t>);</w:t>
       </w:r>
     </w:p>
     <w:p>
@@ -11446,10 +12648,12 @@
     </w:p>
     <w:p>
       <w:proofErr w:type="spellStart"/>
+      <w:proofErr w:type="gramStart"/>
       <w:r>
         <w:t>router.query</w:t>
       </w:r>
       <w:proofErr w:type="spellEnd"/>
+      <w:proofErr w:type="gramEnd"/>
       <w:r>
         <w:t xml:space="preserve"> </w:t>
       </w:r>
@@ -11558,8 +12762,13 @@
     </w:p>
     <w:p>
       <w:r>
-        <w:t>If you see such thing in a site and it is react</w:t>
-      </w:r>
+        <w:t xml:space="preserve">If you see such thing in a site and it is </w:t>
+      </w:r>
+      <w:proofErr w:type="gramStart"/>
+      <w:r>
+        <w:t>react</w:t>
+      </w:r>
+      <w:proofErr w:type="gramEnd"/>
       <w:r>
         <w:t xml:space="preserve"> website</w:t>
       </w:r>
@@ -11619,8 +12828,13 @@
       </w:r>
     </w:p>
     <w:p>
-      <w:r>
-        <w:t xml:space="preserve">However there are other ways </w:t>
+      <w:proofErr w:type="gramStart"/>
+      <w:r>
+        <w:t>However</w:t>
+      </w:r>
+      <w:proofErr w:type="gramEnd"/>
+      <w:r>
+        <w:t xml:space="preserve"> there are other ways </w:t>
       </w:r>
       <w:r>
         <w:t>to do it</w:t>
@@ -11737,29 +12951,75 @@
         <w:t xml:space="preserve"> an event by </w:t>
       </w:r>
       <w:proofErr w:type="spellStart"/>
+      <w:proofErr w:type="gramStart"/>
       <w:r>
         <w:rPr>
           <w:b/>
           <w:bCs/>
           <w:color w:val="EE0000"/>
         </w:rPr>
-        <w:t>router.events.on</w:t>
-      </w:r>
-      <w:proofErr w:type="spellEnd"/>
+        <w:t>router.events</w:t>
+      </w:r>
+      <w:proofErr w:type="gramEnd"/>
       <w:r>
         <w:rPr>
           <w:b/>
           <w:bCs/>
           <w:color w:val="EE0000"/>
         </w:rPr>
-        <w:t>(“event name”,&lt;event handler callback&gt;)</w:t>
-      </w:r>
+        <w:t>.</w:t>
+      </w:r>
+      <w:proofErr w:type="gramStart"/>
       <w:r>
         <w:rPr>
           <w:b/>
           <w:bCs/>
           <w:color w:val="EE0000"/>
         </w:rPr>
+        <w:t>on</w:t>
+      </w:r>
+      <w:proofErr w:type="spellEnd"/>
+      <w:r>
+        <w:rPr>
+          <w:b/>
+          <w:bCs/>
+          <w:color w:val="EE0000"/>
+        </w:rPr>
+        <w:t>(</w:t>
+      </w:r>
+      <w:proofErr w:type="gramEnd"/>
+      <w:r>
+        <w:rPr>
+          <w:b/>
+          <w:bCs/>
+          <w:color w:val="EE0000"/>
+        </w:rPr>
+        <w:t>“event name</w:t>
+      </w:r>
+      <w:proofErr w:type="gramStart"/>
+      <w:r>
+        <w:rPr>
+          <w:b/>
+          <w:bCs/>
+          <w:color w:val="EE0000"/>
+        </w:rPr>
+        <w:t>”,&lt;</w:t>
+      </w:r>
+      <w:proofErr w:type="gramEnd"/>
+      <w:r>
+        <w:rPr>
+          <w:b/>
+          <w:bCs/>
+          <w:color w:val="EE0000"/>
+        </w:rPr>
+        <w:t>event handler callback&gt;)</w:t>
+      </w:r>
+      <w:r>
+        <w:rPr>
+          <w:b/>
+          <w:bCs/>
+          <w:color w:val="EE0000"/>
+        </w:rPr>
         <w:t xml:space="preserve"> we used to listen for the event</w:t>
       </w:r>
       <w:r>
@@ -11869,7 +13129,23 @@
           <w:b/>
           <w:bCs/>
         </w:rPr>
-        <w:t xml:space="preserve">There was also an  event </w:t>
+        <w:t xml:space="preserve">There was also </w:t>
+      </w:r>
+      <w:proofErr w:type="gramStart"/>
+      <w:r>
+        <w:rPr>
+          <w:b/>
+          <w:bCs/>
+        </w:rPr>
+        <w:t>an  event</w:t>
+      </w:r>
+      <w:proofErr w:type="gramEnd"/>
+      <w:r>
+        <w:rPr>
+          <w:b/>
+          <w:bCs/>
+        </w:rPr>
+        <w:t xml:space="preserve"> </w:t>
       </w:r>
       <w:r>
         <w:rPr>
@@ -11899,7 +13175,23 @@
           <w:b/>
           <w:bCs/>
         </w:rPr>
-        <w:t>but now no such thing exist so we need to do a</w:t>
+        <w:t xml:space="preserve">but now no such thing </w:t>
+      </w:r>
+      <w:proofErr w:type="gramStart"/>
+      <w:r>
+        <w:rPr>
+          <w:b/>
+          <w:bCs/>
+        </w:rPr>
+        <w:t>exist</w:t>
+      </w:r>
+      <w:proofErr w:type="gramEnd"/>
+      <w:r>
+        <w:rPr>
+          <w:b/>
+          <w:bCs/>
+        </w:rPr>
+        <w:t xml:space="preserve"> so we need to do a</w:t>
       </w:r>
       <w:r>
         <w:rPr>
@@ -12105,7 +13397,15 @@
         <w:t xml:space="preserve">in blogs when you logout </w:t>
       </w:r>
       <w:r>
-        <w:t>then you stays in the same page after reload but you are not logged in.</w:t>
+        <w:t xml:space="preserve">then you </w:t>
+      </w:r>
+      <w:proofErr w:type="gramStart"/>
+      <w:r>
+        <w:t>stays</w:t>
+      </w:r>
+      <w:proofErr w:type="gramEnd"/>
+      <w:r>
+        <w:t xml:space="preserve"> in the same page after reload but you are not logged in.</w:t>
       </w:r>
     </w:p>
     <w:p>
@@ -12122,7 +13422,25 @@
           <w:bCs/>
           <w:color w:val="EE0000"/>
         </w:rPr>
-        <w:t>Teacher says In orders page there is a tracking link associated with a product to track the product.(who knows)</w:t>
+        <w:t xml:space="preserve">Teacher says </w:t>
+      </w:r>
+      <w:proofErr w:type="gramStart"/>
+      <w:r>
+        <w:rPr>
+          <w:b/>
+          <w:bCs/>
+          <w:color w:val="EE0000"/>
+        </w:rPr>
+        <w:t>In</w:t>
+      </w:r>
+      <w:proofErr w:type="gramEnd"/>
+      <w:r>
+        <w:rPr>
+          <w:b/>
+          <w:bCs/>
+          <w:color w:val="EE0000"/>
+        </w:rPr>
+        <w:t xml:space="preserve"> orders page there is a tracking link associated with a product to track the product.(who knows)</w:t>
       </w:r>
     </w:p>
     <w:p>
@@ -12139,10 +13457,18 @@
         <w:t xml:space="preserve"> payment through payment gateway </w:t>
       </w:r>
       <w:r>
-        <w:t xml:space="preserve">and we add order </w:t>
-      </w:r>
-      <w:r>
-        <w:t xml:space="preserve"> user and then </w:t>
+        <w:t xml:space="preserve">and we add </w:t>
+      </w:r>
+      <w:proofErr w:type="gramStart"/>
+      <w:r>
+        <w:t xml:space="preserve">order </w:t>
+      </w:r>
+      <w:r>
+        <w:t xml:space="preserve"> user</w:t>
+      </w:r>
+      <w:proofErr w:type="gramEnd"/>
+      <w:r>
+        <w:t xml:space="preserve"> and then </w:t>
       </w:r>
       <w:r>
         <w:t>redirect him to order page</w:t>
@@ -12201,10 +13527,18 @@
         <w:t xml:space="preserve">and this is your Subtotal </w:t>
       </w:r>
       <w:r>
-        <w:t>and these are your items and this is your tracking li</w:t>
-      </w:r>
-      <w:r>
-        <w:t>nk(who knows</w:t>
+        <w:t xml:space="preserve">and these are your items and this is your tracking </w:t>
+      </w:r>
+      <w:proofErr w:type="gramStart"/>
+      <w:r>
+        <w:t>li</w:t>
+      </w:r>
+      <w:r>
+        <w:t>nk(</w:t>
+      </w:r>
+      <w:proofErr w:type="gramEnd"/>
+      <w:r>
+        <w:t>who knows</w:t>
       </w:r>
       <w:r>
         <w:t xml:space="preserve"> maybe link to track the order</w:t>
@@ -12219,6 +13553,760 @@
         <w:t xml:space="preserve"> </w:t>
       </w:r>
     </w:p>
+    <w:p>
+      <w:r>
+        <w:t xml:space="preserve">Till now whatever </w:t>
+      </w:r>
+      <w:r>
+        <w:t>secret thing we had</w:t>
+      </w:r>
+      <w:r>
+        <w:t xml:space="preserve"> we hard code</w:t>
+      </w:r>
+      <w:r>
+        <w:t>d</w:t>
+      </w:r>
+      <w:r>
+        <w:t xml:space="preserve"> it</w:t>
+      </w:r>
+      <w:r>
+        <w:t xml:space="preserve">. </w:t>
+      </w:r>
+      <w:r>
+        <w:t xml:space="preserve">we hard coded </w:t>
+      </w:r>
+      <w:r>
+        <w:t xml:space="preserve">JWT secret in the code. </w:t>
+      </w:r>
+      <w:r>
+        <w:t xml:space="preserve">even out encryption secret keys we hardcoded them. </w:t>
+      </w:r>
+      <w:r>
+        <w:t xml:space="preserve">So that means if we share out code base with anyone then </w:t>
+      </w:r>
+      <w:r>
+        <w:t>ou</w:t>
+      </w:r>
+      <w:r>
+        <w:t>r</w:t>
+      </w:r>
+      <w:r>
+        <w:t xml:space="preserve"> whole secret information </w:t>
+      </w:r>
+      <w:r>
+        <w:t>will be in the hands of that person.</w:t>
+      </w:r>
+      <w:r>
+        <w:t xml:space="preserve"> We would not want that </w:t>
+      </w:r>
+      <w:r>
+        <w:t>we will keep our thing like merch</w:t>
+      </w:r>
+      <w:r>
+        <w:t>a</w:t>
+      </w:r>
+      <w:r>
+        <w:t xml:space="preserve">nt </w:t>
+      </w:r>
+      <w:r>
+        <w:t xml:space="preserve">Paytm </w:t>
+      </w:r>
+      <w:proofErr w:type="gramStart"/>
+      <w:r>
+        <w:t>key</w:t>
+      </w:r>
+      <w:r>
+        <w:t>(</w:t>
+      </w:r>
+      <w:proofErr w:type="gramEnd"/>
+      <w:r>
+        <w:t>who knows)</w:t>
+      </w:r>
+      <w:r>
+        <w:t xml:space="preserve">, passwords </w:t>
+      </w:r>
+      <w:r>
+        <w:t xml:space="preserve">or any </w:t>
+      </w:r>
+      <w:r>
+        <w:t xml:space="preserve">type </w:t>
+      </w:r>
+      <w:r>
+        <w:t xml:space="preserve">encryption key </w:t>
+      </w:r>
+      <w:r>
+        <w:t xml:space="preserve">or to be safe </w:t>
+      </w:r>
+      <w:r>
+        <w:t xml:space="preserve">we would not want to </w:t>
+      </w:r>
+      <w:r>
+        <w:t>g</w:t>
+      </w:r>
+      <w:r>
+        <w:t xml:space="preserve">ive </w:t>
+      </w:r>
+      <w:r>
+        <w:t>person information to anyone</w:t>
+      </w:r>
+    </w:p>
+    <w:p>
+      <w:pPr>
+        <w:jc w:val="center"/>
+      </w:pPr>
+      <w:r>
+        <w:lastRenderedPageBreak/>
+        <w:drawing>
+          <wp:inline distT="0" distB="0" distL="0" distR="0" wp14:anchorId="0BE12972" wp14:editId="2AC20666">
+            <wp:extent cx="5731510" cy="2944495"/>
+            <wp:effectExtent l="0" t="0" r="2540" b="8255"/>
+            <wp:docPr id="1825658819" name="Picture 1"/>
+            <wp:cNvGraphicFramePr>
+              <a:graphicFrameLocks xmlns:a="http://schemas.openxmlformats.org/drawingml/2006/main" noChangeAspect="1"/>
+            </wp:cNvGraphicFramePr>
+            <a:graphic xmlns:a="http://schemas.openxmlformats.org/drawingml/2006/main">
+              <a:graphicData uri="http://schemas.openxmlformats.org/drawingml/2006/picture">
+                <pic:pic xmlns:pic="http://schemas.openxmlformats.org/drawingml/2006/picture">
+                  <pic:nvPicPr>
+                    <pic:cNvPr id="1825658819" name=""/>
+                    <pic:cNvPicPr/>
+                  </pic:nvPicPr>
+                  <pic:blipFill>
+                    <a:blip r:embed="rId68"/>
+                    <a:stretch>
+                      <a:fillRect/>
+                    </a:stretch>
+                  </pic:blipFill>
+                  <pic:spPr>
+                    <a:xfrm>
+                      <a:off x="0" y="0"/>
+                      <a:ext cx="5731510" cy="2944495"/>
+                    </a:xfrm>
+                    <a:prstGeom prst="rect">
+                      <a:avLst/>
+                    </a:prstGeom>
+                  </pic:spPr>
+                </pic:pic>
+              </a:graphicData>
+            </a:graphic>
+          </wp:inline>
+        </w:drawing>
+      </w:r>
+    </w:p>
+    <w:p>
+      <w:r>
+        <w:t>We can do this by environment variables we will learn how to add environment va</w:t>
+      </w:r>
+      <w:r>
+        <w:t>r</w:t>
+      </w:r>
+      <w:r>
+        <w:t>iables</w:t>
+      </w:r>
+      <w:r>
+        <w:t xml:space="preserve"> and how they are access</w:t>
+      </w:r>
+      <w:r>
+        <w:t xml:space="preserve">ed. </w:t>
+      </w:r>
+    </w:p>
+    <w:p>
+      <w:r>
+        <w:t xml:space="preserve">We prepend a variable with NEXT_ to </w:t>
+      </w:r>
+      <w:r>
+        <w:t xml:space="preserve">an environment </w:t>
+      </w:r>
+      <w:proofErr w:type="gramStart"/>
+      <w:r>
+        <w:t>variable</w:t>
+      </w:r>
+      <w:r>
+        <w:t>(</w:t>
+      </w:r>
+      <w:proofErr w:type="gramEnd"/>
+      <w:r>
+        <w:t>maybe we are wrong where)</w:t>
+      </w:r>
+      <w:r>
+        <w:t xml:space="preserve"> </w:t>
+      </w:r>
+      <w:r>
+        <w:t xml:space="preserve">name so that </w:t>
+      </w:r>
+      <w:r>
+        <w:t xml:space="preserve">they can be publicly be given in web </w:t>
+      </w:r>
+      <w:proofErr w:type="gramStart"/>
+      <w:r>
+        <w:t>browser</w:t>
+      </w:r>
+      <w:r>
+        <w:t>(</w:t>
+      </w:r>
+      <w:proofErr w:type="gramEnd"/>
+      <w:r>
+        <w:t>who knows)</w:t>
+      </w:r>
+      <w:r>
+        <w:t xml:space="preserve"> </w:t>
+      </w:r>
+      <w:r>
+        <w:t>what is this we will understand it.</w:t>
+      </w:r>
+      <w:r>
+        <w:t xml:space="preserve"> </w:t>
+      </w:r>
+    </w:p>
+    <w:p>
+      <w:hyperlink r:id="rId69" w:history="1">
+        <w:r>
+          <w:rPr>
+            <w:rStyle w:val="Hyperlink"/>
+          </w:rPr>
+          <w:t>https://nextjs.org/docs/pages/guides/environment-variables</w:t>
+        </w:r>
+      </w:hyperlink>
+    </w:p>
+    <w:p>
+      <w:r>
+        <w:t xml:space="preserve">you can use documentation </w:t>
+      </w:r>
+      <w:r>
+        <w:t>below and link above</w:t>
+      </w:r>
+    </w:p>
+    <w:p>
+      <w:pPr>
+        <w:jc w:val="center"/>
+      </w:pPr>
+      <w:r>
+        <w:drawing>
+          <wp:inline distT="0" distB="0" distL="0" distR="0" wp14:anchorId="5C857B50" wp14:editId="56BAFC2D">
+            <wp:extent cx="3597215" cy="3541420"/>
+            <wp:effectExtent l="0" t="0" r="3810" b="1905"/>
+            <wp:docPr id="1011930795" name="Picture 1"/>
+            <wp:cNvGraphicFramePr>
+              <a:graphicFrameLocks xmlns:a="http://schemas.openxmlformats.org/drawingml/2006/main" noChangeAspect="1"/>
+            </wp:cNvGraphicFramePr>
+            <a:graphic xmlns:a="http://schemas.openxmlformats.org/drawingml/2006/main">
+              <a:graphicData uri="http://schemas.openxmlformats.org/drawingml/2006/picture">
+                <pic:pic xmlns:pic="http://schemas.openxmlformats.org/drawingml/2006/picture">
+                  <pic:nvPicPr>
+                    <pic:cNvPr id="1011930795" name=""/>
+                    <pic:cNvPicPr/>
+                  </pic:nvPicPr>
+                  <pic:blipFill>
+                    <a:blip r:embed="rId70"/>
+                    <a:stretch>
+                      <a:fillRect/>
+                    </a:stretch>
+                  </pic:blipFill>
+                  <pic:spPr>
+                    <a:xfrm>
+                      <a:off x="0" y="0"/>
+                      <a:ext cx="3599793" cy="3543958"/>
+                    </a:xfrm>
+                    <a:prstGeom prst="rect">
+                      <a:avLst/>
+                    </a:prstGeom>
+                  </pic:spPr>
+                </pic:pic>
+              </a:graphicData>
+            </a:graphic>
+          </wp:inline>
+        </w:drawing>
+      </w:r>
+    </w:p>
+    <w:p/>
+    <w:p>
+      <w:r>
+        <w:lastRenderedPageBreak/>
+        <w:t>By reading above you will come to know ho</w:t>
+      </w:r>
+      <w:r>
+        <w:t>w</w:t>
+      </w:r>
+      <w:r>
+        <w:t xml:space="preserve"> environment variables work in </w:t>
+      </w:r>
+      <w:proofErr w:type="spellStart"/>
+      <w:r>
+        <w:t>Nextjs</w:t>
+      </w:r>
+      <w:proofErr w:type="spellEnd"/>
+      <w:r>
+        <w:t xml:space="preserve">. </w:t>
+      </w:r>
+      <w:r>
+        <w:t xml:space="preserve">We make </w:t>
+      </w:r>
+      <w:proofErr w:type="gramStart"/>
+      <w:r>
+        <w:t>a .</w:t>
+      </w:r>
+      <w:proofErr w:type="spellStart"/>
+      <w:r>
+        <w:t>env</w:t>
+      </w:r>
+      <w:proofErr w:type="gramEnd"/>
+      <w:r>
+        <w:t>.local</w:t>
+      </w:r>
+      <w:proofErr w:type="spellEnd"/>
+      <w:r>
+        <w:t xml:space="preserve"> file and put it in variables.</w:t>
+      </w:r>
+    </w:p>
+    <w:p>
+      <w:r>
+        <w:t xml:space="preserve">In our code bases we access them by </w:t>
+      </w:r>
+      <w:proofErr w:type="spellStart"/>
+      <w:proofErr w:type="gramStart"/>
+      <w:r>
+        <w:t>process.env</w:t>
+      </w:r>
+      <w:proofErr w:type="spellEnd"/>
+      <w:r>
+        <w:t>.&lt;</w:t>
+      </w:r>
+      <w:proofErr w:type="gramEnd"/>
+      <w:r>
+        <w:t xml:space="preserve">variable name&gt;. </w:t>
+      </w:r>
+      <w:r>
+        <w:t>and we thing is process is by default imported.</w:t>
+      </w:r>
+    </w:p>
+    <w:p>
+      <w:pPr>
+        <w:jc w:val="center"/>
+      </w:pPr>
+      <w:r>
+        <w:drawing>
+          <wp:inline distT="0" distB="0" distL="0" distR="0" wp14:anchorId="26F0266B" wp14:editId="65FEAEAF">
+            <wp:extent cx="4972744" cy="676369"/>
+            <wp:effectExtent l="0" t="0" r="0" b="9525"/>
+            <wp:docPr id="1584575111" name="Picture 1"/>
+            <wp:cNvGraphicFramePr>
+              <a:graphicFrameLocks xmlns:a="http://schemas.openxmlformats.org/drawingml/2006/main" noChangeAspect="1"/>
+            </wp:cNvGraphicFramePr>
+            <a:graphic xmlns:a="http://schemas.openxmlformats.org/drawingml/2006/main">
+              <a:graphicData uri="http://schemas.openxmlformats.org/drawingml/2006/picture">
+                <pic:pic xmlns:pic="http://schemas.openxmlformats.org/drawingml/2006/picture">
+                  <pic:nvPicPr>
+                    <pic:cNvPr id="1584575111" name=""/>
+                    <pic:cNvPicPr/>
+                  </pic:nvPicPr>
+                  <pic:blipFill>
+                    <a:blip r:embed="rId71"/>
+                    <a:stretch>
+                      <a:fillRect/>
+                    </a:stretch>
+                  </pic:blipFill>
+                  <pic:spPr>
+                    <a:xfrm>
+                      <a:off x="0" y="0"/>
+                      <a:ext cx="4972744" cy="676369"/>
+                    </a:xfrm>
+                    <a:prstGeom prst="rect">
+                      <a:avLst/>
+                    </a:prstGeom>
+                  </pic:spPr>
+                </pic:pic>
+              </a:graphicData>
+            </a:graphic>
+          </wp:inline>
+        </w:drawing>
+      </w:r>
+    </w:p>
+    <w:p>
+      <w:r>
+        <w:t xml:space="preserve">Now by this if we want to being changes </w:t>
+      </w:r>
+      <w:r>
+        <w:t>in environment variable it will be reflected in the area in the code where the environment variable is used.</w:t>
+      </w:r>
+    </w:p>
+    <w:p>
+      <w:pPr>
+        <w:rPr>
+          <w:b/>
+          <w:bCs/>
+        </w:rPr>
+      </w:pPr>
+      <w:r>
+        <w:rPr>
+          <w:b/>
+          <w:bCs/>
+        </w:rPr>
+        <w:t xml:space="preserve">We can scroll </w:t>
+      </w:r>
+      <w:r>
+        <w:rPr>
+          <w:b/>
+          <w:bCs/>
+        </w:rPr>
+        <w:t>and move around t</w:t>
+      </w:r>
+      <w:r>
+        <w:rPr>
+          <w:b/>
+          <w:bCs/>
+        </w:rPr>
+        <w:t xml:space="preserve">hrough the tabs in the </w:t>
+      </w:r>
+      <w:r>
+        <w:rPr>
+          <w:b/>
+          <w:bCs/>
+        </w:rPr>
+        <w:t xml:space="preserve">VS Code. </w:t>
+      </w:r>
+    </w:p>
+    <w:p>
+      <w:r>
+        <w:t>We did a grave mistake we need to prefix the variable name with NEXT_PUBLIC</w:t>
+      </w:r>
+      <w:r>
+        <w:t xml:space="preserve">_ </w:t>
+      </w:r>
+    </w:p>
+    <w:p>
+      <w:r>
+        <w:t xml:space="preserve">About it is shown in </w:t>
+      </w:r>
+      <w:proofErr w:type="spellStart"/>
+      <w:r>
+        <w:t>oneliner</w:t>
+      </w:r>
+      <w:proofErr w:type="spellEnd"/>
+      <w:r>
+        <w:t xml:space="preserve"> below.</w:t>
+      </w:r>
+      <w:r>
+        <w:drawing>
+          <wp:inline distT="0" distB="0" distL="0" distR="0" wp14:anchorId="7BC8D637" wp14:editId="62CF0446">
+            <wp:extent cx="4515480" cy="257211"/>
+            <wp:effectExtent l="0" t="0" r="0" b="9525"/>
+            <wp:docPr id="797785610" name="Picture 1"/>
+            <wp:cNvGraphicFramePr>
+              <a:graphicFrameLocks xmlns:a="http://schemas.openxmlformats.org/drawingml/2006/main" noChangeAspect="1"/>
+            </wp:cNvGraphicFramePr>
+            <a:graphic xmlns:a="http://schemas.openxmlformats.org/drawingml/2006/main">
+              <a:graphicData uri="http://schemas.openxmlformats.org/drawingml/2006/picture">
+                <pic:pic xmlns:pic="http://schemas.openxmlformats.org/drawingml/2006/picture">
+                  <pic:nvPicPr>
+                    <pic:cNvPr id="797785610" name=""/>
+                    <pic:cNvPicPr/>
+                  </pic:nvPicPr>
+                  <pic:blipFill>
+                    <a:blip r:embed="rId72"/>
+                    <a:stretch>
+                      <a:fillRect/>
+                    </a:stretch>
+                  </pic:blipFill>
+                  <pic:spPr>
+                    <a:xfrm>
+                      <a:off x="0" y="0"/>
+                      <a:ext cx="4515480" cy="257211"/>
+                    </a:xfrm>
+                    <a:prstGeom prst="rect">
+                      <a:avLst/>
+                    </a:prstGeom>
+                  </pic:spPr>
+                </pic:pic>
+              </a:graphicData>
+            </a:graphic>
+          </wp:inline>
+        </w:drawing>
+      </w:r>
+    </w:p>
+    <w:p>
+      <w:r>
+        <w:t>We need t</w:t>
+      </w:r>
+      <w:r>
+        <w:t>o</w:t>
+      </w:r>
+      <w:r>
+        <w:t xml:space="preserve"> do it so that we can expose</w:t>
+      </w:r>
+      <w:r>
+        <w:t xml:space="preserve"> it</w:t>
+      </w:r>
+      <w:r>
+        <w:t xml:space="preserve"> </w:t>
+      </w:r>
+      <w:r>
+        <w:t xml:space="preserve">to the </w:t>
+      </w:r>
+      <w:r>
+        <w:t xml:space="preserve">browser </w:t>
+      </w:r>
+      <w:r>
+        <w:t>(who knows maybe server decides th</w:t>
+      </w:r>
+      <w:r>
+        <w:t>r</w:t>
+      </w:r>
+      <w:r>
+        <w:t>ough this prefi</w:t>
+      </w:r>
+      <w:r>
+        <w:t>x</w:t>
+      </w:r>
+      <w:r>
+        <w:t xml:space="preserve"> to use that environment variables </w:t>
+      </w:r>
+      <w:r>
+        <w:t xml:space="preserve">for the browser </w:t>
+      </w:r>
+      <w:proofErr w:type="gramStart"/>
+      <w:r>
+        <w:t>code(</w:t>
+      </w:r>
+      <w:proofErr w:type="gramEnd"/>
+      <w:r>
+        <w:t>maybe we are wrong here)</w:t>
+      </w:r>
+      <w:r>
+        <w:t>)</w:t>
+      </w:r>
+      <w:r>
+        <w:t>.</w:t>
+      </w:r>
+    </w:p>
+    <w:p>
+      <w:pPr>
+        <w:jc w:val="center"/>
+      </w:pPr>
+      <w:r>
+        <w:drawing>
+          <wp:inline distT="0" distB="0" distL="0" distR="0" wp14:anchorId="059A4C5F" wp14:editId="0B7095F5">
+            <wp:extent cx="4020111" cy="504895"/>
+            <wp:effectExtent l="0" t="0" r="0" b="9525"/>
+            <wp:docPr id="598929662" name="Picture 1"/>
+            <wp:cNvGraphicFramePr>
+              <a:graphicFrameLocks xmlns:a="http://schemas.openxmlformats.org/drawingml/2006/main" noChangeAspect="1"/>
+            </wp:cNvGraphicFramePr>
+            <a:graphic xmlns:a="http://schemas.openxmlformats.org/drawingml/2006/main">
+              <a:graphicData uri="http://schemas.openxmlformats.org/drawingml/2006/picture">
+                <pic:pic xmlns:pic="http://schemas.openxmlformats.org/drawingml/2006/picture">
+                  <pic:nvPicPr>
+                    <pic:cNvPr id="598929662" name=""/>
+                    <pic:cNvPicPr/>
+                  </pic:nvPicPr>
+                  <pic:blipFill>
+                    <a:blip r:embed="rId73"/>
+                    <a:stretch>
+                      <a:fillRect/>
+                    </a:stretch>
+                  </pic:blipFill>
+                  <pic:spPr>
+                    <a:xfrm>
+                      <a:off x="0" y="0"/>
+                      <a:ext cx="4020111" cy="504895"/>
+                    </a:xfrm>
+                    <a:prstGeom prst="rect">
+                      <a:avLst/>
+                    </a:prstGeom>
+                  </pic:spPr>
+                </pic:pic>
+              </a:graphicData>
+            </a:graphic>
+          </wp:inline>
+        </w:drawing>
+      </w:r>
+    </w:p>
+    <w:p>
+      <w:r>
+        <w:t>You can see above that MONGO_URI is an environment variable</w:t>
+      </w:r>
+      <w:r>
+        <w:t xml:space="preserve"> used by the server and </w:t>
+      </w:r>
+      <w:r>
+        <w:t>NEXT_PUBLIC_HOST</w:t>
+      </w:r>
+      <w:r>
+        <w:t xml:space="preserve"> is used by the browser </w:t>
+      </w:r>
+      <w:r>
+        <w:t xml:space="preserve">as maybe server exposed it to the </w:t>
+      </w:r>
+      <w:proofErr w:type="gramStart"/>
+      <w:r>
+        <w:t>br</w:t>
+      </w:r>
+      <w:r>
+        <w:t>o</w:t>
+      </w:r>
+      <w:r>
+        <w:t>wser(</w:t>
+      </w:r>
+      <w:proofErr w:type="gramEnd"/>
+      <w:r>
+        <w:t>who knows).</w:t>
+      </w:r>
+    </w:p>
+    <w:p>
+      <w:pPr>
+        <w:rPr>
+          <w:b/>
+          <w:bCs/>
+        </w:rPr>
+      </w:pPr>
+      <w:r>
+        <w:rPr>
+          <w:b/>
+          <w:bCs/>
+        </w:rPr>
+        <w:t>All the html,</w:t>
+      </w:r>
+      <w:r>
+        <w:rPr>
+          <w:b/>
+          <w:bCs/>
+        </w:rPr>
+        <w:t xml:space="preserve"> </w:t>
+      </w:r>
+      <w:r>
+        <w:rPr>
+          <w:b/>
+          <w:bCs/>
+        </w:rPr>
+        <w:t>CSS and JS files you can see in source tab of the console as shown below</w:t>
+      </w:r>
+    </w:p>
+    <w:p>
+      <w:pPr>
+        <w:jc w:val="center"/>
+        <w:rPr>
+          <w:b/>
+          <w:bCs/>
+        </w:rPr>
+      </w:pPr>
+      <w:r>
+        <w:rPr>
+          <w:b/>
+          <w:bCs/>
+        </w:rPr>
+        <w:drawing>
+          <wp:inline distT="0" distB="0" distL="0" distR="0" wp14:anchorId="54325F04" wp14:editId="1B36C048">
+            <wp:extent cx="5731510" cy="2517775"/>
+            <wp:effectExtent l="0" t="0" r="2540" b="0"/>
+            <wp:docPr id="447076455" name="Picture 1"/>
+            <wp:cNvGraphicFramePr>
+              <a:graphicFrameLocks xmlns:a="http://schemas.openxmlformats.org/drawingml/2006/main" noChangeAspect="1"/>
+            </wp:cNvGraphicFramePr>
+            <a:graphic xmlns:a="http://schemas.openxmlformats.org/drawingml/2006/main">
+              <a:graphicData uri="http://schemas.openxmlformats.org/drawingml/2006/picture">
+                <pic:pic xmlns:pic="http://schemas.openxmlformats.org/drawingml/2006/picture">
+                  <pic:nvPicPr>
+                    <pic:cNvPr id="447076455" name=""/>
+                    <pic:cNvPicPr/>
+                  </pic:nvPicPr>
+                  <pic:blipFill>
+                    <a:blip r:embed="rId74"/>
+                    <a:stretch>
+                      <a:fillRect/>
+                    </a:stretch>
+                  </pic:blipFill>
+                  <pic:spPr>
+                    <a:xfrm>
+                      <a:off x="0" y="0"/>
+                      <a:ext cx="5731510" cy="2517775"/>
+                    </a:xfrm>
+                    <a:prstGeom prst="rect">
+                      <a:avLst/>
+                    </a:prstGeom>
+                  </pic:spPr>
+                </pic:pic>
+              </a:graphicData>
+            </a:graphic>
+          </wp:inline>
+        </w:drawing>
+      </w:r>
+    </w:p>
+    <w:p>
+      <w:r>
+        <w:t>I</w:t>
+      </w:r>
+      <w:r>
+        <w:t>n</w:t>
+      </w:r>
+      <w:r>
+        <w:t xml:space="preserve"> older </w:t>
+      </w:r>
+      <w:proofErr w:type="spellStart"/>
+      <w:r>
+        <w:t>Next</w:t>
+      </w:r>
+      <w:r>
+        <w:t>J</w:t>
+      </w:r>
+      <w:r>
+        <w:t>s</w:t>
+      </w:r>
+      <w:proofErr w:type="spellEnd"/>
+      <w:r>
+        <w:t xml:space="preserve"> we needed t</w:t>
+      </w:r>
+      <w:r>
+        <w:t>o</w:t>
+      </w:r>
+      <w:r>
+        <w:t xml:space="preserve"> restart the server when we did some very strong changes </w:t>
+      </w:r>
+      <w:r>
+        <w:t>related to</w:t>
+      </w:r>
+      <w:r>
+        <w:t xml:space="preserve"> the </w:t>
+      </w:r>
+      <w:r>
+        <w:t>environment variable</w:t>
+      </w:r>
+      <w:r>
+        <w:t xml:space="preserve"> </w:t>
+      </w:r>
+      <w:r>
+        <w:t xml:space="preserve">in the </w:t>
+      </w:r>
+      <w:r>
+        <w:t xml:space="preserve">server </w:t>
+      </w:r>
+      <w:r>
+        <w:t>(maybe we are wrong).</w:t>
+      </w:r>
+      <w:r>
+        <w:t xml:space="preserve"> But we don’t need to do now anymore </w:t>
+      </w:r>
+      <w:r>
+        <w:t xml:space="preserve">as </w:t>
+      </w:r>
+      <w:r>
+        <w:t>our modern server is strong now o</w:t>
+      </w:r>
+      <w:r>
+        <w:t>r</w:t>
+      </w:r>
+      <w:r>
+        <w:t xml:space="preserve"> maybe we are wrong</w:t>
+      </w:r>
+      <w:r>
+        <w:t xml:space="preserve"> here who knows</w:t>
+      </w:r>
+      <w:r>
+        <w:t>.</w:t>
+      </w:r>
+      <w:r>
+        <w:t xml:space="preserve"> </w:t>
+      </w:r>
+    </w:p>
+    <w:p/>
     <w:sectPr>
       <w:pgSz w:w="11906" w:h="16838"/>
       <w:pgMar w:top="1440" w:right="1440" w:bottom="1440" w:left="1440" w:header="708" w:footer="708" w:gutter="0"/>

</xml_diff>